<commit_message>
Address author comments: Py-CoSim title, first-invention tone, rename SMMM to TIDE, GitHub link, live EndNote citations
- Manuscript title: "Py-CoSim: time-aware message-based co-simulation of building energy and artificial intelligence models"
- Py-CoSim and its hub are presented as new (no "redesign", no version history); repository link in the abstract,
  contributions, implementation and conclusions; fixed a garbled minus sign
- The message hub is now called TIDE (Time-aware Interval Data Exchange) in the paper, code docstrings, docs
  (docs/tide.md), README, CHANGELOG, examples, tests and experiment scripts; figures redrawn
- Submission files keep live EndNote citation fields (no flattening); the author's review folder is git-ignored

Co-Authored-By: Claude Opus 5.5 <noreply@anthropic.com>
</commit_message>
<xml_diff>
--- a/paper/manuscript/Manuscript.docx
+++ b/paper/manuscript/Manuscript.docx
@@ -7,7 +7,7 @@
         <w:pStyle w:val="Title"/>
       </w:pPr>
       <w:r>
-        <w:t xml:space="preserve">Exchanging messages instead of wiring software: time-aware co-simulation of building energy models with data-driven and artificial intelligence components</w:t>
+        <w:t xml:space="preserve">Py-CoSim: time-aware message-based co-simulation of building energy and artificial intelligence models</w:t>
       </w:r>
     </w:p>
     <w:p>
@@ -123,7 +123,7 @@
         <w:pStyle w:val="Abstract"/>
       </w:pPr>
       <w:r>
-        <w:t xml:space="preserve">Building energy models are increasingly co-simulated with photovoltaic systems, batteries, tariffs, occupant and machine-learning models, and large language model agents. Co-simulation tools connect such programs but exchange values as numbers stamped with an instant, leaving users to decide which interval each value belongs to, and offer no rules for artificial intelligence (AI) components that answer differently on every call, return invalid values or respond slowly. This paper redesigns the Simulation Management and Messaging Module (SMMM) of the open-source Py-CoSim framework into a time-aware message hub. Each message states whether its value is an instantaneous sample, an interval average, an interval amount, a value held until replaced or an event, and each input declares the window it needs. SMMM aligns the data automatically, flags their quality, records them for exact replay, traces their provenance and delivers the answers of slow components at a declared simulation time. EnergyPlus is coupled through its Python interface. Co-simulated EnergyPlus results were identical to standalone runs. Aligned exchange computed energy and cost exactly when a consumer’s step was a multiple of its producer’s, whereas exchanging latest values erred by up to 6 %. In a ten-office community with photovoltaics and a battery, naive exchange overstated the battery’s peak reduction (peak import 120 kW instead of 135 kW). Replay reproduced runs with a stochastic AI supervisor exactly and cut the spread of a retrofit-savings estimate 24-fold; asynchronous delivery shortened runs with eight slow AI supervisors 2.9-fold without changing results.</w:t>
+        <w:t xml:space="preserve">Building energy models are increasingly co-simulated with photovoltaic systems, batteries, tariffs, occupant and machine-learning models, and large language model agents. Co-simulation tools connect such programs but exchange values as numbers stamped with an instant, leaving users to decide which interval each value belongs to, and offer no rules for artificial intelligence (AI) components that answer differently on every call, return invalid values or respond slowly. This paper presents Py-CoSim, an open-source Python co-simulation framework in which components exchange messages through a time-aware hub, TIDE (Time-aware Interval Data Exchange). Each message states whether its value is an instantaneous sample, an interval average, an interval amount, a value held until replaced or an event, and each input declares the window it needs. TIDE aligns the data automatically, flags their quality, records them for exact replay, traces their provenance and delivers the answers of slow components at a declared simulation time. Co-simulated EnergyPlus results were identical to standalone runs. Aligned exchange computed energy and cost exactly when a consumer’s step was a multiple of its producer’s, whereas exchanging latest values erred by up to 6 %. In a ten-office community with photovoltaics and a battery, naive exchange overstated the battery’s peak reduction (peak import 120 kW instead of 135 kW). Replay reproduced runs with a stochastic AI supervisor exactly and cut the spread of a retrofit-savings estimate 24-fold; asynchronous delivery shortened runs with eight slow AI supervisors 2.9-fold without changing results. The code is available at https://github.com/lz356/Py-CoSim.</w:t>
       </w:r>
     </w:p>
     <w:p>
@@ -164,7 +164,7 @@
 UmVjTnVtPjU4PC9SZWNOdW0+PERpc3BsYXlUZXh0PlsxLDJdPC9EaXNwbGF5VGV4dD48cmVjb3Jk
 PjxyZWMtbnVtYmVyPjU4PC9yZWMtbnVtYmVyPjxmb3JlaWduLWtleXM+PGtleSBhcHA9IkVOIiBk
 Yi1pZD0ibWRhZTg1MDAxMDk0OTZmZWE0YWZmOWMwODZlMTZjYzI1ODk1IiB0aW1lc3RhbXA9IjE3
-OTMxODU0NzMiPjU4PC9rZXk+PC9mb3JlaWduLWtleXM+PHJlZi10eXBlIG5hbWU9IlJlcG9ydCI+
+OTMyMTY4MjEiPjU4PC9rZXk+PC9mb3JlaWduLWtleXM+PHJlZi10eXBlIG5hbWU9IlJlcG9ydCI+
 Mjc8L3JlZi10eXBlPjxjb250cmlidXRvcnM+PGF1dGhvcnM+PGF1dGhvcj5OZXVrb21tLCBNb25p
 Y2E8L2F1dGhvcj48YXV0aG9yPk51YmJlLCBWYWxlcmllPC9hdXRob3I+PGF1dGhvcj5GYXJlcywg
 Um9iZXJ0PC9hdXRob3I+PC9hdXRob3JzPjwvY29udHJpYnV0b3JzPjx0aXRsZXM+PHRpdGxlPkdy
@@ -179,7 +179,7 @@
 ZT48Q2l0ZT48QXV0aG9yPkhvbmc8L0F1dGhvcj48WWVhcj4yMDI1PC9ZZWFyPjxSZWNOdW0+MzU8
 L1JlY051bT48cmVjb3JkPjxyZWMtbnVtYmVyPjM1PC9yZWMtbnVtYmVyPjxmb3JlaWduLWtleXM+
 PGtleSBhcHA9IkVOIiBkYi1pZD0ibWRhZTg1MDAxMDk0OTZmZWE0YWZmOWMwODZlMTZjYzI1ODk1
-IiB0aW1lc3RhbXA9IjE3OTMxODU0NzMiPjM1PC9rZXk+PC9mb3JlaWduLWtleXM+PHJlZi10eXBl
+IiB0aW1lc3RhbXA9IjE3OTMyMTY4MjEiPjM1PC9rZXk+PC9mb3JlaWduLWtleXM+PHJlZi10eXBl
 IG5hbWU9IkpvdXJuYWwgQXJ0aWNsZSI+MTc8L3JlZi10eXBlPjxjb250cmlidXRvcnM+PGF1dGhv
 cnM+PGF1dGhvcj5Ib25nLCBUaWFuemhlbjwvYXV0aG9yPjxhdXRob3I+TGVlLCBTYW5nIEhvb248
 L2F1dGhvcj48YXV0aG9yPlpoYW5nLCBXYW5uaTwvYXV0aG9yPjxhdXRob3I+TGksIEhhbjwvYXV0
@@ -206,7 +206,7 @@
 UmVjTnVtPjU4PC9SZWNOdW0+PERpc3BsYXlUZXh0PlsxLDJdPC9EaXNwbGF5VGV4dD48cmVjb3Jk
 PjxyZWMtbnVtYmVyPjU4PC9yZWMtbnVtYmVyPjxmb3JlaWduLWtleXM+PGtleSBhcHA9IkVOIiBk
 Yi1pZD0ibWRhZTg1MDAxMDk0OTZmZWE0YWZmOWMwODZlMTZjYzI1ODk1IiB0aW1lc3RhbXA9IjE3
-OTMxODU0NzMiPjU4PC9rZXk+PC9mb3JlaWduLWtleXM+PHJlZi10eXBlIG5hbWU9IlJlcG9ydCI+
+OTMyMTY4MjEiPjU4PC9rZXk+PC9mb3JlaWduLWtleXM+PHJlZi10eXBlIG5hbWU9IlJlcG9ydCI+
 Mjc8L3JlZi10eXBlPjxjb250cmlidXRvcnM+PGF1dGhvcnM+PGF1dGhvcj5OZXVrb21tLCBNb25p
 Y2E8L2F1dGhvcj48YXV0aG9yPk51YmJlLCBWYWxlcmllPC9hdXRob3I+PGF1dGhvcj5GYXJlcywg
 Um9iZXJ0PC9hdXRob3I+PC9hdXRob3JzPjwvY29udHJpYnV0b3JzPjx0aXRsZXM+PHRpdGxlPkdy
@@ -221,7 +221,7 @@
 ZT48Q2l0ZT48QXV0aG9yPkhvbmc8L0F1dGhvcj48WWVhcj4yMDI1PC9ZZWFyPjxSZWNOdW0+MzU8
 L1JlY051bT48cmVjb3JkPjxyZWMtbnVtYmVyPjM1PC9yZWMtbnVtYmVyPjxmb3JlaWduLWtleXM+
 PGtleSBhcHA9IkVOIiBkYi1pZD0ibWRhZTg1MDAxMDk0OTZmZWE0YWZmOWMwODZlMTZjYzI1ODk1
-IiB0aW1lc3RhbXA9IjE3OTMxODU0NzMiPjM1PC9rZXk+PC9mb3JlaWduLWtleXM+PHJlZi10eXBl
+IiB0aW1lc3RhbXA9IjE3OTMyMTY4MjEiPjM1PC9rZXk+PC9mb3JlaWduLWtleXM+PHJlZi10eXBl
 IG5hbWU9IkpvdXJuYWwgQXJ0aWNsZSI+MTc8L3JlZi10eXBlPjxjb250cmlidXRvcnM+PGF1dGhv
 cnM+PGF1dGhvcj5Ib25nLCBUaWFuemhlbjwvYXV0aG9yPjxhdXRob3I+TGVlLCBTYW5nIEhvb248
 L2F1dGhvcj48YXV0aG9yPlpoYW5nLCBXYW5uaTwvYXV0aG9yPjxhdXRob3I+TGksIEhhbjwvYXV0
@@ -266,7 +266,7 @@
 TnVtPjgzPC9SZWNOdW0+PERpc3BsYXlUZXh0Plsz4oCTNl08L0Rpc3BsYXlUZXh0PjxyZWNvcmQ+
 PHJlYy1udW1iZXI+ODM8L3JlYy1udW1iZXI+PGZvcmVpZ24ta2V5cz48a2V5IGFwcD0iRU4iIGRi
 LWlkPSJtZGFlODUwMDEwOTQ5NmZlYTRhZmY5YzA4NmUxNmNjMjU4OTUiIHRpbWVzdGFtcD0iMTc5
-MzE4NTQ3MyI+ODM8L2tleT48L2ZvcmVpZ24ta2V5cz48cmVmLXR5cGUgbmFtZT0iSm91cm5hbCBB
+MzIxNjgyMSI+ODM8L2tleT48L2ZvcmVpZ24ta2V5cz48cmVmLXR5cGUgbmFtZT0iSm91cm5hbCBB
 cnRpY2xlIj4xNzwvcmVmLXR5cGU+PGNvbnRyaWJ1dG9ycz48YXV0aG9ycz48YXV0aG9yPldhbmcs
 IFpoZTwvYXV0aG9yPjxhdXRob3I+SG9uZywgVGlhbnpoZW48L2F1dGhvcj48L2F1dGhvcnM+PC9j
 b250cmlidXRvcnM+PHRpdGxlcz48dGl0bGU+UmVpbmZvcmNlbWVudCBsZWFybmluZyBmb3IgYnVp
@@ -281,7 +281,7 @@
 Y2UtbnVtPjwvcmVjb3JkPjwvQ2l0ZT48Q2l0ZT48QXV0aG9yPkFobjwvQXV0aG9yPjxZZWFyPjIw
 MjM8L1llYXI+PFJlY051bT4xPC9SZWNOdW0+PHJlY29yZD48cmVjLW51bWJlcj4xPC9yZWMtbnVt
 YmVyPjxmb3JlaWduLWtleXM+PGtleSBhcHA9IkVOIiBkYi1pZD0ibWRhZTg1MDAxMDk0OTZmZWE0
-YWZmOWMwODZlMTZjYzI1ODk1IiB0aW1lc3RhbXA9IjE3OTMxODU0NzMiPjE8L2tleT48L2ZvcmVp
+YWZmOWMwODZlMTZjYzI1ODk1IiB0aW1lc3RhbXA9IjE3OTMyMTY4MjEiPjE8L2tleT48L2ZvcmVp
 Z24ta2V5cz48cmVmLXR5cGUgbmFtZT0iSm91cm5hbCBBcnRpY2xlIj4xNzwvcmVmLXR5cGU+PGNv
 bnRyaWJ1dG9ycz48YXV0aG9ycz48YXV0aG9yPkFobiwgS2kgVWhuPC9hdXRob3I+PGF1dGhvcj5L
 aW0sIERldWstV29vPC9hdXRob3I+PGF1dGhvcj5DaG8sIEh5dW4gTWk8L2F1dGhvcj48YXV0aG9y
@@ -299,7 +299,7 @@
 aG9yPlpoYW5nPC9BdXRob3I+PFllYXI+MjAyNDwvWWVhcj48UmVjTnVtPjk0PC9SZWNOdW0+PHJl
 Y29yZD48cmVjLW51bWJlcj45NDwvcmVjLW51bWJlcj48Zm9yZWlnbi1rZXlzPjxrZXkgYXBwPSJF
 TiIgZGItaWQ9Im1kYWU4NTAwMTA5NDk2ZmVhNGFmZjljMDg2ZTE2Y2MyNTg5NSIgdGltZXN0YW1w
-PSIxNzkzMTg1NDczIj45NDwva2V5PjwvZm9yZWlnbi1rZXlzPjxyZWYtdHlwZSBuYW1lPSJKb3Vy
+PSIxNzkzMjE2ODIxIj45NDwva2V5PjwvZm9yZWlnbi1rZXlzPjxyZWYtdHlwZSBuYW1lPSJKb3Vy
 bmFsIEFydGljbGUiPjE3PC9yZWYtdHlwZT48Y29udHJpYnV0b3JzPjxhdXRob3JzPjxhdXRob3I+
 WmhhbmcsIExpYW5nPC9hdXRob3I+PGF1dGhvcj5DaGVuLCBaaGVsdW48L2F1dGhvcj48L2F1dGhv
 cnM+PC9jb250cmlidXRvcnM+PHRpdGxlcz48dGl0bGU+TGFyZ2UgbGFuZ3VhZ2UgbW9kZWwtYmFz
@@ -315,7 +315,7 @@
 aXRlPjxDaXRlPjxBdXRob3I+TGl1PC9BdXRob3I+PFllYXI+MjAyNTwvWWVhcj48UmVjTnVtPjUx
 PC9SZWNOdW0+PHJlY29yZD48cmVjLW51bWJlcj41MTwvcmVjLW51bWJlcj48Zm9yZWlnbi1rZXlz
 PjxrZXkgYXBwPSJFTiIgZGItaWQ9Im1kYWU4NTAwMTA5NDk2ZmVhNGFmZjljMDg2ZTE2Y2MyNTg5
-NSIgdGltZXN0YW1wPSIxNzkzMTg1NDczIj41MTwva2V5PjwvZm9yZWlnbi1rZXlzPjxyZWYtdHlw
+NSIgdGltZXN0YW1wPSIxNzkzMjE2ODIxIj41MTwva2V5PjwvZm9yZWlnbi1rZXlzPjxyZWYtdHlw
 ZSBuYW1lPSJKb3VybmFsIEFydGljbGUiPjE3PC9yZWYtdHlwZT48Y29udHJpYnV0b3JzPjxhdXRo
 b3JzPjxhdXRob3I+TGl1LCBNaW5nemhlPC9hdXRob3I+PGF1dGhvcj5aaGFuZywgTGlhbmc8L2F1
 dGhvcj48YXV0aG9yPkNoZW4sIEppYW5saTwvYXV0aG9yPjxhdXRob3I+Q2hlbiwgV2VpLUFuPC9h
@@ -343,7 +343,7 @@
 TnVtPjgzPC9SZWNOdW0+PERpc3BsYXlUZXh0Plsz4oCTNl08L0Rpc3BsYXlUZXh0PjxyZWNvcmQ+
 PHJlYy1udW1iZXI+ODM8L3JlYy1udW1iZXI+PGZvcmVpZ24ta2V5cz48a2V5IGFwcD0iRU4iIGRi
 LWlkPSJtZGFlODUwMDEwOTQ5NmZlYTRhZmY5YzA4NmUxNmNjMjU4OTUiIHRpbWVzdGFtcD0iMTc5
-MzE4NTQ3MyI+ODM8L2tleT48L2ZvcmVpZ24ta2V5cz48cmVmLXR5cGUgbmFtZT0iSm91cm5hbCBB
+MzIxNjgyMSI+ODM8L2tleT48L2ZvcmVpZ24ta2V5cz48cmVmLXR5cGUgbmFtZT0iSm91cm5hbCBB
 cnRpY2xlIj4xNzwvcmVmLXR5cGU+PGNvbnRyaWJ1dG9ycz48YXV0aG9ycz48YXV0aG9yPldhbmcs
 IFpoZTwvYXV0aG9yPjxhdXRob3I+SG9uZywgVGlhbnpoZW48L2F1dGhvcj48L2F1dGhvcnM+PC9j
 b250cmlidXRvcnM+PHRpdGxlcz48dGl0bGU+UmVpbmZvcmNlbWVudCBsZWFybmluZyBmb3IgYnVp
@@ -358,7 +358,7 @@
 Y2UtbnVtPjwvcmVjb3JkPjwvQ2l0ZT48Q2l0ZT48QXV0aG9yPkFobjwvQXV0aG9yPjxZZWFyPjIw
 MjM8L1llYXI+PFJlY051bT4xPC9SZWNOdW0+PHJlY29yZD48cmVjLW51bWJlcj4xPC9yZWMtbnVt
 YmVyPjxmb3JlaWduLWtleXM+PGtleSBhcHA9IkVOIiBkYi1pZD0ibWRhZTg1MDAxMDk0OTZmZWE0
-YWZmOWMwODZlMTZjYzI1ODk1IiB0aW1lc3RhbXA9IjE3OTMxODU0NzMiPjE8L2tleT48L2ZvcmVp
+YWZmOWMwODZlMTZjYzI1ODk1IiB0aW1lc3RhbXA9IjE3OTMyMTY4MjEiPjE8L2tleT48L2ZvcmVp
 Z24ta2V5cz48cmVmLXR5cGUgbmFtZT0iSm91cm5hbCBBcnRpY2xlIj4xNzwvcmVmLXR5cGU+PGNv
 bnRyaWJ1dG9ycz48YXV0aG9ycz48YXV0aG9yPkFobiwgS2kgVWhuPC9hdXRob3I+PGF1dGhvcj5L
 aW0sIERldWstV29vPC9hdXRob3I+PGF1dGhvcj5DaG8sIEh5dW4gTWk8L2F1dGhvcj48YXV0aG9y
@@ -376,7 +376,7 @@
 aG9yPlpoYW5nPC9BdXRob3I+PFllYXI+MjAyNDwvWWVhcj48UmVjTnVtPjk0PC9SZWNOdW0+PHJl
 Y29yZD48cmVjLW51bWJlcj45NDwvcmVjLW51bWJlcj48Zm9yZWlnbi1rZXlzPjxrZXkgYXBwPSJF
 TiIgZGItaWQ9Im1kYWU4NTAwMTA5NDk2ZmVhNGFmZjljMDg2ZTE2Y2MyNTg5NSIgdGltZXN0YW1w
-PSIxNzkzMTg1NDczIj45NDwva2V5PjwvZm9yZWlnbi1rZXlzPjxyZWYtdHlwZSBuYW1lPSJKb3Vy
+PSIxNzkzMjE2ODIxIj45NDwva2V5PjwvZm9yZWlnbi1rZXlzPjxyZWYtdHlwZSBuYW1lPSJKb3Vy
 bmFsIEFydGljbGUiPjE3PC9yZWYtdHlwZT48Y29udHJpYnV0b3JzPjxhdXRob3JzPjxhdXRob3I+
 WmhhbmcsIExpYW5nPC9hdXRob3I+PGF1dGhvcj5DaGVuLCBaaGVsdW48L2F1dGhvcj48L2F1dGhv
 cnM+PC9jb250cmlidXRvcnM+PHRpdGxlcz48dGl0bGU+TGFyZ2UgbGFuZ3VhZ2UgbW9kZWwtYmFz
@@ -392,7 +392,7 @@
 aXRlPjxDaXRlPjxBdXRob3I+TGl1PC9BdXRob3I+PFllYXI+MjAyNTwvWWVhcj48UmVjTnVtPjUx
 PC9SZWNOdW0+PHJlY29yZD48cmVjLW51bWJlcj41MTwvcmVjLW51bWJlcj48Zm9yZWlnbi1rZXlz
 PjxrZXkgYXBwPSJFTiIgZGItaWQ9Im1kYWU4NTAwMTA5NDk2ZmVhNGFmZjljMDg2ZTE2Y2MyNTg5
-NSIgdGltZXN0YW1wPSIxNzkzMTg1NDczIj41MTwva2V5PjwvZm9yZWlnbi1rZXlzPjxyZWYtdHlw
+NSIgdGltZXN0YW1wPSIxNzkzMjE2ODIxIj41MTwva2V5PjwvZm9yZWlnbi1rZXlzPjxyZWYtdHlw
 ZSBuYW1lPSJKb3VybmFsIEFydGljbGUiPjE3PC9yZWYtdHlwZT48Y29udHJpYnV0b3JzPjxhdXRo
 b3JzPjxhdXRob3I+TGl1LCBNaW5nemhlPC9hdXRob3I+PGF1dGhvcj5aaGFuZywgTGlhbmc8L2F1
 dGhvcj48YXV0aG9yPkNoZW4sIEppYW5saTwvYXV0aG9yPjxhdXRob3I+Q2hlbiwgV2VpLUFuPC9h
@@ -438,7 +438,7 @@
 Y051bT4yNjwvUmVjTnVtPjxEaXNwbGF5VGV4dD5bNyw4XTwvRGlzcGxheVRleHQ+PHJlY29yZD48
 cmVjLW51bWJlcj4yNjwvcmVjLW51bWJlcj48Zm9yZWlnbi1rZXlzPjxrZXkgYXBwPSJFTiIgZGIt
 aWQ9Im1kYWU4NTAwMTA5NDk2ZmVhNGFmZjljMDg2ZTE2Y2MyNTg5NSIgdGltZXN0YW1wPSIxNzkz
-MTg1NDczIj4yNjwva2V5PjwvZm9yZWlnbi1rZXlzPjxyZWYtdHlwZSBuYW1lPSJKb3VybmFsIEFy
+MjE2ODIxIj4yNjwva2V5PjwvZm9yZWlnbi1rZXlzPjxyZWYtdHlwZSBuYW1lPSJKb3VybmFsIEFy
 dGljbGUiPjE3PC9yZWYtdHlwZT48Y29udHJpYnV0b3JzPjxhdXRob3JzPjxhdXRob3I+R29tZXMs
 IENsw6F1ZGlvPC9hdXRob3I+PGF1dGhvcj5UaHVsZSwgQ2FzcGVyPC9hdXRob3I+PGF1dGhvcj5C
 cm9tYW4sIERhdmlkPC9hdXRob3I+PGF1dGhvcj5MYXJzZW4sIFBldGVyIEdvcm08L2F1dGhvcj48
@@ -454,7 +454,7 @@
 Yy1yZXNvdXJjZS1udW0+PC9yZWNvcmQ+PC9DaXRlPjxDaXRlPjxBdXRob3I+SG9uZzwvQXV0aG9y
 PjxZZWFyPjIwMTg8L1llYXI+PFJlY051bT4zNDwvUmVjTnVtPjxyZWNvcmQ+PHJlYy1udW1iZXI+
 MzQ8L3JlYy1udW1iZXI+PGZvcmVpZ24ta2V5cz48a2V5IGFwcD0iRU4iIGRiLWlkPSJtZGFlODUw
-MDEwOTQ5NmZlYTRhZmY5YzA4NmUxNmNjMjU4OTUiIHRpbWVzdGFtcD0iMTc5MzE4NTQ3MyI+MzQ8
+MDEwOTQ5NmZlYTRhZmY5YzA4NmUxNmNjMjU4OTUiIHRpbWVzdGFtcD0iMTc5MzIxNjgyMSI+MzQ8
 L2tleT48L2ZvcmVpZ24ta2V5cz48cmVmLXR5cGUgbmFtZT0iSm91cm5hbCBBcnRpY2xlIj4xNzwv
 cmVmLXR5cGU+PGNvbnRyaWJ1dG9ycz48YXV0aG9ycz48YXV0aG9yPkhvbmcsIFRpYW56aGVuPC9h
 dXRob3I+PGF1dGhvcj5MYW5nZXZpbiwgSmFyZWQ8L2F1dGhvcj48YXV0aG9yPlN1biwgS2FpeXU8
@@ -479,7 +479,7 @@
 Y051bT4yNjwvUmVjTnVtPjxEaXNwbGF5VGV4dD5bNyw4XTwvRGlzcGxheVRleHQ+PHJlY29yZD48
 cmVjLW51bWJlcj4yNjwvcmVjLW51bWJlcj48Zm9yZWlnbi1rZXlzPjxrZXkgYXBwPSJFTiIgZGIt
 aWQ9Im1kYWU4NTAwMTA5NDk2ZmVhNGFmZjljMDg2ZTE2Y2MyNTg5NSIgdGltZXN0YW1wPSIxNzkz
-MTg1NDczIj4yNjwva2V5PjwvZm9yZWlnbi1rZXlzPjxyZWYtdHlwZSBuYW1lPSJKb3VybmFsIEFy
+MjE2ODIxIj4yNjwva2V5PjwvZm9yZWlnbi1rZXlzPjxyZWYtdHlwZSBuYW1lPSJKb3VybmFsIEFy
 dGljbGUiPjE3PC9yZWYtdHlwZT48Y29udHJpYnV0b3JzPjxhdXRob3JzPjxhdXRob3I+R29tZXMs
 IENsw6F1ZGlvPC9hdXRob3I+PGF1dGhvcj5UaHVsZSwgQ2FzcGVyPC9hdXRob3I+PGF1dGhvcj5C
 cm9tYW4sIERhdmlkPC9hdXRob3I+PGF1dGhvcj5MYXJzZW4sIFBldGVyIEdvcm08L2F1dGhvcj48
@@ -495,7 +495,7 @@
 Yy1yZXNvdXJjZS1udW0+PC9yZWNvcmQ+PC9DaXRlPjxDaXRlPjxBdXRob3I+SG9uZzwvQXV0aG9y
 PjxZZWFyPjIwMTg8L1llYXI+PFJlY051bT4zNDwvUmVjTnVtPjxyZWNvcmQ+PHJlYy1udW1iZXI+
 MzQ8L3JlYy1udW1iZXI+PGZvcmVpZ24ta2V5cz48a2V5IGFwcD0iRU4iIGRiLWlkPSJtZGFlODUw
-MDEwOTQ5NmZlYTRhZmY5YzA4NmUxNmNjMjU4OTUiIHRpbWVzdGFtcD0iMTc5MzE4NTQ3MyI+MzQ8
+MDEwOTQ5NmZlYTRhZmY5YzA4NmUxNmNjMjU4OTUiIHRpbWVzdGFtcD0iMTc5MzIxNjgyMSI+MzQ8
 L2tleT48L2ZvcmVpZ24ta2V5cz48cmVmLXR5cGUgbmFtZT0iSm91cm5hbCBBcnRpY2xlIj4xNzwv
 cmVmLXR5cGU+PGNvbnRyaWJ1dG9ycz48YXV0aG9ycz48YXV0aG9yPkhvbmcsIFRpYW56aGVuPC9h
 dXRob3I+PGF1dGhvcj5MYW5nZXZpbiwgSmFyZWQ8L2F1dGhvcj48YXV0aG9yPlN1biwgS2FpeXU8
@@ -546,7 +546,7 @@
 PjxSZWNOdW0+NjwvUmVjTnVtPjxEaXNwbGF5VGV4dD5bOSwxMF08L0Rpc3BsYXlUZXh0PjxyZWNv
 cmQ+PHJlYy1udW1iZXI+NjwvcmVjLW51bWJlcj48Zm9yZWlnbi1rZXlzPjxrZXkgYXBwPSJFTiIg
 ZGItaWQ9Im1kYWU4NTAwMTA5NDk2ZmVhNGFmZjljMDg2ZTE2Y2MyNTg5NSIgdGltZXN0YW1wPSIx
-NzkzMTg1NDczIj42PC9rZXk+PC9mb3JlaWduLWtleXM+PHJlZi10eXBlIG5hbWU9IkNvbmZlcmVu
+NzkzMjE2ODIxIj42PC9rZXk+PC9mb3JlaWduLWtleXM+PHJlZi10eXBlIG5hbWU9IkNvbmZlcmVu
 Y2UgUGFwZXIiPjQ3PC9yZWYtdHlwZT48Y29udHJpYnV0b3JzPjxhdXRob3JzPjxhdXRob3I+Qmxv
 Y2h3aXR6LCBULjwvYXV0aG9yPjxhdXRob3I+T3R0ZXIsIE0uPC9hdXRob3I+PGF1dGhvcj5Bcm5v
 bGQsIE0uPC9hdXRob3I+PGF1dGhvcj5CYXVzY2gsIEMuPC9hdXRob3I+PGF1dGhvcj5DbGF1c3Ms
@@ -567,7 +567,7 @@
 aXRlPjxDaXRlPjxBdXRob3I+SnVuZ2hhbm5zPC9BdXRob3I+PFllYXI+MjAyMTwvWWVhcj48UmVj
 TnVtPjQyPC9SZWNOdW0+PHJlY29yZD48cmVjLW51bWJlcj40MjwvcmVjLW51bWJlcj48Zm9yZWln
 bi1rZXlzPjxrZXkgYXBwPSJFTiIgZGItaWQ9Im1kYWU4NTAwMTA5NDk2ZmVhNGFmZjljMDg2ZTE2
-Y2MyNTg5NSIgdGltZXN0YW1wPSIxNzkzMTg1NDczIj40Mjwva2V5PjwvZm9yZWlnbi1rZXlzPjxy
+Y2MyNTg5NSIgdGltZXN0YW1wPSIxNzkzMjE2ODIxIj40Mjwva2V5PjwvZm9yZWlnbi1rZXlzPjxy
 ZWYtdHlwZSBuYW1lPSJDb25mZXJlbmNlIFBhcGVyIj40NzwvcmVmLXR5cGU+PGNvbnRyaWJ1dG9y
 cz48YXV0aG9ycz48YXV0aG9yPkp1bmdoYW5ucywgQW5kcmVhczwvYXV0aG9yPjxhdXRob3I+Qmxv
 Y2h3aXR6LCBUb3JzdGVuPC9hdXRob3I+PGF1dGhvcj5CZXJ0c2NoLCBDaHJpc3RpYW48L2F1dGhv
@@ -598,7 +598,7 @@
 PjxSZWNOdW0+NjwvUmVjTnVtPjxEaXNwbGF5VGV4dD5bOSwxMF08L0Rpc3BsYXlUZXh0PjxyZWNv
 cmQ+PHJlYy1udW1iZXI+NjwvcmVjLW51bWJlcj48Zm9yZWlnbi1rZXlzPjxrZXkgYXBwPSJFTiIg
 ZGItaWQ9Im1kYWU4NTAwMTA5NDk2ZmVhNGFmZjljMDg2ZTE2Y2MyNTg5NSIgdGltZXN0YW1wPSIx
-NzkzMTg1NDczIj42PC9rZXk+PC9mb3JlaWduLWtleXM+PHJlZi10eXBlIG5hbWU9IkNvbmZlcmVu
+NzkzMjE2ODIxIj42PC9rZXk+PC9mb3JlaWduLWtleXM+PHJlZi10eXBlIG5hbWU9IkNvbmZlcmVu
 Y2UgUGFwZXIiPjQ3PC9yZWYtdHlwZT48Y29udHJpYnV0b3JzPjxhdXRob3JzPjxhdXRob3I+Qmxv
 Y2h3aXR6LCBULjwvYXV0aG9yPjxhdXRob3I+T3R0ZXIsIE0uPC9hdXRob3I+PGF1dGhvcj5Bcm5v
 bGQsIE0uPC9hdXRob3I+PGF1dGhvcj5CYXVzY2gsIEMuPC9hdXRob3I+PGF1dGhvcj5DbGF1c3Ms
@@ -619,7 +619,7 @@
 aXRlPjxDaXRlPjxBdXRob3I+SnVuZ2hhbm5zPC9BdXRob3I+PFllYXI+MjAyMTwvWWVhcj48UmVj
 TnVtPjQyPC9SZWNOdW0+PHJlY29yZD48cmVjLW51bWJlcj40MjwvcmVjLW51bWJlcj48Zm9yZWln
 bi1rZXlzPjxrZXkgYXBwPSJFTiIgZGItaWQ9Im1kYWU4NTAwMTA5NDk2ZmVhNGFmZjljMDg2ZTE2
-Y2MyNTg5NSIgdGltZXN0YW1wPSIxNzkzMTg1NDczIj40Mjwva2V5PjwvZm9yZWlnbi1rZXlzPjxy
+Y2MyNTg5NSIgdGltZXN0YW1wPSIxNzkzMjE2ODIxIj40Mjwva2V5PjwvZm9yZWlnbi1rZXlzPjxy
 ZWYtdHlwZSBuYW1lPSJDb25mZXJlbmNlIFBhcGVyIj40NzwvcmVmLXR5cGU+PGNvbnRyaWJ1dG9y
 cz48YXV0aG9ycz48YXV0aG9yPkp1bmdoYW5ucywgQW5kcmVhczwvYXV0aG9yPjxhdXRob3I+Qmxv
 Y2h3aXR6LCBUb3JzdGVuPC9hdXRob3I+PGF1dGhvcj5CZXJ0c2NoLCBDaHJpc3RpYW48L2F1dGhv
@@ -668,7 +668,7 @@
 ZWNOdW0+ODU8L1JlY051bT48RGlzcGxheVRleHQ+WzExLDEyXTwvRGlzcGxheVRleHQ+PHJlY29y
 ZD48cmVjLW51bWJlcj44NTwvcmVjLW51bWJlcj48Zm9yZWlnbi1rZXlzPjxrZXkgYXBwPSJFTiIg
 ZGItaWQ9Im1kYWU4NTAwMTA5NDk2ZmVhNGFmZjljMDg2ZTE2Y2MyNTg5NSIgdGltZXN0YW1wPSIx
-NzkzMTg1NDczIj44NTwva2V5PjwvZm9yZWlnbi1rZXlzPjxyZWYtdHlwZSBuYW1lPSJKb3VybmFs
+NzkzMjE2ODIxIj44NTwva2V5PjwvZm9yZWlnbi1rZXlzPjxyZWYtdHlwZSBuYW1lPSJKb3VybmFs
 IEFydGljbGUiPjE3PC9yZWYtdHlwZT48Y29udHJpYnV0b3JzPjxhdXRob3JzPjxhdXRob3I+V2V0
 dGVyLCBNaWNoYWVsPC9hdXRob3I+PC9hdXRob3JzPjwvY29udHJpYnV0b3JzPjx0aXRsZXM+PHRp
 dGxlPkNvLXNpbXVsYXRpb24gb2YgYnVpbGRpbmcgZW5lcmd5IGFuZCBjb250cm9sIHN5c3RlbXMg
@@ -685,7 +685,7 @@
 L3JlY29yZD48L0NpdGU+PENpdGU+PEF1dGhvcj5Ob3VpZHVpPC9BdXRob3I+PFllYXI+MjAxNDwv
 WWVhcj48UmVjTnVtPjU5PC9SZWNOdW0+PHJlY29yZD48cmVjLW51bWJlcj41OTwvcmVjLW51bWJl
 cj48Zm9yZWlnbi1rZXlzPjxrZXkgYXBwPSJFTiIgZGItaWQ9Im1kYWU4NTAwMTA5NDk2ZmVhNGFm
-ZjljMDg2ZTE2Y2MyNTg5NSIgdGltZXN0YW1wPSIxNzkzMTg1NDczIj41OTwva2V5PjwvZm9yZWln
+ZjljMDg2ZTE2Y2MyNTg5NSIgdGltZXN0YW1wPSIxNzkzMjE2ODIxIj41OTwva2V5PjwvZm9yZWln
 bi1rZXlzPjxyZWYtdHlwZSBuYW1lPSJKb3VybmFsIEFydGljbGUiPjE3PC9yZWYtdHlwZT48Y29u
 dHJpYnV0b3JzPjxhdXRob3JzPjxhdXRob3I+Tm91aWR1aSwgVGhpZXJyeTwvYXV0aG9yPjxhdXRo
 b3I+V2V0dGVyLCBNaWNoYWVsPC9hdXRob3I+PGF1dGhvcj5adW8sIFdhbmdkYTwvYXV0aG9yPjwv
@@ -712,7 +712,7 @@
 ZWNOdW0+ODU8L1JlY051bT48RGlzcGxheVRleHQ+WzExLDEyXTwvRGlzcGxheVRleHQ+PHJlY29y
 ZD48cmVjLW51bWJlcj44NTwvcmVjLW51bWJlcj48Zm9yZWlnbi1rZXlzPjxrZXkgYXBwPSJFTiIg
 ZGItaWQ9Im1kYWU4NTAwMTA5NDk2ZmVhNGFmZjljMDg2ZTE2Y2MyNTg5NSIgdGltZXN0YW1wPSIx
-NzkzMTg1NDczIj44NTwva2V5PjwvZm9yZWlnbi1rZXlzPjxyZWYtdHlwZSBuYW1lPSJKb3VybmFs
+NzkzMjE2ODIxIj44NTwva2V5PjwvZm9yZWlnbi1rZXlzPjxyZWYtdHlwZSBuYW1lPSJKb3VybmFs
 IEFydGljbGUiPjE3PC9yZWYtdHlwZT48Y29udHJpYnV0b3JzPjxhdXRob3JzPjxhdXRob3I+V2V0
 dGVyLCBNaWNoYWVsPC9hdXRob3I+PC9hdXRob3JzPjwvY29udHJpYnV0b3JzPjx0aXRsZXM+PHRp
 dGxlPkNvLXNpbXVsYXRpb24gb2YgYnVpbGRpbmcgZW5lcmd5IGFuZCBjb250cm9sIHN5c3RlbXMg
@@ -729,7 +729,7 @@
 L3JlY29yZD48L0NpdGU+PENpdGU+PEF1dGhvcj5Ob3VpZHVpPC9BdXRob3I+PFllYXI+MjAxNDwv
 WWVhcj48UmVjTnVtPjU5PC9SZWNOdW0+PHJlY29yZD48cmVjLW51bWJlcj41OTwvcmVjLW51bWJl
 cj48Zm9yZWlnbi1rZXlzPjxrZXkgYXBwPSJFTiIgZGItaWQ9Im1kYWU4NTAwMTA5NDk2ZmVhNGFm
-ZjljMDg2ZTE2Y2MyNTg5NSIgdGltZXN0YW1wPSIxNzkzMTg1NDczIj41OTwva2V5PjwvZm9yZWln
+ZjljMDg2ZTE2Y2MyNTg5NSIgdGltZXN0YW1wPSIxNzkzMjE2ODIxIj41OTwva2V5PjwvZm9yZWln
 bi1rZXlzPjxyZWYtdHlwZSBuYW1lPSJKb3VybmFsIEFydGljbGUiPjE3PC9yZWYtdHlwZT48Y29u
 dHJpYnV0b3JzPjxhdXRob3JzPjxhdXRob3I+Tm91aWR1aSwgVGhpZXJyeTwvYXV0aG9yPjxhdXRo
 b3I+V2V0dGVyLCBNaWNoYWVsPC9hdXRob3I+PGF1dGhvcj5adW8sIFdhbmdkYTwvYXV0aG9yPjwv
@@ -772,7 +772,7 @@
         <w:fldChar w:fldCharType="begin"/>
       </w:r>
       <w:r>
-        <w:instrText xml:space="preserve"> ADDIN EN.CITE &lt;EndNote&gt;&lt;Cite&gt;&lt;Author&gt;Wetter&lt;/Author&gt;&lt;Year&gt;2020&lt;/Year&gt;&lt;RecNum&gt;86&lt;/RecNum&gt;&lt;DisplayText&gt;[13]&lt;/DisplayText&gt;&lt;record&gt;&lt;rec-number&gt;86&lt;/rec-number&gt;&lt;foreign-keys&gt;&lt;key app="EN" db-id="mdae8500109496fea4aff9c086e16cc25895" timestamp="1793185473"&gt;86&lt;/key&gt;&lt;/foreign-keys&gt;&lt;ref-type name="Conference Paper"&gt;47&lt;/ref-type&gt;&lt;contributors&gt;&lt;authors&gt;&lt;author&gt;Wetter, Michael&lt;/author&gt;&lt;author&gt;Benne, Kyle&lt;/author&gt;&lt;author&gt;Gautier, Antoine&lt;/author&gt;&lt;author&gt;Nouidui, Thierry S.&lt;/author&gt;&lt;author&gt;Ramle, Agnes&lt;/author&gt;&lt;author&gt;Roth, Amir&lt;/author&gt;&lt;author&gt;Tummescheit, Hubertus&lt;/author&gt;&lt;author&gt;Mentzer, Stuart&lt;/author&gt;&lt;author&gt;Winther, Christian&lt;/author&gt;&lt;/authors&gt;&lt;/contributors&gt;&lt;titles&gt;&lt;title&gt;Lifting the Garage Door on Spawn, an Open-Source BEM-Controls Engine&lt;/title&gt;&lt;secondary-title&gt;Proceedings of SimBuild Conference 2020, ASHRAE/IBPSA-USA Building Simulation Conference&lt;/secondary-title&gt;&lt;/titles&gt;&lt;volume&gt;9&lt;/volume&gt;&lt;dates&gt;&lt;year&gt;2020&lt;/year&gt;&lt;/dates&gt;&lt;publisher&gt;IBPSA-USA&lt;/publisher&gt;&lt;label&gt;wetter2020&lt;/label&gt;&lt;urls&gt;&lt;/urls&gt;&lt;electronic-resource-num&gt;10.26868/25746308.2020.C063&lt;/electronic-resource-num&gt;&lt;/record&gt;&lt;/Cite&gt;&lt;/EndNote&gt;</w:instrText>
+        <w:instrText xml:space="preserve"> ADDIN EN.CITE &lt;EndNote&gt;&lt;Cite&gt;&lt;Author&gt;Wetter&lt;/Author&gt;&lt;Year&gt;2020&lt;/Year&gt;&lt;RecNum&gt;86&lt;/RecNum&gt;&lt;DisplayText&gt;[13]&lt;/DisplayText&gt;&lt;record&gt;&lt;rec-number&gt;86&lt;/rec-number&gt;&lt;foreign-keys&gt;&lt;key app="EN" db-id="mdae8500109496fea4aff9c086e16cc25895" timestamp="1793216821"&gt;86&lt;/key&gt;&lt;/foreign-keys&gt;&lt;ref-type name="Conference Paper"&gt;47&lt;/ref-type&gt;&lt;contributors&gt;&lt;authors&gt;&lt;author&gt;Wetter, Michael&lt;/author&gt;&lt;author&gt;Benne, Kyle&lt;/author&gt;&lt;author&gt;Gautier, Antoine&lt;/author&gt;&lt;author&gt;Nouidui, Thierry S.&lt;/author&gt;&lt;author&gt;Ramle, Agnes&lt;/author&gt;&lt;author&gt;Roth, Amir&lt;/author&gt;&lt;author&gt;Tummescheit, Hubertus&lt;/author&gt;&lt;author&gt;Mentzer, Stuart&lt;/author&gt;&lt;author&gt;Winther, Christian&lt;/author&gt;&lt;/authors&gt;&lt;/contributors&gt;&lt;titles&gt;&lt;title&gt;Lifting the Garage Door on Spawn, an Open-Source BEM-Controls Engine&lt;/title&gt;&lt;secondary-title&gt;Proceedings of SimBuild Conference 2020, ASHRAE/IBPSA-USA Building Simulation Conference&lt;/secondary-title&gt;&lt;/titles&gt;&lt;volume&gt;9&lt;/volume&gt;&lt;dates&gt;&lt;year&gt;2020&lt;/year&gt;&lt;/dates&gt;&lt;publisher&gt;IBPSA-USA&lt;/publisher&gt;&lt;label&gt;wetter2020&lt;/label&gt;&lt;urls&gt;&lt;/urls&gt;&lt;electronic-resource-num&gt;10.26868/25746308.2020.C063&lt;/electronic-resource-num&gt;&lt;/record&gt;&lt;/Cite&gt;&lt;/EndNote&gt;</w:instrText>
       </w:r>
       <w:r>
         <w:fldChar w:fldCharType="separate"/>
@@ -795,7 +795,7 @@
 PC9ZZWFyPjxSZWNOdW0+NDE8L1JlY051bT48RGlzcGxheVRleHQ+WzE04oCTMTZdPC9EaXNwbGF5
 VGV4dD48cmVjb3JkPjxyZWMtbnVtYmVyPjQxPC9yZWMtbnVtYmVyPjxmb3JlaWduLWtleXM+PGtl
 eSBhcHA9IkVOIiBkYi1pZD0ibWRhZTg1MDAxMDk0OTZmZWE0YWZmOWMwODZlMTZjYzI1ODk1IiB0
-aW1lc3RhbXA9IjE3OTMxODU0NzMiPjQxPC9rZXk+PC9mb3JlaWduLWtleXM+PHJlZi10eXBlIG5h
+aW1lc3RhbXA9IjE3OTMyMTY4MjEiPjQxPC9rZXk+PC9mb3JlaWduLWtleXM+PHJlZi10eXBlIG5h
 bWU9IkNvbmZlcmVuY2UgUGFwZXIiPjQ3PC9yZWYtdHlwZT48Y29udHJpYnV0b3JzPjxhdXRob3Jz
 PjxhdXRob3I+Smltw6luZXotUmFib3NvLCBKYXZpZXI8L2F1dGhvcj48YXV0aG9yPkNhbXBveS1O
 aWV2ZXMsIEFsZWphbmRybzwvYXV0aG9yPjxhdXRob3I+TWFuamF2YWNhcy1MdWNhcywgQW50b25p
@@ -813,8 +813,8 @@
 dHJvbmljLXJlc291cmNlLW51bT48L3JlY29yZD48L0NpdGU+PENpdGU+PEF1dGhvcj5aaGFuZzwv
 QXV0aG9yPjxZZWFyPjIwMjA8L1llYXI+PFJlY051bT45MDwvUmVjTnVtPjxyZWNvcmQ+PHJlYy1u
 dW1iZXI+OTA8L3JlYy1udW1iZXI+PGZvcmVpZ24ta2V5cz48a2V5IGFwcD0iRU4iIGRiLWlkPSJt
-ZGFlODUwMDEwOTQ5NmZlYTRhZmY5YzA4NmUxNmNjMjU4OTUiIHRpbWVzdGFtcD0iMTc5MzE4NTQ3
-MyI+OTA8L2tleT48L2ZvcmVpZ24ta2V5cz48cmVmLXR5cGUgbmFtZT0iQ29uZmVyZW5jZSBQYXBl
+ZGFlODUwMDEwOTQ5NmZlYTRhZmY5YzA4NmUxNmNjMjU4OTUiIHRpbWVzdGFtcD0iMTc5MzIxNjgy
+MSI+OTA8L2tleT48L2ZvcmVpZ24ta2V5cz48cmVmLXR5cGUgbmFtZT0iQ29uZmVyZW5jZSBQYXBl
 ciI+NDc8L3JlZi10eXBlPjxjb250cmlidXRvcnM+PGF1dGhvcnM+PGF1dGhvcj5aaGFuZywgVGlh
 bnl1PC9hdXRob3I+PGF1dGhvcj5BcmRha2FuaWFuLCBPbWlkPC9hdXRob3I+PC9hdXRob3JzPjwv
 Y29udHJpYnV0b3JzPjx0aXRsZXM+PHRpdGxlPkNPQlM6IENPbXByZWhlbnNpdmUgQnVpbGRpbmcg
@@ -829,7 +829,7 @@
 PjxDaXRlPjxBdXRob3I+Qmx1bTwvQXV0aG9yPjxZZWFyPjIwMjE8L1llYXI+PFJlY051bT43PC9S
 ZWNOdW0+PHJlY29yZD48cmVjLW51bWJlcj43PC9yZWMtbnVtYmVyPjxmb3JlaWduLWtleXM+PGtl
 eSBhcHA9IkVOIiBkYi1pZD0ibWRhZTg1MDAxMDk0OTZmZWE0YWZmOWMwODZlMTZjYzI1ODk1IiB0
-aW1lc3RhbXA9IjE3OTMxODU0NzMiPjc8L2tleT48L2ZvcmVpZ24ta2V5cz48cmVmLXR5cGUgbmFt
+aW1lc3RhbXA9IjE3OTMyMTY4MjEiPjc8L2tleT48L2ZvcmVpZ24ta2V5cz48cmVmLXR5cGUgbmFt
 ZT0iSm91cm5hbCBBcnRpY2xlIj4xNzwvcmVmLXR5cGU+PGNvbnRyaWJ1dG9ycz48YXV0aG9ycz48
 YXV0aG9yPkJsdW0sIERhdmlkPC9hdXRob3I+PGF1dGhvcj5BcnJveW8sIEphdmllcjwvYXV0aG9y
 PjxhdXRob3I+SHVhbmcsIFNlbjwvYXV0aG9yPjxhdXRob3I+RHJnb8WIYSwgSsOhbjwvYXV0aG9y
@@ -861,7 +861,7 @@
 PC9ZZWFyPjxSZWNOdW0+NDE8L1JlY051bT48RGlzcGxheVRleHQ+WzE04oCTMTZdPC9EaXNwbGF5
 VGV4dD48cmVjb3JkPjxyZWMtbnVtYmVyPjQxPC9yZWMtbnVtYmVyPjxmb3JlaWduLWtleXM+PGtl
 eSBhcHA9IkVOIiBkYi1pZD0ibWRhZTg1MDAxMDk0OTZmZWE0YWZmOWMwODZlMTZjYzI1ODk1IiB0
-aW1lc3RhbXA9IjE3OTMxODU0NzMiPjQxPC9rZXk+PC9mb3JlaWduLWtleXM+PHJlZi10eXBlIG5h
+aW1lc3RhbXA9IjE3OTMyMTY4MjEiPjQxPC9rZXk+PC9mb3JlaWduLWtleXM+PHJlZi10eXBlIG5h
 bWU9IkNvbmZlcmVuY2UgUGFwZXIiPjQ3PC9yZWYtdHlwZT48Y29udHJpYnV0b3JzPjxhdXRob3Jz
 PjxhdXRob3I+Smltw6luZXotUmFib3NvLCBKYXZpZXI8L2F1dGhvcj48YXV0aG9yPkNhbXBveS1O
 aWV2ZXMsIEFsZWphbmRybzwvYXV0aG9yPjxhdXRob3I+TWFuamF2YWNhcy1MdWNhcywgQW50b25p
@@ -879,8 +879,8 @@
 dHJvbmljLXJlc291cmNlLW51bT48L3JlY29yZD48L0NpdGU+PENpdGU+PEF1dGhvcj5aaGFuZzwv
 QXV0aG9yPjxZZWFyPjIwMjA8L1llYXI+PFJlY051bT45MDwvUmVjTnVtPjxyZWNvcmQ+PHJlYy1u
 dW1iZXI+OTA8L3JlYy1udW1iZXI+PGZvcmVpZ24ta2V5cz48a2V5IGFwcD0iRU4iIGRiLWlkPSJt
-ZGFlODUwMDEwOTQ5NmZlYTRhZmY5YzA4NmUxNmNjMjU4OTUiIHRpbWVzdGFtcD0iMTc5MzE4NTQ3
-MyI+OTA8L2tleT48L2ZvcmVpZ24ta2V5cz48cmVmLXR5cGUgbmFtZT0iQ29uZmVyZW5jZSBQYXBl
+ZGFlODUwMDEwOTQ5NmZlYTRhZmY5YzA4NmUxNmNjMjU4OTUiIHRpbWVzdGFtcD0iMTc5MzIxNjgy
+MSI+OTA8L2tleT48L2ZvcmVpZ24ta2V5cz48cmVmLXR5cGUgbmFtZT0iQ29uZmVyZW5jZSBQYXBl
 ciI+NDc8L3JlZi10eXBlPjxjb250cmlidXRvcnM+PGF1dGhvcnM+PGF1dGhvcj5aaGFuZywgVGlh
 bnl1PC9hdXRob3I+PGF1dGhvcj5BcmRha2FuaWFuLCBPbWlkPC9hdXRob3I+PC9hdXRob3JzPjwv
 Y29udHJpYnV0b3JzPjx0aXRsZXM+PHRpdGxlPkNPQlM6IENPbXByZWhlbnNpdmUgQnVpbGRpbmcg
@@ -895,7 +895,7 @@
 PjxDaXRlPjxBdXRob3I+Qmx1bTwvQXV0aG9yPjxZZWFyPjIwMjE8L1llYXI+PFJlY051bT43PC9S
 ZWNOdW0+PHJlY29yZD48cmVjLW51bWJlcj43PC9yZWMtbnVtYmVyPjxmb3JlaWduLWtleXM+PGtl
 eSBhcHA9IkVOIiBkYi1pZD0ibWRhZTg1MDAxMDk0OTZmZWE0YWZmOWMwODZlMTZjYzI1ODk1IiB0
-aW1lc3RhbXA9IjE3OTMxODU0NzMiPjc8L2tleT48L2ZvcmVpZ24ta2V5cz48cmVmLXR5cGUgbmFt
+aW1lc3RhbXA9IjE3OTMyMTY4MjEiPjc8L2tleT48L2ZvcmVpZ24ta2V5cz48cmVmLXR5cGUgbmFt
 ZT0iSm91cm5hbCBBcnRpY2xlIj4xNzwvcmVmLXR5cGU+PGNvbnRyaWJ1dG9ycz48YXV0aG9ycz48
 YXV0aG9yPkJsdW0sIERhdmlkPC9hdXRob3I+PGF1dGhvcj5BcnJveW8sIEphdmllcjwvYXV0aG9y
 PjxhdXRob3I+SHVhbmcsIFNlbjwvYXV0aG9yPjxhdXRob3I+RHJnb8WIYSwgSsOhbjwvYXV0aG9y
@@ -945,7 +945,7 @@
 cj48UmVjTnVtPjY4PC9SZWNOdW0+PERpc3BsYXlUZXh0PlsxN+KAkzIwXTwvRGlzcGxheVRleHQ+
 PHJlY29yZD48cmVjLW51bWJlcj42ODwvcmVjLW51bWJlcj48Zm9yZWlnbi1rZXlzPjxrZXkgYXBw
 PSJFTiIgZGItaWQ9Im1kYWU4NTAwMTA5NDk2ZmVhNGFmZjljMDg2ZTE2Y2MyNTg5NSIgdGltZXN0
-YW1wPSIxNzkzMTg1NDczIj42ODwva2V5PjwvZm9yZWlnbi1rZXlzPjxyZWYtdHlwZSBuYW1lPSJD
+YW1wPSIxNzkzMjE2ODIxIj42ODwva2V5PjwvZm9yZWlnbi1rZXlzPjxyZWYtdHlwZSBuYW1lPSJD
 b25mZXJlbmNlIFBhcGVyIj40NzwvcmVmLXR5cGU+PGNvbnRyaWJ1dG9ycz48YXV0aG9ycz48YXV0
 aG9yPlBhbG1pbnRpZXIsIEJyeWFuPC9hdXRob3I+PGF1dGhvcj5LcmlzaG5hbXVydGh5LCBEaGVl
 cGFrPC9hdXRob3I+PGF1dGhvcj5Ub3AsIFBoaWxpcDwvYXV0aG9yPjxhdXRob3I+U21pdGgsIFN0
@@ -963,7 +963,7 @@
 SGFyZHk8L0F1dGhvcj48WWVhcj4yMDI0PC9ZZWFyPjxSZWNOdW0+Mjk8L1JlY051bT48cmVjb3Jk
 PjxyZWMtbnVtYmVyPjI5PC9yZWMtbnVtYmVyPjxmb3JlaWduLWtleXM+PGtleSBhcHA9IkVOIiBk
 Yi1pZD0ibWRhZTg1MDAxMDk0OTZmZWE0YWZmOWMwODZlMTZjYzI1ODk1IiB0aW1lc3RhbXA9IjE3
-OTMxODU0NzMiPjI5PC9rZXk+PC9mb3JlaWduLWtleXM+PHJlZi10eXBlIG5hbWU9IkpvdXJuYWwg
+OTMyMTY4MjEiPjI5PC9rZXk+PC9mb3JlaWduLWtleXM+PHJlZi10eXBlIG5hbWU9IkpvdXJuYWwg
 QXJ0aWNsZSI+MTc8L3JlZi10eXBlPjxjb250cmlidXRvcnM+PGF1dGhvcnM+PGF1dGhvcj5IYXJk
 eSwgVHJldm9yIEQuPC9hdXRob3I+PGF1dGhvcj5QYWxtaW50aWVyLCBCcnlhbjwvYXV0aG9yPjxh
 dXRob3I+VG9wLCBQaGlsaXAgTC48L2F1dGhvcj48YXV0aG9yPktyaXNobmFtdXJ0aHksIERoZWVw
@@ -980,7 +980,7 @@
 PC9yZWNvcmQ+PC9DaXRlPjxDaXRlPjxBdXRob3I+U3RlaW5icmluazwvQXV0aG9yPjxZZWFyPjIw
 MTk8L1llYXI+PFJlY051bT43ODwvUmVjTnVtPjxyZWNvcmQ+PHJlYy1udW1iZXI+Nzg8L3JlYy1u
 dW1iZXI+PGZvcmVpZ24ta2V5cz48a2V5IGFwcD0iRU4iIGRiLWlkPSJtZGFlODUwMDEwOTQ5NmZl
-YTRhZmY5YzA4NmUxNmNjMjU4OTUiIHRpbWVzdGFtcD0iMTc5MzE4NTQ3MyI+Nzg8L2tleT48L2Zv
+YTRhZmY5YzA4NmUxNmNjMjU4OTUiIHRpbWVzdGFtcD0iMTc5MzIxNjgyMSI+Nzg8L2tleT48L2Zv
 cmVpZ24ta2V5cz48cmVmLXR5cGUgbmFtZT0iSm91cm5hbCBBcnRpY2xlIj4xNzwvcmVmLXR5cGU+
 PGNvbnRyaWJ1dG9ycz48YXV0aG9ycz48YXV0aG9yPlN0ZWluYnJpbmssIENvcm5lbGl1czwvYXV0
 aG9yPjxhdXRob3I+QmxhbmstQmFiYXphZGVoLCBNYXJpdGE8L2F1dGhvcj48YXV0aG9yPkVsLUFt
@@ -1002,7 +1002,7 @@
 Y29yZD48L0NpdGU+PENpdGU+PEF1dGhvcj5PZmVubG9jaDwvQXV0aG9yPjxZZWFyPjIwMjI8L1ll
 YXI+PFJlY051bT42MjwvUmVjTnVtPjxyZWNvcmQ+PHJlYy1udW1iZXI+NjI8L3JlYy1udW1iZXI+
 PGZvcmVpZ24ta2V5cz48a2V5IGFwcD0iRU4iIGRiLWlkPSJtZGFlODUwMDEwOTQ5NmZlYTRhZmY5
-YzA4NmUxNmNjMjU4OTUiIHRpbWVzdGFtcD0iMTc5MzE4NTQ3MyI+NjI8L2tleT48L2ZvcmVpZ24t
+YzA4NmUxNmNjMjU4OTUiIHRpbWVzdGFtcD0iMTc5MzIxNjgyMSI+NjI8L2tleT48L2ZvcmVpZ24t
 a2V5cz48cmVmLXR5cGUgbmFtZT0iQ29uZmVyZW5jZSBQYXBlciI+NDc8L3JlZi10eXBlPjxjb250
 cmlidXRvcnM+PGF1dGhvcnM+PGF1dGhvcj5PZmVubG9jaCwgQW5uaWthPC9hdXRob3I+PGF1dGhv
 cj5TY2h3YXJ6LCBKYW4gU8O2cmVuPC9hdXRob3I+PGF1dGhvcj5Ub2xrLCBEZWJvcmFoPC9hdXRo
@@ -1029,7 +1029,7 @@
 cj48UmVjTnVtPjY4PC9SZWNOdW0+PERpc3BsYXlUZXh0PlsxN+KAkzIwXTwvRGlzcGxheVRleHQ+
 PHJlY29yZD48cmVjLW51bWJlcj42ODwvcmVjLW51bWJlcj48Zm9yZWlnbi1rZXlzPjxrZXkgYXBw
 PSJFTiIgZGItaWQ9Im1kYWU4NTAwMTA5NDk2ZmVhNGFmZjljMDg2ZTE2Y2MyNTg5NSIgdGltZXN0
-YW1wPSIxNzkzMTg1NDczIj42ODwva2V5PjwvZm9yZWlnbi1rZXlzPjxyZWYtdHlwZSBuYW1lPSJD
+YW1wPSIxNzkzMjE2ODIxIj42ODwva2V5PjwvZm9yZWlnbi1rZXlzPjxyZWYtdHlwZSBuYW1lPSJD
 b25mZXJlbmNlIFBhcGVyIj40NzwvcmVmLXR5cGU+PGNvbnRyaWJ1dG9ycz48YXV0aG9ycz48YXV0
 aG9yPlBhbG1pbnRpZXIsIEJyeWFuPC9hdXRob3I+PGF1dGhvcj5LcmlzaG5hbXVydGh5LCBEaGVl
 cGFrPC9hdXRob3I+PGF1dGhvcj5Ub3AsIFBoaWxpcDwvYXV0aG9yPjxhdXRob3I+U21pdGgsIFN0
@@ -1047,7 +1047,7 @@
 SGFyZHk8L0F1dGhvcj48WWVhcj4yMDI0PC9ZZWFyPjxSZWNOdW0+Mjk8L1JlY051bT48cmVjb3Jk
 PjxyZWMtbnVtYmVyPjI5PC9yZWMtbnVtYmVyPjxmb3JlaWduLWtleXM+PGtleSBhcHA9IkVOIiBk
 Yi1pZD0ibWRhZTg1MDAxMDk0OTZmZWE0YWZmOWMwODZlMTZjYzI1ODk1IiB0aW1lc3RhbXA9IjE3
-OTMxODU0NzMiPjI5PC9rZXk+PC9mb3JlaWduLWtleXM+PHJlZi10eXBlIG5hbWU9IkpvdXJuYWwg
+OTMyMTY4MjEiPjI5PC9rZXk+PC9mb3JlaWduLWtleXM+PHJlZi10eXBlIG5hbWU9IkpvdXJuYWwg
 QXJ0aWNsZSI+MTc8L3JlZi10eXBlPjxjb250cmlidXRvcnM+PGF1dGhvcnM+PGF1dGhvcj5IYXJk
 eSwgVHJldm9yIEQuPC9hdXRob3I+PGF1dGhvcj5QYWxtaW50aWVyLCBCcnlhbjwvYXV0aG9yPjxh
 dXRob3I+VG9wLCBQaGlsaXAgTC48L2F1dGhvcj48YXV0aG9yPktyaXNobmFtdXJ0aHksIERoZWVw
@@ -1064,7 +1064,7 @@
 PC9yZWNvcmQ+PC9DaXRlPjxDaXRlPjxBdXRob3I+U3RlaW5icmluazwvQXV0aG9yPjxZZWFyPjIw
 MTk8L1llYXI+PFJlY051bT43ODwvUmVjTnVtPjxyZWNvcmQ+PHJlYy1udW1iZXI+Nzg8L3JlYy1u
 dW1iZXI+PGZvcmVpZ24ta2V5cz48a2V5IGFwcD0iRU4iIGRiLWlkPSJtZGFlODUwMDEwOTQ5NmZl
-YTRhZmY5YzA4NmUxNmNjMjU4OTUiIHRpbWVzdGFtcD0iMTc5MzE4NTQ3MyI+Nzg8L2tleT48L2Zv
+YTRhZmY5YzA4NmUxNmNjMjU4OTUiIHRpbWVzdGFtcD0iMTc5MzIxNjgyMSI+Nzg8L2tleT48L2Zv
 cmVpZ24ta2V5cz48cmVmLXR5cGUgbmFtZT0iSm91cm5hbCBBcnRpY2xlIj4xNzwvcmVmLXR5cGU+
 PGNvbnRyaWJ1dG9ycz48YXV0aG9ycz48YXV0aG9yPlN0ZWluYnJpbmssIENvcm5lbGl1czwvYXV0
 aG9yPjxhdXRob3I+QmxhbmstQmFiYXphZGVoLCBNYXJpdGE8L2F1dGhvcj48YXV0aG9yPkVsLUFt
@@ -1086,7 +1086,7 @@
 Y29yZD48L0NpdGU+PENpdGU+PEF1dGhvcj5PZmVubG9jaDwvQXV0aG9yPjxZZWFyPjIwMjI8L1ll
 YXI+PFJlY051bT42MjwvUmVjTnVtPjxyZWNvcmQ+PHJlYy1udW1iZXI+NjI8L3JlYy1udW1iZXI+
 PGZvcmVpZ24ta2V5cz48a2V5IGFwcD0iRU4iIGRiLWlkPSJtZGFlODUwMDEwOTQ5NmZlYTRhZmY5
-YzA4NmUxNmNjMjU4OTUiIHRpbWVzdGFtcD0iMTc5MzE4NTQ3MyI+NjI8L2tleT48L2ZvcmVpZ24t
+YzA4NmUxNmNjMjU4OTUiIHRpbWVzdGFtcD0iMTc5MzIxNjgyMSI+NjI8L2tleT48L2ZvcmVpZ24t
 a2V5cz48cmVmLXR5cGUgbmFtZT0iQ29uZmVyZW5jZSBQYXBlciI+NDc8L3JlZi10eXBlPjxjb250
 cmlidXRvcnM+PGF1dGhvcnM+PGF1dGhvcj5PZmVubG9jaCwgQW5uaWthPC9hdXRob3I+PGF1dGhv
 cj5TY2h3YXJ6LCBKYW4gU8O2cmVuPC9hdXRob3I+PGF1dGhvcj5Ub2xrLCBEZWJvcmFoPC9hdXRo
@@ -1137,7 +1137,7 @@
         <w:fldChar w:fldCharType="begin"/>
       </w:r>
       <w:r>
-        <w:instrText xml:space="preserve"> ADDIN EN.CITE &lt;EndNote&gt;&lt;Cite&gt;&lt;Author&gt;U.S. Department of Energy&lt;/Author&gt;&lt;Year&gt;2024&lt;/Year&gt;&lt;RecNum&gt;20&lt;/RecNum&gt;&lt;DisplayText&gt;[21]&lt;/DisplayText&gt;&lt;record&gt;&lt;rec-number&gt;20&lt;/rec-number&gt;&lt;foreign-keys&gt;&lt;key app="EN" db-id="mdae8500109496fea4aff9c086e16cc25895" timestamp="1793185473"&gt;20&lt;/key&gt;&lt;/foreign-keys&gt;&lt;ref-type name="Web Page"&gt;12&lt;/ref-type&gt;&lt;contributors&gt;&lt;authors&gt;&lt;author&gt;U.S. Department of Energy&lt;/author&gt;&lt;/authors&gt;&lt;/contributors&gt;&lt;titles&gt;&lt;title&gt;EnergyPlus Output Details and Examples: eplusout.rdd&lt;/title&gt;&lt;/titles&gt;&lt;dates&gt;&lt;year&gt;2024&lt;/year&gt;&lt;/dates&gt;&lt;label&gt;doe2024rdd&lt;/label&gt;&lt;urls&gt;&lt;related-urls&gt;&lt;url&gt;https://bigladdersoftware.com/epx/docs/24-1/output-details-and-examples/eplusout-rdd.html&lt;/url&gt;&lt;/related-urls&gt;&lt;/urls&gt;&lt;access-date&gt;2026-10-28&lt;/access-date&gt;&lt;/record&gt;&lt;/Cite&gt;&lt;/EndNote&gt;</w:instrText>
+        <w:instrText xml:space="preserve"> ADDIN EN.CITE &lt;EndNote&gt;&lt;Cite&gt;&lt;Author&gt;U.S. Department of Energy&lt;/Author&gt;&lt;Year&gt;2024&lt;/Year&gt;&lt;RecNum&gt;20&lt;/RecNum&gt;&lt;DisplayText&gt;[21]&lt;/DisplayText&gt;&lt;record&gt;&lt;rec-number&gt;20&lt;/rec-number&gt;&lt;foreign-keys&gt;&lt;key app="EN" db-id="mdae8500109496fea4aff9c086e16cc25895" timestamp="1793216821"&gt;20&lt;/key&gt;&lt;/foreign-keys&gt;&lt;ref-type name="Web Page"&gt;12&lt;/ref-type&gt;&lt;contributors&gt;&lt;authors&gt;&lt;author&gt;U.S. Department of Energy&lt;/author&gt;&lt;/authors&gt;&lt;/contributors&gt;&lt;titles&gt;&lt;title&gt;EnergyPlus Output Details and Examples: eplusout.rdd&lt;/title&gt;&lt;/titles&gt;&lt;dates&gt;&lt;year&gt;2024&lt;/year&gt;&lt;/dates&gt;&lt;label&gt;doe2024rdd&lt;/label&gt;&lt;urls&gt;&lt;related-urls&gt;&lt;url&gt;https://bigladdersoftware.com/epx/docs/24-1/output-details-and-examples/eplusout-rdd.html&lt;/url&gt;&lt;/related-urls&gt;&lt;/urls&gt;&lt;access-date&gt;2026-10-28&lt;/access-date&gt;&lt;/record&gt;&lt;/Cite&gt;&lt;/EndNote&gt;</w:instrText>
       </w:r>
       <w:r>
         <w:fldChar w:fldCharType="separate"/>
@@ -1160,7 +1160,7 @@
 UmVjTnVtPjQ3PC9SZWNOdW0+PERpc3BsYXlUZXh0Pls3LDIyXTwvRGlzcGxheVRleHQ+PHJlY29y
 ZD48cmVjLW51bWJlcj40NzwvcmVjLW51bWJlcj48Zm9yZWlnbi1rZXlzPjxrZXkgYXBwPSJFTiIg
 ZGItaWQ9Im1kYWU4NTAwMTA5NDk2ZmVhNGFmZjljMDg2ZTE2Y2MyNTg5NSIgdGltZXN0YW1wPSIx
-NzkzMTg1NDczIj40Nzwva2V5PjwvZm9yZWlnbi1rZXlzPjxyZWYtdHlwZSBuYW1lPSJKb3VybmFs
+NzkzMjE2ODIxIj40Nzwva2V5PjwvZm9yZWlnbi1rZXlzPjxyZWYtdHlwZSBuYW1lPSJKb3VybmFs
 IEFydGljbGUiPjE3PC9yZWYtdHlwZT48Y29udHJpYnV0b3JzPjxhdXRob3JzPjxhdXRob3I+S8O8
 YmxlciwgUi48L2F1dGhvcj48YXV0aG9yPlNjaGllaGxlbiwgVy48L2F1dGhvcj48L2F1dGhvcnM+
 PC9jb250cmlidXRvcnM+PHRpdGxlcz48dGl0bGU+VHdvIE1ldGhvZHMgb2YgU2ltdWxhdG9yIENv
@@ -1177,7 +1177,7 @@
 c291cmNlLW51bT48L3JlY29yZD48L0NpdGU+PENpdGU+PEF1dGhvcj5Hb21lczwvQXV0aG9yPjxZ
 ZWFyPjIwMTg8L1llYXI+PFJlY051bT4yNjwvUmVjTnVtPjxyZWNvcmQ+PHJlYy1udW1iZXI+MjY8
 L3JlYy1udW1iZXI+PGZvcmVpZ24ta2V5cz48a2V5IGFwcD0iRU4iIGRiLWlkPSJtZGFlODUwMDEw
-OTQ5NmZlYTRhZmY5YzA4NmUxNmNjMjU4OTUiIHRpbWVzdGFtcD0iMTc5MzE4NTQ3MyI+MjY8L2tl
+OTQ5NmZlYTRhZmY5YzA4NmUxNmNjMjU4OTUiIHRpbWVzdGFtcD0iMTc5MzIxNjgyMSI+MjY8L2tl
 eT48L2ZvcmVpZ24ta2V5cz48cmVmLXR5cGUgbmFtZT0iSm91cm5hbCBBcnRpY2xlIj4xNzwvcmVm
 LXR5cGU+PGNvbnRyaWJ1dG9ycz48YXV0aG9ycz48YXV0aG9yPkdvbWVzLCBDbMOhdWRpbzwvYXV0
 aG9yPjxhdXRob3I+VGh1bGUsIENhc3BlcjwvYXV0aG9yPjxhdXRob3I+QnJvbWFuLCBEYXZpZDwv
@@ -1203,7 +1203,7 @@
 UmVjTnVtPjQ3PC9SZWNOdW0+PERpc3BsYXlUZXh0Pls3LDIyXTwvRGlzcGxheVRleHQ+PHJlY29y
 ZD48cmVjLW51bWJlcj40NzwvcmVjLW51bWJlcj48Zm9yZWlnbi1rZXlzPjxrZXkgYXBwPSJFTiIg
 ZGItaWQ9Im1kYWU4NTAwMTA5NDk2ZmVhNGFmZjljMDg2ZTE2Y2MyNTg5NSIgdGltZXN0YW1wPSIx
-NzkzMTg1NDczIj40Nzwva2V5PjwvZm9yZWlnbi1rZXlzPjxyZWYtdHlwZSBuYW1lPSJKb3VybmFs
+NzkzMjE2ODIxIj40Nzwva2V5PjwvZm9yZWlnbi1rZXlzPjxyZWYtdHlwZSBuYW1lPSJKb3VybmFs
 IEFydGljbGUiPjE3PC9yZWYtdHlwZT48Y29udHJpYnV0b3JzPjxhdXRob3JzPjxhdXRob3I+S8O8
 YmxlciwgUi48L2F1dGhvcj48YXV0aG9yPlNjaGllaGxlbiwgVy48L2F1dGhvcj48L2F1dGhvcnM+
 PC9jb250cmlidXRvcnM+PHRpdGxlcz48dGl0bGU+VHdvIE1ldGhvZHMgb2YgU2ltdWxhdG9yIENv
@@ -1220,7 +1220,7 @@
 c291cmNlLW51bT48L3JlY29yZD48L0NpdGU+PENpdGU+PEF1dGhvcj5Hb21lczwvQXV0aG9yPjxZ
 ZWFyPjIwMTg8L1llYXI+PFJlY051bT4yNjwvUmVjTnVtPjxyZWNvcmQ+PHJlYy1udW1iZXI+MjY8
 L3JlYy1udW1iZXI+PGZvcmVpZ24ta2V5cz48a2V5IGFwcD0iRU4iIGRiLWlkPSJtZGFlODUwMDEw
-OTQ5NmZlYTRhZmY5YzA4NmUxNmNjMjU4OTUiIHRpbWVzdGFtcD0iMTc5MzE4NTQ3MyI+MjY8L2tl
+OTQ5NmZlYTRhZmY5YzA4NmUxNmNjMjU4OTUiIHRpbWVzdGFtcD0iMTc5MzIxNjgyMSI+MjY8L2tl
 eT48L2ZvcmVpZ24ta2V5cz48cmVmLXR5cGUgbmFtZT0iSm91cm5hbCBBcnRpY2xlIj4xNzwvcmVm
 LXR5cGU+PGNvbnRyaWJ1dG9ycz48YXV0aG9ycz48YXV0aG9yPkdvbWVzLCBDbMOhdWRpbzwvYXV0
 aG9yPjxhdXRob3I+VGh1bGUsIENhc3BlcjwvYXV0aG9yPjxhdXRob3I+QnJvbWFuLCBEYXZpZDwv
@@ -1264,7 +1264,7 @@
 PFJlY051bT44MTwvUmVjTnVtPjxEaXNwbGF5VGV4dD5bMjMsMjRdPC9EaXNwbGF5VGV4dD48cmVj
 b3JkPjxyZWMtbnVtYmVyPjgxPC9yZWMtbnVtYmVyPjxmb3JlaWduLWtleXM+PGtleSBhcHA9IkVO
 IiBkYi1pZD0ibWRhZTg1MDAxMDk0OTZmZWE0YWZmOWMwODZlMTZjYzI1ODk1IiB0aW1lc3RhbXA9
-IjE3OTMxODU0NzMiPjgxPC9rZXk+PC9mb3JlaWduLWtleXM+PHJlZi10eXBlIG5hbWU9IkNvbmZl
+IjE3OTMyMTY4MjEiPjgxPC9rZXk+PC9mb3JlaWduLWtleXM+PHJlZi10eXBlIG5hbWU9IkNvbmZl
 cmVuY2UgUGFwZXIiPjQ3PC9yZWYtdHlwZT48Y29udHJpYnV0b3JzPjxhdXRob3JzPjxhdXRob3I+
 VHJpcGFraXMsIFN0YXZyb3M8L2F1dGhvcj48L2F1dGhvcnM+PC9jb250cmlidXRvcnM+PHRpdGxl
 cz48dGl0bGU+QnJpZGdpbmcgdGhlIHNlbWFudGljIGdhcCBiZXR3ZWVuIGhldGVyb2dlbmVvdXMg
@@ -1279,7 +1279,7 @@
 bWVzPC9BdXRob3I+PFllYXI+MjAxOTwvWWVhcj48UmVjTnVtPjI3PC9SZWNOdW0+PHJlY29yZD48
 cmVjLW51bWJlcj4yNzwvcmVjLW51bWJlcj48Zm9yZWlnbi1rZXlzPjxrZXkgYXBwPSJFTiIgZGIt
 aWQ9Im1kYWU4NTAwMTA5NDk2ZmVhNGFmZjljMDg2ZTE2Y2MyNTg5NSIgdGltZXN0YW1wPSIxNzkz
-MTg1NDczIj4yNzwva2V5PjwvZm9yZWlnbi1rZXlzPjxyZWYtdHlwZSBuYW1lPSJKb3VybmFsIEFy
+MjE2ODIxIj4yNzwva2V5PjwvZm9yZWlnbi1rZXlzPjxyZWYtdHlwZSBuYW1lPSJKb3VybmFsIEFy
 dGljbGUiPjE3PC9yZWYtdHlwZT48Y29udHJpYnV0b3JzPjxhdXRob3JzPjxhdXRob3I+R29tZXMs
 IENsw6F1ZGlvPC9hdXRob3I+PGF1dGhvcj5NZXllcnMsIEJhcnQ8L2F1dGhvcj48YXV0aG9yPkRl
 bmlsLCBKb2FjaGltPC9hdXRob3I+PGF1dGhvcj5UaHVsZSwgQ2FzcGVyPC9hdXRob3I+PGF1dGhv
@@ -1306,7 +1306,7 @@
 PFJlY051bT44MTwvUmVjTnVtPjxEaXNwbGF5VGV4dD5bMjMsMjRdPC9EaXNwbGF5VGV4dD48cmVj
 b3JkPjxyZWMtbnVtYmVyPjgxPC9yZWMtbnVtYmVyPjxmb3JlaWduLWtleXM+PGtleSBhcHA9IkVO
 IiBkYi1pZD0ibWRhZTg1MDAxMDk0OTZmZWE0YWZmOWMwODZlMTZjYzI1ODk1IiB0aW1lc3RhbXA9
-IjE3OTMxODU0NzMiPjgxPC9rZXk+PC9mb3JlaWduLWtleXM+PHJlZi10eXBlIG5hbWU9IkNvbmZl
+IjE3OTMyMTY4MjEiPjgxPC9rZXk+PC9mb3JlaWduLWtleXM+PHJlZi10eXBlIG5hbWU9IkNvbmZl
 cmVuY2UgUGFwZXIiPjQ3PC9yZWYtdHlwZT48Y29udHJpYnV0b3JzPjxhdXRob3JzPjxhdXRob3I+
 VHJpcGFraXMsIFN0YXZyb3M8L2F1dGhvcj48L2F1dGhvcnM+PC9jb250cmlidXRvcnM+PHRpdGxl
 cz48dGl0bGU+QnJpZGdpbmcgdGhlIHNlbWFudGljIGdhcCBiZXR3ZWVuIGhldGVyb2dlbmVvdXMg
@@ -1321,7 +1321,7 @@
 bWVzPC9BdXRob3I+PFllYXI+MjAxOTwvWWVhcj48UmVjTnVtPjI3PC9SZWNOdW0+PHJlY29yZD48
 cmVjLW51bWJlcj4yNzwvcmVjLW51bWJlcj48Zm9yZWlnbi1rZXlzPjxrZXkgYXBwPSJFTiIgZGIt
 aWQ9Im1kYWU4NTAwMTA5NDk2ZmVhNGFmZjljMDg2ZTE2Y2MyNTg5NSIgdGltZXN0YW1wPSIxNzkz
-MTg1NDczIj4yNzwva2V5PjwvZm9yZWlnbi1rZXlzPjxyZWYtdHlwZSBuYW1lPSJKb3VybmFsIEFy
+MjE2ODIxIj4yNzwva2V5PjwvZm9yZWlnbi1rZXlzPjxyZWYtdHlwZSBuYW1lPSJKb3VybmFsIEFy
 dGljbGUiPjE3PC9yZWYtdHlwZT48Y29udHJpYnV0b3JzPjxhdXRob3JzPjxhdXRob3I+R29tZXMs
 IENsw6F1ZGlvPC9hdXRob3I+PGF1dGhvcj5NZXllcnMsIEJhcnQ8L2F1dGhvcj48YXV0aG9yPkRl
 bmlsLCBKb2FjaGltPC9hdXRob3I+PGF1dGhvcj5UaHVsZSwgQ2FzcGVyPC9hdXRob3I+PGF1dGhv
@@ -1372,7 +1372,7 @@
         <w:fldChar w:fldCharType="begin"/>
       </w:r>
       <w:r>
-        <w:instrText xml:space="preserve"> ADDIN EN.CITE &lt;EndNote&gt;&lt;Cite&gt;&lt;Author&gt;Ouyang&lt;/Author&gt;&lt;Year&gt;2025&lt;/Year&gt;&lt;RecNum&gt;66&lt;/RecNum&gt;&lt;DisplayText&gt;[25]&lt;/DisplayText&gt;&lt;record&gt;&lt;rec-number&gt;66&lt;/rec-number&gt;&lt;foreign-keys&gt;&lt;key app="EN" db-id="mdae8500109496fea4aff9c086e16cc25895" timestamp="1793185473"&gt;66&lt;/key&gt;&lt;/foreign-keys&gt;&lt;ref-type name="Journal Article"&gt;17&lt;/ref-type&gt;&lt;contributors&gt;&lt;authors&gt;&lt;author&gt;Ouyang, Shuyin&lt;/author&gt;&lt;author&gt;Zhang, Jie M.&lt;/author&gt;&lt;author&gt;Harman, Mark&lt;/author&gt;&lt;author&gt;Wang, Meng&lt;/author&gt;&lt;/authors&gt;&lt;/contributors&gt;&lt;titles&gt;&lt;title&gt;An Empirical Study of the Non-Determinism of ChatGPT in Code Generation&lt;/title&gt;&lt;secondary-title&gt;ACM Transactions on Software Engineering and Methodology&lt;/secondary-title&gt;&lt;alt-title&gt;ACM Trans. Softw. Eng. Methodol.&lt;/alt-title&gt;&lt;/titles&gt;&lt;periodical&gt;&lt;full-title&gt;ACM Transactions on Software Engineering and Methodology&lt;/full-title&gt;&lt;abbr-1&gt;ACM Trans. Softw. Eng. Methodol.&lt;/abbr-1&gt;&lt;/periodical&gt;&lt;pages&gt;1-28&lt;/pages&gt;&lt;volume&gt;34&lt;/volume&gt;&lt;number&gt;2&lt;/number&gt;&lt;dates&gt;&lt;year&gt;2025&lt;/year&gt;&lt;/dates&gt;&lt;publisher&gt;ACM&lt;/publisher&gt;&lt;label&gt;ouyang2025&lt;/label&gt;&lt;urls&gt;&lt;/urls&gt;&lt;electronic-resource-num&gt;10.1145/3697010&lt;/electronic-resource-num&gt;&lt;/record&gt;&lt;/Cite&gt;&lt;/EndNote&gt;</w:instrText>
+        <w:instrText xml:space="preserve"> ADDIN EN.CITE &lt;EndNote&gt;&lt;Cite&gt;&lt;Author&gt;Ouyang&lt;/Author&gt;&lt;Year&gt;2025&lt;/Year&gt;&lt;RecNum&gt;66&lt;/RecNum&gt;&lt;DisplayText&gt;[25]&lt;/DisplayText&gt;&lt;record&gt;&lt;rec-number&gt;66&lt;/rec-number&gt;&lt;foreign-keys&gt;&lt;key app="EN" db-id="mdae8500109496fea4aff9c086e16cc25895" timestamp="1793216821"&gt;66&lt;/key&gt;&lt;/foreign-keys&gt;&lt;ref-type name="Journal Article"&gt;17&lt;/ref-type&gt;&lt;contributors&gt;&lt;authors&gt;&lt;author&gt;Ouyang, Shuyin&lt;/author&gt;&lt;author&gt;Zhang, Jie M.&lt;/author&gt;&lt;author&gt;Harman, Mark&lt;/author&gt;&lt;author&gt;Wang, Meng&lt;/author&gt;&lt;/authors&gt;&lt;/contributors&gt;&lt;titles&gt;&lt;title&gt;An Empirical Study of the Non-Determinism of ChatGPT in Code Generation&lt;/title&gt;&lt;secondary-title&gt;ACM Transactions on Software Engineering and Methodology&lt;/secondary-title&gt;&lt;alt-title&gt;ACM Trans. Softw. Eng. Methodol.&lt;/alt-title&gt;&lt;/titles&gt;&lt;periodical&gt;&lt;full-title&gt;ACM Transactions on Software Engineering and Methodology&lt;/full-title&gt;&lt;abbr-1&gt;ACM Trans. Softw. Eng. Methodol.&lt;/abbr-1&gt;&lt;/periodical&gt;&lt;pages&gt;1-28&lt;/pages&gt;&lt;volume&gt;34&lt;/volume&gt;&lt;number&gt;2&lt;/number&gt;&lt;dates&gt;&lt;year&gt;2025&lt;/year&gt;&lt;/dates&gt;&lt;publisher&gt;ACM&lt;/publisher&gt;&lt;label&gt;ouyang2025&lt;/label&gt;&lt;urls&gt;&lt;/urls&gt;&lt;electronic-resource-num&gt;10.1145/3697010&lt;/electronic-resource-num&gt;&lt;/record&gt;&lt;/Cite&gt;&lt;/EndNote&gt;</w:instrText>
       </w:r>
       <w:r>
         <w:fldChar w:fldCharType="separate"/>
@@ -1393,7 +1393,7 @@
         <w:fldChar w:fldCharType="begin"/>
       </w:r>
       <w:r>
-        <w:instrText xml:space="preserve"> ADDIN EN.CITE &lt;EndNote&gt;&lt;Cite&gt;&lt;Author&gt;Neubauer&lt;/Author&gt;&lt;Year&gt;2026&lt;/Year&gt;&lt;RecNum&gt;57&lt;/RecNum&gt;&lt;DisplayText&gt;[26]&lt;/DisplayText&gt;&lt;record&gt;&lt;rec-number&gt;57&lt;/rec-number&gt;&lt;foreign-keys&gt;&lt;key app="EN" db-id="mdae8500109496fea4aff9c086e16cc25895" timestamp="1793185473"&gt;57&lt;/key&gt;&lt;/foreign-keys&gt;&lt;ref-type name="Generic"&gt;13&lt;/ref-type&gt;&lt;contributors&gt;&lt;authors&gt;&lt;author&gt;Neubauer, Alexander&lt;/author&gt;&lt;author&gt;Hong, Tianzhen&lt;/author&gt;&lt;author&gt;Li, Han&lt;/author&gt;&lt;author&gt;Yu, Mengbo&lt;/author&gt;&lt;author&gt;Darbandi, Amin&lt;/author&gt;&lt;author&gt;Fürst, Yannick&lt;/author&gt;&lt;author&gt;Kriegel, Martin&lt;/author&gt;&lt;/authors&gt;&lt;/contributors&gt;&lt;titles&gt;&lt;title&gt;Large Language Models for HVAC Operations in Building Energy Systems: A Critical Review of Methods, Applications, and Deployment Readiness&lt;/title&gt;&lt;secondary-title&gt;arXiv&lt;/secondary-title&gt;&lt;/titles&gt;&lt;dates&gt;&lt;year&gt;2026&lt;/year&gt;&lt;/dates&gt;&lt;label&gt;neubauer2026&lt;/label&gt;&lt;work-type&gt;arXiv:2609.05314&lt;/work-type&gt;&lt;urls&gt;&lt;related-urls&gt;&lt;url&gt;https://arxiv.org/abs/2609.05314&lt;/url&gt;&lt;/related-urls&gt;&lt;/urls&gt;&lt;electronic-resource-num&gt;10.48550/arXiv.2609.05314&lt;/electronic-resource-num&gt;&lt;/record&gt;&lt;/Cite&gt;&lt;/EndNote&gt;</w:instrText>
+        <w:instrText xml:space="preserve"> ADDIN EN.CITE &lt;EndNote&gt;&lt;Cite&gt;&lt;Author&gt;Neubauer&lt;/Author&gt;&lt;Year&gt;2026&lt;/Year&gt;&lt;RecNum&gt;57&lt;/RecNum&gt;&lt;DisplayText&gt;[26]&lt;/DisplayText&gt;&lt;record&gt;&lt;rec-number&gt;57&lt;/rec-number&gt;&lt;foreign-keys&gt;&lt;key app="EN" db-id="mdae8500109496fea4aff9c086e16cc25895" timestamp="1793216821"&gt;57&lt;/key&gt;&lt;/foreign-keys&gt;&lt;ref-type name="Generic"&gt;13&lt;/ref-type&gt;&lt;contributors&gt;&lt;authors&gt;&lt;author&gt;Neubauer, Alexander&lt;/author&gt;&lt;author&gt;Hong, Tianzhen&lt;/author&gt;&lt;author&gt;Li, Han&lt;/author&gt;&lt;author&gt;Yu, Mengbo&lt;/author&gt;&lt;author&gt;Darbandi, Amin&lt;/author&gt;&lt;author&gt;Fürst, Yannick&lt;/author&gt;&lt;author&gt;Kriegel, Martin&lt;/author&gt;&lt;/authors&gt;&lt;/contributors&gt;&lt;titles&gt;&lt;title&gt;Large Language Models for HVAC Operations in Building Energy Systems: A Critical Review of Methods, Applications, and Deployment Readiness&lt;/title&gt;&lt;secondary-title&gt;arXiv&lt;/secondary-title&gt;&lt;/titles&gt;&lt;dates&gt;&lt;year&gt;2026&lt;/year&gt;&lt;/dates&gt;&lt;label&gt;neubauer2026&lt;/label&gt;&lt;work-type&gt;arXiv:2609.05314&lt;/work-type&gt;&lt;urls&gt;&lt;related-urls&gt;&lt;url&gt;https://arxiv.org/abs/2609.05314&lt;/url&gt;&lt;/related-urls&gt;&lt;/urls&gt;&lt;electronic-resource-num&gt;10.48550/arXiv.2609.05314&lt;/electronic-resource-num&gt;&lt;/record&gt;&lt;/Cite&gt;&lt;/EndNote&gt;</w:instrText>
       </w:r>
       <w:r>
         <w:fldChar w:fldCharType="separate"/>
@@ -1414,7 +1414,7 @@
         <w:fldChar w:fldCharType="begin"/>
       </w:r>
       <w:r>
-        <w:instrText xml:space="preserve"> ADDIN EN.CITE &lt;EndNote&gt;&lt;Cite&gt;&lt;Author&gt;Henderson&lt;/Author&gt;&lt;Year&gt;2018&lt;/Year&gt;&lt;RecNum&gt;32&lt;/RecNum&gt;&lt;DisplayText&gt;[27]&lt;/DisplayText&gt;&lt;record&gt;&lt;rec-number&gt;32&lt;/rec-number&gt;&lt;foreign-keys&gt;&lt;key app="EN" db-id="mdae8500109496fea4aff9c086e16cc25895" timestamp="1793185473"&gt;32&lt;/key&gt;&lt;/foreign-keys&gt;&lt;ref-type name="Conference Paper"&gt;47&lt;/ref-type&gt;&lt;contributors&gt;&lt;authors&gt;&lt;author&gt;Henderson, Peter&lt;/author&gt;&lt;author&gt;Islam, Riashat&lt;/author&gt;&lt;author&gt;Bachman, Philip&lt;/author&gt;&lt;author&gt;Pineau, Joelle&lt;/author&gt;&lt;author&gt;Precup, Doina&lt;/author&gt;&lt;author&gt;Meger, David&lt;/author&gt;&lt;/authors&gt;&lt;/contributors&gt;&lt;titles&gt;&lt;title&gt;Deep Reinforcement Learning That Matters&lt;/title&gt;&lt;secondary-title&gt;Proceedings of the AAAI Conference on Artificial Intelligence&lt;/secondary-title&gt;&lt;/titles&gt;&lt;pages&gt;3207-3214&lt;/pages&gt;&lt;volume&gt;32&lt;/volume&gt;&lt;number&gt;1&lt;/number&gt;&lt;dates&gt;&lt;year&gt;2018&lt;/year&gt;&lt;/dates&gt;&lt;publisher&gt;AAAI Press&lt;/publisher&gt;&lt;label&gt;henderson2018&lt;/label&gt;&lt;urls&gt;&lt;/urls&gt;&lt;electronic-resource-num&gt;10.1609/aaai.v32i1.11694&lt;/electronic-resource-num&gt;&lt;/record&gt;&lt;/Cite&gt;&lt;/EndNote&gt;</w:instrText>
+        <w:instrText xml:space="preserve"> ADDIN EN.CITE &lt;EndNote&gt;&lt;Cite&gt;&lt;Author&gt;Henderson&lt;/Author&gt;&lt;Year&gt;2018&lt;/Year&gt;&lt;RecNum&gt;32&lt;/RecNum&gt;&lt;DisplayText&gt;[27]&lt;/DisplayText&gt;&lt;record&gt;&lt;rec-number&gt;32&lt;/rec-number&gt;&lt;foreign-keys&gt;&lt;key app="EN" db-id="mdae8500109496fea4aff9c086e16cc25895" timestamp="1793216821"&gt;32&lt;/key&gt;&lt;/foreign-keys&gt;&lt;ref-type name="Conference Paper"&gt;47&lt;/ref-type&gt;&lt;contributors&gt;&lt;authors&gt;&lt;author&gt;Henderson, Peter&lt;/author&gt;&lt;author&gt;Islam, Riashat&lt;/author&gt;&lt;author&gt;Bachman, Philip&lt;/author&gt;&lt;author&gt;Pineau, Joelle&lt;/author&gt;&lt;author&gt;Precup, Doina&lt;/author&gt;&lt;author&gt;Meger, David&lt;/author&gt;&lt;/authors&gt;&lt;/contributors&gt;&lt;titles&gt;&lt;title&gt;Deep Reinforcement Learning That Matters&lt;/title&gt;&lt;secondary-title&gt;Proceedings of the AAAI Conference on Artificial Intelligence&lt;/secondary-title&gt;&lt;/titles&gt;&lt;pages&gt;3207-3214&lt;/pages&gt;&lt;volume&gt;32&lt;/volume&gt;&lt;number&gt;1&lt;/number&gt;&lt;dates&gt;&lt;year&gt;2018&lt;/year&gt;&lt;/dates&gt;&lt;publisher&gt;AAAI Press&lt;/publisher&gt;&lt;label&gt;henderson2018&lt;/label&gt;&lt;urls&gt;&lt;/urls&gt;&lt;electronic-resource-num&gt;10.1609/aaai.v32i1.11694&lt;/electronic-resource-num&gt;&lt;/record&gt;&lt;/Cite&gt;&lt;/EndNote&gt;</w:instrText>
       </w:r>
       <w:r>
         <w:fldChar w:fldCharType="separate"/>
@@ -1435,7 +1435,7 @@
         <w:fldChar w:fldCharType="begin"/>
       </w:r>
       <w:r>
-        <w:instrText xml:space="preserve"> ADDIN EN.CITE &lt;EndNote&gt;&lt;Cite&gt;&lt;Author&gt;Neubauer&lt;/Author&gt;&lt;Year&gt;2026&lt;/Year&gt;&lt;RecNum&gt;57&lt;/RecNum&gt;&lt;DisplayText&gt;[26]&lt;/DisplayText&gt;&lt;record&gt;&lt;rec-number&gt;57&lt;/rec-number&gt;&lt;foreign-keys&gt;&lt;key app="EN" db-id="mdae8500109496fea4aff9c086e16cc25895" timestamp="1793185473"&gt;57&lt;/key&gt;&lt;/foreign-keys&gt;&lt;ref-type name="Generic"&gt;13&lt;/ref-type&gt;&lt;contributors&gt;&lt;authors&gt;&lt;author&gt;Neubauer, Alexander&lt;/author&gt;&lt;author&gt;Hong, Tianzhen&lt;/author&gt;&lt;author&gt;Li, Han&lt;/author&gt;&lt;author&gt;Yu, Mengbo&lt;/author&gt;&lt;author&gt;Darbandi, Amin&lt;/author&gt;&lt;author&gt;Fürst, Yannick&lt;/author&gt;&lt;author&gt;Kriegel, Martin&lt;/author&gt;&lt;/authors&gt;&lt;/contributors&gt;&lt;titles&gt;&lt;title&gt;Large Language Models for HVAC Operations in Building Energy Systems: A Critical Review of Methods, Applications, and Deployment Readiness&lt;/title&gt;&lt;secondary-title&gt;arXiv&lt;/secondary-title&gt;&lt;/titles&gt;&lt;dates&gt;&lt;year&gt;2026&lt;/year&gt;&lt;/dates&gt;&lt;label&gt;neubauer2026&lt;/label&gt;&lt;work-type&gt;arXiv:2609.05314&lt;/work-type&gt;&lt;urls&gt;&lt;related-urls&gt;&lt;url&gt;https://arxiv.org/abs/2609.05314&lt;/url&gt;&lt;/related-urls&gt;&lt;/urls&gt;&lt;electronic-resource-num&gt;10.48550/arXiv.2609.05314&lt;/electronic-resource-num&gt;&lt;/record&gt;&lt;/Cite&gt;&lt;/EndNote&gt;</w:instrText>
+        <w:instrText xml:space="preserve"> ADDIN EN.CITE &lt;EndNote&gt;&lt;Cite&gt;&lt;Author&gt;Neubauer&lt;/Author&gt;&lt;Year&gt;2026&lt;/Year&gt;&lt;RecNum&gt;57&lt;/RecNum&gt;&lt;DisplayText&gt;[26]&lt;/DisplayText&gt;&lt;record&gt;&lt;rec-number&gt;57&lt;/rec-number&gt;&lt;foreign-keys&gt;&lt;key app="EN" db-id="mdae8500109496fea4aff9c086e16cc25895" timestamp="1793216821"&gt;57&lt;/key&gt;&lt;/foreign-keys&gt;&lt;ref-type name="Generic"&gt;13&lt;/ref-type&gt;&lt;contributors&gt;&lt;authors&gt;&lt;author&gt;Neubauer, Alexander&lt;/author&gt;&lt;author&gt;Hong, Tianzhen&lt;/author&gt;&lt;author&gt;Li, Han&lt;/author&gt;&lt;author&gt;Yu, Mengbo&lt;/author&gt;&lt;author&gt;Darbandi, Amin&lt;/author&gt;&lt;author&gt;Fürst, Yannick&lt;/author&gt;&lt;author&gt;Kriegel, Martin&lt;/author&gt;&lt;/authors&gt;&lt;/contributors&gt;&lt;titles&gt;&lt;title&gt;Large Language Models for HVAC Operations in Building Energy Systems: A Critical Review of Methods, Applications, and Deployment Readiness&lt;/title&gt;&lt;secondary-title&gt;arXiv&lt;/secondary-title&gt;&lt;/titles&gt;&lt;dates&gt;&lt;year&gt;2026&lt;/year&gt;&lt;/dates&gt;&lt;label&gt;neubauer2026&lt;/label&gt;&lt;work-type&gt;arXiv:2609.05314&lt;/work-type&gt;&lt;urls&gt;&lt;related-urls&gt;&lt;url&gt;https://arxiv.org/abs/2609.05314&lt;/url&gt;&lt;/related-urls&gt;&lt;/urls&gt;&lt;electronic-resource-num&gt;10.48550/arXiv.2609.05314&lt;/electronic-resource-num&gt;&lt;/record&gt;&lt;/Cite&gt;&lt;/EndNote&gt;</w:instrText>
       </w:r>
       <w:r>
         <w:fldChar w:fldCharType="separate"/>
@@ -1458,28 +1458,7 @@
         <w:pStyle w:val="BodyText"/>
       </w:pPr>
       <w:r>
-        <w:t xml:space="preserve">Py-CoSim was introduced as a Python co-simulation infrastructure that couples EnergyPlus through its Python application programming interface (API) with non-building components such as weather data, ML models and an LLM </w:t>
-      </w:r>
-      <w:r>
-        <w:fldChar w:fldCharType="begin"/>
-      </w:r>
-      <w:r>
-        <w:instrText xml:space="preserve"> ADDIN EN.CITE &lt;EndNote&gt;&lt;Cite&gt;&lt;Author&gt;Zhang&lt;/Author&gt;&lt;Year&gt;2023&lt;/Year&gt;&lt;RecNum&gt;91&lt;/RecNum&gt;&lt;DisplayText&gt;[28]&lt;/DisplayText&gt;&lt;record&gt;&lt;rec-number&gt;91&lt;/rec-number&gt;&lt;foreign-keys&gt;&lt;key app="EN" db-id="mdae8500109496fea4aff9c086e16cc25895" timestamp="1793185473"&gt;91&lt;/key&gt;&lt;/foreign-keys&gt;&lt;ref-type name="Generic"&gt;13&lt;/ref-type&gt;&lt;contributors&gt;&lt;authors&gt;&lt;author&gt;Zhang, Liang&lt;/author&gt;&lt;author&gt;Haroon, Saquib Mohammed&lt;/author&gt;&lt;author&gt;Ryan, Alyssa&lt;/author&gt;&lt;/authors&gt;&lt;/contributors&gt;&lt;titles&gt;&lt;title&gt;Py-CoSim: Python-Based Building Energy Co-Simulation Infrastructure&lt;/title&gt;&lt;secondary-title&gt;SSRN&lt;/secondary-title&gt;&lt;/titles&gt;&lt;dates&gt;&lt;year&gt;2023&lt;/year&gt;&lt;/dates&gt;&lt;label&gt;zhang2023&lt;/label&gt;&lt;work-type&gt;Preprint&lt;/work-type&gt;&lt;urls&gt;&lt;related-urls&gt;&lt;url&gt;https://www.ssrn.com/abstract=4572925&lt;/url&gt;&lt;/related-urls&gt;&lt;/urls&gt;&lt;electronic-resource-num&gt;10.2139/ssrn.4572925&lt;/electronic-resource-num&gt;&lt;/record&gt;&lt;/Cite&gt;&lt;/EndNote&gt;</w:instrText>
-      </w:r>
-      <w:r>
-        <w:fldChar w:fldCharType="separate"/>
-      </w:r>
-      <w:r>
-        <w:rPr>
-          <w:noProof/>
-        </w:rPr>
-        <w:t>[28]</w:t>
-      </w:r>
-      <w:r>
-        <w:fldChar w:fldCharType="end"/>
-      </w:r>
-      <w:r>
-        <w:t xml:space="preserve">. Its Simulation Management and Messaging Module (SMMM) acted as a data hub: components published their results to it and read what they needed, without knowing each other. That first version exchanged data through one CSV file per component and time step and attached no meaning to the time stamps. The present paper keeps the idea of a message hub and develops it into a time-aware co-simulation method. Instead of asking how to connect program A to program B, every component publishes messages that state what their time stamps mean, and SMMM aligns them to what each receiving component needs.</w:t>
+        <w:t xml:space="preserve">This paper presents Py-CoSim, an open-source Python co-simulation framework built on a different principle: instead of connecting program A to program B, every component publishes messages to a hub and subscribes to what it needs, without knowing which component produced it. The hub, TIDE (Time-aware Interval Data Exchange), requires every message to state what its time stamp means and aligns it to what each receiving component needs. EnergyPlus is coupled through its Python application programming interface (API), and the same messages connect weather data, distributed energy resources, tariffs, ML models, LLM agents and reinforcement-learning agents.</w:t>
       </w:r>
     </w:p>
     <w:p>
@@ -1499,7 +1478,7 @@
         </w:numPr>
       </w:pPr>
       <w:r>
-        <w:t xml:space="preserve">A message model in which every exchanged value carries its time meaning (an instantaneous sample, an interval average, an interval amount, a value held until replaced, or an event) and its validity interval, and in which every input declares the window it needs relative to its own step. SMMM reconstructs each signal from its messages and aligns it automatically: time-weighted means, proportional splitting of amounts, and sample-and-hold. To our knowledge, none of the general-purpose or building co-simulation tools we reviewed attaches interval semantics to exchanged values or uses them to align data between components with different step sizes. The vocabulary itself is borrowed from data conventions (</w:t>
+        <w:t xml:space="preserve">A message model in which every exchanged value carries its time meaning (an instantaneous sample, an interval average, an interval amount, a value held until replaced, or an event) and its validity interval, and in which every input declares the window it needs relative to its own step. TIDE reconstructs each signal from its messages and aligns it automatically: time-weighted means, proportional splitting of amounts, and sample-and-hold. To our knowledge, none of the general-purpose or building co-simulation tools we reviewed attaches interval semantics to exchanged values or uses them to align data between components with different step sizes. The vocabulary itself is borrowed from data conventions (</w:t>
       </w:r>
       <w:r>
         <w:t xml:space="preserve">Section 2</w:t>
@@ -1529,7 +1508,7 @@
         </w:numPr>
       </w:pPr>
       <w:r>
-        <w:t xml:space="preserve">An open-source implementation for EnergyPlus and Python components (Py-CoSim 2.1), in which EnergyPlus can also run a finer internal time step than the exchange step. It is evaluated through verification against standalone EnergyPlus, coupling-error studies on synthetic signals and on an EnergyPlus case, reproducibility and latency experiments with stand-ins for LLM services, an overhead analysis, and a head-to-head comparison with HELICS.</w:t>
+        <w:t xml:space="preserve">An open-source implementation for EnergyPlus and Python components (https://github.com/lz356/Py-CoSim), in which EnergyPlus can also run a finer internal time step than the exchange step. It is evaluated through verification against standalone EnergyPlus, coupling-error studies on synthetic signals and on an EnergyPlus case, reproducibility and latency experiments with stand-ins for LLM services, an overhead analysis, and a head-to-head comparison with HELICS.</w:t>
       </w:r>
     </w:p>
     <w:p>
@@ -1543,7 +1522,7 @@
         <w:t xml:space="preserve">Section 3</w:t>
       </w:r>
       <w:r>
-        <w:t xml:space="preserve"> describes SMMM 2.0. </w:t>
+        <w:t xml:space="preserve"> describes TIDE. </w:t>
       </w:r>
       <w:r>
         <w:t xml:space="preserve">Section 4</w:t>
@@ -1599,7 +1578,7 @@
         <w:fldChar w:fldCharType="begin"/>
       </w:r>
       <w:r>
-        <w:instrText xml:space="preserve"> ADDIN EN.CITE &lt;EndNote&gt;&lt;Cite&gt;&lt;Author&gt;Blochwitz&lt;/Author&gt;&lt;Year&gt;2011&lt;/Year&gt;&lt;RecNum&gt;6&lt;/RecNum&gt;&lt;DisplayText&gt;[9]&lt;/DisplayText&gt;&lt;record&gt;&lt;rec-number&gt;6&lt;/rec-number&gt;&lt;foreign-keys&gt;&lt;key app="EN" db-id="mdae8500109496fea4aff9c086e16cc25895" timestamp="1793185473"&gt;6&lt;/key&gt;&lt;/foreign-keys&gt;&lt;ref-type name="Conference Paper"&gt;47&lt;/ref-type&gt;&lt;contributors&gt;&lt;authors&gt;&lt;author&gt;Blochwitz, T.&lt;/author&gt;&lt;author&gt;Otter, M.&lt;/author&gt;&lt;author&gt;Arnold, M.&lt;/author&gt;&lt;author&gt;Bausch, C.&lt;/author&gt;&lt;author&gt;Clauss, C.&lt;/author&gt;&lt;author&gt;Elmqvist, H.&lt;/author&gt;&lt;author&gt;Junghanns, A.&lt;/author&gt;&lt;author&gt;Mauss, J.&lt;/author&gt;&lt;author&gt;Monteiro, M.&lt;/author&gt;&lt;author&gt;Neidhold, T.&lt;/author&gt;&lt;author&gt;Neumerkel, D.&lt;/author&gt;&lt;author&gt;Olsson, H.&lt;/author&gt;&lt;author&gt;Peetz, J.-V.&lt;/author&gt;&lt;author&gt;Wolf, S.&lt;/author&gt;&lt;/authors&gt;&lt;/contributors&gt;&lt;titles&gt;&lt;title&gt;The Functional Mockup Interface for Tool independent Exchange of Simulation Models&lt;/title&gt;&lt;secondary-title&gt;Proceedings of the 8th International Modelica Conference&lt;/secondary-title&gt;&lt;/titles&gt;&lt;pages&gt;105-114&lt;/pages&gt;&lt;volume&gt;63&lt;/volume&gt;&lt;dates&gt;&lt;year&gt;2011&lt;/year&gt;&lt;/dates&gt;&lt;pub-location&gt;Dresden, Germany&lt;/pub-location&gt;&lt;publisher&gt;Linköping University Electronic Press&lt;/publisher&gt;&lt;label&gt;blochwitz2011&lt;/label&gt;&lt;urls&gt;&lt;/urls&gt;&lt;electronic-resource-num&gt;10.3384/ecp11063105&lt;/electronic-resource-num&gt;&lt;/record&gt;&lt;/Cite&gt;&lt;/EndNote&gt;</w:instrText>
+        <w:instrText xml:space="preserve"> ADDIN EN.CITE &lt;EndNote&gt;&lt;Cite&gt;&lt;Author&gt;Blochwitz&lt;/Author&gt;&lt;Year&gt;2011&lt;/Year&gt;&lt;RecNum&gt;6&lt;/RecNum&gt;&lt;DisplayText&gt;[9]&lt;/DisplayText&gt;&lt;record&gt;&lt;rec-number&gt;6&lt;/rec-number&gt;&lt;foreign-keys&gt;&lt;key app="EN" db-id="mdae8500109496fea4aff9c086e16cc25895" timestamp="1793216821"&gt;6&lt;/key&gt;&lt;/foreign-keys&gt;&lt;ref-type name="Conference Paper"&gt;47&lt;/ref-type&gt;&lt;contributors&gt;&lt;authors&gt;&lt;author&gt;Blochwitz, T.&lt;/author&gt;&lt;author&gt;Otter, M.&lt;/author&gt;&lt;author&gt;Arnold, M.&lt;/author&gt;&lt;author&gt;Bausch, C.&lt;/author&gt;&lt;author&gt;Clauss, C.&lt;/author&gt;&lt;author&gt;Elmqvist, H.&lt;/author&gt;&lt;author&gt;Junghanns, A.&lt;/author&gt;&lt;author&gt;Mauss, J.&lt;/author&gt;&lt;author&gt;Monteiro, M.&lt;/author&gt;&lt;author&gt;Neidhold, T.&lt;/author&gt;&lt;author&gt;Neumerkel, D.&lt;/author&gt;&lt;author&gt;Olsson, H.&lt;/author&gt;&lt;author&gt;Peetz, J.-V.&lt;/author&gt;&lt;author&gt;Wolf, S.&lt;/author&gt;&lt;/authors&gt;&lt;/contributors&gt;&lt;titles&gt;&lt;title&gt;The Functional Mockup Interface for Tool independent Exchange of Simulation Models&lt;/title&gt;&lt;secondary-title&gt;Proceedings of the 8th International Modelica Conference&lt;/secondary-title&gt;&lt;/titles&gt;&lt;pages&gt;105-114&lt;/pages&gt;&lt;volume&gt;63&lt;/volume&gt;&lt;dates&gt;&lt;year&gt;2011&lt;/year&gt;&lt;/dates&gt;&lt;pub-location&gt;Dresden, Germany&lt;/pub-location&gt;&lt;publisher&gt;Linköping University Electronic Press&lt;/publisher&gt;&lt;label&gt;blochwitz2011&lt;/label&gt;&lt;urls&gt;&lt;/urls&gt;&lt;electronic-resource-num&gt;10.3384/ecp11063105&lt;/electronic-resource-num&gt;&lt;/record&gt;&lt;/Cite&gt;&lt;/EndNote&gt;</w:instrText>
       </w:r>
       <w:r>
         <w:fldChar w:fldCharType="separate"/>
@@ -1620,7 +1599,7 @@
         <w:fldChar w:fldCharType="begin"/>
       </w:r>
       <w:r>
-        <w:instrText xml:space="preserve"> ADDIN EN.CITE &lt;EndNote&gt;&lt;Cite&gt;&lt;Author&gt;Junghanns&lt;/Author&gt;&lt;Year&gt;2021&lt;/Year&gt;&lt;RecNum&gt;42&lt;/RecNum&gt;&lt;DisplayText&gt;[10]&lt;/DisplayText&gt;&lt;record&gt;&lt;rec-number&gt;42&lt;/rec-number&gt;&lt;foreign-keys&gt;&lt;key app="EN" db-id="mdae8500109496fea4aff9c086e16cc25895" timestamp="1793185473"&gt;42&lt;/key&gt;&lt;/foreign-keys&gt;&lt;ref-type name="Conference Paper"&gt;47&lt;/ref-type&gt;&lt;contributors&gt;&lt;authors&gt;&lt;author&gt;Junghanns, Andreas&lt;/author&gt;&lt;author&gt;Blochwitz, Torsten&lt;/author&gt;&lt;author&gt;Bertsch, Christian&lt;/author&gt;&lt;author&gt;Sommer, Torsten&lt;/author&gt;&lt;author&gt;Wernersson, Karl&lt;/author&gt;&lt;author&gt;Pillekeit, Andreas&lt;/author&gt;&lt;author&gt;Zacharias, Irina&lt;/author&gt;&lt;author&gt;Blesken, Matthias&lt;/author&gt;&lt;author&gt;Mai, Pierre R.&lt;/author&gt;&lt;author&gt;Schuch, Klaus&lt;/author&gt;&lt;author&gt;Schulze, Christian&lt;/author&gt;&lt;author&gt;Gomes, Cláudio&lt;/author&gt;&lt;author&gt;Najafi, Masoud&lt;/author&gt;&lt;/authors&gt;&lt;/contributors&gt;&lt;titles&gt;&lt;title&gt;The Functional Mock-up Interface 3.0 – New Features Enabling New Applications&lt;/title&gt;&lt;secondary-title&gt;Proceedings of the 14th International Modelica Conference&lt;/secondary-title&gt;&lt;/titles&gt;&lt;pages&gt;17-26&lt;/pages&gt;&lt;volume&gt;181&lt;/volume&gt;&lt;dates&gt;&lt;year&gt;2021&lt;/year&gt;&lt;/dates&gt;&lt;pub-location&gt;Linköping, Sweden&lt;/pub-location&gt;&lt;publisher&gt;Linköping University Electronic Press&lt;/publisher&gt;&lt;label&gt;junghanns2021&lt;/label&gt;&lt;urls&gt;&lt;/urls&gt;&lt;electronic-resource-num&gt;10.3384/ecp2118117&lt;/electronic-resource-num&gt;&lt;/record&gt;&lt;/Cite&gt;&lt;/EndNote&gt;</w:instrText>
+        <w:instrText xml:space="preserve"> ADDIN EN.CITE &lt;EndNote&gt;&lt;Cite&gt;&lt;Author&gt;Junghanns&lt;/Author&gt;&lt;Year&gt;2021&lt;/Year&gt;&lt;RecNum&gt;42&lt;/RecNum&gt;&lt;DisplayText&gt;[10]&lt;/DisplayText&gt;&lt;record&gt;&lt;rec-number&gt;42&lt;/rec-number&gt;&lt;foreign-keys&gt;&lt;key app="EN" db-id="mdae8500109496fea4aff9c086e16cc25895" timestamp="1793216821"&gt;42&lt;/key&gt;&lt;/foreign-keys&gt;&lt;ref-type name="Conference Paper"&gt;47&lt;/ref-type&gt;&lt;contributors&gt;&lt;authors&gt;&lt;author&gt;Junghanns, Andreas&lt;/author&gt;&lt;author&gt;Blochwitz, Torsten&lt;/author&gt;&lt;author&gt;Bertsch, Christian&lt;/author&gt;&lt;author&gt;Sommer, Torsten&lt;/author&gt;&lt;author&gt;Wernersson, Karl&lt;/author&gt;&lt;author&gt;Pillekeit, Andreas&lt;/author&gt;&lt;author&gt;Zacharias, Irina&lt;/author&gt;&lt;author&gt;Blesken, Matthias&lt;/author&gt;&lt;author&gt;Mai, Pierre R.&lt;/author&gt;&lt;author&gt;Schuch, Klaus&lt;/author&gt;&lt;author&gt;Schulze, Christian&lt;/author&gt;&lt;author&gt;Gomes, Cláudio&lt;/author&gt;&lt;author&gt;Najafi, Masoud&lt;/author&gt;&lt;/authors&gt;&lt;/contributors&gt;&lt;titles&gt;&lt;title&gt;The Functional Mock-up Interface 3.0 – New Features Enabling New Applications&lt;/title&gt;&lt;secondary-title&gt;Proceedings of the 14th International Modelica Conference&lt;/secondary-title&gt;&lt;/titles&gt;&lt;pages&gt;17-26&lt;/pages&gt;&lt;volume&gt;181&lt;/volume&gt;&lt;dates&gt;&lt;year&gt;2021&lt;/year&gt;&lt;/dates&gt;&lt;pub-location&gt;Linköping, Sweden&lt;/pub-location&gt;&lt;publisher&gt;Linköping University Electronic Press&lt;/publisher&gt;&lt;label&gt;junghanns2021&lt;/label&gt;&lt;urls&gt;&lt;/urls&gt;&lt;electronic-resource-num&gt;10.3384/ecp2118117&lt;/electronic-resource-num&gt;&lt;/record&gt;&lt;/Cite&gt;&lt;/EndNote&gt;</w:instrText>
       </w:r>
       <w:r>
         <w:fldChar w:fldCharType="separate"/>
@@ -1641,7 +1620,7 @@
         <w:fldChar w:fldCharType="begin"/>
       </w:r>
       <w:r>
-        <w:instrText xml:space="preserve"> ADDIN EN.CITE &lt;EndNote&gt;&lt;Cite&gt;&lt;Author&gt;Modelica Association&lt;/Author&gt;&lt;Year&gt;2024&lt;/Year&gt;&lt;RecNum&gt;77&lt;/RecNum&gt;&lt;DisplayText&gt;[29]&lt;/DisplayText&gt;&lt;record&gt;&lt;rec-number&gt;77&lt;/rec-number&gt;&lt;foreign-keys&gt;&lt;key app="EN" db-id="mdae8500109496fea4aff9c086e16cc25895" timestamp="1793185473"&gt;77&lt;/key&gt;&lt;/foreign-keys&gt;&lt;ref-type name="Standard"&gt;58&lt;/ref-type&gt;&lt;contributors&gt;&lt;authors&gt;&lt;author&gt;Modelica Association&lt;/author&gt;&lt;/authors&gt;&lt;/contributors&gt;&lt;titles&gt;&lt;title&gt;System Structure and Parameterization (SSP), Version 2.0&lt;/title&gt;&lt;/titles&gt;&lt;dates&gt;&lt;year&gt;2024&lt;/year&gt;&lt;/dates&gt;&lt;label&gt;ssp2_2024&lt;/label&gt;&lt;urls&gt;&lt;related-urls&gt;&lt;url&gt;https://ssp-standard.org/docs/2.0/&lt;/url&gt;&lt;/related-urls&gt;&lt;/urls&gt;&lt;/record&gt;&lt;/Cite&gt;&lt;/EndNote&gt;</w:instrText>
+        <w:instrText xml:space="preserve"> ADDIN EN.CITE &lt;EndNote&gt;&lt;Cite&gt;&lt;Author&gt;Modelica Association&lt;/Author&gt;&lt;Year&gt;2024&lt;/Year&gt;&lt;RecNum&gt;77&lt;/RecNum&gt;&lt;DisplayText&gt;[28]&lt;/DisplayText&gt;&lt;record&gt;&lt;rec-number&gt;77&lt;/rec-number&gt;&lt;foreign-keys&gt;&lt;key app="EN" db-id="mdae8500109496fea4aff9c086e16cc25895" timestamp="1793216821"&gt;77&lt;/key&gt;&lt;/foreign-keys&gt;&lt;ref-type name="Standard"&gt;58&lt;/ref-type&gt;&lt;contributors&gt;&lt;authors&gt;&lt;author&gt;Modelica Association&lt;/author&gt;&lt;/authors&gt;&lt;/contributors&gt;&lt;titles&gt;&lt;title&gt;System Structure and Parameterization (SSP), Version 2.0&lt;/title&gt;&lt;/titles&gt;&lt;dates&gt;&lt;year&gt;2024&lt;/year&gt;&lt;/dates&gt;&lt;label&gt;ssp2_2024&lt;/label&gt;&lt;urls&gt;&lt;related-urls&gt;&lt;url&gt;https://ssp-standard.org/docs/2.0/&lt;/url&gt;&lt;/related-urls&gt;&lt;/urls&gt;&lt;/record&gt;&lt;/Cite&gt;&lt;/EndNote&gt;</w:instrText>
       </w:r>
       <w:r>
         <w:fldChar w:fldCharType="separate"/>
@@ -1650,69 +1629,69 @@
         <w:rPr>
           <w:noProof/>
         </w:rPr>
+        <w:t>[28]</w:t>
+      </w:r>
+      <w:r>
+        <w:fldChar w:fldCharType="end"/>
+      </w:r>
+      <w:r>
+        <w:t xml:space="preserve">. Neither standard says whether an output is an average or a total over the communication step.</w:t>
+      </w:r>
+    </w:p>
+    <w:p>
+      <w:pPr>
+        <w:pStyle w:val="BodyText"/>
+      </w:pPr>
+      <w:r>
+        <w:t xml:space="preserve">How the units are stepped is the job of a master algorithm. Kübler and Schiehlen compared Jacobi and Gauss–Seidel coupling and the role of direct feedthrough </w:t>
+      </w:r>
+      <w:r>
+        <w:fldChar w:fldCharType="begin"/>
+      </w:r>
+      <w:r>
+        <w:instrText xml:space="preserve"> ADDIN EN.CITE &lt;EndNote&gt;&lt;Cite&gt;&lt;Author&gt;Kübler&lt;/Author&gt;&lt;Year&gt;2000&lt;/Year&gt;&lt;RecNum&gt;47&lt;/RecNum&gt;&lt;DisplayText&gt;[22]&lt;/DisplayText&gt;&lt;record&gt;&lt;rec-number&gt;47&lt;/rec-number&gt;&lt;foreign-keys&gt;&lt;key app="EN" db-id="mdae8500109496fea4aff9c086e16cc25895" timestamp="1793216821"&gt;47&lt;/key&gt;&lt;/foreign-keys&gt;&lt;ref-type name="Journal Article"&gt;17&lt;/ref-type&gt;&lt;contributors&gt;&lt;authors&gt;&lt;author&gt;Kübler, R.&lt;/author&gt;&lt;author&gt;Schiehlen, W.&lt;/author&gt;&lt;/authors&gt;&lt;/contributors&gt;&lt;titles&gt;&lt;title&gt;Two Methods of Simulator Coupling&lt;/title&gt;&lt;secondary-title&gt;Mathematical and Computer Modelling of Dynamical Systems&lt;/secondary-title&gt;&lt;alt-title&gt;Math. Comput. Model. Dyn. Syst.&lt;/alt-title&gt;&lt;/titles&gt;&lt;periodical&gt;&lt;full-title&gt;Mathematical and Computer Modelling of Dynamical Systems&lt;/full-title&gt;&lt;abbr-1&gt;Math. Comput. Model. Dyn. Syst.&lt;/abbr-1&gt;&lt;/periodical&gt;&lt;pages&gt;93-113&lt;/pages&gt;&lt;volume&gt;6&lt;/volume&gt;&lt;number&gt;2&lt;/number&gt;&lt;dates&gt;&lt;year&gt;2000&lt;/year&gt;&lt;/dates&gt;&lt;publisher&gt;Taylor &amp;amp; Francis&lt;/publisher&gt;&lt;label&gt;kubler2000&lt;/label&gt;&lt;urls&gt;&lt;/urls&gt;&lt;electronic-resource-num&gt;10.1076/1387-3954(200006)6:2;1-M;FT093&lt;/electronic-resource-num&gt;&lt;/record&gt;&lt;/Cite&gt;&lt;/EndNote&gt;</w:instrText>
+      </w:r>
+      <w:r>
+        <w:fldChar w:fldCharType="separate"/>
+      </w:r>
+      <w:r>
+        <w:rPr>
+          <w:noProof/>
+        </w:rPr>
+        <w:t>[22]</w:t>
+      </w:r>
+      <w:r>
+        <w:fldChar w:fldCharType="end"/>
+      </w:r>
+      <w:r>
+        <w:t xml:space="preserve">. Broman et al. stated the conditions under which a master composing FMUs gives determinate results </w:t>
+      </w:r>
+      <w:r>
+        <w:fldChar w:fldCharType="begin"/>
+      </w:r>
+      <w:r>
+        <w:instrText xml:space="preserve"> ADDIN EN.CITE &lt;EndNote&gt;&lt;Cite&gt;&lt;Author&gt;Broman&lt;/Author&gt;&lt;Year&gt;2013&lt;/Year&gt;&lt;RecNum&gt;8&lt;/RecNum&gt;&lt;DisplayText&gt;[29]&lt;/DisplayText&gt;&lt;record&gt;&lt;rec-number&gt;8&lt;/rec-number&gt;&lt;foreign-keys&gt;&lt;key app="EN" db-id="mdae8500109496fea4aff9c086e16cc25895" timestamp="1793216821"&gt;8&lt;/key&gt;&lt;/foreign-keys&gt;&lt;ref-type name="Conference Paper"&gt;47&lt;/ref-type&gt;&lt;contributors&gt;&lt;authors&gt;&lt;author&gt;Broman, David&lt;/author&gt;&lt;author&gt;Brooks, Christopher&lt;/author&gt;&lt;author&gt;Greenberg, Lev&lt;/author&gt;&lt;author&gt;Lee, Edward A.&lt;/author&gt;&lt;author&gt;Masin, Michael&lt;/author&gt;&lt;author&gt;Tripakis, Stavros&lt;/author&gt;&lt;author&gt;Wetter, Michael&lt;/author&gt;&lt;/authors&gt;&lt;/contributors&gt;&lt;titles&gt;&lt;title&gt;Determinate composition of FMUs for co-simulation&lt;/title&gt;&lt;secondary-title&gt;2013 Proceedings of the International Conference on Embedded Software (EMSOFT)&lt;/secondary-title&gt;&lt;/titles&gt;&lt;pages&gt;1-12&lt;/pages&gt;&lt;dates&gt;&lt;year&gt;2013&lt;/year&gt;&lt;/dates&gt;&lt;pub-location&gt;Montreal, QC, Canada&lt;/pub-location&gt;&lt;publisher&gt;IEEE&lt;/publisher&gt;&lt;label&gt;broman2013&lt;/label&gt;&lt;urls&gt;&lt;/urls&gt;&lt;electronic-resource-num&gt;10.1109/EMSOFT.2013.6658580&lt;/electronic-resource-num&gt;&lt;/record&gt;&lt;/Cite&gt;&lt;/EndNote&gt;</w:instrText>
+      </w:r>
+      <w:r>
+        <w:fldChar w:fldCharType="separate"/>
+      </w:r>
+      <w:r>
+        <w:rPr>
+          <w:noProof/>
+        </w:rPr>
         <w:t>[29]</w:t>
       </w:r>
       <w:r>
         <w:fldChar w:fldCharType="end"/>
       </w:r>
       <w:r>
-        <w:t xml:space="preserve">. Neither standard says whether an output is an average or a total over the communication step.</w:t>
-      </w:r>
-    </w:p>
-    <w:p>
-      <w:pPr>
-        <w:pStyle w:val="BodyText"/>
-      </w:pPr>
-      <w:r>
-        <w:t xml:space="preserve">How the units are stepped is the job of a master algorithm. Kübler and Schiehlen compared Jacobi and Gauss–Seidel coupling and the role of direct feedthrough </w:t>
+        <w:t xml:space="preserve">, and Gomes et al. surveyed the field, including how signals are reconstructed between communication points by holding or extrapolating them </w:t>
       </w:r>
       <w:r>
         <w:fldChar w:fldCharType="begin"/>
       </w:r>
       <w:r>
-        <w:instrText xml:space="preserve"> ADDIN EN.CITE &lt;EndNote&gt;&lt;Cite&gt;&lt;Author&gt;Kübler&lt;/Author&gt;&lt;Year&gt;2000&lt;/Year&gt;&lt;RecNum&gt;47&lt;/RecNum&gt;&lt;DisplayText&gt;[22]&lt;/DisplayText&gt;&lt;record&gt;&lt;rec-number&gt;47&lt;/rec-number&gt;&lt;foreign-keys&gt;&lt;key app="EN" db-id="mdae8500109496fea4aff9c086e16cc25895" timestamp="1793185473"&gt;47&lt;/key&gt;&lt;/foreign-keys&gt;&lt;ref-type name="Journal Article"&gt;17&lt;/ref-type&gt;&lt;contributors&gt;&lt;authors&gt;&lt;author&gt;Kübler, R.&lt;/author&gt;&lt;author&gt;Schiehlen, W.&lt;/author&gt;&lt;/authors&gt;&lt;/contributors&gt;&lt;titles&gt;&lt;title&gt;Two Methods of Simulator Coupling&lt;/title&gt;&lt;secondary-title&gt;Mathematical and Computer Modelling of Dynamical Systems&lt;/secondary-title&gt;&lt;alt-title&gt;Math. Comput. Model. Dyn. Syst.&lt;/alt-title&gt;&lt;/titles&gt;&lt;periodical&gt;&lt;full-title&gt;Mathematical and Computer Modelling of Dynamical Systems&lt;/full-title&gt;&lt;abbr-1&gt;Math. Comput. Model. Dyn. Syst.&lt;/abbr-1&gt;&lt;/periodical&gt;&lt;pages&gt;93-113&lt;/pages&gt;&lt;volume&gt;6&lt;/volume&gt;&lt;number&gt;2&lt;/number&gt;&lt;dates&gt;&lt;year&gt;2000&lt;/year&gt;&lt;/dates&gt;&lt;publisher&gt;Taylor &amp;amp; Francis&lt;/publisher&gt;&lt;label&gt;kubler2000&lt;/label&gt;&lt;urls&gt;&lt;/urls&gt;&lt;electronic-resource-num&gt;10.1076/1387-3954(200006)6:2;1-M;FT093&lt;/electronic-resource-num&gt;&lt;/record&gt;&lt;/Cite&gt;&lt;/EndNote&gt;</w:instrText>
-      </w:r>
-      <w:r>
-        <w:fldChar w:fldCharType="separate"/>
-      </w:r>
-      <w:r>
-        <w:rPr>
-          <w:noProof/>
-        </w:rPr>
-        <w:t>[22]</w:t>
-      </w:r>
-      <w:r>
-        <w:fldChar w:fldCharType="end"/>
-      </w:r>
-      <w:r>
-        <w:t xml:space="preserve">. Broman et al. stated the conditions under which a master composing FMUs gives determinate results </w:t>
-      </w:r>
-      <w:r>
-        <w:fldChar w:fldCharType="begin"/>
-      </w:r>
-      <w:r>
-        <w:instrText xml:space="preserve"> ADDIN EN.CITE &lt;EndNote&gt;&lt;Cite&gt;&lt;Author&gt;Broman&lt;/Author&gt;&lt;Year&gt;2013&lt;/Year&gt;&lt;RecNum&gt;8&lt;/RecNum&gt;&lt;DisplayText&gt;[30]&lt;/DisplayText&gt;&lt;record&gt;&lt;rec-number&gt;8&lt;/rec-number&gt;&lt;foreign-keys&gt;&lt;key app="EN" db-id="mdae8500109496fea4aff9c086e16cc25895" timestamp="1793185473"&gt;8&lt;/key&gt;&lt;/foreign-keys&gt;&lt;ref-type name="Conference Paper"&gt;47&lt;/ref-type&gt;&lt;contributors&gt;&lt;authors&gt;&lt;author&gt;Broman, David&lt;/author&gt;&lt;author&gt;Brooks, Christopher&lt;/author&gt;&lt;author&gt;Greenberg, Lev&lt;/author&gt;&lt;author&gt;Lee, Edward A.&lt;/author&gt;&lt;author&gt;Masin, Michael&lt;/author&gt;&lt;author&gt;Tripakis, Stavros&lt;/author&gt;&lt;author&gt;Wetter, Michael&lt;/author&gt;&lt;/authors&gt;&lt;/contributors&gt;&lt;titles&gt;&lt;title&gt;Determinate composition of FMUs for co-simulation&lt;/title&gt;&lt;secondary-title&gt;2013 Proceedings of the International Conference on Embedded Software (EMSOFT)&lt;/secondary-title&gt;&lt;/titles&gt;&lt;pages&gt;1-12&lt;/pages&gt;&lt;dates&gt;&lt;year&gt;2013&lt;/year&gt;&lt;/dates&gt;&lt;pub-location&gt;Montreal, QC, Canada&lt;/pub-location&gt;&lt;publisher&gt;IEEE&lt;/publisher&gt;&lt;label&gt;broman2013&lt;/label&gt;&lt;urls&gt;&lt;/urls&gt;&lt;electronic-resource-num&gt;10.1109/EMSOFT.2013.6658580&lt;/electronic-resource-num&gt;&lt;/record&gt;&lt;/Cite&gt;&lt;/EndNote&gt;</w:instrText>
-      </w:r>
-      <w:r>
-        <w:fldChar w:fldCharType="separate"/>
-      </w:r>
-      <w:r>
-        <w:rPr>
-          <w:noProof/>
-        </w:rPr>
-        <w:t>[30]</w:t>
-      </w:r>
-      <w:r>
-        <w:fldChar w:fldCharType="end"/>
-      </w:r>
-      <w:r>
-        <w:t xml:space="preserve">, and Gomes et al. surveyed the field, including how signals are reconstructed between communication points by holding or extrapolating them </w:t>
-      </w:r>
-      <w:r>
-        <w:fldChar w:fldCharType="begin"/>
-      </w:r>
-      <w:r>
-        <w:instrText xml:space="preserve"> ADDIN EN.CITE &lt;EndNote&gt;&lt;Cite&gt;&lt;Author&gt;Gomes&lt;/Author&gt;&lt;Year&gt;2018&lt;/Year&gt;&lt;RecNum&gt;26&lt;/RecNum&gt;&lt;DisplayText&gt;[7]&lt;/DisplayText&gt;&lt;record&gt;&lt;rec-number&gt;26&lt;/rec-number&gt;&lt;foreign-keys&gt;&lt;key app="EN" db-id="mdae8500109496fea4aff9c086e16cc25895" timestamp="1793185473"&gt;26&lt;/key&gt;&lt;/foreign-keys&gt;&lt;ref-type name="Journal Article"&gt;17&lt;/ref-type&gt;&lt;contributors&gt;&lt;authors&gt;&lt;author&gt;Gomes, Cláudio&lt;/author&gt;&lt;author&gt;Thule, Casper&lt;/author&gt;&lt;author&gt;Broman, David&lt;/author&gt;&lt;author&gt;Larsen, Peter Gorm&lt;/author&gt;&lt;author&gt;Vangheluwe, Hans&lt;/author&gt;&lt;/authors&gt;&lt;/contributors&gt;&lt;titles&gt;&lt;title&gt;Co-Simulation: A Survey&lt;/title&gt;&lt;secondary-title&gt;ACM Computing Surveys&lt;/secondary-title&gt;&lt;alt-title&gt;ACM Comput. Surv.&lt;/alt-title&gt;&lt;/titles&gt;&lt;periodical&gt;&lt;full-title&gt;ACM Computing Surveys&lt;/full-title&gt;&lt;abbr-1&gt;ACM Comput. Surv.&lt;/abbr-1&gt;&lt;/periodical&gt;&lt;pages&gt;49&lt;/pages&gt;&lt;volume&gt;51&lt;/volume&gt;&lt;number&gt;3&lt;/number&gt;&lt;dates&gt;&lt;year&gt;2018&lt;/year&gt;&lt;/dates&gt;&lt;publisher&gt;ACM&lt;/publisher&gt;&lt;label&gt;gomes2018&lt;/label&gt;&lt;urls&gt;&lt;/urls&gt;&lt;electronic-resource-num&gt;10.1145/3179993&lt;/electronic-resource-num&gt;&lt;/record&gt;&lt;/Cite&gt;&lt;/EndNote&gt;</w:instrText>
+        <w:instrText xml:space="preserve"> ADDIN EN.CITE &lt;EndNote&gt;&lt;Cite&gt;&lt;Author&gt;Gomes&lt;/Author&gt;&lt;Year&gt;2018&lt;/Year&gt;&lt;RecNum&gt;26&lt;/RecNum&gt;&lt;DisplayText&gt;[7]&lt;/DisplayText&gt;&lt;record&gt;&lt;rec-number&gt;26&lt;/rec-number&gt;&lt;foreign-keys&gt;&lt;key app="EN" db-id="mdae8500109496fea4aff9c086e16cc25895" timestamp="1793216821"&gt;26&lt;/key&gt;&lt;/foreign-keys&gt;&lt;ref-type name="Journal Article"&gt;17&lt;/ref-type&gt;&lt;contributors&gt;&lt;authors&gt;&lt;author&gt;Gomes, Cláudio&lt;/author&gt;&lt;author&gt;Thule, Casper&lt;/author&gt;&lt;author&gt;Broman, David&lt;/author&gt;&lt;author&gt;Larsen, Peter Gorm&lt;/author&gt;&lt;author&gt;Vangheluwe, Hans&lt;/author&gt;&lt;/authors&gt;&lt;/contributors&gt;&lt;titles&gt;&lt;title&gt;Co-Simulation: A Survey&lt;/title&gt;&lt;secondary-title&gt;ACM Computing Surveys&lt;/secondary-title&gt;&lt;alt-title&gt;ACM Comput. Surv.&lt;/alt-title&gt;&lt;/titles&gt;&lt;periodical&gt;&lt;full-title&gt;ACM Computing Surveys&lt;/full-title&gt;&lt;abbr-1&gt;ACM Comput. Surv.&lt;/abbr-1&gt;&lt;/periodical&gt;&lt;pages&gt;49&lt;/pages&gt;&lt;volume&gt;51&lt;/volume&gt;&lt;number&gt;3&lt;/number&gt;&lt;dates&gt;&lt;year&gt;2018&lt;/year&gt;&lt;/dates&gt;&lt;publisher&gt;ACM&lt;/publisher&gt;&lt;label&gt;gomes2018&lt;/label&gt;&lt;urls&gt;&lt;/urls&gt;&lt;electronic-resource-num&gt;10.1145/3179993&lt;/electronic-resource-num&gt;&lt;/record&gt;&lt;/Cite&gt;&lt;/EndNote&gt;</w:instrText>
       </w:r>
       <w:r>
         <w:fldChar w:fldCharType="separate"/>
@@ -1732,10 +1711,10 @@
       <w:r>
         <w:fldChar w:fldCharType="begin">
           <w:fldData xml:space="preserve">PEVuZE5vdGU+PENpdGU+PEF1dGhvcj5CZW5lZGlrdDwvQXV0aG9yPjxZZWFyPjIwMTM8L1llYXI+
-PFJlY051bT4zPC9SZWNOdW0+PERpc3BsYXlUZXh0PlszMSwzMl08L0Rpc3BsYXlUZXh0PjxyZWNv
+PFJlY051bT4zPC9SZWNOdW0+PERpc3BsYXlUZXh0PlszMCwzMV08L0Rpc3BsYXlUZXh0PjxyZWNv
 cmQ+PHJlYy1udW1iZXI+MzwvcmVjLW51bWJlcj48Zm9yZWlnbi1rZXlzPjxrZXkgYXBwPSJFTiIg
 ZGItaWQ9Im1kYWU4NTAwMTA5NDk2ZmVhNGFmZjljMDg2ZTE2Y2MyNTg5NSIgdGltZXN0YW1wPSIx
-NzkzMTg1NDczIj4zPC9rZXk+PC9mb3JlaWduLWtleXM+PHJlZi10eXBlIG5hbWU9IkNvbmZlcmVu
+NzkzMjE2ODIxIj4zPC9rZXk+PC9mb3JlaWduLWtleXM+PHJlZi10eXBlIG5hbWU9IkNvbmZlcmVu
 Y2UgUGFwZXIiPjQ3PC9yZWYtdHlwZT48Y29udHJpYnV0b3JzPjxhdXRob3JzPjxhdXRob3I+QmVu
 ZWRpa3QsIE0uPC9hdXRob3I+PGF1dGhvcj5XYXR6ZW5pZywgRC48L2F1dGhvcj48YXV0aG9yPlpl
 aGV0bmVyLCBKLjwvYXV0aG9yPjxhdXRob3I+SG9mZXIsIEEuPC9hdXRob3I+PC9hdXRob3JzPjwv
@@ -1752,7 +1731,7 @@
 dXJscz48L3VybHM+PC9yZWNvcmQ+PC9DaXRlPjxDaXRlPjxBdXRob3I+U2FkamluYTwvQXV0aG9y
 PjxZZWFyPjIwMTc8L1llYXI+PFJlY051bT43MTwvUmVjTnVtPjxyZWNvcmQ+PHJlYy1udW1iZXI+
 NzE8L3JlYy1udW1iZXI+PGZvcmVpZ24ta2V5cz48a2V5IGFwcD0iRU4iIGRiLWlkPSJtZGFlODUw
-MDEwOTQ5NmZlYTRhZmY5YzA4NmUxNmNjMjU4OTUiIHRpbWVzdGFtcD0iMTc5MzE4NTQ3MyI+NzE8
+MDEwOTQ5NmZlYTRhZmY5YzA4NmUxNmNjMjU4OTUiIHRpbWVzdGFtcD0iMTc5MzIxNjgyMSI+NzE8
 L2tleT48L2ZvcmVpZ24ta2V5cz48cmVmLXR5cGUgbmFtZT0iSm91cm5hbCBBcnRpY2xlIj4xNzwv
 cmVmLXR5cGU+PGNvbnRyaWJ1dG9ycz48YXV0aG9ycz48YXV0aG9yPlNhZGppbmEsIFNldmVyaW48
 L2F1dGhvcj48YXV0aG9yPkt5bGxpbmdzdGFkLCBMYXJzIFQuPC9hdXRob3I+PGF1dGhvcj5Ta2pv
@@ -1777,10 +1756,10 @@
       <w:r>
         <w:fldChar w:fldCharType="begin">
           <w:fldData xml:space="preserve">PEVuZE5vdGU+PENpdGU+PEF1dGhvcj5CZW5lZGlrdDwvQXV0aG9yPjxZZWFyPjIwMTM8L1llYXI+
-PFJlY051bT4zPC9SZWNOdW0+PERpc3BsYXlUZXh0PlszMSwzMl08L0Rpc3BsYXlUZXh0PjxyZWNv
+PFJlY051bT4zPC9SZWNOdW0+PERpc3BsYXlUZXh0PlszMCwzMV08L0Rpc3BsYXlUZXh0PjxyZWNv
 cmQ+PHJlYy1udW1iZXI+MzwvcmVjLW51bWJlcj48Zm9yZWlnbi1rZXlzPjxrZXkgYXBwPSJFTiIg
 ZGItaWQ9Im1kYWU4NTAwMTA5NDk2ZmVhNGFmZjljMDg2ZTE2Y2MyNTg5NSIgdGltZXN0YW1wPSIx
-NzkzMTg1NDczIj4zPC9rZXk+PC9mb3JlaWduLWtleXM+PHJlZi10eXBlIG5hbWU9IkNvbmZlcmVu
+NzkzMjE2ODIxIj4zPC9rZXk+PC9mb3JlaWduLWtleXM+PHJlZi10eXBlIG5hbWU9IkNvbmZlcmVu
 Y2UgUGFwZXIiPjQ3PC9yZWYtdHlwZT48Y29udHJpYnV0b3JzPjxhdXRob3JzPjxhdXRob3I+QmVu
 ZWRpa3QsIE0uPC9hdXRob3I+PGF1dGhvcj5XYXR6ZW5pZywgRC48L2F1dGhvcj48YXV0aG9yPlpl
 aGV0bmVyLCBKLjwvYXV0aG9yPjxhdXRob3I+SG9mZXIsIEEuPC9hdXRob3I+PC9hdXRob3JzPjwv
@@ -1797,7 +1776,7 @@
 dXJscz48L3VybHM+PC9yZWNvcmQ+PC9DaXRlPjxDaXRlPjxBdXRob3I+U2FkamluYTwvQXV0aG9y
 PjxZZWFyPjIwMTc8L1llYXI+PFJlY051bT43MTwvUmVjTnVtPjxyZWNvcmQ+PHJlYy1udW1iZXI+
 NzE8L3JlYy1udW1iZXI+PGZvcmVpZ24ta2V5cz48a2V5IGFwcD0iRU4iIGRiLWlkPSJtZGFlODUw
-MDEwOTQ5NmZlYTRhZmY5YzA4NmUxNmNjMjU4OTUiIHRpbWVzdGFtcD0iMTc5MzE4NTQ3MyI+NzE8
+MDEwOTQ5NmZlYTRhZmY5YzA4NmUxNmNjMjU4OTUiIHRpbWVzdGFtcD0iMTc5MzIxNjgyMSI+NzE8
 L2tleT48L2ZvcmVpZ24ta2V5cz48cmVmLXR5cGUgbmFtZT0iSm91cm5hbCBBcnRpY2xlIj4xNzwv
 cmVmLXR5cGU+PGNvbnRyaWJ1dG9ycz48YXV0aG9ycz48YXV0aG9yPlNhZGppbmEsIFNldmVyaW48
 L2F1dGhvcj48YXV0aG9yPkt5bGxpbmdzdGFkLCBMYXJzIFQuPC9hdXRob3I+PGF1dGhvcj5Ta2pv
@@ -1829,7 +1808,7 @@
         <w:rPr>
           <w:noProof/>
         </w:rPr>
-        <w:t>[31,32]</w:t>
+        <w:t>[30,31]</w:t>
       </w:r>
       <w:r>
         <w:fldChar w:fldCharType="end"/>
@@ -1843,7 +1822,7 @@
 PFJlY051bT44MTwvUmVjTnVtPjxEaXNwbGF5VGV4dD5bMjMsMjRdPC9EaXNwbGF5VGV4dD48cmVj
 b3JkPjxyZWMtbnVtYmVyPjgxPC9yZWMtbnVtYmVyPjxmb3JlaWduLWtleXM+PGtleSBhcHA9IkVO
 IiBkYi1pZD0ibWRhZTg1MDAxMDk0OTZmZWE0YWZmOWMwODZlMTZjYzI1ODk1IiB0aW1lc3RhbXA9
-IjE3OTMxODU0NzMiPjgxPC9rZXk+PC9mb3JlaWduLWtleXM+PHJlZi10eXBlIG5hbWU9IkNvbmZl
+IjE3OTMyMTY4MjEiPjgxPC9rZXk+PC9mb3JlaWduLWtleXM+PHJlZi10eXBlIG5hbWU9IkNvbmZl
 cmVuY2UgUGFwZXIiPjQ3PC9yZWYtdHlwZT48Y29udHJpYnV0b3JzPjxhdXRob3JzPjxhdXRob3I+
 VHJpcGFraXMsIFN0YXZyb3M8L2F1dGhvcj48L2F1dGhvcnM+PC9jb250cmlidXRvcnM+PHRpdGxl
 cz48dGl0bGU+QnJpZGdpbmcgdGhlIHNlbWFudGljIGdhcCBiZXR3ZWVuIGhldGVyb2dlbmVvdXMg
@@ -1858,7 +1837,7 @@
 bWVzPC9BdXRob3I+PFllYXI+MjAxOTwvWWVhcj48UmVjTnVtPjI3PC9SZWNOdW0+PHJlY29yZD48
 cmVjLW51bWJlcj4yNzwvcmVjLW51bWJlcj48Zm9yZWlnbi1rZXlzPjxrZXkgYXBwPSJFTiIgZGIt
 aWQ9Im1kYWU4NTAwMTA5NDk2ZmVhNGFmZjljMDg2ZTE2Y2MyNTg5NSIgdGltZXN0YW1wPSIxNzkz
-MTg1NDczIj4yNzwva2V5PjwvZm9yZWlnbi1rZXlzPjxyZWYtdHlwZSBuYW1lPSJKb3VybmFsIEFy
+MjE2ODIxIj4yNzwva2V5PjwvZm9yZWlnbi1rZXlzPjxyZWYtdHlwZSBuYW1lPSJKb3VybmFsIEFy
 dGljbGUiPjE3PC9yZWYtdHlwZT48Y29udHJpYnV0b3JzPjxhdXRob3JzPjxhdXRob3I+R29tZXMs
 IENsw6F1ZGlvPC9hdXRob3I+PGF1dGhvcj5NZXllcnMsIEJhcnQ8L2F1dGhvcj48YXV0aG9yPkRl
 bmlsLCBKb2FjaGltPC9hdXRob3I+PGF1dGhvcj5UaHVsZSwgQ2FzcGVyPC9hdXRob3I+PGF1dGhv
@@ -1885,7 +1864,7 @@
 PFJlY051bT44MTwvUmVjTnVtPjxEaXNwbGF5VGV4dD5bMjMsMjRdPC9EaXNwbGF5VGV4dD48cmVj
 b3JkPjxyZWMtbnVtYmVyPjgxPC9yZWMtbnVtYmVyPjxmb3JlaWduLWtleXM+PGtleSBhcHA9IkVO
 IiBkYi1pZD0ibWRhZTg1MDAxMDk0OTZmZWE0YWZmOWMwODZlMTZjYzI1ODk1IiB0aW1lc3RhbXA9
-IjE3OTMxODU0NzMiPjgxPC9rZXk+PC9mb3JlaWduLWtleXM+PHJlZi10eXBlIG5hbWU9IkNvbmZl
+IjE3OTMyMTY4MjEiPjgxPC9rZXk+PC9mb3JlaWduLWtleXM+PHJlZi10eXBlIG5hbWU9IkNvbmZl
 cmVuY2UgUGFwZXIiPjQ3PC9yZWYtdHlwZT48Y29udHJpYnV0b3JzPjxhdXRob3JzPjxhdXRob3I+
 VHJpcGFraXMsIFN0YXZyb3M8L2F1dGhvcj48L2F1dGhvcnM+PC9jb250cmlidXRvcnM+PHRpdGxl
 cz48dGl0bGU+QnJpZGdpbmcgdGhlIHNlbWFudGljIGdhcCBiZXR3ZWVuIGhldGVyb2dlbmVvdXMg
@@ -1900,7 +1879,7 @@
 bWVzPC9BdXRob3I+PFllYXI+MjAxOTwvWWVhcj48UmVjTnVtPjI3PC9SZWNOdW0+PHJlY29yZD48
 cmVjLW51bWJlcj4yNzwvcmVjLW51bWJlcj48Zm9yZWlnbi1rZXlzPjxrZXkgYXBwPSJFTiIgZGIt
 aWQ9Im1kYWU4NTAwMTA5NDk2ZmVhNGFmZjljMDg2ZTE2Y2MyNTg5NSIgdGltZXN0YW1wPSIxNzkz
-MTg1NDczIj4yNzwva2V5PjwvZm9yZWlnbi1rZXlzPjxyZWYtdHlwZSBuYW1lPSJKb3VybmFsIEFy
+MjE2ODIxIj4yNzwva2V5PjwvZm9yZWlnbi1rZXlzPjxyZWYtdHlwZSBuYW1lPSJKb3VybmFsIEFy
 dGljbGUiPjE3PC9yZWYtdHlwZT48Y29udHJpYnV0b3JzPjxhdXRob3JzPjxhdXRob3I+R29tZXMs
 IENsw6F1ZGlvPC9hdXRob3I+PGF1dGhvcj5NZXllcnMsIEJhcnQ8L2F1dGhvcj48YXV0aG9yPkRl
 bmlsLCBKb2FjaGltPC9hdXRob3I+PGF1dGhvcj5UaHVsZSwgQ2FzcGVyPC9hdXRob3I+PGF1dGhv
@@ -1959,7 +1938,7 @@
         <w:fldChar w:fldCharType="begin"/>
       </w:r>
       <w:r>
-        <w:instrText xml:space="preserve"> ADDIN EN.CITE &lt;EndNote&gt;&lt;Cite&gt;&lt;Author&gt;IEEE&lt;/Author&gt;&lt;Year&gt;2010&lt;/Year&gt;&lt;RecNum&gt;38&lt;/RecNum&gt;&lt;DisplayText&gt;[33,34]&lt;/DisplayText&gt;&lt;record&gt;&lt;rec-number&gt;38&lt;/rec-number&gt;&lt;foreign-keys&gt;&lt;key app="EN" db-id="mdae8500109496fea4aff9c086e16cc25895" timestamp="1793185473"&gt;38&lt;/key&gt;&lt;/foreign-keys&gt;&lt;ref-type name="Standard"&gt;58&lt;/ref-type&gt;&lt;contributors&gt;&lt;authors&gt;&lt;author&gt;IEEE&lt;/author&gt;&lt;/authors&gt;&lt;/contributors&gt;&lt;titles&gt;&lt;title&gt;IEEE Standard for Modeling and Simulation (M&amp;amp;S) High Level Architecture (HLA) – Framework and Rules&lt;/title&gt;&lt;secondary-title&gt;IEEE Std 1516-2010&lt;/secondary-title&gt;&lt;/titles&gt;&lt;dates&gt;&lt;year&gt;2010&lt;/year&gt;&lt;/dates&gt;&lt;isbn&gt;978-0-7381-6251-5&lt;/isbn&gt;&lt;label&gt;ieee1516_2010&lt;/label&gt;&lt;urls&gt;&lt;related-urls&gt;&lt;url&gt;https://ieeexplore.ieee.org/document/5553440&lt;/url&gt;&lt;/related-urls&gt;&lt;/urls&gt;&lt;electronic-resource-num&gt;10.1109/IEEESTD.2010.5553440&lt;/electronic-resource-num&gt;&lt;/record&gt;&lt;/Cite&gt;&lt;Cite&gt;&lt;Author&gt;Fujimoto&lt;/Author&gt;&lt;Year&gt;2000&lt;/Year&gt;&lt;RecNum&gt;25&lt;/RecNum&gt;&lt;record&gt;&lt;rec-number&gt;25&lt;/rec-number&gt;&lt;foreign-keys&gt;&lt;key app="EN" db-id="mdae8500109496fea4aff9c086e16cc25895" timestamp="1793185473"&gt;25&lt;/key&gt;&lt;/foreign-keys&gt;&lt;ref-type name="Book"&gt;6&lt;/ref-type&gt;&lt;contributors&gt;&lt;authors&gt;&lt;author&gt;Fujimoto, Richard M.&lt;/author&gt;&lt;/authors&gt;&lt;/contributors&gt;&lt;titles&gt;&lt;title&gt;Parallel and Distributed Simulation Systems&lt;/title&gt;&lt;secondary-title&gt;Wiley Series on Parallel and Distributed Computing&lt;/secondary-title&gt;&lt;/titles&gt;&lt;dates&gt;&lt;year&gt;2000&lt;/year&gt;&lt;/dates&gt;&lt;publisher&gt;John Wiley &amp;amp; Sons&lt;/publisher&gt;&lt;isbn&gt;978-0-471-18383-9&lt;/isbn&gt;&lt;label&gt;fujimoto2000&lt;/label&gt;&lt;urls&gt;&lt;/urls&gt;&lt;/record&gt;&lt;/Cite&gt;&lt;/EndNote&gt;</w:instrText>
+        <w:instrText xml:space="preserve"> ADDIN EN.CITE &lt;EndNote&gt;&lt;Cite&gt;&lt;Author&gt;IEEE&lt;/Author&gt;&lt;Year&gt;2010&lt;/Year&gt;&lt;RecNum&gt;38&lt;/RecNum&gt;&lt;DisplayText&gt;[32,33]&lt;/DisplayText&gt;&lt;record&gt;&lt;rec-number&gt;38&lt;/rec-number&gt;&lt;foreign-keys&gt;&lt;key app="EN" db-id="mdae8500109496fea4aff9c086e16cc25895" timestamp="1793216821"&gt;38&lt;/key&gt;&lt;/foreign-keys&gt;&lt;ref-type name="Standard"&gt;58&lt;/ref-type&gt;&lt;contributors&gt;&lt;authors&gt;&lt;author&gt;IEEE&lt;/author&gt;&lt;/authors&gt;&lt;/contributors&gt;&lt;titles&gt;&lt;title&gt;IEEE Standard for Modeling and Simulation (M&amp;amp;S) High Level Architecture (HLA) – Framework and Rules&lt;/title&gt;&lt;secondary-title&gt;IEEE Std 1516-2010&lt;/secondary-title&gt;&lt;/titles&gt;&lt;dates&gt;&lt;year&gt;2010&lt;/year&gt;&lt;/dates&gt;&lt;isbn&gt;978-0-7381-6251-5&lt;/isbn&gt;&lt;label&gt;ieee1516_2010&lt;/label&gt;&lt;urls&gt;&lt;related-urls&gt;&lt;url&gt;https://ieeexplore.ieee.org/document/5553440&lt;/url&gt;&lt;/related-urls&gt;&lt;/urls&gt;&lt;electronic-resource-num&gt;10.1109/IEEESTD.2010.5553440&lt;/electronic-resource-num&gt;&lt;/record&gt;&lt;/Cite&gt;&lt;Cite&gt;&lt;Author&gt;Fujimoto&lt;/Author&gt;&lt;Year&gt;2000&lt;/Year&gt;&lt;RecNum&gt;25&lt;/RecNum&gt;&lt;record&gt;&lt;rec-number&gt;25&lt;/rec-number&gt;&lt;foreign-keys&gt;&lt;key app="EN" db-id="mdae8500109496fea4aff9c086e16cc25895" timestamp="1793216821"&gt;25&lt;/key&gt;&lt;/foreign-keys&gt;&lt;ref-type name="Book"&gt;6&lt;/ref-type&gt;&lt;contributors&gt;&lt;authors&gt;&lt;author&gt;Fujimoto, Richard M.&lt;/author&gt;&lt;/authors&gt;&lt;/contributors&gt;&lt;titles&gt;&lt;title&gt;Parallel and Distributed Simulation Systems&lt;/title&gt;&lt;secondary-title&gt;Wiley Series on Parallel and Distributed Computing&lt;/secondary-title&gt;&lt;/titles&gt;&lt;dates&gt;&lt;year&gt;2000&lt;/year&gt;&lt;/dates&gt;&lt;publisher&gt;John Wiley &amp;amp; Sons&lt;/publisher&gt;&lt;isbn&gt;978-0-471-18383-9&lt;/isbn&gt;&lt;label&gt;fujimoto2000&lt;/label&gt;&lt;urls&gt;&lt;/urls&gt;&lt;/record&gt;&lt;/Cite&gt;&lt;/EndNote&gt;</w:instrText>
       </w:r>
       <w:r>
         <w:fldChar w:fldCharType="separate"/>
@@ -1968,7 +1947,7 @@
         <w:rPr>
           <w:noProof/>
         </w:rPr>
-        <w:t>[33,34]</w:t>
+        <w:t>[32,33]</w:t>
       </w:r>
       <w:r>
         <w:fldChar w:fldCharType="end"/>
@@ -1979,10 +1958,10 @@
       <w:r>
         <w:fldChar w:fldCharType="begin">
           <w:fldData xml:space="preserve">PEVuZE5vdGU+PENpdGU+PEF1dGhvcj5QYWxtaW50aWVyPC9BdXRob3I+PFllYXI+MjAxNzwvWWVh
-cj48UmVjTnVtPjY4PC9SZWNOdW0+PERpc3BsYXlUZXh0PlsxNywxOCwzNV08L0Rpc3BsYXlUZXh0
+cj48UmVjTnVtPjY4PC9SZWNOdW0+PERpc3BsYXlUZXh0PlsxNywxOCwzNF08L0Rpc3BsYXlUZXh0
 PjxyZWNvcmQ+PHJlYy1udW1iZXI+Njg8L3JlYy1udW1iZXI+PGZvcmVpZ24ta2V5cz48a2V5IGFw
 cD0iRU4iIGRiLWlkPSJtZGFlODUwMDEwOTQ5NmZlYTRhZmY5YzA4NmUxNmNjMjU4OTUiIHRpbWVz
-dGFtcD0iMTc5MzE4NTQ3MyI+Njg8L2tleT48L2ZvcmVpZ24ta2V5cz48cmVmLXR5cGUgbmFtZT0i
+dGFtcD0iMTc5MzIxNjgyMSI+Njg8L2tleT48L2ZvcmVpZ24ta2V5cz48cmVmLXR5cGUgbmFtZT0i
 Q29uZmVyZW5jZSBQYXBlciI+NDc8L3JlZi10eXBlPjxjb250cmlidXRvcnM+PGF1dGhvcnM+PGF1
 dGhvcj5QYWxtaW50aWVyLCBCcnlhbjwvYXV0aG9yPjxhdXRob3I+S3Jpc2huYW11cnRoeSwgRGhl
 ZXBhazwvYXV0aG9yPjxhdXRob3I+VG9wLCBQaGlsaXA8L2F1dGhvcj48YXV0aG9yPlNtaXRoLCBT
@@ -2000,7 +1979,7 @@
 PkhhcmR5PC9BdXRob3I+PFllYXI+MjAyNDwvWWVhcj48UmVjTnVtPjI5PC9SZWNOdW0+PHJlY29y
 ZD48cmVjLW51bWJlcj4yOTwvcmVjLW51bWJlcj48Zm9yZWlnbi1rZXlzPjxrZXkgYXBwPSJFTiIg
 ZGItaWQ9Im1kYWU4NTAwMTA5NDk2ZmVhNGFmZjljMDg2ZTE2Y2MyNTg5NSIgdGltZXN0YW1wPSIx
-NzkzMTg1NDczIj4yOTwva2V5PjwvZm9yZWlnbi1rZXlzPjxyZWYtdHlwZSBuYW1lPSJKb3VybmFs
+NzkzMjE2ODIxIj4yOTwva2V5PjwvZm9yZWlnbi1rZXlzPjxyZWYtdHlwZSBuYW1lPSJKb3VybmFs
 IEFydGljbGUiPjE3PC9yZWYtdHlwZT48Y29udHJpYnV0b3JzPjxhdXRob3JzPjxhdXRob3I+SGFy
 ZHksIFRyZXZvciBELjwvYXV0aG9yPjxhdXRob3I+UGFsbWludGllciwgQnJ5YW48L2F1dGhvcj48
 YXV0aG9yPlRvcCwgUGhpbGlwIEwuPC9hdXRob3I+PGF1dGhvcj5LcmlzaG5hbXVydGh5LCBEaGVl
@@ -2017,8 +1996,8 @@
 PjwvcmVjb3JkPjwvQ2l0ZT48Q2l0ZT48QXV0aG9yPkhFTElDUyBkZXZlbG9wZXJzIChHTUxDLVRE
 Qyk8L0F1dGhvcj48WWVhcj4yMDI2PC9ZZWFyPjxSZWNOdW0+MzE8L1JlY051bT48cmVjb3JkPjxy
 ZWMtbnVtYmVyPjMxPC9yZWMtbnVtYmVyPjxmb3JlaWduLWtleXM+PGtleSBhcHA9IkVOIiBkYi1p
-ZD0ibWRhZTg1MDAxMDk0OTZmZWE0YWZmOWMwODZlMTZjYzI1ODk1IiB0aW1lc3RhbXA9IjE3OTMx
-ODU0NzMiPjMxPC9rZXk+PC9mb3JlaWduLWtleXM+PHJlZi10eXBlIG5hbWU9IldlYiBQYWdlIj4x
+ZD0ibWRhZTg1MDAxMDk0OTZmZWE0YWZmOWMwODZlMTZjYzI1ODk1IiB0aW1lc3RhbXA9IjE3OTMy
+MTY4MjEiPjMxPC9rZXk+PC9mb3JlaWduLWtleXM+PHJlZi10eXBlIG5hbWU9IldlYiBQYWdlIj4x
 MjwvcmVmLXR5cGU+PGNvbnRyaWJ1dG9ycz48YXV0aG9ycz48YXV0aG9yPkhFTElDUyBkZXZlbG9w
 ZXJzIChHTUxDLVREQyk8L2F1dGhvcj48L2F1dGhvcnM+PC9jb250cmlidXRvcnM+PHRpdGxlcz48
 dGl0bGU+SEVMSUNTIGRvY3VtZW50YXRpb248L3RpdGxlPjwvdGl0bGVzPjxkYXRlcz48eWVhcj4y
@@ -2034,10 +2013,10 @@
       <w:r>
         <w:fldChar w:fldCharType="begin">
           <w:fldData xml:space="preserve">PEVuZE5vdGU+PENpdGU+PEF1dGhvcj5QYWxtaW50aWVyPC9BdXRob3I+PFllYXI+MjAxNzwvWWVh
-cj48UmVjTnVtPjY4PC9SZWNOdW0+PERpc3BsYXlUZXh0PlsxNywxOCwzNV08L0Rpc3BsYXlUZXh0
+cj48UmVjTnVtPjY4PC9SZWNOdW0+PERpc3BsYXlUZXh0PlsxNywxOCwzNF08L0Rpc3BsYXlUZXh0
 PjxyZWNvcmQ+PHJlYy1udW1iZXI+Njg8L3JlYy1udW1iZXI+PGZvcmVpZ24ta2V5cz48a2V5IGFw
 cD0iRU4iIGRiLWlkPSJtZGFlODUwMDEwOTQ5NmZlYTRhZmY5YzA4NmUxNmNjMjU4OTUiIHRpbWVz
-dGFtcD0iMTc5MzE4NTQ3MyI+Njg8L2tleT48L2ZvcmVpZ24ta2V5cz48cmVmLXR5cGUgbmFtZT0i
+dGFtcD0iMTc5MzIxNjgyMSI+Njg8L2tleT48L2ZvcmVpZ24ta2V5cz48cmVmLXR5cGUgbmFtZT0i
 Q29uZmVyZW5jZSBQYXBlciI+NDc8L3JlZi10eXBlPjxjb250cmlidXRvcnM+PGF1dGhvcnM+PGF1
 dGhvcj5QYWxtaW50aWVyLCBCcnlhbjwvYXV0aG9yPjxhdXRob3I+S3Jpc2huYW11cnRoeSwgRGhl
 ZXBhazwvYXV0aG9yPjxhdXRob3I+VG9wLCBQaGlsaXA8L2F1dGhvcj48YXV0aG9yPlNtaXRoLCBT
@@ -2055,7 +2034,7 @@
 PkhhcmR5PC9BdXRob3I+PFllYXI+MjAyNDwvWWVhcj48UmVjTnVtPjI5PC9SZWNOdW0+PHJlY29y
 ZD48cmVjLW51bWJlcj4yOTwvcmVjLW51bWJlcj48Zm9yZWlnbi1rZXlzPjxrZXkgYXBwPSJFTiIg
 ZGItaWQ9Im1kYWU4NTAwMTA5NDk2ZmVhNGFmZjljMDg2ZTE2Y2MyNTg5NSIgdGltZXN0YW1wPSIx
-NzkzMTg1NDczIj4yOTwva2V5PjwvZm9yZWlnbi1rZXlzPjxyZWYtdHlwZSBuYW1lPSJKb3VybmFs
+NzkzMjE2ODIxIj4yOTwva2V5PjwvZm9yZWlnbi1rZXlzPjxyZWYtdHlwZSBuYW1lPSJKb3VybmFs
 IEFydGljbGUiPjE3PC9yZWYtdHlwZT48Y29udHJpYnV0b3JzPjxhdXRob3JzPjxhdXRob3I+SGFy
 ZHksIFRyZXZvciBELjwvYXV0aG9yPjxhdXRob3I+UGFsbWludGllciwgQnJ5YW48L2F1dGhvcj48
 YXV0aG9yPlRvcCwgUGhpbGlwIEwuPC9hdXRob3I+PGF1dGhvcj5LcmlzaG5hbXVydGh5LCBEaGVl
@@ -2072,8 +2051,8 @@
 PjwvcmVjb3JkPjwvQ2l0ZT48Q2l0ZT48QXV0aG9yPkhFTElDUyBkZXZlbG9wZXJzIChHTUxDLVRE
 Qyk8L0F1dGhvcj48WWVhcj4yMDI2PC9ZZWFyPjxSZWNOdW0+MzE8L1JlY051bT48cmVjb3JkPjxy
 ZWMtbnVtYmVyPjMxPC9yZWMtbnVtYmVyPjxmb3JlaWduLWtleXM+PGtleSBhcHA9IkVOIiBkYi1p
-ZD0ibWRhZTg1MDAxMDk0OTZmZWE0YWZmOWMwODZlMTZjYzI1ODk1IiB0aW1lc3RhbXA9IjE3OTMx
-ODU0NzMiPjMxPC9rZXk+PC9mb3JlaWduLWtleXM+PHJlZi10eXBlIG5hbWU9IldlYiBQYWdlIj4x
+ZD0ibWRhZTg1MDAxMDk0OTZmZWE0YWZmOWMwODZlMTZjYzI1ODk1IiB0aW1lc3RhbXA9IjE3OTMy
+MTY4MjEiPjMxPC9rZXk+PC9mb3JlaWduLWtleXM+PHJlZi10eXBlIG5hbWU9IldlYiBQYWdlIj4x
 MjwvcmVmLXR5cGU+PGNvbnRyaWJ1dG9ycz48YXV0aG9ycz48YXV0aG9yPkhFTElDUyBkZXZlbG9w
 ZXJzIChHTUxDLVREQyk8L2F1dGhvcj48L2F1dGhvcnM+PC9jb250cmlidXRvcnM+PHRpdGxlcz48
 dGl0bGU+SEVMSUNTIGRvY3VtZW50YXRpb248L3RpdGxlPjwvdGl0bGVzPjxkYXRlcz48eWVhcj4y
@@ -2096,7 +2075,7 @@
         <w:rPr>
           <w:noProof/>
         </w:rPr>
-        <w:t>[17,18,35]</w:t>
+        <w:t>[17,18,34]</w:t>
       </w:r>
       <w:r>
         <w:fldChar w:fldCharType="end"/>
@@ -2108,7 +2087,7 @@
         <w:fldChar w:fldCharType="begin"/>
       </w:r>
       <w:r>
-        <w:instrText xml:space="preserve"> ADDIN EN.CITE &lt;EndNote&gt;&lt;Cite&gt;&lt;Author&gt;Ofenloch&lt;/Author&gt;&lt;Year&gt;2022&lt;/Year&gt;&lt;RecNum&gt;62&lt;/RecNum&gt;&lt;DisplayText&gt;[20,36]&lt;/DisplayText&gt;&lt;record&gt;&lt;rec-number&gt;62&lt;/rec-number&gt;&lt;foreign-keys&gt;&lt;key app="EN" db-id="mdae8500109496fea4aff9c086e16cc25895" timestamp="1793185473"&gt;62&lt;/key&gt;&lt;/foreign-keys&gt;&lt;ref-type name="Conference Paper"&gt;47&lt;/ref-type&gt;&lt;contributors&gt;&lt;authors&gt;&lt;author&gt;Ofenloch, Annika&lt;/author&gt;&lt;author&gt;Schwarz, Jan Sören&lt;/author&gt;&lt;author&gt;Tolk, Deborah&lt;/author&gt;&lt;author&gt;Brandt, Tobias&lt;/author&gt;&lt;author&gt;Eilers, Reef&lt;/author&gt;&lt;author&gt;Ramirez, Rebeca&lt;/author&gt;&lt;author&gt;Raub, Thomas&lt;/author&gt;&lt;author&gt;Lehnhoff, Sebastian&lt;/author&gt;&lt;/authors&gt;&lt;/contributors&gt;&lt;titles&gt;&lt;title&gt;MOSAIK 3.0: Combining Time-Stepped and Discrete Event Simulation&lt;/title&gt;&lt;secondary-title&gt;2022 Open Source Modelling and Simulation of Energy Systems (OSMSES)&lt;/secondary-title&gt;&lt;/titles&gt;&lt;pages&gt;1-5&lt;/pages&gt;&lt;dates&gt;&lt;year&gt;2022&lt;/year&gt;&lt;/dates&gt;&lt;pub-location&gt;Aachen, Germany&lt;/pub-location&gt;&lt;publisher&gt;IEEE&lt;/publisher&gt;&lt;label&gt;ofenloch2022&lt;/label&gt;&lt;urls&gt;&lt;/urls&gt;&lt;electronic-resource-num&gt;10.1109/OSMSES54027.2022.9769116&lt;/electronic-resource-num&gt;&lt;/record&gt;&lt;/Cite&gt;&lt;Cite&gt;&lt;Author&gt;OFFIS&lt;/Author&gt;&lt;Year&gt;2025&lt;/Year&gt;&lt;RecNum&gt;56&lt;/RecNum&gt;&lt;record&gt;&lt;rec-number&gt;56&lt;/rec-number&gt;&lt;foreign-keys&gt;&lt;key app="EN" db-id="mdae8500109496fea4aff9c086e16cc25895" timestamp="1793185473"&gt;56&lt;/key&gt;&lt;/foreign-keys&gt;&lt;ref-type name="Web Page"&gt;12&lt;/ref-type&gt;&lt;contributors&gt;&lt;authors&gt;&lt;author&gt;OFFIS&lt;/author&gt;&lt;/authors&gt;&lt;/contributors&gt;&lt;titles&gt;&lt;title&gt;mosaik documentation&lt;/title&gt;&lt;/titles&gt;&lt;dates&gt;&lt;year&gt;2025&lt;/year&gt;&lt;/dates&gt;&lt;label&gt;mosaik_docs&lt;/label&gt;&lt;urls&gt;&lt;related-urls&gt;&lt;url&gt;https://mosaik.readthedocs.io/en/3.5.0/&lt;/url&gt;&lt;/related-urls&gt;&lt;/urls&gt;&lt;access-date&gt;2026-10-28&lt;/access-date&gt;&lt;/record&gt;&lt;/Cite&gt;&lt;/EndNote&gt;</w:instrText>
+        <w:instrText xml:space="preserve"> ADDIN EN.CITE &lt;EndNote&gt;&lt;Cite&gt;&lt;Author&gt;Ofenloch&lt;/Author&gt;&lt;Year&gt;2022&lt;/Year&gt;&lt;RecNum&gt;62&lt;/RecNum&gt;&lt;DisplayText&gt;[20,35]&lt;/DisplayText&gt;&lt;record&gt;&lt;rec-number&gt;62&lt;/rec-number&gt;&lt;foreign-keys&gt;&lt;key app="EN" db-id="mdae8500109496fea4aff9c086e16cc25895" timestamp="1793216821"&gt;62&lt;/key&gt;&lt;/foreign-keys&gt;&lt;ref-type name="Conference Paper"&gt;47&lt;/ref-type&gt;&lt;contributors&gt;&lt;authors&gt;&lt;author&gt;Ofenloch, Annika&lt;/author&gt;&lt;author&gt;Schwarz, Jan Sören&lt;/author&gt;&lt;author&gt;Tolk, Deborah&lt;/author&gt;&lt;author&gt;Brandt, Tobias&lt;/author&gt;&lt;author&gt;Eilers, Reef&lt;/author&gt;&lt;author&gt;Ramirez, Rebeca&lt;/author&gt;&lt;author&gt;Raub, Thomas&lt;/author&gt;&lt;author&gt;Lehnhoff, Sebastian&lt;/author&gt;&lt;/authors&gt;&lt;/contributors&gt;&lt;titles&gt;&lt;title&gt;MOSAIK 3.0: Combining Time-Stepped and Discrete Event Simulation&lt;/title&gt;&lt;secondary-title&gt;2022 Open Source Modelling and Simulation of Energy Systems (OSMSES)&lt;/secondary-title&gt;&lt;/titles&gt;&lt;pages&gt;1-5&lt;/pages&gt;&lt;dates&gt;&lt;year&gt;2022&lt;/year&gt;&lt;/dates&gt;&lt;pub-location&gt;Aachen, Germany&lt;/pub-location&gt;&lt;publisher&gt;IEEE&lt;/publisher&gt;&lt;label&gt;ofenloch2022&lt;/label&gt;&lt;urls&gt;&lt;/urls&gt;&lt;electronic-resource-num&gt;10.1109/OSMSES54027.2022.9769116&lt;/electronic-resource-num&gt;&lt;/record&gt;&lt;/Cite&gt;&lt;Cite&gt;&lt;Author&gt;OFFIS&lt;/Author&gt;&lt;Year&gt;2025&lt;/Year&gt;&lt;RecNum&gt;56&lt;/RecNum&gt;&lt;record&gt;&lt;rec-number&gt;56&lt;/rec-number&gt;&lt;foreign-keys&gt;&lt;key app="EN" db-id="mdae8500109496fea4aff9c086e16cc25895" timestamp="1793216821"&gt;56&lt;/key&gt;&lt;/foreign-keys&gt;&lt;ref-type name="Web Page"&gt;12&lt;/ref-type&gt;&lt;contributors&gt;&lt;authors&gt;&lt;author&gt;OFFIS&lt;/author&gt;&lt;/authors&gt;&lt;/contributors&gt;&lt;titles&gt;&lt;title&gt;mosaik documentation&lt;/title&gt;&lt;/titles&gt;&lt;dates&gt;&lt;year&gt;2025&lt;/year&gt;&lt;/dates&gt;&lt;label&gt;mosaik_docs&lt;/label&gt;&lt;urls&gt;&lt;related-urls&gt;&lt;url&gt;https://mosaik.readthedocs.io/en/3.5.0/&lt;/url&gt;&lt;/related-urls&gt;&lt;/urls&gt;&lt;access-date&gt;2026-10-28&lt;/access-date&gt;&lt;/record&gt;&lt;/Cite&gt;&lt;/EndNote&gt;</w:instrText>
       </w:r>
       <w:r>
         <w:fldChar w:fldCharType="separate"/>
@@ -2117,7 +2096,7 @@
         <w:rPr>
           <w:noProof/>
         </w:rPr>
-        <w:t>[20,36]</w:t>
+        <w:t>[20,35]</w:t>
       </w:r>
       <w:r>
         <w:fldChar w:fldCharType="end"/>
@@ -2128,10 +2107,10 @@
       <w:r>
         <w:fldChar w:fldCharType="begin">
           <w:fldData xml:space="preserve">PEVuZE5vdGU+PENpdGU+PEF1dGhvcj5XZW48L0F1dGhvcj48WWVhcj4yMDI0PC9ZZWFyPjxSZWNO
-dW0+ODQ8L1JlY051bT48RGlzcGxheVRleHQ+WzM3LDM4XTwvRGlzcGxheVRleHQ+PHJlY29yZD48
+dW0+ODQ8L1JlY051bT48RGlzcGxheVRleHQ+WzM2LDM3XTwvRGlzcGxheVRleHQ+PHJlY29yZD48
 cmVjLW51bWJlcj44NDwvcmVjLW51bWJlcj48Zm9yZWlnbi1rZXlzPjxrZXkgYXBwPSJFTiIgZGIt
 aWQ9Im1kYWU4NTAwMTA5NDk2ZmVhNGFmZjljMDg2ZTE2Y2MyNTg5NSIgdGltZXN0YW1wPSIxNzkz
-MTg1NDczIj44NDwva2V5PjwvZm9yZWlnbi1rZXlzPjxyZWYtdHlwZSBuYW1lPSJKb3VybmFsIEFy
+MjE2ODIxIj44NDwva2V5PjwvZm9yZWlnbi1rZXlzPjxyZWYtdHlwZSBuYW1lPSJKb3VybmFsIEFy
 dGljbGUiPjE3PC9yZWYtdHlwZT48Y29udHJpYnV0b3JzPjxhdXRob3JzPjxhdXRob3I+V2VuLCBK
 aWFuZmVuZzwvYXV0aG9yPjxhdXRob3I+SmlhbmcsIExpbjwvYXV0aG9yPjxhdXRob3I+Q2hlbiwg
 WXV5aW5nPC9hdXRob3I+PGF1dGhvcj5DaHUsIENoaWEtQ2hpPC9hdXRob3I+PGF1dGhvcj5aaHUs
@@ -2150,7 +2129,7 @@
 ZD48L0NpdGU+PENpdGU+PEF1dGhvcj5QYWR1YW5pPC9BdXRob3I+PFllYXI+MjAyMzwvWWVhcj48
 UmVjTnVtPjY3PC9SZWNOdW0+PHJlY29yZD48cmVjLW51bWJlcj42NzwvcmVjLW51bWJlcj48Zm9y
 ZWlnbi1rZXlzPjxrZXkgYXBwPSJFTiIgZGItaWQ9Im1kYWU4NTAwMTA5NDk2ZmVhNGFmZjljMDg2
-ZTE2Y2MyNTg5NSIgdGltZXN0YW1wPSIxNzkzMTg1NDczIj42Nzwva2V5PjwvZm9yZWlnbi1rZXlz
+ZTE2Y2MyNTg5NSIgdGltZXN0YW1wPSIxNzkzMjE2ODIxIj42Nzwva2V5PjwvZm9yZWlnbi1rZXlz
 PjxyZWYtdHlwZSBuYW1lPSJDb25mZXJlbmNlIFBhcGVyIj40NzwvcmVmLXR5cGU+PGNvbnRyaWJ1
 dG9ycz48YXV0aG9ycz48YXV0aG9yPlBhZHVhbmksIFZpY3RvcjwvYXV0aG9yPjxhdXRob3I+S2Fk
 YXZpbCwgUmFodWw8L2F1dGhvcj48YXV0aG9yPkhvb3NoeWFyLCBIb3NzZWluPC9hdXRob3I+PGF1
@@ -2173,10 +2152,10 @@
       <w:r>
         <w:fldChar w:fldCharType="begin">
           <w:fldData xml:space="preserve">PEVuZE5vdGU+PENpdGU+PEF1dGhvcj5XZW48L0F1dGhvcj48WWVhcj4yMDI0PC9ZZWFyPjxSZWNO
-dW0+ODQ8L1JlY051bT48RGlzcGxheVRleHQ+WzM3LDM4XTwvRGlzcGxheVRleHQ+PHJlY29yZD48
+dW0+ODQ8L1JlY051bT48RGlzcGxheVRleHQ+WzM2LDM3XTwvRGlzcGxheVRleHQ+PHJlY29yZD48
 cmVjLW51bWJlcj44NDwvcmVjLW51bWJlcj48Zm9yZWlnbi1rZXlzPjxrZXkgYXBwPSJFTiIgZGIt
 aWQ9Im1kYWU4NTAwMTA5NDk2ZmVhNGFmZjljMDg2ZTE2Y2MyNTg5NSIgdGltZXN0YW1wPSIxNzkz
-MTg1NDczIj44NDwva2V5PjwvZm9yZWlnbi1rZXlzPjxyZWYtdHlwZSBuYW1lPSJKb3VybmFsIEFy
+MjE2ODIxIj44NDwva2V5PjwvZm9yZWlnbi1rZXlzPjxyZWYtdHlwZSBuYW1lPSJKb3VybmFsIEFy
 dGljbGUiPjE3PC9yZWYtdHlwZT48Y29udHJpYnV0b3JzPjxhdXRob3JzPjxhdXRob3I+V2VuLCBK
 aWFuZmVuZzwvYXV0aG9yPjxhdXRob3I+SmlhbmcsIExpbjwvYXV0aG9yPjxhdXRob3I+Q2hlbiwg
 WXV5aW5nPC9hdXRob3I+PGF1dGhvcj5DaHUsIENoaWEtQ2hpPC9hdXRob3I+PGF1dGhvcj5aaHUs
@@ -2195,7 +2174,7 @@
 ZD48L0NpdGU+PENpdGU+PEF1dGhvcj5QYWR1YW5pPC9BdXRob3I+PFllYXI+MjAyMzwvWWVhcj48
 UmVjTnVtPjY3PC9SZWNOdW0+PHJlY29yZD48cmVjLW51bWJlcj42NzwvcmVjLW51bWJlcj48Zm9y
 ZWlnbi1rZXlzPjxrZXkgYXBwPSJFTiIgZGItaWQ9Im1kYWU4NTAwMTA5NDk2ZmVhNGFmZjljMDg2
-ZTE2Y2MyNTg5NSIgdGltZXN0YW1wPSIxNzkzMTg1NDczIj42Nzwva2V5PjwvZm9yZWlnbi1rZXlz
+ZTE2Y2MyNTg5NSIgdGltZXN0YW1wPSIxNzkzMjE2ODIxIj42Nzwva2V5PjwvZm9yZWlnbi1rZXlz
 PjxyZWYtdHlwZSBuYW1lPSJDb25mZXJlbmNlIFBhcGVyIj40NzwvcmVmLXR5cGU+PGNvbnRyaWJ1
 dG9ycz48YXV0aG9ycz48YXV0aG9yPlBhZHVhbmksIFZpY3RvcjwvYXV0aG9yPjxhdXRob3I+S2Fk
 YXZpbCwgUmFodWw8L2F1dGhvcj48YXV0aG9yPkhvb3NoeWFyLCBIb3NzZWluPC9hdXRob3I+PGF1
@@ -2225,7 +2204,7 @@
         <w:rPr>
           <w:noProof/>
         </w:rPr>
-        <w:t>[37,38]</w:t>
+        <w:t>[36,37]</w:t>
       </w:r>
       <w:r>
         <w:fldChar w:fldCharType="end"/>
@@ -2237,7 +2216,7 @@
         <w:fldChar w:fldCharType="begin"/>
       </w:r>
       <w:r>
-        <w:instrText xml:space="preserve"> ADDIN EN.CITE &lt;EndNote&gt;&lt;Cite&gt;&lt;Author&gt;Katipamula&lt;/Author&gt;&lt;Year&gt;2016&lt;/Year&gt;&lt;RecNum&gt;44&lt;/RecNum&gt;&lt;DisplayText&gt;[39]&lt;/DisplayText&gt;&lt;record&gt;&lt;rec-number&gt;44&lt;/rec-number&gt;&lt;foreign-keys&gt;&lt;key app="EN" db-id="mdae8500109496fea4aff9c086e16cc25895" timestamp="1793185473"&gt;44&lt;/key&gt;&lt;/foreign-keys&gt;&lt;ref-type name="Journal Article"&gt;17&lt;/ref-type&gt;&lt;contributors&gt;&lt;authors&gt;&lt;author&gt;Katipamula, Srinivas&lt;/author&gt;&lt;author&gt;Haack, Jereme&lt;/author&gt;&lt;author&gt;Hernandez, George&lt;/author&gt;&lt;author&gt;Akyol, Bora&lt;/author&gt;&lt;author&gt;Hagerman, Joseph&lt;/author&gt;&lt;/authors&gt;&lt;/contributors&gt;&lt;titles&gt;&lt;title&gt;VOLTTRON: An Open-Source Software Platform of the Future&lt;/title&gt;&lt;secondary-title&gt;IEEE Electrification Magazine&lt;/secondary-title&gt;&lt;alt-title&gt;IEEE Electrif. Mag.&lt;/alt-title&gt;&lt;/titles&gt;&lt;periodical&gt;&lt;full-title&gt;IEEE Electrification Magazine&lt;/full-title&gt;&lt;abbr-1&gt;IEEE Electrif. Mag.&lt;/abbr-1&gt;&lt;/periodical&gt;&lt;pages&gt;15-22&lt;/pages&gt;&lt;volume&gt;4&lt;/volume&gt;&lt;number&gt;4&lt;/number&gt;&lt;dates&gt;&lt;year&gt;2016&lt;/year&gt;&lt;/dates&gt;&lt;publisher&gt;IEEE&lt;/publisher&gt;&lt;label&gt;katipamula2016&lt;/label&gt;&lt;urls&gt;&lt;/urls&gt;&lt;electronic-resource-num&gt;10.1109/MELE.2016.2614178&lt;/electronic-resource-num&gt;&lt;/record&gt;&lt;/Cite&gt;&lt;/EndNote&gt;</w:instrText>
+        <w:instrText xml:space="preserve"> ADDIN EN.CITE &lt;EndNote&gt;&lt;Cite&gt;&lt;Author&gt;Katipamula&lt;/Author&gt;&lt;Year&gt;2016&lt;/Year&gt;&lt;RecNum&gt;44&lt;/RecNum&gt;&lt;DisplayText&gt;[38]&lt;/DisplayText&gt;&lt;record&gt;&lt;rec-number&gt;44&lt;/rec-number&gt;&lt;foreign-keys&gt;&lt;key app="EN" db-id="mdae8500109496fea4aff9c086e16cc25895" timestamp="1793216821"&gt;44&lt;/key&gt;&lt;/foreign-keys&gt;&lt;ref-type name="Journal Article"&gt;17&lt;/ref-type&gt;&lt;contributors&gt;&lt;authors&gt;&lt;author&gt;Katipamula, Srinivas&lt;/author&gt;&lt;author&gt;Haack, Jereme&lt;/author&gt;&lt;author&gt;Hernandez, George&lt;/author&gt;&lt;author&gt;Akyol, Bora&lt;/author&gt;&lt;author&gt;Hagerman, Joseph&lt;/author&gt;&lt;/authors&gt;&lt;/contributors&gt;&lt;titles&gt;&lt;title&gt;VOLTTRON: An Open-Source Software Platform of the Future&lt;/title&gt;&lt;secondary-title&gt;IEEE Electrification Magazine&lt;/secondary-title&gt;&lt;alt-title&gt;IEEE Electrif. Mag.&lt;/alt-title&gt;&lt;/titles&gt;&lt;periodical&gt;&lt;full-title&gt;IEEE Electrification Magazine&lt;/full-title&gt;&lt;abbr-1&gt;IEEE Electrif. Mag.&lt;/abbr-1&gt;&lt;/periodical&gt;&lt;pages&gt;15-22&lt;/pages&gt;&lt;volume&gt;4&lt;/volume&gt;&lt;number&gt;4&lt;/number&gt;&lt;dates&gt;&lt;year&gt;2016&lt;/year&gt;&lt;/dates&gt;&lt;publisher&gt;IEEE&lt;/publisher&gt;&lt;label&gt;katipamula2016&lt;/label&gt;&lt;urls&gt;&lt;/urls&gt;&lt;electronic-resource-num&gt;10.1109/MELE.2016.2614178&lt;/electronic-resource-num&gt;&lt;/record&gt;&lt;/Cite&gt;&lt;/EndNote&gt;</w:instrText>
       </w:r>
       <w:r>
         <w:fldChar w:fldCharType="separate"/>
@@ -2246,7 +2225,7 @@
         <w:rPr>
           <w:noProof/>
         </w:rPr>
-        <w:t>[39]</w:t>
+        <w:t>[38]</w:t>
       </w:r>
       <w:r>
         <w:fldChar w:fldCharType="end"/>
@@ -2258,7 +2237,7 @@
         <w:fldChar w:fldCharType="begin"/>
       </w:r>
       <w:r>
-        <w:instrText xml:space="preserve"> ADDIN EN.CITE &lt;EndNote&gt;&lt;Cite&gt;&lt;Author&gt;HELICS developers (GMLC-TDC)&lt;/Author&gt;&lt;Year&gt;2026&lt;/Year&gt;&lt;RecNum&gt;31&lt;/RecNum&gt;&lt;DisplayText&gt;[35,36]&lt;/DisplayText&gt;&lt;record&gt;&lt;rec-number&gt;31&lt;/rec-number&gt;&lt;foreign-keys&gt;&lt;key app="EN" db-id="mdae8500109496fea4aff9c086e16cc25895" timestamp="1793185473"&gt;31&lt;/key&gt;&lt;/foreign-keys&gt;&lt;ref-type name="Web Page"&gt;12&lt;/ref-type&gt;&lt;contributors&gt;&lt;authors&gt;&lt;author&gt;HELICS developers (GMLC-TDC)&lt;/author&gt;&lt;/authors&gt;&lt;/contributors&gt;&lt;titles&gt;&lt;title&gt;HELICS documentation&lt;/title&gt;&lt;/titles&gt;&lt;dates&gt;&lt;year&gt;2026&lt;/year&gt;&lt;/dates&gt;&lt;label&gt;helics_docs&lt;/label&gt;&lt;urls&gt;&lt;related-urls&gt;&lt;url&gt;https://docs.helics.org/en/latest/&lt;/url&gt;&lt;/related-urls&gt;&lt;/urls&gt;&lt;access-date&gt;2026-10-28&lt;/access-date&gt;&lt;/record&gt;&lt;/Cite&gt;&lt;Cite&gt;&lt;Author&gt;OFFIS&lt;/Author&gt;&lt;Year&gt;2025&lt;/Year&gt;&lt;RecNum&gt;56&lt;/RecNum&gt;&lt;record&gt;&lt;rec-number&gt;56&lt;/rec-number&gt;&lt;foreign-keys&gt;&lt;key app="EN" db-id="mdae8500109496fea4aff9c086e16cc25895" timestamp="1793185473"&gt;56&lt;/key&gt;&lt;/foreign-keys&gt;&lt;ref-type name="Web Page"&gt;12&lt;/ref-type&gt;&lt;contributors&gt;&lt;authors&gt;&lt;author&gt;OFFIS&lt;/author&gt;&lt;/authors&gt;&lt;/contributors&gt;&lt;titles&gt;&lt;title&gt;mosaik documentation&lt;/title&gt;&lt;/titles&gt;&lt;dates&gt;&lt;year&gt;2025&lt;/year&gt;&lt;/dates&gt;&lt;label&gt;mosaik_docs&lt;/label&gt;&lt;urls&gt;&lt;related-urls&gt;&lt;url&gt;https://mosaik.readthedocs.io/en/3.5.0/&lt;/url&gt;&lt;/related-urls&gt;&lt;/urls&gt;&lt;access-date&gt;2026-10-28&lt;/access-date&gt;&lt;/record&gt;&lt;/Cite&gt;&lt;/EndNote&gt;</w:instrText>
+        <w:instrText xml:space="preserve"> ADDIN EN.CITE &lt;EndNote&gt;&lt;Cite&gt;&lt;Author&gt;HELICS developers (GMLC-TDC)&lt;/Author&gt;&lt;Year&gt;2026&lt;/Year&gt;&lt;RecNum&gt;31&lt;/RecNum&gt;&lt;DisplayText&gt;[34,35]&lt;/DisplayText&gt;&lt;record&gt;&lt;rec-number&gt;31&lt;/rec-number&gt;&lt;foreign-keys&gt;&lt;key app="EN" db-id="mdae8500109496fea4aff9c086e16cc25895" timestamp="1793216821"&gt;31&lt;/key&gt;&lt;/foreign-keys&gt;&lt;ref-type name="Web Page"&gt;12&lt;/ref-type&gt;&lt;contributors&gt;&lt;authors&gt;&lt;author&gt;HELICS developers (GMLC-TDC)&lt;/author&gt;&lt;/authors&gt;&lt;/contributors&gt;&lt;titles&gt;&lt;title&gt;HELICS documentation&lt;/title&gt;&lt;/titles&gt;&lt;dates&gt;&lt;year&gt;2026&lt;/year&gt;&lt;/dates&gt;&lt;label&gt;helics_docs&lt;/label&gt;&lt;urls&gt;&lt;related-urls&gt;&lt;url&gt;https://docs.helics.org/en/latest/&lt;/url&gt;&lt;/related-urls&gt;&lt;/urls&gt;&lt;access-date&gt;2026-10-28&lt;/access-date&gt;&lt;/record&gt;&lt;/Cite&gt;&lt;Cite&gt;&lt;Author&gt;OFFIS&lt;/Author&gt;&lt;Year&gt;2025&lt;/Year&gt;&lt;RecNum&gt;56&lt;/RecNum&gt;&lt;record&gt;&lt;rec-number&gt;56&lt;/rec-number&gt;&lt;foreign-keys&gt;&lt;key app="EN" db-id="mdae8500109496fea4aff9c086e16cc25895" timestamp="1793216821"&gt;56&lt;/key&gt;&lt;/foreign-keys&gt;&lt;ref-type name="Web Page"&gt;12&lt;/ref-type&gt;&lt;contributors&gt;&lt;authors&gt;&lt;author&gt;OFFIS&lt;/author&gt;&lt;/authors&gt;&lt;/contributors&gt;&lt;titles&gt;&lt;title&gt;mosaik documentation&lt;/title&gt;&lt;/titles&gt;&lt;dates&gt;&lt;year&gt;2025&lt;/year&gt;&lt;/dates&gt;&lt;label&gt;mosaik_docs&lt;/label&gt;&lt;urls&gt;&lt;related-urls&gt;&lt;url&gt;https://mosaik.readthedocs.io/en/3.5.0/&lt;/url&gt;&lt;/related-urls&gt;&lt;/urls&gt;&lt;access-date&gt;2026-10-28&lt;/access-date&gt;&lt;/record&gt;&lt;/Cite&gt;&lt;/EndNote&gt;</w:instrText>
       </w:r>
       <w:r>
         <w:fldChar w:fldCharType="separate"/>
@@ -2267,7 +2246,7 @@
         <w:rPr>
           <w:noProof/>
         </w:rPr>
-        <w:t>[35,36]</w:t>
+        <w:t>[34,35]</w:t>
       </w:r>
       <w:r>
         <w:fldChar w:fldCharType="end"/>
@@ -2295,7 +2274,7 @@
         <w:fldChar w:fldCharType="begin"/>
       </w:r>
       <w:r>
-        <w:instrText xml:space="preserve"> ADDIN EN.CITE &lt;EndNote&gt;&lt;Cite&gt;&lt;Author&gt;Wetter&lt;/Author&gt;&lt;Year&gt;2011&lt;/Year&gt;&lt;RecNum&gt;85&lt;/RecNum&gt;&lt;DisplayText&gt;[11,40]&lt;/DisplayText&gt;&lt;record&gt;&lt;rec-number&gt;85&lt;/rec-number&gt;&lt;foreign-keys&gt;&lt;key app="EN" db-id="mdae8500109496fea4aff9c086e16cc25895" timestamp="1793185473"&gt;85&lt;/key&gt;&lt;/foreign-keys&gt;&lt;ref-type name="Journal Article"&gt;17&lt;/ref-type&gt;&lt;contributors&gt;&lt;authors&gt;&lt;author&gt;Wetter, Michael&lt;/author&gt;&lt;/authors&gt;&lt;/contributors&gt;&lt;titles&gt;&lt;title&gt;Co-simulation of building energy and control systems with the Building Controls Virtual Test Bed&lt;/title&gt;&lt;secondary-title&gt;Journal of Building Performance Simulation&lt;/secondary-title&gt;&lt;alt-title&gt;J. Build. Perform. Simul.&lt;/alt-title&gt;&lt;/titles&gt;&lt;periodical&gt;&lt;full-title&gt;Journal of Building Performance Simulation&lt;/full-title&gt;&lt;abbr-1&gt;J. Build. Perform. Simul.&lt;/abbr-1&gt;&lt;/periodical&gt;&lt;pages&gt;185-203&lt;/pages&gt;&lt;volume&gt;4&lt;/volume&gt;&lt;number&gt;3&lt;/number&gt;&lt;dates&gt;&lt;year&gt;2011&lt;/year&gt;&lt;/dates&gt;&lt;publisher&gt;Taylor &amp;amp; Francis&lt;/publisher&gt;&lt;label&gt;wetter2011&lt;/label&gt;&lt;urls&gt;&lt;/urls&gt;&lt;electronic-resource-num&gt;10.1080/19401493.2010.518631&lt;/electronic-resource-num&gt;&lt;/record&gt;&lt;/Cite&gt;&lt;Cite&gt;&lt;Author&gt;U.S. Department of Energy&lt;/Author&gt;&lt;Year&gt;2018&lt;/Year&gt;&lt;RecNum&gt;18&lt;/RecNum&gt;&lt;record&gt;&lt;rec-number&gt;18&lt;/rec-number&gt;&lt;foreign-keys&gt;&lt;key app="EN" db-id="mdae8500109496fea4aff9c086e16cc25895" timestamp="1793185473"&gt;18&lt;/key&gt;&lt;/foreign-keys&gt;&lt;ref-type name="Web Page"&gt;12&lt;/ref-type&gt;&lt;contributors&gt;&lt;authors&gt;&lt;author&gt;U.S. Department of Energy&lt;/author&gt;&lt;/authors&gt;&lt;/contributors&gt;&lt;titles&gt;&lt;title&gt;EnergyPlus External Interface(s) Application Guide: BCVTB Examples&lt;/title&gt;&lt;/titles&gt;&lt;dates&gt;&lt;year&gt;2018&lt;/year&gt;&lt;/dates&gt;&lt;label&gt;doe_extif&lt;/label&gt;&lt;urls&gt;&lt;related-urls&gt;&lt;url&gt;https://bigladdersoftware.com/epx/docs/9-0/external-interfaces-application-guide/bcvtb-examples.html&lt;/url&gt;&lt;/related-urls&gt;&lt;/urls&gt;&lt;access-date&gt;2026-10-28&lt;/access-date&gt;&lt;/record&gt;&lt;/Cite&gt;&lt;/EndNote&gt;</w:instrText>
+        <w:instrText xml:space="preserve"> ADDIN EN.CITE &lt;EndNote&gt;&lt;Cite&gt;&lt;Author&gt;Wetter&lt;/Author&gt;&lt;Year&gt;2011&lt;/Year&gt;&lt;RecNum&gt;85&lt;/RecNum&gt;&lt;DisplayText&gt;[11,39]&lt;/DisplayText&gt;&lt;record&gt;&lt;rec-number&gt;85&lt;/rec-number&gt;&lt;foreign-keys&gt;&lt;key app="EN" db-id="mdae8500109496fea4aff9c086e16cc25895" timestamp="1793216821"&gt;85&lt;/key&gt;&lt;/foreign-keys&gt;&lt;ref-type name="Journal Article"&gt;17&lt;/ref-type&gt;&lt;contributors&gt;&lt;authors&gt;&lt;author&gt;Wetter, Michael&lt;/author&gt;&lt;/authors&gt;&lt;/contributors&gt;&lt;titles&gt;&lt;title&gt;Co-simulation of building energy and control systems with the Building Controls Virtual Test Bed&lt;/title&gt;&lt;secondary-title&gt;Journal of Building Performance Simulation&lt;/secondary-title&gt;&lt;alt-title&gt;J. Build. Perform. Simul.&lt;/alt-title&gt;&lt;/titles&gt;&lt;periodical&gt;&lt;full-title&gt;Journal of Building Performance Simulation&lt;/full-title&gt;&lt;abbr-1&gt;J. Build. Perform. Simul.&lt;/abbr-1&gt;&lt;/periodical&gt;&lt;pages&gt;185-203&lt;/pages&gt;&lt;volume&gt;4&lt;/volume&gt;&lt;number&gt;3&lt;/number&gt;&lt;dates&gt;&lt;year&gt;2011&lt;/year&gt;&lt;/dates&gt;&lt;publisher&gt;Taylor &amp;amp; Francis&lt;/publisher&gt;&lt;label&gt;wetter2011&lt;/label&gt;&lt;urls&gt;&lt;/urls&gt;&lt;electronic-resource-num&gt;10.1080/19401493.2010.518631&lt;/electronic-resource-num&gt;&lt;/record&gt;&lt;/Cite&gt;&lt;Cite&gt;&lt;Author&gt;U.S. Department of Energy&lt;/Author&gt;&lt;Year&gt;2018&lt;/Year&gt;&lt;RecNum&gt;18&lt;/RecNum&gt;&lt;record&gt;&lt;rec-number&gt;18&lt;/rec-number&gt;&lt;foreign-keys&gt;&lt;key app="EN" db-id="mdae8500109496fea4aff9c086e16cc25895" timestamp="1793216821"&gt;18&lt;/key&gt;&lt;/foreign-keys&gt;&lt;ref-type name="Web Page"&gt;12&lt;/ref-type&gt;&lt;contributors&gt;&lt;authors&gt;&lt;author&gt;U.S. Department of Energy&lt;/author&gt;&lt;/authors&gt;&lt;/contributors&gt;&lt;titles&gt;&lt;title&gt;EnergyPlus External Interface(s) Application Guide: BCVTB Examples&lt;/title&gt;&lt;/titles&gt;&lt;dates&gt;&lt;year&gt;2018&lt;/year&gt;&lt;/dates&gt;&lt;label&gt;doe_extif&lt;/label&gt;&lt;urls&gt;&lt;related-urls&gt;&lt;url&gt;https://bigladdersoftware.com/epx/docs/9-0/external-interfaces-application-guide/bcvtb-examples.html&lt;/url&gt;&lt;/related-urls&gt;&lt;/urls&gt;&lt;access-date&gt;2026-10-28&lt;/access-date&gt;&lt;/record&gt;&lt;/Cite&gt;&lt;/EndNote&gt;</w:instrText>
       </w:r>
       <w:r>
         <w:fldChar w:fldCharType="separate"/>
@@ -2304,7 +2283,7 @@
         <w:rPr>
           <w:noProof/>
         </w:rPr>
-        <w:t>[11,40]</w:t>
+        <w:t>[11,39]</w:t>
       </w:r>
       <w:r>
         <w:fldChar w:fldCharType="end"/>
@@ -2315,10 +2294,10 @@
       <w:r>
         <w:fldChar w:fldCharType="begin">
           <w:fldData xml:space="preserve">PEVuZE5vdGU+PENpdGU+PEF1dGhvcj5Ob3VpZHVpPC9BdXRob3I+PFllYXI+MjAxNDwvWWVhcj48
-UmVjTnVtPjU5PC9SZWNOdW0+PERpc3BsYXlUZXh0PlsxMiw0MV08L0Rpc3BsYXlUZXh0PjxyZWNv
+UmVjTnVtPjU5PC9SZWNOdW0+PERpc3BsYXlUZXh0PlsxMiw0MF08L0Rpc3BsYXlUZXh0PjxyZWNv
 cmQ+PHJlYy1udW1iZXI+NTk8L3JlYy1udW1iZXI+PGZvcmVpZ24ta2V5cz48a2V5IGFwcD0iRU4i
 IGRiLWlkPSJtZGFlODUwMDEwOTQ5NmZlYTRhZmY5YzA4NmUxNmNjMjU4OTUiIHRpbWVzdGFtcD0i
-MTc5MzE4NTQ3MyI+NTk8L2tleT48L2ZvcmVpZ24ta2V5cz48cmVmLXR5cGUgbmFtZT0iSm91cm5h
+MTc5MzIxNjgyMSI+NTk8L2tleT48L2ZvcmVpZ24ta2V5cz48cmVmLXR5cGUgbmFtZT0iSm91cm5h
 bCBBcnRpY2xlIj4xNzwvcmVmLXR5cGU+PGNvbnRyaWJ1dG9ycz48YXV0aG9ycz48YXV0aG9yPk5v
 dWlkdWksIFRoaWVycnk8L2F1dGhvcj48YXV0aG9yPldldHRlciwgTWljaGFlbDwvYXV0aG9yPjxh
 dXRob3I+WnVvLCBXYW5nZGE8L2F1dGhvcj48L2F1dGhvcnM+PC9jb250cmlidXRvcnM+PHRpdGxl
@@ -2336,7 +2315,7 @@
 Pkxhd3JlbmNlIEJlcmtlbGV5IE5hdGlvbmFsIExhYm9yYXRvcnk8L0F1dGhvcj48WWVhcj4yMDIx
 PC9ZZWFyPjxSZWNOdW0+NDg8L1JlY051bT48cmVjb3JkPjxyZWMtbnVtYmVyPjQ4PC9yZWMtbnVt
 YmVyPjxmb3JlaWduLWtleXM+PGtleSBhcHA9IkVOIiBkYi1pZD0ibWRhZTg1MDAxMDk0OTZmZWE0
-YWZmOWMwODZlMTZjYzI1ODk1IiB0aW1lc3RhbXA9IjE3OTMxODU0NzMiPjQ4PC9rZXk+PC9mb3Jl
+YWZmOWMwODZlMTZjYzI1ODk1IiB0aW1lc3RhbXA9IjE3OTMyMTY4MjEiPjQ4PC9rZXk+PC9mb3Jl
 aWduLWtleXM+PHJlZi10eXBlIG5hbWU9IldlYiBQYWdlIj4xMjwvcmVmLXR5cGU+PGNvbnRyaWJ1
 dG9ycz48YXV0aG9ycz48YXV0aG9yPkxhd3JlbmNlIEJlcmtlbGV5IE5hdGlvbmFsIExhYm9yYXRv
 cnk8L2F1dGhvcj48L2F1dGhvcnM+PC9jb250cmlidXRvcnM+PHRpdGxlcz48dGl0bGU+Rk1VIEV4
@@ -2355,10 +2334,10 @@
       <w:r>
         <w:fldChar w:fldCharType="begin">
           <w:fldData xml:space="preserve">PEVuZE5vdGU+PENpdGU+PEF1dGhvcj5Ob3VpZHVpPC9BdXRob3I+PFllYXI+MjAxNDwvWWVhcj48
-UmVjTnVtPjU5PC9SZWNOdW0+PERpc3BsYXlUZXh0PlsxMiw0MV08L0Rpc3BsYXlUZXh0PjxyZWNv
+UmVjTnVtPjU5PC9SZWNOdW0+PERpc3BsYXlUZXh0PlsxMiw0MF08L0Rpc3BsYXlUZXh0PjxyZWNv
 cmQ+PHJlYy1udW1iZXI+NTk8L3JlYy1udW1iZXI+PGZvcmVpZ24ta2V5cz48a2V5IGFwcD0iRU4i
 IGRiLWlkPSJtZGFlODUwMDEwOTQ5NmZlYTRhZmY5YzA4NmUxNmNjMjU4OTUiIHRpbWVzdGFtcD0i
-MTc5MzE4NTQ3MyI+NTk8L2tleT48L2ZvcmVpZ24ta2V5cz48cmVmLXR5cGUgbmFtZT0iSm91cm5h
+MTc5MzIxNjgyMSI+NTk8L2tleT48L2ZvcmVpZ24ta2V5cz48cmVmLXR5cGUgbmFtZT0iSm91cm5h
 bCBBcnRpY2xlIj4xNzwvcmVmLXR5cGU+PGNvbnRyaWJ1dG9ycz48YXV0aG9ycz48YXV0aG9yPk5v
 dWlkdWksIFRoaWVycnk8L2F1dGhvcj48YXV0aG9yPldldHRlciwgTWljaGFlbDwvYXV0aG9yPjxh
 dXRob3I+WnVvLCBXYW5nZGE8L2F1dGhvcj48L2F1dGhvcnM+PC9jb250cmlidXRvcnM+PHRpdGxl
@@ -2376,7 +2355,7 @@
 Pkxhd3JlbmNlIEJlcmtlbGV5IE5hdGlvbmFsIExhYm9yYXRvcnk8L0F1dGhvcj48WWVhcj4yMDIx
 PC9ZZWFyPjxSZWNOdW0+NDg8L1JlY051bT48cmVjb3JkPjxyZWMtbnVtYmVyPjQ4PC9yZWMtbnVt
 YmVyPjxmb3JlaWduLWtleXM+PGtleSBhcHA9IkVOIiBkYi1pZD0ibWRhZTg1MDAxMDk0OTZmZWE0
-YWZmOWMwODZlMTZjYzI1ODk1IiB0aW1lc3RhbXA9IjE3OTMxODU0NzMiPjQ4PC9rZXk+PC9mb3Jl
+YWZmOWMwODZlMTZjYzI1ODk1IiB0aW1lc3RhbXA9IjE3OTMyMTY4MjEiPjQ4PC9rZXk+PC9mb3Jl
 aWduLWtleXM+PHJlZi10eXBlIG5hbWU9IldlYiBQYWdlIj4xMjwvcmVmLXR5cGU+PGNvbnRyaWJ1
 dG9ycz48YXV0aG9ycz48YXV0aG9yPkxhd3JlbmNlIEJlcmtlbGV5IE5hdGlvbmFsIExhYm9yYXRv
 cnk8L2F1dGhvcj48L2F1dGhvcnM+PC9jb250cmlidXRvcnM+PHRpdGxlcz48dGl0bGU+Rk1VIEV4
@@ -2402,7 +2381,7 @@
         <w:rPr>
           <w:noProof/>
         </w:rPr>
-        <w:t>[12,41]</w:t>
+        <w:t>[12,40]</w:t>
       </w:r>
       <w:r>
         <w:fldChar w:fldCharType="end"/>
@@ -2414,7 +2393,7 @@
         <w:fldChar w:fldCharType="begin"/>
       </w:r>
       <w:r>
-        <w:instrText xml:space="preserve"> ADDIN EN.CITE &lt;EndNote&gt;&lt;Cite&gt;&lt;Author&gt;Wetter&lt;/Author&gt;&lt;Year&gt;2020&lt;/Year&gt;&lt;RecNum&gt;86&lt;/RecNum&gt;&lt;DisplayText&gt;[13]&lt;/DisplayText&gt;&lt;record&gt;&lt;rec-number&gt;86&lt;/rec-number&gt;&lt;foreign-keys&gt;&lt;key app="EN" db-id="mdae8500109496fea4aff9c086e16cc25895" timestamp="1793185473"&gt;86&lt;/key&gt;&lt;/foreign-keys&gt;&lt;ref-type name="Conference Paper"&gt;47&lt;/ref-type&gt;&lt;contributors&gt;&lt;authors&gt;&lt;author&gt;Wetter, Michael&lt;/author&gt;&lt;author&gt;Benne, Kyle&lt;/author&gt;&lt;author&gt;Gautier, Antoine&lt;/author&gt;&lt;author&gt;Nouidui, Thierry S.&lt;/author&gt;&lt;author&gt;Ramle, Agnes&lt;/author&gt;&lt;author&gt;Roth, Amir&lt;/author&gt;&lt;author&gt;Tummescheit, Hubertus&lt;/author&gt;&lt;author&gt;Mentzer, Stuart&lt;/author&gt;&lt;author&gt;Winther, Christian&lt;/author&gt;&lt;/authors&gt;&lt;/contributors&gt;&lt;titles&gt;&lt;title&gt;Lifting the Garage Door on Spawn, an Open-Source BEM-Controls Engine&lt;/title&gt;&lt;secondary-title&gt;Proceedings of SimBuild Conference 2020, ASHRAE/IBPSA-USA Building Simulation Conference&lt;/secondary-title&gt;&lt;/titles&gt;&lt;volume&gt;9&lt;/volume&gt;&lt;dates&gt;&lt;year&gt;2020&lt;/year&gt;&lt;/dates&gt;&lt;publisher&gt;IBPSA-USA&lt;/publisher&gt;&lt;label&gt;wetter2020&lt;/label&gt;&lt;urls&gt;&lt;/urls&gt;&lt;electronic-resource-num&gt;10.26868/25746308.2020.C063&lt;/electronic-resource-num&gt;&lt;/record&gt;&lt;/Cite&gt;&lt;/EndNote&gt;</w:instrText>
+        <w:instrText xml:space="preserve"> ADDIN EN.CITE &lt;EndNote&gt;&lt;Cite&gt;&lt;Author&gt;Wetter&lt;/Author&gt;&lt;Year&gt;2020&lt;/Year&gt;&lt;RecNum&gt;86&lt;/RecNum&gt;&lt;DisplayText&gt;[13]&lt;/DisplayText&gt;&lt;record&gt;&lt;rec-number&gt;86&lt;/rec-number&gt;&lt;foreign-keys&gt;&lt;key app="EN" db-id="mdae8500109496fea4aff9c086e16cc25895" timestamp="1793216821"&gt;86&lt;/key&gt;&lt;/foreign-keys&gt;&lt;ref-type name="Conference Paper"&gt;47&lt;/ref-type&gt;&lt;contributors&gt;&lt;authors&gt;&lt;author&gt;Wetter, Michael&lt;/author&gt;&lt;author&gt;Benne, Kyle&lt;/author&gt;&lt;author&gt;Gautier, Antoine&lt;/author&gt;&lt;author&gt;Nouidui, Thierry S.&lt;/author&gt;&lt;author&gt;Ramle, Agnes&lt;/author&gt;&lt;author&gt;Roth, Amir&lt;/author&gt;&lt;author&gt;Tummescheit, Hubertus&lt;/author&gt;&lt;author&gt;Mentzer, Stuart&lt;/author&gt;&lt;author&gt;Winther, Christian&lt;/author&gt;&lt;/authors&gt;&lt;/contributors&gt;&lt;titles&gt;&lt;title&gt;Lifting the Garage Door on Spawn, an Open-Source BEM-Controls Engine&lt;/title&gt;&lt;secondary-title&gt;Proceedings of SimBuild Conference 2020, ASHRAE/IBPSA-USA Building Simulation Conference&lt;/secondary-title&gt;&lt;/titles&gt;&lt;volume&gt;9&lt;/volume&gt;&lt;dates&gt;&lt;year&gt;2020&lt;/year&gt;&lt;/dates&gt;&lt;publisher&gt;IBPSA-USA&lt;/publisher&gt;&lt;label&gt;wetter2020&lt;/label&gt;&lt;urls&gt;&lt;/urls&gt;&lt;electronic-resource-num&gt;10.26868/25746308.2020.C063&lt;/electronic-resource-num&gt;&lt;/record&gt;&lt;/Cite&gt;&lt;/EndNote&gt;</w:instrText>
       </w:r>
       <w:r>
         <w:fldChar w:fldCharType="separate"/>
@@ -2435,7 +2414,7 @@
         <w:fldChar w:fldCharType="begin"/>
       </w:r>
       <w:r>
-        <w:instrText xml:space="preserve"> ADDIN EN.CITE &lt;EndNote&gt;&lt;Cite&gt;&lt;Author&gt;U.S. Department of Energy&lt;/Author&gt;&lt;Year&gt;2022&lt;/Year&gt;&lt;RecNum&gt;19&lt;/RecNum&gt;&lt;DisplayText&gt;[42]&lt;/DisplayText&gt;&lt;record&gt;&lt;rec-number&gt;19&lt;/rec-number&gt;&lt;foreign-keys&gt;&lt;key app="EN" db-id="mdae8500109496fea4aff9c086e16cc25895" timestamp="1793185473"&gt;19&lt;/key&gt;&lt;/foreign-keys&gt;&lt;ref-type name="Web Page"&gt;12&lt;/ref-type&gt;&lt;contributors&gt;&lt;authors&gt;&lt;author&gt;U.S. Department of Energy&lt;/author&gt;&lt;/authors&gt;&lt;/contributors&gt;&lt;titles&gt;&lt;title&gt;EnergyPlus Input Output Reference: Group – Python Plugins / Python EMS&lt;/title&gt;&lt;/titles&gt;&lt;dates&gt;&lt;year&gt;2022&lt;/year&gt;&lt;/dates&gt;&lt;label&gt;doe2022&lt;/label&gt;&lt;urls&gt;&lt;related-urls&gt;&lt;url&gt;https://bigladdersoftware.com/epx/docs/22-2/input-output-reference/group-python-plugins.html&lt;/url&gt;&lt;/related-urls&gt;&lt;/urls&gt;&lt;access-date&gt;2026-10-28&lt;/access-date&gt;&lt;/record&gt;&lt;/Cite&gt;&lt;/EndNote&gt;</w:instrText>
+        <w:instrText xml:space="preserve"> ADDIN EN.CITE &lt;EndNote&gt;&lt;Cite&gt;&lt;Author&gt;U.S. Department of Energy&lt;/Author&gt;&lt;Year&gt;2022&lt;/Year&gt;&lt;RecNum&gt;19&lt;/RecNum&gt;&lt;DisplayText&gt;[41]&lt;/DisplayText&gt;&lt;record&gt;&lt;rec-number&gt;19&lt;/rec-number&gt;&lt;foreign-keys&gt;&lt;key app="EN" db-id="mdae8500109496fea4aff9c086e16cc25895" timestamp="1793216821"&gt;19&lt;/key&gt;&lt;/foreign-keys&gt;&lt;ref-type name="Web Page"&gt;12&lt;/ref-type&gt;&lt;contributors&gt;&lt;authors&gt;&lt;author&gt;U.S. Department of Energy&lt;/author&gt;&lt;/authors&gt;&lt;/contributors&gt;&lt;titles&gt;&lt;title&gt;EnergyPlus Input Output Reference: Group – Python Plugins / Python EMS&lt;/title&gt;&lt;/titles&gt;&lt;dates&gt;&lt;year&gt;2022&lt;/year&gt;&lt;/dates&gt;&lt;label&gt;doe2022&lt;/label&gt;&lt;urls&gt;&lt;related-urls&gt;&lt;url&gt;https://bigladdersoftware.com/epx/docs/22-2/input-output-reference/group-python-plugins.html&lt;/url&gt;&lt;/related-urls&gt;&lt;/urls&gt;&lt;access-date&gt;2026-10-28&lt;/access-date&gt;&lt;/record&gt;&lt;/Cite&gt;&lt;/EndNote&gt;</w:instrText>
       </w:r>
       <w:r>
         <w:fldChar w:fldCharType="separate"/>
@@ -2444,7 +2423,7 @@
         <w:rPr>
           <w:noProof/>
         </w:rPr>
-        <w:t>[42]</w:t>
+        <w:t>[41]</w:t>
       </w:r>
       <w:r>
         <w:fldChar w:fldCharType="end"/>
@@ -2455,10 +2434,10 @@
       <w:r>
         <w:fldChar w:fldCharType="begin">
           <w:fldData xml:space="preserve">PEVuZE5vdGU+PENpdGU+PEF1dGhvcj5KaW3DqW5lei1SYWJvc288L0F1dGhvcj48WWVhcj4yMDIx
-PC9ZZWFyPjxSZWNOdW0+NDE8L1JlY051bT48RGlzcGxheVRleHQ+WzE0LDE1LDQzXTwvRGlzcGxh
+PC9ZZWFyPjxSZWNOdW0+NDE8L1JlY051bT48RGlzcGxheVRleHQ+WzE0LDE1LDQyXTwvRGlzcGxh
 eVRleHQ+PHJlY29yZD48cmVjLW51bWJlcj40MTwvcmVjLW51bWJlcj48Zm9yZWlnbi1rZXlzPjxr
 ZXkgYXBwPSJFTiIgZGItaWQ9Im1kYWU4NTAwMTA5NDk2ZmVhNGFmZjljMDg2ZTE2Y2MyNTg5NSIg
-dGltZXN0YW1wPSIxNzkzMTg1NDczIj40MTwva2V5PjwvZm9yZWlnbi1rZXlzPjxyZWYtdHlwZSBu
+dGltZXN0YW1wPSIxNzkzMjE2ODIxIj40MTwva2V5PjwvZm9yZWlnbi1rZXlzPjxyZWYtdHlwZSBu
 YW1lPSJDb25mZXJlbmNlIFBhcGVyIj40NzwvcmVmLXR5cGU+PGNvbnRyaWJ1dG9ycz48YXV0aG9y
 cz48YXV0aG9yPkppbcOpbmV6LVJhYm9zbywgSmF2aWVyPC9hdXRob3I+PGF1dGhvcj5DYW1wb3kt
 TmlldmVzLCBBbGVqYW5kcm88L2F1dGhvcj48YXV0aG9yPk1hbmphdmFjYXMtTHVjYXMsIEFudG9u
@@ -2477,7 +2456,7 @@
 LU5pZXZlczwvQXV0aG9yPjxZZWFyPjIwMjU8L1llYXI+PFJlY051bT45PC9SZWNOdW0+PHJlY29y
 ZD48cmVjLW51bWJlcj45PC9yZWMtbnVtYmVyPjxmb3JlaWduLWtleXM+PGtleSBhcHA9IkVOIiBk
 Yi1pZD0ibWRhZTg1MDAxMDk0OTZmZWE0YWZmOWMwODZlMTZjYzI1ODk1IiB0aW1lc3RhbXA9IjE3
-OTMxODU0NzMiPjk8L2tleT48L2ZvcmVpZ24ta2V5cz48cmVmLXR5cGUgbmFtZT0iSm91cm5hbCBB
+OTMyMTY4MjEiPjk8L2tleT48L2ZvcmVpZ24ta2V5cz48cmVmLXR5cGUgbmFtZT0iSm91cm5hbCBB
 cnRpY2xlIj4xNzwvcmVmLXR5cGU+PGNvbnRyaWJ1dG9ycz48YXV0aG9ycz48YXV0aG9yPkNhbXBv
 eS1OaWV2ZXMsIEFsZWphbmRybzwvYXV0aG9yPjxhdXRob3I+TWFuamF2YWNhcywgQW50b25pbzwv
 YXV0aG9yPjxhdXRob3I+Smltw6luZXotUmFib3NvLCBKYXZpZXI8L2F1dGhvcj48YXV0aG9yPk1v
@@ -2495,7 +2474,7 @@
 cmVjb3JkPjwvQ2l0ZT48Q2l0ZT48QXV0aG9yPlpoYW5nPC9BdXRob3I+PFllYXI+MjAyMDwvWWVh
 cj48UmVjTnVtPjkwPC9SZWNOdW0+PHJlY29yZD48cmVjLW51bWJlcj45MDwvcmVjLW51bWJlcj48
 Zm9yZWlnbi1rZXlzPjxrZXkgYXBwPSJFTiIgZGItaWQ9Im1kYWU4NTAwMTA5NDk2ZmVhNGFmZjlj
-MDg2ZTE2Y2MyNTg5NSIgdGltZXN0YW1wPSIxNzkzMTg1NDczIj45MDwva2V5PjwvZm9yZWlnbi1r
+MDg2ZTE2Y2MyNTg5NSIgdGltZXN0YW1wPSIxNzkzMjE2ODIxIj45MDwva2V5PjwvZm9yZWlnbi1r
 ZXlzPjxyZWYtdHlwZSBuYW1lPSJDb25mZXJlbmNlIFBhcGVyIj40NzwvcmVmLXR5cGU+PGNvbnRy
 aWJ1dG9ycz48YXV0aG9ycz48YXV0aG9yPlpoYW5nLCBUaWFueXU8L2F1dGhvcj48YXV0aG9yPkFy
 ZGFrYW5pYW4sIE9taWQ8L2F1dGhvcj48L2F1dGhvcnM+PC9jb250cmlidXRvcnM+PHRpdGxlcz48
@@ -2516,10 +2495,10 @@
       <w:r>
         <w:fldChar w:fldCharType="begin">
           <w:fldData xml:space="preserve">PEVuZE5vdGU+PENpdGU+PEF1dGhvcj5KaW3DqW5lei1SYWJvc288L0F1dGhvcj48WWVhcj4yMDIx
-PC9ZZWFyPjxSZWNOdW0+NDE8L1JlY051bT48RGlzcGxheVRleHQ+WzE0LDE1LDQzXTwvRGlzcGxh
+PC9ZZWFyPjxSZWNOdW0+NDE8L1JlY051bT48RGlzcGxheVRleHQ+WzE0LDE1LDQyXTwvRGlzcGxh
 eVRleHQ+PHJlY29yZD48cmVjLW51bWJlcj40MTwvcmVjLW51bWJlcj48Zm9yZWlnbi1rZXlzPjxr
 ZXkgYXBwPSJFTiIgZGItaWQ9Im1kYWU4NTAwMTA5NDk2ZmVhNGFmZjljMDg2ZTE2Y2MyNTg5NSIg
-dGltZXN0YW1wPSIxNzkzMTg1NDczIj40MTwva2V5PjwvZm9yZWlnbi1rZXlzPjxyZWYtdHlwZSBu
+dGltZXN0YW1wPSIxNzkzMjE2ODIxIj40MTwva2V5PjwvZm9yZWlnbi1rZXlzPjxyZWYtdHlwZSBu
 YW1lPSJDb25mZXJlbmNlIFBhcGVyIj40NzwvcmVmLXR5cGU+PGNvbnRyaWJ1dG9ycz48YXV0aG9y
 cz48YXV0aG9yPkppbcOpbmV6LVJhYm9zbywgSmF2aWVyPC9hdXRob3I+PGF1dGhvcj5DYW1wb3kt
 TmlldmVzLCBBbGVqYW5kcm88L2F1dGhvcj48YXV0aG9yPk1hbmphdmFjYXMtTHVjYXMsIEFudG9u
@@ -2538,7 +2517,7 @@
 LU5pZXZlczwvQXV0aG9yPjxZZWFyPjIwMjU8L1llYXI+PFJlY051bT45PC9SZWNOdW0+PHJlY29y
 ZD48cmVjLW51bWJlcj45PC9yZWMtbnVtYmVyPjxmb3JlaWduLWtleXM+PGtleSBhcHA9IkVOIiBk
 Yi1pZD0ibWRhZTg1MDAxMDk0OTZmZWE0YWZmOWMwODZlMTZjYzI1ODk1IiB0aW1lc3RhbXA9IjE3
-OTMxODU0NzMiPjk8L2tleT48L2ZvcmVpZ24ta2V5cz48cmVmLXR5cGUgbmFtZT0iSm91cm5hbCBB
+OTMyMTY4MjEiPjk8L2tleT48L2ZvcmVpZ24ta2V5cz48cmVmLXR5cGUgbmFtZT0iSm91cm5hbCBB
 cnRpY2xlIj4xNzwvcmVmLXR5cGU+PGNvbnRyaWJ1dG9ycz48YXV0aG9ycz48YXV0aG9yPkNhbXBv
 eS1OaWV2ZXMsIEFsZWphbmRybzwvYXV0aG9yPjxhdXRob3I+TWFuamF2YWNhcywgQW50b25pbzwv
 YXV0aG9yPjxhdXRob3I+Smltw6luZXotUmFib3NvLCBKYXZpZXI8L2F1dGhvcj48YXV0aG9yPk1v
@@ -2556,7 +2535,7 @@
 cmVjb3JkPjwvQ2l0ZT48Q2l0ZT48QXV0aG9yPlpoYW5nPC9BdXRob3I+PFllYXI+MjAyMDwvWWVh
 cj48UmVjTnVtPjkwPC9SZWNOdW0+PHJlY29yZD48cmVjLW51bWJlcj45MDwvcmVjLW51bWJlcj48
 Zm9yZWlnbi1rZXlzPjxrZXkgYXBwPSJFTiIgZGItaWQ9Im1kYWU4NTAwMTA5NDk2ZmVhNGFmZjlj
-MDg2ZTE2Y2MyNTg5NSIgdGltZXN0YW1wPSIxNzkzMTg1NDczIj45MDwva2V5PjwvZm9yZWlnbi1r
+MDg2ZTE2Y2MyNTg5NSIgdGltZXN0YW1wPSIxNzkzMjE2ODIxIj45MDwva2V5PjwvZm9yZWlnbi1r
 ZXlzPjxyZWYtdHlwZSBuYW1lPSJDb25mZXJlbmNlIFBhcGVyIj40NzwvcmVmLXR5cGU+PGNvbnRy
 aWJ1dG9ycz48YXV0aG9ycz48YXV0aG9yPlpoYW5nLCBUaWFueXU8L2F1dGhvcj48YXV0aG9yPkFy
 ZGFrYW5pYW4sIE9taWQ8L2F1dGhvcj48L2F1dGhvcnM+PC9jb250cmlidXRvcnM+PHRpdGxlcz48
@@ -2584,7 +2563,7 @@
         <w:rPr>
           <w:noProof/>
         </w:rPr>
-        <w:t>[14,15,43]</w:t>
+        <w:t>[14,15,42]</w:t>
       </w:r>
       <w:r>
         <w:fldChar w:fldCharType="end"/>
@@ -2596,7 +2575,7 @@
         <w:fldChar w:fldCharType="begin"/>
       </w:r>
       <w:r>
-        <w:instrText xml:space="preserve"> ADDIN EN.CITE &lt;EndNote&gt;&lt;Cite&gt;&lt;Author&gt;Scharnhorst&lt;/Author&gt;&lt;Year&gt;2021&lt;/Year&gt;&lt;RecNum&gt;75&lt;/RecNum&gt;&lt;DisplayText&gt;[44]&lt;/DisplayText&gt;&lt;record&gt;&lt;rec-number&gt;75&lt;/rec-number&gt;&lt;foreign-keys&gt;&lt;key app="EN" db-id="mdae8500109496fea4aff9c086e16cc25895" timestamp="1793185473"&gt;75&lt;/key&gt;&lt;/foreign-keys&gt;&lt;ref-type name="Journal Article"&gt;17&lt;/ref-type&gt;&lt;contributors&gt;&lt;authors&gt;&lt;author&gt;Scharnhorst, Paul&lt;/author&gt;&lt;author&gt;Schubnel, Baptiste&lt;/author&gt;&lt;author&gt;Fernández Bandera, Carlos&lt;/author&gt;&lt;author&gt;Salom, Jaume&lt;/author&gt;&lt;author&gt;Taddeo, Paolo&lt;/author&gt;&lt;author&gt;Boegli, Max&lt;/author&gt;&lt;author&gt;Gorecki, Tomasz&lt;/author&gt;&lt;author&gt;Stauffer, Yves&lt;/author&gt;&lt;author&gt;Peppas, Antonis&lt;/author&gt;&lt;author&gt;Politi, Chrysa&lt;/author&gt;&lt;/authors&gt;&lt;/contributors&gt;&lt;titles&gt;&lt;title&gt;Energym: A Building Model Library for Controller Benchmarking&lt;/title&gt;&lt;secondary-title&gt;Applied Sciences&lt;/secondary-title&gt;&lt;alt-title&gt;Appl. Sci.&lt;/alt-title&gt;&lt;/titles&gt;&lt;periodical&gt;&lt;full-title&gt;Applied Sciences&lt;/full-title&gt;&lt;abbr-1&gt;Appl. Sci.&lt;/abbr-1&gt;&lt;/periodical&gt;&lt;pages&gt;3518&lt;/pages&gt;&lt;volume&gt;11&lt;/volume&gt;&lt;number&gt;8&lt;/number&gt;&lt;dates&gt;&lt;year&gt;2021&lt;/year&gt;&lt;/dates&gt;&lt;publisher&gt;MDPI&lt;/publisher&gt;&lt;label&gt;scharnhorst2021&lt;/label&gt;&lt;urls&gt;&lt;/urls&gt;&lt;electronic-resource-num&gt;10.3390/app11083518&lt;/electronic-resource-num&gt;&lt;/record&gt;&lt;/Cite&gt;&lt;/EndNote&gt;</w:instrText>
+        <w:instrText xml:space="preserve"> ADDIN EN.CITE &lt;EndNote&gt;&lt;Cite&gt;&lt;Author&gt;Scharnhorst&lt;/Author&gt;&lt;Year&gt;2021&lt;/Year&gt;&lt;RecNum&gt;75&lt;/RecNum&gt;&lt;DisplayText&gt;[43]&lt;/DisplayText&gt;&lt;record&gt;&lt;rec-number&gt;75&lt;/rec-number&gt;&lt;foreign-keys&gt;&lt;key app="EN" db-id="mdae8500109496fea4aff9c086e16cc25895" timestamp="1793216821"&gt;75&lt;/key&gt;&lt;/foreign-keys&gt;&lt;ref-type name="Journal Article"&gt;17&lt;/ref-type&gt;&lt;contributors&gt;&lt;authors&gt;&lt;author&gt;Scharnhorst, Paul&lt;/author&gt;&lt;author&gt;Schubnel, Baptiste&lt;/author&gt;&lt;author&gt;Fernández Bandera, Carlos&lt;/author&gt;&lt;author&gt;Salom, Jaume&lt;/author&gt;&lt;author&gt;Taddeo, Paolo&lt;/author&gt;&lt;author&gt;Boegli, Max&lt;/author&gt;&lt;author&gt;Gorecki, Tomasz&lt;/author&gt;&lt;author&gt;Stauffer, Yves&lt;/author&gt;&lt;author&gt;Peppas, Antonis&lt;/author&gt;&lt;author&gt;Politi, Chrysa&lt;/author&gt;&lt;/authors&gt;&lt;/contributors&gt;&lt;titles&gt;&lt;title&gt;Energym: A Building Model Library for Controller Benchmarking&lt;/title&gt;&lt;secondary-title&gt;Applied Sciences&lt;/secondary-title&gt;&lt;alt-title&gt;Appl. Sci.&lt;/alt-title&gt;&lt;/titles&gt;&lt;periodical&gt;&lt;full-title&gt;Applied Sciences&lt;/full-title&gt;&lt;abbr-1&gt;Appl. Sci.&lt;/abbr-1&gt;&lt;/periodical&gt;&lt;pages&gt;3518&lt;/pages&gt;&lt;volume&gt;11&lt;/volume&gt;&lt;number&gt;8&lt;/number&gt;&lt;dates&gt;&lt;year&gt;2021&lt;/year&gt;&lt;/dates&gt;&lt;publisher&gt;MDPI&lt;/publisher&gt;&lt;label&gt;scharnhorst2021&lt;/label&gt;&lt;urls&gt;&lt;/urls&gt;&lt;electronic-resource-num&gt;10.3390/app11083518&lt;/electronic-resource-num&gt;&lt;/record&gt;&lt;/Cite&gt;&lt;/EndNote&gt;</w:instrText>
       </w:r>
       <w:r>
         <w:fldChar w:fldCharType="separate"/>
@@ -2605,19 +2584,61 @@
         <w:rPr>
           <w:noProof/>
         </w:rPr>
+        <w:t>[43]</w:t>
+      </w:r>
+      <w:r>
+        <w:fldChar w:fldCharType="end"/>
+      </w:r>
+      <w:r>
+        <w:t xml:space="preserve">. BOPTEST exposes test cases through a web API </w:t>
+      </w:r>
+      <w:r>
+        <w:fldChar w:fldCharType="begin"/>
+      </w:r>
+      <w:r>
+        <w:instrText xml:space="preserve"> ADDIN EN.CITE &lt;EndNote&gt;&lt;Cite&gt;&lt;Author&gt;Blum&lt;/Author&gt;&lt;Year&gt;2021&lt;/Year&gt;&lt;RecNum&gt;7&lt;/RecNum&gt;&lt;DisplayText&gt;[16]&lt;/DisplayText&gt;&lt;record&gt;&lt;rec-number&gt;7&lt;/rec-number&gt;&lt;foreign-keys&gt;&lt;key app="EN" db-id="mdae8500109496fea4aff9c086e16cc25895" timestamp="1793216821"&gt;7&lt;/key&gt;&lt;/foreign-keys&gt;&lt;ref-type name="Journal Article"&gt;17&lt;/ref-type&gt;&lt;contributors&gt;&lt;authors&gt;&lt;author&gt;Blum, David&lt;/author&gt;&lt;author&gt;Arroyo, Javier&lt;/author&gt;&lt;author&gt;Huang, Sen&lt;/author&gt;&lt;author&gt;Drgoňa, Ján&lt;/author&gt;&lt;author&gt;Jorissen, Filip&lt;/author&gt;&lt;author&gt;Walnum, Harald Taxt&lt;/author&gt;&lt;author&gt;Chen, Yan&lt;/author&gt;&lt;author&gt;Benne, Kyle&lt;/author&gt;&lt;author&gt;Vrabie, Draguna&lt;/author&gt;&lt;author&gt;Wetter, Michael&lt;/author&gt;&lt;author&gt;Helsen, Lieve&lt;/author&gt;&lt;/authors&gt;&lt;/contributors&gt;&lt;titles&gt;&lt;title&gt;Building optimization testing framework (BOPTEST) for simulation-based benchmarking of control strategies in buildings&lt;/title&gt;&lt;secondary-title&gt;Journal of Building Performance Simulation&lt;/secondary-title&gt;&lt;alt-title&gt;J. Build. Perform. Simul.&lt;/alt-title&gt;&lt;/titles&gt;&lt;periodical&gt;&lt;full-title&gt;Journal of Building Performance Simulation&lt;/full-title&gt;&lt;abbr-1&gt;J. Build. Perform. Simul.&lt;/abbr-1&gt;&lt;/periodical&gt;&lt;pages&gt;586-610&lt;/pages&gt;&lt;volume&gt;14&lt;/volume&gt;&lt;number&gt;5&lt;/number&gt;&lt;dates&gt;&lt;year&gt;2021&lt;/year&gt;&lt;/dates&gt;&lt;publisher&gt;Taylor &amp;amp; Francis&lt;/publisher&gt;&lt;label&gt;blum2021&lt;/label&gt;&lt;urls&gt;&lt;/urls&gt;&lt;electronic-resource-num&gt;10.1080/19401493.2021.1986574&lt;/electronic-resource-num&gt;&lt;/record&gt;&lt;/Cite&gt;&lt;/EndNote&gt;</w:instrText>
+      </w:r>
+      <w:r>
+        <w:fldChar w:fldCharType="separate"/>
+      </w:r>
+      <w:r>
+        <w:rPr>
+          <w:noProof/>
+        </w:rPr>
+        <w:t>[16]</w:t>
+      </w:r>
+      <w:r>
+        <w:fldChar w:fldCharType="end"/>
+      </w:r>
+      <w:r>
+        <w:t xml:space="preserve">, CityLearn targets district demand response </w:t>
+      </w:r>
+      <w:r>
+        <w:fldChar w:fldCharType="begin"/>
+      </w:r>
+      <w:r>
+        <w:instrText xml:space="preserve"> ADDIN EN.CITE &lt;EndNote&gt;&lt;Cite&gt;&lt;Author&gt;Nweye&lt;/Author&gt;&lt;Year&gt;2025&lt;/Year&gt;&lt;RecNum&gt;60&lt;/RecNum&gt;&lt;DisplayText&gt;[44]&lt;/DisplayText&gt;&lt;record&gt;&lt;rec-number&gt;60&lt;/rec-number&gt;&lt;foreign-keys&gt;&lt;key app="EN" db-id="mdae8500109496fea4aff9c086e16cc25895" timestamp="1793216821"&gt;60&lt;/key&gt;&lt;/foreign-keys&gt;&lt;ref-type name="Journal Article"&gt;17&lt;/ref-type&gt;&lt;contributors&gt;&lt;authors&gt;&lt;author&gt;Nweye, Kingsley&lt;/author&gt;&lt;author&gt;Kaspar, Kathryn&lt;/author&gt;&lt;author&gt;Buscemi, Giacomo&lt;/author&gt;&lt;author&gt;Fonseca, Tiago&lt;/author&gt;&lt;author&gt;Pinto, Giuseppe&lt;/author&gt;&lt;author&gt;Ghose, Dipanjan&lt;/author&gt;&lt;author&gt;Duddukuru, Satvik&lt;/author&gt;&lt;author&gt;Pratapa, Pavani&lt;/author&gt;&lt;author&gt;Li, Han&lt;/author&gt;&lt;author&gt;Mohammadi, Javad&lt;/author&gt;&lt;author&gt;Lino Ferreira, Luis&lt;/author&gt;&lt;author&gt;Hong, Tianzhen&lt;/author&gt;&lt;author&gt;Ouf, Mohamed&lt;/author&gt;&lt;author&gt;Capozzoli, Alfonso&lt;/author&gt;&lt;author&gt;Nagy, Zoltan&lt;/author&gt;&lt;/authors&gt;&lt;/contributors&gt;&lt;titles&gt;&lt;title&gt;CityLearn v2: energy-flexible, resilient, occupant-centric, and carbon-aware management of grid-interactive communities&lt;/title&gt;&lt;secondary-title&gt;Journal of Building Performance Simulation&lt;/secondary-title&gt;&lt;alt-title&gt;J. Build. Perform. Simul.&lt;/alt-title&gt;&lt;/titles&gt;&lt;periodical&gt;&lt;full-title&gt;Journal of Building Performance Simulation&lt;/full-title&gt;&lt;abbr-1&gt;J. Build. Perform. Simul.&lt;/abbr-1&gt;&lt;/periodical&gt;&lt;pages&gt;17-38&lt;/pages&gt;&lt;volume&gt;18&lt;/volume&gt;&lt;number&gt;1&lt;/number&gt;&lt;dates&gt;&lt;year&gt;2025&lt;/year&gt;&lt;/dates&gt;&lt;publisher&gt;Taylor &amp;amp; Francis&lt;/publisher&gt;&lt;label&gt;nweye2025&lt;/label&gt;&lt;urls&gt;&lt;/urls&gt;&lt;electronic-resource-num&gt;10.1080/19401493.2024.2418813&lt;/electronic-resource-num&gt;&lt;/record&gt;&lt;/Cite&gt;&lt;/EndNote&gt;</w:instrText>
+      </w:r>
+      <w:r>
+        <w:fldChar w:fldCharType="separate"/>
+      </w:r>
+      <w:r>
+        <w:rPr>
+          <w:noProof/>
+        </w:rPr>
         <w:t>[44]</w:t>
       </w:r>
       <w:r>
         <w:fldChar w:fldCharType="end"/>
       </w:r>
       <w:r>
-        <w:t xml:space="preserve">. BOPTEST exposes test cases through a web API </w:t>
+        <w:t xml:space="preserve">, and Alfalfa runs building models as a service that controllers read and write at run time </w:t>
       </w:r>
       <w:r>
         <w:fldChar w:fldCharType="begin"/>
       </w:r>
       <w:r>
-        <w:instrText xml:space="preserve"> ADDIN EN.CITE &lt;EndNote&gt;&lt;Cite&gt;&lt;Author&gt;Blum&lt;/Author&gt;&lt;Year&gt;2021&lt;/Year&gt;&lt;RecNum&gt;7&lt;/RecNum&gt;&lt;DisplayText&gt;[16]&lt;/DisplayText&gt;&lt;record&gt;&lt;rec-number&gt;7&lt;/rec-number&gt;&lt;foreign-keys&gt;&lt;key app="EN" db-id="mdae8500109496fea4aff9c086e16cc25895" timestamp="1793185473"&gt;7&lt;/key&gt;&lt;/foreign-keys&gt;&lt;ref-type name="Journal Article"&gt;17&lt;/ref-type&gt;&lt;contributors&gt;&lt;authors&gt;&lt;author&gt;Blum, David&lt;/author&gt;&lt;author&gt;Arroyo, Javier&lt;/author&gt;&lt;author&gt;Huang, Sen&lt;/author&gt;&lt;author&gt;Drgoňa, Ján&lt;/author&gt;&lt;author&gt;Jorissen, Filip&lt;/author&gt;&lt;author&gt;Walnum, Harald Taxt&lt;/author&gt;&lt;author&gt;Chen, Yan&lt;/author&gt;&lt;author&gt;Benne, Kyle&lt;/author&gt;&lt;author&gt;Vrabie, Draguna&lt;/author&gt;&lt;author&gt;Wetter, Michael&lt;/author&gt;&lt;author&gt;Helsen, Lieve&lt;/author&gt;&lt;/authors&gt;&lt;/contributors&gt;&lt;titles&gt;&lt;title&gt;Building optimization testing framework (BOPTEST) for simulation-based benchmarking of control strategies in buildings&lt;/title&gt;&lt;secondary-title&gt;Journal of Building Performance Simulation&lt;/secondary-title&gt;&lt;alt-title&gt;J. Build. Perform. Simul.&lt;/alt-title&gt;&lt;/titles&gt;&lt;periodical&gt;&lt;full-title&gt;Journal of Building Performance Simulation&lt;/full-title&gt;&lt;abbr-1&gt;J. Build. Perform. Simul.&lt;/abbr-1&gt;&lt;/periodical&gt;&lt;pages&gt;586-610&lt;/pages&gt;&lt;volume&gt;14&lt;/volume&gt;&lt;number&gt;5&lt;/number&gt;&lt;dates&gt;&lt;year&gt;2021&lt;/year&gt;&lt;/dates&gt;&lt;publisher&gt;Taylor &amp;amp; Francis&lt;/publisher&gt;&lt;label&gt;blum2021&lt;/label&gt;&lt;urls&gt;&lt;/urls&gt;&lt;electronic-resource-num&gt;10.1080/19401493.2021.1986574&lt;/electronic-resource-num&gt;&lt;/record&gt;&lt;/Cite&gt;&lt;/EndNote&gt;</w:instrText>
+        <w:instrText xml:space="preserve"> ADDIN EN.CITE &lt;EndNote&gt;&lt;Cite&gt;&lt;Author&gt;Benne&lt;/Author&gt;&lt;Year&gt;2024&lt;/Year&gt;&lt;RecNum&gt;4&lt;/RecNum&gt;&lt;DisplayText&gt;[45]&lt;/DisplayText&gt;&lt;record&gt;&lt;rec-number&gt;4&lt;/rec-number&gt;&lt;foreign-keys&gt;&lt;key app="EN" db-id="mdae8500109496fea4aff9c086e16cc25895" timestamp="1793216821"&gt;4&lt;/key&gt;&lt;/foreign-keys&gt;&lt;ref-type name="Report"&gt;27&lt;/ref-type&gt;&lt;contributors&gt;&lt;authors&gt;&lt;author&gt;Benne, Kyle&lt;/author&gt;&lt;author&gt;Shapinsky, Tobias&lt;/author&gt;&lt;author&gt;Petersen, Anya&lt;/author&gt;&lt;/authors&gt;&lt;/contributors&gt;&lt;titles&gt;&lt;title&gt;Alfalfa Virtual Building Service: Software Engineering Best Practices Applied to Runtime Interaction with Building Energy Models&lt;/title&gt;&lt;secondary-title&gt;IBPSA-USA SimBuild 2024 Conference, Denver, Colorado, 21–23 May 2024&lt;/secondary-title&gt;&lt;/titles&gt;&lt;dates&gt;&lt;year&gt;2024&lt;/year&gt;&lt;/dates&gt;&lt;pub-location&gt;Golden, CO&lt;/pub-location&gt;&lt;publisher&gt;National Renewable Energy Laboratory&lt;/publisher&gt;&lt;isbn&gt;NREL/PR-5500-89738&lt;/isbn&gt;&lt;label&gt;benne2024&lt;/label&gt;&lt;work-type&gt;Presentation&lt;/work-type&gt;&lt;urls&gt;&lt;related-urls&gt;&lt;url&gt;https://www.osti.gov/biblio/2407013&lt;/url&gt;&lt;/related-urls&gt;&lt;/urls&gt;&lt;/record&gt;&lt;/Cite&gt;&lt;/EndNote&gt;</w:instrText>
       </w:r>
       <w:r>
         <w:fldChar w:fldCharType="separate"/>
@@ -2626,19 +2647,35 @@
         <w:rPr>
           <w:noProof/>
         </w:rPr>
-        <w:t>[16]</w:t>
-      </w:r>
-      <w:r>
-        <w:fldChar w:fldCharType="end"/>
-      </w:r>
-      <w:r>
-        <w:t xml:space="preserve">, CityLearn targets district demand response </w:t>
+        <w:t>[45]</w:t>
+      </w:r>
+      <w:r>
+        <w:fldChar w:fldCharType="end"/>
+      </w:r>
+      <w:r>
+        <w:t xml:space="preserve">. These tools step synchronously or follow the wall clock; we found no time-meaning metadata, no record/replay of components and no asynchronous handling of slow AI calls in them.</w:t>
+      </w:r>
+    </w:p>
+    <w:p>
+      <w:pPr>
+        <w:pStyle w:val="Heading2"/>
+      </w:pPr>
+      <w:r>
+        <w:t xml:space="preserve">AI components in building simulation and control</w:t>
+      </w:r>
+    </w:p>
+    <w:p>
+      <w:pPr>
+        <w:pStyle w:val="BodyText"/>
+      </w:pPr>
+      <w:r>
+        <w:t xml:space="preserve">LLMs have been used to choose HVAC set-points </w:t>
       </w:r>
       <w:r>
         <w:fldChar w:fldCharType="begin"/>
       </w:r>
       <w:r>
-        <w:instrText xml:space="preserve"> ADDIN EN.CITE &lt;EndNote&gt;&lt;Cite&gt;&lt;Author&gt;Nweye&lt;/Author&gt;&lt;Year&gt;2025&lt;/Year&gt;&lt;RecNum&gt;60&lt;/RecNum&gt;&lt;DisplayText&gt;[45]&lt;/DisplayText&gt;&lt;record&gt;&lt;rec-number&gt;60&lt;/rec-number&gt;&lt;foreign-keys&gt;&lt;key app="EN" db-id="mdae8500109496fea4aff9c086e16cc25895" timestamp="1793185473"&gt;60&lt;/key&gt;&lt;/foreign-keys&gt;&lt;ref-type name="Journal Article"&gt;17&lt;/ref-type&gt;&lt;contributors&gt;&lt;authors&gt;&lt;author&gt;Nweye, Kingsley&lt;/author&gt;&lt;author&gt;Kaspar, Kathryn&lt;/author&gt;&lt;author&gt;Buscemi, Giacomo&lt;/author&gt;&lt;author&gt;Fonseca, Tiago&lt;/author&gt;&lt;author&gt;Pinto, Giuseppe&lt;/author&gt;&lt;author&gt;Ghose, Dipanjan&lt;/author&gt;&lt;author&gt;Duddukuru, Satvik&lt;/author&gt;&lt;author&gt;Pratapa, Pavani&lt;/author&gt;&lt;author&gt;Li, Han&lt;/author&gt;&lt;author&gt;Mohammadi, Javad&lt;/author&gt;&lt;author&gt;Lino Ferreira, Luis&lt;/author&gt;&lt;author&gt;Hong, Tianzhen&lt;/author&gt;&lt;author&gt;Ouf, Mohamed&lt;/author&gt;&lt;author&gt;Capozzoli, Alfonso&lt;/author&gt;&lt;author&gt;Nagy, Zoltan&lt;/author&gt;&lt;/authors&gt;&lt;/contributors&gt;&lt;titles&gt;&lt;title&gt;CityLearn v2: energy-flexible, resilient, occupant-centric, and carbon-aware management of grid-interactive communities&lt;/title&gt;&lt;secondary-title&gt;Journal of Building Performance Simulation&lt;/secondary-title&gt;&lt;alt-title&gt;J. Build. Perform. Simul.&lt;/alt-title&gt;&lt;/titles&gt;&lt;periodical&gt;&lt;full-title&gt;Journal of Building Performance Simulation&lt;/full-title&gt;&lt;abbr-1&gt;J. Build. Perform. Simul.&lt;/abbr-1&gt;&lt;/periodical&gt;&lt;pages&gt;17-38&lt;/pages&gt;&lt;volume&gt;18&lt;/volume&gt;&lt;number&gt;1&lt;/number&gt;&lt;dates&gt;&lt;year&gt;2025&lt;/year&gt;&lt;/dates&gt;&lt;publisher&gt;Taylor &amp;amp; Francis&lt;/publisher&gt;&lt;label&gt;nweye2025&lt;/label&gt;&lt;urls&gt;&lt;/urls&gt;&lt;electronic-resource-num&gt;10.1080/19401493.2024.2418813&lt;/electronic-resource-num&gt;&lt;/record&gt;&lt;/Cite&gt;&lt;/EndNote&gt;</w:instrText>
+        <w:instrText xml:space="preserve"> ADDIN EN.CITE &lt;EndNote&gt;&lt;Cite&gt;&lt;Author&gt;Ahn&lt;/Author&gt;&lt;Year&gt;2023&lt;/Year&gt;&lt;RecNum&gt;1&lt;/RecNum&gt;&lt;DisplayText&gt;[4]&lt;/DisplayText&gt;&lt;record&gt;&lt;rec-number&gt;1&lt;/rec-number&gt;&lt;foreign-keys&gt;&lt;key app="EN" db-id="mdae8500109496fea4aff9c086e16cc25895" timestamp="1793216821"&gt;1&lt;/key&gt;&lt;/foreign-keys&gt;&lt;ref-type name="Journal Article"&gt;17&lt;/ref-type&gt;&lt;contributors&gt;&lt;authors&gt;&lt;author&gt;Ahn, Ki Uhn&lt;/author&gt;&lt;author&gt;Kim, Deuk-Woo&lt;/author&gt;&lt;author&gt;Cho, Hyun Mi&lt;/author&gt;&lt;author&gt;Chae, Chang-U&lt;/author&gt;&lt;/authors&gt;&lt;/contributors&gt;&lt;titles&gt;&lt;title&gt;Alternative Approaches to HVAC Control of Chat Generative Pre-Trained Transformer (ChatGPT) for Autonomous Building System Operations&lt;/title&gt;&lt;secondary-title&gt;Buildings&lt;/secondary-title&gt;&lt;alt-title&gt;Buildings&lt;/alt-title&gt;&lt;/titles&gt;&lt;periodical&gt;&lt;full-title&gt;Buildings&lt;/full-title&gt;&lt;abbr-1&gt;Buildings&lt;/abbr-1&gt;&lt;/periodical&gt;&lt;pages&gt;2680&lt;/pages&gt;&lt;volume&gt;13&lt;/volume&gt;&lt;number&gt;11&lt;/number&gt;&lt;dates&gt;&lt;year&gt;2023&lt;/year&gt;&lt;/dates&gt;&lt;publisher&gt;MDPI&lt;/publisher&gt;&lt;label&gt;ahn2023&lt;/label&gt;&lt;urls&gt;&lt;/urls&gt;&lt;electronic-resource-num&gt;10.3390/buildings13112680&lt;/electronic-resource-num&gt;&lt;/record&gt;&lt;/Cite&gt;&lt;/EndNote&gt;</w:instrText>
       </w:r>
       <w:r>
         <w:fldChar w:fldCharType="separate"/>
@@ -2647,19 +2684,19 @@
         <w:rPr>
           <w:noProof/>
         </w:rPr>
-        <w:t>[45]</w:t>
-      </w:r>
-      <w:r>
-        <w:fldChar w:fldCharType="end"/>
-      </w:r>
-      <w:r>
-        <w:t xml:space="preserve">, and Alfalfa runs building models as a service that controllers read and write at run time </w:t>
+        <w:t>[4]</w:t>
+      </w:r>
+      <w:r>
+        <w:fldChar w:fldCharType="end"/>
+      </w:r>
+      <w:r>
+        <w:t xml:space="preserve">, to explain and support ML-based control </w:t>
       </w:r>
       <w:r>
         <w:fldChar w:fldCharType="begin"/>
       </w:r>
       <w:r>
-        <w:instrText xml:space="preserve"> ADDIN EN.CITE &lt;EndNote&gt;&lt;Cite&gt;&lt;Author&gt;Benne&lt;/Author&gt;&lt;Year&gt;2024&lt;/Year&gt;&lt;RecNum&gt;4&lt;/RecNum&gt;&lt;DisplayText&gt;[46]&lt;/DisplayText&gt;&lt;record&gt;&lt;rec-number&gt;4&lt;/rec-number&gt;&lt;foreign-keys&gt;&lt;key app="EN" db-id="mdae8500109496fea4aff9c086e16cc25895" timestamp="1793185473"&gt;4&lt;/key&gt;&lt;/foreign-keys&gt;&lt;ref-type name="Report"&gt;27&lt;/ref-type&gt;&lt;contributors&gt;&lt;authors&gt;&lt;author&gt;Benne, Kyle&lt;/author&gt;&lt;author&gt;Shapinsky, Tobias&lt;/author&gt;&lt;author&gt;Petersen, Anya&lt;/author&gt;&lt;/authors&gt;&lt;/contributors&gt;&lt;titles&gt;&lt;title&gt;Alfalfa Virtual Building Service: Software Engineering Best Practices Applied to Runtime Interaction with Building Energy Models&lt;/title&gt;&lt;secondary-title&gt;IBPSA-USA SimBuild 2024 Conference, Denver, Colorado, 21–23 May 2024&lt;/secondary-title&gt;&lt;/titles&gt;&lt;dates&gt;&lt;year&gt;2024&lt;/year&gt;&lt;/dates&gt;&lt;pub-location&gt;Golden, CO&lt;/pub-location&gt;&lt;publisher&gt;National Renewable Energy Laboratory&lt;/publisher&gt;&lt;isbn&gt;NREL/PR-5500-89738&lt;/isbn&gt;&lt;label&gt;benne2024&lt;/label&gt;&lt;work-type&gt;Presentation&lt;/work-type&gt;&lt;urls&gt;&lt;related-urls&gt;&lt;url&gt;https://www.osti.gov/biblio/2407013&lt;/url&gt;&lt;/related-urls&gt;&lt;/urls&gt;&lt;/record&gt;&lt;/Cite&gt;&lt;/EndNote&gt;</w:instrText>
+        <w:instrText xml:space="preserve"> ADDIN EN.CITE &lt;EndNote&gt;&lt;Cite&gt;&lt;Author&gt;Zhang&lt;/Author&gt;&lt;Year&gt;2024&lt;/Year&gt;&lt;RecNum&gt;94&lt;/RecNum&gt;&lt;DisplayText&gt;[5]&lt;/DisplayText&gt;&lt;record&gt;&lt;rec-number&gt;94&lt;/rec-number&gt;&lt;foreign-keys&gt;&lt;key app="EN" db-id="mdae8500109496fea4aff9c086e16cc25895" timestamp="1793216821"&gt;94&lt;/key&gt;&lt;/foreign-keys&gt;&lt;ref-type name="Journal Article"&gt;17&lt;/ref-type&gt;&lt;contributors&gt;&lt;authors&gt;&lt;author&gt;Zhang, Liang&lt;/author&gt;&lt;author&gt;Chen, Zhelun&lt;/author&gt;&lt;/authors&gt;&lt;/contributors&gt;&lt;titles&gt;&lt;title&gt;Large language model-based interpretable machine learning control in building energy systems&lt;/title&gt;&lt;secondary-title&gt;Energy and Buildings&lt;/secondary-title&gt;&lt;alt-title&gt;Energy Build.&lt;/alt-title&gt;&lt;/titles&gt;&lt;periodical&gt;&lt;full-title&gt;Energy and Buildings&lt;/full-title&gt;&lt;abbr-1&gt;Energy Build.&lt;/abbr-1&gt;&lt;/periodical&gt;&lt;pages&gt;114278&lt;/pages&gt;&lt;volume&gt;313&lt;/volume&gt;&lt;dates&gt;&lt;year&gt;2024&lt;/year&gt;&lt;/dates&gt;&lt;publisher&gt;Elsevier&lt;/publisher&gt;&lt;label&gt;zhangchen2024&lt;/label&gt;&lt;urls&gt;&lt;/urls&gt;&lt;electronic-resource-num&gt;10.1016/j.enbuild.2024.114278&lt;/electronic-resource-num&gt;&lt;/record&gt;&lt;/Cite&gt;&lt;/EndNote&gt;</w:instrText>
       </w:r>
       <w:r>
         <w:fldChar w:fldCharType="separate"/>
@@ -2668,35 +2705,40 @@
         <w:rPr>
           <w:noProof/>
         </w:rPr>
+        <w:t>[5]</w:t>
+      </w:r>
+      <w:r>
+        <w:fldChar w:fldCharType="end"/>
+      </w:r>
+      <w:r>
+        <w:t xml:space="preserve">, in office-in-the-loop experiments </w:t>
+      </w:r>
+      <w:r>
+        <w:fldChar w:fldCharType="begin"/>
+      </w:r>
+      <w:r>
+        <w:instrText xml:space="preserve"> ADDIN EN.CITE &lt;EndNote&gt;&lt;Cite&gt;&lt;Author&gt;Sawada&lt;/Author&gt;&lt;Year&gt;2025&lt;/Year&gt;&lt;RecNum&gt;74&lt;/RecNum&gt;&lt;DisplayText&gt;[46]&lt;/DisplayText&gt;&lt;record&gt;&lt;rec-number&gt;74&lt;/rec-number&gt;&lt;foreign-keys&gt;&lt;key app="EN" db-id="mdae8500109496fea4aff9c086e16cc25895" timestamp="1793216821"&gt;74&lt;/key&gt;&lt;/foreign-keys&gt;&lt;ref-type name="Journal Article"&gt;17&lt;/ref-type&gt;&lt;contributors&gt;&lt;authors&gt;&lt;author&gt;Sawada, Tomoya&lt;/author&gt;&lt;author&gt;Mizuno, Masahiro&lt;/author&gt;&lt;author&gt;Hasegawa, Takaomi&lt;/author&gt;&lt;author&gt;Yokoyama, Keiichi&lt;/author&gt;&lt;author&gt;Kono, Mayuka&lt;/author&gt;&lt;/authors&gt;&lt;/contributors&gt;&lt;titles&gt;&lt;title&gt;Office-in-the-Loop: an investigation into Agentic AI for advanced building HVAC control systems&lt;/title&gt;&lt;secondary-title&gt;Data-Centric Engineering&lt;/secondary-title&gt;&lt;alt-title&gt;Data-Centric Eng.&lt;/alt-title&gt;&lt;/titles&gt;&lt;periodical&gt;&lt;full-title&gt;Data-Centric Engineering&lt;/full-title&gt;&lt;abbr-1&gt;Data-Centric Eng.&lt;/abbr-1&gt;&lt;/periodical&gt;&lt;pages&gt;e31&lt;/pages&gt;&lt;volume&gt;6&lt;/volume&gt;&lt;dates&gt;&lt;year&gt;2025&lt;/year&gt;&lt;/dates&gt;&lt;publisher&gt;Cambridge University Press&lt;/publisher&gt;&lt;label&gt;sawada2025&lt;/label&gt;&lt;urls&gt;&lt;/urls&gt;&lt;electronic-resource-num&gt;10.1017/dce.2025.10010&lt;/electronic-resource-num&gt;&lt;/record&gt;&lt;/Cite&gt;&lt;/EndNote&gt;</w:instrText>
+      </w:r>
+      <w:r>
+        <w:fldChar w:fldCharType="separate"/>
+      </w:r>
+      <w:r>
+        <w:rPr>
+          <w:noProof/>
+        </w:rPr>
         <w:t>[46]</w:t>
       </w:r>
       <w:r>
         <w:fldChar w:fldCharType="end"/>
       </w:r>
       <w:r>
-        <w:t xml:space="preserve">. These tools step synchronously or follow the wall clock; we found no time-meaning metadata, no record/replay of components and no asynchronous handling of slow AI calls in them.</w:t>
-      </w:r>
-    </w:p>
-    <w:p>
-      <w:pPr>
-        <w:pStyle w:val="Heading2"/>
-      </w:pPr>
-      <w:r>
-        <w:t xml:space="preserve">AI components in building simulation and control</w:t>
-      </w:r>
-    </w:p>
-    <w:p>
-      <w:pPr>
-        <w:pStyle w:val="BodyText"/>
-      </w:pPr>
-      <w:r>
-        <w:t xml:space="preserve">LLMs have been used to choose HVAC set-points </w:t>
+        <w:t xml:space="preserve"> and to generate EnergyPlus models </w:t>
       </w:r>
       <w:r>
         <w:fldChar w:fldCharType="begin"/>
       </w:r>
       <w:r>
-        <w:instrText xml:space="preserve"> ADDIN EN.CITE &lt;EndNote&gt;&lt;Cite&gt;&lt;Author&gt;Ahn&lt;/Author&gt;&lt;Year&gt;2023&lt;/Year&gt;&lt;RecNum&gt;1&lt;/RecNum&gt;&lt;DisplayText&gt;[4]&lt;/DisplayText&gt;&lt;record&gt;&lt;rec-number&gt;1&lt;/rec-number&gt;&lt;foreign-keys&gt;&lt;key app="EN" db-id="mdae8500109496fea4aff9c086e16cc25895" timestamp="1793185473"&gt;1&lt;/key&gt;&lt;/foreign-keys&gt;&lt;ref-type name="Journal Article"&gt;17&lt;/ref-type&gt;&lt;contributors&gt;&lt;authors&gt;&lt;author&gt;Ahn, Ki Uhn&lt;/author&gt;&lt;author&gt;Kim, Deuk-Woo&lt;/author&gt;&lt;author&gt;Cho, Hyun Mi&lt;/author&gt;&lt;author&gt;Chae, Chang-U&lt;/author&gt;&lt;/authors&gt;&lt;/contributors&gt;&lt;titles&gt;&lt;title&gt;Alternative Approaches to HVAC Control of Chat Generative Pre-Trained Transformer (ChatGPT) for Autonomous Building System Operations&lt;/title&gt;&lt;secondary-title&gt;Buildings&lt;/secondary-title&gt;&lt;alt-title&gt;Buildings&lt;/alt-title&gt;&lt;/titles&gt;&lt;periodical&gt;&lt;full-title&gt;Buildings&lt;/full-title&gt;&lt;abbr-1&gt;Buildings&lt;/abbr-1&gt;&lt;/periodical&gt;&lt;pages&gt;2680&lt;/pages&gt;&lt;volume&gt;13&lt;/volume&gt;&lt;number&gt;11&lt;/number&gt;&lt;dates&gt;&lt;year&gt;2023&lt;/year&gt;&lt;/dates&gt;&lt;publisher&gt;MDPI&lt;/publisher&gt;&lt;label&gt;ahn2023&lt;/label&gt;&lt;urls&gt;&lt;/urls&gt;&lt;electronic-resource-num&gt;10.3390/buildings13112680&lt;/electronic-resource-num&gt;&lt;/record&gt;&lt;/Cite&gt;&lt;/EndNote&gt;</w:instrText>
+        <w:instrText xml:space="preserve"> ADDIN EN.CITE &lt;EndNote&gt;&lt;Cite&gt;&lt;Author&gt;Jiang&lt;/Author&gt;&lt;Year&gt;2024&lt;/Year&gt;&lt;RecNum&gt;40&lt;/RecNum&gt;&lt;DisplayText&gt;[47]&lt;/DisplayText&gt;&lt;record&gt;&lt;rec-number&gt;40&lt;/rec-number&gt;&lt;foreign-keys&gt;&lt;key app="EN" db-id="mdae8500109496fea4aff9c086e16cc25895" timestamp="1793216821"&gt;40&lt;/key&gt;&lt;/foreign-keys&gt;&lt;ref-type name="Journal Article"&gt;17&lt;/ref-type&gt;&lt;contributors&gt;&lt;authors&gt;&lt;author&gt;Jiang, Gang&lt;/author&gt;&lt;author&gt;Ma, Zhihao&lt;/author&gt;&lt;author&gt;Zhang, Liang&lt;/author&gt;&lt;author&gt;Chen, Jianli&lt;/author&gt;&lt;/authors&gt;&lt;/contributors&gt;&lt;titles&gt;&lt;title&gt;EPlus-LLM: A large language model-based computing platform for automated building energy modeling&lt;/title&gt;&lt;secondary-title&gt;Applied Energy&lt;/secondary-title&gt;&lt;alt-title&gt;Appl. Energy&lt;/alt-title&gt;&lt;/titles&gt;&lt;periodical&gt;&lt;full-title&gt;Applied Energy&lt;/full-title&gt;&lt;abbr-1&gt;Appl. Energy&lt;/abbr-1&gt;&lt;/periodical&gt;&lt;pages&gt;123431&lt;/pages&gt;&lt;volume&gt;367&lt;/volume&gt;&lt;dates&gt;&lt;year&gt;2024&lt;/year&gt;&lt;/dates&gt;&lt;publisher&gt;Elsevier&lt;/publisher&gt;&lt;label&gt;jiang2024&lt;/label&gt;&lt;urls&gt;&lt;/urls&gt;&lt;electronic-resource-num&gt;10.1016/j.apenergy.2024.123431&lt;/electronic-resource-num&gt;&lt;/record&gt;&lt;/Cite&gt;&lt;/EndNote&gt;</w:instrText>
       </w:r>
       <w:r>
         <w:fldChar w:fldCharType="separate"/>
@@ -2705,70 +2747,7 @@
         <w:rPr>
           <w:noProof/>
         </w:rPr>
-        <w:t>[4]</w:t>
-      </w:r>
-      <w:r>
-        <w:fldChar w:fldCharType="end"/>
-      </w:r>
-      <w:r>
-        <w:t xml:space="preserve">, to explain and support ML-based control </w:t>
-      </w:r>
-      <w:r>
-        <w:fldChar w:fldCharType="begin"/>
-      </w:r>
-      <w:r>
-        <w:instrText xml:space="preserve"> ADDIN EN.CITE &lt;EndNote&gt;&lt;Cite&gt;&lt;Author&gt;Zhang&lt;/Author&gt;&lt;Year&gt;2024&lt;/Year&gt;&lt;RecNum&gt;94&lt;/RecNum&gt;&lt;DisplayText&gt;[5]&lt;/DisplayText&gt;&lt;record&gt;&lt;rec-number&gt;94&lt;/rec-number&gt;&lt;foreign-keys&gt;&lt;key app="EN" db-id="mdae8500109496fea4aff9c086e16cc25895" timestamp="1793185473"&gt;94&lt;/key&gt;&lt;/foreign-keys&gt;&lt;ref-type name="Journal Article"&gt;17&lt;/ref-type&gt;&lt;contributors&gt;&lt;authors&gt;&lt;author&gt;Zhang, Liang&lt;/author&gt;&lt;author&gt;Chen, Zhelun&lt;/author&gt;&lt;/authors&gt;&lt;/contributors&gt;&lt;titles&gt;&lt;title&gt;Large language model-based interpretable machine learning control in building energy systems&lt;/title&gt;&lt;secondary-title&gt;Energy and Buildings&lt;/secondary-title&gt;&lt;alt-title&gt;Energy Build.&lt;/alt-title&gt;&lt;/titles&gt;&lt;periodical&gt;&lt;full-title&gt;Energy and Buildings&lt;/full-title&gt;&lt;abbr-1&gt;Energy Build.&lt;/abbr-1&gt;&lt;/periodical&gt;&lt;pages&gt;114278&lt;/pages&gt;&lt;volume&gt;313&lt;/volume&gt;&lt;dates&gt;&lt;year&gt;2024&lt;/year&gt;&lt;/dates&gt;&lt;publisher&gt;Elsevier&lt;/publisher&gt;&lt;label&gt;zhangchen2024&lt;/label&gt;&lt;urls&gt;&lt;/urls&gt;&lt;electronic-resource-num&gt;10.1016/j.enbuild.2024.114278&lt;/electronic-resource-num&gt;&lt;/record&gt;&lt;/Cite&gt;&lt;/EndNote&gt;</w:instrText>
-      </w:r>
-      <w:r>
-        <w:fldChar w:fldCharType="separate"/>
-      </w:r>
-      <w:r>
-        <w:rPr>
-          <w:noProof/>
-        </w:rPr>
-        <w:t>[5]</w:t>
-      </w:r>
-      <w:r>
-        <w:fldChar w:fldCharType="end"/>
-      </w:r>
-      <w:r>
-        <w:t xml:space="preserve">, in office-in-the-loop experiments </w:t>
-      </w:r>
-      <w:r>
-        <w:fldChar w:fldCharType="begin"/>
-      </w:r>
-      <w:r>
-        <w:instrText xml:space="preserve"> ADDIN EN.CITE &lt;EndNote&gt;&lt;Cite&gt;&lt;Author&gt;Sawada&lt;/Author&gt;&lt;Year&gt;2025&lt;/Year&gt;&lt;RecNum&gt;74&lt;/RecNum&gt;&lt;DisplayText&gt;[47]&lt;/DisplayText&gt;&lt;record&gt;&lt;rec-number&gt;74&lt;/rec-number&gt;&lt;foreign-keys&gt;&lt;key app="EN" db-id="mdae8500109496fea4aff9c086e16cc25895" timestamp="1793185473"&gt;74&lt;/key&gt;&lt;/foreign-keys&gt;&lt;ref-type name="Journal Article"&gt;17&lt;/ref-type&gt;&lt;contributors&gt;&lt;authors&gt;&lt;author&gt;Sawada, Tomoya&lt;/author&gt;&lt;author&gt;Mizuno, Masahiro&lt;/author&gt;&lt;author&gt;Hasegawa, Takaomi&lt;/author&gt;&lt;author&gt;Yokoyama, Keiichi&lt;/author&gt;&lt;author&gt;Kono, Mayuka&lt;/author&gt;&lt;/authors&gt;&lt;/contributors&gt;&lt;titles&gt;&lt;title&gt;Office-in-the-Loop: an investigation into Agentic AI for advanced building HVAC control systems&lt;/title&gt;&lt;secondary-title&gt;Data-Centric Engineering&lt;/secondary-title&gt;&lt;alt-title&gt;Data-Centric Eng.&lt;/alt-title&gt;&lt;/titles&gt;&lt;periodical&gt;&lt;full-title&gt;Data-Centric Engineering&lt;/full-title&gt;&lt;abbr-1&gt;Data-Centric Eng.&lt;/abbr-1&gt;&lt;/periodical&gt;&lt;pages&gt;e31&lt;/pages&gt;&lt;volume&gt;6&lt;/volume&gt;&lt;dates&gt;&lt;year&gt;2025&lt;/year&gt;&lt;/dates&gt;&lt;publisher&gt;Cambridge University Press&lt;/publisher&gt;&lt;label&gt;sawada2025&lt;/label&gt;&lt;urls&gt;&lt;/urls&gt;&lt;electronic-resource-num&gt;10.1017/dce.2025.10010&lt;/electronic-resource-num&gt;&lt;/record&gt;&lt;/Cite&gt;&lt;/EndNote&gt;</w:instrText>
-      </w:r>
-      <w:r>
-        <w:fldChar w:fldCharType="separate"/>
-      </w:r>
-      <w:r>
-        <w:rPr>
-          <w:noProof/>
-        </w:rPr>
         <w:t>[47]</w:t>
-      </w:r>
-      <w:r>
-        <w:fldChar w:fldCharType="end"/>
-      </w:r>
-      <w:r>
-        <w:t xml:space="preserve"> and to generate EnergyPlus models </w:t>
-      </w:r>
-      <w:r>
-        <w:fldChar w:fldCharType="begin"/>
-      </w:r>
-      <w:r>
-        <w:instrText xml:space="preserve"> ADDIN EN.CITE &lt;EndNote&gt;&lt;Cite&gt;&lt;Author&gt;Jiang&lt;/Author&gt;&lt;Year&gt;2024&lt;/Year&gt;&lt;RecNum&gt;40&lt;/RecNum&gt;&lt;DisplayText&gt;[48]&lt;/DisplayText&gt;&lt;record&gt;&lt;rec-number&gt;40&lt;/rec-number&gt;&lt;foreign-keys&gt;&lt;key app="EN" db-id="mdae8500109496fea4aff9c086e16cc25895" timestamp="1793185473"&gt;40&lt;/key&gt;&lt;/foreign-keys&gt;&lt;ref-type name="Journal Article"&gt;17&lt;/ref-type&gt;&lt;contributors&gt;&lt;authors&gt;&lt;author&gt;Jiang, Gang&lt;/author&gt;&lt;author&gt;Ma, Zhihao&lt;/author&gt;&lt;author&gt;Zhang, Liang&lt;/author&gt;&lt;author&gt;Chen, Jianli&lt;/author&gt;&lt;/authors&gt;&lt;/contributors&gt;&lt;titles&gt;&lt;title&gt;EPlus-LLM: A large language model-based computing platform for automated building energy modeling&lt;/title&gt;&lt;secondary-title&gt;Applied Energy&lt;/secondary-title&gt;&lt;alt-title&gt;Appl. Energy&lt;/alt-title&gt;&lt;/titles&gt;&lt;periodical&gt;&lt;full-title&gt;Applied Energy&lt;/full-title&gt;&lt;abbr-1&gt;Appl. Energy&lt;/abbr-1&gt;&lt;/periodical&gt;&lt;pages&gt;123431&lt;/pages&gt;&lt;volume&gt;367&lt;/volume&gt;&lt;dates&gt;&lt;year&gt;2024&lt;/year&gt;&lt;/dates&gt;&lt;publisher&gt;Elsevier&lt;/publisher&gt;&lt;label&gt;jiang2024&lt;/label&gt;&lt;urls&gt;&lt;/urls&gt;&lt;electronic-resource-num&gt;10.1016/j.apenergy.2024.123431&lt;/electronic-resource-num&gt;&lt;/record&gt;&lt;/Cite&gt;&lt;/EndNote&gt;</w:instrText>
-      </w:r>
-      <w:r>
-        <w:fldChar w:fldCharType="separate"/>
-      </w:r>
-      <w:r>
-        <w:rPr>
-          <w:noProof/>
-        </w:rPr>
-        <w:t>[48]</w:t>
       </w:r>
       <w:r>
         <w:fldChar w:fldCharType="end"/>
@@ -2781,8 +2760,8 @@
           <w:fldData xml:space="preserve">PEVuZE5vdGU+PENpdGU+PEF1dGhvcj5MaXU8L0F1dGhvcj48WWVhcj4yMDI1PC9ZZWFyPjxSZWNO
 dW0+NTE8L1JlY051bT48RGlzcGxheVRleHQ+WzYsMjZdPC9EaXNwbGF5VGV4dD48cmVjb3JkPjxy
 ZWMtbnVtYmVyPjUxPC9yZWMtbnVtYmVyPjxmb3JlaWduLWtleXM+PGtleSBhcHA9IkVOIiBkYi1p
-ZD0ibWRhZTg1MDAxMDk0OTZmZWE0YWZmOWMwODZlMTZjYzI1ODk1IiB0aW1lc3RhbXA9IjE3OTMx
-ODU0NzMiPjUxPC9rZXk+PC9mb3JlaWduLWtleXM+PHJlZi10eXBlIG5hbWU9IkpvdXJuYWwgQXJ0
+ZD0ibWRhZTg1MDAxMDk0OTZmZWE0YWZmOWMwODZlMTZjYzI1ODk1IiB0aW1lc3RhbXA9IjE3OTMy
+MTY4MjEiPjUxPC9rZXk+PC9mb3JlaWduLWtleXM+PHJlZi10eXBlIG5hbWU9IkpvdXJuYWwgQXJ0
 aWNsZSI+MTc8L3JlZi10eXBlPjxjb250cmlidXRvcnM+PGF1dGhvcnM+PGF1dGhvcj5MaXUsIE1p
 bmd6aGU8L2F1dGhvcj48YXV0aG9yPlpoYW5nLCBMaWFuZzwvYXV0aG9yPjxhdXRob3I+Q2hlbiwg
 SmlhbmxpPC9hdXRob3I+PGF1dGhvcj5DaGVuLCBXZWktQW48L2F1dGhvcj48YXV0aG9yPllhbmcs
@@ -2801,7 +2780,7 @@
 Q2l0ZT48QXV0aG9yPk5ldWJhdWVyPC9BdXRob3I+PFllYXI+MjAyNjwvWWVhcj48UmVjTnVtPjU3
 PC9SZWNOdW0+PHJlY29yZD48cmVjLW51bWJlcj41NzwvcmVjLW51bWJlcj48Zm9yZWlnbi1rZXlz
 PjxrZXkgYXBwPSJFTiIgZGItaWQ9Im1kYWU4NTAwMTA5NDk2ZmVhNGFmZjljMDg2ZTE2Y2MyNTg5
-NSIgdGltZXN0YW1wPSIxNzkzMTg1NDczIj41Nzwva2V5PjwvZm9yZWlnbi1rZXlzPjxyZWYtdHlw
+NSIgdGltZXN0YW1wPSIxNzkzMjE2ODIxIj41Nzwva2V5PjwvZm9yZWlnbi1rZXlzPjxyZWYtdHlw
 ZSBuYW1lPSJHZW5lcmljIj4xMzwvcmVmLXR5cGU+PGNvbnRyaWJ1dG9ycz48YXV0aG9ycz48YXV0
 aG9yPk5ldWJhdWVyLCBBbGV4YW5kZXI8L2F1dGhvcj48YXV0aG9yPkhvbmcsIFRpYW56aGVuPC9h
 dXRob3I+PGF1dGhvcj5MaSwgSGFuPC9hdXRob3I+PGF1dGhvcj5ZdSwgTWVuZ2JvPC9hdXRob3I+
@@ -2826,8 +2805,8 @@
           <w:fldData xml:space="preserve">PEVuZE5vdGU+PENpdGU+PEF1dGhvcj5MaXU8L0F1dGhvcj48WWVhcj4yMDI1PC9ZZWFyPjxSZWNO
 dW0+NTE8L1JlY051bT48RGlzcGxheVRleHQ+WzYsMjZdPC9EaXNwbGF5VGV4dD48cmVjb3JkPjxy
 ZWMtbnVtYmVyPjUxPC9yZWMtbnVtYmVyPjxmb3JlaWduLWtleXM+PGtleSBhcHA9IkVOIiBkYi1p
-ZD0ibWRhZTg1MDAxMDk0OTZmZWE0YWZmOWMwODZlMTZjYzI1ODk1IiB0aW1lc3RhbXA9IjE3OTMx
-ODU0NzMiPjUxPC9rZXk+PC9mb3JlaWduLWtleXM+PHJlZi10eXBlIG5hbWU9IkpvdXJuYWwgQXJ0
+ZD0ibWRhZTg1MDAxMDk0OTZmZWE0YWZmOWMwODZlMTZjYzI1ODk1IiB0aW1lc3RhbXA9IjE3OTMy
+MTY4MjEiPjUxPC9rZXk+PC9mb3JlaWduLWtleXM+PHJlZi10eXBlIG5hbWU9IkpvdXJuYWwgQXJ0
 aWNsZSI+MTc8L3JlZi10eXBlPjxjb250cmlidXRvcnM+PGF1dGhvcnM+PGF1dGhvcj5MaXUsIE1p
 bmd6aGU8L2F1dGhvcj48YXV0aG9yPlpoYW5nLCBMaWFuZzwvYXV0aG9yPjxhdXRob3I+Q2hlbiwg
 SmlhbmxpPC9hdXRob3I+PGF1dGhvcj5DaGVuLCBXZWktQW48L2F1dGhvcj48YXV0aG9yPllhbmcs
@@ -2846,7 +2825,7 @@
 Q2l0ZT48QXV0aG9yPk5ldWJhdWVyPC9BdXRob3I+PFllYXI+MjAyNjwvWWVhcj48UmVjTnVtPjU3
 PC9SZWNOdW0+PHJlY29yZD48cmVjLW51bWJlcj41NzwvcmVjLW51bWJlcj48Zm9yZWlnbi1rZXlz
 PjxrZXkgYXBwPSJFTiIgZGItaWQ9Im1kYWU4NTAwMTA5NDk2ZmVhNGFmZjljMDg2ZTE2Y2MyNTg5
-NSIgdGltZXN0YW1wPSIxNzkzMTg1NDczIj41Nzwva2V5PjwvZm9yZWlnbi1rZXlzPjxyZWYtdHlw
+NSIgdGltZXN0YW1wPSIxNzkzMjE2ODIxIj41Nzwva2V5PjwvZm9yZWlnbi1rZXlzPjxyZWYtdHlw
 ZSBuYW1lPSJHZW5lcmljIj4xMzwvcmVmLXR5cGU+PGNvbnRyaWJ1dG9ycz48YXV0aG9ycz48YXV0
 aG9yPk5ldWJhdWVyLCBBbGV4YW5kZXI8L2F1dGhvcj48YXV0aG9yPkhvbmcsIFRpYW56aGVuPC9h
 dXRob3I+PGF1dGhvcj5MaSwgSGFuPC9hdXRob3I+PGF1dGhvcj5ZdSwgTWVuZ2JvPC9hdXRob3I+
@@ -2904,7 +2883,7 @@
         <w:fldChar w:fldCharType="begin"/>
       </w:r>
       <w:r>
-        <w:instrText xml:space="preserve"> ADDIN EN.CITE &lt;EndNote&gt;&lt;Cite&gt;&lt;Author&gt;Eaton&lt;/Author&gt;&lt;Year&gt;2023&lt;/Year&gt;&lt;RecNum&gt;10&lt;/RecNum&gt;&lt;DisplayText&gt;[49]&lt;/DisplayText&gt;&lt;record&gt;&lt;rec-number&gt;10&lt;/rec-number&gt;&lt;foreign-keys&gt;&lt;key app="EN" db-id="mdae8500109496fea4aff9c086e16cc25895" timestamp="1793185473"&gt;10&lt;/key&gt;&lt;/foreign-keys&gt;&lt;ref-type name="Web Page"&gt;12&lt;/ref-type&gt;&lt;contributors&gt;&lt;authors&gt;&lt;author&gt;Eaton, Brian&lt;/author&gt;&lt;author&gt;Gregory, Jonathan&lt;/author&gt;&lt;author&gt;Drach, Bob&lt;/author&gt;&lt;author&gt;Taylor, Karl&lt;/author&gt;&lt;author&gt;Hankin, Steve&lt;/author&gt;&lt;author&gt;Blower, Jon&lt;/author&gt;&lt;author&gt;Caron, John&lt;/author&gt;&lt;author&gt;Signell, Rich&lt;/author&gt;&lt;author&gt;Bentley, Phil&lt;/author&gt;&lt;author&gt;Rappa, Greg&lt;/author&gt;&lt;author&gt;Höck, Heinke&lt;/author&gt;&lt;author&gt;Pamment, Alison&lt;/author&gt;&lt;author&gt;Juckes, Martin&lt;/author&gt;&lt;author&gt;Raspaud, Martin&lt;/author&gt;&lt;author&gt;Horne, Randy&lt;/author&gt;&lt;author&gt;Whiteaker, Timothy&lt;/author&gt;&lt;author&gt;Blodgett, David&lt;/author&gt;&lt;author&gt;Zender, Charlie&lt;/author&gt;&lt;author&gt;Lee, Daniel&lt;/author&gt;&lt;author&gt;Hassell, David&lt;/author&gt;&lt;author&gt;Snow, Alan D.&lt;/author&gt;&lt;author&gt;Kölling, Tobias&lt;/author&gt;&lt;author&gt;Allured, Dave&lt;/author&gt;&lt;author&gt;Jelenak, Aleksandar&lt;/author&gt;&lt;author&gt;Meier Soerensen, Anders&lt;/author&gt;&lt;author&gt;Gaultier, Lucile&lt;/author&gt;&lt;author&gt;Herlédan, Sylvain&lt;/author&gt;&lt;author&gt;Manzano, Fernando&lt;/author&gt;&lt;author&gt;Bärring, Lars&lt;/author&gt;&lt;author&gt;Barker, Christopher&lt;/author&gt;&lt;author&gt;Bartholomew, Sadie&lt;/author&gt;&lt;/authors&gt;&lt;/contributors&gt;&lt;titles&gt;&lt;title&gt;NetCDF Climate and Forecast (CF) Metadata Conventions&lt;/title&gt;&lt;/titles&gt;&lt;dates&gt;&lt;year&gt;2023&lt;/year&gt;&lt;/dates&gt;&lt;label&gt;cf2023&lt;/label&gt;&lt;urls&gt;&lt;related-urls&gt;&lt;url&gt;https://cfconventions.org/Data/cf-conventions/cf-conventions-1.11/cf-conventions.html&lt;/url&gt;&lt;/related-urls&gt;&lt;/urls&gt;&lt;access-date&gt;2026-10-28&lt;/access-date&gt;&lt;/record&gt;&lt;/Cite&gt;&lt;/EndNote&gt;</w:instrText>
+        <w:instrText xml:space="preserve"> ADDIN EN.CITE &lt;EndNote&gt;&lt;Cite&gt;&lt;Author&gt;Eaton&lt;/Author&gt;&lt;Year&gt;2023&lt;/Year&gt;&lt;RecNum&gt;10&lt;/RecNum&gt;&lt;DisplayText&gt;[48]&lt;/DisplayText&gt;&lt;record&gt;&lt;rec-number&gt;10&lt;/rec-number&gt;&lt;foreign-keys&gt;&lt;key app="EN" db-id="mdae8500109496fea4aff9c086e16cc25895" timestamp="1793216821"&gt;10&lt;/key&gt;&lt;/foreign-keys&gt;&lt;ref-type name="Web Page"&gt;12&lt;/ref-type&gt;&lt;contributors&gt;&lt;authors&gt;&lt;author&gt;Eaton, Brian&lt;/author&gt;&lt;author&gt;Gregory, Jonathan&lt;/author&gt;&lt;author&gt;Drach, Bob&lt;/author&gt;&lt;author&gt;Taylor, Karl&lt;/author&gt;&lt;author&gt;Hankin, Steve&lt;/author&gt;&lt;author&gt;Blower, Jon&lt;/author&gt;&lt;author&gt;Caron, John&lt;/author&gt;&lt;author&gt;Signell, Rich&lt;/author&gt;&lt;author&gt;Bentley, Phil&lt;/author&gt;&lt;author&gt;Rappa, Greg&lt;/author&gt;&lt;author&gt;Höck, Heinke&lt;/author&gt;&lt;author&gt;Pamment, Alison&lt;/author&gt;&lt;author&gt;Juckes, Martin&lt;/author&gt;&lt;author&gt;Raspaud, Martin&lt;/author&gt;&lt;author&gt;Horne, Randy&lt;/author&gt;&lt;author&gt;Whiteaker, Timothy&lt;/author&gt;&lt;author&gt;Blodgett, David&lt;/author&gt;&lt;author&gt;Zender, Charlie&lt;/author&gt;&lt;author&gt;Lee, Daniel&lt;/author&gt;&lt;author&gt;Hassell, David&lt;/author&gt;&lt;author&gt;Snow, Alan D.&lt;/author&gt;&lt;author&gt;Kölling, Tobias&lt;/author&gt;&lt;author&gt;Allured, Dave&lt;/author&gt;&lt;author&gt;Jelenak, Aleksandar&lt;/author&gt;&lt;author&gt;Meier Soerensen, Anders&lt;/author&gt;&lt;author&gt;Gaultier, Lucile&lt;/author&gt;&lt;author&gt;Herlédan, Sylvain&lt;/author&gt;&lt;author&gt;Manzano, Fernando&lt;/author&gt;&lt;author&gt;Bärring, Lars&lt;/author&gt;&lt;author&gt;Barker, Christopher&lt;/author&gt;&lt;author&gt;Bartholomew, Sadie&lt;/author&gt;&lt;/authors&gt;&lt;/contributors&gt;&lt;titles&gt;&lt;title&gt;NetCDF Climate and Forecast (CF) Metadata Conventions&lt;/title&gt;&lt;/titles&gt;&lt;dates&gt;&lt;year&gt;2023&lt;/year&gt;&lt;/dates&gt;&lt;label&gt;cf2023&lt;/label&gt;&lt;urls&gt;&lt;related-urls&gt;&lt;url&gt;https://cfconventions.org/Data/cf-conventions/cf-conventions-1.11/cf-conventions.html&lt;/url&gt;&lt;/related-urls&gt;&lt;/urls&gt;&lt;access-date&gt;2026-10-28&lt;/access-date&gt;&lt;/record&gt;&lt;/Cite&gt;&lt;/EndNote&gt;</w:instrText>
       </w:r>
       <w:r>
         <w:fldChar w:fldCharType="separate"/>
@@ -2913,19 +2892,40 @@
         <w:rPr>
           <w:noProof/>
         </w:rPr>
+        <w:t>[48]</w:t>
+      </w:r>
+      <w:r>
+        <w:fldChar w:fldCharType="end"/>
+      </w:r>
+      <w:r>
+        <w:t xml:space="preserve">; WaterML 2.0 gives every time series an interpolation type such as average, total or constant in the preceding or succeeding interval </w:t>
+      </w:r>
+      <w:r>
+        <w:fldChar w:fldCharType="begin"/>
+      </w:r>
+      <w:r>
+        <w:instrText xml:space="preserve"> ADDIN EN.CITE &lt;EndNote&gt;&lt;Cite&gt;&lt;Author&gt;Open Geospatial Consortium&lt;/Author&gt;&lt;Year&gt;2014&lt;/Year&gt;&lt;RecNum&gt;63&lt;/RecNum&gt;&lt;DisplayText&gt;[49]&lt;/DisplayText&gt;&lt;record&gt;&lt;rec-number&gt;63&lt;/rec-number&gt;&lt;foreign-keys&gt;&lt;key app="EN" db-id="mdae8500109496fea4aff9c086e16cc25895" timestamp="1793216821"&gt;63&lt;/key&gt;&lt;/foreign-keys&gt;&lt;ref-type name="Standard"&gt;58&lt;/ref-type&gt;&lt;contributors&gt;&lt;authors&gt;&lt;author&gt;Open Geospatial Consortium&lt;/author&gt;&lt;/authors&gt;&lt;secondary-authors&gt;&lt;author&gt;Taylor, Peter&lt;/author&gt;&lt;/secondary-authors&gt;&lt;/contributors&gt;&lt;titles&gt;&lt;title&gt;OGC WaterML 2.0: Part 1 – Timeseries, Version 2.0.1&lt;/title&gt;&lt;secondary-title&gt;OGC 10-126r4&lt;/secondary-title&gt;&lt;/titles&gt;&lt;dates&gt;&lt;year&gt;2014&lt;/year&gt;&lt;/dates&gt;&lt;label&gt;ogc_waterml2014&lt;/label&gt;&lt;urls&gt;&lt;related-urls&gt;&lt;url&gt;https://docs.ogc.org/is/10-126r4/10-126r4.pdf&lt;/url&gt;&lt;/related-urls&gt;&lt;/urls&gt;&lt;/record&gt;&lt;/Cite&gt;&lt;/EndNote&gt;</w:instrText>
+      </w:r>
+      <w:r>
+        <w:fldChar w:fldCharType="separate"/>
+      </w:r>
+      <w:r>
+        <w:rPr>
+          <w:noProof/>
+        </w:rPr>
         <w:t>[49]</w:t>
       </w:r>
       <w:r>
         <w:fldChar w:fldCharType="end"/>
       </w:r>
       <w:r>
-        <w:t xml:space="preserve">; WaterML 2.0 gives every time series an interpolation type such as average, total or constant in the preceding or succeeding interval </w:t>
+        <w:t xml:space="preserve">; and EnergyPlus classifies its output variables as averaged or summed when reporting at coarser frequencies </w:t>
       </w:r>
       <w:r>
         <w:fldChar w:fldCharType="begin"/>
       </w:r>
       <w:r>
-        <w:instrText xml:space="preserve"> ADDIN EN.CITE &lt;EndNote&gt;&lt;Cite&gt;&lt;Author&gt;Open Geospatial Consortium&lt;/Author&gt;&lt;Year&gt;2014&lt;/Year&gt;&lt;RecNum&gt;63&lt;/RecNum&gt;&lt;DisplayText&gt;[50]&lt;/DisplayText&gt;&lt;record&gt;&lt;rec-number&gt;63&lt;/rec-number&gt;&lt;foreign-keys&gt;&lt;key app="EN" db-id="mdae8500109496fea4aff9c086e16cc25895" timestamp="1793185473"&gt;63&lt;/key&gt;&lt;/foreign-keys&gt;&lt;ref-type name="Standard"&gt;58&lt;/ref-type&gt;&lt;contributors&gt;&lt;authors&gt;&lt;author&gt;Open Geospatial Consortium&lt;/author&gt;&lt;/authors&gt;&lt;secondary-authors&gt;&lt;author&gt;Taylor, Peter&lt;/author&gt;&lt;/secondary-authors&gt;&lt;/contributors&gt;&lt;titles&gt;&lt;title&gt;OGC WaterML 2.0: Part 1 – Timeseries, Version 2.0.1&lt;/title&gt;&lt;secondary-title&gt;OGC 10-126r4&lt;/secondary-title&gt;&lt;/titles&gt;&lt;dates&gt;&lt;year&gt;2014&lt;/year&gt;&lt;/dates&gt;&lt;label&gt;ogc_waterml2014&lt;/label&gt;&lt;urls&gt;&lt;related-urls&gt;&lt;url&gt;https://docs.ogc.org/is/10-126r4/10-126r4.pdf&lt;/url&gt;&lt;/related-urls&gt;&lt;/urls&gt;&lt;/record&gt;&lt;/Cite&gt;&lt;/EndNote&gt;</w:instrText>
+        <w:instrText xml:space="preserve"> ADDIN EN.CITE &lt;EndNote&gt;&lt;Cite&gt;&lt;Author&gt;U.S. Department of Energy&lt;/Author&gt;&lt;Year&gt;2024&lt;/Year&gt;&lt;RecNum&gt;20&lt;/RecNum&gt;&lt;DisplayText&gt;[21]&lt;/DisplayText&gt;&lt;record&gt;&lt;rec-number&gt;20&lt;/rec-number&gt;&lt;foreign-keys&gt;&lt;key app="EN" db-id="mdae8500109496fea4aff9c086e16cc25895" timestamp="1793216821"&gt;20&lt;/key&gt;&lt;/foreign-keys&gt;&lt;ref-type name="Web Page"&gt;12&lt;/ref-type&gt;&lt;contributors&gt;&lt;authors&gt;&lt;author&gt;U.S. Department of Energy&lt;/author&gt;&lt;/authors&gt;&lt;/contributors&gt;&lt;titles&gt;&lt;title&gt;EnergyPlus Output Details and Examples: eplusout.rdd&lt;/title&gt;&lt;/titles&gt;&lt;dates&gt;&lt;year&gt;2024&lt;/year&gt;&lt;/dates&gt;&lt;label&gt;doe2024rdd&lt;/label&gt;&lt;urls&gt;&lt;related-urls&gt;&lt;url&gt;https://bigladdersoftware.com/epx/docs/24-1/output-details-and-examples/eplusout-rdd.html&lt;/url&gt;&lt;/related-urls&gt;&lt;/urls&gt;&lt;access-date&gt;2026-10-28&lt;/access-date&gt;&lt;/record&gt;&lt;/Cite&gt;&lt;/EndNote&gt;</w:instrText>
       </w:r>
       <w:r>
         <w:fldChar w:fldCharType="separate"/>
@@ -2934,19 +2934,40 @@
         <w:rPr>
           <w:noProof/>
         </w:rPr>
+        <w:t>[21]</w:t>
+      </w:r>
+      <w:r>
+        <w:fldChar w:fldCharType="end"/>
+      </w:r>
+      <w:r>
+        <w:t xml:space="preserve">. Industrial communication standards attach a quality to every value, for example the OPC UA status codes for last usable and substitute values </w:t>
+      </w:r>
+      <w:r>
+        <w:fldChar w:fldCharType="begin"/>
+      </w:r>
+      <w:r>
+        <w:instrText xml:space="preserve"> ADDIN EN.CITE &lt;EndNote&gt;&lt;Cite&gt;&lt;Author&gt;OPC Foundation&lt;/Author&gt;&lt;Year&gt;2026&lt;/Year&gt;&lt;RecNum&gt;65&lt;/RecNum&gt;&lt;DisplayText&gt;[50]&lt;/DisplayText&gt;&lt;record&gt;&lt;rec-number&gt;65&lt;/rec-number&gt;&lt;foreign-keys&gt;&lt;key app="EN" db-id="mdae8500109496fea4aff9c086e16cc25895" timestamp="1793216821"&gt;65&lt;/key&gt;&lt;/foreign-keys&gt;&lt;ref-type name="Standard"&gt;58&lt;/ref-type&gt;&lt;contributors&gt;&lt;authors&gt;&lt;author&gt;OPC Foundation&lt;/author&gt;&lt;/authors&gt;&lt;/contributors&gt;&lt;titles&gt;&lt;title&gt;OPC Unified Architecture – Part 8: Data Access&lt;/title&gt;&lt;secondary-title&gt;OPC 10000-8, Release 1.05.07&lt;/secondary-title&gt;&lt;/titles&gt;&lt;dates&gt;&lt;year&gt;2026&lt;/year&gt;&lt;/dates&gt;&lt;label&gt;opcua_part8&lt;/label&gt;&lt;urls&gt;&lt;related-urls&gt;&lt;url&gt;https://reference.opcfoundation.org/specs/OPC-10000-8&lt;/url&gt;&lt;/related-urls&gt;&lt;/urls&gt;&lt;/record&gt;&lt;/Cite&gt;&lt;/EndNote&gt;</w:instrText>
+      </w:r>
+      <w:r>
+        <w:fldChar w:fldCharType="separate"/>
+      </w:r>
+      <w:r>
+        <w:rPr>
+          <w:noProof/>
+        </w:rPr>
         <w:t>[50]</w:t>
       </w:r>
       <w:r>
         <w:fldChar w:fldCharType="end"/>
       </w:r>
       <w:r>
-        <w:t xml:space="preserve">; and EnergyPlus classifies its output variables as averaged or summed when reporting at coarser frequencies </w:t>
+        <w:t xml:space="preserve">. Provenance models such as W3C PROV describe which activity produced which entity from which inputs </w:t>
       </w:r>
       <w:r>
         <w:fldChar w:fldCharType="begin"/>
       </w:r>
       <w:r>
-        <w:instrText xml:space="preserve"> ADDIN EN.CITE &lt;EndNote&gt;&lt;Cite&gt;&lt;Author&gt;U.S. Department of Energy&lt;/Author&gt;&lt;Year&gt;2024&lt;/Year&gt;&lt;RecNum&gt;20&lt;/RecNum&gt;&lt;DisplayText&gt;[21]&lt;/DisplayText&gt;&lt;record&gt;&lt;rec-number&gt;20&lt;/rec-number&gt;&lt;foreign-keys&gt;&lt;key app="EN" db-id="mdae8500109496fea4aff9c086e16cc25895" timestamp="1793185473"&gt;20&lt;/key&gt;&lt;/foreign-keys&gt;&lt;ref-type name="Web Page"&gt;12&lt;/ref-type&gt;&lt;contributors&gt;&lt;authors&gt;&lt;author&gt;U.S. Department of Energy&lt;/author&gt;&lt;/authors&gt;&lt;/contributors&gt;&lt;titles&gt;&lt;title&gt;EnergyPlus Output Details and Examples: eplusout.rdd&lt;/title&gt;&lt;/titles&gt;&lt;dates&gt;&lt;year&gt;2024&lt;/year&gt;&lt;/dates&gt;&lt;label&gt;doe2024rdd&lt;/label&gt;&lt;urls&gt;&lt;related-urls&gt;&lt;url&gt;https://bigladdersoftware.com/epx/docs/24-1/output-details-and-examples/eplusout-rdd.html&lt;/url&gt;&lt;/related-urls&gt;&lt;/urls&gt;&lt;access-date&gt;2026-10-28&lt;/access-date&gt;&lt;/record&gt;&lt;/Cite&gt;&lt;/EndNote&gt;</w:instrText>
+        <w:instrText xml:space="preserve"> ADDIN EN.CITE &lt;EndNote&gt;&lt;Cite&gt;&lt;Author&gt;Moreau&lt;/Author&gt;&lt;Year&gt;2013&lt;/Year&gt;&lt;RecNum&gt;55&lt;/RecNum&gt;&lt;DisplayText&gt;[51]&lt;/DisplayText&gt;&lt;record&gt;&lt;rec-number&gt;55&lt;/rec-number&gt;&lt;foreign-keys&gt;&lt;key app="EN" db-id="mdae8500109496fea4aff9c086e16cc25895" timestamp="1793216821"&gt;55&lt;/key&gt;&lt;/foreign-keys&gt;&lt;ref-type name="Standard"&gt;58&lt;/ref-type&gt;&lt;contributors&gt;&lt;authors&gt;&lt;author&gt;Moreau, Luc&lt;/author&gt;&lt;author&gt;Missier, Paolo&lt;/author&gt;&lt;/authors&gt;&lt;/contributors&gt;&lt;titles&gt;&lt;title&gt;PROV-DM: The PROV Data Model&lt;/title&gt;&lt;secondary-title&gt;W3C Recommendation&lt;/secondary-title&gt;&lt;/titles&gt;&lt;dates&gt;&lt;year&gt;2013&lt;/year&gt;&lt;/dates&gt;&lt;publisher&gt;World Wide Web Consortium (W3C)&lt;/publisher&gt;&lt;label&gt;moreau2013prov&lt;/label&gt;&lt;urls&gt;&lt;related-urls&gt;&lt;url&gt;https://www.w3.org/TR/2013/REC-prov-dm-20130430/&lt;/url&gt;&lt;/related-urls&gt;&lt;/urls&gt;&lt;/record&gt;&lt;/Cite&gt;&lt;/EndNote&gt;</w:instrText>
       </w:r>
       <w:r>
         <w:fldChar w:fldCharType="separate"/>
@@ -2955,19 +2976,19 @@
         <w:rPr>
           <w:noProof/>
         </w:rPr>
-        <w:t>[21]</w:t>
-      </w:r>
-      <w:r>
-        <w:fldChar w:fldCharType="end"/>
-      </w:r>
-      <w:r>
-        <w:t xml:space="preserve">. Industrial communication standards attach a quality to every value, for example the OPC UA status codes for last usable and substitute values </w:t>
+        <w:t>[51]</w:t>
+      </w:r>
+      <w:r>
+        <w:fldChar w:fldCharType="end"/>
+      </w:r>
+      <w:r>
+        <w:t xml:space="preserve">. Deterministic record and replay is a standard debugging technique </w:t>
       </w:r>
       <w:r>
         <w:fldChar w:fldCharType="begin"/>
       </w:r>
       <w:r>
-        <w:instrText xml:space="preserve"> ADDIN EN.CITE &lt;EndNote&gt;&lt;Cite&gt;&lt;Author&gt;OPC Foundation&lt;/Author&gt;&lt;Year&gt;2026&lt;/Year&gt;&lt;RecNum&gt;65&lt;/RecNum&gt;&lt;DisplayText&gt;[51]&lt;/DisplayText&gt;&lt;record&gt;&lt;rec-number&gt;65&lt;/rec-number&gt;&lt;foreign-keys&gt;&lt;key app="EN" db-id="mdae8500109496fea4aff9c086e16cc25895" timestamp="1793185473"&gt;65&lt;/key&gt;&lt;/foreign-keys&gt;&lt;ref-type name="Standard"&gt;58&lt;/ref-type&gt;&lt;contributors&gt;&lt;authors&gt;&lt;author&gt;OPC Foundation&lt;/author&gt;&lt;/authors&gt;&lt;/contributors&gt;&lt;titles&gt;&lt;title&gt;OPC Unified Architecture – Part 8: Data Access&lt;/title&gt;&lt;secondary-title&gt;OPC 10000-8, Release 1.05.07&lt;/secondary-title&gt;&lt;/titles&gt;&lt;dates&gt;&lt;year&gt;2026&lt;/year&gt;&lt;/dates&gt;&lt;label&gt;opcua_part8&lt;/label&gt;&lt;urls&gt;&lt;related-urls&gt;&lt;url&gt;https://reference.opcfoundation.org/specs/OPC-10000-8&lt;/url&gt;&lt;/related-urls&gt;&lt;/urls&gt;&lt;/record&gt;&lt;/Cite&gt;&lt;/EndNote&gt;</w:instrText>
+        <w:instrText xml:space="preserve"> ADDIN EN.CITE &lt;EndNote&gt;&lt;Cite&gt;&lt;Author&gt;Chen&lt;/Author&gt;&lt;Year&gt;2015&lt;/Year&gt;&lt;RecNum&gt;12&lt;/RecNum&gt;&lt;DisplayText&gt;[52]&lt;/DisplayText&gt;&lt;record&gt;&lt;rec-number&gt;12&lt;/rec-number&gt;&lt;foreign-keys&gt;&lt;key app="EN" db-id="mdae8500109496fea4aff9c086e16cc25895" timestamp="1793216821"&gt;12&lt;/key&gt;&lt;/foreign-keys&gt;&lt;ref-type name="Journal Article"&gt;17&lt;/ref-type&gt;&lt;contributors&gt;&lt;authors&gt;&lt;author&gt;Chen, Yunji&lt;/author&gt;&lt;author&gt;Zhang, Shijin&lt;/author&gt;&lt;author&gt;Guo, Qi&lt;/author&gt;&lt;author&gt;Li, Ling&lt;/author&gt;&lt;author&gt;Wu, Ruiyang&lt;/author&gt;&lt;author&gt;Chen, Tianshi&lt;/author&gt;&lt;/authors&gt;&lt;/contributors&gt;&lt;titles&gt;&lt;title&gt;Deterministic Replay: A Survey&lt;/title&gt;&lt;secondary-title&gt;ACM Computing Surveys&lt;/secondary-title&gt;&lt;alt-title&gt;ACM Comput. Surv.&lt;/alt-title&gt;&lt;/titles&gt;&lt;periodical&gt;&lt;full-title&gt;ACM Computing Surveys&lt;/full-title&gt;&lt;abbr-1&gt;ACM Comput. Surv.&lt;/abbr-1&gt;&lt;/periodical&gt;&lt;pages&gt;1-47&lt;/pages&gt;&lt;volume&gt;48&lt;/volume&gt;&lt;number&gt;2&lt;/number&gt;&lt;dates&gt;&lt;year&gt;2015&lt;/year&gt;&lt;/dates&gt;&lt;publisher&gt;ACM&lt;/publisher&gt;&lt;label&gt;chen2015replay&lt;/label&gt;&lt;urls&gt;&lt;/urls&gt;&lt;electronic-resource-num&gt;10.1145/2790077&lt;/electronic-resource-num&gt;&lt;/record&gt;&lt;/Cite&gt;&lt;/EndNote&gt;</w:instrText>
       </w:r>
       <w:r>
         <w:fldChar w:fldCharType="separate"/>
@@ -2976,19 +2997,19 @@
         <w:rPr>
           <w:noProof/>
         </w:rPr>
-        <w:t>[51]</w:t>
-      </w:r>
-      <w:r>
-        <w:fldChar w:fldCharType="end"/>
-      </w:r>
-      <w:r>
-        <w:t xml:space="preserve">. Provenance models such as W3C PROV describe which activity produced which entity from which inputs </w:t>
+        <w:t>[52]</w:t>
+      </w:r>
+      <w:r>
+        <w:fldChar w:fldCharType="end"/>
+      </w:r>
+      <w:r>
+        <w:t xml:space="preserve"> and has recently been applied to LLM agents </w:t>
       </w:r>
       <w:r>
         <w:fldChar w:fldCharType="begin"/>
       </w:r>
       <w:r>
-        <w:instrText xml:space="preserve"> ADDIN EN.CITE &lt;EndNote&gt;&lt;Cite&gt;&lt;Author&gt;Moreau&lt;/Author&gt;&lt;Year&gt;2013&lt;/Year&gt;&lt;RecNum&gt;55&lt;/RecNum&gt;&lt;DisplayText&gt;[52]&lt;/DisplayText&gt;&lt;record&gt;&lt;rec-number&gt;55&lt;/rec-number&gt;&lt;foreign-keys&gt;&lt;key app="EN" db-id="mdae8500109496fea4aff9c086e16cc25895" timestamp="1793185473"&gt;55&lt;/key&gt;&lt;/foreign-keys&gt;&lt;ref-type name="Standard"&gt;58&lt;/ref-type&gt;&lt;contributors&gt;&lt;authors&gt;&lt;author&gt;Moreau, Luc&lt;/author&gt;&lt;author&gt;Missier, Paolo&lt;/author&gt;&lt;/authors&gt;&lt;/contributors&gt;&lt;titles&gt;&lt;title&gt;PROV-DM: The PROV Data Model&lt;/title&gt;&lt;secondary-title&gt;W3C Recommendation&lt;/secondary-title&gt;&lt;/titles&gt;&lt;dates&gt;&lt;year&gt;2013&lt;/year&gt;&lt;/dates&gt;&lt;publisher&gt;World Wide Web Consortium (W3C)&lt;/publisher&gt;&lt;label&gt;moreau2013prov&lt;/label&gt;&lt;urls&gt;&lt;related-urls&gt;&lt;url&gt;https://www.w3.org/TR/2013/REC-prov-dm-20130430/&lt;/url&gt;&lt;/related-urls&gt;&lt;/urls&gt;&lt;/record&gt;&lt;/Cite&gt;&lt;/EndNote&gt;</w:instrText>
+        <w:instrText xml:space="preserve"> ADDIN EN.CITE &lt;EndNote&gt;&lt;Cite&gt;&lt;Author&gt;Feng&lt;/Author&gt;&lt;Year&gt;2025&lt;/Year&gt;&lt;RecNum&gt;21&lt;/RecNum&gt;&lt;DisplayText&gt;[53]&lt;/DisplayText&gt;&lt;record&gt;&lt;rec-number&gt;21&lt;/rec-number&gt;&lt;foreign-keys&gt;&lt;key app="EN" db-id="mdae8500109496fea4aff9c086e16cc25895" timestamp="1793216821"&gt;21&lt;/key&gt;&lt;/foreign-keys&gt;&lt;ref-type name="Generic"&gt;13&lt;/ref-type&gt;&lt;contributors&gt;&lt;authors&gt;&lt;author&gt;Feng, Erhu&lt;/author&gt;&lt;author&gt;Zhou, Wenbo&lt;/author&gt;&lt;author&gt;Liu, Zibin&lt;/author&gt;&lt;author&gt;Chen, Le&lt;/author&gt;&lt;author&gt;Dong, Yunpeng&lt;/author&gt;&lt;author&gt;Zhang, Cheng&lt;/author&gt;&lt;author&gt;Zhao, Yisheng&lt;/author&gt;&lt;author&gt;Du, Dong&lt;/author&gt;&lt;author&gt;Hua, Zhichao&lt;/author&gt;&lt;author&gt;Xia, Yubin&lt;/author&gt;&lt;author&gt;Chen, Haibo&lt;/author&gt;&lt;/authors&gt;&lt;/contributors&gt;&lt;titles&gt;&lt;title&gt;Get Experience from Practice: LLM Agents with Record &amp;amp; Replay&lt;/title&gt;&lt;secondary-title&gt;arXiv&lt;/secondary-title&gt;&lt;/titles&gt;&lt;dates&gt;&lt;year&gt;2025&lt;/year&gt;&lt;/dates&gt;&lt;label&gt;feng2025agentrr&lt;/label&gt;&lt;work-type&gt;arXiv:2505.17716&lt;/work-type&gt;&lt;urls&gt;&lt;related-urls&gt;&lt;url&gt;https://arxiv.org/abs/2505.17716&lt;/url&gt;&lt;/related-urls&gt;&lt;/urls&gt;&lt;electronic-resource-num&gt;10.48550/arXiv.2505.17716&lt;/electronic-resource-num&gt;&lt;/record&gt;&lt;/Cite&gt;&lt;/EndNote&gt;</w:instrText>
       </w:r>
       <w:r>
         <w:fldChar w:fldCharType="separate"/>
@@ -2997,19 +3018,19 @@
         <w:rPr>
           <w:noProof/>
         </w:rPr>
-        <w:t>[52]</w:t>
-      </w:r>
-      <w:r>
-        <w:fldChar w:fldCharType="end"/>
-      </w:r>
-      <w:r>
-        <w:t xml:space="preserve">. Deterministic record and replay is a standard debugging technique </w:t>
+        <w:t>[53]</w:t>
+      </w:r>
+      <w:r>
+        <w:fldChar w:fldCharType="end"/>
+      </w:r>
+      <w:r>
+        <w:t xml:space="preserve">. Finally, real-time systems separate when a task’s outputs take effect from how long it actually runs: Giotto fixes this logical execution time </w:t>
       </w:r>
       <w:r>
         <w:fldChar w:fldCharType="begin"/>
       </w:r>
       <w:r>
-        <w:instrText xml:space="preserve"> ADDIN EN.CITE &lt;EndNote&gt;&lt;Cite&gt;&lt;Author&gt;Chen&lt;/Author&gt;&lt;Year&gt;2015&lt;/Year&gt;&lt;RecNum&gt;12&lt;/RecNum&gt;&lt;DisplayText&gt;[53]&lt;/DisplayText&gt;&lt;record&gt;&lt;rec-number&gt;12&lt;/rec-number&gt;&lt;foreign-keys&gt;&lt;key app="EN" db-id="mdae8500109496fea4aff9c086e16cc25895" timestamp="1793185473"&gt;12&lt;/key&gt;&lt;/foreign-keys&gt;&lt;ref-type name="Journal Article"&gt;17&lt;/ref-type&gt;&lt;contributors&gt;&lt;authors&gt;&lt;author&gt;Chen, Yunji&lt;/author&gt;&lt;author&gt;Zhang, Shijin&lt;/author&gt;&lt;author&gt;Guo, Qi&lt;/author&gt;&lt;author&gt;Li, Ling&lt;/author&gt;&lt;author&gt;Wu, Ruiyang&lt;/author&gt;&lt;author&gt;Chen, Tianshi&lt;/author&gt;&lt;/authors&gt;&lt;/contributors&gt;&lt;titles&gt;&lt;title&gt;Deterministic Replay: A Survey&lt;/title&gt;&lt;secondary-title&gt;ACM Computing Surveys&lt;/secondary-title&gt;&lt;alt-title&gt;ACM Comput. Surv.&lt;/alt-title&gt;&lt;/titles&gt;&lt;periodical&gt;&lt;full-title&gt;ACM Computing Surveys&lt;/full-title&gt;&lt;abbr-1&gt;ACM Comput. Surv.&lt;/abbr-1&gt;&lt;/periodical&gt;&lt;pages&gt;1-47&lt;/pages&gt;&lt;volume&gt;48&lt;/volume&gt;&lt;number&gt;2&lt;/number&gt;&lt;dates&gt;&lt;year&gt;2015&lt;/year&gt;&lt;/dates&gt;&lt;publisher&gt;ACM&lt;/publisher&gt;&lt;label&gt;chen2015replay&lt;/label&gt;&lt;urls&gt;&lt;/urls&gt;&lt;electronic-resource-num&gt;10.1145/2790077&lt;/electronic-resource-num&gt;&lt;/record&gt;&lt;/Cite&gt;&lt;/EndNote&gt;</w:instrText>
+        <w:instrText xml:space="preserve"> ADDIN EN.CITE &lt;EndNote&gt;&lt;Cite&gt;&lt;Author&gt;Henzinger&lt;/Author&gt;&lt;Year&gt;2003&lt;/Year&gt;&lt;RecNum&gt;33&lt;/RecNum&gt;&lt;DisplayText&gt;[54]&lt;/DisplayText&gt;&lt;record&gt;&lt;rec-number&gt;33&lt;/rec-number&gt;&lt;foreign-keys&gt;&lt;key app="EN" db-id="mdae8500109496fea4aff9c086e16cc25895" timestamp="1793216821"&gt;33&lt;/key&gt;&lt;/foreign-keys&gt;&lt;ref-type name="Journal Article"&gt;17&lt;/ref-type&gt;&lt;contributors&gt;&lt;authors&gt;&lt;author&gt;Henzinger, T. A.&lt;/author&gt;&lt;author&gt;Horowitz, B.&lt;/author&gt;&lt;author&gt;Kirsch, C. M.&lt;/author&gt;&lt;/authors&gt;&lt;/contributors&gt;&lt;titles&gt;&lt;title&gt;Giotto: a time-triggered language for embedded programming&lt;/title&gt;&lt;secondary-title&gt;Proceedings of the IEEE&lt;/secondary-title&gt;&lt;alt-title&gt;Proc. IEEE&lt;/alt-title&gt;&lt;/titles&gt;&lt;periodical&gt;&lt;full-title&gt;Proceedings of the IEEE&lt;/full-title&gt;&lt;abbr-1&gt;Proc. IEEE&lt;/abbr-1&gt;&lt;/periodical&gt;&lt;pages&gt;84-99&lt;/pages&gt;&lt;volume&gt;91&lt;/volume&gt;&lt;number&gt;1&lt;/number&gt;&lt;dates&gt;&lt;year&gt;2003&lt;/year&gt;&lt;/dates&gt;&lt;publisher&gt;IEEE&lt;/publisher&gt;&lt;label&gt;henzinger2003&lt;/label&gt;&lt;urls&gt;&lt;/urls&gt;&lt;electronic-resource-num&gt;10.1109/JPROC.2002.805825&lt;/electronic-resource-num&gt;&lt;/record&gt;&lt;/Cite&gt;&lt;/EndNote&gt;</w:instrText>
       </w:r>
       <w:r>
         <w:fldChar w:fldCharType="separate"/>
@@ -3018,19 +3039,19 @@
         <w:rPr>
           <w:noProof/>
         </w:rPr>
-        <w:t>[53]</w:t>
-      </w:r>
-      <w:r>
-        <w:fldChar w:fldCharType="end"/>
-      </w:r>
-      <w:r>
-        <w:t xml:space="preserve"> and has recently been applied to LLM agents </w:t>
+        <w:t>[54]</w:t>
+      </w:r>
+      <w:r>
+        <w:fldChar w:fldCharType="end"/>
+      </w:r>
+      <w:r>
+        <w:t xml:space="preserve">, and Lingua Franca runs a deadline handler when a reaction is late </w:t>
       </w:r>
       <w:r>
         <w:fldChar w:fldCharType="begin"/>
       </w:r>
       <w:r>
-        <w:instrText xml:space="preserve"> ADDIN EN.CITE &lt;EndNote&gt;&lt;Cite&gt;&lt;Author&gt;Feng&lt;/Author&gt;&lt;Year&gt;2025&lt;/Year&gt;&lt;RecNum&gt;21&lt;/RecNum&gt;&lt;DisplayText&gt;[54]&lt;/DisplayText&gt;&lt;record&gt;&lt;rec-number&gt;21&lt;/rec-number&gt;&lt;foreign-keys&gt;&lt;key app="EN" db-id="mdae8500109496fea4aff9c086e16cc25895" timestamp="1793185473"&gt;21&lt;/key&gt;&lt;/foreign-keys&gt;&lt;ref-type name="Generic"&gt;13&lt;/ref-type&gt;&lt;contributors&gt;&lt;authors&gt;&lt;author&gt;Feng, Erhu&lt;/author&gt;&lt;author&gt;Zhou, Wenbo&lt;/author&gt;&lt;author&gt;Liu, Zibin&lt;/author&gt;&lt;author&gt;Chen, Le&lt;/author&gt;&lt;author&gt;Dong, Yunpeng&lt;/author&gt;&lt;author&gt;Zhang, Cheng&lt;/author&gt;&lt;author&gt;Zhao, Yisheng&lt;/author&gt;&lt;author&gt;Du, Dong&lt;/author&gt;&lt;author&gt;Hua, Zhichao&lt;/author&gt;&lt;author&gt;Xia, Yubin&lt;/author&gt;&lt;author&gt;Chen, Haibo&lt;/author&gt;&lt;/authors&gt;&lt;/contributors&gt;&lt;titles&gt;&lt;title&gt;Get Experience from Practice: LLM Agents with Record &amp;amp; Replay&lt;/title&gt;&lt;secondary-title&gt;arXiv&lt;/secondary-title&gt;&lt;/titles&gt;&lt;dates&gt;&lt;year&gt;2025&lt;/year&gt;&lt;/dates&gt;&lt;label&gt;feng2025agentrr&lt;/label&gt;&lt;work-type&gt;arXiv:2505.17716&lt;/work-type&gt;&lt;urls&gt;&lt;related-urls&gt;&lt;url&gt;https://arxiv.org/abs/2505.17716&lt;/url&gt;&lt;/related-urls&gt;&lt;/urls&gt;&lt;electronic-resource-num&gt;10.48550/arXiv.2505.17716&lt;/electronic-resource-num&gt;&lt;/record&gt;&lt;/Cite&gt;&lt;/EndNote&gt;</w:instrText>
+        <w:instrText xml:space="preserve"> ADDIN EN.CITE &lt;EndNote&gt;&lt;Cite&gt;&lt;Author&gt;Lohstroh&lt;/Author&gt;&lt;Year&gt;2021&lt;/Year&gt;&lt;RecNum&gt;53&lt;/RecNum&gt;&lt;DisplayText&gt;[55]&lt;/DisplayText&gt;&lt;record&gt;&lt;rec-number&gt;53&lt;/rec-number&gt;&lt;foreign-keys&gt;&lt;key app="EN" db-id="mdae8500109496fea4aff9c086e16cc25895" timestamp="1793216821"&gt;53&lt;/key&gt;&lt;/foreign-keys&gt;&lt;ref-type name="Journal Article"&gt;17&lt;/ref-type&gt;&lt;contributors&gt;&lt;authors&gt;&lt;author&gt;Lohstroh, Marten&lt;/author&gt;&lt;author&gt;Menard, Christian&lt;/author&gt;&lt;author&gt;Bateni, Soroush&lt;/author&gt;&lt;author&gt;Lee, Edward A.&lt;/author&gt;&lt;/authors&gt;&lt;/contributors&gt;&lt;titles&gt;&lt;title&gt;Toward a Lingua Franca for Deterministic Concurrent Systems&lt;/title&gt;&lt;secondary-title&gt;ACM Transactions on Embedded Computing Systems&lt;/secondary-title&gt;&lt;alt-title&gt;ACM Trans. Embed. Comput. Syst.&lt;/alt-title&gt;&lt;/titles&gt;&lt;periodical&gt;&lt;full-title&gt;ACM Transactions on Embedded Computing Systems&lt;/full-title&gt;&lt;abbr-1&gt;ACM Trans. Embed. Comput. Syst.&lt;/abbr-1&gt;&lt;/periodical&gt;&lt;pages&gt;1-27&lt;/pages&gt;&lt;volume&gt;20&lt;/volume&gt;&lt;number&gt;4&lt;/number&gt;&lt;dates&gt;&lt;year&gt;2021&lt;/year&gt;&lt;/dates&gt;&lt;publisher&gt;ACM&lt;/publisher&gt;&lt;label&gt;lohstroh2021&lt;/label&gt;&lt;urls&gt;&lt;/urls&gt;&lt;electronic-resource-num&gt;10.1145/3448128&lt;/electronic-resource-num&gt;&lt;/record&gt;&lt;/Cite&gt;&lt;/EndNote&gt;</w:instrText>
       </w:r>
       <w:r>
         <w:fldChar w:fldCharType="separate"/>
@@ -3039,55 +3060,13 @@
         <w:rPr>
           <w:noProof/>
         </w:rPr>
-        <w:t>[54]</w:t>
-      </w:r>
-      <w:r>
-        <w:fldChar w:fldCharType="end"/>
-      </w:r>
-      <w:r>
-        <w:t xml:space="preserve">. Finally, real-time systems separate when a task’s outputs take effect from how long it actually runs: Giotto fixes this logical execution time </w:t>
-      </w:r>
-      <w:r>
-        <w:fldChar w:fldCharType="begin"/>
-      </w:r>
-      <w:r>
-        <w:instrText xml:space="preserve"> ADDIN EN.CITE &lt;EndNote&gt;&lt;Cite&gt;&lt;Author&gt;Henzinger&lt;/Author&gt;&lt;Year&gt;2003&lt;/Year&gt;&lt;RecNum&gt;33&lt;/RecNum&gt;&lt;DisplayText&gt;[55]&lt;/DisplayText&gt;&lt;record&gt;&lt;rec-number&gt;33&lt;/rec-number&gt;&lt;foreign-keys&gt;&lt;key app="EN" db-id="mdae8500109496fea4aff9c086e16cc25895" timestamp="1793185473"&gt;33&lt;/key&gt;&lt;/foreign-keys&gt;&lt;ref-type name="Journal Article"&gt;17&lt;/ref-type&gt;&lt;contributors&gt;&lt;authors&gt;&lt;author&gt;Henzinger, T. A.&lt;/author&gt;&lt;author&gt;Horowitz, B.&lt;/author&gt;&lt;author&gt;Kirsch, C. M.&lt;/author&gt;&lt;/authors&gt;&lt;/contributors&gt;&lt;titles&gt;&lt;title&gt;Giotto: a time-triggered language for embedded programming&lt;/title&gt;&lt;secondary-title&gt;Proceedings of the IEEE&lt;/secondary-title&gt;&lt;alt-title&gt;Proc. IEEE&lt;/alt-title&gt;&lt;/titles&gt;&lt;periodical&gt;&lt;full-title&gt;Proceedings of the IEEE&lt;/full-title&gt;&lt;abbr-1&gt;Proc. IEEE&lt;/abbr-1&gt;&lt;/periodical&gt;&lt;pages&gt;84-99&lt;/pages&gt;&lt;volume&gt;91&lt;/volume&gt;&lt;number&gt;1&lt;/number&gt;&lt;dates&gt;&lt;year&gt;2003&lt;/year&gt;&lt;/dates&gt;&lt;publisher&gt;IEEE&lt;/publisher&gt;&lt;label&gt;henzinger2003&lt;/label&gt;&lt;urls&gt;&lt;/urls&gt;&lt;electronic-resource-num&gt;10.1109/JPROC.2002.805825&lt;/electronic-resource-num&gt;&lt;/record&gt;&lt;/Cite&gt;&lt;/EndNote&gt;</w:instrText>
-      </w:r>
-      <w:r>
-        <w:fldChar w:fldCharType="separate"/>
-      </w:r>
-      <w:r>
-        <w:rPr>
-          <w:noProof/>
-        </w:rPr>
         <w:t>[55]</w:t>
       </w:r>
       <w:r>
         <w:fldChar w:fldCharType="end"/>
       </w:r>
       <w:r>
-        <w:t xml:space="preserve">, and Lingua Franca runs a deadline handler when a reaction is late </w:t>
-      </w:r>
-      <w:r>
-        <w:fldChar w:fldCharType="begin"/>
-      </w:r>
-      <w:r>
-        <w:instrText xml:space="preserve"> ADDIN EN.CITE &lt;EndNote&gt;&lt;Cite&gt;&lt;Author&gt;Lohstroh&lt;/Author&gt;&lt;Year&gt;2021&lt;/Year&gt;&lt;RecNum&gt;53&lt;/RecNum&gt;&lt;DisplayText&gt;[56]&lt;/DisplayText&gt;&lt;record&gt;&lt;rec-number&gt;53&lt;/rec-number&gt;&lt;foreign-keys&gt;&lt;key app="EN" db-id="mdae8500109496fea4aff9c086e16cc25895" timestamp="1793185473"&gt;53&lt;/key&gt;&lt;/foreign-keys&gt;&lt;ref-type name="Journal Article"&gt;17&lt;/ref-type&gt;&lt;contributors&gt;&lt;authors&gt;&lt;author&gt;Lohstroh, Marten&lt;/author&gt;&lt;author&gt;Menard, Christian&lt;/author&gt;&lt;author&gt;Bateni, Soroush&lt;/author&gt;&lt;author&gt;Lee, Edward A.&lt;/author&gt;&lt;/authors&gt;&lt;/contributors&gt;&lt;titles&gt;&lt;title&gt;Toward a Lingua Franca for Deterministic Concurrent Systems&lt;/title&gt;&lt;secondary-title&gt;ACM Transactions on Embedded Computing Systems&lt;/secondary-title&gt;&lt;alt-title&gt;ACM Trans. Embed. Comput. Syst.&lt;/alt-title&gt;&lt;/titles&gt;&lt;periodical&gt;&lt;full-title&gt;ACM Transactions on Embedded Computing Systems&lt;/full-title&gt;&lt;abbr-1&gt;ACM Trans. Embed. Comput. Syst.&lt;/abbr-1&gt;&lt;/periodical&gt;&lt;pages&gt;1-27&lt;/pages&gt;&lt;volume&gt;20&lt;/volume&gt;&lt;number&gt;4&lt;/number&gt;&lt;dates&gt;&lt;year&gt;2021&lt;/year&gt;&lt;/dates&gt;&lt;publisher&gt;ACM&lt;/publisher&gt;&lt;label&gt;lohstroh2021&lt;/label&gt;&lt;urls&gt;&lt;/urls&gt;&lt;electronic-resource-num&gt;10.1145/3448128&lt;/electronic-resource-num&gt;&lt;/record&gt;&lt;/Cite&gt;&lt;/EndNote&gt;</w:instrText>
-      </w:r>
-      <w:r>
-        <w:fldChar w:fldCharType="separate"/>
-      </w:r>
-      <w:r>
-        <w:rPr>
-          <w:noProof/>
-        </w:rPr>
-        <w:t>[56]</w:t>
-      </w:r>
-      <w:r>
-        <w:fldChar w:fldCharType="end"/>
-      </w:r>
-      <w:r>
-        <w:t xml:space="preserve">. SMMM 2.0 brings these ideas into building co-simulation. </w:t>
+        <w:t xml:space="preserve">. TIDE brings these ideas into building co-simulation. </w:t>
       </w:r>
       <w:r>
         <w:t xml:space="preserve">Table </w:t>
@@ -3170,7 +3149,7 @@
         <w:t xml:space="preserve"> </w:t>
       </w:r>
       <w:r>
-        <w:t xml:space="preserve">Comparison of SMMM 2.0 with representative co-simulation standards and tools, based on their documentation and publications.</w:t>
+        <w:t xml:space="preserve">Comparison of Py-CoSim (TIDE) with representative co-simulation standards and tools, based on their documentation and publications.</w:t>
       </w:r>
     </w:p>
     <w:tbl>
@@ -3852,7 +3831,7 @@
               <w:pStyle w:val="TableText"/>
             </w:pPr>
             <w:r>
-              <w:t xml:space="preserve">Py-CoSim 2.1 (SMMM 2.0)</w:t>
+              <w:t xml:space="preserve">Py-CoSim (TIDE)</w:t>
             </w:r>
           </w:p>
         </w:tc>
@@ -3950,7 +3929,7 @@
       </w:pPr>
       <w:bookmarkStart w:id="4" w:name="_Ref_sec_method"/>
       <w:r>
-        <w:t xml:space="preserve">SMMM 2.0: co-simulation through time-aware messages</w:t>
+        <w:t xml:space="preserve">TIDE: co-simulation through time-aware messages</w:t>
       </w:r>
       <w:bookmarkEnd w:id="4"/>
     </w:p>
@@ -3967,7 +3946,7 @@
         <w:pStyle w:val="BodyText"/>
       </w:pPr>
       <w:r>
-        <w:t xml:space="preserve">A Py-CoSim co-simulation consists of components and SMMM (</w:t>
+        <w:t xml:space="preserve">A Py-CoSim co-simulation consists of components and TIDE (</w:t>
       </w:r>
       <w:r>
         <w:t xml:space="preserve">Fig. </w:t>
@@ -3988,28 +3967,7 @@
         <w:fldChar w:fldCharType="end"/>
       </w:r>
       <w:r>
-        <w:t xml:space="preserve">). A component is any model, data source, controller or service with named input and output ports: an EnergyPlus building, a PV array, a tariff, an ML predictor, an LLM supervisor or a reinforcement-learning agent. Components never call each other. At each of its steps, a component publishes messages on its output ports and reads the messages it subscribed to. SMMM has two halves, as in the original design </w:t>
-      </w:r>
-      <w:r>
-        <w:fldChar w:fldCharType="begin"/>
-      </w:r>
-      <w:r>
-        <w:instrText xml:space="preserve"> ADDIN EN.CITE &lt;EndNote&gt;&lt;Cite&gt;&lt;Author&gt;Zhang&lt;/Author&gt;&lt;Year&gt;2023&lt;/Year&gt;&lt;RecNum&gt;91&lt;/RecNum&gt;&lt;DisplayText&gt;[28]&lt;/DisplayText&gt;&lt;record&gt;&lt;rec-number&gt;91&lt;/rec-number&gt;&lt;foreign-keys&gt;&lt;key app="EN" db-id="mdae8500109496fea4aff9c086e16cc25895" timestamp="1793185473"&gt;91&lt;/key&gt;&lt;/foreign-keys&gt;&lt;ref-type name="Generic"&gt;13&lt;/ref-type&gt;&lt;contributors&gt;&lt;authors&gt;&lt;author&gt;Zhang, Liang&lt;/author&gt;&lt;author&gt;Haroon, Saquib Mohammed&lt;/author&gt;&lt;author&gt;Ryan, Alyssa&lt;/author&gt;&lt;/authors&gt;&lt;/contributors&gt;&lt;titles&gt;&lt;title&gt;Py-CoSim: Python-Based Building Energy Co-Simulation Infrastructure&lt;/title&gt;&lt;secondary-title&gt;SSRN&lt;/secondary-title&gt;&lt;/titles&gt;&lt;dates&gt;&lt;year&gt;2023&lt;/year&gt;&lt;/dates&gt;&lt;label&gt;zhang2023&lt;/label&gt;&lt;work-type&gt;Preprint&lt;/work-type&gt;&lt;urls&gt;&lt;related-urls&gt;&lt;url&gt;https://www.ssrn.com/abstract=4572925&lt;/url&gt;&lt;/related-urls&gt;&lt;/urls&gt;&lt;electronic-resource-num&gt;10.2139/ssrn.4572925&lt;/electronic-resource-num&gt;&lt;/record&gt;&lt;/Cite&gt;&lt;/EndNote&gt;</w:instrText>
-      </w:r>
-      <w:r>
-        <w:fldChar w:fldCharType="separate"/>
-      </w:r>
-      <w:r>
-        <w:rPr>
-          <w:noProof/>
-        </w:rPr>
-        <w:t>[28]</w:t>
-      </w:r>
-      <w:r>
-        <w:fldChar w:fldCharType="end"/>
-      </w:r>
-      <w:r>
-        <w:t xml:space="preserve">. The </w:t>
+        <w:t xml:space="preserve">). A component is any model, data source, controller or service with named input and output ports: an EnergyPlus building, a PV array, a tariff, an ML predictor, an LLM supervisor or a reinforcement-learning agent. Components never call each other. At each of its steps, a component publishes messages on its output ports and reads the messages it subscribed to. TIDE has two parts. The </w:t>
       </w:r>
       <w:r>
         <w:rPr>
@@ -4019,7 +3977,7 @@
         <w:t xml:space="preserve">messaging</w:t>
       </w:r>
       <w:r>
-        <w:t xml:space="preserve"> half stores every message with its time meaning and answers time-aware queries. The </w:t>
+        <w:t xml:space="preserve"> part stores every message with its time meaning and answers time-aware queries. The </w:t>
       </w:r>
       <w:r>
         <w:rPr>
@@ -4029,7 +3987,7 @@
         <w:t xml:space="preserve">management</w:t>
       </w:r>
       <w:r>
-        <w:t xml:space="preserve"> half keeps one simulation clock, decides in which order components run within a step, delivers the answers of slow components, and writes logs, error reports and results. Subscriptions are made by port name, by topic, or by pattern (for example, every </w:t>
+        <w:t xml:space="preserve"> part keeps one simulation clock, decides in which order components run within a step, delivers the answers of slow components, and writes logs, error reports and results. Subscriptions are made by port name, by topic, or by pattern (for example, every </w:t>
       </w:r>
       <w:r>
         <w:rPr>
@@ -4142,7 +4100,7 @@
         <w:t xml:space="preserve"> </w:t>
       </w:r>
       <w:r>
-        <w:t xml:space="preserve">Two ways to organize a co-simulation. (a) Connecting software: each pair of tools needs its own interface and time conversion. (b) Py-CoSim: every component publishes messages that state what their time stamps mean to SMMM, which aligns them to each subscriber’s step, flags their quality, records them for replay and decides when slow answers take effect.</w:t>
+        <w:t xml:space="preserve">Two ways to organize a co-simulation. (a) Connecting software: each pair of tools needs its own interface and time conversion. (b) Py-CoSim: every component publishes messages that state what their time stamps mean to TIDE, which aligns them to each subscriber’s step, flags their quality, records them for replay and decides when slow answers take effect.</w:t>
       </w:r>
     </w:p>
     <w:p>
@@ -5084,7 +5042,7 @@
         <w:t xml:space="preserve">hold</w:t>
       </w:r>
       <w:r>
-        <w:t xml:space="preserve">, which reproduces the behavior of Py-CoSim 2.0. A component can also publish messages with explicit validity, for example a price announced for a future hour.</w:t>
+        <w:t xml:space="preserve">. A component can also publish messages with explicit validity, for example a price announced for a future hour.</w:t>
       </w:r>
     </w:p>
     <w:p>
@@ -5092,7 +5050,7 @@
         <w:pStyle w:val="BodyText"/>
       </w:pPr>
       <w:r>
-        <w:t xml:space="preserve">From the messages of a port, SMMM reconstructs a signal </w:t>
+        <w:t xml:space="preserve">From the messages of a port, TIDE reconstructs a signal </w:t>
       </w:r>
       <m:oMath>
         <m:acc>
@@ -5597,7 +5555,7 @@
         <w:t xml:space="preserve">latest</w:t>
       </w:r>
       <w:r>
-        <w:t xml:space="preserve">, the default and the behavior of Py-CoSim 2.0), the value in effect at </w:t>
+        <w:t xml:space="preserve">, the default, which is what conventional tools deliver), the value in effect at </w:t>
       </w:r>
       <m:oMath>
         <m:sSub>
@@ -5876,7 +5834,7 @@
         </m:r>
       </m:oMath>
       <w:r>
-        <w:t xml:space="preserve"> SMMM returns</w:t>
+        <w:t xml:space="preserve"> TIDE returns</w:t>
       </w:r>
     </w:p>
     <w:p>
@@ -6431,7 +6389,7 @@
         </m:r>
       </m:oMath>
       <w:r>
-        <w:t xml:space="preserve">, SMMM runs four phases. In phase 0 it delivers the answers of asynchronous components that are due. In phase 1, components whose outputs depend only on their state (non-feedthrough components such as EnergyPlus, and replayed components) report their outputs at </w:t>
+        <w:t xml:space="preserve">, TIDE runs four phases. In phase 0 it delivers the answers of asynchronous components that are due. In phase 1, components whose outputs depend only on their state (non-feedthrough components such as EnergyPlus, and replayed components) report their outputs at </w:t>
       </w:r>
       <m:oMath>
         <m:sSub>
@@ -6662,7 +6620,7 @@
         <w:fldChar w:fldCharType="begin"/>
       </w:r>
       <w:r>
-        <w:instrText xml:space="preserve"> ADDIN EN.CITE &lt;EndNote&gt;&lt;Cite&gt;&lt;Author&gt;Fujimoto&lt;/Author&gt;&lt;Year&gt;2000&lt;/Year&gt;&lt;RecNum&gt;25&lt;/RecNum&gt;&lt;DisplayText&gt;[20,34]&lt;/DisplayText&gt;&lt;record&gt;&lt;rec-number&gt;25&lt;/rec-number&gt;&lt;foreign-keys&gt;&lt;key app="EN" db-id="mdae8500109496fea4aff9c086e16cc25895" timestamp="1793185473"&gt;25&lt;/key&gt;&lt;/foreign-keys&gt;&lt;ref-type name="Book"&gt;6&lt;/ref-type&gt;&lt;contributors&gt;&lt;authors&gt;&lt;author&gt;Fujimoto, Richard M.&lt;/author&gt;&lt;/authors&gt;&lt;/contributors&gt;&lt;titles&gt;&lt;title&gt;Parallel and Distributed Simulation Systems&lt;/title&gt;&lt;secondary-title&gt;Wiley Series on Parallel and Distributed Computing&lt;/secondary-title&gt;&lt;/titles&gt;&lt;dates&gt;&lt;year&gt;2000&lt;/year&gt;&lt;/dates&gt;&lt;publisher&gt;John Wiley &amp;amp; Sons&lt;/publisher&gt;&lt;isbn&gt;978-0-471-18383-9&lt;/isbn&gt;&lt;label&gt;fujimoto2000&lt;/label&gt;&lt;urls&gt;&lt;/urls&gt;&lt;/record&gt;&lt;/Cite&gt;&lt;Cite&gt;&lt;Author&gt;Ofenloch&lt;/Author&gt;&lt;Year&gt;2022&lt;/Year&gt;&lt;RecNum&gt;62&lt;/RecNum&gt;&lt;record&gt;&lt;rec-number&gt;62&lt;/rec-number&gt;&lt;foreign-keys&gt;&lt;key app="EN" db-id="mdae8500109496fea4aff9c086e16cc25895" timestamp="1793185473"&gt;62&lt;/key&gt;&lt;/foreign-keys&gt;&lt;ref-type name="Conference Paper"&gt;47&lt;/ref-type&gt;&lt;contributors&gt;&lt;authors&gt;&lt;author&gt;Ofenloch, Annika&lt;/author&gt;&lt;author&gt;Schwarz, Jan Sören&lt;/author&gt;&lt;author&gt;Tolk, Deborah&lt;/author&gt;&lt;author&gt;Brandt, Tobias&lt;/author&gt;&lt;author&gt;Eilers, Reef&lt;/author&gt;&lt;author&gt;Ramirez, Rebeca&lt;/author&gt;&lt;author&gt;Raub, Thomas&lt;/author&gt;&lt;author&gt;Lehnhoff, Sebastian&lt;/author&gt;&lt;/authors&gt;&lt;/contributors&gt;&lt;titles&gt;&lt;title&gt;MOSAIK 3.0: Combining Time-Stepped and Discrete Event Simulation&lt;/title&gt;&lt;secondary-title&gt;2022 Open Source Modelling and Simulation of Energy Systems (OSMSES)&lt;/secondary-title&gt;&lt;/titles&gt;&lt;pages&gt;1-5&lt;/pages&gt;&lt;dates&gt;&lt;year&gt;2022&lt;/year&gt;&lt;/dates&gt;&lt;pub-location&gt;Aachen, Germany&lt;/pub-location&gt;&lt;publisher&gt;IEEE&lt;/publisher&gt;&lt;label&gt;ofenloch2022&lt;/label&gt;&lt;urls&gt;&lt;/urls&gt;&lt;electronic-resource-num&gt;10.1109/OSMSES54027.2022.9769116&lt;/electronic-resource-num&gt;&lt;/record&gt;&lt;/Cite&gt;&lt;/EndNote&gt;</w:instrText>
+        <w:instrText xml:space="preserve"> ADDIN EN.CITE &lt;EndNote&gt;&lt;Cite&gt;&lt;Author&gt;Fujimoto&lt;/Author&gt;&lt;Year&gt;2000&lt;/Year&gt;&lt;RecNum&gt;25&lt;/RecNum&gt;&lt;DisplayText&gt;[20,33]&lt;/DisplayText&gt;&lt;record&gt;&lt;rec-number&gt;25&lt;/rec-number&gt;&lt;foreign-keys&gt;&lt;key app="EN" db-id="mdae8500109496fea4aff9c086e16cc25895" timestamp="1793216821"&gt;25&lt;/key&gt;&lt;/foreign-keys&gt;&lt;ref-type name="Book"&gt;6&lt;/ref-type&gt;&lt;contributors&gt;&lt;authors&gt;&lt;author&gt;Fujimoto, Richard M.&lt;/author&gt;&lt;/authors&gt;&lt;/contributors&gt;&lt;titles&gt;&lt;title&gt;Parallel and Distributed Simulation Systems&lt;/title&gt;&lt;secondary-title&gt;Wiley Series on Parallel and Distributed Computing&lt;/secondary-title&gt;&lt;/titles&gt;&lt;dates&gt;&lt;year&gt;2000&lt;/year&gt;&lt;/dates&gt;&lt;publisher&gt;John Wiley &amp;amp; Sons&lt;/publisher&gt;&lt;isbn&gt;978-0-471-18383-9&lt;/isbn&gt;&lt;label&gt;fujimoto2000&lt;/label&gt;&lt;urls&gt;&lt;/urls&gt;&lt;/record&gt;&lt;/Cite&gt;&lt;Cite&gt;&lt;Author&gt;Ofenloch&lt;/Author&gt;&lt;Year&gt;2022&lt;/Year&gt;&lt;RecNum&gt;62&lt;/RecNum&gt;&lt;record&gt;&lt;rec-number&gt;62&lt;/rec-number&gt;&lt;foreign-keys&gt;&lt;key app="EN" db-id="mdae8500109496fea4aff9c086e16cc25895" timestamp="1793216821"&gt;62&lt;/key&gt;&lt;/foreign-keys&gt;&lt;ref-type name="Conference Paper"&gt;47&lt;/ref-type&gt;&lt;contributors&gt;&lt;authors&gt;&lt;author&gt;Ofenloch, Annika&lt;/author&gt;&lt;author&gt;Schwarz, Jan Sören&lt;/author&gt;&lt;author&gt;Tolk, Deborah&lt;/author&gt;&lt;author&gt;Brandt, Tobias&lt;/author&gt;&lt;author&gt;Eilers, Reef&lt;/author&gt;&lt;author&gt;Ramirez, Rebeca&lt;/author&gt;&lt;author&gt;Raub, Thomas&lt;/author&gt;&lt;author&gt;Lehnhoff, Sebastian&lt;/author&gt;&lt;/authors&gt;&lt;/contributors&gt;&lt;titles&gt;&lt;title&gt;MOSAIK 3.0: Combining Time-Stepped and Discrete Event Simulation&lt;/title&gt;&lt;secondary-title&gt;2022 Open Source Modelling and Simulation of Energy Systems (OSMSES)&lt;/secondary-title&gt;&lt;/titles&gt;&lt;pages&gt;1-5&lt;/pages&gt;&lt;dates&gt;&lt;year&gt;2022&lt;/year&gt;&lt;/dates&gt;&lt;pub-location&gt;Aachen, Germany&lt;/pub-location&gt;&lt;publisher&gt;IEEE&lt;/publisher&gt;&lt;label&gt;ofenloch2022&lt;/label&gt;&lt;urls&gt;&lt;/urls&gt;&lt;electronic-resource-num&gt;10.1109/OSMSES54027.2022.9769116&lt;/electronic-resource-num&gt;&lt;/record&gt;&lt;/Cite&gt;&lt;/EndNote&gt;</w:instrText>
       </w:r>
       <w:r>
         <w:fldChar w:fldCharType="separate"/>
@@ -6671,7 +6629,7 @@
         <w:rPr>
           <w:noProof/>
         </w:rPr>
-        <w:t>[20,34]</w:t>
+        <w:t>[20,33]</w:t>
       </w:r>
       <w:r>
         <w:fldChar w:fldCharType="end"/>
@@ -6751,7 +6709,7 @@
         <w:fldChar w:fldCharType="begin"/>
       </w:r>
       <w:r>
-        <w:instrText xml:space="preserve"> ADDIN EN.CITE &lt;EndNote&gt;&lt;Cite&gt;&lt;Author&gt;OPC Foundation&lt;/Author&gt;&lt;Year&gt;2026&lt;/Year&gt;&lt;RecNum&gt;65&lt;/RecNum&gt;&lt;DisplayText&gt;[51,57]&lt;/DisplayText&gt;&lt;record&gt;&lt;rec-number&gt;65&lt;/rec-number&gt;&lt;foreign-keys&gt;&lt;key app="EN" db-id="mdae8500109496fea4aff9c086e16cc25895" timestamp="1793185473"&gt;65&lt;/key&gt;&lt;/foreign-keys&gt;&lt;ref-type name="Standard"&gt;58&lt;/ref-type&gt;&lt;contributors&gt;&lt;authors&gt;&lt;author&gt;OPC Foundation&lt;/author&gt;&lt;/authors&gt;&lt;/contributors&gt;&lt;titles&gt;&lt;title&gt;OPC Unified Architecture – Part 8: Data Access&lt;/title&gt;&lt;secondary-title&gt;OPC 10000-8, Release 1.05.07&lt;/secondary-title&gt;&lt;/titles&gt;&lt;dates&gt;&lt;year&gt;2026&lt;/year&gt;&lt;/dates&gt;&lt;label&gt;opcua_part8&lt;/label&gt;&lt;urls&gt;&lt;related-urls&gt;&lt;url&gt;https://reference.opcfoundation.org/specs/OPC-10000-8&lt;/url&gt;&lt;/related-urls&gt;&lt;/urls&gt;&lt;/record&gt;&lt;/Cite&gt;&lt;Cite&gt;&lt;Author&gt;International Electrotechnical Commission&lt;/Author&gt;&lt;Year&gt;2010&lt;/Year&gt;&lt;RecNum&gt;36&lt;/RecNum&gt;&lt;record&gt;&lt;rec-number&gt;36&lt;/rec-number&gt;&lt;foreign-keys&gt;&lt;key app="EN" db-id="mdae8500109496fea4aff9c086e16cc25895" timestamp="1793185473"&gt;36&lt;/key&gt;&lt;/foreign-keys&gt;&lt;ref-type name="Standard"&gt;58&lt;/ref-type&gt;&lt;contributors&gt;&lt;authors&gt;&lt;author&gt;International Electrotechnical Commission&lt;/author&gt;&lt;/authors&gt;&lt;/contributors&gt;&lt;titles&gt;&lt;title&gt;Communication networks and systems for power utility automation – Part 7-3: Basic communication structure – Common data classes&lt;/title&gt;&lt;secondary-title&gt;IEC 61850-7-3:2010, Edition 2.0&lt;/secondary-title&gt;&lt;/titles&gt;&lt;dates&gt;&lt;year&gt;2010&lt;/year&gt;&lt;/dates&gt;&lt;isbn&gt;978-2-88912-258-5&lt;/isbn&gt;&lt;label&gt;iec61850_7_3&lt;/label&gt;&lt;urls&gt;&lt;related-urls&gt;&lt;url&gt;https://webstore.iec.ch/en/publication/6016&lt;/url&gt;&lt;/related-urls&gt;&lt;/urls&gt;&lt;/record&gt;&lt;/Cite&gt;&lt;/EndNote&gt;</w:instrText>
+        <w:instrText xml:space="preserve"> ADDIN EN.CITE &lt;EndNote&gt;&lt;Cite&gt;&lt;Author&gt;OPC Foundation&lt;/Author&gt;&lt;Year&gt;2026&lt;/Year&gt;&lt;RecNum&gt;65&lt;/RecNum&gt;&lt;DisplayText&gt;[50,56]&lt;/DisplayText&gt;&lt;record&gt;&lt;rec-number&gt;65&lt;/rec-number&gt;&lt;foreign-keys&gt;&lt;key app="EN" db-id="mdae8500109496fea4aff9c086e16cc25895" timestamp="1793216821"&gt;65&lt;/key&gt;&lt;/foreign-keys&gt;&lt;ref-type name="Standard"&gt;58&lt;/ref-type&gt;&lt;contributors&gt;&lt;authors&gt;&lt;author&gt;OPC Foundation&lt;/author&gt;&lt;/authors&gt;&lt;/contributors&gt;&lt;titles&gt;&lt;title&gt;OPC Unified Architecture – Part 8: Data Access&lt;/title&gt;&lt;secondary-title&gt;OPC 10000-8, Release 1.05.07&lt;/secondary-title&gt;&lt;/titles&gt;&lt;dates&gt;&lt;year&gt;2026&lt;/year&gt;&lt;/dates&gt;&lt;label&gt;opcua_part8&lt;/label&gt;&lt;urls&gt;&lt;related-urls&gt;&lt;url&gt;https://reference.opcfoundation.org/specs/OPC-10000-8&lt;/url&gt;&lt;/related-urls&gt;&lt;/urls&gt;&lt;/record&gt;&lt;/Cite&gt;&lt;Cite&gt;&lt;Author&gt;International Electrotechnical Commission&lt;/Author&gt;&lt;Year&gt;2010&lt;/Year&gt;&lt;RecNum&gt;36&lt;/RecNum&gt;&lt;record&gt;&lt;rec-number&gt;36&lt;/rec-number&gt;&lt;foreign-keys&gt;&lt;key app="EN" db-id="mdae8500109496fea4aff9c086e16cc25895" timestamp="1793216821"&gt;36&lt;/key&gt;&lt;/foreign-keys&gt;&lt;ref-type name="Standard"&gt;58&lt;/ref-type&gt;&lt;contributors&gt;&lt;authors&gt;&lt;author&gt;International Electrotechnical Commission&lt;/author&gt;&lt;/authors&gt;&lt;/contributors&gt;&lt;titles&gt;&lt;title&gt;Communication networks and systems for power utility automation – Part 7-3: Basic communication structure – Common data classes&lt;/title&gt;&lt;secondary-title&gt;IEC 61850-7-3:2010, Edition 2.0&lt;/secondary-title&gt;&lt;/titles&gt;&lt;dates&gt;&lt;year&gt;2010&lt;/year&gt;&lt;/dates&gt;&lt;isbn&gt;978-2-88912-258-5&lt;/isbn&gt;&lt;label&gt;iec61850_7_3&lt;/label&gt;&lt;urls&gt;&lt;related-urls&gt;&lt;url&gt;https://webstore.iec.ch/en/publication/6016&lt;/url&gt;&lt;/related-urls&gt;&lt;/urls&gt;&lt;/record&gt;&lt;/Cite&gt;&lt;/EndNote&gt;</w:instrText>
       </w:r>
       <w:r>
         <w:fldChar w:fldCharType="separate"/>
@@ -6760,7 +6718,7 @@
         <w:rPr>
           <w:noProof/>
         </w:rPr>
-        <w:t>[51,57]</w:t>
+        <w:t>[50,56]</w:t>
       </w:r>
       <w:r>
         <w:fldChar w:fldCharType="end"/>
@@ -6787,7 +6745,7 @@
         <w:fldChar w:fldCharType="begin"/>
       </w:r>
       <w:r>
-        <w:instrText xml:space="preserve"> ADDIN EN.CITE &lt;EndNote&gt;&lt;Cite&gt;&lt;Author&gt;Chen&lt;/Author&gt;&lt;Year&gt;2015&lt;/Year&gt;&lt;RecNum&gt;12&lt;/RecNum&gt;&lt;DisplayText&gt;[35,53]&lt;/DisplayText&gt;&lt;record&gt;&lt;rec-number&gt;12&lt;/rec-number&gt;&lt;foreign-keys&gt;&lt;key app="EN" db-id="mdae8500109496fea4aff9c086e16cc25895" timestamp="1793185473"&gt;12&lt;/key&gt;&lt;/foreign-keys&gt;&lt;ref-type name="Journal Article"&gt;17&lt;/ref-type&gt;&lt;contributors&gt;&lt;authors&gt;&lt;author&gt;Chen, Yunji&lt;/author&gt;&lt;author&gt;Zhang, Shijin&lt;/author&gt;&lt;author&gt;Guo, Qi&lt;/author&gt;&lt;author&gt;Li, Ling&lt;/author&gt;&lt;author&gt;Wu, Ruiyang&lt;/author&gt;&lt;author&gt;Chen, Tianshi&lt;/author&gt;&lt;/authors&gt;&lt;/contributors&gt;&lt;titles&gt;&lt;title&gt;Deterministic Replay: A Survey&lt;/title&gt;&lt;secondary-title&gt;ACM Computing Surveys&lt;/secondary-title&gt;&lt;alt-title&gt;ACM Comput. Surv.&lt;/alt-title&gt;&lt;/titles&gt;&lt;periodical&gt;&lt;full-title&gt;ACM Computing Surveys&lt;/full-title&gt;&lt;abbr-1&gt;ACM Comput. Surv.&lt;/abbr-1&gt;&lt;/periodical&gt;&lt;pages&gt;1-47&lt;/pages&gt;&lt;volume&gt;48&lt;/volume&gt;&lt;number&gt;2&lt;/number&gt;&lt;dates&gt;&lt;year&gt;2015&lt;/year&gt;&lt;/dates&gt;&lt;publisher&gt;ACM&lt;/publisher&gt;&lt;label&gt;chen2015replay&lt;/label&gt;&lt;urls&gt;&lt;/urls&gt;&lt;electronic-resource-num&gt;10.1145/2790077&lt;/electronic-resource-num&gt;&lt;/record&gt;&lt;/Cite&gt;&lt;Cite&gt;&lt;Author&gt;HELICS developers (GMLC-TDC)&lt;/Author&gt;&lt;Year&gt;2026&lt;/Year&gt;&lt;RecNum&gt;31&lt;/RecNum&gt;&lt;record&gt;&lt;rec-number&gt;31&lt;/rec-number&gt;&lt;foreign-keys&gt;&lt;key app="EN" db-id="mdae8500109496fea4aff9c086e16cc25895" timestamp="1793185473"&gt;31&lt;/key&gt;&lt;/foreign-keys&gt;&lt;ref-type name="Web Page"&gt;12&lt;/ref-type&gt;&lt;contributors&gt;&lt;authors&gt;&lt;author&gt;HELICS developers (GMLC-TDC)&lt;/author&gt;&lt;/authors&gt;&lt;/contributors&gt;&lt;titles&gt;&lt;title&gt;HELICS documentation&lt;/title&gt;&lt;/titles&gt;&lt;dates&gt;&lt;year&gt;2026&lt;/year&gt;&lt;/dates&gt;&lt;label&gt;helics_docs&lt;/label&gt;&lt;urls&gt;&lt;related-urls&gt;&lt;url&gt;https://docs.helics.org/en/latest/&lt;/url&gt;&lt;/related-urls&gt;&lt;/urls&gt;&lt;access-date&gt;2026-10-28&lt;/access-date&gt;&lt;/record&gt;&lt;/Cite&gt;&lt;/EndNote&gt;</w:instrText>
+        <w:instrText xml:space="preserve"> ADDIN EN.CITE &lt;EndNote&gt;&lt;Cite&gt;&lt;Author&gt;Chen&lt;/Author&gt;&lt;Year&gt;2015&lt;/Year&gt;&lt;RecNum&gt;12&lt;/RecNum&gt;&lt;DisplayText&gt;[34,52]&lt;/DisplayText&gt;&lt;record&gt;&lt;rec-number&gt;12&lt;/rec-number&gt;&lt;foreign-keys&gt;&lt;key app="EN" db-id="mdae8500109496fea4aff9c086e16cc25895" timestamp="1793216821"&gt;12&lt;/key&gt;&lt;/foreign-keys&gt;&lt;ref-type name="Journal Article"&gt;17&lt;/ref-type&gt;&lt;contributors&gt;&lt;authors&gt;&lt;author&gt;Chen, Yunji&lt;/author&gt;&lt;author&gt;Zhang, Shijin&lt;/author&gt;&lt;author&gt;Guo, Qi&lt;/author&gt;&lt;author&gt;Li, Ling&lt;/author&gt;&lt;author&gt;Wu, Ruiyang&lt;/author&gt;&lt;author&gt;Chen, Tianshi&lt;/author&gt;&lt;/authors&gt;&lt;/contributors&gt;&lt;titles&gt;&lt;title&gt;Deterministic Replay: A Survey&lt;/title&gt;&lt;secondary-title&gt;ACM Computing Surveys&lt;/secondary-title&gt;&lt;alt-title&gt;ACM Comput. Surv.&lt;/alt-title&gt;&lt;/titles&gt;&lt;periodical&gt;&lt;full-title&gt;ACM Computing Surveys&lt;/full-title&gt;&lt;abbr-1&gt;ACM Comput. Surv.&lt;/abbr-1&gt;&lt;/periodical&gt;&lt;pages&gt;1-47&lt;/pages&gt;&lt;volume&gt;48&lt;/volume&gt;&lt;number&gt;2&lt;/number&gt;&lt;dates&gt;&lt;year&gt;2015&lt;/year&gt;&lt;/dates&gt;&lt;publisher&gt;ACM&lt;/publisher&gt;&lt;label&gt;chen2015replay&lt;/label&gt;&lt;urls&gt;&lt;/urls&gt;&lt;electronic-resource-num&gt;10.1145/2790077&lt;/electronic-resource-num&gt;&lt;/record&gt;&lt;/Cite&gt;&lt;Cite&gt;&lt;Author&gt;HELICS developers (GMLC-TDC)&lt;/Author&gt;&lt;Year&gt;2026&lt;/Year&gt;&lt;RecNum&gt;31&lt;/RecNum&gt;&lt;record&gt;&lt;rec-number&gt;31&lt;/rec-number&gt;&lt;foreign-keys&gt;&lt;key app="EN" db-id="mdae8500109496fea4aff9c086e16cc25895" timestamp="1793216821"&gt;31&lt;/key&gt;&lt;/foreign-keys&gt;&lt;ref-type name="Web Page"&gt;12&lt;/ref-type&gt;&lt;contributors&gt;&lt;authors&gt;&lt;author&gt;HELICS developers (GMLC-TDC)&lt;/author&gt;&lt;/authors&gt;&lt;/contributors&gt;&lt;titles&gt;&lt;title&gt;HELICS documentation&lt;/title&gt;&lt;/titles&gt;&lt;dates&gt;&lt;year&gt;2026&lt;/year&gt;&lt;/dates&gt;&lt;label&gt;helics_docs&lt;/label&gt;&lt;urls&gt;&lt;related-urls&gt;&lt;url&gt;https://docs.helics.org/en/latest/&lt;/url&gt;&lt;/related-urls&gt;&lt;/urls&gt;&lt;access-date&gt;2026-10-28&lt;/access-date&gt;&lt;/record&gt;&lt;/Cite&gt;&lt;/EndNote&gt;</w:instrText>
       </w:r>
       <w:r>
         <w:fldChar w:fldCharType="separate"/>
@@ -6796,7 +6754,7 @@
         <w:rPr>
           <w:noProof/>
         </w:rPr>
-        <w:t>[35,53]</w:t>
+        <w:t>[34,52]</w:t>
       </w:r>
       <w:r>
         <w:fldChar w:fldCharType="end"/>
@@ -6817,13 +6775,13 @@
         <w:t xml:space="preserve">Provenance.</w:t>
       </w:r>
       <w:r>
-        <w:t xml:space="preserve"> Optionally, SMMM records which messages each component read at each step. A recorded message can then be traced back through the chain that produced it, for example from a grid import through an EnergyPlus output and an LLM decision to the temperature and price it was based on. This is a lightweight, message-level form of a PROV graph </w:t>
+        <w:t xml:space="preserve"> Optionally, TIDE records which messages each component read at each step. A recorded message can then be traced back through the chain that produced it, for example from a grid import through an EnergyPlus output and an LLM decision to the temperature and price it was based on. This is a lightweight, message-level form of a PROV graph </w:t>
       </w:r>
       <w:r>
         <w:fldChar w:fldCharType="begin"/>
       </w:r>
       <w:r>
-        <w:instrText xml:space="preserve"> ADDIN EN.CITE &lt;EndNote&gt;&lt;Cite&gt;&lt;Author&gt;Moreau&lt;/Author&gt;&lt;Year&gt;2013&lt;/Year&gt;&lt;RecNum&gt;55&lt;/RecNum&gt;&lt;DisplayText&gt;[52]&lt;/DisplayText&gt;&lt;record&gt;&lt;rec-number&gt;55&lt;/rec-number&gt;&lt;foreign-keys&gt;&lt;key app="EN" db-id="mdae8500109496fea4aff9c086e16cc25895" timestamp="1793185473"&gt;55&lt;/key&gt;&lt;/foreign-keys&gt;&lt;ref-type name="Standard"&gt;58&lt;/ref-type&gt;&lt;contributors&gt;&lt;authors&gt;&lt;author&gt;Moreau, Luc&lt;/author&gt;&lt;author&gt;Missier, Paolo&lt;/author&gt;&lt;/authors&gt;&lt;/contributors&gt;&lt;titles&gt;&lt;title&gt;PROV-DM: The PROV Data Model&lt;/title&gt;&lt;secondary-title&gt;W3C Recommendation&lt;/secondary-title&gt;&lt;/titles&gt;&lt;dates&gt;&lt;year&gt;2013&lt;/year&gt;&lt;/dates&gt;&lt;publisher&gt;World Wide Web Consortium (W3C)&lt;/publisher&gt;&lt;label&gt;moreau2013prov&lt;/label&gt;&lt;urls&gt;&lt;related-urls&gt;&lt;url&gt;https://www.w3.org/TR/2013/REC-prov-dm-20130430/&lt;/url&gt;&lt;/related-urls&gt;&lt;/urls&gt;&lt;/record&gt;&lt;/Cite&gt;&lt;/EndNote&gt;</w:instrText>
+        <w:instrText xml:space="preserve"> ADDIN EN.CITE &lt;EndNote&gt;&lt;Cite&gt;&lt;Author&gt;Moreau&lt;/Author&gt;&lt;Year&gt;2013&lt;/Year&gt;&lt;RecNum&gt;55&lt;/RecNum&gt;&lt;DisplayText&gt;[51]&lt;/DisplayText&gt;&lt;record&gt;&lt;rec-number&gt;55&lt;/rec-number&gt;&lt;foreign-keys&gt;&lt;key app="EN" db-id="mdae8500109496fea4aff9c086e16cc25895" timestamp="1793216821"&gt;55&lt;/key&gt;&lt;/foreign-keys&gt;&lt;ref-type name="Standard"&gt;58&lt;/ref-type&gt;&lt;contributors&gt;&lt;authors&gt;&lt;author&gt;Moreau, Luc&lt;/author&gt;&lt;author&gt;Missier, Paolo&lt;/author&gt;&lt;/authors&gt;&lt;/contributors&gt;&lt;titles&gt;&lt;title&gt;PROV-DM: The PROV Data Model&lt;/title&gt;&lt;secondary-title&gt;W3C Recommendation&lt;/secondary-title&gt;&lt;/titles&gt;&lt;dates&gt;&lt;year&gt;2013&lt;/year&gt;&lt;/dates&gt;&lt;publisher&gt;World Wide Web Consortium (W3C)&lt;/publisher&gt;&lt;label&gt;moreau2013prov&lt;/label&gt;&lt;urls&gt;&lt;related-urls&gt;&lt;url&gt;https://www.w3.org/TR/2013/REC-prov-dm-20130430/&lt;/url&gt;&lt;/related-urls&gt;&lt;/urls&gt;&lt;/record&gt;&lt;/Cite&gt;&lt;/EndNote&gt;</w:instrText>
       </w:r>
       <w:r>
         <w:fldChar w:fldCharType="separate"/>
@@ -6832,7 +6790,7 @@
         <w:rPr>
           <w:noProof/>
         </w:rPr>
-        <w:t>[52]</w:t>
+        <w:t>[51]</w:t>
       </w:r>
       <w:r>
         <w:fldChar w:fldCharType="end"/>
@@ -6918,7 +6876,7 @@
         </m:sSub>
       </m:oMath>
       <w:r>
-        <w:t xml:space="preserve">, SMMM gathers its inputs, hands the call to a background thread and keeps simulating. Its outputs are published in phase 0 of the step at </w:t>
+        <w:t xml:space="preserve">, TIDE gathers its inputs, hands the call to a background thread and keeps simulating. Its outputs are published in phase 0 of the step at </w:t>
       </w:r>
       <m:oMath>
         <m:sSub>
@@ -6972,10 +6930,10 @@
       <w:r>
         <w:fldChar w:fldCharType="begin">
           <w:fldData xml:space="preserve">PEVuZE5vdGU+PENpdGU+PEF1dGhvcj5IZW56aW5nZXI8L0F1dGhvcj48WWVhcj4yMDAzPC9ZZWFy
-PjxSZWNOdW0+MzM8L1JlY051bT48RGlzcGxheVRleHQ+WzU1LDU2XTwvRGlzcGxheVRleHQ+PHJl
+PjxSZWNOdW0+MzM8L1JlY051bT48RGlzcGxheVRleHQ+WzU0LDU1XTwvRGlzcGxheVRleHQ+PHJl
 Y29yZD48cmVjLW51bWJlcj4zMzwvcmVjLW51bWJlcj48Zm9yZWlnbi1rZXlzPjxrZXkgYXBwPSJF
 TiIgZGItaWQ9Im1kYWU4NTAwMTA5NDk2ZmVhNGFmZjljMDg2ZTE2Y2MyNTg5NSIgdGltZXN0YW1w
-PSIxNzkzMTg1NDczIj4zMzwva2V5PjwvZm9yZWlnbi1rZXlzPjxyZWYtdHlwZSBuYW1lPSJKb3Vy
+PSIxNzkzMjE2ODIxIj4zMzwva2V5PjwvZm9yZWlnbi1rZXlzPjxyZWYtdHlwZSBuYW1lPSJKb3Vy
 bmFsIEFydGljbGUiPjE3PC9yZWYtdHlwZT48Y29udHJpYnV0b3JzPjxhdXRob3JzPjxhdXRob3I+
 SGVuemluZ2VyLCBULiBBLjwvYXV0aG9yPjxhdXRob3I+SG9yb3dpdHosIEIuPC9hdXRob3I+PGF1
 dGhvcj5LaXJzY2gsIEMuIE0uPC9hdXRob3I+PC9hdXRob3JzPjwvY29udHJpYnV0b3JzPjx0aXRs
@@ -6991,7 +6949,7 @@
 Y29yZD48L0NpdGU+PENpdGU+PEF1dGhvcj5Mb2hzdHJvaDwvQXV0aG9yPjxZZWFyPjIwMjE8L1ll
 YXI+PFJlY051bT41MzwvUmVjTnVtPjxyZWNvcmQ+PHJlYy1udW1iZXI+NTM8L3JlYy1udW1iZXI+
 PGZvcmVpZ24ta2V5cz48a2V5IGFwcD0iRU4iIGRiLWlkPSJtZGFlODUwMDEwOTQ5NmZlYTRhZmY5
-YzA4NmUxNmNjMjU4OTUiIHRpbWVzdGFtcD0iMTc5MzE4NTQ3MyI+NTM8L2tleT48L2ZvcmVpZ24t
+YzA4NmUxNmNjMjU4OTUiIHRpbWVzdGFtcD0iMTc5MzIxNjgyMSI+NTM8L2tleT48L2ZvcmVpZ24t
 a2V5cz48cmVmLXR5cGUgbmFtZT0iSm91cm5hbCBBcnRpY2xlIj4xNzwvcmVmLXR5cGU+PGNvbnRy
 aWJ1dG9ycz48YXV0aG9ycz48YXV0aG9yPkxvaHN0cm9oLCBNYXJ0ZW48L2F1dGhvcj48YXV0aG9y
 Pk1lbmFyZCwgQ2hyaXN0aWFuPC9hdXRob3I+PGF1dGhvcj5CYXRlbmksIFNvcm91c2g8L2F1dGhv
@@ -7015,10 +6973,10 @@
       <w:r>
         <w:fldChar w:fldCharType="begin">
           <w:fldData xml:space="preserve">PEVuZE5vdGU+PENpdGU+PEF1dGhvcj5IZW56aW5nZXI8L0F1dGhvcj48WWVhcj4yMDAzPC9ZZWFy
-PjxSZWNOdW0+MzM8L1JlY051bT48RGlzcGxheVRleHQ+WzU1LDU2XTwvRGlzcGxheVRleHQ+PHJl
+PjxSZWNOdW0+MzM8L1JlY051bT48RGlzcGxheVRleHQ+WzU0LDU1XTwvRGlzcGxheVRleHQ+PHJl
 Y29yZD48cmVjLW51bWJlcj4zMzwvcmVjLW51bWJlcj48Zm9yZWlnbi1rZXlzPjxrZXkgYXBwPSJF
 TiIgZGItaWQ9Im1kYWU4NTAwMTA5NDk2ZmVhNGFmZjljMDg2ZTE2Y2MyNTg5NSIgdGltZXN0YW1w
-PSIxNzkzMTg1NDczIj4zMzwva2V5PjwvZm9yZWlnbi1rZXlzPjxyZWYtdHlwZSBuYW1lPSJKb3Vy
+PSIxNzkzMjE2ODIxIj4zMzwva2V5PjwvZm9yZWlnbi1rZXlzPjxyZWYtdHlwZSBuYW1lPSJKb3Vy
 bmFsIEFydGljbGUiPjE3PC9yZWYtdHlwZT48Y29udHJpYnV0b3JzPjxhdXRob3JzPjxhdXRob3I+
 SGVuemluZ2VyLCBULiBBLjwvYXV0aG9yPjxhdXRob3I+SG9yb3dpdHosIEIuPC9hdXRob3I+PGF1
 dGhvcj5LaXJzY2gsIEMuIE0uPC9hdXRob3I+PC9hdXRob3JzPjwvY29udHJpYnV0b3JzPjx0aXRs
@@ -7034,7 +6992,7 @@
 Y29yZD48L0NpdGU+PENpdGU+PEF1dGhvcj5Mb2hzdHJvaDwvQXV0aG9yPjxZZWFyPjIwMjE8L1ll
 YXI+PFJlY051bT41MzwvUmVjTnVtPjxyZWNvcmQ+PHJlYy1udW1iZXI+NTM8L3JlYy1udW1iZXI+
 PGZvcmVpZ24ta2V5cz48a2V5IGFwcD0iRU4iIGRiLWlkPSJtZGFlODUwMDEwOTQ5NmZlYTRhZmY5
-YzA4NmUxNmNjMjU4OTUiIHRpbWVzdGFtcD0iMTc5MzE4NTQ3MyI+NTM8L2tleT48L2ZvcmVpZ24t
+YzA4NmUxNmNjMjU4OTUiIHRpbWVzdGFtcD0iMTc5MzIxNjgyMSI+NTM8L2tleT48L2ZvcmVpZ24t
 a2V5cz48cmVmLXR5cGUgbmFtZT0iSm91cm5hbCBBcnRpY2xlIj4xNzwvcmVmLXR5cGU+PGNvbnRy
 aWJ1dG9ycz48YXV0aG9ycz48YXV0aG9yPkxvaHN0cm9oLCBNYXJ0ZW48L2F1dGhvcj48YXV0aG9y
 Pk1lbmFyZCwgQ2hyaXN0aWFuPC9hdXRob3I+PGF1dGhvcj5CYXRlbmksIFNvcm91c2g8L2F1dGhv
@@ -7065,7 +7023,7 @@
         <w:rPr>
           <w:noProof/>
         </w:rPr>
-        <w:t>[55,56]</w:t>
+        <w:t>[54,55]</w:t>
       </w:r>
       <w:r>
         <w:fldChar w:fldCharType="end"/>
@@ -7180,7 +7138,7 @@
         <w:fldChar w:fldCharType="begin"/>
       </w:r>
       <w:r>
-        <w:instrText xml:space="preserve"> ADDIN EN.CITE &lt;EndNote&gt;&lt;Cite&gt;&lt;Author&gt;U.S. Department of Energy&lt;/Author&gt;&lt;Year&gt;2024&lt;/Year&gt;&lt;RecNum&gt;20&lt;/RecNum&gt;&lt;DisplayText&gt;[21]&lt;/DisplayText&gt;&lt;record&gt;&lt;rec-number&gt;20&lt;/rec-number&gt;&lt;foreign-keys&gt;&lt;key app="EN" db-id="mdae8500109496fea4aff9c086e16cc25895" timestamp="1793185473"&gt;20&lt;/key&gt;&lt;/foreign-keys&gt;&lt;ref-type name="Web Page"&gt;12&lt;/ref-type&gt;&lt;contributors&gt;&lt;authors&gt;&lt;author&gt;U.S. Department of Energy&lt;/author&gt;&lt;/authors&gt;&lt;/contributors&gt;&lt;titles&gt;&lt;title&gt;EnergyPlus Output Details and Examples: eplusout.rdd&lt;/title&gt;&lt;/titles&gt;&lt;dates&gt;&lt;year&gt;2024&lt;/year&gt;&lt;/dates&gt;&lt;label&gt;doe2024rdd&lt;/label&gt;&lt;urls&gt;&lt;related-urls&gt;&lt;url&gt;https://bigladdersoftware.com/epx/docs/24-1/output-details-and-examples/eplusout-rdd.html&lt;/url&gt;&lt;/related-urls&gt;&lt;/urls&gt;&lt;access-date&gt;2026-10-28&lt;/access-date&gt;&lt;/record&gt;&lt;/Cite&gt;&lt;/EndNote&gt;</w:instrText>
+        <w:instrText xml:space="preserve"> ADDIN EN.CITE &lt;EndNote&gt;&lt;Cite&gt;&lt;Author&gt;U.S. Department of Energy&lt;/Author&gt;&lt;Year&gt;2024&lt;/Year&gt;&lt;RecNum&gt;20&lt;/RecNum&gt;&lt;DisplayText&gt;[21]&lt;/DisplayText&gt;&lt;record&gt;&lt;rec-number&gt;20&lt;/rec-number&gt;&lt;foreign-keys&gt;&lt;key app="EN" db-id="mdae8500109496fea4aff9c086e16cc25895" timestamp="1793216821"&gt;20&lt;/key&gt;&lt;/foreign-keys&gt;&lt;ref-type name="Web Page"&gt;12&lt;/ref-type&gt;&lt;contributors&gt;&lt;authors&gt;&lt;author&gt;U.S. Department of Energy&lt;/author&gt;&lt;/authors&gt;&lt;/contributors&gt;&lt;titles&gt;&lt;title&gt;EnergyPlus Output Details and Examples: eplusout.rdd&lt;/title&gt;&lt;/titles&gt;&lt;dates&gt;&lt;year&gt;2024&lt;/year&gt;&lt;/dates&gt;&lt;label&gt;doe2024rdd&lt;/label&gt;&lt;urls&gt;&lt;related-urls&gt;&lt;url&gt;https://bigladdersoftware.com/epx/docs/24-1/output-details-and-examples/eplusout-rdd.html&lt;/url&gt;&lt;/related-urls&gt;&lt;/urls&gt;&lt;access-date&gt;2026-10-28&lt;/access-date&gt;&lt;/record&gt;&lt;/Cite&gt;&lt;/EndNote&gt;</w:instrText>
       </w:r>
       <w:r>
         <w:fldChar w:fldCharType="separate"/>
@@ -7209,7 +7167,7 @@
         <w:fldChar w:fldCharType="begin"/>
       </w:r>
       <w:r>
-        <w:instrText xml:space="preserve"> ADDIN EN.CITE &lt;EndNote&gt;&lt;Cite&gt;&lt;Author&gt;U.S. Department of Energy&lt;/Author&gt;&lt;Year&gt;2018&lt;/Year&gt;&lt;RecNum&gt;18&lt;/RecNum&gt;&lt;DisplayText&gt;[40,41]&lt;/DisplayText&gt;&lt;record&gt;&lt;rec-number&gt;18&lt;/rec-number&gt;&lt;foreign-keys&gt;&lt;key app="EN" db-id="mdae8500109496fea4aff9c086e16cc25895" timestamp="1793185473"&gt;18&lt;/key&gt;&lt;/foreign-keys&gt;&lt;ref-type name="Web Page"&gt;12&lt;/ref-type&gt;&lt;contributors&gt;&lt;authors&gt;&lt;author&gt;U.S. Department of Energy&lt;/author&gt;&lt;/authors&gt;&lt;/contributors&gt;&lt;titles&gt;&lt;title&gt;EnergyPlus External Interface(s) Application Guide: BCVTB Examples&lt;/title&gt;&lt;/titles&gt;&lt;dates&gt;&lt;year&gt;2018&lt;/year&gt;&lt;/dates&gt;&lt;label&gt;doe_extif&lt;/label&gt;&lt;urls&gt;&lt;related-urls&gt;&lt;url&gt;https://bigladdersoftware.com/epx/docs/9-0/external-interfaces-application-guide/bcvtb-examples.html&lt;/url&gt;&lt;/related-urls&gt;&lt;/urls&gt;&lt;access-date&gt;2026-10-28&lt;/access-date&gt;&lt;/record&gt;&lt;/Cite&gt;&lt;Cite&gt;&lt;Author&gt;Lawrence Berkeley National Laboratory&lt;/Author&gt;&lt;Year&gt;2021&lt;/Year&gt;&lt;RecNum&gt;48&lt;/RecNum&gt;&lt;record&gt;&lt;rec-number&gt;48&lt;/rec-number&gt;&lt;foreign-keys&gt;&lt;key app="EN" db-id="mdae8500109496fea4aff9c086e16cc25895" timestamp="1793185473"&gt;48&lt;/key&gt;&lt;/foreign-keys&gt;&lt;ref-type name="Web Page"&gt;12&lt;/ref-type&gt;&lt;contributors&gt;&lt;authors&gt;&lt;author&gt;Lawrence Berkeley National Laboratory&lt;/author&gt;&lt;/authors&gt;&lt;/contributors&gt;&lt;titles&gt;&lt;title&gt;FMU Export of EnergyPlus User Guide, Section 5: Usage of EnergyPlus as an FMU&lt;/title&gt;&lt;/titles&gt;&lt;dates&gt;&lt;year&gt;2021&lt;/year&gt;&lt;/dates&gt;&lt;label&gt;lbnl_fmuexport&lt;/label&gt;&lt;urls&gt;&lt;related-urls&gt;&lt;url&gt;https://simulationresearch.lbl.gov/fmu/EnergyPlus/export/userGuide/usage.html&lt;/url&gt;&lt;/related-urls&gt;&lt;/urls&gt;&lt;access-date&gt;2026-10-28&lt;/access-date&gt;&lt;/record&gt;&lt;/Cite&gt;&lt;/EndNote&gt;</w:instrText>
+        <w:instrText xml:space="preserve"> ADDIN EN.CITE &lt;EndNote&gt;&lt;Cite&gt;&lt;Author&gt;U.S. Department of Energy&lt;/Author&gt;&lt;Year&gt;2018&lt;/Year&gt;&lt;RecNum&gt;18&lt;/RecNum&gt;&lt;DisplayText&gt;[39,40]&lt;/DisplayText&gt;&lt;record&gt;&lt;rec-number&gt;18&lt;/rec-number&gt;&lt;foreign-keys&gt;&lt;key app="EN" db-id="mdae8500109496fea4aff9c086e16cc25895" timestamp="1793216821"&gt;18&lt;/key&gt;&lt;/foreign-keys&gt;&lt;ref-type name="Web Page"&gt;12&lt;/ref-type&gt;&lt;contributors&gt;&lt;authors&gt;&lt;author&gt;U.S. Department of Energy&lt;/author&gt;&lt;/authors&gt;&lt;/contributors&gt;&lt;titles&gt;&lt;title&gt;EnergyPlus External Interface(s) Application Guide: BCVTB Examples&lt;/title&gt;&lt;/titles&gt;&lt;dates&gt;&lt;year&gt;2018&lt;/year&gt;&lt;/dates&gt;&lt;label&gt;doe_extif&lt;/label&gt;&lt;urls&gt;&lt;related-urls&gt;&lt;url&gt;https://bigladdersoftware.com/epx/docs/9-0/external-interfaces-application-guide/bcvtb-examples.html&lt;/url&gt;&lt;/related-urls&gt;&lt;/urls&gt;&lt;access-date&gt;2026-10-28&lt;/access-date&gt;&lt;/record&gt;&lt;/Cite&gt;&lt;Cite&gt;&lt;Author&gt;Lawrence Berkeley National Laboratory&lt;/Author&gt;&lt;Year&gt;2021&lt;/Year&gt;&lt;RecNum&gt;48&lt;/RecNum&gt;&lt;record&gt;&lt;rec-number&gt;48&lt;/rec-number&gt;&lt;foreign-keys&gt;&lt;key app="EN" db-id="mdae8500109496fea4aff9c086e16cc25895" timestamp="1793216821"&gt;48&lt;/key&gt;&lt;/foreign-keys&gt;&lt;ref-type name="Web Page"&gt;12&lt;/ref-type&gt;&lt;contributors&gt;&lt;authors&gt;&lt;author&gt;Lawrence Berkeley National Laboratory&lt;/author&gt;&lt;/authors&gt;&lt;/contributors&gt;&lt;titles&gt;&lt;title&gt;FMU Export of EnergyPlus User Guide, Section 5: Usage of EnergyPlus as an FMU&lt;/title&gt;&lt;/titles&gt;&lt;dates&gt;&lt;year&gt;2021&lt;/year&gt;&lt;/dates&gt;&lt;label&gt;lbnl_fmuexport&lt;/label&gt;&lt;urls&gt;&lt;related-urls&gt;&lt;url&gt;https://simulationresearch.lbl.gov/fmu/EnergyPlus/export/userGuide/usage.html&lt;/url&gt;&lt;/related-urls&gt;&lt;/urls&gt;&lt;access-date&gt;2026-10-28&lt;/access-date&gt;&lt;/record&gt;&lt;/Cite&gt;&lt;/EndNote&gt;</w:instrText>
       </w:r>
       <w:r>
         <w:fldChar w:fldCharType="separate"/>
@@ -7218,7 +7176,7 @@
         <w:rPr>
           <w:noProof/>
         </w:rPr>
-        <w:t>[40,41]</w:t>
+        <w:t>[39,40]</w:t>
       </w:r>
       <w:r>
         <w:fldChar w:fldCharType="end"/>
@@ -7242,7 +7200,7 @@
         <w:pStyle w:val="BodyText"/>
       </w:pPr>
       <w:r>
-        <w:t xml:space="preserve">Py-CoSim 2.1 is a Python package (Python 3.9 or later) released under the MIT license. Its core depends only on NumPy and pandas. Components subclass a base class or wrap a plain function with a decorator; ports are declared as dictionaries, for example </w:t>
+        <w:t xml:space="preserve">Py-CoSim is a Python package (Python 3.9 or later) released under the MIT license; the source code, examples and the scripts that reproduce every result of this paper are available at https://github.com/lz356/Py-CoSim. Its core depends only on NumPy and pandas. Components subclass a base class or wrap a plain function with a decorator; ports are declared as dictionaries, for example </w:t>
       </w:r>
       <w:r>
         <w:rPr>
@@ -7257,7 +7215,7 @@
         <w:fldChar w:fldCharType="begin"/>
       </w:r>
       <w:r>
-        <w:instrText xml:space="preserve"> ADDIN EN.CITE &lt;EndNote&gt;&lt;Cite&gt;&lt;Author&gt;Dobos&lt;/Author&gt;&lt;Year&gt;2014&lt;/Year&gt;&lt;RecNum&gt;17&lt;/RecNum&gt;&lt;DisplayText&gt;[58]&lt;/DisplayText&gt;&lt;record&gt;&lt;rec-number&gt;17&lt;/rec-number&gt;&lt;foreign-keys&gt;&lt;key app="EN" db-id="mdae8500109496fea4aff9c086e16cc25895" timestamp="1793185473"&gt;17&lt;/key&gt;&lt;/foreign-keys&gt;&lt;ref-type name="Report"&gt;27&lt;/ref-type&gt;&lt;contributors&gt;&lt;authors&gt;&lt;author&gt;Dobos, A. P.&lt;/author&gt;&lt;/authors&gt;&lt;/contributors&gt;&lt;titles&gt;&lt;title&gt;PVWatts Version 5 Manual&lt;/title&gt;&lt;/titles&gt;&lt;dates&gt;&lt;year&gt;2014&lt;/year&gt;&lt;/dates&gt;&lt;pub-location&gt;Golden, CO&lt;/pub-location&gt;&lt;publisher&gt;National Renewable Energy Laboratory&lt;/publisher&gt;&lt;isbn&gt;NREL/TP-6A20-62641&lt;/isbn&gt;&lt;label&gt;dobos2014&lt;/label&gt;&lt;work-type&gt;Technical Report&lt;/work-type&gt;&lt;urls&gt;&lt;/urls&gt;&lt;electronic-resource-num&gt;10.2172/1158421&lt;/electronic-resource-num&gt;&lt;/record&gt;&lt;/Cite&gt;&lt;/EndNote&gt;</w:instrText>
+        <w:instrText xml:space="preserve"> ADDIN EN.CITE &lt;EndNote&gt;&lt;Cite&gt;&lt;Author&gt;Dobos&lt;/Author&gt;&lt;Year&gt;2014&lt;/Year&gt;&lt;RecNum&gt;17&lt;/RecNum&gt;&lt;DisplayText&gt;[57]&lt;/DisplayText&gt;&lt;record&gt;&lt;rec-number&gt;17&lt;/rec-number&gt;&lt;foreign-keys&gt;&lt;key app="EN" db-id="mdae8500109496fea4aff9c086e16cc25895" timestamp="1793216821"&gt;17&lt;/key&gt;&lt;/foreign-keys&gt;&lt;ref-type name="Report"&gt;27&lt;/ref-type&gt;&lt;contributors&gt;&lt;authors&gt;&lt;author&gt;Dobos, A. P.&lt;/author&gt;&lt;/authors&gt;&lt;/contributors&gt;&lt;titles&gt;&lt;title&gt;PVWatts Version 5 Manual&lt;/title&gt;&lt;/titles&gt;&lt;dates&gt;&lt;year&gt;2014&lt;/year&gt;&lt;/dates&gt;&lt;pub-location&gt;Golden, CO&lt;/pub-location&gt;&lt;publisher&gt;National Renewable Energy Laboratory&lt;/publisher&gt;&lt;isbn&gt;NREL/TP-6A20-62641&lt;/isbn&gt;&lt;label&gt;dobos2014&lt;/label&gt;&lt;work-type&gt;Technical Report&lt;/work-type&gt;&lt;urls&gt;&lt;/urls&gt;&lt;electronic-resource-num&gt;10.2172/1158421&lt;/electronic-resource-num&gt;&lt;/record&gt;&lt;/Cite&gt;&lt;/EndNote&gt;</w:instrText>
       </w:r>
       <w:r>
         <w:fldChar w:fldCharType="separate"/>
@@ -7266,19 +7224,143 @@
         <w:rPr>
           <w:noProof/>
         </w:rPr>
+        <w:t>[57]</w:t>
+      </w:r>
+      <w:r>
+        <w:fldChar w:fldCharType="end"/>
+      </w:r>
+      <w:r>
+        <w:t xml:space="preserve">), batteries, tariffs, grid metering, controllers, a two-node resistance–capacitance building, occupancy from the 2017 National Household Travel Survey </w:t>
+      </w:r>
+      <w:r>
+        <w:fldChar w:fldCharType="begin"/>
+      </w:r>
+      <w:r>
+        <w:instrText xml:space="preserve"> ADDIN EN.CITE &lt;EndNote&gt;&lt;Cite&gt;&lt;Author&gt;Federal Highway Administration&lt;/Author&gt;&lt;Year&gt;2017&lt;/Year&gt;&lt;RecNum&gt;22&lt;/RecNum&gt;&lt;DisplayText&gt;[58]&lt;/DisplayText&gt;&lt;record&gt;&lt;rec-number&gt;22&lt;/rec-number&gt;&lt;foreign-keys&gt;&lt;key app="EN" db-id="mdae8500109496fea4aff9c086e16cc25895" timestamp="1793216821"&gt;22&lt;/key&gt;&lt;/foreign-keys&gt;&lt;ref-type name="Web Page"&gt;12&lt;/ref-type&gt;&lt;contributors&gt;&lt;authors&gt;&lt;author&gt;Federal Highway Administration&lt;/author&gt;&lt;/authors&gt;&lt;/contributors&gt;&lt;titles&gt;&lt;title&gt;2017 National Household Travel Survey&lt;/title&gt;&lt;/titles&gt;&lt;dates&gt;&lt;year&gt;2017&lt;/year&gt;&lt;/dates&gt;&lt;publisher&gt;U.S. Department of Transportation&lt;/publisher&gt;&lt;label&gt;fhwa2017&lt;/label&gt;&lt;urls&gt;&lt;related-urls&gt;&lt;url&gt;https://nhts.ornl.gov&lt;/url&gt;&lt;/related-urls&gt;&lt;/urls&gt;&lt;access-date&gt;2026-10-28&lt;/access-date&gt;&lt;/record&gt;&lt;/Cite&gt;&lt;/EndNote&gt;</w:instrText>
+      </w:r>
+      <w:r>
+        <w:fldChar w:fldCharType="separate"/>
+      </w:r>
+      <w:r>
+        <w:rPr>
+          <w:noProof/>
+        </w:rPr>
         <w:t>[58]</w:t>
       </w:r>
       <w:r>
         <w:fldChar w:fldCharType="end"/>
       </w:r>
       <w:r>
-        <w:t xml:space="preserve">), batteries, tariffs, grid metering, controllers, a two-node resistance–capacitance building, occupancy from the 2017 National Household Travel Survey </w:t>
+        <w:t xml:space="preserve">, LLM supervisors with interchangeable back ends, an adapter for co-simulation FMUs, and a Gymnasium environment for reinforcement learning. Library components declare the time meaning of their ports: the grid meter, for instance, reads power and price over the step that has just ended. Scenarios can also be written in YAML and run from the command line. The repository contains 11 example co-simulations and a test suite of more than 450 tests, run in continuous integration on three operating systems.</w:t>
+      </w:r>
+    </w:p>
+    <w:p>
+      <w:pPr>
+        <w:pStyle w:val="BodyText"/>
+      </w:pPr>
+      <w:r>
+        <w:t xml:space="preserve">A co-simulation takes a few lines of code. A </w:t>
+      </w:r>
+      <w:r>
+        <w:rPr>
+          <w:rFonts w:ascii="Courier New" w:hAnsi="Courier New" w:cs="Courier New"/>
+        </w:rPr>
+        <w:t xml:space="preserve">CoSimulation(start, end, step)</w:t>
+      </w:r>
+      <w:r>
+        <w:t xml:space="preserve"> object is created, components are added, and inputs are subscribed to outputs. For example, </w:t>
+      </w:r>
+      <w:r>
+        <w:rPr>
+          <w:rFonts w:ascii="Courier New" w:hAnsi="Courier New" w:cs="Courier New"/>
+        </w:rPr>
+        <w:t xml:space="preserve">sim.subscribe("grid.P_load", "bldg*.P_facility", reduce="sum")</w:t>
+      </w:r>
+      <w:r>
+        <w:t xml:space="preserve"> makes a grid meter read, over each of its steps, the summed mean power of every building whose name starts with </w:t>
+      </w:r>
+      <w:r>
+        <w:rPr>
+          <w:rFonts w:ascii="Courier New" w:hAnsi="Courier New" w:cs="Courier New"/>
+        </w:rPr>
+        <w:t xml:space="preserve">bldg</w:t>
+      </w:r>
+      <w:r>
+        <w:t xml:space="preserve">, whatever their step sizes. The features of </w:t>
+      </w:r>
+      <w:r>
+        <w:t xml:space="preserve">Section 3</w:t>
+      </w:r>
+      <w:r>
+        <w:t xml:space="preserve"> are switched on with keyword arguments: </w:t>
+      </w:r>
+      <w:r>
+        <w:rPr>
+          <w:rFonts w:ascii="Courier New" w:hAnsi="Courier New" w:cs="Courier New"/>
+        </w:rPr>
+        <w:t xml:space="preserve">record=["llm"]</w:t>
+      </w:r>
+      <w:r>
+        <w:t xml:space="preserve"> and </w:t>
+      </w:r>
+      <w:r>
+        <w:rPr>
+          <w:rFonts w:ascii="Courier New" w:hAnsi="Courier New" w:cs="Courier New"/>
+        </w:rPr>
+        <w:t xml:space="preserve">trace=True</w:t>
+      </w:r>
+      <w:r>
+        <w:t xml:space="preserve"> when the simulation is created, </w:t>
+      </w:r>
+      <w:r>
+        <w:rPr>
+          <w:rFonts w:ascii="Courier New" w:hAnsi="Courier New" w:cs="Courier New"/>
+        </w:rPr>
+        <w:t xml:space="preserve">sim.replay("llm", "runs/first")</w:t>
+      </w:r>
+      <w:r>
+        <w:t xml:space="preserve"> before it runs, and </w:t>
+      </w:r>
+      <w:r>
+        <w:rPr>
+          <w:rFonts w:ascii="Courier New" w:hAnsi="Courier New" w:cs="Courier New"/>
+        </w:rPr>
+        <w:t xml:space="preserve">llm.make_async(delay="15min", deadline=10)</w:t>
+      </w:r>
+      <w:r>
+        <w:t xml:space="preserve"> on a component. Results are pandas tables of all outputs on the master grid, plus the recorded messages with their validity and quality, the quality counts, the alignment report (how often a read had to be extrapolated) and the provenance trace.</w:t>
+      </w:r>
+    </w:p>
+    <w:p>
+      <w:pPr>
+        <w:pStyle w:val="Heading1"/>
+      </w:pPr>
+      <w:bookmarkStart w:id="12" w:name="_Ref_sec_eval"/>
+      <w:r>
+        <w:t xml:space="preserve">Evaluation</w:t>
+      </w:r>
+      <w:bookmarkEnd w:id="12"/>
+    </w:p>
+    <w:p>
+      <w:pPr>
+        <w:pStyle w:val="Heading2"/>
+      </w:pPr>
+      <w:r>
+        <w:t xml:space="preserve">Set-up</w:t>
+      </w:r>
+    </w:p>
+    <w:p>
+      <w:pPr>
+        <w:pStyle w:val="BodyText"/>
+      </w:pPr>
+      <w:r>
+        <w:t xml:space="preserve">All experiments use EnergyPlus 22.2 </w:t>
       </w:r>
       <w:r>
         <w:fldChar w:fldCharType="begin"/>
       </w:r>
       <w:r>
-        <w:instrText xml:space="preserve"> ADDIN EN.CITE &lt;EndNote&gt;&lt;Cite&gt;&lt;Author&gt;Federal Highway Administration&lt;/Author&gt;&lt;Year&gt;2017&lt;/Year&gt;&lt;RecNum&gt;22&lt;/RecNum&gt;&lt;DisplayText&gt;[59]&lt;/DisplayText&gt;&lt;record&gt;&lt;rec-number&gt;22&lt;/rec-number&gt;&lt;foreign-keys&gt;&lt;key app="EN" db-id="mdae8500109496fea4aff9c086e16cc25895" timestamp="1793185473"&gt;22&lt;/key&gt;&lt;/foreign-keys&gt;&lt;ref-type name="Web Page"&gt;12&lt;/ref-type&gt;&lt;contributors&gt;&lt;authors&gt;&lt;author&gt;Federal Highway Administration&lt;/author&gt;&lt;/authors&gt;&lt;/contributors&gt;&lt;titles&gt;&lt;title&gt;2017 National Household Travel Survey&lt;/title&gt;&lt;/titles&gt;&lt;dates&gt;&lt;year&gt;2017&lt;/year&gt;&lt;/dates&gt;&lt;publisher&gt;U.S. Department of Transportation&lt;/publisher&gt;&lt;label&gt;fhwa2017&lt;/label&gt;&lt;urls&gt;&lt;related-urls&gt;&lt;url&gt;https://nhts.ornl.gov&lt;/url&gt;&lt;/related-urls&gt;&lt;/urls&gt;&lt;access-date&gt;2026-10-28&lt;/access-date&gt;&lt;/record&gt;&lt;/Cite&gt;&lt;/EndNote&gt;</w:instrText>
+        <w:instrText xml:space="preserve"> ADDIN EN.CITE &lt;EndNote&gt;&lt;Cite&gt;&lt;Author&gt;Crawley&lt;/Author&gt;&lt;Year&gt;2001&lt;/Year&gt;&lt;RecNum&gt;13&lt;/RecNum&gt;&lt;DisplayText&gt;[59]&lt;/DisplayText&gt;&lt;record&gt;&lt;rec-number&gt;13&lt;/rec-number&gt;&lt;foreign-keys&gt;&lt;key app="EN" db-id="mdae8500109496fea4aff9c086e16cc25895" timestamp="1793216821"&gt;13&lt;/key&gt;&lt;/foreign-keys&gt;&lt;ref-type name="Journal Article"&gt;17&lt;/ref-type&gt;&lt;contributors&gt;&lt;authors&gt;&lt;author&gt;Crawley, Drury B.&lt;/author&gt;&lt;author&gt;Lawrie, Linda K.&lt;/author&gt;&lt;author&gt;Winkelmann, Frederick C.&lt;/author&gt;&lt;author&gt;Buhl, W. F.&lt;/author&gt;&lt;author&gt;Huang, Y. Joe&lt;/author&gt;&lt;author&gt;Pedersen, Curtis O.&lt;/author&gt;&lt;author&gt;Strand, Richard K.&lt;/author&gt;&lt;author&gt;Liesen, Richard J.&lt;/author&gt;&lt;author&gt;Fisher, Daniel E.&lt;/author&gt;&lt;author&gt;Witte, Michael J.&lt;/author&gt;&lt;author&gt;Glazer, Jason&lt;/author&gt;&lt;/authors&gt;&lt;/contributors&gt;&lt;titles&gt;&lt;title&gt;EnergyPlus: creating a new-generation building energy simulation program&lt;/title&gt;&lt;secondary-title&gt;Energy and Buildings&lt;/secondary-title&gt;&lt;alt-title&gt;Energy Build.&lt;/alt-title&gt;&lt;/titles&gt;&lt;periodical&gt;&lt;full-title&gt;Energy and Buildings&lt;/full-title&gt;&lt;abbr-1&gt;Energy Build.&lt;/abbr-1&gt;&lt;/periodical&gt;&lt;pages&gt;319-331&lt;/pages&gt;&lt;volume&gt;33&lt;/volume&gt;&lt;number&gt;4&lt;/number&gt;&lt;dates&gt;&lt;year&gt;2001&lt;/year&gt;&lt;/dates&gt;&lt;publisher&gt;Elsevier&lt;/publisher&gt;&lt;label&gt;crawley2001&lt;/label&gt;&lt;urls&gt;&lt;/urls&gt;&lt;electronic-resource-num&gt;10.1016/S0378-7788(00)00114-6&lt;/electronic-resource-num&gt;&lt;/record&gt;&lt;/Cite&gt;&lt;/EndNote&gt;</w:instrText>
       </w:r>
       <w:r>
         <w:fldChar w:fldCharType="separate"/>
@@ -7293,179 +7375,55 @@
         <w:fldChar w:fldCharType="end"/>
       </w:r>
       <w:r>
-        <w:t xml:space="preserve">, LLM supervisors with interchangeable back ends, an adapter for co-simulation FMUs, and a Gymnasium environment for reinforcement learning. Library components declare the time meaning of their ports: the grid meter, for instance, reads power and price over the step that has just ended. Scenarios can also be written in YAML and run from the command line. The repository contains 11 example co-simulations and a test suite of more than 450 tests, run in continuous integration on three operating systems.</w:t>
-      </w:r>
+        <w:t xml:space="preserve"> and the DOE small office reference building (511 m</w:t>
+      </w:r>
+      <w:r>
+        <w:rPr>
+          <w:vertAlign w:val="superscript"/>
+        </w:rPr>
+        <w:t xml:space="preserve">2</w:t>
+      </w:r>
+      <w:r>
+        <w:t xml:space="preserve">, five conditioned zones, packaged single-zone air conditioners with direct-expansion cooling) </w:t>
+      </w:r>
+      <w:r>
+        <w:fldChar w:fldCharType="begin"/>
+      </w:r>
+      <w:r>
+        <w:instrText xml:space="preserve"> ADDIN EN.CITE &lt;EndNote&gt;&lt;Cite&gt;&lt;Author&gt;Deru&lt;/Author&gt;&lt;Year&gt;2011&lt;/Year&gt;&lt;RecNum&gt;15&lt;/RecNum&gt;&lt;DisplayText&gt;[60]&lt;/DisplayText&gt;&lt;record&gt;&lt;rec-number&gt;15&lt;/rec-number&gt;&lt;foreign-keys&gt;&lt;key app="EN" db-id="mdae8500109496fea4aff9c086e16cc25895" timestamp="1793216821"&gt;15&lt;/key&gt;&lt;/foreign-keys&gt;&lt;ref-type name="Report"&gt;27&lt;/ref-type&gt;&lt;contributors&gt;&lt;authors&gt;&lt;author&gt;Deru, M.&lt;/author&gt;&lt;author&gt;Field, K.&lt;/author&gt;&lt;author&gt;Studer, D.&lt;/author&gt;&lt;author&gt;Benne, K.&lt;/author&gt;&lt;author&gt;Griffith, B.&lt;/author&gt;&lt;author&gt;Torcellini, P.&lt;/author&gt;&lt;author&gt;Liu, B.&lt;/author&gt;&lt;author&gt;Halverson, M.&lt;/author&gt;&lt;author&gt;Winiarski, D.&lt;/author&gt;&lt;author&gt;Rosenberg, M.&lt;/author&gt;&lt;author&gt;Yazdanian, M.&lt;/author&gt;&lt;author&gt;Huang, J.&lt;/author&gt;&lt;author&gt;Crawley, D.&lt;/author&gt;&lt;/authors&gt;&lt;/contributors&gt;&lt;titles&gt;&lt;title&gt;U.S. Department of Energy Commercial Reference Building Models of the National Building Stock&lt;/title&gt;&lt;/titles&gt;&lt;dates&gt;&lt;year&gt;2011&lt;/year&gt;&lt;/dates&gt;&lt;pub-location&gt;Golden, CO&lt;/pub-location&gt;&lt;publisher&gt;National Renewable Energy Laboratory&lt;/publisher&gt;&lt;isbn&gt;NREL/TP-5500-46861&lt;/isbn&gt;&lt;label&gt;deru2011&lt;/label&gt;&lt;work-type&gt;Technical Report&lt;/work-type&gt;&lt;urls&gt;&lt;/urls&gt;&lt;electronic-resource-num&gt;10.2172/1009264&lt;/electronic-resource-num&gt;&lt;/record&gt;&lt;/Cite&gt;&lt;/EndNote&gt;</w:instrText>
+      </w:r>
+      <w:r>
+        <w:fldChar w:fldCharType="separate"/>
+      </w:r>
+      <w:r>
+        <w:rPr>
+          <w:noProof/>
+        </w:rPr>
+        <w:t>[60]</w:t>
+      </w:r>
+      <w:r>
+        <w:fldChar w:fldCharType="end"/>
+      </w:r>
+      <w:r>
+        <w:t xml:space="preserve"> with the Tucson, Arizona TMY3 weather file. Daylight-saving time is removed from the model, as Arizona does not observe it. Unless stated otherwise, the period is the week from Monday 17 July to Sunday 23 July and the exchange step is 15 min. The computer is a laptop with an Intel Core i7-1185G7 processor (4 cores, 8 threads) and 16 GB of memory, running Windows 11 and Python 3.12. Every number in this section is produced by scripts in the repository, which also contains the raw results.</w:t>
+      </w:r>
+    </w:p>
+    <w:p>
+      <w:pPr>
+        <w:pStyle w:val="Heading2"/>
+      </w:pPr>
+      <w:bookmarkStart w:id="13" w:name="_Ref_sec_verification"/>
+      <w:r>
+        <w:t xml:space="preserve">Verification against standalone EnergyPlus</w:t>
+      </w:r>
+      <w:bookmarkEnd w:id="13"/>
     </w:p>
     <w:p>
       <w:pPr>
         <w:pStyle w:val="BodyText"/>
       </w:pPr>
       <w:r>
-        <w:t xml:space="preserve">A co-simulation takes a few lines of code. A </w:t>
-      </w:r>
-      <w:r>
-        <w:rPr>
-          <w:rFonts w:ascii="Courier New" w:hAnsi="Courier New" w:cs="Courier New"/>
-        </w:rPr>
-        <w:t xml:space="preserve">CoSimulation(start, end, step)</w:t>
-      </w:r>
-      <w:r>
-        <w:t xml:space="preserve"> object is created, components are added, and inputs are subscribed to outputs. For example, </w:t>
-      </w:r>
-      <w:r>
-        <w:rPr>
-          <w:rFonts w:ascii="Courier New" w:hAnsi="Courier New" w:cs="Courier New"/>
-        </w:rPr>
-        <w:t xml:space="preserve">sim.subscribe("grid.P_load", "bldg*.P_facility", reduce="sum")</w:t>
-      </w:r>
-      <w:r>
-        <w:t xml:space="preserve"> makes a grid meter read, over each of its steps, the summed mean power of every building whose name starts with </w:t>
-      </w:r>
-      <w:r>
-        <w:rPr>
-          <w:rFonts w:ascii="Courier New" w:hAnsi="Courier New" w:cs="Courier New"/>
-        </w:rPr>
-        <w:t xml:space="preserve">bldg</w:t>
-      </w:r>
-      <w:r>
-        <w:t xml:space="preserve">, whatever their step sizes. The features of </w:t>
-      </w:r>
-      <w:r>
-        <w:t xml:space="preserve">Section 3</w:t>
-      </w:r>
-      <w:r>
-        <w:t xml:space="preserve"> are switched on with keyword arguments: </w:t>
-      </w:r>
-      <w:r>
-        <w:rPr>
-          <w:rFonts w:ascii="Courier New" w:hAnsi="Courier New" w:cs="Courier New"/>
-        </w:rPr>
-        <w:t xml:space="preserve">record=["llm"]</w:t>
-      </w:r>
-      <w:r>
-        <w:t xml:space="preserve"> and </w:t>
-      </w:r>
-      <w:r>
-        <w:rPr>
-          <w:rFonts w:ascii="Courier New" w:hAnsi="Courier New" w:cs="Courier New"/>
-        </w:rPr>
-        <w:t xml:space="preserve">trace=True</w:t>
-      </w:r>
-      <w:r>
-        <w:t xml:space="preserve"> when the simulation is created, </w:t>
-      </w:r>
-      <w:r>
-        <w:rPr>
-          <w:rFonts w:ascii="Courier New" w:hAnsi="Courier New" w:cs="Courier New"/>
-        </w:rPr>
-        <w:t xml:space="preserve">sim.replay("llm", "runs/first")</w:t>
-      </w:r>
-      <w:r>
-        <w:t xml:space="preserve"> before it runs, and </w:t>
-      </w:r>
-      <w:r>
-        <w:rPr>
-          <w:rFonts w:ascii="Courier New" w:hAnsi="Courier New" w:cs="Courier New"/>
-        </w:rPr>
-        <w:t xml:space="preserve">llm.make_async(delay="15min", deadline=10)</w:t>
-      </w:r>
-      <w:r>
-        <w:t xml:space="preserve"> on a component. Results are pandas tables of all outputs on the master grid, plus the recorded messages with their validity and quality, the quality counts, the alignment report (how often a read had to be extrapolated) and the provenance trace.</w:t>
-      </w:r>
-    </w:p>
-    <w:p>
-      <w:pPr>
-        <w:pStyle w:val="Heading1"/>
-      </w:pPr>
-      <w:bookmarkStart w:id="12" w:name="_Ref_sec_eval"/>
-      <w:r>
-        <w:t xml:space="preserve">Evaluation</w:t>
-      </w:r>
-      <w:bookmarkEnd w:id="12"/>
-    </w:p>
-    <w:p>
-      <w:pPr>
-        <w:pStyle w:val="Heading2"/>
-      </w:pPr>
-      <w:r>
-        <w:t xml:space="preserve">Set-up</w:t>
-      </w:r>
-    </w:p>
-    <w:p>
-      <w:pPr>
-        <w:pStyle w:val="BodyText"/>
-      </w:pPr>
-      <w:r>
-        <w:t xml:space="preserve">All experiments use EnergyPlus 22.2 </w:t>
-      </w:r>
-      <w:r>
-        <w:fldChar w:fldCharType="begin"/>
-      </w:r>
-      <w:r>
-        <w:instrText xml:space="preserve"> ADDIN EN.CITE &lt;EndNote&gt;&lt;Cite&gt;&lt;Author&gt;Crawley&lt;/Author&gt;&lt;Year&gt;2001&lt;/Year&gt;&lt;RecNum&gt;13&lt;/RecNum&gt;&lt;DisplayText&gt;[60]&lt;/DisplayText&gt;&lt;record&gt;&lt;rec-number&gt;13&lt;/rec-number&gt;&lt;foreign-keys&gt;&lt;key app="EN" db-id="mdae8500109496fea4aff9c086e16cc25895" timestamp="1793185473"&gt;13&lt;/key&gt;&lt;/foreign-keys&gt;&lt;ref-type name="Journal Article"&gt;17&lt;/ref-type&gt;&lt;contributors&gt;&lt;authors&gt;&lt;author&gt;Crawley, Drury B.&lt;/author&gt;&lt;author&gt;Lawrie, Linda K.&lt;/author&gt;&lt;author&gt;Winkelmann, Frederick C.&lt;/author&gt;&lt;author&gt;Buhl, W. F.&lt;/author&gt;&lt;author&gt;Huang, Y. Joe&lt;/author&gt;&lt;author&gt;Pedersen, Curtis O.&lt;/author&gt;&lt;author&gt;Strand, Richard K.&lt;/author&gt;&lt;author&gt;Liesen, Richard J.&lt;/author&gt;&lt;author&gt;Fisher, Daniel E.&lt;/author&gt;&lt;author&gt;Witte, Michael J.&lt;/author&gt;&lt;author&gt;Glazer, Jason&lt;/author&gt;&lt;/authors&gt;&lt;/contributors&gt;&lt;titles&gt;&lt;title&gt;EnergyPlus: creating a new-generation building energy simulation program&lt;/title&gt;&lt;secondary-title&gt;Energy and Buildings&lt;/secondary-title&gt;&lt;alt-title&gt;Energy Build.&lt;/alt-title&gt;&lt;/titles&gt;&lt;periodical&gt;&lt;full-title&gt;Energy and Buildings&lt;/full-title&gt;&lt;abbr-1&gt;Energy Build.&lt;/abbr-1&gt;&lt;/periodical&gt;&lt;pages&gt;319-331&lt;/pages&gt;&lt;volume&gt;33&lt;/volume&gt;&lt;number&gt;4&lt;/number&gt;&lt;dates&gt;&lt;year&gt;2001&lt;/year&gt;&lt;/dates&gt;&lt;publisher&gt;Elsevier&lt;/publisher&gt;&lt;label&gt;crawley2001&lt;/label&gt;&lt;urls&gt;&lt;/urls&gt;&lt;electronic-resource-num&gt;10.1016/S0378-7788(00)00114-6&lt;/electronic-resource-num&gt;&lt;/record&gt;&lt;/Cite&gt;&lt;/EndNote&gt;</w:instrText>
-      </w:r>
-      <w:r>
-        <w:fldChar w:fldCharType="separate"/>
-      </w:r>
-      <w:r>
-        <w:rPr>
-          <w:noProof/>
-        </w:rPr>
-        <w:t>[60]</w:t>
-      </w:r>
-      <w:r>
-        <w:fldChar w:fldCharType="end"/>
-      </w:r>
-      <w:r>
-        <w:t xml:space="preserve"> and the DOE small office reference building (511 m</w:t>
-      </w:r>
-      <w:r>
-        <w:rPr>
-          <w:vertAlign w:val="superscript"/>
-        </w:rPr>
-        <w:t xml:space="preserve">2</w:t>
-      </w:r>
-      <w:r>
-        <w:t xml:space="preserve">, five conditioned zones, packaged single-zone air conditioners with direct-expansion cooling) </w:t>
-      </w:r>
-      <w:r>
-        <w:fldChar w:fldCharType="begin"/>
-      </w:r>
-      <w:r>
-        <w:instrText xml:space="preserve"> ADDIN EN.CITE &lt;EndNote&gt;&lt;Cite&gt;&lt;Author&gt;Deru&lt;/Author&gt;&lt;Year&gt;2011&lt;/Year&gt;&lt;RecNum&gt;15&lt;/RecNum&gt;&lt;DisplayText&gt;[61]&lt;/DisplayText&gt;&lt;record&gt;&lt;rec-number&gt;15&lt;/rec-number&gt;&lt;foreign-keys&gt;&lt;key app="EN" db-id="mdae8500109496fea4aff9c086e16cc25895" timestamp="1793185473"&gt;15&lt;/key&gt;&lt;/foreign-keys&gt;&lt;ref-type name="Report"&gt;27&lt;/ref-type&gt;&lt;contributors&gt;&lt;authors&gt;&lt;author&gt;Deru, M.&lt;/author&gt;&lt;author&gt;Field, K.&lt;/author&gt;&lt;author&gt;Studer, D.&lt;/author&gt;&lt;author&gt;Benne, K.&lt;/author&gt;&lt;author&gt;Griffith, B.&lt;/author&gt;&lt;author&gt;Torcellini, P.&lt;/author&gt;&lt;author&gt;Liu, B.&lt;/author&gt;&lt;author&gt;Halverson, M.&lt;/author&gt;&lt;author&gt;Winiarski, D.&lt;/author&gt;&lt;author&gt;Rosenberg, M.&lt;/author&gt;&lt;author&gt;Yazdanian, M.&lt;/author&gt;&lt;author&gt;Huang, J.&lt;/author&gt;&lt;author&gt;Crawley, D.&lt;/author&gt;&lt;/authors&gt;&lt;/contributors&gt;&lt;titles&gt;&lt;title&gt;U.S. Department of Energy Commercial Reference Building Models of the National Building Stock&lt;/title&gt;&lt;/titles&gt;&lt;dates&gt;&lt;year&gt;2011&lt;/year&gt;&lt;/dates&gt;&lt;pub-location&gt;Golden, CO&lt;/pub-location&gt;&lt;publisher&gt;National Renewable Energy Laboratory&lt;/publisher&gt;&lt;isbn&gt;NREL/TP-5500-46861&lt;/isbn&gt;&lt;label&gt;deru2011&lt;/label&gt;&lt;work-type&gt;Technical Report&lt;/work-type&gt;&lt;urls&gt;&lt;/urls&gt;&lt;electronic-resource-num&gt;10.2172/1009264&lt;/electronic-resource-num&gt;&lt;/record&gt;&lt;/Cite&gt;&lt;/EndNote&gt;</w:instrText>
-      </w:r>
-      <w:r>
-        <w:fldChar w:fldCharType="separate"/>
-      </w:r>
-      <w:r>
-        <w:rPr>
-          <w:noProof/>
-        </w:rPr>
-        <w:t>[61]</w:t>
-      </w:r>
-      <w:r>
-        <w:fldChar w:fldCharType="end"/>
-      </w:r>
-      <w:r>
-        <w:t xml:space="preserve"> with the Tucson, Arizona TMY3 weather file. Daylight-saving time is removed from the model, as Arizona does not observe it. Unless stated otherwise, the period is the week from Monday 17 July to Sunday 23 July and the exchange step is 15 min. The computer is a laptop with an Intel Core i7-1185G7 processor (4 cores, 8 threads) and 16 GB of memory, running Windows 11 and Python 3.12. Every number in this section is produced by scripts in the repository, which also contains the raw results.</w:t>
-      </w:r>
-    </w:p>
-    <w:p>
-      <w:pPr>
-        <w:pStyle w:val="Heading2"/>
-      </w:pPr>
-      <w:bookmarkStart w:id="13" w:name="_Ref_sec_verification"/>
-      <w:r>
-        <w:t xml:space="preserve">Verification against standalone EnergyPlus</w:t>
-      </w:r>
-      <w:bookmarkEnd w:id="13"/>
-    </w:p>
-    <w:p>
-      <w:pPr>
-        <w:pStyle w:val="BodyText"/>
-      </w:pPr>
-      <w:r>
-        <w:t xml:space="preserve">The EnergyPlus adapter must not change what EnergyPlus computes. Three checks over the test week (672 steps) confirm this; all were repeated with the SMMM 2.0 code. (V1) The model run inside Py-CoSim with sensors only and the same model run from the EnergyPlus command line give identical outputs: the maximum absolute difference over seven time series (five zone temperatures, the outdoor temperature and the facility electricity) is zero. (V2) The value Py-CoSim publishes at master time </w:t>
+        <w:t xml:space="preserve">The EnergyPlus adapter must not change what EnergyPlus computes. Three checks over the test week (672 steps) confirm this. (V1) The model run inside Py-CoSim with sensors only and the same model run from the EnergyPlus command line give identical outputs: the maximum absolute difference over seven time series (five zone temperatures, the outdoor temperature and the facility electricity) is zero. (V2) The value Py-CoSim publishes at master time </w:t>
       </w:r>
       <m:oMath>
         <m:r>
@@ -7573,7 +7531,7 @@
         <w:fldChar w:fldCharType="end"/>
       </w:r>
       <w:r>
-        <w:t xml:space="preserve">), no message covers the current producer interval yet. SMMM then holds the last complete interval and reports the missing coverage in the run’s alignment table, and errors of up to 5.9 % remain in both modes.</w:t>
+        <w:t xml:space="preserve">), no message covers the current producer interval yet. TIDE then holds the last complete interval and reports the missing coverage in the run’s alignment table, and errors of up to 5.9 % remain in both modes.</w:t>
       </w:r>
     </w:p>
     <w:p>
@@ -7585,7 +7543,7 @@
           <wp:inline distT="0" distB="0" distL="0" distR="0">
             <wp:extent cx="4500000" cy="4242857"/>
             <wp:effectExtent l="0" t="0" r="0" b="0"/>
-            <wp:docPr id="3" name="Figure 3" descr="Cost error of a grid meter for every combination of producer and meter step: (a, b) naive exchange of the latest values; (c, d) SMMM-aligned exchange with read=&quot;past&quot;; (a, c) time-of-use price; (b, d)"/>
+            <wp:docPr id="3" name="Figure 3" descr="Cost error of a grid meter for every combination of producer and meter step: (a, b) naive exchange of the latest values; (c, d) aligned exchange with read=&quot;past&quot;; (a, c) time-of-use price; (b, d) real"/>
             <wp:cNvGraphicFramePr>
               <a:graphicFrameLocks noChangeAspect="1"/>
             </wp:cNvGraphicFramePr>
@@ -7677,7 +7635,7 @@
         <w:t xml:space="preserve"> </w:t>
       </w:r>
       <w:r>
-        <w:t xml:space="preserve">Cost error of a grid meter for every combination of producer and meter step: (a, b) naive exchange of the latest values; (c, d) SMMM-aligned exchange with </w:t>
+        <w:t xml:space="preserve">Cost error of a grid meter for every combination of producer and meter step: (a, b) naive exchange of the latest values; (c, d) aligned exchange with </w:t>
       </w:r>
       <w:r>
         <w:rPr>
@@ -7704,7 +7662,7 @@
         <w:pStyle w:val="BodyText"/>
       </w:pPr>
       <w:r>
-        <w:t xml:space="preserve">The second coupling experiment uses the office with a 30 kW PV array, a 100 kWh battery, the TOU tariff and a grid meter. To isolate numerical effects, all control actions are schedules: pre-cooling to 22 °C from 13:00 to 16:00 and a set-up to 26.7 °C from 16:00 to 21:00 on weekdays, and a battery that charges at 20 kW from 10:00 to 14:00 and discharges at 25 kW from 16:00 to 20:00 on weekdays. The physical system is then the same whatever the exchange step. A reference run exchanges data every minute with EnergyPlus at 60 steps per hour. Each exchange step of 5, 15, 30 and 60 min is then run in three ways: naive coupling, in which a helper component adds the latest building, PV and battery powers and the meter multiplies the result by the latest price (the wiring of Py-CoSim 2.0); aligned coupling, in which the meter subscribes to the three flows and the price with </w:t>
+        <w:t xml:space="preserve">The second coupling experiment uses the office with a 30 kW PV array, a 100 kWh battery, the TOU tariff and a grid meter. To isolate numerical effects, all control actions are schedules: pre-cooling to 22 °C from 13:00 to 16:00 and a set-up to 26.7 °C from 16:00 to 21:00 on weekdays, and a battery that charges at 20 kW from 10:00 to 14:00 and discharges at 25 kW from 16:00 to 20:00 on weekdays. The physical system is then the same whatever the exchange step. A reference run exchanges data every minute with EnergyPlus at 60 steps per hour. Each exchange step of 5, 15, 30 and 60 min is then run in three ways: naive coupling, in which a helper component adds the latest building, PV and battery powers and the meter multiplies the result by the latest price (the conventional wiring); aligned coupling, in which the meter subscribes to the three flows and the price with </w:t>
       </w:r>
       <w:r>
         <w:rPr>
@@ -8156,7 +8114,7 @@
           <wp:inline distT="0" distB="0" distL="0" distR="0">
             <wp:extent cx="3060000" cy="2259140"/>
             <wp:effectExtent l="0" t="0" r="0" b="0"/>
-            <wp:docPr id="6" name="Figure 6" descr="Wall-clock time of a two-day co-simulation of N EnergyPlus offices, each with an AI supervisor whose calls take 0.5 s (median), with blocking calls and with SMMM's asynchronous delivery (decision dela"/>
+            <wp:docPr id="6" name="Figure 6" descr="Wall-clock time of a two-day co-simulation of N EnergyPlus offices, each with an AI supervisor whose calls take 0.5 s (median), with blocking calls and with asynchronous delivery by TIDE (decision del"/>
             <wp:cNvGraphicFramePr>
               <a:graphicFrameLocks noChangeAspect="1"/>
             </wp:cNvGraphicFramePr>
@@ -8259,7 +8217,7 @@
         </m:r>
       </m:oMath>
       <w:r>
-        <w:t xml:space="preserve"> EnergyPlus offices, each with an AI supervisor whose calls take 0.5 s (median), with blocking calls and with SMMM’s asynchronous delivery (decision delay 15 min).</w:t>
+        <w:t xml:space="preserve"> EnergyPlus offices, each with an AI supervisor whose calls take 0.5 s (median), with blocking calls and with asynchronous delivery by TIDE (decision delay 15 min).</w:t>
       </w:r>
     </w:p>
     <w:p>
@@ -8277,7 +8235,7 @@
         <w:pStyle w:val="BodyText"/>
       </w:pPr>
       <w:r>
-        <w:t xml:space="preserve">The features of SMMM cost little next to a building model. Publishing a message and reading the latest value takes 4.3 µs; reading a window that spans 15 messages takes 58 µs, as the reconstruction runs in pure Python. In a co-simulation without EnergyPlus that stresses the hub, 50 Python producers publish 15-min averages and an hourly meter subscribes to all of them with one pattern (30 days, 2880 steps). The master then needs 34 µs per component and step with latest reads and 39 µs with aligned reads. Recording all 144,720 messages raises this to 61 µs, mostly for building the message table at the end of the run, and the provenance trace adds 3 µs more. With EnergyPlus, the master adds little. One building-week took 9.4 ± 0.6 s in Py-CoSim (five repetitions, EnergyPlus in a worker process) against 6.4 ± 0.9 s for the same model run from the EnergyPlus command line; the difference is process start-up, the exchange at each of the 672 steps and Python imports. Because every EnergyPlus instance runs in its own process, buildings advance in parallel: eight buildings took 22 s instead of 74 s when run one after the other (3.4 times faster), and sixteen took 45 s instead of 124 s (2.8 times, limited by the four physical cores), with results identical to the sequential runs.</w:t>
+        <w:t xml:space="preserve">The features of TIDE cost little next to a building model. Publishing a message and reading the latest value takes 4.3 µs; reading a window that spans 15 messages takes 58 µs, as the reconstruction runs in pure Python. In a co-simulation without EnergyPlus that stresses the hub, 50 Python producers publish 15-min averages and an hourly meter subscribes to all of them with one pattern (30 days, 2880 steps). The master then needs 34 µs per component and step with latest reads and 39 µs with aligned reads. Recording all 144,720 messages raises this to 61 µs, mostly for building the message table at the end of the run, and the provenance trace adds 3 µs more. With EnergyPlus, the master adds little. One building-week took 9.4 ± 0.6 s in Py-CoSim (five repetitions, EnergyPlus in a worker process) against 6.4 ± 0.9 s for the same model run from the EnergyPlus command line; the difference is process start-up, the exchange at each of the 672 steps and Python imports. Because every EnergyPlus instance runs in its own process, buildings advance in parallel: eight buildings took 22 s instead of 74 s when run one after the other (3.4 times faster), and sixteen took 45 s instead of 124 s (2.8 times, limited by the four physical cores), with results identical to the sequential runs.</w:t>
       </w:r>
     </w:p>
     <w:p>
@@ -8301,7 +8259,7 @@
         <w:fldChar w:fldCharType="begin"/>
       </w:r>
       <w:r>
-        <w:instrText xml:space="preserve"> ADDIN EN.CITE &lt;EndNote&gt;&lt;Cite&gt;&lt;Author&gt;Hardy&lt;/Author&gt;&lt;Year&gt;2024&lt;/Year&gt;&lt;RecNum&gt;29&lt;/RecNum&gt;&lt;DisplayText&gt;[18]&lt;/DisplayText&gt;&lt;record&gt;&lt;rec-number&gt;29&lt;/rec-number&gt;&lt;foreign-keys&gt;&lt;key app="EN" db-id="mdae8500109496fea4aff9c086e16cc25895" timestamp="1793185473"&gt;29&lt;/key&gt;&lt;/foreign-keys&gt;&lt;ref-type name="Journal Article"&gt;17&lt;/ref-type&gt;&lt;contributors&gt;&lt;authors&gt;&lt;author&gt;Hardy, Trevor D.&lt;/author&gt;&lt;author&gt;Palmintier, Bryan&lt;/author&gt;&lt;author&gt;Top, Philip L.&lt;/author&gt;&lt;author&gt;Krishnamurthy, Dheepak&lt;/author&gt;&lt;author&gt;Fuller, Jason C.&lt;/author&gt;&lt;/authors&gt;&lt;/contributors&gt;&lt;titles&gt;&lt;title&gt;HELICS: A Co-Simulation Framework for Scalable Multi-Domain Modeling and Analysis&lt;/title&gt;&lt;secondary-title&gt;IEEE Access&lt;/secondary-title&gt;&lt;alt-title&gt;IEEE Access&lt;/alt-title&gt;&lt;/titles&gt;&lt;periodical&gt;&lt;full-title&gt;IEEE Access&lt;/full-title&gt;&lt;abbr-1&gt;IEEE Access&lt;/abbr-1&gt;&lt;/periodical&gt;&lt;pages&gt;24325-24347&lt;/pages&gt;&lt;volume&gt;12&lt;/volume&gt;&lt;dates&gt;&lt;year&gt;2024&lt;/year&gt;&lt;/dates&gt;&lt;publisher&gt;IEEE&lt;/publisher&gt;&lt;label&gt;hardy2024&lt;/label&gt;&lt;urls&gt;&lt;/urls&gt;&lt;electronic-resource-num&gt;10.1109/ACCESS.2024.3363615&lt;/electronic-resource-num&gt;&lt;/record&gt;&lt;/Cite&gt;&lt;/EndNote&gt;</w:instrText>
+        <w:instrText xml:space="preserve"> ADDIN EN.CITE &lt;EndNote&gt;&lt;Cite&gt;&lt;Author&gt;Hardy&lt;/Author&gt;&lt;Year&gt;2024&lt;/Year&gt;&lt;RecNum&gt;29&lt;/RecNum&gt;&lt;DisplayText&gt;[18]&lt;/DisplayText&gt;&lt;record&gt;&lt;rec-number&gt;29&lt;/rec-number&gt;&lt;foreign-keys&gt;&lt;key app="EN" db-id="mdae8500109496fea4aff9c086e16cc25895" timestamp="1793216821"&gt;29&lt;/key&gt;&lt;/foreign-keys&gt;&lt;ref-type name="Journal Article"&gt;17&lt;/ref-type&gt;&lt;contributors&gt;&lt;authors&gt;&lt;author&gt;Hardy, Trevor D.&lt;/author&gt;&lt;author&gt;Palmintier, Bryan&lt;/author&gt;&lt;author&gt;Top, Philip L.&lt;/author&gt;&lt;author&gt;Krishnamurthy, Dheepak&lt;/author&gt;&lt;author&gt;Fuller, Jason C.&lt;/author&gt;&lt;/authors&gt;&lt;/contributors&gt;&lt;titles&gt;&lt;title&gt;HELICS: A Co-Simulation Framework for Scalable Multi-Domain Modeling and Analysis&lt;/title&gt;&lt;secondary-title&gt;IEEE Access&lt;/secondary-title&gt;&lt;alt-title&gt;IEEE Access&lt;/alt-title&gt;&lt;/titles&gt;&lt;periodical&gt;&lt;full-title&gt;IEEE Access&lt;/full-title&gt;&lt;abbr-1&gt;IEEE Access&lt;/abbr-1&gt;&lt;/periodical&gt;&lt;pages&gt;24325-24347&lt;/pages&gt;&lt;volume&gt;12&lt;/volume&gt;&lt;dates&gt;&lt;year&gt;2024&lt;/year&gt;&lt;/dates&gt;&lt;publisher&gt;IEEE&lt;/publisher&gt;&lt;label&gt;hardy2024&lt;/label&gt;&lt;urls&gt;&lt;/urls&gt;&lt;electronic-resource-num&gt;10.1109/ACCESS.2024.3363615&lt;/electronic-resource-num&gt;&lt;/record&gt;&lt;/Cite&gt;&lt;/EndNote&gt;</w:instrText>
       </w:r>
       <w:r>
         <w:fldChar w:fldCharType="separate"/>
@@ -8325,13 +8283,13 @@
         <w:t xml:space="preserve">wait_for_current_time_update</w:t>
       </w:r>
       <w:r>
-        <w:t xml:space="preserve"> option on the building and meter federates, HELICS reproduced the naive Py-CoSim run bit for bit over all 672 steps (power, set-point and price identical; cost difference 10</w:t>
+        <w:t xml:space="preserve"> option on the building and meter federates, HELICS reproduced the Py-CoSim run with latest-value reads bit for bit over all 672 steps (power, set-point and price identical; cost difference 10</w:t>
       </w:r>
       <w:r>
         <w:rPr>
           <w:vertAlign w:val="superscript"/>
         </w:rPr>
-        <w:t xml:space="preserve">âˆ’14</w:t>
+        <w:t xml:space="preserve">−14</w:t>
       </w:r>
       <w:r>
         <w:t xml:space="preserve"> $). Without that option, every link lagged by one period and the set-point took effect 15 min late.</w:t>
@@ -8390,7 +8348,7 @@
         <w:pStyle w:val="BodyText"/>
       </w:pPr>
       <w:r>
-        <w:t xml:space="preserve">The last experiment shows what alignment changes in a typical study. Ten small offices (floor areas varied by ±10 %), each a separate EnergyPlus instance in its own worker process, share a 250 kW PV array, a 500 kWh battery and one grid connection under a TOU tariff (0.30 $/kWh from 16:00 to 21:00 on weekdays, 0.08 $/kWh otherwise). Four strategies are compared over the test week: a baseline, pre-cooling of all offices before the price peak, a battery that charges from PV surplus, discharges on peak and shaves the import above 120 kW, and both together (coordinated). Every strategy is run twice. In the naive version, a helper component adds the latest building, PV and battery powers and the meter multiplies the sum by the latest price, as in the Py-CoSim 2.0 version of this example. In the aligned version, the meter subscribes to all buildings with the pattern </w:t>
+        <w:t xml:space="preserve">The last experiment shows what alignment changes in a typical study. Ten small offices (floor areas varied by ±10 %), each a separate EnergyPlus instance in its own worker process, share a 250 kW PV array, a 500 kWh battery and one grid connection under a TOU tariff (0.30 $/kWh from 16:00 to 21:00 on weekdays, 0.08 $/kWh otherwise). Four strategies are compared over the test week: a baseline, pre-cooling of all offices before the price peak, a battery that charges from PV surplus, discharges on peak and shaves the import above 120 kW, and both together (coordinated). Every strategy is run twice. In the naive version, a helper component adds the latest building, PV and battery powers and the meter multiplies the sum by the latest price, as is common practice. In the aligned version, the meter subscribes to all buildings with the pattern </w:t>
       </w:r>
       <w:r>
         <w:rPr>
@@ -8428,7 +8386,7 @@
         <w:fldChar w:fldCharType="end"/>
       </w:r>
       <w:r>
-        <w:t xml:space="preserve">). With naive coupling, the coordinated strategy reduces the energy cost by 32.7 % and the on-peak import by 83.3 %, and its peak import equals the battery’s import limit of 120 kW exactly. With aligned coupling, the reductions are 30.1 % and 79.5 %, and the peak import is 135 kW. The naive meter adds the battery power that the controller chose for the coming 15 min to the net load of the 15 min that just ended, which is the very load the controller reacted to; it therefore credits the controller with perfect foresight. The aligned meter adds the battery power to the interval in which it actually flowed, exposing the controller’s one-step lag. For the pre-cooling strategy, which has no battery, the two versions differ by less than 1 percentage point in cost savings. The results of Py-CoSim 2.0 for this example, which used the naive wiring, overstated the benefits of the battery strategies accordingly.</w:t>
+        <w:t xml:space="preserve">). With naive coupling, the coordinated strategy reduces the energy cost by 32.7 % and the on-peak import by 83.3 %, and its peak import equals the battery’s import limit of 120 kW exactly. With aligned coupling, the reductions are 30.1 % and 79.5 %, and the peak import is 135 kW. The naive meter adds the battery power that the controller chose for the coming 15 min to the net load of the 15 min that just ended, which is the very load the controller reacted to; it therefore credits the controller with perfect foresight. The aligned meter adds the battery power to the interval in which it actually flowed, exposing the controller’s one-step lag. For the pre-cooling strategy, which has no battery, the two versions differ by less than 1 percentage point in cost savings. Any study that exchanges latest values would overstate the benefits of such battery strategies in the same way.</w:t>
       </w:r>
     </w:p>
     <w:p>
@@ -8440,7 +8398,7 @@
           <wp:inline distT="0" distB="0" distL="0" distR="0">
             <wp:extent cx="5580000" cy="2195138"/>
             <wp:effectExtent l="0" t="0" r="0" b="0"/>
-            <wp:docPr id="7" name="Figure 7" descr="Community of ten EnergyPlus offices with PV and a battery under four strategies, with naive and SMMM-aligned metering: (a) energy cost and (b) on-peak grid import relative to the baseline; (c) peak 15"/>
+            <wp:docPr id="7" name="Figure 7" descr="Community of ten EnergyPlus offices with PV and a battery under four strategies, with naive and aligned metering: (a) energy cost and (b) on-peak grid import relative to the baseline; (c) peak 15-min "/>
             <wp:cNvGraphicFramePr>
               <a:graphicFrameLocks noChangeAspect="1"/>
             </wp:cNvGraphicFramePr>
@@ -8532,7 +8490,7 @@
         <w:t xml:space="preserve"> </w:t>
       </w:r>
       <w:r>
-        <w:t xml:space="preserve">Community of ten EnergyPlus offices with PV and a battery under four strategies, with naive and SMMM-aligned metering: (a) energy cost and (b) on-peak grid import relative to the baseline; (c) peak 15-min grid import, with the battery controller’s import limit.</w:t>
+        <w:t xml:space="preserve">Community of ten EnergyPlus offices with PV and a battery under four strategies, with naive and aligned metering: (a) energy cost and (b) on-peak grid import relative to the baseline; (c) peak 15-min grid import, with the battery controller’s import limit.</w:t>
       </w:r>
     </w:p>
     <w:p>
@@ -8566,7 +8524,7 @@
 UmVjTnVtPjQ3PC9SZWNOdW0+PERpc3BsYXlUZXh0Pls3LDIyXTwvRGlzcGxheVRleHQ+PHJlY29y
 ZD48cmVjLW51bWJlcj40NzwvcmVjLW51bWJlcj48Zm9yZWlnbi1rZXlzPjxrZXkgYXBwPSJFTiIg
 ZGItaWQ9Im1kYWU4NTAwMTA5NDk2ZmVhNGFmZjljMDg2ZTE2Y2MyNTg5NSIgdGltZXN0YW1wPSIx
-NzkzMTg1NDczIj40Nzwva2V5PjwvZm9yZWlnbi1rZXlzPjxyZWYtdHlwZSBuYW1lPSJKb3VybmFs
+NzkzMjE2ODIxIj40Nzwva2V5PjwvZm9yZWlnbi1rZXlzPjxyZWYtdHlwZSBuYW1lPSJKb3VybmFs
 IEFydGljbGUiPjE3PC9yZWYtdHlwZT48Y29udHJpYnV0b3JzPjxhdXRob3JzPjxhdXRob3I+S8O8
 YmxlciwgUi48L2F1dGhvcj48YXV0aG9yPlNjaGllaGxlbiwgVy48L2F1dGhvcj48L2F1dGhvcnM+
 PC9jb250cmlidXRvcnM+PHRpdGxlcz48dGl0bGU+VHdvIE1ldGhvZHMgb2YgU2ltdWxhdG9yIENv
@@ -8583,7 +8541,7 @@
 c291cmNlLW51bT48L3JlY29yZD48L0NpdGU+PENpdGU+PEF1dGhvcj5Hb21lczwvQXV0aG9yPjxZ
 ZWFyPjIwMTg8L1llYXI+PFJlY051bT4yNjwvUmVjTnVtPjxyZWNvcmQ+PHJlYy1udW1iZXI+MjY8
 L3JlYy1udW1iZXI+PGZvcmVpZ24ta2V5cz48a2V5IGFwcD0iRU4iIGRiLWlkPSJtZGFlODUwMDEw
-OTQ5NmZlYTRhZmY5YzA4NmUxNmNjMjU4OTUiIHRpbWVzdGFtcD0iMTc5MzE4NTQ3MyI+MjY8L2tl
+OTQ5NmZlYTRhZmY5YzA4NmUxNmNjMjU4OTUiIHRpbWVzdGFtcD0iMTc5MzIxNjgyMSI+MjY8L2tl
 eT48L2ZvcmVpZ24ta2V5cz48cmVmLXR5cGUgbmFtZT0iSm91cm5hbCBBcnRpY2xlIj4xNzwvcmVm
 LXR5cGU+PGNvbnRyaWJ1dG9ycz48YXV0aG9ycz48YXV0aG9yPkdvbWVzLCBDbMOhdWRpbzwvYXV0
 aG9yPjxhdXRob3I+VGh1bGUsIENhc3BlcjwvYXV0aG9yPjxhdXRob3I+QnJvbWFuLCBEYXZpZDwv
@@ -8609,7 +8567,7 @@
 UmVjTnVtPjQ3PC9SZWNOdW0+PERpc3BsYXlUZXh0Pls3LDIyXTwvRGlzcGxheVRleHQ+PHJlY29y
 ZD48cmVjLW51bWJlcj40NzwvcmVjLW51bWJlcj48Zm9yZWlnbi1rZXlzPjxrZXkgYXBwPSJFTiIg
 ZGItaWQ9Im1kYWU4NTAwMTA5NDk2ZmVhNGFmZjljMDg2ZTE2Y2MyNTg5NSIgdGltZXN0YW1wPSIx
-NzkzMTg1NDczIj40Nzwva2V5PjwvZm9yZWlnbi1rZXlzPjxyZWYtdHlwZSBuYW1lPSJKb3VybmFs
+NzkzMjE2ODIxIj40Nzwva2V5PjwvZm9yZWlnbi1rZXlzPjxyZWYtdHlwZSBuYW1lPSJKb3VybmFs
 IEFydGljbGUiPjE3PC9yZWYtdHlwZT48Y29udHJpYnV0b3JzPjxhdXRob3JzPjxhdXRob3I+S8O8
 YmxlciwgUi48L2F1dGhvcj48YXV0aG9yPlNjaGllaGxlbiwgVy48L2F1dGhvcj48L2F1dGhvcnM+
 PC9jb250cmlidXRvcnM+PHRpdGxlcz48dGl0bGU+VHdvIE1ldGhvZHMgb2YgU2ltdWxhdG9yIENv
@@ -8626,7 +8584,7 @@
 c291cmNlLW51bT48L3JlY29yZD48L0NpdGU+PENpdGU+PEF1dGhvcj5Hb21lczwvQXV0aG9yPjxZ
 ZWFyPjIwMTg8L1llYXI+PFJlY051bT4yNjwvUmVjTnVtPjxyZWNvcmQ+PHJlYy1udW1iZXI+MjY8
 L3JlYy1udW1iZXI+PGZvcmVpZ24ta2V5cz48a2V5IGFwcD0iRU4iIGRiLWlkPSJtZGFlODUwMDEw
-OTQ5NmZlYTRhZmY5YzA4NmUxNmNjMjU4OTUiIHRpbWVzdGFtcD0iMTc5MzE4NTQ3MyI+MjY8L2tl
+OTQ5NmZlYTRhZmY5YzA4NmUxNmNjMjU4OTUiIHRpbWVzdGFtcD0iMTc5MzIxNjgyMSI+MjY8L2tl
 eT48L2ZvcmVpZ24ta2V5cz48cmVmLXR5cGUgbmFtZT0iSm91cm5hbCBBcnRpY2xlIj4xNzwvcmVm
 LXR5cGU+PGNvbnRyaWJ1dG9ycz48YXV0aG9ycz48YXV0aG9yPkdvbWVzLCBDbMOhdWRpbzwvYXV0
 aG9yPjxhdXRob3I+VGh1bGUsIENhc3BlcjwvYXV0aG9yPjxhdXRob3I+QnJvbWFuLCBEYXZpZDwv
@@ -8668,7 +8626,7 @@
         <w:fldChar w:fldCharType="begin"/>
       </w:r>
       <w:r>
-        <w:instrText xml:space="preserve"> ADDIN EN.CITE &lt;EndNote&gt;&lt;Cite&gt;&lt;Author&gt;Eaton&lt;/Author&gt;&lt;Year&gt;2023&lt;/Year&gt;&lt;RecNum&gt;10&lt;/RecNum&gt;&lt;DisplayText&gt;[49]&lt;/DisplayText&gt;&lt;record&gt;&lt;rec-number&gt;10&lt;/rec-number&gt;&lt;foreign-keys&gt;&lt;key app="EN" db-id="mdae8500109496fea4aff9c086e16cc25895" timestamp="1793185473"&gt;10&lt;/key&gt;&lt;/foreign-keys&gt;&lt;ref-type name="Web Page"&gt;12&lt;/ref-type&gt;&lt;contributors&gt;&lt;authors&gt;&lt;author&gt;Eaton, Brian&lt;/author&gt;&lt;author&gt;Gregory, Jonathan&lt;/author&gt;&lt;author&gt;Drach, Bob&lt;/author&gt;&lt;author&gt;Taylor, Karl&lt;/author&gt;&lt;author&gt;Hankin, Steve&lt;/author&gt;&lt;author&gt;Blower, Jon&lt;/author&gt;&lt;author&gt;Caron, John&lt;/author&gt;&lt;author&gt;Signell, Rich&lt;/author&gt;&lt;author&gt;Bentley, Phil&lt;/author&gt;&lt;author&gt;Rappa, Greg&lt;/author&gt;&lt;author&gt;Höck, Heinke&lt;/author&gt;&lt;author&gt;Pamment, Alison&lt;/author&gt;&lt;author&gt;Juckes, Martin&lt;/author&gt;&lt;author&gt;Raspaud, Martin&lt;/author&gt;&lt;author&gt;Horne, Randy&lt;/author&gt;&lt;author&gt;Whiteaker, Timothy&lt;/author&gt;&lt;author&gt;Blodgett, David&lt;/author&gt;&lt;author&gt;Zender, Charlie&lt;/author&gt;&lt;author&gt;Lee, Daniel&lt;/author&gt;&lt;author&gt;Hassell, David&lt;/author&gt;&lt;author&gt;Snow, Alan D.&lt;/author&gt;&lt;author&gt;Kölling, Tobias&lt;/author&gt;&lt;author&gt;Allured, Dave&lt;/author&gt;&lt;author&gt;Jelenak, Aleksandar&lt;/author&gt;&lt;author&gt;Meier Soerensen, Anders&lt;/author&gt;&lt;author&gt;Gaultier, Lucile&lt;/author&gt;&lt;author&gt;Herlédan, Sylvain&lt;/author&gt;&lt;author&gt;Manzano, Fernando&lt;/author&gt;&lt;author&gt;Bärring, Lars&lt;/author&gt;&lt;author&gt;Barker, Christopher&lt;/author&gt;&lt;author&gt;Bartholomew, Sadie&lt;/author&gt;&lt;/authors&gt;&lt;/contributors&gt;&lt;titles&gt;&lt;title&gt;NetCDF Climate and Forecast (CF) Metadata Conventions&lt;/title&gt;&lt;/titles&gt;&lt;dates&gt;&lt;year&gt;2023&lt;/year&gt;&lt;/dates&gt;&lt;label&gt;cf2023&lt;/label&gt;&lt;urls&gt;&lt;related-urls&gt;&lt;url&gt;https://cfconventions.org/Data/cf-conventions/cf-conventions-1.11/cf-conventions.html&lt;/url&gt;&lt;/related-urls&gt;&lt;/urls&gt;&lt;access-date&gt;2026-10-28&lt;/access-date&gt;&lt;/record&gt;&lt;/Cite&gt;&lt;/EndNote&gt;</w:instrText>
+        <w:instrText xml:space="preserve"> ADDIN EN.CITE &lt;EndNote&gt;&lt;Cite&gt;&lt;Author&gt;Eaton&lt;/Author&gt;&lt;Year&gt;2023&lt;/Year&gt;&lt;RecNum&gt;10&lt;/RecNum&gt;&lt;DisplayText&gt;[48]&lt;/DisplayText&gt;&lt;record&gt;&lt;rec-number&gt;10&lt;/rec-number&gt;&lt;foreign-keys&gt;&lt;key app="EN" db-id="mdae8500109496fea4aff9c086e16cc25895" timestamp="1793216821"&gt;10&lt;/key&gt;&lt;/foreign-keys&gt;&lt;ref-type name="Web Page"&gt;12&lt;/ref-type&gt;&lt;contributors&gt;&lt;authors&gt;&lt;author&gt;Eaton, Brian&lt;/author&gt;&lt;author&gt;Gregory, Jonathan&lt;/author&gt;&lt;author&gt;Drach, Bob&lt;/author&gt;&lt;author&gt;Taylor, Karl&lt;/author&gt;&lt;author&gt;Hankin, Steve&lt;/author&gt;&lt;author&gt;Blower, Jon&lt;/author&gt;&lt;author&gt;Caron, John&lt;/author&gt;&lt;author&gt;Signell, Rich&lt;/author&gt;&lt;author&gt;Bentley, Phil&lt;/author&gt;&lt;author&gt;Rappa, Greg&lt;/author&gt;&lt;author&gt;Höck, Heinke&lt;/author&gt;&lt;author&gt;Pamment, Alison&lt;/author&gt;&lt;author&gt;Juckes, Martin&lt;/author&gt;&lt;author&gt;Raspaud, Martin&lt;/author&gt;&lt;author&gt;Horne, Randy&lt;/author&gt;&lt;author&gt;Whiteaker, Timothy&lt;/author&gt;&lt;author&gt;Blodgett, David&lt;/author&gt;&lt;author&gt;Zender, Charlie&lt;/author&gt;&lt;author&gt;Lee, Daniel&lt;/author&gt;&lt;author&gt;Hassell, David&lt;/author&gt;&lt;author&gt;Snow, Alan D.&lt;/author&gt;&lt;author&gt;Kölling, Tobias&lt;/author&gt;&lt;author&gt;Allured, Dave&lt;/author&gt;&lt;author&gt;Jelenak, Aleksandar&lt;/author&gt;&lt;author&gt;Meier Soerensen, Anders&lt;/author&gt;&lt;author&gt;Gaultier, Lucile&lt;/author&gt;&lt;author&gt;Herlédan, Sylvain&lt;/author&gt;&lt;author&gt;Manzano, Fernando&lt;/author&gt;&lt;author&gt;Bärring, Lars&lt;/author&gt;&lt;author&gt;Barker, Christopher&lt;/author&gt;&lt;author&gt;Bartholomew, Sadie&lt;/author&gt;&lt;/authors&gt;&lt;/contributors&gt;&lt;titles&gt;&lt;title&gt;NetCDF Climate and Forecast (CF) Metadata Conventions&lt;/title&gt;&lt;/titles&gt;&lt;dates&gt;&lt;year&gt;2023&lt;/year&gt;&lt;/dates&gt;&lt;label&gt;cf2023&lt;/label&gt;&lt;urls&gt;&lt;related-urls&gt;&lt;url&gt;https://cfconventions.org/Data/cf-conventions/cf-conventions-1.11/cf-conventions.html&lt;/url&gt;&lt;/related-urls&gt;&lt;/urls&gt;&lt;access-date&gt;2026-10-28&lt;/access-date&gt;&lt;/record&gt;&lt;/Cite&gt;&lt;/EndNote&gt;</w:instrText>
       </w:r>
       <w:r>
         <w:fldChar w:fldCharType="separate"/>
@@ -8677,13 +8635,13 @@
         <w:rPr>
           <w:noProof/>
         </w:rPr>
-        <w:t>[49]</w:t>
-      </w:r>
-      <w:r>
-        <w:fldChar w:fldCharType="end"/>
-      </w:r>
-      <w:r>
-        <w:t xml:space="preserve">. Second, SMMM converts piecewise-constant and piecewise-linear signals exactly, which removed the interval-mismatch error whenever the consumer was not faster than the producer (</w:t>
+        <w:t>[48]</w:t>
+      </w:r>
+      <w:r>
+        <w:fldChar w:fldCharType="end"/>
+      </w:r>
+      <w:r>
+        <w:t xml:space="preserve">. Second, TIDE converts piecewise-constant and piecewise-linear signals exactly, which removed the interval-mismatch error whenever the consumer was not faster than the producer (</w:t>
       </w:r>
       <w:r>
         <w:t xml:space="preserve">Section 5.3</w:t>
@@ -8697,15 +8655,15 @@
         <w:pStyle w:val="BodyText"/>
       </w:pPr>
       <w:r>
-        <w:t xml:space="preserve">Alignment does not make an explicit co-simulation exact. SMMM aligns the data a component reads; it does not iterate between components or roll them back, so the physical coupling error of a feedback loop that is closed only every exchange step remains. Energy-residual methods such as NEPCE and power bonds address that error and are complementary </w:t>
+        <w:t xml:space="preserve">Alignment does not make an explicit co-simulation exact. TIDE aligns the data a component reads; it does not iterate between components or roll them back, so the physical coupling error of a feedback loop that is closed only every exchange step remains. Energy-residual methods such as NEPCE and power bonds address that error and are complementary </w:t>
       </w:r>
       <w:r>
         <w:fldChar w:fldCharType="begin">
           <w:fldData xml:space="preserve">PEVuZE5vdGU+PENpdGU+PEF1dGhvcj5CZW5lZGlrdDwvQXV0aG9yPjxZZWFyPjIwMTM8L1llYXI+
-PFJlY051bT4zPC9SZWNOdW0+PERpc3BsYXlUZXh0PlszMSwzMl08L0Rpc3BsYXlUZXh0PjxyZWNv
+PFJlY051bT4zPC9SZWNOdW0+PERpc3BsYXlUZXh0PlszMCwzMV08L0Rpc3BsYXlUZXh0PjxyZWNv
 cmQ+PHJlYy1udW1iZXI+MzwvcmVjLW51bWJlcj48Zm9yZWlnbi1rZXlzPjxrZXkgYXBwPSJFTiIg
 ZGItaWQ9Im1kYWU4NTAwMTA5NDk2ZmVhNGFmZjljMDg2ZTE2Y2MyNTg5NSIgdGltZXN0YW1wPSIx
-NzkzMTg1NDczIj4zPC9rZXk+PC9mb3JlaWduLWtleXM+PHJlZi10eXBlIG5hbWU9IkNvbmZlcmVu
+NzkzMjE2ODIxIj4zPC9rZXk+PC9mb3JlaWduLWtleXM+PHJlZi10eXBlIG5hbWU9IkNvbmZlcmVu
 Y2UgUGFwZXIiPjQ3PC9yZWYtdHlwZT48Y29udHJpYnV0b3JzPjxhdXRob3JzPjxhdXRob3I+QmVu
 ZWRpa3QsIE0uPC9hdXRob3I+PGF1dGhvcj5XYXR6ZW5pZywgRC48L2F1dGhvcj48YXV0aG9yPlpl
 aGV0bmVyLCBKLjwvYXV0aG9yPjxhdXRob3I+SG9mZXIsIEEuPC9hdXRob3I+PC9hdXRob3JzPjwv
@@ -8722,7 +8680,7 @@
 dXJscz48L3VybHM+PC9yZWNvcmQ+PC9DaXRlPjxDaXRlPjxBdXRob3I+U2FkamluYTwvQXV0aG9y
 PjxZZWFyPjIwMTc8L1llYXI+PFJlY051bT43MTwvUmVjTnVtPjxyZWNvcmQ+PHJlYy1udW1iZXI+
 NzE8L3JlYy1udW1iZXI+PGZvcmVpZ24ta2V5cz48a2V5IGFwcD0iRU4iIGRiLWlkPSJtZGFlODUw
-MDEwOTQ5NmZlYTRhZmY5YzA4NmUxNmNjMjU4OTUiIHRpbWVzdGFtcD0iMTc5MzE4NTQ3MyI+NzE8
+MDEwOTQ5NmZlYTRhZmY5YzA4NmUxNmNjMjU4OTUiIHRpbWVzdGFtcD0iMTc5MzIxNjgyMSI+NzE8
 L2tleT48L2ZvcmVpZ24ta2V5cz48cmVmLXR5cGUgbmFtZT0iSm91cm5hbCBBcnRpY2xlIj4xNzwv
 cmVmLXR5cGU+PGNvbnRyaWJ1dG9ycz48YXV0aG9ycz48YXV0aG9yPlNhZGppbmEsIFNldmVyaW48
 L2F1dGhvcj48YXV0aG9yPkt5bGxpbmdzdGFkLCBMYXJzIFQuPC9hdXRob3I+PGF1dGhvcj5Ta2pv
@@ -8747,10 +8705,10 @@
       <w:r>
         <w:fldChar w:fldCharType="begin">
           <w:fldData xml:space="preserve">PEVuZE5vdGU+PENpdGU+PEF1dGhvcj5CZW5lZGlrdDwvQXV0aG9yPjxZZWFyPjIwMTM8L1llYXI+
-PFJlY051bT4zPC9SZWNOdW0+PERpc3BsYXlUZXh0PlszMSwzMl08L0Rpc3BsYXlUZXh0PjxyZWNv
+PFJlY051bT4zPC9SZWNOdW0+PERpc3BsYXlUZXh0PlszMCwzMV08L0Rpc3BsYXlUZXh0PjxyZWNv
 cmQ+PHJlYy1udW1iZXI+MzwvcmVjLW51bWJlcj48Zm9yZWlnbi1rZXlzPjxrZXkgYXBwPSJFTiIg
 ZGItaWQ9Im1kYWU4NTAwMTA5NDk2ZmVhNGFmZjljMDg2ZTE2Y2MyNTg5NSIgdGltZXN0YW1wPSIx
-NzkzMTg1NDczIj4zPC9rZXk+PC9mb3JlaWduLWtleXM+PHJlZi10eXBlIG5hbWU9IkNvbmZlcmVu
+NzkzMjE2ODIxIj4zPC9rZXk+PC9mb3JlaWduLWtleXM+PHJlZi10eXBlIG5hbWU9IkNvbmZlcmVu
 Y2UgUGFwZXIiPjQ3PC9yZWYtdHlwZT48Y29udHJpYnV0b3JzPjxhdXRob3JzPjxhdXRob3I+QmVu
 ZWRpa3QsIE0uPC9hdXRob3I+PGF1dGhvcj5XYXR6ZW5pZywgRC48L2F1dGhvcj48YXV0aG9yPlpl
 aGV0bmVyLCBKLjwvYXV0aG9yPjxhdXRob3I+SG9mZXIsIEEuPC9hdXRob3I+PC9hdXRob3JzPjwv
@@ -8767,7 +8725,7 @@
 dXJscz48L3VybHM+PC9yZWNvcmQ+PC9DaXRlPjxDaXRlPjxBdXRob3I+U2FkamluYTwvQXV0aG9y
 PjxZZWFyPjIwMTc8L1llYXI+PFJlY051bT43MTwvUmVjTnVtPjxyZWNvcmQ+PHJlYy1udW1iZXI+
 NzE8L3JlYy1udW1iZXI+PGZvcmVpZ24ta2V5cz48a2V5IGFwcD0iRU4iIGRiLWlkPSJtZGFlODUw
-MDEwOTQ5NmZlYTRhZmY5YzA4NmUxNmNjMjU4OTUiIHRpbWVzdGFtcD0iMTc5MzE4NTQ3MyI+NzE8
+MDEwOTQ5NmZlYTRhZmY5YzA4NmUxNmNjMjU4OTUiIHRpbWVzdGFtcD0iMTc5MzIxNjgyMSI+NzE8
 L2tleT48L2ZvcmVpZ24ta2V5cz48cmVmLXR5cGUgbmFtZT0iSm91cm5hbCBBcnRpY2xlIj4xNzwv
 cmVmLXR5cGU+PGNvbnRyaWJ1dG9ycz48YXV0aG9ycz48YXV0aG9yPlNhZGppbmEsIFNldmVyaW48
 L2F1dGhvcj48YXV0aG9yPkt5bGxpbmdzdGFkLCBMYXJzIFQuPC9hdXRob3I+PGF1dGhvcj5Ta2pv
@@ -8799,13 +8757,13 @@
         <w:rPr>
           <w:noProof/>
         </w:rPr>
-        <w:t>[31,32]</w:t>
-      </w:r>
-      <w:r>
-        <w:fldChar w:fldCharType="end"/>
-      </w:r>
-      <w:r>
-        <w:t xml:space="preserve">. Within a consumer’s step, SMMM can only deliver aggregates: the product of a rapidly changing price and a rapidly changing load needs a consumer step at least as fine as the price changes (</w:t>
+        <w:t>[30,31]</w:t>
+      </w:r>
+      <w:r>
+        <w:fldChar w:fldCharType="end"/>
+      </w:r>
+      <w:r>
+        <w:t xml:space="preserve">. Within a consumer’s step, TIDE can only deliver aggregates: the product of a rapidly changing price and a rapidly changing load needs a consumer step at least as fine as the price changes (</w:t>
       </w:r>
       <w:r>
         <w:t xml:space="preserve">Section 5.3</w:t>
@@ -8865,7 +8823,7 @@
         <w:pStyle w:val="BodyText"/>
       </w:pPr>
       <w:r>
-        <w:t xml:space="preserve">The evaluation uses stand-ins for LLM services that imitate sampling and latency; the infrastructure claims do not depend on the quality of the answers, but a study with a hosted model is still needed to report realistic latency distributions and failure rates. All experiments run on one computer with EnergyPlus 22.2, and asynchronous components run in threads, which suits remote services better than CPU-bound local models. SMMM runs in one Python process, with EnergyPlus instances in worker processes; distributing components over several machines, as HELICS and HLA do, and connecting components written in other languages are left for future work, as is exchanging units along with time meanings. The comparison with HELICS covers one scenario and measures what a typical user would write in each tool, not the best that each tool can do.</w:t>
+        <w:t xml:space="preserve">The evaluation uses stand-ins for LLM services that imitate sampling and latency; the infrastructure claims do not depend on the quality of the answers, but a study with a hosted model is still needed to report realistic latency distributions and failure rates. All experiments run on one computer with EnergyPlus 22.2, and asynchronous components run in threads, which suits remote services better than CPU-bound local models. TIDE runs in one Python process, with EnergyPlus instances in worker processes; distributing components over several machines, as HELICS and HLA do, and connecting components written in other languages are left for future work, as is exchanging units along with time meanings. The comparison with HELICS covers one scenario and measures what a typical user would write in each tool, not the best that each tool can do.</w:t>
       </w:r>
     </w:p>
     <w:p>
@@ -8883,7 +8841,7 @@
         <w:pStyle w:val="BodyText"/>
       </w:pPr>
       <w:r>
-        <w:t xml:space="preserve">This paper turned the message hub of Py-CoSim into a time-aware co-simulation method. Components exchange messages that state whether a value is an instantaneous sample, an interval average, an interval amount, a value held until replaced or an event, and over which interval it is valid; consumers state which window they need; the Simulation Management and Messaging Module aligns the data, flags its quality, records it for replay, traces its provenance and decides when the answers of slow components take effect. The main findings are:</w:t>
+        <w:t xml:space="preserve">This paper presented Py-CoSim, a co-simulation framework in which components exchange messages that state whether a value is an instantaneous sample, an interval average, an interval amount, a value held until replaced or an event, and over which interval it is valid; consumers state which window they need; and the time-aware hub, TIDE, aligns the data, flags its quality, records it for replay, traces its provenance and decides when the answers of slow components take effect. The main findings are:</w:t>
       </w:r>
     </w:p>
     <w:p>
@@ -8975,7 +8933,7 @@
         <w:pStyle w:val="BodyText"/>
       </w:pPr>
       <w:r>
-        <w:t xml:space="preserve">Building co-simulation increasingly brings together physics models, data and AI services that were never designed to work together. Agreeing on what exchanged values mean in time is a small step that removes a whole class of errors and makes the remaining ones visible. The source code, examples and all experiment scripts are openly available.</w:t>
+        <w:t xml:space="preserve">Building co-simulation increasingly brings together physics models, data and AI services that were never designed to work together. Agreeing on what exchanged values mean in time is a small step that removes a whole class of errors and makes the remaining ones visible. The source code, examples and all experiment scripts are openly available at https://github.com/lz356/Py-CoSim.</w:t>
       </w:r>
     </w:p>
     <w:p>
@@ -9344,7 +9302,7 @@
         <w:tab/>
       </w:r>
       <w:r>
-        <w:t xml:space="preserve">L. Zhang, S.M. Haroon, A. Ryan, Py-CoSim: Python-Based Building Energy Co-Simulation Infrastructure, SSRN, 2023. https://doi.org/10.2139/ssrn.4572925.</w:t>
+        <w:t xml:space="preserve">Modelica Association, System Structure and Parameterization (SSP), Version 2.0, 2024. https://ssp-standard.org/docs/2.0/.</w:t>
       </w:r>
     </w:p>
     <w:p>
@@ -9356,7 +9314,7 @@
         <w:tab/>
       </w:r>
       <w:r>
-        <w:t xml:space="preserve">Modelica Association, System Structure and Parameterization (SSP), Version 2.0, 2024. https://ssp-standard.org/docs/2.0/.</w:t>
+        <w:t xml:space="preserve">D. Broman, C. Brooks, L. Greenberg, E.A. Lee, M. Masin, S. Tripakis, M. Wetter, Determinate composition of FMUs for co-simulation, in: 2013 Proceedings of the International Conference on Embedded Software (EMSOFT), Montreal, QC, Canada, 2013, pp. 1–12. https://doi.org/10.1109/EMSOFT.2013.6658580.</w:t>
       </w:r>
     </w:p>
     <w:p>
@@ -9368,7 +9326,7 @@
         <w:tab/>
       </w:r>
       <w:r>
-        <w:t xml:space="preserve">D. Broman, C. Brooks, L. Greenberg, E.A. Lee, M. Masin, S. Tripakis, M. Wetter, Determinate composition of FMUs for co-simulation, in: 2013 Proceedings of the International Conference on Embedded Software (EMSOFT), Montreal, QC, Canada, 2013, pp. 1–12. https://doi.org/10.1109/EMSOFT.2013.6658580.</w:t>
+        <w:t xml:space="preserve">M. Benedikt, D. Watzenig, J. Zehetner, A. Hofer, NEPCE – a nearly energy-preserving coupling element for weak-coupled problems and co-simulations, in: V International Conference on Computational Methods for Coupled Problems in Science and Engineering (COUPLED 2013), Santa Eulàlia, Ibiza, Spain, 2013, pp. 1021–1032.</w:t>
       </w:r>
     </w:p>
     <w:p>
@@ -9380,7 +9338,7 @@
         <w:tab/>
       </w:r>
       <w:r>
-        <w:t xml:space="preserve">M. Benedikt, D. Watzenig, J. Zehetner, A. Hofer, NEPCE – a nearly energy-preserving coupling element for weak-coupled problems and co-simulations, in: V International Conference on Computational Methods for Coupled Problems in Science and Engineering (COUPLED 2013), Santa Eulàlia, Ibiza, Spain, 2013, pp. 1021–1032.</w:t>
+        <w:t xml:space="preserve">S. Sadjina, L.T. Kyllingstad, S. Skjong, E. Pedersen, Energy conservation and power bonds in co-simulations: non-iterative adaptive step size control and error estimation, Eng. Comput. 33 (2017) 607–620. https://doi.org/10.1007/s00366-016-0492-8.</w:t>
       </w:r>
     </w:p>
     <w:p>
@@ -9392,7 +9350,7 @@
         <w:tab/>
       </w:r>
       <w:r>
-        <w:t xml:space="preserve">S. Sadjina, L.T. Kyllingstad, S. Skjong, E. Pedersen, Energy conservation and power bonds in co-simulations: non-iterative adaptive step size control and error estimation, Eng. Comput. 33 (2017) 607–620. https://doi.org/10.1007/s00366-016-0492-8.</w:t>
+        <w:t xml:space="preserve">IEEE, IEEE Standard for Modeling and Simulation (M&amp;S) High Level Architecture (HLA) – Framework and Rules, IEEE Std 1516-2010, 2010. https://doi.org/10.1109/IEEESTD.2010.5553440.</w:t>
       </w:r>
     </w:p>
     <w:p>
@@ -9404,7 +9362,7 @@
         <w:tab/>
       </w:r>
       <w:r>
-        <w:t xml:space="preserve">IEEE, IEEE Standard for Modeling and Simulation (M&amp;S) High Level Architecture (HLA) – Framework and Rules, IEEE Std 1516-2010, 2010. https://doi.org/10.1109/IEEESTD.2010.5553440.</w:t>
+        <w:t xml:space="preserve">R.M. Fujimoto, Parallel and Distributed Simulation Systems, John Wiley &amp; Sons, 2000.</w:t>
       </w:r>
     </w:p>
     <w:p>
@@ -9416,7 +9374,7 @@
         <w:tab/>
       </w:r>
       <w:r>
-        <w:t xml:space="preserve">R.M. Fujimoto, Parallel and Distributed Simulation Systems, John Wiley &amp; Sons, 2000.</w:t>
+        <w:t xml:space="preserve">HELICS developers (GMLC-TDC), HELICS documentation, 2026. https://docs.helics.org/en/latest/ (accessed 2026-10-28).</w:t>
       </w:r>
     </w:p>
     <w:p>
@@ -9428,7 +9386,7 @@
         <w:tab/>
       </w:r>
       <w:r>
-        <w:t xml:space="preserve">HELICS developers (GMLC-TDC), HELICS documentation, 2026. https://docs.helics.org/en/latest/ (accessed 2026-10-28).</w:t>
+        <w:t xml:space="preserve">OFFIS, mosaik documentation, version 3.5.0, 2025. https://mosaik.readthedocs.io/en/3.5.0/ (accessed 2026-10-28).</w:t>
       </w:r>
     </w:p>
     <w:p>
@@ -9440,7 +9398,7 @@
         <w:tab/>
       </w:r>
       <w:r>
-        <w:t xml:space="preserve">OFFIS, mosaik documentation, version 3.5.0, 2025. https://mosaik.readthedocs.io/en/3.5.0/ (accessed 2026-10-28).</w:t>
+        <w:t xml:space="preserve">J. Wen, L. Jiang, Y. Chen, C.-C. Chu, J. Zhu, Z. Qiu, Design of Data Distributed Service-Based Distributed Co-Simulation Platform of Power Systems, IEEE Trans. Ind. Appl. 60 (2024) 8115–8127. https://doi.org/10.1109/TIA.2024.3429466.</w:t>
       </w:r>
     </w:p>
     <w:p>
@@ -9452,7 +9410,7 @@
         <w:tab/>
       </w:r>
       <w:r>
-        <w:t xml:space="preserve">J. Wen, L. Jiang, Y. Chen, C.-C. Chu, J. Zhu, Z. Qiu, Design of Data Distributed Service-Based Distributed Co-Simulation Platform of Power Systems, IEEE Trans. Ind. Appl. 60 (2024) 8115–8127. https://doi.org/10.1109/TIA.2024.3429466.</w:t>
+        <w:t xml:space="preserve">V. Paduani, R. Kadavil, H. Hooshyar, A. Haddadi, A.H.M. Jakaria, A. Huque, Real-Time T&amp;D Co-Simulation for Testing Grid Impact of High DER Participation, in: 2023 IEEE PES Grid Edge Technologies Conference &amp; Exposition (Grid Edge), San Diego, CA, USA, 2023, pp. 1–5. https://doi.org/10.1109/GridEdge54130.2023.10102714.</w:t>
       </w:r>
     </w:p>
     <w:p>
@@ -9464,7 +9422,7 @@
         <w:tab/>
       </w:r>
       <w:r>
-        <w:t xml:space="preserve">V. Paduani, R. Kadavil, H. Hooshyar, A. Haddadi, A.H.M. Jakaria, A. Huque, Real-Time T&amp;D Co-Simulation for Testing Grid Impact of High DER Participation, in: 2023 IEEE PES Grid Edge Technologies Conference &amp; Exposition (Grid Edge), San Diego, CA, USA, 2023, pp. 1–5. https://doi.org/10.1109/GridEdge54130.2023.10102714.</w:t>
+        <w:t xml:space="preserve">S. Katipamula, J. Haack, G. Hernandez, B. Akyol, J. Hagerman, VOLTTRON: An Open-Source Software Platform of the Future, IEEE Electrif. Mag. 4 (2016) 15–22. https://doi.org/10.1109/MELE.2016.2614178.</w:t>
       </w:r>
     </w:p>
     <w:p>
@@ -9476,7 +9434,7 @@
         <w:tab/>
       </w:r>
       <w:r>
-        <w:t xml:space="preserve">S. Katipamula, J. Haack, G. Hernandez, B. Akyol, J. Hagerman, VOLTTRON: An Open-Source Software Platform of the Future, IEEE Electrif. Mag. 4 (2016) 15–22. https://doi.org/10.1109/MELE.2016.2614178.</w:t>
+        <w:t xml:space="preserve">U.S. Department of Energy, EnergyPlus External Interface(s) Application Guide: BCVTB Examples, version 9.0, 2018. https://bigladdersoftware.com/epx/docs/9-0/external-interfaces-application-guide/bcvtb-examples.html (accessed 2026-10-28).</w:t>
       </w:r>
     </w:p>
     <w:p>
@@ -9488,7 +9446,7 @@
         <w:tab/>
       </w:r>
       <w:r>
-        <w:t xml:space="preserve">U.S. Department of Energy, EnergyPlus External Interface(s) Application Guide: BCVTB Examples, version 9.0, 2018. https://bigladdersoftware.com/epx/docs/9-0/external-interfaces-application-guide/bcvtb-examples.html (accessed 2026-10-28).</w:t>
+        <w:t xml:space="preserve">Lawrence Berkeley National Laboratory, FMU Export of EnergyPlus User Guide, Section 5: Usage of EnergyPlus as an FMU, 2021. https://simulationresearch.lbl.gov/fmu/EnergyPlus/export/userGuide/usage.html (accessed 2026-10-28).</w:t>
       </w:r>
     </w:p>
     <w:p>
@@ -9500,7 +9458,7 @@
         <w:tab/>
       </w:r>
       <w:r>
-        <w:t xml:space="preserve">Lawrence Berkeley National Laboratory, FMU Export of EnergyPlus User Guide, Section 5: Usage of EnergyPlus as an FMU, 2021. https://simulationresearch.lbl.gov/fmu/EnergyPlus/export/userGuide/usage.html (accessed 2026-10-28).</w:t>
+        <w:t xml:space="preserve">U.S. Department of Energy, EnergyPlus Input Output Reference: Group – Python Plugins / Python EMS, version 22.2, 2022. https://bigladdersoftware.com/epx/docs/22-2/input-output-reference/group-python-plugins.html (accessed 2026-10-28).</w:t>
       </w:r>
     </w:p>
     <w:p>
@@ -9512,7 +9470,7 @@
         <w:tab/>
       </w:r>
       <w:r>
-        <w:t xml:space="preserve">U.S. Department of Energy, EnergyPlus Input Output Reference: Group – Python Plugins / Python EMS, version 22.2, 2022. https://bigladdersoftware.com/epx/docs/22-2/input-output-reference/group-python-plugins.html (accessed 2026-10-28).</w:t>
+        <w:t xml:space="preserve">A. Campoy-Nieves, A. Manjavacas, J. Jiménez-Raboso, M. Molina-Solana, J. Gómez-Romero, Sinergym – A virtual testbed for building energy optimization with Reinforcement Learning, Energy Build. 327 (2025) 115075. https://doi.org/10.1016/j.enbuild.2024.115075.</w:t>
       </w:r>
     </w:p>
     <w:p>
@@ -9524,7 +9482,7 @@
         <w:tab/>
       </w:r>
       <w:r>
-        <w:t xml:space="preserve">A. Campoy-Nieves, A. Manjavacas, J. Jiménez-Raboso, M. Molina-Solana, J. Gómez-Romero, Sinergym – A virtual testbed for building energy optimization with Reinforcement Learning, Energy Build. 327 (2025) 115075. https://doi.org/10.1016/j.enbuild.2024.115075.</w:t>
+        <w:t xml:space="preserve">P. Scharnhorst, B. Schubnel, C. Fernández Bandera, J. Salom, P. Taddeo, M. Boegli, T. Gorecki, Y. Stauffer, A. Peppas, C. Politi, Energym: A Building Model Library for Controller Benchmarking, Appl. Sci. 11 (2021) 3518. https://doi.org/10.3390/app11083518.</w:t>
       </w:r>
     </w:p>
     <w:p>
@@ -9536,7 +9494,7 @@
         <w:tab/>
       </w:r>
       <w:r>
-        <w:t xml:space="preserve">P. Scharnhorst, B. Schubnel, C. Fernández Bandera, J. Salom, P. Taddeo, M. Boegli, T. Gorecki, Y. Stauffer, A. Peppas, C. Politi, Energym: A Building Model Library for Controller Benchmarking, Appl. Sci. 11 (2021) 3518. https://doi.org/10.3390/app11083518.</w:t>
+        <w:t xml:space="preserve">K. Nweye, K. Kaspar, G. Buscemi, T. Fonseca, G. Pinto, D. Ghose, S. Duddukuru, P. Pratapa, H. Li, J. Mohammadi, L. Lino Ferreira, T. Hong, M. Ouf, A. Capozzoli, Z. Nagy, CityLearn v2: energy-flexible, resilient, occupant-centric, and carbon-aware management of grid-interactive communities, J. Build. Perform. Simul. 18 (2025) 17–38. https://doi.org/10.1080/19401493.2024.2418813.</w:t>
       </w:r>
     </w:p>
     <w:p>
@@ -9548,7 +9506,7 @@
         <w:tab/>
       </w:r>
       <w:r>
-        <w:t xml:space="preserve">K. Nweye, K. Kaspar, G. Buscemi, T. Fonseca, G. Pinto, D. Ghose, S. Duddukuru, P. Pratapa, H. Li, J. Mohammadi, L. Lino Ferreira, T. Hong, M. Ouf, A. Capozzoli, Z. Nagy, CityLearn v2: energy-flexible, resilient, occupant-centric, and carbon-aware management of grid-interactive communities, J. Build. Perform. Simul. 18 (2025) 17–38. https://doi.org/10.1080/19401493.2024.2418813.</w:t>
+        <w:t xml:space="preserve">K. Benne, T. Shapinsky, A. Petersen, Alfalfa Virtual Building Service: Software Engineering Best Practices Applied to Runtime Interaction with Building Energy Models, IBPSA-USA SimBuild 2024 Conference, Denver, Colorado, 21–23 May 2024, National Renewable Energy Laboratory, Golden, CO, 2024. https://www.osti.gov/biblio/2407013.</w:t>
       </w:r>
     </w:p>
     <w:p>
@@ -9560,7 +9518,7 @@
         <w:tab/>
       </w:r>
       <w:r>
-        <w:t xml:space="preserve">K. Benne, T. Shapinsky, A. Petersen, Alfalfa Virtual Building Service: Software Engineering Best Practices Applied to Runtime Interaction with Building Energy Models, IBPSA-USA SimBuild 2024 Conference, Denver, Colorado, 21–23 May 2024, National Renewable Energy Laboratory, Golden, CO, 2024. https://www.osti.gov/biblio/2407013.</w:t>
+        <w:t xml:space="preserve">T. Sawada, M. Mizuno, T. Hasegawa, K. Yokoyama, M. Kono, Office-in-the-Loop: an investigation into Agentic AI for advanced building HVAC control systems, Data-Centric Eng. 6 (2025) e31. https://doi.org/10.1017/dce.2025.10010.</w:t>
       </w:r>
     </w:p>
     <w:p>
@@ -9572,7 +9530,7 @@
         <w:tab/>
       </w:r>
       <w:r>
-        <w:t xml:space="preserve">T. Sawada, M. Mizuno, T. Hasegawa, K. Yokoyama, M. Kono, Office-in-the-Loop: an investigation into Agentic AI for advanced building HVAC control systems, Data-Centric Eng. 6 (2025) e31. https://doi.org/10.1017/dce.2025.10010.</w:t>
+        <w:t xml:space="preserve">G. Jiang, Z. Ma, L. Zhang, J. Chen, EPlus-LLM: A large language model-based computing platform for automated building energy modeling, Appl. Energy 367 (2024) 123431. https://doi.org/10.1016/j.apenergy.2024.123431.</w:t>
       </w:r>
     </w:p>
     <w:p>
@@ -9584,7 +9542,7 @@
         <w:tab/>
       </w:r>
       <w:r>
-        <w:t xml:space="preserve">G. Jiang, Z. Ma, L. Zhang, J. Chen, EPlus-LLM: A large language model-based computing platform for automated building energy modeling, Appl. Energy 367 (2024) 123431. https://doi.org/10.1016/j.apenergy.2024.123431.</w:t>
+        <w:t xml:space="preserve">B. Eaton, J. Gregory, B. Drach, K. Taylor, S. Hankin, J. Blower, J. Caron, R. Signell, P. Bentley, G. Rappa, H. Höck, A. Pamment, M. Juckes, M. Raspaud, R. Horne, T. Whiteaker, D. Blodgett, C. Zender, D. Lee, D. Hassell, A.D. Snow, T. Kölling, D. Allured, A. Jelenak, A. Meier Soerensen, L. Gaultier, S. Herlédan, F. Manzano, L. Bärring, C. Barker, S. Bartholomew, NetCDF Climate and Forecast (CF) Metadata Conventions, version 1.11, 2023. https://cfconventions.org/Data/cf-conventions/cf-conventions-1.11/cf-conventions.html (accessed 2026-10-28).</w:t>
       </w:r>
     </w:p>
     <w:p>
@@ -9596,7 +9554,7 @@
         <w:tab/>
       </w:r>
       <w:r>
-        <w:t xml:space="preserve">B. Eaton, J. Gregory, B. Drach, K. Taylor, S. Hankin, J. Blower, J. Caron, R. Signell, P. Bentley, G. Rappa, H. Höck, A. Pamment, M. Juckes, M. Raspaud, R. Horne, T. Whiteaker, D. Blodgett, C. Zender, D. Lee, D. Hassell, A.D. Snow, T. Kölling, D. Allured, A. Jelenak, A. Meier Soerensen, L. Gaultier, S. Herlédan, F. Manzano, L. Bärring, C. Barker, S. Bartholomew, NetCDF Climate and Forecast (CF) Metadata Conventions, version 1.11, 2023. https://cfconventions.org/Data/cf-conventions/cf-conventions-1.11/cf-conventions.html (accessed 2026-10-28).</w:t>
+        <w:t xml:space="preserve">Open Geospatial Consortium, OGC WaterML 2.0: Part 1 – Timeseries, Version 2.0.1, OGC 10-126r4, 2014. https://docs.ogc.org/is/10-126r4/10-126r4.pdf.</w:t>
       </w:r>
     </w:p>
     <w:p>
@@ -9608,7 +9566,7 @@
         <w:tab/>
       </w:r>
       <w:r>
-        <w:t xml:space="preserve">Open Geospatial Consortium, OGC WaterML 2.0: Part 1 – Timeseries, Version 2.0.1, OGC 10-126r4, 2014. https://docs.ogc.org/is/10-126r4/10-126r4.pdf.</w:t>
+        <w:t xml:space="preserve">OPC Foundation, OPC Unified Architecture – Part 8: Data Access, OPC 10000-8, Release 1.05.07, 2026. https://reference.opcfoundation.org/specs/OPC-10000-8.</w:t>
       </w:r>
     </w:p>
     <w:p>
@@ -9620,7 +9578,7 @@
         <w:tab/>
       </w:r>
       <w:r>
-        <w:t xml:space="preserve">OPC Foundation, OPC Unified Architecture – Part 8: Data Access, OPC 10000-8, Release 1.05.07, 2026. https://reference.opcfoundation.org/specs/OPC-10000-8.</w:t>
+        <w:t xml:space="preserve">L. Moreau, P. Missier, PROV-DM: The PROV Data Model, W3C Recommendation, World Wide Web Consortium (W3C), 2013. https://www.w3.org/TR/2013/REC-prov-dm-20130430/.</w:t>
       </w:r>
     </w:p>
     <w:p>
@@ -9632,7 +9590,7 @@
         <w:tab/>
       </w:r>
       <w:r>
-        <w:t xml:space="preserve">L. Moreau, P. Missier, PROV-DM: The PROV Data Model, W3C Recommendation, World Wide Web Consortium (W3C), 2013. https://www.w3.org/TR/2013/REC-prov-dm-20130430/.</w:t>
+        <w:t xml:space="preserve">Y. Chen, S. Zhang, Q. Guo, L. Li, R. Wu, T. Chen, Deterministic Replay: A Survey, ACM Comput. Surv. 48 (2015) 1–47. https://doi.org/10.1145/2790077.</w:t>
       </w:r>
     </w:p>
     <w:p>
@@ -9644,7 +9602,7 @@
         <w:tab/>
       </w:r>
       <w:r>
-        <w:t xml:space="preserve">Y. Chen, S. Zhang, Q. Guo, L. Li, R. Wu, T. Chen, Deterministic Replay: A Survey, ACM Comput. Surv. 48 (2015) 1–47. https://doi.org/10.1145/2790077.</w:t>
+        <w:t xml:space="preserve">E. Feng, W. Zhou, Z. Liu, L. Chen, Y. Dong, C. Zhang, Y. Zhao, D. Du, Z. Hua, Y. Xia, H. Chen, Get Experience from Practice: LLM Agents with Record &amp; Replay, arXiv, 2025. https://doi.org/10.48550/arXiv.2505.17716.</w:t>
       </w:r>
     </w:p>
     <w:p>
@@ -9656,7 +9614,7 @@
         <w:tab/>
       </w:r>
       <w:r>
-        <w:t xml:space="preserve">E. Feng, W. Zhou, Z. Liu, L. Chen, Y. Dong, C. Zhang, Y. Zhao, D. Du, Z. Hua, Y. Xia, H. Chen, Get Experience from Practice: LLM Agents with Record &amp; Replay, arXiv, 2025. https://doi.org/10.48550/arXiv.2505.17716.</w:t>
+        <w:t xml:space="preserve">T.A. Henzinger, B. Horowitz, C.M. Kirsch, Giotto: a time-triggered language for embedded programming, Proc. IEEE 91 (2003) 84–99. https://doi.org/10.1109/JPROC.2002.805825.</w:t>
       </w:r>
     </w:p>
     <w:p>
@@ -9668,7 +9626,7 @@
         <w:tab/>
       </w:r>
       <w:r>
-        <w:t xml:space="preserve">T.A. Henzinger, B. Horowitz, C.M. Kirsch, Giotto: a time-triggered language for embedded programming, Proc. IEEE 91 (2003) 84–99. https://doi.org/10.1109/JPROC.2002.805825.</w:t>
+        <w:t xml:space="preserve">M. Lohstroh, C. Menard, S. Bateni, E.A. Lee, Toward a Lingua Franca for Deterministic Concurrent Systems, ACM Trans. Embed. Comput. Syst. 20 (2021) 1–27. https://doi.org/10.1145/3448128.</w:t>
       </w:r>
     </w:p>
     <w:p>
@@ -9680,7 +9638,7 @@
         <w:tab/>
       </w:r>
       <w:r>
-        <w:t xml:space="preserve">M. Lohstroh, C. Menard, S. Bateni, E.A. Lee, Toward a Lingua Franca for Deterministic Concurrent Systems, ACM Trans. Embed. Comput. Syst. 20 (2021) 1–27. https://doi.org/10.1145/3448128.</w:t>
+        <w:t xml:space="preserve">International Electrotechnical Commission, Communication networks and systems for power utility automation – Part 7-3: Basic communication structure – Common data classes, IEC 61850-7-3:2010, Edition 2.0, 2010. https://webstore.iec.ch/en/publication/6016.</w:t>
       </w:r>
     </w:p>
     <w:p>
@@ -9692,7 +9650,7 @@
         <w:tab/>
       </w:r>
       <w:r>
-        <w:t xml:space="preserve">International Electrotechnical Commission, Communication networks and systems for power utility automation – Part 7-3: Basic communication structure – Common data classes, IEC 61850-7-3:2010, Edition 2.0, 2010. https://webstore.iec.ch/en/publication/6016.</w:t>
+        <w:t xml:space="preserve">A.P. Dobos, PVWatts Version 5 Manual, National Renewable Energy Laboratory, Golden, CO, 2014. https://doi.org/10.2172/1158421.</w:t>
       </w:r>
     </w:p>
     <w:p>
@@ -9704,7 +9662,7 @@
         <w:tab/>
       </w:r>
       <w:r>
-        <w:t xml:space="preserve">A.P. Dobos, PVWatts Version 5 Manual, National Renewable Energy Laboratory, Golden, CO, 2014. https://doi.org/10.2172/1158421.</w:t>
+        <w:t xml:space="preserve">Federal Highway Administration, 2017 National Household Travel Survey, 2017. https://nhts.ornl.gov (accessed 2026-10-28).</w:t>
       </w:r>
     </w:p>
     <w:p>
@@ -9716,7 +9674,7 @@
         <w:tab/>
       </w:r>
       <w:r>
-        <w:t xml:space="preserve">Federal Highway Administration, 2017 National Household Travel Survey, 2017. https://nhts.ornl.gov (accessed 2026-10-28).</w:t>
+        <w:t xml:space="preserve">D.B. Crawley, L.K. Lawrie, F.C. Winkelmann, W.F. Buhl, Y.J. Huang, C.O. Pedersen, R.K. Strand, R.J. Liesen, D.E. Fisher, M.J. Witte, J. Glazer, EnergyPlus: creating a new-generation building energy simulation program, Energy Build. 33 (2001) 319–331. https://doi.org/10.1016/S0378-7788(00)00114-6.</w:t>
       </w:r>
     </w:p>
     <w:p>
@@ -9725,18 +9683,6 @@
       </w:pPr>
       <w:r>
         <w:t xml:space="preserve">[60]</w:t>
-        <w:tab/>
-      </w:r>
-      <w:r>
-        <w:t xml:space="preserve">D.B. Crawley, L.K. Lawrie, F.C. Winkelmann, W.F. Buhl, Y.J. Huang, C.O. Pedersen, R.K. Strand, R.J. Liesen, D.E. Fisher, M.J. Witte, J. Glazer, EnergyPlus: creating a new-generation building energy simulation program, Energy Build. 33 (2001) 319–331. https://doi.org/10.1016/S0378-7788(00)00114-6.</w:t>
-      </w:r>
-    </w:p>
-    <w:p>
-      <w:pPr>
-        <w:pStyle w:val="EndNoteBibliography"/>
-      </w:pPr>
-      <w:r>
-        <w:t xml:space="preserve">[61]</w:t>
         <w:tab/>
       </w:r>
       <w:r>

</xml_diff>

<commit_message>
Title page: authors and affiliations as in the SSRN preprint
Liang Zhang (University of Arizona; National Renewable Energy Laboratory; corresponding author),
Saquib Mohammed Haroon and Alyssa Ryan (University of Arizona). Word lock files are git-ignored.

Co-Authored-By: Claude Opus 5.5 <noreply@anthropic.com>
</commit_message>
<xml_diff>
--- a/paper/manuscript/Manuscript.docx
+++ b/paper/manuscript/Manuscript.docx
@@ -15,19 +15,19 @@
         <w:pStyle w:val="Authors"/>
       </w:pPr>
       <w:r>
-        <w:t xml:space="preserve">Author One</w:t>
+        <w:t xml:space="preserve">Liang Zhang</w:t>
       </w:r>
       <w:r>
         <w:rPr>
           <w:vertAlign w:val="superscript"/>
         </w:rPr>
-        <w:t xml:space="preserve">1,*</w:t>
+        <w:t xml:space="preserve">1,2,*</w:t>
       </w:r>
       <w:r>
         <w:t xml:space="preserve">, </w:t>
       </w:r>
       <w:r>
-        <w:t xml:space="preserve">Author Two</w:t>
+        <w:t xml:space="preserve">Saquib Mohammed Haroon</w:t>
       </w:r>
       <w:r>
         <w:rPr>
@@ -39,47 +39,47 @@
         <w:t xml:space="preserve">, </w:t>
       </w:r>
       <w:r>
-        <w:t xml:space="preserve">Author Three</w:t>
+        <w:t xml:space="preserve">Alyssa Ryan</w:t>
       </w:r>
       <w:r>
         <w:rPr>
           <w:vertAlign w:val="superscript"/>
         </w:rPr>
+        <w:t xml:space="preserve">1</w:t>
+      </w:r>
+    </w:p>
+    <w:p>
+      <w:pPr>
+        <w:pStyle w:val="Affiliation"/>
+      </w:pPr>
+      <w:r>
+        <w:rPr>
+          <w:vertAlign w:val="superscript"/>
+        </w:rPr>
+        <w:t xml:space="preserve">1</w:t>
+      </w:r>
+      <w:r>
+        <w:t xml:space="preserve"> </w:t>
+      </w:r>
+      <w:r>
+        <w:t xml:space="preserve">University of Arizona, Tucson, Arizona, USA</w:t>
+      </w:r>
+    </w:p>
+    <w:p>
+      <w:pPr>
+        <w:pStyle w:val="Affiliation"/>
+      </w:pPr>
+      <w:r>
+        <w:rPr>
+          <w:vertAlign w:val="superscript"/>
+        </w:rPr>
         <w:t xml:space="preserve">2</w:t>
       </w:r>
-    </w:p>
-    <w:p>
-      <w:pPr>
-        <w:pStyle w:val="Affiliation"/>
-      </w:pPr>
-      <w:r>
-        <w:rPr>
-          <w:vertAlign w:val="superscript"/>
-        </w:rPr>
-        <w:t xml:space="preserve">1</w:t>
-      </w:r>
       <w:r>
         <w:t xml:space="preserve"> </w:t>
       </w:r>
       <w:r>
-        <w:t xml:space="preserve">Department, University, Street address, City, State Postal code, Country</w:t>
-      </w:r>
-    </w:p>
-    <w:p>
-      <w:pPr>
-        <w:pStyle w:val="Affiliation"/>
-      </w:pPr>
-      <w:r>
-        <w:rPr>
-          <w:vertAlign w:val="superscript"/>
-        </w:rPr>
-        <w:t xml:space="preserve">2</w:t>
-      </w:r>
-      <w:r>
-        <w:t xml:space="preserve"> </w:t>
-      </w:r>
-      <w:r>
-        <w:t xml:space="preserve">Department, Institution, Street address, City, Postal code, Country</w:t>
+        <w:t xml:space="preserve">National Renewable Energy Laboratory, Golden, Colorado, USA</w:t>
       </w:r>
     </w:p>
     <w:p>
@@ -103,11 +103,11 @@
           <w:rPr>
             <w:rStyle w:val="Hyperlink"/>
           </w:rPr>
-          <w:t xml:space="preserve">corresponding.author@university.edu</w:t>
+          <w:t xml:space="preserve">liangzhang1@arizona.edu</w:t>
         </w:r>
       </w:hyperlink>
       <w:r>
-        <w:t xml:space="preserve"> (Author One)</w:t>
+        <w:t xml:space="preserve"> (Liang Zhang)</w:t>
       </w:r>
     </w:p>
     <w:p>
@@ -164,7 +164,7 @@
 UmVjTnVtPjU4PC9SZWNOdW0+PERpc3BsYXlUZXh0PlsxLDJdPC9EaXNwbGF5VGV4dD48cmVjb3Jk
 PjxyZWMtbnVtYmVyPjU4PC9yZWMtbnVtYmVyPjxmb3JlaWduLWtleXM+PGtleSBhcHA9IkVOIiBk
 Yi1pZD0ibWRhZTg1MDAxMDk0OTZmZWE0YWZmOWMwODZlMTZjYzI1ODk1IiB0aW1lc3RhbXA9IjE3
-OTMyMTY4MjEiPjU4PC9rZXk+PC9mb3JlaWduLWtleXM+PHJlZi10eXBlIG5hbWU9IlJlcG9ydCI+
+OTMyMjEzMDQiPjU4PC9rZXk+PC9mb3JlaWduLWtleXM+PHJlZi10eXBlIG5hbWU9IlJlcG9ydCI+
 Mjc8L3JlZi10eXBlPjxjb250cmlidXRvcnM+PGF1dGhvcnM+PGF1dGhvcj5OZXVrb21tLCBNb25p
 Y2E8L2F1dGhvcj48YXV0aG9yPk51YmJlLCBWYWxlcmllPC9hdXRob3I+PGF1dGhvcj5GYXJlcywg
 Um9iZXJ0PC9hdXRob3I+PC9hdXRob3JzPjwvY29udHJpYnV0b3JzPjx0aXRsZXM+PHRpdGxlPkdy
@@ -179,7 +179,7 @@
 ZT48Q2l0ZT48QXV0aG9yPkhvbmc8L0F1dGhvcj48WWVhcj4yMDI1PC9ZZWFyPjxSZWNOdW0+MzU8
 L1JlY051bT48cmVjb3JkPjxyZWMtbnVtYmVyPjM1PC9yZWMtbnVtYmVyPjxmb3JlaWduLWtleXM+
 PGtleSBhcHA9IkVOIiBkYi1pZD0ibWRhZTg1MDAxMDk0OTZmZWE0YWZmOWMwODZlMTZjYzI1ODk1
-IiB0aW1lc3RhbXA9IjE3OTMyMTY4MjEiPjM1PC9rZXk+PC9mb3JlaWduLWtleXM+PHJlZi10eXBl
+IiB0aW1lc3RhbXA9IjE3OTMyMjEzMDQiPjM1PC9rZXk+PC9mb3JlaWduLWtleXM+PHJlZi10eXBl
 IG5hbWU9IkpvdXJuYWwgQXJ0aWNsZSI+MTc8L3JlZi10eXBlPjxjb250cmlidXRvcnM+PGF1dGhv
 cnM+PGF1dGhvcj5Ib25nLCBUaWFuemhlbjwvYXV0aG9yPjxhdXRob3I+TGVlLCBTYW5nIEhvb248
 L2F1dGhvcj48YXV0aG9yPlpoYW5nLCBXYW5uaTwvYXV0aG9yPjxhdXRob3I+TGksIEhhbjwvYXV0
@@ -206,7 +206,7 @@
 UmVjTnVtPjU4PC9SZWNOdW0+PERpc3BsYXlUZXh0PlsxLDJdPC9EaXNwbGF5VGV4dD48cmVjb3Jk
 PjxyZWMtbnVtYmVyPjU4PC9yZWMtbnVtYmVyPjxmb3JlaWduLWtleXM+PGtleSBhcHA9IkVOIiBk
 Yi1pZD0ibWRhZTg1MDAxMDk0OTZmZWE0YWZmOWMwODZlMTZjYzI1ODk1IiB0aW1lc3RhbXA9IjE3
-OTMyMTY4MjEiPjU4PC9rZXk+PC9mb3JlaWduLWtleXM+PHJlZi10eXBlIG5hbWU9IlJlcG9ydCI+
+OTMyMjEzMDQiPjU4PC9rZXk+PC9mb3JlaWduLWtleXM+PHJlZi10eXBlIG5hbWU9IlJlcG9ydCI+
 Mjc8L3JlZi10eXBlPjxjb250cmlidXRvcnM+PGF1dGhvcnM+PGF1dGhvcj5OZXVrb21tLCBNb25p
 Y2E8L2F1dGhvcj48YXV0aG9yPk51YmJlLCBWYWxlcmllPC9hdXRob3I+PGF1dGhvcj5GYXJlcywg
 Um9iZXJ0PC9hdXRob3I+PC9hdXRob3JzPjwvY29udHJpYnV0b3JzPjx0aXRsZXM+PHRpdGxlPkdy
@@ -221,7 +221,7 @@
 ZT48Q2l0ZT48QXV0aG9yPkhvbmc8L0F1dGhvcj48WWVhcj4yMDI1PC9ZZWFyPjxSZWNOdW0+MzU8
 L1JlY051bT48cmVjb3JkPjxyZWMtbnVtYmVyPjM1PC9yZWMtbnVtYmVyPjxmb3JlaWduLWtleXM+
 PGtleSBhcHA9IkVOIiBkYi1pZD0ibWRhZTg1MDAxMDk0OTZmZWE0YWZmOWMwODZlMTZjYzI1ODk1
-IiB0aW1lc3RhbXA9IjE3OTMyMTY4MjEiPjM1PC9rZXk+PC9mb3JlaWduLWtleXM+PHJlZi10eXBl
+IiB0aW1lc3RhbXA9IjE3OTMyMjEzMDQiPjM1PC9rZXk+PC9mb3JlaWduLWtleXM+PHJlZi10eXBl
 IG5hbWU9IkpvdXJuYWwgQXJ0aWNsZSI+MTc8L3JlZi10eXBlPjxjb250cmlidXRvcnM+PGF1dGhv
 cnM+PGF1dGhvcj5Ib25nLCBUaWFuemhlbjwvYXV0aG9yPjxhdXRob3I+TGVlLCBTYW5nIEhvb248
 L2F1dGhvcj48YXV0aG9yPlpoYW5nLCBXYW5uaTwvYXV0aG9yPjxhdXRob3I+TGksIEhhbjwvYXV0
@@ -266,7 +266,7 @@
 TnVtPjgzPC9SZWNOdW0+PERpc3BsYXlUZXh0Plsz4oCTNl08L0Rpc3BsYXlUZXh0PjxyZWNvcmQ+
 PHJlYy1udW1iZXI+ODM8L3JlYy1udW1iZXI+PGZvcmVpZ24ta2V5cz48a2V5IGFwcD0iRU4iIGRi
 LWlkPSJtZGFlODUwMDEwOTQ5NmZlYTRhZmY5YzA4NmUxNmNjMjU4OTUiIHRpbWVzdGFtcD0iMTc5
-MzIxNjgyMSI+ODM8L2tleT48L2ZvcmVpZ24ta2V5cz48cmVmLXR5cGUgbmFtZT0iSm91cm5hbCBB
+MzIyMTMwNCI+ODM8L2tleT48L2ZvcmVpZ24ta2V5cz48cmVmLXR5cGUgbmFtZT0iSm91cm5hbCBB
 cnRpY2xlIj4xNzwvcmVmLXR5cGU+PGNvbnRyaWJ1dG9ycz48YXV0aG9ycz48YXV0aG9yPldhbmcs
 IFpoZTwvYXV0aG9yPjxhdXRob3I+SG9uZywgVGlhbnpoZW48L2F1dGhvcj48L2F1dGhvcnM+PC9j
 b250cmlidXRvcnM+PHRpdGxlcz48dGl0bGU+UmVpbmZvcmNlbWVudCBsZWFybmluZyBmb3IgYnVp
@@ -281,7 +281,7 @@
 Y2UtbnVtPjwvcmVjb3JkPjwvQ2l0ZT48Q2l0ZT48QXV0aG9yPkFobjwvQXV0aG9yPjxZZWFyPjIw
 MjM8L1llYXI+PFJlY051bT4xPC9SZWNOdW0+PHJlY29yZD48cmVjLW51bWJlcj4xPC9yZWMtbnVt
 YmVyPjxmb3JlaWduLWtleXM+PGtleSBhcHA9IkVOIiBkYi1pZD0ibWRhZTg1MDAxMDk0OTZmZWE0
-YWZmOWMwODZlMTZjYzI1ODk1IiB0aW1lc3RhbXA9IjE3OTMyMTY4MjEiPjE8L2tleT48L2ZvcmVp
+YWZmOWMwODZlMTZjYzI1ODk1IiB0aW1lc3RhbXA9IjE3OTMyMjEzMDQiPjE8L2tleT48L2ZvcmVp
 Z24ta2V5cz48cmVmLXR5cGUgbmFtZT0iSm91cm5hbCBBcnRpY2xlIj4xNzwvcmVmLXR5cGU+PGNv
 bnRyaWJ1dG9ycz48YXV0aG9ycz48YXV0aG9yPkFobiwgS2kgVWhuPC9hdXRob3I+PGF1dGhvcj5L
 aW0sIERldWstV29vPC9hdXRob3I+PGF1dGhvcj5DaG8sIEh5dW4gTWk8L2F1dGhvcj48YXV0aG9y
@@ -299,7 +299,7 @@
 aG9yPlpoYW5nPC9BdXRob3I+PFllYXI+MjAyNDwvWWVhcj48UmVjTnVtPjk0PC9SZWNOdW0+PHJl
 Y29yZD48cmVjLW51bWJlcj45NDwvcmVjLW51bWJlcj48Zm9yZWlnbi1rZXlzPjxrZXkgYXBwPSJF
 TiIgZGItaWQ9Im1kYWU4NTAwMTA5NDk2ZmVhNGFmZjljMDg2ZTE2Y2MyNTg5NSIgdGltZXN0YW1w
-PSIxNzkzMjE2ODIxIj45NDwva2V5PjwvZm9yZWlnbi1rZXlzPjxyZWYtdHlwZSBuYW1lPSJKb3Vy
+PSIxNzkzMjIxMzA0Ij45NDwva2V5PjwvZm9yZWlnbi1rZXlzPjxyZWYtdHlwZSBuYW1lPSJKb3Vy
 bmFsIEFydGljbGUiPjE3PC9yZWYtdHlwZT48Y29udHJpYnV0b3JzPjxhdXRob3JzPjxhdXRob3I+
 WmhhbmcsIExpYW5nPC9hdXRob3I+PGF1dGhvcj5DaGVuLCBaaGVsdW48L2F1dGhvcj48L2F1dGhv
 cnM+PC9jb250cmlidXRvcnM+PHRpdGxlcz48dGl0bGU+TGFyZ2UgbGFuZ3VhZ2UgbW9kZWwtYmFz
@@ -315,7 +315,7 @@
 aXRlPjxDaXRlPjxBdXRob3I+TGl1PC9BdXRob3I+PFllYXI+MjAyNTwvWWVhcj48UmVjTnVtPjUx
 PC9SZWNOdW0+PHJlY29yZD48cmVjLW51bWJlcj41MTwvcmVjLW51bWJlcj48Zm9yZWlnbi1rZXlz
 PjxrZXkgYXBwPSJFTiIgZGItaWQ9Im1kYWU4NTAwMTA5NDk2ZmVhNGFmZjljMDg2ZTE2Y2MyNTg5
-NSIgdGltZXN0YW1wPSIxNzkzMjE2ODIxIj41MTwva2V5PjwvZm9yZWlnbi1rZXlzPjxyZWYtdHlw
+NSIgdGltZXN0YW1wPSIxNzkzMjIxMzA0Ij41MTwva2V5PjwvZm9yZWlnbi1rZXlzPjxyZWYtdHlw
 ZSBuYW1lPSJKb3VybmFsIEFydGljbGUiPjE3PC9yZWYtdHlwZT48Y29udHJpYnV0b3JzPjxhdXRo
 b3JzPjxhdXRob3I+TGl1LCBNaW5nemhlPC9hdXRob3I+PGF1dGhvcj5aaGFuZywgTGlhbmc8L2F1
 dGhvcj48YXV0aG9yPkNoZW4sIEppYW5saTwvYXV0aG9yPjxhdXRob3I+Q2hlbiwgV2VpLUFuPC9h
@@ -343,7 +343,7 @@
 TnVtPjgzPC9SZWNOdW0+PERpc3BsYXlUZXh0Plsz4oCTNl08L0Rpc3BsYXlUZXh0PjxyZWNvcmQ+
 PHJlYy1udW1iZXI+ODM8L3JlYy1udW1iZXI+PGZvcmVpZ24ta2V5cz48a2V5IGFwcD0iRU4iIGRi
 LWlkPSJtZGFlODUwMDEwOTQ5NmZlYTRhZmY5YzA4NmUxNmNjMjU4OTUiIHRpbWVzdGFtcD0iMTc5
-MzIxNjgyMSI+ODM8L2tleT48L2ZvcmVpZ24ta2V5cz48cmVmLXR5cGUgbmFtZT0iSm91cm5hbCBB
+MzIyMTMwNCI+ODM8L2tleT48L2ZvcmVpZ24ta2V5cz48cmVmLXR5cGUgbmFtZT0iSm91cm5hbCBB
 cnRpY2xlIj4xNzwvcmVmLXR5cGU+PGNvbnRyaWJ1dG9ycz48YXV0aG9ycz48YXV0aG9yPldhbmcs
 IFpoZTwvYXV0aG9yPjxhdXRob3I+SG9uZywgVGlhbnpoZW48L2F1dGhvcj48L2F1dGhvcnM+PC9j
 b250cmlidXRvcnM+PHRpdGxlcz48dGl0bGU+UmVpbmZvcmNlbWVudCBsZWFybmluZyBmb3IgYnVp
@@ -358,7 +358,7 @@
 Y2UtbnVtPjwvcmVjb3JkPjwvQ2l0ZT48Q2l0ZT48QXV0aG9yPkFobjwvQXV0aG9yPjxZZWFyPjIw
 MjM8L1llYXI+PFJlY051bT4xPC9SZWNOdW0+PHJlY29yZD48cmVjLW51bWJlcj4xPC9yZWMtbnVt
 YmVyPjxmb3JlaWduLWtleXM+PGtleSBhcHA9IkVOIiBkYi1pZD0ibWRhZTg1MDAxMDk0OTZmZWE0
-YWZmOWMwODZlMTZjYzI1ODk1IiB0aW1lc3RhbXA9IjE3OTMyMTY4MjEiPjE8L2tleT48L2ZvcmVp
+YWZmOWMwODZlMTZjYzI1ODk1IiB0aW1lc3RhbXA9IjE3OTMyMjEzMDQiPjE8L2tleT48L2ZvcmVp
 Z24ta2V5cz48cmVmLXR5cGUgbmFtZT0iSm91cm5hbCBBcnRpY2xlIj4xNzwvcmVmLXR5cGU+PGNv
 bnRyaWJ1dG9ycz48YXV0aG9ycz48YXV0aG9yPkFobiwgS2kgVWhuPC9hdXRob3I+PGF1dGhvcj5L
 aW0sIERldWstV29vPC9hdXRob3I+PGF1dGhvcj5DaG8sIEh5dW4gTWk8L2F1dGhvcj48YXV0aG9y
@@ -376,7 +376,7 @@
 aG9yPlpoYW5nPC9BdXRob3I+PFllYXI+MjAyNDwvWWVhcj48UmVjTnVtPjk0PC9SZWNOdW0+PHJl
 Y29yZD48cmVjLW51bWJlcj45NDwvcmVjLW51bWJlcj48Zm9yZWlnbi1rZXlzPjxrZXkgYXBwPSJF
 TiIgZGItaWQ9Im1kYWU4NTAwMTA5NDk2ZmVhNGFmZjljMDg2ZTE2Y2MyNTg5NSIgdGltZXN0YW1w
-PSIxNzkzMjE2ODIxIj45NDwva2V5PjwvZm9yZWlnbi1rZXlzPjxyZWYtdHlwZSBuYW1lPSJKb3Vy
+PSIxNzkzMjIxMzA0Ij45NDwva2V5PjwvZm9yZWlnbi1rZXlzPjxyZWYtdHlwZSBuYW1lPSJKb3Vy
 bmFsIEFydGljbGUiPjE3PC9yZWYtdHlwZT48Y29udHJpYnV0b3JzPjxhdXRob3JzPjxhdXRob3I+
 WmhhbmcsIExpYW5nPC9hdXRob3I+PGF1dGhvcj5DaGVuLCBaaGVsdW48L2F1dGhvcj48L2F1dGhv
 cnM+PC9jb250cmlidXRvcnM+PHRpdGxlcz48dGl0bGU+TGFyZ2UgbGFuZ3VhZ2UgbW9kZWwtYmFz
@@ -392,7 +392,7 @@
 aXRlPjxDaXRlPjxBdXRob3I+TGl1PC9BdXRob3I+PFllYXI+MjAyNTwvWWVhcj48UmVjTnVtPjUx
 PC9SZWNOdW0+PHJlY29yZD48cmVjLW51bWJlcj41MTwvcmVjLW51bWJlcj48Zm9yZWlnbi1rZXlz
 PjxrZXkgYXBwPSJFTiIgZGItaWQ9Im1kYWU4NTAwMTA5NDk2ZmVhNGFmZjljMDg2ZTE2Y2MyNTg5
-NSIgdGltZXN0YW1wPSIxNzkzMjE2ODIxIj41MTwva2V5PjwvZm9yZWlnbi1rZXlzPjxyZWYtdHlw
+NSIgdGltZXN0YW1wPSIxNzkzMjIxMzA0Ij41MTwva2V5PjwvZm9yZWlnbi1rZXlzPjxyZWYtdHlw
 ZSBuYW1lPSJKb3VybmFsIEFydGljbGUiPjE3PC9yZWYtdHlwZT48Y29udHJpYnV0b3JzPjxhdXRo
 b3JzPjxhdXRob3I+TGl1LCBNaW5nemhlPC9hdXRob3I+PGF1dGhvcj5aaGFuZywgTGlhbmc8L2F1
 dGhvcj48YXV0aG9yPkNoZW4sIEppYW5saTwvYXV0aG9yPjxhdXRob3I+Q2hlbiwgV2VpLUFuPC9h
@@ -438,7 +438,7 @@
 Y051bT4yNjwvUmVjTnVtPjxEaXNwbGF5VGV4dD5bNyw4XTwvRGlzcGxheVRleHQ+PHJlY29yZD48
 cmVjLW51bWJlcj4yNjwvcmVjLW51bWJlcj48Zm9yZWlnbi1rZXlzPjxrZXkgYXBwPSJFTiIgZGIt
 aWQ9Im1kYWU4NTAwMTA5NDk2ZmVhNGFmZjljMDg2ZTE2Y2MyNTg5NSIgdGltZXN0YW1wPSIxNzkz
-MjE2ODIxIj4yNjwva2V5PjwvZm9yZWlnbi1rZXlzPjxyZWYtdHlwZSBuYW1lPSJKb3VybmFsIEFy
+MjIxMzA0Ij4yNjwva2V5PjwvZm9yZWlnbi1rZXlzPjxyZWYtdHlwZSBuYW1lPSJKb3VybmFsIEFy
 dGljbGUiPjE3PC9yZWYtdHlwZT48Y29udHJpYnV0b3JzPjxhdXRob3JzPjxhdXRob3I+R29tZXMs
 IENsw6F1ZGlvPC9hdXRob3I+PGF1dGhvcj5UaHVsZSwgQ2FzcGVyPC9hdXRob3I+PGF1dGhvcj5C
 cm9tYW4sIERhdmlkPC9hdXRob3I+PGF1dGhvcj5MYXJzZW4sIFBldGVyIEdvcm08L2F1dGhvcj48
@@ -454,7 +454,7 @@
 Yy1yZXNvdXJjZS1udW0+PC9yZWNvcmQ+PC9DaXRlPjxDaXRlPjxBdXRob3I+SG9uZzwvQXV0aG9y
 PjxZZWFyPjIwMTg8L1llYXI+PFJlY051bT4zNDwvUmVjTnVtPjxyZWNvcmQ+PHJlYy1udW1iZXI+
 MzQ8L3JlYy1udW1iZXI+PGZvcmVpZ24ta2V5cz48a2V5IGFwcD0iRU4iIGRiLWlkPSJtZGFlODUw
-MDEwOTQ5NmZlYTRhZmY5YzA4NmUxNmNjMjU4OTUiIHRpbWVzdGFtcD0iMTc5MzIxNjgyMSI+MzQ8
+MDEwOTQ5NmZlYTRhZmY5YzA4NmUxNmNjMjU4OTUiIHRpbWVzdGFtcD0iMTc5MzIyMTMwNCI+MzQ8
 L2tleT48L2ZvcmVpZ24ta2V5cz48cmVmLXR5cGUgbmFtZT0iSm91cm5hbCBBcnRpY2xlIj4xNzwv
 cmVmLXR5cGU+PGNvbnRyaWJ1dG9ycz48YXV0aG9ycz48YXV0aG9yPkhvbmcsIFRpYW56aGVuPC9h
 dXRob3I+PGF1dGhvcj5MYW5nZXZpbiwgSmFyZWQ8L2F1dGhvcj48YXV0aG9yPlN1biwgS2FpeXU8
@@ -479,7 +479,7 @@
 Y051bT4yNjwvUmVjTnVtPjxEaXNwbGF5VGV4dD5bNyw4XTwvRGlzcGxheVRleHQ+PHJlY29yZD48
 cmVjLW51bWJlcj4yNjwvcmVjLW51bWJlcj48Zm9yZWlnbi1rZXlzPjxrZXkgYXBwPSJFTiIgZGIt
 aWQ9Im1kYWU4NTAwMTA5NDk2ZmVhNGFmZjljMDg2ZTE2Y2MyNTg5NSIgdGltZXN0YW1wPSIxNzkz
-MjE2ODIxIj4yNjwva2V5PjwvZm9yZWlnbi1rZXlzPjxyZWYtdHlwZSBuYW1lPSJKb3VybmFsIEFy
+MjIxMzA0Ij4yNjwva2V5PjwvZm9yZWlnbi1rZXlzPjxyZWYtdHlwZSBuYW1lPSJKb3VybmFsIEFy
 dGljbGUiPjE3PC9yZWYtdHlwZT48Y29udHJpYnV0b3JzPjxhdXRob3JzPjxhdXRob3I+R29tZXMs
 IENsw6F1ZGlvPC9hdXRob3I+PGF1dGhvcj5UaHVsZSwgQ2FzcGVyPC9hdXRob3I+PGF1dGhvcj5C
 cm9tYW4sIERhdmlkPC9hdXRob3I+PGF1dGhvcj5MYXJzZW4sIFBldGVyIEdvcm08L2F1dGhvcj48
@@ -495,7 +495,7 @@
 Yy1yZXNvdXJjZS1udW0+PC9yZWNvcmQ+PC9DaXRlPjxDaXRlPjxBdXRob3I+SG9uZzwvQXV0aG9y
 PjxZZWFyPjIwMTg8L1llYXI+PFJlY051bT4zNDwvUmVjTnVtPjxyZWNvcmQ+PHJlYy1udW1iZXI+
 MzQ8L3JlYy1udW1iZXI+PGZvcmVpZ24ta2V5cz48a2V5IGFwcD0iRU4iIGRiLWlkPSJtZGFlODUw
-MDEwOTQ5NmZlYTRhZmY5YzA4NmUxNmNjMjU4OTUiIHRpbWVzdGFtcD0iMTc5MzIxNjgyMSI+MzQ8
+MDEwOTQ5NmZlYTRhZmY5YzA4NmUxNmNjMjU4OTUiIHRpbWVzdGFtcD0iMTc5MzIyMTMwNCI+MzQ8
 L2tleT48L2ZvcmVpZ24ta2V5cz48cmVmLXR5cGUgbmFtZT0iSm91cm5hbCBBcnRpY2xlIj4xNzwv
 cmVmLXR5cGU+PGNvbnRyaWJ1dG9ycz48YXV0aG9ycz48YXV0aG9yPkhvbmcsIFRpYW56aGVuPC9h
 dXRob3I+PGF1dGhvcj5MYW5nZXZpbiwgSmFyZWQ8L2F1dGhvcj48YXV0aG9yPlN1biwgS2FpeXU8
@@ -546,7 +546,7 @@
 PjxSZWNOdW0+NjwvUmVjTnVtPjxEaXNwbGF5VGV4dD5bOSwxMF08L0Rpc3BsYXlUZXh0PjxyZWNv
 cmQ+PHJlYy1udW1iZXI+NjwvcmVjLW51bWJlcj48Zm9yZWlnbi1rZXlzPjxrZXkgYXBwPSJFTiIg
 ZGItaWQ9Im1kYWU4NTAwMTA5NDk2ZmVhNGFmZjljMDg2ZTE2Y2MyNTg5NSIgdGltZXN0YW1wPSIx
-NzkzMjE2ODIxIj42PC9rZXk+PC9mb3JlaWduLWtleXM+PHJlZi10eXBlIG5hbWU9IkNvbmZlcmVu
+NzkzMjIxMzA0Ij42PC9rZXk+PC9mb3JlaWduLWtleXM+PHJlZi10eXBlIG5hbWU9IkNvbmZlcmVu
 Y2UgUGFwZXIiPjQ3PC9yZWYtdHlwZT48Y29udHJpYnV0b3JzPjxhdXRob3JzPjxhdXRob3I+Qmxv
 Y2h3aXR6LCBULjwvYXV0aG9yPjxhdXRob3I+T3R0ZXIsIE0uPC9hdXRob3I+PGF1dGhvcj5Bcm5v
 bGQsIE0uPC9hdXRob3I+PGF1dGhvcj5CYXVzY2gsIEMuPC9hdXRob3I+PGF1dGhvcj5DbGF1c3Ms
@@ -567,7 +567,7 @@
 aXRlPjxDaXRlPjxBdXRob3I+SnVuZ2hhbm5zPC9BdXRob3I+PFllYXI+MjAyMTwvWWVhcj48UmVj
 TnVtPjQyPC9SZWNOdW0+PHJlY29yZD48cmVjLW51bWJlcj40MjwvcmVjLW51bWJlcj48Zm9yZWln
 bi1rZXlzPjxrZXkgYXBwPSJFTiIgZGItaWQ9Im1kYWU4NTAwMTA5NDk2ZmVhNGFmZjljMDg2ZTE2
-Y2MyNTg5NSIgdGltZXN0YW1wPSIxNzkzMjE2ODIxIj40Mjwva2V5PjwvZm9yZWlnbi1rZXlzPjxy
+Y2MyNTg5NSIgdGltZXN0YW1wPSIxNzkzMjIxMzA0Ij40Mjwva2V5PjwvZm9yZWlnbi1rZXlzPjxy
 ZWYtdHlwZSBuYW1lPSJDb25mZXJlbmNlIFBhcGVyIj40NzwvcmVmLXR5cGU+PGNvbnRyaWJ1dG9y
 cz48YXV0aG9ycz48YXV0aG9yPkp1bmdoYW5ucywgQW5kcmVhczwvYXV0aG9yPjxhdXRob3I+Qmxv
 Y2h3aXR6LCBUb3JzdGVuPC9hdXRob3I+PGF1dGhvcj5CZXJ0c2NoLCBDaHJpc3RpYW48L2F1dGhv
@@ -598,7 +598,7 @@
 PjxSZWNOdW0+NjwvUmVjTnVtPjxEaXNwbGF5VGV4dD5bOSwxMF08L0Rpc3BsYXlUZXh0PjxyZWNv
 cmQ+PHJlYy1udW1iZXI+NjwvcmVjLW51bWJlcj48Zm9yZWlnbi1rZXlzPjxrZXkgYXBwPSJFTiIg
 ZGItaWQ9Im1kYWU4NTAwMTA5NDk2ZmVhNGFmZjljMDg2ZTE2Y2MyNTg5NSIgdGltZXN0YW1wPSIx
-NzkzMjE2ODIxIj42PC9rZXk+PC9mb3JlaWduLWtleXM+PHJlZi10eXBlIG5hbWU9IkNvbmZlcmVu
+NzkzMjIxMzA0Ij42PC9rZXk+PC9mb3JlaWduLWtleXM+PHJlZi10eXBlIG5hbWU9IkNvbmZlcmVu
 Y2UgUGFwZXIiPjQ3PC9yZWYtdHlwZT48Y29udHJpYnV0b3JzPjxhdXRob3JzPjxhdXRob3I+Qmxv
 Y2h3aXR6LCBULjwvYXV0aG9yPjxhdXRob3I+T3R0ZXIsIE0uPC9hdXRob3I+PGF1dGhvcj5Bcm5v
 bGQsIE0uPC9hdXRob3I+PGF1dGhvcj5CYXVzY2gsIEMuPC9hdXRob3I+PGF1dGhvcj5DbGF1c3Ms
@@ -619,7 +619,7 @@
 aXRlPjxDaXRlPjxBdXRob3I+SnVuZ2hhbm5zPC9BdXRob3I+PFllYXI+MjAyMTwvWWVhcj48UmVj
 TnVtPjQyPC9SZWNOdW0+PHJlY29yZD48cmVjLW51bWJlcj40MjwvcmVjLW51bWJlcj48Zm9yZWln
 bi1rZXlzPjxrZXkgYXBwPSJFTiIgZGItaWQ9Im1kYWU4NTAwMTA5NDk2ZmVhNGFmZjljMDg2ZTE2
-Y2MyNTg5NSIgdGltZXN0YW1wPSIxNzkzMjE2ODIxIj40Mjwva2V5PjwvZm9yZWlnbi1rZXlzPjxy
+Y2MyNTg5NSIgdGltZXN0YW1wPSIxNzkzMjIxMzA0Ij40Mjwva2V5PjwvZm9yZWlnbi1rZXlzPjxy
 ZWYtdHlwZSBuYW1lPSJDb25mZXJlbmNlIFBhcGVyIj40NzwvcmVmLXR5cGU+PGNvbnRyaWJ1dG9y
 cz48YXV0aG9ycz48YXV0aG9yPkp1bmdoYW5ucywgQW5kcmVhczwvYXV0aG9yPjxhdXRob3I+Qmxv
 Y2h3aXR6LCBUb3JzdGVuPC9hdXRob3I+PGF1dGhvcj5CZXJ0c2NoLCBDaHJpc3RpYW48L2F1dGhv
@@ -668,7 +668,7 @@
 ZWNOdW0+ODU8L1JlY051bT48RGlzcGxheVRleHQ+WzExLDEyXTwvRGlzcGxheVRleHQ+PHJlY29y
 ZD48cmVjLW51bWJlcj44NTwvcmVjLW51bWJlcj48Zm9yZWlnbi1rZXlzPjxrZXkgYXBwPSJFTiIg
 ZGItaWQ9Im1kYWU4NTAwMTA5NDk2ZmVhNGFmZjljMDg2ZTE2Y2MyNTg5NSIgdGltZXN0YW1wPSIx
-NzkzMjE2ODIxIj44NTwva2V5PjwvZm9yZWlnbi1rZXlzPjxyZWYtdHlwZSBuYW1lPSJKb3VybmFs
+NzkzMjIxMzA0Ij44NTwva2V5PjwvZm9yZWlnbi1rZXlzPjxyZWYtdHlwZSBuYW1lPSJKb3VybmFs
 IEFydGljbGUiPjE3PC9yZWYtdHlwZT48Y29udHJpYnV0b3JzPjxhdXRob3JzPjxhdXRob3I+V2V0
 dGVyLCBNaWNoYWVsPC9hdXRob3I+PC9hdXRob3JzPjwvY29udHJpYnV0b3JzPjx0aXRsZXM+PHRp
 dGxlPkNvLXNpbXVsYXRpb24gb2YgYnVpbGRpbmcgZW5lcmd5IGFuZCBjb250cm9sIHN5c3RlbXMg
@@ -685,7 +685,7 @@
 L3JlY29yZD48L0NpdGU+PENpdGU+PEF1dGhvcj5Ob3VpZHVpPC9BdXRob3I+PFllYXI+MjAxNDwv
 WWVhcj48UmVjTnVtPjU5PC9SZWNOdW0+PHJlY29yZD48cmVjLW51bWJlcj41OTwvcmVjLW51bWJl
 cj48Zm9yZWlnbi1rZXlzPjxrZXkgYXBwPSJFTiIgZGItaWQ9Im1kYWU4NTAwMTA5NDk2ZmVhNGFm
-ZjljMDg2ZTE2Y2MyNTg5NSIgdGltZXN0YW1wPSIxNzkzMjE2ODIxIj41OTwva2V5PjwvZm9yZWln
+ZjljMDg2ZTE2Y2MyNTg5NSIgdGltZXN0YW1wPSIxNzkzMjIxMzA0Ij41OTwva2V5PjwvZm9yZWln
 bi1rZXlzPjxyZWYtdHlwZSBuYW1lPSJKb3VybmFsIEFydGljbGUiPjE3PC9yZWYtdHlwZT48Y29u
 dHJpYnV0b3JzPjxhdXRob3JzPjxhdXRob3I+Tm91aWR1aSwgVGhpZXJyeTwvYXV0aG9yPjxhdXRo
 b3I+V2V0dGVyLCBNaWNoYWVsPC9hdXRob3I+PGF1dGhvcj5adW8sIFdhbmdkYTwvYXV0aG9yPjwv
@@ -712,7 +712,7 @@
 ZWNOdW0+ODU8L1JlY051bT48RGlzcGxheVRleHQ+WzExLDEyXTwvRGlzcGxheVRleHQ+PHJlY29y
 ZD48cmVjLW51bWJlcj44NTwvcmVjLW51bWJlcj48Zm9yZWlnbi1rZXlzPjxrZXkgYXBwPSJFTiIg
 ZGItaWQ9Im1kYWU4NTAwMTA5NDk2ZmVhNGFmZjljMDg2ZTE2Y2MyNTg5NSIgdGltZXN0YW1wPSIx
-NzkzMjE2ODIxIj44NTwva2V5PjwvZm9yZWlnbi1rZXlzPjxyZWYtdHlwZSBuYW1lPSJKb3VybmFs
+NzkzMjIxMzA0Ij44NTwva2V5PjwvZm9yZWlnbi1rZXlzPjxyZWYtdHlwZSBuYW1lPSJKb3VybmFs
 IEFydGljbGUiPjE3PC9yZWYtdHlwZT48Y29udHJpYnV0b3JzPjxhdXRob3JzPjxhdXRob3I+V2V0
 dGVyLCBNaWNoYWVsPC9hdXRob3I+PC9hdXRob3JzPjwvY29udHJpYnV0b3JzPjx0aXRsZXM+PHRp
 dGxlPkNvLXNpbXVsYXRpb24gb2YgYnVpbGRpbmcgZW5lcmd5IGFuZCBjb250cm9sIHN5c3RlbXMg
@@ -729,7 +729,7 @@
 L3JlY29yZD48L0NpdGU+PENpdGU+PEF1dGhvcj5Ob3VpZHVpPC9BdXRob3I+PFllYXI+MjAxNDwv
 WWVhcj48UmVjTnVtPjU5PC9SZWNOdW0+PHJlY29yZD48cmVjLW51bWJlcj41OTwvcmVjLW51bWJl
 cj48Zm9yZWlnbi1rZXlzPjxrZXkgYXBwPSJFTiIgZGItaWQ9Im1kYWU4NTAwMTA5NDk2ZmVhNGFm
-ZjljMDg2ZTE2Y2MyNTg5NSIgdGltZXN0YW1wPSIxNzkzMjE2ODIxIj41OTwva2V5PjwvZm9yZWln
+ZjljMDg2ZTE2Y2MyNTg5NSIgdGltZXN0YW1wPSIxNzkzMjIxMzA0Ij41OTwva2V5PjwvZm9yZWln
 bi1rZXlzPjxyZWYtdHlwZSBuYW1lPSJKb3VybmFsIEFydGljbGUiPjE3PC9yZWYtdHlwZT48Y29u
 dHJpYnV0b3JzPjxhdXRob3JzPjxhdXRob3I+Tm91aWR1aSwgVGhpZXJyeTwvYXV0aG9yPjxhdXRo
 b3I+V2V0dGVyLCBNaWNoYWVsPC9hdXRob3I+PGF1dGhvcj5adW8sIFdhbmdkYTwvYXV0aG9yPjwv
@@ -772,7 +772,7 @@
         <w:fldChar w:fldCharType="begin"/>
       </w:r>
       <w:r>
-        <w:instrText xml:space="preserve"> ADDIN EN.CITE &lt;EndNote&gt;&lt;Cite&gt;&lt;Author&gt;Wetter&lt;/Author&gt;&lt;Year&gt;2020&lt;/Year&gt;&lt;RecNum&gt;86&lt;/RecNum&gt;&lt;DisplayText&gt;[13]&lt;/DisplayText&gt;&lt;record&gt;&lt;rec-number&gt;86&lt;/rec-number&gt;&lt;foreign-keys&gt;&lt;key app="EN" db-id="mdae8500109496fea4aff9c086e16cc25895" timestamp="1793216821"&gt;86&lt;/key&gt;&lt;/foreign-keys&gt;&lt;ref-type name="Conference Paper"&gt;47&lt;/ref-type&gt;&lt;contributors&gt;&lt;authors&gt;&lt;author&gt;Wetter, Michael&lt;/author&gt;&lt;author&gt;Benne, Kyle&lt;/author&gt;&lt;author&gt;Gautier, Antoine&lt;/author&gt;&lt;author&gt;Nouidui, Thierry S.&lt;/author&gt;&lt;author&gt;Ramle, Agnes&lt;/author&gt;&lt;author&gt;Roth, Amir&lt;/author&gt;&lt;author&gt;Tummescheit, Hubertus&lt;/author&gt;&lt;author&gt;Mentzer, Stuart&lt;/author&gt;&lt;author&gt;Winther, Christian&lt;/author&gt;&lt;/authors&gt;&lt;/contributors&gt;&lt;titles&gt;&lt;title&gt;Lifting the Garage Door on Spawn, an Open-Source BEM-Controls Engine&lt;/title&gt;&lt;secondary-title&gt;Proceedings of SimBuild Conference 2020, ASHRAE/IBPSA-USA Building Simulation Conference&lt;/secondary-title&gt;&lt;/titles&gt;&lt;volume&gt;9&lt;/volume&gt;&lt;dates&gt;&lt;year&gt;2020&lt;/year&gt;&lt;/dates&gt;&lt;publisher&gt;IBPSA-USA&lt;/publisher&gt;&lt;label&gt;wetter2020&lt;/label&gt;&lt;urls&gt;&lt;/urls&gt;&lt;electronic-resource-num&gt;10.26868/25746308.2020.C063&lt;/electronic-resource-num&gt;&lt;/record&gt;&lt;/Cite&gt;&lt;/EndNote&gt;</w:instrText>
+        <w:instrText xml:space="preserve"> ADDIN EN.CITE &lt;EndNote&gt;&lt;Cite&gt;&lt;Author&gt;Wetter&lt;/Author&gt;&lt;Year&gt;2020&lt;/Year&gt;&lt;RecNum&gt;86&lt;/RecNum&gt;&lt;DisplayText&gt;[13]&lt;/DisplayText&gt;&lt;record&gt;&lt;rec-number&gt;86&lt;/rec-number&gt;&lt;foreign-keys&gt;&lt;key app="EN" db-id="mdae8500109496fea4aff9c086e16cc25895" timestamp="1793221304"&gt;86&lt;/key&gt;&lt;/foreign-keys&gt;&lt;ref-type name="Conference Paper"&gt;47&lt;/ref-type&gt;&lt;contributors&gt;&lt;authors&gt;&lt;author&gt;Wetter, Michael&lt;/author&gt;&lt;author&gt;Benne, Kyle&lt;/author&gt;&lt;author&gt;Gautier, Antoine&lt;/author&gt;&lt;author&gt;Nouidui, Thierry S.&lt;/author&gt;&lt;author&gt;Ramle, Agnes&lt;/author&gt;&lt;author&gt;Roth, Amir&lt;/author&gt;&lt;author&gt;Tummescheit, Hubertus&lt;/author&gt;&lt;author&gt;Mentzer, Stuart&lt;/author&gt;&lt;author&gt;Winther, Christian&lt;/author&gt;&lt;/authors&gt;&lt;/contributors&gt;&lt;titles&gt;&lt;title&gt;Lifting the Garage Door on Spawn, an Open-Source BEM-Controls Engine&lt;/title&gt;&lt;secondary-title&gt;Proceedings of SimBuild Conference 2020, ASHRAE/IBPSA-USA Building Simulation Conference&lt;/secondary-title&gt;&lt;/titles&gt;&lt;volume&gt;9&lt;/volume&gt;&lt;dates&gt;&lt;year&gt;2020&lt;/year&gt;&lt;/dates&gt;&lt;publisher&gt;IBPSA-USA&lt;/publisher&gt;&lt;label&gt;wetter2020&lt;/label&gt;&lt;urls&gt;&lt;/urls&gt;&lt;electronic-resource-num&gt;10.26868/25746308.2020.C063&lt;/electronic-resource-num&gt;&lt;/record&gt;&lt;/Cite&gt;&lt;/EndNote&gt;</w:instrText>
       </w:r>
       <w:r>
         <w:fldChar w:fldCharType="separate"/>
@@ -795,7 +795,7 @@
 PC9ZZWFyPjxSZWNOdW0+NDE8L1JlY051bT48RGlzcGxheVRleHQ+WzE04oCTMTZdPC9EaXNwbGF5
 VGV4dD48cmVjb3JkPjxyZWMtbnVtYmVyPjQxPC9yZWMtbnVtYmVyPjxmb3JlaWduLWtleXM+PGtl
 eSBhcHA9IkVOIiBkYi1pZD0ibWRhZTg1MDAxMDk0OTZmZWE0YWZmOWMwODZlMTZjYzI1ODk1IiB0
-aW1lc3RhbXA9IjE3OTMyMTY4MjEiPjQxPC9rZXk+PC9mb3JlaWduLWtleXM+PHJlZi10eXBlIG5h
+aW1lc3RhbXA9IjE3OTMyMjEzMDQiPjQxPC9rZXk+PC9mb3JlaWduLWtleXM+PHJlZi10eXBlIG5h
 bWU9IkNvbmZlcmVuY2UgUGFwZXIiPjQ3PC9yZWYtdHlwZT48Y29udHJpYnV0b3JzPjxhdXRob3Jz
 PjxhdXRob3I+Smltw6luZXotUmFib3NvLCBKYXZpZXI8L2F1dGhvcj48YXV0aG9yPkNhbXBveS1O
 aWV2ZXMsIEFsZWphbmRybzwvYXV0aG9yPjxhdXRob3I+TWFuamF2YWNhcy1MdWNhcywgQW50b25p
@@ -813,8 +813,8 @@
 dHJvbmljLXJlc291cmNlLW51bT48L3JlY29yZD48L0NpdGU+PENpdGU+PEF1dGhvcj5aaGFuZzwv
 QXV0aG9yPjxZZWFyPjIwMjA8L1llYXI+PFJlY051bT45MDwvUmVjTnVtPjxyZWNvcmQ+PHJlYy1u
 dW1iZXI+OTA8L3JlYy1udW1iZXI+PGZvcmVpZ24ta2V5cz48a2V5IGFwcD0iRU4iIGRiLWlkPSJt
-ZGFlODUwMDEwOTQ5NmZlYTRhZmY5YzA4NmUxNmNjMjU4OTUiIHRpbWVzdGFtcD0iMTc5MzIxNjgy
-MSI+OTA8L2tleT48L2ZvcmVpZ24ta2V5cz48cmVmLXR5cGUgbmFtZT0iQ29uZmVyZW5jZSBQYXBl
+ZGFlODUwMDEwOTQ5NmZlYTRhZmY5YzA4NmUxNmNjMjU4OTUiIHRpbWVzdGFtcD0iMTc5MzIyMTMw
+NCI+OTA8L2tleT48L2ZvcmVpZ24ta2V5cz48cmVmLXR5cGUgbmFtZT0iQ29uZmVyZW5jZSBQYXBl
 ciI+NDc8L3JlZi10eXBlPjxjb250cmlidXRvcnM+PGF1dGhvcnM+PGF1dGhvcj5aaGFuZywgVGlh
 bnl1PC9hdXRob3I+PGF1dGhvcj5BcmRha2FuaWFuLCBPbWlkPC9hdXRob3I+PC9hdXRob3JzPjwv
 Y29udHJpYnV0b3JzPjx0aXRsZXM+PHRpdGxlPkNPQlM6IENPbXByZWhlbnNpdmUgQnVpbGRpbmcg
@@ -829,7 +829,7 @@
 PjxDaXRlPjxBdXRob3I+Qmx1bTwvQXV0aG9yPjxZZWFyPjIwMjE8L1llYXI+PFJlY051bT43PC9S
 ZWNOdW0+PHJlY29yZD48cmVjLW51bWJlcj43PC9yZWMtbnVtYmVyPjxmb3JlaWduLWtleXM+PGtl
 eSBhcHA9IkVOIiBkYi1pZD0ibWRhZTg1MDAxMDk0OTZmZWE0YWZmOWMwODZlMTZjYzI1ODk1IiB0
-aW1lc3RhbXA9IjE3OTMyMTY4MjEiPjc8L2tleT48L2ZvcmVpZ24ta2V5cz48cmVmLXR5cGUgbmFt
+aW1lc3RhbXA9IjE3OTMyMjEzMDQiPjc8L2tleT48L2ZvcmVpZ24ta2V5cz48cmVmLXR5cGUgbmFt
 ZT0iSm91cm5hbCBBcnRpY2xlIj4xNzwvcmVmLXR5cGU+PGNvbnRyaWJ1dG9ycz48YXV0aG9ycz48
 YXV0aG9yPkJsdW0sIERhdmlkPC9hdXRob3I+PGF1dGhvcj5BcnJveW8sIEphdmllcjwvYXV0aG9y
 PjxhdXRob3I+SHVhbmcsIFNlbjwvYXV0aG9yPjxhdXRob3I+RHJnb8WIYSwgSsOhbjwvYXV0aG9y
@@ -861,7 +861,7 @@
 PC9ZZWFyPjxSZWNOdW0+NDE8L1JlY051bT48RGlzcGxheVRleHQ+WzE04oCTMTZdPC9EaXNwbGF5
 VGV4dD48cmVjb3JkPjxyZWMtbnVtYmVyPjQxPC9yZWMtbnVtYmVyPjxmb3JlaWduLWtleXM+PGtl
 eSBhcHA9IkVOIiBkYi1pZD0ibWRhZTg1MDAxMDk0OTZmZWE0YWZmOWMwODZlMTZjYzI1ODk1IiB0
-aW1lc3RhbXA9IjE3OTMyMTY4MjEiPjQxPC9rZXk+PC9mb3JlaWduLWtleXM+PHJlZi10eXBlIG5h
+aW1lc3RhbXA9IjE3OTMyMjEzMDQiPjQxPC9rZXk+PC9mb3JlaWduLWtleXM+PHJlZi10eXBlIG5h
 bWU9IkNvbmZlcmVuY2UgUGFwZXIiPjQ3PC9yZWYtdHlwZT48Y29udHJpYnV0b3JzPjxhdXRob3Jz
 PjxhdXRob3I+Smltw6luZXotUmFib3NvLCBKYXZpZXI8L2F1dGhvcj48YXV0aG9yPkNhbXBveS1O
 aWV2ZXMsIEFsZWphbmRybzwvYXV0aG9yPjxhdXRob3I+TWFuamF2YWNhcy1MdWNhcywgQW50b25p
@@ -879,8 +879,8 @@
 dHJvbmljLXJlc291cmNlLW51bT48L3JlY29yZD48L0NpdGU+PENpdGU+PEF1dGhvcj5aaGFuZzwv
 QXV0aG9yPjxZZWFyPjIwMjA8L1llYXI+PFJlY051bT45MDwvUmVjTnVtPjxyZWNvcmQ+PHJlYy1u
 dW1iZXI+OTA8L3JlYy1udW1iZXI+PGZvcmVpZ24ta2V5cz48a2V5IGFwcD0iRU4iIGRiLWlkPSJt
-ZGFlODUwMDEwOTQ5NmZlYTRhZmY5YzA4NmUxNmNjMjU4OTUiIHRpbWVzdGFtcD0iMTc5MzIxNjgy
-MSI+OTA8L2tleT48L2ZvcmVpZ24ta2V5cz48cmVmLXR5cGUgbmFtZT0iQ29uZmVyZW5jZSBQYXBl
+ZGFlODUwMDEwOTQ5NmZlYTRhZmY5YzA4NmUxNmNjMjU4OTUiIHRpbWVzdGFtcD0iMTc5MzIyMTMw
+NCI+OTA8L2tleT48L2ZvcmVpZ24ta2V5cz48cmVmLXR5cGUgbmFtZT0iQ29uZmVyZW5jZSBQYXBl
 ciI+NDc8L3JlZi10eXBlPjxjb250cmlidXRvcnM+PGF1dGhvcnM+PGF1dGhvcj5aaGFuZywgVGlh
 bnl1PC9hdXRob3I+PGF1dGhvcj5BcmRha2FuaWFuLCBPbWlkPC9hdXRob3I+PC9hdXRob3JzPjwv
 Y29udHJpYnV0b3JzPjx0aXRsZXM+PHRpdGxlPkNPQlM6IENPbXByZWhlbnNpdmUgQnVpbGRpbmcg
@@ -895,7 +895,7 @@
 PjxDaXRlPjxBdXRob3I+Qmx1bTwvQXV0aG9yPjxZZWFyPjIwMjE8L1llYXI+PFJlY051bT43PC9S
 ZWNOdW0+PHJlY29yZD48cmVjLW51bWJlcj43PC9yZWMtbnVtYmVyPjxmb3JlaWduLWtleXM+PGtl
 eSBhcHA9IkVOIiBkYi1pZD0ibWRhZTg1MDAxMDk0OTZmZWE0YWZmOWMwODZlMTZjYzI1ODk1IiB0
-aW1lc3RhbXA9IjE3OTMyMTY4MjEiPjc8L2tleT48L2ZvcmVpZ24ta2V5cz48cmVmLXR5cGUgbmFt
+aW1lc3RhbXA9IjE3OTMyMjEzMDQiPjc8L2tleT48L2ZvcmVpZ24ta2V5cz48cmVmLXR5cGUgbmFt
 ZT0iSm91cm5hbCBBcnRpY2xlIj4xNzwvcmVmLXR5cGU+PGNvbnRyaWJ1dG9ycz48YXV0aG9ycz48
 YXV0aG9yPkJsdW0sIERhdmlkPC9hdXRob3I+PGF1dGhvcj5BcnJveW8sIEphdmllcjwvYXV0aG9y
 PjxhdXRob3I+SHVhbmcsIFNlbjwvYXV0aG9yPjxhdXRob3I+RHJnb8WIYSwgSsOhbjwvYXV0aG9y
@@ -945,7 +945,7 @@
 cj48UmVjTnVtPjY4PC9SZWNOdW0+PERpc3BsYXlUZXh0PlsxN+KAkzIwXTwvRGlzcGxheVRleHQ+
 PHJlY29yZD48cmVjLW51bWJlcj42ODwvcmVjLW51bWJlcj48Zm9yZWlnbi1rZXlzPjxrZXkgYXBw
 PSJFTiIgZGItaWQ9Im1kYWU4NTAwMTA5NDk2ZmVhNGFmZjljMDg2ZTE2Y2MyNTg5NSIgdGltZXN0
-YW1wPSIxNzkzMjE2ODIxIj42ODwva2V5PjwvZm9yZWlnbi1rZXlzPjxyZWYtdHlwZSBuYW1lPSJD
+YW1wPSIxNzkzMjIxMzA0Ij42ODwva2V5PjwvZm9yZWlnbi1rZXlzPjxyZWYtdHlwZSBuYW1lPSJD
 b25mZXJlbmNlIFBhcGVyIj40NzwvcmVmLXR5cGU+PGNvbnRyaWJ1dG9ycz48YXV0aG9ycz48YXV0
 aG9yPlBhbG1pbnRpZXIsIEJyeWFuPC9hdXRob3I+PGF1dGhvcj5LcmlzaG5hbXVydGh5LCBEaGVl
 cGFrPC9hdXRob3I+PGF1dGhvcj5Ub3AsIFBoaWxpcDwvYXV0aG9yPjxhdXRob3I+U21pdGgsIFN0
@@ -963,7 +963,7 @@
 SGFyZHk8L0F1dGhvcj48WWVhcj4yMDI0PC9ZZWFyPjxSZWNOdW0+Mjk8L1JlY051bT48cmVjb3Jk
 PjxyZWMtbnVtYmVyPjI5PC9yZWMtbnVtYmVyPjxmb3JlaWduLWtleXM+PGtleSBhcHA9IkVOIiBk
 Yi1pZD0ibWRhZTg1MDAxMDk0OTZmZWE0YWZmOWMwODZlMTZjYzI1ODk1IiB0aW1lc3RhbXA9IjE3
-OTMyMTY4MjEiPjI5PC9rZXk+PC9mb3JlaWduLWtleXM+PHJlZi10eXBlIG5hbWU9IkpvdXJuYWwg
+OTMyMjEzMDQiPjI5PC9rZXk+PC9mb3JlaWduLWtleXM+PHJlZi10eXBlIG5hbWU9IkpvdXJuYWwg
 QXJ0aWNsZSI+MTc8L3JlZi10eXBlPjxjb250cmlidXRvcnM+PGF1dGhvcnM+PGF1dGhvcj5IYXJk
 eSwgVHJldm9yIEQuPC9hdXRob3I+PGF1dGhvcj5QYWxtaW50aWVyLCBCcnlhbjwvYXV0aG9yPjxh
 dXRob3I+VG9wLCBQaGlsaXAgTC48L2F1dGhvcj48YXV0aG9yPktyaXNobmFtdXJ0aHksIERoZWVw
@@ -980,7 +980,7 @@
 PC9yZWNvcmQ+PC9DaXRlPjxDaXRlPjxBdXRob3I+U3RlaW5icmluazwvQXV0aG9yPjxZZWFyPjIw
 MTk8L1llYXI+PFJlY051bT43ODwvUmVjTnVtPjxyZWNvcmQ+PHJlYy1udW1iZXI+Nzg8L3JlYy1u
 dW1iZXI+PGZvcmVpZ24ta2V5cz48a2V5IGFwcD0iRU4iIGRiLWlkPSJtZGFlODUwMDEwOTQ5NmZl
-YTRhZmY5YzA4NmUxNmNjMjU4OTUiIHRpbWVzdGFtcD0iMTc5MzIxNjgyMSI+Nzg8L2tleT48L2Zv
+YTRhZmY5YzA4NmUxNmNjMjU4OTUiIHRpbWVzdGFtcD0iMTc5MzIyMTMwNCI+Nzg8L2tleT48L2Zv
 cmVpZ24ta2V5cz48cmVmLXR5cGUgbmFtZT0iSm91cm5hbCBBcnRpY2xlIj4xNzwvcmVmLXR5cGU+
 PGNvbnRyaWJ1dG9ycz48YXV0aG9ycz48YXV0aG9yPlN0ZWluYnJpbmssIENvcm5lbGl1czwvYXV0
 aG9yPjxhdXRob3I+QmxhbmstQmFiYXphZGVoLCBNYXJpdGE8L2F1dGhvcj48YXV0aG9yPkVsLUFt
@@ -1002,7 +1002,7 @@
 Y29yZD48L0NpdGU+PENpdGU+PEF1dGhvcj5PZmVubG9jaDwvQXV0aG9yPjxZZWFyPjIwMjI8L1ll
 YXI+PFJlY051bT42MjwvUmVjTnVtPjxyZWNvcmQ+PHJlYy1udW1iZXI+NjI8L3JlYy1udW1iZXI+
 PGZvcmVpZ24ta2V5cz48a2V5IGFwcD0iRU4iIGRiLWlkPSJtZGFlODUwMDEwOTQ5NmZlYTRhZmY5
-YzA4NmUxNmNjMjU4OTUiIHRpbWVzdGFtcD0iMTc5MzIxNjgyMSI+NjI8L2tleT48L2ZvcmVpZ24t
+YzA4NmUxNmNjMjU4OTUiIHRpbWVzdGFtcD0iMTc5MzIyMTMwNCI+NjI8L2tleT48L2ZvcmVpZ24t
 a2V5cz48cmVmLXR5cGUgbmFtZT0iQ29uZmVyZW5jZSBQYXBlciI+NDc8L3JlZi10eXBlPjxjb250
 cmlidXRvcnM+PGF1dGhvcnM+PGF1dGhvcj5PZmVubG9jaCwgQW5uaWthPC9hdXRob3I+PGF1dGhv
 cj5TY2h3YXJ6LCBKYW4gU8O2cmVuPC9hdXRob3I+PGF1dGhvcj5Ub2xrLCBEZWJvcmFoPC9hdXRo
@@ -1029,7 +1029,7 @@
 cj48UmVjTnVtPjY4PC9SZWNOdW0+PERpc3BsYXlUZXh0PlsxN+KAkzIwXTwvRGlzcGxheVRleHQ+
 PHJlY29yZD48cmVjLW51bWJlcj42ODwvcmVjLW51bWJlcj48Zm9yZWlnbi1rZXlzPjxrZXkgYXBw
 PSJFTiIgZGItaWQ9Im1kYWU4NTAwMTA5NDk2ZmVhNGFmZjljMDg2ZTE2Y2MyNTg5NSIgdGltZXN0
-YW1wPSIxNzkzMjE2ODIxIj42ODwva2V5PjwvZm9yZWlnbi1rZXlzPjxyZWYtdHlwZSBuYW1lPSJD
+YW1wPSIxNzkzMjIxMzA0Ij42ODwva2V5PjwvZm9yZWlnbi1rZXlzPjxyZWYtdHlwZSBuYW1lPSJD
 b25mZXJlbmNlIFBhcGVyIj40NzwvcmVmLXR5cGU+PGNvbnRyaWJ1dG9ycz48YXV0aG9ycz48YXV0
 aG9yPlBhbG1pbnRpZXIsIEJyeWFuPC9hdXRob3I+PGF1dGhvcj5LcmlzaG5hbXVydGh5LCBEaGVl
 cGFrPC9hdXRob3I+PGF1dGhvcj5Ub3AsIFBoaWxpcDwvYXV0aG9yPjxhdXRob3I+U21pdGgsIFN0
@@ -1047,7 +1047,7 @@
 SGFyZHk8L0F1dGhvcj48WWVhcj4yMDI0PC9ZZWFyPjxSZWNOdW0+Mjk8L1JlY051bT48cmVjb3Jk
 PjxyZWMtbnVtYmVyPjI5PC9yZWMtbnVtYmVyPjxmb3JlaWduLWtleXM+PGtleSBhcHA9IkVOIiBk
 Yi1pZD0ibWRhZTg1MDAxMDk0OTZmZWE0YWZmOWMwODZlMTZjYzI1ODk1IiB0aW1lc3RhbXA9IjE3
-OTMyMTY4MjEiPjI5PC9rZXk+PC9mb3JlaWduLWtleXM+PHJlZi10eXBlIG5hbWU9IkpvdXJuYWwg
+OTMyMjEzMDQiPjI5PC9rZXk+PC9mb3JlaWduLWtleXM+PHJlZi10eXBlIG5hbWU9IkpvdXJuYWwg
 QXJ0aWNsZSI+MTc8L3JlZi10eXBlPjxjb250cmlidXRvcnM+PGF1dGhvcnM+PGF1dGhvcj5IYXJk
 eSwgVHJldm9yIEQuPC9hdXRob3I+PGF1dGhvcj5QYWxtaW50aWVyLCBCcnlhbjwvYXV0aG9yPjxh
 dXRob3I+VG9wLCBQaGlsaXAgTC48L2F1dGhvcj48YXV0aG9yPktyaXNobmFtdXJ0aHksIERoZWVw
@@ -1064,7 +1064,7 @@
 PC9yZWNvcmQ+PC9DaXRlPjxDaXRlPjxBdXRob3I+U3RlaW5icmluazwvQXV0aG9yPjxZZWFyPjIw
 MTk8L1llYXI+PFJlY051bT43ODwvUmVjTnVtPjxyZWNvcmQ+PHJlYy1udW1iZXI+Nzg8L3JlYy1u
 dW1iZXI+PGZvcmVpZ24ta2V5cz48a2V5IGFwcD0iRU4iIGRiLWlkPSJtZGFlODUwMDEwOTQ5NmZl
-YTRhZmY5YzA4NmUxNmNjMjU4OTUiIHRpbWVzdGFtcD0iMTc5MzIxNjgyMSI+Nzg8L2tleT48L2Zv
+YTRhZmY5YzA4NmUxNmNjMjU4OTUiIHRpbWVzdGFtcD0iMTc5MzIyMTMwNCI+Nzg8L2tleT48L2Zv
 cmVpZ24ta2V5cz48cmVmLXR5cGUgbmFtZT0iSm91cm5hbCBBcnRpY2xlIj4xNzwvcmVmLXR5cGU+
 PGNvbnRyaWJ1dG9ycz48YXV0aG9ycz48YXV0aG9yPlN0ZWluYnJpbmssIENvcm5lbGl1czwvYXV0
 aG9yPjxhdXRob3I+QmxhbmstQmFiYXphZGVoLCBNYXJpdGE8L2F1dGhvcj48YXV0aG9yPkVsLUFt
@@ -1086,7 +1086,7 @@
 Y29yZD48L0NpdGU+PENpdGU+PEF1dGhvcj5PZmVubG9jaDwvQXV0aG9yPjxZZWFyPjIwMjI8L1ll
 YXI+PFJlY051bT42MjwvUmVjTnVtPjxyZWNvcmQ+PHJlYy1udW1iZXI+NjI8L3JlYy1udW1iZXI+
 PGZvcmVpZ24ta2V5cz48a2V5IGFwcD0iRU4iIGRiLWlkPSJtZGFlODUwMDEwOTQ5NmZlYTRhZmY5
-YzA4NmUxNmNjMjU4OTUiIHRpbWVzdGFtcD0iMTc5MzIxNjgyMSI+NjI8L2tleT48L2ZvcmVpZ24t
+YzA4NmUxNmNjMjU4OTUiIHRpbWVzdGFtcD0iMTc5MzIyMTMwNCI+NjI8L2tleT48L2ZvcmVpZ24t
 a2V5cz48cmVmLXR5cGUgbmFtZT0iQ29uZmVyZW5jZSBQYXBlciI+NDc8L3JlZi10eXBlPjxjb250
 cmlidXRvcnM+PGF1dGhvcnM+PGF1dGhvcj5PZmVubG9jaCwgQW5uaWthPC9hdXRob3I+PGF1dGhv
 cj5TY2h3YXJ6LCBKYW4gU8O2cmVuPC9hdXRob3I+PGF1dGhvcj5Ub2xrLCBEZWJvcmFoPC9hdXRo
@@ -1137,7 +1137,7 @@
         <w:fldChar w:fldCharType="begin"/>
       </w:r>
       <w:r>
-        <w:instrText xml:space="preserve"> ADDIN EN.CITE &lt;EndNote&gt;&lt;Cite&gt;&lt;Author&gt;U.S. Department of Energy&lt;/Author&gt;&lt;Year&gt;2024&lt;/Year&gt;&lt;RecNum&gt;20&lt;/RecNum&gt;&lt;DisplayText&gt;[21]&lt;/DisplayText&gt;&lt;record&gt;&lt;rec-number&gt;20&lt;/rec-number&gt;&lt;foreign-keys&gt;&lt;key app="EN" db-id="mdae8500109496fea4aff9c086e16cc25895" timestamp="1793216821"&gt;20&lt;/key&gt;&lt;/foreign-keys&gt;&lt;ref-type name="Web Page"&gt;12&lt;/ref-type&gt;&lt;contributors&gt;&lt;authors&gt;&lt;author&gt;U.S. Department of Energy&lt;/author&gt;&lt;/authors&gt;&lt;/contributors&gt;&lt;titles&gt;&lt;title&gt;EnergyPlus Output Details and Examples: eplusout.rdd&lt;/title&gt;&lt;/titles&gt;&lt;dates&gt;&lt;year&gt;2024&lt;/year&gt;&lt;/dates&gt;&lt;label&gt;doe2024rdd&lt;/label&gt;&lt;urls&gt;&lt;related-urls&gt;&lt;url&gt;https://bigladdersoftware.com/epx/docs/24-1/output-details-and-examples/eplusout-rdd.html&lt;/url&gt;&lt;/related-urls&gt;&lt;/urls&gt;&lt;access-date&gt;2026-10-28&lt;/access-date&gt;&lt;/record&gt;&lt;/Cite&gt;&lt;/EndNote&gt;</w:instrText>
+        <w:instrText xml:space="preserve"> ADDIN EN.CITE &lt;EndNote&gt;&lt;Cite&gt;&lt;Author&gt;U.S. Department of Energy&lt;/Author&gt;&lt;Year&gt;2024&lt;/Year&gt;&lt;RecNum&gt;20&lt;/RecNum&gt;&lt;DisplayText&gt;[21]&lt;/DisplayText&gt;&lt;record&gt;&lt;rec-number&gt;20&lt;/rec-number&gt;&lt;foreign-keys&gt;&lt;key app="EN" db-id="mdae8500109496fea4aff9c086e16cc25895" timestamp="1793221304"&gt;20&lt;/key&gt;&lt;/foreign-keys&gt;&lt;ref-type name="Web Page"&gt;12&lt;/ref-type&gt;&lt;contributors&gt;&lt;authors&gt;&lt;author&gt;U.S. Department of Energy&lt;/author&gt;&lt;/authors&gt;&lt;/contributors&gt;&lt;titles&gt;&lt;title&gt;EnergyPlus Output Details and Examples: eplusout.rdd&lt;/title&gt;&lt;/titles&gt;&lt;dates&gt;&lt;year&gt;2024&lt;/year&gt;&lt;/dates&gt;&lt;label&gt;doe2024rdd&lt;/label&gt;&lt;urls&gt;&lt;related-urls&gt;&lt;url&gt;https://bigladdersoftware.com/epx/docs/24-1/output-details-and-examples/eplusout-rdd.html&lt;/url&gt;&lt;/related-urls&gt;&lt;/urls&gt;&lt;access-date&gt;2026-10-28&lt;/access-date&gt;&lt;/record&gt;&lt;/Cite&gt;&lt;/EndNote&gt;</w:instrText>
       </w:r>
       <w:r>
         <w:fldChar w:fldCharType="separate"/>
@@ -1160,7 +1160,7 @@
 UmVjTnVtPjQ3PC9SZWNOdW0+PERpc3BsYXlUZXh0Pls3LDIyXTwvRGlzcGxheVRleHQ+PHJlY29y
 ZD48cmVjLW51bWJlcj40NzwvcmVjLW51bWJlcj48Zm9yZWlnbi1rZXlzPjxrZXkgYXBwPSJFTiIg
 ZGItaWQ9Im1kYWU4NTAwMTA5NDk2ZmVhNGFmZjljMDg2ZTE2Y2MyNTg5NSIgdGltZXN0YW1wPSIx
-NzkzMjE2ODIxIj40Nzwva2V5PjwvZm9yZWlnbi1rZXlzPjxyZWYtdHlwZSBuYW1lPSJKb3VybmFs
+NzkzMjIxMzA0Ij40Nzwva2V5PjwvZm9yZWlnbi1rZXlzPjxyZWYtdHlwZSBuYW1lPSJKb3VybmFs
 IEFydGljbGUiPjE3PC9yZWYtdHlwZT48Y29udHJpYnV0b3JzPjxhdXRob3JzPjxhdXRob3I+S8O8
 YmxlciwgUi48L2F1dGhvcj48YXV0aG9yPlNjaGllaGxlbiwgVy48L2F1dGhvcj48L2F1dGhvcnM+
 PC9jb250cmlidXRvcnM+PHRpdGxlcz48dGl0bGU+VHdvIE1ldGhvZHMgb2YgU2ltdWxhdG9yIENv
@@ -1177,7 +1177,7 @@
 c291cmNlLW51bT48L3JlY29yZD48L0NpdGU+PENpdGU+PEF1dGhvcj5Hb21lczwvQXV0aG9yPjxZ
 ZWFyPjIwMTg8L1llYXI+PFJlY051bT4yNjwvUmVjTnVtPjxyZWNvcmQ+PHJlYy1udW1iZXI+MjY8
 L3JlYy1udW1iZXI+PGZvcmVpZ24ta2V5cz48a2V5IGFwcD0iRU4iIGRiLWlkPSJtZGFlODUwMDEw
-OTQ5NmZlYTRhZmY5YzA4NmUxNmNjMjU4OTUiIHRpbWVzdGFtcD0iMTc5MzIxNjgyMSI+MjY8L2tl
+OTQ5NmZlYTRhZmY5YzA4NmUxNmNjMjU4OTUiIHRpbWVzdGFtcD0iMTc5MzIyMTMwNCI+MjY8L2tl
 eT48L2ZvcmVpZ24ta2V5cz48cmVmLXR5cGUgbmFtZT0iSm91cm5hbCBBcnRpY2xlIj4xNzwvcmVm
 LXR5cGU+PGNvbnRyaWJ1dG9ycz48YXV0aG9ycz48YXV0aG9yPkdvbWVzLCBDbMOhdWRpbzwvYXV0
 aG9yPjxhdXRob3I+VGh1bGUsIENhc3BlcjwvYXV0aG9yPjxhdXRob3I+QnJvbWFuLCBEYXZpZDwv
@@ -1203,7 +1203,7 @@
 UmVjTnVtPjQ3PC9SZWNOdW0+PERpc3BsYXlUZXh0Pls3LDIyXTwvRGlzcGxheVRleHQ+PHJlY29y
 ZD48cmVjLW51bWJlcj40NzwvcmVjLW51bWJlcj48Zm9yZWlnbi1rZXlzPjxrZXkgYXBwPSJFTiIg
 ZGItaWQ9Im1kYWU4NTAwMTA5NDk2ZmVhNGFmZjljMDg2ZTE2Y2MyNTg5NSIgdGltZXN0YW1wPSIx
-NzkzMjE2ODIxIj40Nzwva2V5PjwvZm9yZWlnbi1rZXlzPjxyZWYtdHlwZSBuYW1lPSJKb3VybmFs
+NzkzMjIxMzA0Ij40Nzwva2V5PjwvZm9yZWlnbi1rZXlzPjxyZWYtdHlwZSBuYW1lPSJKb3VybmFs
 IEFydGljbGUiPjE3PC9yZWYtdHlwZT48Y29udHJpYnV0b3JzPjxhdXRob3JzPjxhdXRob3I+S8O8
 YmxlciwgUi48L2F1dGhvcj48YXV0aG9yPlNjaGllaGxlbiwgVy48L2F1dGhvcj48L2F1dGhvcnM+
 PC9jb250cmlidXRvcnM+PHRpdGxlcz48dGl0bGU+VHdvIE1ldGhvZHMgb2YgU2ltdWxhdG9yIENv
@@ -1220,7 +1220,7 @@
 c291cmNlLW51bT48L3JlY29yZD48L0NpdGU+PENpdGU+PEF1dGhvcj5Hb21lczwvQXV0aG9yPjxZ
 ZWFyPjIwMTg8L1llYXI+PFJlY051bT4yNjwvUmVjTnVtPjxyZWNvcmQ+PHJlYy1udW1iZXI+MjY8
 L3JlYy1udW1iZXI+PGZvcmVpZ24ta2V5cz48a2V5IGFwcD0iRU4iIGRiLWlkPSJtZGFlODUwMDEw
-OTQ5NmZlYTRhZmY5YzA4NmUxNmNjMjU4OTUiIHRpbWVzdGFtcD0iMTc5MzIxNjgyMSI+MjY8L2tl
+OTQ5NmZlYTRhZmY5YzA4NmUxNmNjMjU4OTUiIHRpbWVzdGFtcD0iMTc5MzIyMTMwNCI+MjY8L2tl
 eT48L2ZvcmVpZ24ta2V5cz48cmVmLXR5cGUgbmFtZT0iSm91cm5hbCBBcnRpY2xlIj4xNzwvcmVm
 LXR5cGU+PGNvbnRyaWJ1dG9ycz48YXV0aG9ycz48YXV0aG9yPkdvbWVzLCBDbMOhdWRpbzwvYXV0
 aG9yPjxhdXRob3I+VGh1bGUsIENhc3BlcjwvYXV0aG9yPjxhdXRob3I+QnJvbWFuLCBEYXZpZDwv
@@ -1264,7 +1264,7 @@
 PFJlY051bT44MTwvUmVjTnVtPjxEaXNwbGF5VGV4dD5bMjMsMjRdPC9EaXNwbGF5VGV4dD48cmVj
 b3JkPjxyZWMtbnVtYmVyPjgxPC9yZWMtbnVtYmVyPjxmb3JlaWduLWtleXM+PGtleSBhcHA9IkVO
 IiBkYi1pZD0ibWRhZTg1MDAxMDk0OTZmZWE0YWZmOWMwODZlMTZjYzI1ODk1IiB0aW1lc3RhbXA9
-IjE3OTMyMTY4MjEiPjgxPC9rZXk+PC9mb3JlaWduLWtleXM+PHJlZi10eXBlIG5hbWU9IkNvbmZl
+IjE3OTMyMjEzMDQiPjgxPC9rZXk+PC9mb3JlaWduLWtleXM+PHJlZi10eXBlIG5hbWU9IkNvbmZl
 cmVuY2UgUGFwZXIiPjQ3PC9yZWYtdHlwZT48Y29udHJpYnV0b3JzPjxhdXRob3JzPjxhdXRob3I+
 VHJpcGFraXMsIFN0YXZyb3M8L2F1dGhvcj48L2F1dGhvcnM+PC9jb250cmlidXRvcnM+PHRpdGxl
 cz48dGl0bGU+QnJpZGdpbmcgdGhlIHNlbWFudGljIGdhcCBiZXR3ZWVuIGhldGVyb2dlbmVvdXMg
@@ -1279,7 +1279,7 @@
 bWVzPC9BdXRob3I+PFllYXI+MjAxOTwvWWVhcj48UmVjTnVtPjI3PC9SZWNOdW0+PHJlY29yZD48
 cmVjLW51bWJlcj4yNzwvcmVjLW51bWJlcj48Zm9yZWlnbi1rZXlzPjxrZXkgYXBwPSJFTiIgZGIt
 aWQ9Im1kYWU4NTAwMTA5NDk2ZmVhNGFmZjljMDg2ZTE2Y2MyNTg5NSIgdGltZXN0YW1wPSIxNzkz
-MjE2ODIxIj4yNzwva2V5PjwvZm9yZWlnbi1rZXlzPjxyZWYtdHlwZSBuYW1lPSJKb3VybmFsIEFy
+MjIxMzA0Ij4yNzwva2V5PjwvZm9yZWlnbi1rZXlzPjxyZWYtdHlwZSBuYW1lPSJKb3VybmFsIEFy
 dGljbGUiPjE3PC9yZWYtdHlwZT48Y29udHJpYnV0b3JzPjxhdXRob3JzPjxhdXRob3I+R29tZXMs
 IENsw6F1ZGlvPC9hdXRob3I+PGF1dGhvcj5NZXllcnMsIEJhcnQ8L2F1dGhvcj48YXV0aG9yPkRl
 bmlsLCBKb2FjaGltPC9hdXRob3I+PGF1dGhvcj5UaHVsZSwgQ2FzcGVyPC9hdXRob3I+PGF1dGhv
@@ -1306,7 +1306,7 @@
 PFJlY051bT44MTwvUmVjTnVtPjxEaXNwbGF5VGV4dD5bMjMsMjRdPC9EaXNwbGF5VGV4dD48cmVj
 b3JkPjxyZWMtbnVtYmVyPjgxPC9yZWMtbnVtYmVyPjxmb3JlaWduLWtleXM+PGtleSBhcHA9IkVO
 IiBkYi1pZD0ibWRhZTg1MDAxMDk0OTZmZWE0YWZmOWMwODZlMTZjYzI1ODk1IiB0aW1lc3RhbXA9
-IjE3OTMyMTY4MjEiPjgxPC9rZXk+PC9mb3JlaWduLWtleXM+PHJlZi10eXBlIG5hbWU9IkNvbmZl
+IjE3OTMyMjEzMDQiPjgxPC9rZXk+PC9mb3JlaWduLWtleXM+PHJlZi10eXBlIG5hbWU9IkNvbmZl
 cmVuY2UgUGFwZXIiPjQ3PC9yZWYtdHlwZT48Y29udHJpYnV0b3JzPjxhdXRob3JzPjxhdXRob3I+
 VHJpcGFraXMsIFN0YXZyb3M8L2F1dGhvcj48L2F1dGhvcnM+PC9jb250cmlidXRvcnM+PHRpdGxl
 cz48dGl0bGU+QnJpZGdpbmcgdGhlIHNlbWFudGljIGdhcCBiZXR3ZWVuIGhldGVyb2dlbmVvdXMg
@@ -1321,7 +1321,7 @@
 bWVzPC9BdXRob3I+PFllYXI+MjAxOTwvWWVhcj48UmVjTnVtPjI3PC9SZWNOdW0+PHJlY29yZD48
 cmVjLW51bWJlcj4yNzwvcmVjLW51bWJlcj48Zm9yZWlnbi1rZXlzPjxrZXkgYXBwPSJFTiIgZGIt
 aWQ9Im1kYWU4NTAwMTA5NDk2ZmVhNGFmZjljMDg2ZTE2Y2MyNTg5NSIgdGltZXN0YW1wPSIxNzkz
-MjE2ODIxIj4yNzwva2V5PjwvZm9yZWlnbi1rZXlzPjxyZWYtdHlwZSBuYW1lPSJKb3VybmFsIEFy
+MjIxMzA0Ij4yNzwva2V5PjwvZm9yZWlnbi1rZXlzPjxyZWYtdHlwZSBuYW1lPSJKb3VybmFsIEFy
 dGljbGUiPjE3PC9yZWYtdHlwZT48Y29udHJpYnV0b3JzPjxhdXRob3JzPjxhdXRob3I+R29tZXMs
 IENsw6F1ZGlvPC9hdXRob3I+PGF1dGhvcj5NZXllcnMsIEJhcnQ8L2F1dGhvcj48YXV0aG9yPkRl
 bmlsLCBKb2FjaGltPC9hdXRob3I+PGF1dGhvcj5UaHVsZSwgQ2FzcGVyPC9hdXRob3I+PGF1dGhv
@@ -1372,7 +1372,7 @@
         <w:fldChar w:fldCharType="begin"/>
       </w:r>
       <w:r>
-        <w:instrText xml:space="preserve"> ADDIN EN.CITE &lt;EndNote&gt;&lt;Cite&gt;&lt;Author&gt;Ouyang&lt;/Author&gt;&lt;Year&gt;2025&lt;/Year&gt;&lt;RecNum&gt;66&lt;/RecNum&gt;&lt;DisplayText&gt;[25]&lt;/DisplayText&gt;&lt;record&gt;&lt;rec-number&gt;66&lt;/rec-number&gt;&lt;foreign-keys&gt;&lt;key app="EN" db-id="mdae8500109496fea4aff9c086e16cc25895" timestamp="1793216821"&gt;66&lt;/key&gt;&lt;/foreign-keys&gt;&lt;ref-type name="Journal Article"&gt;17&lt;/ref-type&gt;&lt;contributors&gt;&lt;authors&gt;&lt;author&gt;Ouyang, Shuyin&lt;/author&gt;&lt;author&gt;Zhang, Jie M.&lt;/author&gt;&lt;author&gt;Harman, Mark&lt;/author&gt;&lt;author&gt;Wang, Meng&lt;/author&gt;&lt;/authors&gt;&lt;/contributors&gt;&lt;titles&gt;&lt;title&gt;An Empirical Study of the Non-Determinism of ChatGPT in Code Generation&lt;/title&gt;&lt;secondary-title&gt;ACM Transactions on Software Engineering and Methodology&lt;/secondary-title&gt;&lt;alt-title&gt;ACM Trans. Softw. Eng. Methodol.&lt;/alt-title&gt;&lt;/titles&gt;&lt;periodical&gt;&lt;full-title&gt;ACM Transactions on Software Engineering and Methodology&lt;/full-title&gt;&lt;abbr-1&gt;ACM Trans. Softw. Eng. Methodol.&lt;/abbr-1&gt;&lt;/periodical&gt;&lt;pages&gt;1-28&lt;/pages&gt;&lt;volume&gt;34&lt;/volume&gt;&lt;number&gt;2&lt;/number&gt;&lt;dates&gt;&lt;year&gt;2025&lt;/year&gt;&lt;/dates&gt;&lt;publisher&gt;ACM&lt;/publisher&gt;&lt;label&gt;ouyang2025&lt;/label&gt;&lt;urls&gt;&lt;/urls&gt;&lt;electronic-resource-num&gt;10.1145/3697010&lt;/electronic-resource-num&gt;&lt;/record&gt;&lt;/Cite&gt;&lt;/EndNote&gt;</w:instrText>
+        <w:instrText xml:space="preserve"> ADDIN EN.CITE &lt;EndNote&gt;&lt;Cite&gt;&lt;Author&gt;Ouyang&lt;/Author&gt;&lt;Year&gt;2025&lt;/Year&gt;&lt;RecNum&gt;66&lt;/RecNum&gt;&lt;DisplayText&gt;[25]&lt;/DisplayText&gt;&lt;record&gt;&lt;rec-number&gt;66&lt;/rec-number&gt;&lt;foreign-keys&gt;&lt;key app="EN" db-id="mdae8500109496fea4aff9c086e16cc25895" timestamp="1793221304"&gt;66&lt;/key&gt;&lt;/foreign-keys&gt;&lt;ref-type name="Journal Article"&gt;17&lt;/ref-type&gt;&lt;contributors&gt;&lt;authors&gt;&lt;author&gt;Ouyang, Shuyin&lt;/author&gt;&lt;author&gt;Zhang, Jie M.&lt;/author&gt;&lt;author&gt;Harman, Mark&lt;/author&gt;&lt;author&gt;Wang, Meng&lt;/author&gt;&lt;/authors&gt;&lt;/contributors&gt;&lt;titles&gt;&lt;title&gt;An Empirical Study of the Non-Determinism of ChatGPT in Code Generation&lt;/title&gt;&lt;secondary-title&gt;ACM Transactions on Software Engineering and Methodology&lt;/secondary-title&gt;&lt;alt-title&gt;ACM Trans. Softw. Eng. Methodol.&lt;/alt-title&gt;&lt;/titles&gt;&lt;periodical&gt;&lt;full-title&gt;ACM Transactions on Software Engineering and Methodology&lt;/full-title&gt;&lt;abbr-1&gt;ACM Trans. Softw. Eng. Methodol.&lt;/abbr-1&gt;&lt;/periodical&gt;&lt;pages&gt;1-28&lt;/pages&gt;&lt;volume&gt;34&lt;/volume&gt;&lt;number&gt;2&lt;/number&gt;&lt;dates&gt;&lt;year&gt;2025&lt;/year&gt;&lt;/dates&gt;&lt;publisher&gt;ACM&lt;/publisher&gt;&lt;label&gt;ouyang2025&lt;/label&gt;&lt;urls&gt;&lt;/urls&gt;&lt;electronic-resource-num&gt;10.1145/3697010&lt;/electronic-resource-num&gt;&lt;/record&gt;&lt;/Cite&gt;&lt;/EndNote&gt;</w:instrText>
       </w:r>
       <w:r>
         <w:fldChar w:fldCharType="separate"/>
@@ -1393,7 +1393,7 @@
         <w:fldChar w:fldCharType="begin"/>
       </w:r>
       <w:r>
-        <w:instrText xml:space="preserve"> ADDIN EN.CITE &lt;EndNote&gt;&lt;Cite&gt;&lt;Author&gt;Neubauer&lt;/Author&gt;&lt;Year&gt;2026&lt;/Year&gt;&lt;RecNum&gt;57&lt;/RecNum&gt;&lt;DisplayText&gt;[26]&lt;/DisplayText&gt;&lt;record&gt;&lt;rec-number&gt;57&lt;/rec-number&gt;&lt;foreign-keys&gt;&lt;key app="EN" db-id="mdae8500109496fea4aff9c086e16cc25895" timestamp="1793216821"&gt;57&lt;/key&gt;&lt;/foreign-keys&gt;&lt;ref-type name="Generic"&gt;13&lt;/ref-type&gt;&lt;contributors&gt;&lt;authors&gt;&lt;author&gt;Neubauer, Alexander&lt;/author&gt;&lt;author&gt;Hong, Tianzhen&lt;/author&gt;&lt;author&gt;Li, Han&lt;/author&gt;&lt;author&gt;Yu, Mengbo&lt;/author&gt;&lt;author&gt;Darbandi, Amin&lt;/author&gt;&lt;author&gt;Fürst, Yannick&lt;/author&gt;&lt;author&gt;Kriegel, Martin&lt;/author&gt;&lt;/authors&gt;&lt;/contributors&gt;&lt;titles&gt;&lt;title&gt;Large Language Models for HVAC Operations in Building Energy Systems: A Critical Review of Methods, Applications, and Deployment Readiness&lt;/title&gt;&lt;secondary-title&gt;arXiv&lt;/secondary-title&gt;&lt;/titles&gt;&lt;dates&gt;&lt;year&gt;2026&lt;/year&gt;&lt;/dates&gt;&lt;label&gt;neubauer2026&lt;/label&gt;&lt;work-type&gt;arXiv:2609.05314&lt;/work-type&gt;&lt;urls&gt;&lt;related-urls&gt;&lt;url&gt;https://arxiv.org/abs/2609.05314&lt;/url&gt;&lt;/related-urls&gt;&lt;/urls&gt;&lt;electronic-resource-num&gt;10.48550/arXiv.2609.05314&lt;/electronic-resource-num&gt;&lt;/record&gt;&lt;/Cite&gt;&lt;/EndNote&gt;</w:instrText>
+        <w:instrText xml:space="preserve"> ADDIN EN.CITE &lt;EndNote&gt;&lt;Cite&gt;&lt;Author&gt;Neubauer&lt;/Author&gt;&lt;Year&gt;2026&lt;/Year&gt;&lt;RecNum&gt;57&lt;/RecNum&gt;&lt;DisplayText&gt;[26]&lt;/DisplayText&gt;&lt;record&gt;&lt;rec-number&gt;57&lt;/rec-number&gt;&lt;foreign-keys&gt;&lt;key app="EN" db-id="mdae8500109496fea4aff9c086e16cc25895" timestamp="1793221304"&gt;57&lt;/key&gt;&lt;/foreign-keys&gt;&lt;ref-type name="Generic"&gt;13&lt;/ref-type&gt;&lt;contributors&gt;&lt;authors&gt;&lt;author&gt;Neubauer, Alexander&lt;/author&gt;&lt;author&gt;Hong, Tianzhen&lt;/author&gt;&lt;author&gt;Li, Han&lt;/author&gt;&lt;author&gt;Yu, Mengbo&lt;/author&gt;&lt;author&gt;Darbandi, Amin&lt;/author&gt;&lt;author&gt;Fürst, Yannick&lt;/author&gt;&lt;author&gt;Kriegel, Martin&lt;/author&gt;&lt;/authors&gt;&lt;/contributors&gt;&lt;titles&gt;&lt;title&gt;Large Language Models for HVAC Operations in Building Energy Systems: A Critical Review of Methods, Applications, and Deployment Readiness&lt;/title&gt;&lt;secondary-title&gt;arXiv&lt;/secondary-title&gt;&lt;/titles&gt;&lt;dates&gt;&lt;year&gt;2026&lt;/year&gt;&lt;/dates&gt;&lt;label&gt;neubauer2026&lt;/label&gt;&lt;work-type&gt;arXiv:2609.05314&lt;/work-type&gt;&lt;urls&gt;&lt;related-urls&gt;&lt;url&gt;https://arxiv.org/abs/2609.05314&lt;/url&gt;&lt;/related-urls&gt;&lt;/urls&gt;&lt;electronic-resource-num&gt;10.48550/arXiv.2609.05314&lt;/electronic-resource-num&gt;&lt;/record&gt;&lt;/Cite&gt;&lt;/EndNote&gt;</w:instrText>
       </w:r>
       <w:r>
         <w:fldChar w:fldCharType="separate"/>
@@ -1414,7 +1414,7 @@
         <w:fldChar w:fldCharType="begin"/>
       </w:r>
       <w:r>
-        <w:instrText xml:space="preserve"> ADDIN EN.CITE &lt;EndNote&gt;&lt;Cite&gt;&lt;Author&gt;Henderson&lt;/Author&gt;&lt;Year&gt;2018&lt;/Year&gt;&lt;RecNum&gt;32&lt;/RecNum&gt;&lt;DisplayText&gt;[27]&lt;/DisplayText&gt;&lt;record&gt;&lt;rec-number&gt;32&lt;/rec-number&gt;&lt;foreign-keys&gt;&lt;key app="EN" db-id="mdae8500109496fea4aff9c086e16cc25895" timestamp="1793216821"&gt;32&lt;/key&gt;&lt;/foreign-keys&gt;&lt;ref-type name="Conference Paper"&gt;47&lt;/ref-type&gt;&lt;contributors&gt;&lt;authors&gt;&lt;author&gt;Henderson, Peter&lt;/author&gt;&lt;author&gt;Islam, Riashat&lt;/author&gt;&lt;author&gt;Bachman, Philip&lt;/author&gt;&lt;author&gt;Pineau, Joelle&lt;/author&gt;&lt;author&gt;Precup, Doina&lt;/author&gt;&lt;author&gt;Meger, David&lt;/author&gt;&lt;/authors&gt;&lt;/contributors&gt;&lt;titles&gt;&lt;title&gt;Deep Reinforcement Learning That Matters&lt;/title&gt;&lt;secondary-title&gt;Proceedings of the AAAI Conference on Artificial Intelligence&lt;/secondary-title&gt;&lt;/titles&gt;&lt;pages&gt;3207-3214&lt;/pages&gt;&lt;volume&gt;32&lt;/volume&gt;&lt;number&gt;1&lt;/number&gt;&lt;dates&gt;&lt;year&gt;2018&lt;/year&gt;&lt;/dates&gt;&lt;publisher&gt;AAAI Press&lt;/publisher&gt;&lt;label&gt;henderson2018&lt;/label&gt;&lt;urls&gt;&lt;/urls&gt;&lt;electronic-resource-num&gt;10.1609/aaai.v32i1.11694&lt;/electronic-resource-num&gt;&lt;/record&gt;&lt;/Cite&gt;&lt;/EndNote&gt;</w:instrText>
+        <w:instrText xml:space="preserve"> ADDIN EN.CITE &lt;EndNote&gt;&lt;Cite&gt;&lt;Author&gt;Henderson&lt;/Author&gt;&lt;Year&gt;2018&lt;/Year&gt;&lt;RecNum&gt;32&lt;/RecNum&gt;&lt;DisplayText&gt;[27]&lt;/DisplayText&gt;&lt;record&gt;&lt;rec-number&gt;32&lt;/rec-number&gt;&lt;foreign-keys&gt;&lt;key app="EN" db-id="mdae8500109496fea4aff9c086e16cc25895" timestamp="1793221304"&gt;32&lt;/key&gt;&lt;/foreign-keys&gt;&lt;ref-type name="Conference Paper"&gt;47&lt;/ref-type&gt;&lt;contributors&gt;&lt;authors&gt;&lt;author&gt;Henderson, Peter&lt;/author&gt;&lt;author&gt;Islam, Riashat&lt;/author&gt;&lt;author&gt;Bachman, Philip&lt;/author&gt;&lt;author&gt;Pineau, Joelle&lt;/author&gt;&lt;author&gt;Precup, Doina&lt;/author&gt;&lt;author&gt;Meger, David&lt;/author&gt;&lt;/authors&gt;&lt;/contributors&gt;&lt;titles&gt;&lt;title&gt;Deep Reinforcement Learning That Matters&lt;/title&gt;&lt;secondary-title&gt;Proceedings of the AAAI Conference on Artificial Intelligence&lt;/secondary-title&gt;&lt;/titles&gt;&lt;pages&gt;3207-3214&lt;/pages&gt;&lt;volume&gt;32&lt;/volume&gt;&lt;number&gt;1&lt;/number&gt;&lt;dates&gt;&lt;year&gt;2018&lt;/year&gt;&lt;/dates&gt;&lt;publisher&gt;AAAI Press&lt;/publisher&gt;&lt;label&gt;henderson2018&lt;/label&gt;&lt;urls&gt;&lt;/urls&gt;&lt;electronic-resource-num&gt;10.1609/aaai.v32i1.11694&lt;/electronic-resource-num&gt;&lt;/record&gt;&lt;/Cite&gt;&lt;/EndNote&gt;</w:instrText>
       </w:r>
       <w:r>
         <w:fldChar w:fldCharType="separate"/>
@@ -1435,7 +1435,7 @@
         <w:fldChar w:fldCharType="begin"/>
       </w:r>
       <w:r>
-        <w:instrText xml:space="preserve"> ADDIN EN.CITE &lt;EndNote&gt;&lt;Cite&gt;&lt;Author&gt;Neubauer&lt;/Author&gt;&lt;Year&gt;2026&lt;/Year&gt;&lt;RecNum&gt;57&lt;/RecNum&gt;&lt;DisplayText&gt;[26]&lt;/DisplayText&gt;&lt;record&gt;&lt;rec-number&gt;57&lt;/rec-number&gt;&lt;foreign-keys&gt;&lt;key app="EN" db-id="mdae8500109496fea4aff9c086e16cc25895" timestamp="1793216821"&gt;57&lt;/key&gt;&lt;/foreign-keys&gt;&lt;ref-type name="Generic"&gt;13&lt;/ref-type&gt;&lt;contributors&gt;&lt;authors&gt;&lt;author&gt;Neubauer, Alexander&lt;/author&gt;&lt;author&gt;Hong, Tianzhen&lt;/author&gt;&lt;author&gt;Li, Han&lt;/author&gt;&lt;author&gt;Yu, Mengbo&lt;/author&gt;&lt;author&gt;Darbandi, Amin&lt;/author&gt;&lt;author&gt;Fürst, Yannick&lt;/author&gt;&lt;author&gt;Kriegel, Martin&lt;/author&gt;&lt;/authors&gt;&lt;/contributors&gt;&lt;titles&gt;&lt;title&gt;Large Language Models for HVAC Operations in Building Energy Systems: A Critical Review of Methods, Applications, and Deployment Readiness&lt;/title&gt;&lt;secondary-title&gt;arXiv&lt;/secondary-title&gt;&lt;/titles&gt;&lt;dates&gt;&lt;year&gt;2026&lt;/year&gt;&lt;/dates&gt;&lt;label&gt;neubauer2026&lt;/label&gt;&lt;work-type&gt;arXiv:2609.05314&lt;/work-type&gt;&lt;urls&gt;&lt;related-urls&gt;&lt;url&gt;https://arxiv.org/abs/2609.05314&lt;/url&gt;&lt;/related-urls&gt;&lt;/urls&gt;&lt;electronic-resource-num&gt;10.48550/arXiv.2609.05314&lt;/electronic-resource-num&gt;&lt;/record&gt;&lt;/Cite&gt;&lt;/EndNote&gt;</w:instrText>
+        <w:instrText xml:space="preserve"> ADDIN EN.CITE &lt;EndNote&gt;&lt;Cite&gt;&lt;Author&gt;Neubauer&lt;/Author&gt;&lt;Year&gt;2026&lt;/Year&gt;&lt;RecNum&gt;57&lt;/RecNum&gt;&lt;DisplayText&gt;[26]&lt;/DisplayText&gt;&lt;record&gt;&lt;rec-number&gt;57&lt;/rec-number&gt;&lt;foreign-keys&gt;&lt;key app="EN" db-id="mdae8500109496fea4aff9c086e16cc25895" timestamp="1793221304"&gt;57&lt;/key&gt;&lt;/foreign-keys&gt;&lt;ref-type name="Generic"&gt;13&lt;/ref-type&gt;&lt;contributors&gt;&lt;authors&gt;&lt;author&gt;Neubauer, Alexander&lt;/author&gt;&lt;author&gt;Hong, Tianzhen&lt;/author&gt;&lt;author&gt;Li, Han&lt;/author&gt;&lt;author&gt;Yu, Mengbo&lt;/author&gt;&lt;author&gt;Darbandi, Amin&lt;/author&gt;&lt;author&gt;Fürst, Yannick&lt;/author&gt;&lt;author&gt;Kriegel, Martin&lt;/author&gt;&lt;/authors&gt;&lt;/contributors&gt;&lt;titles&gt;&lt;title&gt;Large Language Models for HVAC Operations in Building Energy Systems: A Critical Review of Methods, Applications, and Deployment Readiness&lt;/title&gt;&lt;secondary-title&gt;arXiv&lt;/secondary-title&gt;&lt;/titles&gt;&lt;dates&gt;&lt;year&gt;2026&lt;/year&gt;&lt;/dates&gt;&lt;label&gt;neubauer2026&lt;/label&gt;&lt;work-type&gt;arXiv:2609.05314&lt;/work-type&gt;&lt;urls&gt;&lt;related-urls&gt;&lt;url&gt;https://arxiv.org/abs/2609.05314&lt;/url&gt;&lt;/related-urls&gt;&lt;/urls&gt;&lt;electronic-resource-num&gt;10.48550/arXiv.2609.05314&lt;/electronic-resource-num&gt;&lt;/record&gt;&lt;/Cite&gt;&lt;/EndNote&gt;</w:instrText>
       </w:r>
       <w:r>
         <w:fldChar w:fldCharType="separate"/>
@@ -1578,7 +1578,7 @@
         <w:fldChar w:fldCharType="begin"/>
       </w:r>
       <w:r>
-        <w:instrText xml:space="preserve"> ADDIN EN.CITE &lt;EndNote&gt;&lt;Cite&gt;&lt;Author&gt;Blochwitz&lt;/Author&gt;&lt;Year&gt;2011&lt;/Year&gt;&lt;RecNum&gt;6&lt;/RecNum&gt;&lt;DisplayText&gt;[9]&lt;/DisplayText&gt;&lt;record&gt;&lt;rec-number&gt;6&lt;/rec-number&gt;&lt;foreign-keys&gt;&lt;key app="EN" db-id="mdae8500109496fea4aff9c086e16cc25895" timestamp="1793216821"&gt;6&lt;/key&gt;&lt;/foreign-keys&gt;&lt;ref-type name="Conference Paper"&gt;47&lt;/ref-type&gt;&lt;contributors&gt;&lt;authors&gt;&lt;author&gt;Blochwitz, T.&lt;/author&gt;&lt;author&gt;Otter, M.&lt;/author&gt;&lt;author&gt;Arnold, M.&lt;/author&gt;&lt;author&gt;Bausch, C.&lt;/author&gt;&lt;author&gt;Clauss, C.&lt;/author&gt;&lt;author&gt;Elmqvist, H.&lt;/author&gt;&lt;author&gt;Junghanns, A.&lt;/author&gt;&lt;author&gt;Mauss, J.&lt;/author&gt;&lt;author&gt;Monteiro, M.&lt;/author&gt;&lt;author&gt;Neidhold, T.&lt;/author&gt;&lt;author&gt;Neumerkel, D.&lt;/author&gt;&lt;author&gt;Olsson, H.&lt;/author&gt;&lt;author&gt;Peetz, J.-V.&lt;/author&gt;&lt;author&gt;Wolf, S.&lt;/author&gt;&lt;/authors&gt;&lt;/contributors&gt;&lt;titles&gt;&lt;title&gt;The Functional Mockup Interface for Tool independent Exchange of Simulation Models&lt;/title&gt;&lt;secondary-title&gt;Proceedings of the 8th International Modelica Conference&lt;/secondary-title&gt;&lt;/titles&gt;&lt;pages&gt;105-114&lt;/pages&gt;&lt;volume&gt;63&lt;/volume&gt;&lt;dates&gt;&lt;year&gt;2011&lt;/year&gt;&lt;/dates&gt;&lt;pub-location&gt;Dresden, Germany&lt;/pub-location&gt;&lt;publisher&gt;Linköping University Electronic Press&lt;/publisher&gt;&lt;label&gt;blochwitz2011&lt;/label&gt;&lt;urls&gt;&lt;/urls&gt;&lt;electronic-resource-num&gt;10.3384/ecp11063105&lt;/electronic-resource-num&gt;&lt;/record&gt;&lt;/Cite&gt;&lt;/EndNote&gt;</w:instrText>
+        <w:instrText xml:space="preserve"> ADDIN EN.CITE &lt;EndNote&gt;&lt;Cite&gt;&lt;Author&gt;Blochwitz&lt;/Author&gt;&lt;Year&gt;2011&lt;/Year&gt;&lt;RecNum&gt;6&lt;/RecNum&gt;&lt;DisplayText&gt;[9]&lt;/DisplayText&gt;&lt;record&gt;&lt;rec-number&gt;6&lt;/rec-number&gt;&lt;foreign-keys&gt;&lt;key app="EN" db-id="mdae8500109496fea4aff9c086e16cc25895" timestamp="1793221304"&gt;6&lt;/key&gt;&lt;/foreign-keys&gt;&lt;ref-type name="Conference Paper"&gt;47&lt;/ref-type&gt;&lt;contributors&gt;&lt;authors&gt;&lt;author&gt;Blochwitz, T.&lt;/author&gt;&lt;author&gt;Otter, M.&lt;/author&gt;&lt;author&gt;Arnold, M.&lt;/author&gt;&lt;author&gt;Bausch, C.&lt;/author&gt;&lt;author&gt;Clauss, C.&lt;/author&gt;&lt;author&gt;Elmqvist, H.&lt;/author&gt;&lt;author&gt;Junghanns, A.&lt;/author&gt;&lt;author&gt;Mauss, J.&lt;/author&gt;&lt;author&gt;Monteiro, M.&lt;/author&gt;&lt;author&gt;Neidhold, T.&lt;/author&gt;&lt;author&gt;Neumerkel, D.&lt;/author&gt;&lt;author&gt;Olsson, H.&lt;/author&gt;&lt;author&gt;Peetz, J.-V.&lt;/author&gt;&lt;author&gt;Wolf, S.&lt;/author&gt;&lt;/authors&gt;&lt;/contributors&gt;&lt;titles&gt;&lt;title&gt;The Functional Mockup Interface for Tool independent Exchange of Simulation Models&lt;/title&gt;&lt;secondary-title&gt;Proceedings of the 8th International Modelica Conference&lt;/secondary-title&gt;&lt;/titles&gt;&lt;pages&gt;105-114&lt;/pages&gt;&lt;volume&gt;63&lt;/volume&gt;&lt;dates&gt;&lt;year&gt;2011&lt;/year&gt;&lt;/dates&gt;&lt;pub-location&gt;Dresden, Germany&lt;/pub-location&gt;&lt;publisher&gt;Linköping University Electronic Press&lt;/publisher&gt;&lt;label&gt;blochwitz2011&lt;/label&gt;&lt;urls&gt;&lt;/urls&gt;&lt;electronic-resource-num&gt;10.3384/ecp11063105&lt;/electronic-resource-num&gt;&lt;/record&gt;&lt;/Cite&gt;&lt;/EndNote&gt;</w:instrText>
       </w:r>
       <w:r>
         <w:fldChar w:fldCharType="separate"/>
@@ -1599,7 +1599,7 @@
         <w:fldChar w:fldCharType="begin"/>
       </w:r>
       <w:r>
-        <w:instrText xml:space="preserve"> ADDIN EN.CITE &lt;EndNote&gt;&lt;Cite&gt;&lt;Author&gt;Junghanns&lt;/Author&gt;&lt;Year&gt;2021&lt;/Year&gt;&lt;RecNum&gt;42&lt;/RecNum&gt;&lt;DisplayText&gt;[10]&lt;/DisplayText&gt;&lt;record&gt;&lt;rec-number&gt;42&lt;/rec-number&gt;&lt;foreign-keys&gt;&lt;key app="EN" db-id="mdae8500109496fea4aff9c086e16cc25895" timestamp="1793216821"&gt;42&lt;/key&gt;&lt;/foreign-keys&gt;&lt;ref-type name="Conference Paper"&gt;47&lt;/ref-type&gt;&lt;contributors&gt;&lt;authors&gt;&lt;author&gt;Junghanns, Andreas&lt;/author&gt;&lt;author&gt;Blochwitz, Torsten&lt;/author&gt;&lt;author&gt;Bertsch, Christian&lt;/author&gt;&lt;author&gt;Sommer, Torsten&lt;/author&gt;&lt;author&gt;Wernersson, Karl&lt;/author&gt;&lt;author&gt;Pillekeit, Andreas&lt;/author&gt;&lt;author&gt;Zacharias, Irina&lt;/author&gt;&lt;author&gt;Blesken, Matthias&lt;/author&gt;&lt;author&gt;Mai, Pierre R.&lt;/author&gt;&lt;author&gt;Schuch, Klaus&lt;/author&gt;&lt;author&gt;Schulze, Christian&lt;/author&gt;&lt;author&gt;Gomes, Cláudio&lt;/author&gt;&lt;author&gt;Najafi, Masoud&lt;/author&gt;&lt;/authors&gt;&lt;/contributors&gt;&lt;titles&gt;&lt;title&gt;The Functional Mock-up Interface 3.0 – New Features Enabling New Applications&lt;/title&gt;&lt;secondary-title&gt;Proceedings of the 14th International Modelica Conference&lt;/secondary-title&gt;&lt;/titles&gt;&lt;pages&gt;17-26&lt;/pages&gt;&lt;volume&gt;181&lt;/volume&gt;&lt;dates&gt;&lt;year&gt;2021&lt;/year&gt;&lt;/dates&gt;&lt;pub-location&gt;Linköping, Sweden&lt;/pub-location&gt;&lt;publisher&gt;Linköping University Electronic Press&lt;/publisher&gt;&lt;label&gt;junghanns2021&lt;/label&gt;&lt;urls&gt;&lt;/urls&gt;&lt;electronic-resource-num&gt;10.3384/ecp2118117&lt;/electronic-resource-num&gt;&lt;/record&gt;&lt;/Cite&gt;&lt;/EndNote&gt;</w:instrText>
+        <w:instrText xml:space="preserve"> ADDIN EN.CITE &lt;EndNote&gt;&lt;Cite&gt;&lt;Author&gt;Junghanns&lt;/Author&gt;&lt;Year&gt;2021&lt;/Year&gt;&lt;RecNum&gt;42&lt;/RecNum&gt;&lt;DisplayText&gt;[10]&lt;/DisplayText&gt;&lt;record&gt;&lt;rec-number&gt;42&lt;/rec-number&gt;&lt;foreign-keys&gt;&lt;key app="EN" db-id="mdae8500109496fea4aff9c086e16cc25895" timestamp="1793221304"&gt;42&lt;/key&gt;&lt;/foreign-keys&gt;&lt;ref-type name="Conference Paper"&gt;47&lt;/ref-type&gt;&lt;contributors&gt;&lt;authors&gt;&lt;author&gt;Junghanns, Andreas&lt;/author&gt;&lt;author&gt;Blochwitz, Torsten&lt;/author&gt;&lt;author&gt;Bertsch, Christian&lt;/author&gt;&lt;author&gt;Sommer, Torsten&lt;/author&gt;&lt;author&gt;Wernersson, Karl&lt;/author&gt;&lt;author&gt;Pillekeit, Andreas&lt;/author&gt;&lt;author&gt;Zacharias, Irina&lt;/author&gt;&lt;author&gt;Blesken, Matthias&lt;/author&gt;&lt;author&gt;Mai, Pierre R.&lt;/author&gt;&lt;author&gt;Schuch, Klaus&lt;/author&gt;&lt;author&gt;Schulze, Christian&lt;/author&gt;&lt;author&gt;Gomes, Cláudio&lt;/author&gt;&lt;author&gt;Najafi, Masoud&lt;/author&gt;&lt;/authors&gt;&lt;/contributors&gt;&lt;titles&gt;&lt;title&gt;The Functional Mock-up Interface 3.0 – New Features Enabling New Applications&lt;/title&gt;&lt;secondary-title&gt;Proceedings of the 14th International Modelica Conference&lt;/secondary-title&gt;&lt;/titles&gt;&lt;pages&gt;17-26&lt;/pages&gt;&lt;volume&gt;181&lt;/volume&gt;&lt;dates&gt;&lt;year&gt;2021&lt;/year&gt;&lt;/dates&gt;&lt;pub-location&gt;Linköping, Sweden&lt;/pub-location&gt;&lt;publisher&gt;Linköping University Electronic Press&lt;/publisher&gt;&lt;label&gt;junghanns2021&lt;/label&gt;&lt;urls&gt;&lt;/urls&gt;&lt;electronic-resource-num&gt;10.3384/ecp2118117&lt;/electronic-resource-num&gt;&lt;/record&gt;&lt;/Cite&gt;&lt;/EndNote&gt;</w:instrText>
       </w:r>
       <w:r>
         <w:fldChar w:fldCharType="separate"/>
@@ -1620,7 +1620,7 @@
         <w:fldChar w:fldCharType="begin"/>
       </w:r>
       <w:r>
-        <w:instrText xml:space="preserve"> ADDIN EN.CITE &lt;EndNote&gt;&lt;Cite&gt;&lt;Author&gt;Modelica Association&lt;/Author&gt;&lt;Year&gt;2024&lt;/Year&gt;&lt;RecNum&gt;77&lt;/RecNum&gt;&lt;DisplayText&gt;[28]&lt;/DisplayText&gt;&lt;record&gt;&lt;rec-number&gt;77&lt;/rec-number&gt;&lt;foreign-keys&gt;&lt;key app="EN" db-id="mdae8500109496fea4aff9c086e16cc25895" timestamp="1793216821"&gt;77&lt;/key&gt;&lt;/foreign-keys&gt;&lt;ref-type name="Standard"&gt;58&lt;/ref-type&gt;&lt;contributors&gt;&lt;authors&gt;&lt;author&gt;Modelica Association&lt;/author&gt;&lt;/authors&gt;&lt;/contributors&gt;&lt;titles&gt;&lt;title&gt;System Structure and Parameterization (SSP), Version 2.0&lt;/title&gt;&lt;/titles&gt;&lt;dates&gt;&lt;year&gt;2024&lt;/year&gt;&lt;/dates&gt;&lt;label&gt;ssp2_2024&lt;/label&gt;&lt;urls&gt;&lt;related-urls&gt;&lt;url&gt;https://ssp-standard.org/docs/2.0/&lt;/url&gt;&lt;/related-urls&gt;&lt;/urls&gt;&lt;/record&gt;&lt;/Cite&gt;&lt;/EndNote&gt;</w:instrText>
+        <w:instrText xml:space="preserve"> ADDIN EN.CITE &lt;EndNote&gt;&lt;Cite&gt;&lt;Author&gt;Modelica Association&lt;/Author&gt;&lt;Year&gt;2024&lt;/Year&gt;&lt;RecNum&gt;77&lt;/RecNum&gt;&lt;DisplayText&gt;[28]&lt;/DisplayText&gt;&lt;record&gt;&lt;rec-number&gt;77&lt;/rec-number&gt;&lt;foreign-keys&gt;&lt;key app="EN" db-id="mdae8500109496fea4aff9c086e16cc25895" timestamp="1793221304"&gt;77&lt;/key&gt;&lt;/foreign-keys&gt;&lt;ref-type name="Standard"&gt;58&lt;/ref-type&gt;&lt;contributors&gt;&lt;authors&gt;&lt;author&gt;Modelica Association&lt;/author&gt;&lt;/authors&gt;&lt;/contributors&gt;&lt;titles&gt;&lt;title&gt;System Structure and Parameterization (SSP), Version 2.0&lt;/title&gt;&lt;/titles&gt;&lt;dates&gt;&lt;year&gt;2024&lt;/year&gt;&lt;/dates&gt;&lt;label&gt;ssp2_2024&lt;/label&gt;&lt;urls&gt;&lt;related-urls&gt;&lt;url&gt;https://ssp-standard.org/docs/2.0/&lt;/url&gt;&lt;/related-urls&gt;&lt;/urls&gt;&lt;/record&gt;&lt;/Cite&gt;&lt;/EndNote&gt;</w:instrText>
       </w:r>
       <w:r>
         <w:fldChar w:fldCharType="separate"/>
@@ -1649,7 +1649,7 @@
         <w:fldChar w:fldCharType="begin"/>
       </w:r>
       <w:r>
-        <w:instrText xml:space="preserve"> ADDIN EN.CITE &lt;EndNote&gt;&lt;Cite&gt;&lt;Author&gt;Kübler&lt;/Author&gt;&lt;Year&gt;2000&lt;/Year&gt;&lt;RecNum&gt;47&lt;/RecNum&gt;&lt;DisplayText&gt;[22]&lt;/DisplayText&gt;&lt;record&gt;&lt;rec-number&gt;47&lt;/rec-number&gt;&lt;foreign-keys&gt;&lt;key app="EN" db-id="mdae8500109496fea4aff9c086e16cc25895" timestamp="1793216821"&gt;47&lt;/key&gt;&lt;/foreign-keys&gt;&lt;ref-type name="Journal Article"&gt;17&lt;/ref-type&gt;&lt;contributors&gt;&lt;authors&gt;&lt;author&gt;Kübler, R.&lt;/author&gt;&lt;author&gt;Schiehlen, W.&lt;/author&gt;&lt;/authors&gt;&lt;/contributors&gt;&lt;titles&gt;&lt;title&gt;Two Methods of Simulator Coupling&lt;/title&gt;&lt;secondary-title&gt;Mathematical and Computer Modelling of Dynamical Systems&lt;/secondary-title&gt;&lt;alt-title&gt;Math. Comput. Model. Dyn. Syst.&lt;/alt-title&gt;&lt;/titles&gt;&lt;periodical&gt;&lt;full-title&gt;Mathematical and Computer Modelling of Dynamical Systems&lt;/full-title&gt;&lt;abbr-1&gt;Math. Comput. Model. Dyn. Syst.&lt;/abbr-1&gt;&lt;/periodical&gt;&lt;pages&gt;93-113&lt;/pages&gt;&lt;volume&gt;6&lt;/volume&gt;&lt;number&gt;2&lt;/number&gt;&lt;dates&gt;&lt;year&gt;2000&lt;/year&gt;&lt;/dates&gt;&lt;publisher&gt;Taylor &amp;amp; Francis&lt;/publisher&gt;&lt;label&gt;kubler2000&lt;/label&gt;&lt;urls&gt;&lt;/urls&gt;&lt;electronic-resource-num&gt;10.1076/1387-3954(200006)6:2;1-M;FT093&lt;/electronic-resource-num&gt;&lt;/record&gt;&lt;/Cite&gt;&lt;/EndNote&gt;</w:instrText>
+        <w:instrText xml:space="preserve"> ADDIN EN.CITE &lt;EndNote&gt;&lt;Cite&gt;&lt;Author&gt;Kübler&lt;/Author&gt;&lt;Year&gt;2000&lt;/Year&gt;&lt;RecNum&gt;47&lt;/RecNum&gt;&lt;DisplayText&gt;[22]&lt;/DisplayText&gt;&lt;record&gt;&lt;rec-number&gt;47&lt;/rec-number&gt;&lt;foreign-keys&gt;&lt;key app="EN" db-id="mdae8500109496fea4aff9c086e16cc25895" timestamp="1793221304"&gt;47&lt;/key&gt;&lt;/foreign-keys&gt;&lt;ref-type name="Journal Article"&gt;17&lt;/ref-type&gt;&lt;contributors&gt;&lt;authors&gt;&lt;author&gt;Kübler, R.&lt;/author&gt;&lt;author&gt;Schiehlen, W.&lt;/author&gt;&lt;/authors&gt;&lt;/contributors&gt;&lt;titles&gt;&lt;title&gt;Two Methods of Simulator Coupling&lt;/title&gt;&lt;secondary-title&gt;Mathematical and Computer Modelling of Dynamical Systems&lt;/secondary-title&gt;&lt;alt-title&gt;Math. Comput. Model. Dyn. Syst.&lt;/alt-title&gt;&lt;/titles&gt;&lt;periodical&gt;&lt;full-title&gt;Mathematical and Computer Modelling of Dynamical Systems&lt;/full-title&gt;&lt;abbr-1&gt;Math. Comput. Model. Dyn. Syst.&lt;/abbr-1&gt;&lt;/periodical&gt;&lt;pages&gt;93-113&lt;/pages&gt;&lt;volume&gt;6&lt;/volume&gt;&lt;number&gt;2&lt;/number&gt;&lt;dates&gt;&lt;year&gt;2000&lt;/year&gt;&lt;/dates&gt;&lt;publisher&gt;Taylor &amp;amp; Francis&lt;/publisher&gt;&lt;label&gt;kubler2000&lt;/label&gt;&lt;urls&gt;&lt;/urls&gt;&lt;electronic-resource-num&gt;10.1076/1387-3954(200006)6:2;1-M;FT093&lt;/electronic-resource-num&gt;&lt;/record&gt;&lt;/Cite&gt;&lt;/EndNote&gt;</w:instrText>
       </w:r>
       <w:r>
         <w:fldChar w:fldCharType="separate"/>
@@ -1670,7 +1670,7 @@
         <w:fldChar w:fldCharType="begin"/>
       </w:r>
       <w:r>
-        <w:instrText xml:space="preserve"> ADDIN EN.CITE &lt;EndNote&gt;&lt;Cite&gt;&lt;Author&gt;Broman&lt;/Author&gt;&lt;Year&gt;2013&lt;/Year&gt;&lt;RecNum&gt;8&lt;/RecNum&gt;&lt;DisplayText&gt;[29]&lt;/DisplayText&gt;&lt;record&gt;&lt;rec-number&gt;8&lt;/rec-number&gt;&lt;foreign-keys&gt;&lt;key app="EN" db-id="mdae8500109496fea4aff9c086e16cc25895" timestamp="1793216821"&gt;8&lt;/key&gt;&lt;/foreign-keys&gt;&lt;ref-type name="Conference Paper"&gt;47&lt;/ref-type&gt;&lt;contributors&gt;&lt;authors&gt;&lt;author&gt;Broman, David&lt;/author&gt;&lt;author&gt;Brooks, Christopher&lt;/author&gt;&lt;author&gt;Greenberg, Lev&lt;/author&gt;&lt;author&gt;Lee, Edward A.&lt;/author&gt;&lt;author&gt;Masin, Michael&lt;/author&gt;&lt;author&gt;Tripakis, Stavros&lt;/author&gt;&lt;author&gt;Wetter, Michael&lt;/author&gt;&lt;/authors&gt;&lt;/contributors&gt;&lt;titles&gt;&lt;title&gt;Determinate composition of FMUs for co-simulation&lt;/title&gt;&lt;secondary-title&gt;2013 Proceedings of the International Conference on Embedded Software (EMSOFT)&lt;/secondary-title&gt;&lt;/titles&gt;&lt;pages&gt;1-12&lt;/pages&gt;&lt;dates&gt;&lt;year&gt;2013&lt;/year&gt;&lt;/dates&gt;&lt;pub-location&gt;Montreal, QC, Canada&lt;/pub-location&gt;&lt;publisher&gt;IEEE&lt;/publisher&gt;&lt;label&gt;broman2013&lt;/label&gt;&lt;urls&gt;&lt;/urls&gt;&lt;electronic-resource-num&gt;10.1109/EMSOFT.2013.6658580&lt;/electronic-resource-num&gt;&lt;/record&gt;&lt;/Cite&gt;&lt;/EndNote&gt;</w:instrText>
+        <w:instrText xml:space="preserve"> ADDIN EN.CITE &lt;EndNote&gt;&lt;Cite&gt;&lt;Author&gt;Broman&lt;/Author&gt;&lt;Year&gt;2013&lt;/Year&gt;&lt;RecNum&gt;8&lt;/RecNum&gt;&lt;DisplayText&gt;[29]&lt;/DisplayText&gt;&lt;record&gt;&lt;rec-number&gt;8&lt;/rec-number&gt;&lt;foreign-keys&gt;&lt;key app="EN" db-id="mdae8500109496fea4aff9c086e16cc25895" timestamp="1793221304"&gt;8&lt;/key&gt;&lt;/foreign-keys&gt;&lt;ref-type name="Conference Paper"&gt;47&lt;/ref-type&gt;&lt;contributors&gt;&lt;authors&gt;&lt;author&gt;Broman, David&lt;/author&gt;&lt;author&gt;Brooks, Christopher&lt;/author&gt;&lt;author&gt;Greenberg, Lev&lt;/author&gt;&lt;author&gt;Lee, Edward A.&lt;/author&gt;&lt;author&gt;Masin, Michael&lt;/author&gt;&lt;author&gt;Tripakis, Stavros&lt;/author&gt;&lt;author&gt;Wetter, Michael&lt;/author&gt;&lt;/authors&gt;&lt;/contributors&gt;&lt;titles&gt;&lt;title&gt;Determinate composition of FMUs for co-simulation&lt;/title&gt;&lt;secondary-title&gt;2013 Proceedings of the International Conference on Embedded Software (EMSOFT)&lt;/secondary-title&gt;&lt;/titles&gt;&lt;pages&gt;1-12&lt;/pages&gt;&lt;dates&gt;&lt;year&gt;2013&lt;/year&gt;&lt;/dates&gt;&lt;pub-location&gt;Montreal, QC, Canada&lt;/pub-location&gt;&lt;publisher&gt;IEEE&lt;/publisher&gt;&lt;label&gt;broman2013&lt;/label&gt;&lt;urls&gt;&lt;/urls&gt;&lt;electronic-resource-num&gt;10.1109/EMSOFT.2013.6658580&lt;/electronic-resource-num&gt;&lt;/record&gt;&lt;/Cite&gt;&lt;/EndNote&gt;</w:instrText>
       </w:r>
       <w:r>
         <w:fldChar w:fldCharType="separate"/>
@@ -1691,7 +1691,7 @@
         <w:fldChar w:fldCharType="begin"/>
       </w:r>
       <w:r>
-        <w:instrText xml:space="preserve"> ADDIN EN.CITE &lt;EndNote&gt;&lt;Cite&gt;&lt;Author&gt;Gomes&lt;/Author&gt;&lt;Year&gt;2018&lt;/Year&gt;&lt;RecNum&gt;26&lt;/RecNum&gt;&lt;DisplayText&gt;[7]&lt;/DisplayText&gt;&lt;record&gt;&lt;rec-number&gt;26&lt;/rec-number&gt;&lt;foreign-keys&gt;&lt;key app="EN" db-id="mdae8500109496fea4aff9c086e16cc25895" timestamp="1793216821"&gt;26&lt;/key&gt;&lt;/foreign-keys&gt;&lt;ref-type name="Journal Article"&gt;17&lt;/ref-type&gt;&lt;contributors&gt;&lt;authors&gt;&lt;author&gt;Gomes, Cláudio&lt;/author&gt;&lt;author&gt;Thule, Casper&lt;/author&gt;&lt;author&gt;Broman, David&lt;/author&gt;&lt;author&gt;Larsen, Peter Gorm&lt;/author&gt;&lt;author&gt;Vangheluwe, Hans&lt;/author&gt;&lt;/authors&gt;&lt;/contributors&gt;&lt;titles&gt;&lt;title&gt;Co-Simulation: A Survey&lt;/title&gt;&lt;secondary-title&gt;ACM Computing Surveys&lt;/secondary-title&gt;&lt;alt-title&gt;ACM Comput. Surv.&lt;/alt-title&gt;&lt;/titles&gt;&lt;periodical&gt;&lt;full-title&gt;ACM Computing Surveys&lt;/full-title&gt;&lt;abbr-1&gt;ACM Comput. Surv.&lt;/abbr-1&gt;&lt;/periodical&gt;&lt;pages&gt;49&lt;/pages&gt;&lt;volume&gt;51&lt;/volume&gt;&lt;number&gt;3&lt;/number&gt;&lt;dates&gt;&lt;year&gt;2018&lt;/year&gt;&lt;/dates&gt;&lt;publisher&gt;ACM&lt;/publisher&gt;&lt;label&gt;gomes2018&lt;/label&gt;&lt;urls&gt;&lt;/urls&gt;&lt;electronic-resource-num&gt;10.1145/3179993&lt;/electronic-resource-num&gt;&lt;/record&gt;&lt;/Cite&gt;&lt;/EndNote&gt;</w:instrText>
+        <w:instrText xml:space="preserve"> ADDIN EN.CITE &lt;EndNote&gt;&lt;Cite&gt;&lt;Author&gt;Gomes&lt;/Author&gt;&lt;Year&gt;2018&lt;/Year&gt;&lt;RecNum&gt;26&lt;/RecNum&gt;&lt;DisplayText&gt;[7]&lt;/DisplayText&gt;&lt;record&gt;&lt;rec-number&gt;26&lt;/rec-number&gt;&lt;foreign-keys&gt;&lt;key app="EN" db-id="mdae8500109496fea4aff9c086e16cc25895" timestamp="1793221304"&gt;26&lt;/key&gt;&lt;/foreign-keys&gt;&lt;ref-type name="Journal Article"&gt;17&lt;/ref-type&gt;&lt;contributors&gt;&lt;authors&gt;&lt;author&gt;Gomes, Cláudio&lt;/author&gt;&lt;author&gt;Thule, Casper&lt;/author&gt;&lt;author&gt;Broman, David&lt;/author&gt;&lt;author&gt;Larsen, Peter Gorm&lt;/author&gt;&lt;author&gt;Vangheluwe, Hans&lt;/author&gt;&lt;/authors&gt;&lt;/contributors&gt;&lt;titles&gt;&lt;title&gt;Co-Simulation: A Survey&lt;/title&gt;&lt;secondary-title&gt;ACM Computing Surveys&lt;/secondary-title&gt;&lt;alt-title&gt;ACM Comput. Surv.&lt;/alt-title&gt;&lt;/titles&gt;&lt;periodical&gt;&lt;full-title&gt;ACM Computing Surveys&lt;/full-title&gt;&lt;abbr-1&gt;ACM Comput. Surv.&lt;/abbr-1&gt;&lt;/periodical&gt;&lt;pages&gt;49&lt;/pages&gt;&lt;volume&gt;51&lt;/volume&gt;&lt;number&gt;3&lt;/number&gt;&lt;dates&gt;&lt;year&gt;2018&lt;/year&gt;&lt;/dates&gt;&lt;publisher&gt;ACM&lt;/publisher&gt;&lt;label&gt;gomes2018&lt;/label&gt;&lt;urls&gt;&lt;/urls&gt;&lt;electronic-resource-num&gt;10.1145/3179993&lt;/electronic-resource-num&gt;&lt;/record&gt;&lt;/Cite&gt;&lt;/EndNote&gt;</w:instrText>
       </w:r>
       <w:r>
         <w:fldChar w:fldCharType="separate"/>
@@ -1714,7 +1714,7 @@
 PFJlY051bT4zPC9SZWNOdW0+PERpc3BsYXlUZXh0PlszMCwzMV08L0Rpc3BsYXlUZXh0PjxyZWNv
 cmQ+PHJlYy1udW1iZXI+MzwvcmVjLW51bWJlcj48Zm9yZWlnbi1rZXlzPjxrZXkgYXBwPSJFTiIg
 ZGItaWQ9Im1kYWU4NTAwMTA5NDk2ZmVhNGFmZjljMDg2ZTE2Y2MyNTg5NSIgdGltZXN0YW1wPSIx
-NzkzMjE2ODIxIj4zPC9rZXk+PC9mb3JlaWduLWtleXM+PHJlZi10eXBlIG5hbWU9IkNvbmZlcmVu
+NzkzMjIxMzA0Ij4zPC9rZXk+PC9mb3JlaWduLWtleXM+PHJlZi10eXBlIG5hbWU9IkNvbmZlcmVu
 Y2UgUGFwZXIiPjQ3PC9yZWYtdHlwZT48Y29udHJpYnV0b3JzPjxhdXRob3JzPjxhdXRob3I+QmVu
 ZWRpa3QsIE0uPC9hdXRob3I+PGF1dGhvcj5XYXR6ZW5pZywgRC48L2F1dGhvcj48YXV0aG9yPlpl
 aGV0bmVyLCBKLjwvYXV0aG9yPjxhdXRob3I+SG9mZXIsIEEuPC9hdXRob3I+PC9hdXRob3JzPjwv
@@ -1731,7 +1731,7 @@
 dXJscz48L3VybHM+PC9yZWNvcmQ+PC9DaXRlPjxDaXRlPjxBdXRob3I+U2FkamluYTwvQXV0aG9y
 PjxZZWFyPjIwMTc8L1llYXI+PFJlY051bT43MTwvUmVjTnVtPjxyZWNvcmQ+PHJlYy1udW1iZXI+
 NzE8L3JlYy1udW1iZXI+PGZvcmVpZ24ta2V5cz48a2V5IGFwcD0iRU4iIGRiLWlkPSJtZGFlODUw
-MDEwOTQ5NmZlYTRhZmY5YzA4NmUxNmNjMjU4OTUiIHRpbWVzdGFtcD0iMTc5MzIxNjgyMSI+NzE8
+MDEwOTQ5NmZlYTRhZmY5YzA4NmUxNmNjMjU4OTUiIHRpbWVzdGFtcD0iMTc5MzIyMTMwNCI+NzE8
 L2tleT48L2ZvcmVpZ24ta2V5cz48cmVmLXR5cGUgbmFtZT0iSm91cm5hbCBBcnRpY2xlIj4xNzwv
 cmVmLXR5cGU+PGNvbnRyaWJ1dG9ycz48YXV0aG9ycz48YXV0aG9yPlNhZGppbmEsIFNldmVyaW48
 L2F1dGhvcj48YXV0aG9yPkt5bGxpbmdzdGFkLCBMYXJzIFQuPC9hdXRob3I+PGF1dGhvcj5Ta2pv
@@ -1759,7 +1759,7 @@
 PFJlY051bT4zPC9SZWNOdW0+PERpc3BsYXlUZXh0PlszMCwzMV08L0Rpc3BsYXlUZXh0PjxyZWNv
 cmQ+PHJlYy1udW1iZXI+MzwvcmVjLW51bWJlcj48Zm9yZWlnbi1rZXlzPjxrZXkgYXBwPSJFTiIg
 ZGItaWQ9Im1kYWU4NTAwMTA5NDk2ZmVhNGFmZjljMDg2ZTE2Y2MyNTg5NSIgdGltZXN0YW1wPSIx
-NzkzMjE2ODIxIj4zPC9rZXk+PC9mb3JlaWduLWtleXM+PHJlZi10eXBlIG5hbWU9IkNvbmZlcmVu
+NzkzMjIxMzA0Ij4zPC9rZXk+PC9mb3JlaWduLWtleXM+PHJlZi10eXBlIG5hbWU9IkNvbmZlcmVu
 Y2UgUGFwZXIiPjQ3PC9yZWYtdHlwZT48Y29udHJpYnV0b3JzPjxhdXRob3JzPjxhdXRob3I+QmVu
 ZWRpa3QsIE0uPC9hdXRob3I+PGF1dGhvcj5XYXR6ZW5pZywgRC48L2F1dGhvcj48YXV0aG9yPlpl
 aGV0bmVyLCBKLjwvYXV0aG9yPjxhdXRob3I+SG9mZXIsIEEuPC9hdXRob3I+PC9hdXRob3JzPjwv
@@ -1776,7 +1776,7 @@
 dXJscz48L3VybHM+PC9yZWNvcmQ+PC9DaXRlPjxDaXRlPjxBdXRob3I+U2FkamluYTwvQXV0aG9y
 PjxZZWFyPjIwMTc8L1llYXI+PFJlY051bT43MTwvUmVjTnVtPjxyZWNvcmQ+PHJlYy1udW1iZXI+
 NzE8L3JlYy1udW1iZXI+PGZvcmVpZ24ta2V5cz48a2V5IGFwcD0iRU4iIGRiLWlkPSJtZGFlODUw
-MDEwOTQ5NmZlYTRhZmY5YzA4NmUxNmNjMjU4OTUiIHRpbWVzdGFtcD0iMTc5MzIxNjgyMSI+NzE8
+MDEwOTQ5NmZlYTRhZmY5YzA4NmUxNmNjMjU4OTUiIHRpbWVzdGFtcD0iMTc5MzIyMTMwNCI+NzE8
 L2tleT48L2ZvcmVpZ24ta2V5cz48cmVmLXR5cGUgbmFtZT0iSm91cm5hbCBBcnRpY2xlIj4xNzwv
 cmVmLXR5cGU+PGNvbnRyaWJ1dG9ycz48YXV0aG9ycz48YXV0aG9yPlNhZGppbmEsIFNldmVyaW48
 L2F1dGhvcj48YXV0aG9yPkt5bGxpbmdzdGFkLCBMYXJzIFQuPC9hdXRob3I+PGF1dGhvcj5Ta2pv
@@ -1822,7 +1822,7 @@
 PFJlY051bT44MTwvUmVjTnVtPjxEaXNwbGF5VGV4dD5bMjMsMjRdPC9EaXNwbGF5VGV4dD48cmVj
 b3JkPjxyZWMtbnVtYmVyPjgxPC9yZWMtbnVtYmVyPjxmb3JlaWduLWtleXM+PGtleSBhcHA9IkVO
 IiBkYi1pZD0ibWRhZTg1MDAxMDk0OTZmZWE0YWZmOWMwODZlMTZjYzI1ODk1IiB0aW1lc3RhbXA9
-IjE3OTMyMTY4MjEiPjgxPC9rZXk+PC9mb3JlaWduLWtleXM+PHJlZi10eXBlIG5hbWU9IkNvbmZl
+IjE3OTMyMjEzMDQiPjgxPC9rZXk+PC9mb3JlaWduLWtleXM+PHJlZi10eXBlIG5hbWU9IkNvbmZl
 cmVuY2UgUGFwZXIiPjQ3PC9yZWYtdHlwZT48Y29udHJpYnV0b3JzPjxhdXRob3JzPjxhdXRob3I+
 VHJpcGFraXMsIFN0YXZyb3M8L2F1dGhvcj48L2F1dGhvcnM+PC9jb250cmlidXRvcnM+PHRpdGxl
 cz48dGl0bGU+QnJpZGdpbmcgdGhlIHNlbWFudGljIGdhcCBiZXR3ZWVuIGhldGVyb2dlbmVvdXMg
@@ -1837,7 +1837,7 @@
 bWVzPC9BdXRob3I+PFllYXI+MjAxOTwvWWVhcj48UmVjTnVtPjI3PC9SZWNOdW0+PHJlY29yZD48
 cmVjLW51bWJlcj4yNzwvcmVjLW51bWJlcj48Zm9yZWlnbi1rZXlzPjxrZXkgYXBwPSJFTiIgZGIt
 aWQ9Im1kYWU4NTAwMTA5NDk2ZmVhNGFmZjljMDg2ZTE2Y2MyNTg5NSIgdGltZXN0YW1wPSIxNzkz
-MjE2ODIxIj4yNzwva2V5PjwvZm9yZWlnbi1rZXlzPjxyZWYtdHlwZSBuYW1lPSJKb3VybmFsIEFy
+MjIxMzA0Ij4yNzwva2V5PjwvZm9yZWlnbi1rZXlzPjxyZWYtdHlwZSBuYW1lPSJKb3VybmFsIEFy
 dGljbGUiPjE3PC9yZWYtdHlwZT48Y29udHJpYnV0b3JzPjxhdXRob3JzPjxhdXRob3I+R29tZXMs
 IENsw6F1ZGlvPC9hdXRob3I+PGF1dGhvcj5NZXllcnMsIEJhcnQ8L2F1dGhvcj48YXV0aG9yPkRl
 bmlsLCBKb2FjaGltPC9hdXRob3I+PGF1dGhvcj5UaHVsZSwgQ2FzcGVyPC9hdXRob3I+PGF1dGhv
@@ -1864,7 +1864,7 @@
 PFJlY051bT44MTwvUmVjTnVtPjxEaXNwbGF5VGV4dD5bMjMsMjRdPC9EaXNwbGF5VGV4dD48cmVj
 b3JkPjxyZWMtbnVtYmVyPjgxPC9yZWMtbnVtYmVyPjxmb3JlaWduLWtleXM+PGtleSBhcHA9IkVO
 IiBkYi1pZD0ibWRhZTg1MDAxMDk0OTZmZWE0YWZmOWMwODZlMTZjYzI1ODk1IiB0aW1lc3RhbXA9
-IjE3OTMyMTY4MjEiPjgxPC9rZXk+PC9mb3JlaWduLWtleXM+PHJlZi10eXBlIG5hbWU9IkNvbmZl
+IjE3OTMyMjEzMDQiPjgxPC9rZXk+PC9mb3JlaWduLWtleXM+PHJlZi10eXBlIG5hbWU9IkNvbmZl
 cmVuY2UgUGFwZXIiPjQ3PC9yZWYtdHlwZT48Y29udHJpYnV0b3JzPjxhdXRob3JzPjxhdXRob3I+
 VHJpcGFraXMsIFN0YXZyb3M8L2F1dGhvcj48L2F1dGhvcnM+PC9jb250cmlidXRvcnM+PHRpdGxl
 cz48dGl0bGU+QnJpZGdpbmcgdGhlIHNlbWFudGljIGdhcCBiZXR3ZWVuIGhldGVyb2dlbmVvdXMg
@@ -1879,7 +1879,7 @@
 bWVzPC9BdXRob3I+PFllYXI+MjAxOTwvWWVhcj48UmVjTnVtPjI3PC9SZWNOdW0+PHJlY29yZD48
 cmVjLW51bWJlcj4yNzwvcmVjLW51bWJlcj48Zm9yZWlnbi1rZXlzPjxrZXkgYXBwPSJFTiIgZGIt
 aWQ9Im1kYWU4NTAwMTA5NDk2ZmVhNGFmZjljMDg2ZTE2Y2MyNTg5NSIgdGltZXN0YW1wPSIxNzkz
-MjE2ODIxIj4yNzwva2V5PjwvZm9yZWlnbi1rZXlzPjxyZWYtdHlwZSBuYW1lPSJKb3VybmFsIEFy
+MjIxMzA0Ij4yNzwva2V5PjwvZm9yZWlnbi1rZXlzPjxyZWYtdHlwZSBuYW1lPSJKb3VybmFsIEFy
 dGljbGUiPjE3PC9yZWYtdHlwZT48Y29udHJpYnV0b3JzPjxhdXRob3JzPjxhdXRob3I+R29tZXMs
 IENsw6F1ZGlvPC9hdXRob3I+PGF1dGhvcj5NZXllcnMsIEJhcnQ8L2F1dGhvcj48YXV0aG9yPkRl
 bmlsLCBKb2FjaGltPC9hdXRob3I+PGF1dGhvcj5UaHVsZSwgQ2FzcGVyPC9hdXRob3I+PGF1dGhv
@@ -1938,7 +1938,7 @@
         <w:fldChar w:fldCharType="begin"/>
       </w:r>
       <w:r>
-        <w:instrText xml:space="preserve"> ADDIN EN.CITE &lt;EndNote&gt;&lt;Cite&gt;&lt;Author&gt;IEEE&lt;/Author&gt;&lt;Year&gt;2010&lt;/Year&gt;&lt;RecNum&gt;38&lt;/RecNum&gt;&lt;DisplayText&gt;[32,33]&lt;/DisplayText&gt;&lt;record&gt;&lt;rec-number&gt;38&lt;/rec-number&gt;&lt;foreign-keys&gt;&lt;key app="EN" db-id="mdae8500109496fea4aff9c086e16cc25895" timestamp="1793216821"&gt;38&lt;/key&gt;&lt;/foreign-keys&gt;&lt;ref-type name="Standard"&gt;58&lt;/ref-type&gt;&lt;contributors&gt;&lt;authors&gt;&lt;author&gt;IEEE&lt;/author&gt;&lt;/authors&gt;&lt;/contributors&gt;&lt;titles&gt;&lt;title&gt;IEEE Standard for Modeling and Simulation (M&amp;amp;S) High Level Architecture (HLA) – Framework and Rules&lt;/title&gt;&lt;secondary-title&gt;IEEE Std 1516-2010&lt;/secondary-title&gt;&lt;/titles&gt;&lt;dates&gt;&lt;year&gt;2010&lt;/year&gt;&lt;/dates&gt;&lt;isbn&gt;978-0-7381-6251-5&lt;/isbn&gt;&lt;label&gt;ieee1516_2010&lt;/label&gt;&lt;urls&gt;&lt;related-urls&gt;&lt;url&gt;https://ieeexplore.ieee.org/document/5553440&lt;/url&gt;&lt;/related-urls&gt;&lt;/urls&gt;&lt;electronic-resource-num&gt;10.1109/IEEESTD.2010.5553440&lt;/electronic-resource-num&gt;&lt;/record&gt;&lt;/Cite&gt;&lt;Cite&gt;&lt;Author&gt;Fujimoto&lt;/Author&gt;&lt;Year&gt;2000&lt;/Year&gt;&lt;RecNum&gt;25&lt;/RecNum&gt;&lt;record&gt;&lt;rec-number&gt;25&lt;/rec-number&gt;&lt;foreign-keys&gt;&lt;key app="EN" db-id="mdae8500109496fea4aff9c086e16cc25895" timestamp="1793216821"&gt;25&lt;/key&gt;&lt;/foreign-keys&gt;&lt;ref-type name="Book"&gt;6&lt;/ref-type&gt;&lt;contributors&gt;&lt;authors&gt;&lt;author&gt;Fujimoto, Richard M.&lt;/author&gt;&lt;/authors&gt;&lt;/contributors&gt;&lt;titles&gt;&lt;title&gt;Parallel and Distributed Simulation Systems&lt;/title&gt;&lt;secondary-title&gt;Wiley Series on Parallel and Distributed Computing&lt;/secondary-title&gt;&lt;/titles&gt;&lt;dates&gt;&lt;year&gt;2000&lt;/year&gt;&lt;/dates&gt;&lt;publisher&gt;John Wiley &amp;amp; Sons&lt;/publisher&gt;&lt;isbn&gt;978-0-471-18383-9&lt;/isbn&gt;&lt;label&gt;fujimoto2000&lt;/label&gt;&lt;urls&gt;&lt;/urls&gt;&lt;/record&gt;&lt;/Cite&gt;&lt;/EndNote&gt;</w:instrText>
+        <w:instrText xml:space="preserve"> ADDIN EN.CITE &lt;EndNote&gt;&lt;Cite&gt;&lt;Author&gt;IEEE&lt;/Author&gt;&lt;Year&gt;2010&lt;/Year&gt;&lt;RecNum&gt;38&lt;/RecNum&gt;&lt;DisplayText&gt;[32,33]&lt;/DisplayText&gt;&lt;record&gt;&lt;rec-number&gt;38&lt;/rec-number&gt;&lt;foreign-keys&gt;&lt;key app="EN" db-id="mdae8500109496fea4aff9c086e16cc25895" timestamp="1793221304"&gt;38&lt;/key&gt;&lt;/foreign-keys&gt;&lt;ref-type name="Standard"&gt;58&lt;/ref-type&gt;&lt;contributors&gt;&lt;authors&gt;&lt;author&gt;IEEE&lt;/author&gt;&lt;/authors&gt;&lt;/contributors&gt;&lt;titles&gt;&lt;title&gt;IEEE Standard for Modeling and Simulation (M&amp;amp;S) High Level Architecture (HLA) – Framework and Rules&lt;/title&gt;&lt;secondary-title&gt;IEEE Std 1516-2010&lt;/secondary-title&gt;&lt;/titles&gt;&lt;dates&gt;&lt;year&gt;2010&lt;/year&gt;&lt;/dates&gt;&lt;isbn&gt;978-0-7381-6251-5&lt;/isbn&gt;&lt;label&gt;ieee1516_2010&lt;/label&gt;&lt;urls&gt;&lt;related-urls&gt;&lt;url&gt;https://ieeexplore.ieee.org/document/5553440&lt;/url&gt;&lt;/related-urls&gt;&lt;/urls&gt;&lt;electronic-resource-num&gt;10.1109/IEEESTD.2010.5553440&lt;/electronic-resource-num&gt;&lt;/record&gt;&lt;/Cite&gt;&lt;Cite&gt;&lt;Author&gt;Fujimoto&lt;/Author&gt;&lt;Year&gt;2000&lt;/Year&gt;&lt;RecNum&gt;25&lt;/RecNum&gt;&lt;record&gt;&lt;rec-number&gt;25&lt;/rec-number&gt;&lt;foreign-keys&gt;&lt;key app="EN" db-id="mdae8500109496fea4aff9c086e16cc25895" timestamp="1793221304"&gt;25&lt;/key&gt;&lt;/foreign-keys&gt;&lt;ref-type name="Book"&gt;6&lt;/ref-type&gt;&lt;contributors&gt;&lt;authors&gt;&lt;author&gt;Fujimoto, Richard M.&lt;/author&gt;&lt;/authors&gt;&lt;/contributors&gt;&lt;titles&gt;&lt;title&gt;Parallel and Distributed Simulation Systems&lt;/title&gt;&lt;secondary-title&gt;Wiley Series on Parallel and Distributed Computing&lt;/secondary-title&gt;&lt;/titles&gt;&lt;dates&gt;&lt;year&gt;2000&lt;/year&gt;&lt;/dates&gt;&lt;publisher&gt;John Wiley &amp;amp; Sons&lt;/publisher&gt;&lt;isbn&gt;978-0-471-18383-9&lt;/isbn&gt;&lt;label&gt;fujimoto2000&lt;/label&gt;&lt;urls&gt;&lt;/urls&gt;&lt;/record&gt;&lt;/Cite&gt;&lt;/EndNote&gt;</w:instrText>
       </w:r>
       <w:r>
         <w:fldChar w:fldCharType="separate"/>
@@ -1961,7 +1961,7 @@
 cj48UmVjTnVtPjY4PC9SZWNOdW0+PERpc3BsYXlUZXh0PlsxNywxOCwzNF08L0Rpc3BsYXlUZXh0
 PjxyZWNvcmQ+PHJlYy1udW1iZXI+Njg8L3JlYy1udW1iZXI+PGZvcmVpZ24ta2V5cz48a2V5IGFw
 cD0iRU4iIGRiLWlkPSJtZGFlODUwMDEwOTQ5NmZlYTRhZmY5YzA4NmUxNmNjMjU4OTUiIHRpbWVz
-dGFtcD0iMTc5MzIxNjgyMSI+Njg8L2tleT48L2ZvcmVpZ24ta2V5cz48cmVmLXR5cGUgbmFtZT0i
+dGFtcD0iMTc5MzIyMTMwNCI+Njg8L2tleT48L2ZvcmVpZ24ta2V5cz48cmVmLXR5cGUgbmFtZT0i
 Q29uZmVyZW5jZSBQYXBlciI+NDc8L3JlZi10eXBlPjxjb250cmlidXRvcnM+PGF1dGhvcnM+PGF1
 dGhvcj5QYWxtaW50aWVyLCBCcnlhbjwvYXV0aG9yPjxhdXRob3I+S3Jpc2huYW11cnRoeSwgRGhl
 ZXBhazwvYXV0aG9yPjxhdXRob3I+VG9wLCBQaGlsaXA8L2F1dGhvcj48YXV0aG9yPlNtaXRoLCBT
@@ -1979,7 +1979,7 @@
 PkhhcmR5PC9BdXRob3I+PFllYXI+MjAyNDwvWWVhcj48UmVjTnVtPjI5PC9SZWNOdW0+PHJlY29y
 ZD48cmVjLW51bWJlcj4yOTwvcmVjLW51bWJlcj48Zm9yZWlnbi1rZXlzPjxrZXkgYXBwPSJFTiIg
 ZGItaWQ9Im1kYWU4NTAwMTA5NDk2ZmVhNGFmZjljMDg2ZTE2Y2MyNTg5NSIgdGltZXN0YW1wPSIx
-NzkzMjE2ODIxIj4yOTwva2V5PjwvZm9yZWlnbi1rZXlzPjxyZWYtdHlwZSBuYW1lPSJKb3VybmFs
+NzkzMjIxMzA0Ij4yOTwva2V5PjwvZm9yZWlnbi1rZXlzPjxyZWYtdHlwZSBuYW1lPSJKb3VybmFs
 IEFydGljbGUiPjE3PC9yZWYtdHlwZT48Y29udHJpYnV0b3JzPjxhdXRob3JzPjxhdXRob3I+SGFy
 ZHksIFRyZXZvciBELjwvYXV0aG9yPjxhdXRob3I+UGFsbWludGllciwgQnJ5YW48L2F1dGhvcj48
 YXV0aG9yPlRvcCwgUGhpbGlwIEwuPC9hdXRob3I+PGF1dGhvcj5LcmlzaG5hbXVydGh5LCBEaGVl
@@ -1997,7 +1997,7 @@
 Qyk8L0F1dGhvcj48WWVhcj4yMDI2PC9ZZWFyPjxSZWNOdW0+MzE8L1JlY051bT48cmVjb3JkPjxy
 ZWMtbnVtYmVyPjMxPC9yZWMtbnVtYmVyPjxmb3JlaWduLWtleXM+PGtleSBhcHA9IkVOIiBkYi1p
 ZD0ibWRhZTg1MDAxMDk0OTZmZWE0YWZmOWMwODZlMTZjYzI1ODk1IiB0aW1lc3RhbXA9IjE3OTMy
-MTY4MjEiPjMxPC9rZXk+PC9mb3JlaWduLWtleXM+PHJlZi10eXBlIG5hbWU9IldlYiBQYWdlIj4x
+MjEzMDQiPjMxPC9rZXk+PC9mb3JlaWduLWtleXM+PHJlZi10eXBlIG5hbWU9IldlYiBQYWdlIj4x
 MjwvcmVmLXR5cGU+PGNvbnRyaWJ1dG9ycz48YXV0aG9ycz48YXV0aG9yPkhFTElDUyBkZXZlbG9w
 ZXJzIChHTUxDLVREQyk8L2F1dGhvcj48L2F1dGhvcnM+PC9jb250cmlidXRvcnM+PHRpdGxlcz48
 dGl0bGU+SEVMSUNTIGRvY3VtZW50YXRpb248L3RpdGxlPjwvdGl0bGVzPjxkYXRlcz48eWVhcj4y
@@ -2016,7 +2016,7 @@
 cj48UmVjTnVtPjY4PC9SZWNOdW0+PERpc3BsYXlUZXh0PlsxNywxOCwzNF08L0Rpc3BsYXlUZXh0
 PjxyZWNvcmQ+PHJlYy1udW1iZXI+Njg8L3JlYy1udW1iZXI+PGZvcmVpZ24ta2V5cz48a2V5IGFw
 cD0iRU4iIGRiLWlkPSJtZGFlODUwMDEwOTQ5NmZlYTRhZmY5YzA4NmUxNmNjMjU4OTUiIHRpbWVz
-dGFtcD0iMTc5MzIxNjgyMSI+Njg8L2tleT48L2ZvcmVpZ24ta2V5cz48cmVmLXR5cGUgbmFtZT0i
+dGFtcD0iMTc5MzIyMTMwNCI+Njg8L2tleT48L2ZvcmVpZ24ta2V5cz48cmVmLXR5cGUgbmFtZT0i
 Q29uZmVyZW5jZSBQYXBlciI+NDc8L3JlZi10eXBlPjxjb250cmlidXRvcnM+PGF1dGhvcnM+PGF1
 dGhvcj5QYWxtaW50aWVyLCBCcnlhbjwvYXV0aG9yPjxhdXRob3I+S3Jpc2huYW11cnRoeSwgRGhl
 ZXBhazwvYXV0aG9yPjxhdXRob3I+VG9wLCBQaGlsaXA8L2F1dGhvcj48YXV0aG9yPlNtaXRoLCBT
@@ -2034,7 +2034,7 @@
 PkhhcmR5PC9BdXRob3I+PFllYXI+MjAyNDwvWWVhcj48UmVjTnVtPjI5PC9SZWNOdW0+PHJlY29y
 ZD48cmVjLW51bWJlcj4yOTwvcmVjLW51bWJlcj48Zm9yZWlnbi1rZXlzPjxrZXkgYXBwPSJFTiIg
 ZGItaWQ9Im1kYWU4NTAwMTA5NDk2ZmVhNGFmZjljMDg2ZTE2Y2MyNTg5NSIgdGltZXN0YW1wPSIx
-NzkzMjE2ODIxIj4yOTwva2V5PjwvZm9yZWlnbi1rZXlzPjxyZWYtdHlwZSBuYW1lPSJKb3VybmFs
+NzkzMjIxMzA0Ij4yOTwva2V5PjwvZm9yZWlnbi1rZXlzPjxyZWYtdHlwZSBuYW1lPSJKb3VybmFs
 IEFydGljbGUiPjE3PC9yZWYtdHlwZT48Y29udHJpYnV0b3JzPjxhdXRob3JzPjxhdXRob3I+SGFy
 ZHksIFRyZXZvciBELjwvYXV0aG9yPjxhdXRob3I+UGFsbWludGllciwgQnJ5YW48L2F1dGhvcj48
 YXV0aG9yPlRvcCwgUGhpbGlwIEwuPC9hdXRob3I+PGF1dGhvcj5LcmlzaG5hbXVydGh5LCBEaGVl
@@ -2052,7 +2052,7 @@
 Qyk8L0F1dGhvcj48WWVhcj4yMDI2PC9ZZWFyPjxSZWNOdW0+MzE8L1JlY051bT48cmVjb3JkPjxy
 ZWMtbnVtYmVyPjMxPC9yZWMtbnVtYmVyPjxmb3JlaWduLWtleXM+PGtleSBhcHA9IkVOIiBkYi1p
 ZD0ibWRhZTg1MDAxMDk0OTZmZWE0YWZmOWMwODZlMTZjYzI1ODk1IiB0aW1lc3RhbXA9IjE3OTMy
-MTY4MjEiPjMxPC9rZXk+PC9mb3JlaWduLWtleXM+PHJlZi10eXBlIG5hbWU9IldlYiBQYWdlIj4x
+MjEzMDQiPjMxPC9rZXk+PC9mb3JlaWduLWtleXM+PHJlZi10eXBlIG5hbWU9IldlYiBQYWdlIj4x
 MjwvcmVmLXR5cGU+PGNvbnRyaWJ1dG9ycz48YXV0aG9ycz48YXV0aG9yPkhFTElDUyBkZXZlbG9w
 ZXJzIChHTUxDLVREQyk8L2F1dGhvcj48L2F1dGhvcnM+PC9jb250cmlidXRvcnM+PHRpdGxlcz48
 dGl0bGU+SEVMSUNTIGRvY3VtZW50YXRpb248L3RpdGxlPjwvdGl0bGVzPjxkYXRlcz48eWVhcj4y
@@ -2087,7 +2087,7 @@
         <w:fldChar w:fldCharType="begin"/>
       </w:r>
       <w:r>
-        <w:instrText xml:space="preserve"> ADDIN EN.CITE &lt;EndNote&gt;&lt;Cite&gt;&lt;Author&gt;Ofenloch&lt;/Author&gt;&lt;Year&gt;2022&lt;/Year&gt;&lt;RecNum&gt;62&lt;/RecNum&gt;&lt;DisplayText&gt;[20,35]&lt;/DisplayText&gt;&lt;record&gt;&lt;rec-number&gt;62&lt;/rec-number&gt;&lt;foreign-keys&gt;&lt;key app="EN" db-id="mdae8500109496fea4aff9c086e16cc25895" timestamp="1793216821"&gt;62&lt;/key&gt;&lt;/foreign-keys&gt;&lt;ref-type name="Conference Paper"&gt;47&lt;/ref-type&gt;&lt;contributors&gt;&lt;authors&gt;&lt;author&gt;Ofenloch, Annika&lt;/author&gt;&lt;author&gt;Schwarz, Jan Sören&lt;/author&gt;&lt;author&gt;Tolk, Deborah&lt;/author&gt;&lt;author&gt;Brandt, Tobias&lt;/author&gt;&lt;author&gt;Eilers, Reef&lt;/author&gt;&lt;author&gt;Ramirez, Rebeca&lt;/author&gt;&lt;author&gt;Raub, Thomas&lt;/author&gt;&lt;author&gt;Lehnhoff, Sebastian&lt;/author&gt;&lt;/authors&gt;&lt;/contributors&gt;&lt;titles&gt;&lt;title&gt;MOSAIK 3.0: Combining Time-Stepped and Discrete Event Simulation&lt;/title&gt;&lt;secondary-title&gt;2022 Open Source Modelling and Simulation of Energy Systems (OSMSES)&lt;/secondary-title&gt;&lt;/titles&gt;&lt;pages&gt;1-5&lt;/pages&gt;&lt;dates&gt;&lt;year&gt;2022&lt;/year&gt;&lt;/dates&gt;&lt;pub-location&gt;Aachen, Germany&lt;/pub-location&gt;&lt;publisher&gt;IEEE&lt;/publisher&gt;&lt;label&gt;ofenloch2022&lt;/label&gt;&lt;urls&gt;&lt;/urls&gt;&lt;electronic-resource-num&gt;10.1109/OSMSES54027.2022.9769116&lt;/electronic-resource-num&gt;&lt;/record&gt;&lt;/Cite&gt;&lt;Cite&gt;&lt;Author&gt;OFFIS&lt;/Author&gt;&lt;Year&gt;2025&lt;/Year&gt;&lt;RecNum&gt;56&lt;/RecNum&gt;&lt;record&gt;&lt;rec-number&gt;56&lt;/rec-number&gt;&lt;foreign-keys&gt;&lt;key app="EN" db-id="mdae8500109496fea4aff9c086e16cc25895" timestamp="1793216821"&gt;56&lt;/key&gt;&lt;/foreign-keys&gt;&lt;ref-type name="Web Page"&gt;12&lt;/ref-type&gt;&lt;contributors&gt;&lt;authors&gt;&lt;author&gt;OFFIS&lt;/author&gt;&lt;/authors&gt;&lt;/contributors&gt;&lt;titles&gt;&lt;title&gt;mosaik documentation&lt;/title&gt;&lt;/titles&gt;&lt;dates&gt;&lt;year&gt;2025&lt;/year&gt;&lt;/dates&gt;&lt;label&gt;mosaik_docs&lt;/label&gt;&lt;urls&gt;&lt;related-urls&gt;&lt;url&gt;https://mosaik.readthedocs.io/en/3.5.0/&lt;/url&gt;&lt;/related-urls&gt;&lt;/urls&gt;&lt;access-date&gt;2026-10-28&lt;/access-date&gt;&lt;/record&gt;&lt;/Cite&gt;&lt;/EndNote&gt;</w:instrText>
+        <w:instrText xml:space="preserve"> ADDIN EN.CITE &lt;EndNote&gt;&lt;Cite&gt;&lt;Author&gt;Ofenloch&lt;/Author&gt;&lt;Year&gt;2022&lt;/Year&gt;&lt;RecNum&gt;62&lt;/RecNum&gt;&lt;DisplayText&gt;[20,35]&lt;/DisplayText&gt;&lt;record&gt;&lt;rec-number&gt;62&lt;/rec-number&gt;&lt;foreign-keys&gt;&lt;key app="EN" db-id="mdae8500109496fea4aff9c086e16cc25895" timestamp="1793221304"&gt;62&lt;/key&gt;&lt;/foreign-keys&gt;&lt;ref-type name="Conference Paper"&gt;47&lt;/ref-type&gt;&lt;contributors&gt;&lt;authors&gt;&lt;author&gt;Ofenloch, Annika&lt;/author&gt;&lt;author&gt;Schwarz, Jan Sören&lt;/author&gt;&lt;author&gt;Tolk, Deborah&lt;/author&gt;&lt;author&gt;Brandt, Tobias&lt;/author&gt;&lt;author&gt;Eilers, Reef&lt;/author&gt;&lt;author&gt;Ramirez, Rebeca&lt;/author&gt;&lt;author&gt;Raub, Thomas&lt;/author&gt;&lt;author&gt;Lehnhoff, Sebastian&lt;/author&gt;&lt;/authors&gt;&lt;/contributors&gt;&lt;titles&gt;&lt;title&gt;MOSAIK 3.0: Combining Time-Stepped and Discrete Event Simulation&lt;/title&gt;&lt;secondary-title&gt;2022 Open Source Modelling and Simulation of Energy Systems (OSMSES)&lt;/secondary-title&gt;&lt;/titles&gt;&lt;pages&gt;1-5&lt;/pages&gt;&lt;dates&gt;&lt;year&gt;2022&lt;/year&gt;&lt;/dates&gt;&lt;pub-location&gt;Aachen, Germany&lt;/pub-location&gt;&lt;publisher&gt;IEEE&lt;/publisher&gt;&lt;label&gt;ofenloch2022&lt;/label&gt;&lt;urls&gt;&lt;/urls&gt;&lt;electronic-resource-num&gt;10.1109/OSMSES54027.2022.9769116&lt;/electronic-resource-num&gt;&lt;/record&gt;&lt;/Cite&gt;&lt;Cite&gt;&lt;Author&gt;OFFIS&lt;/Author&gt;&lt;Year&gt;2025&lt;/Year&gt;&lt;RecNum&gt;56&lt;/RecNum&gt;&lt;record&gt;&lt;rec-number&gt;56&lt;/rec-number&gt;&lt;foreign-keys&gt;&lt;key app="EN" db-id="mdae8500109496fea4aff9c086e16cc25895" timestamp="1793221304"&gt;56&lt;/key&gt;&lt;/foreign-keys&gt;&lt;ref-type name="Web Page"&gt;12&lt;/ref-type&gt;&lt;contributors&gt;&lt;authors&gt;&lt;author&gt;OFFIS&lt;/author&gt;&lt;/authors&gt;&lt;/contributors&gt;&lt;titles&gt;&lt;title&gt;mosaik documentation&lt;/title&gt;&lt;/titles&gt;&lt;dates&gt;&lt;year&gt;2025&lt;/year&gt;&lt;/dates&gt;&lt;label&gt;mosaik_docs&lt;/label&gt;&lt;urls&gt;&lt;related-urls&gt;&lt;url&gt;https://mosaik.readthedocs.io/en/3.5.0/&lt;/url&gt;&lt;/related-urls&gt;&lt;/urls&gt;&lt;access-date&gt;2026-10-28&lt;/access-date&gt;&lt;/record&gt;&lt;/Cite&gt;&lt;/EndNote&gt;</w:instrText>
       </w:r>
       <w:r>
         <w:fldChar w:fldCharType="separate"/>
@@ -2110,7 +2110,7 @@
 dW0+ODQ8L1JlY051bT48RGlzcGxheVRleHQ+WzM2LDM3XTwvRGlzcGxheVRleHQ+PHJlY29yZD48
 cmVjLW51bWJlcj44NDwvcmVjLW51bWJlcj48Zm9yZWlnbi1rZXlzPjxrZXkgYXBwPSJFTiIgZGIt
 aWQ9Im1kYWU4NTAwMTA5NDk2ZmVhNGFmZjljMDg2ZTE2Y2MyNTg5NSIgdGltZXN0YW1wPSIxNzkz
-MjE2ODIxIj44NDwva2V5PjwvZm9yZWlnbi1rZXlzPjxyZWYtdHlwZSBuYW1lPSJKb3VybmFsIEFy
+MjIxMzA0Ij44NDwva2V5PjwvZm9yZWlnbi1rZXlzPjxyZWYtdHlwZSBuYW1lPSJKb3VybmFsIEFy
 dGljbGUiPjE3PC9yZWYtdHlwZT48Y29udHJpYnV0b3JzPjxhdXRob3JzPjxhdXRob3I+V2VuLCBK
 aWFuZmVuZzwvYXV0aG9yPjxhdXRob3I+SmlhbmcsIExpbjwvYXV0aG9yPjxhdXRob3I+Q2hlbiwg
 WXV5aW5nPC9hdXRob3I+PGF1dGhvcj5DaHUsIENoaWEtQ2hpPC9hdXRob3I+PGF1dGhvcj5aaHUs
@@ -2129,7 +2129,7 @@
 ZD48L0NpdGU+PENpdGU+PEF1dGhvcj5QYWR1YW5pPC9BdXRob3I+PFllYXI+MjAyMzwvWWVhcj48
 UmVjTnVtPjY3PC9SZWNOdW0+PHJlY29yZD48cmVjLW51bWJlcj42NzwvcmVjLW51bWJlcj48Zm9y
 ZWlnbi1rZXlzPjxrZXkgYXBwPSJFTiIgZGItaWQ9Im1kYWU4NTAwMTA5NDk2ZmVhNGFmZjljMDg2
-ZTE2Y2MyNTg5NSIgdGltZXN0YW1wPSIxNzkzMjE2ODIxIj42Nzwva2V5PjwvZm9yZWlnbi1rZXlz
+ZTE2Y2MyNTg5NSIgdGltZXN0YW1wPSIxNzkzMjIxMzA0Ij42Nzwva2V5PjwvZm9yZWlnbi1rZXlz
 PjxyZWYtdHlwZSBuYW1lPSJDb25mZXJlbmNlIFBhcGVyIj40NzwvcmVmLXR5cGU+PGNvbnRyaWJ1
 dG9ycz48YXV0aG9ycz48YXV0aG9yPlBhZHVhbmksIFZpY3RvcjwvYXV0aG9yPjxhdXRob3I+S2Fk
 YXZpbCwgUmFodWw8L2F1dGhvcj48YXV0aG9yPkhvb3NoeWFyLCBIb3NzZWluPC9hdXRob3I+PGF1
@@ -2155,7 +2155,7 @@
 dW0+ODQ8L1JlY051bT48RGlzcGxheVRleHQ+WzM2LDM3XTwvRGlzcGxheVRleHQ+PHJlY29yZD48
 cmVjLW51bWJlcj44NDwvcmVjLW51bWJlcj48Zm9yZWlnbi1rZXlzPjxrZXkgYXBwPSJFTiIgZGIt
 aWQ9Im1kYWU4NTAwMTA5NDk2ZmVhNGFmZjljMDg2ZTE2Y2MyNTg5NSIgdGltZXN0YW1wPSIxNzkz
-MjE2ODIxIj44NDwva2V5PjwvZm9yZWlnbi1rZXlzPjxyZWYtdHlwZSBuYW1lPSJKb3VybmFsIEFy
+MjIxMzA0Ij44NDwva2V5PjwvZm9yZWlnbi1rZXlzPjxyZWYtdHlwZSBuYW1lPSJKb3VybmFsIEFy
 dGljbGUiPjE3PC9yZWYtdHlwZT48Y29udHJpYnV0b3JzPjxhdXRob3JzPjxhdXRob3I+V2VuLCBK
 aWFuZmVuZzwvYXV0aG9yPjxhdXRob3I+SmlhbmcsIExpbjwvYXV0aG9yPjxhdXRob3I+Q2hlbiwg
 WXV5aW5nPC9hdXRob3I+PGF1dGhvcj5DaHUsIENoaWEtQ2hpPC9hdXRob3I+PGF1dGhvcj5aaHUs
@@ -2174,7 +2174,7 @@
 ZD48L0NpdGU+PENpdGU+PEF1dGhvcj5QYWR1YW5pPC9BdXRob3I+PFllYXI+MjAyMzwvWWVhcj48
 UmVjTnVtPjY3PC9SZWNOdW0+PHJlY29yZD48cmVjLW51bWJlcj42NzwvcmVjLW51bWJlcj48Zm9y
 ZWlnbi1rZXlzPjxrZXkgYXBwPSJFTiIgZGItaWQ9Im1kYWU4NTAwMTA5NDk2ZmVhNGFmZjljMDg2
-ZTE2Y2MyNTg5NSIgdGltZXN0YW1wPSIxNzkzMjE2ODIxIj42Nzwva2V5PjwvZm9yZWlnbi1rZXlz
+ZTE2Y2MyNTg5NSIgdGltZXN0YW1wPSIxNzkzMjIxMzA0Ij42Nzwva2V5PjwvZm9yZWlnbi1rZXlz
 PjxyZWYtdHlwZSBuYW1lPSJDb25mZXJlbmNlIFBhcGVyIj40NzwvcmVmLXR5cGU+PGNvbnRyaWJ1
 dG9ycz48YXV0aG9ycz48YXV0aG9yPlBhZHVhbmksIFZpY3RvcjwvYXV0aG9yPjxhdXRob3I+S2Fk
 YXZpbCwgUmFodWw8L2F1dGhvcj48YXV0aG9yPkhvb3NoeWFyLCBIb3NzZWluPC9hdXRob3I+PGF1
@@ -2216,7 +2216,7 @@
         <w:fldChar w:fldCharType="begin"/>
       </w:r>
       <w:r>
-        <w:instrText xml:space="preserve"> ADDIN EN.CITE &lt;EndNote&gt;&lt;Cite&gt;&lt;Author&gt;Katipamula&lt;/Author&gt;&lt;Year&gt;2016&lt;/Year&gt;&lt;RecNum&gt;44&lt;/RecNum&gt;&lt;DisplayText&gt;[38]&lt;/DisplayText&gt;&lt;record&gt;&lt;rec-number&gt;44&lt;/rec-number&gt;&lt;foreign-keys&gt;&lt;key app="EN" db-id="mdae8500109496fea4aff9c086e16cc25895" timestamp="1793216821"&gt;44&lt;/key&gt;&lt;/foreign-keys&gt;&lt;ref-type name="Journal Article"&gt;17&lt;/ref-type&gt;&lt;contributors&gt;&lt;authors&gt;&lt;author&gt;Katipamula, Srinivas&lt;/author&gt;&lt;author&gt;Haack, Jereme&lt;/author&gt;&lt;author&gt;Hernandez, George&lt;/author&gt;&lt;author&gt;Akyol, Bora&lt;/author&gt;&lt;author&gt;Hagerman, Joseph&lt;/author&gt;&lt;/authors&gt;&lt;/contributors&gt;&lt;titles&gt;&lt;title&gt;VOLTTRON: An Open-Source Software Platform of the Future&lt;/title&gt;&lt;secondary-title&gt;IEEE Electrification Magazine&lt;/secondary-title&gt;&lt;alt-title&gt;IEEE Electrif. Mag.&lt;/alt-title&gt;&lt;/titles&gt;&lt;periodical&gt;&lt;full-title&gt;IEEE Electrification Magazine&lt;/full-title&gt;&lt;abbr-1&gt;IEEE Electrif. Mag.&lt;/abbr-1&gt;&lt;/periodical&gt;&lt;pages&gt;15-22&lt;/pages&gt;&lt;volume&gt;4&lt;/volume&gt;&lt;number&gt;4&lt;/number&gt;&lt;dates&gt;&lt;year&gt;2016&lt;/year&gt;&lt;/dates&gt;&lt;publisher&gt;IEEE&lt;/publisher&gt;&lt;label&gt;katipamula2016&lt;/label&gt;&lt;urls&gt;&lt;/urls&gt;&lt;electronic-resource-num&gt;10.1109/MELE.2016.2614178&lt;/electronic-resource-num&gt;&lt;/record&gt;&lt;/Cite&gt;&lt;/EndNote&gt;</w:instrText>
+        <w:instrText xml:space="preserve"> ADDIN EN.CITE &lt;EndNote&gt;&lt;Cite&gt;&lt;Author&gt;Katipamula&lt;/Author&gt;&lt;Year&gt;2016&lt;/Year&gt;&lt;RecNum&gt;44&lt;/RecNum&gt;&lt;DisplayText&gt;[38]&lt;/DisplayText&gt;&lt;record&gt;&lt;rec-number&gt;44&lt;/rec-number&gt;&lt;foreign-keys&gt;&lt;key app="EN" db-id="mdae8500109496fea4aff9c086e16cc25895" timestamp="1793221304"&gt;44&lt;/key&gt;&lt;/foreign-keys&gt;&lt;ref-type name="Journal Article"&gt;17&lt;/ref-type&gt;&lt;contributors&gt;&lt;authors&gt;&lt;author&gt;Katipamula, Srinivas&lt;/author&gt;&lt;author&gt;Haack, Jereme&lt;/author&gt;&lt;author&gt;Hernandez, George&lt;/author&gt;&lt;author&gt;Akyol, Bora&lt;/author&gt;&lt;author&gt;Hagerman, Joseph&lt;/author&gt;&lt;/authors&gt;&lt;/contributors&gt;&lt;titles&gt;&lt;title&gt;VOLTTRON: An Open-Source Software Platform of the Future&lt;/title&gt;&lt;secondary-title&gt;IEEE Electrification Magazine&lt;/secondary-title&gt;&lt;alt-title&gt;IEEE Electrif. Mag.&lt;/alt-title&gt;&lt;/titles&gt;&lt;periodical&gt;&lt;full-title&gt;IEEE Electrification Magazine&lt;/full-title&gt;&lt;abbr-1&gt;IEEE Electrif. Mag.&lt;/abbr-1&gt;&lt;/periodical&gt;&lt;pages&gt;15-22&lt;/pages&gt;&lt;volume&gt;4&lt;/volume&gt;&lt;number&gt;4&lt;/number&gt;&lt;dates&gt;&lt;year&gt;2016&lt;/year&gt;&lt;/dates&gt;&lt;publisher&gt;IEEE&lt;/publisher&gt;&lt;label&gt;katipamula2016&lt;/label&gt;&lt;urls&gt;&lt;/urls&gt;&lt;electronic-resource-num&gt;10.1109/MELE.2016.2614178&lt;/electronic-resource-num&gt;&lt;/record&gt;&lt;/Cite&gt;&lt;/EndNote&gt;</w:instrText>
       </w:r>
       <w:r>
         <w:fldChar w:fldCharType="separate"/>
@@ -2237,7 +2237,7 @@
         <w:fldChar w:fldCharType="begin"/>
       </w:r>
       <w:r>
-        <w:instrText xml:space="preserve"> ADDIN EN.CITE &lt;EndNote&gt;&lt;Cite&gt;&lt;Author&gt;HELICS developers (GMLC-TDC)&lt;/Author&gt;&lt;Year&gt;2026&lt;/Year&gt;&lt;RecNum&gt;31&lt;/RecNum&gt;&lt;DisplayText&gt;[34,35]&lt;/DisplayText&gt;&lt;record&gt;&lt;rec-number&gt;31&lt;/rec-number&gt;&lt;foreign-keys&gt;&lt;key app="EN" db-id="mdae8500109496fea4aff9c086e16cc25895" timestamp="1793216821"&gt;31&lt;/key&gt;&lt;/foreign-keys&gt;&lt;ref-type name="Web Page"&gt;12&lt;/ref-type&gt;&lt;contributors&gt;&lt;authors&gt;&lt;author&gt;HELICS developers (GMLC-TDC)&lt;/author&gt;&lt;/authors&gt;&lt;/contributors&gt;&lt;titles&gt;&lt;title&gt;HELICS documentation&lt;/title&gt;&lt;/titles&gt;&lt;dates&gt;&lt;year&gt;2026&lt;/year&gt;&lt;/dates&gt;&lt;label&gt;helics_docs&lt;/label&gt;&lt;urls&gt;&lt;related-urls&gt;&lt;url&gt;https://docs.helics.org/en/latest/&lt;/url&gt;&lt;/related-urls&gt;&lt;/urls&gt;&lt;access-date&gt;2026-10-28&lt;/access-date&gt;&lt;/record&gt;&lt;/Cite&gt;&lt;Cite&gt;&lt;Author&gt;OFFIS&lt;/Author&gt;&lt;Year&gt;2025&lt;/Year&gt;&lt;RecNum&gt;56&lt;/RecNum&gt;&lt;record&gt;&lt;rec-number&gt;56&lt;/rec-number&gt;&lt;foreign-keys&gt;&lt;key app="EN" db-id="mdae8500109496fea4aff9c086e16cc25895" timestamp="1793216821"&gt;56&lt;/key&gt;&lt;/foreign-keys&gt;&lt;ref-type name="Web Page"&gt;12&lt;/ref-type&gt;&lt;contributors&gt;&lt;authors&gt;&lt;author&gt;OFFIS&lt;/author&gt;&lt;/authors&gt;&lt;/contributors&gt;&lt;titles&gt;&lt;title&gt;mosaik documentation&lt;/title&gt;&lt;/titles&gt;&lt;dates&gt;&lt;year&gt;2025&lt;/year&gt;&lt;/dates&gt;&lt;label&gt;mosaik_docs&lt;/label&gt;&lt;urls&gt;&lt;related-urls&gt;&lt;url&gt;https://mosaik.readthedocs.io/en/3.5.0/&lt;/url&gt;&lt;/related-urls&gt;&lt;/urls&gt;&lt;access-date&gt;2026-10-28&lt;/access-date&gt;&lt;/record&gt;&lt;/Cite&gt;&lt;/EndNote&gt;</w:instrText>
+        <w:instrText xml:space="preserve"> ADDIN EN.CITE &lt;EndNote&gt;&lt;Cite&gt;&lt;Author&gt;HELICS developers (GMLC-TDC)&lt;/Author&gt;&lt;Year&gt;2026&lt;/Year&gt;&lt;RecNum&gt;31&lt;/RecNum&gt;&lt;DisplayText&gt;[34,35]&lt;/DisplayText&gt;&lt;record&gt;&lt;rec-number&gt;31&lt;/rec-number&gt;&lt;foreign-keys&gt;&lt;key app="EN" db-id="mdae8500109496fea4aff9c086e16cc25895" timestamp="1793221304"&gt;31&lt;/key&gt;&lt;/foreign-keys&gt;&lt;ref-type name="Web Page"&gt;12&lt;/ref-type&gt;&lt;contributors&gt;&lt;authors&gt;&lt;author&gt;HELICS developers (GMLC-TDC)&lt;/author&gt;&lt;/authors&gt;&lt;/contributors&gt;&lt;titles&gt;&lt;title&gt;HELICS documentation&lt;/title&gt;&lt;/titles&gt;&lt;dates&gt;&lt;year&gt;2026&lt;/year&gt;&lt;/dates&gt;&lt;label&gt;helics_docs&lt;/label&gt;&lt;urls&gt;&lt;related-urls&gt;&lt;url&gt;https://docs.helics.org/en/latest/&lt;/url&gt;&lt;/related-urls&gt;&lt;/urls&gt;&lt;access-date&gt;2026-10-28&lt;/access-date&gt;&lt;/record&gt;&lt;/Cite&gt;&lt;Cite&gt;&lt;Author&gt;OFFIS&lt;/Author&gt;&lt;Year&gt;2025&lt;/Year&gt;&lt;RecNum&gt;56&lt;/RecNum&gt;&lt;record&gt;&lt;rec-number&gt;56&lt;/rec-number&gt;&lt;foreign-keys&gt;&lt;key app="EN" db-id="mdae8500109496fea4aff9c086e16cc25895" timestamp="1793221304"&gt;56&lt;/key&gt;&lt;/foreign-keys&gt;&lt;ref-type name="Web Page"&gt;12&lt;/ref-type&gt;&lt;contributors&gt;&lt;authors&gt;&lt;author&gt;OFFIS&lt;/author&gt;&lt;/authors&gt;&lt;/contributors&gt;&lt;titles&gt;&lt;title&gt;mosaik documentation&lt;/title&gt;&lt;/titles&gt;&lt;dates&gt;&lt;year&gt;2025&lt;/year&gt;&lt;/dates&gt;&lt;label&gt;mosaik_docs&lt;/label&gt;&lt;urls&gt;&lt;related-urls&gt;&lt;url&gt;https://mosaik.readthedocs.io/en/3.5.0/&lt;/url&gt;&lt;/related-urls&gt;&lt;/urls&gt;&lt;access-date&gt;2026-10-28&lt;/access-date&gt;&lt;/record&gt;&lt;/Cite&gt;&lt;/EndNote&gt;</w:instrText>
       </w:r>
       <w:r>
         <w:fldChar w:fldCharType="separate"/>
@@ -2274,7 +2274,7 @@
         <w:fldChar w:fldCharType="begin"/>
       </w:r>
       <w:r>
-        <w:instrText xml:space="preserve"> ADDIN EN.CITE &lt;EndNote&gt;&lt;Cite&gt;&lt;Author&gt;Wetter&lt;/Author&gt;&lt;Year&gt;2011&lt;/Year&gt;&lt;RecNum&gt;85&lt;/RecNum&gt;&lt;DisplayText&gt;[11,39]&lt;/DisplayText&gt;&lt;record&gt;&lt;rec-number&gt;85&lt;/rec-number&gt;&lt;foreign-keys&gt;&lt;key app="EN" db-id="mdae8500109496fea4aff9c086e16cc25895" timestamp="1793216821"&gt;85&lt;/key&gt;&lt;/foreign-keys&gt;&lt;ref-type name="Journal Article"&gt;17&lt;/ref-type&gt;&lt;contributors&gt;&lt;authors&gt;&lt;author&gt;Wetter, Michael&lt;/author&gt;&lt;/authors&gt;&lt;/contributors&gt;&lt;titles&gt;&lt;title&gt;Co-simulation of building energy and control systems with the Building Controls Virtual Test Bed&lt;/title&gt;&lt;secondary-title&gt;Journal of Building Performance Simulation&lt;/secondary-title&gt;&lt;alt-title&gt;J. Build. Perform. Simul.&lt;/alt-title&gt;&lt;/titles&gt;&lt;periodical&gt;&lt;full-title&gt;Journal of Building Performance Simulation&lt;/full-title&gt;&lt;abbr-1&gt;J. Build. Perform. Simul.&lt;/abbr-1&gt;&lt;/periodical&gt;&lt;pages&gt;185-203&lt;/pages&gt;&lt;volume&gt;4&lt;/volume&gt;&lt;number&gt;3&lt;/number&gt;&lt;dates&gt;&lt;year&gt;2011&lt;/year&gt;&lt;/dates&gt;&lt;publisher&gt;Taylor &amp;amp; Francis&lt;/publisher&gt;&lt;label&gt;wetter2011&lt;/label&gt;&lt;urls&gt;&lt;/urls&gt;&lt;electronic-resource-num&gt;10.1080/19401493.2010.518631&lt;/electronic-resource-num&gt;&lt;/record&gt;&lt;/Cite&gt;&lt;Cite&gt;&lt;Author&gt;U.S. Department of Energy&lt;/Author&gt;&lt;Year&gt;2018&lt;/Year&gt;&lt;RecNum&gt;18&lt;/RecNum&gt;&lt;record&gt;&lt;rec-number&gt;18&lt;/rec-number&gt;&lt;foreign-keys&gt;&lt;key app="EN" db-id="mdae8500109496fea4aff9c086e16cc25895" timestamp="1793216821"&gt;18&lt;/key&gt;&lt;/foreign-keys&gt;&lt;ref-type name="Web Page"&gt;12&lt;/ref-type&gt;&lt;contributors&gt;&lt;authors&gt;&lt;author&gt;U.S. Department of Energy&lt;/author&gt;&lt;/authors&gt;&lt;/contributors&gt;&lt;titles&gt;&lt;title&gt;EnergyPlus External Interface(s) Application Guide: BCVTB Examples&lt;/title&gt;&lt;/titles&gt;&lt;dates&gt;&lt;year&gt;2018&lt;/year&gt;&lt;/dates&gt;&lt;label&gt;doe_extif&lt;/label&gt;&lt;urls&gt;&lt;related-urls&gt;&lt;url&gt;https://bigladdersoftware.com/epx/docs/9-0/external-interfaces-application-guide/bcvtb-examples.html&lt;/url&gt;&lt;/related-urls&gt;&lt;/urls&gt;&lt;access-date&gt;2026-10-28&lt;/access-date&gt;&lt;/record&gt;&lt;/Cite&gt;&lt;/EndNote&gt;</w:instrText>
+        <w:instrText xml:space="preserve"> ADDIN EN.CITE &lt;EndNote&gt;&lt;Cite&gt;&lt;Author&gt;Wetter&lt;/Author&gt;&lt;Year&gt;2011&lt;/Year&gt;&lt;RecNum&gt;85&lt;/RecNum&gt;&lt;DisplayText&gt;[11,39]&lt;/DisplayText&gt;&lt;record&gt;&lt;rec-number&gt;85&lt;/rec-number&gt;&lt;foreign-keys&gt;&lt;key app="EN" db-id="mdae8500109496fea4aff9c086e16cc25895" timestamp="1793221304"&gt;85&lt;/key&gt;&lt;/foreign-keys&gt;&lt;ref-type name="Journal Article"&gt;17&lt;/ref-type&gt;&lt;contributors&gt;&lt;authors&gt;&lt;author&gt;Wetter, Michael&lt;/author&gt;&lt;/authors&gt;&lt;/contributors&gt;&lt;titles&gt;&lt;title&gt;Co-simulation of building energy and control systems with the Building Controls Virtual Test Bed&lt;/title&gt;&lt;secondary-title&gt;Journal of Building Performance Simulation&lt;/secondary-title&gt;&lt;alt-title&gt;J. Build. Perform. Simul.&lt;/alt-title&gt;&lt;/titles&gt;&lt;periodical&gt;&lt;full-title&gt;Journal of Building Performance Simulation&lt;/full-title&gt;&lt;abbr-1&gt;J. Build. Perform. Simul.&lt;/abbr-1&gt;&lt;/periodical&gt;&lt;pages&gt;185-203&lt;/pages&gt;&lt;volume&gt;4&lt;/volume&gt;&lt;number&gt;3&lt;/number&gt;&lt;dates&gt;&lt;year&gt;2011&lt;/year&gt;&lt;/dates&gt;&lt;publisher&gt;Taylor &amp;amp; Francis&lt;/publisher&gt;&lt;label&gt;wetter2011&lt;/label&gt;&lt;urls&gt;&lt;/urls&gt;&lt;electronic-resource-num&gt;10.1080/19401493.2010.518631&lt;/electronic-resource-num&gt;&lt;/record&gt;&lt;/Cite&gt;&lt;Cite&gt;&lt;Author&gt;U.S. Department of Energy&lt;/Author&gt;&lt;Year&gt;2018&lt;/Year&gt;&lt;RecNum&gt;18&lt;/RecNum&gt;&lt;record&gt;&lt;rec-number&gt;18&lt;/rec-number&gt;&lt;foreign-keys&gt;&lt;key app="EN" db-id="mdae8500109496fea4aff9c086e16cc25895" timestamp="1793221304"&gt;18&lt;/key&gt;&lt;/foreign-keys&gt;&lt;ref-type name="Web Page"&gt;12&lt;/ref-type&gt;&lt;contributors&gt;&lt;authors&gt;&lt;author&gt;U.S. Department of Energy&lt;/author&gt;&lt;/authors&gt;&lt;/contributors&gt;&lt;titles&gt;&lt;title&gt;EnergyPlus External Interface(s) Application Guide: BCVTB Examples&lt;/title&gt;&lt;/titles&gt;&lt;dates&gt;&lt;year&gt;2018&lt;/year&gt;&lt;/dates&gt;&lt;label&gt;doe_extif&lt;/label&gt;&lt;urls&gt;&lt;related-urls&gt;&lt;url&gt;https://bigladdersoftware.com/epx/docs/9-0/external-interfaces-application-guide/bcvtb-examples.html&lt;/url&gt;&lt;/related-urls&gt;&lt;/urls&gt;&lt;access-date&gt;2026-10-28&lt;/access-date&gt;&lt;/record&gt;&lt;/Cite&gt;&lt;/EndNote&gt;</w:instrText>
       </w:r>
       <w:r>
         <w:fldChar w:fldCharType="separate"/>
@@ -2297,7 +2297,7 @@
 UmVjTnVtPjU5PC9SZWNOdW0+PERpc3BsYXlUZXh0PlsxMiw0MF08L0Rpc3BsYXlUZXh0PjxyZWNv
 cmQ+PHJlYy1udW1iZXI+NTk8L3JlYy1udW1iZXI+PGZvcmVpZ24ta2V5cz48a2V5IGFwcD0iRU4i
 IGRiLWlkPSJtZGFlODUwMDEwOTQ5NmZlYTRhZmY5YzA4NmUxNmNjMjU4OTUiIHRpbWVzdGFtcD0i
-MTc5MzIxNjgyMSI+NTk8L2tleT48L2ZvcmVpZ24ta2V5cz48cmVmLXR5cGUgbmFtZT0iSm91cm5h
+MTc5MzIyMTMwNCI+NTk8L2tleT48L2ZvcmVpZ24ta2V5cz48cmVmLXR5cGUgbmFtZT0iSm91cm5h
 bCBBcnRpY2xlIj4xNzwvcmVmLXR5cGU+PGNvbnRyaWJ1dG9ycz48YXV0aG9ycz48YXV0aG9yPk5v
 dWlkdWksIFRoaWVycnk8L2F1dGhvcj48YXV0aG9yPldldHRlciwgTWljaGFlbDwvYXV0aG9yPjxh
 dXRob3I+WnVvLCBXYW5nZGE8L2F1dGhvcj48L2F1dGhvcnM+PC9jb250cmlidXRvcnM+PHRpdGxl
@@ -2315,7 +2315,7 @@
 Pkxhd3JlbmNlIEJlcmtlbGV5IE5hdGlvbmFsIExhYm9yYXRvcnk8L0F1dGhvcj48WWVhcj4yMDIx
 PC9ZZWFyPjxSZWNOdW0+NDg8L1JlY051bT48cmVjb3JkPjxyZWMtbnVtYmVyPjQ4PC9yZWMtbnVt
 YmVyPjxmb3JlaWduLWtleXM+PGtleSBhcHA9IkVOIiBkYi1pZD0ibWRhZTg1MDAxMDk0OTZmZWE0
-YWZmOWMwODZlMTZjYzI1ODk1IiB0aW1lc3RhbXA9IjE3OTMyMTY4MjEiPjQ4PC9rZXk+PC9mb3Jl
+YWZmOWMwODZlMTZjYzI1ODk1IiB0aW1lc3RhbXA9IjE3OTMyMjEzMDQiPjQ4PC9rZXk+PC9mb3Jl
 aWduLWtleXM+PHJlZi10eXBlIG5hbWU9IldlYiBQYWdlIj4xMjwvcmVmLXR5cGU+PGNvbnRyaWJ1
 dG9ycz48YXV0aG9ycz48YXV0aG9yPkxhd3JlbmNlIEJlcmtlbGV5IE5hdGlvbmFsIExhYm9yYXRv
 cnk8L2F1dGhvcj48L2F1dGhvcnM+PC9jb250cmlidXRvcnM+PHRpdGxlcz48dGl0bGU+Rk1VIEV4
@@ -2337,7 +2337,7 @@
 UmVjTnVtPjU5PC9SZWNOdW0+PERpc3BsYXlUZXh0PlsxMiw0MF08L0Rpc3BsYXlUZXh0PjxyZWNv
 cmQ+PHJlYy1udW1iZXI+NTk8L3JlYy1udW1iZXI+PGZvcmVpZ24ta2V5cz48a2V5IGFwcD0iRU4i
 IGRiLWlkPSJtZGFlODUwMDEwOTQ5NmZlYTRhZmY5YzA4NmUxNmNjMjU4OTUiIHRpbWVzdGFtcD0i
-MTc5MzIxNjgyMSI+NTk8L2tleT48L2ZvcmVpZ24ta2V5cz48cmVmLXR5cGUgbmFtZT0iSm91cm5h
+MTc5MzIyMTMwNCI+NTk8L2tleT48L2ZvcmVpZ24ta2V5cz48cmVmLXR5cGUgbmFtZT0iSm91cm5h
 bCBBcnRpY2xlIj4xNzwvcmVmLXR5cGU+PGNvbnRyaWJ1dG9ycz48YXV0aG9ycz48YXV0aG9yPk5v
 dWlkdWksIFRoaWVycnk8L2F1dGhvcj48YXV0aG9yPldldHRlciwgTWljaGFlbDwvYXV0aG9yPjxh
 dXRob3I+WnVvLCBXYW5nZGE8L2F1dGhvcj48L2F1dGhvcnM+PC9jb250cmlidXRvcnM+PHRpdGxl
@@ -2355,7 +2355,7 @@
 Pkxhd3JlbmNlIEJlcmtlbGV5IE5hdGlvbmFsIExhYm9yYXRvcnk8L0F1dGhvcj48WWVhcj4yMDIx
 PC9ZZWFyPjxSZWNOdW0+NDg8L1JlY051bT48cmVjb3JkPjxyZWMtbnVtYmVyPjQ4PC9yZWMtbnVt
 YmVyPjxmb3JlaWduLWtleXM+PGtleSBhcHA9IkVOIiBkYi1pZD0ibWRhZTg1MDAxMDk0OTZmZWE0
-YWZmOWMwODZlMTZjYzI1ODk1IiB0aW1lc3RhbXA9IjE3OTMyMTY4MjEiPjQ4PC9rZXk+PC9mb3Jl
+YWZmOWMwODZlMTZjYzI1ODk1IiB0aW1lc3RhbXA9IjE3OTMyMjEzMDQiPjQ4PC9rZXk+PC9mb3Jl
 aWduLWtleXM+PHJlZi10eXBlIG5hbWU9IldlYiBQYWdlIj4xMjwvcmVmLXR5cGU+PGNvbnRyaWJ1
 dG9ycz48YXV0aG9ycz48YXV0aG9yPkxhd3JlbmNlIEJlcmtlbGV5IE5hdGlvbmFsIExhYm9yYXRv
 cnk8L2F1dGhvcj48L2F1dGhvcnM+PC9jb250cmlidXRvcnM+PHRpdGxlcz48dGl0bGU+Rk1VIEV4
@@ -2393,7 +2393,7 @@
         <w:fldChar w:fldCharType="begin"/>
       </w:r>
       <w:r>
-        <w:instrText xml:space="preserve"> ADDIN EN.CITE &lt;EndNote&gt;&lt;Cite&gt;&lt;Author&gt;Wetter&lt;/Author&gt;&lt;Year&gt;2020&lt;/Year&gt;&lt;RecNum&gt;86&lt;/RecNum&gt;&lt;DisplayText&gt;[13]&lt;/DisplayText&gt;&lt;record&gt;&lt;rec-number&gt;86&lt;/rec-number&gt;&lt;foreign-keys&gt;&lt;key app="EN" db-id="mdae8500109496fea4aff9c086e16cc25895" timestamp="1793216821"&gt;86&lt;/key&gt;&lt;/foreign-keys&gt;&lt;ref-type name="Conference Paper"&gt;47&lt;/ref-type&gt;&lt;contributors&gt;&lt;authors&gt;&lt;author&gt;Wetter, Michael&lt;/author&gt;&lt;author&gt;Benne, Kyle&lt;/author&gt;&lt;author&gt;Gautier, Antoine&lt;/author&gt;&lt;author&gt;Nouidui, Thierry S.&lt;/author&gt;&lt;author&gt;Ramle, Agnes&lt;/author&gt;&lt;author&gt;Roth, Amir&lt;/author&gt;&lt;author&gt;Tummescheit, Hubertus&lt;/author&gt;&lt;author&gt;Mentzer, Stuart&lt;/author&gt;&lt;author&gt;Winther, Christian&lt;/author&gt;&lt;/authors&gt;&lt;/contributors&gt;&lt;titles&gt;&lt;title&gt;Lifting the Garage Door on Spawn, an Open-Source BEM-Controls Engine&lt;/title&gt;&lt;secondary-title&gt;Proceedings of SimBuild Conference 2020, ASHRAE/IBPSA-USA Building Simulation Conference&lt;/secondary-title&gt;&lt;/titles&gt;&lt;volume&gt;9&lt;/volume&gt;&lt;dates&gt;&lt;year&gt;2020&lt;/year&gt;&lt;/dates&gt;&lt;publisher&gt;IBPSA-USA&lt;/publisher&gt;&lt;label&gt;wetter2020&lt;/label&gt;&lt;urls&gt;&lt;/urls&gt;&lt;electronic-resource-num&gt;10.26868/25746308.2020.C063&lt;/electronic-resource-num&gt;&lt;/record&gt;&lt;/Cite&gt;&lt;/EndNote&gt;</w:instrText>
+        <w:instrText xml:space="preserve"> ADDIN EN.CITE &lt;EndNote&gt;&lt;Cite&gt;&lt;Author&gt;Wetter&lt;/Author&gt;&lt;Year&gt;2020&lt;/Year&gt;&lt;RecNum&gt;86&lt;/RecNum&gt;&lt;DisplayText&gt;[13]&lt;/DisplayText&gt;&lt;record&gt;&lt;rec-number&gt;86&lt;/rec-number&gt;&lt;foreign-keys&gt;&lt;key app="EN" db-id="mdae8500109496fea4aff9c086e16cc25895" timestamp="1793221304"&gt;86&lt;/key&gt;&lt;/foreign-keys&gt;&lt;ref-type name="Conference Paper"&gt;47&lt;/ref-type&gt;&lt;contributors&gt;&lt;authors&gt;&lt;author&gt;Wetter, Michael&lt;/author&gt;&lt;author&gt;Benne, Kyle&lt;/author&gt;&lt;author&gt;Gautier, Antoine&lt;/author&gt;&lt;author&gt;Nouidui, Thierry S.&lt;/author&gt;&lt;author&gt;Ramle, Agnes&lt;/author&gt;&lt;author&gt;Roth, Amir&lt;/author&gt;&lt;author&gt;Tummescheit, Hubertus&lt;/author&gt;&lt;author&gt;Mentzer, Stuart&lt;/author&gt;&lt;author&gt;Winther, Christian&lt;/author&gt;&lt;/authors&gt;&lt;/contributors&gt;&lt;titles&gt;&lt;title&gt;Lifting the Garage Door on Spawn, an Open-Source BEM-Controls Engine&lt;/title&gt;&lt;secondary-title&gt;Proceedings of SimBuild Conference 2020, ASHRAE/IBPSA-USA Building Simulation Conference&lt;/secondary-title&gt;&lt;/titles&gt;&lt;volume&gt;9&lt;/volume&gt;&lt;dates&gt;&lt;year&gt;2020&lt;/year&gt;&lt;/dates&gt;&lt;publisher&gt;IBPSA-USA&lt;/publisher&gt;&lt;label&gt;wetter2020&lt;/label&gt;&lt;urls&gt;&lt;/urls&gt;&lt;electronic-resource-num&gt;10.26868/25746308.2020.C063&lt;/electronic-resource-num&gt;&lt;/record&gt;&lt;/Cite&gt;&lt;/EndNote&gt;</w:instrText>
       </w:r>
       <w:r>
         <w:fldChar w:fldCharType="separate"/>
@@ -2414,7 +2414,7 @@
         <w:fldChar w:fldCharType="begin"/>
       </w:r>
       <w:r>
-        <w:instrText xml:space="preserve"> ADDIN EN.CITE &lt;EndNote&gt;&lt;Cite&gt;&lt;Author&gt;U.S. Department of Energy&lt;/Author&gt;&lt;Year&gt;2022&lt;/Year&gt;&lt;RecNum&gt;19&lt;/RecNum&gt;&lt;DisplayText&gt;[41]&lt;/DisplayText&gt;&lt;record&gt;&lt;rec-number&gt;19&lt;/rec-number&gt;&lt;foreign-keys&gt;&lt;key app="EN" db-id="mdae8500109496fea4aff9c086e16cc25895" timestamp="1793216821"&gt;19&lt;/key&gt;&lt;/foreign-keys&gt;&lt;ref-type name="Web Page"&gt;12&lt;/ref-type&gt;&lt;contributors&gt;&lt;authors&gt;&lt;author&gt;U.S. Department of Energy&lt;/author&gt;&lt;/authors&gt;&lt;/contributors&gt;&lt;titles&gt;&lt;title&gt;EnergyPlus Input Output Reference: Group – Python Plugins / Python EMS&lt;/title&gt;&lt;/titles&gt;&lt;dates&gt;&lt;year&gt;2022&lt;/year&gt;&lt;/dates&gt;&lt;label&gt;doe2022&lt;/label&gt;&lt;urls&gt;&lt;related-urls&gt;&lt;url&gt;https://bigladdersoftware.com/epx/docs/22-2/input-output-reference/group-python-plugins.html&lt;/url&gt;&lt;/related-urls&gt;&lt;/urls&gt;&lt;access-date&gt;2026-10-28&lt;/access-date&gt;&lt;/record&gt;&lt;/Cite&gt;&lt;/EndNote&gt;</w:instrText>
+        <w:instrText xml:space="preserve"> ADDIN EN.CITE &lt;EndNote&gt;&lt;Cite&gt;&lt;Author&gt;U.S. Department of Energy&lt;/Author&gt;&lt;Year&gt;2022&lt;/Year&gt;&lt;RecNum&gt;19&lt;/RecNum&gt;&lt;DisplayText&gt;[41]&lt;/DisplayText&gt;&lt;record&gt;&lt;rec-number&gt;19&lt;/rec-number&gt;&lt;foreign-keys&gt;&lt;key app="EN" db-id="mdae8500109496fea4aff9c086e16cc25895" timestamp="1793221304"&gt;19&lt;/key&gt;&lt;/foreign-keys&gt;&lt;ref-type name="Web Page"&gt;12&lt;/ref-type&gt;&lt;contributors&gt;&lt;authors&gt;&lt;author&gt;U.S. Department of Energy&lt;/author&gt;&lt;/authors&gt;&lt;/contributors&gt;&lt;titles&gt;&lt;title&gt;EnergyPlus Input Output Reference: Group – Python Plugins / Python EMS&lt;/title&gt;&lt;/titles&gt;&lt;dates&gt;&lt;year&gt;2022&lt;/year&gt;&lt;/dates&gt;&lt;label&gt;doe2022&lt;/label&gt;&lt;urls&gt;&lt;related-urls&gt;&lt;url&gt;https://bigladdersoftware.com/epx/docs/22-2/input-output-reference/group-python-plugins.html&lt;/url&gt;&lt;/related-urls&gt;&lt;/urls&gt;&lt;access-date&gt;2026-10-28&lt;/access-date&gt;&lt;/record&gt;&lt;/Cite&gt;&lt;/EndNote&gt;</w:instrText>
       </w:r>
       <w:r>
         <w:fldChar w:fldCharType="separate"/>
@@ -2437,7 +2437,7 @@
 PC9ZZWFyPjxSZWNOdW0+NDE8L1JlY051bT48RGlzcGxheVRleHQ+WzE0LDE1LDQyXTwvRGlzcGxh
 eVRleHQ+PHJlY29yZD48cmVjLW51bWJlcj40MTwvcmVjLW51bWJlcj48Zm9yZWlnbi1rZXlzPjxr
 ZXkgYXBwPSJFTiIgZGItaWQ9Im1kYWU4NTAwMTA5NDk2ZmVhNGFmZjljMDg2ZTE2Y2MyNTg5NSIg
-dGltZXN0YW1wPSIxNzkzMjE2ODIxIj40MTwva2V5PjwvZm9yZWlnbi1rZXlzPjxyZWYtdHlwZSBu
+dGltZXN0YW1wPSIxNzkzMjIxMzA0Ij40MTwva2V5PjwvZm9yZWlnbi1rZXlzPjxyZWYtdHlwZSBu
 YW1lPSJDb25mZXJlbmNlIFBhcGVyIj40NzwvcmVmLXR5cGU+PGNvbnRyaWJ1dG9ycz48YXV0aG9y
 cz48YXV0aG9yPkppbcOpbmV6LVJhYm9zbywgSmF2aWVyPC9hdXRob3I+PGF1dGhvcj5DYW1wb3kt
 TmlldmVzLCBBbGVqYW5kcm88L2F1dGhvcj48YXV0aG9yPk1hbmphdmFjYXMtTHVjYXMsIEFudG9u
@@ -2456,7 +2456,7 @@
 LU5pZXZlczwvQXV0aG9yPjxZZWFyPjIwMjU8L1llYXI+PFJlY051bT45PC9SZWNOdW0+PHJlY29y
 ZD48cmVjLW51bWJlcj45PC9yZWMtbnVtYmVyPjxmb3JlaWduLWtleXM+PGtleSBhcHA9IkVOIiBk
 Yi1pZD0ibWRhZTg1MDAxMDk0OTZmZWE0YWZmOWMwODZlMTZjYzI1ODk1IiB0aW1lc3RhbXA9IjE3
-OTMyMTY4MjEiPjk8L2tleT48L2ZvcmVpZ24ta2V5cz48cmVmLXR5cGUgbmFtZT0iSm91cm5hbCBB
+OTMyMjEzMDQiPjk8L2tleT48L2ZvcmVpZ24ta2V5cz48cmVmLXR5cGUgbmFtZT0iSm91cm5hbCBB
 cnRpY2xlIj4xNzwvcmVmLXR5cGU+PGNvbnRyaWJ1dG9ycz48YXV0aG9ycz48YXV0aG9yPkNhbXBv
 eS1OaWV2ZXMsIEFsZWphbmRybzwvYXV0aG9yPjxhdXRob3I+TWFuamF2YWNhcywgQW50b25pbzwv
 YXV0aG9yPjxhdXRob3I+Smltw6luZXotUmFib3NvLCBKYXZpZXI8L2F1dGhvcj48YXV0aG9yPk1v
@@ -2474,7 +2474,7 @@
 cmVjb3JkPjwvQ2l0ZT48Q2l0ZT48QXV0aG9yPlpoYW5nPC9BdXRob3I+PFllYXI+MjAyMDwvWWVh
 cj48UmVjTnVtPjkwPC9SZWNOdW0+PHJlY29yZD48cmVjLW51bWJlcj45MDwvcmVjLW51bWJlcj48
 Zm9yZWlnbi1rZXlzPjxrZXkgYXBwPSJFTiIgZGItaWQ9Im1kYWU4NTAwMTA5NDk2ZmVhNGFmZjlj
-MDg2ZTE2Y2MyNTg5NSIgdGltZXN0YW1wPSIxNzkzMjE2ODIxIj45MDwva2V5PjwvZm9yZWlnbi1r
+MDg2ZTE2Y2MyNTg5NSIgdGltZXN0YW1wPSIxNzkzMjIxMzA0Ij45MDwva2V5PjwvZm9yZWlnbi1r
 ZXlzPjxyZWYtdHlwZSBuYW1lPSJDb25mZXJlbmNlIFBhcGVyIj40NzwvcmVmLXR5cGU+PGNvbnRy
 aWJ1dG9ycz48YXV0aG9ycz48YXV0aG9yPlpoYW5nLCBUaWFueXU8L2F1dGhvcj48YXV0aG9yPkFy
 ZGFrYW5pYW4sIE9taWQ8L2F1dGhvcj48L2F1dGhvcnM+PC9jb250cmlidXRvcnM+PHRpdGxlcz48
@@ -2498,7 +2498,7 @@
 PC9ZZWFyPjxSZWNOdW0+NDE8L1JlY051bT48RGlzcGxheVRleHQ+WzE0LDE1LDQyXTwvRGlzcGxh
 eVRleHQ+PHJlY29yZD48cmVjLW51bWJlcj40MTwvcmVjLW51bWJlcj48Zm9yZWlnbi1rZXlzPjxr
 ZXkgYXBwPSJFTiIgZGItaWQ9Im1kYWU4NTAwMTA5NDk2ZmVhNGFmZjljMDg2ZTE2Y2MyNTg5NSIg
-dGltZXN0YW1wPSIxNzkzMjE2ODIxIj40MTwva2V5PjwvZm9yZWlnbi1rZXlzPjxyZWYtdHlwZSBu
+dGltZXN0YW1wPSIxNzkzMjIxMzA0Ij40MTwva2V5PjwvZm9yZWlnbi1rZXlzPjxyZWYtdHlwZSBu
 YW1lPSJDb25mZXJlbmNlIFBhcGVyIj40NzwvcmVmLXR5cGU+PGNvbnRyaWJ1dG9ycz48YXV0aG9y
 cz48YXV0aG9yPkppbcOpbmV6LVJhYm9zbywgSmF2aWVyPC9hdXRob3I+PGF1dGhvcj5DYW1wb3kt
 TmlldmVzLCBBbGVqYW5kcm88L2F1dGhvcj48YXV0aG9yPk1hbmphdmFjYXMtTHVjYXMsIEFudG9u
@@ -2517,7 +2517,7 @@
 LU5pZXZlczwvQXV0aG9yPjxZZWFyPjIwMjU8L1llYXI+PFJlY051bT45PC9SZWNOdW0+PHJlY29y
 ZD48cmVjLW51bWJlcj45PC9yZWMtbnVtYmVyPjxmb3JlaWduLWtleXM+PGtleSBhcHA9IkVOIiBk
 Yi1pZD0ibWRhZTg1MDAxMDk0OTZmZWE0YWZmOWMwODZlMTZjYzI1ODk1IiB0aW1lc3RhbXA9IjE3
-OTMyMTY4MjEiPjk8L2tleT48L2ZvcmVpZ24ta2V5cz48cmVmLXR5cGUgbmFtZT0iSm91cm5hbCBB
+OTMyMjEzMDQiPjk8L2tleT48L2ZvcmVpZ24ta2V5cz48cmVmLXR5cGUgbmFtZT0iSm91cm5hbCBB
 cnRpY2xlIj4xNzwvcmVmLXR5cGU+PGNvbnRyaWJ1dG9ycz48YXV0aG9ycz48YXV0aG9yPkNhbXBv
 eS1OaWV2ZXMsIEFsZWphbmRybzwvYXV0aG9yPjxhdXRob3I+TWFuamF2YWNhcywgQW50b25pbzwv
 YXV0aG9yPjxhdXRob3I+Smltw6luZXotUmFib3NvLCBKYXZpZXI8L2F1dGhvcj48YXV0aG9yPk1v
@@ -2535,7 +2535,7 @@
 cmVjb3JkPjwvQ2l0ZT48Q2l0ZT48QXV0aG9yPlpoYW5nPC9BdXRob3I+PFllYXI+MjAyMDwvWWVh
 cj48UmVjTnVtPjkwPC9SZWNOdW0+PHJlY29yZD48cmVjLW51bWJlcj45MDwvcmVjLW51bWJlcj48
 Zm9yZWlnbi1rZXlzPjxrZXkgYXBwPSJFTiIgZGItaWQ9Im1kYWU4NTAwMTA5NDk2ZmVhNGFmZjlj
-MDg2ZTE2Y2MyNTg5NSIgdGltZXN0YW1wPSIxNzkzMjE2ODIxIj45MDwva2V5PjwvZm9yZWlnbi1r
+MDg2ZTE2Y2MyNTg5NSIgdGltZXN0YW1wPSIxNzkzMjIxMzA0Ij45MDwva2V5PjwvZm9yZWlnbi1r
 ZXlzPjxyZWYtdHlwZSBuYW1lPSJDb25mZXJlbmNlIFBhcGVyIj40NzwvcmVmLXR5cGU+PGNvbnRy
 aWJ1dG9ycz48YXV0aG9ycz48YXV0aG9yPlpoYW5nLCBUaWFueXU8L2F1dGhvcj48YXV0aG9yPkFy
 ZGFrYW5pYW4sIE9taWQ8L2F1dGhvcj48L2F1dGhvcnM+PC9jb250cmlidXRvcnM+PHRpdGxlcz48
@@ -2575,7 +2575,7 @@
         <w:fldChar w:fldCharType="begin"/>
       </w:r>
       <w:r>
-        <w:instrText xml:space="preserve"> ADDIN EN.CITE &lt;EndNote&gt;&lt;Cite&gt;&lt;Author&gt;Scharnhorst&lt;/Author&gt;&lt;Year&gt;2021&lt;/Year&gt;&lt;RecNum&gt;75&lt;/RecNum&gt;&lt;DisplayText&gt;[43]&lt;/DisplayText&gt;&lt;record&gt;&lt;rec-number&gt;75&lt;/rec-number&gt;&lt;foreign-keys&gt;&lt;key app="EN" db-id="mdae8500109496fea4aff9c086e16cc25895" timestamp="1793216821"&gt;75&lt;/key&gt;&lt;/foreign-keys&gt;&lt;ref-type name="Journal Article"&gt;17&lt;/ref-type&gt;&lt;contributors&gt;&lt;authors&gt;&lt;author&gt;Scharnhorst, Paul&lt;/author&gt;&lt;author&gt;Schubnel, Baptiste&lt;/author&gt;&lt;author&gt;Fernández Bandera, Carlos&lt;/author&gt;&lt;author&gt;Salom, Jaume&lt;/author&gt;&lt;author&gt;Taddeo, Paolo&lt;/author&gt;&lt;author&gt;Boegli, Max&lt;/author&gt;&lt;author&gt;Gorecki, Tomasz&lt;/author&gt;&lt;author&gt;Stauffer, Yves&lt;/author&gt;&lt;author&gt;Peppas, Antonis&lt;/author&gt;&lt;author&gt;Politi, Chrysa&lt;/author&gt;&lt;/authors&gt;&lt;/contributors&gt;&lt;titles&gt;&lt;title&gt;Energym: A Building Model Library for Controller Benchmarking&lt;/title&gt;&lt;secondary-title&gt;Applied Sciences&lt;/secondary-title&gt;&lt;alt-title&gt;Appl. Sci.&lt;/alt-title&gt;&lt;/titles&gt;&lt;periodical&gt;&lt;full-title&gt;Applied Sciences&lt;/full-title&gt;&lt;abbr-1&gt;Appl. Sci.&lt;/abbr-1&gt;&lt;/periodical&gt;&lt;pages&gt;3518&lt;/pages&gt;&lt;volume&gt;11&lt;/volume&gt;&lt;number&gt;8&lt;/number&gt;&lt;dates&gt;&lt;year&gt;2021&lt;/year&gt;&lt;/dates&gt;&lt;publisher&gt;MDPI&lt;/publisher&gt;&lt;label&gt;scharnhorst2021&lt;/label&gt;&lt;urls&gt;&lt;/urls&gt;&lt;electronic-resource-num&gt;10.3390/app11083518&lt;/electronic-resource-num&gt;&lt;/record&gt;&lt;/Cite&gt;&lt;/EndNote&gt;</w:instrText>
+        <w:instrText xml:space="preserve"> ADDIN EN.CITE &lt;EndNote&gt;&lt;Cite&gt;&lt;Author&gt;Scharnhorst&lt;/Author&gt;&lt;Year&gt;2021&lt;/Year&gt;&lt;RecNum&gt;75&lt;/RecNum&gt;&lt;DisplayText&gt;[43]&lt;/DisplayText&gt;&lt;record&gt;&lt;rec-number&gt;75&lt;/rec-number&gt;&lt;foreign-keys&gt;&lt;key app="EN" db-id="mdae8500109496fea4aff9c086e16cc25895" timestamp="1793221304"&gt;75&lt;/key&gt;&lt;/foreign-keys&gt;&lt;ref-type name="Journal Article"&gt;17&lt;/ref-type&gt;&lt;contributors&gt;&lt;authors&gt;&lt;author&gt;Scharnhorst, Paul&lt;/author&gt;&lt;author&gt;Schubnel, Baptiste&lt;/author&gt;&lt;author&gt;Fernández Bandera, Carlos&lt;/author&gt;&lt;author&gt;Salom, Jaume&lt;/author&gt;&lt;author&gt;Taddeo, Paolo&lt;/author&gt;&lt;author&gt;Boegli, Max&lt;/author&gt;&lt;author&gt;Gorecki, Tomasz&lt;/author&gt;&lt;author&gt;Stauffer, Yves&lt;/author&gt;&lt;author&gt;Peppas, Antonis&lt;/author&gt;&lt;author&gt;Politi, Chrysa&lt;/author&gt;&lt;/authors&gt;&lt;/contributors&gt;&lt;titles&gt;&lt;title&gt;Energym: A Building Model Library for Controller Benchmarking&lt;/title&gt;&lt;secondary-title&gt;Applied Sciences&lt;/secondary-title&gt;&lt;alt-title&gt;Appl. Sci.&lt;/alt-title&gt;&lt;/titles&gt;&lt;periodical&gt;&lt;full-title&gt;Applied Sciences&lt;/full-title&gt;&lt;abbr-1&gt;Appl. Sci.&lt;/abbr-1&gt;&lt;/periodical&gt;&lt;pages&gt;3518&lt;/pages&gt;&lt;volume&gt;11&lt;/volume&gt;&lt;number&gt;8&lt;/number&gt;&lt;dates&gt;&lt;year&gt;2021&lt;/year&gt;&lt;/dates&gt;&lt;publisher&gt;MDPI&lt;/publisher&gt;&lt;label&gt;scharnhorst2021&lt;/label&gt;&lt;urls&gt;&lt;/urls&gt;&lt;electronic-resource-num&gt;10.3390/app11083518&lt;/electronic-resource-num&gt;&lt;/record&gt;&lt;/Cite&gt;&lt;/EndNote&gt;</w:instrText>
       </w:r>
       <w:r>
         <w:fldChar w:fldCharType="separate"/>
@@ -2596,7 +2596,7 @@
         <w:fldChar w:fldCharType="begin"/>
       </w:r>
       <w:r>
-        <w:instrText xml:space="preserve"> ADDIN EN.CITE &lt;EndNote&gt;&lt;Cite&gt;&lt;Author&gt;Blum&lt;/Author&gt;&lt;Year&gt;2021&lt;/Year&gt;&lt;RecNum&gt;7&lt;/RecNum&gt;&lt;DisplayText&gt;[16]&lt;/DisplayText&gt;&lt;record&gt;&lt;rec-number&gt;7&lt;/rec-number&gt;&lt;foreign-keys&gt;&lt;key app="EN" db-id="mdae8500109496fea4aff9c086e16cc25895" timestamp="1793216821"&gt;7&lt;/key&gt;&lt;/foreign-keys&gt;&lt;ref-type name="Journal Article"&gt;17&lt;/ref-type&gt;&lt;contributors&gt;&lt;authors&gt;&lt;author&gt;Blum, David&lt;/author&gt;&lt;author&gt;Arroyo, Javier&lt;/author&gt;&lt;author&gt;Huang, Sen&lt;/author&gt;&lt;author&gt;Drgoňa, Ján&lt;/author&gt;&lt;author&gt;Jorissen, Filip&lt;/author&gt;&lt;author&gt;Walnum, Harald Taxt&lt;/author&gt;&lt;author&gt;Chen, Yan&lt;/author&gt;&lt;author&gt;Benne, Kyle&lt;/author&gt;&lt;author&gt;Vrabie, Draguna&lt;/author&gt;&lt;author&gt;Wetter, Michael&lt;/author&gt;&lt;author&gt;Helsen, Lieve&lt;/author&gt;&lt;/authors&gt;&lt;/contributors&gt;&lt;titles&gt;&lt;title&gt;Building optimization testing framework (BOPTEST) for simulation-based benchmarking of control strategies in buildings&lt;/title&gt;&lt;secondary-title&gt;Journal of Building Performance Simulation&lt;/secondary-title&gt;&lt;alt-title&gt;J. Build. Perform. Simul.&lt;/alt-title&gt;&lt;/titles&gt;&lt;periodical&gt;&lt;full-title&gt;Journal of Building Performance Simulation&lt;/full-title&gt;&lt;abbr-1&gt;J. Build. Perform. Simul.&lt;/abbr-1&gt;&lt;/periodical&gt;&lt;pages&gt;586-610&lt;/pages&gt;&lt;volume&gt;14&lt;/volume&gt;&lt;number&gt;5&lt;/number&gt;&lt;dates&gt;&lt;year&gt;2021&lt;/year&gt;&lt;/dates&gt;&lt;publisher&gt;Taylor &amp;amp; Francis&lt;/publisher&gt;&lt;label&gt;blum2021&lt;/label&gt;&lt;urls&gt;&lt;/urls&gt;&lt;electronic-resource-num&gt;10.1080/19401493.2021.1986574&lt;/electronic-resource-num&gt;&lt;/record&gt;&lt;/Cite&gt;&lt;/EndNote&gt;</w:instrText>
+        <w:instrText xml:space="preserve"> ADDIN EN.CITE &lt;EndNote&gt;&lt;Cite&gt;&lt;Author&gt;Blum&lt;/Author&gt;&lt;Year&gt;2021&lt;/Year&gt;&lt;RecNum&gt;7&lt;/RecNum&gt;&lt;DisplayText&gt;[16]&lt;/DisplayText&gt;&lt;record&gt;&lt;rec-number&gt;7&lt;/rec-number&gt;&lt;foreign-keys&gt;&lt;key app="EN" db-id="mdae8500109496fea4aff9c086e16cc25895" timestamp="1793221304"&gt;7&lt;/key&gt;&lt;/foreign-keys&gt;&lt;ref-type name="Journal Article"&gt;17&lt;/ref-type&gt;&lt;contributors&gt;&lt;authors&gt;&lt;author&gt;Blum, David&lt;/author&gt;&lt;author&gt;Arroyo, Javier&lt;/author&gt;&lt;author&gt;Huang, Sen&lt;/author&gt;&lt;author&gt;Drgoňa, Ján&lt;/author&gt;&lt;author&gt;Jorissen, Filip&lt;/author&gt;&lt;author&gt;Walnum, Harald Taxt&lt;/author&gt;&lt;author&gt;Chen, Yan&lt;/author&gt;&lt;author&gt;Benne, Kyle&lt;/author&gt;&lt;author&gt;Vrabie, Draguna&lt;/author&gt;&lt;author&gt;Wetter, Michael&lt;/author&gt;&lt;author&gt;Helsen, Lieve&lt;/author&gt;&lt;/authors&gt;&lt;/contributors&gt;&lt;titles&gt;&lt;title&gt;Building optimization testing framework (BOPTEST) for simulation-based benchmarking of control strategies in buildings&lt;/title&gt;&lt;secondary-title&gt;Journal of Building Performance Simulation&lt;/secondary-title&gt;&lt;alt-title&gt;J. Build. Perform. Simul.&lt;/alt-title&gt;&lt;/titles&gt;&lt;periodical&gt;&lt;full-title&gt;Journal of Building Performance Simulation&lt;/full-title&gt;&lt;abbr-1&gt;J. Build. Perform. Simul.&lt;/abbr-1&gt;&lt;/periodical&gt;&lt;pages&gt;586-610&lt;/pages&gt;&lt;volume&gt;14&lt;/volume&gt;&lt;number&gt;5&lt;/number&gt;&lt;dates&gt;&lt;year&gt;2021&lt;/year&gt;&lt;/dates&gt;&lt;publisher&gt;Taylor &amp;amp; Francis&lt;/publisher&gt;&lt;label&gt;blum2021&lt;/label&gt;&lt;urls&gt;&lt;/urls&gt;&lt;electronic-resource-num&gt;10.1080/19401493.2021.1986574&lt;/electronic-resource-num&gt;&lt;/record&gt;&lt;/Cite&gt;&lt;/EndNote&gt;</w:instrText>
       </w:r>
       <w:r>
         <w:fldChar w:fldCharType="separate"/>
@@ -2617,7 +2617,7 @@
         <w:fldChar w:fldCharType="begin"/>
       </w:r>
       <w:r>
-        <w:instrText xml:space="preserve"> ADDIN EN.CITE &lt;EndNote&gt;&lt;Cite&gt;&lt;Author&gt;Nweye&lt;/Author&gt;&lt;Year&gt;2025&lt;/Year&gt;&lt;RecNum&gt;60&lt;/RecNum&gt;&lt;DisplayText&gt;[44]&lt;/DisplayText&gt;&lt;record&gt;&lt;rec-number&gt;60&lt;/rec-number&gt;&lt;foreign-keys&gt;&lt;key app="EN" db-id="mdae8500109496fea4aff9c086e16cc25895" timestamp="1793216821"&gt;60&lt;/key&gt;&lt;/foreign-keys&gt;&lt;ref-type name="Journal Article"&gt;17&lt;/ref-type&gt;&lt;contributors&gt;&lt;authors&gt;&lt;author&gt;Nweye, Kingsley&lt;/author&gt;&lt;author&gt;Kaspar, Kathryn&lt;/author&gt;&lt;author&gt;Buscemi, Giacomo&lt;/author&gt;&lt;author&gt;Fonseca, Tiago&lt;/author&gt;&lt;author&gt;Pinto, Giuseppe&lt;/author&gt;&lt;author&gt;Ghose, Dipanjan&lt;/author&gt;&lt;author&gt;Duddukuru, Satvik&lt;/author&gt;&lt;author&gt;Pratapa, Pavani&lt;/author&gt;&lt;author&gt;Li, Han&lt;/author&gt;&lt;author&gt;Mohammadi, Javad&lt;/author&gt;&lt;author&gt;Lino Ferreira, Luis&lt;/author&gt;&lt;author&gt;Hong, Tianzhen&lt;/author&gt;&lt;author&gt;Ouf, Mohamed&lt;/author&gt;&lt;author&gt;Capozzoli, Alfonso&lt;/author&gt;&lt;author&gt;Nagy, Zoltan&lt;/author&gt;&lt;/authors&gt;&lt;/contributors&gt;&lt;titles&gt;&lt;title&gt;CityLearn v2: energy-flexible, resilient, occupant-centric, and carbon-aware management of grid-interactive communities&lt;/title&gt;&lt;secondary-title&gt;Journal of Building Performance Simulation&lt;/secondary-title&gt;&lt;alt-title&gt;J. Build. Perform. Simul.&lt;/alt-title&gt;&lt;/titles&gt;&lt;periodical&gt;&lt;full-title&gt;Journal of Building Performance Simulation&lt;/full-title&gt;&lt;abbr-1&gt;J. Build. Perform. Simul.&lt;/abbr-1&gt;&lt;/periodical&gt;&lt;pages&gt;17-38&lt;/pages&gt;&lt;volume&gt;18&lt;/volume&gt;&lt;number&gt;1&lt;/number&gt;&lt;dates&gt;&lt;year&gt;2025&lt;/year&gt;&lt;/dates&gt;&lt;publisher&gt;Taylor &amp;amp; Francis&lt;/publisher&gt;&lt;label&gt;nweye2025&lt;/label&gt;&lt;urls&gt;&lt;/urls&gt;&lt;electronic-resource-num&gt;10.1080/19401493.2024.2418813&lt;/electronic-resource-num&gt;&lt;/record&gt;&lt;/Cite&gt;&lt;/EndNote&gt;</w:instrText>
+        <w:instrText xml:space="preserve"> ADDIN EN.CITE &lt;EndNote&gt;&lt;Cite&gt;&lt;Author&gt;Nweye&lt;/Author&gt;&lt;Year&gt;2025&lt;/Year&gt;&lt;RecNum&gt;60&lt;/RecNum&gt;&lt;DisplayText&gt;[44]&lt;/DisplayText&gt;&lt;record&gt;&lt;rec-number&gt;60&lt;/rec-number&gt;&lt;foreign-keys&gt;&lt;key app="EN" db-id="mdae8500109496fea4aff9c086e16cc25895" timestamp="1793221304"&gt;60&lt;/key&gt;&lt;/foreign-keys&gt;&lt;ref-type name="Journal Article"&gt;17&lt;/ref-type&gt;&lt;contributors&gt;&lt;authors&gt;&lt;author&gt;Nweye, Kingsley&lt;/author&gt;&lt;author&gt;Kaspar, Kathryn&lt;/author&gt;&lt;author&gt;Buscemi, Giacomo&lt;/author&gt;&lt;author&gt;Fonseca, Tiago&lt;/author&gt;&lt;author&gt;Pinto, Giuseppe&lt;/author&gt;&lt;author&gt;Ghose, Dipanjan&lt;/author&gt;&lt;author&gt;Duddukuru, Satvik&lt;/author&gt;&lt;author&gt;Pratapa, Pavani&lt;/author&gt;&lt;author&gt;Li, Han&lt;/author&gt;&lt;author&gt;Mohammadi, Javad&lt;/author&gt;&lt;author&gt;Lino Ferreira, Luis&lt;/author&gt;&lt;author&gt;Hong, Tianzhen&lt;/author&gt;&lt;author&gt;Ouf, Mohamed&lt;/author&gt;&lt;author&gt;Capozzoli, Alfonso&lt;/author&gt;&lt;author&gt;Nagy, Zoltan&lt;/author&gt;&lt;/authors&gt;&lt;/contributors&gt;&lt;titles&gt;&lt;title&gt;CityLearn v2: energy-flexible, resilient, occupant-centric, and carbon-aware management of grid-interactive communities&lt;/title&gt;&lt;secondary-title&gt;Journal of Building Performance Simulation&lt;/secondary-title&gt;&lt;alt-title&gt;J. Build. Perform. Simul.&lt;/alt-title&gt;&lt;/titles&gt;&lt;periodical&gt;&lt;full-title&gt;Journal of Building Performance Simulation&lt;/full-title&gt;&lt;abbr-1&gt;J. Build. Perform. Simul.&lt;/abbr-1&gt;&lt;/periodical&gt;&lt;pages&gt;17-38&lt;/pages&gt;&lt;volume&gt;18&lt;/volume&gt;&lt;number&gt;1&lt;/number&gt;&lt;dates&gt;&lt;year&gt;2025&lt;/year&gt;&lt;/dates&gt;&lt;publisher&gt;Taylor &amp;amp; Francis&lt;/publisher&gt;&lt;label&gt;nweye2025&lt;/label&gt;&lt;urls&gt;&lt;/urls&gt;&lt;electronic-resource-num&gt;10.1080/19401493.2024.2418813&lt;/electronic-resource-num&gt;&lt;/record&gt;&lt;/Cite&gt;&lt;/EndNote&gt;</w:instrText>
       </w:r>
       <w:r>
         <w:fldChar w:fldCharType="separate"/>
@@ -2638,7 +2638,7 @@
         <w:fldChar w:fldCharType="begin"/>
       </w:r>
       <w:r>
-        <w:instrText xml:space="preserve"> ADDIN EN.CITE &lt;EndNote&gt;&lt;Cite&gt;&lt;Author&gt;Benne&lt;/Author&gt;&lt;Year&gt;2024&lt;/Year&gt;&lt;RecNum&gt;4&lt;/RecNum&gt;&lt;DisplayText&gt;[45]&lt;/DisplayText&gt;&lt;record&gt;&lt;rec-number&gt;4&lt;/rec-number&gt;&lt;foreign-keys&gt;&lt;key app="EN" db-id="mdae8500109496fea4aff9c086e16cc25895" timestamp="1793216821"&gt;4&lt;/key&gt;&lt;/foreign-keys&gt;&lt;ref-type name="Report"&gt;27&lt;/ref-type&gt;&lt;contributors&gt;&lt;authors&gt;&lt;author&gt;Benne, Kyle&lt;/author&gt;&lt;author&gt;Shapinsky, Tobias&lt;/author&gt;&lt;author&gt;Petersen, Anya&lt;/author&gt;&lt;/authors&gt;&lt;/contributors&gt;&lt;titles&gt;&lt;title&gt;Alfalfa Virtual Building Service: Software Engineering Best Practices Applied to Runtime Interaction with Building Energy Models&lt;/title&gt;&lt;secondary-title&gt;IBPSA-USA SimBuild 2024 Conference, Denver, Colorado, 21–23 May 2024&lt;/secondary-title&gt;&lt;/titles&gt;&lt;dates&gt;&lt;year&gt;2024&lt;/year&gt;&lt;/dates&gt;&lt;pub-location&gt;Golden, CO&lt;/pub-location&gt;&lt;publisher&gt;National Renewable Energy Laboratory&lt;/publisher&gt;&lt;isbn&gt;NREL/PR-5500-89738&lt;/isbn&gt;&lt;label&gt;benne2024&lt;/label&gt;&lt;work-type&gt;Presentation&lt;/work-type&gt;&lt;urls&gt;&lt;related-urls&gt;&lt;url&gt;https://www.osti.gov/biblio/2407013&lt;/url&gt;&lt;/related-urls&gt;&lt;/urls&gt;&lt;/record&gt;&lt;/Cite&gt;&lt;/EndNote&gt;</w:instrText>
+        <w:instrText xml:space="preserve"> ADDIN EN.CITE &lt;EndNote&gt;&lt;Cite&gt;&lt;Author&gt;Benne&lt;/Author&gt;&lt;Year&gt;2024&lt;/Year&gt;&lt;RecNum&gt;4&lt;/RecNum&gt;&lt;DisplayText&gt;[45]&lt;/DisplayText&gt;&lt;record&gt;&lt;rec-number&gt;4&lt;/rec-number&gt;&lt;foreign-keys&gt;&lt;key app="EN" db-id="mdae8500109496fea4aff9c086e16cc25895" timestamp="1793221304"&gt;4&lt;/key&gt;&lt;/foreign-keys&gt;&lt;ref-type name="Report"&gt;27&lt;/ref-type&gt;&lt;contributors&gt;&lt;authors&gt;&lt;author&gt;Benne, Kyle&lt;/author&gt;&lt;author&gt;Shapinsky, Tobias&lt;/author&gt;&lt;author&gt;Petersen, Anya&lt;/author&gt;&lt;/authors&gt;&lt;/contributors&gt;&lt;titles&gt;&lt;title&gt;Alfalfa Virtual Building Service: Software Engineering Best Practices Applied to Runtime Interaction with Building Energy Models&lt;/title&gt;&lt;secondary-title&gt;IBPSA-USA SimBuild 2024 Conference, Denver, Colorado, 21–23 May 2024&lt;/secondary-title&gt;&lt;/titles&gt;&lt;dates&gt;&lt;year&gt;2024&lt;/year&gt;&lt;/dates&gt;&lt;pub-location&gt;Golden, CO&lt;/pub-location&gt;&lt;publisher&gt;National Renewable Energy Laboratory&lt;/publisher&gt;&lt;isbn&gt;NREL/PR-5500-89738&lt;/isbn&gt;&lt;label&gt;benne2024&lt;/label&gt;&lt;work-type&gt;Presentation&lt;/work-type&gt;&lt;urls&gt;&lt;related-urls&gt;&lt;url&gt;https://www.osti.gov/biblio/2407013&lt;/url&gt;&lt;/related-urls&gt;&lt;/urls&gt;&lt;/record&gt;&lt;/Cite&gt;&lt;/EndNote&gt;</w:instrText>
       </w:r>
       <w:r>
         <w:fldChar w:fldCharType="separate"/>
@@ -2675,7 +2675,7 @@
         <w:fldChar w:fldCharType="begin"/>
       </w:r>
       <w:r>
-        <w:instrText xml:space="preserve"> ADDIN EN.CITE &lt;EndNote&gt;&lt;Cite&gt;&lt;Author&gt;Ahn&lt;/Author&gt;&lt;Year&gt;2023&lt;/Year&gt;&lt;RecNum&gt;1&lt;/RecNum&gt;&lt;DisplayText&gt;[4]&lt;/DisplayText&gt;&lt;record&gt;&lt;rec-number&gt;1&lt;/rec-number&gt;&lt;foreign-keys&gt;&lt;key app="EN" db-id="mdae8500109496fea4aff9c086e16cc25895" timestamp="1793216821"&gt;1&lt;/key&gt;&lt;/foreign-keys&gt;&lt;ref-type name="Journal Article"&gt;17&lt;/ref-type&gt;&lt;contributors&gt;&lt;authors&gt;&lt;author&gt;Ahn, Ki Uhn&lt;/author&gt;&lt;author&gt;Kim, Deuk-Woo&lt;/author&gt;&lt;author&gt;Cho, Hyun Mi&lt;/author&gt;&lt;author&gt;Chae, Chang-U&lt;/author&gt;&lt;/authors&gt;&lt;/contributors&gt;&lt;titles&gt;&lt;title&gt;Alternative Approaches to HVAC Control of Chat Generative Pre-Trained Transformer (ChatGPT) for Autonomous Building System Operations&lt;/title&gt;&lt;secondary-title&gt;Buildings&lt;/secondary-title&gt;&lt;alt-title&gt;Buildings&lt;/alt-title&gt;&lt;/titles&gt;&lt;periodical&gt;&lt;full-title&gt;Buildings&lt;/full-title&gt;&lt;abbr-1&gt;Buildings&lt;/abbr-1&gt;&lt;/periodical&gt;&lt;pages&gt;2680&lt;/pages&gt;&lt;volume&gt;13&lt;/volume&gt;&lt;number&gt;11&lt;/number&gt;&lt;dates&gt;&lt;year&gt;2023&lt;/year&gt;&lt;/dates&gt;&lt;publisher&gt;MDPI&lt;/publisher&gt;&lt;label&gt;ahn2023&lt;/label&gt;&lt;urls&gt;&lt;/urls&gt;&lt;electronic-resource-num&gt;10.3390/buildings13112680&lt;/electronic-resource-num&gt;&lt;/record&gt;&lt;/Cite&gt;&lt;/EndNote&gt;</w:instrText>
+        <w:instrText xml:space="preserve"> ADDIN EN.CITE &lt;EndNote&gt;&lt;Cite&gt;&lt;Author&gt;Ahn&lt;/Author&gt;&lt;Year&gt;2023&lt;/Year&gt;&lt;RecNum&gt;1&lt;/RecNum&gt;&lt;DisplayText&gt;[4]&lt;/DisplayText&gt;&lt;record&gt;&lt;rec-number&gt;1&lt;/rec-number&gt;&lt;foreign-keys&gt;&lt;key app="EN" db-id="mdae8500109496fea4aff9c086e16cc25895" timestamp="1793221304"&gt;1&lt;/key&gt;&lt;/foreign-keys&gt;&lt;ref-type name="Journal Article"&gt;17&lt;/ref-type&gt;&lt;contributors&gt;&lt;authors&gt;&lt;author&gt;Ahn, Ki Uhn&lt;/author&gt;&lt;author&gt;Kim, Deuk-Woo&lt;/author&gt;&lt;author&gt;Cho, Hyun Mi&lt;/author&gt;&lt;author&gt;Chae, Chang-U&lt;/author&gt;&lt;/authors&gt;&lt;/contributors&gt;&lt;titles&gt;&lt;title&gt;Alternative Approaches to HVAC Control of Chat Generative Pre-Trained Transformer (ChatGPT) for Autonomous Building System Operations&lt;/title&gt;&lt;secondary-title&gt;Buildings&lt;/secondary-title&gt;&lt;alt-title&gt;Buildings&lt;/alt-title&gt;&lt;/titles&gt;&lt;periodical&gt;&lt;full-title&gt;Buildings&lt;/full-title&gt;&lt;abbr-1&gt;Buildings&lt;/abbr-1&gt;&lt;/periodical&gt;&lt;pages&gt;2680&lt;/pages&gt;&lt;volume&gt;13&lt;/volume&gt;&lt;number&gt;11&lt;/number&gt;&lt;dates&gt;&lt;year&gt;2023&lt;/year&gt;&lt;/dates&gt;&lt;publisher&gt;MDPI&lt;/publisher&gt;&lt;label&gt;ahn2023&lt;/label&gt;&lt;urls&gt;&lt;/urls&gt;&lt;electronic-resource-num&gt;10.3390/buildings13112680&lt;/electronic-resource-num&gt;&lt;/record&gt;&lt;/Cite&gt;&lt;/EndNote&gt;</w:instrText>
       </w:r>
       <w:r>
         <w:fldChar w:fldCharType="separate"/>
@@ -2696,7 +2696,7 @@
         <w:fldChar w:fldCharType="begin"/>
       </w:r>
       <w:r>
-        <w:instrText xml:space="preserve"> ADDIN EN.CITE &lt;EndNote&gt;&lt;Cite&gt;&lt;Author&gt;Zhang&lt;/Author&gt;&lt;Year&gt;2024&lt;/Year&gt;&lt;RecNum&gt;94&lt;/RecNum&gt;&lt;DisplayText&gt;[5]&lt;/DisplayText&gt;&lt;record&gt;&lt;rec-number&gt;94&lt;/rec-number&gt;&lt;foreign-keys&gt;&lt;key app="EN" db-id="mdae8500109496fea4aff9c086e16cc25895" timestamp="1793216821"&gt;94&lt;/key&gt;&lt;/foreign-keys&gt;&lt;ref-type name="Journal Article"&gt;17&lt;/ref-type&gt;&lt;contributors&gt;&lt;authors&gt;&lt;author&gt;Zhang, Liang&lt;/author&gt;&lt;author&gt;Chen, Zhelun&lt;/author&gt;&lt;/authors&gt;&lt;/contributors&gt;&lt;titles&gt;&lt;title&gt;Large language model-based interpretable machine learning control in building energy systems&lt;/title&gt;&lt;secondary-title&gt;Energy and Buildings&lt;/secondary-title&gt;&lt;alt-title&gt;Energy Build.&lt;/alt-title&gt;&lt;/titles&gt;&lt;periodical&gt;&lt;full-title&gt;Energy and Buildings&lt;/full-title&gt;&lt;abbr-1&gt;Energy Build.&lt;/abbr-1&gt;&lt;/periodical&gt;&lt;pages&gt;114278&lt;/pages&gt;&lt;volume&gt;313&lt;/volume&gt;&lt;dates&gt;&lt;year&gt;2024&lt;/year&gt;&lt;/dates&gt;&lt;publisher&gt;Elsevier&lt;/publisher&gt;&lt;label&gt;zhangchen2024&lt;/label&gt;&lt;urls&gt;&lt;/urls&gt;&lt;electronic-resource-num&gt;10.1016/j.enbuild.2024.114278&lt;/electronic-resource-num&gt;&lt;/record&gt;&lt;/Cite&gt;&lt;/EndNote&gt;</w:instrText>
+        <w:instrText xml:space="preserve"> ADDIN EN.CITE &lt;EndNote&gt;&lt;Cite&gt;&lt;Author&gt;Zhang&lt;/Author&gt;&lt;Year&gt;2024&lt;/Year&gt;&lt;RecNum&gt;94&lt;/RecNum&gt;&lt;DisplayText&gt;[5]&lt;/DisplayText&gt;&lt;record&gt;&lt;rec-number&gt;94&lt;/rec-number&gt;&lt;foreign-keys&gt;&lt;key app="EN" db-id="mdae8500109496fea4aff9c086e16cc25895" timestamp="1793221304"&gt;94&lt;/key&gt;&lt;/foreign-keys&gt;&lt;ref-type name="Journal Article"&gt;17&lt;/ref-type&gt;&lt;contributors&gt;&lt;authors&gt;&lt;author&gt;Zhang, Liang&lt;/author&gt;&lt;author&gt;Chen, Zhelun&lt;/author&gt;&lt;/authors&gt;&lt;/contributors&gt;&lt;titles&gt;&lt;title&gt;Large language model-based interpretable machine learning control in building energy systems&lt;/title&gt;&lt;secondary-title&gt;Energy and Buildings&lt;/secondary-title&gt;&lt;alt-title&gt;Energy Build.&lt;/alt-title&gt;&lt;/titles&gt;&lt;periodical&gt;&lt;full-title&gt;Energy and Buildings&lt;/full-title&gt;&lt;abbr-1&gt;Energy Build.&lt;/abbr-1&gt;&lt;/periodical&gt;&lt;pages&gt;114278&lt;/pages&gt;&lt;volume&gt;313&lt;/volume&gt;&lt;dates&gt;&lt;year&gt;2024&lt;/year&gt;&lt;/dates&gt;&lt;publisher&gt;Elsevier&lt;/publisher&gt;&lt;label&gt;zhangchen2024&lt;/label&gt;&lt;urls&gt;&lt;/urls&gt;&lt;electronic-resource-num&gt;10.1016/j.enbuild.2024.114278&lt;/electronic-resource-num&gt;&lt;/record&gt;&lt;/Cite&gt;&lt;/EndNote&gt;</w:instrText>
       </w:r>
       <w:r>
         <w:fldChar w:fldCharType="separate"/>
@@ -2717,7 +2717,7 @@
         <w:fldChar w:fldCharType="begin"/>
       </w:r>
       <w:r>
-        <w:instrText xml:space="preserve"> ADDIN EN.CITE &lt;EndNote&gt;&lt;Cite&gt;&lt;Author&gt;Sawada&lt;/Author&gt;&lt;Year&gt;2025&lt;/Year&gt;&lt;RecNum&gt;74&lt;/RecNum&gt;&lt;DisplayText&gt;[46]&lt;/DisplayText&gt;&lt;record&gt;&lt;rec-number&gt;74&lt;/rec-number&gt;&lt;foreign-keys&gt;&lt;key app="EN" db-id="mdae8500109496fea4aff9c086e16cc25895" timestamp="1793216821"&gt;74&lt;/key&gt;&lt;/foreign-keys&gt;&lt;ref-type name="Journal Article"&gt;17&lt;/ref-type&gt;&lt;contributors&gt;&lt;authors&gt;&lt;author&gt;Sawada, Tomoya&lt;/author&gt;&lt;author&gt;Mizuno, Masahiro&lt;/author&gt;&lt;author&gt;Hasegawa, Takaomi&lt;/author&gt;&lt;author&gt;Yokoyama, Keiichi&lt;/author&gt;&lt;author&gt;Kono, Mayuka&lt;/author&gt;&lt;/authors&gt;&lt;/contributors&gt;&lt;titles&gt;&lt;title&gt;Office-in-the-Loop: an investigation into Agentic AI for advanced building HVAC control systems&lt;/title&gt;&lt;secondary-title&gt;Data-Centric Engineering&lt;/secondary-title&gt;&lt;alt-title&gt;Data-Centric Eng.&lt;/alt-title&gt;&lt;/titles&gt;&lt;periodical&gt;&lt;full-title&gt;Data-Centric Engineering&lt;/full-title&gt;&lt;abbr-1&gt;Data-Centric Eng.&lt;/abbr-1&gt;&lt;/periodical&gt;&lt;pages&gt;e31&lt;/pages&gt;&lt;volume&gt;6&lt;/volume&gt;&lt;dates&gt;&lt;year&gt;2025&lt;/year&gt;&lt;/dates&gt;&lt;publisher&gt;Cambridge University Press&lt;/publisher&gt;&lt;label&gt;sawada2025&lt;/label&gt;&lt;urls&gt;&lt;/urls&gt;&lt;electronic-resource-num&gt;10.1017/dce.2025.10010&lt;/electronic-resource-num&gt;&lt;/record&gt;&lt;/Cite&gt;&lt;/EndNote&gt;</w:instrText>
+        <w:instrText xml:space="preserve"> ADDIN EN.CITE &lt;EndNote&gt;&lt;Cite&gt;&lt;Author&gt;Sawada&lt;/Author&gt;&lt;Year&gt;2025&lt;/Year&gt;&lt;RecNum&gt;74&lt;/RecNum&gt;&lt;DisplayText&gt;[46]&lt;/DisplayText&gt;&lt;record&gt;&lt;rec-number&gt;74&lt;/rec-number&gt;&lt;foreign-keys&gt;&lt;key app="EN" db-id="mdae8500109496fea4aff9c086e16cc25895" timestamp="1793221304"&gt;74&lt;/key&gt;&lt;/foreign-keys&gt;&lt;ref-type name="Journal Article"&gt;17&lt;/ref-type&gt;&lt;contributors&gt;&lt;authors&gt;&lt;author&gt;Sawada, Tomoya&lt;/author&gt;&lt;author&gt;Mizuno, Masahiro&lt;/author&gt;&lt;author&gt;Hasegawa, Takaomi&lt;/author&gt;&lt;author&gt;Yokoyama, Keiichi&lt;/author&gt;&lt;author&gt;Kono, Mayuka&lt;/author&gt;&lt;/authors&gt;&lt;/contributors&gt;&lt;titles&gt;&lt;title&gt;Office-in-the-Loop: an investigation into Agentic AI for advanced building HVAC control systems&lt;/title&gt;&lt;secondary-title&gt;Data-Centric Engineering&lt;/secondary-title&gt;&lt;alt-title&gt;Data-Centric Eng.&lt;/alt-title&gt;&lt;/titles&gt;&lt;periodical&gt;&lt;full-title&gt;Data-Centric Engineering&lt;/full-title&gt;&lt;abbr-1&gt;Data-Centric Eng.&lt;/abbr-1&gt;&lt;/periodical&gt;&lt;pages&gt;e31&lt;/pages&gt;&lt;volume&gt;6&lt;/volume&gt;&lt;dates&gt;&lt;year&gt;2025&lt;/year&gt;&lt;/dates&gt;&lt;publisher&gt;Cambridge University Press&lt;/publisher&gt;&lt;label&gt;sawada2025&lt;/label&gt;&lt;urls&gt;&lt;/urls&gt;&lt;electronic-resource-num&gt;10.1017/dce.2025.10010&lt;/electronic-resource-num&gt;&lt;/record&gt;&lt;/Cite&gt;&lt;/EndNote&gt;</w:instrText>
       </w:r>
       <w:r>
         <w:fldChar w:fldCharType="separate"/>
@@ -2738,7 +2738,7 @@
         <w:fldChar w:fldCharType="begin"/>
       </w:r>
       <w:r>
-        <w:instrText xml:space="preserve"> ADDIN EN.CITE &lt;EndNote&gt;&lt;Cite&gt;&lt;Author&gt;Jiang&lt;/Author&gt;&lt;Year&gt;2024&lt;/Year&gt;&lt;RecNum&gt;40&lt;/RecNum&gt;&lt;DisplayText&gt;[47]&lt;/DisplayText&gt;&lt;record&gt;&lt;rec-number&gt;40&lt;/rec-number&gt;&lt;foreign-keys&gt;&lt;key app="EN" db-id="mdae8500109496fea4aff9c086e16cc25895" timestamp="1793216821"&gt;40&lt;/key&gt;&lt;/foreign-keys&gt;&lt;ref-type name="Journal Article"&gt;17&lt;/ref-type&gt;&lt;contributors&gt;&lt;authors&gt;&lt;author&gt;Jiang, Gang&lt;/author&gt;&lt;author&gt;Ma, Zhihao&lt;/author&gt;&lt;author&gt;Zhang, Liang&lt;/author&gt;&lt;author&gt;Chen, Jianli&lt;/author&gt;&lt;/authors&gt;&lt;/contributors&gt;&lt;titles&gt;&lt;title&gt;EPlus-LLM: A large language model-based computing platform for automated building energy modeling&lt;/title&gt;&lt;secondary-title&gt;Applied Energy&lt;/secondary-title&gt;&lt;alt-title&gt;Appl. Energy&lt;/alt-title&gt;&lt;/titles&gt;&lt;periodical&gt;&lt;full-title&gt;Applied Energy&lt;/full-title&gt;&lt;abbr-1&gt;Appl. Energy&lt;/abbr-1&gt;&lt;/periodical&gt;&lt;pages&gt;123431&lt;/pages&gt;&lt;volume&gt;367&lt;/volume&gt;&lt;dates&gt;&lt;year&gt;2024&lt;/year&gt;&lt;/dates&gt;&lt;publisher&gt;Elsevier&lt;/publisher&gt;&lt;label&gt;jiang2024&lt;/label&gt;&lt;urls&gt;&lt;/urls&gt;&lt;electronic-resource-num&gt;10.1016/j.apenergy.2024.123431&lt;/electronic-resource-num&gt;&lt;/record&gt;&lt;/Cite&gt;&lt;/EndNote&gt;</w:instrText>
+        <w:instrText xml:space="preserve"> ADDIN EN.CITE &lt;EndNote&gt;&lt;Cite&gt;&lt;Author&gt;Jiang&lt;/Author&gt;&lt;Year&gt;2024&lt;/Year&gt;&lt;RecNum&gt;40&lt;/RecNum&gt;&lt;DisplayText&gt;[47]&lt;/DisplayText&gt;&lt;record&gt;&lt;rec-number&gt;40&lt;/rec-number&gt;&lt;foreign-keys&gt;&lt;key app="EN" db-id="mdae8500109496fea4aff9c086e16cc25895" timestamp="1793221304"&gt;40&lt;/key&gt;&lt;/foreign-keys&gt;&lt;ref-type name="Journal Article"&gt;17&lt;/ref-type&gt;&lt;contributors&gt;&lt;authors&gt;&lt;author&gt;Jiang, Gang&lt;/author&gt;&lt;author&gt;Ma, Zhihao&lt;/author&gt;&lt;author&gt;Zhang, Liang&lt;/author&gt;&lt;author&gt;Chen, Jianli&lt;/author&gt;&lt;/authors&gt;&lt;/contributors&gt;&lt;titles&gt;&lt;title&gt;EPlus-LLM: A large language model-based computing platform for automated building energy modeling&lt;/title&gt;&lt;secondary-title&gt;Applied Energy&lt;/secondary-title&gt;&lt;alt-title&gt;Appl. Energy&lt;/alt-title&gt;&lt;/titles&gt;&lt;periodical&gt;&lt;full-title&gt;Applied Energy&lt;/full-title&gt;&lt;abbr-1&gt;Appl. Energy&lt;/abbr-1&gt;&lt;/periodical&gt;&lt;pages&gt;123431&lt;/pages&gt;&lt;volume&gt;367&lt;/volume&gt;&lt;dates&gt;&lt;year&gt;2024&lt;/year&gt;&lt;/dates&gt;&lt;publisher&gt;Elsevier&lt;/publisher&gt;&lt;label&gt;jiang2024&lt;/label&gt;&lt;urls&gt;&lt;/urls&gt;&lt;electronic-resource-num&gt;10.1016/j.apenergy.2024.123431&lt;/electronic-resource-num&gt;&lt;/record&gt;&lt;/Cite&gt;&lt;/EndNote&gt;</w:instrText>
       </w:r>
       <w:r>
         <w:fldChar w:fldCharType="separate"/>
@@ -2761,7 +2761,7 @@
 dW0+NTE8L1JlY051bT48RGlzcGxheVRleHQ+WzYsMjZdPC9EaXNwbGF5VGV4dD48cmVjb3JkPjxy
 ZWMtbnVtYmVyPjUxPC9yZWMtbnVtYmVyPjxmb3JlaWduLWtleXM+PGtleSBhcHA9IkVOIiBkYi1p
 ZD0ibWRhZTg1MDAxMDk0OTZmZWE0YWZmOWMwODZlMTZjYzI1ODk1IiB0aW1lc3RhbXA9IjE3OTMy
-MTY4MjEiPjUxPC9rZXk+PC9mb3JlaWduLWtleXM+PHJlZi10eXBlIG5hbWU9IkpvdXJuYWwgQXJ0
+MjEzMDQiPjUxPC9rZXk+PC9mb3JlaWduLWtleXM+PHJlZi10eXBlIG5hbWU9IkpvdXJuYWwgQXJ0
 aWNsZSI+MTc8L3JlZi10eXBlPjxjb250cmlidXRvcnM+PGF1dGhvcnM+PGF1dGhvcj5MaXUsIE1p
 bmd6aGU8L2F1dGhvcj48YXV0aG9yPlpoYW5nLCBMaWFuZzwvYXV0aG9yPjxhdXRob3I+Q2hlbiwg
 SmlhbmxpPC9hdXRob3I+PGF1dGhvcj5DaGVuLCBXZWktQW48L2F1dGhvcj48YXV0aG9yPllhbmcs
@@ -2780,7 +2780,7 @@
 Q2l0ZT48QXV0aG9yPk5ldWJhdWVyPC9BdXRob3I+PFllYXI+MjAyNjwvWWVhcj48UmVjTnVtPjU3
 PC9SZWNOdW0+PHJlY29yZD48cmVjLW51bWJlcj41NzwvcmVjLW51bWJlcj48Zm9yZWlnbi1rZXlz
 PjxrZXkgYXBwPSJFTiIgZGItaWQ9Im1kYWU4NTAwMTA5NDk2ZmVhNGFmZjljMDg2ZTE2Y2MyNTg5
-NSIgdGltZXN0YW1wPSIxNzkzMjE2ODIxIj41Nzwva2V5PjwvZm9yZWlnbi1rZXlzPjxyZWYtdHlw
+NSIgdGltZXN0YW1wPSIxNzkzMjIxMzA0Ij41Nzwva2V5PjwvZm9yZWlnbi1rZXlzPjxyZWYtdHlw
 ZSBuYW1lPSJHZW5lcmljIj4xMzwvcmVmLXR5cGU+PGNvbnRyaWJ1dG9ycz48YXV0aG9ycz48YXV0
 aG9yPk5ldWJhdWVyLCBBbGV4YW5kZXI8L2F1dGhvcj48YXV0aG9yPkhvbmcsIFRpYW56aGVuPC9h
 dXRob3I+PGF1dGhvcj5MaSwgSGFuPC9hdXRob3I+PGF1dGhvcj5ZdSwgTWVuZ2JvPC9hdXRob3I+
@@ -2806,7 +2806,7 @@
 dW0+NTE8L1JlY051bT48RGlzcGxheVRleHQ+WzYsMjZdPC9EaXNwbGF5VGV4dD48cmVjb3JkPjxy
 ZWMtbnVtYmVyPjUxPC9yZWMtbnVtYmVyPjxmb3JlaWduLWtleXM+PGtleSBhcHA9IkVOIiBkYi1p
 ZD0ibWRhZTg1MDAxMDk0OTZmZWE0YWZmOWMwODZlMTZjYzI1ODk1IiB0aW1lc3RhbXA9IjE3OTMy
-MTY4MjEiPjUxPC9rZXk+PC9mb3JlaWduLWtleXM+PHJlZi10eXBlIG5hbWU9IkpvdXJuYWwgQXJ0
+MjEzMDQiPjUxPC9rZXk+PC9mb3JlaWduLWtleXM+PHJlZi10eXBlIG5hbWU9IkpvdXJuYWwgQXJ0
 aWNsZSI+MTc8L3JlZi10eXBlPjxjb250cmlidXRvcnM+PGF1dGhvcnM+PGF1dGhvcj5MaXUsIE1p
 bmd6aGU8L2F1dGhvcj48YXV0aG9yPlpoYW5nLCBMaWFuZzwvYXV0aG9yPjxhdXRob3I+Q2hlbiwg
 SmlhbmxpPC9hdXRob3I+PGF1dGhvcj5DaGVuLCBXZWktQW48L2F1dGhvcj48YXV0aG9yPllhbmcs
@@ -2825,7 +2825,7 @@
 Q2l0ZT48QXV0aG9yPk5ldWJhdWVyPC9BdXRob3I+PFllYXI+MjAyNjwvWWVhcj48UmVjTnVtPjU3
 PC9SZWNOdW0+PHJlY29yZD48cmVjLW51bWJlcj41NzwvcmVjLW51bWJlcj48Zm9yZWlnbi1rZXlz
 PjxrZXkgYXBwPSJFTiIgZGItaWQ9Im1kYWU4NTAwMTA5NDk2ZmVhNGFmZjljMDg2ZTE2Y2MyNTg5
-NSIgdGltZXN0YW1wPSIxNzkzMjE2ODIxIj41Nzwva2V5PjwvZm9yZWlnbi1rZXlzPjxyZWYtdHlw
+NSIgdGltZXN0YW1wPSIxNzkzMjIxMzA0Ij41Nzwva2V5PjwvZm9yZWlnbi1rZXlzPjxyZWYtdHlw
 ZSBuYW1lPSJHZW5lcmljIj4xMzwvcmVmLXR5cGU+PGNvbnRyaWJ1dG9ycz48YXV0aG9ycz48YXV0
 aG9yPk5ldWJhdWVyLCBBbGV4YW5kZXI8L2F1dGhvcj48YXV0aG9yPkhvbmcsIFRpYW56aGVuPC9h
 dXRob3I+PGF1dGhvcj5MaSwgSGFuPC9hdXRob3I+PGF1dGhvcj5ZdSwgTWVuZ2JvPC9hdXRob3I+
@@ -2883,7 +2883,7 @@
         <w:fldChar w:fldCharType="begin"/>
       </w:r>
       <w:r>
-        <w:instrText xml:space="preserve"> ADDIN EN.CITE &lt;EndNote&gt;&lt;Cite&gt;&lt;Author&gt;Eaton&lt;/Author&gt;&lt;Year&gt;2023&lt;/Year&gt;&lt;RecNum&gt;10&lt;/RecNum&gt;&lt;DisplayText&gt;[48]&lt;/DisplayText&gt;&lt;record&gt;&lt;rec-number&gt;10&lt;/rec-number&gt;&lt;foreign-keys&gt;&lt;key app="EN" db-id="mdae8500109496fea4aff9c086e16cc25895" timestamp="1793216821"&gt;10&lt;/key&gt;&lt;/foreign-keys&gt;&lt;ref-type name="Web Page"&gt;12&lt;/ref-type&gt;&lt;contributors&gt;&lt;authors&gt;&lt;author&gt;Eaton, Brian&lt;/author&gt;&lt;author&gt;Gregory, Jonathan&lt;/author&gt;&lt;author&gt;Drach, Bob&lt;/author&gt;&lt;author&gt;Taylor, Karl&lt;/author&gt;&lt;author&gt;Hankin, Steve&lt;/author&gt;&lt;author&gt;Blower, Jon&lt;/author&gt;&lt;author&gt;Caron, John&lt;/author&gt;&lt;author&gt;Signell, Rich&lt;/author&gt;&lt;author&gt;Bentley, Phil&lt;/author&gt;&lt;author&gt;Rappa, Greg&lt;/author&gt;&lt;author&gt;Höck, Heinke&lt;/author&gt;&lt;author&gt;Pamment, Alison&lt;/author&gt;&lt;author&gt;Juckes, Martin&lt;/author&gt;&lt;author&gt;Raspaud, Martin&lt;/author&gt;&lt;author&gt;Horne, Randy&lt;/author&gt;&lt;author&gt;Whiteaker, Timothy&lt;/author&gt;&lt;author&gt;Blodgett, David&lt;/author&gt;&lt;author&gt;Zender, Charlie&lt;/author&gt;&lt;author&gt;Lee, Daniel&lt;/author&gt;&lt;author&gt;Hassell, David&lt;/author&gt;&lt;author&gt;Snow, Alan D.&lt;/author&gt;&lt;author&gt;Kölling, Tobias&lt;/author&gt;&lt;author&gt;Allured, Dave&lt;/author&gt;&lt;author&gt;Jelenak, Aleksandar&lt;/author&gt;&lt;author&gt;Meier Soerensen, Anders&lt;/author&gt;&lt;author&gt;Gaultier, Lucile&lt;/author&gt;&lt;author&gt;Herlédan, Sylvain&lt;/author&gt;&lt;author&gt;Manzano, Fernando&lt;/author&gt;&lt;author&gt;Bärring, Lars&lt;/author&gt;&lt;author&gt;Barker, Christopher&lt;/author&gt;&lt;author&gt;Bartholomew, Sadie&lt;/author&gt;&lt;/authors&gt;&lt;/contributors&gt;&lt;titles&gt;&lt;title&gt;NetCDF Climate and Forecast (CF) Metadata Conventions&lt;/title&gt;&lt;/titles&gt;&lt;dates&gt;&lt;year&gt;2023&lt;/year&gt;&lt;/dates&gt;&lt;label&gt;cf2023&lt;/label&gt;&lt;urls&gt;&lt;related-urls&gt;&lt;url&gt;https://cfconventions.org/Data/cf-conventions/cf-conventions-1.11/cf-conventions.html&lt;/url&gt;&lt;/related-urls&gt;&lt;/urls&gt;&lt;access-date&gt;2026-10-28&lt;/access-date&gt;&lt;/record&gt;&lt;/Cite&gt;&lt;/EndNote&gt;</w:instrText>
+        <w:instrText xml:space="preserve"> ADDIN EN.CITE &lt;EndNote&gt;&lt;Cite&gt;&lt;Author&gt;Eaton&lt;/Author&gt;&lt;Year&gt;2023&lt;/Year&gt;&lt;RecNum&gt;10&lt;/RecNum&gt;&lt;DisplayText&gt;[48]&lt;/DisplayText&gt;&lt;record&gt;&lt;rec-number&gt;10&lt;/rec-number&gt;&lt;foreign-keys&gt;&lt;key app="EN" db-id="mdae8500109496fea4aff9c086e16cc25895" timestamp="1793221304"&gt;10&lt;/key&gt;&lt;/foreign-keys&gt;&lt;ref-type name="Web Page"&gt;12&lt;/ref-type&gt;&lt;contributors&gt;&lt;authors&gt;&lt;author&gt;Eaton, Brian&lt;/author&gt;&lt;author&gt;Gregory, Jonathan&lt;/author&gt;&lt;author&gt;Drach, Bob&lt;/author&gt;&lt;author&gt;Taylor, Karl&lt;/author&gt;&lt;author&gt;Hankin, Steve&lt;/author&gt;&lt;author&gt;Blower, Jon&lt;/author&gt;&lt;author&gt;Caron, John&lt;/author&gt;&lt;author&gt;Signell, Rich&lt;/author&gt;&lt;author&gt;Bentley, Phil&lt;/author&gt;&lt;author&gt;Rappa, Greg&lt;/author&gt;&lt;author&gt;Höck, Heinke&lt;/author&gt;&lt;author&gt;Pamment, Alison&lt;/author&gt;&lt;author&gt;Juckes, Martin&lt;/author&gt;&lt;author&gt;Raspaud, Martin&lt;/author&gt;&lt;author&gt;Horne, Randy&lt;/author&gt;&lt;author&gt;Whiteaker, Timothy&lt;/author&gt;&lt;author&gt;Blodgett, David&lt;/author&gt;&lt;author&gt;Zender, Charlie&lt;/author&gt;&lt;author&gt;Lee, Daniel&lt;/author&gt;&lt;author&gt;Hassell, David&lt;/author&gt;&lt;author&gt;Snow, Alan D.&lt;/author&gt;&lt;author&gt;Kölling, Tobias&lt;/author&gt;&lt;author&gt;Allured, Dave&lt;/author&gt;&lt;author&gt;Jelenak, Aleksandar&lt;/author&gt;&lt;author&gt;Meier Soerensen, Anders&lt;/author&gt;&lt;author&gt;Gaultier, Lucile&lt;/author&gt;&lt;author&gt;Herlédan, Sylvain&lt;/author&gt;&lt;author&gt;Manzano, Fernando&lt;/author&gt;&lt;author&gt;Bärring, Lars&lt;/author&gt;&lt;author&gt;Barker, Christopher&lt;/author&gt;&lt;author&gt;Bartholomew, Sadie&lt;/author&gt;&lt;/authors&gt;&lt;/contributors&gt;&lt;titles&gt;&lt;title&gt;NetCDF Climate and Forecast (CF) Metadata Conventions&lt;/title&gt;&lt;/titles&gt;&lt;dates&gt;&lt;year&gt;2023&lt;/year&gt;&lt;/dates&gt;&lt;label&gt;cf2023&lt;/label&gt;&lt;urls&gt;&lt;related-urls&gt;&lt;url&gt;https://cfconventions.org/Data/cf-conventions/cf-conventions-1.11/cf-conventions.html&lt;/url&gt;&lt;/related-urls&gt;&lt;/urls&gt;&lt;access-date&gt;2026-10-28&lt;/access-date&gt;&lt;/record&gt;&lt;/Cite&gt;&lt;/EndNote&gt;</w:instrText>
       </w:r>
       <w:r>
         <w:fldChar w:fldCharType="separate"/>
@@ -2904,7 +2904,7 @@
         <w:fldChar w:fldCharType="begin"/>
       </w:r>
       <w:r>
-        <w:instrText xml:space="preserve"> ADDIN EN.CITE &lt;EndNote&gt;&lt;Cite&gt;&lt;Author&gt;Open Geospatial Consortium&lt;/Author&gt;&lt;Year&gt;2014&lt;/Year&gt;&lt;RecNum&gt;63&lt;/RecNum&gt;&lt;DisplayText&gt;[49]&lt;/DisplayText&gt;&lt;record&gt;&lt;rec-number&gt;63&lt;/rec-number&gt;&lt;foreign-keys&gt;&lt;key app="EN" db-id="mdae8500109496fea4aff9c086e16cc25895" timestamp="1793216821"&gt;63&lt;/key&gt;&lt;/foreign-keys&gt;&lt;ref-type name="Standard"&gt;58&lt;/ref-type&gt;&lt;contributors&gt;&lt;authors&gt;&lt;author&gt;Open Geospatial Consortium&lt;/author&gt;&lt;/authors&gt;&lt;secondary-authors&gt;&lt;author&gt;Taylor, Peter&lt;/author&gt;&lt;/secondary-authors&gt;&lt;/contributors&gt;&lt;titles&gt;&lt;title&gt;OGC WaterML 2.0: Part 1 – Timeseries, Version 2.0.1&lt;/title&gt;&lt;secondary-title&gt;OGC 10-126r4&lt;/secondary-title&gt;&lt;/titles&gt;&lt;dates&gt;&lt;year&gt;2014&lt;/year&gt;&lt;/dates&gt;&lt;label&gt;ogc_waterml2014&lt;/label&gt;&lt;urls&gt;&lt;related-urls&gt;&lt;url&gt;https://docs.ogc.org/is/10-126r4/10-126r4.pdf&lt;/url&gt;&lt;/related-urls&gt;&lt;/urls&gt;&lt;/record&gt;&lt;/Cite&gt;&lt;/EndNote&gt;</w:instrText>
+        <w:instrText xml:space="preserve"> ADDIN EN.CITE &lt;EndNote&gt;&lt;Cite&gt;&lt;Author&gt;Open Geospatial Consortium&lt;/Author&gt;&lt;Year&gt;2014&lt;/Year&gt;&lt;RecNum&gt;63&lt;/RecNum&gt;&lt;DisplayText&gt;[49]&lt;/DisplayText&gt;&lt;record&gt;&lt;rec-number&gt;63&lt;/rec-number&gt;&lt;foreign-keys&gt;&lt;key app="EN" db-id="mdae8500109496fea4aff9c086e16cc25895" timestamp="1793221304"&gt;63&lt;/key&gt;&lt;/foreign-keys&gt;&lt;ref-type name="Standard"&gt;58&lt;/ref-type&gt;&lt;contributors&gt;&lt;authors&gt;&lt;author&gt;Open Geospatial Consortium&lt;/author&gt;&lt;/authors&gt;&lt;secondary-authors&gt;&lt;author&gt;Taylor, Peter&lt;/author&gt;&lt;/secondary-authors&gt;&lt;/contributors&gt;&lt;titles&gt;&lt;title&gt;OGC WaterML 2.0: Part 1 – Timeseries, Version 2.0.1&lt;/title&gt;&lt;secondary-title&gt;OGC 10-126r4&lt;/secondary-title&gt;&lt;/titles&gt;&lt;dates&gt;&lt;year&gt;2014&lt;/year&gt;&lt;/dates&gt;&lt;label&gt;ogc_waterml2014&lt;/label&gt;&lt;urls&gt;&lt;related-urls&gt;&lt;url&gt;https://docs.ogc.org/is/10-126r4/10-126r4.pdf&lt;/url&gt;&lt;/related-urls&gt;&lt;/urls&gt;&lt;/record&gt;&lt;/Cite&gt;&lt;/EndNote&gt;</w:instrText>
       </w:r>
       <w:r>
         <w:fldChar w:fldCharType="separate"/>
@@ -2925,7 +2925,7 @@
         <w:fldChar w:fldCharType="begin"/>
       </w:r>
       <w:r>
-        <w:instrText xml:space="preserve"> ADDIN EN.CITE &lt;EndNote&gt;&lt;Cite&gt;&lt;Author&gt;U.S. Department of Energy&lt;/Author&gt;&lt;Year&gt;2024&lt;/Year&gt;&lt;RecNum&gt;20&lt;/RecNum&gt;&lt;DisplayText&gt;[21]&lt;/DisplayText&gt;&lt;record&gt;&lt;rec-number&gt;20&lt;/rec-number&gt;&lt;foreign-keys&gt;&lt;key app="EN" db-id="mdae8500109496fea4aff9c086e16cc25895" timestamp="1793216821"&gt;20&lt;/key&gt;&lt;/foreign-keys&gt;&lt;ref-type name="Web Page"&gt;12&lt;/ref-type&gt;&lt;contributors&gt;&lt;authors&gt;&lt;author&gt;U.S. Department of Energy&lt;/author&gt;&lt;/authors&gt;&lt;/contributors&gt;&lt;titles&gt;&lt;title&gt;EnergyPlus Output Details and Examples: eplusout.rdd&lt;/title&gt;&lt;/titles&gt;&lt;dates&gt;&lt;year&gt;2024&lt;/year&gt;&lt;/dates&gt;&lt;label&gt;doe2024rdd&lt;/label&gt;&lt;urls&gt;&lt;related-urls&gt;&lt;url&gt;https://bigladdersoftware.com/epx/docs/24-1/output-details-and-examples/eplusout-rdd.html&lt;/url&gt;&lt;/related-urls&gt;&lt;/urls&gt;&lt;access-date&gt;2026-10-28&lt;/access-date&gt;&lt;/record&gt;&lt;/Cite&gt;&lt;/EndNote&gt;</w:instrText>
+        <w:instrText xml:space="preserve"> ADDIN EN.CITE &lt;EndNote&gt;&lt;Cite&gt;&lt;Author&gt;U.S. Department of Energy&lt;/Author&gt;&lt;Year&gt;2024&lt;/Year&gt;&lt;RecNum&gt;20&lt;/RecNum&gt;&lt;DisplayText&gt;[21]&lt;/DisplayText&gt;&lt;record&gt;&lt;rec-number&gt;20&lt;/rec-number&gt;&lt;foreign-keys&gt;&lt;key app="EN" db-id="mdae8500109496fea4aff9c086e16cc25895" timestamp="1793221304"&gt;20&lt;/key&gt;&lt;/foreign-keys&gt;&lt;ref-type name="Web Page"&gt;12&lt;/ref-type&gt;&lt;contributors&gt;&lt;authors&gt;&lt;author&gt;U.S. Department of Energy&lt;/author&gt;&lt;/authors&gt;&lt;/contributors&gt;&lt;titles&gt;&lt;title&gt;EnergyPlus Output Details and Examples: eplusout.rdd&lt;/title&gt;&lt;/titles&gt;&lt;dates&gt;&lt;year&gt;2024&lt;/year&gt;&lt;/dates&gt;&lt;label&gt;doe2024rdd&lt;/label&gt;&lt;urls&gt;&lt;related-urls&gt;&lt;url&gt;https://bigladdersoftware.com/epx/docs/24-1/output-details-and-examples/eplusout-rdd.html&lt;/url&gt;&lt;/related-urls&gt;&lt;/urls&gt;&lt;access-date&gt;2026-10-28&lt;/access-date&gt;&lt;/record&gt;&lt;/Cite&gt;&lt;/EndNote&gt;</w:instrText>
       </w:r>
       <w:r>
         <w:fldChar w:fldCharType="separate"/>
@@ -2946,7 +2946,7 @@
         <w:fldChar w:fldCharType="begin"/>
       </w:r>
       <w:r>
-        <w:instrText xml:space="preserve"> ADDIN EN.CITE &lt;EndNote&gt;&lt;Cite&gt;&lt;Author&gt;OPC Foundation&lt;/Author&gt;&lt;Year&gt;2026&lt;/Year&gt;&lt;RecNum&gt;65&lt;/RecNum&gt;&lt;DisplayText&gt;[50]&lt;/DisplayText&gt;&lt;record&gt;&lt;rec-number&gt;65&lt;/rec-number&gt;&lt;foreign-keys&gt;&lt;key app="EN" db-id="mdae8500109496fea4aff9c086e16cc25895" timestamp="1793216821"&gt;65&lt;/key&gt;&lt;/foreign-keys&gt;&lt;ref-type name="Standard"&gt;58&lt;/ref-type&gt;&lt;contributors&gt;&lt;authors&gt;&lt;author&gt;OPC Foundation&lt;/author&gt;&lt;/authors&gt;&lt;/contributors&gt;&lt;titles&gt;&lt;title&gt;OPC Unified Architecture – Part 8: Data Access&lt;/title&gt;&lt;secondary-title&gt;OPC 10000-8, Release 1.05.07&lt;/secondary-title&gt;&lt;/titles&gt;&lt;dates&gt;&lt;year&gt;2026&lt;/year&gt;&lt;/dates&gt;&lt;label&gt;opcua_part8&lt;/label&gt;&lt;urls&gt;&lt;related-urls&gt;&lt;url&gt;https://reference.opcfoundation.org/specs/OPC-10000-8&lt;/url&gt;&lt;/related-urls&gt;&lt;/urls&gt;&lt;/record&gt;&lt;/Cite&gt;&lt;/EndNote&gt;</w:instrText>
+        <w:instrText xml:space="preserve"> ADDIN EN.CITE &lt;EndNote&gt;&lt;Cite&gt;&lt;Author&gt;OPC Foundation&lt;/Author&gt;&lt;Year&gt;2026&lt;/Year&gt;&lt;RecNum&gt;65&lt;/RecNum&gt;&lt;DisplayText&gt;[50]&lt;/DisplayText&gt;&lt;record&gt;&lt;rec-number&gt;65&lt;/rec-number&gt;&lt;foreign-keys&gt;&lt;key app="EN" db-id="mdae8500109496fea4aff9c086e16cc25895" timestamp="1793221304"&gt;65&lt;/key&gt;&lt;/foreign-keys&gt;&lt;ref-type name="Standard"&gt;58&lt;/ref-type&gt;&lt;contributors&gt;&lt;authors&gt;&lt;author&gt;OPC Foundation&lt;/author&gt;&lt;/authors&gt;&lt;/contributors&gt;&lt;titles&gt;&lt;title&gt;OPC Unified Architecture – Part 8: Data Access&lt;/title&gt;&lt;secondary-title&gt;OPC 10000-8, Release 1.05.07&lt;/secondary-title&gt;&lt;/titles&gt;&lt;dates&gt;&lt;year&gt;2026&lt;/year&gt;&lt;/dates&gt;&lt;label&gt;opcua_part8&lt;/label&gt;&lt;urls&gt;&lt;related-urls&gt;&lt;url&gt;https://reference.opcfoundation.org/specs/OPC-10000-8&lt;/url&gt;&lt;/related-urls&gt;&lt;/urls&gt;&lt;/record&gt;&lt;/Cite&gt;&lt;/EndNote&gt;</w:instrText>
       </w:r>
       <w:r>
         <w:fldChar w:fldCharType="separate"/>
@@ -2967,7 +2967,7 @@
         <w:fldChar w:fldCharType="begin"/>
       </w:r>
       <w:r>
-        <w:instrText xml:space="preserve"> ADDIN EN.CITE &lt;EndNote&gt;&lt;Cite&gt;&lt;Author&gt;Moreau&lt;/Author&gt;&lt;Year&gt;2013&lt;/Year&gt;&lt;RecNum&gt;55&lt;/RecNum&gt;&lt;DisplayText&gt;[51]&lt;/DisplayText&gt;&lt;record&gt;&lt;rec-number&gt;55&lt;/rec-number&gt;&lt;foreign-keys&gt;&lt;key app="EN" db-id="mdae8500109496fea4aff9c086e16cc25895" timestamp="1793216821"&gt;55&lt;/key&gt;&lt;/foreign-keys&gt;&lt;ref-type name="Standard"&gt;58&lt;/ref-type&gt;&lt;contributors&gt;&lt;authors&gt;&lt;author&gt;Moreau, Luc&lt;/author&gt;&lt;author&gt;Missier, Paolo&lt;/author&gt;&lt;/authors&gt;&lt;/contributors&gt;&lt;titles&gt;&lt;title&gt;PROV-DM: The PROV Data Model&lt;/title&gt;&lt;secondary-title&gt;W3C Recommendation&lt;/secondary-title&gt;&lt;/titles&gt;&lt;dates&gt;&lt;year&gt;2013&lt;/year&gt;&lt;/dates&gt;&lt;publisher&gt;World Wide Web Consortium (W3C)&lt;/publisher&gt;&lt;label&gt;moreau2013prov&lt;/label&gt;&lt;urls&gt;&lt;related-urls&gt;&lt;url&gt;https://www.w3.org/TR/2013/REC-prov-dm-20130430/&lt;/url&gt;&lt;/related-urls&gt;&lt;/urls&gt;&lt;/record&gt;&lt;/Cite&gt;&lt;/EndNote&gt;</w:instrText>
+        <w:instrText xml:space="preserve"> ADDIN EN.CITE &lt;EndNote&gt;&lt;Cite&gt;&lt;Author&gt;Moreau&lt;/Author&gt;&lt;Year&gt;2013&lt;/Year&gt;&lt;RecNum&gt;55&lt;/RecNum&gt;&lt;DisplayText&gt;[51]&lt;/DisplayText&gt;&lt;record&gt;&lt;rec-number&gt;55&lt;/rec-number&gt;&lt;foreign-keys&gt;&lt;key app="EN" db-id="mdae8500109496fea4aff9c086e16cc25895" timestamp="1793221304"&gt;55&lt;/key&gt;&lt;/foreign-keys&gt;&lt;ref-type name="Standard"&gt;58&lt;/ref-type&gt;&lt;contributors&gt;&lt;authors&gt;&lt;author&gt;Moreau, Luc&lt;/author&gt;&lt;author&gt;Missier, Paolo&lt;/author&gt;&lt;/authors&gt;&lt;/contributors&gt;&lt;titles&gt;&lt;title&gt;PROV-DM: The PROV Data Model&lt;/title&gt;&lt;secondary-title&gt;W3C Recommendation&lt;/secondary-title&gt;&lt;/titles&gt;&lt;dates&gt;&lt;year&gt;2013&lt;/year&gt;&lt;/dates&gt;&lt;publisher&gt;World Wide Web Consortium (W3C)&lt;/publisher&gt;&lt;label&gt;moreau2013prov&lt;/label&gt;&lt;urls&gt;&lt;related-urls&gt;&lt;url&gt;https://www.w3.org/TR/2013/REC-prov-dm-20130430/&lt;/url&gt;&lt;/related-urls&gt;&lt;/urls&gt;&lt;/record&gt;&lt;/Cite&gt;&lt;/EndNote&gt;</w:instrText>
       </w:r>
       <w:r>
         <w:fldChar w:fldCharType="separate"/>
@@ -2988,7 +2988,7 @@
         <w:fldChar w:fldCharType="begin"/>
       </w:r>
       <w:r>
-        <w:instrText xml:space="preserve"> ADDIN EN.CITE &lt;EndNote&gt;&lt;Cite&gt;&lt;Author&gt;Chen&lt;/Author&gt;&lt;Year&gt;2015&lt;/Year&gt;&lt;RecNum&gt;12&lt;/RecNum&gt;&lt;DisplayText&gt;[52]&lt;/DisplayText&gt;&lt;record&gt;&lt;rec-number&gt;12&lt;/rec-number&gt;&lt;foreign-keys&gt;&lt;key app="EN" db-id="mdae8500109496fea4aff9c086e16cc25895" timestamp="1793216821"&gt;12&lt;/key&gt;&lt;/foreign-keys&gt;&lt;ref-type name="Journal Article"&gt;17&lt;/ref-type&gt;&lt;contributors&gt;&lt;authors&gt;&lt;author&gt;Chen, Yunji&lt;/author&gt;&lt;author&gt;Zhang, Shijin&lt;/author&gt;&lt;author&gt;Guo, Qi&lt;/author&gt;&lt;author&gt;Li, Ling&lt;/author&gt;&lt;author&gt;Wu, Ruiyang&lt;/author&gt;&lt;author&gt;Chen, Tianshi&lt;/author&gt;&lt;/authors&gt;&lt;/contributors&gt;&lt;titles&gt;&lt;title&gt;Deterministic Replay: A Survey&lt;/title&gt;&lt;secondary-title&gt;ACM Computing Surveys&lt;/secondary-title&gt;&lt;alt-title&gt;ACM Comput. Surv.&lt;/alt-title&gt;&lt;/titles&gt;&lt;periodical&gt;&lt;full-title&gt;ACM Computing Surveys&lt;/full-title&gt;&lt;abbr-1&gt;ACM Comput. Surv.&lt;/abbr-1&gt;&lt;/periodical&gt;&lt;pages&gt;1-47&lt;/pages&gt;&lt;volume&gt;48&lt;/volume&gt;&lt;number&gt;2&lt;/number&gt;&lt;dates&gt;&lt;year&gt;2015&lt;/year&gt;&lt;/dates&gt;&lt;publisher&gt;ACM&lt;/publisher&gt;&lt;label&gt;chen2015replay&lt;/label&gt;&lt;urls&gt;&lt;/urls&gt;&lt;electronic-resource-num&gt;10.1145/2790077&lt;/electronic-resource-num&gt;&lt;/record&gt;&lt;/Cite&gt;&lt;/EndNote&gt;</w:instrText>
+        <w:instrText xml:space="preserve"> ADDIN EN.CITE &lt;EndNote&gt;&lt;Cite&gt;&lt;Author&gt;Chen&lt;/Author&gt;&lt;Year&gt;2015&lt;/Year&gt;&lt;RecNum&gt;12&lt;/RecNum&gt;&lt;DisplayText&gt;[52]&lt;/DisplayText&gt;&lt;record&gt;&lt;rec-number&gt;12&lt;/rec-number&gt;&lt;foreign-keys&gt;&lt;key app="EN" db-id="mdae8500109496fea4aff9c086e16cc25895" timestamp="1793221304"&gt;12&lt;/key&gt;&lt;/foreign-keys&gt;&lt;ref-type name="Journal Article"&gt;17&lt;/ref-type&gt;&lt;contributors&gt;&lt;authors&gt;&lt;author&gt;Chen, Yunji&lt;/author&gt;&lt;author&gt;Zhang, Shijin&lt;/author&gt;&lt;author&gt;Guo, Qi&lt;/author&gt;&lt;author&gt;Li, Ling&lt;/author&gt;&lt;author&gt;Wu, Ruiyang&lt;/author&gt;&lt;author&gt;Chen, Tianshi&lt;/author&gt;&lt;/authors&gt;&lt;/contributors&gt;&lt;titles&gt;&lt;title&gt;Deterministic Replay: A Survey&lt;/title&gt;&lt;secondary-title&gt;ACM Computing Surveys&lt;/secondary-title&gt;&lt;alt-title&gt;ACM Comput. Surv.&lt;/alt-title&gt;&lt;/titles&gt;&lt;periodical&gt;&lt;full-title&gt;ACM Computing Surveys&lt;/full-title&gt;&lt;abbr-1&gt;ACM Comput. Surv.&lt;/abbr-1&gt;&lt;/periodical&gt;&lt;pages&gt;1-47&lt;/pages&gt;&lt;volume&gt;48&lt;/volume&gt;&lt;number&gt;2&lt;/number&gt;&lt;dates&gt;&lt;year&gt;2015&lt;/year&gt;&lt;/dates&gt;&lt;publisher&gt;ACM&lt;/publisher&gt;&lt;label&gt;chen2015replay&lt;/label&gt;&lt;urls&gt;&lt;/urls&gt;&lt;electronic-resource-num&gt;10.1145/2790077&lt;/electronic-resource-num&gt;&lt;/record&gt;&lt;/Cite&gt;&lt;/EndNote&gt;</w:instrText>
       </w:r>
       <w:r>
         <w:fldChar w:fldCharType="separate"/>
@@ -3009,7 +3009,7 @@
         <w:fldChar w:fldCharType="begin"/>
       </w:r>
       <w:r>
-        <w:instrText xml:space="preserve"> ADDIN EN.CITE &lt;EndNote&gt;&lt;Cite&gt;&lt;Author&gt;Feng&lt;/Author&gt;&lt;Year&gt;2025&lt;/Year&gt;&lt;RecNum&gt;21&lt;/RecNum&gt;&lt;DisplayText&gt;[53]&lt;/DisplayText&gt;&lt;record&gt;&lt;rec-number&gt;21&lt;/rec-number&gt;&lt;foreign-keys&gt;&lt;key app="EN" db-id="mdae8500109496fea4aff9c086e16cc25895" timestamp="1793216821"&gt;21&lt;/key&gt;&lt;/foreign-keys&gt;&lt;ref-type name="Generic"&gt;13&lt;/ref-type&gt;&lt;contributors&gt;&lt;authors&gt;&lt;author&gt;Feng, Erhu&lt;/author&gt;&lt;author&gt;Zhou, Wenbo&lt;/author&gt;&lt;author&gt;Liu, Zibin&lt;/author&gt;&lt;author&gt;Chen, Le&lt;/author&gt;&lt;author&gt;Dong, Yunpeng&lt;/author&gt;&lt;author&gt;Zhang, Cheng&lt;/author&gt;&lt;author&gt;Zhao, Yisheng&lt;/author&gt;&lt;author&gt;Du, Dong&lt;/author&gt;&lt;author&gt;Hua, Zhichao&lt;/author&gt;&lt;author&gt;Xia, Yubin&lt;/author&gt;&lt;author&gt;Chen, Haibo&lt;/author&gt;&lt;/authors&gt;&lt;/contributors&gt;&lt;titles&gt;&lt;title&gt;Get Experience from Practice: LLM Agents with Record &amp;amp; Replay&lt;/title&gt;&lt;secondary-title&gt;arXiv&lt;/secondary-title&gt;&lt;/titles&gt;&lt;dates&gt;&lt;year&gt;2025&lt;/year&gt;&lt;/dates&gt;&lt;label&gt;feng2025agentrr&lt;/label&gt;&lt;work-type&gt;arXiv:2505.17716&lt;/work-type&gt;&lt;urls&gt;&lt;related-urls&gt;&lt;url&gt;https://arxiv.org/abs/2505.17716&lt;/url&gt;&lt;/related-urls&gt;&lt;/urls&gt;&lt;electronic-resource-num&gt;10.48550/arXiv.2505.17716&lt;/electronic-resource-num&gt;&lt;/record&gt;&lt;/Cite&gt;&lt;/EndNote&gt;</w:instrText>
+        <w:instrText xml:space="preserve"> ADDIN EN.CITE &lt;EndNote&gt;&lt;Cite&gt;&lt;Author&gt;Feng&lt;/Author&gt;&lt;Year&gt;2025&lt;/Year&gt;&lt;RecNum&gt;21&lt;/RecNum&gt;&lt;DisplayText&gt;[53]&lt;/DisplayText&gt;&lt;record&gt;&lt;rec-number&gt;21&lt;/rec-number&gt;&lt;foreign-keys&gt;&lt;key app="EN" db-id="mdae8500109496fea4aff9c086e16cc25895" timestamp="1793221304"&gt;21&lt;/key&gt;&lt;/foreign-keys&gt;&lt;ref-type name="Generic"&gt;13&lt;/ref-type&gt;&lt;contributors&gt;&lt;authors&gt;&lt;author&gt;Feng, Erhu&lt;/author&gt;&lt;author&gt;Zhou, Wenbo&lt;/author&gt;&lt;author&gt;Liu, Zibin&lt;/author&gt;&lt;author&gt;Chen, Le&lt;/author&gt;&lt;author&gt;Dong, Yunpeng&lt;/author&gt;&lt;author&gt;Zhang, Cheng&lt;/author&gt;&lt;author&gt;Zhao, Yisheng&lt;/author&gt;&lt;author&gt;Du, Dong&lt;/author&gt;&lt;author&gt;Hua, Zhichao&lt;/author&gt;&lt;author&gt;Xia, Yubin&lt;/author&gt;&lt;author&gt;Chen, Haibo&lt;/author&gt;&lt;/authors&gt;&lt;/contributors&gt;&lt;titles&gt;&lt;title&gt;Get Experience from Practice: LLM Agents with Record &amp;amp; Replay&lt;/title&gt;&lt;secondary-title&gt;arXiv&lt;/secondary-title&gt;&lt;/titles&gt;&lt;dates&gt;&lt;year&gt;2025&lt;/year&gt;&lt;/dates&gt;&lt;label&gt;feng2025agentrr&lt;/label&gt;&lt;work-type&gt;arXiv:2505.17716&lt;/work-type&gt;&lt;urls&gt;&lt;related-urls&gt;&lt;url&gt;https://arxiv.org/abs/2505.17716&lt;/url&gt;&lt;/related-urls&gt;&lt;/urls&gt;&lt;electronic-resource-num&gt;10.48550/arXiv.2505.17716&lt;/electronic-resource-num&gt;&lt;/record&gt;&lt;/Cite&gt;&lt;/EndNote&gt;</w:instrText>
       </w:r>
       <w:r>
         <w:fldChar w:fldCharType="separate"/>
@@ -3030,7 +3030,7 @@
         <w:fldChar w:fldCharType="begin"/>
       </w:r>
       <w:r>
-        <w:instrText xml:space="preserve"> ADDIN EN.CITE &lt;EndNote&gt;&lt;Cite&gt;&lt;Author&gt;Henzinger&lt;/Author&gt;&lt;Year&gt;2003&lt;/Year&gt;&lt;RecNum&gt;33&lt;/RecNum&gt;&lt;DisplayText&gt;[54]&lt;/DisplayText&gt;&lt;record&gt;&lt;rec-number&gt;33&lt;/rec-number&gt;&lt;foreign-keys&gt;&lt;key app="EN" db-id="mdae8500109496fea4aff9c086e16cc25895" timestamp="1793216821"&gt;33&lt;/key&gt;&lt;/foreign-keys&gt;&lt;ref-type name="Journal Article"&gt;17&lt;/ref-type&gt;&lt;contributors&gt;&lt;authors&gt;&lt;author&gt;Henzinger, T. A.&lt;/author&gt;&lt;author&gt;Horowitz, B.&lt;/author&gt;&lt;author&gt;Kirsch, C. M.&lt;/author&gt;&lt;/authors&gt;&lt;/contributors&gt;&lt;titles&gt;&lt;title&gt;Giotto: a time-triggered language for embedded programming&lt;/title&gt;&lt;secondary-title&gt;Proceedings of the IEEE&lt;/secondary-title&gt;&lt;alt-title&gt;Proc. IEEE&lt;/alt-title&gt;&lt;/titles&gt;&lt;periodical&gt;&lt;full-title&gt;Proceedings of the IEEE&lt;/full-title&gt;&lt;abbr-1&gt;Proc. IEEE&lt;/abbr-1&gt;&lt;/periodical&gt;&lt;pages&gt;84-99&lt;/pages&gt;&lt;volume&gt;91&lt;/volume&gt;&lt;number&gt;1&lt;/number&gt;&lt;dates&gt;&lt;year&gt;2003&lt;/year&gt;&lt;/dates&gt;&lt;publisher&gt;IEEE&lt;/publisher&gt;&lt;label&gt;henzinger2003&lt;/label&gt;&lt;urls&gt;&lt;/urls&gt;&lt;electronic-resource-num&gt;10.1109/JPROC.2002.805825&lt;/electronic-resource-num&gt;&lt;/record&gt;&lt;/Cite&gt;&lt;/EndNote&gt;</w:instrText>
+        <w:instrText xml:space="preserve"> ADDIN EN.CITE &lt;EndNote&gt;&lt;Cite&gt;&lt;Author&gt;Henzinger&lt;/Author&gt;&lt;Year&gt;2003&lt;/Year&gt;&lt;RecNum&gt;33&lt;/RecNum&gt;&lt;DisplayText&gt;[54]&lt;/DisplayText&gt;&lt;record&gt;&lt;rec-number&gt;33&lt;/rec-number&gt;&lt;foreign-keys&gt;&lt;key app="EN" db-id="mdae8500109496fea4aff9c086e16cc25895" timestamp="1793221304"&gt;33&lt;/key&gt;&lt;/foreign-keys&gt;&lt;ref-type name="Journal Article"&gt;17&lt;/ref-type&gt;&lt;contributors&gt;&lt;authors&gt;&lt;author&gt;Henzinger, T. A.&lt;/author&gt;&lt;author&gt;Horowitz, B.&lt;/author&gt;&lt;author&gt;Kirsch, C. M.&lt;/author&gt;&lt;/authors&gt;&lt;/contributors&gt;&lt;titles&gt;&lt;title&gt;Giotto: a time-triggered language for embedded programming&lt;/title&gt;&lt;secondary-title&gt;Proceedings of the IEEE&lt;/secondary-title&gt;&lt;alt-title&gt;Proc. IEEE&lt;/alt-title&gt;&lt;/titles&gt;&lt;periodical&gt;&lt;full-title&gt;Proceedings of the IEEE&lt;/full-title&gt;&lt;abbr-1&gt;Proc. IEEE&lt;/abbr-1&gt;&lt;/periodical&gt;&lt;pages&gt;84-99&lt;/pages&gt;&lt;volume&gt;91&lt;/volume&gt;&lt;number&gt;1&lt;/number&gt;&lt;dates&gt;&lt;year&gt;2003&lt;/year&gt;&lt;/dates&gt;&lt;publisher&gt;IEEE&lt;/publisher&gt;&lt;label&gt;henzinger2003&lt;/label&gt;&lt;urls&gt;&lt;/urls&gt;&lt;electronic-resource-num&gt;10.1109/JPROC.2002.805825&lt;/electronic-resource-num&gt;&lt;/record&gt;&lt;/Cite&gt;&lt;/EndNote&gt;</w:instrText>
       </w:r>
       <w:r>
         <w:fldChar w:fldCharType="separate"/>
@@ -3051,7 +3051,7 @@
         <w:fldChar w:fldCharType="begin"/>
       </w:r>
       <w:r>
-        <w:instrText xml:space="preserve"> ADDIN EN.CITE &lt;EndNote&gt;&lt;Cite&gt;&lt;Author&gt;Lohstroh&lt;/Author&gt;&lt;Year&gt;2021&lt;/Year&gt;&lt;RecNum&gt;53&lt;/RecNum&gt;&lt;DisplayText&gt;[55]&lt;/DisplayText&gt;&lt;record&gt;&lt;rec-number&gt;53&lt;/rec-number&gt;&lt;foreign-keys&gt;&lt;key app="EN" db-id="mdae8500109496fea4aff9c086e16cc25895" timestamp="1793216821"&gt;53&lt;/key&gt;&lt;/foreign-keys&gt;&lt;ref-type name="Journal Article"&gt;17&lt;/ref-type&gt;&lt;contributors&gt;&lt;authors&gt;&lt;author&gt;Lohstroh, Marten&lt;/author&gt;&lt;author&gt;Menard, Christian&lt;/author&gt;&lt;author&gt;Bateni, Soroush&lt;/author&gt;&lt;author&gt;Lee, Edward A.&lt;/author&gt;&lt;/authors&gt;&lt;/contributors&gt;&lt;titles&gt;&lt;title&gt;Toward a Lingua Franca for Deterministic Concurrent Systems&lt;/title&gt;&lt;secondary-title&gt;ACM Transactions on Embedded Computing Systems&lt;/secondary-title&gt;&lt;alt-title&gt;ACM Trans. Embed. Comput. Syst.&lt;/alt-title&gt;&lt;/titles&gt;&lt;periodical&gt;&lt;full-title&gt;ACM Transactions on Embedded Computing Systems&lt;/full-title&gt;&lt;abbr-1&gt;ACM Trans. Embed. Comput. Syst.&lt;/abbr-1&gt;&lt;/periodical&gt;&lt;pages&gt;1-27&lt;/pages&gt;&lt;volume&gt;20&lt;/volume&gt;&lt;number&gt;4&lt;/number&gt;&lt;dates&gt;&lt;year&gt;2021&lt;/year&gt;&lt;/dates&gt;&lt;publisher&gt;ACM&lt;/publisher&gt;&lt;label&gt;lohstroh2021&lt;/label&gt;&lt;urls&gt;&lt;/urls&gt;&lt;electronic-resource-num&gt;10.1145/3448128&lt;/electronic-resource-num&gt;&lt;/record&gt;&lt;/Cite&gt;&lt;/EndNote&gt;</w:instrText>
+        <w:instrText xml:space="preserve"> ADDIN EN.CITE &lt;EndNote&gt;&lt;Cite&gt;&lt;Author&gt;Lohstroh&lt;/Author&gt;&lt;Year&gt;2021&lt;/Year&gt;&lt;RecNum&gt;53&lt;/RecNum&gt;&lt;DisplayText&gt;[55]&lt;/DisplayText&gt;&lt;record&gt;&lt;rec-number&gt;53&lt;/rec-number&gt;&lt;foreign-keys&gt;&lt;key app="EN" db-id="mdae8500109496fea4aff9c086e16cc25895" timestamp="1793221304"&gt;53&lt;/key&gt;&lt;/foreign-keys&gt;&lt;ref-type name="Journal Article"&gt;17&lt;/ref-type&gt;&lt;contributors&gt;&lt;authors&gt;&lt;author&gt;Lohstroh, Marten&lt;/author&gt;&lt;author&gt;Menard, Christian&lt;/author&gt;&lt;author&gt;Bateni, Soroush&lt;/author&gt;&lt;author&gt;Lee, Edward A.&lt;/author&gt;&lt;/authors&gt;&lt;/contributors&gt;&lt;titles&gt;&lt;title&gt;Toward a Lingua Franca for Deterministic Concurrent Systems&lt;/title&gt;&lt;secondary-title&gt;ACM Transactions on Embedded Computing Systems&lt;/secondary-title&gt;&lt;alt-title&gt;ACM Trans. Embed. Comput. Syst.&lt;/alt-title&gt;&lt;/titles&gt;&lt;periodical&gt;&lt;full-title&gt;ACM Transactions on Embedded Computing Systems&lt;/full-title&gt;&lt;abbr-1&gt;ACM Trans. Embed. Comput. Syst.&lt;/abbr-1&gt;&lt;/periodical&gt;&lt;pages&gt;1-27&lt;/pages&gt;&lt;volume&gt;20&lt;/volume&gt;&lt;number&gt;4&lt;/number&gt;&lt;dates&gt;&lt;year&gt;2021&lt;/year&gt;&lt;/dates&gt;&lt;publisher&gt;ACM&lt;/publisher&gt;&lt;label&gt;lohstroh2021&lt;/label&gt;&lt;urls&gt;&lt;/urls&gt;&lt;electronic-resource-num&gt;10.1145/3448128&lt;/electronic-resource-num&gt;&lt;/record&gt;&lt;/Cite&gt;&lt;/EndNote&gt;</w:instrText>
       </w:r>
       <w:r>
         <w:fldChar w:fldCharType="separate"/>
@@ -6620,7 +6620,7 @@
         <w:fldChar w:fldCharType="begin"/>
       </w:r>
       <w:r>
-        <w:instrText xml:space="preserve"> ADDIN EN.CITE &lt;EndNote&gt;&lt;Cite&gt;&lt;Author&gt;Fujimoto&lt;/Author&gt;&lt;Year&gt;2000&lt;/Year&gt;&lt;RecNum&gt;25&lt;/RecNum&gt;&lt;DisplayText&gt;[20,33]&lt;/DisplayText&gt;&lt;record&gt;&lt;rec-number&gt;25&lt;/rec-number&gt;&lt;foreign-keys&gt;&lt;key app="EN" db-id="mdae8500109496fea4aff9c086e16cc25895" timestamp="1793216821"&gt;25&lt;/key&gt;&lt;/foreign-keys&gt;&lt;ref-type name="Book"&gt;6&lt;/ref-type&gt;&lt;contributors&gt;&lt;authors&gt;&lt;author&gt;Fujimoto, Richard M.&lt;/author&gt;&lt;/authors&gt;&lt;/contributors&gt;&lt;titles&gt;&lt;title&gt;Parallel and Distributed Simulation Systems&lt;/title&gt;&lt;secondary-title&gt;Wiley Series on Parallel and Distributed Computing&lt;/secondary-title&gt;&lt;/titles&gt;&lt;dates&gt;&lt;year&gt;2000&lt;/year&gt;&lt;/dates&gt;&lt;publisher&gt;John Wiley &amp;amp; Sons&lt;/publisher&gt;&lt;isbn&gt;978-0-471-18383-9&lt;/isbn&gt;&lt;label&gt;fujimoto2000&lt;/label&gt;&lt;urls&gt;&lt;/urls&gt;&lt;/record&gt;&lt;/Cite&gt;&lt;Cite&gt;&lt;Author&gt;Ofenloch&lt;/Author&gt;&lt;Year&gt;2022&lt;/Year&gt;&lt;RecNum&gt;62&lt;/RecNum&gt;&lt;record&gt;&lt;rec-number&gt;62&lt;/rec-number&gt;&lt;foreign-keys&gt;&lt;key app="EN" db-id="mdae8500109496fea4aff9c086e16cc25895" timestamp="1793216821"&gt;62&lt;/key&gt;&lt;/foreign-keys&gt;&lt;ref-type name="Conference Paper"&gt;47&lt;/ref-type&gt;&lt;contributors&gt;&lt;authors&gt;&lt;author&gt;Ofenloch, Annika&lt;/author&gt;&lt;author&gt;Schwarz, Jan Sören&lt;/author&gt;&lt;author&gt;Tolk, Deborah&lt;/author&gt;&lt;author&gt;Brandt, Tobias&lt;/author&gt;&lt;author&gt;Eilers, Reef&lt;/author&gt;&lt;author&gt;Ramirez, Rebeca&lt;/author&gt;&lt;author&gt;Raub, Thomas&lt;/author&gt;&lt;author&gt;Lehnhoff, Sebastian&lt;/author&gt;&lt;/authors&gt;&lt;/contributors&gt;&lt;titles&gt;&lt;title&gt;MOSAIK 3.0: Combining Time-Stepped and Discrete Event Simulation&lt;/title&gt;&lt;secondary-title&gt;2022 Open Source Modelling and Simulation of Energy Systems (OSMSES)&lt;/secondary-title&gt;&lt;/titles&gt;&lt;pages&gt;1-5&lt;/pages&gt;&lt;dates&gt;&lt;year&gt;2022&lt;/year&gt;&lt;/dates&gt;&lt;pub-location&gt;Aachen, Germany&lt;/pub-location&gt;&lt;publisher&gt;IEEE&lt;/publisher&gt;&lt;label&gt;ofenloch2022&lt;/label&gt;&lt;urls&gt;&lt;/urls&gt;&lt;electronic-resource-num&gt;10.1109/OSMSES54027.2022.9769116&lt;/electronic-resource-num&gt;&lt;/record&gt;&lt;/Cite&gt;&lt;/EndNote&gt;</w:instrText>
+        <w:instrText xml:space="preserve"> ADDIN EN.CITE &lt;EndNote&gt;&lt;Cite&gt;&lt;Author&gt;Fujimoto&lt;/Author&gt;&lt;Year&gt;2000&lt;/Year&gt;&lt;RecNum&gt;25&lt;/RecNum&gt;&lt;DisplayText&gt;[20,33]&lt;/DisplayText&gt;&lt;record&gt;&lt;rec-number&gt;25&lt;/rec-number&gt;&lt;foreign-keys&gt;&lt;key app="EN" db-id="mdae8500109496fea4aff9c086e16cc25895" timestamp="1793221304"&gt;25&lt;/key&gt;&lt;/foreign-keys&gt;&lt;ref-type name="Book"&gt;6&lt;/ref-type&gt;&lt;contributors&gt;&lt;authors&gt;&lt;author&gt;Fujimoto, Richard M.&lt;/author&gt;&lt;/authors&gt;&lt;/contributors&gt;&lt;titles&gt;&lt;title&gt;Parallel and Distributed Simulation Systems&lt;/title&gt;&lt;secondary-title&gt;Wiley Series on Parallel and Distributed Computing&lt;/secondary-title&gt;&lt;/titles&gt;&lt;dates&gt;&lt;year&gt;2000&lt;/year&gt;&lt;/dates&gt;&lt;publisher&gt;John Wiley &amp;amp; Sons&lt;/publisher&gt;&lt;isbn&gt;978-0-471-18383-9&lt;/isbn&gt;&lt;label&gt;fujimoto2000&lt;/label&gt;&lt;urls&gt;&lt;/urls&gt;&lt;/record&gt;&lt;/Cite&gt;&lt;Cite&gt;&lt;Author&gt;Ofenloch&lt;/Author&gt;&lt;Year&gt;2022&lt;/Year&gt;&lt;RecNum&gt;62&lt;/RecNum&gt;&lt;record&gt;&lt;rec-number&gt;62&lt;/rec-number&gt;&lt;foreign-keys&gt;&lt;key app="EN" db-id="mdae8500109496fea4aff9c086e16cc25895" timestamp="1793221304"&gt;62&lt;/key&gt;&lt;/foreign-keys&gt;&lt;ref-type name="Conference Paper"&gt;47&lt;/ref-type&gt;&lt;contributors&gt;&lt;authors&gt;&lt;author&gt;Ofenloch, Annika&lt;/author&gt;&lt;author&gt;Schwarz, Jan Sören&lt;/author&gt;&lt;author&gt;Tolk, Deborah&lt;/author&gt;&lt;author&gt;Brandt, Tobias&lt;/author&gt;&lt;author&gt;Eilers, Reef&lt;/author&gt;&lt;author&gt;Ramirez, Rebeca&lt;/author&gt;&lt;author&gt;Raub, Thomas&lt;/author&gt;&lt;author&gt;Lehnhoff, Sebastian&lt;/author&gt;&lt;/authors&gt;&lt;/contributors&gt;&lt;titles&gt;&lt;title&gt;MOSAIK 3.0: Combining Time-Stepped and Discrete Event Simulation&lt;/title&gt;&lt;secondary-title&gt;2022 Open Source Modelling and Simulation of Energy Systems (OSMSES)&lt;/secondary-title&gt;&lt;/titles&gt;&lt;pages&gt;1-5&lt;/pages&gt;&lt;dates&gt;&lt;year&gt;2022&lt;/year&gt;&lt;/dates&gt;&lt;pub-location&gt;Aachen, Germany&lt;/pub-location&gt;&lt;publisher&gt;IEEE&lt;/publisher&gt;&lt;label&gt;ofenloch2022&lt;/label&gt;&lt;urls&gt;&lt;/urls&gt;&lt;electronic-resource-num&gt;10.1109/OSMSES54027.2022.9769116&lt;/electronic-resource-num&gt;&lt;/record&gt;&lt;/Cite&gt;&lt;/EndNote&gt;</w:instrText>
       </w:r>
       <w:r>
         <w:fldChar w:fldCharType="separate"/>
@@ -6709,7 +6709,7 @@
         <w:fldChar w:fldCharType="begin"/>
       </w:r>
       <w:r>
-        <w:instrText xml:space="preserve"> ADDIN EN.CITE &lt;EndNote&gt;&lt;Cite&gt;&lt;Author&gt;OPC Foundation&lt;/Author&gt;&lt;Year&gt;2026&lt;/Year&gt;&lt;RecNum&gt;65&lt;/RecNum&gt;&lt;DisplayText&gt;[50,56]&lt;/DisplayText&gt;&lt;record&gt;&lt;rec-number&gt;65&lt;/rec-number&gt;&lt;foreign-keys&gt;&lt;key app="EN" db-id="mdae8500109496fea4aff9c086e16cc25895" timestamp="1793216821"&gt;65&lt;/key&gt;&lt;/foreign-keys&gt;&lt;ref-type name="Standard"&gt;58&lt;/ref-type&gt;&lt;contributors&gt;&lt;authors&gt;&lt;author&gt;OPC Foundation&lt;/author&gt;&lt;/authors&gt;&lt;/contributors&gt;&lt;titles&gt;&lt;title&gt;OPC Unified Architecture – Part 8: Data Access&lt;/title&gt;&lt;secondary-title&gt;OPC 10000-8, Release 1.05.07&lt;/secondary-title&gt;&lt;/titles&gt;&lt;dates&gt;&lt;year&gt;2026&lt;/year&gt;&lt;/dates&gt;&lt;label&gt;opcua_part8&lt;/label&gt;&lt;urls&gt;&lt;related-urls&gt;&lt;url&gt;https://reference.opcfoundation.org/specs/OPC-10000-8&lt;/url&gt;&lt;/related-urls&gt;&lt;/urls&gt;&lt;/record&gt;&lt;/Cite&gt;&lt;Cite&gt;&lt;Author&gt;International Electrotechnical Commission&lt;/Author&gt;&lt;Year&gt;2010&lt;/Year&gt;&lt;RecNum&gt;36&lt;/RecNum&gt;&lt;record&gt;&lt;rec-number&gt;36&lt;/rec-number&gt;&lt;foreign-keys&gt;&lt;key app="EN" db-id="mdae8500109496fea4aff9c086e16cc25895" timestamp="1793216821"&gt;36&lt;/key&gt;&lt;/foreign-keys&gt;&lt;ref-type name="Standard"&gt;58&lt;/ref-type&gt;&lt;contributors&gt;&lt;authors&gt;&lt;author&gt;International Electrotechnical Commission&lt;/author&gt;&lt;/authors&gt;&lt;/contributors&gt;&lt;titles&gt;&lt;title&gt;Communication networks and systems for power utility automation – Part 7-3: Basic communication structure – Common data classes&lt;/title&gt;&lt;secondary-title&gt;IEC 61850-7-3:2010, Edition 2.0&lt;/secondary-title&gt;&lt;/titles&gt;&lt;dates&gt;&lt;year&gt;2010&lt;/year&gt;&lt;/dates&gt;&lt;isbn&gt;978-2-88912-258-5&lt;/isbn&gt;&lt;label&gt;iec61850_7_3&lt;/label&gt;&lt;urls&gt;&lt;related-urls&gt;&lt;url&gt;https://webstore.iec.ch/en/publication/6016&lt;/url&gt;&lt;/related-urls&gt;&lt;/urls&gt;&lt;/record&gt;&lt;/Cite&gt;&lt;/EndNote&gt;</w:instrText>
+        <w:instrText xml:space="preserve"> ADDIN EN.CITE &lt;EndNote&gt;&lt;Cite&gt;&lt;Author&gt;OPC Foundation&lt;/Author&gt;&lt;Year&gt;2026&lt;/Year&gt;&lt;RecNum&gt;65&lt;/RecNum&gt;&lt;DisplayText&gt;[50,56]&lt;/DisplayText&gt;&lt;record&gt;&lt;rec-number&gt;65&lt;/rec-number&gt;&lt;foreign-keys&gt;&lt;key app="EN" db-id="mdae8500109496fea4aff9c086e16cc25895" timestamp="1793221304"&gt;65&lt;/key&gt;&lt;/foreign-keys&gt;&lt;ref-type name="Standard"&gt;58&lt;/ref-type&gt;&lt;contributors&gt;&lt;authors&gt;&lt;author&gt;OPC Foundation&lt;/author&gt;&lt;/authors&gt;&lt;/contributors&gt;&lt;titles&gt;&lt;title&gt;OPC Unified Architecture – Part 8: Data Access&lt;/title&gt;&lt;secondary-title&gt;OPC 10000-8, Release 1.05.07&lt;/secondary-title&gt;&lt;/titles&gt;&lt;dates&gt;&lt;year&gt;2026&lt;/year&gt;&lt;/dates&gt;&lt;label&gt;opcua_part8&lt;/label&gt;&lt;urls&gt;&lt;related-urls&gt;&lt;url&gt;https://reference.opcfoundation.org/specs/OPC-10000-8&lt;/url&gt;&lt;/related-urls&gt;&lt;/urls&gt;&lt;/record&gt;&lt;/Cite&gt;&lt;Cite&gt;&lt;Author&gt;International Electrotechnical Commission&lt;/Author&gt;&lt;Year&gt;2010&lt;/Year&gt;&lt;RecNum&gt;36&lt;/RecNum&gt;&lt;record&gt;&lt;rec-number&gt;36&lt;/rec-number&gt;&lt;foreign-keys&gt;&lt;key app="EN" db-id="mdae8500109496fea4aff9c086e16cc25895" timestamp="1793221304"&gt;36&lt;/key&gt;&lt;/foreign-keys&gt;&lt;ref-type name="Standard"&gt;58&lt;/ref-type&gt;&lt;contributors&gt;&lt;authors&gt;&lt;author&gt;International Electrotechnical Commission&lt;/author&gt;&lt;/authors&gt;&lt;/contributors&gt;&lt;titles&gt;&lt;title&gt;Communication networks and systems for power utility automation – Part 7-3: Basic communication structure – Common data classes&lt;/title&gt;&lt;secondary-title&gt;IEC 61850-7-3:2010, Edition 2.0&lt;/secondary-title&gt;&lt;/titles&gt;&lt;dates&gt;&lt;year&gt;2010&lt;/year&gt;&lt;/dates&gt;&lt;isbn&gt;978-2-88912-258-5&lt;/isbn&gt;&lt;label&gt;iec61850_7_3&lt;/label&gt;&lt;urls&gt;&lt;related-urls&gt;&lt;url&gt;https://webstore.iec.ch/en/publication/6016&lt;/url&gt;&lt;/related-urls&gt;&lt;/urls&gt;&lt;/record&gt;&lt;/Cite&gt;&lt;/EndNote&gt;</w:instrText>
       </w:r>
       <w:r>
         <w:fldChar w:fldCharType="separate"/>
@@ -6745,7 +6745,7 @@
         <w:fldChar w:fldCharType="begin"/>
       </w:r>
       <w:r>
-        <w:instrText xml:space="preserve"> ADDIN EN.CITE &lt;EndNote&gt;&lt;Cite&gt;&lt;Author&gt;Chen&lt;/Author&gt;&lt;Year&gt;2015&lt;/Year&gt;&lt;RecNum&gt;12&lt;/RecNum&gt;&lt;DisplayText&gt;[34,52]&lt;/DisplayText&gt;&lt;record&gt;&lt;rec-number&gt;12&lt;/rec-number&gt;&lt;foreign-keys&gt;&lt;key app="EN" db-id="mdae8500109496fea4aff9c086e16cc25895" timestamp="1793216821"&gt;12&lt;/key&gt;&lt;/foreign-keys&gt;&lt;ref-type name="Journal Article"&gt;17&lt;/ref-type&gt;&lt;contributors&gt;&lt;authors&gt;&lt;author&gt;Chen, Yunji&lt;/author&gt;&lt;author&gt;Zhang, Shijin&lt;/author&gt;&lt;author&gt;Guo, Qi&lt;/author&gt;&lt;author&gt;Li, Ling&lt;/author&gt;&lt;author&gt;Wu, Ruiyang&lt;/author&gt;&lt;author&gt;Chen, Tianshi&lt;/author&gt;&lt;/authors&gt;&lt;/contributors&gt;&lt;titles&gt;&lt;title&gt;Deterministic Replay: A Survey&lt;/title&gt;&lt;secondary-title&gt;ACM Computing Surveys&lt;/secondary-title&gt;&lt;alt-title&gt;ACM Comput. Surv.&lt;/alt-title&gt;&lt;/titles&gt;&lt;periodical&gt;&lt;full-title&gt;ACM Computing Surveys&lt;/full-title&gt;&lt;abbr-1&gt;ACM Comput. Surv.&lt;/abbr-1&gt;&lt;/periodical&gt;&lt;pages&gt;1-47&lt;/pages&gt;&lt;volume&gt;48&lt;/volume&gt;&lt;number&gt;2&lt;/number&gt;&lt;dates&gt;&lt;year&gt;2015&lt;/year&gt;&lt;/dates&gt;&lt;publisher&gt;ACM&lt;/publisher&gt;&lt;label&gt;chen2015replay&lt;/label&gt;&lt;urls&gt;&lt;/urls&gt;&lt;electronic-resource-num&gt;10.1145/2790077&lt;/electronic-resource-num&gt;&lt;/record&gt;&lt;/Cite&gt;&lt;Cite&gt;&lt;Author&gt;HELICS developers (GMLC-TDC)&lt;/Author&gt;&lt;Year&gt;2026&lt;/Year&gt;&lt;RecNum&gt;31&lt;/RecNum&gt;&lt;record&gt;&lt;rec-number&gt;31&lt;/rec-number&gt;&lt;foreign-keys&gt;&lt;key app="EN" db-id="mdae8500109496fea4aff9c086e16cc25895" timestamp="1793216821"&gt;31&lt;/key&gt;&lt;/foreign-keys&gt;&lt;ref-type name="Web Page"&gt;12&lt;/ref-type&gt;&lt;contributors&gt;&lt;authors&gt;&lt;author&gt;HELICS developers (GMLC-TDC)&lt;/author&gt;&lt;/authors&gt;&lt;/contributors&gt;&lt;titles&gt;&lt;title&gt;HELICS documentation&lt;/title&gt;&lt;/titles&gt;&lt;dates&gt;&lt;year&gt;2026&lt;/year&gt;&lt;/dates&gt;&lt;label&gt;helics_docs&lt;/label&gt;&lt;urls&gt;&lt;related-urls&gt;&lt;url&gt;https://docs.helics.org/en/latest/&lt;/url&gt;&lt;/related-urls&gt;&lt;/urls&gt;&lt;access-date&gt;2026-10-28&lt;/access-date&gt;&lt;/record&gt;&lt;/Cite&gt;&lt;/EndNote&gt;</w:instrText>
+        <w:instrText xml:space="preserve"> ADDIN EN.CITE &lt;EndNote&gt;&lt;Cite&gt;&lt;Author&gt;Chen&lt;/Author&gt;&lt;Year&gt;2015&lt;/Year&gt;&lt;RecNum&gt;12&lt;/RecNum&gt;&lt;DisplayText&gt;[34,52]&lt;/DisplayText&gt;&lt;record&gt;&lt;rec-number&gt;12&lt;/rec-number&gt;&lt;foreign-keys&gt;&lt;key app="EN" db-id="mdae8500109496fea4aff9c086e16cc25895" timestamp="1793221304"&gt;12&lt;/key&gt;&lt;/foreign-keys&gt;&lt;ref-type name="Journal Article"&gt;17&lt;/ref-type&gt;&lt;contributors&gt;&lt;authors&gt;&lt;author&gt;Chen, Yunji&lt;/author&gt;&lt;author&gt;Zhang, Shijin&lt;/author&gt;&lt;author&gt;Guo, Qi&lt;/author&gt;&lt;author&gt;Li, Ling&lt;/author&gt;&lt;author&gt;Wu, Ruiyang&lt;/author&gt;&lt;author&gt;Chen, Tianshi&lt;/author&gt;&lt;/authors&gt;&lt;/contributors&gt;&lt;titles&gt;&lt;title&gt;Deterministic Replay: A Survey&lt;/title&gt;&lt;secondary-title&gt;ACM Computing Surveys&lt;/secondary-title&gt;&lt;alt-title&gt;ACM Comput. Surv.&lt;/alt-title&gt;&lt;/titles&gt;&lt;periodical&gt;&lt;full-title&gt;ACM Computing Surveys&lt;/full-title&gt;&lt;abbr-1&gt;ACM Comput. Surv.&lt;/abbr-1&gt;&lt;/periodical&gt;&lt;pages&gt;1-47&lt;/pages&gt;&lt;volume&gt;48&lt;/volume&gt;&lt;number&gt;2&lt;/number&gt;&lt;dates&gt;&lt;year&gt;2015&lt;/year&gt;&lt;/dates&gt;&lt;publisher&gt;ACM&lt;/publisher&gt;&lt;label&gt;chen2015replay&lt;/label&gt;&lt;urls&gt;&lt;/urls&gt;&lt;electronic-resource-num&gt;10.1145/2790077&lt;/electronic-resource-num&gt;&lt;/record&gt;&lt;/Cite&gt;&lt;Cite&gt;&lt;Author&gt;HELICS developers (GMLC-TDC)&lt;/Author&gt;&lt;Year&gt;2026&lt;/Year&gt;&lt;RecNum&gt;31&lt;/RecNum&gt;&lt;record&gt;&lt;rec-number&gt;31&lt;/rec-number&gt;&lt;foreign-keys&gt;&lt;key app="EN" db-id="mdae8500109496fea4aff9c086e16cc25895" timestamp="1793221304"&gt;31&lt;/key&gt;&lt;/foreign-keys&gt;&lt;ref-type name="Web Page"&gt;12&lt;/ref-type&gt;&lt;contributors&gt;&lt;authors&gt;&lt;author&gt;HELICS developers (GMLC-TDC)&lt;/author&gt;&lt;/authors&gt;&lt;/contributors&gt;&lt;titles&gt;&lt;title&gt;HELICS documentation&lt;/title&gt;&lt;/titles&gt;&lt;dates&gt;&lt;year&gt;2026&lt;/year&gt;&lt;/dates&gt;&lt;label&gt;helics_docs&lt;/label&gt;&lt;urls&gt;&lt;related-urls&gt;&lt;url&gt;https://docs.helics.org/en/latest/&lt;/url&gt;&lt;/related-urls&gt;&lt;/urls&gt;&lt;access-date&gt;2026-10-28&lt;/access-date&gt;&lt;/record&gt;&lt;/Cite&gt;&lt;/EndNote&gt;</w:instrText>
       </w:r>
       <w:r>
         <w:fldChar w:fldCharType="separate"/>
@@ -6781,7 +6781,7 @@
         <w:fldChar w:fldCharType="begin"/>
       </w:r>
       <w:r>
-        <w:instrText xml:space="preserve"> ADDIN EN.CITE &lt;EndNote&gt;&lt;Cite&gt;&lt;Author&gt;Moreau&lt;/Author&gt;&lt;Year&gt;2013&lt;/Year&gt;&lt;RecNum&gt;55&lt;/RecNum&gt;&lt;DisplayText&gt;[51]&lt;/DisplayText&gt;&lt;record&gt;&lt;rec-number&gt;55&lt;/rec-number&gt;&lt;foreign-keys&gt;&lt;key app="EN" db-id="mdae8500109496fea4aff9c086e16cc25895" timestamp="1793216821"&gt;55&lt;/key&gt;&lt;/foreign-keys&gt;&lt;ref-type name="Standard"&gt;58&lt;/ref-type&gt;&lt;contributors&gt;&lt;authors&gt;&lt;author&gt;Moreau, Luc&lt;/author&gt;&lt;author&gt;Missier, Paolo&lt;/author&gt;&lt;/authors&gt;&lt;/contributors&gt;&lt;titles&gt;&lt;title&gt;PROV-DM: The PROV Data Model&lt;/title&gt;&lt;secondary-title&gt;W3C Recommendation&lt;/secondary-title&gt;&lt;/titles&gt;&lt;dates&gt;&lt;year&gt;2013&lt;/year&gt;&lt;/dates&gt;&lt;publisher&gt;World Wide Web Consortium (W3C)&lt;/publisher&gt;&lt;label&gt;moreau2013prov&lt;/label&gt;&lt;urls&gt;&lt;related-urls&gt;&lt;url&gt;https://www.w3.org/TR/2013/REC-prov-dm-20130430/&lt;/url&gt;&lt;/related-urls&gt;&lt;/urls&gt;&lt;/record&gt;&lt;/Cite&gt;&lt;/EndNote&gt;</w:instrText>
+        <w:instrText xml:space="preserve"> ADDIN EN.CITE &lt;EndNote&gt;&lt;Cite&gt;&lt;Author&gt;Moreau&lt;/Author&gt;&lt;Year&gt;2013&lt;/Year&gt;&lt;RecNum&gt;55&lt;/RecNum&gt;&lt;DisplayText&gt;[51]&lt;/DisplayText&gt;&lt;record&gt;&lt;rec-number&gt;55&lt;/rec-number&gt;&lt;foreign-keys&gt;&lt;key app="EN" db-id="mdae8500109496fea4aff9c086e16cc25895" timestamp="1793221304"&gt;55&lt;/key&gt;&lt;/foreign-keys&gt;&lt;ref-type name="Standard"&gt;58&lt;/ref-type&gt;&lt;contributors&gt;&lt;authors&gt;&lt;author&gt;Moreau, Luc&lt;/author&gt;&lt;author&gt;Missier, Paolo&lt;/author&gt;&lt;/authors&gt;&lt;/contributors&gt;&lt;titles&gt;&lt;title&gt;PROV-DM: The PROV Data Model&lt;/title&gt;&lt;secondary-title&gt;W3C Recommendation&lt;/secondary-title&gt;&lt;/titles&gt;&lt;dates&gt;&lt;year&gt;2013&lt;/year&gt;&lt;/dates&gt;&lt;publisher&gt;World Wide Web Consortium (W3C)&lt;/publisher&gt;&lt;label&gt;moreau2013prov&lt;/label&gt;&lt;urls&gt;&lt;related-urls&gt;&lt;url&gt;https://www.w3.org/TR/2013/REC-prov-dm-20130430/&lt;/url&gt;&lt;/related-urls&gt;&lt;/urls&gt;&lt;/record&gt;&lt;/Cite&gt;&lt;/EndNote&gt;</w:instrText>
       </w:r>
       <w:r>
         <w:fldChar w:fldCharType="separate"/>
@@ -6933,7 +6933,7 @@
 PjxSZWNOdW0+MzM8L1JlY051bT48RGlzcGxheVRleHQ+WzU0LDU1XTwvRGlzcGxheVRleHQ+PHJl
 Y29yZD48cmVjLW51bWJlcj4zMzwvcmVjLW51bWJlcj48Zm9yZWlnbi1rZXlzPjxrZXkgYXBwPSJF
 TiIgZGItaWQ9Im1kYWU4NTAwMTA5NDk2ZmVhNGFmZjljMDg2ZTE2Y2MyNTg5NSIgdGltZXN0YW1w
-PSIxNzkzMjE2ODIxIj4zMzwva2V5PjwvZm9yZWlnbi1rZXlzPjxyZWYtdHlwZSBuYW1lPSJKb3Vy
+PSIxNzkzMjIxMzA0Ij4zMzwva2V5PjwvZm9yZWlnbi1rZXlzPjxyZWYtdHlwZSBuYW1lPSJKb3Vy
 bmFsIEFydGljbGUiPjE3PC9yZWYtdHlwZT48Y29udHJpYnV0b3JzPjxhdXRob3JzPjxhdXRob3I+
 SGVuemluZ2VyLCBULiBBLjwvYXV0aG9yPjxhdXRob3I+SG9yb3dpdHosIEIuPC9hdXRob3I+PGF1
 dGhvcj5LaXJzY2gsIEMuIE0uPC9hdXRob3I+PC9hdXRob3JzPjwvY29udHJpYnV0b3JzPjx0aXRs
@@ -6949,7 +6949,7 @@
 Y29yZD48L0NpdGU+PENpdGU+PEF1dGhvcj5Mb2hzdHJvaDwvQXV0aG9yPjxZZWFyPjIwMjE8L1ll
 YXI+PFJlY051bT41MzwvUmVjTnVtPjxyZWNvcmQ+PHJlYy1udW1iZXI+NTM8L3JlYy1udW1iZXI+
 PGZvcmVpZ24ta2V5cz48a2V5IGFwcD0iRU4iIGRiLWlkPSJtZGFlODUwMDEwOTQ5NmZlYTRhZmY5
-YzA4NmUxNmNjMjU4OTUiIHRpbWVzdGFtcD0iMTc5MzIxNjgyMSI+NTM8L2tleT48L2ZvcmVpZ24t
+YzA4NmUxNmNjMjU4OTUiIHRpbWVzdGFtcD0iMTc5MzIyMTMwNCI+NTM8L2tleT48L2ZvcmVpZ24t
 a2V5cz48cmVmLXR5cGUgbmFtZT0iSm91cm5hbCBBcnRpY2xlIj4xNzwvcmVmLXR5cGU+PGNvbnRy
 aWJ1dG9ycz48YXV0aG9ycz48YXV0aG9yPkxvaHN0cm9oLCBNYXJ0ZW48L2F1dGhvcj48YXV0aG9y
 Pk1lbmFyZCwgQ2hyaXN0aWFuPC9hdXRob3I+PGF1dGhvcj5CYXRlbmksIFNvcm91c2g8L2F1dGhv
@@ -6976,7 +6976,7 @@
 PjxSZWNOdW0+MzM8L1JlY051bT48RGlzcGxheVRleHQ+WzU0LDU1XTwvRGlzcGxheVRleHQ+PHJl
 Y29yZD48cmVjLW51bWJlcj4zMzwvcmVjLW51bWJlcj48Zm9yZWlnbi1rZXlzPjxrZXkgYXBwPSJF
 TiIgZGItaWQ9Im1kYWU4NTAwMTA5NDk2ZmVhNGFmZjljMDg2ZTE2Y2MyNTg5NSIgdGltZXN0YW1w
-PSIxNzkzMjE2ODIxIj4zMzwva2V5PjwvZm9yZWlnbi1rZXlzPjxyZWYtdHlwZSBuYW1lPSJKb3Vy
+PSIxNzkzMjIxMzA0Ij4zMzwva2V5PjwvZm9yZWlnbi1rZXlzPjxyZWYtdHlwZSBuYW1lPSJKb3Vy
 bmFsIEFydGljbGUiPjE3PC9yZWYtdHlwZT48Y29udHJpYnV0b3JzPjxhdXRob3JzPjxhdXRob3I+
 SGVuemluZ2VyLCBULiBBLjwvYXV0aG9yPjxhdXRob3I+SG9yb3dpdHosIEIuPC9hdXRob3I+PGF1
 dGhvcj5LaXJzY2gsIEMuIE0uPC9hdXRob3I+PC9hdXRob3JzPjwvY29udHJpYnV0b3JzPjx0aXRs
@@ -6992,7 +6992,7 @@
 Y29yZD48L0NpdGU+PENpdGU+PEF1dGhvcj5Mb2hzdHJvaDwvQXV0aG9yPjxZZWFyPjIwMjE8L1ll
 YXI+PFJlY051bT41MzwvUmVjTnVtPjxyZWNvcmQ+PHJlYy1udW1iZXI+NTM8L3JlYy1udW1iZXI+
 PGZvcmVpZ24ta2V5cz48a2V5IGFwcD0iRU4iIGRiLWlkPSJtZGFlODUwMDEwOTQ5NmZlYTRhZmY5
-YzA4NmUxNmNjMjU4OTUiIHRpbWVzdGFtcD0iMTc5MzIxNjgyMSI+NTM8L2tleT48L2ZvcmVpZ24t
+YzA4NmUxNmNjMjU4OTUiIHRpbWVzdGFtcD0iMTc5MzIyMTMwNCI+NTM8L2tleT48L2ZvcmVpZ24t
 a2V5cz48cmVmLXR5cGUgbmFtZT0iSm91cm5hbCBBcnRpY2xlIj4xNzwvcmVmLXR5cGU+PGNvbnRy
 aWJ1dG9ycz48YXV0aG9ycz48YXV0aG9yPkxvaHN0cm9oLCBNYXJ0ZW48L2F1dGhvcj48YXV0aG9y
 Pk1lbmFyZCwgQ2hyaXN0aWFuPC9hdXRob3I+PGF1dGhvcj5CYXRlbmksIFNvcm91c2g8L2F1dGhv
@@ -7138,7 +7138,7 @@
         <w:fldChar w:fldCharType="begin"/>
       </w:r>
       <w:r>
-        <w:instrText xml:space="preserve"> ADDIN EN.CITE &lt;EndNote&gt;&lt;Cite&gt;&lt;Author&gt;U.S. Department of Energy&lt;/Author&gt;&lt;Year&gt;2024&lt;/Year&gt;&lt;RecNum&gt;20&lt;/RecNum&gt;&lt;DisplayText&gt;[21]&lt;/DisplayText&gt;&lt;record&gt;&lt;rec-number&gt;20&lt;/rec-number&gt;&lt;foreign-keys&gt;&lt;key app="EN" db-id="mdae8500109496fea4aff9c086e16cc25895" timestamp="1793216821"&gt;20&lt;/key&gt;&lt;/foreign-keys&gt;&lt;ref-type name="Web Page"&gt;12&lt;/ref-type&gt;&lt;contributors&gt;&lt;authors&gt;&lt;author&gt;U.S. Department of Energy&lt;/author&gt;&lt;/authors&gt;&lt;/contributors&gt;&lt;titles&gt;&lt;title&gt;EnergyPlus Output Details and Examples: eplusout.rdd&lt;/title&gt;&lt;/titles&gt;&lt;dates&gt;&lt;year&gt;2024&lt;/year&gt;&lt;/dates&gt;&lt;label&gt;doe2024rdd&lt;/label&gt;&lt;urls&gt;&lt;related-urls&gt;&lt;url&gt;https://bigladdersoftware.com/epx/docs/24-1/output-details-and-examples/eplusout-rdd.html&lt;/url&gt;&lt;/related-urls&gt;&lt;/urls&gt;&lt;access-date&gt;2026-10-28&lt;/access-date&gt;&lt;/record&gt;&lt;/Cite&gt;&lt;/EndNote&gt;</w:instrText>
+        <w:instrText xml:space="preserve"> ADDIN EN.CITE &lt;EndNote&gt;&lt;Cite&gt;&lt;Author&gt;U.S. Department of Energy&lt;/Author&gt;&lt;Year&gt;2024&lt;/Year&gt;&lt;RecNum&gt;20&lt;/RecNum&gt;&lt;DisplayText&gt;[21]&lt;/DisplayText&gt;&lt;record&gt;&lt;rec-number&gt;20&lt;/rec-number&gt;&lt;foreign-keys&gt;&lt;key app="EN" db-id="mdae8500109496fea4aff9c086e16cc25895" timestamp="1793221304"&gt;20&lt;/key&gt;&lt;/foreign-keys&gt;&lt;ref-type name="Web Page"&gt;12&lt;/ref-type&gt;&lt;contributors&gt;&lt;authors&gt;&lt;author&gt;U.S. Department of Energy&lt;/author&gt;&lt;/authors&gt;&lt;/contributors&gt;&lt;titles&gt;&lt;title&gt;EnergyPlus Output Details and Examples: eplusout.rdd&lt;/title&gt;&lt;/titles&gt;&lt;dates&gt;&lt;year&gt;2024&lt;/year&gt;&lt;/dates&gt;&lt;label&gt;doe2024rdd&lt;/label&gt;&lt;urls&gt;&lt;related-urls&gt;&lt;url&gt;https://bigladdersoftware.com/epx/docs/24-1/output-details-and-examples/eplusout-rdd.html&lt;/url&gt;&lt;/related-urls&gt;&lt;/urls&gt;&lt;access-date&gt;2026-10-28&lt;/access-date&gt;&lt;/record&gt;&lt;/Cite&gt;&lt;/EndNote&gt;</w:instrText>
       </w:r>
       <w:r>
         <w:fldChar w:fldCharType="separate"/>
@@ -7167,7 +7167,7 @@
         <w:fldChar w:fldCharType="begin"/>
       </w:r>
       <w:r>
-        <w:instrText xml:space="preserve"> ADDIN EN.CITE &lt;EndNote&gt;&lt;Cite&gt;&lt;Author&gt;U.S. Department of Energy&lt;/Author&gt;&lt;Year&gt;2018&lt;/Year&gt;&lt;RecNum&gt;18&lt;/RecNum&gt;&lt;DisplayText&gt;[39,40]&lt;/DisplayText&gt;&lt;record&gt;&lt;rec-number&gt;18&lt;/rec-number&gt;&lt;foreign-keys&gt;&lt;key app="EN" db-id="mdae8500109496fea4aff9c086e16cc25895" timestamp="1793216821"&gt;18&lt;/key&gt;&lt;/foreign-keys&gt;&lt;ref-type name="Web Page"&gt;12&lt;/ref-type&gt;&lt;contributors&gt;&lt;authors&gt;&lt;author&gt;U.S. Department of Energy&lt;/author&gt;&lt;/authors&gt;&lt;/contributors&gt;&lt;titles&gt;&lt;title&gt;EnergyPlus External Interface(s) Application Guide: BCVTB Examples&lt;/title&gt;&lt;/titles&gt;&lt;dates&gt;&lt;year&gt;2018&lt;/year&gt;&lt;/dates&gt;&lt;label&gt;doe_extif&lt;/label&gt;&lt;urls&gt;&lt;related-urls&gt;&lt;url&gt;https://bigladdersoftware.com/epx/docs/9-0/external-interfaces-application-guide/bcvtb-examples.html&lt;/url&gt;&lt;/related-urls&gt;&lt;/urls&gt;&lt;access-date&gt;2026-10-28&lt;/access-date&gt;&lt;/record&gt;&lt;/Cite&gt;&lt;Cite&gt;&lt;Author&gt;Lawrence Berkeley National Laboratory&lt;/Author&gt;&lt;Year&gt;2021&lt;/Year&gt;&lt;RecNum&gt;48&lt;/RecNum&gt;&lt;record&gt;&lt;rec-number&gt;48&lt;/rec-number&gt;&lt;foreign-keys&gt;&lt;key app="EN" db-id="mdae8500109496fea4aff9c086e16cc25895" timestamp="1793216821"&gt;48&lt;/key&gt;&lt;/foreign-keys&gt;&lt;ref-type name="Web Page"&gt;12&lt;/ref-type&gt;&lt;contributors&gt;&lt;authors&gt;&lt;author&gt;Lawrence Berkeley National Laboratory&lt;/author&gt;&lt;/authors&gt;&lt;/contributors&gt;&lt;titles&gt;&lt;title&gt;FMU Export of EnergyPlus User Guide, Section 5: Usage of EnergyPlus as an FMU&lt;/title&gt;&lt;/titles&gt;&lt;dates&gt;&lt;year&gt;2021&lt;/year&gt;&lt;/dates&gt;&lt;label&gt;lbnl_fmuexport&lt;/label&gt;&lt;urls&gt;&lt;related-urls&gt;&lt;url&gt;https://simulationresearch.lbl.gov/fmu/EnergyPlus/export/userGuide/usage.html&lt;/url&gt;&lt;/related-urls&gt;&lt;/urls&gt;&lt;access-date&gt;2026-10-28&lt;/access-date&gt;&lt;/record&gt;&lt;/Cite&gt;&lt;/EndNote&gt;</w:instrText>
+        <w:instrText xml:space="preserve"> ADDIN EN.CITE &lt;EndNote&gt;&lt;Cite&gt;&lt;Author&gt;U.S. Department of Energy&lt;/Author&gt;&lt;Year&gt;2018&lt;/Year&gt;&lt;RecNum&gt;18&lt;/RecNum&gt;&lt;DisplayText&gt;[39,40]&lt;/DisplayText&gt;&lt;record&gt;&lt;rec-number&gt;18&lt;/rec-number&gt;&lt;foreign-keys&gt;&lt;key app="EN" db-id="mdae8500109496fea4aff9c086e16cc25895" timestamp="1793221304"&gt;18&lt;/key&gt;&lt;/foreign-keys&gt;&lt;ref-type name="Web Page"&gt;12&lt;/ref-type&gt;&lt;contributors&gt;&lt;authors&gt;&lt;author&gt;U.S. Department of Energy&lt;/author&gt;&lt;/authors&gt;&lt;/contributors&gt;&lt;titles&gt;&lt;title&gt;EnergyPlus External Interface(s) Application Guide: BCVTB Examples&lt;/title&gt;&lt;/titles&gt;&lt;dates&gt;&lt;year&gt;2018&lt;/year&gt;&lt;/dates&gt;&lt;label&gt;doe_extif&lt;/label&gt;&lt;urls&gt;&lt;related-urls&gt;&lt;url&gt;https://bigladdersoftware.com/epx/docs/9-0/external-interfaces-application-guide/bcvtb-examples.html&lt;/url&gt;&lt;/related-urls&gt;&lt;/urls&gt;&lt;access-date&gt;2026-10-28&lt;/access-date&gt;&lt;/record&gt;&lt;/Cite&gt;&lt;Cite&gt;&lt;Author&gt;Lawrence Berkeley National Laboratory&lt;/Author&gt;&lt;Year&gt;2021&lt;/Year&gt;&lt;RecNum&gt;48&lt;/RecNum&gt;&lt;record&gt;&lt;rec-number&gt;48&lt;/rec-number&gt;&lt;foreign-keys&gt;&lt;key app="EN" db-id="mdae8500109496fea4aff9c086e16cc25895" timestamp="1793221304"&gt;48&lt;/key&gt;&lt;/foreign-keys&gt;&lt;ref-type name="Web Page"&gt;12&lt;/ref-type&gt;&lt;contributors&gt;&lt;authors&gt;&lt;author&gt;Lawrence Berkeley National Laboratory&lt;/author&gt;&lt;/authors&gt;&lt;/contributors&gt;&lt;titles&gt;&lt;title&gt;FMU Export of EnergyPlus User Guide, Section 5: Usage of EnergyPlus as an FMU&lt;/title&gt;&lt;/titles&gt;&lt;dates&gt;&lt;year&gt;2021&lt;/year&gt;&lt;/dates&gt;&lt;label&gt;lbnl_fmuexport&lt;/label&gt;&lt;urls&gt;&lt;related-urls&gt;&lt;url&gt;https://simulationresearch.lbl.gov/fmu/EnergyPlus/export/userGuide/usage.html&lt;/url&gt;&lt;/related-urls&gt;&lt;/urls&gt;&lt;access-date&gt;2026-10-28&lt;/access-date&gt;&lt;/record&gt;&lt;/Cite&gt;&lt;/EndNote&gt;</w:instrText>
       </w:r>
       <w:r>
         <w:fldChar w:fldCharType="separate"/>
@@ -7215,7 +7215,7 @@
         <w:fldChar w:fldCharType="begin"/>
       </w:r>
       <w:r>
-        <w:instrText xml:space="preserve"> ADDIN EN.CITE &lt;EndNote&gt;&lt;Cite&gt;&lt;Author&gt;Dobos&lt;/Author&gt;&lt;Year&gt;2014&lt;/Year&gt;&lt;RecNum&gt;17&lt;/RecNum&gt;&lt;DisplayText&gt;[57]&lt;/DisplayText&gt;&lt;record&gt;&lt;rec-number&gt;17&lt;/rec-number&gt;&lt;foreign-keys&gt;&lt;key app="EN" db-id="mdae8500109496fea4aff9c086e16cc25895" timestamp="1793216821"&gt;17&lt;/key&gt;&lt;/foreign-keys&gt;&lt;ref-type name="Report"&gt;27&lt;/ref-type&gt;&lt;contributors&gt;&lt;authors&gt;&lt;author&gt;Dobos, A. P.&lt;/author&gt;&lt;/authors&gt;&lt;/contributors&gt;&lt;titles&gt;&lt;title&gt;PVWatts Version 5 Manual&lt;/title&gt;&lt;/titles&gt;&lt;dates&gt;&lt;year&gt;2014&lt;/year&gt;&lt;/dates&gt;&lt;pub-location&gt;Golden, CO&lt;/pub-location&gt;&lt;publisher&gt;National Renewable Energy Laboratory&lt;/publisher&gt;&lt;isbn&gt;NREL/TP-6A20-62641&lt;/isbn&gt;&lt;label&gt;dobos2014&lt;/label&gt;&lt;work-type&gt;Technical Report&lt;/work-type&gt;&lt;urls&gt;&lt;/urls&gt;&lt;electronic-resource-num&gt;10.2172/1158421&lt;/electronic-resource-num&gt;&lt;/record&gt;&lt;/Cite&gt;&lt;/EndNote&gt;</w:instrText>
+        <w:instrText xml:space="preserve"> ADDIN EN.CITE &lt;EndNote&gt;&lt;Cite&gt;&lt;Author&gt;Dobos&lt;/Author&gt;&lt;Year&gt;2014&lt;/Year&gt;&lt;RecNum&gt;17&lt;/RecNum&gt;&lt;DisplayText&gt;[57]&lt;/DisplayText&gt;&lt;record&gt;&lt;rec-number&gt;17&lt;/rec-number&gt;&lt;foreign-keys&gt;&lt;key app="EN" db-id="mdae8500109496fea4aff9c086e16cc25895" timestamp="1793221304"&gt;17&lt;/key&gt;&lt;/foreign-keys&gt;&lt;ref-type name="Report"&gt;27&lt;/ref-type&gt;&lt;contributors&gt;&lt;authors&gt;&lt;author&gt;Dobos, A. P.&lt;/author&gt;&lt;/authors&gt;&lt;/contributors&gt;&lt;titles&gt;&lt;title&gt;PVWatts Version 5 Manual&lt;/title&gt;&lt;/titles&gt;&lt;dates&gt;&lt;year&gt;2014&lt;/year&gt;&lt;/dates&gt;&lt;pub-location&gt;Golden, CO&lt;/pub-location&gt;&lt;publisher&gt;National Renewable Energy Laboratory&lt;/publisher&gt;&lt;isbn&gt;NREL/TP-6A20-62641&lt;/isbn&gt;&lt;label&gt;dobos2014&lt;/label&gt;&lt;work-type&gt;Technical Report&lt;/work-type&gt;&lt;urls&gt;&lt;/urls&gt;&lt;electronic-resource-num&gt;10.2172/1158421&lt;/electronic-resource-num&gt;&lt;/record&gt;&lt;/Cite&gt;&lt;/EndNote&gt;</w:instrText>
       </w:r>
       <w:r>
         <w:fldChar w:fldCharType="separate"/>
@@ -7236,7 +7236,7 @@
         <w:fldChar w:fldCharType="begin"/>
       </w:r>
       <w:r>
-        <w:instrText xml:space="preserve"> ADDIN EN.CITE &lt;EndNote&gt;&lt;Cite&gt;&lt;Author&gt;Federal Highway Administration&lt;/Author&gt;&lt;Year&gt;2017&lt;/Year&gt;&lt;RecNum&gt;22&lt;/RecNum&gt;&lt;DisplayText&gt;[58]&lt;/DisplayText&gt;&lt;record&gt;&lt;rec-number&gt;22&lt;/rec-number&gt;&lt;foreign-keys&gt;&lt;key app="EN" db-id="mdae8500109496fea4aff9c086e16cc25895" timestamp="1793216821"&gt;22&lt;/key&gt;&lt;/foreign-keys&gt;&lt;ref-type name="Web Page"&gt;12&lt;/ref-type&gt;&lt;contributors&gt;&lt;authors&gt;&lt;author&gt;Federal Highway Administration&lt;/author&gt;&lt;/authors&gt;&lt;/contributors&gt;&lt;titles&gt;&lt;title&gt;2017 National Household Travel Survey&lt;/title&gt;&lt;/titles&gt;&lt;dates&gt;&lt;year&gt;2017&lt;/year&gt;&lt;/dates&gt;&lt;publisher&gt;U.S. Department of Transportation&lt;/publisher&gt;&lt;label&gt;fhwa2017&lt;/label&gt;&lt;urls&gt;&lt;related-urls&gt;&lt;url&gt;https://nhts.ornl.gov&lt;/url&gt;&lt;/related-urls&gt;&lt;/urls&gt;&lt;access-date&gt;2026-10-28&lt;/access-date&gt;&lt;/record&gt;&lt;/Cite&gt;&lt;/EndNote&gt;</w:instrText>
+        <w:instrText xml:space="preserve"> ADDIN EN.CITE &lt;EndNote&gt;&lt;Cite&gt;&lt;Author&gt;Federal Highway Administration&lt;/Author&gt;&lt;Year&gt;2017&lt;/Year&gt;&lt;RecNum&gt;22&lt;/RecNum&gt;&lt;DisplayText&gt;[58]&lt;/DisplayText&gt;&lt;record&gt;&lt;rec-number&gt;22&lt;/rec-number&gt;&lt;foreign-keys&gt;&lt;key app="EN" db-id="mdae8500109496fea4aff9c086e16cc25895" timestamp="1793221304"&gt;22&lt;/key&gt;&lt;/foreign-keys&gt;&lt;ref-type name="Web Page"&gt;12&lt;/ref-type&gt;&lt;contributors&gt;&lt;authors&gt;&lt;author&gt;Federal Highway Administration&lt;/author&gt;&lt;/authors&gt;&lt;/contributors&gt;&lt;titles&gt;&lt;title&gt;2017 National Household Travel Survey&lt;/title&gt;&lt;/titles&gt;&lt;dates&gt;&lt;year&gt;2017&lt;/year&gt;&lt;/dates&gt;&lt;publisher&gt;U.S. Department of Transportation&lt;/publisher&gt;&lt;label&gt;fhwa2017&lt;/label&gt;&lt;urls&gt;&lt;related-urls&gt;&lt;url&gt;https://nhts.ornl.gov&lt;/url&gt;&lt;/related-urls&gt;&lt;/urls&gt;&lt;access-date&gt;2026-10-28&lt;/access-date&gt;&lt;/record&gt;&lt;/Cite&gt;&lt;/EndNote&gt;</w:instrText>
       </w:r>
       <w:r>
         <w:fldChar w:fldCharType="separate"/>
@@ -7360,7 +7360,7 @@
         <w:fldChar w:fldCharType="begin"/>
       </w:r>
       <w:r>
-        <w:instrText xml:space="preserve"> ADDIN EN.CITE &lt;EndNote&gt;&lt;Cite&gt;&lt;Author&gt;Crawley&lt;/Author&gt;&lt;Year&gt;2001&lt;/Year&gt;&lt;RecNum&gt;13&lt;/RecNum&gt;&lt;DisplayText&gt;[59]&lt;/DisplayText&gt;&lt;record&gt;&lt;rec-number&gt;13&lt;/rec-number&gt;&lt;foreign-keys&gt;&lt;key app="EN" db-id="mdae8500109496fea4aff9c086e16cc25895" timestamp="1793216821"&gt;13&lt;/key&gt;&lt;/foreign-keys&gt;&lt;ref-type name="Journal Article"&gt;17&lt;/ref-type&gt;&lt;contributors&gt;&lt;authors&gt;&lt;author&gt;Crawley, Drury B.&lt;/author&gt;&lt;author&gt;Lawrie, Linda K.&lt;/author&gt;&lt;author&gt;Winkelmann, Frederick C.&lt;/author&gt;&lt;author&gt;Buhl, W. F.&lt;/author&gt;&lt;author&gt;Huang, Y. Joe&lt;/author&gt;&lt;author&gt;Pedersen, Curtis O.&lt;/author&gt;&lt;author&gt;Strand, Richard K.&lt;/author&gt;&lt;author&gt;Liesen, Richard J.&lt;/author&gt;&lt;author&gt;Fisher, Daniel E.&lt;/author&gt;&lt;author&gt;Witte, Michael J.&lt;/author&gt;&lt;author&gt;Glazer, Jason&lt;/author&gt;&lt;/authors&gt;&lt;/contributors&gt;&lt;titles&gt;&lt;title&gt;EnergyPlus: creating a new-generation building energy simulation program&lt;/title&gt;&lt;secondary-title&gt;Energy and Buildings&lt;/secondary-title&gt;&lt;alt-title&gt;Energy Build.&lt;/alt-title&gt;&lt;/titles&gt;&lt;periodical&gt;&lt;full-title&gt;Energy and Buildings&lt;/full-title&gt;&lt;abbr-1&gt;Energy Build.&lt;/abbr-1&gt;&lt;/periodical&gt;&lt;pages&gt;319-331&lt;/pages&gt;&lt;volume&gt;33&lt;/volume&gt;&lt;number&gt;4&lt;/number&gt;&lt;dates&gt;&lt;year&gt;2001&lt;/year&gt;&lt;/dates&gt;&lt;publisher&gt;Elsevier&lt;/publisher&gt;&lt;label&gt;crawley2001&lt;/label&gt;&lt;urls&gt;&lt;/urls&gt;&lt;electronic-resource-num&gt;10.1016/S0378-7788(00)00114-6&lt;/electronic-resource-num&gt;&lt;/record&gt;&lt;/Cite&gt;&lt;/EndNote&gt;</w:instrText>
+        <w:instrText xml:space="preserve"> ADDIN EN.CITE &lt;EndNote&gt;&lt;Cite&gt;&lt;Author&gt;Crawley&lt;/Author&gt;&lt;Year&gt;2001&lt;/Year&gt;&lt;RecNum&gt;13&lt;/RecNum&gt;&lt;DisplayText&gt;[59]&lt;/DisplayText&gt;&lt;record&gt;&lt;rec-number&gt;13&lt;/rec-number&gt;&lt;foreign-keys&gt;&lt;key app="EN" db-id="mdae8500109496fea4aff9c086e16cc25895" timestamp="1793221304"&gt;13&lt;/key&gt;&lt;/foreign-keys&gt;&lt;ref-type name="Journal Article"&gt;17&lt;/ref-type&gt;&lt;contributors&gt;&lt;authors&gt;&lt;author&gt;Crawley, Drury B.&lt;/author&gt;&lt;author&gt;Lawrie, Linda K.&lt;/author&gt;&lt;author&gt;Winkelmann, Frederick C.&lt;/author&gt;&lt;author&gt;Buhl, W. F.&lt;/author&gt;&lt;author&gt;Huang, Y. Joe&lt;/author&gt;&lt;author&gt;Pedersen, Curtis O.&lt;/author&gt;&lt;author&gt;Strand, Richard K.&lt;/author&gt;&lt;author&gt;Liesen, Richard J.&lt;/author&gt;&lt;author&gt;Fisher, Daniel E.&lt;/author&gt;&lt;author&gt;Witte, Michael J.&lt;/author&gt;&lt;author&gt;Glazer, Jason&lt;/author&gt;&lt;/authors&gt;&lt;/contributors&gt;&lt;titles&gt;&lt;title&gt;EnergyPlus: creating a new-generation building energy simulation program&lt;/title&gt;&lt;secondary-title&gt;Energy and Buildings&lt;/secondary-title&gt;&lt;alt-title&gt;Energy Build.&lt;/alt-title&gt;&lt;/titles&gt;&lt;periodical&gt;&lt;full-title&gt;Energy and Buildings&lt;/full-title&gt;&lt;abbr-1&gt;Energy Build.&lt;/abbr-1&gt;&lt;/periodical&gt;&lt;pages&gt;319-331&lt;/pages&gt;&lt;volume&gt;33&lt;/volume&gt;&lt;number&gt;4&lt;/number&gt;&lt;dates&gt;&lt;year&gt;2001&lt;/year&gt;&lt;/dates&gt;&lt;publisher&gt;Elsevier&lt;/publisher&gt;&lt;label&gt;crawley2001&lt;/label&gt;&lt;urls&gt;&lt;/urls&gt;&lt;electronic-resource-num&gt;10.1016/S0378-7788(00)00114-6&lt;/electronic-resource-num&gt;&lt;/record&gt;&lt;/Cite&gt;&lt;/EndNote&gt;</w:instrText>
       </w:r>
       <w:r>
         <w:fldChar w:fldCharType="separate"/>
@@ -7390,7 +7390,7 @@
         <w:fldChar w:fldCharType="begin"/>
       </w:r>
       <w:r>
-        <w:instrText xml:space="preserve"> ADDIN EN.CITE &lt;EndNote&gt;&lt;Cite&gt;&lt;Author&gt;Deru&lt;/Author&gt;&lt;Year&gt;2011&lt;/Year&gt;&lt;RecNum&gt;15&lt;/RecNum&gt;&lt;DisplayText&gt;[60]&lt;/DisplayText&gt;&lt;record&gt;&lt;rec-number&gt;15&lt;/rec-number&gt;&lt;foreign-keys&gt;&lt;key app="EN" db-id="mdae8500109496fea4aff9c086e16cc25895" timestamp="1793216821"&gt;15&lt;/key&gt;&lt;/foreign-keys&gt;&lt;ref-type name="Report"&gt;27&lt;/ref-type&gt;&lt;contributors&gt;&lt;authors&gt;&lt;author&gt;Deru, M.&lt;/author&gt;&lt;author&gt;Field, K.&lt;/author&gt;&lt;author&gt;Studer, D.&lt;/author&gt;&lt;author&gt;Benne, K.&lt;/author&gt;&lt;author&gt;Griffith, B.&lt;/author&gt;&lt;author&gt;Torcellini, P.&lt;/author&gt;&lt;author&gt;Liu, B.&lt;/author&gt;&lt;author&gt;Halverson, M.&lt;/author&gt;&lt;author&gt;Winiarski, D.&lt;/author&gt;&lt;author&gt;Rosenberg, M.&lt;/author&gt;&lt;author&gt;Yazdanian, M.&lt;/author&gt;&lt;author&gt;Huang, J.&lt;/author&gt;&lt;author&gt;Crawley, D.&lt;/author&gt;&lt;/authors&gt;&lt;/contributors&gt;&lt;titles&gt;&lt;title&gt;U.S. Department of Energy Commercial Reference Building Models of the National Building Stock&lt;/title&gt;&lt;/titles&gt;&lt;dates&gt;&lt;year&gt;2011&lt;/year&gt;&lt;/dates&gt;&lt;pub-location&gt;Golden, CO&lt;/pub-location&gt;&lt;publisher&gt;National Renewable Energy Laboratory&lt;/publisher&gt;&lt;isbn&gt;NREL/TP-5500-46861&lt;/isbn&gt;&lt;label&gt;deru2011&lt;/label&gt;&lt;work-type&gt;Technical Report&lt;/work-type&gt;&lt;urls&gt;&lt;/urls&gt;&lt;electronic-resource-num&gt;10.2172/1009264&lt;/electronic-resource-num&gt;&lt;/record&gt;&lt;/Cite&gt;&lt;/EndNote&gt;</w:instrText>
+        <w:instrText xml:space="preserve"> ADDIN EN.CITE &lt;EndNote&gt;&lt;Cite&gt;&lt;Author&gt;Deru&lt;/Author&gt;&lt;Year&gt;2011&lt;/Year&gt;&lt;RecNum&gt;15&lt;/RecNum&gt;&lt;DisplayText&gt;[60]&lt;/DisplayText&gt;&lt;record&gt;&lt;rec-number&gt;15&lt;/rec-number&gt;&lt;foreign-keys&gt;&lt;key app="EN" db-id="mdae8500109496fea4aff9c086e16cc25895" timestamp="1793221304"&gt;15&lt;/key&gt;&lt;/foreign-keys&gt;&lt;ref-type name="Report"&gt;27&lt;/ref-type&gt;&lt;contributors&gt;&lt;authors&gt;&lt;author&gt;Deru, M.&lt;/author&gt;&lt;author&gt;Field, K.&lt;/author&gt;&lt;author&gt;Studer, D.&lt;/author&gt;&lt;author&gt;Benne, K.&lt;/author&gt;&lt;author&gt;Griffith, B.&lt;/author&gt;&lt;author&gt;Torcellini, P.&lt;/author&gt;&lt;author&gt;Liu, B.&lt;/author&gt;&lt;author&gt;Halverson, M.&lt;/author&gt;&lt;author&gt;Winiarski, D.&lt;/author&gt;&lt;author&gt;Rosenberg, M.&lt;/author&gt;&lt;author&gt;Yazdanian, M.&lt;/author&gt;&lt;author&gt;Huang, J.&lt;/author&gt;&lt;author&gt;Crawley, D.&lt;/author&gt;&lt;/authors&gt;&lt;/contributors&gt;&lt;titles&gt;&lt;title&gt;U.S. Department of Energy Commercial Reference Building Models of the National Building Stock&lt;/title&gt;&lt;/titles&gt;&lt;dates&gt;&lt;year&gt;2011&lt;/year&gt;&lt;/dates&gt;&lt;pub-location&gt;Golden, CO&lt;/pub-location&gt;&lt;publisher&gt;National Renewable Energy Laboratory&lt;/publisher&gt;&lt;isbn&gt;NREL/TP-5500-46861&lt;/isbn&gt;&lt;label&gt;deru2011&lt;/label&gt;&lt;work-type&gt;Technical Report&lt;/work-type&gt;&lt;urls&gt;&lt;/urls&gt;&lt;electronic-resource-num&gt;10.2172/1009264&lt;/electronic-resource-num&gt;&lt;/record&gt;&lt;/Cite&gt;&lt;/EndNote&gt;</w:instrText>
       </w:r>
       <w:r>
         <w:fldChar w:fldCharType="separate"/>
@@ -8259,7 +8259,7 @@
         <w:fldChar w:fldCharType="begin"/>
       </w:r>
       <w:r>
-        <w:instrText xml:space="preserve"> ADDIN EN.CITE &lt;EndNote&gt;&lt;Cite&gt;&lt;Author&gt;Hardy&lt;/Author&gt;&lt;Year&gt;2024&lt;/Year&gt;&lt;RecNum&gt;29&lt;/RecNum&gt;&lt;DisplayText&gt;[18]&lt;/DisplayText&gt;&lt;record&gt;&lt;rec-number&gt;29&lt;/rec-number&gt;&lt;foreign-keys&gt;&lt;key app="EN" db-id="mdae8500109496fea4aff9c086e16cc25895" timestamp="1793216821"&gt;29&lt;/key&gt;&lt;/foreign-keys&gt;&lt;ref-type name="Journal Article"&gt;17&lt;/ref-type&gt;&lt;contributors&gt;&lt;authors&gt;&lt;author&gt;Hardy, Trevor D.&lt;/author&gt;&lt;author&gt;Palmintier, Bryan&lt;/author&gt;&lt;author&gt;Top, Philip L.&lt;/author&gt;&lt;author&gt;Krishnamurthy, Dheepak&lt;/author&gt;&lt;author&gt;Fuller, Jason C.&lt;/author&gt;&lt;/authors&gt;&lt;/contributors&gt;&lt;titles&gt;&lt;title&gt;HELICS: A Co-Simulation Framework for Scalable Multi-Domain Modeling and Analysis&lt;/title&gt;&lt;secondary-title&gt;IEEE Access&lt;/secondary-title&gt;&lt;alt-title&gt;IEEE Access&lt;/alt-title&gt;&lt;/titles&gt;&lt;periodical&gt;&lt;full-title&gt;IEEE Access&lt;/full-title&gt;&lt;abbr-1&gt;IEEE Access&lt;/abbr-1&gt;&lt;/periodical&gt;&lt;pages&gt;24325-24347&lt;/pages&gt;&lt;volume&gt;12&lt;/volume&gt;&lt;dates&gt;&lt;year&gt;2024&lt;/year&gt;&lt;/dates&gt;&lt;publisher&gt;IEEE&lt;/publisher&gt;&lt;label&gt;hardy2024&lt;/label&gt;&lt;urls&gt;&lt;/urls&gt;&lt;electronic-resource-num&gt;10.1109/ACCESS.2024.3363615&lt;/electronic-resource-num&gt;&lt;/record&gt;&lt;/Cite&gt;&lt;/EndNote&gt;</w:instrText>
+        <w:instrText xml:space="preserve"> ADDIN EN.CITE &lt;EndNote&gt;&lt;Cite&gt;&lt;Author&gt;Hardy&lt;/Author&gt;&lt;Year&gt;2024&lt;/Year&gt;&lt;RecNum&gt;29&lt;/RecNum&gt;&lt;DisplayText&gt;[18]&lt;/DisplayText&gt;&lt;record&gt;&lt;rec-number&gt;29&lt;/rec-number&gt;&lt;foreign-keys&gt;&lt;key app="EN" db-id="mdae8500109496fea4aff9c086e16cc25895" timestamp="1793221304"&gt;29&lt;/key&gt;&lt;/foreign-keys&gt;&lt;ref-type name="Journal Article"&gt;17&lt;/ref-type&gt;&lt;contributors&gt;&lt;authors&gt;&lt;author&gt;Hardy, Trevor D.&lt;/author&gt;&lt;author&gt;Palmintier, Bryan&lt;/author&gt;&lt;author&gt;Top, Philip L.&lt;/author&gt;&lt;author&gt;Krishnamurthy, Dheepak&lt;/author&gt;&lt;author&gt;Fuller, Jason C.&lt;/author&gt;&lt;/authors&gt;&lt;/contributors&gt;&lt;titles&gt;&lt;title&gt;HELICS: A Co-Simulation Framework for Scalable Multi-Domain Modeling and Analysis&lt;/title&gt;&lt;secondary-title&gt;IEEE Access&lt;/secondary-title&gt;&lt;alt-title&gt;IEEE Access&lt;/alt-title&gt;&lt;/titles&gt;&lt;periodical&gt;&lt;full-title&gt;IEEE Access&lt;/full-title&gt;&lt;abbr-1&gt;IEEE Access&lt;/abbr-1&gt;&lt;/periodical&gt;&lt;pages&gt;24325-24347&lt;/pages&gt;&lt;volume&gt;12&lt;/volume&gt;&lt;dates&gt;&lt;year&gt;2024&lt;/year&gt;&lt;/dates&gt;&lt;publisher&gt;IEEE&lt;/publisher&gt;&lt;label&gt;hardy2024&lt;/label&gt;&lt;urls&gt;&lt;/urls&gt;&lt;electronic-resource-num&gt;10.1109/ACCESS.2024.3363615&lt;/electronic-resource-num&gt;&lt;/record&gt;&lt;/Cite&gt;&lt;/EndNote&gt;</w:instrText>
       </w:r>
       <w:r>
         <w:fldChar w:fldCharType="separate"/>
@@ -8524,7 +8524,7 @@
 UmVjTnVtPjQ3PC9SZWNOdW0+PERpc3BsYXlUZXh0Pls3LDIyXTwvRGlzcGxheVRleHQ+PHJlY29y
 ZD48cmVjLW51bWJlcj40NzwvcmVjLW51bWJlcj48Zm9yZWlnbi1rZXlzPjxrZXkgYXBwPSJFTiIg
 ZGItaWQ9Im1kYWU4NTAwMTA5NDk2ZmVhNGFmZjljMDg2ZTE2Y2MyNTg5NSIgdGltZXN0YW1wPSIx
-NzkzMjE2ODIxIj40Nzwva2V5PjwvZm9yZWlnbi1rZXlzPjxyZWYtdHlwZSBuYW1lPSJKb3VybmFs
+NzkzMjIxMzA0Ij40Nzwva2V5PjwvZm9yZWlnbi1rZXlzPjxyZWYtdHlwZSBuYW1lPSJKb3VybmFs
 IEFydGljbGUiPjE3PC9yZWYtdHlwZT48Y29udHJpYnV0b3JzPjxhdXRob3JzPjxhdXRob3I+S8O8
 YmxlciwgUi48L2F1dGhvcj48YXV0aG9yPlNjaGllaGxlbiwgVy48L2F1dGhvcj48L2F1dGhvcnM+
 PC9jb250cmlidXRvcnM+PHRpdGxlcz48dGl0bGU+VHdvIE1ldGhvZHMgb2YgU2ltdWxhdG9yIENv
@@ -8541,7 +8541,7 @@
 c291cmNlLW51bT48L3JlY29yZD48L0NpdGU+PENpdGU+PEF1dGhvcj5Hb21lczwvQXV0aG9yPjxZ
 ZWFyPjIwMTg8L1llYXI+PFJlY051bT4yNjwvUmVjTnVtPjxyZWNvcmQ+PHJlYy1udW1iZXI+MjY8
 L3JlYy1udW1iZXI+PGZvcmVpZ24ta2V5cz48a2V5IGFwcD0iRU4iIGRiLWlkPSJtZGFlODUwMDEw
-OTQ5NmZlYTRhZmY5YzA4NmUxNmNjMjU4OTUiIHRpbWVzdGFtcD0iMTc5MzIxNjgyMSI+MjY8L2tl
+OTQ5NmZlYTRhZmY5YzA4NmUxNmNjMjU4OTUiIHRpbWVzdGFtcD0iMTc5MzIyMTMwNCI+MjY8L2tl
 eT48L2ZvcmVpZ24ta2V5cz48cmVmLXR5cGUgbmFtZT0iSm91cm5hbCBBcnRpY2xlIj4xNzwvcmVm
 LXR5cGU+PGNvbnRyaWJ1dG9ycz48YXV0aG9ycz48YXV0aG9yPkdvbWVzLCBDbMOhdWRpbzwvYXV0
 aG9yPjxhdXRob3I+VGh1bGUsIENhc3BlcjwvYXV0aG9yPjxhdXRob3I+QnJvbWFuLCBEYXZpZDwv
@@ -8567,7 +8567,7 @@
 UmVjTnVtPjQ3PC9SZWNOdW0+PERpc3BsYXlUZXh0Pls3LDIyXTwvRGlzcGxheVRleHQ+PHJlY29y
 ZD48cmVjLW51bWJlcj40NzwvcmVjLW51bWJlcj48Zm9yZWlnbi1rZXlzPjxrZXkgYXBwPSJFTiIg
 ZGItaWQ9Im1kYWU4NTAwMTA5NDk2ZmVhNGFmZjljMDg2ZTE2Y2MyNTg5NSIgdGltZXN0YW1wPSIx
-NzkzMjE2ODIxIj40Nzwva2V5PjwvZm9yZWlnbi1rZXlzPjxyZWYtdHlwZSBuYW1lPSJKb3VybmFs
+NzkzMjIxMzA0Ij40Nzwva2V5PjwvZm9yZWlnbi1rZXlzPjxyZWYtdHlwZSBuYW1lPSJKb3VybmFs
 IEFydGljbGUiPjE3PC9yZWYtdHlwZT48Y29udHJpYnV0b3JzPjxhdXRob3JzPjxhdXRob3I+S8O8
 YmxlciwgUi48L2F1dGhvcj48YXV0aG9yPlNjaGllaGxlbiwgVy48L2F1dGhvcj48L2F1dGhvcnM+
 PC9jb250cmlidXRvcnM+PHRpdGxlcz48dGl0bGU+VHdvIE1ldGhvZHMgb2YgU2ltdWxhdG9yIENv
@@ -8584,7 +8584,7 @@
 c291cmNlLW51bT48L3JlY29yZD48L0NpdGU+PENpdGU+PEF1dGhvcj5Hb21lczwvQXV0aG9yPjxZ
 ZWFyPjIwMTg8L1llYXI+PFJlY051bT4yNjwvUmVjTnVtPjxyZWNvcmQ+PHJlYy1udW1iZXI+MjY8
 L3JlYy1udW1iZXI+PGZvcmVpZ24ta2V5cz48a2V5IGFwcD0iRU4iIGRiLWlkPSJtZGFlODUwMDEw
-OTQ5NmZlYTRhZmY5YzA4NmUxNmNjMjU4OTUiIHRpbWVzdGFtcD0iMTc5MzIxNjgyMSI+MjY8L2tl
+OTQ5NmZlYTRhZmY5YzA4NmUxNmNjMjU4OTUiIHRpbWVzdGFtcD0iMTc5MzIyMTMwNCI+MjY8L2tl
 eT48L2ZvcmVpZ24ta2V5cz48cmVmLXR5cGUgbmFtZT0iSm91cm5hbCBBcnRpY2xlIj4xNzwvcmVm
 LXR5cGU+PGNvbnRyaWJ1dG9ycz48YXV0aG9ycz48YXV0aG9yPkdvbWVzLCBDbMOhdWRpbzwvYXV0
 aG9yPjxhdXRob3I+VGh1bGUsIENhc3BlcjwvYXV0aG9yPjxhdXRob3I+QnJvbWFuLCBEYXZpZDwv
@@ -8626,7 +8626,7 @@
         <w:fldChar w:fldCharType="begin"/>
       </w:r>
       <w:r>
-        <w:instrText xml:space="preserve"> ADDIN EN.CITE &lt;EndNote&gt;&lt;Cite&gt;&lt;Author&gt;Eaton&lt;/Author&gt;&lt;Year&gt;2023&lt;/Year&gt;&lt;RecNum&gt;10&lt;/RecNum&gt;&lt;DisplayText&gt;[48]&lt;/DisplayText&gt;&lt;record&gt;&lt;rec-number&gt;10&lt;/rec-number&gt;&lt;foreign-keys&gt;&lt;key app="EN" db-id="mdae8500109496fea4aff9c086e16cc25895" timestamp="1793216821"&gt;10&lt;/key&gt;&lt;/foreign-keys&gt;&lt;ref-type name="Web Page"&gt;12&lt;/ref-type&gt;&lt;contributors&gt;&lt;authors&gt;&lt;author&gt;Eaton, Brian&lt;/author&gt;&lt;author&gt;Gregory, Jonathan&lt;/author&gt;&lt;author&gt;Drach, Bob&lt;/author&gt;&lt;author&gt;Taylor, Karl&lt;/author&gt;&lt;author&gt;Hankin, Steve&lt;/author&gt;&lt;author&gt;Blower, Jon&lt;/author&gt;&lt;author&gt;Caron, John&lt;/author&gt;&lt;author&gt;Signell, Rich&lt;/author&gt;&lt;author&gt;Bentley, Phil&lt;/author&gt;&lt;author&gt;Rappa, Greg&lt;/author&gt;&lt;author&gt;Höck, Heinke&lt;/author&gt;&lt;author&gt;Pamment, Alison&lt;/author&gt;&lt;author&gt;Juckes, Martin&lt;/author&gt;&lt;author&gt;Raspaud, Martin&lt;/author&gt;&lt;author&gt;Horne, Randy&lt;/author&gt;&lt;author&gt;Whiteaker, Timothy&lt;/author&gt;&lt;author&gt;Blodgett, David&lt;/author&gt;&lt;author&gt;Zender, Charlie&lt;/author&gt;&lt;author&gt;Lee, Daniel&lt;/author&gt;&lt;author&gt;Hassell, David&lt;/author&gt;&lt;author&gt;Snow, Alan D.&lt;/author&gt;&lt;author&gt;Kölling, Tobias&lt;/author&gt;&lt;author&gt;Allured, Dave&lt;/author&gt;&lt;author&gt;Jelenak, Aleksandar&lt;/author&gt;&lt;author&gt;Meier Soerensen, Anders&lt;/author&gt;&lt;author&gt;Gaultier, Lucile&lt;/author&gt;&lt;author&gt;Herlédan, Sylvain&lt;/author&gt;&lt;author&gt;Manzano, Fernando&lt;/author&gt;&lt;author&gt;Bärring, Lars&lt;/author&gt;&lt;author&gt;Barker, Christopher&lt;/author&gt;&lt;author&gt;Bartholomew, Sadie&lt;/author&gt;&lt;/authors&gt;&lt;/contributors&gt;&lt;titles&gt;&lt;title&gt;NetCDF Climate and Forecast (CF) Metadata Conventions&lt;/title&gt;&lt;/titles&gt;&lt;dates&gt;&lt;year&gt;2023&lt;/year&gt;&lt;/dates&gt;&lt;label&gt;cf2023&lt;/label&gt;&lt;urls&gt;&lt;related-urls&gt;&lt;url&gt;https://cfconventions.org/Data/cf-conventions/cf-conventions-1.11/cf-conventions.html&lt;/url&gt;&lt;/related-urls&gt;&lt;/urls&gt;&lt;access-date&gt;2026-10-28&lt;/access-date&gt;&lt;/record&gt;&lt;/Cite&gt;&lt;/EndNote&gt;</w:instrText>
+        <w:instrText xml:space="preserve"> ADDIN EN.CITE &lt;EndNote&gt;&lt;Cite&gt;&lt;Author&gt;Eaton&lt;/Author&gt;&lt;Year&gt;2023&lt;/Year&gt;&lt;RecNum&gt;10&lt;/RecNum&gt;&lt;DisplayText&gt;[48]&lt;/DisplayText&gt;&lt;record&gt;&lt;rec-number&gt;10&lt;/rec-number&gt;&lt;foreign-keys&gt;&lt;key app="EN" db-id="mdae8500109496fea4aff9c086e16cc25895" timestamp="1793221304"&gt;10&lt;/key&gt;&lt;/foreign-keys&gt;&lt;ref-type name="Web Page"&gt;12&lt;/ref-type&gt;&lt;contributors&gt;&lt;authors&gt;&lt;author&gt;Eaton, Brian&lt;/author&gt;&lt;author&gt;Gregory, Jonathan&lt;/author&gt;&lt;author&gt;Drach, Bob&lt;/author&gt;&lt;author&gt;Taylor, Karl&lt;/author&gt;&lt;author&gt;Hankin, Steve&lt;/author&gt;&lt;author&gt;Blower, Jon&lt;/author&gt;&lt;author&gt;Caron, John&lt;/author&gt;&lt;author&gt;Signell, Rich&lt;/author&gt;&lt;author&gt;Bentley, Phil&lt;/author&gt;&lt;author&gt;Rappa, Greg&lt;/author&gt;&lt;author&gt;Höck, Heinke&lt;/author&gt;&lt;author&gt;Pamment, Alison&lt;/author&gt;&lt;author&gt;Juckes, Martin&lt;/author&gt;&lt;author&gt;Raspaud, Martin&lt;/author&gt;&lt;author&gt;Horne, Randy&lt;/author&gt;&lt;author&gt;Whiteaker, Timothy&lt;/author&gt;&lt;author&gt;Blodgett, David&lt;/author&gt;&lt;author&gt;Zender, Charlie&lt;/author&gt;&lt;author&gt;Lee, Daniel&lt;/author&gt;&lt;author&gt;Hassell, David&lt;/author&gt;&lt;author&gt;Snow, Alan D.&lt;/author&gt;&lt;author&gt;Kölling, Tobias&lt;/author&gt;&lt;author&gt;Allured, Dave&lt;/author&gt;&lt;author&gt;Jelenak, Aleksandar&lt;/author&gt;&lt;author&gt;Meier Soerensen, Anders&lt;/author&gt;&lt;author&gt;Gaultier, Lucile&lt;/author&gt;&lt;author&gt;Herlédan, Sylvain&lt;/author&gt;&lt;author&gt;Manzano, Fernando&lt;/author&gt;&lt;author&gt;Bärring, Lars&lt;/author&gt;&lt;author&gt;Barker, Christopher&lt;/author&gt;&lt;author&gt;Bartholomew, Sadie&lt;/author&gt;&lt;/authors&gt;&lt;/contributors&gt;&lt;titles&gt;&lt;title&gt;NetCDF Climate and Forecast (CF) Metadata Conventions&lt;/title&gt;&lt;/titles&gt;&lt;dates&gt;&lt;year&gt;2023&lt;/year&gt;&lt;/dates&gt;&lt;label&gt;cf2023&lt;/label&gt;&lt;urls&gt;&lt;related-urls&gt;&lt;url&gt;https://cfconventions.org/Data/cf-conventions/cf-conventions-1.11/cf-conventions.html&lt;/url&gt;&lt;/related-urls&gt;&lt;/urls&gt;&lt;access-date&gt;2026-10-28&lt;/access-date&gt;&lt;/record&gt;&lt;/Cite&gt;&lt;/EndNote&gt;</w:instrText>
       </w:r>
       <w:r>
         <w:fldChar w:fldCharType="separate"/>
@@ -8663,7 +8663,7 @@
 PFJlY051bT4zPC9SZWNOdW0+PERpc3BsYXlUZXh0PlszMCwzMV08L0Rpc3BsYXlUZXh0PjxyZWNv
 cmQ+PHJlYy1udW1iZXI+MzwvcmVjLW51bWJlcj48Zm9yZWlnbi1rZXlzPjxrZXkgYXBwPSJFTiIg
 ZGItaWQ9Im1kYWU4NTAwMTA5NDk2ZmVhNGFmZjljMDg2ZTE2Y2MyNTg5NSIgdGltZXN0YW1wPSIx
-NzkzMjE2ODIxIj4zPC9rZXk+PC9mb3JlaWduLWtleXM+PHJlZi10eXBlIG5hbWU9IkNvbmZlcmVu
+NzkzMjIxMzA0Ij4zPC9rZXk+PC9mb3JlaWduLWtleXM+PHJlZi10eXBlIG5hbWU9IkNvbmZlcmVu
 Y2UgUGFwZXIiPjQ3PC9yZWYtdHlwZT48Y29udHJpYnV0b3JzPjxhdXRob3JzPjxhdXRob3I+QmVu
 ZWRpa3QsIE0uPC9hdXRob3I+PGF1dGhvcj5XYXR6ZW5pZywgRC48L2F1dGhvcj48YXV0aG9yPlpl
 aGV0bmVyLCBKLjwvYXV0aG9yPjxhdXRob3I+SG9mZXIsIEEuPC9hdXRob3I+PC9hdXRob3JzPjwv
@@ -8680,7 +8680,7 @@
 dXJscz48L3VybHM+PC9yZWNvcmQ+PC9DaXRlPjxDaXRlPjxBdXRob3I+U2FkamluYTwvQXV0aG9y
 PjxZZWFyPjIwMTc8L1llYXI+PFJlY051bT43MTwvUmVjTnVtPjxyZWNvcmQ+PHJlYy1udW1iZXI+
 NzE8L3JlYy1udW1iZXI+PGZvcmVpZ24ta2V5cz48a2V5IGFwcD0iRU4iIGRiLWlkPSJtZGFlODUw
-MDEwOTQ5NmZlYTRhZmY5YzA4NmUxNmNjMjU4OTUiIHRpbWVzdGFtcD0iMTc5MzIxNjgyMSI+NzE8
+MDEwOTQ5NmZlYTRhZmY5YzA4NmUxNmNjMjU4OTUiIHRpbWVzdGFtcD0iMTc5MzIyMTMwNCI+NzE8
 L2tleT48L2ZvcmVpZ24ta2V5cz48cmVmLXR5cGUgbmFtZT0iSm91cm5hbCBBcnRpY2xlIj4xNzwv
 cmVmLXR5cGU+PGNvbnRyaWJ1dG9ycz48YXV0aG9ycz48YXV0aG9yPlNhZGppbmEsIFNldmVyaW48
 L2F1dGhvcj48YXV0aG9yPkt5bGxpbmdzdGFkLCBMYXJzIFQuPC9hdXRob3I+PGF1dGhvcj5Ta2pv
@@ -8708,7 +8708,7 @@
 PFJlY051bT4zPC9SZWNOdW0+PERpc3BsYXlUZXh0PlszMCwzMV08L0Rpc3BsYXlUZXh0PjxyZWNv
 cmQ+PHJlYy1udW1iZXI+MzwvcmVjLW51bWJlcj48Zm9yZWlnbi1rZXlzPjxrZXkgYXBwPSJFTiIg
 ZGItaWQ9Im1kYWU4NTAwMTA5NDk2ZmVhNGFmZjljMDg2ZTE2Y2MyNTg5NSIgdGltZXN0YW1wPSIx
-NzkzMjE2ODIxIj4zPC9rZXk+PC9mb3JlaWduLWtleXM+PHJlZi10eXBlIG5hbWU9IkNvbmZlcmVu
+NzkzMjIxMzA0Ij4zPC9rZXk+PC9mb3JlaWduLWtleXM+PHJlZi10eXBlIG5hbWU9IkNvbmZlcmVu
 Y2UgUGFwZXIiPjQ3PC9yZWYtdHlwZT48Y29udHJpYnV0b3JzPjxhdXRob3JzPjxhdXRob3I+QmVu
 ZWRpa3QsIE0uPC9hdXRob3I+PGF1dGhvcj5XYXR6ZW5pZywgRC48L2F1dGhvcj48YXV0aG9yPlpl
 aGV0bmVyLCBKLjwvYXV0aG9yPjxhdXRob3I+SG9mZXIsIEEuPC9hdXRob3I+PC9hdXRob3JzPjwv
@@ -8725,7 +8725,7 @@
 dXJscz48L3VybHM+PC9yZWNvcmQ+PC9DaXRlPjxDaXRlPjxBdXRob3I+U2FkamluYTwvQXV0aG9y
 PjxZZWFyPjIwMTc8L1llYXI+PFJlY051bT43MTwvUmVjTnVtPjxyZWNvcmQ+PHJlYy1udW1iZXI+
 NzE8L3JlYy1udW1iZXI+PGZvcmVpZ24ta2V5cz48a2V5IGFwcD0iRU4iIGRiLWlkPSJtZGFlODUw
-MDEwOTQ5NmZlYTRhZmY5YzA4NmUxNmNjMjU4OTUiIHRpbWVzdGFtcD0iMTc5MzIxNjgyMSI+NzE8
+MDEwOTQ5NmZlYTRhZmY5YzA4NmUxNmNjMjU4OTUiIHRpbWVzdGFtcD0iMTc5MzIyMTMwNCI+NzE8
 L2tleT48L2ZvcmVpZ24ta2V5cz48cmVmLXR5cGUgbmFtZT0iSm91cm5hbCBBcnRpY2xlIj4xNzwv
 cmVmLXR5cGU+PGNvbnRyaWJ1dG9ycz48YXV0aG9ycz48YXV0aG9yPlNhZGppbmEsIFNldmVyaW48
 L2F1dGhvcj48YXV0aG9yPkt5bGxpbmdzdGFkLCBMYXJzIFQuPC9hdXRob3I+PGF1dGhvcj5Ta2pv

</xml_diff>

<commit_message>
Title page: current affiliations and NSF funding acknowledgement
- Liang Zhang: University of Arizona; National Laboratory of the Rockies (formerly NREL)
- Saquib Mohammed Haroon: AAA Foundation for Traffic Safety
- Alyssa Ryan: Michigan State University
- Acknowledgements: NSF Award No. 2623038 with the standard NSF disclaimer

Co-Authored-By: Claude Opus 5.5 <noreply@anthropic.com>
</commit_message>
<xml_diff>
--- a/paper/manuscript/Manuscript.docx
+++ b/paper/manuscript/Manuscript.docx
@@ -33,19 +33,53 @@
         <w:rPr>
           <w:vertAlign w:val="superscript"/>
         </w:rPr>
+        <w:t xml:space="preserve">3</w:t>
+      </w:r>
+      <w:r>
+        <w:t xml:space="preserve">, </w:t>
+      </w:r>
+      <w:r>
+        <w:t xml:space="preserve">Alyssa Ryan</w:t>
+      </w:r>
+      <w:r>
+        <w:rPr>
+          <w:vertAlign w:val="superscript"/>
+        </w:rPr>
+        <w:t xml:space="preserve">4</w:t>
+      </w:r>
+    </w:p>
+    <w:p>
+      <w:pPr>
+        <w:pStyle w:val="Affiliation"/>
+      </w:pPr>
+      <w:r>
+        <w:rPr>
+          <w:vertAlign w:val="superscript"/>
+        </w:rPr>
         <w:t xml:space="preserve">1</w:t>
       </w:r>
       <w:r>
-        <w:t xml:space="preserve">, </w:t>
-      </w:r>
-      <w:r>
-        <w:t xml:space="preserve">Alyssa Ryan</w:t>
-      </w:r>
+        <w:t xml:space="preserve"> </w:t>
+      </w:r>
+      <w:r>
+        <w:t xml:space="preserve">University of Arizona, Tucson, Arizona, USA</w:t>
+      </w:r>
+    </w:p>
+    <w:p>
+      <w:pPr>
+        <w:pStyle w:val="Affiliation"/>
+      </w:pPr>
       <w:r>
         <w:rPr>
           <w:vertAlign w:val="superscript"/>
         </w:rPr>
-        <w:t xml:space="preserve">1</w:t>
+        <w:t xml:space="preserve">2</w:t>
+      </w:r>
+      <w:r>
+        <w:t xml:space="preserve"> </w:t>
+      </w:r>
+      <w:r>
+        <w:t xml:space="preserve">National Laboratory of the Rockies (formerly National Renewable Energy Laboratory), Golden, Colorado, USA</w:t>
       </w:r>
     </w:p>
     <w:p>
@@ -56,13 +90,13 @@
         <w:rPr>
           <w:vertAlign w:val="superscript"/>
         </w:rPr>
-        <w:t xml:space="preserve">1</w:t>
+        <w:t xml:space="preserve">3</w:t>
       </w:r>
       <w:r>
         <w:t xml:space="preserve"> </w:t>
       </w:r>
       <w:r>
-        <w:t xml:space="preserve">University of Arizona, Tucson, Arizona, USA</w:t>
+        <w:t xml:space="preserve">AAA Foundation for Traffic Safety, Washington, DC, USA</w:t>
       </w:r>
     </w:p>
     <w:p>
@@ -73,13 +107,13 @@
         <w:rPr>
           <w:vertAlign w:val="superscript"/>
         </w:rPr>
-        <w:t xml:space="preserve">2</w:t>
+        <w:t xml:space="preserve">4</w:t>
       </w:r>
       <w:r>
         <w:t xml:space="preserve"> </w:t>
       </w:r>
       <w:r>
-        <w:t xml:space="preserve">National Renewable Energy Laboratory, Golden, Colorado, USA</w:t>
+        <w:t xml:space="preserve">Michigan State University, East Lansing, Michigan, USA</w:t>
       </w:r>
     </w:p>
     <w:p>
@@ -164,7 +198,7 @@
 UmVjTnVtPjU4PC9SZWNOdW0+PERpc3BsYXlUZXh0PlsxLDJdPC9EaXNwbGF5VGV4dD48cmVjb3Jk
 PjxyZWMtbnVtYmVyPjU4PC9yZWMtbnVtYmVyPjxmb3JlaWduLWtleXM+PGtleSBhcHA9IkVOIiBk
 Yi1pZD0ibWRhZTg1MDAxMDk0OTZmZWE0YWZmOWMwODZlMTZjYzI1ODk1IiB0aW1lc3RhbXA9IjE3
-OTMyMjEzMDQiPjU4PC9rZXk+PC9mb3JlaWduLWtleXM+PHJlZi10eXBlIG5hbWU9IlJlcG9ydCI+
+OTMyMjE2NDkiPjU4PC9rZXk+PC9mb3JlaWduLWtleXM+PHJlZi10eXBlIG5hbWU9IlJlcG9ydCI+
 Mjc8L3JlZi10eXBlPjxjb250cmlidXRvcnM+PGF1dGhvcnM+PGF1dGhvcj5OZXVrb21tLCBNb25p
 Y2E8L2F1dGhvcj48YXV0aG9yPk51YmJlLCBWYWxlcmllPC9hdXRob3I+PGF1dGhvcj5GYXJlcywg
 Um9iZXJ0PC9hdXRob3I+PC9hdXRob3JzPjwvY29udHJpYnV0b3JzPjx0aXRsZXM+PHRpdGxlPkdy
@@ -179,7 +213,7 @@
 ZT48Q2l0ZT48QXV0aG9yPkhvbmc8L0F1dGhvcj48WWVhcj4yMDI1PC9ZZWFyPjxSZWNOdW0+MzU8
 L1JlY051bT48cmVjb3JkPjxyZWMtbnVtYmVyPjM1PC9yZWMtbnVtYmVyPjxmb3JlaWduLWtleXM+
 PGtleSBhcHA9IkVOIiBkYi1pZD0ibWRhZTg1MDAxMDk0OTZmZWE0YWZmOWMwODZlMTZjYzI1ODk1
-IiB0aW1lc3RhbXA9IjE3OTMyMjEzMDQiPjM1PC9rZXk+PC9mb3JlaWduLWtleXM+PHJlZi10eXBl
+IiB0aW1lc3RhbXA9IjE3OTMyMjE2NDkiPjM1PC9rZXk+PC9mb3JlaWduLWtleXM+PHJlZi10eXBl
 IG5hbWU9IkpvdXJuYWwgQXJ0aWNsZSI+MTc8L3JlZi10eXBlPjxjb250cmlidXRvcnM+PGF1dGhv
 cnM+PGF1dGhvcj5Ib25nLCBUaWFuemhlbjwvYXV0aG9yPjxhdXRob3I+TGVlLCBTYW5nIEhvb248
 L2F1dGhvcj48YXV0aG9yPlpoYW5nLCBXYW5uaTwvYXV0aG9yPjxhdXRob3I+TGksIEhhbjwvYXV0
@@ -206,7 +240,7 @@
 UmVjTnVtPjU4PC9SZWNOdW0+PERpc3BsYXlUZXh0PlsxLDJdPC9EaXNwbGF5VGV4dD48cmVjb3Jk
 PjxyZWMtbnVtYmVyPjU4PC9yZWMtbnVtYmVyPjxmb3JlaWduLWtleXM+PGtleSBhcHA9IkVOIiBk
 Yi1pZD0ibWRhZTg1MDAxMDk0OTZmZWE0YWZmOWMwODZlMTZjYzI1ODk1IiB0aW1lc3RhbXA9IjE3
-OTMyMjEzMDQiPjU4PC9rZXk+PC9mb3JlaWduLWtleXM+PHJlZi10eXBlIG5hbWU9IlJlcG9ydCI+
+OTMyMjE2NDkiPjU4PC9rZXk+PC9mb3JlaWduLWtleXM+PHJlZi10eXBlIG5hbWU9IlJlcG9ydCI+
 Mjc8L3JlZi10eXBlPjxjb250cmlidXRvcnM+PGF1dGhvcnM+PGF1dGhvcj5OZXVrb21tLCBNb25p
 Y2E8L2F1dGhvcj48YXV0aG9yPk51YmJlLCBWYWxlcmllPC9hdXRob3I+PGF1dGhvcj5GYXJlcywg
 Um9iZXJ0PC9hdXRob3I+PC9hdXRob3JzPjwvY29udHJpYnV0b3JzPjx0aXRsZXM+PHRpdGxlPkdy
@@ -221,7 +255,7 @@
 ZT48Q2l0ZT48QXV0aG9yPkhvbmc8L0F1dGhvcj48WWVhcj4yMDI1PC9ZZWFyPjxSZWNOdW0+MzU8
 L1JlY051bT48cmVjb3JkPjxyZWMtbnVtYmVyPjM1PC9yZWMtbnVtYmVyPjxmb3JlaWduLWtleXM+
 PGtleSBhcHA9IkVOIiBkYi1pZD0ibWRhZTg1MDAxMDk0OTZmZWE0YWZmOWMwODZlMTZjYzI1ODk1
-IiB0aW1lc3RhbXA9IjE3OTMyMjEzMDQiPjM1PC9rZXk+PC9mb3JlaWduLWtleXM+PHJlZi10eXBl
+IiB0aW1lc3RhbXA9IjE3OTMyMjE2NDkiPjM1PC9rZXk+PC9mb3JlaWduLWtleXM+PHJlZi10eXBl
 IG5hbWU9IkpvdXJuYWwgQXJ0aWNsZSI+MTc8L3JlZi10eXBlPjxjb250cmlidXRvcnM+PGF1dGhv
 cnM+PGF1dGhvcj5Ib25nLCBUaWFuemhlbjwvYXV0aG9yPjxhdXRob3I+TGVlLCBTYW5nIEhvb248
 L2F1dGhvcj48YXV0aG9yPlpoYW5nLCBXYW5uaTwvYXV0aG9yPjxhdXRob3I+TGksIEhhbjwvYXV0
@@ -266,7 +300,7 @@
 TnVtPjgzPC9SZWNOdW0+PERpc3BsYXlUZXh0Plsz4oCTNl08L0Rpc3BsYXlUZXh0PjxyZWNvcmQ+
 PHJlYy1udW1iZXI+ODM8L3JlYy1udW1iZXI+PGZvcmVpZ24ta2V5cz48a2V5IGFwcD0iRU4iIGRi
 LWlkPSJtZGFlODUwMDEwOTQ5NmZlYTRhZmY5YzA4NmUxNmNjMjU4OTUiIHRpbWVzdGFtcD0iMTc5
-MzIyMTMwNCI+ODM8L2tleT48L2ZvcmVpZ24ta2V5cz48cmVmLXR5cGUgbmFtZT0iSm91cm5hbCBB
+MzIyMTY0OSI+ODM8L2tleT48L2ZvcmVpZ24ta2V5cz48cmVmLXR5cGUgbmFtZT0iSm91cm5hbCBB
 cnRpY2xlIj4xNzwvcmVmLXR5cGU+PGNvbnRyaWJ1dG9ycz48YXV0aG9ycz48YXV0aG9yPldhbmcs
 IFpoZTwvYXV0aG9yPjxhdXRob3I+SG9uZywgVGlhbnpoZW48L2F1dGhvcj48L2F1dGhvcnM+PC9j
 b250cmlidXRvcnM+PHRpdGxlcz48dGl0bGU+UmVpbmZvcmNlbWVudCBsZWFybmluZyBmb3IgYnVp
@@ -281,7 +315,7 @@
 Y2UtbnVtPjwvcmVjb3JkPjwvQ2l0ZT48Q2l0ZT48QXV0aG9yPkFobjwvQXV0aG9yPjxZZWFyPjIw
 MjM8L1llYXI+PFJlY051bT4xPC9SZWNOdW0+PHJlY29yZD48cmVjLW51bWJlcj4xPC9yZWMtbnVt
 YmVyPjxmb3JlaWduLWtleXM+PGtleSBhcHA9IkVOIiBkYi1pZD0ibWRhZTg1MDAxMDk0OTZmZWE0
-YWZmOWMwODZlMTZjYzI1ODk1IiB0aW1lc3RhbXA9IjE3OTMyMjEzMDQiPjE8L2tleT48L2ZvcmVp
+YWZmOWMwODZlMTZjYzI1ODk1IiB0aW1lc3RhbXA9IjE3OTMyMjE2NDkiPjE8L2tleT48L2ZvcmVp
 Z24ta2V5cz48cmVmLXR5cGUgbmFtZT0iSm91cm5hbCBBcnRpY2xlIj4xNzwvcmVmLXR5cGU+PGNv
 bnRyaWJ1dG9ycz48YXV0aG9ycz48YXV0aG9yPkFobiwgS2kgVWhuPC9hdXRob3I+PGF1dGhvcj5L
 aW0sIERldWstV29vPC9hdXRob3I+PGF1dGhvcj5DaG8sIEh5dW4gTWk8L2F1dGhvcj48YXV0aG9y
@@ -299,7 +333,7 @@
 aG9yPlpoYW5nPC9BdXRob3I+PFllYXI+MjAyNDwvWWVhcj48UmVjTnVtPjk0PC9SZWNOdW0+PHJl
 Y29yZD48cmVjLW51bWJlcj45NDwvcmVjLW51bWJlcj48Zm9yZWlnbi1rZXlzPjxrZXkgYXBwPSJF
 TiIgZGItaWQ9Im1kYWU4NTAwMTA5NDk2ZmVhNGFmZjljMDg2ZTE2Y2MyNTg5NSIgdGltZXN0YW1w
-PSIxNzkzMjIxMzA0Ij45NDwva2V5PjwvZm9yZWlnbi1rZXlzPjxyZWYtdHlwZSBuYW1lPSJKb3Vy
+PSIxNzkzMjIxNjQ5Ij45NDwva2V5PjwvZm9yZWlnbi1rZXlzPjxyZWYtdHlwZSBuYW1lPSJKb3Vy
 bmFsIEFydGljbGUiPjE3PC9yZWYtdHlwZT48Y29udHJpYnV0b3JzPjxhdXRob3JzPjxhdXRob3I+
 WmhhbmcsIExpYW5nPC9hdXRob3I+PGF1dGhvcj5DaGVuLCBaaGVsdW48L2F1dGhvcj48L2F1dGhv
 cnM+PC9jb250cmlidXRvcnM+PHRpdGxlcz48dGl0bGU+TGFyZ2UgbGFuZ3VhZ2UgbW9kZWwtYmFz
@@ -315,7 +349,7 @@
 aXRlPjxDaXRlPjxBdXRob3I+TGl1PC9BdXRob3I+PFllYXI+MjAyNTwvWWVhcj48UmVjTnVtPjUx
 PC9SZWNOdW0+PHJlY29yZD48cmVjLW51bWJlcj41MTwvcmVjLW51bWJlcj48Zm9yZWlnbi1rZXlz
 PjxrZXkgYXBwPSJFTiIgZGItaWQ9Im1kYWU4NTAwMTA5NDk2ZmVhNGFmZjljMDg2ZTE2Y2MyNTg5
-NSIgdGltZXN0YW1wPSIxNzkzMjIxMzA0Ij41MTwva2V5PjwvZm9yZWlnbi1rZXlzPjxyZWYtdHlw
+NSIgdGltZXN0YW1wPSIxNzkzMjIxNjQ5Ij41MTwva2V5PjwvZm9yZWlnbi1rZXlzPjxyZWYtdHlw
 ZSBuYW1lPSJKb3VybmFsIEFydGljbGUiPjE3PC9yZWYtdHlwZT48Y29udHJpYnV0b3JzPjxhdXRo
 b3JzPjxhdXRob3I+TGl1LCBNaW5nemhlPC9hdXRob3I+PGF1dGhvcj5aaGFuZywgTGlhbmc8L2F1
 dGhvcj48YXV0aG9yPkNoZW4sIEppYW5saTwvYXV0aG9yPjxhdXRob3I+Q2hlbiwgV2VpLUFuPC9h
@@ -343,7 +377,7 @@
 TnVtPjgzPC9SZWNOdW0+PERpc3BsYXlUZXh0Plsz4oCTNl08L0Rpc3BsYXlUZXh0PjxyZWNvcmQ+
 PHJlYy1udW1iZXI+ODM8L3JlYy1udW1iZXI+PGZvcmVpZ24ta2V5cz48a2V5IGFwcD0iRU4iIGRi
 LWlkPSJtZGFlODUwMDEwOTQ5NmZlYTRhZmY5YzA4NmUxNmNjMjU4OTUiIHRpbWVzdGFtcD0iMTc5
-MzIyMTMwNCI+ODM8L2tleT48L2ZvcmVpZ24ta2V5cz48cmVmLXR5cGUgbmFtZT0iSm91cm5hbCBB
+MzIyMTY0OSI+ODM8L2tleT48L2ZvcmVpZ24ta2V5cz48cmVmLXR5cGUgbmFtZT0iSm91cm5hbCBB
 cnRpY2xlIj4xNzwvcmVmLXR5cGU+PGNvbnRyaWJ1dG9ycz48YXV0aG9ycz48YXV0aG9yPldhbmcs
 IFpoZTwvYXV0aG9yPjxhdXRob3I+SG9uZywgVGlhbnpoZW48L2F1dGhvcj48L2F1dGhvcnM+PC9j
 b250cmlidXRvcnM+PHRpdGxlcz48dGl0bGU+UmVpbmZvcmNlbWVudCBsZWFybmluZyBmb3IgYnVp
@@ -358,7 +392,7 @@
 Y2UtbnVtPjwvcmVjb3JkPjwvQ2l0ZT48Q2l0ZT48QXV0aG9yPkFobjwvQXV0aG9yPjxZZWFyPjIw
 MjM8L1llYXI+PFJlY051bT4xPC9SZWNOdW0+PHJlY29yZD48cmVjLW51bWJlcj4xPC9yZWMtbnVt
 YmVyPjxmb3JlaWduLWtleXM+PGtleSBhcHA9IkVOIiBkYi1pZD0ibWRhZTg1MDAxMDk0OTZmZWE0
-YWZmOWMwODZlMTZjYzI1ODk1IiB0aW1lc3RhbXA9IjE3OTMyMjEzMDQiPjE8L2tleT48L2ZvcmVp
+YWZmOWMwODZlMTZjYzI1ODk1IiB0aW1lc3RhbXA9IjE3OTMyMjE2NDkiPjE8L2tleT48L2ZvcmVp
 Z24ta2V5cz48cmVmLXR5cGUgbmFtZT0iSm91cm5hbCBBcnRpY2xlIj4xNzwvcmVmLXR5cGU+PGNv
 bnRyaWJ1dG9ycz48YXV0aG9ycz48YXV0aG9yPkFobiwgS2kgVWhuPC9hdXRob3I+PGF1dGhvcj5L
 aW0sIERldWstV29vPC9hdXRob3I+PGF1dGhvcj5DaG8sIEh5dW4gTWk8L2F1dGhvcj48YXV0aG9y
@@ -376,7 +410,7 @@
 aG9yPlpoYW5nPC9BdXRob3I+PFllYXI+MjAyNDwvWWVhcj48UmVjTnVtPjk0PC9SZWNOdW0+PHJl
 Y29yZD48cmVjLW51bWJlcj45NDwvcmVjLW51bWJlcj48Zm9yZWlnbi1rZXlzPjxrZXkgYXBwPSJF
 TiIgZGItaWQ9Im1kYWU4NTAwMTA5NDk2ZmVhNGFmZjljMDg2ZTE2Y2MyNTg5NSIgdGltZXN0YW1w
-PSIxNzkzMjIxMzA0Ij45NDwva2V5PjwvZm9yZWlnbi1rZXlzPjxyZWYtdHlwZSBuYW1lPSJKb3Vy
+PSIxNzkzMjIxNjQ5Ij45NDwva2V5PjwvZm9yZWlnbi1rZXlzPjxyZWYtdHlwZSBuYW1lPSJKb3Vy
 bmFsIEFydGljbGUiPjE3PC9yZWYtdHlwZT48Y29udHJpYnV0b3JzPjxhdXRob3JzPjxhdXRob3I+
 WmhhbmcsIExpYW5nPC9hdXRob3I+PGF1dGhvcj5DaGVuLCBaaGVsdW48L2F1dGhvcj48L2F1dGhv
 cnM+PC9jb250cmlidXRvcnM+PHRpdGxlcz48dGl0bGU+TGFyZ2UgbGFuZ3VhZ2UgbW9kZWwtYmFz
@@ -392,7 +426,7 @@
 aXRlPjxDaXRlPjxBdXRob3I+TGl1PC9BdXRob3I+PFllYXI+MjAyNTwvWWVhcj48UmVjTnVtPjUx
 PC9SZWNOdW0+PHJlY29yZD48cmVjLW51bWJlcj41MTwvcmVjLW51bWJlcj48Zm9yZWlnbi1rZXlz
 PjxrZXkgYXBwPSJFTiIgZGItaWQ9Im1kYWU4NTAwMTA5NDk2ZmVhNGFmZjljMDg2ZTE2Y2MyNTg5
-NSIgdGltZXN0YW1wPSIxNzkzMjIxMzA0Ij41MTwva2V5PjwvZm9yZWlnbi1rZXlzPjxyZWYtdHlw
+NSIgdGltZXN0YW1wPSIxNzkzMjIxNjQ5Ij41MTwva2V5PjwvZm9yZWlnbi1rZXlzPjxyZWYtdHlw
 ZSBuYW1lPSJKb3VybmFsIEFydGljbGUiPjE3PC9yZWYtdHlwZT48Y29udHJpYnV0b3JzPjxhdXRo
 b3JzPjxhdXRob3I+TGl1LCBNaW5nemhlPC9hdXRob3I+PGF1dGhvcj5aaGFuZywgTGlhbmc8L2F1
 dGhvcj48YXV0aG9yPkNoZW4sIEppYW5saTwvYXV0aG9yPjxhdXRob3I+Q2hlbiwgV2VpLUFuPC9h
@@ -438,7 +472,7 @@
 Y051bT4yNjwvUmVjTnVtPjxEaXNwbGF5VGV4dD5bNyw4XTwvRGlzcGxheVRleHQ+PHJlY29yZD48
 cmVjLW51bWJlcj4yNjwvcmVjLW51bWJlcj48Zm9yZWlnbi1rZXlzPjxrZXkgYXBwPSJFTiIgZGIt
 aWQ9Im1kYWU4NTAwMTA5NDk2ZmVhNGFmZjljMDg2ZTE2Y2MyNTg5NSIgdGltZXN0YW1wPSIxNzkz
-MjIxMzA0Ij4yNjwva2V5PjwvZm9yZWlnbi1rZXlzPjxyZWYtdHlwZSBuYW1lPSJKb3VybmFsIEFy
+MjIxNjQ5Ij4yNjwva2V5PjwvZm9yZWlnbi1rZXlzPjxyZWYtdHlwZSBuYW1lPSJKb3VybmFsIEFy
 dGljbGUiPjE3PC9yZWYtdHlwZT48Y29udHJpYnV0b3JzPjxhdXRob3JzPjxhdXRob3I+R29tZXMs
 IENsw6F1ZGlvPC9hdXRob3I+PGF1dGhvcj5UaHVsZSwgQ2FzcGVyPC9hdXRob3I+PGF1dGhvcj5C
 cm9tYW4sIERhdmlkPC9hdXRob3I+PGF1dGhvcj5MYXJzZW4sIFBldGVyIEdvcm08L2F1dGhvcj48
@@ -454,7 +488,7 @@
 Yy1yZXNvdXJjZS1udW0+PC9yZWNvcmQ+PC9DaXRlPjxDaXRlPjxBdXRob3I+SG9uZzwvQXV0aG9y
 PjxZZWFyPjIwMTg8L1llYXI+PFJlY051bT4zNDwvUmVjTnVtPjxyZWNvcmQ+PHJlYy1udW1iZXI+
 MzQ8L3JlYy1udW1iZXI+PGZvcmVpZ24ta2V5cz48a2V5IGFwcD0iRU4iIGRiLWlkPSJtZGFlODUw
-MDEwOTQ5NmZlYTRhZmY5YzA4NmUxNmNjMjU4OTUiIHRpbWVzdGFtcD0iMTc5MzIyMTMwNCI+MzQ8
+MDEwOTQ5NmZlYTRhZmY5YzA4NmUxNmNjMjU4OTUiIHRpbWVzdGFtcD0iMTc5MzIyMTY0OSI+MzQ8
 L2tleT48L2ZvcmVpZ24ta2V5cz48cmVmLXR5cGUgbmFtZT0iSm91cm5hbCBBcnRpY2xlIj4xNzwv
 cmVmLXR5cGU+PGNvbnRyaWJ1dG9ycz48YXV0aG9ycz48YXV0aG9yPkhvbmcsIFRpYW56aGVuPC9h
 dXRob3I+PGF1dGhvcj5MYW5nZXZpbiwgSmFyZWQ8L2F1dGhvcj48YXV0aG9yPlN1biwgS2FpeXU8
@@ -479,7 +513,7 @@
 Y051bT4yNjwvUmVjTnVtPjxEaXNwbGF5VGV4dD5bNyw4XTwvRGlzcGxheVRleHQ+PHJlY29yZD48
 cmVjLW51bWJlcj4yNjwvcmVjLW51bWJlcj48Zm9yZWlnbi1rZXlzPjxrZXkgYXBwPSJFTiIgZGIt
 aWQ9Im1kYWU4NTAwMTA5NDk2ZmVhNGFmZjljMDg2ZTE2Y2MyNTg5NSIgdGltZXN0YW1wPSIxNzkz
-MjIxMzA0Ij4yNjwva2V5PjwvZm9yZWlnbi1rZXlzPjxyZWYtdHlwZSBuYW1lPSJKb3VybmFsIEFy
+MjIxNjQ5Ij4yNjwva2V5PjwvZm9yZWlnbi1rZXlzPjxyZWYtdHlwZSBuYW1lPSJKb3VybmFsIEFy
 dGljbGUiPjE3PC9yZWYtdHlwZT48Y29udHJpYnV0b3JzPjxhdXRob3JzPjxhdXRob3I+R29tZXMs
 IENsw6F1ZGlvPC9hdXRob3I+PGF1dGhvcj5UaHVsZSwgQ2FzcGVyPC9hdXRob3I+PGF1dGhvcj5C
 cm9tYW4sIERhdmlkPC9hdXRob3I+PGF1dGhvcj5MYXJzZW4sIFBldGVyIEdvcm08L2F1dGhvcj48
@@ -495,7 +529,7 @@
 Yy1yZXNvdXJjZS1udW0+PC9yZWNvcmQ+PC9DaXRlPjxDaXRlPjxBdXRob3I+SG9uZzwvQXV0aG9y
 PjxZZWFyPjIwMTg8L1llYXI+PFJlY051bT4zNDwvUmVjTnVtPjxyZWNvcmQ+PHJlYy1udW1iZXI+
 MzQ8L3JlYy1udW1iZXI+PGZvcmVpZ24ta2V5cz48a2V5IGFwcD0iRU4iIGRiLWlkPSJtZGFlODUw
-MDEwOTQ5NmZlYTRhZmY5YzA4NmUxNmNjMjU4OTUiIHRpbWVzdGFtcD0iMTc5MzIyMTMwNCI+MzQ8
+MDEwOTQ5NmZlYTRhZmY5YzA4NmUxNmNjMjU4OTUiIHRpbWVzdGFtcD0iMTc5MzIyMTY0OSI+MzQ8
 L2tleT48L2ZvcmVpZ24ta2V5cz48cmVmLXR5cGUgbmFtZT0iSm91cm5hbCBBcnRpY2xlIj4xNzwv
 cmVmLXR5cGU+PGNvbnRyaWJ1dG9ycz48YXV0aG9ycz48YXV0aG9yPkhvbmcsIFRpYW56aGVuPC9h
 dXRob3I+PGF1dGhvcj5MYW5nZXZpbiwgSmFyZWQ8L2F1dGhvcj48YXV0aG9yPlN1biwgS2FpeXU8
@@ -546,7 +580,7 @@
 PjxSZWNOdW0+NjwvUmVjTnVtPjxEaXNwbGF5VGV4dD5bOSwxMF08L0Rpc3BsYXlUZXh0PjxyZWNv
 cmQ+PHJlYy1udW1iZXI+NjwvcmVjLW51bWJlcj48Zm9yZWlnbi1rZXlzPjxrZXkgYXBwPSJFTiIg
 ZGItaWQ9Im1kYWU4NTAwMTA5NDk2ZmVhNGFmZjljMDg2ZTE2Y2MyNTg5NSIgdGltZXN0YW1wPSIx
-NzkzMjIxMzA0Ij42PC9rZXk+PC9mb3JlaWduLWtleXM+PHJlZi10eXBlIG5hbWU9IkNvbmZlcmVu
+NzkzMjIxNjQ5Ij42PC9rZXk+PC9mb3JlaWduLWtleXM+PHJlZi10eXBlIG5hbWU9IkNvbmZlcmVu
 Y2UgUGFwZXIiPjQ3PC9yZWYtdHlwZT48Y29udHJpYnV0b3JzPjxhdXRob3JzPjxhdXRob3I+Qmxv
 Y2h3aXR6LCBULjwvYXV0aG9yPjxhdXRob3I+T3R0ZXIsIE0uPC9hdXRob3I+PGF1dGhvcj5Bcm5v
 bGQsIE0uPC9hdXRob3I+PGF1dGhvcj5CYXVzY2gsIEMuPC9hdXRob3I+PGF1dGhvcj5DbGF1c3Ms
@@ -567,7 +601,7 @@
 aXRlPjxDaXRlPjxBdXRob3I+SnVuZ2hhbm5zPC9BdXRob3I+PFllYXI+MjAyMTwvWWVhcj48UmVj
 TnVtPjQyPC9SZWNOdW0+PHJlY29yZD48cmVjLW51bWJlcj40MjwvcmVjLW51bWJlcj48Zm9yZWln
 bi1rZXlzPjxrZXkgYXBwPSJFTiIgZGItaWQ9Im1kYWU4NTAwMTA5NDk2ZmVhNGFmZjljMDg2ZTE2
-Y2MyNTg5NSIgdGltZXN0YW1wPSIxNzkzMjIxMzA0Ij40Mjwva2V5PjwvZm9yZWlnbi1rZXlzPjxy
+Y2MyNTg5NSIgdGltZXN0YW1wPSIxNzkzMjIxNjQ5Ij40Mjwva2V5PjwvZm9yZWlnbi1rZXlzPjxy
 ZWYtdHlwZSBuYW1lPSJDb25mZXJlbmNlIFBhcGVyIj40NzwvcmVmLXR5cGU+PGNvbnRyaWJ1dG9y
 cz48YXV0aG9ycz48YXV0aG9yPkp1bmdoYW5ucywgQW5kcmVhczwvYXV0aG9yPjxhdXRob3I+Qmxv
 Y2h3aXR6LCBUb3JzdGVuPC9hdXRob3I+PGF1dGhvcj5CZXJ0c2NoLCBDaHJpc3RpYW48L2F1dGhv
@@ -598,7 +632,7 @@
 PjxSZWNOdW0+NjwvUmVjTnVtPjxEaXNwbGF5VGV4dD5bOSwxMF08L0Rpc3BsYXlUZXh0PjxyZWNv
 cmQ+PHJlYy1udW1iZXI+NjwvcmVjLW51bWJlcj48Zm9yZWlnbi1rZXlzPjxrZXkgYXBwPSJFTiIg
 ZGItaWQ9Im1kYWU4NTAwMTA5NDk2ZmVhNGFmZjljMDg2ZTE2Y2MyNTg5NSIgdGltZXN0YW1wPSIx
-NzkzMjIxMzA0Ij42PC9rZXk+PC9mb3JlaWduLWtleXM+PHJlZi10eXBlIG5hbWU9IkNvbmZlcmVu
+NzkzMjIxNjQ5Ij42PC9rZXk+PC9mb3JlaWduLWtleXM+PHJlZi10eXBlIG5hbWU9IkNvbmZlcmVu
 Y2UgUGFwZXIiPjQ3PC9yZWYtdHlwZT48Y29udHJpYnV0b3JzPjxhdXRob3JzPjxhdXRob3I+Qmxv
 Y2h3aXR6LCBULjwvYXV0aG9yPjxhdXRob3I+T3R0ZXIsIE0uPC9hdXRob3I+PGF1dGhvcj5Bcm5v
 bGQsIE0uPC9hdXRob3I+PGF1dGhvcj5CYXVzY2gsIEMuPC9hdXRob3I+PGF1dGhvcj5DbGF1c3Ms
@@ -619,7 +653,7 @@
 aXRlPjxDaXRlPjxBdXRob3I+SnVuZ2hhbm5zPC9BdXRob3I+PFllYXI+MjAyMTwvWWVhcj48UmVj
 TnVtPjQyPC9SZWNOdW0+PHJlY29yZD48cmVjLW51bWJlcj40MjwvcmVjLW51bWJlcj48Zm9yZWln
 bi1rZXlzPjxrZXkgYXBwPSJFTiIgZGItaWQ9Im1kYWU4NTAwMTA5NDk2ZmVhNGFmZjljMDg2ZTE2
-Y2MyNTg5NSIgdGltZXN0YW1wPSIxNzkzMjIxMzA0Ij40Mjwva2V5PjwvZm9yZWlnbi1rZXlzPjxy
+Y2MyNTg5NSIgdGltZXN0YW1wPSIxNzkzMjIxNjQ5Ij40Mjwva2V5PjwvZm9yZWlnbi1rZXlzPjxy
 ZWYtdHlwZSBuYW1lPSJDb25mZXJlbmNlIFBhcGVyIj40NzwvcmVmLXR5cGU+PGNvbnRyaWJ1dG9y
 cz48YXV0aG9ycz48YXV0aG9yPkp1bmdoYW5ucywgQW5kcmVhczwvYXV0aG9yPjxhdXRob3I+Qmxv
 Y2h3aXR6LCBUb3JzdGVuPC9hdXRob3I+PGF1dGhvcj5CZXJ0c2NoLCBDaHJpc3RpYW48L2F1dGhv
@@ -668,7 +702,7 @@
 ZWNOdW0+ODU8L1JlY051bT48RGlzcGxheVRleHQ+WzExLDEyXTwvRGlzcGxheVRleHQ+PHJlY29y
 ZD48cmVjLW51bWJlcj44NTwvcmVjLW51bWJlcj48Zm9yZWlnbi1rZXlzPjxrZXkgYXBwPSJFTiIg
 ZGItaWQ9Im1kYWU4NTAwMTA5NDk2ZmVhNGFmZjljMDg2ZTE2Y2MyNTg5NSIgdGltZXN0YW1wPSIx
-NzkzMjIxMzA0Ij44NTwva2V5PjwvZm9yZWlnbi1rZXlzPjxyZWYtdHlwZSBuYW1lPSJKb3VybmFs
+NzkzMjIxNjQ5Ij44NTwva2V5PjwvZm9yZWlnbi1rZXlzPjxyZWYtdHlwZSBuYW1lPSJKb3VybmFs
 IEFydGljbGUiPjE3PC9yZWYtdHlwZT48Y29udHJpYnV0b3JzPjxhdXRob3JzPjxhdXRob3I+V2V0
 dGVyLCBNaWNoYWVsPC9hdXRob3I+PC9hdXRob3JzPjwvY29udHJpYnV0b3JzPjx0aXRsZXM+PHRp
 dGxlPkNvLXNpbXVsYXRpb24gb2YgYnVpbGRpbmcgZW5lcmd5IGFuZCBjb250cm9sIHN5c3RlbXMg
@@ -685,7 +719,7 @@
 L3JlY29yZD48L0NpdGU+PENpdGU+PEF1dGhvcj5Ob3VpZHVpPC9BdXRob3I+PFllYXI+MjAxNDwv
 WWVhcj48UmVjTnVtPjU5PC9SZWNOdW0+PHJlY29yZD48cmVjLW51bWJlcj41OTwvcmVjLW51bWJl
 cj48Zm9yZWlnbi1rZXlzPjxrZXkgYXBwPSJFTiIgZGItaWQ9Im1kYWU4NTAwMTA5NDk2ZmVhNGFm
-ZjljMDg2ZTE2Y2MyNTg5NSIgdGltZXN0YW1wPSIxNzkzMjIxMzA0Ij41OTwva2V5PjwvZm9yZWln
+ZjljMDg2ZTE2Y2MyNTg5NSIgdGltZXN0YW1wPSIxNzkzMjIxNjQ5Ij41OTwva2V5PjwvZm9yZWln
 bi1rZXlzPjxyZWYtdHlwZSBuYW1lPSJKb3VybmFsIEFydGljbGUiPjE3PC9yZWYtdHlwZT48Y29u
 dHJpYnV0b3JzPjxhdXRob3JzPjxhdXRob3I+Tm91aWR1aSwgVGhpZXJyeTwvYXV0aG9yPjxhdXRo
 b3I+V2V0dGVyLCBNaWNoYWVsPC9hdXRob3I+PGF1dGhvcj5adW8sIFdhbmdkYTwvYXV0aG9yPjwv
@@ -712,7 +746,7 @@
 ZWNOdW0+ODU8L1JlY051bT48RGlzcGxheVRleHQ+WzExLDEyXTwvRGlzcGxheVRleHQ+PHJlY29y
 ZD48cmVjLW51bWJlcj44NTwvcmVjLW51bWJlcj48Zm9yZWlnbi1rZXlzPjxrZXkgYXBwPSJFTiIg
 ZGItaWQ9Im1kYWU4NTAwMTA5NDk2ZmVhNGFmZjljMDg2ZTE2Y2MyNTg5NSIgdGltZXN0YW1wPSIx
-NzkzMjIxMzA0Ij44NTwva2V5PjwvZm9yZWlnbi1rZXlzPjxyZWYtdHlwZSBuYW1lPSJKb3VybmFs
+NzkzMjIxNjQ5Ij44NTwva2V5PjwvZm9yZWlnbi1rZXlzPjxyZWYtdHlwZSBuYW1lPSJKb3VybmFs
 IEFydGljbGUiPjE3PC9yZWYtdHlwZT48Y29udHJpYnV0b3JzPjxhdXRob3JzPjxhdXRob3I+V2V0
 dGVyLCBNaWNoYWVsPC9hdXRob3I+PC9hdXRob3JzPjwvY29udHJpYnV0b3JzPjx0aXRsZXM+PHRp
 dGxlPkNvLXNpbXVsYXRpb24gb2YgYnVpbGRpbmcgZW5lcmd5IGFuZCBjb250cm9sIHN5c3RlbXMg
@@ -729,7 +763,7 @@
 L3JlY29yZD48L0NpdGU+PENpdGU+PEF1dGhvcj5Ob3VpZHVpPC9BdXRob3I+PFllYXI+MjAxNDwv
 WWVhcj48UmVjTnVtPjU5PC9SZWNOdW0+PHJlY29yZD48cmVjLW51bWJlcj41OTwvcmVjLW51bWJl
 cj48Zm9yZWlnbi1rZXlzPjxrZXkgYXBwPSJFTiIgZGItaWQ9Im1kYWU4NTAwMTA5NDk2ZmVhNGFm
-ZjljMDg2ZTE2Y2MyNTg5NSIgdGltZXN0YW1wPSIxNzkzMjIxMzA0Ij41OTwva2V5PjwvZm9yZWln
+ZjljMDg2ZTE2Y2MyNTg5NSIgdGltZXN0YW1wPSIxNzkzMjIxNjQ5Ij41OTwva2V5PjwvZm9yZWln
 bi1rZXlzPjxyZWYtdHlwZSBuYW1lPSJKb3VybmFsIEFydGljbGUiPjE3PC9yZWYtdHlwZT48Y29u
 dHJpYnV0b3JzPjxhdXRob3JzPjxhdXRob3I+Tm91aWR1aSwgVGhpZXJyeTwvYXV0aG9yPjxhdXRo
 b3I+V2V0dGVyLCBNaWNoYWVsPC9hdXRob3I+PGF1dGhvcj5adW8sIFdhbmdkYTwvYXV0aG9yPjwv
@@ -772,7 +806,7 @@
         <w:fldChar w:fldCharType="begin"/>
       </w:r>
       <w:r>
-        <w:instrText xml:space="preserve"> ADDIN EN.CITE &lt;EndNote&gt;&lt;Cite&gt;&lt;Author&gt;Wetter&lt;/Author&gt;&lt;Year&gt;2020&lt;/Year&gt;&lt;RecNum&gt;86&lt;/RecNum&gt;&lt;DisplayText&gt;[13]&lt;/DisplayText&gt;&lt;record&gt;&lt;rec-number&gt;86&lt;/rec-number&gt;&lt;foreign-keys&gt;&lt;key app="EN" db-id="mdae8500109496fea4aff9c086e16cc25895" timestamp="1793221304"&gt;86&lt;/key&gt;&lt;/foreign-keys&gt;&lt;ref-type name="Conference Paper"&gt;47&lt;/ref-type&gt;&lt;contributors&gt;&lt;authors&gt;&lt;author&gt;Wetter, Michael&lt;/author&gt;&lt;author&gt;Benne, Kyle&lt;/author&gt;&lt;author&gt;Gautier, Antoine&lt;/author&gt;&lt;author&gt;Nouidui, Thierry S.&lt;/author&gt;&lt;author&gt;Ramle, Agnes&lt;/author&gt;&lt;author&gt;Roth, Amir&lt;/author&gt;&lt;author&gt;Tummescheit, Hubertus&lt;/author&gt;&lt;author&gt;Mentzer, Stuart&lt;/author&gt;&lt;author&gt;Winther, Christian&lt;/author&gt;&lt;/authors&gt;&lt;/contributors&gt;&lt;titles&gt;&lt;title&gt;Lifting the Garage Door on Spawn, an Open-Source BEM-Controls Engine&lt;/title&gt;&lt;secondary-title&gt;Proceedings of SimBuild Conference 2020, ASHRAE/IBPSA-USA Building Simulation Conference&lt;/secondary-title&gt;&lt;/titles&gt;&lt;volume&gt;9&lt;/volume&gt;&lt;dates&gt;&lt;year&gt;2020&lt;/year&gt;&lt;/dates&gt;&lt;publisher&gt;IBPSA-USA&lt;/publisher&gt;&lt;label&gt;wetter2020&lt;/label&gt;&lt;urls&gt;&lt;/urls&gt;&lt;electronic-resource-num&gt;10.26868/25746308.2020.C063&lt;/electronic-resource-num&gt;&lt;/record&gt;&lt;/Cite&gt;&lt;/EndNote&gt;</w:instrText>
+        <w:instrText xml:space="preserve"> ADDIN EN.CITE &lt;EndNote&gt;&lt;Cite&gt;&lt;Author&gt;Wetter&lt;/Author&gt;&lt;Year&gt;2020&lt;/Year&gt;&lt;RecNum&gt;86&lt;/RecNum&gt;&lt;DisplayText&gt;[13]&lt;/DisplayText&gt;&lt;record&gt;&lt;rec-number&gt;86&lt;/rec-number&gt;&lt;foreign-keys&gt;&lt;key app="EN" db-id="mdae8500109496fea4aff9c086e16cc25895" timestamp="1793221649"&gt;86&lt;/key&gt;&lt;/foreign-keys&gt;&lt;ref-type name="Conference Paper"&gt;47&lt;/ref-type&gt;&lt;contributors&gt;&lt;authors&gt;&lt;author&gt;Wetter, Michael&lt;/author&gt;&lt;author&gt;Benne, Kyle&lt;/author&gt;&lt;author&gt;Gautier, Antoine&lt;/author&gt;&lt;author&gt;Nouidui, Thierry S.&lt;/author&gt;&lt;author&gt;Ramle, Agnes&lt;/author&gt;&lt;author&gt;Roth, Amir&lt;/author&gt;&lt;author&gt;Tummescheit, Hubertus&lt;/author&gt;&lt;author&gt;Mentzer, Stuart&lt;/author&gt;&lt;author&gt;Winther, Christian&lt;/author&gt;&lt;/authors&gt;&lt;/contributors&gt;&lt;titles&gt;&lt;title&gt;Lifting the Garage Door on Spawn, an Open-Source BEM-Controls Engine&lt;/title&gt;&lt;secondary-title&gt;Proceedings of SimBuild Conference 2020, ASHRAE/IBPSA-USA Building Simulation Conference&lt;/secondary-title&gt;&lt;/titles&gt;&lt;volume&gt;9&lt;/volume&gt;&lt;dates&gt;&lt;year&gt;2020&lt;/year&gt;&lt;/dates&gt;&lt;publisher&gt;IBPSA-USA&lt;/publisher&gt;&lt;label&gt;wetter2020&lt;/label&gt;&lt;urls&gt;&lt;/urls&gt;&lt;electronic-resource-num&gt;10.26868/25746308.2020.C063&lt;/electronic-resource-num&gt;&lt;/record&gt;&lt;/Cite&gt;&lt;/EndNote&gt;</w:instrText>
       </w:r>
       <w:r>
         <w:fldChar w:fldCharType="separate"/>
@@ -795,7 +829,7 @@
 PC9ZZWFyPjxSZWNOdW0+NDE8L1JlY051bT48RGlzcGxheVRleHQ+WzE04oCTMTZdPC9EaXNwbGF5
 VGV4dD48cmVjb3JkPjxyZWMtbnVtYmVyPjQxPC9yZWMtbnVtYmVyPjxmb3JlaWduLWtleXM+PGtl
 eSBhcHA9IkVOIiBkYi1pZD0ibWRhZTg1MDAxMDk0OTZmZWE0YWZmOWMwODZlMTZjYzI1ODk1IiB0
-aW1lc3RhbXA9IjE3OTMyMjEzMDQiPjQxPC9rZXk+PC9mb3JlaWduLWtleXM+PHJlZi10eXBlIG5h
+aW1lc3RhbXA9IjE3OTMyMjE2NDkiPjQxPC9rZXk+PC9mb3JlaWduLWtleXM+PHJlZi10eXBlIG5h
 bWU9IkNvbmZlcmVuY2UgUGFwZXIiPjQ3PC9yZWYtdHlwZT48Y29udHJpYnV0b3JzPjxhdXRob3Jz
 PjxhdXRob3I+Smltw6luZXotUmFib3NvLCBKYXZpZXI8L2F1dGhvcj48YXV0aG9yPkNhbXBveS1O
 aWV2ZXMsIEFsZWphbmRybzwvYXV0aG9yPjxhdXRob3I+TWFuamF2YWNhcy1MdWNhcywgQW50b25p
@@ -813,8 +847,8 @@
 dHJvbmljLXJlc291cmNlLW51bT48L3JlY29yZD48L0NpdGU+PENpdGU+PEF1dGhvcj5aaGFuZzwv
 QXV0aG9yPjxZZWFyPjIwMjA8L1llYXI+PFJlY051bT45MDwvUmVjTnVtPjxyZWNvcmQ+PHJlYy1u
 dW1iZXI+OTA8L3JlYy1udW1iZXI+PGZvcmVpZ24ta2V5cz48a2V5IGFwcD0iRU4iIGRiLWlkPSJt
-ZGFlODUwMDEwOTQ5NmZlYTRhZmY5YzA4NmUxNmNjMjU4OTUiIHRpbWVzdGFtcD0iMTc5MzIyMTMw
-NCI+OTA8L2tleT48L2ZvcmVpZ24ta2V5cz48cmVmLXR5cGUgbmFtZT0iQ29uZmVyZW5jZSBQYXBl
+ZGFlODUwMDEwOTQ5NmZlYTRhZmY5YzA4NmUxNmNjMjU4OTUiIHRpbWVzdGFtcD0iMTc5MzIyMTY0
+OSI+OTA8L2tleT48L2ZvcmVpZ24ta2V5cz48cmVmLXR5cGUgbmFtZT0iQ29uZmVyZW5jZSBQYXBl
 ciI+NDc8L3JlZi10eXBlPjxjb250cmlidXRvcnM+PGF1dGhvcnM+PGF1dGhvcj5aaGFuZywgVGlh
 bnl1PC9hdXRob3I+PGF1dGhvcj5BcmRha2FuaWFuLCBPbWlkPC9hdXRob3I+PC9hdXRob3JzPjwv
 Y29udHJpYnV0b3JzPjx0aXRsZXM+PHRpdGxlPkNPQlM6IENPbXByZWhlbnNpdmUgQnVpbGRpbmcg
@@ -829,7 +863,7 @@
 PjxDaXRlPjxBdXRob3I+Qmx1bTwvQXV0aG9yPjxZZWFyPjIwMjE8L1llYXI+PFJlY051bT43PC9S
 ZWNOdW0+PHJlY29yZD48cmVjLW51bWJlcj43PC9yZWMtbnVtYmVyPjxmb3JlaWduLWtleXM+PGtl
 eSBhcHA9IkVOIiBkYi1pZD0ibWRhZTg1MDAxMDk0OTZmZWE0YWZmOWMwODZlMTZjYzI1ODk1IiB0
-aW1lc3RhbXA9IjE3OTMyMjEzMDQiPjc8L2tleT48L2ZvcmVpZ24ta2V5cz48cmVmLXR5cGUgbmFt
+aW1lc3RhbXA9IjE3OTMyMjE2NDkiPjc8L2tleT48L2ZvcmVpZ24ta2V5cz48cmVmLXR5cGUgbmFt
 ZT0iSm91cm5hbCBBcnRpY2xlIj4xNzwvcmVmLXR5cGU+PGNvbnRyaWJ1dG9ycz48YXV0aG9ycz48
 YXV0aG9yPkJsdW0sIERhdmlkPC9hdXRob3I+PGF1dGhvcj5BcnJveW8sIEphdmllcjwvYXV0aG9y
 PjxhdXRob3I+SHVhbmcsIFNlbjwvYXV0aG9yPjxhdXRob3I+RHJnb8WIYSwgSsOhbjwvYXV0aG9y
@@ -861,7 +895,7 @@
 PC9ZZWFyPjxSZWNOdW0+NDE8L1JlY051bT48RGlzcGxheVRleHQ+WzE04oCTMTZdPC9EaXNwbGF5
 VGV4dD48cmVjb3JkPjxyZWMtbnVtYmVyPjQxPC9yZWMtbnVtYmVyPjxmb3JlaWduLWtleXM+PGtl
 eSBhcHA9IkVOIiBkYi1pZD0ibWRhZTg1MDAxMDk0OTZmZWE0YWZmOWMwODZlMTZjYzI1ODk1IiB0
-aW1lc3RhbXA9IjE3OTMyMjEzMDQiPjQxPC9rZXk+PC9mb3JlaWduLWtleXM+PHJlZi10eXBlIG5h
+aW1lc3RhbXA9IjE3OTMyMjE2NDkiPjQxPC9rZXk+PC9mb3JlaWduLWtleXM+PHJlZi10eXBlIG5h
 bWU9IkNvbmZlcmVuY2UgUGFwZXIiPjQ3PC9yZWYtdHlwZT48Y29udHJpYnV0b3JzPjxhdXRob3Jz
 PjxhdXRob3I+Smltw6luZXotUmFib3NvLCBKYXZpZXI8L2F1dGhvcj48YXV0aG9yPkNhbXBveS1O
 aWV2ZXMsIEFsZWphbmRybzwvYXV0aG9yPjxhdXRob3I+TWFuamF2YWNhcy1MdWNhcywgQW50b25p
@@ -879,8 +913,8 @@
 dHJvbmljLXJlc291cmNlLW51bT48L3JlY29yZD48L0NpdGU+PENpdGU+PEF1dGhvcj5aaGFuZzwv
 QXV0aG9yPjxZZWFyPjIwMjA8L1llYXI+PFJlY051bT45MDwvUmVjTnVtPjxyZWNvcmQ+PHJlYy1u
 dW1iZXI+OTA8L3JlYy1udW1iZXI+PGZvcmVpZ24ta2V5cz48a2V5IGFwcD0iRU4iIGRiLWlkPSJt
-ZGFlODUwMDEwOTQ5NmZlYTRhZmY5YzA4NmUxNmNjMjU4OTUiIHRpbWVzdGFtcD0iMTc5MzIyMTMw
-NCI+OTA8L2tleT48L2ZvcmVpZ24ta2V5cz48cmVmLXR5cGUgbmFtZT0iQ29uZmVyZW5jZSBQYXBl
+ZGFlODUwMDEwOTQ5NmZlYTRhZmY5YzA4NmUxNmNjMjU4OTUiIHRpbWVzdGFtcD0iMTc5MzIyMTY0
+OSI+OTA8L2tleT48L2ZvcmVpZ24ta2V5cz48cmVmLXR5cGUgbmFtZT0iQ29uZmVyZW5jZSBQYXBl
 ciI+NDc8L3JlZi10eXBlPjxjb250cmlidXRvcnM+PGF1dGhvcnM+PGF1dGhvcj5aaGFuZywgVGlh
 bnl1PC9hdXRob3I+PGF1dGhvcj5BcmRha2FuaWFuLCBPbWlkPC9hdXRob3I+PC9hdXRob3JzPjwv
 Y29udHJpYnV0b3JzPjx0aXRsZXM+PHRpdGxlPkNPQlM6IENPbXByZWhlbnNpdmUgQnVpbGRpbmcg
@@ -895,7 +929,7 @@
 PjxDaXRlPjxBdXRob3I+Qmx1bTwvQXV0aG9yPjxZZWFyPjIwMjE8L1llYXI+PFJlY051bT43PC9S
 ZWNOdW0+PHJlY29yZD48cmVjLW51bWJlcj43PC9yZWMtbnVtYmVyPjxmb3JlaWduLWtleXM+PGtl
 eSBhcHA9IkVOIiBkYi1pZD0ibWRhZTg1MDAxMDk0OTZmZWE0YWZmOWMwODZlMTZjYzI1ODk1IiB0
-aW1lc3RhbXA9IjE3OTMyMjEzMDQiPjc8L2tleT48L2ZvcmVpZ24ta2V5cz48cmVmLXR5cGUgbmFt
+aW1lc3RhbXA9IjE3OTMyMjE2NDkiPjc8L2tleT48L2ZvcmVpZ24ta2V5cz48cmVmLXR5cGUgbmFt
 ZT0iSm91cm5hbCBBcnRpY2xlIj4xNzwvcmVmLXR5cGU+PGNvbnRyaWJ1dG9ycz48YXV0aG9ycz48
 YXV0aG9yPkJsdW0sIERhdmlkPC9hdXRob3I+PGF1dGhvcj5BcnJveW8sIEphdmllcjwvYXV0aG9y
 PjxhdXRob3I+SHVhbmcsIFNlbjwvYXV0aG9yPjxhdXRob3I+RHJnb8WIYSwgSsOhbjwvYXV0aG9y
@@ -945,7 +979,7 @@
 cj48UmVjTnVtPjY4PC9SZWNOdW0+PERpc3BsYXlUZXh0PlsxN+KAkzIwXTwvRGlzcGxheVRleHQ+
 PHJlY29yZD48cmVjLW51bWJlcj42ODwvcmVjLW51bWJlcj48Zm9yZWlnbi1rZXlzPjxrZXkgYXBw
 PSJFTiIgZGItaWQ9Im1kYWU4NTAwMTA5NDk2ZmVhNGFmZjljMDg2ZTE2Y2MyNTg5NSIgdGltZXN0
-YW1wPSIxNzkzMjIxMzA0Ij42ODwva2V5PjwvZm9yZWlnbi1rZXlzPjxyZWYtdHlwZSBuYW1lPSJD
+YW1wPSIxNzkzMjIxNjQ5Ij42ODwva2V5PjwvZm9yZWlnbi1rZXlzPjxyZWYtdHlwZSBuYW1lPSJD
 b25mZXJlbmNlIFBhcGVyIj40NzwvcmVmLXR5cGU+PGNvbnRyaWJ1dG9ycz48YXV0aG9ycz48YXV0
 aG9yPlBhbG1pbnRpZXIsIEJyeWFuPC9hdXRob3I+PGF1dGhvcj5LcmlzaG5hbXVydGh5LCBEaGVl
 cGFrPC9hdXRob3I+PGF1dGhvcj5Ub3AsIFBoaWxpcDwvYXV0aG9yPjxhdXRob3I+U21pdGgsIFN0
@@ -963,7 +997,7 @@
 SGFyZHk8L0F1dGhvcj48WWVhcj4yMDI0PC9ZZWFyPjxSZWNOdW0+Mjk8L1JlY051bT48cmVjb3Jk
 PjxyZWMtbnVtYmVyPjI5PC9yZWMtbnVtYmVyPjxmb3JlaWduLWtleXM+PGtleSBhcHA9IkVOIiBk
 Yi1pZD0ibWRhZTg1MDAxMDk0OTZmZWE0YWZmOWMwODZlMTZjYzI1ODk1IiB0aW1lc3RhbXA9IjE3
-OTMyMjEzMDQiPjI5PC9rZXk+PC9mb3JlaWduLWtleXM+PHJlZi10eXBlIG5hbWU9IkpvdXJuYWwg
+OTMyMjE2NDkiPjI5PC9rZXk+PC9mb3JlaWduLWtleXM+PHJlZi10eXBlIG5hbWU9IkpvdXJuYWwg
 QXJ0aWNsZSI+MTc8L3JlZi10eXBlPjxjb250cmlidXRvcnM+PGF1dGhvcnM+PGF1dGhvcj5IYXJk
 eSwgVHJldm9yIEQuPC9hdXRob3I+PGF1dGhvcj5QYWxtaW50aWVyLCBCcnlhbjwvYXV0aG9yPjxh
 dXRob3I+VG9wLCBQaGlsaXAgTC48L2F1dGhvcj48YXV0aG9yPktyaXNobmFtdXJ0aHksIERoZWVw
@@ -980,7 +1014,7 @@
 PC9yZWNvcmQ+PC9DaXRlPjxDaXRlPjxBdXRob3I+U3RlaW5icmluazwvQXV0aG9yPjxZZWFyPjIw
 MTk8L1llYXI+PFJlY051bT43ODwvUmVjTnVtPjxyZWNvcmQ+PHJlYy1udW1iZXI+Nzg8L3JlYy1u
 dW1iZXI+PGZvcmVpZ24ta2V5cz48a2V5IGFwcD0iRU4iIGRiLWlkPSJtZGFlODUwMDEwOTQ5NmZl
-YTRhZmY5YzA4NmUxNmNjMjU4OTUiIHRpbWVzdGFtcD0iMTc5MzIyMTMwNCI+Nzg8L2tleT48L2Zv
+YTRhZmY5YzA4NmUxNmNjMjU4OTUiIHRpbWVzdGFtcD0iMTc5MzIyMTY0OSI+Nzg8L2tleT48L2Zv
 cmVpZ24ta2V5cz48cmVmLXR5cGUgbmFtZT0iSm91cm5hbCBBcnRpY2xlIj4xNzwvcmVmLXR5cGU+
 PGNvbnRyaWJ1dG9ycz48YXV0aG9ycz48YXV0aG9yPlN0ZWluYnJpbmssIENvcm5lbGl1czwvYXV0
 aG9yPjxhdXRob3I+QmxhbmstQmFiYXphZGVoLCBNYXJpdGE8L2F1dGhvcj48YXV0aG9yPkVsLUFt
@@ -1002,7 +1036,7 @@
 Y29yZD48L0NpdGU+PENpdGU+PEF1dGhvcj5PZmVubG9jaDwvQXV0aG9yPjxZZWFyPjIwMjI8L1ll
 YXI+PFJlY051bT42MjwvUmVjTnVtPjxyZWNvcmQ+PHJlYy1udW1iZXI+NjI8L3JlYy1udW1iZXI+
 PGZvcmVpZ24ta2V5cz48a2V5IGFwcD0iRU4iIGRiLWlkPSJtZGFlODUwMDEwOTQ5NmZlYTRhZmY5
-YzA4NmUxNmNjMjU4OTUiIHRpbWVzdGFtcD0iMTc5MzIyMTMwNCI+NjI8L2tleT48L2ZvcmVpZ24t
+YzA4NmUxNmNjMjU4OTUiIHRpbWVzdGFtcD0iMTc5MzIyMTY0OSI+NjI8L2tleT48L2ZvcmVpZ24t
 a2V5cz48cmVmLXR5cGUgbmFtZT0iQ29uZmVyZW5jZSBQYXBlciI+NDc8L3JlZi10eXBlPjxjb250
 cmlidXRvcnM+PGF1dGhvcnM+PGF1dGhvcj5PZmVubG9jaCwgQW5uaWthPC9hdXRob3I+PGF1dGhv
 cj5TY2h3YXJ6LCBKYW4gU8O2cmVuPC9hdXRob3I+PGF1dGhvcj5Ub2xrLCBEZWJvcmFoPC9hdXRo
@@ -1029,7 +1063,7 @@
 cj48UmVjTnVtPjY4PC9SZWNOdW0+PERpc3BsYXlUZXh0PlsxN+KAkzIwXTwvRGlzcGxheVRleHQ+
 PHJlY29yZD48cmVjLW51bWJlcj42ODwvcmVjLW51bWJlcj48Zm9yZWlnbi1rZXlzPjxrZXkgYXBw
 PSJFTiIgZGItaWQ9Im1kYWU4NTAwMTA5NDk2ZmVhNGFmZjljMDg2ZTE2Y2MyNTg5NSIgdGltZXN0
-YW1wPSIxNzkzMjIxMzA0Ij42ODwva2V5PjwvZm9yZWlnbi1rZXlzPjxyZWYtdHlwZSBuYW1lPSJD
+YW1wPSIxNzkzMjIxNjQ5Ij42ODwva2V5PjwvZm9yZWlnbi1rZXlzPjxyZWYtdHlwZSBuYW1lPSJD
 b25mZXJlbmNlIFBhcGVyIj40NzwvcmVmLXR5cGU+PGNvbnRyaWJ1dG9ycz48YXV0aG9ycz48YXV0
 aG9yPlBhbG1pbnRpZXIsIEJyeWFuPC9hdXRob3I+PGF1dGhvcj5LcmlzaG5hbXVydGh5LCBEaGVl
 cGFrPC9hdXRob3I+PGF1dGhvcj5Ub3AsIFBoaWxpcDwvYXV0aG9yPjxhdXRob3I+U21pdGgsIFN0
@@ -1047,7 +1081,7 @@
 SGFyZHk8L0F1dGhvcj48WWVhcj4yMDI0PC9ZZWFyPjxSZWNOdW0+Mjk8L1JlY051bT48cmVjb3Jk
 PjxyZWMtbnVtYmVyPjI5PC9yZWMtbnVtYmVyPjxmb3JlaWduLWtleXM+PGtleSBhcHA9IkVOIiBk
 Yi1pZD0ibWRhZTg1MDAxMDk0OTZmZWE0YWZmOWMwODZlMTZjYzI1ODk1IiB0aW1lc3RhbXA9IjE3
-OTMyMjEzMDQiPjI5PC9rZXk+PC9mb3JlaWduLWtleXM+PHJlZi10eXBlIG5hbWU9IkpvdXJuYWwg
+OTMyMjE2NDkiPjI5PC9rZXk+PC9mb3JlaWduLWtleXM+PHJlZi10eXBlIG5hbWU9IkpvdXJuYWwg
 QXJ0aWNsZSI+MTc8L3JlZi10eXBlPjxjb250cmlidXRvcnM+PGF1dGhvcnM+PGF1dGhvcj5IYXJk
 eSwgVHJldm9yIEQuPC9hdXRob3I+PGF1dGhvcj5QYWxtaW50aWVyLCBCcnlhbjwvYXV0aG9yPjxh
 dXRob3I+VG9wLCBQaGlsaXAgTC48L2F1dGhvcj48YXV0aG9yPktyaXNobmFtdXJ0aHksIERoZWVw
@@ -1064,7 +1098,7 @@
 PC9yZWNvcmQ+PC9DaXRlPjxDaXRlPjxBdXRob3I+U3RlaW5icmluazwvQXV0aG9yPjxZZWFyPjIw
 MTk8L1llYXI+PFJlY051bT43ODwvUmVjTnVtPjxyZWNvcmQ+PHJlYy1udW1iZXI+Nzg8L3JlYy1u
 dW1iZXI+PGZvcmVpZ24ta2V5cz48a2V5IGFwcD0iRU4iIGRiLWlkPSJtZGFlODUwMDEwOTQ5NmZl
-YTRhZmY5YzA4NmUxNmNjMjU4OTUiIHRpbWVzdGFtcD0iMTc5MzIyMTMwNCI+Nzg8L2tleT48L2Zv
+YTRhZmY5YzA4NmUxNmNjMjU4OTUiIHRpbWVzdGFtcD0iMTc5MzIyMTY0OSI+Nzg8L2tleT48L2Zv
 cmVpZ24ta2V5cz48cmVmLXR5cGUgbmFtZT0iSm91cm5hbCBBcnRpY2xlIj4xNzwvcmVmLXR5cGU+
 PGNvbnRyaWJ1dG9ycz48YXV0aG9ycz48YXV0aG9yPlN0ZWluYnJpbmssIENvcm5lbGl1czwvYXV0
 aG9yPjxhdXRob3I+QmxhbmstQmFiYXphZGVoLCBNYXJpdGE8L2F1dGhvcj48YXV0aG9yPkVsLUFt
@@ -1086,7 +1120,7 @@
 Y29yZD48L0NpdGU+PENpdGU+PEF1dGhvcj5PZmVubG9jaDwvQXV0aG9yPjxZZWFyPjIwMjI8L1ll
 YXI+PFJlY051bT42MjwvUmVjTnVtPjxyZWNvcmQ+PHJlYy1udW1iZXI+NjI8L3JlYy1udW1iZXI+
 PGZvcmVpZ24ta2V5cz48a2V5IGFwcD0iRU4iIGRiLWlkPSJtZGFlODUwMDEwOTQ5NmZlYTRhZmY5
-YzA4NmUxNmNjMjU4OTUiIHRpbWVzdGFtcD0iMTc5MzIyMTMwNCI+NjI8L2tleT48L2ZvcmVpZ24t
+YzA4NmUxNmNjMjU4OTUiIHRpbWVzdGFtcD0iMTc5MzIyMTY0OSI+NjI8L2tleT48L2ZvcmVpZ24t
 a2V5cz48cmVmLXR5cGUgbmFtZT0iQ29uZmVyZW5jZSBQYXBlciI+NDc8L3JlZi10eXBlPjxjb250
 cmlidXRvcnM+PGF1dGhvcnM+PGF1dGhvcj5PZmVubG9jaCwgQW5uaWthPC9hdXRob3I+PGF1dGhv
 cj5TY2h3YXJ6LCBKYW4gU8O2cmVuPC9hdXRob3I+PGF1dGhvcj5Ub2xrLCBEZWJvcmFoPC9hdXRo
@@ -1137,7 +1171,7 @@
         <w:fldChar w:fldCharType="begin"/>
       </w:r>
       <w:r>
-        <w:instrText xml:space="preserve"> ADDIN EN.CITE &lt;EndNote&gt;&lt;Cite&gt;&lt;Author&gt;U.S. Department of Energy&lt;/Author&gt;&lt;Year&gt;2024&lt;/Year&gt;&lt;RecNum&gt;20&lt;/RecNum&gt;&lt;DisplayText&gt;[21]&lt;/DisplayText&gt;&lt;record&gt;&lt;rec-number&gt;20&lt;/rec-number&gt;&lt;foreign-keys&gt;&lt;key app="EN" db-id="mdae8500109496fea4aff9c086e16cc25895" timestamp="1793221304"&gt;20&lt;/key&gt;&lt;/foreign-keys&gt;&lt;ref-type name="Web Page"&gt;12&lt;/ref-type&gt;&lt;contributors&gt;&lt;authors&gt;&lt;author&gt;U.S. Department of Energy&lt;/author&gt;&lt;/authors&gt;&lt;/contributors&gt;&lt;titles&gt;&lt;title&gt;EnergyPlus Output Details and Examples: eplusout.rdd&lt;/title&gt;&lt;/titles&gt;&lt;dates&gt;&lt;year&gt;2024&lt;/year&gt;&lt;/dates&gt;&lt;label&gt;doe2024rdd&lt;/label&gt;&lt;urls&gt;&lt;related-urls&gt;&lt;url&gt;https://bigladdersoftware.com/epx/docs/24-1/output-details-and-examples/eplusout-rdd.html&lt;/url&gt;&lt;/related-urls&gt;&lt;/urls&gt;&lt;access-date&gt;2026-10-28&lt;/access-date&gt;&lt;/record&gt;&lt;/Cite&gt;&lt;/EndNote&gt;</w:instrText>
+        <w:instrText xml:space="preserve"> ADDIN EN.CITE &lt;EndNote&gt;&lt;Cite&gt;&lt;Author&gt;U.S. Department of Energy&lt;/Author&gt;&lt;Year&gt;2024&lt;/Year&gt;&lt;RecNum&gt;20&lt;/RecNum&gt;&lt;DisplayText&gt;[21]&lt;/DisplayText&gt;&lt;record&gt;&lt;rec-number&gt;20&lt;/rec-number&gt;&lt;foreign-keys&gt;&lt;key app="EN" db-id="mdae8500109496fea4aff9c086e16cc25895" timestamp="1793221649"&gt;20&lt;/key&gt;&lt;/foreign-keys&gt;&lt;ref-type name="Web Page"&gt;12&lt;/ref-type&gt;&lt;contributors&gt;&lt;authors&gt;&lt;author&gt;U.S. Department of Energy&lt;/author&gt;&lt;/authors&gt;&lt;/contributors&gt;&lt;titles&gt;&lt;title&gt;EnergyPlus Output Details and Examples: eplusout.rdd&lt;/title&gt;&lt;/titles&gt;&lt;dates&gt;&lt;year&gt;2024&lt;/year&gt;&lt;/dates&gt;&lt;label&gt;doe2024rdd&lt;/label&gt;&lt;urls&gt;&lt;related-urls&gt;&lt;url&gt;https://bigladdersoftware.com/epx/docs/24-1/output-details-and-examples/eplusout-rdd.html&lt;/url&gt;&lt;/related-urls&gt;&lt;/urls&gt;&lt;access-date&gt;2026-10-28&lt;/access-date&gt;&lt;/record&gt;&lt;/Cite&gt;&lt;/EndNote&gt;</w:instrText>
       </w:r>
       <w:r>
         <w:fldChar w:fldCharType="separate"/>
@@ -1160,7 +1194,7 @@
 UmVjTnVtPjQ3PC9SZWNOdW0+PERpc3BsYXlUZXh0Pls3LDIyXTwvRGlzcGxheVRleHQ+PHJlY29y
 ZD48cmVjLW51bWJlcj40NzwvcmVjLW51bWJlcj48Zm9yZWlnbi1rZXlzPjxrZXkgYXBwPSJFTiIg
 ZGItaWQ9Im1kYWU4NTAwMTA5NDk2ZmVhNGFmZjljMDg2ZTE2Y2MyNTg5NSIgdGltZXN0YW1wPSIx
-NzkzMjIxMzA0Ij40Nzwva2V5PjwvZm9yZWlnbi1rZXlzPjxyZWYtdHlwZSBuYW1lPSJKb3VybmFs
+NzkzMjIxNjQ5Ij40Nzwva2V5PjwvZm9yZWlnbi1rZXlzPjxyZWYtdHlwZSBuYW1lPSJKb3VybmFs
 IEFydGljbGUiPjE3PC9yZWYtdHlwZT48Y29udHJpYnV0b3JzPjxhdXRob3JzPjxhdXRob3I+S8O8
 YmxlciwgUi48L2F1dGhvcj48YXV0aG9yPlNjaGllaGxlbiwgVy48L2F1dGhvcj48L2F1dGhvcnM+
 PC9jb250cmlidXRvcnM+PHRpdGxlcz48dGl0bGU+VHdvIE1ldGhvZHMgb2YgU2ltdWxhdG9yIENv
@@ -1177,7 +1211,7 @@
 c291cmNlLW51bT48L3JlY29yZD48L0NpdGU+PENpdGU+PEF1dGhvcj5Hb21lczwvQXV0aG9yPjxZ
 ZWFyPjIwMTg8L1llYXI+PFJlY051bT4yNjwvUmVjTnVtPjxyZWNvcmQ+PHJlYy1udW1iZXI+MjY8
 L3JlYy1udW1iZXI+PGZvcmVpZ24ta2V5cz48a2V5IGFwcD0iRU4iIGRiLWlkPSJtZGFlODUwMDEw
-OTQ5NmZlYTRhZmY5YzA4NmUxNmNjMjU4OTUiIHRpbWVzdGFtcD0iMTc5MzIyMTMwNCI+MjY8L2tl
+OTQ5NmZlYTRhZmY5YzA4NmUxNmNjMjU4OTUiIHRpbWVzdGFtcD0iMTc5MzIyMTY0OSI+MjY8L2tl
 eT48L2ZvcmVpZ24ta2V5cz48cmVmLXR5cGUgbmFtZT0iSm91cm5hbCBBcnRpY2xlIj4xNzwvcmVm
 LXR5cGU+PGNvbnRyaWJ1dG9ycz48YXV0aG9ycz48YXV0aG9yPkdvbWVzLCBDbMOhdWRpbzwvYXV0
 aG9yPjxhdXRob3I+VGh1bGUsIENhc3BlcjwvYXV0aG9yPjxhdXRob3I+QnJvbWFuLCBEYXZpZDwv
@@ -1203,7 +1237,7 @@
 UmVjTnVtPjQ3PC9SZWNOdW0+PERpc3BsYXlUZXh0Pls3LDIyXTwvRGlzcGxheVRleHQ+PHJlY29y
 ZD48cmVjLW51bWJlcj40NzwvcmVjLW51bWJlcj48Zm9yZWlnbi1rZXlzPjxrZXkgYXBwPSJFTiIg
 ZGItaWQ9Im1kYWU4NTAwMTA5NDk2ZmVhNGFmZjljMDg2ZTE2Y2MyNTg5NSIgdGltZXN0YW1wPSIx
-NzkzMjIxMzA0Ij40Nzwva2V5PjwvZm9yZWlnbi1rZXlzPjxyZWYtdHlwZSBuYW1lPSJKb3VybmFs
+NzkzMjIxNjQ5Ij40Nzwva2V5PjwvZm9yZWlnbi1rZXlzPjxyZWYtdHlwZSBuYW1lPSJKb3VybmFs
 IEFydGljbGUiPjE3PC9yZWYtdHlwZT48Y29udHJpYnV0b3JzPjxhdXRob3JzPjxhdXRob3I+S8O8
 YmxlciwgUi48L2F1dGhvcj48YXV0aG9yPlNjaGllaGxlbiwgVy48L2F1dGhvcj48L2F1dGhvcnM+
 PC9jb250cmlidXRvcnM+PHRpdGxlcz48dGl0bGU+VHdvIE1ldGhvZHMgb2YgU2ltdWxhdG9yIENv
@@ -1220,7 +1254,7 @@
 c291cmNlLW51bT48L3JlY29yZD48L0NpdGU+PENpdGU+PEF1dGhvcj5Hb21lczwvQXV0aG9yPjxZ
 ZWFyPjIwMTg8L1llYXI+PFJlY051bT4yNjwvUmVjTnVtPjxyZWNvcmQ+PHJlYy1udW1iZXI+MjY8
 L3JlYy1udW1iZXI+PGZvcmVpZ24ta2V5cz48a2V5IGFwcD0iRU4iIGRiLWlkPSJtZGFlODUwMDEw
-OTQ5NmZlYTRhZmY5YzA4NmUxNmNjMjU4OTUiIHRpbWVzdGFtcD0iMTc5MzIyMTMwNCI+MjY8L2tl
+OTQ5NmZlYTRhZmY5YzA4NmUxNmNjMjU4OTUiIHRpbWVzdGFtcD0iMTc5MzIyMTY0OSI+MjY8L2tl
 eT48L2ZvcmVpZ24ta2V5cz48cmVmLXR5cGUgbmFtZT0iSm91cm5hbCBBcnRpY2xlIj4xNzwvcmVm
 LXR5cGU+PGNvbnRyaWJ1dG9ycz48YXV0aG9ycz48YXV0aG9yPkdvbWVzLCBDbMOhdWRpbzwvYXV0
 aG9yPjxhdXRob3I+VGh1bGUsIENhc3BlcjwvYXV0aG9yPjxhdXRob3I+QnJvbWFuLCBEYXZpZDwv
@@ -1264,7 +1298,7 @@
 PFJlY051bT44MTwvUmVjTnVtPjxEaXNwbGF5VGV4dD5bMjMsMjRdPC9EaXNwbGF5VGV4dD48cmVj
 b3JkPjxyZWMtbnVtYmVyPjgxPC9yZWMtbnVtYmVyPjxmb3JlaWduLWtleXM+PGtleSBhcHA9IkVO
 IiBkYi1pZD0ibWRhZTg1MDAxMDk0OTZmZWE0YWZmOWMwODZlMTZjYzI1ODk1IiB0aW1lc3RhbXA9
-IjE3OTMyMjEzMDQiPjgxPC9rZXk+PC9mb3JlaWduLWtleXM+PHJlZi10eXBlIG5hbWU9IkNvbmZl
+IjE3OTMyMjE2NDkiPjgxPC9rZXk+PC9mb3JlaWduLWtleXM+PHJlZi10eXBlIG5hbWU9IkNvbmZl
 cmVuY2UgUGFwZXIiPjQ3PC9yZWYtdHlwZT48Y29udHJpYnV0b3JzPjxhdXRob3JzPjxhdXRob3I+
 VHJpcGFraXMsIFN0YXZyb3M8L2F1dGhvcj48L2F1dGhvcnM+PC9jb250cmlidXRvcnM+PHRpdGxl
 cz48dGl0bGU+QnJpZGdpbmcgdGhlIHNlbWFudGljIGdhcCBiZXR3ZWVuIGhldGVyb2dlbmVvdXMg
@@ -1279,7 +1313,7 @@
 bWVzPC9BdXRob3I+PFllYXI+MjAxOTwvWWVhcj48UmVjTnVtPjI3PC9SZWNOdW0+PHJlY29yZD48
 cmVjLW51bWJlcj4yNzwvcmVjLW51bWJlcj48Zm9yZWlnbi1rZXlzPjxrZXkgYXBwPSJFTiIgZGIt
 aWQ9Im1kYWU4NTAwMTA5NDk2ZmVhNGFmZjljMDg2ZTE2Y2MyNTg5NSIgdGltZXN0YW1wPSIxNzkz
-MjIxMzA0Ij4yNzwva2V5PjwvZm9yZWlnbi1rZXlzPjxyZWYtdHlwZSBuYW1lPSJKb3VybmFsIEFy
+MjIxNjQ5Ij4yNzwva2V5PjwvZm9yZWlnbi1rZXlzPjxyZWYtdHlwZSBuYW1lPSJKb3VybmFsIEFy
 dGljbGUiPjE3PC9yZWYtdHlwZT48Y29udHJpYnV0b3JzPjxhdXRob3JzPjxhdXRob3I+R29tZXMs
 IENsw6F1ZGlvPC9hdXRob3I+PGF1dGhvcj5NZXllcnMsIEJhcnQ8L2F1dGhvcj48YXV0aG9yPkRl
 bmlsLCBKb2FjaGltPC9hdXRob3I+PGF1dGhvcj5UaHVsZSwgQ2FzcGVyPC9hdXRob3I+PGF1dGhv
@@ -1306,7 +1340,7 @@
 PFJlY051bT44MTwvUmVjTnVtPjxEaXNwbGF5VGV4dD5bMjMsMjRdPC9EaXNwbGF5VGV4dD48cmVj
 b3JkPjxyZWMtbnVtYmVyPjgxPC9yZWMtbnVtYmVyPjxmb3JlaWduLWtleXM+PGtleSBhcHA9IkVO
 IiBkYi1pZD0ibWRhZTg1MDAxMDk0OTZmZWE0YWZmOWMwODZlMTZjYzI1ODk1IiB0aW1lc3RhbXA9
-IjE3OTMyMjEzMDQiPjgxPC9rZXk+PC9mb3JlaWduLWtleXM+PHJlZi10eXBlIG5hbWU9IkNvbmZl
+IjE3OTMyMjE2NDkiPjgxPC9rZXk+PC9mb3JlaWduLWtleXM+PHJlZi10eXBlIG5hbWU9IkNvbmZl
 cmVuY2UgUGFwZXIiPjQ3PC9yZWYtdHlwZT48Y29udHJpYnV0b3JzPjxhdXRob3JzPjxhdXRob3I+
 VHJpcGFraXMsIFN0YXZyb3M8L2F1dGhvcj48L2F1dGhvcnM+PC9jb250cmlidXRvcnM+PHRpdGxl
 cz48dGl0bGU+QnJpZGdpbmcgdGhlIHNlbWFudGljIGdhcCBiZXR3ZWVuIGhldGVyb2dlbmVvdXMg
@@ -1321,7 +1355,7 @@
 bWVzPC9BdXRob3I+PFllYXI+MjAxOTwvWWVhcj48UmVjTnVtPjI3PC9SZWNOdW0+PHJlY29yZD48
 cmVjLW51bWJlcj4yNzwvcmVjLW51bWJlcj48Zm9yZWlnbi1rZXlzPjxrZXkgYXBwPSJFTiIgZGIt
 aWQ9Im1kYWU4NTAwMTA5NDk2ZmVhNGFmZjljMDg2ZTE2Y2MyNTg5NSIgdGltZXN0YW1wPSIxNzkz
-MjIxMzA0Ij4yNzwva2V5PjwvZm9yZWlnbi1rZXlzPjxyZWYtdHlwZSBuYW1lPSJKb3VybmFsIEFy
+MjIxNjQ5Ij4yNzwva2V5PjwvZm9yZWlnbi1rZXlzPjxyZWYtdHlwZSBuYW1lPSJKb3VybmFsIEFy
 dGljbGUiPjE3PC9yZWYtdHlwZT48Y29udHJpYnV0b3JzPjxhdXRob3JzPjxhdXRob3I+R29tZXMs
 IENsw6F1ZGlvPC9hdXRob3I+PGF1dGhvcj5NZXllcnMsIEJhcnQ8L2F1dGhvcj48YXV0aG9yPkRl
 bmlsLCBKb2FjaGltPC9hdXRob3I+PGF1dGhvcj5UaHVsZSwgQ2FzcGVyPC9hdXRob3I+PGF1dGhv
@@ -1372,7 +1406,7 @@
         <w:fldChar w:fldCharType="begin"/>
       </w:r>
       <w:r>
-        <w:instrText xml:space="preserve"> ADDIN EN.CITE &lt;EndNote&gt;&lt;Cite&gt;&lt;Author&gt;Ouyang&lt;/Author&gt;&lt;Year&gt;2025&lt;/Year&gt;&lt;RecNum&gt;66&lt;/RecNum&gt;&lt;DisplayText&gt;[25]&lt;/DisplayText&gt;&lt;record&gt;&lt;rec-number&gt;66&lt;/rec-number&gt;&lt;foreign-keys&gt;&lt;key app="EN" db-id="mdae8500109496fea4aff9c086e16cc25895" timestamp="1793221304"&gt;66&lt;/key&gt;&lt;/foreign-keys&gt;&lt;ref-type name="Journal Article"&gt;17&lt;/ref-type&gt;&lt;contributors&gt;&lt;authors&gt;&lt;author&gt;Ouyang, Shuyin&lt;/author&gt;&lt;author&gt;Zhang, Jie M.&lt;/author&gt;&lt;author&gt;Harman, Mark&lt;/author&gt;&lt;author&gt;Wang, Meng&lt;/author&gt;&lt;/authors&gt;&lt;/contributors&gt;&lt;titles&gt;&lt;title&gt;An Empirical Study of the Non-Determinism of ChatGPT in Code Generation&lt;/title&gt;&lt;secondary-title&gt;ACM Transactions on Software Engineering and Methodology&lt;/secondary-title&gt;&lt;alt-title&gt;ACM Trans. Softw. Eng. Methodol.&lt;/alt-title&gt;&lt;/titles&gt;&lt;periodical&gt;&lt;full-title&gt;ACM Transactions on Software Engineering and Methodology&lt;/full-title&gt;&lt;abbr-1&gt;ACM Trans. Softw. Eng. Methodol.&lt;/abbr-1&gt;&lt;/periodical&gt;&lt;pages&gt;1-28&lt;/pages&gt;&lt;volume&gt;34&lt;/volume&gt;&lt;number&gt;2&lt;/number&gt;&lt;dates&gt;&lt;year&gt;2025&lt;/year&gt;&lt;/dates&gt;&lt;publisher&gt;ACM&lt;/publisher&gt;&lt;label&gt;ouyang2025&lt;/label&gt;&lt;urls&gt;&lt;/urls&gt;&lt;electronic-resource-num&gt;10.1145/3697010&lt;/electronic-resource-num&gt;&lt;/record&gt;&lt;/Cite&gt;&lt;/EndNote&gt;</w:instrText>
+        <w:instrText xml:space="preserve"> ADDIN EN.CITE &lt;EndNote&gt;&lt;Cite&gt;&lt;Author&gt;Ouyang&lt;/Author&gt;&lt;Year&gt;2025&lt;/Year&gt;&lt;RecNum&gt;66&lt;/RecNum&gt;&lt;DisplayText&gt;[25]&lt;/DisplayText&gt;&lt;record&gt;&lt;rec-number&gt;66&lt;/rec-number&gt;&lt;foreign-keys&gt;&lt;key app="EN" db-id="mdae8500109496fea4aff9c086e16cc25895" timestamp="1793221649"&gt;66&lt;/key&gt;&lt;/foreign-keys&gt;&lt;ref-type name="Journal Article"&gt;17&lt;/ref-type&gt;&lt;contributors&gt;&lt;authors&gt;&lt;author&gt;Ouyang, Shuyin&lt;/author&gt;&lt;author&gt;Zhang, Jie M.&lt;/author&gt;&lt;author&gt;Harman, Mark&lt;/author&gt;&lt;author&gt;Wang, Meng&lt;/author&gt;&lt;/authors&gt;&lt;/contributors&gt;&lt;titles&gt;&lt;title&gt;An Empirical Study of the Non-Determinism of ChatGPT in Code Generation&lt;/title&gt;&lt;secondary-title&gt;ACM Transactions on Software Engineering and Methodology&lt;/secondary-title&gt;&lt;alt-title&gt;ACM Trans. Softw. Eng. Methodol.&lt;/alt-title&gt;&lt;/titles&gt;&lt;periodical&gt;&lt;full-title&gt;ACM Transactions on Software Engineering and Methodology&lt;/full-title&gt;&lt;abbr-1&gt;ACM Trans. Softw. Eng. Methodol.&lt;/abbr-1&gt;&lt;/periodical&gt;&lt;pages&gt;1-28&lt;/pages&gt;&lt;volume&gt;34&lt;/volume&gt;&lt;number&gt;2&lt;/number&gt;&lt;dates&gt;&lt;year&gt;2025&lt;/year&gt;&lt;/dates&gt;&lt;publisher&gt;ACM&lt;/publisher&gt;&lt;label&gt;ouyang2025&lt;/label&gt;&lt;urls&gt;&lt;/urls&gt;&lt;electronic-resource-num&gt;10.1145/3697010&lt;/electronic-resource-num&gt;&lt;/record&gt;&lt;/Cite&gt;&lt;/EndNote&gt;</w:instrText>
       </w:r>
       <w:r>
         <w:fldChar w:fldCharType="separate"/>
@@ -1393,7 +1427,7 @@
         <w:fldChar w:fldCharType="begin"/>
       </w:r>
       <w:r>
-        <w:instrText xml:space="preserve"> ADDIN EN.CITE &lt;EndNote&gt;&lt;Cite&gt;&lt;Author&gt;Neubauer&lt;/Author&gt;&lt;Year&gt;2026&lt;/Year&gt;&lt;RecNum&gt;57&lt;/RecNum&gt;&lt;DisplayText&gt;[26]&lt;/DisplayText&gt;&lt;record&gt;&lt;rec-number&gt;57&lt;/rec-number&gt;&lt;foreign-keys&gt;&lt;key app="EN" db-id="mdae8500109496fea4aff9c086e16cc25895" timestamp="1793221304"&gt;57&lt;/key&gt;&lt;/foreign-keys&gt;&lt;ref-type name="Generic"&gt;13&lt;/ref-type&gt;&lt;contributors&gt;&lt;authors&gt;&lt;author&gt;Neubauer, Alexander&lt;/author&gt;&lt;author&gt;Hong, Tianzhen&lt;/author&gt;&lt;author&gt;Li, Han&lt;/author&gt;&lt;author&gt;Yu, Mengbo&lt;/author&gt;&lt;author&gt;Darbandi, Amin&lt;/author&gt;&lt;author&gt;Fürst, Yannick&lt;/author&gt;&lt;author&gt;Kriegel, Martin&lt;/author&gt;&lt;/authors&gt;&lt;/contributors&gt;&lt;titles&gt;&lt;title&gt;Large Language Models for HVAC Operations in Building Energy Systems: A Critical Review of Methods, Applications, and Deployment Readiness&lt;/title&gt;&lt;secondary-title&gt;arXiv&lt;/secondary-title&gt;&lt;/titles&gt;&lt;dates&gt;&lt;year&gt;2026&lt;/year&gt;&lt;/dates&gt;&lt;label&gt;neubauer2026&lt;/label&gt;&lt;work-type&gt;arXiv:2609.05314&lt;/work-type&gt;&lt;urls&gt;&lt;related-urls&gt;&lt;url&gt;https://arxiv.org/abs/2609.05314&lt;/url&gt;&lt;/related-urls&gt;&lt;/urls&gt;&lt;electronic-resource-num&gt;10.48550/arXiv.2609.05314&lt;/electronic-resource-num&gt;&lt;/record&gt;&lt;/Cite&gt;&lt;/EndNote&gt;</w:instrText>
+        <w:instrText xml:space="preserve"> ADDIN EN.CITE &lt;EndNote&gt;&lt;Cite&gt;&lt;Author&gt;Neubauer&lt;/Author&gt;&lt;Year&gt;2026&lt;/Year&gt;&lt;RecNum&gt;57&lt;/RecNum&gt;&lt;DisplayText&gt;[26]&lt;/DisplayText&gt;&lt;record&gt;&lt;rec-number&gt;57&lt;/rec-number&gt;&lt;foreign-keys&gt;&lt;key app="EN" db-id="mdae8500109496fea4aff9c086e16cc25895" timestamp="1793221649"&gt;57&lt;/key&gt;&lt;/foreign-keys&gt;&lt;ref-type name="Generic"&gt;13&lt;/ref-type&gt;&lt;contributors&gt;&lt;authors&gt;&lt;author&gt;Neubauer, Alexander&lt;/author&gt;&lt;author&gt;Hong, Tianzhen&lt;/author&gt;&lt;author&gt;Li, Han&lt;/author&gt;&lt;author&gt;Yu, Mengbo&lt;/author&gt;&lt;author&gt;Darbandi, Amin&lt;/author&gt;&lt;author&gt;Fürst, Yannick&lt;/author&gt;&lt;author&gt;Kriegel, Martin&lt;/author&gt;&lt;/authors&gt;&lt;/contributors&gt;&lt;titles&gt;&lt;title&gt;Large Language Models for HVAC Operations in Building Energy Systems: A Critical Review of Methods, Applications, and Deployment Readiness&lt;/title&gt;&lt;secondary-title&gt;arXiv&lt;/secondary-title&gt;&lt;/titles&gt;&lt;dates&gt;&lt;year&gt;2026&lt;/year&gt;&lt;/dates&gt;&lt;label&gt;neubauer2026&lt;/label&gt;&lt;work-type&gt;arXiv:2609.05314&lt;/work-type&gt;&lt;urls&gt;&lt;related-urls&gt;&lt;url&gt;https://arxiv.org/abs/2609.05314&lt;/url&gt;&lt;/related-urls&gt;&lt;/urls&gt;&lt;electronic-resource-num&gt;10.48550/arXiv.2609.05314&lt;/electronic-resource-num&gt;&lt;/record&gt;&lt;/Cite&gt;&lt;/EndNote&gt;</w:instrText>
       </w:r>
       <w:r>
         <w:fldChar w:fldCharType="separate"/>
@@ -1414,7 +1448,7 @@
         <w:fldChar w:fldCharType="begin"/>
       </w:r>
       <w:r>
-        <w:instrText xml:space="preserve"> ADDIN EN.CITE &lt;EndNote&gt;&lt;Cite&gt;&lt;Author&gt;Henderson&lt;/Author&gt;&lt;Year&gt;2018&lt;/Year&gt;&lt;RecNum&gt;32&lt;/RecNum&gt;&lt;DisplayText&gt;[27]&lt;/DisplayText&gt;&lt;record&gt;&lt;rec-number&gt;32&lt;/rec-number&gt;&lt;foreign-keys&gt;&lt;key app="EN" db-id="mdae8500109496fea4aff9c086e16cc25895" timestamp="1793221304"&gt;32&lt;/key&gt;&lt;/foreign-keys&gt;&lt;ref-type name="Conference Paper"&gt;47&lt;/ref-type&gt;&lt;contributors&gt;&lt;authors&gt;&lt;author&gt;Henderson, Peter&lt;/author&gt;&lt;author&gt;Islam, Riashat&lt;/author&gt;&lt;author&gt;Bachman, Philip&lt;/author&gt;&lt;author&gt;Pineau, Joelle&lt;/author&gt;&lt;author&gt;Precup, Doina&lt;/author&gt;&lt;author&gt;Meger, David&lt;/author&gt;&lt;/authors&gt;&lt;/contributors&gt;&lt;titles&gt;&lt;title&gt;Deep Reinforcement Learning That Matters&lt;/title&gt;&lt;secondary-title&gt;Proceedings of the AAAI Conference on Artificial Intelligence&lt;/secondary-title&gt;&lt;/titles&gt;&lt;pages&gt;3207-3214&lt;/pages&gt;&lt;volume&gt;32&lt;/volume&gt;&lt;number&gt;1&lt;/number&gt;&lt;dates&gt;&lt;year&gt;2018&lt;/year&gt;&lt;/dates&gt;&lt;publisher&gt;AAAI Press&lt;/publisher&gt;&lt;label&gt;henderson2018&lt;/label&gt;&lt;urls&gt;&lt;/urls&gt;&lt;electronic-resource-num&gt;10.1609/aaai.v32i1.11694&lt;/electronic-resource-num&gt;&lt;/record&gt;&lt;/Cite&gt;&lt;/EndNote&gt;</w:instrText>
+        <w:instrText xml:space="preserve"> ADDIN EN.CITE &lt;EndNote&gt;&lt;Cite&gt;&lt;Author&gt;Henderson&lt;/Author&gt;&lt;Year&gt;2018&lt;/Year&gt;&lt;RecNum&gt;32&lt;/RecNum&gt;&lt;DisplayText&gt;[27]&lt;/DisplayText&gt;&lt;record&gt;&lt;rec-number&gt;32&lt;/rec-number&gt;&lt;foreign-keys&gt;&lt;key app="EN" db-id="mdae8500109496fea4aff9c086e16cc25895" timestamp="1793221649"&gt;32&lt;/key&gt;&lt;/foreign-keys&gt;&lt;ref-type name="Conference Paper"&gt;47&lt;/ref-type&gt;&lt;contributors&gt;&lt;authors&gt;&lt;author&gt;Henderson, Peter&lt;/author&gt;&lt;author&gt;Islam, Riashat&lt;/author&gt;&lt;author&gt;Bachman, Philip&lt;/author&gt;&lt;author&gt;Pineau, Joelle&lt;/author&gt;&lt;author&gt;Precup, Doina&lt;/author&gt;&lt;author&gt;Meger, David&lt;/author&gt;&lt;/authors&gt;&lt;/contributors&gt;&lt;titles&gt;&lt;title&gt;Deep Reinforcement Learning That Matters&lt;/title&gt;&lt;secondary-title&gt;Proceedings of the AAAI Conference on Artificial Intelligence&lt;/secondary-title&gt;&lt;/titles&gt;&lt;pages&gt;3207-3214&lt;/pages&gt;&lt;volume&gt;32&lt;/volume&gt;&lt;number&gt;1&lt;/number&gt;&lt;dates&gt;&lt;year&gt;2018&lt;/year&gt;&lt;/dates&gt;&lt;publisher&gt;AAAI Press&lt;/publisher&gt;&lt;label&gt;henderson2018&lt;/label&gt;&lt;urls&gt;&lt;/urls&gt;&lt;electronic-resource-num&gt;10.1609/aaai.v32i1.11694&lt;/electronic-resource-num&gt;&lt;/record&gt;&lt;/Cite&gt;&lt;/EndNote&gt;</w:instrText>
       </w:r>
       <w:r>
         <w:fldChar w:fldCharType="separate"/>
@@ -1435,7 +1469,7 @@
         <w:fldChar w:fldCharType="begin"/>
       </w:r>
       <w:r>
-        <w:instrText xml:space="preserve"> ADDIN EN.CITE &lt;EndNote&gt;&lt;Cite&gt;&lt;Author&gt;Neubauer&lt;/Author&gt;&lt;Year&gt;2026&lt;/Year&gt;&lt;RecNum&gt;57&lt;/RecNum&gt;&lt;DisplayText&gt;[26]&lt;/DisplayText&gt;&lt;record&gt;&lt;rec-number&gt;57&lt;/rec-number&gt;&lt;foreign-keys&gt;&lt;key app="EN" db-id="mdae8500109496fea4aff9c086e16cc25895" timestamp="1793221304"&gt;57&lt;/key&gt;&lt;/foreign-keys&gt;&lt;ref-type name="Generic"&gt;13&lt;/ref-type&gt;&lt;contributors&gt;&lt;authors&gt;&lt;author&gt;Neubauer, Alexander&lt;/author&gt;&lt;author&gt;Hong, Tianzhen&lt;/author&gt;&lt;author&gt;Li, Han&lt;/author&gt;&lt;author&gt;Yu, Mengbo&lt;/author&gt;&lt;author&gt;Darbandi, Amin&lt;/author&gt;&lt;author&gt;Fürst, Yannick&lt;/author&gt;&lt;author&gt;Kriegel, Martin&lt;/author&gt;&lt;/authors&gt;&lt;/contributors&gt;&lt;titles&gt;&lt;title&gt;Large Language Models for HVAC Operations in Building Energy Systems: A Critical Review of Methods, Applications, and Deployment Readiness&lt;/title&gt;&lt;secondary-title&gt;arXiv&lt;/secondary-title&gt;&lt;/titles&gt;&lt;dates&gt;&lt;year&gt;2026&lt;/year&gt;&lt;/dates&gt;&lt;label&gt;neubauer2026&lt;/label&gt;&lt;work-type&gt;arXiv:2609.05314&lt;/work-type&gt;&lt;urls&gt;&lt;related-urls&gt;&lt;url&gt;https://arxiv.org/abs/2609.05314&lt;/url&gt;&lt;/related-urls&gt;&lt;/urls&gt;&lt;electronic-resource-num&gt;10.48550/arXiv.2609.05314&lt;/electronic-resource-num&gt;&lt;/record&gt;&lt;/Cite&gt;&lt;/EndNote&gt;</w:instrText>
+        <w:instrText xml:space="preserve"> ADDIN EN.CITE &lt;EndNote&gt;&lt;Cite&gt;&lt;Author&gt;Neubauer&lt;/Author&gt;&lt;Year&gt;2026&lt;/Year&gt;&lt;RecNum&gt;57&lt;/RecNum&gt;&lt;DisplayText&gt;[26]&lt;/DisplayText&gt;&lt;record&gt;&lt;rec-number&gt;57&lt;/rec-number&gt;&lt;foreign-keys&gt;&lt;key app="EN" db-id="mdae8500109496fea4aff9c086e16cc25895" timestamp="1793221649"&gt;57&lt;/key&gt;&lt;/foreign-keys&gt;&lt;ref-type name="Generic"&gt;13&lt;/ref-type&gt;&lt;contributors&gt;&lt;authors&gt;&lt;author&gt;Neubauer, Alexander&lt;/author&gt;&lt;author&gt;Hong, Tianzhen&lt;/author&gt;&lt;author&gt;Li, Han&lt;/author&gt;&lt;author&gt;Yu, Mengbo&lt;/author&gt;&lt;author&gt;Darbandi, Amin&lt;/author&gt;&lt;author&gt;Fürst, Yannick&lt;/author&gt;&lt;author&gt;Kriegel, Martin&lt;/author&gt;&lt;/authors&gt;&lt;/contributors&gt;&lt;titles&gt;&lt;title&gt;Large Language Models for HVAC Operations in Building Energy Systems: A Critical Review of Methods, Applications, and Deployment Readiness&lt;/title&gt;&lt;secondary-title&gt;arXiv&lt;/secondary-title&gt;&lt;/titles&gt;&lt;dates&gt;&lt;year&gt;2026&lt;/year&gt;&lt;/dates&gt;&lt;label&gt;neubauer2026&lt;/label&gt;&lt;work-type&gt;arXiv:2609.05314&lt;/work-type&gt;&lt;urls&gt;&lt;related-urls&gt;&lt;url&gt;https://arxiv.org/abs/2609.05314&lt;/url&gt;&lt;/related-urls&gt;&lt;/urls&gt;&lt;electronic-resource-num&gt;10.48550/arXiv.2609.05314&lt;/electronic-resource-num&gt;&lt;/record&gt;&lt;/Cite&gt;&lt;/EndNote&gt;</w:instrText>
       </w:r>
       <w:r>
         <w:fldChar w:fldCharType="separate"/>
@@ -1578,7 +1612,7 @@
         <w:fldChar w:fldCharType="begin"/>
       </w:r>
       <w:r>
-        <w:instrText xml:space="preserve"> ADDIN EN.CITE &lt;EndNote&gt;&lt;Cite&gt;&lt;Author&gt;Blochwitz&lt;/Author&gt;&lt;Year&gt;2011&lt;/Year&gt;&lt;RecNum&gt;6&lt;/RecNum&gt;&lt;DisplayText&gt;[9]&lt;/DisplayText&gt;&lt;record&gt;&lt;rec-number&gt;6&lt;/rec-number&gt;&lt;foreign-keys&gt;&lt;key app="EN" db-id="mdae8500109496fea4aff9c086e16cc25895" timestamp="1793221304"&gt;6&lt;/key&gt;&lt;/foreign-keys&gt;&lt;ref-type name="Conference Paper"&gt;47&lt;/ref-type&gt;&lt;contributors&gt;&lt;authors&gt;&lt;author&gt;Blochwitz, T.&lt;/author&gt;&lt;author&gt;Otter, M.&lt;/author&gt;&lt;author&gt;Arnold, M.&lt;/author&gt;&lt;author&gt;Bausch, C.&lt;/author&gt;&lt;author&gt;Clauss, C.&lt;/author&gt;&lt;author&gt;Elmqvist, H.&lt;/author&gt;&lt;author&gt;Junghanns, A.&lt;/author&gt;&lt;author&gt;Mauss, J.&lt;/author&gt;&lt;author&gt;Monteiro, M.&lt;/author&gt;&lt;author&gt;Neidhold, T.&lt;/author&gt;&lt;author&gt;Neumerkel, D.&lt;/author&gt;&lt;author&gt;Olsson, H.&lt;/author&gt;&lt;author&gt;Peetz, J.-V.&lt;/author&gt;&lt;author&gt;Wolf, S.&lt;/author&gt;&lt;/authors&gt;&lt;/contributors&gt;&lt;titles&gt;&lt;title&gt;The Functional Mockup Interface for Tool independent Exchange of Simulation Models&lt;/title&gt;&lt;secondary-title&gt;Proceedings of the 8th International Modelica Conference&lt;/secondary-title&gt;&lt;/titles&gt;&lt;pages&gt;105-114&lt;/pages&gt;&lt;volume&gt;63&lt;/volume&gt;&lt;dates&gt;&lt;year&gt;2011&lt;/year&gt;&lt;/dates&gt;&lt;pub-location&gt;Dresden, Germany&lt;/pub-location&gt;&lt;publisher&gt;Linköping University Electronic Press&lt;/publisher&gt;&lt;label&gt;blochwitz2011&lt;/label&gt;&lt;urls&gt;&lt;/urls&gt;&lt;electronic-resource-num&gt;10.3384/ecp11063105&lt;/electronic-resource-num&gt;&lt;/record&gt;&lt;/Cite&gt;&lt;/EndNote&gt;</w:instrText>
+        <w:instrText xml:space="preserve"> ADDIN EN.CITE &lt;EndNote&gt;&lt;Cite&gt;&lt;Author&gt;Blochwitz&lt;/Author&gt;&lt;Year&gt;2011&lt;/Year&gt;&lt;RecNum&gt;6&lt;/RecNum&gt;&lt;DisplayText&gt;[9]&lt;/DisplayText&gt;&lt;record&gt;&lt;rec-number&gt;6&lt;/rec-number&gt;&lt;foreign-keys&gt;&lt;key app="EN" db-id="mdae8500109496fea4aff9c086e16cc25895" timestamp="1793221649"&gt;6&lt;/key&gt;&lt;/foreign-keys&gt;&lt;ref-type name="Conference Paper"&gt;47&lt;/ref-type&gt;&lt;contributors&gt;&lt;authors&gt;&lt;author&gt;Blochwitz, T.&lt;/author&gt;&lt;author&gt;Otter, M.&lt;/author&gt;&lt;author&gt;Arnold, M.&lt;/author&gt;&lt;author&gt;Bausch, C.&lt;/author&gt;&lt;author&gt;Clauss, C.&lt;/author&gt;&lt;author&gt;Elmqvist, H.&lt;/author&gt;&lt;author&gt;Junghanns, A.&lt;/author&gt;&lt;author&gt;Mauss, J.&lt;/author&gt;&lt;author&gt;Monteiro, M.&lt;/author&gt;&lt;author&gt;Neidhold, T.&lt;/author&gt;&lt;author&gt;Neumerkel, D.&lt;/author&gt;&lt;author&gt;Olsson, H.&lt;/author&gt;&lt;author&gt;Peetz, J.-V.&lt;/author&gt;&lt;author&gt;Wolf, S.&lt;/author&gt;&lt;/authors&gt;&lt;/contributors&gt;&lt;titles&gt;&lt;title&gt;The Functional Mockup Interface for Tool independent Exchange of Simulation Models&lt;/title&gt;&lt;secondary-title&gt;Proceedings of the 8th International Modelica Conference&lt;/secondary-title&gt;&lt;/titles&gt;&lt;pages&gt;105-114&lt;/pages&gt;&lt;volume&gt;63&lt;/volume&gt;&lt;dates&gt;&lt;year&gt;2011&lt;/year&gt;&lt;/dates&gt;&lt;pub-location&gt;Dresden, Germany&lt;/pub-location&gt;&lt;publisher&gt;Linköping University Electronic Press&lt;/publisher&gt;&lt;label&gt;blochwitz2011&lt;/label&gt;&lt;urls&gt;&lt;/urls&gt;&lt;electronic-resource-num&gt;10.3384/ecp11063105&lt;/electronic-resource-num&gt;&lt;/record&gt;&lt;/Cite&gt;&lt;/EndNote&gt;</w:instrText>
       </w:r>
       <w:r>
         <w:fldChar w:fldCharType="separate"/>
@@ -1599,7 +1633,7 @@
         <w:fldChar w:fldCharType="begin"/>
       </w:r>
       <w:r>
-        <w:instrText xml:space="preserve"> ADDIN EN.CITE &lt;EndNote&gt;&lt;Cite&gt;&lt;Author&gt;Junghanns&lt;/Author&gt;&lt;Year&gt;2021&lt;/Year&gt;&lt;RecNum&gt;42&lt;/RecNum&gt;&lt;DisplayText&gt;[10]&lt;/DisplayText&gt;&lt;record&gt;&lt;rec-number&gt;42&lt;/rec-number&gt;&lt;foreign-keys&gt;&lt;key app="EN" db-id="mdae8500109496fea4aff9c086e16cc25895" timestamp="1793221304"&gt;42&lt;/key&gt;&lt;/foreign-keys&gt;&lt;ref-type name="Conference Paper"&gt;47&lt;/ref-type&gt;&lt;contributors&gt;&lt;authors&gt;&lt;author&gt;Junghanns, Andreas&lt;/author&gt;&lt;author&gt;Blochwitz, Torsten&lt;/author&gt;&lt;author&gt;Bertsch, Christian&lt;/author&gt;&lt;author&gt;Sommer, Torsten&lt;/author&gt;&lt;author&gt;Wernersson, Karl&lt;/author&gt;&lt;author&gt;Pillekeit, Andreas&lt;/author&gt;&lt;author&gt;Zacharias, Irina&lt;/author&gt;&lt;author&gt;Blesken, Matthias&lt;/author&gt;&lt;author&gt;Mai, Pierre R.&lt;/author&gt;&lt;author&gt;Schuch, Klaus&lt;/author&gt;&lt;author&gt;Schulze, Christian&lt;/author&gt;&lt;author&gt;Gomes, Cláudio&lt;/author&gt;&lt;author&gt;Najafi, Masoud&lt;/author&gt;&lt;/authors&gt;&lt;/contributors&gt;&lt;titles&gt;&lt;title&gt;The Functional Mock-up Interface 3.0 – New Features Enabling New Applications&lt;/title&gt;&lt;secondary-title&gt;Proceedings of the 14th International Modelica Conference&lt;/secondary-title&gt;&lt;/titles&gt;&lt;pages&gt;17-26&lt;/pages&gt;&lt;volume&gt;181&lt;/volume&gt;&lt;dates&gt;&lt;year&gt;2021&lt;/year&gt;&lt;/dates&gt;&lt;pub-location&gt;Linköping, Sweden&lt;/pub-location&gt;&lt;publisher&gt;Linköping University Electronic Press&lt;/publisher&gt;&lt;label&gt;junghanns2021&lt;/label&gt;&lt;urls&gt;&lt;/urls&gt;&lt;electronic-resource-num&gt;10.3384/ecp2118117&lt;/electronic-resource-num&gt;&lt;/record&gt;&lt;/Cite&gt;&lt;/EndNote&gt;</w:instrText>
+        <w:instrText xml:space="preserve"> ADDIN EN.CITE &lt;EndNote&gt;&lt;Cite&gt;&lt;Author&gt;Junghanns&lt;/Author&gt;&lt;Year&gt;2021&lt;/Year&gt;&lt;RecNum&gt;42&lt;/RecNum&gt;&lt;DisplayText&gt;[10]&lt;/DisplayText&gt;&lt;record&gt;&lt;rec-number&gt;42&lt;/rec-number&gt;&lt;foreign-keys&gt;&lt;key app="EN" db-id="mdae8500109496fea4aff9c086e16cc25895" timestamp="1793221649"&gt;42&lt;/key&gt;&lt;/foreign-keys&gt;&lt;ref-type name="Conference Paper"&gt;47&lt;/ref-type&gt;&lt;contributors&gt;&lt;authors&gt;&lt;author&gt;Junghanns, Andreas&lt;/author&gt;&lt;author&gt;Blochwitz, Torsten&lt;/author&gt;&lt;author&gt;Bertsch, Christian&lt;/author&gt;&lt;author&gt;Sommer, Torsten&lt;/author&gt;&lt;author&gt;Wernersson, Karl&lt;/author&gt;&lt;author&gt;Pillekeit, Andreas&lt;/author&gt;&lt;author&gt;Zacharias, Irina&lt;/author&gt;&lt;author&gt;Blesken, Matthias&lt;/author&gt;&lt;author&gt;Mai, Pierre R.&lt;/author&gt;&lt;author&gt;Schuch, Klaus&lt;/author&gt;&lt;author&gt;Schulze, Christian&lt;/author&gt;&lt;author&gt;Gomes, Cláudio&lt;/author&gt;&lt;author&gt;Najafi, Masoud&lt;/author&gt;&lt;/authors&gt;&lt;/contributors&gt;&lt;titles&gt;&lt;title&gt;The Functional Mock-up Interface 3.0 – New Features Enabling New Applications&lt;/title&gt;&lt;secondary-title&gt;Proceedings of the 14th International Modelica Conference&lt;/secondary-title&gt;&lt;/titles&gt;&lt;pages&gt;17-26&lt;/pages&gt;&lt;volume&gt;181&lt;/volume&gt;&lt;dates&gt;&lt;year&gt;2021&lt;/year&gt;&lt;/dates&gt;&lt;pub-location&gt;Linköping, Sweden&lt;/pub-location&gt;&lt;publisher&gt;Linköping University Electronic Press&lt;/publisher&gt;&lt;label&gt;junghanns2021&lt;/label&gt;&lt;urls&gt;&lt;/urls&gt;&lt;electronic-resource-num&gt;10.3384/ecp2118117&lt;/electronic-resource-num&gt;&lt;/record&gt;&lt;/Cite&gt;&lt;/EndNote&gt;</w:instrText>
       </w:r>
       <w:r>
         <w:fldChar w:fldCharType="separate"/>
@@ -1620,7 +1654,7 @@
         <w:fldChar w:fldCharType="begin"/>
       </w:r>
       <w:r>
-        <w:instrText xml:space="preserve"> ADDIN EN.CITE &lt;EndNote&gt;&lt;Cite&gt;&lt;Author&gt;Modelica Association&lt;/Author&gt;&lt;Year&gt;2024&lt;/Year&gt;&lt;RecNum&gt;77&lt;/RecNum&gt;&lt;DisplayText&gt;[28]&lt;/DisplayText&gt;&lt;record&gt;&lt;rec-number&gt;77&lt;/rec-number&gt;&lt;foreign-keys&gt;&lt;key app="EN" db-id="mdae8500109496fea4aff9c086e16cc25895" timestamp="1793221304"&gt;77&lt;/key&gt;&lt;/foreign-keys&gt;&lt;ref-type name="Standard"&gt;58&lt;/ref-type&gt;&lt;contributors&gt;&lt;authors&gt;&lt;author&gt;Modelica Association&lt;/author&gt;&lt;/authors&gt;&lt;/contributors&gt;&lt;titles&gt;&lt;title&gt;System Structure and Parameterization (SSP), Version 2.0&lt;/title&gt;&lt;/titles&gt;&lt;dates&gt;&lt;year&gt;2024&lt;/year&gt;&lt;/dates&gt;&lt;label&gt;ssp2_2024&lt;/label&gt;&lt;urls&gt;&lt;related-urls&gt;&lt;url&gt;https://ssp-standard.org/docs/2.0/&lt;/url&gt;&lt;/related-urls&gt;&lt;/urls&gt;&lt;/record&gt;&lt;/Cite&gt;&lt;/EndNote&gt;</w:instrText>
+        <w:instrText xml:space="preserve"> ADDIN EN.CITE &lt;EndNote&gt;&lt;Cite&gt;&lt;Author&gt;Modelica Association&lt;/Author&gt;&lt;Year&gt;2024&lt;/Year&gt;&lt;RecNum&gt;77&lt;/RecNum&gt;&lt;DisplayText&gt;[28]&lt;/DisplayText&gt;&lt;record&gt;&lt;rec-number&gt;77&lt;/rec-number&gt;&lt;foreign-keys&gt;&lt;key app="EN" db-id="mdae8500109496fea4aff9c086e16cc25895" timestamp="1793221649"&gt;77&lt;/key&gt;&lt;/foreign-keys&gt;&lt;ref-type name="Standard"&gt;58&lt;/ref-type&gt;&lt;contributors&gt;&lt;authors&gt;&lt;author&gt;Modelica Association&lt;/author&gt;&lt;/authors&gt;&lt;/contributors&gt;&lt;titles&gt;&lt;title&gt;System Structure and Parameterization (SSP), Version 2.0&lt;/title&gt;&lt;/titles&gt;&lt;dates&gt;&lt;year&gt;2024&lt;/year&gt;&lt;/dates&gt;&lt;label&gt;ssp2_2024&lt;/label&gt;&lt;urls&gt;&lt;related-urls&gt;&lt;url&gt;https://ssp-standard.org/docs/2.0/&lt;/url&gt;&lt;/related-urls&gt;&lt;/urls&gt;&lt;/record&gt;&lt;/Cite&gt;&lt;/EndNote&gt;</w:instrText>
       </w:r>
       <w:r>
         <w:fldChar w:fldCharType="separate"/>
@@ -1649,7 +1683,7 @@
         <w:fldChar w:fldCharType="begin"/>
       </w:r>
       <w:r>
-        <w:instrText xml:space="preserve"> ADDIN EN.CITE &lt;EndNote&gt;&lt;Cite&gt;&lt;Author&gt;Kübler&lt;/Author&gt;&lt;Year&gt;2000&lt;/Year&gt;&lt;RecNum&gt;47&lt;/RecNum&gt;&lt;DisplayText&gt;[22]&lt;/DisplayText&gt;&lt;record&gt;&lt;rec-number&gt;47&lt;/rec-number&gt;&lt;foreign-keys&gt;&lt;key app="EN" db-id="mdae8500109496fea4aff9c086e16cc25895" timestamp="1793221304"&gt;47&lt;/key&gt;&lt;/foreign-keys&gt;&lt;ref-type name="Journal Article"&gt;17&lt;/ref-type&gt;&lt;contributors&gt;&lt;authors&gt;&lt;author&gt;Kübler, R.&lt;/author&gt;&lt;author&gt;Schiehlen, W.&lt;/author&gt;&lt;/authors&gt;&lt;/contributors&gt;&lt;titles&gt;&lt;title&gt;Two Methods of Simulator Coupling&lt;/title&gt;&lt;secondary-title&gt;Mathematical and Computer Modelling of Dynamical Systems&lt;/secondary-title&gt;&lt;alt-title&gt;Math. Comput. Model. Dyn. Syst.&lt;/alt-title&gt;&lt;/titles&gt;&lt;periodical&gt;&lt;full-title&gt;Mathematical and Computer Modelling of Dynamical Systems&lt;/full-title&gt;&lt;abbr-1&gt;Math. Comput. Model. Dyn. Syst.&lt;/abbr-1&gt;&lt;/periodical&gt;&lt;pages&gt;93-113&lt;/pages&gt;&lt;volume&gt;6&lt;/volume&gt;&lt;number&gt;2&lt;/number&gt;&lt;dates&gt;&lt;year&gt;2000&lt;/year&gt;&lt;/dates&gt;&lt;publisher&gt;Taylor &amp;amp; Francis&lt;/publisher&gt;&lt;label&gt;kubler2000&lt;/label&gt;&lt;urls&gt;&lt;/urls&gt;&lt;electronic-resource-num&gt;10.1076/1387-3954(200006)6:2;1-M;FT093&lt;/electronic-resource-num&gt;&lt;/record&gt;&lt;/Cite&gt;&lt;/EndNote&gt;</w:instrText>
+        <w:instrText xml:space="preserve"> ADDIN EN.CITE &lt;EndNote&gt;&lt;Cite&gt;&lt;Author&gt;Kübler&lt;/Author&gt;&lt;Year&gt;2000&lt;/Year&gt;&lt;RecNum&gt;47&lt;/RecNum&gt;&lt;DisplayText&gt;[22]&lt;/DisplayText&gt;&lt;record&gt;&lt;rec-number&gt;47&lt;/rec-number&gt;&lt;foreign-keys&gt;&lt;key app="EN" db-id="mdae8500109496fea4aff9c086e16cc25895" timestamp="1793221649"&gt;47&lt;/key&gt;&lt;/foreign-keys&gt;&lt;ref-type name="Journal Article"&gt;17&lt;/ref-type&gt;&lt;contributors&gt;&lt;authors&gt;&lt;author&gt;Kübler, R.&lt;/author&gt;&lt;author&gt;Schiehlen, W.&lt;/author&gt;&lt;/authors&gt;&lt;/contributors&gt;&lt;titles&gt;&lt;title&gt;Two Methods of Simulator Coupling&lt;/title&gt;&lt;secondary-title&gt;Mathematical and Computer Modelling of Dynamical Systems&lt;/secondary-title&gt;&lt;alt-title&gt;Math. Comput. Model. Dyn. Syst.&lt;/alt-title&gt;&lt;/titles&gt;&lt;periodical&gt;&lt;full-title&gt;Mathematical and Computer Modelling of Dynamical Systems&lt;/full-title&gt;&lt;abbr-1&gt;Math. Comput. Model. Dyn. Syst.&lt;/abbr-1&gt;&lt;/periodical&gt;&lt;pages&gt;93-113&lt;/pages&gt;&lt;volume&gt;6&lt;/volume&gt;&lt;number&gt;2&lt;/number&gt;&lt;dates&gt;&lt;year&gt;2000&lt;/year&gt;&lt;/dates&gt;&lt;publisher&gt;Taylor &amp;amp; Francis&lt;/publisher&gt;&lt;label&gt;kubler2000&lt;/label&gt;&lt;urls&gt;&lt;/urls&gt;&lt;electronic-resource-num&gt;10.1076/1387-3954(200006)6:2;1-M;FT093&lt;/electronic-resource-num&gt;&lt;/record&gt;&lt;/Cite&gt;&lt;/EndNote&gt;</w:instrText>
       </w:r>
       <w:r>
         <w:fldChar w:fldCharType="separate"/>
@@ -1670,7 +1704,7 @@
         <w:fldChar w:fldCharType="begin"/>
       </w:r>
       <w:r>
-        <w:instrText xml:space="preserve"> ADDIN EN.CITE &lt;EndNote&gt;&lt;Cite&gt;&lt;Author&gt;Broman&lt;/Author&gt;&lt;Year&gt;2013&lt;/Year&gt;&lt;RecNum&gt;8&lt;/RecNum&gt;&lt;DisplayText&gt;[29]&lt;/DisplayText&gt;&lt;record&gt;&lt;rec-number&gt;8&lt;/rec-number&gt;&lt;foreign-keys&gt;&lt;key app="EN" db-id="mdae8500109496fea4aff9c086e16cc25895" timestamp="1793221304"&gt;8&lt;/key&gt;&lt;/foreign-keys&gt;&lt;ref-type name="Conference Paper"&gt;47&lt;/ref-type&gt;&lt;contributors&gt;&lt;authors&gt;&lt;author&gt;Broman, David&lt;/author&gt;&lt;author&gt;Brooks, Christopher&lt;/author&gt;&lt;author&gt;Greenberg, Lev&lt;/author&gt;&lt;author&gt;Lee, Edward A.&lt;/author&gt;&lt;author&gt;Masin, Michael&lt;/author&gt;&lt;author&gt;Tripakis, Stavros&lt;/author&gt;&lt;author&gt;Wetter, Michael&lt;/author&gt;&lt;/authors&gt;&lt;/contributors&gt;&lt;titles&gt;&lt;title&gt;Determinate composition of FMUs for co-simulation&lt;/title&gt;&lt;secondary-title&gt;2013 Proceedings of the International Conference on Embedded Software (EMSOFT)&lt;/secondary-title&gt;&lt;/titles&gt;&lt;pages&gt;1-12&lt;/pages&gt;&lt;dates&gt;&lt;year&gt;2013&lt;/year&gt;&lt;/dates&gt;&lt;pub-location&gt;Montreal, QC, Canada&lt;/pub-location&gt;&lt;publisher&gt;IEEE&lt;/publisher&gt;&lt;label&gt;broman2013&lt;/label&gt;&lt;urls&gt;&lt;/urls&gt;&lt;electronic-resource-num&gt;10.1109/EMSOFT.2013.6658580&lt;/electronic-resource-num&gt;&lt;/record&gt;&lt;/Cite&gt;&lt;/EndNote&gt;</w:instrText>
+        <w:instrText xml:space="preserve"> ADDIN EN.CITE &lt;EndNote&gt;&lt;Cite&gt;&lt;Author&gt;Broman&lt;/Author&gt;&lt;Year&gt;2013&lt;/Year&gt;&lt;RecNum&gt;8&lt;/RecNum&gt;&lt;DisplayText&gt;[29]&lt;/DisplayText&gt;&lt;record&gt;&lt;rec-number&gt;8&lt;/rec-number&gt;&lt;foreign-keys&gt;&lt;key app="EN" db-id="mdae8500109496fea4aff9c086e16cc25895" timestamp="1793221649"&gt;8&lt;/key&gt;&lt;/foreign-keys&gt;&lt;ref-type name="Conference Paper"&gt;47&lt;/ref-type&gt;&lt;contributors&gt;&lt;authors&gt;&lt;author&gt;Broman, David&lt;/author&gt;&lt;author&gt;Brooks, Christopher&lt;/author&gt;&lt;author&gt;Greenberg, Lev&lt;/author&gt;&lt;author&gt;Lee, Edward A.&lt;/author&gt;&lt;author&gt;Masin, Michael&lt;/author&gt;&lt;author&gt;Tripakis, Stavros&lt;/author&gt;&lt;author&gt;Wetter, Michael&lt;/author&gt;&lt;/authors&gt;&lt;/contributors&gt;&lt;titles&gt;&lt;title&gt;Determinate composition of FMUs for co-simulation&lt;/title&gt;&lt;secondary-title&gt;2013 Proceedings of the International Conference on Embedded Software (EMSOFT)&lt;/secondary-title&gt;&lt;/titles&gt;&lt;pages&gt;1-12&lt;/pages&gt;&lt;dates&gt;&lt;year&gt;2013&lt;/year&gt;&lt;/dates&gt;&lt;pub-location&gt;Montreal, QC, Canada&lt;/pub-location&gt;&lt;publisher&gt;IEEE&lt;/publisher&gt;&lt;label&gt;broman2013&lt;/label&gt;&lt;urls&gt;&lt;/urls&gt;&lt;electronic-resource-num&gt;10.1109/EMSOFT.2013.6658580&lt;/electronic-resource-num&gt;&lt;/record&gt;&lt;/Cite&gt;&lt;/EndNote&gt;</w:instrText>
       </w:r>
       <w:r>
         <w:fldChar w:fldCharType="separate"/>
@@ -1691,7 +1725,7 @@
         <w:fldChar w:fldCharType="begin"/>
       </w:r>
       <w:r>
-        <w:instrText xml:space="preserve"> ADDIN EN.CITE &lt;EndNote&gt;&lt;Cite&gt;&lt;Author&gt;Gomes&lt;/Author&gt;&lt;Year&gt;2018&lt;/Year&gt;&lt;RecNum&gt;26&lt;/RecNum&gt;&lt;DisplayText&gt;[7]&lt;/DisplayText&gt;&lt;record&gt;&lt;rec-number&gt;26&lt;/rec-number&gt;&lt;foreign-keys&gt;&lt;key app="EN" db-id="mdae8500109496fea4aff9c086e16cc25895" timestamp="1793221304"&gt;26&lt;/key&gt;&lt;/foreign-keys&gt;&lt;ref-type name="Journal Article"&gt;17&lt;/ref-type&gt;&lt;contributors&gt;&lt;authors&gt;&lt;author&gt;Gomes, Cláudio&lt;/author&gt;&lt;author&gt;Thule, Casper&lt;/author&gt;&lt;author&gt;Broman, David&lt;/author&gt;&lt;author&gt;Larsen, Peter Gorm&lt;/author&gt;&lt;author&gt;Vangheluwe, Hans&lt;/author&gt;&lt;/authors&gt;&lt;/contributors&gt;&lt;titles&gt;&lt;title&gt;Co-Simulation: A Survey&lt;/title&gt;&lt;secondary-title&gt;ACM Computing Surveys&lt;/secondary-title&gt;&lt;alt-title&gt;ACM Comput. Surv.&lt;/alt-title&gt;&lt;/titles&gt;&lt;periodical&gt;&lt;full-title&gt;ACM Computing Surveys&lt;/full-title&gt;&lt;abbr-1&gt;ACM Comput. Surv.&lt;/abbr-1&gt;&lt;/periodical&gt;&lt;pages&gt;49&lt;/pages&gt;&lt;volume&gt;51&lt;/volume&gt;&lt;number&gt;3&lt;/number&gt;&lt;dates&gt;&lt;year&gt;2018&lt;/year&gt;&lt;/dates&gt;&lt;publisher&gt;ACM&lt;/publisher&gt;&lt;label&gt;gomes2018&lt;/label&gt;&lt;urls&gt;&lt;/urls&gt;&lt;electronic-resource-num&gt;10.1145/3179993&lt;/electronic-resource-num&gt;&lt;/record&gt;&lt;/Cite&gt;&lt;/EndNote&gt;</w:instrText>
+        <w:instrText xml:space="preserve"> ADDIN EN.CITE &lt;EndNote&gt;&lt;Cite&gt;&lt;Author&gt;Gomes&lt;/Author&gt;&lt;Year&gt;2018&lt;/Year&gt;&lt;RecNum&gt;26&lt;/RecNum&gt;&lt;DisplayText&gt;[7]&lt;/DisplayText&gt;&lt;record&gt;&lt;rec-number&gt;26&lt;/rec-number&gt;&lt;foreign-keys&gt;&lt;key app="EN" db-id="mdae8500109496fea4aff9c086e16cc25895" timestamp="1793221649"&gt;26&lt;/key&gt;&lt;/foreign-keys&gt;&lt;ref-type name="Journal Article"&gt;17&lt;/ref-type&gt;&lt;contributors&gt;&lt;authors&gt;&lt;author&gt;Gomes, Cláudio&lt;/author&gt;&lt;author&gt;Thule, Casper&lt;/author&gt;&lt;author&gt;Broman, David&lt;/author&gt;&lt;author&gt;Larsen, Peter Gorm&lt;/author&gt;&lt;author&gt;Vangheluwe, Hans&lt;/author&gt;&lt;/authors&gt;&lt;/contributors&gt;&lt;titles&gt;&lt;title&gt;Co-Simulation: A Survey&lt;/title&gt;&lt;secondary-title&gt;ACM Computing Surveys&lt;/secondary-title&gt;&lt;alt-title&gt;ACM Comput. Surv.&lt;/alt-title&gt;&lt;/titles&gt;&lt;periodical&gt;&lt;full-title&gt;ACM Computing Surveys&lt;/full-title&gt;&lt;abbr-1&gt;ACM Comput. Surv.&lt;/abbr-1&gt;&lt;/periodical&gt;&lt;pages&gt;49&lt;/pages&gt;&lt;volume&gt;51&lt;/volume&gt;&lt;number&gt;3&lt;/number&gt;&lt;dates&gt;&lt;year&gt;2018&lt;/year&gt;&lt;/dates&gt;&lt;publisher&gt;ACM&lt;/publisher&gt;&lt;label&gt;gomes2018&lt;/label&gt;&lt;urls&gt;&lt;/urls&gt;&lt;electronic-resource-num&gt;10.1145/3179993&lt;/electronic-resource-num&gt;&lt;/record&gt;&lt;/Cite&gt;&lt;/EndNote&gt;</w:instrText>
       </w:r>
       <w:r>
         <w:fldChar w:fldCharType="separate"/>
@@ -1714,7 +1748,7 @@
 PFJlY051bT4zPC9SZWNOdW0+PERpc3BsYXlUZXh0PlszMCwzMV08L0Rpc3BsYXlUZXh0PjxyZWNv
 cmQ+PHJlYy1udW1iZXI+MzwvcmVjLW51bWJlcj48Zm9yZWlnbi1rZXlzPjxrZXkgYXBwPSJFTiIg
 ZGItaWQ9Im1kYWU4NTAwMTA5NDk2ZmVhNGFmZjljMDg2ZTE2Y2MyNTg5NSIgdGltZXN0YW1wPSIx
-NzkzMjIxMzA0Ij4zPC9rZXk+PC9mb3JlaWduLWtleXM+PHJlZi10eXBlIG5hbWU9IkNvbmZlcmVu
+NzkzMjIxNjQ5Ij4zPC9rZXk+PC9mb3JlaWduLWtleXM+PHJlZi10eXBlIG5hbWU9IkNvbmZlcmVu
 Y2UgUGFwZXIiPjQ3PC9yZWYtdHlwZT48Y29udHJpYnV0b3JzPjxhdXRob3JzPjxhdXRob3I+QmVu
 ZWRpa3QsIE0uPC9hdXRob3I+PGF1dGhvcj5XYXR6ZW5pZywgRC48L2F1dGhvcj48YXV0aG9yPlpl
 aGV0bmVyLCBKLjwvYXV0aG9yPjxhdXRob3I+SG9mZXIsIEEuPC9hdXRob3I+PC9hdXRob3JzPjwv
@@ -1731,7 +1765,7 @@
 dXJscz48L3VybHM+PC9yZWNvcmQ+PC9DaXRlPjxDaXRlPjxBdXRob3I+U2FkamluYTwvQXV0aG9y
 PjxZZWFyPjIwMTc8L1llYXI+PFJlY051bT43MTwvUmVjTnVtPjxyZWNvcmQ+PHJlYy1udW1iZXI+
 NzE8L3JlYy1udW1iZXI+PGZvcmVpZ24ta2V5cz48a2V5IGFwcD0iRU4iIGRiLWlkPSJtZGFlODUw
-MDEwOTQ5NmZlYTRhZmY5YzA4NmUxNmNjMjU4OTUiIHRpbWVzdGFtcD0iMTc5MzIyMTMwNCI+NzE8
+MDEwOTQ5NmZlYTRhZmY5YzA4NmUxNmNjMjU4OTUiIHRpbWVzdGFtcD0iMTc5MzIyMTY0OSI+NzE8
 L2tleT48L2ZvcmVpZ24ta2V5cz48cmVmLXR5cGUgbmFtZT0iSm91cm5hbCBBcnRpY2xlIj4xNzwv
 cmVmLXR5cGU+PGNvbnRyaWJ1dG9ycz48YXV0aG9ycz48YXV0aG9yPlNhZGppbmEsIFNldmVyaW48
 L2F1dGhvcj48YXV0aG9yPkt5bGxpbmdzdGFkLCBMYXJzIFQuPC9hdXRob3I+PGF1dGhvcj5Ta2pv
@@ -1759,7 +1793,7 @@
 PFJlY051bT4zPC9SZWNOdW0+PERpc3BsYXlUZXh0PlszMCwzMV08L0Rpc3BsYXlUZXh0PjxyZWNv
 cmQ+PHJlYy1udW1iZXI+MzwvcmVjLW51bWJlcj48Zm9yZWlnbi1rZXlzPjxrZXkgYXBwPSJFTiIg
 ZGItaWQ9Im1kYWU4NTAwMTA5NDk2ZmVhNGFmZjljMDg2ZTE2Y2MyNTg5NSIgdGltZXN0YW1wPSIx
-NzkzMjIxMzA0Ij4zPC9rZXk+PC9mb3JlaWduLWtleXM+PHJlZi10eXBlIG5hbWU9IkNvbmZlcmVu
+NzkzMjIxNjQ5Ij4zPC9rZXk+PC9mb3JlaWduLWtleXM+PHJlZi10eXBlIG5hbWU9IkNvbmZlcmVu
 Y2UgUGFwZXIiPjQ3PC9yZWYtdHlwZT48Y29udHJpYnV0b3JzPjxhdXRob3JzPjxhdXRob3I+QmVu
 ZWRpa3QsIE0uPC9hdXRob3I+PGF1dGhvcj5XYXR6ZW5pZywgRC48L2F1dGhvcj48YXV0aG9yPlpl
 aGV0bmVyLCBKLjwvYXV0aG9yPjxhdXRob3I+SG9mZXIsIEEuPC9hdXRob3I+PC9hdXRob3JzPjwv
@@ -1776,7 +1810,7 @@
 dXJscz48L3VybHM+PC9yZWNvcmQ+PC9DaXRlPjxDaXRlPjxBdXRob3I+U2FkamluYTwvQXV0aG9y
 PjxZZWFyPjIwMTc8L1llYXI+PFJlY051bT43MTwvUmVjTnVtPjxyZWNvcmQ+PHJlYy1udW1iZXI+
 NzE8L3JlYy1udW1iZXI+PGZvcmVpZ24ta2V5cz48a2V5IGFwcD0iRU4iIGRiLWlkPSJtZGFlODUw
-MDEwOTQ5NmZlYTRhZmY5YzA4NmUxNmNjMjU4OTUiIHRpbWVzdGFtcD0iMTc5MzIyMTMwNCI+NzE8
+MDEwOTQ5NmZlYTRhZmY5YzA4NmUxNmNjMjU4OTUiIHRpbWVzdGFtcD0iMTc5MzIyMTY0OSI+NzE8
 L2tleT48L2ZvcmVpZ24ta2V5cz48cmVmLXR5cGUgbmFtZT0iSm91cm5hbCBBcnRpY2xlIj4xNzwv
 cmVmLXR5cGU+PGNvbnRyaWJ1dG9ycz48YXV0aG9ycz48YXV0aG9yPlNhZGppbmEsIFNldmVyaW48
 L2F1dGhvcj48YXV0aG9yPkt5bGxpbmdzdGFkLCBMYXJzIFQuPC9hdXRob3I+PGF1dGhvcj5Ta2pv
@@ -1822,7 +1856,7 @@
 PFJlY051bT44MTwvUmVjTnVtPjxEaXNwbGF5VGV4dD5bMjMsMjRdPC9EaXNwbGF5VGV4dD48cmVj
 b3JkPjxyZWMtbnVtYmVyPjgxPC9yZWMtbnVtYmVyPjxmb3JlaWduLWtleXM+PGtleSBhcHA9IkVO
 IiBkYi1pZD0ibWRhZTg1MDAxMDk0OTZmZWE0YWZmOWMwODZlMTZjYzI1ODk1IiB0aW1lc3RhbXA9
-IjE3OTMyMjEzMDQiPjgxPC9rZXk+PC9mb3JlaWduLWtleXM+PHJlZi10eXBlIG5hbWU9IkNvbmZl
+IjE3OTMyMjE2NDkiPjgxPC9rZXk+PC9mb3JlaWduLWtleXM+PHJlZi10eXBlIG5hbWU9IkNvbmZl
 cmVuY2UgUGFwZXIiPjQ3PC9yZWYtdHlwZT48Y29udHJpYnV0b3JzPjxhdXRob3JzPjxhdXRob3I+
 VHJpcGFraXMsIFN0YXZyb3M8L2F1dGhvcj48L2F1dGhvcnM+PC9jb250cmlidXRvcnM+PHRpdGxl
 cz48dGl0bGU+QnJpZGdpbmcgdGhlIHNlbWFudGljIGdhcCBiZXR3ZWVuIGhldGVyb2dlbmVvdXMg
@@ -1837,7 +1871,7 @@
 bWVzPC9BdXRob3I+PFllYXI+MjAxOTwvWWVhcj48UmVjTnVtPjI3PC9SZWNOdW0+PHJlY29yZD48
 cmVjLW51bWJlcj4yNzwvcmVjLW51bWJlcj48Zm9yZWlnbi1rZXlzPjxrZXkgYXBwPSJFTiIgZGIt
 aWQ9Im1kYWU4NTAwMTA5NDk2ZmVhNGFmZjljMDg2ZTE2Y2MyNTg5NSIgdGltZXN0YW1wPSIxNzkz
-MjIxMzA0Ij4yNzwva2V5PjwvZm9yZWlnbi1rZXlzPjxyZWYtdHlwZSBuYW1lPSJKb3VybmFsIEFy
+MjIxNjQ5Ij4yNzwva2V5PjwvZm9yZWlnbi1rZXlzPjxyZWYtdHlwZSBuYW1lPSJKb3VybmFsIEFy
 dGljbGUiPjE3PC9yZWYtdHlwZT48Y29udHJpYnV0b3JzPjxhdXRob3JzPjxhdXRob3I+R29tZXMs
 IENsw6F1ZGlvPC9hdXRob3I+PGF1dGhvcj5NZXllcnMsIEJhcnQ8L2F1dGhvcj48YXV0aG9yPkRl
 bmlsLCBKb2FjaGltPC9hdXRob3I+PGF1dGhvcj5UaHVsZSwgQ2FzcGVyPC9hdXRob3I+PGF1dGhv
@@ -1864,7 +1898,7 @@
 PFJlY051bT44MTwvUmVjTnVtPjxEaXNwbGF5VGV4dD5bMjMsMjRdPC9EaXNwbGF5VGV4dD48cmVj
 b3JkPjxyZWMtbnVtYmVyPjgxPC9yZWMtbnVtYmVyPjxmb3JlaWduLWtleXM+PGtleSBhcHA9IkVO
 IiBkYi1pZD0ibWRhZTg1MDAxMDk0OTZmZWE0YWZmOWMwODZlMTZjYzI1ODk1IiB0aW1lc3RhbXA9
-IjE3OTMyMjEzMDQiPjgxPC9rZXk+PC9mb3JlaWduLWtleXM+PHJlZi10eXBlIG5hbWU9IkNvbmZl
+IjE3OTMyMjE2NDkiPjgxPC9rZXk+PC9mb3JlaWduLWtleXM+PHJlZi10eXBlIG5hbWU9IkNvbmZl
 cmVuY2UgUGFwZXIiPjQ3PC9yZWYtdHlwZT48Y29udHJpYnV0b3JzPjxhdXRob3JzPjxhdXRob3I+
 VHJpcGFraXMsIFN0YXZyb3M8L2F1dGhvcj48L2F1dGhvcnM+PC9jb250cmlidXRvcnM+PHRpdGxl
 cz48dGl0bGU+QnJpZGdpbmcgdGhlIHNlbWFudGljIGdhcCBiZXR3ZWVuIGhldGVyb2dlbmVvdXMg
@@ -1879,7 +1913,7 @@
 bWVzPC9BdXRob3I+PFllYXI+MjAxOTwvWWVhcj48UmVjTnVtPjI3PC9SZWNOdW0+PHJlY29yZD48
 cmVjLW51bWJlcj4yNzwvcmVjLW51bWJlcj48Zm9yZWlnbi1rZXlzPjxrZXkgYXBwPSJFTiIgZGIt
 aWQ9Im1kYWU4NTAwMTA5NDk2ZmVhNGFmZjljMDg2ZTE2Y2MyNTg5NSIgdGltZXN0YW1wPSIxNzkz
-MjIxMzA0Ij4yNzwva2V5PjwvZm9yZWlnbi1rZXlzPjxyZWYtdHlwZSBuYW1lPSJKb3VybmFsIEFy
+MjIxNjQ5Ij4yNzwva2V5PjwvZm9yZWlnbi1rZXlzPjxyZWYtdHlwZSBuYW1lPSJKb3VybmFsIEFy
 dGljbGUiPjE3PC9yZWYtdHlwZT48Y29udHJpYnV0b3JzPjxhdXRob3JzPjxhdXRob3I+R29tZXMs
 IENsw6F1ZGlvPC9hdXRob3I+PGF1dGhvcj5NZXllcnMsIEJhcnQ8L2F1dGhvcj48YXV0aG9yPkRl
 bmlsLCBKb2FjaGltPC9hdXRob3I+PGF1dGhvcj5UaHVsZSwgQ2FzcGVyPC9hdXRob3I+PGF1dGhv
@@ -1938,7 +1972,7 @@
         <w:fldChar w:fldCharType="begin"/>
       </w:r>
       <w:r>
-        <w:instrText xml:space="preserve"> ADDIN EN.CITE &lt;EndNote&gt;&lt;Cite&gt;&lt;Author&gt;IEEE&lt;/Author&gt;&lt;Year&gt;2010&lt;/Year&gt;&lt;RecNum&gt;38&lt;/RecNum&gt;&lt;DisplayText&gt;[32,33]&lt;/DisplayText&gt;&lt;record&gt;&lt;rec-number&gt;38&lt;/rec-number&gt;&lt;foreign-keys&gt;&lt;key app="EN" db-id="mdae8500109496fea4aff9c086e16cc25895" timestamp="1793221304"&gt;38&lt;/key&gt;&lt;/foreign-keys&gt;&lt;ref-type name="Standard"&gt;58&lt;/ref-type&gt;&lt;contributors&gt;&lt;authors&gt;&lt;author&gt;IEEE&lt;/author&gt;&lt;/authors&gt;&lt;/contributors&gt;&lt;titles&gt;&lt;title&gt;IEEE Standard for Modeling and Simulation (M&amp;amp;S) High Level Architecture (HLA) – Framework and Rules&lt;/title&gt;&lt;secondary-title&gt;IEEE Std 1516-2010&lt;/secondary-title&gt;&lt;/titles&gt;&lt;dates&gt;&lt;year&gt;2010&lt;/year&gt;&lt;/dates&gt;&lt;isbn&gt;978-0-7381-6251-5&lt;/isbn&gt;&lt;label&gt;ieee1516_2010&lt;/label&gt;&lt;urls&gt;&lt;related-urls&gt;&lt;url&gt;https://ieeexplore.ieee.org/document/5553440&lt;/url&gt;&lt;/related-urls&gt;&lt;/urls&gt;&lt;electronic-resource-num&gt;10.1109/IEEESTD.2010.5553440&lt;/electronic-resource-num&gt;&lt;/record&gt;&lt;/Cite&gt;&lt;Cite&gt;&lt;Author&gt;Fujimoto&lt;/Author&gt;&lt;Year&gt;2000&lt;/Year&gt;&lt;RecNum&gt;25&lt;/RecNum&gt;&lt;record&gt;&lt;rec-number&gt;25&lt;/rec-number&gt;&lt;foreign-keys&gt;&lt;key app="EN" db-id="mdae8500109496fea4aff9c086e16cc25895" timestamp="1793221304"&gt;25&lt;/key&gt;&lt;/foreign-keys&gt;&lt;ref-type name="Book"&gt;6&lt;/ref-type&gt;&lt;contributors&gt;&lt;authors&gt;&lt;author&gt;Fujimoto, Richard M.&lt;/author&gt;&lt;/authors&gt;&lt;/contributors&gt;&lt;titles&gt;&lt;title&gt;Parallel and Distributed Simulation Systems&lt;/title&gt;&lt;secondary-title&gt;Wiley Series on Parallel and Distributed Computing&lt;/secondary-title&gt;&lt;/titles&gt;&lt;dates&gt;&lt;year&gt;2000&lt;/year&gt;&lt;/dates&gt;&lt;publisher&gt;John Wiley &amp;amp; Sons&lt;/publisher&gt;&lt;isbn&gt;978-0-471-18383-9&lt;/isbn&gt;&lt;label&gt;fujimoto2000&lt;/label&gt;&lt;urls&gt;&lt;/urls&gt;&lt;/record&gt;&lt;/Cite&gt;&lt;/EndNote&gt;</w:instrText>
+        <w:instrText xml:space="preserve"> ADDIN EN.CITE &lt;EndNote&gt;&lt;Cite&gt;&lt;Author&gt;IEEE&lt;/Author&gt;&lt;Year&gt;2010&lt;/Year&gt;&lt;RecNum&gt;38&lt;/RecNum&gt;&lt;DisplayText&gt;[32,33]&lt;/DisplayText&gt;&lt;record&gt;&lt;rec-number&gt;38&lt;/rec-number&gt;&lt;foreign-keys&gt;&lt;key app="EN" db-id="mdae8500109496fea4aff9c086e16cc25895" timestamp="1793221649"&gt;38&lt;/key&gt;&lt;/foreign-keys&gt;&lt;ref-type name="Standard"&gt;58&lt;/ref-type&gt;&lt;contributors&gt;&lt;authors&gt;&lt;author&gt;IEEE&lt;/author&gt;&lt;/authors&gt;&lt;/contributors&gt;&lt;titles&gt;&lt;title&gt;IEEE Standard for Modeling and Simulation (M&amp;amp;S) High Level Architecture (HLA) – Framework and Rules&lt;/title&gt;&lt;secondary-title&gt;IEEE Std 1516-2010&lt;/secondary-title&gt;&lt;/titles&gt;&lt;dates&gt;&lt;year&gt;2010&lt;/year&gt;&lt;/dates&gt;&lt;isbn&gt;978-0-7381-6251-5&lt;/isbn&gt;&lt;label&gt;ieee1516_2010&lt;/label&gt;&lt;urls&gt;&lt;related-urls&gt;&lt;url&gt;https://ieeexplore.ieee.org/document/5553440&lt;/url&gt;&lt;/related-urls&gt;&lt;/urls&gt;&lt;electronic-resource-num&gt;10.1109/IEEESTD.2010.5553440&lt;/electronic-resource-num&gt;&lt;/record&gt;&lt;/Cite&gt;&lt;Cite&gt;&lt;Author&gt;Fujimoto&lt;/Author&gt;&lt;Year&gt;2000&lt;/Year&gt;&lt;RecNum&gt;25&lt;/RecNum&gt;&lt;record&gt;&lt;rec-number&gt;25&lt;/rec-number&gt;&lt;foreign-keys&gt;&lt;key app="EN" db-id="mdae8500109496fea4aff9c086e16cc25895" timestamp="1793221649"&gt;25&lt;/key&gt;&lt;/foreign-keys&gt;&lt;ref-type name="Book"&gt;6&lt;/ref-type&gt;&lt;contributors&gt;&lt;authors&gt;&lt;author&gt;Fujimoto, Richard M.&lt;/author&gt;&lt;/authors&gt;&lt;/contributors&gt;&lt;titles&gt;&lt;title&gt;Parallel and Distributed Simulation Systems&lt;/title&gt;&lt;secondary-title&gt;Wiley Series on Parallel and Distributed Computing&lt;/secondary-title&gt;&lt;/titles&gt;&lt;dates&gt;&lt;year&gt;2000&lt;/year&gt;&lt;/dates&gt;&lt;publisher&gt;John Wiley &amp;amp; Sons&lt;/publisher&gt;&lt;isbn&gt;978-0-471-18383-9&lt;/isbn&gt;&lt;label&gt;fujimoto2000&lt;/label&gt;&lt;urls&gt;&lt;/urls&gt;&lt;/record&gt;&lt;/Cite&gt;&lt;/EndNote&gt;</w:instrText>
       </w:r>
       <w:r>
         <w:fldChar w:fldCharType="separate"/>
@@ -1961,7 +1995,7 @@
 cj48UmVjTnVtPjY4PC9SZWNOdW0+PERpc3BsYXlUZXh0PlsxNywxOCwzNF08L0Rpc3BsYXlUZXh0
 PjxyZWNvcmQ+PHJlYy1udW1iZXI+Njg8L3JlYy1udW1iZXI+PGZvcmVpZ24ta2V5cz48a2V5IGFw
 cD0iRU4iIGRiLWlkPSJtZGFlODUwMDEwOTQ5NmZlYTRhZmY5YzA4NmUxNmNjMjU4OTUiIHRpbWVz
-dGFtcD0iMTc5MzIyMTMwNCI+Njg8L2tleT48L2ZvcmVpZ24ta2V5cz48cmVmLXR5cGUgbmFtZT0i
+dGFtcD0iMTc5MzIyMTY0OSI+Njg8L2tleT48L2ZvcmVpZ24ta2V5cz48cmVmLXR5cGUgbmFtZT0i
 Q29uZmVyZW5jZSBQYXBlciI+NDc8L3JlZi10eXBlPjxjb250cmlidXRvcnM+PGF1dGhvcnM+PGF1
 dGhvcj5QYWxtaW50aWVyLCBCcnlhbjwvYXV0aG9yPjxhdXRob3I+S3Jpc2huYW11cnRoeSwgRGhl
 ZXBhazwvYXV0aG9yPjxhdXRob3I+VG9wLCBQaGlsaXA8L2F1dGhvcj48YXV0aG9yPlNtaXRoLCBT
@@ -1979,7 +2013,7 @@
 PkhhcmR5PC9BdXRob3I+PFllYXI+MjAyNDwvWWVhcj48UmVjTnVtPjI5PC9SZWNOdW0+PHJlY29y
 ZD48cmVjLW51bWJlcj4yOTwvcmVjLW51bWJlcj48Zm9yZWlnbi1rZXlzPjxrZXkgYXBwPSJFTiIg
 ZGItaWQ9Im1kYWU4NTAwMTA5NDk2ZmVhNGFmZjljMDg2ZTE2Y2MyNTg5NSIgdGltZXN0YW1wPSIx
-NzkzMjIxMzA0Ij4yOTwva2V5PjwvZm9yZWlnbi1rZXlzPjxyZWYtdHlwZSBuYW1lPSJKb3VybmFs
+NzkzMjIxNjQ5Ij4yOTwva2V5PjwvZm9yZWlnbi1rZXlzPjxyZWYtdHlwZSBuYW1lPSJKb3VybmFs
 IEFydGljbGUiPjE3PC9yZWYtdHlwZT48Y29udHJpYnV0b3JzPjxhdXRob3JzPjxhdXRob3I+SGFy
 ZHksIFRyZXZvciBELjwvYXV0aG9yPjxhdXRob3I+UGFsbWludGllciwgQnJ5YW48L2F1dGhvcj48
 YXV0aG9yPlRvcCwgUGhpbGlwIEwuPC9hdXRob3I+PGF1dGhvcj5LcmlzaG5hbXVydGh5LCBEaGVl
@@ -1997,7 +2031,7 @@
 Qyk8L0F1dGhvcj48WWVhcj4yMDI2PC9ZZWFyPjxSZWNOdW0+MzE8L1JlY051bT48cmVjb3JkPjxy
 ZWMtbnVtYmVyPjMxPC9yZWMtbnVtYmVyPjxmb3JlaWduLWtleXM+PGtleSBhcHA9IkVOIiBkYi1p
 ZD0ibWRhZTg1MDAxMDk0OTZmZWE0YWZmOWMwODZlMTZjYzI1ODk1IiB0aW1lc3RhbXA9IjE3OTMy
-MjEzMDQiPjMxPC9rZXk+PC9mb3JlaWduLWtleXM+PHJlZi10eXBlIG5hbWU9IldlYiBQYWdlIj4x
+MjE2NDkiPjMxPC9rZXk+PC9mb3JlaWduLWtleXM+PHJlZi10eXBlIG5hbWU9IldlYiBQYWdlIj4x
 MjwvcmVmLXR5cGU+PGNvbnRyaWJ1dG9ycz48YXV0aG9ycz48YXV0aG9yPkhFTElDUyBkZXZlbG9w
 ZXJzIChHTUxDLVREQyk8L2F1dGhvcj48L2F1dGhvcnM+PC9jb250cmlidXRvcnM+PHRpdGxlcz48
 dGl0bGU+SEVMSUNTIGRvY3VtZW50YXRpb248L3RpdGxlPjwvdGl0bGVzPjxkYXRlcz48eWVhcj4y
@@ -2016,7 +2050,7 @@
 cj48UmVjTnVtPjY4PC9SZWNOdW0+PERpc3BsYXlUZXh0PlsxNywxOCwzNF08L0Rpc3BsYXlUZXh0
 PjxyZWNvcmQ+PHJlYy1udW1iZXI+Njg8L3JlYy1udW1iZXI+PGZvcmVpZ24ta2V5cz48a2V5IGFw
 cD0iRU4iIGRiLWlkPSJtZGFlODUwMDEwOTQ5NmZlYTRhZmY5YzA4NmUxNmNjMjU4OTUiIHRpbWVz
-dGFtcD0iMTc5MzIyMTMwNCI+Njg8L2tleT48L2ZvcmVpZ24ta2V5cz48cmVmLXR5cGUgbmFtZT0i
+dGFtcD0iMTc5MzIyMTY0OSI+Njg8L2tleT48L2ZvcmVpZ24ta2V5cz48cmVmLXR5cGUgbmFtZT0i
 Q29uZmVyZW5jZSBQYXBlciI+NDc8L3JlZi10eXBlPjxjb250cmlidXRvcnM+PGF1dGhvcnM+PGF1
 dGhvcj5QYWxtaW50aWVyLCBCcnlhbjwvYXV0aG9yPjxhdXRob3I+S3Jpc2huYW11cnRoeSwgRGhl
 ZXBhazwvYXV0aG9yPjxhdXRob3I+VG9wLCBQaGlsaXA8L2F1dGhvcj48YXV0aG9yPlNtaXRoLCBT
@@ -2034,7 +2068,7 @@
 PkhhcmR5PC9BdXRob3I+PFllYXI+MjAyNDwvWWVhcj48UmVjTnVtPjI5PC9SZWNOdW0+PHJlY29y
 ZD48cmVjLW51bWJlcj4yOTwvcmVjLW51bWJlcj48Zm9yZWlnbi1rZXlzPjxrZXkgYXBwPSJFTiIg
 ZGItaWQ9Im1kYWU4NTAwMTA5NDk2ZmVhNGFmZjljMDg2ZTE2Y2MyNTg5NSIgdGltZXN0YW1wPSIx
-NzkzMjIxMzA0Ij4yOTwva2V5PjwvZm9yZWlnbi1rZXlzPjxyZWYtdHlwZSBuYW1lPSJKb3VybmFs
+NzkzMjIxNjQ5Ij4yOTwva2V5PjwvZm9yZWlnbi1rZXlzPjxyZWYtdHlwZSBuYW1lPSJKb3VybmFs
 IEFydGljbGUiPjE3PC9yZWYtdHlwZT48Y29udHJpYnV0b3JzPjxhdXRob3JzPjxhdXRob3I+SGFy
 ZHksIFRyZXZvciBELjwvYXV0aG9yPjxhdXRob3I+UGFsbWludGllciwgQnJ5YW48L2F1dGhvcj48
 YXV0aG9yPlRvcCwgUGhpbGlwIEwuPC9hdXRob3I+PGF1dGhvcj5LcmlzaG5hbXVydGh5LCBEaGVl
@@ -2052,7 +2086,7 @@
 Qyk8L0F1dGhvcj48WWVhcj4yMDI2PC9ZZWFyPjxSZWNOdW0+MzE8L1JlY051bT48cmVjb3JkPjxy
 ZWMtbnVtYmVyPjMxPC9yZWMtbnVtYmVyPjxmb3JlaWduLWtleXM+PGtleSBhcHA9IkVOIiBkYi1p
 ZD0ibWRhZTg1MDAxMDk0OTZmZWE0YWZmOWMwODZlMTZjYzI1ODk1IiB0aW1lc3RhbXA9IjE3OTMy
-MjEzMDQiPjMxPC9rZXk+PC9mb3JlaWduLWtleXM+PHJlZi10eXBlIG5hbWU9IldlYiBQYWdlIj4x
+MjE2NDkiPjMxPC9rZXk+PC9mb3JlaWduLWtleXM+PHJlZi10eXBlIG5hbWU9IldlYiBQYWdlIj4x
 MjwvcmVmLXR5cGU+PGNvbnRyaWJ1dG9ycz48YXV0aG9ycz48YXV0aG9yPkhFTElDUyBkZXZlbG9w
 ZXJzIChHTUxDLVREQyk8L2F1dGhvcj48L2F1dGhvcnM+PC9jb250cmlidXRvcnM+PHRpdGxlcz48
 dGl0bGU+SEVMSUNTIGRvY3VtZW50YXRpb248L3RpdGxlPjwvdGl0bGVzPjxkYXRlcz48eWVhcj4y
@@ -2087,7 +2121,7 @@
         <w:fldChar w:fldCharType="begin"/>
       </w:r>
       <w:r>
-        <w:instrText xml:space="preserve"> ADDIN EN.CITE &lt;EndNote&gt;&lt;Cite&gt;&lt;Author&gt;Ofenloch&lt;/Author&gt;&lt;Year&gt;2022&lt;/Year&gt;&lt;RecNum&gt;62&lt;/RecNum&gt;&lt;DisplayText&gt;[20,35]&lt;/DisplayText&gt;&lt;record&gt;&lt;rec-number&gt;62&lt;/rec-number&gt;&lt;foreign-keys&gt;&lt;key app="EN" db-id="mdae8500109496fea4aff9c086e16cc25895" timestamp="1793221304"&gt;62&lt;/key&gt;&lt;/foreign-keys&gt;&lt;ref-type name="Conference Paper"&gt;47&lt;/ref-type&gt;&lt;contributors&gt;&lt;authors&gt;&lt;author&gt;Ofenloch, Annika&lt;/author&gt;&lt;author&gt;Schwarz, Jan Sören&lt;/author&gt;&lt;author&gt;Tolk, Deborah&lt;/author&gt;&lt;author&gt;Brandt, Tobias&lt;/author&gt;&lt;author&gt;Eilers, Reef&lt;/author&gt;&lt;author&gt;Ramirez, Rebeca&lt;/author&gt;&lt;author&gt;Raub, Thomas&lt;/author&gt;&lt;author&gt;Lehnhoff, Sebastian&lt;/author&gt;&lt;/authors&gt;&lt;/contributors&gt;&lt;titles&gt;&lt;title&gt;MOSAIK 3.0: Combining Time-Stepped and Discrete Event Simulation&lt;/title&gt;&lt;secondary-title&gt;2022 Open Source Modelling and Simulation of Energy Systems (OSMSES)&lt;/secondary-title&gt;&lt;/titles&gt;&lt;pages&gt;1-5&lt;/pages&gt;&lt;dates&gt;&lt;year&gt;2022&lt;/year&gt;&lt;/dates&gt;&lt;pub-location&gt;Aachen, Germany&lt;/pub-location&gt;&lt;publisher&gt;IEEE&lt;/publisher&gt;&lt;label&gt;ofenloch2022&lt;/label&gt;&lt;urls&gt;&lt;/urls&gt;&lt;electronic-resource-num&gt;10.1109/OSMSES54027.2022.9769116&lt;/electronic-resource-num&gt;&lt;/record&gt;&lt;/Cite&gt;&lt;Cite&gt;&lt;Author&gt;OFFIS&lt;/Author&gt;&lt;Year&gt;2025&lt;/Year&gt;&lt;RecNum&gt;56&lt;/RecNum&gt;&lt;record&gt;&lt;rec-number&gt;56&lt;/rec-number&gt;&lt;foreign-keys&gt;&lt;key app="EN" db-id="mdae8500109496fea4aff9c086e16cc25895" timestamp="1793221304"&gt;56&lt;/key&gt;&lt;/foreign-keys&gt;&lt;ref-type name="Web Page"&gt;12&lt;/ref-type&gt;&lt;contributors&gt;&lt;authors&gt;&lt;author&gt;OFFIS&lt;/author&gt;&lt;/authors&gt;&lt;/contributors&gt;&lt;titles&gt;&lt;title&gt;mosaik documentation&lt;/title&gt;&lt;/titles&gt;&lt;dates&gt;&lt;year&gt;2025&lt;/year&gt;&lt;/dates&gt;&lt;label&gt;mosaik_docs&lt;/label&gt;&lt;urls&gt;&lt;related-urls&gt;&lt;url&gt;https://mosaik.readthedocs.io/en/3.5.0/&lt;/url&gt;&lt;/related-urls&gt;&lt;/urls&gt;&lt;access-date&gt;2026-10-28&lt;/access-date&gt;&lt;/record&gt;&lt;/Cite&gt;&lt;/EndNote&gt;</w:instrText>
+        <w:instrText xml:space="preserve"> ADDIN EN.CITE &lt;EndNote&gt;&lt;Cite&gt;&lt;Author&gt;Ofenloch&lt;/Author&gt;&lt;Year&gt;2022&lt;/Year&gt;&lt;RecNum&gt;62&lt;/RecNum&gt;&lt;DisplayText&gt;[20,35]&lt;/DisplayText&gt;&lt;record&gt;&lt;rec-number&gt;62&lt;/rec-number&gt;&lt;foreign-keys&gt;&lt;key app="EN" db-id="mdae8500109496fea4aff9c086e16cc25895" timestamp="1793221649"&gt;62&lt;/key&gt;&lt;/foreign-keys&gt;&lt;ref-type name="Conference Paper"&gt;47&lt;/ref-type&gt;&lt;contributors&gt;&lt;authors&gt;&lt;author&gt;Ofenloch, Annika&lt;/author&gt;&lt;author&gt;Schwarz, Jan Sören&lt;/author&gt;&lt;author&gt;Tolk, Deborah&lt;/author&gt;&lt;author&gt;Brandt, Tobias&lt;/author&gt;&lt;author&gt;Eilers, Reef&lt;/author&gt;&lt;author&gt;Ramirez, Rebeca&lt;/author&gt;&lt;author&gt;Raub, Thomas&lt;/author&gt;&lt;author&gt;Lehnhoff, Sebastian&lt;/author&gt;&lt;/authors&gt;&lt;/contributors&gt;&lt;titles&gt;&lt;title&gt;MOSAIK 3.0: Combining Time-Stepped and Discrete Event Simulation&lt;/title&gt;&lt;secondary-title&gt;2022 Open Source Modelling and Simulation of Energy Systems (OSMSES)&lt;/secondary-title&gt;&lt;/titles&gt;&lt;pages&gt;1-5&lt;/pages&gt;&lt;dates&gt;&lt;year&gt;2022&lt;/year&gt;&lt;/dates&gt;&lt;pub-location&gt;Aachen, Germany&lt;/pub-location&gt;&lt;publisher&gt;IEEE&lt;/publisher&gt;&lt;label&gt;ofenloch2022&lt;/label&gt;&lt;urls&gt;&lt;/urls&gt;&lt;electronic-resource-num&gt;10.1109/OSMSES54027.2022.9769116&lt;/electronic-resource-num&gt;&lt;/record&gt;&lt;/Cite&gt;&lt;Cite&gt;&lt;Author&gt;OFFIS&lt;/Author&gt;&lt;Year&gt;2025&lt;/Year&gt;&lt;RecNum&gt;56&lt;/RecNum&gt;&lt;record&gt;&lt;rec-number&gt;56&lt;/rec-number&gt;&lt;foreign-keys&gt;&lt;key app="EN" db-id="mdae8500109496fea4aff9c086e16cc25895" timestamp="1793221649"&gt;56&lt;/key&gt;&lt;/foreign-keys&gt;&lt;ref-type name="Web Page"&gt;12&lt;/ref-type&gt;&lt;contributors&gt;&lt;authors&gt;&lt;author&gt;OFFIS&lt;/author&gt;&lt;/authors&gt;&lt;/contributors&gt;&lt;titles&gt;&lt;title&gt;mosaik documentation&lt;/title&gt;&lt;/titles&gt;&lt;dates&gt;&lt;year&gt;2025&lt;/year&gt;&lt;/dates&gt;&lt;label&gt;mosaik_docs&lt;/label&gt;&lt;urls&gt;&lt;related-urls&gt;&lt;url&gt;https://mosaik.readthedocs.io/en/3.5.0/&lt;/url&gt;&lt;/related-urls&gt;&lt;/urls&gt;&lt;access-date&gt;2026-10-28&lt;/access-date&gt;&lt;/record&gt;&lt;/Cite&gt;&lt;/EndNote&gt;</w:instrText>
       </w:r>
       <w:r>
         <w:fldChar w:fldCharType="separate"/>
@@ -2110,7 +2144,7 @@
 dW0+ODQ8L1JlY051bT48RGlzcGxheVRleHQ+WzM2LDM3XTwvRGlzcGxheVRleHQ+PHJlY29yZD48
 cmVjLW51bWJlcj44NDwvcmVjLW51bWJlcj48Zm9yZWlnbi1rZXlzPjxrZXkgYXBwPSJFTiIgZGIt
 aWQ9Im1kYWU4NTAwMTA5NDk2ZmVhNGFmZjljMDg2ZTE2Y2MyNTg5NSIgdGltZXN0YW1wPSIxNzkz
-MjIxMzA0Ij44NDwva2V5PjwvZm9yZWlnbi1rZXlzPjxyZWYtdHlwZSBuYW1lPSJKb3VybmFsIEFy
+MjIxNjQ5Ij44NDwva2V5PjwvZm9yZWlnbi1rZXlzPjxyZWYtdHlwZSBuYW1lPSJKb3VybmFsIEFy
 dGljbGUiPjE3PC9yZWYtdHlwZT48Y29udHJpYnV0b3JzPjxhdXRob3JzPjxhdXRob3I+V2VuLCBK
 aWFuZmVuZzwvYXV0aG9yPjxhdXRob3I+SmlhbmcsIExpbjwvYXV0aG9yPjxhdXRob3I+Q2hlbiwg
 WXV5aW5nPC9hdXRob3I+PGF1dGhvcj5DaHUsIENoaWEtQ2hpPC9hdXRob3I+PGF1dGhvcj5aaHUs
@@ -2129,7 +2163,7 @@
 ZD48L0NpdGU+PENpdGU+PEF1dGhvcj5QYWR1YW5pPC9BdXRob3I+PFllYXI+MjAyMzwvWWVhcj48
 UmVjTnVtPjY3PC9SZWNOdW0+PHJlY29yZD48cmVjLW51bWJlcj42NzwvcmVjLW51bWJlcj48Zm9y
 ZWlnbi1rZXlzPjxrZXkgYXBwPSJFTiIgZGItaWQ9Im1kYWU4NTAwMTA5NDk2ZmVhNGFmZjljMDg2
-ZTE2Y2MyNTg5NSIgdGltZXN0YW1wPSIxNzkzMjIxMzA0Ij42Nzwva2V5PjwvZm9yZWlnbi1rZXlz
+ZTE2Y2MyNTg5NSIgdGltZXN0YW1wPSIxNzkzMjIxNjQ5Ij42Nzwva2V5PjwvZm9yZWlnbi1rZXlz
 PjxyZWYtdHlwZSBuYW1lPSJDb25mZXJlbmNlIFBhcGVyIj40NzwvcmVmLXR5cGU+PGNvbnRyaWJ1
 dG9ycz48YXV0aG9ycz48YXV0aG9yPlBhZHVhbmksIFZpY3RvcjwvYXV0aG9yPjxhdXRob3I+S2Fk
 YXZpbCwgUmFodWw8L2F1dGhvcj48YXV0aG9yPkhvb3NoeWFyLCBIb3NzZWluPC9hdXRob3I+PGF1
@@ -2155,7 +2189,7 @@
 dW0+ODQ8L1JlY051bT48RGlzcGxheVRleHQ+WzM2LDM3XTwvRGlzcGxheVRleHQ+PHJlY29yZD48
 cmVjLW51bWJlcj44NDwvcmVjLW51bWJlcj48Zm9yZWlnbi1rZXlzPjxrZXkgYXBwPSJFTiIgZGIt
 aWQ9Im1kYWU4NTAwMTA5NDk2ZmVhNGFmZjljMDg2ZTE2Y2MyNTg5NSIgdGltZXN0YW1wPSIxNzkz
-MjIxMzA0Ij44NDwva2V5PjwvZm9yZWlnbi1rZXlzPjxyZWYtdHlwZSBuYW1lPSJKb3VybmFsIEFy
+MjIxNjQ5Ij44NDwva2V5PjwvZm9yZWlnbi1rZXlzPjxyZWYtdHlwZSBuYW1lPSJKb3VybmFsIEFy
 dGljbGUiPjE3PC9yZWYtdHlwZT48Y29udHJpYnV0b3JzPjxhdXRob3JzPjxhdXRob3I+V2VuLCBK
 aWFuZmVuZzwvYXV0aG9yPjxhdXRob3I+SmlhbmcsIExpbjwvYXV0aG9yPjxhdXRob3I+Q2hlbiwg
 WXV5aW5nPC9hdXRob3I+PGF1dGhvcj5DaHUsIENoaWEtQ2hpPC9hdXRob3I+PGF1dGhvcj5aaHUs
@@ -2174,7 +2208,7 @@
 ZD48L0NpdGU+PENpdGU+PEF1dGhvcj5QYWR1YW5pPC9BdXRob3I+PFllYXI+MjAyMzwvWWVhcj48
 UmVjTnVtPjY3PC9SZWNOdW0+PHJlY29yZD48cmVjLW51bWJlcj42NzwvcmVjLW51bWJlcj48Zm9y
 ZWlnbi1rZXlzPjxrZXkgYXBwPSJFTiIgZGItaWQ9Im1kYWU4NTAwMTA5NDk2ZmVhNGFmZjljMDg2
-ZTE2Y2MyNTg5NSIgdGltZXN0YW1wPSIxNzkzMjIxMzA0Ij42Nzwva2V5PjwvZm9yZWlnbi1rZXlz
+ZTE2Y2MyNTg5NSIgdGltZXN0YW1wPSIxNzkzMjIxNjQ5Ij42Nzwva2V5PjwvZm9yZWlnbi1rZXlz
 PjxyZWYtdHlwZSBuYW1lPSJDb25mZXJlbmNlIFBhcGVyIj40NzwvcmVmLXR5cGU+PGNvbnRyaWJ1
 dG9ycz48YXV0aG9ycz48YXV0aG9yPlBhZHVhbmksIFZpY3RvcjwvYXV0aG9yPjxhdXRob3I+S2Fk
 YXZpbCwgUmFodWw8L2F1dGhvcj48YXV0aG9yPkhvb3NoeWFyLCBIb3NzZWluPC9hdXRob3I+PGF1
@@ -2216,7 +2250,7 @@
         <w:fldChar w:fldCharType="begin"/>
       </w:r>
       <w:r>
-        <w:instrText xml:space="preserve"> ADDIN EN.CITE &lt;EndNote&gt;&lt;Cite&gt;&lt;Author&gt;Katipamula&lt;/Author&gt;&lt;Year&gt;2016&lt;/Year&gt;&lt;RecNum&gt;44&lt;/RecNum&gt;&lt;DisplayText&gt;[38]&lt;/DisplayText&gt;&lt;record&gt;&lt;rec-number&gt;44&lt;/rec-number&gt;&lt;foreign-keys&gt;&lt;key app="EN" db-id="mdae8500109496fea4aff9c086e16cc25895" timestamp="1793221304"&gt;44&lt;/key&gt;&lt;/foreign-keys&gt;&lt;ref-type name="Journal Article"&gt;17&lt;/ref-type&gt;&lt;contributors&gt;&lt;authors&gt;&lt;author&gt;Katipamula, Srinivas&lt;/author&gt;&lt;author&gt;Haack, Jereme&lt;/author&gt;&lt;author&gt;Hernandez, George&lt;/author&gt;&lt;author&gt;Akyol, Bora&lt;/author&gt;&lt;author&gt;Hagerman, Joseph&lt;/author&gt;&lt;/authors&gt;&lt;/contributors&gt;&lt;titles&gt;&lt;title&gt;VOLTTRON: An Open-Source Software Platform of the Future&lt;/title&gt;&lt;secondary-title&gt;IEEE Electrification Magazine&lt;/secondary-title&gt;&lt;alt-title&gt;IEEE Electrif. Mag.&lt;/alt-title&gt;&lt;/titles&gt;&lt;periodical&gt;&lt;full-title&gt;IEEE Electrification Magazine&lt;/full-title&gt;&lt;abbr-1&gt;IEEE Electrif. Mag.&lt;/abbr-1&gt;&lt;/periodical&gt;&lt;pages&gt;15-22&lt;/pages&gt;&lt;volume&gt;4&lt;/volume&gt;&lt;number&gt;4&lt;/number&gt;&lt;dates&gt;&lt;year&gt;2016&lt;/year&gt;&lt;/dates&gt;&lt;publisher&gt;IEEE&lt;/publisher&gt;&lt;label&gt;katipamula2016&lt;/label&gt;&lt;urls&gt;&lt;/urls&gt;&lt;electronic-resource-num&gt;10.1109/MELE.2016.2614178&lt;/electronic-resource-num&gt;&lt;/record&gt;&lt;/Cite&gt;&lt;/EndNote&gt;</w:instrText>
+        <w:instrText xml:space="preserve"> ADDIN EN.CITE &lt;EndNote&gt;&lt;Cite&gt;&lt;Author&gt;Katipamula&lt;/Author&gt;&lt;Year&gt;2016&lt;/Year&gt;&lt;RecNum&gt;44&lt;/RecNum&gt;&lt;DisplayText&gt;[38]&lt;/DisplayText&gt;&lt;record&gt;&lt;rec-number&gt;44&lt;/rec-number&gt;&lt;foreign-keys&gt;&lt;key app="EN" db-id="mdae8500109496fea4aff9c086e16cc25895" timestamp="1793221649"&gt;44&lt;/key&gt;&lt;/foreign-keys&gt;&lt;ref-type name="Journal Article"&gt;17&lt;/ref-type&gt;&lt;contributors&gt;&lt;authors&gt;&lt;author&gt;Katipamula, Srinivas&lt;/author&gt;&lt;author&gt;Haack, Jereme&lt;/author&gt;&lt;author&gt;Hernandez, George&lt;/author&gt;&lt;author&gt;Akyol, Bora&lt;/author&gt;&lt;author&gt;Hagerman, Joseph&lt;/author&gt;&lt;/authors&gt;&lt;/contributors&gt;&lt;titles&gt;&lt;title&gt;VOLTTRON: An Open-Source Software Platform of the Future&lt;/title&gt;&lt;secondary-title&gt;IEEE Electrification Magazine&lt;/secondary-title&gt;&lt;alt-title&gt;IEEE Electrif. Mag.&lt;/alt-title&gt;&lt;/titles&gt;&lt;periodical&gt;&lt;full-title&gt;IEEE Electrification Magazine&lt;/full-title&gt;&lt;abbr-1&gt;IEEE Electrif. Mag.&lt;/abbr-1&gt;&lt;/periodical&gt;&lt;pages&gt;15-22&lt;/pages&gt;&lt;volume&gt;4&lt;/volume&gt;&lt;number&gt;4&lt;/number&gt;&lt;dates&gt;&lt;year&gt;2016&lt;/year&gt;&lt;/dates&gt;&lt;publisher&gt;IEEE&lt;/publisher&gt;&lt;label&gt;katipamula2016&lt;/label&gt;&lt;urls&gt;&lt;/urls&gt;&lt;electronic-resource-num&gt;10.1109/MELE.2016.2614178&lt;/electronic-resource-num&gt;&lt;/record&gt;&lt;/Cite&gt;&lt;/EndNote&gt;</w:instrText>
       </w:r>
       <w:r>
         <w:fldChar w:fldCharType="separate"/>
@@ -2237,7 +2271,7 @@
         <w:fldChar w:fldCharType="begin"/>
       </w:r>
       <w:r>
-        <w:instrText xml:space="preserve"> ADDIN EN.CITE &lt;EndNote&gt;&lt;Cite&gt;&lt;Author&gt;HELICS developers (GMLC-TDC)&lt;/Author&gt;&lt;Year&gt;2026&lt;/Year&gt;&lt;RecNum&gt;31&lt;/RecNum&gt;&lt;DisplayText&gt;[34,35]&lt;/DisplayText&gt;&lt;record&gt;&lt;rec-number&gt;31&lt;/rec-number&gt;&lt;foreign-keys&gt;&lt;key app="EN" db-id="mdae8500109496fea4aff9c086e16cc25895" timestamp="1793221304"&gt;31&lt;/key&gt;&lt;/foreign-keys&gt;&lt;ref-type name="Web Page"&gt;12&lt;/ref-type&gt;&lt;contributors&gt;&lt;authors&gt;&lt;author&gt;HELICS developers (GMLC-TDC)&lt;/author&gt;&lt;/authors&gt;&lt;/contributors&gt;&lt;titles&gt;&lt;title&gt;HELICS documentation&lt;/title&gt;&lt;/titles&gt;&lt;dates&gt;&lt;year&gt;2026&lt;/year&gt;&lt;/dates&gt;&lt;label&gt;helics_docs&lt;/label&gt;&lt;urls&gt;&lt;related-urls&gt;&lt;url&gt;https://docs.helics.org/en/latest/&lt;/url&gt;&lt;/related-urls&gt;&lt;/urls&gt;&lt;access-date&gt;2026-10-28&lt;/access-date&gt;&lt;/record&gt;&lt;/Cite&gt;&lt;Cite&gt;&lt;Author&gt;OFFIS&lt;/Author&gt;&lt;Year&gt;2025&lt;/Year&gt;&lt;RecNum&gt;56&lt;/RecNum&gt;&lt;record&gt;&lt;rec-number&gt;56&lt;/rec-number&gt;&lt;foreign-keys&gt;&lt;key app="EN" db-id="mdae8500109496fea4aff9c086e16cc25895" timestamp="1793221304"&gt;56&lt;/key&gt;&lt;/foreign-keys&gt;&lt;ref-type name="Web Page"&gt;12&lt;/ref-type&gt;&lt;contributors&gt;&lt;authors&gt;&lt;author&gt;OFFIS&lt;/author&gt;&lt;/authors&gt;&lt;/contributors&gt;&lt;titles&gt;&lt;title&gt;mosaik documentation&lt;/title&gt;&lt;/titles&gt;&lt;dates&gt;&lt;year&gt;2025&lt;/year&gt;&lt;/dates&gt;&lt;label&gt;mosaik_docs&lt;/label&gt;&lt;urls&gt;&lt;related-urls&gt;&lt;url&gt;https://mosaik.readthedocs.io/en/3.5.0/&lt;/url&gt;&lt;/related-urls&gt;&lt;/urls&gt;&lt;access-date&gt;2026-10-28&lt;/access-date&gt;&lt;/record&gt;&lt;/Cite&gt;&lt;/EndNote&gt;</w:instrText>
+        <w:instrText xml:space="preserve"> ADDIN EN.CITE &lt;EndNote&gt;&lt;Cite&gt;&lt;Author&gt;HELICS developers (GMLC-TDC)&lt;/Author&gt;&lt;Year&gt;2026&lt;/Year&gt;&lt;RecNum&gt;31&lt;/RecNum&gt;&lt;DisplayText&gt;[34,35]&lt;/DisplayText&gt;&lt;record&gt;&lt;rec-number&gt;31&lt;/rec-number&gt;&lt;foreign-keys&gt;&lt;key app="EN" db-id="mdae8500109496fea4aff9c086e16cc25895" timestamp="1793221649"&gt;31&lt;/key&gt;&lt;/foreign-keys&gt;&lt;ref-type name="Web Page"&gt;12&lt;/ref-type&gt;&lt;contributors&gt;&lt;authors&gt;&lt;author&gt;HELICS developers (GMLC-TDC)&lt;/author&gt;&lt;/authors&gt;&lt;/contributors&gt;&lt;titles&gt;&lt;title&gt;HELICS documentation&lt;/title&gt;&lt;/titles&gt;&lt;dates&gt;&lt;year&gt;2026&lt;/year&gt;&lt;/dates&gt;&lt;label&gt;helics_docs&lt;/label&gt;&lt;urls&gt;&lt;related-urls&gt;&lt;url&gt;https://docs.helics.org/en/latest/&lt;/url&gt;&lt;/related-urls&gt;&lt;/urls&gt;&lt;access-date&gt;2026-10-28&lt;/access-date&gt;&lt;/record&gt;&lt;/Cite&gt;&lt;Cite&gt;&lt;Author&gt;OFFIS&lt;/Author&gt;&lt;Year&gt;2025&lt;/Year&gt;&lt;RecNum&gt;56&lt;/RecNum&gt;&lt;record&gt;&lt;rec-number&gt;56&lt;/rec-number&gt;&lt;foreign-keys&gt;&lt;key app="EN" db-id="mdae8500109496fea4aff9c086e16cc25895" timestamp="1793221649"&gt;56&lt;/key&gt;&lt;/foreign-keys&gt;&lt;ref-type name="Web Page"&gt;12&lt;/ref-type&gt;&lt;contributors&gt;&lt;authors&gt;&lt;author&gt;OFFIS&lt;/author&gt;&lt;/authors&gt;&lt;/contributors&gt;&lt;titles&gt;&lt;title&gt;mosaik documentation&lt;/title&gt;&lt;/titles&gt;&lt;dates&gt;&lt;year&gt;2025&lt;/year&gt;&lt;/dates&gt;&lt;label&gt;mosaik_docs&lt;/label&gt;&lt;urls&gt;&lt;related-urls&gt;&lt;url&gt;https://mosaik.readthedocs.io/en/3.5.0/&lt;/url&gt;&lt;/related-urls&gt;&lt;/urls&gt;&lt;access-date&gt;2026-10-28&lt;/access-date&gt;&lt;/record&gt;&lt;/Cite&gt;&lt;/EndNote&gt;</w:instrText>
       </w:r>
       <w:r>
         <w:fldChar w:fldCharType="separate"/>
@@ -2274,7 +2308,7 @@
         <w:fldChar w:fldCharType="begin"/>
       </w:r>
       <w:r>
-        <w:instrText xml:space="preserve"> ADDIN EN.CITE &lt;EndNote&gt;&lt;Cite&gt;&lt;Author&gt;Wetter&lt;/Author&gt;&lt;Year&gt;2011&lt;/Year&gt;&lt;RecNum&gt;85&lt;/RecNum&gt;&lt;DisplayText&gt;[11,39]&lt;/DisplayText&gt;&lt;record&gt;&lt;rec-number&gt;85&lt;/rec-number&gt;&lt;foreign-keys&gt;&lt;key app="EN" db-id="mdae8500109496fea4aff9c086e16cc25895" timestamp="1793221304"&gt;85&lt;/key&gt;&lt;/foreign-keys&gt;&lt;ref-type name="Journal Article"&gt;17&lt;/ref-type&gt;&lt;contributors&gt;&lt;authors&gt;&lt;author&gt;Wetter, Michael&lt;/author&gt;&lt;/authors&gt;&lt;/contributors&gt;&lt;titles&gt;&lt;title&gt;Co-simulation of building energy and control systems with the Building Controls Virtual Test Bed&lt;/title&gt;&lt;secondary-title&gt;Journal of Building Performance Simulation&lt;/secondary-title&gt;&lt;alt-title&gt;J. Build. Perform. Simul.&lt;/alt-title&gt;&lt;/titles&gt;&lt;periodical&gt;&lt;full-title&gt;Journal of Building Performance Simulation&lt;/full-title&gt;&lt;abbr-1&gt;J. Build. Perform. Simul.&lt;/abbr-1&gt;&lt;/periodical&gt;&lt;pages&gt;185-203&lt;/pages&gt;&lt;volume&gt;4&lt;/volume&gt;&lt;number&gt;3&lt;/number&gt;&lt;dates&gt;&lt;year&gt;2011&lt;/year&gt;&lt;/dates&gt;&lt;publisher&gt;Taylor &amp;amp; Francis&lt;/publisher&gt;&lt;label&gt;wetter2011&lt;/label&gt;&lt;urls&gt;&lt;/urls&gt;&lt;electronic-resource-num&gt;10.1080/19401493.2010.518631&lt;/electronic-resource-num&gt;&lt;/record&gt;&lt;/Cite&gt;&lt;Cite&gt;&lt;Author&gt;U.S. Department of Energy&lt;/Author&gt;&lt;Year&gt;2018&lt;/Year&gt;&lt;RecNum&gt;18&lt;/RecNum&gt;&lt;record&gt;&lt;rec-number&gt;18&lt;/rec-number&gt;&lt;foreign-keys&gt;&lt;key app="EN" db-id="mdae8500109496fea4aff9c086e16cc25895" timestamp="1793221304"&gt;18&lt;/key&gt;&lt;/foreign-keys&gt;&lt;ref-type name="Web Page"&gt;12&lt;/ref-type&gt;&lt;contributors&gt;&lt;authors&gt;&lt;author&gt;U.S. Department of Energy&lt;/author&gt;&lt;/authors&gt;&lt;/contributors&gt;&lt;titles&gt;&lt;title&gt;EnergyPlus External Interface(s) Application Guide: BCVTB Examples&lt;/title&gt;&lt;/titles&gt;&lt;dates&gt;&lt;year&gt;2018&lt;/year&gt;&lt;/dates&gt;&lt;label&gt;doe_extif&lt;/label&gt;&lt;urls&gt;&lt;related-urls&gt;&lt;url&gt;https://bigladdersoftware.com/epx/docs/9-0/external-interfaces-application-guide/bcvtb-examples.html&lt;/url&gt;&lt;/related-urls&gt;&lt;/urls&gt;&lt;access-date&gt;2026-10-28&lt;/access-date&gt;&lt;/record&gt;&lt;/Cite&gt;&lt;/EndNote&gt;</w:instrText>
+        <w:instrText xml:space="preserve"> ADDIN EN.CITE &lt;EndNote&gt;&lt;Cite&gt;&lt;Author&gt;Wetter&lt;/Author&gt;&lt;Year&gt;2011&lt;/Year&gt;&lt;RecNum&gt;85&lt;/RecNum&gt;&lt;DisplayText&gt;[11,39]&lt;/DisplayText&gt;&lt;record&gt;&lt;rec-number&gt;85&lt;/rec-number&gt;&lt;foreign-keys&gt;&lt;key app="EN" db-id="mdae8500109496fea4aff9c086e16cc25895" timestamp="1793221649"&gt;85&lt;/key&gt;&lt;/foreign-keys&gt;&lt;ref-type name="Journal Article"&gt;17&lt;/ref-type&gt;&lt;contributors&gt;&lt;authors&gt;&lt;author&gt;Wetter, Michael&lt;/author&gt;&lt;/authors&gt;&lt;/contributors&gt;&lt;titles&gt;&lt;title&gt;Co-simulation of building energy and control systems with the Building Controls Virtual Test Bed&lt;/title&gt;&lt;secondary-title&gt;Journal of Building Performance Simulation&lt;/secondary-title&gt;&lt;alt-title&gt;J. Build. Perform. Simul.&lt;/alt-title&gt;&lt;/titles&gt;&lt;periodical&gt;&lt;full-title&gt;Journal of Building Performance Simulation&lt;/full-title&gt;&lt;abbr-1&gt;J. Build. Perform. Simul.&lt;/abbr-1&gt;&lt;/periodical&gt;&lt;pages&gt;185-203&lt;/pages&gt;&lt;volume&gt;4&lt;/volume&gt;&lt;number&gt;3&lt;/number&gt;&lt;dates&gt;&lt;year&gt;2011&lt;/year&gt;&lt;/dates&gt;&lt;publisher&gt;Taylor &amp;amp; Francis&lt;/publisher&gt;&lt;label&gt;wetter2011&lt;/label&gt;&lt;urls&gt;&lt;/urls&gt;&lt;electronic-resource-num&gt;10.1080/19401493.2010.518631&lt;/electronic-resource-num&gt;&lt;/record&gt;&lt;/Cite&gt;&lt;Cite&gt;&lt;Author&gt;U.S. Department of Energy&lt;/Author&gt;&lt;Year&gt;2018&lt;/Year&gt;&lt;RecNum&gt;18&lt;/RecNum&gt;&lt;record&gt;&lt;rec-number&gt;18&lt;/rec-number&gt;&lt;foreign-keys&gt;&lt;key app="EN" db-id="mdae8500109496fea4aff9c086e16cc25895" timestamp="1793221649"&gt;18&lt;/key&gt;&lt;/foreign-keys&gt;&lt;ref-type name="Web Page"&gt;12&lt;/ref-type&gt;&lt;contributors&gt;&lt;authors&gt;&lt;author&gt;U.S. Department of Energy&lt;/author&gt;&lt;/authors&gt;&lt;/contributors&gt;&lt;titles&gt;&lt;title&gt;EnergyPlus External Interface(s) Application Guide: BCVTB Examples&lt;/title&gt;&lt;/titles&gt;&lt;dates&gt;&lt;year&gt;2018&lt;/year&gt;&lt;/dates&gt;&lt;label&gt;doe_extif&lt;/label&gt;&lt;urls&gt;&lt;related-urls&gt;&lt;url&gt;https://bigladdersoftware.com/epx/docs/9-0/external-interfaces-application-guide/bcvtb-examples.html&lt;/url&gt;&lt;/related-urls&gt;&lt;/urls&gt;&lt;access-date&gt;2026-10-28&lt;/access-date&gt;&lt;/record&gt;&lt;/Cite&gt;&lt;/EndNote&gt;</w:instrText>
       </w:r>
       <w:r>
         <w:fldChar w:fldCharType="separate"/>
@@ -2297,7 +2331,7 @@
 UmVjTnVtPjU5PC9SZWNOdW0+PERpc3BsYXlUZXh0PlsxMiw0MF08L0Rpc3BsYXlUZXh0PjxyZWNv
 cmQ+PHJlYy1udW1iZXI+NTk8L3JlYy1udW1iZXI+PGZvcmVpZ24ta2V5cz48a2V5IGFwcD0iRU4i
 IGRiLWlkPSJtZGFlODUwMDEwOTQ5NmZlYTRhZmY5YzA4NmUxNmNjMjU4OTUiIHRpbWVzdGFtcD0i
-MTc5MzIyMTMwNCI+NTk8L2tleT48L2ZvcmVpZ24ta2V5cz48cmVmLXR5cGUgbmFtZT0iSm91cm5h
+MTc5MzIyMTY0OSI+NTk8L2tleT48L2ZvcmVpZ24ta2V5cz48cmVmLXR5cGUgbmFtZT0iSm91cm5h
 bCBBcnRpY2xlIj4xNzwvcmVmLXR5cGU+PGNvbnRyaWJ1dG9ycz48YXV0aG9ycz48YXV0aG9yPk5v
 dWlkdWksIFRoaWVycnk8L2F1dGhvcj48YXV0aG9yPldldHRlciwgTWljaGFlbDwvYXV0aG9yPjxh
 dXRob3I+WnVvLCBXYW5nZGE8L2F1dGhvcj48L2F1dGhvcnM+PC9jb250cmlidXRvcnM+PHRpdGxl
@@ -2315,7 +2349,7 @@
 Pkxhd3JlbmNlIEJlcmtlbGV5IE5hdGlvbmFsIExhYm9yYXRvcnk8L0F1dGhvcj48WWVhcj4yMDIx
 PC9ZZWFyPjxSZWNOdW0+NDg8L1JlY051bT48cmVjb3JkPjxyZWMtbnVtYmVyPjQ4PC9yZWMtbnVt
 YmVyPjxmb3JlaWduLWtleXM+PGtleSBhcHA9IkVOIiBkYi1pZD0ibWRhZTg1MDAxMDk0OTZmZWE0
-YWZmOWMwODZlMTZjYzI1ODk1IiB0aW1lc3RhbXA9IjE3OTMyMjEzMDQiPjQ4PC9rZXk+PC9mb3Jl
+YWZmOWMwODZlMTZjYzI1ODk1IiB0aW1lc3RhbXA9IjE3OTMyMjE2NDkiPjQ4PC9rZXk+PC9mb3Jl
 aWduLWtleXM+PHJlZi10eXBlIG5hbWU9IldlYiBQYWdlIj4xMjwvcmVmLXR5cGU+PGNvbnRyaWJ1
 dG9ycz48YXV0aG9ycz48YXV0aG9yPkxhd3JlbmNlIEJlcmtlbGV5IE5hdGlvbmFsIExhYm9yYXRv
 cnk8L2F1dGhvcj48L2F1dGhvcnM+PC9jb250cmlidXRvcnM+PHRpdGxlcz48dGl0bGU+Rk1VIEV4
@@ -2337,7 +2371,7 @@
 UmVjTnVtPjU5PC9SZWNOdW0+PERpc3BsYXlUZXh0PlsxMiw0MF08L0Rpc3BsYXlUZXh0PjxyZWNv
 cmQ+PHJlYy1udW1iZXI+NTk8L3JlYy1udW1iZXI+PGZvcmVpZ24ta2V5cz48a2V5IGFwcD0iRU4i
 IGRiLWlkPSJtZGFlODUwMDEwOTQ5NmZlYTRhZmY5YzA4NmUxNmNjMjU4OTUiIHRpbWVzdGFtcD0i
-MTc5MzIyMTMwNCI+NTk8L2tleT48L2ZvcmVpZ24ta2V5cz48cmVmLXR5cGUgbmFtZT0iSm91cm5h
+MTc5MzIyMTY0OSI+NTk8L2tleT48L2ZvcmVpZ24ta2V5cz48cmVmLXR5cGUgbmFtZT0iSm91cm5h
 bCBBcnRpY2xlIj4xNzwvcmVmLXR5cGU+PGNvbnRyaWJ1dG9ycz48YXV0aG9ycz48YXV0aG9yPk5v
 dWlkdWksIFRoaWVycnk8L2F1dGhvcj48YXV0aG9yPldldHRlciwgTWljaGFlbDwvYXV0aG9yPjxh
 dXRob3I+WnVvLCBXYW5nZGE8L2F1dGhvcj48L2F1dGhvcnM+PC9jb250cmlidXRvcnM+PHRpdGxl
@@ -2355,7 +2389,7 @@
 Pkxhd3JlbmNlIEJlcmtlbGV5IE5hdGlvbmFsIExhYm9yYXRvcnk8L0F1dGhvcj48WWVhcj4yMDIx
 PC9ZZWFyPjxSZWNOdW0+NDg8L1JlY051bT48cmVjb3JkPjxyZWMtbnVtYmVyPjQ4PC9yZWMtbnVt
 YmVyPjxmb3JlaWduLWtleXM+PGtleSBhcHA9IkVOIiBkYi1pZD0ibWRhZTg1MDAxMDk0OTZmZWE0
-YWZmOWMwODZlMTZjYzI1ODk1IiB0aW1lc3RhbXA9IjE3OTMyMjEzMDQiPjQ4PC9rZXk+PC9mb3Jl
+YWZmOWMwODZlMTZjYzI1ODk1IiB0aW1lc3RhbXA9IjE3OTMyMjE2NDkiPjQ4PC9rZXk+PC9mb3Jl
 aWduLWtleXM+PHJlZi10eXBlIG5hbWU9IldlYiBQYWdlIj4xMjwvcmVmLXR5cGU+PGNvbnRyaWJ1
 dG9ycz48YXV0aG9ycz48YXV0aG9yPkxhd3JlbmNlIEJlcmtlbGV5IE5hdGlvbmFsIExhYm9yYXRv
 cnk8L2F1dGhvcj48L2F1dGhvcnM+PC9jb250cmlidXRvcnM+PHRpdGxlcz48dGl0bGU+Rk1VIEV4
@@ -2393,7 +2427,7 @@
         <w:fldChar w:fldCharType="begin"/>
       </w:r>
       <w:r>
-        <w:instrText xml:space="preserve"> ADDIN EN.CITE &lt;EndNote&gt;&lt;Cite&gt;&lt;Author&gt;Wetter&lt;/Author&gt;&lt;Year&gt;2020&lt;/Year&gt;&lt;RecNum&gt;86&lt;/RecNum&gt;&lt;DisplayText&gt;[13]&lt;/DisplayText&gt;&lt;record&gt;&lt;rec-number&gt;86&lt;/rec-number&gt;&lt;foreign-keys&gt;&lt;key app="EN" db-id="mdae8500109496fea4aff9c086e16cc25895" timestamp="1793221304"&gt;86&lt;/key&gt;&lt;/foreign-keys&gt;&lt;ref-type name="Conference Paper"&gt;47&lt;/ref-type&gt;&lt;contributors&gt;&lt;authors&gt;&lt;author&gt;Wetter, Michael&lt;/author&gt;&lt;author&gt;Benne, Kyle&lt;/author&gt;&lt;author&gt;Gautier, Antoine&lt;/author&gt;&lt;author&gt;Nouidui, Thierry S.&lt;/author&gt;&lt;author&gt;Ramle, Agnes&lt;/author&gt;&lt;author&gt;Roth, Amir&lt;/author&gt;&lt;author&gt;Tummescheit, Hubertus&lt;/author&gt;&lt;author&gt;Mentzer, Stuart&lt;/author&gt;&lt;author&gt;Winther, Christian&lt;/author&gt;&lt;/authors&gt;&lt;/contributors&gt;&lt;titles&gt;&lt;title&gt;Lifting the Garage Door on Spawn, an Open-Source BEM-Controls Engine&lt;/title&gt;&lt;secondary-title&gt;Proceedings of SimBuild Conference 2020, ASHRAE/IBPSA-USA Building Simulation Conference&lt;/secondary-title&gt;&lt;/titles&gt;&lt;volume&gt;9&lt;/volume&gt;&lt;dates&gt;&lt;year&gt;2020&lt;/year&gt;&lt;/dates&gt;&lt;publisher&gt;IBPSA-USA&lt;/publisher&gt;&lt;label&gt;wetter2020&lt;/label&gt;&lt;urls&gt;&lt;/urls&gt;&lt;electronic-resource-num&gt;10.26868/25746308.2020.C063&lt;/electronic-resource-num&gt;&lt;/record&gt;&lt;/Cite&gt;&lt;/EndNote&gt;</w:instrText>
+        <w:instrText xml:space="preserve"> ADDIN EN.CITE &lt;EndNote&gt;&lt;Cite&gt;&lt;Author&gt;Wetter&lt;/Author&gt;&lt;Year&gt;2020&lt;/Year&gt;&lt;RecNum&gt;86&lt;/RecNum&gt;&lt;DisplayText&gt;[13]&lt;/DisplayText&gt;&lt;record&gt;&lt;rec-number&gt;86&lt;/rec-number&gt;&lt;foreign-keys&gt;&lt;key app="EN" db-id="mdae8500109496fea4aff9c086e16cc25895" timestamp="1793221649"&gt;86&lt;/key&gt;&lt;/foreign-keys&gt;&lt;ref-type name="Conference Paper"&gt;47&lt;/ref-type&gt;&lt;contributors&gt;&lt;authors&gt;&lt;author&gt;Wetter, Michael&lt;/author&gt;&lt;author&gt;Benne, Kyle&lt;/author&gt;&lt;author&gt;Gautier, Antoine&lt;/author&gt;&lt;author&gt;Nouidui, Thierry S.&lt;/author&gt;&lt;author&gt;Ramle, Agnes&lt;/author&gt;&lt;author&gt;Roth, Amir&lt;/author&gt;&lt;author&gt;Tummescheit, Hubertus&lt;/author&gt;&lt;author&gt;Mentzer, Stuart&lt;/author&gt;&lt;author&gt;Winther, Christian&lt;/author&gt;&lt;/authors&gt;&lt;/contributors&gt;&lt;titles&gt;&lt;title&gt;Lifting the Garage Door on Spawn, an Open-Source BEM-Controls Engine&lt;/title&gt;&lt;secondary-title&gt;Proceedings of SimBuild Conference 2020, ASHRAE/IBPSA-USA Building Simulation Conference&lt;/secondary-title&gt;&lt;/titles&gt;&lt;volume&gt;9&lt;/volume&gt;&lt;dates&gt;&lt;year&gt;2020&lt;/year&gt;&lt;/dates&gt;&lt;publisher&gt;IBPSA-USA&lt;/publisher&gt;&lt;label&gt;wetter2020&lt;/label&gt;&lt;urls&gt;&lt;/urls&gt;&lt;electronic-resource-num&gt;10.26868/25746308.2020.C063&lt;/electronic-resource-num&gt;&lt;/record&gt;&lt;/Cite&gt;&lt;/EndNote&gt;</w:instrText>
       </w:r>
       <w:r>
         <w:fldChar w:fldCharType="separate"/>
@@ -2414,7 +2448,7 @@
         <w:fldChar w:fldCharType="begin"/>
       </w:r>
       <w:r>
-        <w:instrText xml:space="preserve"> ADDIN EN.CITE &lt;EndNote&gt;&lt;Cite&gt;&lt;Author&gt;U.S. Department of Energy&lt;/Author&gt;&lt;Year&gt;2022&lt;/Year&gt;&lt;RecNum&gt;19&lt;/RecNum&gt;&lt;DisplayText&gt;[41]&lt;/DisplayText&gt;&lt;record&gt;&lt;rec-number&gt;19&lt;/rec-number&gt;&lt;foreign-keys&gt;&lt;key app="EN" db-id="mdae8500109496fea4aff9c086e16cc25895" timestamp="1793221304"&gt;19&lt;/key&gt;&lt;/foreign-keys&gt;&lt;ref-type name="Web Page"&gt;12&lt;/ref-type&gt;&lt;contributors&gt;&lt;authors&gt;&lt;author&gt;U.S. Department of Energy&lt;/author&gt;&lt;/authors&gt;&lt;/contributors&gt;&lt;titles&gt;&lt;title&gt;EnergyPlus Input Output Reference: Group – Python Plugins / Python EMS&lt;/title&gt;&lt;/titles&gt;&lt;dates&gt;&lt;year&gt;2022&lt;/year&gt;&lt;/dates&gt;&lt;label&gt;doe2022&lt;/label&gt;&lt;urls&gt;&lt;related-urls&gt;&lt;url&gt;https://bigladdersoftware.com/epx/docs/22-2/input-output-reference/group-python-plugins.html&lt;/url&gt;&lt;/related-urls&gt;&lt;/urls&gt;&lt;access-date&gt;2026-10-28&lt;/access-date&gt;&lt;/record&gt;&lt;/Cite&gt;&lt;/EndNote&gt;</w:instrText>
+        <w:instrText xml:space="preserve"> ADDIN EN.CITE &lt;EndNote&gt;&lt;Cite&gt;&lt;Author&gt;U.S. Department of Energy&lt;/Author&gt;&lt;Year&gt;2022&lt;/Year&gt;&lt;RecNum&gt;19&lt;/RecNum&gt;&lt;DisplayText&gt;[41]&lt;/DisplayText&gt;&lt;record&gt;&lt;rec-number&gt;19&lt;/rec-number&gt;&lt;foreign-keys&gt;&lt;key app="EN" db-id="mdae8500109496fea4aff9c086e16cc25895" timestamp="1793221649"&gt;19&lt;/key&gt;&lt;/foreign-keys&gt;&lt;ref-type name="Web Page"&gt;12&lt;/ref-type&gt;&lt;contributors&gt;&lt;authors&gt;&lt;author&gt;U.S. Department of Energy&lt;/author&gt;&lt;/authors&gt;&lt;/contributors&gt;&lt;titles&gt;&lt;title&gt;EnergyPlus Input Output Reference: Group – Python Plugins / Python EMS&lt;/title&gt;&lt;/titles&gt;&lt;dates&gt;&lt;year&gt;2022&lt;/year&gt;&lt;/dates&gt;&lt;label&gt;doe2022&lt;/label&gt;&lt;urls&gt;&lt;related-urls&gt;&lt;url&gt;https://bigladdersoftware.com/epx/docs/22-2/input-output-reference/group-python-plugins.html&lt;/url&gt;&lt;/related-urls&gt;&lt;/urls&gt;&lt;access-date&gt;2026-10-28&lt;/access-date&gt;&lt;/record&gt;&lt;/Cite&gt;&lt;/EndNote&gt;</w:instrText>
       </w:r>
       <w:r>
         <w:fldChar w:fldCharType="separate"/>
@@ -2437,7 +2471,7 @@
 PC9ZZWFyPjxSZWNOdW0+NDE8L1JlY051bT48RGlzcGxheVRleHQ+WzE0LDE1LDQyXTwvRGlzcGxh
 eVRleHQ+PHJlY29yZD48cmVjLW51bWJlcj40MTwvcmVjLW51bWJlcj48Zm9yZWlnbi1rZXlzPjxr
 ZXkgYXBwPSJFTiIgZGItaWQ9Im1kYWU4NTAwMTA5NDk2ZmVhNGFmZjljMDg2ZTE2Y2MyNTg5NSIg
-dGltZXN0YW1wPSIxNzkzMjIxMzA0Ij40MTwva2V5PjwvZm9yZWlnbi1rZXlzPjxyZWYtdHlwZSBu
+dGltZXN0YW1wPSIxNzkzMjIxNjQ5Ij40MTwva2V5PjwvZm9yZWlnbi1rZXlzPjxyZWYtdHlwZSBu
 YW1lPSJDb25mZXJlbmNlIFBhcGVyIj40NzwvcmVmLXR5cGU+PGNvbnRyaWJ1dG9ycz48YXV0aG9y
 cz48YXV0aG9yPkppbcOpbmV6LVJhYm9zbywgSmF2aWVyPC9hdXRob3I+PGF1dGhvcj5DYW1wb3kt
 TmlldmVzLCBBbGVqYW5kcm88L2F1dGhvcj48YXV0aG9yPk1hbmphdmFjYXMtTHVjYXMsIEFudG9u
@@ -2456,7 +2490,7 @@
 LU5pZXZlczwvQXV0aG9yPjxZZWFyPjIwMjU8L1llYXI+PFJlY051bT45PC9SZWNOdW0+PHJlY29y
 ZD48cmVjLW51bWJlcj45PC9yZWMtbnVtYmVyPjxmb3JlaWduLWtleXM+PGtleSBhcHA9IkVOIiBk
 Yi1pZD0ibWRhZTg1MDAxMDk0OTZmZWE0YWZmOWMwODZlMTZjYzI1ODk1IiB0aW1lc3RhbXA9IjE3
-OTMyMjEzMDQiPjk8L2tleT48L2ZvcmVpZ24ta2V5cz48cmVmLXR5cGUgbmFtZT0iSm91cm5hbCBB
+OTMyMjE2NDkiPjk8L2tleT48L2ZvcmVpZ24ta2V5cz48cmVmLXR5cGUgbmFtZT0iSm91cm5hbCBB
 cnRpY2xlIj4xNzwvcmVmLXR5cGU+PGNvbnRyaWJ1dG9ycz48YXV0aG9ycz48YXV0aG9yPkNhbXBv
 eS1OaWV2ZXMsIEFsZWphbmRybzwvYXV0aG9yPjxhdXRob3I+TWFuamF2YWNhcywgQW50b25pbzwv
 YXV0aG9yPjxhdXRob3I+Smltw6luZXotUmFib3NvLCBKYXZpZXI8L2F1dGhvcj48YXV0aG9yPk1v
@@ -2474,7 +2508,7 @@
 cmVjb3JkPjwvQ2l0ZT48Q2l0ZT48QXV0aG9yPlpoYW5nPC9BdXRob3I+PFllYXI+MjAyMDwvWWVh
 cj48UmVjTnVtPjkwPC9SZWNOdW0+PHJlY29yZD48cmVjLW51bWJlcj45MDwvcmVjLW51bWJlcj48
 Zm9yZWlnbi1rZXlzPjxrZXkgYXBwPSJFTiIgZGItaWQ9Im1kYWU4NTAwMTA5NDk2ZmVhNGFmZjlj
-MDg2ZTE2Y2MyNTg5NSIgdGltZXN0YW1wPSIxNzkzMjIxMzA0Ij45MDwva2V5PjwvZm9yZWlnbi1r
+MDg2ZTE2Y2MyNTg5NSIgdGltZXN0YW1wPSIxNzkzMjIxNjQ5Ij45MDwva2V5PjwvZm9yZWlnbi1r
 ZXlzPjxyZWYtdHlwZSBuYW1lPSJDb25mZXJlbmNlIFBhcGVyIj40NzwvcmVmLXR5cGU+PGNvbnRy
 aWJ1dG9ycz48YXV0aG9ycz48YXV0aG9yPlpoYW5nLCBUaWFueXU8L2F1dGhvcj48YXV0aG9yPkFy
 ZGFrYW5pYW4sIE9taWQ8L2F1dGhvcj48L2F1dGhvcnM+PC9jb250cmlidXRvcnM+PHRpdGxlcz48
@@ -2498,7 +2532,7 @@
 PC9ZZWFyPjxSZWNOdW0+NDE8L1JlY051bT48RGlzcGxheVRleHQ+WzE0LDE1LDQyXTwvRGlzcGxh
 eVRleHQ+PHJlY29yZD48cmVjLW51bWJlcj40MTwvcmVjLW51bWJlcj48Zm9yZWlnbi1rZXlzPjxr
 ZXkgYXBwPSJFTiIgZGItaWQ9Im1kYWU4NTAwMTA5NDk2ZmVhNGFmZjljMDg2ZTE2Y2MyNTg5NSIg
-dGltZXN0YW1wPSIxNzkzMjIxMzA0Ij40MTwva2V5PjwvZm9yZWlnbi1rZXlzPjxyZWYtdHlwZSBu
+dGltZXN0YW1wPSIxNzkzMjIxNjQ5Ij40MTwva2V5PjwvZm9yZWlnbi1rZXlzPjxyZWYtdHlwZSBu
 YW1lPSJDb25mZXJlbmNlIFBhcGVyIj40NzwvcmVmLXR5cGU+PGNvbnRyaWJ1dG9ycz48YXV0aG9y
 cz48YXV0aG9yPkppbcOpbmV6LVJhYm9zbywgSmF2aWVyPC9hdXRob3I+PGF1dGhvcj5DYW1wb3kt
 TmlldmVzLCBBbGVqYW5kcm88L2F1dGhvcj48YXV0aG9yPk1hbmphdmFjYXMtTHVjYXMsIEFudG9u
@@ -2517,7 +2551,7 @@
 LU5pZXZlczwvQXV0aG9yPjxZZWFyPjIwMjU8L1llYXI+PFJlY051bT45PC9SZWNOdW0+PHJlY29y
 ZD48cmVjLW51bWJlcj45PC9yZWMtbnVtYmVyPjxmb3JlaWduLWtleXM+PGtleSBhcHA9IkVOIiBk
 Yi1pZD0ibWRhZTg1MDAxMDk0OTZmZWE0YWZmOWMwODZlMTZjYzI1ODk1IiB0aW1lc3RhbXA9IjE3
-OTMyMjEzMDQiPjk8L2tleT48L2ZvcmVpZ24ta2V5cz48cmVmLXR5cGUgbmFtZT0iSm91cm5hbCBB
+OTMyMjE2NDkiPjk8L2tleT48L2ZvcmVpZ24ta2V5cz48cmVmLXR5cGUgbmFtZT0iSm91cm5hbCBB
 cnRpY2xlIj4xNzwvcmVmLXR5cGU+PGNvbnRyaWJ1dG9ycz48YXV0aG9ycz48YXV0aG9yPkNhbXBv
 eS1OaWV2ZXMsIEFsZWphbmRybzwvYXV0aG9yPjxhdXRob3I+TWFuamF2YWNhcywgQW50b25pbzwv
 YXV0aG9yPjxhdXRob3I+Smltw6luZXotUmFib3NvLCBKYXZpZXI8L2F1dGhvcj48YXV0aG9yPk1v
@@ -2535,7 +2569,7 @@
 cmVjb3JkPjwvQ2l0ZT48Q2l0ZT48QXV0aG9yPlpoYW5nPC9BdXRob3I+PFllYXI+MjAyMDwvWWVh
 cj48UmVjTnVtPjkwPC9SZWNOdW0+PHJlY29yZD48cmVjLW51bWJlcj45MDwvcmVjLW51bWJlcj48
 Zm9yZWlnbi1rZXlzPjxrZXkgYXBwPSJFTiIgZGItaWQ9Im1kYWU4NTAwMTA5NDk2ZmVhNGFmZjlj
-MDg2ZTE2Y2MyNTg5NSIgdGltZXN0YW1wPSIxNzkzMjIxMzA0Ij45MDwva2V5PjwvZm9yZWlnbi1r
+MDg2ZTE2Y2MyNTg5NSIgdGltZXN0YW1wPSIxNzkzMjIxNjQ5Ij45MDwva2V5PjwvZm9yZWlnbi1r
 ZXlzPjxyZWYtdHlwZSBuYW1lPSJDb25mZXJlbmNlIFBhcGVyIj40NzwvcmVmLXR5cGU+PGNvbnRy
 aWJ1dG9ycz48YXV0aG9ycz48YXV0aG9yPlpoYW5nLCBUaWFueXU8L2F1dGhvcj48YXV0aG9yPkFy
 ZGFrYW5pYW4sIE9taWQ8L2F1dGhvcj48L2F1dGhvcnM+PC9jb250cmlidXRvcnM+PHRpdGxlcz48
@@ -2575,7 +2609,7 @@
         <w:fldChar w:fldCharType="begin"/>
       </w:r>
       <w:r>
-        <w:instrText xml:space="preserve"> ADDIN EN.CITE &lt;EndNote&gt;&lt;Cite&gt;&lt;Author&gt;Scharnhorst&lt;/Author&gt;&lt;Year&gt;2021&lt;/Year&gt;&lt;RecNum&gt;75&lt;/RecNum&gt;&lt;DisplayText&gt;[43]&lt;/DisplayText&gt;&lt;record&gt;&lt;rec-number&gt;75&lt;/rec-number&gt;&lt;foreign-keys&gt;&lt;key app="EN" db-id="mdae8500109496fea4aff9c086e16cc25895" timestamp="1793221304"&gt;75&lt;/key&gt;&lt;/foreign-keys&gt;&lt;ref-type name="Journal Article"&gt;17&lt;/ref-type&gt;&lt;contributors&gt;&lt;authors&gt;&lt;author&gt;Scharnhorst, Paul&lt;/author&gt;&lt;author&gt;Schubnel, Baptiste&lt;/author&gt;&lt;author&gt;Fernández Bandera, Carlos&lt;/author&gt;&lt;author&gt;Salom, Jaume&lt;/author&gt;&lt;author&gt;Taddeo, Paolo&lt;/author&gt;&lt;author&gt;Boegli, Max&lt;/author&gt;&lt;author&gt;Gorecki, Tomasz&lt;/author&gt;&lt;author&gt;Stauffer, Yves&lt;/author&gt;&lt;author&gt;Peppas, Antonis&lt;/author&gt;&lt;author&gt;Politi, Chrysa&lt;/author&gt;&lt;/authors&gt;&lt;/contributors&gt;&lt;titles&gt;&lt;title&gt;Energym: A Building Model Library for Controller Benchmarking&lt;/title&gt;&lt;secondary-title&gt;Applied Sciences&lt;/secondary-title&gt;&lt;alt-title&gt;Appl. Sci.&lt;/alt-title&gt;&lt;/titles&gt;&lt;periodical&gt;&lt;full-title&gt;Applied Sciences&lt;/full-title&gt;&lt;abbr-1&gt;Appl. Sci.&lt;/abbr-1&gt;&lt;/periodical&gt;&lt;pages&gt;3518&lt;/pages&gt;&lt;volume&gt;11&lt;/volume&gt;&lt;number&gt;8&lt;/number&gt;&lt;dates&gt;&lt;year&gt;2021&lt;/year&gt;&lt;/dates&gt;&lt;publisher&gt;MDPI&lt;/publisher&gt;&lt;label&gt;scharnhorst2021&lt;/label&gt;&lt;urls&gt;&lt;/urls&gt;&lt;electronic-resource-num&gt;10.3390/app11083518&lt;/electronic-resource-num&gt;&lt;/record&gt;&lt;/Cite&gt;&lt;/EndNote&gt;</w:instrText>
+        <w:instrText xml:space="preserve"> ADDIN EN.CITE &lt;EndNote&gt;&lt;Cite&gt;&lt;Author&gt;Scharnhorst&lt;/Author&gt;&lt;Year&gt;2021&lt;/Year&gt;&lt;RecNum&gt;75&lt;/RecNum&gt;&lt;DisplayText&gt;[43]&lt;/DisplayText&gt;&lt;record&gt;&lt;rec-number&gt;75&lt;/rec-number&gt;&lt;foreign-keys&gt;&lt;key app="EN" db-id="mdae8500109496fea4aff9c086e16cc25895" timestamp="1793221649"&gt;75&lt;/key&gt;&lt;/foreign-keys&gt;&lt;ref-type name="Journal Article"&gt;17&lt;/ref-type&gt;&lt;contributors&gt;&lt;authors&gt;&lt;author&gt;Scharnhorst, Paul&lt;/author&gt;&lt;author&gt;Schubnel, Baptiste&lt;/author&gt;&lt;author&gt;Fernández Bandera, Carlos&lt;/author&gt;&lt;author&gt;Salom, Jaume&lt;/author&gt;&lt;author&gt;Taddeo, Paolo&lt;/author&gt;&lt;author&gt;Boegli, Max&lt;/author&gt;&lt;author&gt;Gorecki, Tomasz&lt;/author&gt;&lt;author&gt;Stauffer, Yves&lt;/author&gt;&lt;author&gt;Peppas, Antonis&lt;/author&gt;&lt;author&gt;Politi, Chrysa&lt;/author&gt;&lt;/authors&gt;&lt;/contributors&gt;&lt;titles&gt;&lt;title&gt;Energym: A Building Model Library for Controller Benchmarking&lt;/title&gt;&lt;secondary-title&gt;Applied Sciences&lt;/secondary-title&gt;&lt;alt-title&gt;Appl. Sci.&lt;/alt-title&gt;&lt;/titles&gt;&lt;periodical&gt;&lt;full-title&gt;Applied Sciences&lt;/full-title&gt;&lt;abbr-1&gt;Appl. Sci.&lt;/abbr-1&gt;&lt;/periodical&gt;&lt;pages&gt;3518&lt;/pages&gt;&lt;volume&gt;11&lt;/volume&gt;&lt;number&gt;8&lt;/number&gt;&lt;dates&gt;&lt;year&gt;2021&lt;/year&gt;&lt;/dates&gt;&lt;publisher&gt;MDPI&lt;/publisher&gt;&lt;label&gt;scharnhorst2021&lt;/label&gt;&lt;urls&gt;&lt;/urls&gt;&lt;electronic-resource-num&gt;10.3390/app11083518&lt;/electronic-resource-num&gt;&lt;/record&gt;&lt;/Cite&gt;&lt;/EndNote&gt;</w:instrText>
       </w:r>
       <w:r>
         <w:fldChar w:fldCharType="separate"/>
@@ -2596,7 +2630,7 @@
         <w:fldChar w:fldCharType="begin"/>
       </w:r>
       <w:r>
-        <w:instrText xml:space="preserve"> ADDIN EN.CITE &lt;EndNote&gt;&lt;Cite&gt;&lt;Author&gt;Blum&lt;/Author&gt;&lt;Year&gt;2021&lt;/Year&gt;&lt;RecNum&gt;7&lt;/RecNum&gt;&lt;DisplayText&gt;[16]&lt;/DisplayText&gt;&lt;record&gt;&lt;rec-number&gt;7&lt;/rec-number&gt;&lt;foreign-keys&gt;&lt;key app="EN" db-id="mdae8500109496fea4aff9c086e16cc25895" timestamp="1793221304"&gt;7&lt;/key&gt;&lt;/foreign-keys&gt;&lt;ref-type name="Journal Article"&gt;17&lt;/ref-type&gt;&lt;contributors&gt;&lt;authors&gt;&lt;author&gt;Blum, David&lt;/author&gt;&lt;author&gt;Arroyo, Javier&lt;/author&gt;&lt;author&gt;Huang, Sen&lt;/author&gt;&lt;author&gt;Drgoňa, Ján&lt;/author&gt;&lt;author&gt;Jorissen, Filip&lt;/author&gt;&lt;author&gt;Walnum, Harald Taxt&lt;/author&gt;&lt;author&gt;Chen, Yan&lt;/author&gt;&lt;author&gt;Benne, Kyle&lt;/author&gt;&lt;author&gt;Vrabie, Draguna&lt;/author&gt;&lt;author&gt;Wetter, Michael&lt;/author&gt;&lt;author&gt;Helsen, Lieve&lt;/author&gt;&lt;/authors&gt;&lt;/contributors&gt;&lt;titles&gt;&lt;title&gt;Building optimization testing framework (BOPTEST) for simulation-based benchmarking of control strategies in buildings&lt;/title&gt;&lt;secondary-title&gt;Journal of Building Performance Simulation&lt;/secondary-title&gt;&lt;alt-title&gt;J. Build. Perform. Simul.&lt;/alt-title&gt;&lt;/titles&gt;&lt;periodical&gt;&lt;full-title&gt;Journal of Building Performance Simulation&lt;/full-title&gt;&lt;abbr-1&gt;J. Build. Perform. Simul.&lt;/abbr-1&gt;&lt;/periodical&gt;&lt;pages&gt;586-610&lt;/pages&gt;&lt;volume&gt;14&lt;/volume&gt;&lt;number&gt;5&lt;/number&gt;&lt;dates&gt;&lt;year&gt;2021&lt;/year&gt;&lt;/dates&gt;&lt;publisher&gt;Taylor &amp;amp; Francis&lt;/publisher&gt;&lt;label&gt;blum2021&lt;/label&gt;&lt;urls&gt;&lt;/urls&gt;&lt;electronic-resource-num&gt;10.1080/19401493.2021.1986574&lt;/electronic-resource-num&gt;&lt;/record&gt;&lt;/Cite&gt;&lt;/EndNote&gt;</w:instrText>
+        <w:instrText xml:space="preserve"> ADDIN EN.CITE &lt;EndNote&gt;&lt;Cite&gt;&lt;Author&gt;Blum&lt;/Author&gt;&lt;Year&gt;2021&lt;/Year&gt;&lt;RecNum&gt;7&lt;/RecNum&gt;&lt;DisplayText&gt;[16]&lt;/DisplayText&gt;&lt;record&gt;&lt;rec-number&gt;7&lt;/rec-number&gt;&lt;foreign-keys&gt;&lt;key app="EN" db-id="mdae8500109496fea4aff9c086e16cc25895" timestamp="1793221649"&gt;7&lt;/key&gt;&lt;/foreign-keys&gt;&lt;ref-type name="Journal Article"&gt;17&lt;/ref-type&gt;&lt;contributors&gt;&lt;authors&gt;&lt;author&gt;Blum, David&lt;/author&gt;&lt;author&gt;Arroyo, Javier&lt;/author&gt;&lt;author&gt;Huang, Sen&lt;/author&gt;&lt;author&gt;Drgoňa, Ján&lt;/author&gt;&lt;author&gt;Jorissen, Filip&lt;/author&gt;&lt;author&gt;Walnum, Harald Taxt&lt;/author&gt;&lt;author&gt;Chen, Yan&lt;/author&gt;&lt;author&gt;Benne, Kyle&lt;/author&gt;&lt;author&gt;Vrabie, Draguna&lt;/author&gt;&lt;author&gt;Wetter, Michael&lt;/author&gt;&lt;author&gt;Helsen, Lieve&lt;/author&gt;&lt;/authors&gt;&lt;/contributors&gt;&lt;titles&gt;&lt;title&gt;Building optimization testing framework (BOPTEST) for simulation-based benchmarking of control strategies in buildings&lt;/title&gt;&lt;secondary-title&gt;Journal of Building Performance Simulation&lt;/secondary-title&gt;&lt;alt-title&gt;J. Build. Perform. Simul.&lt;/alt-title&gt;&lt;/titles&gt;&lt;periodical&gt;&lt;full-title&gt;Journal of Building Performance Simulation&lt;/full-title&gt;&lt;abbr-1&gt;J. Build. Perform. Simul.&lt;/abbr-1&gt;&lt;/periodical&gt;&lt;pages&gt;586-610&lt;/pages&gt;&lt;volume&gt;14&lt;/volume&gt;&lt;number&gt;5&lt;/number&gt;&lt;dates&gt;&lt;year&gt;2021&lt;/year&gt;&lt;/dates&gt;&lt;publisher&gt;Taylor &amp;amp; Francis&lt;/publisher&gt;&lt;label&gt;blum2021&lt;/label&gt;&lt;urls&gt;&lt;/urls&gt;&lt;electronic-resource-num&gt;10.1080/19401493.2021.1986574&lt;/electronic-resource-num&gt;&lt;/record&gt;&lt;/Cite&gt;&lt;/EndNote&gt;</w:instrText>
       </w:r>
       <w:r>
         <w:fldChar w:fldCharType="separate"/>
@@ -2617,7 +2651,7 @@
         <w:fldChar w:fldCharType="begin"/>
       </w:r>
       <w:r>
-        <w:instrText xml:space="preserve"> ADDIN EN.CITE &lt;EndNote&gt;&lt;Cite&gt;&lt;Author&gt;Nweye&lt;/Author&gt;&lt;Year&gt;2025&lt;/Year&gt;&lt;RecNum&gt;60&lt;/RecNum&gt;&lt;DisplayText&gt;[44]&lt;/DisplayText&gt;&lt;record&gt;&lt;rec-number&gt;60&lt;/rec-number&gt;&lt;foreign-keys&gt;&lt;key app="EN" db-id="mdae8500109496fea4aff9c086e16cc25895" timestamp="1793221304"&gt;60&lt;/key&gt;&lt;/foreign-keys&gt;&lt;ref-type name="Journal Article"&gt;17&lt;/ref-type&gt;&lt;contributors&gt;&lt;authors&gt;&lt;author&gt;Nweye, Kingsley&lt;/author&gt;&lt;author&gt;Kaspar, Kathryn&lt;/author&gt;&lt;author&gt;Buscemi, Giacomo&lt;/author&gt;&lt;author&gt;Fonseca, Tiago&lt;/author&gt;&lt;author&gt;Pinto, Giuseppe&lt;/author&gt;&lt;author&gt;Ghose, Dipanjan&lt;/author&gt;&lt;author&gt;Duddukuru, Satvik&lt;/author&gt;&lt;author&gt;Pratapa, Pavani&lt;/author&gt;&lt;author&gt;Li, Han&lt;/author&gt;&lt;author&gt;Mohammadi, Javad&lt;/author&gt;&lt;author&gt;Lino Ferreira, Luis&lt;/author&gt;&lt;author&gt;Hong, Tianzhen&lt;/author&gt;&lt;author&gt;Ouf, Mohamed&lt;/author&gt;&lt;author&gt;Capozzoli, Alfonso&lt;/author&gt;&lt;author&gt;Nagy, Zoltan&lt;/author&gt;&lt;/authors&gt;&lt;/contributors&gt;&lt;titles&gt;&lt;title&gt;CityLearn v2: energy-flexible, resilient, occupant-centric, and carbon-aware management of grid-interactive communities&lt;/title&gt;&lt;secondary-title&gt;Journal of Building Performance Simulation&lt;/secondary-title&gt;&lt;alt-title&gt;J. Build. Perform. Simul.&lt;/alt-title&gt;&lt;/titles&gt;&lt;periodical&gt;&lt;full-title&gt;Journal of Building Performance Simulation&lt;/full-title&gt;&lt;abbr-1&gt;J. Build. Perform. Simul.&lt;/abbr-1&gt;&lt;/periodical&gt;&lt;pages&gt;17-38&lt;/pages&gt;&lt;volume&gt;18&lt;/volume&gt;&lt;number&gt;1&lt;/number&gt;&lt;dates&gt;&lt;year&gt;2025&lt;/year&gt;&lt;/dates&gt;&lt;publisher&gt;Taylor &amp;amp; Francis&lt;/publisher&gt;&lt;label&gt;nweye2025&lt;/label&gt;&lt;urls&gt;&lt;/urls&gt;&lt;electronic-resource-num&gt;10.1080/19401493.2024.2418813&lt;/electronic-resource-num&gt;&lt;/record&gt;&lt;/Cite&gt;&lt;/EndNote&gt;</w:instrText>
+        <w:instrText xml:space="preserve"> ADDIN EN.CITE &lt;EndNote&gt;&lt;Cite&gt;&lt;Author&gt;Nweye&lt;/Author&gt;&lt;Year&gt;2025&lt;/Year&gt;&lt;RecNum&gt;60&lt;/RecNum&gt;&lt;DisplayText&gt;[44]&lt;/DisplayText&gt;&lt;record&gt;&lt;rec-number&gt;60&lt;/rec-number&gt;&lt;foreign-keys&gt;&lt;key app="EN" db-id="mdae8500109496fea4aff9c086e16cc25895" timestamp="1793221649"&gt;60&lt;/key&gt;&lt;/foreign-keys&gt;&lt;ref-type name="Journal Article"&gt;17&lt;/ref-type&gt;&lt;contributors&gt;&lt;authors&gt;&lt;author&gt;Nweye, Kingsley&lt;/author&gt;&lt;author&gt;Kaspar, Kathryn&lt;/author&gt;&lt;author&gt;Buscemi, Giacomo&lt;/author&gt;&lt;author&gt;Fonseca, Tiago&lt;/author&gt;&lt;author&gt;Pinto, Giuseppe&lt;/author&gt;&lt;author&gt;Ghose, Dipanjan&lt;/author&gt;&lt;author&gt;Duddukuru, Satvik&lt;/author&gt;&lt;author&gt;Pratapa, Pavani&lt;/author&gt;&lt;author&gt;Li, Han&lt;/author&gt;&lt;author&gt;Mohammadi, Javad&lt;/author&gt;&lt;author&gt;Lino Ferreira, Luis&lt;/author&gt;&lt;author&gt;Hong, Tianzhen&lt;/author&gt;&lt;author&gt;Ouf, Mohamed&lt;/author&gt;&lt;author&gt;Capozzoli, Alfonso&lt;/author&gt;&lt;author&gt;Nagy, Zoltan&lt;/author&gt;&lt;/authors&gt;&lt;/contributors&gt;&lt;titles&gt;&lt;title&gt;CityLearn v2: energy-flexible, resilient, occupant-centric, and carbon-aware management of grid-interactive communities&lt;/title&gt;&lt;secondary-title&gt;Journal of Building Performance Simulation&lt;/secondary-title&gt;&lt;alt-title&gt;J. Build. Perform. Simul.&lt;/alt-title&gt;&lt;/titles&gt;&lt;periodical&gt;&lt;full-title&gt;Journal of Building Performance Simulation&lt;/full-title&gt;&lt;abbr-1&gt;J. Build. Perform. Simul.&lt;/abbr-1&gt;&lt;/periodical&gt;&lt;pages&gt;17-38&lt;/pages&gt;&lt;volume&gt;18&lt;/volume&gt;&lt;number&gt;1&lt;/number&gt;&lt;dates&gt;&lt;year&gt;2025&lt;/year&gt;&lt;/dates&gt;&lt;publisher&gt;Taylor &amp;amp; Francis&lt;/publisher&gt;&lt;label&gt;nweye2025&lt;/label&gt;&lt;urls&gt;&lt;/urls&gt;&lt;electronic-resource-num&gt;10.1080/19401493.2024.2418813&lt;/electronic-resource-num&gt;&lt;/record&gt;&lt;/Cite&gt;&lt;/EndNote&gt;</w:instrText>
       </w:r>
       <w:r>
         <w:fldChar w:fldCharType="separate"/>
@@ -2638,7 +2672,7 @@
         <w:fldChar w:fldCharType="begin"/>
       </w:r>
       <w:r>
-        <w:instrText xml:space="preserve"> ADDIN EN.CITE &lt;EndNote&gt;&lt;Cite&gt;&lt;Author&gt;Benne&lt;/Author&gt;&lt;Year&gt;2024&lt;/Year&gt;&lt;RecNum&gt;4&lt;/RecNum&gt;&lt;DisplayText&gt;[45]&lt;/DisplayText&gt;&lt;record&gt;&lt;rec-number&gt;4&lt;/rec-number&gt;&lt;foreign-keys&gt;&lt;key app="EN" db-id="mdae8500109496fea4aff9c086e16cc25895" timestamp="1793221304"&gt;4&lt;/key&gt;&lt;/foreign-keys&gt;&lt;ref-type name="Report"&gt;27&lt;/ref-type&gt;&lt;contributors&gt;&lt;authors&gt;&lt;author&gt;Benne, Kyle&lt;/author&gt;&lt;author&gt;Shapinsky, Tobias&lt;/author&gt;&lt;author&gt;Petersen, Anya&lt;/author&gt;&lt;/authors&gt;&lt;/contributors&gt;&lt;titles&gt;&lt;title&gt;Alfalfa Virtual Building Service: Software Engineering Best Practices Applied to Runtime Interaction with Building Energy Models&lt;/title&gt;&lt;secondary-title&gt;IBPSA-USA SimBuild 2024 Conference, Denver, Colorado, 21–23 May 2024&lt;/secondary-title&gt;&lt;/titles&gt;&lt;dates&gt;&lt;year&gt;2024&lt;/year&gt;&lt;/dates&gt;&lt;pub-location&gt;Golden, CO&lt;/pub-location&gt;&lt;publisher&gt;National Renewable Energy Laboratory&lt;/publisher&gt;&lt;isbn&gt;NREL/PR-5500-89738&lt;/isbn&gt;&lt;label&gt;benne2024&lt;/label&gt;&lt;work-type&gt;Presentation&lt;/work-type&gt;&lt;urls&gt;&lt;related-urls&gt;&lt;url&gt;https://www.osti.gov/biblio/2407013&lt;/url&gt;&lt;/related-urls&gt;&lt;/urls&gt;&lt;/record&gt;&lt;/Cite&gt;&lt;/EndNote&gt;</w:instrText>
+        <w:instrText xml:space="preserve"> ADDIN EN.CITE &lt;EndNote&gt;&lt;Cite&gt;&lt;Author&gt;Benne&lt;/Author&gt;&lt;Year&gt;2024&lt;/Year&gt;&lt;RecNum&gt;4&lt;/RecNum&gt;&lt;DisplayText&gt;[45]&lt;/DisplayText&gt;&lt;record&gt;&lt;rec-number&gt;4&lt;/rec-number&gt;&lt;foreign-keys&gt;&lt;key app="EN" db-id="mdae8500109496fea4aff9c086e16cc25895" timestamp="1793221649"&gt;4&lt;/key&gt;&lt;/foreign-keys&gt;&lt;ref-type name="Report"&gt;27&lt;/ref-type&gt;&lt;contributors&gt;&lt;authors&gt;&lt;author&gt;Benne, Kyle&lt;/author&gt;&lt;author&gt;Shapinsky, Tobias&lt;/author&gt;&lt;author&gt;Petersen, Anya&lt;/author&gt;&lt;/authors&gt;&lt;/contributors&gt;&lt;titles&gt;&lt;title&gt;Alfalfa Virtual Building Service: Software Engineering Best Practices Applied to Runtime Interaction with Building Energy Models&lt;/title&gt;&lt;secondary-title&gt;IBPSA-USA SimBuild 2024 Conference, Denver, Colorado, 21–23 May 2024&lt;/secondary-title&gt;&lt;/titles&gt;&lt;dates&gt;&lt;year&gt;2024&lt;/year&gt;&lt;/dates&gt;&lt;pub-location&gt;Golden, CO&lt;/pub-location&gt;&lt;publisher&gt;National Renewable Energy Laboratory&lt;/publisher&gt;&lt;isbn&gt;NREL/PR-5500-89738&lt;/isbn&gt;&lt;label&gt;benne2024&lt;/label&gt;&lt;work-type&gt;Presentation&lt;/work-type&gt;&lt;urls&gt;&lt;related-urls&gt;&lt;url&gt;https://www.osti.gov/biblio/2407013&lt;/url&gt;&lt;/related-urls&gt;&lt;/urls&gt;&lt;/record&gt;&lt;/Cite&gt;&lt;/EndNote&gt;</w:instrText>
       </w:r>
       <w:r>
         <w:fldChar w:fldCharType="separate"/>
@@ -2675,7 +2709,7 @@
         <w:fldChar w:fldCharType="begin"/>
       </w:r>
       <w:r>
-        <w:instrText xml:space="preserve"> ADDIN EN.CITE &lt;EndNote&gt;&lt;Cite&gt;&lt;Author&gt;Ahn&lt;/Author&gt;&lt;Year&gt;2023&lt;/Year&gt;&lt;RecNum&gt;1&lt;/RecNum&gt;&lt;DisplayText&gt;[4]&lt;/DisplayText&gt;&lt;record&gt;&lt;rec-number&gt;1&lt;/rec-number&gt;&lt;foreign-keys&gt;&lt;key app="EN" db-id="mdae8500109496fea4aff9c086e16cc25895" timestamp="1793221304"&gt;1&lt;/key&gt;&lt;/foreign-keys&gt;&lt;ref-type name="Journal Article"&gt;17&lt;/ref-type&gt;&lt;contributors&gt;&lt;authors&gt;&lt;author&gt;Ahn, Ki Uhn&lt;/author&gt;&lt;author&gt;Kim, Deuk-Woo&lt;/author&gt;&lt;author&gt;Cho, Hyun Mi&lt;/author&gt;&lt;author&gt;Chae, Chang-U&lt;/author&gt;&lt;/authors&gt;&lt;/contributors&gt;&lt;titles&gt;&lt;title&gt;Alternative Approaches to HVAC Control of Chat Generative Pre-Trained Transformer (ChatGPT) for Autonomous Building System Operations&lt;/title&gt;&lt;secondary-title&gt;Buildings&lt;/secondary-title&gt;&lt;alt-title&gt;Buildings&lt;/alt-title&gt;&lt;/titles&gt;&lt;periodical&gt;&lt;full-title&gt;Buildings&lt;/full-title&gt;&lt;abbr-1&gt;Buildings&lt;/abbr-1&gt;&lt;/periodical&gt;&lt;pages&gt;2680&lt;/pages&gt;&lt;volume&gt;13&lt;/volume&gt;&lt;number&gt;11&lt;/number&gt;&lt;dates&gt;&lt;year&gt;2023&lt;/year&gt;&lt;/dates&gt;&lt;publisher&gt;MDPI&lt;/publisher&gt;&lt;label&gt;ahn2023&lt;/label&gt;&lt;urls&gt;&lt;/urls&gt;&lt;electronic-resource-num&gt;10.3390/buildings13112680&lt;/electronic-resource-num&gt;&lt;/record&gt;&lt;/Cite&gt;&lt;/EndNote&gt;</w:instrText>
+        <w:instrText xml:space="preserve"> ADDIN EN.CITE &lt;EndNote&gt;&lt;Cite&gt;&lt;Author&gt;Ahn&lt;/Author&gt;&lt;Year&gt;2023&lt;/Year&gt;&lt;RecNum&gt;1&lt;/RecNum&gt;&lt;DisplayText&gt;[4]&lt;/DisplayText&gt;&lt;record&gt;&lt;rec-number&gt;1&lt;/rec-number&gt;&lt;foreign-keys&gt;&lt;key app="EN" db-id="mdae8500109496fea4aff9c086e16cc25895" timestamp="1793221649"&gt;1&lt;/key&gt;&lt;/foreign-keys&gt;&lt;ref-type name="Journal Article"&gt;17&lt;/ref-type&gt;&lt;contributors&gt;&lt;authors&gt;&lt;author&gt;Ahn, Ki Uhn&lt;/author&gt;&lt;author&gt;Kim, Deuk-Woo&lt;/author&gt;&lt;author&gt;Cho, Hyun Mi&lt;/author&gt;&lt;author&gt;Chae, Chang-U&lt;/author&gt;&lt;/authors&gt;&lt;/contributors&gt;&lt;titles&gt;&lt;title&gt;Alternative Approaches to HVAC Control of Chat Generative Pre-Trained Transformer (ChatGPT) for Autonomous Building System Operations&lt;/title&gt;&lt;secondary-title&gt;Buildings&lt;/secondary-title&gt;&lt;alt-title&gt;Buildings&lt;/alt-title&gt;&lt;/titles&gt;&lt;periodical&gt;&lt;full-title&gt;Buildings&lt;/full-title&gt;&lt;abbr-1&gt;Buildings&lt;/abbr-1&gt;&lt;/periodical&gt;&lt;pages&gt;2680&lt;/pages&gt;&lt;volume&gt;13&lt;/volume&gt;&lt;number&gt;11&lt;/number&gt;&lt;dates&gt;&lt;year&gt;2023&lt;/year&gt;&lt;/dates&gt;&lt;publisher&gt;MDPI&lt;/publisher&gt;&lt;label&gt;ahn2023&lt;/label&gt;&lt;urls&gt;&lt;/urls&gt;&lt;electronic-resource-num&gt;10.3390/buildings13112680&lt;/electronic-resource-num&gt;&lt;/record&gt;&lt;/Cite&gt;&lt;/EndNote&gt;</w:instrText>
       </w:r>
       <w:r>
         <w:fldChar w:fldCharType="separate"/>
@@ -2696,7 +2730,7 @@
         <w:fldChar w:fldCharType="begin"/>
       </w:r>
       <w:r>
-        <w:instrText xml:space="preserve"> ADDIN EN.CITE &lt;EndNote&gt;&lt;Cite&gt;&lt;Author&gt;Zhang&lt;/Author&gt;&lt;Year&gt;2024&lt;/Year&gt;&lt;RecNum&gt;94&lt;/RecNum&gt;&lt;DisplayText&gt;[5]&lt;/DisplayText&gt;&lt;record&gt;&lt;rec-number&gt;94&lt;/rec-number&gt;&lt;foreign-keys&gt;&lt;key app="EN" db-id="mdae8500109496fea4aff9c086e16cc25895" timestamp="1793221304"&gt;94&lt;/key&gt;&lt;/foreign-keys&gt;&lt;ref-type name="Journal Article"&gt;17&lt;/ref-type&gt;&lt;contributors&gt;&lt;authors&gt;&lt;author&gt;Zhang, Liang&lt;/author&gt;&lt;author&gt;Chen, Zhelun&lt;/author&gt;&lt;/authors&gt;&lt;/contributors&gt;&lt;titles&gt;&lt;title&gt;Large language model-based interpretable machine learning control in building energy systems&lt;/title&gt;&lt;secondary-title&gt;Energy and Buildings&lt;/secondary-title&gt;&lt;alt-title&gt;Energy Build.&lt;/alt-title&gt;&lt;/titles&gt;&lt;periodical&gt;&lt;full-title&gt;Energy and Buildings&lt;/full-title&gt;&lt;abbr-1&gt;Energy Build.&lt;/abbr-1&gt;&lt;/periodical&gt;&lt;pages&gt;114278&lt;/pages&gt;&lt;volume&gt;313&lt;/volume&gt;&lt;dates&gt;&lt;year&gt;2024&lt;/year&gt;&lt;/dates&gt;&lt;publisher&gt;Elsevier&lt;/publisher&gt;&lt;label&gt;zhangchen2024&lt;/label&gt;&lt;urls&gt;&lt;/urls&gt;&lt;electronic-resource-num&gt;10.1016/j.enbuild.2024.114278&lt;/electronic-resource-num&gt;&lt;/record&gt;&lt;/Cite&gt;&lt;/EndNote&gt;</w:instrText>
+        <w:instrText xml:space="preserve"> ADDIN EN.CITE &lt;EndNote&gt;&lt;Cite&gt;&lt;Author&gt;Zhang&lt;/Author&gt;&lt;Year&gt;2024&lt;/Year&gt;&lt;RecNum&gt;94&lt;/RecNum&gt;&lt;DisplayText&gt;[5]&lt;/DisplayText&gt;&lt;record&gt;&lt;rec-number&gt;94&lt;/rec-number&gt;&lt;foreign-keys&gt;&lt;key app="EN" db-id="mdae8500109496fea4aff9c086e16cc25895" timestamp="1793221649"&gt;94&lt;/key&gt;&lt;/foreign-keys&gt;&lt;ref-type name="Journal Article"&gt;17&lt;/ref-type&gt;&lt;contributors&gt;&lt;authors&gt;&lt;author&gt;Zhang, Liang&lt;/author&gt;&lt;author&gt;Chen, Zhelun&lt;/author&gt;&lt;/authors&gt;&lt;/contributors&gt;&lt;titles&gt;&lt;title&gt;Large language model-based interpretable machine learning control in building energy systems&lt;/title&gt;&lt;secondary-title&gt;Energy and Buildings&lt;/secondary-title&gt;&lt;alt-title&gt;Energy Build.&lt;/alt-title&gt;&lt;/titles&gt;&lt;periodical&gt;&lt;full-title&gt;Energy and Buildings&lt;/full-title&gt;&lt;abbr-1&gt;Energy Build.&lt;/abbr-1&gt;&lt;/periodical&gt;&lt;pages&gt;114278&lt;/pages&gt;&lt;volume&gt;313&lt;/volume&gt;&lt;dates&gt;&lt;year&gt;2024&lt;/year&gt;&lt;/dates&gt;&lt;publisher&gt;Elsevier&lt;/publisher&gt;&lt;label&gt;zhangchen2024&lt;/label&gt;&lt;urls&gt;&lt;/urls&gt;&lt;electronic-resource-num&gt;10.1016/j.enbuild.2024.114278&lt;/electronic-resource-num&gt;&lt;/record&gt;&lt;/Cite&gt;&lt;/EndNote&gt;</w:instrText>
       </w:r>
       <w:r>
         <w:fldChar w:fldCharType="separate"/>
@@ -2717,7 +2751,7 @@
         <w:fldChar w:fldCharType="begin"/>
       </w:r>
       <w:r>
-        <w:instrText xml:space="preserve"> ADDIN EN.CITE &lt;EndNote&gt;&lt;Cite&gt;&lt;Author&gt;Sawada&lt;/Author&gt;&lt;Year&gt;2025&lt;/Year&gt;&lt;RecNum&gt;74&lt;/RecNum&gt;&lt;DisplayText&gt;[46]&lt;/DisplayText&gt;&lt;record&gt;&lt;rec-number&gt;74&lt;/rec-number&gt;&lt;foreign-keys&gt;&lt;key app="EN" db-id="mdae8500109496fea4aff9c086e16cc25895" timestamp="1793221304"&gt;74&lt;/key&gt;&lt;/foreign-keys&gt;&lt;ref-type name="Journal Article"&gt;17&lt;/ref-type&gt;&lt;contributors&gt;&lt;authors&gt;&lt;author&gt;Sawada, Tomoya&lt;/author&gt;&lt;author&gt;Mizuno, Masahiro&lt;/author&gt;&lt;author&gt;Hasegawa, Takaomi&lt;/author&gt;&lt;author&gt;Yokoyama, Keiichi&lt;/author&gt;&lt;author&gt;Kono, Mayuka&lt;/author&gt;&lt;/authors&gt;&lt;/contributors&gt;&lt;titles&gt;&lt;title&gt;Office-in-the-Loop: an investigation into Agentic AI for advanced building HVAC control systems&lt;/title&gt;&lt;secondary-title&gt;Data-Centric Engineering&lt;/secondary-title&gt;&lt;alt-title&gt;Data-Centric Eng.&lt;/alt-title&gt;&lt;/titles&gt;&lt;periodical&gt;&lt;full-title&gt;Data-Centric Engineering&lt;/full-title&gt;&lt;abbr-1&gt;Data-Centric Eng.&lt;/abbr-1&gt;&lt;/periodical&gt;&lt;pages&gt;e31&lt;/pages&gt;&lt;volume&gt;6&lt;/volume&gt;&lt;dates&gt;&lt;year&gt;2025&lt;/year&gt;&lt;/dates&gt;&lt;publisher&gt;Cambridge University Press&lt;/publisher&gt;&lt;label&gt;sawada2025&lt;/label&gt;&lt;urls&gt;&lt;/urls&gt;&lt;electronic-resource-num&gt;10.1017/dce.2025.10010&lt;/electronic-resource-num&gt;&lt;/record&gt;&lt;/Cite&gt;&lt;/EndNote&gt;</w:instrText>
+        <w:instrText xml:space="preserve"> ADDIN EN.CITE &lt;EndNote&gt;&lt;Cite&gt;&lt;Author&gt;Sawada&lt;/Author&gt;&lt;Year&gt;2025&lt;/Year&gt;&lt;RecNum&gt;74&lt;/RecNum&gt;&lt;DisplayText&gt;[46]&lt;/DisplayText&gt;&lt;record&gt;&lt;rec-number&gt;74&lt;/rec-number&gt;&lt;foreign-keys&gt;&lt;key app="EN" db-id="mdae8500109496fea4aff9c086e16cc25895" timestamp="1793221649"&gt;74&lt;/key&gt;&lt;/foreign-keys&gt;&lt;ref-type name="Journal Article"&gt;17&lt;/ref-type&gt;&lt;contributors&gt;&lt;authors&gt;&lt;author&gt;Sawada, Tomoya&lt;/author&gt;&lt;author&gt;Mizuno, Masahiro&lt;/author&gt;&lt;author&gt;Hasegawa, Takaomi&lt;/author&gt;&lt;author&gt;Yokoyama, Keiichi&lt;/author&gt;&lt;author&gt;Kono, Mayuka&lt;/author&gt;&lt;/authors&gt;&lt;/contributors&gt;&lt;titles&gt;&lt;title&gt;Office-in-the-Loop: an investigation into Agentic AI for advanced building HVAC control systems&lt;/title&gt;&lt;secondary-title&gt;Data-Centric Engineering&lt;/secondary-title&gt;&lt;alt-title&gt;Data-Centric Eng.&lt;/alt-title&gt;&lt;/titles&gt;&lt;periodical&gt;&lt;full-title&gt;Data-Centric Engineering&lt;/full-title&gt;&lt;abbr-1&gt;Data-Centric Eng.&lt;/abbr-1&gt;&lt;/periodical&gt;&lt;pages&gt;e31&lt;/pages&gt;&lt;volume&gt;6&lt;/volume&gt;&lt;dates&gt;&lt;year&gt;2025&lt;/year&gt;&lt;/dates&gt;&lt;publisher&gt;Cambridge University Press&lt;/publisher&gt;&lt;label&gt;sawada2025&lt;/label&gt;&lt;urls&gt;&lt;/urls&gt;&lt;electronic-resource-num&gt;10.1017/dce.2025.10010&lt;/electronic-resource-num&gt;&lt;/record&gt;&lt;/Cite&gt;&lt;/EndNote&gt;</w:instrText>
       </w:r>
       <w:r>
         <w:fldChar w:fldCharType="separate"/>
@@ -2738,7 +2772,7 @@
         <w:fldChar w:fldCharType="begin"/>
       </w:r>
       <w:r>
-        <w:instrText xml:space="preserve"> ADDIN EN.CITE &lt;EndNote&gt;&lt;Cite&gt;&lt;Author&gt;Jiang&lt;/Author&gt;&lt;Year&gt;2024&lt;/Year&gt;&lt;RecNum&gt;40&lt;/RecNum&gt;&lt;DisplayText&gt;[47]&lt;/DisplayText&gt;&lt;record&gt;&lt;rec-number&gt;40&lt;/rec-number&gt;&lt;foreign-keys&gt;&lt;key app="EN" db-id="mdae8500109496fea4aff9c086e16cc25895" timestamp="1793221304"&gt;40&lt;/key&gt;&lt;/foreign-keys&gt;&lt;ref-type name="Journal Article"&gt;17&lt;/ref-type&gt;&lt;contributors&gt;&lt;authors&gt;&lt;author&gt;Jiang, Gang&lt;/author&gt;&lt;author&gt;Ma, Zhihao&lt;/author&gt;&lt;author&gt;Zhang, Liang&lt;/author&gt;&lt;author&gt;Chen, Jianli&lt;/author&gt;&lt;/authors&gt;&lt;/contributors&gt;&lt;titles&gt;&lt;title&gt;EPlus-LLM: A large language model-based computing platform for automated building energy modeling&lt;/title&gt;&lt;secondary-title&gt;Applied Energy&lt;/secondary-title&gt;&lt;alt-title&gt;Appl. Energy&lt;/alt-title&gt;&lt;/titles&gt;&lt;periodical&gt;&lt;full-title&gt;Applied Energy&lt;/full-title&gt;&lt;abbr-1&gt;Appl. Energy&lt;/abbr-1&gt;&lt;/periodical&gt;&lt;pages&gt;123431&lt;/pages&gt;&lt;volume&gt;367&lt;/volume&gt;&lt;dates&gt;&lt;year&gt;2024&lt;/year&gt;&lt;/dates&gt;&lt;publisher&gt;Elsevier&lt;/publisher&gt;&lt;label&gt;jiang2024&lt;/label&gt;&lt;urls&gt;&lt;/urls&gt;&lt;electronic-resource-num&gt;10.1016/j.apenergy.2024.123431&lt;/electronic-resource-num&gt;&lt;/record&gt;&lt;/Cite&gt;&lt;/EndNote&gt;</w:instrText>
+        <w:instrText xml:space="preserve"> ADDIN EN.CITE &lt;EndNote&gt;&lt;Cite&gt;&lt;Author&gt;Jiang&lt;/Author&gt;&lt;Year&gt;2024&lt;/Year&gt;&lt;RecNum&gt;40&lt;/RecNum&gt;&lt;DisplayText&gt;[47]&lt;/DisplayText&gt;&lt;record&gt;&lt;rec-number&gt;40&lt;/rec-number&gt;&lt;foreign-keys&gt;&lt;key app="EN" db-id="mdae8500109496fea4aff9c086e16cc25895" timestamp="1793221649"&gt;40&lt;/key&gt;&lt;/foreign-keys&gt;&lt;ref-type name="Journal Article"&gt;17&lt;/ref-type&gt;&lt;contributors&gt;&lt;authors&gt;&lt;author&gt;Jiang, Gang&lt;/author&gt;&lt;author&gt;Ma, Zhihao&lt;/author&gt;&lt;author&gt;Zhang, Liang&lt;/author&gt;&lt;author&gt;Chen, Jianli&lt;/author&gt;&lt;/authors&gt;&lt;/contributors&gt;&lt;titles&gt;&lt;title&gt;EPlus-LLM: A large language model-based computing platform for automated building energy modeling&lt;/title&gt;&lt;secondary-title&gt;Applied Energy&lt;/secondary-title&gt;&lt;alt-title&gt;Appl. Energy&lt;/alt-title&gt;&lt;/titles&gt;&lt;periodical&gt;&lt;full-title&gt;Applied Energy&lt;/full-title&gt;&lt;abbr-1&gt;Appl. Energy&lt;/abbr-1&gt;&lt;/periodical&gt;&lt;pages&gt;123431&lt;/pages&gt;&lt;volume&gt;367&lt;/volume&gt;&lt;dates&gt;&lt;year&gt;2024&lt;/year&gt;&lt;/dates&gt;&lt;publisher&gt;Elsevier&lt;/publisher&gt;&lt;label&gt;jiang2024&lt;/label&gt;&lt;urls&gt;&lt;/urls&gt;&lt;electronic-resource-num&gt;10.1016/j.apenergy.2024.123431&lt;/electronic-resource-num&gt;&lt;/record&gt;&lt;/Cite&gt;&lt;/EndNote&gt;</w:instrText>
       </w:r>
       <w:r>
         <w:fldChar w:fldCharType="separate"/>
@@ -2761,7 +2795,7 @@
 dW0+NTE8L1JlY051bT48RGlzcGxheVRleHQ+WzYsMjZdPC9EaXNwbGF5VGV4dD48cmVjb3JkPjxy
 ZWMtbnVtYmVyPjUxPC9yZWMtbnVtYmVyPjxmb3JlaWduLWtleXM+PGtleSBhcHA9IkVOIiBkYi1p
 ZD0ibWRhZTg1MDAxMDk0OTZmZWE0YWZmOWMwODZlMTZjYzI1ODk1IiB0aW1lc3RhbXA9IjE3OTMy
-MjEzMDQiPjUxPC9rZXk+PC9mb3JlaWduLWtleXM+PHJlZi10eXBlIG5hbWU9IkpvdXJuYWwgQXJ0
+MjE2NDkiPjUxPC9rZXk+PC9mb3JlaWduLWtleXM+PHJlZi10eXBlIG5hbWU9IkpvdXJuYWwgQXJ0
 aWNsZSI+MTc8L3JlZi10eXBlPjxjb250cmlidXRvcnM+PGF1dGhvcnM+PGF1dGhvcj5MaXUsIE1p
 bmd6aGU8L2F1dGhvcj48YXV0aG9yPlpoYW5nLCBMaWFuZzwvYXV0aG9yPjxhdXRob3I+Q2hlbiwg
 SmlhbmxpPC9hdXRob3I+PGF1dGhvcj5DaGVuLCBXZWktQW48L2F1dGhvcj48YXV0aG9yPllhbmcs
@@ -2780,7 +2814,7 @@
 Q2l0ZT48QXV0aG9yPk5ldWJhdWVyPC9BdXRob3I+PFllYXI+MjAyNjwvWWVhcj48UmVjTnVtPjU3
 PC9SZWNOdW0+PHJlY29yZD48cmVjLW51bWJlcj41NzwvcmVjLW51bWJlcj48Zm9yZWlnbi1rZXlz
 PjxrZXkgYXBwPSJFTiIgZGItaWQ9Im1kYWU4NTAwMTA5NDk2ZmVhNGFmZjljMDg2ZTE2Y2MyNTg5
-NSIgdGltZXN0YW1wPSIxNzkzMjIxMzA0Ij41Nzwva2V5PjwvZm9yZWlnbi1rZXlzPjxyZWYtdHlw
+NSIgdGltZXN0YW1wPSIxNzkzMjIxNjQ5Ij41Nzwva2V5PjwvZm9yZWlnbi1rZXlzPjxyZWYtdHlw
 ZSBuYW1lPSJHZW5lcmljIj4xMzwvcmVmLXR5cGU+PGNvbnRyaWJ1dG9ycz48YXV0aG9ycz48YXV0
 aG9yPk5ldWJhdWVyLCBBbGV4YW5kZXI8L2F1dGhvcj48YXV0aG9yPkhvbmcsIFRpYW56aGVuPC9h
 dXRob3I+PGF1dGhvcj5MaSwgSGFuPC9hdXRob3I+PGF1dGhvcj5ZdSwgTWVuZ2JvPC9hdXRob3I+
@@ -2806,7 +2840,7 @@
 dW0+NTE8L1JlY051bT48RGlzcGxheVRleHQ+WzYsMjZdPC9EaXNwbGF5VGV4dD48cmVjb3JkPjxy
 ZWMtbnVtYmVyPjUxPC9yZWMtbnVtYmVyPjxmb3JlaWduLWtleXM+PGtleSBhcHA9IkVOIiBkYi1p
 ZD0ibWRhZTg1MDAxMDk0OTZmZWE0YWZmOWMwODZlMTZjYzI1ODk1IiB0aW1lc3RhbXA9IjE3OTMy
-MjEzMDQiPjUxPC9rZXk+PC9mb3JlaWduLWtleXM+PHJlZi10eXBlIG5hbWU9IkpvdXJuYWwgQXJ0
+MjE2NDkiPjUxPC9rZXk+PC9mb3JlaWduLWtleXM+PHJlZi10eXBlIG5hbWU9IkpvdXJuYWwgQXJ0
 aWNsZSI+MTc8L3JlZi10eXBlPjxjb250cmlidXRvcnM+PGF1dGhvcnM+PGF1dGhvcj5MaXUsIE1p
 bmd6aGU8L2F1dGhvcj48YXV0aG9yPlpoYW5nLCBMaWFuZzwvYXV0aG9yPjxhdXRob3I+Q2hlbiwg
 SmlhbmxpPC9hdXRob3I+PGF1dGhvcj5DaGVuLCBXZWktQW48L2F1dGhvcj48YXV0aG9yPllhbmcs
@@ -2825,7 +2859,7 @@
 Q2l0ZT48QXV0aG9yPk5ldWJhdWVyPC9BdXRob3I+PFllYXI+MjAyNjwvWWVhcj48UmVjTnVtPjU3
 PC9SZWNOdW0+PHJlY29yZD48cmVjLW51bWJlcj41NzwvcmVjLW51bWJlcj48Zm9yZWlnbi1rZXlz
 PjxrZXkgYXBwPSJFTiIgZGItaWQ9Im1kYWU4NTAwMTA5NDk2ZmVhNGFmZjljMDg2ZTE2Y2MyNTg5
-NSIgdGltZXN0YW1wPSIxNzkzMjIxMzA0Ij41Nzwva2V5PjwvZm9yZWlnbi1rZXlzPjxyZWYtdHlw
+NSIgdGltZXN0YW1wPSIxNzkzMjIxNjQ5Ij41Nzwva2V5PjwvZm9yZWlnbi1rZXlzPjxyZWYtdHlw
 ZSBuYW1lPSJHZW5lcmljIj4xMzwvcmVmLXR5cGU+PGNvbnRyaWJ1dG9ycz48YXV0aG9ycz48YXV0
 aG9yPk5ldWJhdWVyLCBBbGV4YW5kZXI8L2F1dGhvcj48YXV0aG9yPkhvbmcsIFRpYW56aGVuPC9h
 dXRob3I+PGF1dGhvcj5MaSwgSGFuPC9hdXRob3I+PGF1dGhvcj5ZdSwgTWVuZ2JvPC9hdXRob3I+
@@ -2883,7 +2917,7 @@
         <w:fldChar w:fldCharType="begin"/>
       </w:r>
       <w:r>
-        <w:instrText xml:space="preserve"> ADDIN EN.CITE &lt;EndNote&gt;&lt;Cite&gt;&lt;Author&gt;Eaton&lt;/Author&gt;&lt;Year&gt;2023&lt;/Year&gt;&lt;RecNum&gt;10&lt;/RecNum&gt;&lt;DisplayText&gt;[48]&lt;/DisplayText&gt;&lt;record&gt;&lt;rec-number&gt;10&lt;/rec-number&gt;&lt;foreign-keys&gt;&lt;key app="EN" db-id="mdae8500109496fea4aff9c086e16cc25895" timestamp="1793221304"&gt;10&lt;/key&gt;&lt;/foreign-keys&gt;&lt;ref-type name="Web Page"&gt;12&lt;/ref-type&gt;&lt;contributors&gt;&lt;authors&gt;&lt;author&gt;Eaton, Brian&lt;/author&gt;&lt;author&gt;Gregory, Jonathan&lt;/author&gt;&lt;author&gt;Drach, Bob&lt;/author&gt;&lt;author&gt;Taylor, Karl&lt;/author&gt;&lt;author&gt;Hankin, Steve&lt;/author&gt;&lt;author&gt;Blower, Jon&lt;/author&gt;&lt;author&gt;Caron, John&lt;/author&gt;&lt;author&gt;Signell, Rich&lt;/author&gt;&lt;author&gt;Bentley, Phil&lt;/author&gt;&lt;author&gt;Rappa, Greg&lt;/author&gt;&lt;author&gt;Höck, Heinke&lt;/author&gt;&lt;author&gt;Pamment, Alison&lt;/author&gt;&lt;author&gt;Juckes, Martin&lt;/author&gt;&lt;author&gt;Raspaud, Martin&lt;/author&gt;&lt;author&gt;Horne, Randy&lt;/author&gt;&lt;author&gt;Whiteaker, Timothy&lt;/author&gt;&lt;author&gt;Blodgett, David&lt;/author&gt;&lt;author&gt;Zender, Charlie&lt;/author&gt;&lt;author&gt;Lee, Daniel&lt;/author&gt;&lt;author&gt;Hassell, David&lt;/author&gt;&lt;author&gt;Snow, Alan D.&lt;/author&gt;&lt;author&gt;Kölling, Tobias&lt;/author&gt;&lt;author&gt;Allured, Dave&lt;/author&gt;&lt;author&gt;Jelenak, Aleksandar&lt;/author&gt;&lt;author&gt;Meier Soerensen, Anders&lt;/author&gt;&lt;author&gt;Gaultier, Lucile&lt;/author&gt;&lt;author&gt;Herlédan, Sylvain&lt;/author&gt;&lt;author&gt;Manzano, Fernando&lt;/author&gt;&lt;author&gt;Bärring, Lars&lt;/author&gt;&lt;author&gt;Barker, Christopher&lt;/author&gt;&lt;author&gt;Bartholomew, Sadie&lt;/author&gt;&lt;/authors&gt;&lt;/contributors&gt;&lt;titles&gt;&lt;title&gt;NetCDF Climate and Forecast (CF) Metadata Conventions&lt;/title&gt;&lt;/titles&gt;&lt;dates&gt;&lt;year&gt;2023&lt;/year&gt;&lt;/dates&gt;&lt;label&gt;cf2023&lt;/label&gt;&lt;urls&gt;&lt;related-urls&gt;&lt;url&gt;https://cfconventions.org/Data/cf-conventions/cf-conventions-1.11/cf-conventions.html&lt;/url&gt;&lt;/related-urls&gt;&lt;/urls&gt;&lt;access-date&gt;2026-10-28&lt;/access-date&gt;&lt;/record&gt;&lt;/Cite&gt;&lt;/EndNote&gt;</w:instrText>
+        <w:instrText xml:space="preserve"> ADDIN EN.CITE &lt;EndNote&gt;&lt;Cite&gt;&lt;Author&gt;Eaton&lt;/Author&gt;&lt;Year&gt;2023&lt;/Year&gt;&lt;RecNum&gt;10&lt;/RecNum&gt;&lt;DisplayText&gt;[48]&lt;/DisplayText&gt;&lt;record&gt;&lt;rec-number&gt;10&lt;/rec-number&gt;&lt;foreign-keys&gt;&lt;key app="EN" db-id="mdae8500109496fea4aff9c086e16cc25895" timestamp="1793221649"&gt;10&lt;/key&gt;&lt;/foreign-keys&gt;&lt;ref-type name="Web Page"&gt;12&lt;/ref-type&gt;&lt;contributors&gt;&lt;authors&gt;&lt;author&gt;Eaton, Brian&lt;/author&gt;&lt;author&gt;Gregory, Jonathan&lt;/author&gt;&lt;author&gt;Drach, Bob&lt;/author&gt;&lt;author&gt;Taylor, Karl&lt;/author&gt;&lt;author&gt;Hankin, Steve&lt;/author&gt;&lt;author&gt;Blower, Jon&lt;/author&gt;&lt;author&gt;Caron, John&lt;/author&gt;&lt;author&gt;Signell, Rich&lt;/author&gt;&lt;author&gt;Bentley, Phil&lt;/author&gt;&lt;author&gt;Rappa, Greg&lt;/author&gt;&lt;author&gt;Höck, Heinke&lt;/author&gt;&lt;author&gt;Pamment, Alison&lt;/author&gt;&lt;author&gt;Juckes, Martin&lt;/author&gt;&lt;author&gt;Raspaud, Martin&lt;/author&gt;&lt;author&gt;Horne, Randy&lt;/author&gt;&lt;author&gt;Whiteaker, Timothy&lt;/author&gt;&lt;author&gt;Blodgett, David&lt;/author&gt;&lt;author&gt;Zender, Charlie&lt;/author&gt;&lt;author&gt;Lee, Daniel&lt;/author&gt;&lt;author&gt;Hassell, David&lt;/author&gt;&lt;author&gt;Snow, Alan D.&lt;/author&gt;&lt;author&gt;Kölling, Tobias&lt;/author&gt;&lt;author&gt;Allured, Dave&lt;/author&gt;&lt;author&gt;Jelenak, Aleksandar&lt;/author&gt;&lt;author&gt;Meier Soerensen, Anders&lt;/author&gt;&lt;author&gt;Gaultier, Lucile&lt;/author&gt;&lt;author&gt;Herlédan, Sylvain&lt;/author&gt;&lt;author&gt;Manzano, Fernando&lt;/author&gt;&lt;author&gt;Bärring, Lars&lt;/author&gt;&lt;author&gt;Barker, Christopher&lt;/author&gt;&lt;author&gt;Bartholomew, Sadie&lt;/author&gt;&lt;/authors&gt;&lt;/contributors&gt;&lt;titles&gt;&lt;title&gt;NetCDF Climate and Forecast (CF) Metadata Conventions&lt;/title&gt;&lt;/titles&gt;&lt;dates&gt;&lt;year&gt;2023&lt;/year&gt;&lt;/dates&gt;&lt;label&gt;cf2023&lt;/label&gt;&lt;urls&gt;&lt;related-urls&gt;&lt;url&gt;https://cfconventions.org/Data/cf-conventions/cf-conventions-1.11/cf-conventions.html&lt;/url&gt;&lt;/related-urls&gt;&lt;/urls&gt;&lt;access-date&gt;2026-10-28&lt;/access-date&gt;&lt;/record&gt;&lt;/Cite&gt;&lt;/EndNote&gt;</w:instrText>
       </w:r>
       <w:r>
         <w:fldChar w:fldCharType="separate"/>
@@ -2904,7 +2938,7 @@
         <w:fldChar w:fldCharType="begin"/>
       </w:r>
       <w:r>
-        <w:instrText xml:space="preserve"> ADDIN EN.CITE &lt;EndNote&gt;&lt;Cite&gt;&lt;Author&gt;Open Geospatial Consortium&lt;/Author&gt;&lt;Year&gt;2014&lt;/Year&gt;&lt;RecNum&gt;63&lt;/RecNum&gt;&lt;DisplayText&gt;[49]&lt;/DisplayText&gt;&lt;record&gt;&lt;rec-number&gt;63&lt;/rec-number&gt;&lt;foreign-keys&gt;&lt;key app="EN" db-id="mdae8500109496fea4aff9c086e16cc25895" timestamp="1793221304"&gt;63&lt;/key&gt;&lt;/foreign-keys&gt;&lt;ref-type name="Standard"&gt;58&lt;/ref-type&gt;&lt;contributors&gt;&lt;authors&gt;&lt;author&gt;Open Geospatial Consortium&lt;/author&gt;&lt;/authors&gt;&lt;secondary-authors&gt;&lt;author&gt;Taylor, Peter&lt;/author&gt;&lt;/secondary-authors&gt;&lt;/contributors&gt;&lt;titles&gt;&lt;title&gt;OGC WaterML 2.0: Part 1 – Timeseries, Version 2.0.1&lt;/title&gt;&lt;secondary-title&gt;OGC 10-126r4&lt;/secondary-title&gt;&lt;/titles&gt;&lt;dates&gt;&lt;year&gt;2014&lt;/year&gt;&lt;/dates&gt;&lt;label&gt;ogc_waterml2014&lt;/label&gt;&lt;urls&gt;&lt;related-urls&gt;&lt;url&gt;https://docs.ogc.org/is/10-126r4/10-126r4.pdf&lt;/url&gt;&lt;/related-urls&gt;&lt;/urls&gt;&lt;/record&gt;&lt;/Cite&gt;&lt;/EndNote&gt;</w:instrText>
+        <w:instrText xml:space="preserve"> ADDIN EN.CITE &lt;EndNote&gt;&lt;Cite&gt;&lt;Author&gt;Open Geospatial Consortium&lt;/Author&gt;&lt;Year&gt;2014&lt;/Year&gt;&lt;RecNum&gt;63&lt;/RecNum&gt;&lt;DisplayText&gt;[49]&lt;/DisplayText&gt;&lt;record&gt;&lt;rec-number&gt;63&lt;/rec-number&gt;&lt;foreign-keys&gt;&lt;key app="EN" db-id="mdae8500109496fea4aff9c086e16cc25895" timestamp="1793221649"&gt;63&lt;/key&gt;&lt;/foreign-keys&gt;&lt;ref-type name="Standard"&gt;58&lt;/ref-type&gt;&lt;contributors&gt;&lt;authors&gt;&lt;author&gt;Open Geospatial Consortium&lt;/author&gt;&lt;/authors&gt;&lt;secondary-authors&gt;&lt;author&gt;Taylor, Peter&lt;/author&gt;&lt;/secondary-authors&gt;&lt;/contributors&gt;&lt;titles&gt;&lt;title&gt;OGC WaterML 2.0: Part 1 – Timeseries, Version 2.0.1&lt;/title&gt;&lt;secondary-title&gt;OGC 10-126r4&lt;/secondary-title&gt;&lt;/titles&gt;&lt;dates&gt;&lt;year&gt;2014&lt;/year&gt;&lt;/dates&gt;&lt;label&gt;ogc_waterml2014&lt;/label&gt;&lt;urls&gt;&lt;related-urls&gt;&lt;url&gt;https://docs.ogc.org/is/10-126r4/10-126r4.pdf&lt;/url&gt;&lt;/related-urls&gt;&lt;/urls&gt;&lt;/record&gt;&lt;/Cite&gt;&lt;/EndNote&gt;</w:instrText>
       </w:r>
       <w:r>
         <w:fldChar w:fldCharType="separate"/>
@@ -2925,7 +2959,7 @@
         <w:fldChar w:fldCharType="begin"/>
       </w:r>
       <w:r>
-        <w:instrText xml:space="preserve"> ADDIN EN.CITE &lt;EndNote&gt;&lt;Cite&gt;&lt;Author&gt;U.S. Department of Energy&lt;/Author&gt;&lt;Year&gt;2024&lt;/Year&gt;&lt;RecNum&gt;20&lt;/RecNum&gt;&lt;DisplayText&gt;[21]&lt;/DisplayText&gt;&lt;record&gt;&lt;rec-number&gt;20&lt;/rec-number&gt;&lt;foreign-keys&gt;&lt;key app="EN" db-id="mdae8500109496fea4aff9c086e16cc25895" timestamp="1793221304"&gt;20&lt;/key&gt;&lt;/foreign-keys&gt;&lt;ref-type name="Web Page"&gt;12&lt;/ref-type&gt;&lt;contributors&gt;&lt;authors&gt;&lt;author&gt;U.S. Department of Energy&lt;/author&gt;&lt;/authors&gt;&lt;/contributors&gt;&lt;titles&gt;&lt;title&gt;EnergyPlus Output Details and Examples: eplusout.rdd&lt;/title&gt;&lt;/titles&gt;&lt;dates&gt;&lt;year&gt;2024&lt;/year&gt;&lt;/dates&gt;&lt;label&gt;doe2024rdd&lt;/label&gt;&lt;urls&gt;&lt;related-urls&gt;&lt;url&gt;https://bigladdersoftware.com/epx/docs/24-1/output-details-and-examples/eplusout-rdd.html&lt;/url&gt;&lt;/related-urls&gt;&lt;/urls&gt;&lt;access-date&gt;2026-10-28&lt;/access-date&gt;&lt;/record&gt;&lt;/Cite&gt;&lt;/EndNote&gt;</w:instrText>
+        <w:instrText xml:space="preserve"> ADDIN EN.CITE &lt;EndNote&gt;&lt;Cite&gt;&lt;Author&gt;U.S. Department of Energy&lt;/Author&gt;&lt;Year&gt;2024&lt;/Year&gt;&lt;RecNum&gt;20&lt;/RecNum&gt;&lt;DisplayText&gt;[21]&lt;/DisplayText&gt;&lt;record&gt;&lt;rec-number&gt;20&lt;/rec-number&gt;&lt;foreign-keys&gt;&lt;key app="EN" db-id="mdae8500109496fea4aff9c086e16cc25895" timestamp="1793221649"&gt;20&lt;/key&gt;&lt;/foreign-keys&gt;&lt;ref-type name="Web Page"&gt;12&lt;/ref-type&gt;&lt;contributors&gt;&lt;authors&gt;&lt;author&gt;U.S. Department of Energy&lt;/author&gt;&lt;/authors&gt;&lt;/contributors&gt;&lt;titles&gt;&lt;title&gt;EnergyPlus Output Details and Examples: eplusout.rdd&lt;/title&gt;&lt;/titles&gt;&lt;dates&gt;&lt;year&gt;2024&lt;/year&gt;&lt;/dates&gt;&lt;label&gt;doe2024rdd&lt;/label&gt;&lt;urls&gt;&lt;related-urls&gt;&lt;url&gt;https://bigladdersoftware.com/epx/docs/24-1/output-details-and-examples/eplusout-rdd.html&lt;/url&gt;&lt;/related-urls&gt;&lt;/urls&gt;&lt;access-date&gt;2026-10-28&lt;/access-date&gt;&lt;/record&gt;&lt;/Cite&gt;&lt;/EndNote&gt;</w:instrText>
       </w:r>
       <w:r>
         <w:fldChar w:fldCharType="separate"/>
@@ -2946,7 +2980,7 @@
         <w:fldChar w:fldCharType="begin"/>
       </w:r>
       <w:r>
-        <w:instrText xml:space="preserve"> ADDIN EN.CITE &lt;EndNote&gt;&lt;Cite&gt;&lt;Author&gt;OPC Foundation&lt;/Author&gt;&lt;Year&gt;2026&lt;/Year&gt;&lt;RecNum&gt;65&lt;/RecNum&gt;&lt;DisplayText&gt;[50]&lt;/DisplayText&gt;&lt;record&gt;&lt;rec-number&gt;65&lt;/rec-number&gt;&lt;foreign-keys&gt;&lt;key app="EN" db-id="mdae8500109496fea4aff9c086e16cc25895" timestamp="1793221304"&gt;65&lt;/key&gt;&lt;/foreign-keys&gt;&lt;ref-type name="Standard"&gt;58&lt;/ref-type&gt;&lt;contributors&gt;&lt;authors&gt;&lt;author&gt;OPC Foundation&lt;/author&gt;&lt;/authors&gt;&lt;/contributors&gt;&lt;titles&gt;&lt;title&gt;OPC Unified Architecture – Part 8: Data Access&lt;/title&gt;&lt;secondary-title&gt;OPC 10000-8, Release 1.05.07&lt;/secondary-title&gt;&lt;/titles&gt;&lt;dates&gt;&lt;year&gt;2026&lt;/year&gt;&lt;/dates&gt;&lt;label&gt;opcua_part8&lt;/label&gt;&lt;urls&gt;&lt;related-urls&gt;&lt;url&gt;https://reference.opcfoundation.org/specs/OPC-10000-8&lt;/url&gt;&lt;/related-urls&gt;&lt;/urls&gt;&lt;/record&gt;&lt;/Cite&gt;&lt;/EndNote&gt;</w:instrText>
+        <w:instrText xml:space="preserve"> ADDIN EN.CITE &lt;EndNote&gt;&lt;Cite&gt;&lt;Author&gt;OPC Foundation&lt;/Author&gt;&lt;Year&gt;2026&lt;/Year&gt;&lt;RecNum&gt;65&lt;/RecNum&gt;&lt;DisplayText&gt;[50]&lt;/DisplayText&gt;&lt;record&gt;&lt;rec-number&gt;65&lt;/rec-number&gt;&lt;foreign-keys&gt;&lt;key app="EN" db-id="mdae8500109496fea4aff9c086e16cc25895" timestamp="1793221649"&gt;65&lt;/key&gt;&lt;/foreign-keys&gt;&lt;ref-type name="Standard"&gt;58&lt;/ref-type&gt;&lt;contributors&gt;&lt;authors&gt;&lt;author&gt;OPC Foundation&lt;/author&gt;&lt;/authors&gt;&lt;/contributors&gt;&lt;titles&gt;&lt;title&gt;OPC Unified Architecture – Part 8: Data Access&lt;/title&gt;&lt;secondary-title&gt;OPC 10000-8, Release 1.05.07&lt;/secondary-title&gt;&lt;/titles&gt;&lt;dates&gt;&lt;year&gt;2026&lt;/year&gt;&lt;/dates&gt;&lt;label&gt;opcua_part8&lt;/label&gt;&lt;urls&gt;&lt;related-urls&gt;&lt;url&gt;https://reference.opcfoundation.org/specs/OPC-10000-8&lt;/url&gt;&lt;/related-urls&gt;&lt;/urls&gt;&lt;/record&gt;&lt;/Cite&gt;&lt;/EndNote&gt;</w:instrText>
       </w:r>
       <w:r>
         <w:fldChar w:fldCharType="separate"/>
@@ -2967,7 +3001,7 @@
         <w:fldChar w:fldCharType="begin"/>
       </w:r>
       <w:r>
-        <w:instrText xml:space="preserve"> ADDIN EN.CITE &lt;EndNote&gt;&lt;Cite&gt;&lt;Author&gt;Moreau&lt;/Author&gt;&lt;Year&gt;2013&lt;/Year&gt;&lt;RecNum&gt;55&lt;/RecNum&gt;&lt;DisplayText&gt;[51]&lt;/DisplayText&gt;&lt;record&gt;&lt;rec-number&gt;55&lt;/rec-number&gt;&lt;foreign-keys&gt;&lt;key app="EN" db-id="mdae8500109496fea4aff9c086e16cc25895" timestamp="1793221304"&gt;55&lt;/key&gt;&lt;/foreign-keys&gt;&lt;ref-type name="Standard"&gt;58&lt;/ref-type&gt;&lt;contributors&gt;&lt;authors&gt;&lt;author&gt;Moreau, Luc&lt;/author&gt;&lt;author&gt;Missier, Paolo&lt;/author&gt;&lt;/authors&gt;&lt;/contributors&gt;&lt;titles&gt;&lt;title&gt;PROV-DM: The PROV Data Model&lt;/title&gt;&lt;secondary-title&gt;W3C Recommendation&lt;/secondary-title&gt;&lt;/titles&gt;&lt;dates&gt;&lt;year&gt;2013&lt;/year&gt;&lt;/dates&gt;&lt;publisher&gt;World Wide Web Consortium (W3C)&lt;/publisher&gt;&lt;label&gt;moreau2013prov&lt;/label&gt;&lt;urls&gt;&lt;related-urls&gt;&lt;url&gt;https://www.w3.org/TR/2013/REC-prov-dm-20130430/&lt;/url&gt;&lt;/related-urls&gt;&lt;/urls&gt;&lt;/record&gt;&lt;/Cite&gt;&lt;/EndNote&gt;</w:instrText>
+        <w:instrText xml:space="preserve"> ADDIN EN.CITE &lt;EndNote&gt;&lt;Cite&gt;&lt;Author&gt;Moreau&lt;/Author&gt;&lt;Year&gt;2013&lt;/Year&gt;&lt;RecNum&gt;55&lt;/RecNum&gt;&lt;DisplayText&gt;[51]&lt;/DisplayText&gt;&lt;record&gt;&lt;rec-number&gt;55&lt;/rec-number&gt;&lt;foreign-keys&gt;&lt;key app="EN" db-id="mdae8500109496fea4aff9c086e16cc25895" timestamp="1793221649"&gt;55&lt;/key&gt;&lt;/foreign-keys&gt;&lt;ref-type name="Standard"&gt;58&lt;/ref-type&gt;&lt;contributors&gt;&lt;authors&gt;&lt;author&gt;Moreau, Luc&lt;/author&gt;&lt;author&gt;Missier, Paolo&lt;/author&gt;&lt;/authors&gt;&lt;/contributors&gt;&lt;titles&gt;&lt;title&gt;PROV-DM: The PROV Data Model&lt;/title&gt;&lt;secondary-title&gt;W3C Recommendation&lt;/secondary-title&gt;&lt;/titles&gt;&lt;dates&gt;&lt;year&gt;2013&lt;/year&gt;&lt;/dates&gt;&lt;publisher&gt;World Wide Web Consortium (W3C)&lt;/publisher&gt;&lt;label&gt;moreau2013prov&lt;/label&gt;&lt;urls&gt;&lt;related-urls&gt;&lt;url&gt;https://www.w3.org/TR/2013/REC-prov-dm-20130430/&lt;/url&gt;&lt;/related-urls&gt;&lt;/urls&gt;&lt;/record&gt;&lt;/Cite&gt;&lt;/EndNote&gt;</w:instrText>
       </w:r>
       <w:r>
         <w:fldChar w:fldCharType="separate"/>
@@ -2988,7 +3022,7 @@
         <w:fldChar w:fldCharType="begin"/>
       </w:r>
       <w:r>
-        <w:instrText xml:space="preserve"> ADDIN EN.CITE &lt;EndNote&gt;&lt;Cite&gt;&lt;Author&gt;Chen&lt;/Author&gt;&lt;Year&gt;2015&lt;/Year&gt;&lt;RecNum&gt;12&lt;/RecNum&gt;&lt;DisplayText&gt;[52]&lt;/DisplayText&gt;&lt;record&gt;&lt;rec-number&gt;12&lt;/rec-number&gt;&lt;foreign-keys&gt;&lt;key app="EN" db-id="mdae8500109496fea4aff9c086e16cc25895" timestamp="1793221304"&gt;12&lt;/key&gt;&lt;/foreign-keys&gt;&lt;ref-type name="Journal Article"&gt;17&lt;/ref-type&gt;&lt;contributors&gt;&lt;authors&gt;&lt;author&gt;Chen, Yunji&lt;/author&gt;&lt;author&gt;Zhang, Shijin&lt;/author&gt;&lt;author&gt;Guo, Qi&lt;/author&gt;&lt;author&gt;Li, Ling&lt;/author&gt;&lt;author&gt;Wu, Ruiyang&lt;/author&gt;&lt;author&gt;Chen, Tianshi&lt;/author&gt;&lt;/authors&gt;&lt;/contributors&gt;&lt;titles&gt;&lt;title&gt;Deterministic Replay: A Survey&lt;/title&gt;&lt;secondary-title&gt;ACM Computing Surveys&lt;/secondary-title&gt;&lt;alt-title&gt;ACM Comput. Surv.&lt;/alt-title&gt;&lt;/titles&gt;&lt;periodical&gt;&lt;full-title&gt;ACM Computing Surveys&lt;/full-title&gt;&lt;abbr-1&gt;ACM Comput. Surv.&lt;/abbr-1&gt;&lt;/periodical&gt;&lt;pages&gt;1-47&lt;/pages&gt;&lt;volume&gt;48&lt;/volume&gt;&lt;number&gt;2&lt;/number&gt;&lt;dates&gt;&lt;year&gt;2015&lt;/year&gt;&lt;/dates&gt;&lt;publisher&gt;ACM&lt;/publisher&gt;&lt;label&gt;chen2015replay&lt;/label&gt;&lt;urls&gt;&lt;/urls&gt;&lt;electronic-resource-num&gt;10.1145/2790077&lt;/electronic-resource-num&gt;&lt;/record&gt;&lt;/Cite&gt;&lt;/EndNote&gt;</w:instrText>
+        <w:instrText xml:space="preserve"> ADDIN EN.CITE &lt;EndNote&gt;&lt;Cite&gt;&lt;Author&gt;Chen&lt;/Author&gt;&lt;Year&gt;2015&lt;/Year&gt;&lt;RecNum&gt;12&lt;/RecNum&gt;&lt;DisplayText&gt;[52]&lt;/DisplayText&gt;&lt;record&gt;&lt;rec-number&gt;12&lt;/rec-number&gt;&lt;foreign-keys&gt;&lt;key app="EN" db-id="mdae8500109496fea4aff9c086e16cc25895" timestamp="1793221649"&gt;12&lt;/key&gt;&lt;/foreign-keys&gt;&lt;ref-type name="Journal Article"&gt;17&lt;/ref-type&gt;&lt;contributors&gt;&lt;authors&gt;&lt;author&gt;Chen, Yunji&lt;/author&gt;&lt;author&gt;Zhang, Shijin&lt;/author&gt;&lt;author&gt;Guo, Qi&lt;/author&gt;&lt;author&gt;Li, Ling&lt;/author&gt;&lt;author&gt;Wu, Ruiyang&lt;/author&gt;&lt;author&gt;Chen, Tianshi&lt;/author&gt;&lt;/authors&gt;&lt;/contributors&gt;&lt;titles&gt;&lt;title&gt;Deterministic Replay: A Survey&lt;/title&gt;&lt;secondary-title&gt;ACM Computing Surveys&lt;/secondary-title&gt;&lt;alt-title&gt;ACM Comput. Surv.&lt;/alt-title&gt;&lt;/titles&gt;&lt;periodical&gt;&lt;full-title&gt;ACM Computing Surveys&lt;/full-title&gt;&lt;abbr-1&gt;ACM Comput. Surv.&lt;/abbr-1&gt;&lt;/periodical&gt;&lt;pages&gt;1-47&lt;/pages&gt;&lt;volume&gt;48&lt;/volume&gt;&lt;number&gt;2&lt;/number&gt;&lt;dates&gt;&lt;year&gt;2015&lt;/year&gt;&lt;/dates&gt;&lt;publisher&gt;ACM&lt;/publisher&gt;&lt;label&gt;chen2015replay&lt;/label&gt;&lt;urls&gt;&lt;/urls&gt;&lt;electronic-resource-num&gt;10.1145/2790077&lt;/electronic-resource-num&gt;&lt;/record&gt;&lt;/Cite&gt;&lt;/EndNote&gt;</w:instrText>
       </w:r>
       <w:r>
         <w:fldChar w:fldCharType="separate"/>
@@ -3009,7 +3043,7 @@
         <w:fldChar w:fldCharType="begin"/>
       </w:r>
       <w:r>
-        <w:instrText xml:space="preserve"> ADDIN EN.CITE &lt;EndNote&gt;&lt;Cite&gt;&lt;Author&gt;Feng&lt;/Author&gt;&lt;Year&gt;2025&lt;/Year&gt;&lt;RecNum&gt;21&lt;/RecNum&gt;&lt;DisplayText&gt;[53]&lt;/DisplayText&gt;&lt;record&gt;&lt;rec-number&gt;21&lt;/rec-number&gt;&lt;foreign-keys&gt;&lt;key app="EN" db-id="mdae8500109496fea4aff9c086e16cc25895" timestamp="1793221304"&gt;21&lt;/key&gt;&lt;/foreign-keys&gt;&lt;ref-type name="Generic"&gt;13&lt;/ref-type&gt;&lt;contributors&gt;&lt;authors&gt;&lt;author&gt;Feng, Erhu&lt;/author&gt;&lt;author&gt;Zhou, Wenbo&lt;/author&gt;&lt;author&gt;Liu, Zibin&lt;/author&gt;&lt;author&gt;Chen, Le&lt;/author&gt;&lt;author&gt;Dong, Yunpeng&lt;/author&gt;&lt;author&gt;Zhang, Cheng&lt;/author&gt;&lt;author&gt;Zhao, Yisheng&lt;/author&gt;&lt;author&gt;Du, Dong&lt;/author&gt;&lt;author&gt;Hua, Zhichao&lt;/author&gt;&lt;author&gt;Xia, Yubin&lt;/author&gt;&lt;author&gt;Chen, Haibo&lt;/author&gt;&lt;/authors&gt;&lt;/contributors&gt;&lt;titles&gt;&lt;title&gt;Get Experience from Practice: LLM Agents with Record &amp;amp; Replay&lt;/title&gt;&lt;secondary-title&gt;arXiv&lt;/secondary-title&gt;&lt;/titles&gt;&lt;dates&gt;&lt;year&gt;2025&lt;/year&gt;&lt;/dates&gt;&lt;label&gt;feng2025agentrr&lt;/label&gt;&lt;work-type&gt;arXiv:2505.17716&lt;/work-type&gt;&lt;urls&gt;&lt;related-urls&gt;&lt;url&gt;https://arxiv.org/abs/2505.17716&lt;/url&gt;&lt;/related-urls&gt;&lt;/urls&gt;&lt;electronic-resource-num&gt;10.48550/arXiv.2505.17716&lt;/electronic-resource-num&gt;&lt;/record&gt;&lt;/Cite&gt;&lt;/EndNote&gt;</w:instrText>
+        <w:instrText xml:space="preserve"> ADDIN EN.CITE &lt;EndNote&gt;&lt;Cite&gt;&lt;Author&gt;Feng&lt;/Author&gt;&lt;Year&gt;2025&lt;/Year&gt;&lt;RecNum&gt;21&lt;/RecNum&gt;&lt;DisplayText&gt;[53]&lt;/DisplayText&gt;&lt;record&gt;&lt;rec-number&gt;21&lt;/rec-number&gt;&lt;foreign-keys&gt;&lt;key app="EN" db-id="mdae8500109496fea4aff9c086e16cc25895" timestamp="1793221649"&gt;21&lt;/key&gt;&lt;/foreign-keys&gt;&lt;ref-type name="Generic"&gt;13&lt;/ref-type&gt;&lt;contributors&gt;&lt;authors&gt;&lt;author&gt;Feng, Erhu&lt;/author&gt;&lt;author&gt;Zhou, Wenbo&lt;/author&gt;&lt;author&gt;Liu, Zibin&lt;/author&gt;&lt;author&gt;Chen, Le&lt;/author&gt;&lt;author&gt;Dong, Yunpeng&lt;/author&gt;&lt;author&gt;Zhang, Cheng&lt;/author&gt;&lt;author&gt;Zhao, Yisheng&lt;/author&gt;&lt;author&gt;Du, Dong&lt;/author&gt;&lt;author&gt;Hua, Zhichao&lt;/author&gt;&lt;author&gt;Xia, Yubin&lt;/author&gt;&lt;author&gt;Chen, Haibo&lt;/author&gt;&lt;/authors&gt;&lt;/contributors&gt;&lt;titles&gt;&lt;title&gt;Get Experience from Practice: LLM Agents with Record &amp;amp; Replay&lt;/title&gt;&lt;secondary-title&gt;arXiv&lt;/secondary-title&gt;&lt;/titles&gt;&lt;dates&gt;&lt;year&gt;2025&lt;/year&gt;&lt;/dates&gt;&lt;label&gt;feng2025agentrr&lt;/label&gt;&lt;work-type&gt;arXiv:2505.17716&lt;/work-type&gt;&lt;urls&gt;&lt;related-urls&gt;&lt;url&gt;https://arxiv.org/abs/2505.17716&lt;/url&gt;&lt;/related-urls&gt;&lt;/urls&gt;&lt;electronic-resource-num&gt;10.48550/arXiv.2505.17716&lt;/electronic-resource-num&gt;&lt;/record&gt;&lt;/Cite&gt;&lt;/EndNote&gt;</w:instrText>
       </w:r>
       <w:r>
         <w:fldChar w:fldCharType="separate"/>
@@ -3030,7 +3064,7 @@
         <w:fldChar w:fldCharType="begin"/>
       </w:r>
       <w:r>
-        <w:instrText xml:space="preserve"> ADDIN EN.CITE &lt;EndNote&gt;&lt;Cite&gt;&lt;Author&gt;Henzinger&lt;/Author&gt;&lt;Year&gt;2003&lt;/Year&gt;&lt;RecNum&gt;33&lt;/RecNum&gt;&lt;DisplayText&gt;[54]&lt;/DisplayText&gt;&lt;record&gt;&lt;rec-number&gt;33&lt;/rec-number&gt;&lt;foreign-keys&gt;&lt;key app="EN" db-id="mdae8500109496fea4aff9c086e16cc25895" timestamp="1793221304"&gt;33&lt;/key&gt;&lt;/foreign-keys&gt;&lt;ref-type name="Journal Article"&gt;17&lt;/ref-type&gt;&lt;contributors&gt;&lt;authors&gt;&lt;author&gt;Henzinger, T. A.&lt;/author&gt;&lt;author&gt;Horowitz, B.&lt;/author&gt;&lt;author&gt;Kirsch, C. M.&lt;/author&gt;&lt;/authors&gt;&lt;/contributors&gt;&lt;titles&gt;&lt;title&gt;Giotto: a time-triggered language for embedded programming&lt;/title&gt;&lt;secondary-title&gt;Proceedings of the IEEE&lt;/secondary-title&gt;&lt;alt-title&gt;Proc. IEEE&lt;/alt-title&gt;&lt;/titles&gt;&lt;periodical&gt;&lt;full-title&gt;Proceedings of the IEEE&lt;/full-title&gt;&lt;abbr-1&gt;Proc. IEEE&lt;/abbr-1&gt;&lt;/periodical&gt;&lt;pages&gt;84-99&lt;/pages&gt;&lt;volume&gt;91&lt;/volume&gt;&lt;number&gt;1&lt;/number&gt;&lt;dates&gt;&lt;year&gt;2003&lt;/year&gt;&lt;/dates&gt;&lt;publisher&gt;IEEE&lt;/publisher&gt;&lt;label&gt;henzinger2003&lt;/label&gt;&lt;urls&gt;&lt;/urls&gt;&lt;electronic-resource-num&gt;10.1109/JPROC.2002.805825&lt;/electronic-resource-num&gt;&lt;/record&gt;&lt;/Cite&gt;&lt;/EndNote&gt;</w:instrText>
+        <w:instrText xml:space="preserve"> ADDIN EN.CITE &lt;EndNote&gt;&lt;Cite&gt;&lt;Author&gt;Henzinger&lt;/Author&gt;&lt;Year&gt;2003&lt;/Year&gt;&lt;RecNum&gt;33&lt;/RecNum&gt;&lt;DisplayText&gt;[54]&lt;/DisplayText&gt;&lt;record&gt;&lt;rec-number&gt;33&lt;/rec-number&gt;&lt;foreign-keys&gt;&lt;key app="EN" db-id="mdae8500109496fea4aff9c086e16cc25895" timestamp="1793221649"&gt;33&lt;/key&gt;&lt;/foreign-keys&gt;&lt;ref-type name="Journal Article"&gt;17&lt;/ref-type&gt;&lt;contributors&gt;&lt;authors&gt;&lt;author&gt;Henzinger, T. A.&lt;/author&gt;&lt;author&gt;Horowitz, B.&lt;/author&gt;&lt;author&gt;Kirsch, C. M.&lt;/author&gt;&lt;/authors&gt;&lt;/contributors&gt;&lt;titles&gt;&lt;title&gt;Giotto: a time-triggered language for embedded programming&lt;/title&gt;&lt;secondary-title&gt;Proceedings of the IEEE&lt;/secondary-title&gt;&lt;alt-title&gt;Proc. IEEE&lt;/alt-title&gt;&lt;/titles&gt;&lt;periodical&gt;&lt;full-title&gt;Proceedings of the IEEE&lt;/full-title&gt;&lt;abbr-1&gt;Proc. IEEE&lt;/abbr-1&gt;&lt;/periodical&gt;&lt;pages&gt;84-99&lt;/pages&gt;&lt;volume&gt;91&lt;/volume&gt;&lt;number&gt;1&lt;/number&gt;&lt;dates&gt;&lt;year&gt;2003&lt;/year&gt;&lt;/dates&gt;&lt;publisher&gt;IEEE&lt;/publisher&gt;&lt;label&gt;henzinger2003&lt;/label&gt;&lt;urls&gt;&lt;/urls&gt;&lt;electronic-resource-num&gt;10.1109/JPROC.2002.805825&lt;/electronic-resource-num&gt;&lt;/record&gt;&lt;/Cite&gt;&lt;/EndNote&gt;</w:instrText>
       </w:r>
       <w:r>
         <w:fldChar w:fldCharType="separate"/>
@@ -3051,7 +3085,7 @@
         <w:fldChar w:fldCharType="begin"/>
       </w:r>
       <w:r>
-        <w:instrText xml:space="preserve"> ADDIN EN.CITE &lt;EndNote&gt;&lt;Cite&gt;&lt;Author&gt;Lohstroh&lt;/Author&gt;&lt;Year&gt;2021&lt;/Year&gt;&lt;RecNum&gt;53&lt;/RecNum&gt;&lt;DisplayText&gt;[55]&lt;/DisplayText&gt;&lt;record&gt;&lt;rec-number&gt;53&lt;/rec-number&gt;&lt;foreign-keys&gt;&lt;key app="EN" db-id="mdae8500109496fea4aff9c086e16cc25895" timestamp="1793221304"&gt;53&lt;/key&gt;&lt;/foreign-keys&gt;&lt;ref-type name="Journal Article"&gt;17&lt;/ref-type&gt;&lt;contributors&gt;&lt;authors&gt;&lt;author&gt;Lohstroh, Marten&lt;/author&gt;&lt;author&gt;Menard, Christian&lt;/author&gt;&lt;author&gt;Bateni, Soroush&lt;/author&gt;&lt;author&gt;Lee, Edward A.&lt;/author&gt;&lt;/authors&gt;&lt;/contributors&gt;&lt;titles&gt;&lt;title&gt;Toward a Lingua Franca for Deterministic Concurrent Systems&lt;/title&gt;&lt;secondary-title&gt;ACM Transactions on Embedded Computing Systems&lt;/secondary-title&gt;&lt;alt-title&gt;ACM Trans. Embed. Comput. Syst.&lt;/alt-title&gt;&lt;/titles&gt;&lt;periodical&gt;&lt;full-title&gt;ACM Transactions on Embedded Computing Systems&lt;/full-title&gt;&lt;abbr-1&gt;ACM Trans. Embed. Comput. Syst.&lt;/abbr-1&gt;&lt;/periodical&gt;&lt;pages&gt;1-27&lt;/pages&gt;&lt;volume&gt;20&lt;/volume&gt;&lt;number&gt;4&lt;/number&gt;&lt;dates&gt;&lt;year&gt;2021&lt;/year&gt;&lt;/dates&gt;&lt;publisher&gt;ACM&lt;/publisher&gt;&lt;label&gt;lohstroh2021&lt;/label&gt;&lt;urls&gt;&lt;/urls&gt;&lt;electronic-resource-num&gt;10.1145/3448128&lt;/electronic-resource-num&gt;&lt;/record&gt;&lt;/Cite&gt;&lt;/EndNote&gt;</w:instrText>
+        <w:instrText xml:space="preserve"> ADDIN EN.CITE &lt;EndNote&gt;&lt;Cite&gt;&lt;Author&gt;Lohstroh&lt;/Author&gt;&lt;Year&gt;2021&lt;/Year&gt;&lt;RecNum&gt;53&lt;/RecNum&gt;&lt;DisplayText&gt;[55]&lt;/DisplayText&gt;&lt;record&gt;&lt;rec-number&gt;53&lt;/rec-number&gt;&lt;foreign-keys&gt;&lt;key app="EN" db-id="mdae8500109496fea4aff9c086e16cc25895" timestamp="1793221649"&gt;53&lt;/key&gt;&lt;/foreign-keys&gt;&lt;ref-type name="Journal Article"&gt;17&lt;/ref-type&gt;&lt;contributors&gt;&lt;authors&gt;&lt;author&gt;Lohstroh, Marten&lt;/author&gt;&lt;author&gt;Menard, Christian&lt;/author&gt;&lt;author&gt;Bateni, Soroush&lt;/author&gt;&lt;author&gt;Lee, Edward A.&lt;/author&gt;&lt;/authors&gt;&lt;/contributors&gt;&lt;titles&gt;&lt;title&gt;Toward a Lingua Franca for Deterministic Concurrent Systems&lt;/title&gt;&lt;secondary-title&gt;ACM Transactions on Embedded Computing Systems&lt;/secondary-title&gt;&lt;alt-title&gt;ACM Trans. Embed. Comput. Syst.&lt;/alt-title&gt;&lt;/titles&gt;&lt;periodical&gt;&lt;full-title&gt;ACM Transactions on Embedded Computing Systems&lt;/full-title&gt;&lt;abbr-1&gt;ACM Trans. Embed. Comput. Syst.&lt;/abbr-1&gt;&lt;/periodical&gt;&lt;pages&gt;1-27&lt;/pages&gt;&lt;volume&gt;20&lt;/volume&gt;&lt;number&gt;4&lt;/number&gt;&lt;dates&gt;&lt;year&gt;2021&lt;/year&gt;&lt;/dates&gt;&lt;publisher&gt;ACM&lt;/publisher&gt;&lt;label&gt;lohstroh2021&lt;/label&gt;&lt;urls&gt;&lt;/urls&gt;&lt;electronic-resource-num&gt;10.1145/3448128&lt;/electronic-resource-num&gt;&lt;/record&gt;&lt;/Cite&gt;&lt;/EndNote&gt;</w:instrText>
       </w:r>
       <w:r>
         <w:fldChar w:fldCharType="separate"/>
@@ -6620,7 +6654,7 @@
         <w:fldChar w:fldCharType="begin"/>
       </w:r>
       <w:r>
-        <w:instrText xml:space="preserve"> ADDIN EN.CITE &lt;EndNote&gt;&lt;Cite&gt;&lt;Author&gt;Fujimoto&lt;/Author&gt;&lt;Year&gt;2000&lt;/Year&gt;&lt;RecNum&gt;25&lt;/RecNum&gt;&lt;DisplayText&gt;[20,33]&lt;/DisplayText&gt;&lt;record&gt;&lt;rec-number&gt;25&lt;/rec-number&gt;&lt;foreign-keys&gt;&lt;key app="EN" db-id="mdae8500109496fea4aff9c086e16cc25895" timestamp="1793221304"&gt;25&lt;/key&gt;&lt;/foreign-keys&gt;&lt;ref-type name="Book"&gt;6&lt;/ref-type&gt;&lt;contributors&gt;&lt;authors&gt;&lt;author&gt;Fujimoto, Richard M.&lt;/author&gt;&lt;/authors&gt;&lt;/contributors&gt;&lt;titles&gt;&lt;title&gt;Parallel and Distributed Simulation Systems&lt;/title&gt;&lt;secondary-title&gt;Wiley Series on Parallel and Distributed Computing&lt;/secondary-title&gt;&lt;/titles&gt;&lt;dates&gt;&lt;year&gt;2000&lt;/year&gt;&lt;/dates&gt;&lt;publisher&gt;John Wiley &amp;amp; Sons&lt;/publisher&gt;&lt;isbn&gt;978-0-471-18383-9&lt;/isbn&gt;&lt;label&gt;fujimoto2000&lt;/label&gt;&lt;urls&gt;&lt;/urls&gt;&lt;/record&gt;&lt;/Cite&gt;&lt;Cite&gt;&lt;Author&gt;Ofenloch&lt;/Author&gt;&lt;Year&gt;2022&lt;/Year&gt;&lt;RecNum&gt;62&lt;/RecNum&gt;&lt;record&gt;&lt;rec-number&gt;62&lt;/rec-number&gt;&lt;foreign-keys&gt;&lt;key app="EN" db-id="mdae8500109496fea4aff9c086e16cc25895" timestamp="1793221304"&gt;62&lt;/key&gt;&lt;/foreign-keys&gt;&lt;ref-type name="Conference Paper"&gt;47&lt;/ref-type&gt;&lt;contributors&gt;&lt;authors&gt;&lt;author&gt;Ofenloch, Annika&lt;/author&gt;&lt;author&gt;Schwarz, Jan Sören&lt;/author&gt;&lt;author&gt;Tolk, Deborah&lt;/author&gt;&lt;author&gt;Brandt, Tobias&lt;/author&gt;&lt;author&gt;Eilers, Reef&lt;/author&gt;&lt;author&gt;Ramirez, Rebeca&lt;/author&gt;&lt;author&gt;Raub, Thomas&lt;/author&gt;&lt;author&gt;Lehnhoff, Sebastian&lt;/author&gt;&lt;/authors&gt;&lt;/contributors&gt;&lt;titles&gt;&lt;title&gt;MOSAIK 3.0: Combining Time-Stepped and Discrete Event Simulation&lt;/title&gt;&lt;secondary-title&gt;2022 Open Source Modelling and Simulation of Energy Systems (OSMSES)&lt;/secondary-title&gt;&lt;/titles&gt;&lt;pages&gt;1-5&lt;/pages&gt;&lt;dates&gt;&lt;year&gt;2022&lt;/year&gt;&lt;/dates&gt;&lt;pub-location&gt;Aachen, Germany&lt;/pub-location&gt;&lt;publisher&gt;IEEE&lt;/publisher&gt;&lt;label&gt;ofenloch2022&lt;/label&gt;&lt;urls&gt;&lt;/urls&gt;&lt;electronic-resource-num&gt;10.1109/OSMSES54027.2022.9769116&lt;/electronic-resource-num&gt;&lt;/record&gt;&lt;/Cite&gt;&lt;/EndNote&gt;</w:instrText>
+        <w:instrText xml:space="preserve"> ADDIN EN.CITE &lt;EndNote&gt;&lt;Cite&gt;&lt;Author&gt;Fujimoto&lt;/Author&gt;&lt;Year&gt;2000&lt;/Year&gt;&lt;RecNum&gt;25&lt;/RecNum&gt;&lt;DisplayText&gt;[20,33]&lt;/DisplayText&gt;&lt;record&gt;&lt;rec-number&gt;25&lt;/rec-number&gt;&lt;foreign-keys&gt;&lt;key app="EN" db-id="mdae8500109496fea4aff9c086e16cc25895" timestamp="1793221649"&gt;25&lt;/key&gt;&lt;/foreign-keys&gt;&lt;ref-type name="Book"&gt;6&lt;/ref-type&gt;&lt;contributors&gt;&lt;authors&gt;&lt;author&gt;Fujimoto, Richard M.&lt;/author&gt;&lt;/authors&gt;&lt;/contributors&gt;&lt;titles&gt;&lt;title&gt;Parallel and Distributed Simulation Systems&lt;/title&gt;&lt;secondary-title&gt;Wiley Series on Parallel and Distributed Computing&lt;/secondary-title&gt;&lt;/titles&gt;&lt;dates&gt;&lt;year&gt;2000&lt;/year&gt;&lt;/dates&gt;&lt;publisher&gt;John Wiley &amp;amp; Sons&lt;/publisher&gt;&lt;isbn&gt;978-0-471-18383-9&lt;/isbn&gt;&lt;label&gt;fujimoto2000&lt;/label&gt;&lt;urls&gt;&lt;/urls&gt;&lt;/record&gt;&lt;/Cite&gt;&lt;Cite&gt;&lt;Author&gt;Ofenloch&lt;/Author&gt;&lt;Year&gt;2022&lt;/Year&gt;&lt;RecNum&gt;62&lt;/RecNum&gt;&lt;record&gt;&lt;rec-number&gt;62&lt;/rec-number&gt;&lt;foreign-keys&gt;&lt;key app="EN" db-id="mdae8500109496fea4aff9c086e16cc25895" timestamp="1793221649"&gt;62&lt;/key&gt;&lt;/foreign-keys&gt;&lt;ref-type name="Conference Paper"&gt;47&lt;/ref-type&gt;&lt;contributors&gt;&lt;authors&gt;&lt;author&gt;Ofenloch, Annika&lt;/author&gt;&lt;author&gt;Schwarz, Jan Sören&lt;/author&gt;&lt;author&gt;Tolk, Deborah&lt;/author&gt;&lt;author&gt;Brandt, Tobias&lt;/author&gt;&lt;author&gt;Eilers, Reef&lt;/author&gt;&lt;author&gt;Ramirez, Rebeca&lt;/author&gt;&lt;author&gt;Raub, Thomas&lt;/author&gt;&lt;author&gt;Lehnhoff, Sebastian&lt;/author&gt;&lt;/authors&gt;&lt;/contributors&gt;&lt;titles&gt;&lt;title&gt;MOSAIK 3.0: Combining Time-Stepped and Discrete Event Simulation&lt;/title&gt;&lt;secondary-title&gt;2022 Open Source Modelling and Simulation of Energy Systems (OSMSES)&lt;/secondary-title&gt;&lt;/titles&gt;&lt;pages&gt;1-5&lt;/pages&gt;&lt;dates&gt;&lt;year&gt;2022&lt;/year&gt;&lt;/dates&gt;&lt;pub-location&gt;Aachen, Germany&lt;/pub-location&gt;&lt;publisher&gt;IEEE&lt;/publisher&gt;&lt;label&gt;ofenloch2022&lt;/label&gt;&lt;urls&gt;&lt;/urls&gt;&lt;electronic-resource-num&gt;10.1109/OSMSES54027.2022.9769116&lt;/electronic-resource-num&gt;&lt;/record&gt;&lt;/Cite&gt;&lt;/EndNote&gt;</w:instrText>
       </w:r>
       <w:r>
         <w:fldChar w:fldCharType="separate"/>
@@ -6709,7 +6743,7 @@
         <w:fldChar w:fldCharType="begin"/>
       </w:r>
       <w:r>
-        <w:instrText xml:space="preserve"> ADDIN EN.CITE &lt;EndNote&gt;&lt;Cite&gt;&lt;Author&gt;OPC Foundation&lt;/Author&gt;&lt;Year&gt;2026&lt;/Year&gt;&lt;RecNum&gt;65&lt;/RecNum&gt;&lt;DisplayText&gt;[50,56]&lt;/DisplayText&gt;&lt;record&gt;&lt;rec-number&gt;65&lt;/rec-number&gt;&lt;foreign-keys&gt;&lt;key app="EN" db-id="mdae8500109496fea4aff9c086e16cc25895" timestamp="1793221304"&gt;65&lt;/key&gt;&lt;/foreign-keys&gt;&lt;ref-type name="Standard"&gt;58&lt;/ref-type&gt;&lt;contributors&gt;&lt;authors&gt;&lt;author&gt;OPC Foundation&lt;/author&gt;&lt;/authors&gt;&lt;/contributors&gt;&lt;titles&gt;&lt;title&gt;OPC Unified Architecture – Part 8: Data Access&lt;/title&gt;&lt;secondary-title&gt;OPC 10000-8, Release 1.05.07&lt;/secondary-title&gt;&lt;/titles&gt;&lt;dates&gt;&lt;year&gt;2026&lt;/year&gt;&lt;/dates&gt;&lt;label&gt;opcua_part8&lt;/label&gt;&lt;urls&gt;&lt;related-urls&gt;&lt;url&gt;https://reference.opcfoundation.org/specs/OPC-10000-8&lt;/url&gt;&lt;/related-urls&gt;&lt;/urls&gt;&lt;/record&gt;&lt;/Cite&gt;&lt;Cite&gt;&lt;Author&gt;International Electrotechnical Commission&lt;/Author&gt;&lt;Year&gt;2010&lt;/Year&gt;&lt;RecNum&gt;36&lt;/RecNum&gt;&lt;record&gt;&lt;rec-number&gt;36&lt;/rec-number&gt;&lt;foreign-keys&gt;&lt;key app="EN" db-id="mdae8500109496fea4aff9c086e16cc25895" timestamp="1793221304"&gt;36&lt;/key&gt;&lt;/foreign-keys&gt;&lt;ref-type name="Standard"&gt;58&lt;/ref-type&gt;&lt;contributors&gt;&lt;authors&gt;&lt;author&gt;International Electrotechnical Commission&lt;/author&gt;&lt;/authors&gt;&lt;/contributors&gt;&lt;titles&gt;&lt;title&gt;Communication networks and systems for power utility automation – Part 7-3: Basic communication structure – Common data classes&lt;/title&gt;&lt;secondary-title&gt;IEC 61850-7-3:2010, Edition 2.0&lt;/secondary-title&gt;&lt;/titles&gt;&lt;dates&gt;&lt;year&gt;2010&lt;/year&gt;&lt;/dates&gt;&lt;isbn&gt;978-2-88912-258-5&lt;/isbn&gt;&lt;label&gt;iec61850_7_3&lt;/label&gt;&lt;urls&gt;&lt;related-urls&gt;&lt;url&gt;https://webstore.iec.ch/en/publication/6016&lt;/url&gt;&lt;/related-urls&gt;&lt;/urls&gt;&lt;/record&gt;&lt;/Cite&gt;&lt;/EndNote&gt;</w:instrText>
+        <w:instrText xml:space="preserve"> ADDIN EN.CITE &lt;EndNote&gt;&lt;Cite&gt;&lt;Author&gt;OPC Foundation&lt;/Author&gt;&lt;Year&gt;2026&lt;/Year&gt;&lt;RecNum&gt;65&lt;/RecNum&gt;&lt;DisplayText&gt;[50,56]&lt;/DisplayText&gt;&lt;record&gt;&lt;rec-number&gt;65&lt;/rec-number&gt;&lt;foreign-keys&gt;&lt;key app="EN" db-id="mdae8500109496fea4aff9c086e16cc25895" timestamp="1793221649"&gt;65&lt;/key&gt;&lt;/foreign-keys&gt;&lt;ref-type name="Standard"&gt;58&lt;/ref-type&gt;&lt;contributors&gt;&lt;authors&gt;&lt;author&gt;OPC Foundation&lt;/author&gt;&lt;/authors&gt;&lt;/contributors&gt;&lt;titles&gt;&lt;title&gt;OPC Unified Architecture – Part 8: Data Access&lt;/title&gt;&lt;secondary-title&gt;OPC 10000-8, Release 1.05.07&lt;/secondary-title&gt;&lt;/titles&gt;&lt;dates&gt;&lt;year&gt;2026&lt;/year&gt;&lt;/dates&gt;&lt;label&gt;opcua_part8&lt;/label&gt;&lt;urls&gt;&lt;related-urls&gt;&lt;url&gt;https://reference.opcfoundation.org/specs/OPC-10000-8&lt;/url&gt;&lt;/related-urls&gt;&lt;/urls&gt;&lt;/record&gt;&lt;/Cite&gt;&lt;Cite&gt;&lt;Author&gt;International Electrotechnical Commission&lt;/Author&gt;&lt;Year&gt;2010&lt;/Year&gt;&lt;RecNum&gt;36&lt;/RecNum&gt;&lt;record&gt;&lt;rec-number&gt;36&lt;/rec-number&gt;&lt;foreign-keys&gt;&lt;key app="EN" db-id="mdae8500109496fea4aff9c086e16cc25895" timestamp="1793221649"&gt;36&lt;/key&gt;&lt;/foreign-keys&gt;&lt;ref-type name="Standard"&gt;58&lt;/ref-type&gt;&lt;contributors&gt;&lt;authors&gt;&lt;author&gt;International Electrotechnical Commission&lt;/author&gt;&lt;/authors&gt;&lt;/contributors&gt;&lt;titles&gt;&lt;title&gt;Communication networks and systems for power utility automation – Part 7-3: Basic communication structure – Common data classes&lt;/title&gt;&lt;secondary-title&gt;IEC 61850-7-3:2010, Edition 2.0&lt;/secondary-title&gt;&lt;/titles&gt;&lt;dates&gt;&lt;year&gt;2010&lt;/year&gt;&lt;/dates&gt;&lt;isbn&gt;978-2-88912-258-5&lt;/isbn&gt;&lt;label&gt;iec61850_7_3&lt;/label&gt;&lt;urls&gt;&lt;related-urls&gt;&lt;url&gt;https://webstore.iec.ch/en/publication/6016&lt;/url&gt;&lt;/related-urls&gt;&lt;/urls&gt;&lt;/record&gt;&lt;/Cite&gt;&lt;/EndNote&gt;</w:instrText>
       </w:r>
       <w:r>
         <w:fldChar w:fldCharType="separate"/>
@@ -6745,7 +6779,7 @@
         <w:fldChar w:fldCharType="begin"/>
       </w:r>
       <w:r>
-        <w:instrText xml:space="preserve"> ADDIN EN.CITE &lt;EndNote&gt;&lt;Cite&gt;&lt;Author&gt;Chen&lt;/Author&gt;&lt;Year&gt;2015&lt;/Year&gt;&lt;RecNum&gt;12&lt;/RecNum&gt;&lt;DisplayText&gt;[34,52]&lt;/DisplayText&gt;&lt;record&gt;&lt;rec-number&gt;12&lt;/rec-number&gt;&lt;foreign-keys&gt;&lt;key app="EN" db-id="mdae8500109496fea4aff9c086e16cc25895" timestamp="1793221304"&gt;12&lt;/key&gt;&lt;/foreign-keys&gt;&lt;ref-type name="Journal Article"&gt;17&lt;/ref-type&gt;&lt;contributors&gt;&lt;authors&gt;&lt;author&gt;Chen, Yunji&lt;/author&gt;&lt;author&gt;Zhang, Shijin&lt;/author&gt;&lt;author&gt;Guo, Qi&lt;/author&gt;&lt;author&gt;Li, Ling&lt;/author&gt;&lt;author&gt;Wu, Ruiyang&lt;/author&gt;&lt;author&gt;Chen, Tianshi&lt;/author&gt;&lt;/authors&gt;&lt;/contributors&gt;&lt;titles&gt;&lt;title&gt;Deterministic Replay: A Survey&lt;/title&gt;&lt;secondary-title&gt;ACM Computing Surveys&lt;/secondary-title&gt;&lt;alt-title&gt;ACM Comput. Surv.&lt;/alt-title&gt;&lt;/titles&gt;&lt;periodical&gt;&lt;full-title&gt;ACM Computing Surveys&lt;/full-title&gt;&lt;abbr-1&gt;ACM Comput. Surv.&lt;/abbr-1&gt;&lt;/periodical&gt;&lt;pages&gt;1-47&lt;/pages&gt;&lt;volume&gt;48&lt;/volume&gt;&lt;number&gt;2&lt;/number&gt;&lt;dates&gt;&lt;year&gt;2015&lt;/year&gt;&lt;/dates&gt;&lt;publisher&gt;ACM&lt;/publisher&gt;&lt;label&gt;chen2015replay&lt;/label&gt;&lt;urls&gt;&lt;/urls&gt;&lt;electronic-resource-num&gt;10.1145/2790077&lt;/electronic-resource-num&gt;&lt;/record&gt;&lt;/Cite&gt;&lt;Cite&gt;&lt;Author&gt;HELICS developers (GMLC-TDC)&lt;/Author&gt;&lt;Year&gt;2026&lt;/Year&gt;&lt;RecNum&gt;31&lt;/RecNum&gt;&lt;record&gt;&lt;rec-number&gt;31&lt;/rec-number&gt;&lt;foreign-keys&gt;&lt;key app="EN" db-id="mdae8500109496fea4aff9c086e16cc25895" timestamp="1793221304"&gt;31&lt;/key&gt;&lt;/foreign-keys&gt;&lt;ref-type name="Web Page"&gt;12&lt;/ref-type&gt;&lt;contributors&gt;&lt;authors&gt;&lt;author&gt;HELICS developers (GMLC-TDC)&lt;/author&gt;&lt;/authors&gt;&lt;/contributors&gt;&lt;titles&gt;&lt;title&gt;HELICS documentation&lt;/title&gt;&lt;/titles&gt;&lt;dates&gt;&lt;year&gt;2026&lt;/year&gt;&lt;/dates&gt;&lt;label&gt;helics_docs&lt;/label&gt;&lt;urls&gt;&lt;related-urls&gt;&lt;url&gt;https://docs.helics.org/en/latest/&lt;/url&gt;&lt;/related-urls&gt;&lt;/urls&gt;&lt;access-date&gt;2026-10-28&lt;/access-date&gt;&lt;/record&gt;&lt;/Cite&gt;&lt;/EndNote&gt;</w:instrText>
+        <w:instrText xml:space="preserve"> ADDIN EN.CITE &lt;EndNote&gt;&lt;Cite&gt;&lt;Author&gt;Chen&lt;/Author&gt;&lt;Year&gt;2015&lt;/Year&gt;&lt;RecNum&gt;12&lt;/RecNum&gt;&lt;DisplayText&gt;[34,52]&lt;/DisplayText&gt;&lt;record&gt;&lt;rec-number&gt;12&lt;/rec-number&gt;&lt;foreign-keys&gt;&lt;key app="EN" db-id="mdae8500109496fea4aff9c086e16cc25895" timestamp="1793221649"&gt;12&lt;/key&gt;&lt;/foreign-keys&gt;&lt;ref-type name="Journal Article"&gt;17&lt;/ref-type&gt;&lt;contributors&gt;&lt;authors&gt;&lt;author&gt;Chen, Yunji&lt;/author&gt;&lt;author&gt;Zhang, Shijin&lt;/author&gt;&lt;author&gt;Guo, Qi&lt;/author&gt;&lt;author&gt;Li, Ling&lt;/author&gt;&lt;author&gt;Wu, Ruiyang&lt;/author&gt;&lt;author&gt;Chen, Tianshi&lt;/author&gt;&lt;/authors&gt;&lt;/contributors&gt;&lt;titles&gt;&lt;title&gt;Deterministic Replay: A Survey&lt;/title&gt;&lt;secondary-title&gt;ACM Computing Surveys&lt;/secondary-title&gt;&lt;alt-title&gt;ACM Comput. Surv.&lt;/alt-title&gt;&lt;/titles&gt;&lt;periodical&gt;&lt;full-title&gt;ACM Computing Surveys&lt;/full-title&gt;&lt;abbr-1&gt;ACM Comput. Surv.&lt;/abbr-1&gt;&lt;/periodical&gt;&lt;pages&gt;1-47&lt;/pages&gt;&lt;volume&gt;48&lt;/volume&gt;&lt;number&gt;2&lt;/number&gt;&lt;dates&gt;&lt;year&gt;2015&lt;/year&gt;&lt;/dates&gt;&lt;publisher&gt;ACM&lt;/publisher&gt;&lt;label&gt;chen2015replay&lt;/label&gt;&lt;urls&gt;&lt;/urls&gt;&lt;electronic-resource-num&gt;10.1145/2790077&lt;/electronic-resource-num&gt;&lt;/record&gt;&lt;/Cite&gt;&lt;Cite&gt;&lt;Author&gt;HELICS developers (GMLC-TDC)&lt;/Author&gt;&lt;Year&gt;2026&lt;/Year&gt;&lt;RecNum&gt;31&lt;/RecNum&gt;&lt;record&gt;&lt;rec-number&gt;31&lt;/rec-number&gt;&lt;foreign-keys&gt;&lt;key app="EN" db-id="mdae8500109496fea4aff9c086e16cc25895" timestamp="1793221649"&gt;31&lt;/key&gt;&lt;/foreign-keys&gt;&lt;ref-type name="Web Page"&gt;12&lt;/ref-type&gt;&lt;contributors&gt;&lt;authors&gt;&lt;author&gt;HELICS developers (GMLC-TDC)&lt;/author&gt;&lt;/authors&gt;&lt;/contributors&gt;&lt;titles&gt;&lt;title&gt;HELICS documentation&lt;/title&gt;&lt;/titles&gt;&lt;dates&gt;&lt;year&gt;2026&lt;/year&gt;&lt;/dates&gt;&lt;label&gt;helics_docs&lt;/label&gt;&lt;urls&gt;&lt;related-urls&gt;&lt;url&gt;https://docs.helics.org/en/latest/&lt;/url&gt;&lt;/related-urls&gt;&lt;/urls&gt;&lt;access-date&gt;2026-10-28&lt;/access-date&gt;&lt;/record&gt;&lt;/Cite&gt;&lt;/EndNote&gt;</w:instrText>
       </w:r>
       <w:r>
         <w:fldChar w:fldCharType="separate"/>
@@ -6781,7 +6815,7 @@
         <w:fldChar w:fldCharType="begin"/>
       </w:r>
       <w:r>
-        <w:instrText xml:space="preserve"> ADDIN EN.CITE &lt;EndNote&gt;&lt;Cite&gt;&lt;Author&gt;Moreau&lt;/Author&gt;&lt;Year&gt;2013&lt;/Year&gt;&lt;RecNum&gt;55&lt;/RecNum&gt;&lt;DisplayText&gt;[51]&lt;/DisplayText&gt;&lt;record&gt;&lt;rec-number&gt;55&lt;/rec-number&gt;&lt;foreign-keys&gt;&lt;key app="EN" db-id="mdae8500109496fea4aff9c086e16cc25895" timestamp="1793221304"&gt;55&lt;/key&gt;&lt;/foreign-keys&gt;&lt;ref-type name="Standard"&gt;58&lt;/ref-type&gt;&lt;contributors&gt;&lt;authors&gt;&lt;author&gt;Moreau, Luc&lt;/author&gt;&lt;author&gt;Missier, Paolo&lt;/author&gt;&lt;/authors&gt;&lt;/contributors&gt;&lt;titles&gt;&lt;title&gt;PROV-DM: The PROV Data Model&lt;/title&gt;&lt;secondary-title&gt;W3C Recommendation&lt;/secondary-title&gt;&lt;/titles&gt;&lt;dates&gt;&lt;year&gt;2013&lt;/year&gt;&lt;/dates&gt;&lt;publisher&gt;World Wide Web Consortium (W3C)&lt;/publisher&gt;&lt;label&gt;moreau2013prov&lt;/label&gt;&lt;urls&gt;&lt;related-urls&gt;&lt;url&gt;https://www.w3.org/TR/2013/REC-prov-dm-20130430/&lt;/url&gt;&lt;/related-urls&gt;&lt;/urls&gt;&lt;/record&gt;&lt;/Cite&gt;&lt;/EndNote&gt;</w:instrText>
+        <w:instrText xml:space="preserve"> ADDIN EN.CITE &lt;EndNote&gt;&lt;Cite&gt;&lt;Author&gt;Moreau&lt;/Author&gt;&lt;Year&gt;2013&lt;/Year&gt;&lt;RecNum&gt;55&lt;/RecNum&gt;&lt;DisplayText&gt;[51]&lt;/DisplayText&gt;&lt;record&gt;&lt;rec-number&gt;55&lt;/rec-number&gt;&lt;foreign-keys&gt;&lt;key app="EN" db-id="mdae8500109496fea4aff9c086e16cc25895" timestamp="1793221649"&gt;55&lt;/key&gt;&lt;/foreign-keys&gt;&lt;ref-type name="Standard"&gt;58&lt;/ref-type&gt;&lt;contributors&gt;&lt;authors&gt;&lt;author&gt;Moreau, Luc&lt;/author&gt;&lt;author&gt;Missier, Paolo&lt;/author&gt;&lt;/authors&gt;&lt;/contributors&gt;&lt;titles&gt;&lt;title&gt;PROV-DM: The PROV Data Model&lt;/title&gt;&lt;secondary-title&gt;W3C Recommendation&lt;/secondary-title&gt;&lt;/titles&gt;&lt;dates&gt;&lt;year&gt;2013&lt;/year&gt;&lt;/dates&gt;&lt;publisher&gt;World Wide Web Consortium (W3C)&lt;/publisher&gt;&lt;label&gt;moreau2013prov&lt;/label&gt;&lt;urls&gt;&lt;related-urls&gt;&lt;url&gt;https://www.w3.org/TR/2013/REC-prov-dm-20130430/&lt;/url&gt;&lt;/related-urls&gt;&lt;/urls&gt;&lt;/record&gt;&lt;/Cite&gt;&lt;/EndNote&gt;</w:instrText>
       </w:r>
       <w:r>
         <w:fldChar w:fldCharType="separate"/>
@@ -6933,7 +6967,7 @@
 PjxSZWNOdW0+MzM8L1JlY051bT48RGlzcGxheVRleHQ+WzU0LDU1XTwvRGlzcGxheVRleHQ+PHJl
 Y29yZD48cmVjLW51bWJlcj4zMzwvcmVjLW51bWJlcj48Zm9yZWlnbi1rZXlzPjxrZXkgYXBwPSJF
 TiIgZGItaWQ9Im1kYWU4NTAwMTA5NDk2ZmVhNGFmZjljMDg2ZTE2Y2MyNTg5NSIgdGltZXN0YW1w
-PSIxNzkzMjIxMzA0Ij4zMzwva2V5PjwvZm9yZWlnbi1rZXlzPjxyZWYtdHlwZSBuYW1lPSJKb3Vy
+PSIxNzkzMjIxNjQ5Ij4zMzwva2V5PjwvZm9yZWlnbi1rZXlzPjxyZWYtdHlwZSBuYW1lPSJKb3Vy
 bmFsIEFydGljbGUiPjE3PC9yZWYtdHlwZT48Y29udHJpYnV0b3JzPjxhdXRob3JzPjxhdXRob3I+
 SGVuemluZ2VyLCBULiBBLjwvYXV0aG9yPjxhdXRob3I+SG9yb3dpdHosIEIuPC9hdXRob3I+PGF1
 dGhvcj5LaXJzY2gsIEMuIE0uPC9hdXRob3I+PC9hdXRob3JzPjwvY29udHJpYnV0b3JzPjx0aXRs
@@ -6949,7 +6983,7 @@
 Y29yZD48L0NpdGU+PENpdGU+PEF1dGhvcj5Mb2hzdHJvaDwvQXV0aG9yPjxZZWFyPjIwMjE8L1ll
 YXI+PFJlY051bT41MzwvUmVjTnVtPjxyZWNvcmQ+PHJlYy1udW1iZXI+NTM8L3JlYy1udW1iZXI+
 PGZvcmVpZ24ta2V5cz48a2V5IGFwcD0iRU4iIGRiLWlkPSJtZGFlODUwMDEwOTQ5NmZlYTRhZmY5
-YzA4NmUxNmNjMjU4OTUiIHRpbWVzdGFtcD0iMTc5MzIyMTMwNCI+NTM8L2tleT48L2ZvcmVpZ24t
+YzA4NmUxNmNjMjU4OTUiIHRpbWVzdGFtcD0iMTc5MzIyMTY0OSI+NTM8L2tleT48L2ZvcmVpZ24t
 a2V5cz48cmVmLXR5cGUgbmFtZT0iSm91cm5hbCBBcnRpY2xlIj4xNzwvcmVmLXR5cGU+PGNvbnRy
 aWJ1dG9ycz48YXV0aG9ycz48YXV0aG9yPkxvaHN0cm9oLCBNYXJ0ZW48L2F1dGhvcj48YXV0aG9y
 Pk1lbmFyZCwgQ2hyaXN0aWFuPC9hdXRob3I+PGF1dGhvcj5CYXRlbmksIFNvcm91c2g8L2F1dGhv
@@ -6976,7 +7010,7 @@
 PjxSZWNOdW0+MzM8L1JlY051bT48RGlzcGxheVRleHQ+WzU0LDU1XTwvRGlzcGxheVRleHQ+PHJl
 Y29yZD48cmVjLW51bWJlcj4zMzwvcmVjLW51bWJlcj48Zm9yZWlnbi1rZXlzPjxrZXkgYXBwPSJF
 TiIgZGItaWQ9Im1kYWU4NTAwMTA5NDk2ZmVhNGFmZjljMDg2ZTE2Y2MyNTg5NSIgdGltZXN0YW1w
-PSIxNzkzMjIxMzA0Ij4zMzwva2V5PjwvZm9yZWlnbi1rZXlzPjxyZWYtdHlwZSBuYW1lPSJKb3Vy
+PSIxNzkzMjIxNjQ5Ij4zMzwva2V5PjwvZm9yZWlnbi1rZXlzPjxyZWYtdHlwZSBuYW1lPSJKb3Vy
 bmFsIEFydGljbGUiPjE3PC9yZWYtdHlwZT48Y29udHJpYnV0b3JzPjxhdXRob3JzPjxhdXRob3I+
 SGVuemluZ2VyLCBULiBBLjwvYXV0aG9yPjxhdXRob3I+SG9yb3dpdHosIEIuPC9hdXRob3I+PGF1
 dGhvcj5LaXJzY2gsIEMuIE0uPC9hdXRob3I+PC9hdXRob3JzPjwvY29udHJpYnV0b3JzPjx0aXRs
@@ -6992,7 +7026,7 @@
 Y29yZD48L0NpdGU+PENpdGU+PEF1dGhvcj5Mb2hzdHJvaDwvQXV0aG9yPjxZZWFyPjIwMjE8L1ll
 YXI+PFJlY051bT41MzwvUmVjTnVtPjxyZWNvcmQ+PHJlYy1udW1iZXI+NTM8L3JlYy1udW1iZXI+
 PGZvcmVpZ24ta2V5cz48a2V5IGFwcD0iRU4iIGRiLWlkPSJtZGFlODUwMDEwOTQ5NmZlYTRhZmY5
-YzA4NmUxNmNjMjU4OTUiIHRpbWVzdGFtcD0iMTc5MzIyMTMwNCI+NTM8L2tleT48L2ZvcmVpZ24t
+YzA4NmUxNmNjMjU4OTUiIHRpbWVzdGFtcD0iMTc5MzIyMTY0OSI+NTM8L2tleT48L2ZvcmVpZ24t
 a2V5cz48cmVmLXR5cGUgbmFtZT0iSm91cm5hbCBBcnRpY2xlIj4xNzwvcmVmLXR5cGU+PGNvbnRy
 aWJ1dG9ycz48YXV0aG9ycz48YXV0aG9yPkxvaHN0cm9oLCBNYXJ0ZW48L2F1dGhvcj48YXV0aG9y
 Pk1lbmFyZCwgQ2hyaXN0aWFuPC9hdXRob3I+PGF1dGhvcj5CYXRlbmksIFNvcm91c2g8L2F1dGhv
@@ -7138,7 +7172,7 @@
         <w:fldChar w:fldCharType="begin"/>
       </w:r>
       <w:r>
-        <w:instrText xml:space="preserve"> ADDIN EN.CITE &lt;EndNote&gt;&lt;Cite&gt;&lt;Author&gt;U.S. Department of Energy&lt;/Author&gt;&lt;Year&gt;2024&lt;/Year&gt;&lt;RecNum&gt;20&lt;/RecNum&gt;&lt;DisplayText&gt;[21]&lt;/DisplayText&gt;&lt;record&gt;&lt;rec-number&gt;20&lt;/rec-number&gt;&lt;foreign-keys&gt;&lt;key app="EN" db-id="mdae8500109496fea4aff9c086e16cc25895" timestamp="1793221304"&gt;20&lt;/key&gt;&lt;/foreign-keys&gt;&lt;ref-type name="Web Page"&gt;12&lt;/ref-type&gt;&lt;contributors&gt;&lt;authors&gt;&lt;author&gt;U.S. Department of Energy&lt;/author&gt;&lt;/authors&gt;&lt;/contributors&gt;&lt;titles&gt;&lt;title&gt;EnergyPlus Output Details and Examples: eplusout.rdd&lt;/title&gt;&lt;/titles&gt;&lt;dates&gt;&lt;year&gt;2024&lt;/year&gt;&lt;/dates&gt;&lt;label&gt;doe2024rdd&lt;/label&gt;&lt;urls&gt;&lt;related-urls&gt;&lt;url&gt;https://bigladdersoftware.com/epx/docs/24-1/output-details-and-examples/eplusout-rdd.html&lt;/url&gt;&lt;/related-urls&gt;&lt;/urls&gt;&lt;access-date&gt;2026-10-28&lt;/access-date&gt;&lt;/record&gt;&lt;/Cite&gt;&lt;/EndNote&gt;</w:instrText>
+        <w:instrText xml:space="preserve"> ADDIN EN.CITE &lt;EndNote&gt;&lt;Cite&gt;&lt;Author&gt;U.S. Department of Energy&lt;/Author&gt;&lt;Year&gt;2024&lt;/Year&gt;&lt;RecNum&gt;20&lt;/RecNum&gt;&lt;DisplayText&gt;[21]&lt;/DisplayText&gt;&lt;record&gt;&lt;rec-number&gt;20&lt;/rec-number&gt;&lt;foreign-keys&gt;&lt;key app="EN" db-id="mdae8500109496fea4aff9c086e16cc25895" timestamp="1793221649"&gt;20&lt;/key&gt;&lt;/foreign-keys&gt;&lt;ref-type name="Web Page"&gt;12&lt;/ref-type&gt;&lt;contributors&gt;&lt;authors&gt;&lt;author&gt;U.S. Department of Energy&lt;/author&gt;&lt;/authors&gt;&lt;/contributors&gt;&lt;titles&gt;&lt;title&gt;EnergyPlus Output Details and Examples: eplusout.rdd&lt;/title&gt;&lt;/titles&gt;&lt;dates&gt;&lt;year&gt;2024&lt;/year&gt;&lt;/dates&gt;&lt;label&gt;doe2024rdd&lt;/label&gt;&lt;urls&gt;&lt;related-urls&gt;&lt;url&gt;https://bigladdersoftware.com/epx/docs/24-1/output-details-and-examples/eplusout-rdd.html&lt;/url&gt;&lt;/related-urls&gt;&lt;/urls&gt;&lt;access-date&gt;2026-10-28&lt;/access-date&gt;&lt;/record&gt;&lt;/Cite&gt;&lt;/EndNote&gt;</w:instrText>
       </w:r>
       <w:r>
         <w:fldChar w:fldCharType="separate"/>
@@ -7167,7 +7201,7 @@
         <w:fldChar w:fldCharType="begin"/>
       </w:r>
       <w:r>
-        <w:instrText xml:space="preserve"> ADDIN EN.CITE &lt;EndNote&gt;&lt;Cite&gt;&lt;Author&gt;U.S. Department of Energy&lt;/Author&gt;&lt;Year&gt;2018&lt;/Year&gt;&lt;RecNum&gt;18&lt;/RecNum&gt;&lt;DisplayText&gt;[39,40]&lt;/DisplayText&gt;&lt;record&gt;&lt;rec-number&gt;18&lt;/rec-number&gt;&lt;foreign-keys&gt;&lt;key app="EN" db-id="mdae8500109496fea4aff9c086e16cc25895" timestamp="1793221304"&gt;18&lt;/key&gt;&lt;/foreign-keys&gt;&lt;ref-type name="Web Page"&gt;12&lt;/ref-type&gt;&lt;contributors&gt;&lt;authors&gt;&lt;author&gt;U.S. Department of Energy&lt;/author&gt;&lt;/authors&gt;&lt;/contributors&gt;&lt;titles&gt;&lt;title&gt;EnergyPlus External Interface(s) Application Guide: BCVTB Examples&lt;/title&gt;&lt;/titles&gt;&lt;dates&gt;&lt;year&gt;2018&lt;/year&gt;&lt;/dates&gt;&lt;label&gt;doe_extif&lt;/label&gt;&lt;urls&gt;&lt;related-urls&gt;&lt;url&gt;https://bigladdersoftware.com/epx/docs/9-0/external-interfaces-application-guide/bcvtb-examples.html&lt;/url&gt;&lt;/related-urls&gt;&lt;/urls&gt;&lt;access-date&gt;2026-10-28&lt;/access-date&gt;&lt;/record&gt;&lt;/Cite&gt;&lt;Cite&gt;&lt;Author&gt;Lawrence Berkeley National Laboratory&lt;/Author&gt;&lt;Year&gt;2021&lt;/Year&gt;&lt;RecNum&gt;48&lt;/RecNum&gt;&lt;record&gt;&lt;rec-number&gt;48&lt;/rec-number&gt;&lt;foreign-keys&gt;&lt;key app="EN" db-id="mdae8500109496fea4aff9c086e16cc25895" timestamp="1793221304"&gt;48&lt;/key&gt;&lt;/foreign-keys&gt;&lt;ref-type name="Web Page"&gt;12&lt;/ref-type&gt;&lt;contributors&gt;&lt;authors&gt;&lt;author&gt;Lawrence Berkeley National Laboratory&lt;/author&gt;&lt;/authors&gt;&lt;/contributors&gt;&lt;titles&gt;&lt;title&gt;FMU Export of EnergyPlus User Guide, Section 5: Usage of EnergyPlus as an FMU&lt;/title&gt;&lt;/titles&gt;&lt;dates&gt;&lt;year&gt;2021&lt;/year&gt;&lt;/dates&gt;&lt;label&gt;lbnl_fmuexport&lt;/label&gt;&lt;urls&gt;&lt;related-urls&gt;&lt;url&gt;https://simulationresearch.lbl.gov/fmu/EnergyPlus/export/userGuide/usage.html&lt;/url&gt;&lt;/related-urls&gt;&lt;/urls&gt;&lt;access-date&gt;2026-10-28&lt;/access-date&gt;&lt;/record&gt;&lt;/Cite&gt;&lt;/EndNote&gt;</w:instrText>
+        <w:instrText xml:space="preserve"> ADDIN EN.CITE &lt;EndNote&gt;&lt;Cite&gt;&lt;Author&gt;U.S. Department of Energy&lt;/Author&gt;&lt;Year&gt;2018&lt;/Year&gt;&lt;RecNum&gt;18&lt;/RecNum&gt;&lt;DisplayText&gt;[39,40]&lt;/DisplayText&gt;&lt;record&gt;&lt;rec-number&gt;18&lt;/rec-number&gt;&lt;foreign-keys&gt;&lt;key app="EN" db-id="mdae8500109496fea4aff9c086e16cc25895" timestamp="1793221649"&gt;18&lt;/key&gt;&lt;/foreign-keys&gt;&lt;ref-type name="Web Page"&gt;12&lt;/ref-type&gt;&lt;contributors&gt;&lt;authors&gt;&lt;author&gt;U.S. Department of Energy&lt;/author&gt;&lt;/authors&gt;&lt;/contributors&gt;&lt;titles&gt;&lt;title&gt;EnergyPlus External Interface(s) Application Guide: BCVTB Examples&lt;/title&gt;&lt;/titles&gt;&lt;dates&gt;&lt;year&gt;2018&lt;/year&gt;&lt;/dates&gt;&lt;label&gt;doe_extif&lt;/label&gt;&lt;urls&gt;&lt;related-urls&gt;&lt;url&gt;https://bigladdersoftware.com/epx/docs/9-0/external-interfaces-application-guide/bcvtb-examples.html&lt;/url&gt;&lt;/related-urls&gt;&lt;/urls&gt;&lt;access-date&gt;2026-10-28&lt;/access-date&gt;&lt;/record&gt;&lt;/Cite&gt;&lt;Cite&gt;&lt;Author&gt;Lawrence Berkeley National Laboratory&lt;/Author&gt;&lt;Year&gt;2021&lt;/Year&gt;&lt;RecNum&gt;48&lt;/RecNum&gt;&lt;record&gt;&lt;rec-number&gt;48&lt;/rec-number&gt;&lt;foreign-keys&gt;&lt;key app="EN" db-id="mdae8500109496fea4aff9c086e16cc25895" timestamp="1793221649"&gt;48&lt;/key&gt;&lt;/foreign-keys&gt;&lt;ref-type name="Web Page"&gt;12&lt;/ref-type&gt;&lt;contributors&gt;&lt;authors&gt;&lt;author&gt;Lawrence Berkeley National Laboratory&lt;/author&gt;&lt;/authors&gt;&lt;/contributors&gt;&lt;titles&gt;&lt;title&gt;FMU Export of EnergyPlus User Guide, Section 5: Usage of EnergyPlus as an FMU&lt;/title&gt;&lt;/titles&gt;&lt;dates&gt;&lt;year&gt;2021&lt;/year&gt;&lt;/dates&gt;&lt;label&gt;lbnl_fmuexport&lt;/label&gt;&lt;urls&gt;&lt;related-urls&gt;&lt;url&gt;https://simulationresearch.lbl.gov/fmu/EnergyPlus/export/userGuide/usage.html&lt;/url&gt;&lt;/related-urls&gt;&lt;/urls&gt;&lt;access-date&gt;2026-10-28&lt;/access-date&gt;&lt;/record&gt;&lt;/Cite&gt;&lt;/EndNote&gt;</w:instrText>
       </w:r>
       <w:r>
         <w:fldChar w:fldCharType="separate"/>
@@ -7215,7 +7249,7 @@
         <w:fldChar w:fldCharType="begin"/>
       </w:r>
       <w:r>
-        <w:instrText xml:space="preserve"> ADDIN EN.CITE &lt;EndNote&gt;&lt;Cite&gt;&lt;Author&gt;Dobos&lt;/Author&gt;&lt;Year&gt;2014&lt;/Year&gt;&lt;RecNum&gt;17&lt;/RecNum&gt;&lt;DisplayText&gt;[57]&lt;/DisplayText&gt;&lt;record&gt;&lt;rec-number&gt;17&lt;/rec-number&gt;&lt;foreign-keys&gt;&lt;key app="EN" db-id="mdae8500109496fea4aff9c086e16cc25895" timestamp="1793221304"&gt;17&lt;/key&gt;&lt;/foreign-keys&gt;&lt;ref-type name="Report"&gt;27&lt;/ref-type&gt;&lt;contributors&gt;&lt;authors&gt;&lt;author&gt;Dobos, A. P.&lt;/author&gt;&lt;/authors&gt;&lt;/contributors&gt;&lt;titles&gt;&lt;title&gt;PVWatts Version 5 Manual&lt;/title&gt;&lt;/titles&gt;&lt;dates&gt;&lt;year&gt;2014&lt;/year&gt;&lt;/dates&gt;&lt;pub-location&gt;Golden, CO&lt;/pub-location&gt;&lt;publisher&gt;National Renewable Energy Laboratory&lt;/publisher&gt;&lt;isbn&gt;NREL/TP-6A20-62641&lt;/isbn&gt;&lt;label&gt;dobos2014&lt;/label&gt;&lt;work-type&gt;Technical Report&lt;/work-type&gt;&lt;urls&gt;&lt;/urls&gt;&lt;electronic-resource-num&gt;10.2172/1158421&lt;/electronic-resource-num&gt;&lt;/record&gt;&lt;/Cite&gt;&lt;/EndNote&gt;</w:instrText>
+        <w:instrText xml:space="preserve"> ADDIN EN.CITE &lt;EndNote&gt;&lt;Cite&gt;&lt;Author&gt;Dobos&lt;/Author&gt;&lt;Year&gt;2014&lt;/Year&gt;&lt;RecNum&gt;17&lt;/RecNum&gt;&lt;DisplayText&gt;[57]&lt;/DisplayText&gt;&lt;record&gt;&lt;rec-number&gt;17&lt;/rec-number&gt;&lt;foreign-keys&gt;&lt;key app="EN" db-id="mdae8500109496fea4aff9c086e16cc25895" timestamp="1793221649"&gt;17&lt;/key&gt;&lt;/foreign-keys&gt;&lt;ref-type name="Report"&gt;27&lt;/ref-type&gt;&lt;contributors&gt;&lt;authors&gt;&lt;author&gt;Dobos, A. P.&lt;/author&gt;&lt;/authors&gt;&lt;/contributors&gt;&lt;titles&gt;&lt;title&gt;PVWatts Version 5 Manual&lt;/title&gt;&lt;/titles&gt;&lt;dates&gt;&lt;year&gt;2014&lt;/year&gt;&lt;/dates&gt;&lt;pub-location&gt;Golden, CO&lt;/pub-location&gt;&lt;publisher&gt;National Renewable Energy Laboratory&lt;/publisher&gt;&lt;isbn&gt;NREL/TP-6A20-62641&lt;/isbn&gt;&lt;label&gt;dobos2014&lt;/label&gt;&lt;work-type&gt;Technical Report&lt;/work-type&gt;&lt;urls&gt;&lt;/urls&gt;&lt;electronic-resource-num&gt;10.2172/1158421&lt;/electronic-resource-num&gt;&lt;/record&gt;&lt;/Cite&gt;&lt;/EndNote&gt;</w:instrText>
       </w:r>
       <w:r>
         <w:fldChar w:fldCharType="separate"/>
@@ -7236,7 +7270,7 @@
         <w:fldChar w:fldCharType="begin"/>
       </w:r>
       <w:r>
-        <w:instrText xml:space="preserve"> ADDIN EN.CITE &lt;EndNote&gt;&lt;Cite&gt;&lt;Author&gt;Federal Highway Administration&lt;/Author&gt;&lt;Year&gt;2017&lt;/Year&gt;&lt;RecNum&gt;22&lt;/RecNum&gt;&lt;DisplayText&gt;[58]&lt;/DisplayText&gt;&lt;record&gt;&lt;rec-number&gt;22&lt;/rec-number&gt;&lt;foreign-keys&gt;&lt;key app="EN" db-id="mdae8500109496fea4aff9c086e16cc25895" timestamp="1793221304"&gt;22&lt;/key&gt;&lt;/foreign-keys&gt;&lt;ref-type name="Web Page"&gt;12&lt;/ref-type&gt;&lt;contributors&gt;&lt;authors&gt;&lt;author&gt;Federal Highway Administration&lt;/author&gt;&lt;/authors&gt;&lt;/contributors&gt;&lt;titles&gt;&lt;title&gt;2017 National Household Travel Survey&lt;/title&gt;&lt;/titles&gt;&lt;dates&gt;&lt;year&gt;2017&lt;/year&gt;&lt;/dates&gt;&lt;publisher&gt;U.S. Department of Transportation&lt;/publisher&gt;&lt;label&gt;fhwa2017&lt;/label&gt;&lt;urls&gt;&lt;related-urls&gt;&lt;url&gt;https://nhts.ornl.gov&lt;/url&gt;&lt;/related-urls&gt;&lt;/urls&gt;&lt;access-date&gt;2026-10-28&lt;/access-date&gt;&lt;/record&gt;&lt;/Cite&gt;&lt;/EndNote&gt;</w:instrText>
+        <w:instrText xml:space="preserve"> ADDIN EN.CITE &lt;EndNote&gt;&lt;Cite&gt;&lt;Author&gt;Federal Highway Administration&lt;/Author&gt;&lt;Year&gt;2017&lt;/Year&gt;&lt;RecNum&gt;22&lt;/RecNum&gt;&lt;DisplayText&gt;[58]&lt;/DisplayText&gt;&lt;record&gt;&lt;rec-number&gt;22&lt;/rec-number&gt;&lt;foreign-keys&gt;&lt;key app="EN" db-id="mdae8500109496fea4aff9c086e16cc25895" timestamp="1793221649"&gt;22&lt;/key&gt;&lt;/foreign-keys&gt;&lt;ref-type name="Web Page"&gt;12&lt;/ref-type&gt;&lt;contributors&gt;&lt;authors&gt;&lt;author&gt;Federal Highway Administration&lt;/author&gt;&lt;/authors&gt;&lt;/contributors&gt;&lt;titles&gt;&lt;title&gt;2017 National Household Travel Survey&lt;/title&gt;&lt;/titles&gt;&lt;dates&gt;&lt;year&gt;2017&lt;/year&gt;&lt;/dates&gt;&lt;publisher&gt;U.S. Department of Transportation&lt;/publisher&gt;&lt;label&gt;fhwa2017&lt;/label&gt;&lt;urls&gt;&lt;related-urls&gt;&lt;url&gt;https://nhts.ornl.gov&lt;/url&gt;&lt;/related-urls&gt;&lt;/urls&gt;&lt;access-date&gt;2026-10-28&lt;/access-date&gt;&lt;/record&gt;&lt;/Cite&gt;&lt;/EndNote&gt;</w:instrText>
       </w:r>
       <w:r>
         <w:fldChar w:fldCharType="separate"/>
@@ -7360,7 +7394,7 @@
         <w:fldChar w:fldCharType="begin"/>
       </w:r>
       <w:r>
-        <w:instrText xml:space="preserve"> ADDIN EN.CITE &lt;EndNote&gt;&lt;Cite&gt;&lt;Author&gt;Crawley&lt;/Author&gt;&lt;Year&gt;2001&lt;/Year&gt;&lt;RecNum&gt;13&lt;/RecNum&gt;&lt;DisplayText&gt;[59]&lt;/DisplayText&gt;&lt;record&gt;&lt;rec-number&gt;13&lt;/rec-number&gt;&lt;foreign-keys&gt;&lt;key app="EN" db-id="mdae8500109496fea4aff9c086e16cc25895" timestamp="1793221304"&gt;13&lt;/key&gt;&lt;/foreign-keys&gt;&lt;ref-type name="Journal Article"&gt;17&lt;/ref-type&gt;&lt;contributors&gt;&lt;authors&gt;&lt;author&gt;Crawley, Drury B.&lt;/author&gt;&lt;author&gt;Lawrie, Linda K.&lt;/author&gt;&lt;author&gt;Winkelmann, Frederick C.&lt;/author&gt;&lt;author&gt;Buhl, W. F.&lt;/author&gt;&lt;author&gt;Huang, Y. Joe&lt;/author&gt;&lt;author&gt;Pedersen, Curtis O.&lt;/author&gt;&lt;author&gt;Strand, Richard K.&lt;/author&gt;&lt;author&gt;Liesen, Richard J.&lt;/author&gt;&lt;author&gt;Fisher, Daniel E.&lt;/author&gt;&lt;author&gt;Witte, Michael J.&lt;/author&gt;&lt;author&gt;Glazer, Jason&lt;/author&gt;&lt;/authors&gt;&lt;/contributors&gt;&lt;titles&gt;&lt;title&gt;EnergyPlus: creating a new-generation building energy simulation program&lt;/title&gt;&lt;secondary-title&gt;Energy and Buildings&lt;/secondary-title&gt;&lt;alt-title&gt;Energy Build.&lt;/alt-title&gt;&lt;/titles&gt;&lt;periodical&gt;&lt;full-title&gt;Energy and Buildings&lt;/full-title&gt;&lt;abbr-1&gt;Energy Build.&lt;/abbr-1&gt;&lt;/periodical&gt;&lt;pages&gt;319-331&lt;/pages&gt;&lt;volume&gt;33&lt;/volume&gt;&lt;number&gt;4&lt;/number&gt;&lt;dates&gt;&lt;year&gt;2001&lt;/year&gt;&lt;/dates&gt;&lt;publisher&gt;Elsevier&lt;/publisher&gt;&lt;label&gt;crawley2001&lt;/label&gt;&lt;urls&gt;&lt;/urls&gt;&lt;electronic-resource-num&gt;10.1016/S0378-7788(00)00114-6&lt;/electronic-resource-num&gt;&lt;/record&gt;&lt;/Cite&gt;&lt;/EndNote&gt;</w:instrText>
+        <w:instrText xml:space="preserve"> ADDIN EN.CITE &lt;EndNote&gt;&lt;Cite&gt;&lt;Author&gt;Crawley&lt;/Author&gt;&lt;Year&gt;2001&lt;/Year&gt;&lt;RecNum&gt;13&lt;/RecNum&gt;&lt;DisplayText&gt;[59]&lt;/DisplayText&gt;&lt;record&gt;&lt;rec-number&gt;13&lt;/rec-number&gt;&lt;foreign-keys&gt;&lt;key app="EN" db-id="mdae8500109496fea4aff9c086e16cc25895" timestamp="1793221649"&gt;13&lt;/key&gt;&lt;/foreign-keys&gt;&lt;ref-type name="Journal Article"&gt;17&lt;/ref-type&gt;&lt;contributors&gt;&lt;authors&gt;&lt;author&gt;Crawley, Drury B.&lt;/author&gt;&lt;author&gt;Lawrie, Linda K.&lt;/author&gt;&lt;author&gt;Winkelmann, Frederick C.&lt;/author&gt;&lt;author&gt;Buhl, W. F.&lt;/author&gt;&lt;author&gt;Huang, Y. Joe&lt;/author&gt;&lt;author&gt;Pedersen, Curtis O.&lt;/author&gt;&lt;author&gt;Strand, Richard K.&lt;/author&gt;&lt;author&gt;Liesen, Richard J.&lt;/author&gt;&lt;author&gt;Fisher, Daniel E.&lt;/author&gt;&lt;author&gt;Witte, Michael J.&lt;/author&gt;&lt;author&gt;Glazer, Jason&lt;/author&gt;&lt;/authors&gt;&lt;/contributors&gt;&lt;titles&gt;&lt;title&gt;EnergyPlus: creating a new-generation building energy simulation program&lt;/title&gt;&lt;secondary-title&gt;Energy and Buildings&lt;/secondary-title&gt;&lt;alt-title&gt;Energy Build.&lt;/alt-title&gt;&lt;/titles&gt;&lt;periodical&gt;&lt;full-title&gt;Energy and Buildings&lt;/full-title&gt;&lt;abbr-1&gt;Energy Build.&lt;/abbr-1&gt;&lt;/periodical&gt;&lt;pages&gt;319-331&lt;/pages&gt;&lt;volume&gt;33&lt;/volume&gt;&lt;number&gt;4&lt;/number&gt;&lt;dates&gt;&lt;year&gt;2001&lt;/year&gt;&lt;/dates&gt;&lt;publisher&gt;Elsevier&lt;/publisher&gt;&lt;label&gt;crawley2001&lt;/label&gt;&lt;urls&gt;&lt;/urls&gt;&lt;electronic-resource-num&gt;10.1016/S0378-7788(00)00114-6&lt;/electronic-resource-num&gt;&lt;/record&gt;&lt;/Cite&gt;&lt;/EndNote&gt;</w:instrText>
       </w:r>
       <w:r>
         <w:fldChar w:fldCharType="separate"/>
@@ -7390,7 +7424,7 @@
         <w:fldChar w:fldCharType="begin"/>
       </w:r>
       <w:r>
-        <w:instrText xml:space="preserve"> ADDIN EN.CITE &lt;EndNote&gt;&lt;Cite&gt;&lt;Author&gt;Deru&lt;/Author&gt;&lt;Year&gt;2011&lt;/Year&gt;&lt;RecNum&gt;15&lt;/RecNum&gt;&lt;DisplayText&gt;[60]&lt;/DisplayText&gt;&lt;record&gt;&lt;rec-number&gt;15&lt;/rec-number&gt;&lt;foreign-keys&gt;&lt;key app="EN" db-id="mdae8500109496fea4aff9c086e16cc25895" timestamp="1793221304"&gt;15&lt;/key&gt;&lt;/foreign-keys&gt;&lt;ref-type name="Report"&gt;27&lt;/ref-type&gt;&lt;contributors&gt;&lt;authors&gt;&lt;author&gt;Deru, M.&lt;/author&gt;&lt;author&gt;Field, K.&lt;/author&gt;&lt;author&gt;Studer, D.&lt;/author&gt;&lt;author&gt;Benne, K.&lt;/author&gt;&lt;author&gt;Griffith, B.&lt;/author&gt;&lt;author&gt;Torcellini, P.&lt;/author&gt;&lt;author&gt;Liu, B.&lt;/author&gt;&lt;author&gt;Halverson, M.&lt;/author&gt;&lt;author&gt;Winiarski, D.&lt;/author&gt;&lt;author&gt;Rosenberg, M.&lt;/author&gt;&lt;author&gt;Yazdanian, M.&lt;/author&gt;&lt;author&gt;Huang, J.&lt;/author&gt;&lt;author&gt;Crawley, D.&lt;/author&gt;&lt;/authors&gt;&lt;/contributors&gt;&lt;titles&gt;&lt;title&gt;U.S. Department of Energy Commercial Reference Building Models of the National Building Stock&lt;/title&gt;&lt;/titles&gt;&lt;dates&gt;&lt;year&gt;2011&lt;/year&gt;&lt;/dates&gt;&lt;pub-location&gt;Golden, CO&lt;/pub-location&gt;&lt;publisher&gt;National Renewable Energy Laboratory&lt;/publisher&gt;&lt;isbn&gt;NREL/TP-5500-46861&lt;/isbn&gt;&lt;label&gt;deru2011&lt;/label&gt;&lt;work-type&gt;Technical Report&lt;/work-type&gt;&lt;urls&gt;&lt;/urls&gt;&lt;electronic-resource-num&gt;10.2172/1009264&lt;/electronic-resource-num&gt;&lt;/record&gt;&lt;/Cite&gt;&lt;/EndNote&gt;</w:instrText>
+        <w:instrText xml:space="preserve"> ADDIN EN.CITE &lt;EndNote&gt;&lt;Cite&gt;&lt;Author&gt;Deru&lt;/Author&gt;&lt;Year&gt;2011&lt;/Year&gt;&lt;RecNum&gt;15&lt;/RecNum&gt;&lt;DisplayText&gt;[60]&lt;/DisplayText&gt;&lt;record&gt;&lt;rec-number&gt;15&lt;/rec-number&gt;&lt;foreign-keys&gt;&lt;key app="EN" db-id="mdae8500109496fea4aff9c086e16cc25895" timestamp="1793221649"&gt;15&lt;/key&gt;&lt;/foreign-keys&gt;&lt;ref-type name="Report"&gt;27&lt;/ref-type&gt;&lt;contributors&gt;&lt;authors&gt;&lt;author&gt;Deru, M.&lt;/author&gt;&lt;author&gt;Field, K.&lt;/author&gt;&lt;author&gt;Studer, D.&lt;/author&gt;&lt;author&gt;Benne, K.&lt;/author&gt;&lt;author&gt;Griffith, B.&lt;/author&gt;&lt;author&gt;Torcellini, P.&lt;/author&gt;&lt;author&gt;Liu, B.&lt;/author&gt;&lt;author&gt;Halverson, M.&lt;/author&gt;&lt;author&gt;Winiarski, D.&lt;/author&gt;&lt;author&gt;Rosenberg, M.&lt;/author&gt;&lt;author&gt;Yazdanian, M.&lt;/author&gt;&lt;author&gt;Huang, J.&lt;/author&gt;&lt;author&gt;Crawley, D.&lt;/author&gt;&lt;/authors&gt;&lt;/contributors&gt;&lt;titles&gt;&lt;title&gt;U.S. Department of Energy Commercial Reference Building Models of the National Building Stock&lt;/title&gt;&lt;/titles&gt;&lt;dates&gt;&lt;year&gt;2011&lt;/year&gt;&lt;/dates&gt;&lt;pub-location&gt;Golden, CO&lt;/pub-location&gt;&lt;publisher&gt;National Renewable Energy Laboratory&lt;/publisher&gt;&lt;isbn&gt;NREL/TP-5500-46861&lt;/isbn&gt;&lt;label&gt;deru2011&lt;/label&gt;&lt;work-type&gt;Technical Report&lt;/work-type&gt;&lt;urls&gt;&lt;/urls&gt;&lt;electronic-resource-num&gt;10.2172/1009264&lt;/electronic-resource-num&gt;&lt;/record&gt;&lt;/Cite&gt;&lt;/EndNote&gt;</w:instrText>
       </w:r>
       <w:r>
         <w:fldChar w:fldCharType="separate"/>
@@ -8259,7 +8293,7 @@
         <w:fldChar w:fldCharType="begin"/>
       </w:r>
       <w:r>
-        <w:instrText xml:space="preserve"> ADDIN EN.CITE &lt;EndNote&gt;&lt;Cite&gt;&lt;Author&gt;Hardy&lt;/Author&gt;&lt;Year&gt;2024&lt;/Year&gt;&lt;RecNum&gt;29&lt;/RecNum&gt;&lt;DisplayText&gt;[18]&lt;/DisplayText&gt;&lt;record&gt;&lt;rec-number&gt;29&lt;/rec-number&gt;&lt;foreign-keys&gt;&lt;key app="EN" db-id="mdae8500109496fea4aff9c086e16cc25895" timestamp="1793221304"&gt;29&lt;/key&gt;&lt;/foreign-keys&gt;&lt;ref-type name="Journal Article"&gt;17&lt;/ref-type&gt;&lt;contributors&gt;&lt;authors&gt;&lt;author&gt;Hardy, Trevor D.&lt;/author&gt;&lt;author&gt;Palmintier, Bryan&lt;/author&gt;&lt;author&gt;Top, Philip L.&lt;/author&gt;&lt;author&gt;Krishnamurthy, Dheepak&lt;/author&gt;&lt;author&gt;Fuller, Jason C.&lt;/author&gt;&lt;/authors&gt;&lt;/contributors&gt;&lt;titles&gt;&lt;title&gt;HELICS: A Co-Simulation Framework for Scalable Multi-Domain Modeling and Analysis&lt;/title&gt;&lt;secondary-title&gt;IEEE Access&lt;/secondary-title&gt;&lt;alt-title&gt;IEEE Access&lt;/alt-title&gt;&lt;/titles&gt;&lt;periodical&gt;&lt;full-title&gt;IEEE Access&lt;/full-title&gt;&lt;abbr-1&gt;IEEE Access&lt;/abbr-1&gt;&lt;/periodical&gt;&lt;pages&gt;24325-24347&lt;/pages&gt;&lt;volume&gt;12&lt;/volume&gt;&lt;dates&gt;&lt;year&gt;2024&lt;/year&gt;&lt;/dates&gt;&lt;publisher&gt;IEEE&lt;/publisher&gt;&lt;label&gt;hardy2024&lt;/label&gt;&lt;urls&gt;&lt;/urls&gt;&lt;electronic-resource-num&gt;10.1109/ACCESS.2024.3363615&lt;/electronic-resource-num&gt;&lt;/record&gt;&lt;/Cite&gt;&lt;/EndNote&gt;</w:instrText>
+        <w:instrText xml:space="preserve"> ADDIN EN.CITE &lt;EndNote&gt;&lt;Cite&gt;&lt;Author&gt;Hardy&lt;/Author&gt;&lt;Year&gt;2024&lt;/Year&gt;&lt;RecNum&gt;29&lt;/RecNum&gt;&lt;DisplayText&gt;[18]&lt;/DisplayText&gt;&lt;record&gt;&lt;rec-number&gt;29&lt;/rec-number&gt;&lt;foreign-keys&gt;&lt;key app="EN" db-id="mdae8500109496fea4aff9c086e16cc25895" timestamp="1793221649"&gt;29&lt;/key&gt;&lt;/foreign-keys&gt;&lt;ref-type name="Journal Article"&gt;17&lt;/ref-type&gt;&lt;contributors&gt;&lt;authors&gt;&lt;author&gt;Hardy, Trevor D.&lt;/author&gt;&lt;author&gt;Palmintier, Bryan&lt;/author&gt;&lt;author&gt;Top, Philip L.&lt;/author&gt;&lt;author&gt;Krishnamurthy, Dheepak&lt;/author&gt;&lt;author&gt;Fuller, Jason C.&lt;/author&gt;&lt;/authors&gt;&lt;/contributors&gt;&lt;titles&gt;&lt;title&gt;HELICS: A Co-Simulation Framework for Scalable Multi-Domain Modeling and Analysis&lt;/title&gt;&lt;secondary-title&gt;IEEE Access&lt;/secondary-title&gt;&lt;alt-title&gt;IEEE Access&lt;/alt-title&gt;&lt;/titles&gt;&lt;periodical&gt;&lt;full-title&gt;IEEE Access&lt;/full-title&gt;&lt;abbr-1&gt;IEEE Access&lt;/abbr-1&gt;&lt;/periodical&gt;&lt;pages&gt;24325-24347&lt;/pages&gt;&lt;volume&gt;12&lt;/volume&gt;&lt;dates&gt;&lt;year&gt;2024&lt;/year&gt;&lt;/dates&gt;&lt;publisher&gt;IEEE&lt;/publisher&gt;&lt;label&gt;hardy2024&lt;/label&gt;&lt;urls&gt;&lt;/urls&gt;&lt;electronic-resource-num&gt;10.1109/ACCESS.2024.3363615&lt;/electronic-resource-num&gt;&lt;/record&gt;&lt;/Cite&gt;&lt;/EndNote&gt;</w:instrText>
       </w:r>
       <w:r>
         <w:fldChar w:fldCharType="separate"/>
@@ -8524,7 +8558,7 @@
 UmVjTnVtPjQ3PC9SZWNOdW0+PERpc3BsYXlUZXh0Pls3LDIyXTwvRGlzcGxheVRleHQ+PHJlY29y
 ZD48cmVjLW51bWJlcj40NzwvcmVjLW51bWJlcj48Zm9yZWlnbi1rZXlzPjxrZXkgYXBwPSJFTiIg
 ZGItaWQ9Im1kYWU4NTAwMTA5NDk2ZmVhNGFmZjljMDg2ZTE2Y2MyNTg5NSIgdGltZXN0YW1wPSIx
-NzkzMjIxMzA0Ij40Nzwva2V5PjwvZm9yZWlnbi1rZXlzPjxyZWYtdHlwZSBuYW1lPSJKb3VybmFs
+NzkzMjIxNjQ5Ij40Nzwva2V5PjwvZm9yZWlnbi1rZXlzPjxyZWYtdHlwZSBuYW1lPSJKb3VybmFs
 IEFydGljbGUiPjE3PC9yZWYtdHlwZT48Y29udHJpYnV0b3JzPjxhdXRob3JzPjxhdXRob3I+S8O8
 YmxlciwgUi48L2F1dGhvcj48YXV0aG9yPlNjaGllaGxlbiwgVy48L2F1dGhvcj48L2F1dGhvcnM+
 PC9jb250cmlidXRvcnM+PHRpdGxlcz48dGl0bGU+VHdvIE1ldGhvZHMgb2YgU2ltdWxhdG9yIENv
@@ -8541,7 +8575,7 @@
 c291cmNlLW51bT48L3JlY29yZD48L0NpdGU+PENpdGU+PEF1dGhvcj5Hb21lczwvQXV0aG9yPjxZ
 ZWFyPjIwMTg8L1llYXI+PFJlY051bT4yNjwvUmVjTnVtPjxyZWNvcmQ+PHJlYy1udW1iZXI+MjY8
 L3JlYy1udW1iZXI+PGZvcmVpZ24ta2V5cz48a2V5IGFwcD0iRU4iIGRiLWlkPSJtZGFlODUwMDEw
-OTQ5NmZlYTRhZmY5YzA4NmUxNmNjMjU4OTUiIHRpbWVzdGFtcD0iMTc5MzIyMTMwNCI+MjY8L2tl
+OTQ5NmZlYTRhZmY5YzA4NmUxNmNjMjU4OTUiIHRpbWVzdGFtcD0iMTc5MzIyMTY0OSI+MjY8L2tl
 eT48L2ZvcmVpZ24ta2V5cz48cmVmLXR5cGUgbmFtZT0iSm91cm5hbCBBcnRpY2xlIj4xNzwvcmVm
 LXR5cGU+PGNvbnRyaWJ1dG9ycz48YXV0aG9ycz48YXV0aG9yPkdvbWVzLCBDbMOhdWRpbzwvYXV0
 aG9yPjxhdXRob3I+VGh1bGUsIENhc3BlcjwvYXV0aG9yPjxhdXRob3I+QnJvbWFuLCBEYXZpZDwv
@@ -8567,7 +8601,7 @@
 UmVjTnVtPjQ3PC9SZWNOdW0+PERpc3BsYXlUZXh0Pls3LDIyXTwvRGlzcGxheVRleHQ+PHJlY29y
 ZD48cmVjLW51bWJlcj40NzwvcmVjLW51bWJlcj48Zm9yZWlnbi1rZXlzPjxrZXkgYXBwPSJFTiIg
 ZGItaWQ9Im1kYWU4NTAwMTA5NDk2ZmVhNGFmZjljMDg2ZTE2Y2MyNTg5NSIgdGltZXN0YW1wPSIx
-NzkzMjIxMzA0Ij40Nzwva2V5PjwvZm9yZWlnbi1rZXlzPjxyZWYtdHlwZSBuYW1lPSJKb3VybmFs
+NzkzMjIxNjQ5Ij40Nzwva2V5PjwvZm9yZWlnbi1rZXlzPjxyZWYtdHlwZSBuYW1lPSJKb3VybmFs
 IEFydGljbGUiPjE3PC9yZWYtdHlwZT48Y29udHJpYnV0b3JzPjxhdXRob3JzPjxhdXRob3I+S8O8
 YmxlciwgUi48L2F1dGhvcj48YXV0aG9yPlNjaGllaGxlbiwgVy48L2F1dGhvcj48L2F1dGhvcnM+
 PC9jb250cmlidXRvcnM+PHRpdGxlcz48dGl0bGU+VHdvIE1ldGhvZHMgb2YgU2ltdWxhdG9yIENv
@@ -8584,7 +8618,7 @@
 c291cmNlLW51bT48L3JlY29yZD48L0NpdGU+PENpdGU+PEF1dGhvcj5Hb21lczwvQXV0aG9yPjxZ
 ZWFyPjIwMTg8L1llYXI+PFJlY051bT4yNjwvUmVjTnVtPjxyZWNvcmQ+PHJlYy1udW1iZXI+MjY8
 L3JlYy1udW1iZXI+PGZvcmVpZ24ta2V5cz48a2V5IGFwcD0iRU4iIGRiLWlkPSJtZGFlODUwMDEw
-OTQ5NmZlYTRhZmY5YzA4NmUxNmNjMjU4OTUiIHRpbWVzdGFtcD0iMTc5MzIyMTMwNCI+MjY8L2tl
+OTQ5NmZlYTRhZmY5YzA4NmUxNmNjMjU4OTUiIHRpbWVzdGFtcD0iMTc5MzIyMTY0OSI+MjY8L2tl
 eT48L2ZvcmVpZ24ta2V5cz48cmVmLXR5cGUgbmFtZT0iSm91cm5hbCBBcnRpY2xlIj4xNzwvcmVm
 LXR5cGU+PGNvbnRyaWJ1dG9ycz48YXV0aG9ycz48YXV0aG9yPkdvbWVzLCBDbMOhdWRpbzwvYXV0
 aG9yPjxhdXRob3I+VGh1bGUsIENhc3BlcjwvYXV0aG9yPjxhdXRob3I+QnJvbWFuLCBEYXZpZDwv
@@ -8626,7 +8660,7 @@
         <w:fldChar w:fldCharType="begin"/>
       </w:r>
       <w:r>
-        <w:instrText xml:space="preserve"> ADDIN EN.CITE &lt;EndNote&gt;&lt;Cite&gt;&lt;Author&gt;Eaton&lt;/Author&gt;&lt;Year&gt;2023&lt;/Year&gt;&lt;RecNum&gt;10&lt;/RecNum&gt;&lt;DisplayText&gt;[48]&lt;/DisplayText&gt;&lt;record&gt;&lt;rec-number&gt;10&lt;/rec-number&gt;&lt;foreign-keys&gt;&lt;key app="EN" db-id="mdae8500109496fea4aff9c086e16cc25895" timestamp="1793221304"&gt;10&lt;/key&gt;&lt;/foreign-keys&gt;&lt;ref-type name="Web Page"&gt;12&lt;/ref-type&gt;&lt;contributors&gt;&lt;authors&gt;&lt;author&gt;Eaton, Brian&lt;/author&gt;&lt;author&gt;Gregory, Jonathan&lt;/author&gt;&lt;author&gt;Drach, Bob&lt;/author&gt;&lt;author&gt;Taylor, Karl&lt;/author&gt;&lt;author&gt;Hankin, Steve&lt;/author&gt;&lt;author&gt;Blower, Jon&lt;/author&gt;&lt;author&gt;Caron, John&lt;/author&gt;&lt;author&gt;Signell, Rich&lt;/author&gt;&lt;author&gt;Bentley, Phil&lt;/author&gt;&lt;author&gt;Rappa, Greg&lt;/author&gt;&lt;author&gt;Höck, Heinke&lt;/author&gt;&lt;author&gt;Pamment, Alison&lt;/author&gt;&lt;author&gt;Juckes, Martin&lt;/author&gt;&lt;author&gt;Raspaud, Martin&lt;/author&gt;&lt;author&gt;Horne, Randy&lt;/author&gt;&lt;author&gt;Whiteaker, Timothy&lt;/author&gt;&lt;author&gt;Blodgett, David&lt;/author&gt;&lt;author&gt;Zender, Charlie&lt;/author&gt;&lt;author&gt;Lee, Daniel&lt;/author&gt;&lt;author&gt;Hassell, David&lt;/author&gt;&lt;author&gt;Snow, Alan D.&lt;/author&gt;&lt;author&gt;Kölling, Tobias&lt;/author&gt;&lt;author&gt;Allured, Dave&lt;/author&gt;&lt;author&gt;Jelenak, Aleksandar&lt;/author&gt;&lt;author&gt;Meier Soerensen, Anders&lt;/author&gt;&lt;author&gt;Gaultier, Lucile&lt;/author&gt;&lt;author&gt;Herlédan, Sylvain&lt;/author&gt;&lt;author&gt;Manzano, Fernando&lt;/author&gt;&lt;author&gt;Bärring, Lars&lt;/author&gt;&lt;author&gt;Barker, Christopher&lt;/author&gt;&lt;author&gt;Bartholomew, Sadie&lt;/author&gt;&lt;/authors&gt;&lt;/contributors&gt;&lt;titles&gt;&lt;title&gt;NetCDF Climate and Forecast (CF) Metadata Conventions&lt;/title&gt;&lt;/titles&gt;&lt;dates&gt;&lt;year&gt;2023&lt;/year&gt;&lt;/dates&gt;&lt;label&gt;cf2023&lt;/label&gt;&lt;urls&gt;&lt;related-urls&gt;&lt;url&gt;https://cfconventions.org/Data/cf-conventions/cf-conventions-1.11/cf-conventions.html&lt;/url&gt;&lt;/related-urls&gt;&lt;/urls&gt;&lt;access-date&gt;2026-10-28&lt;/access-date&gt;&lt;/record&gt;&lt;/Cite&gt;&lt;/EndNote&gt;</w:instrText>
+        <w:instrText xml:space="preserve"> ADDIN EN.CITE &lt;EndNote&gt;&lt;Cite&gt;&lt;Author&gt;Eaton&lt;/Author&gt;&lt;Year&gt;2023&lt;/Year&gt;&lt;RecNum&gt;10&lt;/RecNum&gt;&lt;DisplayText&gt;[48]&lt;/DisplayText&gt;&lt;record&gt;&lt;rec-number&gt;10&lt;/rec-number&gt;&lt;foreign-keys&gt;&lt;key app="EN" db-id="mdae8500109496fea4aff9c086e16cc25895" timestamp="1793221649"&gt;10&lt;/key&gt;&lt;/foreign-keys&gt;&lt;ref-type name="Web Page"&gt;12&lt;/ref-type&gt;&lt;contributors&gt;&lt;authors&gt;&lt;author&gt;Eaton, Brian&lt;/author&gt;&lt;author&gt;Gregory, Jonathan&lt;/author&gt;&lt;author&gt;Drach, Bob&lt;/author&gt;&lt;author&gt;Taylor, Karl&lt;/author&gt;&lt;author&gt;Hankin, Steve&lt;/author&gt;&lt;author&gt;Blower, Jon&lt;/author&gt;&lt;author&gt;Caron, John&lt;/author&gt;&lt;author&gt;Signell, Rich&lt;/author&gt;&lt;author&gt;Bentley, Phil&lt;/author&gt;&lt;author&gt;Rappa, Greg&lt;/author&gt;&lt;author&gt;Höck, Heinke&lt;/author&gt;&lt;author&gt;Pamment, Alison&lt;/author&gt;&lt;author&gt;Juckes, Martin&lt;/author&gt;&lt;author&gt;Raspaud, Martin&lt;/author&gt;&lt;author&gt;Horne, Randy&lt;/author&gt;&lt;author&gt;Whiteaker, Timothy&lt;/author&gt;&lt;author&gt;Blodgett, David&lt;/author&gt;&lt;author&gt;Zender, Charlie&lt;/author&gt;&lt;author&gt;Lee, Daniel&lt;/author&gt;&lt;author&gt;Hassell, David&lt;/author&gt;&lt;author&gt;Snow, Alan D.&lt;/author&gt;&lt;author&gt;Kölling, Tobias&lt;/author&gt;&lt;author&gt;Allured, Dave&lt;/author&gt;&lt;author&gt;Jelenak, Aleksandar&lt;/author&gt;&lt;author&gt;Meier Soerensen, Anders&lt;/author&gt;&lt;author&gt;Gaultier, Lucile&lt;/author&gt;&lt;author&gt;Herlédan, Sylvain&lt;/author&gt;&lt;author&gt;Manzano, Fernando&lt;/author&gt;&lt;author&gt;Bärring, Lars&lt;/author&gt;&lt;author&gt;Barker, Christopher&lt;/author&gt;&lt;author&gt;Bartholomew, Sadie&lt;/author&gt;&lt;/authors&gt;&lt;/contributors&gt;&lt;titles&gt;&lt;title&gt;NetCDF Climate and Forecast (CF) Metadata Conventions&lt;/title&gt;&lt;/titles&gt;&lt;dates&gt;&lt;year&gt;2023&lt;/year&gt;&lt;/dates&gt;&lt;label&gt;cf2023&lt;/label&gt;&lt;urls&gt;&lt;related-urls&gt;&lt;url&gt;https://cfconventions.org/Data/cf-conventions/cf-conventions-1.11/cf-conventions.html&lt;/url&gt;&lt;/related-urls&gt;&lt;/urls&gt;&lt;access-date&gt;2026-10-28&lt;/access-date&gt;&lt;/record&gt;&lt;/Cite&gt;&lt;/EndNote&gt;</w:instrText>
       </w:r>
       <w:r>
         <w:fldChar w:fldCharType="separate"/>
@@ -8663,7 +8697,7 @@
 PFJlY051bT4zPC9SZWNOdW0+PERpc3BsYXlUZXh0PlszMCwzMV08L0Rpc3BsYXlUZXh0PjxyZWNv
 cmQ+PHJlYy1udW1iZXI+MzwvcmVjLW51bWJlcj48Zm9yZWlnbi1rZXlzPjxrZXkgYXBwPSJFTiIg
 ZGItaWQ9Im1kYWU4NTAwMTA5NDk2ZmVhNGFmZjljMDg2ZTE2Y2MyNTg5NSIgdGltZXN0YW1wPSIx
-NzkzMjIxMzA0Ij4zPC9rZXk+PC9mb3JlaWduLWtleXM+PHJlZi10eXBlIG5hbWU9IkNvbmZlcmVu
+NzkzMjIxNjQ5Ij4zPC9rZXk+PC9mb3JlaWduLWtleXM+PHJlZi10eXBlIG5hbWU9IkNvbmZlcmVu
 Y2UgUGFwZXIiPjQ3PC9yZWYtdHlwZT48Y29udHJpYnV0b3JzPjxhdXRob3JzPjxhdXRob3I+QmVu
 ZWRpa3QsIE0uPC9hdXRob3I+PGF1dGhvcj5XYXR6ZW5pZywgRC48L2F1dGhvcj48YXV0aG9yPlpl
 aGV0bmVyLCBKLjwvYXV0aG9yPjxhdXRob3I+SG9mZXIsIEEuPC9hdXRob3I+PC9hdXRob3JzPjwv
@@ -8680,7 +8714,7 @@
 dXJscz48L3VybHM+PC9yZWNvcmQ+PC9DaXRlPjxDaXRlPjxBdXRob3I+U2FkamluYTwvQXV0aG9y
 PjxZZWFyPjIwMTc8L1llYXI+PFJlY051bT43MTwvUmVjTnVtPjxyZWNvcmQ+PHJlYy1udW1iZXI+
 NzE8L3JlYy1udW1iZXI+PGZvcmVpZ24ta2V5cz48a2V5IGFwcD0iRU4iIGRiLWlkPSJtZGFlODUw
-MDEwOTQ5NmZlYTRhZmY5YzA4NmUxNmNjMjU4OTUiIHRpbWVzdGFtcD0iMTc5MzIyMTMwNCI+NzE8
+MDEwOTQ5NmZlYTRhZmY5YzA4NmUxNmNjMjU4OTUiIHRpbWVzdGFtcD0iMTc5MzIyMTY0OSI+NzE8
 L2tleT48L2ZvcmVpZ24ta2V5cz48cmVmLXR5cGUgbmFtZT0iSm91cm5hbCBBcnRpY2xlIj4xNzwv
 cmVmLXR5cGU+PGNvbnRyaWJ1dG9ycz48YXV0aG9ycz48YXV0aG9yPlNhZGppbmEsIFNldmVyaW48
 L2F1dGhvcj48YXV0aG9yPkt5bGxpbmdzdGFkLCBMYXJzIFQuPC9hdXRob3I+PGF1dGhvcj5Ta2pv
@@ -8708,7 +8742,7 @@
 PFJlY051bT4zPC9SZWNOdW0+PERpc3BsYXlUZXh0PlszMCwzMV08L0Rpc3BsYXlUZXh0PjxyZWNv
 cmQ+PHJlYy1udW1iZXI+MzwvcmVjLW51bWJlcj48Zm9yZWlnbi1rZXlzPjxrZXkgYXBwPSJFTiIg
 ZGItaWQ9Im1kYWU4NTAwMTA5NDk2ZmVhNGFmZjljMDg2ZTE2Y2MyNTg5NSIgdGltZXN0YW1wPSIx
-NzkzMjIxMzA0Ij4zPC9rZXk+PC9mb3JlaWduLWtleXM+PHJlZi10eXBlIG5hbWU9IkNvbmZlcmVu
+NzkzMjIxNjQ5Ij4zPC9rZXk+PC9mb3JlaWduLWtleXM+PHJlZi10eXBlIG5hbWU9IkNvbmZlcmVu
 Y2UgUGFwZXIiPjQ3PC9yZWYtdHlwZT48Y29udHJpYnV0b3JzPjxhdXRob3JzPjxhdXRob3I+QmVu
 ZWRpa3QsIE0uPC9hdXRob3I+PGF1dGhvcj5XYXR6ZW5pZywgRC48L2F1dGhvcj48YXV0aG9yPlpl
 aGV0bmVyLCBKLjwvYXV0aG9yPjxhdXRob3I+SG9mZXIsIEEuPC9hdXRob3I+PC9hdXRob3JzPjwv
@@ -8725,7 +8759,7 @@
 dXJscz48L3VybHM+PC9yZWNvcmQ+PC9DaXRlPjxDaXRlPjxBdXRob3I+U2FkamluYTwvQXV0aG9y
 PjxZZWFyPjIwMTc8L1llYXI+PFJlY051bT43MTwvUmVjTnVtPjxyZWNvcmQ+PHJlYy1udW1iZXI+
 NzE8L3JlYy1udW1iZXI+PGZvcmVpZ24ta2V5cz48a2V5IGFwcD0iRU4iIGRiLWlkPSJtZGFlODUw
-MDEwOTQ5NmZlYTRhZmY5YzA4NmUxNmNjMjU4OTUiIHRpbWVzdGFtcD0iMTc5MzIyMTMwNCI+NzE8
+MDEwOTQ5NmZlYTRhZmY5YzA4NmUxNmNjMjU4OTUiIHRpbWVzdGFtcD0iMTc5MzIyMTY0OSI+NzE8
 L2tleT48L2ZvcmVpZ24ta2V5cz48cmVmLXR5cGUgbmFtZT0iSm91cm5hbCBBcnRpY2xlIj4xNzwv
 cmVmLXR5cGU+PGNvbnRyaWJ1dG9ycz48YXV0aG9ycz48YXV0aG9yPlNhZGppbmEsIFNldmVyaW48
 L2F1dGhvcj48YXV0aG9yPkt5bGxpbmdzdGFkLCBMYXJzIFQuPC9hdXRob3I+PGF1dGhvcj5Ta2pv
@@ -8949,7 +8983,7 @@
         <w:pStyle w:val="BodyText"/>
       </w:pPr>
       <w:r>
-        <w:t xml:space="preserve">[Funding and acknowledgements to be added by the authors.]</w:t>
+        <w:t xml:space="preserve">This material is based upon work supported by the U.S. National Science Foundation under Award No. 2623038, “GOALI: A Community-Driven Benchmarking Framework for Trustworthy Generative AI in Architecture, Engineering and Construction.” Any opinions, findings and conclusions or recommendations expressed in this material are those of the authors and do not necessarily reflect the views of the National Science Foundation.</w:t>
       </w:r>
     </w:p>
     <w:p>

</xml_diff>

<commit_message>
Manuscript: drop AI from the title, state AI/GenAI compatibility with reasons
The evaluation uses stand-ins for LLM services, not a real AI model, so AI is no
longer the headline:
- Title: "Py-CoSim: time-aware message-based co-simulation for building energy
  systems" (manuscript, title page, cover letter, README)
- Abstract and introduction lead with time-aware messages; AI is one class of
  non-physics components; keyword "large language models" -> "data alignment"
- New Discussion subsection "Compatibility with AI and generative AI
  applications" with four reasons (history windows, quality flags, replay,
  asynchronous delivery)
- Experiments, captions and figure labels name the stochastic and slow
  supervisors as stand-ins for an LLM service
- Shortened text and moved two figures to keep the blinded manuscript at 39 pages

Co-Authored-By: Claude Opus 5.5 <noreply@anthropic.com>
</commit_message>
<xml_diff>
--- a/paper/manuscript/Manuscript.docx
+++ b/paper/manuscript/Manuscript.docx
@@ -7,7 +7,7 @@
         <w:pStyle w:val="Title"/>
       </w:pPr>
       <w:r>
-        <w:t xml:space="preserve">Py-CoSim: time-aware message-based co-simulation of building energy and artificial intelligence models</w:t>
+        <w:t xml:space="preserve">Py-CoSim: time-aware message-based co-simulation for building energy systems</w:t>
       </w:r>
     </w:p>
     <w:p>
@@ -157,7 +157,7 @@
         <w:pStyle w:val="Abstract"/>
       </w:pPr>
       <w:r>
-        <w:t xml:space="preserve">Building energy models are increasingly co-simulated with photovoltaics, batteries, tariffs, occupant and machine-learning models, and large language model agents. Co-simulation tools exchange values as numbers stamped with an instant, leaving users to decide which interval each value belongs to, and offer no rules for artificial intelligence (AI) components that answer differently on every call, return invalid values or respond slowly. This paper presents Py-CoSim, an open-source Python co-simulation framework in which components exchange messages through a time-aware hub, TIDE (Time-aware Interval Data Exchange). Each message states whether its value is an instantaneous sample, an interval average, an interval amount, a value held until replaced or an event, and each input declares the window it needs. TIDE aligns the data, flags their quality, records them for exact replay, traces their provenance and delivers the answers of slow components at a declared simulation time. Co-simulated EnergyPlus results were identical to standalone runs. When a consumer’s step was a multiple of its producer’s, aligned exchange computed energy exactly and cost within 0.011 %, whereas exchanging latest values erred by up to 6 %. In a ten-office community with photovoltaics and a battery, naive exchange overstated the battery’s peak reduction (peak import 120 instead of 135 kW). Replay reproduced runs with a stochastic AI supervisor exactly and cut the spread of a retrofit-savings estimate 24-fold; asynchronous delivery shortened runs with eight slow AI supervisors 2.9-fold without changing results. Time-aware messages thus make co-simulation with AI components more accurate and reproducible.</w:t>
+        <w:t xml:space="preserve">Building energy models are increasingly co-simulated with photovoltaics, batteries, tariffs, occupant models and data-driven controllers. Co-simulation tools exchange values as numbers stamped with an instant, leaving users to decide which interval each value belongs to, and assume that every component answers deterministically, validly and at once. This paper presents Py-CoSim, an open-source Python co-simulation framework in which components exchange messages through a time-aware hub, TIDE (Time-aware Interval Data Exchange). Each message states whether its value is an instantaneous sample, an interval average, an interval amount, a value held until replaced or an event, and each input declares the window it needs. TIDE aligns the data, flags their quality, records them for exact replay, traces their provenance and delivers the answers of slow components at a declared simulation time; these features also suit artificial intelligence components such as large language model agents. Co-simulated EnergyPlus results were identical to standalone runs. When a consumer’s step was a multiple of its producer’s, aligned exchange computed energy exactly and cost within 0.011 %, whereas exchanging latest values erred by up to 6 %. In a ten-office community with photovoltaics and a battery, naive exchange overstated the battery’s peak reduction (peak import 120 instead of 135 kW). With a stochastic supervisor, replay reproduced runs exactly and cut the spread of a retrofit-savings estimate 24-fold; asynchronous delivery shortened runs with eight slow supervisors 2.9-fold without changing results. Stating the time meaning of exchanged data thus makes building co-simulation more accurate and reproducible.</w:t>
       </w:r>
     </w:p>
     <w:p>
@@ -172,7 +172,7 @@
         <w:t xml:space="preserve">Keywords: </w:t>
       </w:r>
       <w:r>
-        <w:t xml:space="preserve">co-simulation; EnergyPlus; time semantics; large language models; reproducibility; grid-interactive buildings</w:t>
+        <w:t xml:space="preserve">co-simulation; EnergyPlus; time semantics; data alignment; reproducibility; grid-interactive buildings</w:t>
       </w:r>
     </w:p>
     <w:p>
@@ -198,7 +198,7 @@
 UmVjTnVtPjU4PC9SZWNOdW0+PERpc3BsYXlUZXh0PihOZXVrb21tIGV0IGFsLiAyMDE5OyBIb25n
 IGV0IGFsLiAyMDI1KTwvRGlzcGxheVRleHQ+PHJlY29yZD48cmVjLW51bWJlcj41ODwvcmVjLW51
 bWJlcj48Zm9yZWlnbi1rZXlzPjxrZXkgYXBwPSJFTiIgZGItaWQ9Im1kYWU4NTAwMTA5NDk2ZmVh
-NGFmZjljMDg2ZTE2Y2MyNTg5NSIgdGltZXN0YW1wPSIxNzkzMjI2NjIxIj41ODwva2V5PjwvZm9y
+NGFmZjljMDg2ZTE2Y2MyNTg5NSIgdGltZXN0YW1wPSIxNzkzMjI5MTc2Ij41ODwva2V5PjwvZm9y
 ZWlnbi1rZXlzPjxyZWYtdHlwZSBuYW1lPSJSZXBvcnQiPjI3PC9yZWYtdHlwZT48Y29udHJpYnV0
 b3JzPjxhdXRob3JzPjxhdXRob3I+TmV1a29tbSwgTW9uaWNhPC9hdXRob3I+PGF1dGhvcj5OdWJi
 ZSwgVmFsZXJpZTwvYXV0aG9yPjxhdXRob3I+RmFyZXMsIFJvYmVydDwvYXV0aG9yPjwvYXV0aG9y
@@ -213,7 +213,7 @@
 dHJvbmljLXJlc291cmNlLW51bT48L3JlY29yZD48L0NpdGU+PENpdGU+PEF1dGhvcj5Ib25nPC9B
 dXRob3I+PFllYXI+MjAyNTwvWWVhcj48UmVjTnVtPjM1PC9SZWNOdW0+PHJlY29yZD48cmVjLW51
 bWJlcj4zNTwvcmVjLW51bWJlcj48Zm9yZWlnbi1rZXlzPjxrZXkgYXBwPSJFTiIgZGItaWQ9Im1k
-YWU4NTAwMTA5NDk2ZmVhNGFmZjljMDg2ZTE2Y2MyNTg5NSIgdGltZXN0YW1wPSIxNzkzMjI2NjIx
+YWU4NTAwMTA5NDk2ZmVhNGFmZjljMDg2ZTE2Y2MyNTg5NSIgdGltZXN0YW1wPSIxNzkzMjI5MTc2
 Ij4zNTwva2V5PjwvZm9yZWlnbi1rZXlzPjxyZWYtdHlwZSBuYW1lPSJKb3VybmFsIEFydGljbGUi
 PjE3PC9yZWYtdHlwZT48Y29udHJpYnV0b3JzPjxhdXRob3JzPjxhdXRob3I+SG9uZywgVGlhbnpo
 ZW48L2F1dGhvcj48YXV0aG9yPkxlZSwgU2FuZyBIb29uPC9hdXRob3I+PGF1dGhvcj5aaGFuZywg
@@ -241,7 +241,7 @@
 UmVjTnVtPjU4PC9SZWNOdW0+PERpc3BsYXlUZXh0PihOZXVrb21tIGV0IGFsLiAyMDE5OyBIb25n
 IGV0IGFsLiAyMDI1KTwvRGlzcGxheVRleHQ+PHJlY29yZD48cmVjLW51bWJlcj41ODwvcmVjLW51
 bWJlcj48Zm9yZWlnbi1rZXlzPjxrZXkgYXBwPSJFTiIgZGItaWQ9Im1kYWU4NTAwMTA5NDk2ZmVh
-NGFmZjljMDg2ZTE2Y2MyNTg5NSIgdGltZXN0YW1wPSIxNzkzMjI2NjIxIj41ODwva2V5PjwvZm9y
+NGFmZjljMDg2ZTE2Y2MyNTg5NSIgdGltZXN0YW1wPSIxNzkzMjI5MTc2Ij41ODwva2V5PjwvZm9y
 ZWlnbi1rZXlzPjxyZWYtdHlwZSBuYW1lPSJSZXBvcnQiPjI3PC9yZWYtdHlwZT48Y29udHJpYnV0
 b3JzPjxhdXRob3JzPjxhdXRob3I+TmV1a29tbSwgTW9uaWNhPC9hdXRob3I+PGF1dGhvcj5OdWJi
 ZSwgVmFsZXJpZTwvYXV0aG9yPjxhdXRob3I+RmFyZXMsIFJvYmVydDwvYXV0aG9yPjwvYXV0aG9y
@@ -256,7 +256,7 @@
 dHJvbmljLXJlc291cmNlLW51bT48L3JlY29yZD48L0NpdGU+PENpdGU+PEF1dGhvcj5Ib25nPC9B
 dXRob3I+PFllYXI+MjAyNTwvWWVhcj48UmVjTnVtPjM1PC9SZWNOdW0+PHJlY29yZD48cmVjLW51
 bWJlcj4zNTwvcmVjLW51bWJlcj48Zm9yZWlnbi1rZXlzPjxrZXkgYXBwPSJFTiIgZGItaWQ9Im1k
-YWU4NTAwMTA5NDk2ZmVhNGFmZjljMDg2ZTE2Y2MyNTg5NSIgdGltZXN0YW1wPSIxNzkzMjI2NjIx
+YWU4NTAwMTA5NDk2ZmVhNGFmZjljMDg2ZTE2Y2MyNTg5NSIgdGltZXN0YW1wPSIxNzkzMjI5MTc2
 Ij4zNTwva2V5PjwvZm9yZWlnbi1rZXlzPjxyZWYtdHlwZSBuYW1lPSJKb3VybmFsIEFydGljbGUi
 PjE3PC9yZWYtdHlwZT48Y29udHJpYnV0b3JzPjxhdXRob3JzPjxhdXRob3I+SG9uZywgVGlhbnpo
 ZW48L2F1dGhvcj48YXV0aG9yPkxlZSwgU2FuZyBIb29uPC9hdXRob3I+PGF1dGhvcj5aaGFuZywg
@@ -303,7 +303,7 @@
 bC4gMjAyMzsgWmhhbmcgYW5kIENoZW4gMjAyNDsgTGl1IGV0IGFsLiAyMDI1KTwvRGlzcGxheVRl
 eHQ+PHJlY29yZD48cmVjLW51bWJlcj44MzwvcmVjLW51bWJlcj48Zm9yZWlnbi1rZXlzPjxrZXkg
 YXBwPSJFTiIgZGItaWQ9Im1kYWU4NTAwMTA5NDk2ZmVhNGFmZjljMDg2ZTE2Y2MyNTg5NSIgdGlt
-ZXN0YW1wPSIxNzkzMjI2NjIxIj44Mzwva2V5PjwvZm9yZWlnbi1rZXlzPjxyZWYtdHlwZSBuYW1l
+ZXN0YW1wPSIxNzkzMjI5MTc2Ij44Mzwva2V5PjwvZm9yZWlnbi1rZXlzPjxyZWYtdHlwZSBuYW1l
 PSJKb3VybmFsIEFydGljbGUiPjE3PC9yZWYtdHlwZT48Y29udHJpYnV0b3JzPjxhdXRob3JzPjxh
 dXRob3I+V2FuZywgWmhlPC9hdXRob3I+PGF1dGhvcj5Ib25nLCBUaWFuemhlbjwvYXV0aG9yPjwv
 YXV0aG9ycz48L2NvbnRyaWJ1dG9ycz48dGl0bGVzPjx0aXRsZT5SZWluZm9yY2VtZW50IGxlYXJu
@@ -318,7 +318,7 @@
 b25pYy1yZXNvdXJjZS1udW0+PC9yZWNvcmQ+PC9DaXRlPjxDaXRlPjxBdXRob3I+QWhuPC9BdXRo
 b3I+PFllYXI+MjAyMzwvWWVhcj48UmVjTnVtPjE8L1JlY051bT48cmVjb3JkPjxyZWMtbnVtYmVy
 PjE8L3JlYy1udW1iZXI+PGZvcmVpZ24ta2V5cz48a2V5IGFwcD0iRU4iIGRiLWlkPSJtZGFlODUw
-MDEwOTQ5NmZlYTRhZmY5YzA4NmUxNmNjMjU4OTUiIHRpbWVzdGFtcD0iMTc5MzIyNjYyMSI+MTwv
+MDEwOTQ5NmZlYTRhZmY5YzA4NmUxNmNjMjU4OTUiIHRpbWVzdGFtcD0iMTc5MzIyOTE3NiI+MTwv
 a2V5PjwvZm9yZWlnbi1rZXlzPjxyZWYtdHlwZSBuYW1lPSJKb3VybmFsIEFydGljbGUiPjE3PC9y
 ZWYtdHlwZT48Y29udHJpYnV0b3JzPjxhdXRob3JzPjxhdXRob3I+QWhuLCBLaSBVaG48L2F1dGhv
 cj48YXV0aG9yPktpbSwgRGV1ay1Xb288L2F1dGhvcj48YXV0aG9yPkNobywgSHl1biBNaTwvYXV0
@@ -336,7 +336,7 @@
 PjxDaXRlPjxBdXRob3I+Wmhhbmc8L0F1dGhvcj48WWVhcj4yMDI0PC9ZZWFyPjxSZWNOdW0+OTQ8
 L1JlY051bT48cmVjb3JkPjxyZWMtbnVtYmVyPjk0PC9yZWMtbnVtYmVyPjxmb3JlaWduLWtleXM+
 PGtleSBhcHA9IkVOIiBkYi1pZD0ibWRhZTg1MDAxMDk0OTZmZWE0YWZmOWMwODZlMTZjYzI1ODk1
-IiB0aW1lc3RhbXA9IjE3OTMyMjY2MjEiPjk0PC9rZXk+PC9mb3JlaWduLWtleXM+PHJlZi10eXBl
+IiB0aW1lc3RhbXA9IjE3OTMyMjkxNzYiPjk0PC9rZXk+PC9mb3JlaWduLWtleXM+PHJlZi10eXBl
 IG5hbWU9IkpvdXJuYWwgQXJ0aWNsZSI+MTc8L3JlZi10eXBlPjxjb250cmlidXRvcnM+PGF1dGhv
 cnM+PGF1dGhvcj5aaGFuZywgTGlhbmc8L2F1dGhvcj48YXV0aG9yPkNoZW4sIFpoZWx1bjwvYXV0
 aG9yPjwvYXV0aG9ycz48L2NvbnRyaWJ1dG9ycz48dGl0bGVzPjx0aXRsZT5MYXJnZSBsYW5ndWFn
@@ -352,7 +352,7 @@
 L3JlY29yZD48L0NpdGU+PENpdGU+PEF1dGhvcj5MaXU8L0F1dGhvcj48WWVhcj4yMDI1PC9ZZWFy
 PjxSZWNOdW0+NTE8L1JlY051bT48cmVjb3JkPjxyZWMtbnVtYmVyPjUxPC9yZWMtbnVtYmVyPjxm
 b3JlaWduLWtleXM+PGtleSBhcHA9IkVOIiBkYi1pZD0ibWRhZTg1MDAxMDk0OTZmZWE0YWZmOWMw
-ODZlMTZjYzI1ODk1IiB0aW1lc3RhbXA9IjE3OTMyMjY2MjEiPjUxPC9rZXk+PC9mb3JlaWduLWtl
+ODZlMTZjYzI1ODk1IiB0aW1lc3RhbXA9IjE3OTMyMjkxNzYiPjUxPC9rZXk+PC9mb3JlaWduLWtl
 eXM+PHJlZi10eXBlIG5hbWU9IkpvdXJuYWwgQXJ0aWNsZSI+MTc8L3JlZi10eXBlPjxjb250cmli
 dXRvcnM+PGF1dGhvcnM+PGF1dGhvcj5MaXUsIE1pbmd6aGU8L2F1dGhvcj48YXV0aG9yPlpoYW5n
 LCBMaWFuZzwvYXV0aG9yPjxhdXRob3I+Q2hlbiwgSmlhbmxpPC9hdXRob3I+PGF1dGhvcj5DaGVu
@@ -381,7 +381,7 @@
 bC4gMjAyMzsgWmhhbmcgYW5kIENoZW4gMjAyNDsgTGl1IGV0IGFsLiAyMDI1KTwvRGlzcGxheVRl
 eHQ+PHJlY29yZD48cmVjLW51bWJlcj44MzwvcmVjLW51bWJlcj48Zm9yZWlnbi1rZXlzPjxrZXkg
 YXBwPSJFTiIgZGItaWQ9Im1kYWU4NTAwMTA5NDk2ZmVhNGFmZjljMDg2ZTE2Y2MyNTg5NSIgdGlt
-ZXN0YW1wPSIxNzkzMjI2NjIxIj44Mzwva2V5PjwvZm9yZWlnbi1rZXlzPjxyZWYtdHlwZSBuYW1l
+ZXN0YW1wPSIxNzkzMjI5MTc2Ij44Mzwva2V5PjwvZm9yZWlnbi1rZXlzPjxyZWYtdHlwZSBuYW1l
 PSJKb3VybmFsIEFydGljbGUiPjE3PC9yZWYtdHlwZT48Y29udHJpYnV0b3JzPjxhdXRob3JzPjxh
 dXRob3I+V2FuZywgWmhlPC9hdXRob3I+PGF1dGhvcj5Ib25nLCBUaWFuemhlbjwvYXV0aG9yPjwv
 YXV0aG9ycz48L2NvbnRyaWJ1dG9ycz48dGl0bGVzPjx0aXRsZT5SZWluZm9yY2VtZW50IGxlYXJu
@@ -396,7 +396,7 @@
 b25pYy1yZXNvdXJjZS1udW0+PC9yZWNvcmQ+PC9DaXRlPjxDaXRlPjxBdXRob3I+QWhuPC9BdXRo
 b3I+PFllYXI+MjAyMzwvWWVhcj48UmVjTnVtPjE8L1JlY051bT48cmVjb3JkPjxyZWMtbnVtYmVy
 PjE8L3JlYy1udW1iZXI+PGZvcmVpZ24ta2V5cz48a2V5IGFwcD0iRU4iIGRiLWlkPSJtZGFlODUw
-MDEwOTQ5NmZlYTRhZmY5YzA4NmUxNmNjMjU4OTUiIHRpbWVzdGFtcD0iMTc5MzIyNjYyMSI+MTwv
+MDEwOTQ5NmZlYTRhZmY5YzA4NmUxNmNjMjU4OTUiIHRpbWVzdGFtcD0iMTc5MzIyOTE3NiI+MTwv
 a2V5PjwvZm9yZWlnbi1rZXlzPjxyZWYtdHlwZSBuYW1lPSJKb3VybmFsIEFydGljbGUiPjE3PC9y
 ZWYtdHlwZT48Y29udHJpYnV0b3JzPjxhdXRob3JzPjxhdXRob3I+QWhuLCBLaSBVaG48L2F1dGhv
 cj48YXV0aG9yPktpbSwgRGV1ay1Xb288L2F1dGhvcj48YXV0aG9yPkNobywgSHl1biBNaTwvYXV0
@@ -414,7 +414,7 @@
 PjxDaXRlPjxBdXRob3I+Wmhhbmc8L0F1dGhvcj48WWVhcj4yMDI0PC9ZZWFyPjxSZWNOdW0+OTQ8
 L1JlY051bT48cmVjb3JkPjxyZWMtbnVtYmVyPjk0PC9yZWMtbnVtYmVyPjxmb3JlaWduLWtleXM+
 PGtleSBhcHA9IkVOIiBkYi1pZD0ibWRhZTg1MDAxMDk0OTZmZWE0YWZmOWMwODZlMTZjYzI1ODk1
-IiB0aW1lc3RhbXA9IjE3OTMyMjY2MjEiPjk0PC9rZXk+PC9mb3JlaWduLWtleXM+PHJlZi10eXBl
+IiB0aW1lc3RhbXA9IjE3OTMyMjkxNzYiPjk0PC9rZXk+PC9mb3JlaWduLWtleXM+PHJlZi10eXBl
 IG5hbWU9IkpvdXJuYWwgQXJ0aWNsZSI+MTc8L3JlZi10eXBlPjxjb250cmlidXRvcnM+PGF1dGhv
 cnM+PGF1dGhvcj5aaGFuZywgTGlhbmc8L2F1dGhvcj48YXV0aG9yPkNoZW4sIFpoZWx1bjwvYXV0
 aG9yPjwvYXV0aG9ycz48L2NvbnRyaWJ1dG9ycz48dGl0bGVzPjx0aXRsZT5MYXJnZSBsYW5ndWFn
@@ -430,7 +430,7 @@
 L3JlY29yZD48L0NpdGU+PENpdGU+PEF1dGhvcj5MaXU8L0F1dGhvcj48WWVhcj4yMDI1PC9ZZWFy
 PjxSZWNOdW0+NTE8L1JlY051bT48cmVjb3JkPjxyZWMtbnVtYmVyPjUxPC9yZWMtbnVtYmVyPjxm
 b3JlaWduLWtleXM+PGtleSBhcHA9IkVOIiBkYi1pZD0ibWRhZTg1MDAxMDk0OTZmZWE0YWZmOWMw
-ODZlMTZjYzI1ODk1IiB0aW1lc3RhbXA9IjE3OTMyMjY2MjEiPjUxPC9rZXk+PC9mb3JlaWduLWtl
+ODZlMTZjYzI1ODk1IiB0aW1lc3RhbXA9IjE3OTMyMjkxNzYiPjUxPC9rZXk+PC9mb3JlaWduLWtl
 eXM+PHJlZi10eXBlIG5hbWU9IkpvdXJuYWwgQXJ0aWNsZSI+MTc8L3JlZi10eXBlPjxjb250cmli
 dXRvcnM+PGF1dGhvcnM+PGF1dGhvcj5MaXUsIE1pbmd6aGU8L2F1dGhvcj48YXV0aG9yPlpoYW5n
 LCBMaWFuZzwvYXV0aG9yPjxhdXRob3I+Q2hlbiwgSmlhbmxpPC9hdXRob3I+PGF1dGhvcj5DaGVu
@@ -476,7 +476,7 @@
 Y051bT4yNjwvUmVjTnVtPjxEaXNwbGF5VGV4dD4oR29tZXMgZXQgYWwuIDIwMTg7IEhvbmcgZXQg
 YWwuIDIwMTgpPC9EaXNwbGF5VGV4dD48cmVjb3JkPjxyZWMtbnVtYmVyPjI2PC9yZWMtbnVtYmVy
 Pjxmb3JlaWduLWtleXM+PGtleSBhcHA9IkVOIiBkYi1pZD0ibWRhZTg1MDAxMDk0OTZmZWE0YWZm
-OWMwODZlMTZjYzI1ODk1IiB0aW1lc3RhbXA9IjE3OTMyMjY2MjEiPjI2PC9rZXk+PC9mb3JlaWdu
+OWMwODZlMTZjYzI1ODk1IiB0aW1lc3RhbXA9IjE3OTMyMjkxNzYiPjI2PC9rZXk+PC9mb3JlaWdu
 LWtleXM+PHJlZi10eXBlIG5hbWU9IkpvdXJuYWwgQXJ0aWNsZSI+MTc8L3JlZi10eXBlPjxjb250
 cmlidXRvcnM+PGF1dGhvcnM+PGF1dGhvcj5Hb21lcywgQ2zDoXVkaW88L2F1dGhvcj48YXV0aG9y
 PlRodWxlLCBDYXNwZXI8L2F1dGhvcj48YXV0aG9yPkJyb21hbiwgRGF2aWQ8L2F1dGhvcj48YXV0
@@ -493,7 +493,7 @@
 L0NpdGU+PENpdGU+PEF1dGhvcj5Ib25nPC9BdXRob3I+PFllYXI+MjAxODwvWWVhcj48UmVjTnVt
 PjM0PC9SZWNOdW0+PHJlY29yZD48cmVjLW51bWJlcj4zNDwvcmVjLW51bWJlcj48Zm9yZWlnbi1r
 ZXlzPjxrZXkgYXBwPSJFTiIgZGItaWQ9Im1kYWU4NTAwMTA5NDk2ZmVhNGFmZjljMDg2ZTE2Y2My
-NTg5NSIgdGltZXN0YW1wPSIxNzkzMjI2NjIxIj4zNDwva2V5PjwvZm9yZWlnbi1rZXlzPjxyZWYt
+NTg5NSIgdGltZXN0YW1wPSIxNzkzMjI5MTc2Ij4zNDwva2V5PjwvZm9yZWlnbi1rZXlzPjxyZWYt
 dHlwZSBuYW1lPSJKb3VybmFsIEFydGljbGUiPjE3PC9yZWYtdHlwZT48Y29udHJpYnV0b3JzPjxh
 dXRob3JzPjxhdXRob3I+SG9uZywgVGlhbnpoZW48L2F1dGhvcj48YXV0aG9yPkxhbmdldmluLCBK
 YXJlZDwvYXV0aG9yPjxhdXRob3I+U3VuLCBLYWl5dTwvYXV0aG9yPjwvYXV0aG9ycz48L2NvbnRy
@@ -518,7 +518,7 @@
 Y051bT4yNjwvUmVjTnVtPjxEaXNwbGF5VGV4dD4oR29tZXMgZXQgYWwuIDIwMTg7IEhvbmcgZXQg
 YWwuIDIwMTgpPC9EaXNwbGF5VGV4dD48cmVjb3JkPjxyZWMtbnVtYmVyPjI2PC9yZWMtbnVtYmVy
 Pjxmb3JlaWduLWtleXM+PGtleSBhcHA9IkVOIiBkYi1pZD0ibWRhZTg1MDAxMDk0OTZmZWE0YWZm
-OWMwODZlMTZjYzI1ODk1IiB0aW1lc3RhbXA9IjE3OTMyMjY2MjEiPjI2PC9rZXk+PC9mb3JlaWdu
+OWMwODZlMTZjYzI1ODk1IiB0aW1lc3RhbXA9IjE3OTMyMjkxNzYiPjI2PC9rZXk+PC9mb3JlaWdu
 LWtleXM+PHJlZi10eXBlIG5hbWU9IkpvdXJuYWwgQXJ0aWNsZSI+MTc8L3JlZi10eXBlPjxjb250
 cmlidXRvcnM+PGF1dGhvcnM+PGF1dGhvcj5Hb21lcywgQ2zDoXVkaW88L2F1dGhvcj48YXV0aG9y
 PlRodWxlLCBDYXNwZXI8L2F1dGhvcj48YXV0aG9yPkJyb21hbiwgRGF2aWQ8L2F1dGhvcj48YXV0
@@ -535,7 +535,7 @@
 L0NpdGU+PENpdGU+PEF1dGhvcj5Ib25nPC9BdXRob3I+PFllYXI+MjAxODwvWWVhcj48UmVjTnVt
 PjM0PC9SZWNOdW0+PHJlY29yZD48cmVjLW51bWJlcj4zNDwvcmVjLW51bWJlcj48Zm9yZWlnbi1r
 ZXlzPjxrZXkgYXBwPSJFTiIgZGItaWQ9Im1kYWU4NTAwMTA5NDk2ZmVhNGFmZjljMDg2ZTE2Y2My
-NTg5NSIgdGltZXN0YW1wPSIxNzkzMjI2NjIxIj4zNDwva2V5PjwvZm9yZWlnbi1rZXlzPjxyZWYt
+NTg5NSIgdGltZXN0YW1wPSIxNzkzMjI5MTc2Ij4zNDwva2V5PjwvZm9yZWlnbi1rZXlzPjxyZWYt
 dHlwZSBuYW1lPSJKb3VybmFsIEFydGljbGUiPjE3PC9yZWYtdHlwZT48Y29udHJpYnV0b3JzPjxh
 dXRob3JzPjxhdXRob3I+SG9uZywgVGlhbnpoZW48L2F1dGhvcj48YXV0aG9yPkxhbmdldmluLCBK
 YXJlZDwvYXV0aG9yPjxhdXRob3I+U3VuLCBLYWl5dTwvYXV0aG9yPjwvYXV0aG9ycz48L2NvbnRy
@@ -586,7 +586,7 @@
 PjxSZWNOdW0+NjwvUmVjTnVtPjxEaXNwbGF5VGV4dD4oQmxvY2h3aXR6IGV0IGFsLiAyMDExOyBK
 dW5naGFubnMgZXQgYWwuIDIwMjEpPC9EaXNwbGF5VGV4dD48cmVjb3JkPjxyZWMtbnVtYmVyPjY8
 L3JlYy1udW1iZXI+PGZvcmVpZ24ta2V5cz48a2V5IGFwcD0iRU4iIGRiLWlkPSJtZGFlODUwMDEw
-OTQ5NmZlYTRhZmY5YzA4NmUxNmNjMjU4OTUiIHRpbWVzdGFtcD0iMTc5MzIyNjYyMSI+Njwva2V5
+OTQ5NmZlYTRhZmY5YzA4NmUxNmNjMjU4OTUiIHRpbWVzdGFtcD0iMTc5MzIyOTE3NiI+Njwva2V5
 PjwvZm9yZWlnbi1rZXlzPjxyZWYtdHlwZSBuYW1lPSJDb25mZXJlbmNlIFBhcGVyIj40NzwvcmVm
 LXR5cGU+PGNvbnRyaWJ1dG9ycz48YXV0aG9ycz48YXV0aG9yPkJsb2Nod2l0eiwgVC48L2F1dGhv
 cj48YXV0aG9yPk90dGVyLCBNLjwvYXV0aG9yPjxhdXRob3I+QXJub2xkLCBNLjwvYXV0aG9yPjxh
@@ -608,7 +608,7 @@
 Pkp1bmdoYW5uczwvQXV0aG9yPjxZZWFyPjIwMjE8L1llYXI+PFJlY051bT40MjwvUmVjTnVtPjxy
 ZWNvcmQ+PHJlYy1udW1iZXI+NDI8L3JlYy1udW1iZXI+PGZvcmVpZ24ta2V5cz48a2V5IGFwcD0i
 RU4iIGRiLWlkPSJtZGFlODUwMDEwOTQ5NmZlYTRhZmY5YzA4NmUxNmNjMjU4OTUiIHRpbWVzdGFt
-cD0iMTc5MzIyNjYyMSI+NDI8L2tleT48L2ZvcmVpZ24ta2V5cz48cmVmLXR5cGUgbmFtZT0iQ29u
+cD0iMTc5MzIyOTE3NiI+NDI8L2tleT48L2ZvcmVpZ24ta2V5cz48cmVmLXR5cGUgbmFtZT0iQ29u
 ZmVyZW5jZSBQYXBlciI+NDc8L3JlZi10eXBlPjxjb250cmlidXRvcnM+PGF1dGhvcnM+PGF1dGhv
 cj5KdW5naGFubnMsIEFuZHJlYXM8L2F1dGhvcj48YXV0aG9yPkJsb2Nod2l0eiwgVG9yc3Rlbjwv
 YXV0aG9yPjxhdXRob3I+QmVydHNjaCwgQ2hyaXN0aWFuPC9hdXRob3I+PGF1dGhvcj5Tb21tZXIs
@@ -639,7 +639,7 @@
 PjxSZWNOdW0+NjwvUmVjTnVtPjxEaXNwbGF5VGV4dD4oQmxvY2h3aXR6IGV0IGFsLiAyMDExOyBK
 dW5naGFubnMgZXQgYWwuIDIwMjEpPC9EaXNwbGF5VGV4dD48cmVjb3JkPjxyZWMtbnVtYmVyPjY8
 L3JlYy1udW1iZXI+PGZvcmVpZ24ta2V5cz48a2V5IGFwcD0iRU4iIGRiLWlkPSJtZGFlODUwMDEw
-OTQ5NmZlYTRhZmY5YzA4NmUxNmNjMjU4OTUiIHRpbWVzdGFtcD0iMTc5MzIyNjYyMSI+Njwva2V5
+OTQ5NmZlYTRhZmY5YzA4NmUxNmNjMjU4OTUiIHRpbWVzdGFtcD0iMTc5MzIyOTE3NiI+Njwva2V5
 PjwvZm9yZWlnbi1rZXlzPjxyZWYtdHlwZSBuYW1lPSJDb25mZXJlbmNlIFBhcGVyIj40NzwvcmVm
 LXR5cGU+PGNvbnRyaWJ1dG9ycz48YXV0aG9ycz48YXV0aG9yPkJsb2Nod2l0eiwgVC48L2F1dGhv
 cj48YXV0aG9yPk90dGVyLCBNLjwvYXV0aG9yPjxhdXRob3I+QXJub2xkLCBNLjwvYXV0aG9yPjxh
@@ -661,7 +661,7 @@
 Pkp1bmdoYW5uczwvQXV0aG9yPjxZZWFyPjIwMjE8L1llYXI+PFJlY051bT40MjwvUmVjTnVtPjxy
 ZWNvcmQ+PHJlYy1udW1iZXI+NDI8L3JlYy1udW1iZXI+PGZvcmVpZ24ta2V5cz48a2V5IGFwcD0i
 RU4iIGRiLWlkPSJtZGFlODUwMDEwOTQ5NmZlYTRhZmY5YzA4NmUxNmNjMjU4OTUiIHRpbWVzdGFt
-cD0iMTc5MzIyNjYyMSI+NDI8L2tleT48L2ZvcmVpZ24ta2V5cz48cmVmLXR5cGUgbmFtZT0iQ29u
+cD0iMTc5MzIyOTE3NiI+NDI8L2tleT48L2ZvcmVpZ24ta2V5cz48cmVmLXR5cGUgbmFtZT0iQ29u
 ZmVyZW5jZSBQYXBlciI+NDc8L3JlZi10eXBlPjxjb250cmlidXRvcnM+PGF1dGhvcnM+PGF1dGhv
 cj5KdW5naGFubnMsIEFuZHJlYXM8L2F1dGhvcj48YXV0aG9yPkJsb2Nod2l0eiwgVG9yc3Rlbjwv
 YXV0aG9yPjxhdXRob3I+QmVydHNjaCwgQ2hyaXN0aWFuPC9hdXRob3I+PGF1dGhvcj5Tb21tZXIs
@@ -710,7 +710,7 @@
 ZWNOdW0+ODU8L1JlY051bT48RGlzcGxheVRleHQ+KFdldHRlciAyMDExOyBOb3VpZHVpIGV0IGFs
 LiAyMDE0KTwvRGlzcGxheVRleHQ+PHJlY29yZD48cmVjLW51bWJlcj44NTwvcmVjLW51bWJlcj48
 Zm9yZWlnbi1rZXlzPjxrZXkgYXBwPSJFTiIgZGItaWQ9Im1kYWU4NTAwMTA5NDk2ZmVhNGFmZjlj
-MDg2ZTE2Y2MyNTg5NSIgdGltZXN0YW1wPSIxNzkzMjI2NjIxIj44NTwva2V5PjwvZm9yZWlnbi1r
+MDg2ZTE2Y2MyNTg5NSIgdGltZXN0YW1wPSIxNzkzMjI5MTc2Ij44NTwva2V5PjwvZm9yZWlnbi1r
 ZXlzPjxyZWYtdHlwZSBuYW1lPSJKb3VybmFsIEFydGljbGUiPjE3PC9yZWYtdHlwZT48Y29udHJp
 YnV0b3JzPjxhdXRob3JzPjxhdXRob3I+V2V0dGVyLCBNaWNoYWVsPC9hdXRob3I+PC9hdXRob3Jz
 PjwvY29udHJpYnV0b3JzPjx0aXRsZXM+PHRpdGxlPkNvLXNpbXVsYXRpb24gb2YgYnVpbGRpbmcg
@@ -728,7 +728,7 @@
 b3VpZHVpPC9BdXRob3I+PFllYXI+MjAxNDwvWWVhcj48UmVjTnVtPjU5PC9SZWNOdW0+PHJlY29y
 ZD48cmVjLW51bWJlcj41OTwvcmVjLW51bWJlcj48Zm9yZWlnbi1rZXlzPjxrZXkgYXBwPSJFTiIg
 ZGItaWQ9Im1kYWU4NTAwMTA5NDk2ZmVhNGFmZjljMDg2ZTE2Y2MyNTg5NSIgdGltZXN0YW1wPSIx
-NzkzMjI2NjIxIj41OTwva2V5PjwvZm9yZWlnbi1rZXlzPjxyZWYtdHlwZSBuYW1lPSJKb3VybmFs
+NzkzMjI5MTc2Ij41OTwva2V5PjwvZm9yZWlnbi1rZXlzPjxyZWYtdHlwZSBuYW1lPSJKb3VybmFs
 IEFydGljbGUiPjE3PC9yZWYtdHlwZT48Y29udHJpYnV0b3JzPjxhdXRob3JzPjxhdXRob3I+Tm91
 aWR1aSwgVGhpZXJyeTwvYXV0aG9yPjxhdXRob3I+V2V0dGVyLCBNaWNoYWVsPC9hdXRob3I+PGF1
 dGhvcj5adW8sIFdhbmdkYTwvYXV0aG9yPjwvYXV0aG9ycz48L2NvbnRyaWJ1dG9ycz48dGl0bGVz
@@ -754,7 +754,7 @@
 ZWNOdW0+ODU8L1JlY051bT48RGlzcGxheVRleHQ+KFdldHRlciAyMDExOyBOb3VpZHVpIGV0IGFs
 LiAyMDE0KTwvRGlzcGxheVRleHQ+PHJlY29yZD48cmVjLW51bWJlcj44NTwvcmVjLW51bWJlcj48
 Zm9yZWlnbi1rZXlzPjxrZXkgYXBwPSJFTiIgZGItaWQ9Im1kYWU4NTAwMTA5NDk2ZmVhNGFmZjlj
-MDg2ZTE2Y2MyNTg5NSIgdGltZXN0YW1wPSIxNzkzMjI2NjIxIj44NTwva2V5PjwvZm9yZWlnbi1r
+MDg2ZTE2Y2MyNTg5NSIgdGltZXN0YW1wPSIxNzkzMjI5MTc2Ij44NTwva2V5PjwvZm9yZWlnbi1r
 ZXlzPjxyZWYtdHlwZSBuYW1lPSJKb3VybmFsIEFydGljbGUiPjE3PC9yZWYtdHlwZT48Y29udHJp
 YnV0b3JzPjxhdXRob3JzPjxhdXRob3I+V2V0dGVyLCBNaWNoYWVsPC9hdXRob3I+PC9hdXRob3Jz
 PjwvY29udHJpYnV0b3JzPjx0aXRsZXM+PHRpdGxlPkNvLXNpbXVsYXRpb24gb2YgYnVpbGRpbmcg
@@ -772,7 +772,7 @@
 b3VpZHVpPC9BdXRob3I+PFllYXI+MjAxNDwvWWVhcj48UmVjTnVtPjU5PC9SZWNOdW0+PHJlY29y
 ZD48cmVjLW51bWJlcj41OTwvcmVjLW51bWJlcj48Zm9yZWlnbi1rZXlzPjxrZXkgYXBwPSJFTiIg
 ZGItaWQ9Im1kYWU4NTAwMTA5NDk2ZmVhNGFmZjljMDg2ZTE2Y2MyNTg5NSIgdGltZXN0YW1wPSIx
-NzkzMjI2NjIxIj41OTwva2V5PjwvZm9yZWlnbi1rZXlzPjxyZWYtdHlwZSBuYW1lPSJKb3VybmFs
+NzkzMjI5MTc2Ij41OTwva2V5PjwvZm9yZWlnbi1rZXlzPjxyZWYtdHlwZSBuYW1lPSJKb3VybmFs
 IEFydGljbGUiPjE3PC9yZWYtdHlwZT48Y29udHJpYnV0b3JzPjxhdXRob3JzPjxhdXRob3I+Tm91
 aWR1aSwgVGhpZXJyeTwvYXV0aG9yPjxhdXRob3I+V2V0dGVyLCBNaWNoYWVsPC9hdXRob3I+PGF1
 dGhvcj5adW8sIFdhbmdkYTwvYXV0aG9yPjwvYXV0aG9ycz48L2NvbnRyaWJ1dG9ycz48dGl0bGVz
@@ -814,7 +814,7 @@
         <w:fldChar w:fldCharType="begin"/>
       </w:r>
       <w:r>
-        <w:instrText xml:space="preserve"> ADDIN EN.CITE &lt;EndNote&gt;&lt;Cite&gt;&lt;Author&gt;Wetter&lt;/Author&gt;&lt;Year&gt;2020&lt;/Year&gt;&lt;RecNum&gt;86&lt;/RecNum&gt;&lt;DisplayText&gt;(Wetter et al. 2020)&lt;/DisplayText&gt;&lt;record&gt;&lt;rec-number&gt;86&lt;/rec-number&gt;&lt;foreign-keys&gt;&lt;key app="EN" db-id="mdae8500109496fea4aff9c086e16cc25895" timestamp="1793226621"&gt;86&lt;/key&gt;&lt;/foreign-keys&gt;&lt;ref-type name="Conference Paper"&gt;47&lt;/ref-type&gt;&lt;contributors&gt;&lt;authors&gt;&lt;author&gt;Wetter, Michael&lt;/author&gt;&lt;author&gt;Benne, Kyle&lt;/author&gt;&lt;author&gt;Gautier, Antoine&lt;/author&gt;&lt;author&gt;Nouidui, Thierry S.&lt;/author&gt;&lt;author&gt;Ramle, Agnes&lt;/author&gt;&lt;author&gt;Roth, Amir&lt;/author&gt;&lt;author&gt;Tummescheit, Hubertus&lt;/author&gt;&lt;author&gt;Mentzer, Stuart&lt;/author&gt;&lt;author&gt;Winther, Christian&lt;/author&gt;&lt;/authors&gt;&lt;/contributors&gt;&lt;titles&gt;&lt;title&gt;Lifting the Garage Door on Spawn, an Open-Source BEM-Controls Engine&lt;/title&gt;&lt;secondary-title&gt;Proceedings of SimBuild Conference 2020, ASHRAE/IBPSA-USA Building Simulation Conference&lt;/secondary-title&gt;&lt;/titles&gt;&lt;volume&gt;9&lt;/volume&gt;&lt;dates&gt;&lt;year&gt;2020&lt;/year&gt;&lt;/dates&gt;&lt;publisher&gt;IBPSA-USA&lt;/publisher&gt;&lt;label&gt;wetter2020&lt;/label&gt;&lt;urls&gt;&lt;/urls&gt;&lt;electronic-resource-num&gt;10.26868/25746308.2020.C063&lt;/electronic-resource-num&gt;&lt;/record&gt;&lt;/Cite&gt;&lt;/EndNote&gt;</w:instrText>
+        <w:instrText xml:space="preserve"> ADDIN EN.CITE &lt;EndNote&gt;&lt;Cite&gt;&lt;Author&gt;Wetter&lt;/Author&gt;&lt;Year&gt;2020&lt;/Year&gt;&lt;RecNum&gt;86&lt;/RecNum&gt;&lt;DisplayText&gt;(Wetter et al. 2020)&lt;/DisplayText&gt;&lt;record&gt;&lt;rec-number&gt;86&lt;/rec-number&gt;&lt;foreign-keys&gt;&lt;key app="EN" db-id="mdae8500109496fea4aff9c086e16cc25895" timestamp="1793229176"&gt;86&lt;/key&gt;&lt;/foreign-keys&gt;&lt;ref-type name="Conference Paper"&gt;47&lt;/ref-type&gt;&lt;contributors&gt;&lt;authors&gt;&lt;author&gt;Wetter, Michael&lt;/author&gt;&lt;author&gt;Benne, Kyle&lt;/author&gt;&lt;author&gt;Gautier, Antoine&lt;/author&gt;&lt;author&gt;Nouidui, Thierry S.&lt;/author&gt;&lt;author&gt;Ramle, Agnes&lt;/author&gt;&lt;author&gt;Roth, Amir&lt;/author&gt;&lt;author&gt;Tummescheit, Hubertus&lt;/author&gt;&lt;author&gt;Mentzer, Stuart&lt;/author&gt;&lt;author&gt;Winther, Christian&lt;/author&gt;&lt;/authors&gt;&lt;/contributors&gt;&lt;titles&gt;&lt;title&gt;Lifting the Garage Door on Spawn, an Open-Source BEM-Controls Engine&lt;/title&gt;&lt;secondary-title&gt;Proceedings of SimBuild Conference 2020, ASHRAE/IBPSA-USA Building Simulation Conference&lt;/secondary-title&gt;&lt;/titles&gt;&lt;volume&gt;9&lt;/volume&gt;&lt;dates&gt;&lt;year&gt;2020&lt;/year&gt;&lt;/dates&gt;&lt;publisher&gt;IBPSA-USA&lt;/publisher&gt;&lt;label&gt;wetter2020&lt;/label&gt;&lt;urls&gt;&lt;/urls&gt;&lt;electronic-resource-num&gt;10.26868/25746308.2020.C063&lt;/electronic-resource-num&gt;&lt;/record&gt;&lt;/Cite&gt;&lt;/EndNote&gt;</w:instrText>
       </w:r>
       <w:r>
         <w:fldChar w:fldCharType="separate"/>
@@ -838,7 +838,7 @@
 dCBhbC4gMjAyMTsgWmhhbmcgYW5kIEFyZGFrYW5pYW4gMjAyMDsgQmx1bSBldCBhbC4gMjAyMSk8
 L0Rpc3BsYXlUZXh0PjxyZWNvcmQ+PHJlYy1udW1iZXI+NDE8L3JlYy1udW1iZXI+PGZvcmVpZ24t
 a2V5cz48a2V5IGFwcD0iRU4iIGRiLWlkPSJtZGFlODUwMDEwOTQ5NmZlYTRhZmY5YzA4NmUxNmNj
-MjU4OTUiIHRpbWVzdGFtcD0iMTc5MzIyNjYyMSI+NDE8L2tleT48L2ZvcmVpZ24ta2V5cz48cmVm
+MjU4OTUiIHRpbWVzdGFtcD0iMTc5MzIyOTE3NiI+NDE8L2tleT48L2ZvcmVpZ24ta2V5cz48cmVm
 LXR5cGUgbmFtZT0iQ29uZmVyZW5jZSBQYXBlciI+NDc8L3JlZi10eXBlPjxjb250cmlidXRvcnM+
 PGF1dGhvcnM+PGF1dGhvcj5KaW3DqW5lei1SYWJvc28sIEphdmllcjwvYXV0aG9yPjxhdXRob3I+
 Q2FtcG95LU5pZXZlcywgQWxlamFuZHJvPC9hdXRob3I+PGF1dGhvcj5NYW5qYXZhY2FzLUx1Y2Fz
@@ -857,7 +857,7 @@
 PlpoYW5nPC9BdXRob3I+PFllYXI+MjAyMDwvWWVhcj48UmVjTnVtPjkwPC9SZWNOdW0+PHJlY29y
 ZD48cmVjLW51bWJlcj45MDwvcmVjLW51bWJlcj48Zm9yZWlnbi1rZXlzPjxrZXkgYXBwPSJFTiIg
 ZGItaWQ9Im1kYWU4NTAwMTA5NDk2ZmVhNGFmZjljMDg2ZTE2Y2MyNTg5NSIgdGltZXN0YW1wPSIx
-NzkzMjI2NjIxIj45MDwva2V5PjwvZm9yZWlnbi1rZXlzPjxyZWYtdHlwZSBuYW1lPSJDb25mZXJl
+NzkzMjI5MTc2Ij45MDwva2V5PjwvZm9yZWlnbi1rZXlzPjxyZWYtdHlwZSBuYW1lPSJDb25mZXJl
 bmNlIFBhcGVyIj40NzwvcmVmLXR5cGU+PGNvbnRyaWJ1dG9ycz48YXV0aG9ycz48YXV0aG9yPlpo
 YW5nLCBUaWFueXU8L2F1dGhvcj48YXV0aG9yPkFyZGFrYW5pYW4sIE9taWQ8L2F1dGhvcj48L2F1
 dGhvcnM+PC9jb250cmlidXRvcnM+PHRpdGxlcz48dGl0bGU+Q09CUzogQ09tcHJlaGVuc2l2ZSBC
@@ -872,7 +872,7 @@
 ZD48L0NpdGU+PENpdGU+PEF1dGhvcj5CbHVtPC9BdXRob3I+PFllYXI+MjAyMTwvWWVhcj48UmVj
 TnVtPjc8L1JlY051bT48cmVjb3JkPjxyZWMtbnVtYmVyPjc8L3JlYy1udW1iZXI+PGZvcmVpZ24t
 a2V5cz48a2V5IGFwcD0iRU4iIGRiLWlkPSJtZGFlODUwMDEwOTQ5NmZlYTRhZmY5YzA4NmUxNmNj
-MjU4OTUiIHRpbWVzdGFtcD0iMTc5MzIyNjYyMSI+Nzwva2V5PjwvZm9yZWlnbi1rZXlzPjxyZWYt
+MjU4OTUiIHRpbWVzdGFtcD0iMTc5MzIyOTE3NiI+Nzwva2V5PjwvZm9yZWlnbi1rZXlzPjxyZWYt
 dHlwZSBuYW1lPSJKb3VybmFsIEFydGljbGUiPjE3PC9yZWYtdHlwZT48Y29udHJpYnV0b3JzPjxh
 dXRob3JzPjxhdXRob3I+Qmx1bSwgRGF2aWQ8L2F1dGhvcj48YXV0aG9yPkFycm95bywgSmF2aWVy
 PC9hdXRob3I+PGF1dGhvcj5IdWFuZywgU2VuPC9hdXRob3I+PGF1dGhvcj5EcmdvxYhhLCBKw6Fu
@@ -905,7 +905,7 @@
 dCBhbC4gMjAyMTsgWmhhbmcgYW5kIEFyZGFrYW5pYW4gMjAyMDsgQmx1bSBldCBhbC4gMjAyMSk8
 L0Rpc3BsYXlUZXh0PjxyZWNvcmQ+PHJlYy1udW1iZXI+NDE8L3JlYy1udW1iZXI+PGZvcmVpZ24t
 a2V5cz48a2V5IGFwcD0iRU4iIGRiLWlkPSJtZGFlODUwMDEwOTQ5NmZlYTRhZmY5YzA4NmUxNmNj
-MjU4OTUiIHRpbWVzdGFtcD0iMTc5MzIyNjYyMSI+NDE8L2tleT48L2ZvcmVpZ24ta2V5cz48cmVm
+MjU4OTUiIHRpbWVzdGFtcD0iMTc5MzIyOTE3NiI+NDE8L2tleT48L2ZvcmVpZ24ta2V5cz48cmVm
 LXR5cGUgbmFtZT0iQ29uZmVyZW5jZSBQYXBlciI+NDc8L3JlZi10eXBlPjxjb250cmlidXRvcnM+
 PGF1dGhvcnM+PGF1dGhvcj5KaW3DqW5lei1SYWJvc28sIEphdmllcjwvYXV0aG9yPjxhdXRob3I+
 Q2FtcG95LU5pZXZlcywgQWxlamFuZHJvPC9hdXRob3I+PGF1dGhvcj5NYW5qYXZhY2FzLUx1Y2Fz
@@ -924,7 +924,7 @@
 PlpoYW5nPC9BdXRob3I+PFllYXI+MjAyMDwvWWVhcj48UmVjTnVtPjkwPC9SZWNOdW0+PHJlY29y
 ZD48cmVjLW51bWJlcj45MDwvcmVjLW51bWJlcj48Zm9yZWlnbi1rZXlzPjxrZXkgYXBwPSJFTiIg
 ZGItaWQ9Im1kYWU4NTAwMTA5NDk2ZmVhNGFmZjljMDg2ZTE2Y2MyNTg5NSIgdGltZXN0YW1wPSIx
-NzkzMjI2NjIxIj45MDwva2V5PjwvZm9yZWlnbi1rZXlzPjxyZWYtdHlwZSBuYW1lPSJDb25mZXJl
+NzkzMjI5MTc2Ij45MDwva2V5PjwvZm9yZWlnbi1rZXlzPjxyZWYtdHlwZSBuYW1lPSJDb25mZXJl
 bmNlIFBhcGVyIj40NzwvcmVmLXR5cGU+PGNvbnRyaWJ1dG9ycz48YXV0aG9ycz48YXV0aG9yPlpo
 YW5nLCBUaWFueXU8L2F1dGhvcj48YXV0aG9yPkFyZGFrYW5pYW4sIE9taWQ8L2F1dGhvcj48L2F1
 dGhvcnM+PC9jb250cmlidXRvcnM+PHRpdGxlcz48dGl0bGU+Q09CUzogQ09tcHJlaGVuc2l2ZSBC
@@ -939,7 +939,7 @@
 ZD48L0NpdGU+PENpdGU+PEF1dGhvcj5CbHVtPC9BdXRob3I+PFllYXI+MjAyMTwvWWVhcj48UmVj
 TnVtPjc8L1JlY051bT48cmVjb3JkPjxyZWMtbnVtYmVyPjc8L3JlYy1udW1iZXI+PGZvcmVpZ24t
 a2V5cz48a2V5IGFwcD0iRU4iIGRiLWlkPSJtZGFlODUwMDEwOTQ5NmZlYTRhZmY5YzA4NmUxNmNj
-MjU4OTUiIHRpbWVzdGFtcD0iMTc5MzIyNjYyMSI+Nzwva2V5PjwvZm9yZWlnbi1rZXlzPjxyZWYt
+MjU4OTUiIHRpbWVzdGFtcD0iMTc5MzIyOTE3NiI+Nzwva2V5PjwvZm9yZWlnbi1rZXlzPjxyZWYt
 dHlwZSBuYW1lPSJKb3VybmFsIEFydGljbGUiPjE3PC9yZWYtdHlwZT48Y29udHJpYnV0b3JzPjxh
 dXRob3JzPjxhdXRob3I+Qmx1bSwgRGF2aWQ8L2F1dGhvcj48YXV0aG9yPkFycm95bywgSmF2aWVy
 PC9hdXRob3I+PGF1dGhvcj5IdWFuZywgU2VuPC9hdXRob3I+PGF1dGhvcj5EcmdvxYhhLCBKw6Fu
@@ -990,7 +990,7 @@
 OyBIYXJkeSBldCBhbC4gMjAyNDsgU3RlaW5icmluayBldCBhbC4gMjAxOTsgT2ZlbmxvY2ggZXQg
 YWwuIDIwMjIpPC9EaXNwbGF5VGV4dD48cmVjb3JkPjxyZWMtbnVtYmVyPjY4PC9yZWMtbnVtYmVy
 Pjxmb3JlaWduLWtleXM+PGtleSBhcHA9IkVOIiBkYi1pZD0ibWRhZTg1MDAxMDk0OTZmZWE0YWZm
-OWMwODZlMTZjYzI1ODk1IiB0aW1lc3RhbXA9IjE3OTMyMjY2MjEiPjY4PC9rZXk+PC9mb3JlaWdu
+OWMwODZlMTZjYzI1ODk1IiB0aW1lc3RhbXA9IjE3OTMyMjkxNzYiPjY4PC9rZXk+PC9mb3JlaWdu
 LWtleXM+PHJlZi10eXBlIG5hbWU9IkNvbmZlcmVuY2UgUGFwZXIiPjQ3PC9yZWYtdHlwZT48Y29u
 dHJpYnV0b3JzPjxhdXRob3JzPjxhdXRob3I+UGFsbWludGllciwgQnJ5YW48L2F1dGhvcj48YXV0
 aG9yPktyaXNobmFtdXJ0aHksIERoZWVwYWs8L2F1dGhvcj48YXV0aG9yPlRvcCwgUGhpbGlwPC9h
@@ -1008,7 +1008,7 @@
 ZD48L0NpdGU+PENpdGU+PEF1dGhvcj5IYXJkeTwvQXV0aG9yPjxZZWFyPjIwMjQ8L1llYXI+PFJl
 Y051bT4yOTwvUmVjTnVtPjxyZWNvcmQ+PHJlYy1udW1iZXI+Mjk8L3JlYy1udW1iZXI+PGZvcmVp
 Z24ta2V5cz48a2V5IGFwcD0iRU4iIGRiLWlkPSJtZGFlODUwMDEwOTQ5NmZlYTRhZmY5YzA4NmUx
-NmNjMjU4OTUiIHRpbWVzdGFtcD0iMTc5MzIyNjYyMSI+Mjk8L2tleT48L2ZvcmVpZ24ta2V5cz48
+NmNjMjU4OTUiIHRpbWVzdGFtcD0iMTc5MzIyOTE3NiI+Mjk8L2tleT48L2ZvcmVpZ24ta2V5cz48
 cmVmLXR5cGUgbmFtZT0iSm91cm5hbCBBcnRpY2xlIj4xNzwvcmVmLXR5cGU+PGNvbnRyaWJ1dG9y
 cz48YXV0aG9ycz48YXV0aG9yPkhhcmR5LCBUcmV2b3IgRC48L2F1dGhvcj48YXV0aG9yPlBhbG1p
 bnRpZXIsIEJyeWFuPC9hdXRob3I+PGF1dGhvcj5Ub3AsIFBoaWxpcCBMLjwvYXV0aG9yPjxhdXRo
@@ -1026,7 +1026,7 @@
 bmJyaW5rPC9BdXRob3I+PFllYXI+MjAxOTwvWWVhcj48UmVjTnVtPjc4PC9SZWNOdW0+PHJlY29y
 ZD48cmVjLW51bWJlcj43ODwvcmVjLW51bWJlcj48Zm9yZWlnbi1rZXlzPjxrZXkgYXBwPSJFTiIg
 ZGItaWQ9Im1kYWU4NTAwMTA5NDk2ZmVhNGFmZjljMDg2ZTE2Y2MyNTg5NSIgdGltZXN0YW1wPSIx
-NzkzMjI2NjIxIj43ODwva2V5PjwvZm9yZWlnbi1rZXlzPjxyZWYtdHlwZSBuYW1lPSJKb3VybmFs
+NzkzMjI5MTc2Ij43ODwva2V5PjwvZm9yZWlnbi1rZXlzPjxyZWYtdHlwZSBuYW1lPSJKb3VybmFs
 IEFydGljbGUiPjE3PC9yZWYtdHlwZT48Y29udHJpYnV0b3JzPjxhdXRob3JzPjxhdXRob3I+U3Rl
 aW5icmluaywgQ29ybmVsaXVzPC9hdXRob3I+PGF1dGhvcj5CbGFuay1CYWJhemFkZWgsIE1hcml0
 YTwvYXV0aG9yPjxhdXRob3I+RWwtQW1hLCBBbmRyw6k8L2F1dGhvcj48YXV0aG9yPkhvbGx5LCBT
@@ -1047,8 +1047,8 @@
 cm9uaWMtcmVzb3VyY2UtbnVtPjwvcmVjb3JkPjwvQ2l0ZT48Q2l0ZT48QXV0aG9yPk9mZW5sb2No
 PC9BdXRob3I+PFllYXI+MjAyMjwvWWVhcj48UmVjTnVtPjYyPC9SZWNOdW0+PHJlY29yZD48cmVj
 LW51bWJlcj42MjwvcmVjLW51bWJlcj48Zm9yZWlnbi1rZXlzPjxrZXkgYXBwPSJFTiIgZGItaWQ9
-Im1kYWU4NTAwMTA5NDk2ZmVhNGFmZjljMDg2ZTE2Y2MyNTg5NSIgdGltZXN0YW1wPSIxNzkzMjI2
-NjIxIj42Mjwva2V5PjwvZm9yZWlnbi1rZXlzPjxyZWYtdHlwZSBuYW1lPSJDb25mZXJlbmNlIFBh
+Im1kYWU4NTAwMTA5NDk2ZmVhNGFmZjljMDg2ZTE2Y2MyNTg5NSIgdGltZXN0YW1wPSIxNzkzMjI5
+MTc2Ij42Mjwva2V5PjwvZm9yZWlnbi1rZXlzPjxyZWYtdHlwZSBuYW1lPSJDb25mZXJlbmNlIFBh
 cGVyIj40NzwvcmVmLXR5cGU+PGNvbnRyaWJ1dG9ycz48YXV0aG9ycz48YXV0aG9yPk9mZW5sb2No
 LCBBbm5pa2E8L2F1dGhvcj48YXV0aG9yPlNjaHdhcnosIEphbiBTw7ZyZW48L2F1dGhvcj48YXV0
 aG9yPlRvbGssIERlYm9yYWg8L2F1dGhvcj48YXV0aG9yPkJyYW5kdCwgVG9iaWFzPC9hdXRob3I+
@@ -1075,7 +1075,7 @@
 OyBIYXJkeSBldCBhbC4gMjAyNDsgU3RlaW5icmluayBldCBhbC4gMjAxOTsgT2ZlbmxvY2ggZXQg
 YWwuIDIwMjIpPC9EaXNwbGF5VGV4dD48cmVjb3JkPjxyZWMtbnVtYmVyPjY4PC9yZWMtbnVtYmVy
 Pjxmb3JlaWduLWtleXM+PGtleSBhcHA9IkVOIiBkYi1pZD0ibWRhZTg1MDAxMDk0OTZmZWE0YWZm
-OWMwODZlMTZjYzI1ODk1IiB0aW1lc3RhbXA9IjE3OTMyMjY2MjEiPjY4PC9rZXk+PC9mb3JlaWdu
+OWMwODZlMTZjYzI1ODk1IiB0aW1lc3RhbXA9IjE3OTMyMjkxNzYiPjY4PC9rZXk+PC9mb3JlaWdu
 LWtleXM+PHJlZi10eXBlIG5hbWU9IkNvbmZlcmVuY2UgUGFwZXIiPjQ3PC9yZWYtdHlwZT48Y29u
 dHJpYnV0b3JzPjxhdXRob3JzPjxhdXRob3I+UGFsbWludGllciwgQnJ5YW48L2F1dGhvcj48YXV0
 aG9yPktyaXNobmFtdXJ0aHksIERoZWVwYWs8L2F1dGhvcj48YXV0aG9yPlRvcCwgUGhpbGlwPC9h
@@ -1093,7 +1093,7 @@
 ZD48L0NpdGU+PENpdGU+PEF1dGhvcj5IYXJkeTwvQXV0aG9yPjxZZWFyPjIwMjQ8L1llYXI+PFJl
 Y051bT4yOTwvUmVjTnVtPjxyZWNvcmQ+PHJlYy1udW1iZXI+Mjk8L3JlYy1udW1iZXI+PGZvcmVp
 Z24ta2V5cz48a2V5IGFwcD0iRU4iIGRiLWlkPSJtZGFlODUwMDEwOTQ5NmZlYTRhZmY5YzA4NmUx
-NmNjMjU4OTUiIHRpbWVzdGFtcD0iMTc5MzIyNjYyMSI+Mjk8L2tleT48L2ZvcmVpZ24ta2V5cz48
+NmNjMjU4OTUiIHRpbWVzdGFtcD0iMTc5MzIyOTE3NiI+Mjk8L2tleT48L2ZvcmVpZ24ta2V5cz48
 cmVmLXR5cGUgbmFtZT0iSm91cm5hbCBBcnRpY2xlIj4xNzwvcmVmLXR5cGU+PGNvbnRyaWJ1dG9y
 cz48YXV0aG9ycz48YXV0aG9yPkhhcmR5LCBUcmV2b3IgRC48L2F1dGhvcj48YXV0aG9yPlBhbG1p
 bnRpZXIsIEJyeWFuPC9hdXRob3I+PGF1dGhvcj5Ub3AsIFBoaWxpcCBMLjwvYXV0aG9yPjxhdXRo
@@ -1111,7 +1111,7 @@
 bmJyaW5rPC9BdXRob3I+PFllYXI+MjAxOTwvWWVhcj48UmVjTnVtPjc4PC9SZWNOdW0+PHJlY29y
 ZD48cmVjLW51bWJlcj43ODwvcmVjLW51bWJlcj48Zm9yZWlnbi1rZXlzPjxrZXkgYXBwPSJFTiIg
 ZGItaWQ9Im1kYWU4NTAwMTA5NDk2ZmVhNGFmZjljMDg2ZTE2Y2MyNTg5NSIgdGltZXN0YW1wPSIx
-NzkzMjI2NjIxIj43ODwva2V5PjwvZm9yZWlnbi1rZXlzPjxyZWYtdHlwZSBuYW1lPSJKb3VybmFs
+NzkzMjI5MTc2Ij43ODwva2V5PjwvZm9yZWlnbi1rZXlzPjxyZWYtdHlwZSBuYW1lPSJKb3VybmFs
 IEFydGljbGUiPjE3PC9yZWYtdHlwZT48Y29udHJpYnV0b3JzPjxhdXRob3JzPjxhdXRob3I+U3Rl
 aW5icmluaywgQ29ybmVsaXVzPC9hdXRob3I+PGF1dGhvcj5CbGFuay1CYWJhemFkZWgsIE1hcml0
 YTwvYXV0aG9yPjxhdXRob3I+RWwtQW1hLCBBbmRyw6k8L2F1dGhvcj48YXV0aG9yPkhvbGx5LCBT
@@ -1132,8 +1132,8 @@
 cm9uaWMtcmVzb3VyY2UtbnVtPjwvcmVjb3JkPjwvQ2l0ZT48Q2l0ZT48QXV0aG9yPk9mZW5sb2No
 PC9BdXRob3I+PFllYXI+MjAyMjwvWWVhcj48UmVjTnVtPjYyPC9SZWNOdW0+PHJlY29yZD48cmVj
 LW51bWJlcj42MjwvcmVjLW51bWJlcj48Zm9yZWlnbi1rZXlzPjxrZXkgYXBwPSJFTiIgZGItaWQ9
-Im1kYWU4NTAwMTA5NDk2ZmVhNGFmZjljMDg2ZTE2Y2MyNTg5NSIgdGltZXN0YW1wPSIxNzkzMjI2
-NjIxIj42Mjwva2V5PjwvZm9yZWlnbi1rZXlzPjxyZWYtdHlwZSBuYW1lPSJDb25mZXJlbmNlIFBh
+Im1kYWU4NTAwMTA5NDk2ZmVhNGFmZjljMDg2ZTE2Y2MyNTg5NSIgdGltZXN0YW1wPSIxNzkzMjI5
+MTc2Ij42Mjwva2V5PjwvZm9yZWlnbi1rZXlzPjxyZWYtdHlwZSBuYW1lPSJDb25mZXJlbmNlIFBh
 cGVyIj40NzwvcmVmLXR5cGU+PGNvbnRyaWJ1dG9ycz48YXV0aG9ycz48YXV0aG9yPk9mZW5sb2No
 LCBBbm5pa2E8L2F1dGhvcj48YXV0aG9yPlNjaHdhcnosIEphbiBTw7ZyZW48L2F1dGhvcj48YXV0
 aG9yPlRvbGssIERlYm9yYWg8L2F1dGhvcj48YXV0aG9yPkJyYW5kdCwgVG9iaWFzPC9hdXRob3I+
@@ -1183,7 +1183,7 @@
         <w:fldChar w:fldCharType="begin"/>
       </w:r>
       <w:r>
-        <w:instrText xml:space="preserve"> ADDIN EN.CITE &lt;EndNote&gt;&lt;Cite&gt;&lt;Author&gt;U.S. Department of Energy&lt;/Author&gt;&lt;Year&gt;2024&lt;/Year&gt;&lt;RecNum&gt;20&lt;/RecNum&gt;&lt;DisplayText&gt;(U.S. Department of Energy 2024)&lt;/DisplayText&gt;&lt;record&gt;&lt;rec-number&gt;20&lt;/rec-number&gt;&lt;foreign-keys&gt;&lt;key app="EN" db-id="mdae8500109496fea4aff9c086e16cc25895" timestamp="1793226621"&gt;20&lt;/key&gt;&lt;/foreign-keys&gt;&lt;ref-type name="Web Page"&gt;12&lt;/ref-type&gt;&lt;contributors&gt;&lt;authors&gt;&lt;author&gt;U.S. Department of Energy&lt;/author&gt;&lt;/authors&gt;&lt;/contributors&gt;&lt;titles&gt;&lt;title&gt;EnergyPlus Output Details and Examples: eplusout.rdd&lt;/title&gt;&lt;/titles&gt;&lt;dates&gt;&lt;year&gt;2024&lt;/year&gt;&lt;/dates&gt;&lt;label&gt;doe2024rdd&lt;/label&gt;&lt;urls&gt;&lt;related-urls&gt;&lt;url&gt;https://bigladdersoftware.com/epx/docs/24-1/output-details-and-examples/eplusout-rdd.html&lt;/url&gt;&lt;/related-urls&gt;&lt;/urls&gt;&lt;access-date&gt;2026-10-28&lt;/access-date&gt;&lt;/record&gt;&lt;/Cite&gt;&lt;/EndNote&gt;</w:instrText>
+        <w:instrText xml:space="preserve"> ADDIN EN.CITE &lt;EndNote&gt;&lt;Cite&gt;&lt;Author&gt;U.S. Department of Energy&lt;/Author&gt;&lt;Year&gt;2024&lt;/Year&gt;&lt;RecNum&gt;20&lt;/RecNum&gt;&lt;DisplayText&gt;(U.S. Department of Energy 2024)&lt;/DisplayText&gt;&lt;record&gt;&lt;rec-number&gt;20&lt;/rec-number&gt;&lt;foreign-keys&gt;&lt;key app="EN" db-id="mdae8500109496fea4aff9c086e16cc25895" timestamp="1793229176"&gt;20&lt;/key&gt;&lt;/foreign-keys&gt;&lt;ref-type name="Web Page"&gt;12&lt;/ref-type&gt;&lt;contributors&gt;&lt;authors&gt;&lt;author&gt;U.S. Department of Energy&lt;/author&gt;&lt;/authors&gt;&lt;/contributors&gt;&lt;titles&gt;&lt;title&gt;EnergyPlus Output Details and Examples: eplusout.rdd&lt;/title&gt;&lt;/titles&gt;&lt;dates&gt;&lt;year&gt;2024&lt;/year&gt;&lt;/dates&gt;&lt;label&gt;doe2024rdd&lt;/label&gt;&lt;urls&gt;&lt;related-urls&gt;&lt;url&gt;https://bigladdersoftware.com/epx/docs/24-1/output-details-and-examples/eplusout-rdd.html&lt;/url&gt;&lt;/related-urls&gt;&lt;/urls&gt;&lt;access-date&gt;2026-10-28&lt;/access-date&gt;&lt;/record&gt;&lt;/Cite&gt;&lt;/EndNote&gt;</w:instrText>
       </w:r>
       <w:r>
         <w:fldChar w:fldCharType="separate"/>
@@ -1206,7 +1206,7 @@
 UmVjTnVtPjQ3PC9SZWNOdW0+PERpc3BsYXlUZXh0PihLw7xibGVyIGFuZCBTY2hpZWhsZW4gMjAw
 MDsgR29tZXMgZXQgYWwuIDIwMTgpPC9EaXNwbGF5VGV4dD48cmVjb3JkPjxyZWMtbnVtYmVyPjQ3
 PC9yZWMtbnVtYmVyPjxmb3JlaWduLWtleXM+PGtleSBhcHA9IkVOIiBkYi1pZD0ibWRhZTg1MDAx
-MDk0OTZmZWE0YWZmOWMwODZlMTZjYzI1ODk1IiB0aW1lc3RhbXA9IjE3OTMyMjY2MjEiPjQ3PC9r
+MDk0OTZmZWE0YWZmOWMwODZlMTZjYzI1ODk1IiB0aW1lc3RhbXA9IjE3OTMyMjkxNzYiPjQ3PC9r
 ZXk+PC9mb3JlaWduLWtleXM+PHJlZi10eXBlIG5hbWU9IkpvdXJuYWwgQXJ0aWNsZSI+MTc8L3Jl
 Zi10eXBlPjxjb250cmlidXRvcnM+PGF1dGhvcnM+PGF1dGhvcj5Lw7xibGVyLCBSLjwvYXV0aG9y
 PjxhdXRob3I+U2NoaWVobGVuLCBXLjwvYXV0aG9yPjwvYXV0aG9ycz48L2NvbnRyaWJ1dG9ycz48
@@ -1224,7 +1224,7 @@
 b3JkPjwvQ2l0ZT48Q2l0ZT48QXV0aG9yPkdvbWVzPC9BdXRob3I+PFllYXI+MjAxODwvWWVhcj48
 UmVjTnVtPjI2PC9SZWNOdW0+PHJlY29yZD48cmVjLW51bWJlcj4yNjwvcmVjLW51bWJlcj48Zm9y
 ZWlnbi1rZXlzPjxrZXkgYXBwPSJFTiIgZGItaWQ9Im1kYWU4NTAwMTA5NDk2ZmVhNGFmZjljMDg2
-ZTE2Y2MyNTg5NSIgdGltZXN0YW1wPSIxNzkzMjI2NjIxIj4yNjwva2V5PjwvZm9yZWlnbi1rZXlz
+ZTE2Y2MyNTg5NSIgdGltZXN0YW1wPSIxNzkzMjI5MTc2Ij4yNjwva2V5PjwvZm9yZWlnbi1rZXlz
 PjxyZWYtdHlwZSBuYW1lPSJKb3VybmFsIEFydGljbGUiPjE3PC9yZWYtdHlwZT48Y29udHJpYnV0
 b3JzPjxhdXRob3JzPjxhdXRob3I+R29tZXMsIENsw6F1ZGlvPC9hdXRob3I+PGF1dGhvcj5UaHVs
 ZSwgQ2FzcGVyPC9hdXRob3I+PGF1dGhvcj5Ccm9tYW4sIERhdmlkPC9hdXRob3I+PGF1dGhvcj5M
@@ -1250,7 +1250,7 @@
 UmVjTnVtPjQ3PC9SZWNOdW0+PERpc3BsYXlUZXh0PihLw7xibGVyIGFuZCBTY2hpZWhsZW4gMjAw
 MDsgR29tZXMgZXQgYWwuIDIwMTgpPC9EaXNwbGF5VGV4dD48cmVjb3JkPjxyZWMtbnVtYmVyPjQ3
 PC9yZWMtbnVtYmVyPjxmb3JlaWduLWtleXM+PGtleSBhcHA9IkVOIiBkYi1pZD0ibWRhZTg1MDAx
-MDk0OTZmZWE0YWZmOWMwODZlMTZjYzI1ODk1IiB0aW1lc3RhbXA9IjE3OTMyMjY2MjEiPjQ3PC9r
+MDk0OTZmZWE0YWZmOWMwODZlMTZjYzI1ODk1IiB0aW1lc3RhbXA9IjE3OTMyMjkxNzYiPjQ3PC9r
 ZXk+PC9mb3JlaWduLWtleXM+PHJlZi10eXBlIG5hbWU9IkpvdXJuYWwgQXJ0aWNsZSI+MTc8L3Jl
 Zi10eXBlPjxjb250cmlidXRvcnM+PGF1dGhvcnM+PGF1dGhvcj5Lw7xibGVyLCBSLjwvYXV0aG9y
 PjxhdXRob3I+U2NoaWVobGVuLCBXLjwvYXV0aG9yPjwvYXV0aG9ycz48L2NvbnRyaWJ1dG9ycz48
@@ -1268,7 +1268,7 @@
 b3JkPjwvQ2l0ZT48Q2l0ZT48QXV0aG9yPkdvbWVzPC9BdXRob3I+PFllYXI+MjAxODwvWWVhcj48
 UmVjTnVtPjI2PC9SZWNOdW0+PHJlY29yZD48cmVjLW51bWJlcj4yNjwvcmVjLW51bWJlcj48Zm9y
 ZWlnbi1rZXlzPjxrZXkgYXBwPSJFTiIgZGItaWQ9Im1kYWU4NTAwMTA5NDk2ZmVhNGFmZjljMDg2
-ZTE2Y2MyNTg5NSIgdGltZXN0YW1wPSIxNzkzMjI2NjIxIj4yNjwva2V5PjwvZm9yZWlnbi1rZXlz
+ZTE2Y2MyNTg5NSIgdGltZXN0YW1wPSIxNzkzMjI5MTc2Ij4yNjwva2V5PjwvZm9yZWlnbi1rZXlz
 PjxyZWYtdHlwZSBuYW1lPSJKb3VybmFsIEFydGljbGUiPjE3PC9yZWYtdHlwZT48Y29udHJpYnV0
 b3JzPjxhdXRob3JzPjxhdXRob3I+R29tZXMsIENsw6F1ZGlvPC9hdXRob3I+PGF1dGhvcj5UaHVs
 ZSwgQ2FzcGVyPC9hdXRob3I+PGF1dGhvcj5Ccm9tYW4sIERhdmlkPC9hdXRob3I+PGF1dGhvcj5M
@@ -1312,7 +1312,7 @@
 PFJlY051bT44MTwvUmVjTnVtPjxEaXNwbGF5VGV4dD4oVHJpcGFraXMgMjAxNTsgR29tZXMgZXQg
 YWwuIDIwMTkpPC9EaXNwbGF5VGV4dD48cmVjb3JkPjxyZWMtbnVtYmVyPjgxPC9yZWMtbnVtYmVy
 Pjxmb3JlaWduLWtleXM+PGtleSBhcHA9IkVOIiBkYi1pZD0ibWRhZTg1MDAxMDk0OTZmZWE0YWZm
-OWMwODZlMTZjYzI1ODk1IiB0aW1lc3RhbXA9IjE3OTMyMjY2MjEiPjgxPC9rZXk+PC9mb3JlaWdu
+OWMwODZlMTZjYzI1ODk1IiB0aW1lc3RhbXA9IjE3OTMyMjkxNzYiPjgxPC9rZXk+PC9mb3JlaWdu
 LWtleXM+PHJlZi10eXBlIG5hbWU9IkNvbmZlcmVuY2UgUGFwZXIiPjQ3PC9yZWYtdHlwZT48Y29u
 dHJpYnV0b3JzPjxhdXRob3JzPjxhdXRob3I+VHJpcGFraXMsIFN0YXZyb3M8L2F1dGhvcj48L2F1
 dGhvcnM+PC9jb250cmlidXRvcnM+PHRpdGxlcz48dGl0bGU+QnJpZGdpbmcgdGhlIHNlbWFudGlj
@@ -1327,7 +1327,7 @@
 b3JkPjwvQ2l0ZT48Q2l0ZT48QXV0aG9yPkdvbWVzPC9BdXRob3I+PFllYXI+MjAxOTwvWWVhcj48
 UmVjTnVtPjI3PC9SZWNOdW0+PHJlY29yZD48cmVjLW51bWJlcj4yNzwvcmVjLW51bWJlcj48Zm9y
 ZWlnbi1rZXlzPjxrZXkgYXBwPSJFTiIgZGItaWQ9Im1kYWU4NTAwMTA5NDk2ZmVhNGFmZjljMDg2
-ZTE2Y2MyNTg5NSIgdGltZXN0YW1wPSIxNzkzMjI2NjIxIj4yNzwva2V5PjwvZm9yZWlnbi1rZXlz
+ZTE2Y2MyNTg5NSIgdGltZXN0YW1wPSIxNzkzMjI5MTc2Ij4yNzwva2V5PjwvZm9yZWlnbi1rZXlz
 PjxyZWYtdHlwZSBuYW1lPSJKb3VybmFsIEFydGljbGUiPjE3PC9yZWYtdHlwZT48Y29udHJpYnV0
 b3JzPjxhdXRob3JzPjxhdXRob3I+R29tZXMsIENsw6F1ZGlvPC9hdXRob3I+PGF1dGhvcj5NZXll
 cnMsIEJhcnQ8L2F1dGhvcj48YXV0aG9yPkRlbmlsLCBKb2FjaGltPC9hdXRob3I+PGF1dGhvcj5U
@@ -1355,7 +1355,7 @@
 PFJlY051bT44MTwvUmVjTnVtPjxEaXNwbGF5VGV4dD4oVHJpcGFraXMgMjAxNTsgR29tZXMgZXQg
 YWwuIDIwMTkpPC9EaXNwbGF5VGV4dD48cmVjb3JkPjxyZWMtbnVtYmVyPjgxPC9yZWMtbnVtYmVy
 Pjxmb3JlaWduLWtleXM+PGtleSBhcHA9IkVOIiBkYi1pZD0ibWRhZTg1MDAxMDk0OTZmZWE0YWZm
-OWMwODZlMTZjYzI1ODk1IiB0aW1lc3RhbXA9IjE3OTMyMjY2MjEiPjgxPC9rZXk+PC9mb3JlaWdu
+OWMwODZlMTZjYzI1ODk1IiB0aW1lc3RhbXA9IjE3OTMyMjkxNzYiPjgxPC9rZXk+PC9mb3JlaWdu
 LWtleXM+PHJlZi10eXBlIG5hbWU9IkNvbmZlcmVuY2UgUGFwZXIiPjQ3PC9yZWYtdHlwZT48Y29u
 dHJpYnV0b3JzPjxhdXRob3JzPjxhdXRob3I+VHJpcGFraXMsIFN0YXZyb3M8L2F1dGhvcj48L2F1
 dGhvcnM+PC9jb250cmlidXRvcnM+PHRpdGxlcz48dGl0bGU+QnJpZGdpbmcgdGhlIHNlbWFudGlj
@@ -1370,7 +1370,7 @@
 b3JkPjwvQ2l0ZT48Q2l0ZT48QXV0aG9yPkdvbWVzPC9BdXRob3I+PFllYXI+MjAxOTwvWWVhcj48
 UmVjTnVtPjI3PC9SZWNOdW0+PHJlY29yZD48cmVjLW51bWJlcj4yNzwvcmVjLW51bWJlcj48Zm9y
 ZWlnbi1rZXlzPjxrZXkgYXBwPSJFTiIgZGItaWQ9Im1kYWU4NTAwMTA5NDk2ZmVhNGFmZjljMDg2
-ZTE2Y2MyNTg5NSIgdGltZXN0YW1wPSIxNzkzMjI2NjIxIj4yNzwva2V5PjwvZm9yZWlnbi1rZXlz
+ZTE2Y2MyNTg5NSIgdGltZXN0YW1wPSIxNzkzMjI5MTc2Ij4yNzwva2V5PjwvZm9yZWlnbi1rZXlz
 PjxyZWYtdHlwZSBuYW1lPSJKb3VybmFsIEFydGljbGUiPjE3PC9yZWYtdHlwZT48Y29udHJpYnV0
 b3JzPjxhdXRob3JzPjxhdXRob3I+R29tZXMsIENsw6F1ZGlvPC9hdXRob3I+PGF1dGhvcj5NZXll
 cnMsIEJhcnQ8L2F1dGhvcj48YXV0aG9yPkRlbmlsLCBKb2FjaGltPC9hdXRob3I+PGF1dGhvcj5U
@@ -1416,13 +1416,13 @@
         <w:pStyle w:val="BodyText"/>
       </w:pPr>
       <w:r>
-        <w:t xml:space="preserve">The second reason is that artificial intelligence (AI) components behave differently from physics models. A physics model is deterministic, fast, always returns a valid number, and needs only its current inputs. A hosted LLM may answer the same prompt differently on each call, even at temperature zero </w:t>
+        <w:t xml:space="preserve">The second reason is that not every component behaves like a physics model. A physics model is deterministic, fast, always returns a valid number, and needs only its current inputs. Data services, ML predictors and artificial intelligence (AI) agents often do not. A hosted LLM may answer the same prompt differently on each call, even at temperature zero </w:t>
       </w:r>
       <w:r>
         <w:fldChar w:fldCharType="begin"/>
       </w:r>
       <w:r>
-        <w:instrText xml:space="preserve"> ADDIN EN.CITE &lt;EndNote&gt;&lt;Cite&gt;&lt;Author&gt;Ouyang&lt;/Author&gt;&lt;Year&gt;2025&lt;/Year&gt;&lt;RecNum&gt;66&lt;/RecNum&gt;&lt;DisplayText&gt;(Ouyang et al. 2025)&lt;/DisplayText&gt;&lt;record&gt;&lt;rec-number&gt;66&lt;/rec-number&gt;&lt;foreign-keys&gt;&lt;key app="EN" db-id="mdae8500109496fea4aff9c086e16cc25895" timestamp="1793226621"&gt;66&lt;/key&gt;&lt;/foreign-keys&gt;&lt;ref-type name="Journal Article"&gt;17&lt;/ref-type&gt;&lt;contributors&gt;&lt;authors&gt;&lt;author&gt;Ouyang, Shuyin&lt;/author&gt;&lt;author&gt;Zhang, Jie M.&lt;/author&gt;&lt;author&gt;Harman, Mark&lt;/author&gt;&lt;author&gt;Wang, Meng&lt;/author&gt;&lt;/authors&gt;&lt;/contributors&gt;&lt;titles&gt;&lt;title&gt;An Empirical Study of the Non-Determinism of ChatGPT in Code Generation&lt;/title&gt;&lt;secondary-title&gt;ACM Transactions on Software Engineering and Methodology&lt;/secondary-title&gt;&lt;alt-title&gt;ACM Trans. Softw. Eng. Methodol.&lt;/alt-title&gt;&lt;/titles&gt;&lt;periodical&gt;&lt;full-title&gt;ACM Transactions on Software Engineering and Methodology&lt;/full-title&gt;&lt;abbr-1&gt;ACM Trans. Softw. Eng. Methodol.&lt;/abbr-1&gt;&lt;/periodical&gt;&lt;pages&gt;1-28&lt;/pages&gt;&lt;volume&gt;34&lt;/volume&gt;&lt;number&gt;2&lt;/number&gt;&lt;dates&gt;&lt;year&gt;2025&lt;/year&gt;&lt;/dates&gt;&lt;publisher&gt;ACM&lt;/publisher&gt;&lt;label&gt;ouyang2025&lt;/label&gt;&lt;urls&gt;&lt;/urls&gt;&lt;electronic-resource-num&gt;10.1145/3697010&lt;/electronic-resource-num&gt;&lt;/record&gt;&lt;/Cite&gt;&lt;/EndNote&gt;</w:instrText>
+        <w:instrText xml:space="preserve"> ADDIN EN.CITE &lt;EndNote&gt;&lt;Cite&gt;&lt;Author&gt;Ouyang&lt;/Author&gt;&lt;Year&gt;2025&lt;/Year&gt;&lt;RecNum&gt;66&lt;/RecNum&gt;&lt;DisplayText&gt;(Ouyang et al. 2025)&lt;/DisplayText&gt;&lt;record&gt;&lt;rec-number&gt;66&lt;/rec-number&gt;&lt;foreign-keys&gt;&lt;key app="EN" db-id="mdae8500109496fea4aff9c086e16cc25895" timestamp="1793229176"&gt;66&lt;/key&gt;&lt;/foreign-keys&gt;&lt;ref-type name="Journal Article"&gt;17&lt;/ref-type&gt;&lt;contributors&gt;&lt;authors&gt;&lt;author&gt;Ouyang, Shuyin&lt;/author&gt;&lt;author&gt;Zhang, Jie M.&lt;/author&gt;&lt;author&gt;Harman, Mark&lt;/author&gt;&lt;author&gt;Wang, Meng&lt;/author&gt;&lt;/authors&gt;&lt;/contributors&gt;&lt;titles&gt;&lt;title&gt;An Empirical Study of the Non-Determinism of ChatGPT in Code Generation&lt;/title&gt;&lt;secondary-title&gt;ACM Transactions on Software Engineering and Methodology&lt;/secondary-title&gt;&lt;alt-title&gt;ACM Trans. Softw. Eng. Methodol.&lt;/alt-title&gt;&lt;/titles&gt;&lt;periodical&gt;&lt;full-title&gt;ACM Transactions on Software Engineering and Methodology&lt;/full-title&gt;&lt;abbr-1&gt;ACM Trans. Softw. Eng. Methodol.&lt;/abbr-1&gt;&lt;/periodical&gt;&lt;pages&gt;1-28&lt;/pages&gt;&lt;volume&gt;34&lt;/volume&gt;&lt;number&gt;2&lt;/number&gt;&lt;dates&gt;&lt;year&gt;2025&lt;/year&gt;&lt;/dates&gt;&lt;publisher&gt;ACM&lt;/publisher&gt;&lt;label&gt;ouyang2025&lt;/label&gt;&lt;urls&gt;&lt;/urls&gt;&lt;electronic-resource-num&gt;10.1145/3697010&lt;/electronic-resource-num&gt;&lt;/record&gt;&lt;/Cite&gt;&lt;/EndNote&gt;</w:instrText>
       </w:r>
       <w:r>
         <w:fldChar w:fldCharType="separate"/>
@@ -1437,13 +1437,13 @@
         <w:fldChar w:fldCharType="end"/>
       </w:r>
       <w:r>
-        <w:t xml:space="preserve">. It may time out, refuse, or return text that is not a valid control signal. One call can take seconds while a building time step takes milliseconds. An ML predictor needs a history of features rather than a single value. Reinforcement-learning results are notoriously hard to reproduce </w:t>
+        <w:t xml:space="preserve">, may time out or return text that is not a valid control signal, and one call can take seconds while a building time step takes milliseconds. An ML predictor needs a history of features rather than a single value, and reinforcement-learning results are notoriously hard to reproduce </w:t>
       </w:r>
       <w:r>
         <w:fldChar w:fldCharType="begin"/>
       </w:r>
       <w:r>
-        <w:instrText xml:space="preserve"> ADDIN EN.CITE &lt;EndNote&gt;&lt;Cite&gt;&lt;Author&gt;Henderson&lt;/Author&gt;&lt;Year&gt;2018&lt;/Year&gt;&lt;RecNum&gt;32&lt;/RecNum&gt;&lt;DisplayText&gt;(Henderson et al. 2018)&lt;/DisplayText&gt;&lt;record&gt;&lt;rec-number&gt;32&lt;/rec-number&gt;&lt;foreign-keys&gt;&lt;key app="EN" db-id="mdae8500109496fea4aff9c086e16cc25895" timestamp="1793226621"&gt;32&lt;/key&gt;&lt;/foreign-keys&gt;&lt;ref-type name="Conference Paper"&gt;47&lt;/ref-type&gt;&lt;contributors&gt;&lt;authors&gt;&lt;author&gt;Henderson, Peter&lt;/author&gt;&lt;author&gt;Islam, Riashat&lt;/author&gt;&lt;author&gt;Bachman, Philip&lt;/author&gt;&lt;author&gt;Pineau, Joelle&lt;/author&gt;&lt;author&gt;Precup, Doina&lt;/author&gt;&lt;author&gt;Meger, David&lt;/author&gt;&lt;/authors&gt;&lt;/contributors&gt;&lt;titles&gt;&lt;title&gt;Deep Reinforcement Learning That Matters&lt;/title&gt;&lt;secondary-title&gt;Proceedings of the AAAI Conference on Artificial Intelligence&lt;/secondary-title&gt;&lt;/titles&gt;&lt;pages&gt;3207-3214&lt;/pages&gt;&lt;volume&gt;32&lt;/volume&gt;&lt;number&gt;1&lt;/number&gt;&lt;dates&gt;&lt;year&gt;2018&lt;/year&gt;&lt;/dates&gt;&lt;publisher&gt;AAAI Press&lt;/publisher&gt;&lt;label&gt;henderson2018&lt;/label&gt;&lt;urls&gt;&lt;/urls&gt;&lt;electronic-resource-num&gt;10.1609/aaai.v32i1.11694&lt;/electronic-resource-num&gt;&lt;/record&gt;&lt;/Cite&gt;&lt;/EndNote&gt;</w:instrText>
+        <w:instrText xml:space="preserve"> ADDIN EN.CITE &lt;EndNote&gt;&lt;Cite&gt;&lt;Author&gt;Henderson&lt;/Author&gt;&lt;Year&gt;2018&lt;/Year&gt;&lt;RecNum&gt;32&lt;/RecNum&gt;&lt;DisplayText&gt;(Henderson et al. 2018)&lt;/DisplayText&gt;&lt;record&gt;&lt;rec-number&gt;32&lt;/rec-number&gt;&lt;foreign-keys&gt;&lt;key app="EN" db-id="mdae8500109496fea4aff9c086e16cc25895" timestamp="1793229176"&gt;32&lt;/key&gt;&lt;/foreign-keys&gt;&lt;ref-type name="Conference Paper"&gt;47&lt;/ref-type&gt;&lt;contributors&gt;&lt;authors&gt;&lt;author&gt;Henderson, Peter&lt;/author&gt;&lt;author&gt;Islam, Riashat&lt;/author&gt;&lt;author&gt;Bachman, Philip&lt;/author&gt;&lt;author&gt;Pineau, Joelle&lt;/author&gt;&lt;author&gt;Precup, Doina&lt;/author&gt;&lt;author&gt;Meger, David&lt;/author&gt;&lt;/authors&gt;&lt;/contributors&gt;&lt;titles&gt;&lt;title&gt;Deep Reinforcement Learning That Matters&lt;/title&gt;&lt;secondary-title&gt;Proceedings of the AAAI Conference on Artificial Intelligence&lt;/secondary-title&gt;&lt;/titles&gt;&lt;pages&gt;3207-3214&lt;/pages&gt;&lt;volume&gt;32&lt;/volume&gt;&lt;number&gt;1&lt;/number&gt;&lt;dates&gt;&lt;year&gt;2018&lt;/year&gt;&lt;/dates&gt;&lt;publisher&gt;AAAI Press&lt;/publisher&gt;&lt;label&gt;henderson2018&lt;/label&gt;&lt;urls&gt;&lt;/urls&gt;&lt;electronic-resource-num&gt;10.1609/aaai.v32i1.11694&lt;/electronic-resource-num&gt;&lt;/record&gt;&lt;/Cite&gt;&lt;/EndNote&gt;</w:instrText>
       </w:r>
       <w:r>
         <w:fldChar w:fldCharType="separate"/>
@@ -1504,7 +1504,7 @@
         </w:numPr>
       </w:pPr>
       <w:r>
-        <w:t xml:space="preserve">Message handling for AI components, built on established principles: per-message quality flags with bounds and fallbacks, record and replay of the messages of any component (including counterfactual replay into a modified system), a provenance trace, and deadline-aware asynchronous execution in which a slow call runs in wall-clock time while its answer takes effect at a declared simulation time.</w:t>
+        <w:t xml:space="preserve">Message handling for stochastic, error-prone and slow components such as AI services, built on established principles: per-message quality flags with bounds and fallbacks, record and replay of the messages of any component (including counterfactual replay into a modified system), a provenance trace, and deadline-aware asynchronous execution in which a slow call runs in wall-clock time while its answer takes effect at a declared simulation time.</w:t>
       </w:r>
     </w:p>
     <w:p>
@@ -1516,7 +1516,7 @@
         </w:numPr>
       </w:pPr>
       <w:r>
-        <w:t xml:space="preserve">An open-source implementation for EnergyPlus and Python components (https://github.com/lz356/Py-CoSim), in which EnergyPlus can also run a finer internal time step than the exchange step. It is verified against standalone EnergyPlus, tested on synthetic and EnergyPlus coupling cases and with stand-ins for LLM services, and compared with HELICS.</w:t>
+        <w:t xml:space="preserve">An open-source implementation for EnergyPlus and Python components (https://github.com/lz356/Py-CoSim), in which EnergyPlus can also run a finer internal time step than the exchange step. It is verified against standalone EnergyPlus, tested on synthetic and EnergyPlus coupling cases and with stochastic and slow stand-ins for LLM services, and compared with HELICS.</w:t>
       </w:r>
     </w:p>
     <w:p>
@@ -1548,7 +1548,7 @@
         <w:fldChar w:fldCharType="begin"/>
       </w:r>
       <w:r>
-        <w:instrText xml:space="preserve"> ADDIN EN.CITE &lt;EndNote&gt;&lt;Cite&gt;&lt;Author&gt;Blochwitz&lt;/Author&gt;&lt;Year&gt;2011&lt;/Year&gt;&lt;RecNum&gt;6&lt;/RecNum&gt;&lt;DisplayText&gt;(Blochwitz et al. 2011)&lt;/DisplayText&gt;&lt;record&gt;&lt;rec-number&gt;6&lt;/rec-number&gt;&lt;foreign-keys&gt;&lt;key app="EN" db-id="mdae8500109496fea4aff9c086e16cc25895" timestamp="1793226621"&gt;6&lt;/key&gt;&lt;/foreign-keys&gt;&lt;ref-type name="Conference Paper"&gt;47&lt;/ref-type&gt;&lt;contributors&gt;&lt;authors&gt;&lt;author&gt;Blochwitz, T.&lt;/author&gt;&lt;author&gt;Otter, M.&lt;/author&gt;&lt;author&gt;Arnold, M.&lt;/author&gt;&lt;author&gt;Bausch, C.&lt;/author&gt;&lt;author&gt;Clauss, C.&lt;/author&gt;&lt;author&gt;Elmqvist, H.&lt;/author&gt;&lt;author&gt;Junghanns, A.&lt;/author&gt;&lt;author&gt;Mauss, J.&lt;/author&gt;&lt;author&gt;Monteiro, M.&lt;/author&gt;&lt;author&gt;Neidhold, T.&lt;/author&gt;&lt;author&gt;Neumerkel, D.&lt;/author&gt;&lt;author&gt;Olsson, H.&lt;/author&gt;&lt;author&gt;Peetz, J.-V.&lt;/author&gt;&lt;author&gt;Wolf, S.&lt;/author&gt;&lt;/authors&gt;&lt;/contributors&gt;&lt;titles&gt;&lt;title&gt;The Functional Mockup Interface for Tool independent Exchange of Simulation Models&lt;/title&gt;&lt;secondary-title&gt;Proceedings of the 8th International Modelica Conference&lt;/secondary-title&gt;&lt;/titles&gt;&lt;pages&gt;105-114&lt;/pages&gt;&lt;volume&gt;63&lt;/volume&gt;&lt;dates&gt;&lt;year&gt;2011&lt;/year&gt;&lt;/dates&gt;&lt;pub-location&gt;Dresden, Germany&lt;/pub-location&gt;&lt;publisher&gt;Linköping University Electronic Press&lt;/publisher&gt;&lt;label&gt;blochwitz2011&lt;/label&gt;&lt;urls&gt;&lt;/urls&gt;&lt;electronic-resource-num&gt;10.3384/ecp11063105&lt;/electronic-resource-num&gt;&lt;/record&gt;&lt;/Cite&gt;&lt;/EndNote&gt;</w:instrText>
+        <w:instrText xml:space="preserve"> ADDIN EN.CITE &lt;EndNote&gt;&lt;Cite&gt;&lt;Author&gt;Blochwitz&lt;/Author&gt;&lt;Year&gt;2011&lt;/Year&gt;&lt;RecNum&gt;6&lt;/RecNum&gt;&lt;DisplayText&gt;(Blochwitz et al. 2011)&lt;/DisplayText&gt;&lt;record&gt;&lt;rec-number&gt;6&lt;/rec-number&gt;&lt;foreign-keys&gt;&lt;key app="EN" db-id="mdae8500109496fea4aff9c086e16cc25895" timestamp="1793229176"&gt;6&lt;/key&gt;&lt;/foreign-keys&gt;&lt;ref-type name="Conference Paper"&gt;47&lt;/ref-type&gt;&lt;contributors&gt;&lt;authors&gt;&lt;author&gt;Blochwitz, T.&lt;/author&gt;&lt;author&gt;Otter, M.&lt;/author&gt;&lt;author&gt;Arnold, M.&lt;/author&gt;&lt;author&gt;Bausch, C.&lt;/author&gt;&lt;author&gt;Clauss, C.&lt;/author&gt;&lt;author&gt;Elmqvist, H.&lt;/author&gt;&lt;author&gt;Junghanns, A.&lt;/author&gt;&lt;author&gt;Mauss, J.&lt;/author&gt;&lt;author&gt;Monteiro, M.&lt;/author&gt;&lt;author&gt;Neidhold, T.&lt;/author&gt;&lt;author&gt;Neumerkel, D.&lt;/author&gt;&lt;author&gt;Olsson, H.&lt;/author&gt;&lt;author&gt;Peetz, J.-V.&lt;/author&gt;&lt;author&gt;Wolf, S.&lt;/author&gt;&lt;/authors&gt;&lt;/contributors&gt;&lt;titles&gt;&lt;title&gt;The Functional Mockup Interface for Tool independent Exchange of Simulation Models&lt;/title&gt;&lt;secondary-title&gt;Proceedings of the 8th International Modelica Conference&lt;/secondary-title&gt;&lt;/titles&gt;&lt;pages&gt;105-114&lt;/pages&gt;&lt;volume&gt;63&lt;/volume&gt;&lt;dates&gt;&lt;year&gt;2011&lt;/year&gt;&lt;/dates&gt;&lt;pub-location&gt;Dresden, Germany&lt;/pub-location&gt;&lt;publisher&gt;Linköping University Electronic Press&lt;/publisher&gt;&lt;label&gt;blochwitz2011&lt;/label&gt;&lt;urls&gt;&lt;/urls&gt;&lt;electronic-resource-num&gt;10.3384/ecp11063105&lt;/electronic-resource-num&gt;&lt;/record&gt;&lt;/Cite&gt;&lt;/EndNote&gt;</w:instrText>
       </w:r>
       <w:r>
         <w:fldChar w:fldCharType="separate"/>
@@ -1569,7 +1569,7 @@
         <w:fldChar w:fldCharType="begin"/>
       </w:r>
       <w:r>
-        <w:instrText xml:space="preserve"> ADDIN EN.CITE &lt;EndNote&gt;&lt;Cite&gt;&lt;Author&gt;Junghanns&lt;/Author&gt;&lt;Year&gt;2021&lt;/Year&gt;&lt;RecNum&gt;42&lt;/RecNum&gt;&lt;DisplayText&gt;(Junghanns et al. 2021)&lt;/DisplayText&gt;&lt;record&gt;&lt;rec-number&gt;42&lt;/rec-number&gt;&lt;foreign-keys&gt;&lt;key app="EN" db-id="mdae8500109496fea4aff9c086e16cc25895" timestamp="1793226621"&gt;42&lt;/key&gt;&lt;/foreign-keys&gt;&lt;ref-type name="Conference Paper"&gt;47&lt;/ref-type&gt;&lt;contributors&gt;&lt;authors&gt;&lt;author&gt;Junghanns, Andreas&lt;/author&gt;&lt;author&gt;Blochwitz, Torsten&lt;/author&gt;&lt;author&gt;Bertsch, Christian&lt;/author&gt;&lt;author&gt;Sommer, Torsten&lt;/author&gt;&lt;author&gt;Wernersson, Karl&lt;/author&gt;&lt;author&gt;Pillekeit, Andreas&lt;/author&gt;&lt;author&gt;Zacharias, Irina&lt;/author&gt;&lt;author&gt;Blesken, Matthias&lt;/author&gt;&lt;author&gt;Mai, Pierre R.&lt;/author&gt;&lt;author&gt;Schuch, Klaus&lt;/author&gt;&lt;author&gt;Schulze, Christian&lt;/author&gt;&lt;author&gt;Gomes, Cláudio&lt;/author&gt;&lt;author&gt;Najafi, Masoud&lt;/author&gt;&lt;/authors&gt;&lt;/contributors&gt;&lt;titles&gt;&lt;title&gt;The Functional Mock-up Interface 3.0 – New Features Enabling New Applications&lt;/title&gt;&lt;secondary-title&gt;Proceedings of the 14th International Modelica Conference&lt;/secondary-title&gt;&lt;/titles&gt;&lt;pages&gt;17-26&lt;/pages&gt;&lt;volume&gt;181&lt;/volume&gt;&lt;dates&gt;&lt;year&gt;2021&lt;/year&gt;&lt;/dates&gt;&lt;pub-location&gt;Linköping, Sweden&lt;/pub-location&gt;&lt;publisher&gt;Linköping University Electronic Press&lt;/publisher&gt;&lt;label&gt;junghanns2021&lt;/label&gt;&lt;urls&gt;&lt;/urls&gt;&lt;electronic-resource-num&gt;10.3384/ecp2118117&lt;/electronic-resource-num&gt;&lt;/record&gt;&lt;/Cite&gt;&lt;/EndNote&gt;</w:instrText>
+        <w:instrText xml:space="preserve"> ADDIN EN.CITE &lt;EndNote&gt;&lt;Cite&gt;&lt;Author&gt;Junghanns&lt;/Author&gt;&lt;Year&gt;2021&lt;/Year&gt;&lt;RecNum&gt;42&lt;/RecNum&gt;&lt;DisplayText&gt;(Junghanns et al. 2021)&lt;/DisplayText&gt;&lt;record&gt;&lt;rec-number&gt;42&lt;/rec-number&gt;&lt;foreign-keys&gt;&lt;key app="EN" db-id="mdae8500109496fea4aff9c086e16cc25895" timestamp="1793229176"&gt;42&lt;/key&gt;&lt;/foreign-keys&gt;&lt;ref-type name="Conference Paper"&gt;47&lt;/ref-type&gt;&lt;contributors&gt;&lt;authors&gt;&lt;author&gt;Junghanns, Andreas&lt;/author&gt;&lt;author&gt;Blochwitz, Torsten&lt;/author&gt;&lt;author&gt;Bertsch, Christian&lt;/author&gt;&lt;author&gt;Sommer, Torsten&lt;/author&gt;&lt;author&gt;Wernersson, Karl&lt;/author&gt;&lt;author&gt;Pillekeit, Andreas&lt;/author&gt;&lt;author&gt;Zacharias, Irina&lt;/author&gt;&lt;author&gt;Blesken, Matthias&lt;/author&gt;&lt;author&gt;Mai, Pierre R.&lt;/author&gt;&lt;author&gt;Schuch, Klaus&lt;/author&gt;&lt;author&gt;Schulze, Christian&lt;/author&gt;&lt;author&gt;Gomes, Cláudio&lt;/author&gt;&lt;author&gt;Najafi, Masoud&lt;/author&gt;&lt;/authors&gt;&lt;/contributors&gt;&lt;titles&gt;&lt;title&gt;The Functional Mock-up Interface 3.0 – New Features Enabling New Applications&lt;/title&gt;&lt;secondary-title&gt;Proceedings of the 14th International Modelica Conference&lt;/secondary-title&gt;&lt;/titles&gt;&lt;pages&gt;17-26&lt;/pages&gt;&lt;volume&gt;181&lt;/volume&gt;&lt;dates&gt;&lt;year&gt;2021&lt;/year&gt;&lt;/dates&gt;&lt;pub-location&gt;Linköping, Sweden&lt;/pub-location&gt;&lt;publisher&gt;Linköping University Electronic Press&lt;/publisher&gt;&lt;label&gt;junghanns2021&lt;/label&gt;&lt;urls&gt;&lt;/urls&gt;&lt;electronic-resource-num&gt;10.3384/ecp2118117&lt;/electronic-resource-num&gt;&lt;/record&gt;&lt;/Cite&gt;&lt;/EndNote&gt;</w:instrText>
       </w:r>
       <w:r>
         <w:fldChar w:fldCharType="separate"/>
@@ -1590,7 +1590,7 @@
         <w:fldChar w:fldCharType="begin"/>
       </w:r>
       <w:r>
-        <w:instrText xml:space="preserve"> ADDIN EN.CITE &lt;EndNote&gt;&lt;Cite&gt;&lt;Author&gt;Modelica Association&lt;/Author&gt;&lt;Year&gt;2024&lt;/Year&gt;&lt;RecNum&gt;77&lt;/RecNum&gt;&lt;DisplayText&gt;(Modelica Association 2024)&lt;/DisplayText&gt;&lt;record&gt;&lt;rec-number&gt;77&lt;/rec-number&gt;&lt;foreign-keys&gt;&lt;key app="EN" db-id="mdae8500109496fea4aff9c086e16cc25895" timestamp="1793226621"&gt;77&lt;/key&gt;&lt;/foreign-keys&gt;&lt;ref-type name="Standard"&gt;58&lt;/ref-type&gt;&lt;contributors&gt;&lt;authors&gt;&lt;author&gt;Modelica Association&lt;/author&gt;&lt;/authors&gt;&lt;/contributors&gt;&lt;titles&gt;&lt;title&gt;System Structure and Parameterization (SSP), Version 2.0&lt;/title&gt;&lt;/titles&gt;&lt;dates&gt;&lt;year&gt;2024&lt;/year&gt;&lt;/dates&gt;&lt;label&gt;ssp2_2024&lt;/label&gt;&lt;urls&gt;&lt;related-urls&gt;&lt;url&gt;https://ssp-standard.org/docs/2.0/&lt;/url&gt;&lt;/related-urls&gt;&lt;/urls&gt;&lt;/record&gt;&lt;/Cite&gt;&lt;/EndNote&gt;</w:instrText>
+        <w:instrText xml:space="preserve"> ADDIN EN.CITE &lt;EndNote&gt;&lt;Cite&gt;&lt;Author&gt;Modelica Association&lt;/Author&gt;&lt;Year&gt;2024&lt;/Year&gt;&lt;RecNum&gt;77&lt;/RecNum&gt;&lt;DisplayText&gt;(Modelica Association 2024)&lt;/DisplayText&gt;&lt;record&gt;&lt;rec-number&gt;77&lt;/rec-number&gt;&lt;foreign-keys&gt;&lt;key app="EN" db-id="mdae8500109496fea4aff9c086e16cc25895" timestamp="1793229176"&gt;77&lt;/key&gt;&lt;/foreign-keys&gt;&lt;ref-type name="Standard"&gt;58&lt;/ref-type&gt;&lt;contributors&gt;&lt;authors&gt;&lt;author&gt;Modelica Association&lt;/author&gt;&lt;/authors&gt;&lt;/contributors&gt;&lt;titles&gt;&lt;title&gt;System Structure and Parameterization (SSP), Version 2.0&lt;/title&gt;&lt;/titles&gt;&lt;dates&gt;&lt;year&gt;2024&lt;/year&gt;&lt;/dates&gt;&lt;label&gt;ssp2_2024&lt;/label&gt;&lt;urls&gt;&lt;related-urls&gt;&lt;url&gt;https://ssp-standard.org/docs/2.0/&lt;/url&gt;&lt;/related-urls&gt;&lt;/urls&gt;&lt;/record&gt;&lt;/Cite&gt;&lt;/EndNote&gt;</w:instrText>
       </w:r>
       <w:r>
         <w:fldChar w:fldCharType="separate"/>
@@ -1619,7 +1619,7 @@
         <w:fldChar w:fldCharType="begin"/>
       </w:r>
       <w:r>
-        <w:instrText xml:space="preserve"> ADDIN EN.CITE &lt;EndNote&gt;&lt;Cite ExcludeAuth="1"&gt;&lt;Author&gt;Kübler&lt;/Author&gt;&lt;Year&gt;2000&lt;/Year&gt;&lt;RecNum&gt;47&lt;/RecNum&gt;&lt;DisplayText&gt;(2000)&lt;/DisplayText&gt;&lt;record&gt;&lt;rec-number&gt;47&lt;/rec-number&gt;&lt;foreign-keys&gt;&lt;key app="EN" db-id="mdae8500109496fea4aff9c086e16cc25895" timestamp="1793226621"&gt;47&lt;/key&gt;&lt;/foreign-keys&gt;&lt;ref-type name="Journal Article"&gt;17&lt;/ref-type&gt;&lt;contributors&gt;&lt;authors&gt;&lt;author&gt;Kübler, R.&lt;/author&gt;&lt;author&gt;Schiehlen, W.&lt;/author&gt;&lt;/authors&gt;&lt;/contributors&gt;&lt;titles&gt;&lt;title&gt;Two Methods of Simulator Coupling&lt;/title&gt;&lt;secondary-title&gt;Mathematical and Computer Modelling of Dynamical Systems&lt;/secondary-title&gt;&lt;alt-title&gt;Math. Comput. Model. Dyn. Syst.&lt;/alt-title&gt;&lt;/titles&gt;&lt;periodical&gt;&lt;full-title&gt;Mathematical and Computer Modelling of Dynamical Systems&lt;/full-title&gt;&lt;abbr-1&gt;Math. Comput. Model. Dyn. Syst.&lt;/abbr-1&gt;&lt;/periodical&gt;&lt;pages&gt;93-113&lt;/pages&gt;&lt;volume&gt;6&lt;/volume&gt;&lt;number&gt;2&lt;/number&gt;&lt;dates&gt;&lt;year&gt;2000&lt;/year&gt;&lt;/dates&gt;&lt;publisher&gt;Taylor &amp;amp; Francis&lt;/publisher&gt;&lt;label&gt;kubler2000&lt;/label&gt;&lt;urls&gt;&lt;/urls&gt;&lt;electronic-resource-num&gt;10.1076/1387-3954(200006)6:2;1-M;FT093&lt;/electronic-resource-num&gt;&lt;/record&gt;&lt;/Cite&gt;&lt;/EndNote&gt;</w:instrText>
+        <w:instrText xml:space="preserve"> ADDIN EN.CITE &lt;EndNote&gt;&lt;Cite ExcludeAuth="1"&gt;&lt;Author&gt;Kübler&lt;/Author&gt;&lt;Year&gt;2000&lt;/Year&gt;&lt;RecNum&gt;47&lt;/RecNum&gt;&lt;DisplayText&gt;(2000)&lt;/DisplayText&gt;&lt;record&gt;&lt;rec-number&gt;47&lt;/rec-number&gt;&lt;foreign-keys&gt;&lt;key app="EN" db-id="mdae8500109496fea4aff9c086e16cc25895" timestamp="1793229176"&gt;47&lt;/key&gt;&lt;/foreign-keys&gt;&lt;ref-type name="Journal Article"&gt;17&lt;/ref-type&gt;&lt;contributors&gt;&lt;authors&gt;&lt;author&gt;Kübler, R.&lt;/author&gt;&lt;author&gt;Schiehlen, W.&lt;/author&gt;&lt;/authors&gt;&lt;/contributors&gt;&lt;titles&gt;&lt;title&gt;Two Methods of Simulator Coupling&lt;/title&gt;&lt;secondary-title&gt;Mathematical and Computer Modelling of Dynamical Systems&lt;/secondary-title&gt;&lt;alt-title&gt;Math. Comput. Model. Dyn. Syst.&lt;/alt-title&gt;&lt;/titles&gt;&lt;periodical&gt;&lt;full-title&gt;Mathematical and Computer Modelling of Dynamical Systems&lt;/full-title&gt;&lt;abbr-1&gt;Math. Comput. Model. Dyn. Syst.&lt;/abbr-1&gt;&lt;/periodical&gt;&lt;pages&gt;93-113&lt;/pages&gt;&lt;volume&gt;6&lt;/volume&gt;&lt;number&gt;2&lt;/number&gt;&lt;dates&gt;&lt;year&gt;2000&lt;/year&gt;&lt;/dates&gt;&lt;publisher&gt;Taylor &amp;amp; Francis&lt;/publisher&gt;&lt;label&gt;kubler2000&lt;/label&gt;&lt;urls&gt;&lt;/urls&gt;&lt;electronic-resource-num&gt;10.1076/1387-3954(200006)6:2;1-M;FT093&lt;/electronic-resource-num&gt;&lt;/record&gt;&lt;/Cite&gt;&lt;/EndNote&gt;</w:instrText>
       </w:r>
       <w:r>
         <w:fldChar w:fldCharType="separate"/>
@@ -1640,7 +1640,7 @@
         <w:fldChar w:fldCharType="begin"/>
       </w:r>
       <w:r>
-        <w:instrText xml:space="preserve"> ADDIN EN.CITE &lt;EndNote&gt;&lt;Cite ExcludeAuth="1"&gt;&lt;Author&gt;Broman&lt;/Author&gt;&lt;Year&gt;2013&lt;/Year&gt;&lt;RecNum&gt;8&lt;/RecNum&gt;&lt;DisplayText&gt;(2013)&lt;/DisplayText&gt;&lt;record&gt;&lt;rec-number&gt;8&lt;/rec-number&gt;&lt;foreign-keys&gt;&lt;key app="EN" db-id="mdae8500109496fea4aff9c086e16cc25895" timestamp="1793226621"&gt;8&lt;/key&gt;&lt;/foreign-keys&gt;&lt;ref-type name="Conference Paper"&gt;47&lt;/ref-type&gt;&lt;contributors&gt;&lt;authors&gt;&lt;author&gt;Broman, David&lt;/author&gt;&lt;author&gt;Brooks, Christopher&lt;/author&gt;&lt;author&gt;Greenberg, Lev&lt;/author&gt;&lt;author&gt;Lee, Edward A.&lt;/author&gt;&lt;author&gt;Masin, Michael&lt;/author&gt;&lt;author&gt;Tripakis, Stavros&lt;/author&gt;&lt;author&gt;Wetter, Michael&lt;/author&gt;&lt;/authors&gt;&lt;/contributors&gt;&lt;titles&gt;&lt;title&gt;Determinate composition of FMUs for co-simulation&lt;/title&gt;&lt;secondary-title&gt;2013 Proceedings of the International Conference on Embedded Software (EMSOFT)&lt;/secondary-title&gt;&lt;/titles&gt;&lt;pages&gt;1-12&lt;/pages&gt;&lt;dates&gt;&lt;year&gt;2013&lt;/year&gt;&lt;/dates&gt;&lt;pub-location&gt;Montreal, QC, Canada&lt;/pub-location&gt;&lt;publisher&gt;IEEE&lt;/publisher&gt;&lt;label&gt;broman2013&lt;/label&gt;&lt;urls&gt;&lt;/urls&gt;&lt;electronic-resource-num&gt;10.1109/EMSOFT.2013.6658580&lt;/electronic-resource-num&gt;&lt;/record&gt;&lt;/Cite&gt;&lt;/EndNote&gt;</w:instrText>
+        <w:instrText xml:space="preserve"> ADDIN EN.CITE &lt;EndNote&gt;&lt;Cite ExcludeAuth="1"&gt;&lt;Author&gt;Broman&lt;/Author&gt;&lt;Year&gt;2013&lt;/Year&gt;&lt;RecNum&gt;8&lt;/RecNum&gt;&lt;DisplayText&gt;(2013)&lt;/DisplayText&gt;&lt;record&gt;&lt;rec-number&gt;8&lt;/rec-number&gt;&lt;foreign-keys&gt;&lt;key app="EN" db-id="mdae8500109496fea4aff9c086e16cc25895" timestamp="1793229176"&gt;8&lt;/key&gt;&lt;/foreign-keys&gt;&lt;ref-type name="Conference Paper"&gt;47&lt;/ref-type&gt;&lt;contributors&gt;&lt;authors&gt;&lt;author&gt;Broman, David&lt;/author&gt;&lt;author&gt;Brooks, Christopher&lt;/author&gt;&lt;author&gt;Greenberg, Lev&lt;/author&gt;&lt;author&gt;Lee, Edward A.&lt;/author&gt;&lt;author&gt;Masin, Michael&lt;/author&gt;&lt;author&gt;Tripakis, Stavros&lt;/author&gt;&lt;author&gt;Wetter, Michael&lt;/author&gt;&lt;/authors&gt;&lt;/contributors&gt;&lt;titles&gt;&lt;title&gt;Determinate composition of FMUs for co-simulation&lt;/title&gt;&lt;secondary-title&gt;2013 Proceedings of the International Conference on Embedded Software (EMSOFT)&lt;/secondary-title&gt;&lt;/titles&gt;&lt;pages&gt;1-12&lt;/pages&gt;&lt;dates&gt;&lt;year&gt;2013&lt;/year&gt;&lt;/dates&gt;&lt;pub-location&gt;Montreal, QC, Canada&lt;/pub-location&gt;&lt;publisher&gt;IEEE&lt;/publisher&gt;&lt;label&gt;broman2013&lt;/label&gt;&lt;urls&gt;&lt;/urls&gt;&lt;electronic-resource-num&gt;10.1109/EMSOFT.2013.6658580&lt;/electronic-resource-num&gt;&lt;/record&gt;&lt;/Cite&gt;&lt;/EndNote&gt;</w:instrText>
       </w:r>
       <w:r>
         <w:fldChar w:fldCharType="separate"/>
@@ -1661,7 +1661,7 @@
         <w:fldChar w:fldCharType="begin"/>
       </w:r>
       <w:r>
-        <w:instrText xml:space="preserve"> ADDIN EN.CITE &lt;EndNote&gt;&lt;Cite ExcludeAuth="1"&gt;&lt;Author&gt;Gomes&lt;/Author&gt;&lt;Year&gt;2018&lt;/Year&gt;&lt;RecNum&gt;26&lt;/RecNum&gt;&lt;DisplayText&gt;(2018)&lt;/DisplayText&gt;&lt;record&gt;&lt;rec-number&gt;26&lt;/rec-number&gt;&lt;foreign-keys&gt;&lt;key app="EN" db-id="mdae8500109496fea4aff9c086e16cc25895" timestamp="1793226621"&gt;26&lt;/key&gt;&lt;/foreign-keys&gt;&lt;ref-type name="Journal Article"&gt;17&lt;/ref-type&gt;&lt;contributors&gt;&lt;authors&gt;&lt;author&gt;Gomes, Cláudio&lt;/author&gt;&lt;author&gt;Thule, Casper&lt;/author&gt;&lt;author&gt;Broman, David&lt;/author&gt;&lt;author&gt;Larsen, Peter Gorm&lt;/author&gt;&lt;author&gt;Vangheluwe, Hans&lt;/author&gt;&lt;/authors&gt;&lt;/contributors&gt;&lt;titles&gt;&lt;title&gt;Co-Simulation: A Survey&lt;/title&gt;&lt;secondary-title&gt;ACM Computing Surveys&lt;/secondary-title&gt;&lt;alt-title&gt;ACM Comput. Surv.&lt;/alt-title&gt;&lt;/titles&gt;&lt;periodical&gt;&lt;full-title&gt;ACM Computing Surveys&lt;/full-title&gt;&lt;abbr-1&gt;ACM Comput. Surv.&lt;/abbr-1&gt;&lt;/periodical&gt;&lt;pages&gt;49&lt;/pages&gt;&lt;volume&gt;51&lt;/volume&gt;&lt;number&gt;3&lt;/number&gt;&lt;dates&gt;&lt;year&gt;2018&lt;/year&gt;&lt;/dates&gt;&lt;publisher&gt;ACM&lt;/publisher&gt;&lt;label&gt;gomes2018&lt;/label&gt;&lt;urls&gt;&lt;/urls&gt;&lt;electronic-resource-num&gt;10.1145/3179993&lt;/electronic-resource-num&gt;&lt;/record&gt;&lt;/Cite&gt;&lt;/EndNote&gt;</w:instrText>
+        <w:instrText xml:space="preserve"> ADDIN EN.CITE &lt;EndNote&gt;&lt;Cite ExcludeAuth="1"&gt;&lt;Author&gt;Gomes&lt;/Author&gt;&lt;Year&gt;2018&lt;/Year&gt;&lt;RecNum&gt;26&lt;/RecNum&gt;&lt;DisplayText&gt;(2018)&lt;/DisplayText&gt;&lt;record&gt;&lt;rec-number&gt;26&lt;/rec-number&gt;&lt;foreign-keys&gt;&lt;key app="EN" db-id="mdae8500109496fea4aff9c086e16cc25895" timestamp="1793229176"&gt;26&lt;/key&gt;&lt;/foreign-keys&gt;&lt;ref-type name="Journal Article"&gt;17&lt;/ref-type&gt;&lt;contributors&gt;&lt;authors&gt;&lt;author&gt;Gomes, Cláudio&lt;/author&gt;&lt;author&gt;Thule, Casper&lt;/author&gt;&lt;author&gt;Broman, David&lt;/author&gt;&lt;author&gt;Larsen, Peter Gorm&lt;/author&gt;&lt;author&gt;Vangheluwe, Hans&lt;/author&gt;&lt;/authors&gt;&lt;/contributors&gt;&lt;titles&gt;&lt;title&gt;Co-Simulation: A Survey&lt;/title&gt;&lt;secondary-title&gt;ACM Computing Surveys&lt;/secondary-title&gt;&lt;alt-title&gt;ACM Comput. Surv.&lt;/alt-title&gt;&lt;/titles&gt;&lt;periodical&gt;&lt;full-title&gt;ACM Computing Surveys&lt;/full-title&gt;&lt;abbr-1&gt;ACM Comput. Surv.&lt;/abbr-1&gt;&lt;/periodical&gt;&lt;pages&gt;49&lt;/pages&gt;&lt;volume&gt;51&lt;/volume&gt;&lt;number&gt;3&lt;/number&gt;&lt;dates&gt;&lt;year&gt;2018&lt;/year&gt;&lt;/dates&gt;&lt;publisher&gt;ACM&lt;/publisher&gt;&lt;label&gt;gomes2018&lt;/label&gt;&lt;urls&gt;&lt;/urls&gt;&lt;electronic-resource-num&gt;10.1145/3179993&lt;/electronic-resource-num&gt;&lt;/record&gt;&lt;/Cite&gt;&lt;/EndNote&gt;</w:instrText>
       </w:r>
       <w:r>
         <w:fldChar w:fldCharType="separate"/>
@@ -1684,7 +1684,7 @@
 PFJlY051bT4zPC9SZWNOdW0+PERpc3BsYXlUZXh0PihCZW5lZGlrdCBldCBhbC4gMjAxMzsgU2Fk
 amluYSBldCBhbC4gMjAxNyk8L0Rpc3BsYXlUZXh0PjxyZWNvcmQ+PHJlYy1udW1iZXI+MzwvcmVj
 LW51bWJlcj48Zm9yZWlnbi1rZXlzPjxrZXkgYXBwPSJFTiIgZGItaWQ9Im1kYWU4NTAwMTA5NDk2
-ZmVhNGFmZjljMDg2ZTE2Y2MyNTg5NSIgdGltZXN0YW1wPSIxNzkzMjI2NjIxIj4zPC9rZXk+PC9m
+ZmVhNGFmZjljMDg2ZTE2Y2MyNTg5NSIgdGltZXN0YW1wPSIxNzkzMjI5MTc2Ij4zPC9rZXk+PC9m
 b3JlaWduLWtleXM+PHJlZi10eXBlIG5hbWU9IkNvbmZlcmVuY2UgUGFwZXIiPjQ3PC9yZWYtdHlw
 ZT48Y29udHJpYnV0b3JzPjxhdXRob3JzPjxhdXRob3I+QmVuZWRpa3QsIE0uPC9hdXRob3I+PGF1
 dGhvcj5XYXR6ZW5pZywgRC48L2F1dGhvcj48YXV0aG9yPlplaGV0bmVyLCBKLjwvYXV0aG9yPjxh
@@ -1702,7 +1702,7 @@
 PC9DaXRlPjxDaXRlPjxBdXRob3I+U2FkamluYTwvQXV0aG9yPjxZZWFyPjIwMTc8L1llYXI+PFJl
 Y051bT43MTwvUmVjTnVtPjxyZWNvcmQ+PHJlYy1udW1iZXI+NzE8L3JlYy1udW1iZXI+PGZvcmVp
 Z24ta2V5cz48a2V5IGFwcD0iRU4iIGRiLWlkPSJtZGFlODUwMDEwOTQ5NmZlYTRhZmY5YzA4NmUx
-NmNjMjU4OTUiIHRpbWVzdGFtcD0iMTc5MzIyNjYyMSI+NzE8L2tleT48L2ZvcmVpZ24ta2V5cz48
+NmNjMjU4OTUiIHRpbWVzdGFtcD0iMTc5MzIyOTE3NiI+NzE8L2tleT48L2ZvcmVpZ24ta2V5cz48
 cmVmLXR5cGUgbmFtZT0iSm91cm5hbCBBcnRpY2xlIj4xNzwvcmVmLXR5cGU+PGNvbnRyaWJ1dG9y
 cz48YXV0aG9ycz48YXV0aG9yPlNhZGppbmEsIFNldmVyaW48L2F1dGhvcj48YXV0aG9yPkt5bGxp
 bmdzdGFkLCBMYXJzIFQuPC9hdXRob3I+PGF1dGhvcj5Ta2pvbmcsIFN0aWFuPC9hdXRob3I+PGF1
@@ -1729,7 +1729,7 @@
 PFJlY051bT4zPC9SZWNOdW0+PERpc3BsYXlUZXh0PihCZW5lZGlrdCBldCBhbC4gMjAxMzsgU2Fk
 amluYSBldCBhbC4gMjAxNyk8L0Rpc3BsYXlUZXh0PjxyZWNvcmQ+PHJlYy1udW1iZXI+MzwvcmVj
 LW51bWJlcj48Zm9yZWlnbi1rZXlzPjxrZXkgYXBwPSJFTiIgZGItaWQ9Im1kYWU4NTAwMTA5NDk2
-ZmVhNGFmZjljMDg2ZTE2Y2MyNTg5NSIgdGltZXN0YW1wPSIxNzkzMjI2NjIxIj4zPC9rZXk+PC9m
+ZmVhNGFmZjljMDg2ZTE2Y2MyNTg5NSIgdGltZXN0YW1wPSIxNzkzMjI5MTc2Ij4zPC9rZXk+PC9m
 b3JlaWduLWtleXM+PHJlZi10eXBlIG5hbWU9IkNvbmZlcmVuY2UgUGFwZXIiPjQ3PC9yZWYtdHlw
 ZT48Y29udHJpYnV0b3JzPjxhdXRob3JzPjxhdXRob3I+QmVuZWRpa3QsIE0uPC9hdXRob3I+PGF1
 dGhvcj5XYXR6ZW5pZywgRC48L2F1dGhvcj48YXV0aG9yPlplaGV0bmVyLCBKLjwvYXV0aG9yPjxh
@@ -1747,7 +1747,7 @@
 PC9DaXRlPjxDaXRlPjxBdXRob3I+U2FkamluYTwvQXV0aG9yPjxZZWFyPjIwMTc8L1llYXI+PFJl
 Y051bT43MTwvUmVjTnVtPjxyZWNvcmQ+PHJlYy1udW1iZXI+NzE8L3JlYy1udW1iZXI+PGZvcmVp
 Z24ta2V5cz48a2V5IGFwcD0iRU4iIGRiLWlkPSJtZGFlODUwMDEwOTQ5NmZlYTRhZmY5YzA4NmUx
-NmNjMjU4OTUiIHRpbWVzdGFtcD0iMTc5MzIyNjYyMSI+NzE8L2tleT48L2ZvcmVpZ24ta2V5cz48
+NmNjMjU4OTUiIHRpbWVzdGFtcD0iMTc5MzIyOTE3NiI+NzE8L2tleT48L2ZvcmVpZ24ta2V5cz48
 cmVmLXR5cGUgbmFtZT0iSm91cm5hbCBBcnRpY2xlIj4xNzwvcmVmLXR5cGU+PGNvbnRyaWJ1dG9y
 cz48YXV0aG9ycz48YXV0aG9yPlNhZGppbmEsIFNldmVyaW48L2F1dGhvcj48YXV0aG9yPkt5bGxp
 bmdzdGFkLCBMYXJzIFQuPC9hdXRob3I+PGF1dGhvcj5Ta2pvbmcsIFN0aWFuPC9hdXRob3I+PGF1
@@ -1792,7 +1792,7 @@
 PFJlY051bT44MTwvUmVjTnVtPjxEaXNwbGF5VGV4dD4oVHJpcGFraXMgMjAxNTsgR29tZXMgZXQg
 YWwuIDIwMTkpPC9EaXNwbGF5VGV4dD48cmVjb3JkPjxyZWMtbnVtYmVyPjgxPC9yZWMtbnVtYmVy
 Pjxmb3JlaWduLWtleXM+PGtleSBhcHA9IkVOIiBkYi1pZD0ibWRhZTg1MDAxMDk0OTZmZWE0YWZm
-OWMwODZlMTZjYzI1ODk1IiB0aW1lc3RhbXA9IjE3OTMyMjY2MjEiPjgxPC9rZXk+PC9mb3JlaWdu
+OWMwODZlMTZjYzI1ODk1IiB0aW1lc3RhbXA9IjE3OTMyMjkxNzYiPjgxPC9rZXk+PC9mb3JlaWdu
 LWtleXM+PHJlZi10eXBlIG5hbWU9IkNvbmZlcmVuY2UgUGFwZXIiPjQ3PC9yZWYtdHlwZT48Y29u
 dHJpYnV0b3JzPjxhdXRob3JzPjxhdXRob3I+VHJpcGFraXMsIFN0YXZyb3M8L2F1dGhvcj48L2F1
 dGhvcnM+PC9jb250cmlidXRvcnM+PHRpdGxlcz48dGl0bGU+QnJpZGdpbmcgdGhlIHNlbWFudGlj
@@ -1807,7 +1807,7 @@
 b3JkPjwvQ2l0ZT48Q2l0ZT48QXV0aG9yPkdvbWVzPC9BdXRob3I+PFllYXI+MjAxOTwvWWVhcj48
 UmVjTnVtPjI3PC9SZWNOdW0+PHJlY29yZD48cmVjLW51bWJlcj4yNzwvcmVjLW51bWJlcj48Zm9y
 ZWlnbi1rZXlzPjxrZXkgYXBwPSJFTiIgZGItaWQ9Im1kYWU4NTAwMTA5NDk2ZmVhNGFmZjljMDg2
-ZTE2Y2MyNTg5NSIgdGltZXN0YW1wPSIxNzkzMjI2NjIxIj4yNzwva2V5PjwvZm9yZWlnbi1rZXlz
+ZTE2Y2MyNTg5NSIgdGltZXN0YW1wPSIxNzkzMjI5MTc2Ij4yNzwva2V5PjwvZm9yZWlnbi1rZXlz
 PjxyZWYtdHlwZSBuYW1lPSJKb3VybmFsIEFydGljbGUiPjE3PC9yZWYtdHlwZT48Y29udHJpYnV0
 b3JzPjxhdXRob3JzPjxhdXRob3I+R29tZXMsIENsw6F1ZGlvPC9hdXRob3I+PGF1dGhvcj5NZXll
 cnMsIEJhcnQ8L2F1dGhvcj48YXV0aG9yPkRlbmlsLCBKb2FjaGltPC9hdXRob3I+PGF1dGhvcj5U
@@ -1835,7 +1835,7 @@
 PFJlY051bT44MTwvUmVjTnVtPjxEaXNwbGF5VGV4dD4oVHJpcGFraXMgMjAxNTsgR29tZXMgZXQg
 YWwuIDIwMTkpPC9EaXNwbGF5VGV4dD48cmVjb3JkPjxyZWMtbnVtYmVyPjgxPC9yZWMtbnVtYmVy
 Pjxmb3JlaWduLWtleXM+PGtleSBhcHA9IkVOIiBkYi1pZD0ibWRhZTg1MDAxMDk0OTZmZWE0YWZm
-OWMwODZlMTZjYzI1ODk1IiB0aW1lc3RhbXA9IjE3OTMyMjY2MjEiPjgxPC9rZXk+PC9mb3JlaWdu
+OWMwODZlMTZjYzI1ODk1IiB0aW1lc3RhbXA9IjE3OTMyMjkxNzYiPjgxPC9rZXk+PC9mb3JlaWdu
 LWtleXM+PHJlZi10eXBlIG5hbWU9IkNvbmZlcmVuY2UgUGFwZXIiPjQ3PC9yZWYtdHlwZT48Y29u
 dHJpYnV0b3JzPjxhdXRob3JzPjxhdXRob3I+VHJpcGFraXMsIFN0YXZyb3M8L2F1dGhvcj48L2F1
 dGhvcnM+PC9jb250cmlidXRvcnM+PHRpdGxlcz48dGl0bGU+QnJpZGdpbmcgdGhlIHNlbWFudGlj
@@ -1850,7 +1850,7 @@
 b3JkPjwvQ2l0ZT48Q2l0ZT48QXV0aG9yPkdvbWVzPC9BdXRob3I+PFllYXI+MjAxOTwvWWVhcj48
 UmVjTnVtPjI3PC9SZWNOdW0+PHJlY29yZD48cmVjLW51bWJlcj4yNzwvcmVjLW51bWJlcj48Zm9y
 ZWlnbi1rZXlzPjxrZXkgYXBwPSJFTiIgZGItaWQ9Im1kYWU4NTAwMTA5NDk2ZmVhNGFmZjljMDg2
-ZTE2Y2MyNTg5NSIgdGltZXN0YW1wPSIxNzkzMjI2NjIxIj4yNzwva2V5PjwvZm9yZWlnbi1rZXlz
+ZTE2Y2MyNTg5NSIgdGltZXN0YW1wPSIxNzkzMjI5MTc2Ij4yNzwva2V5PjwvZm9yZWlnbi1rZXlz
 PjxyZWYtdHlwZSBuYW1lPSJKb3VybmFsIEFydGljbGUiPjE3PC9yZWYtdHlwZT48Y29udHJpYnV0
 b3JzPjxhdXRob3JzPjxhdXRob3I+R29tZXMsIENsw6F1ZGlvPC9hdXRob3I+PGF1dGhvcj5NZXll
 cnMsIEJhcnQ8L2F1dGhvcj48YXV0aG9yPkRlbmlsLCBKb2FjaGltPC9hdXRob3I+PGF1dGhvcj5U
@@ -1910,7 +1910,7 @@
         <w:fldChar w:fldCharType="begin"/>
       </w:r>
       <w:r>
-        <w:instrText xml:space="preserve"> ADDIN EN.CITE &lt;EndNote&gt;&lt;Cite&gt;&lt;Author&gt;IEEE&lt;/Author&gt;&lt;Year&gt;2010&lt;/Year&gt;&lt;RecNum&gt;38&lt;/RecNum&gt;&lt;DisplayText&gt;(IEEE 2010; Fujimoto 2000)&lt;/DisplayText&gt;&lt;record&gt;&lt;rec-number&gt;38&lt;/rec-number&gt;&lt;foreign-keys&gt;&lt;key app="EN" db-id="mdae8500109496fea4aff9c086e16cc25895" timestamp="1793226621"&gt;38&lt;/key&gt;&lt;/foreign-keys&gt;&lt;ref-type name="Standard"&gt;58&lt;/ref-type&gt;&lt;contributors&gt;&lt;authors&gt;&lt;author&gt;IEEE&lt;/author&gt;&lt;/authors&gt;&lt;/contributors&gt;&lt;titles&gt;&lt;title&gt;IEEE Standard for Modeling and Simulation (M&amp;amp;S) High Level Architecture (HLA) – Framework and Rules&lt;/title&gt;&lt;secondary-title&gt;IEEE Std 1516-2010&lt;/secondary-title&gt;&lt;/titles&gt;&lt;dates&gt;&lt;year&gt;2010&lt;/year&gt;&lt;/dates&gt;&lt;isbn&gt;978-0-7381-6251-5&lt;/isbn&gt;&lt;label&gt;ieee1516_2010&lt;/label&gt;&lt;urls&gt;&lt;related-urls&gt;&lt;url&gt;https://ieeexplore.ieee.org/document/5553440&lt;/url&gt;&lt;/related-urls&gt;&lt;/urls&gt;&lt;electronic-resource-num&gt;10.1109/IEEESTD.2010.5553440&lt;/electronic-resource-num&gt;&lt;/record&gt;&lt;/Cite&gt;&lt;Cite&gt;&lt;Author&gt;Fujimoto&lt;/Author&gt;&lt;Year&gt;2000&lt;/Year&gt;&lt;RecNum&gt;25&lt;/RecNum&gt;&lt;record&gt;&lt;rec-number&gt;25&lt;/rec-number&gt;&lt;foreign-keys&gt;&lt;key app="EN" db-id="mdae8500109496fea4aff9c086e16cc25895" timestamp="1793226621"&gt;25&lt;/key&gt;&lt;/foreign-keys&gt;&lt;ref-type name="Book"&gt;6&lt;/ref-type&gt;&lt;contributors&gt;&lt;authors&gt;&lt;author&gt;Fujimoto, Richard M.&lt;/author&gt;&lt;/authors&gt;&lt;/contributors&gt;&lt;titles&gt;&lt;title&gt;Parallel and Distributed Simulation Systems&lt;/title&gt;&lt;secondary-title&gt;Wiley Series on Parallel and Distributed Computing&lt;/secondary-title&gt;&lt;/titles&gt;&lt;dates&gt;&lt;year&gt;2000&lt;/year&gt;&lt;/dates&gt;&lt;pub-location&gt;New York&lt;/pub-location&gt;&lt;publisher&gt;John Wiley &amp;amp; Sons&lt;/publisher&gt;&lt;isbn&gt;978-0-471-18383-9&lt;/isbn&gt;&lt;label&gt;fujimoto2000&lt;/label&gt;&lt;urls&gt;&lt;/urls&gt;&lt;/record&gt;&lt;/Cite&gt;&lt;/EndNote&gt;</w:instrText>
+        <w:instrText xml:space="preserve"> ADDIN EN.CITE &lt;EndNote&gt;&lt;Cite&gt;&lt;Author&gt;IEEE&lt;/Author&gt;&lt;Year&gt;2010&lt;/Year&gt;&lt;RecNum&gt;38&lt;/RecNum&gt;&lt;DisplayText&gt;(IEEE 2010; Fujimoto 2000)&lt;/DisplayText&gt;&lt;record&gt;&lt;rec-number&gt;38&lt;/rec-number&gt;&lt;foreign-keys&gt;&lt;key app="EN" db-id="mdae8500109496fea4aff9c086e16cc25895" timestamp="1793229176"&gt;38&lt;/key&gt;&lt;/foreign-keys&gt;&lt;ref-type name="Standard"&gt;58&lt;/ref-type&gt;&lt;contributors&gt;&lt;authors&gt;&lt;author&gt;IEEE&lt;/author&gt;&lt;/authors&gt;&lt;/contributors&gt;&lt;titles&gt;&lt;title&gt;IEEE Standard for Modeling and Simulation (M&amp;amp;S) High Level Architecture (HLA) – Framework and Rules&lt;/title&gt;&lt;secondary-title&gt;IEEE Std 1516-2010&lt;/secondary-title&gt;&lt;/titles&gt;&lt;dates&gt;&lt;year&gt;2010&lt;/year&gt;&lt;/dates&gt;&lt;isbn&gt;978-0-7381-6251-5&lt;/isbn&gt;&lt;label&gt;ieee1516_2010&lt;/label&gt;&lt;urls&gt;&lt;related-urls&gt;&lt;url&gt;https://ieeexplore.ieee.org/document/5553440&lt;/url&gt;&lt;/related-urls&gt;&lt;/urls&gt;&lt;electronic-resource-num&gt;10.1109/IEEESTD.2010.5553440&lt;/electronic-resource-num&gt;&lt;/record&gt;&lt;/Cite&gt;&lt;Cite&gt;&lt;Author&gt;Fujimoto&lt;/Author&gt;&lt;Year&gt;2000&lt;/Year&gt;&lt;RecNum&gt;25&lt;/RecNum&gt;&lt;record&gt;&lt;rec-number&gt;25&lt;/rec-number&gt;&lt;foreign-keys&gt;&lt;key app="EN" db-id="mdae8500109496fea4aff9c086e16cc25895" timestamp="1793229176"&gt;25&lt;/key&gt;&lt;/foreign-keys&gt;&lt;ref-type name="Book"&gt;6&lt;/ref-type&gt;&lt;contributors&gt;&lt;authors&gt;&lt;author&gt;Fujimoto, Richard M.&lt;/author&gt;&lt;/authors&gt;&lt;/contributors&gt;&lt;titles&gt;&lt;title&gt;Parallel and Distributed Simulation Systems&lt;/title&gt;&lt;secondary-title&gt;Wiley Series on Parallel and Distributed Computing&lt;/secondary-title&gt;&lt;/titles&gt;&lt;dates&gt;&lt;year&gt;2000&lt;/year&gt;&lt;/dates&gt;&lt;pub-location&gt;New York&lt;/pub-location&gt;&lt;publisher&gt;John Wiley &amp;amp; Sons&lt;/publisher&gt;&lt;isbn&gt;978-0-471-18383-9&lt;/isbn&gt;&lt;label&gt;fujimoto2000&lt;/label&gt;&lt;urls&gt;&lt;/urls&gt;&lt;/record&gt;&lt;/Cite&gt;&lt;/EndNote&gt;</w:instrText>
       </w:r>
       <w:r>
         <w:fldChar w:fldCharType="separate"/>
@@ -1934,7 +1934,7 @@
 OyBIYXJkeSBldCBhbC4gMjAyNDsgSEVMSUNTIGRldmVsb3BlcnMgMjAyNik8L0Rpc3BsYXlUZXh0
 PjxyZWNvcmQ+PHJlYy1udW1iZXI+Njg8L3JlYy1udW1iZXI+PGZvcmVpZ24ta2V5cz48a2V5IGFw
 cD0iRU4iIGRiLWlkPSJtZGFlODUwMDEwOTQ5NmZlYTRhZmY5YzA4NmUxNmNjMjU4OTUiIHRpbWVz
-dGFtcD0iMTc5MzIyNjYyMSI+Njg8L2tleT48L2ZvcmVpZ24ta2V5cz48cmVmLXR5cGUgbmFtZT0i
+dGFtcD0iMTc5MzIyOTE3NiI+Njg8L2tleT48L2ZvcmVpZ24ta2V5cz48cmVmLXR5cGUgbmFtZT0i
 Q29uZmVyZW5jZSBQYXBlciI+NDc8L3JlZi10eXBlPjxjb250cmlidXRvcnM+PGF1dGhvcnM+PGF1
 dGhvcj5QYWxtaW50aWVyLCBCcnlhbjwvYXV0aG9yPjxhdXRob3I+S3Jpc2huYW11cnRoeSwgRGhl
 ZXBhazwvYXV0aG9yPjxhdXRob3I+VG9wLCBQaGlsaXA8L2F1dGhvcj48YXV0aG9yPlNtaXRoLCBT
@@ -1952,7 +1952,7 @@
 PkhhcmR5PC9BdXRob3I+PFllYXI+MjAyNDwvWWVhcj48UmVjTnVtPjI5PC9SZWNOdW0+PHJlY29y
 ZD48cmVjLW51bWJlcj4yOTwvcmVjLW51bWJlcj48Zm9yZWlnbi1rZXlzPjxrZXkgYXBwPSJFTiIg
 ZGItaWQ9Im1kYWU4NTAwMTA5NDk2ZmVhNGFmZjljMDg2ZTE2Y2MyNTg5NSIgdGltZXN0YW1wPSIx
-NzkzMjI2NjIxIj4yOTwva2V5PjwvZm9yZWlnbi1rZXlzPjxyZWYtdHlwZSBuYW1lPSJKb3VybmFs
+NzkzMjI5MTc2Ij4yOTwva2V5PjwvZm9yZWlnbi1rZXlzPjxyZWYtdHlwZSBuYW1lPSJKb3VybmFs
 IEFydGljbGUiPjE3PC9yZWYtdHlwZT48Y29udHJpYnV0b3JzPjxhdXRob3JzPjxhdXRob3I+SGFy
 ZHksIFRyZXZvciBELjwvYXV0aG9yPjxhdXRob3I+UGFsbWludGllciwgQnJ5YW48L2F1dGhvcj48
 YXV0aG9yPlRvcCwgUGhpbGlwIEwuPC9hdXRob3I+PGF1dGhvcj5LcmlzaG5hbXVydGh5LCBEaGVl
@@ -1969,7 +1969,7 @@
 PjwvcmVjb3JkPjwvQ2l0ZT48Q2l0ZT48QXV0aG9yPkhFTElDUyBkZXZlbG9wZXJzPC9BdXRob3I+
 PFllYXI+MjAyNjwvWWVhcj48UmVjTnVtPjMxPC9SZWNOdW0+PHJlY29yZD48cmVjLW51bWJlcj4z
 MTwvcmVjLW51bWJlcj48Zm9yZWlnbi1rZXlzPjxrZXkgYXBwPSJFTiIgZGItaWQ9Im1kYWU4NTAw
-MTA5NDk2ZmVhNGFmZjljMDg2ZTE2Y2MyNTg5NSIgdGltZXN0YW1wPSIxNzkzMjI2NjIxIj4zMTwv
+MTA5NDk2ZmVhNGFmZjljMDg2ZTE2Y2MyNTg5NSIgdGltZXN0YW1wPSIxNzkzMjI5MTc2Ij4zMTwv
 a2V5PjwvZm9yZWlnbi1rZXlzPjxyZWYtdHlwZSBuYW1lPSJXZWIgUGFnZSI+MTI8L3JlZi10eXBl
 Pjxjb250cmlidXRvcnM+PGF1dGhvcnM+PGF1dGhvcj5IRUxJQ1MgZGV2ZWxvcGVyczwvYXV0aG9y
 PjwvYXV0aG9ycz48L2NvbnRyaWJ1dG9ycz48dGl0bGVzPjx0aXRsZT5IRUxJQ1MgZG9jdW1lbnRh
@@ -1990,7 +1990,7 @@
 OyBIYXJkeSBldCBhbC4gMjAyNDsgSEVMSUNTIGRldmVsb3BlcnMgMjAyNik8L0Rpc3BsYXlUZXh0
 PjxyZWNvcmQ+PHJlYy1udW1iZXI+Njg8L3JlYy1udW1iZXI+PGZvcmVpZ24ta2V5cz48a2V5IGFw
 cD0iRU4iIGRiLWlkPSJtZGFlODUwMDEwOTQ5NmZlYTRhZmY5YzA4NmUxNmNjMjU4OTUiIHRpbWVz
-dGFtcD0iMTc5MzIyNjYyMSI+Njg8L2tleT48L2ZvcmVpZ24ta2V5cz48cmVmLXR5cGUgbmFtZT0i
+dGFtcD0iMTc5MzIyOTE3NiI+Njg8L2tleT48L2ZvcmVpZ24ta2V5cz48cmVmLXR5cGUgbmFtZT0i
 Q29uZmVyZW5jZSBQYXBlciI+NDc8L3JlZi10eXBlPjxjb250cmlidXRvcnM+PGF1dGhvcnM+PGF1
 dGhvcj5QYWxtaW50aWVyLCBCcnlhbjwvYXV0aG9yPjxhdXRob3I+S3Jpc2huYW11cnRoeSwgRGhl
 ZXBhazwvYXV0aG9yPjxhdXRob3I+VG9wLCBQaGlsaXA8L2F1dGhvcj48YXV0aG9yPlNtaXRoLCBT
@@ -2008,7 +2008,7 @@
 PkhhcmR5PC9BdXRob3I+PFllYXI+MjAyNDwvWWVhcj48UmVjTnVtPjI5PC9SZWNOdW0+PHJlY29y
 ZD48cmVjLW51bWJlcj4yOTwvcmVjLW51bWJlcj48Zm9yZWlnbi1rZXlzPjxrZXkgYXBwPSJFTiIg
 ZGItaWQ9Im1kYWU4NTAwMTA5NDk2ZmVhNGFmZjljMDg2ZTE2Y2MyNTg5NSIgdGltZXN0YW1wPSIx
-NzkzMjI2NjIxIj4yOTwva2V5PjwvZm9yZWlnbi1rZXlzPjxyZWYtdHlwZSBuYW1lPSJKb3VybmFs
+NzkzMjI5MTc2Ij4yOTwva2V5PjwvZm9yZWlnbi1rZXlzPjxyZWYtdHlwZSBuYW1lPSJKb3VybmFs
 IEFydGljbGUiPjE3PC9yZWYtdHlwZT48Y29udHJpYnV0b3JzPjxhdXRob3JzPjxhdXRob3I+SGFy
 ZHksIFRyZXZvciBELjwvYXV0aG9yPjxhdXRob3I+UGFsbWludGllciwgQnJ5YW48L2F1dGhvcj48
 YXV0aG9yPlRvcCwgUGhpbGlwIEwuPC9hdXRob3I+PGF1dGhvcj5LcmlzaG5hbXVydGh5LCBEaGVl
@@ -2025,7 +2025,7 @@
 PjwvcmVjb3JkPjwvQ2l0ZT48Q2l0ZT48QXV0aG9yPkhFTElDUyBkZXZlbG9wZXJzPC9BdXRob3I+
 PFllYXI+MjAyNjwvWWVhcj48UmVjTnVtPjMxPC9SZWNOdW0+PHJlY29yZD48cmVjLW51bWJlcj4z
 MTwvcmVjLW51bWJlcj48Zm9yZWlnbi1rZXlzPjxrZXkgYXBwPSJFTiIgZGItaWQ9Im1kYWU4NTAw
-MTA5NDk2ZmVhNGFmZjljMDg2ZTE2Y2MyNTg5NSIgdGltZXN0YW1wPSIxNzkzMjI2NjIxIj4zMTwv
+MTA5NDk2ZmVhNGFmZjljMDg2ZTE2Y2MyNTg5NSIgdGltZXN0YW1wPSIxNzkzMjI5MTc2Ij4zMTwv
 a2V5PjwvZm9yZWlnbi1rZXlzPjxyZWYtdHlwZSBuYW1lPSJXZWIgUGFnZSI+MTI8L3JlZi10eXBl
 Pjxjb250cmlidXRvcnM+PGF1dGhvcnM+PGF1dGhvcj5IRUxJQ1MgZGV2ZWxvcGVyczwvYXV0aG9y
 PjwvYXV0aG9ycz48L2NvbnRyaWJ1dG9ycz48dGl0bGVzPjx0aXRsZT5IRUxJQ1MgZG9jdW1lbnRh
@@ -2061,7 +2061,7 @@
         <w:fldChar w:fldCharType="begin"/>
       </w:r>
       <w:r>
-        <w:instrText xml:space="preserve"> ADDIN EN.CITE &lt;EndNote&gt;&lt;Cite&gt;&lt;Author&gt;Ofenloch&lt;/Author&gt;&lt;Year&gt;2022&lt;/Year&gt;&lt;RecNum&gt;62&lt;/RecNum&gt;&lt;DisplayText&gt;(Ofenloch et al. 2022; OFFIS 2025)&lt;/DisplayText&gt;&lt;record&gt;&lt;rec-number&gt;62&lt;/rec-number&gt;&lt;foreign-keys&gt;&lt;key app="EN" db-id="mdae8500109496fea4aff9c086e16cc25895" timestamp="1793226621"&gt;62&lt;/key&gt;&lt;/foreign-keys&gt;&lt;ref-type name="Conference Paper"&gt;47&lt;/ref-type&gt;&lt;contributors&gt;&lt;authors&gt;&lt;author&gt;Ofenloch, Annika&lt;/author&gt;&lt;author&gt;Schwarz, Jan Sören&lt;/author&gt;&lt;author&gt;Tolk, Deborah&lt;/author&gt;&lt;author&gt;Brandt, Tobias&lt;/author&gt;&lt;author&gt;Eilers, Reef&lt;/author&gt;&lt;author&gt;Ramirez, Rebeca&lt;/author&gt;&lt;author&gt;Raub, Thomas&lt;/author&gt;&lt;author&gt;Lehnhoff, Sebastian&lt;/author&gt;&lt;/authors&gt;&lt;/contributors&gt;&lt;titles&gt;&lt;title&gt;MOSAIK 3.0: Combining Time-Stepped and Discrete Event Simulation&lt;/title&gt;&lt;secondary-title&gt;2022 Open Source Modelling and Simulation of Energy Systems (OSMSES)&lt;/secondary-title&gt;&lt;/titles&gt;&lt;pages&gt;1-5&lt;/pages&gt;&lt;dates&gt;&lt;year&gt;2022&lt;/year&gt;&lt;/dates&gt;&lt;pub-location&gt;Aachen, Germany&lt;/pub-location&gt;&lt;publisher&gt;IEEE&lt;/publisher&gt;&lt;label&gt;ofenloch2022&lt;/label&gt;&lt;urls&gt;&lt;/urls&gt;&lt;electronic-resource-num&gt;10.1109/OSMSES54027.2022.9769116&lt;/electronic-resource-num&gt;&lt;/record&gt;&lt;/Cite&gt;&lt;Cite&gt;&lt;Author&gt;OFFIS&lt;/Author&gt;&lt;Year&gt;2025&lt;/Year&gt;&lt;RecNum&gt;56&lt;/RecNum&gt;&lt;record&gt;&lt;rec-number&gt;56&lt;/rec-number&gt;&lt;foreign-keys&gt;&lt;key app="EN" db-id="mdae8500109496fea4aff9c086e16cc25895" timestamp="1793226621"&gt;56&lt;/key&gt;&lt;/foreign-keys&gt;&lt;ref-type name="Web Page"&gt;12&lt;/ref-type&gt;&lt;contributors&gt;&lt;authors&gt;&lt;author&gt;OFFIS&lt;/author&gt;&lt;/authors&gt;&lt;/contributors&gt;&lt;titles&gt;&lt;title&gt;mosaik documentation&lt;/title&gt;&lt;/titles&gt;&lt;dates&gt;&lt;year&gt;2025&lt;/year&gt;&lt;/dates&gt;&lt;label&gt;mosaik_docs&lt;/label&gt;&lt;urls&gt;&lt;related-urls&gt;&lt;url&gt;https://mosaik.readthedocs.io/en/3.5.0/&lt;/url&gt;&lt;/related-urls&gt;&lt;/urls&gt;&lt;access-date&gt;2026-10-28&lt;/access-date&gt;&lt;/record&gt;&lt;/Cite&gt;&lt;/EndNote&gt;</w:instrText>
+        <w:instrText xml:space="preserve"> ADDIN EN.CITE &lt;EndNote&gt;&lt;Cite&gt;&lt;Author&gt;Ofenloch&lt;/Author&gt;&lt;Year&gt;2022&lt;/Year&gt;&lt;RecNum&gt;62&lt;/RecNum&gt;&lt;DisplayText&gt;(Ofenloch et al. 2022; OFFIS 2025)&lt;/DisplayText&gt;&lt;record&gt;&lt;rec-number&gt;62&lt;/rec-number&gt;&lt;foreign-keys&gt;&lt;key app="EN" db-id="mdae8500109496fea4aff9c086e16cc25895" timestamp="1793229176"&gt;62&lt;/key&gt;&lt;/foreign-keys&gt;&lt;ref-type name="Conference Paper"&gt;47&lt;/ref-type&gt;&lt;contributors&gt;&lt;authors&gt;&lt;author&gt;Ofenloch, Annika&lt;/author&gt;&lt;author&gt;Schwarz, Jan Sören&lt;/author&gt;&lt;author&gt;Tolk, Deborah&lt;/author&gt;&lt;author&gt;Brandt, Tobias&lt;/author&gt;&lt;author&gt;Eilers, Reef&lt;/author&gt;&lt;author&gt;Ramirez, Rebeca&lt;/author&gt;&lt;author&gt;Raub, Thomas&lt;/author&gt;&lt;author&gt;Lehnhoff, Sebastian&lt;/author&gt;&lt;/authors&gt;&lt;/contributors&gt;&lt;titles&gt;&lt;title&gt;MOSAIK 3.0: Combining Time-Stepped and Discrete Event Simulation&lt;/title&gt;&lt;secondary-title&gt;2022 Open Source Modelling and Simulation of Energy Systems (OSMSES)&lt;/secondary-title&gt;&lt;/titles&gt;&lt;pages&gt;1-5&lt;/pages&gt;&lt;dates&gt;&lt;year&gt;2022&lt;/year&gt;&lt;/dates&gt;&lt;pub-location&gt;Aachen, Germany&lt;/pub-location&gt;&lt;publisher&gt;IEEE&lt;/publisher&gt;&lt;label&gt;ofenloch2022&lt;/label&gt;&lt;urls&gt;&lt;/urls&gt;&lt;electronic-resource-num&gt;10.1109/OSMSES54027.2022.9769116&lt;/electronic-resource-num&gt;&lt;/record&gt;&lt;/Cite&gt;&lt;Cite&gt;&lt;Author&gt;OFFIS&lt;/Author&gt;&lt;Year&gt;2025&lt;/Year&gt;&lt;RecNum&gt;56&lt;/RecNum&gt;&lt;record&gt;&lt;rec-number&gt;56&lt;/rec-number&gt;&lt;foreign-keys&gt;&lt;key app="EN" db-id="mdae8500109496fea4aff9c086e16cc25895" timestamp="1793229176"&gt;56&lt;/key&gt;&lt;/foreign-keys&gt;&lt;ref-type name="Web Page"&gt;12&lt;/ref-type&gt;&lt;contributors&gt;&lt;authors&gt;&lt;author&gt;OFFIS&lt;/author&gt;&lt;/authors&gt;&lt;/contributors&gt;&lt;titles&gt;&lt;title&gt;mosaik documentation&lt;/title&gt;&lt;/titles&gt;&lt;dates&gt;&lt;year&gt;2025&lt;/year&gt;&lt;/dates&gt;&lt;label&gt;mosaik_docs&lt;/label&gt;&lt;urls&gt;&lt;related-urls&gt;&lt;url&gt;https://mosaik.readthedocs.io/en/3.5.0/&lt;/url&gt;&lt;/related-urls&gt;&lt;/urls&gt;&lt;access-date&gt;2026-10-28&lt;/access-date&gt;&lt;/record&gt;&lt;/Cite&gt;&lt;/EndNote&gt;</w:instrText>
       </w:r>
       <w:r>
         <w:fldChar w:fldCharType="separate"/>
@@ -2084,7 +2084,7 @@
 dW0+ODQ8L1JlY051bT48RGlzcGxheVRleHQ+KFdlbiBldCBhbC4gMjAyNDsgUGFkdWFuaSBldCBh
 bC4gMjAyMyk8L0Rpc3BsYXlUZXh0PjxyZWNvcmQ+PHJlYy1udW1iZXI+ODQ8L3JlYy1udW1iZXI+
 PGZvcmVpZ24ta2V5cz48a2V5IGFwcD0iRU4iIGRiLWlkPSJtZGFlODUwMDEwOTQ5NmZlYTRhZmY5
-YzA4NmUxNmNjMjU4OTUiIHRpbWVzdGFtcD0iMTc5MzIyNjYyMSI+ODQ8L2tleT48L2ZvcmVpZ24t
+YzA4NmUxNmNjMjU4OTUiIHRpbWVzdGFtcD0iMTc5MzIyOTE3NiI+ODQ8L2tleT48L2ZvcmVpZ24t
 a2V5cz48cmVmLXR5cGUgbmFtZT0iSm91cm5hbCBBcnRpY2xlIj4xNzwvcmVmLXR5cGU+PGNvbnRy
 aWJ1dG9ycz48YXV0aG9ycz48YXV0aG9yPldlbiwgSmlhbmZlbmc8L2F1dGhvcj48YXV0aG9yPkpp
 YW5nLCBMaW48L2F1dGhvcj48YXV0aG9yPkNoZW4sIFl1eWluZzwvYXV0aG9yPjxhdXRob3I+Q2h1
@@ -2104,7 +2104,7 @@
 dWFuaTwvQXV0aG9yPjxZZWFyPjIwMjM8L1llYXI+PFJlY051bT42NzwvUmVjTnVtPjxyZWNvcmQ+
 PHJlYy1udW1iZXI+Njc8L3JlYy1udW1iZXI+PGZvcmVpZ24ta2V5cz48a2V5IGFwcD0iRU4iIGRi
 LWlkPSJtZGFlODUwMDEwOTQ5NmZlYTRhZmY5YzA4NmUxNmNjMjU4OTUiIHRpbWVzdGFtcD0iMTc5
-MzIyNjYyMSI+Njc8L2tleT48L2ZvcmVpZ24ta2V5cz48cmVmLXR5cGUgbmFtZT0iQ29uZmVyZW5j
+MzIyOTE3NiI+Njc8L2tleT48L2ZvcmVpZ24ta2V5cz48cmVmLXR5cGUgbmFtZT0iQ29uZmVyZW5j
 ZSBQYXBlciI+NDc8L3JlZi10eXBlPjxjb250cmlidXRvcnM+PGF1dGhvcnM+PGF1dGhvcj5QYWR1
 YW5pLCBWaWN0b3I8L2F1dGhvcj48YXV0aG9yPkthZGF2aWwsIFJhaHVsPC9hdXRob3I+PGF1dGhv
 cj5Ib29zaHlhciwgSG9zc2VpbjwvYXV0aG9yPjxhdXRob3I+SGFkZGFkaSwgQWJvdXRhbGViPC9h
@@ -2130,7 +2130,7 @@
 dW0+ODQ8L1JlY051bT48RGlzcGxheVRleHQ+KFdlbiBldCBhbC4gMjAyNDsgUGFkdWFuaSBldCBh
 bC4gMjAyMyk8L0Rpc3BsYXlUZXh0PjxyZWNvcmQ+PHJlYy1udW1iZXI+ODQ8L3JlYy1udW1iZXI+
 PGZvcmVpZ24ta2V5cz48a2V5IGFwcD0iRU4iIGRiLWlkPSJtZGFlODUwMDEwOTQ5NmZlYTRhZmY5
-YzA4NmUxNmNjMjU4OTUiIHRpbWVzdGFtcD0iMTc5MzIyNjYyMSI+ODQ8L2tleT48L2ZvcmVpZ24t
+YzA4NmUxNmNjMjU4OTUiIHRpbWVzdGFtcD0iMTc5MzIyOTE3NiI+ODQ8L2tleT48L2ZvcmVpZ24t
 a2V5cz48cmVmLXR5cGUgbmFtZT0iSm91cm5hbCBBcnRpY2xlIj4xNzwvcmVmLXR5cGU+PGNvbnRy
 aWJ1dG9ycz48YXV0aG9ycz48YXV0aG9yPldlbiwgSmlhbmZlbmc8L2F1dGhvcj48YXV0aG9yPkpp
 YW5nLCBMaW48L2F1dGhvcj48YXV0aG9yPkNoZW4sIFl1eWluZzwvYXV0aG9yPjxhdXRob3I+Q2h1
@@ -2150,7 +2150,7 @@
 dWFuaTwvQXV0aG9yPjxZZWFyPjIwMjM8L1llYXI+PFJlY051bT42NzwvUmVjTnVtPjxyZWNvcmQ+
 PHJlYy1udW1iZXI+Njc8L3JlYy1udW1iZXI+PGZvcmVpZ24ta2V5cz48a2V5IGFwcD0iRU4iIGRi
 LWlkPSJtZGFlODUwMDEwOTQ5NmZlYTRhZmY5YzA4NmUxNmNjMjU4OTUiIHRpbWVzdGFtcD0iMTc5
-MzIyNjYyMSI+Njc8L2tleT48L2ZvcmVpZ24ta2V5cz48cmVmLXR5cGUgbmFtZT0iQ29uZmVyZW5j
+MzIyOTE3NiI+Njc8L2tleT48L2ZvcmVpZ24ta2V5cz48cmVmLXR5cGUgbmFtZT0iQ29uZmVyZW5j
 ZSBQYXBlciI+NDc8L3JlZi10eXBlPjxjb250cmlidXRvcnM+PGF1dGhvcnM+PGF1dGhvcj5QYWR1
 YW5pLCBWaWN0b3I8L2F1dGhvcj48YXV0aG9yPkthZGF2aWwsIFJhaHVsPC9hdXRob3I+PGF1dGhv
 cj5Ib29zaHlhciwgSG9zc2VpbjwvYXV0aG9yPjxhdXRob3I+SGFkZGFkaSwgQWJvdXRhbGViPC9h
@@ -2192,7 +2192,7 @@
         <w:fldChar w:fldCharType="begin"/>
       </w:r>
       <w:r>
-        <w:instrText xml:space="preserve"> ADDIN EN.CITE &lt;EndNote&gt;&lt;Cite&gt;&lt;Author&gt;Katipamula&lt;/Author&gt;&lt;Year&gt;2016&lt;/Year&gt;&lt;RecNum&gt;44&lt;/RecNum&gt;&lt;DisplayText&gt;(Katipamula et al. 2016)&lt;/DisplayText&gt;&lt;record&gt;&lt;rec-number&gt;44&lt;/rec-number&gt;&lt;foreign-keys&gt;&lt;key app="EN" db-id="mdae8500109496fea4aff9c086e16cc25895" timestamp="1793226621"&gt;44&lt;/key&gt;&lt;/foreign-keys&gt;&lt;ref-type name="Journal Article"&gt;17&lt;/ref-type&gt;&lt;contributors&gt;&lt;authors&gt;&lt;author&gt;Katipamula, Srinivas&lt;/author&gt;&lt;author&gt;Haack, Jereme&lt;/author&gt;&lt;author&gt;Hernandez, George&lt;/author&gt;&lt;author&gt;Akyol, Bora&lt;/author&gt;&lt;author&gt;Hagerman, Joseph&lt;/author&gt;&lt;/authors&gt;&lt;/contributors&gt;&lt;titles&gt;&lt;title&gt;VOLTTRON: An Open-Source Software Platform of the Future&lt;/title&gt;&lt;secondary-title&gt;IEEE Electrification Magazine&lt;/secondary-title&gt;&lt;alt-title&gt;IEEE Electrif. Mag.&lt;/alt-title&gt;&lt;/titles&gt;&lt;periodical&gt;&lt;full-title&gt;IEEE Electrification Magazine&lt;/full-title&gt;&lt;abbr-1&gt;IEEE Electrif. Mag.&lt;/abbr-1&gt;&lt;/periodical&gt;&lt;pages&gt;15-22&lt;/pages&gt;&lt;volume&gt;4&lt;/volume&gt;&lt;number&gt;4&lt;/number&gt;&lt;dates&gt;&lt;year&gt;2016&lt;/year&gt;&lt;/dates&gt;&lt;publisher&gt;IEEE&lt;/publisher&gt;&lt;label&gt;katipamula2016&lt;/label&gt;&lt;urls&gt;&lt;/urls&gt;&lt;electronic-resource-num&gt;10.1109/MELE.2016.2614178&lt;/electronic-resource-num&gt;&lt;/record&gt;&lt;/Cite&gt;&lt;/EndNote&gt;</w:instrText>
+        <w:instrText xml:space="preserve"> ADDIN EN.CITE &lt;EndNote&gt;&lt;Cite&gt;&lt;Author&gt;Katipamula&lt;/Author&gt;&lt;Year&gt;2016&lt;/Year&gt;&lt;RecNum&gt;44&lt;/RecNum&gt;&lt;DisplayText&gt;(Katipamula et al. 2016)&lt;/DisplayText&gt;&lt;record&gt;&lt;rec-number&gt;44&lt;/rec-number&gt;&lt;foreign-keys&gt;&lt;key app="EN" db-id="mdae8500109496fea4aff9c086e16cc25895" timestamp="1793229176"&gt;44&lt;/key&gt;&lt;/foreign-keys&gt;&lt;ref-type name="Journal Article"&gt;17&lt;/ref-type&gt;&lt;contributors&gt;&lt;authors&gt;&lt;author&gt;Katipamula, Srinivas&lt;/author&gt;&lt;author&gt;Haack, Jereme&lt;/author&gt;&lt;author&gt;Hernandez, George&lt;/author&gt;&lt;author&gt;Akyol, Bora&lt;/author&gt;&lt;author&gt;Hagerman, Joseph&lt;/author&gt;&lt;/authors&gt;&lt;/contributors&gt;&lt;titles&gt;&lt;title&gt;VOLTTRON: An Open-Source Software Platform of the Future&lt;/title&gt;&lt;secondary-title&gt;IEEE Electrification Magazine&lt;/secondary-title&gt;&lt;alt-title&gt;IEEE Electrif. Mag.&lt;/alt-title&gt;&lt;/titles&gt;&lt;periodical&gt;&lt;full-title&gt;IEEE Electrification Magazine&lt;/full-title&gt;&lt;abbr-1&gt;IEEE Electrif. Mag.&lt;/abbr-1&gt;&lt;/periodical&gt;&lt;pages&gt;15-22&lt;/pages&gt;&lt;volume&gt;4&lt;/volume&gt;&lt;number&gt;4&lt;/number&gt;&lt;dates&gt;&lt;year&gt;2016&lt;/year&gt;&lt;/dates&gt;&lt;publisher&gt;IEEE&lt;/publisher&gt;&lt;label&gt;katipamula2016&lt;/label&gt;&lt;urls&gt;&lt;/urls&gt;&lt;electronic-resource-num&gt;10.1109/MELE.2016.2614178&lt;/electronic-resource-num&gt;&lt;/record&gt;&lt;/Cite&gt;&lt;/EndNote&gt;</w:instrText>
       </w:r>
       <w:r>
         <w:fldChar w:fldCharType="separate"/>
@@ -2213,7 +2213,7 @@
         <w:fldChar w:fldCharType="begin"/>
       </w:r>
       <w:r>
-        <w:instrText xml:space="preserve"> ADDIN EN.CITE &lt;EndNote&gt;&lt;Cite&gt;&lt;Author&gt;HELICS developers&lt;/Author&gt;&lt;Year&gt;2026&lt;/Year&gt;&lt;RecNum&gt;31&lt;/RecNum&gt;&lt;DisplayText&gt;(HELICS developers 2026; OFFIS 2025)&lt;/DisplayText&gt;&lt;record&gt;&lt;rec-number&gt;31&lt;/rec-number&gt;&lt;foreign-keys&gt;&lt;key app="EN" db-id="mdae8500109496fea4aff9c086e16cc25895" timestamp="1793226621"&gt;31&lt;/key&gt;&lt;/foreign-keys&gt;&lt;ref-type name="Web Page"&gt;12&lt;/ref-type&gt;&lt;contributors&gt;&lt;authors&gt;&lt;author&gt;HELICS developers&lt;/author&gt;&lt;/authors&gt;&lt;/contributors&gt;&lt;titles&gt;&lt;title&gt;HELICS documentation&lt;/title&gt;&lt;/titles&gt;&lt;dates&gt;&lt;year&gt;2026&lt;/year&gt;&lt;/dates&gt;&lt;label&gt;helics_docs&lt;/label&gt;&lt;urls&gt;&lt;related-urls&gt;&lt;url&gt;https://docs.helics.org/en/latest/&lt;/url&gt;&lt;/related-urls&gt;&lt;/urls&gt;&lt;access-date&gt;2026-10-28&lt;/access-date&gt;&lt;/record&gt;&lt;/Cite&gt;&lt;Cite&gt;&lt;Author&gt;OFFIS&lt;/Author&gt;&lt;Year&gt;2025&lt;/Year&gt;&lt;RecNum&gt;56&lt;/RecNum&gt;&lt;record&gt;&lt;rec-number&gt;56&lt;/rec-number&gt;&lt;foreign-keys&gt;&lt;key app="EN" db-id="mdae8500109496fea4aff9c086e16cc25895" timestamp="1793226621"&gt;56&lt;/key&gt;&lt;/foreign-keys&gt;&lt;ref-type name="Web Page"&gt;12&lt;/ref-type&gt;&lt;contributors&gt;&lt;authors&gt;&lt;author&gt;OFFIS&lt;/author&gt;&lt;/authors&gt;&lt;/contributors&gt;&lt;titles&gt;&lt;title&gt;mosaik documentation&lt;/title&gt;&lt;/titles&gt;&lt;dates&gt;&lt;year&gt;2025&lt;/year&gt;&lt;/dates&gt;&lt;label&gt;mosaik_docs&lt;/label&gt;&lt;urls&gt;&lt;related-urls&gt;&lt;url&gt;https://mosaik.readthedocs.io/en/3.5.0/&lt;/url&gt;&lt;/related-urls&gt;&lt;/urls&gt;&lt;access-date&gt;2026-10-28&lt;/access-date&gt;&lt;/record&gt;&lt;/Cite&gt;&lt;/EndNote&gt;</w:instrText>
+        <w:instrText xml:space="preserve"> ADDIN EN.CITE &lt;EndNote&gt;&lt;Cite&gt;&lt;Author&gt;HELICS developers&lt;/Author&gt;&lt;Year&gt;2026&lt;/Year&gt;&lt;RecNum&gt;31&lt;/RecNum&gt;&lt;DisplayText&gt;(HELICS developers 2026; OFFIS 2025)&lt;/DisplayText&gt;&lt;record&gt;&lt;rec-number&gt;31&lt;/rec-number&gt;&lt;foreign-keys&gt;&lt;key app="EN" db-id="mdae8500109496fea4aff9c086e16cc25895" timestamp="1793229176"&gt;31&lt;/key&gt;&lt;/foreign-keys&gt;&lt;ref-type name="Web Page"&gt;12&lt;/ref-type&gt;&lt;contributors&gt;&lt;authors&gt;&lt;author&gt;HELICS developers&lt;/author&gt;&lt;/authors&gt;&lt;/contributors&gt;&lt;titles&gt;&lt;title&gt;HELICS documentation&lt;/title&gt;&lt;/titles&gt;&lt;dates&gt;&lt;year&gt;2026&lt;/year&gt;&lt;/dates&gt;&lt;label&gt;helics_docs&lt;/label&gt;&lt;urls&gt;&lt;related-urls&gt;&lt;url&gt;https://docs.helics.org/en/latest/&lt;/url&gt;&lt;/related-urls&gt;&lt;/urls&gt;&lt;access-date&gt;2026-10-28&lt;/access-date&gt;&lt;/record&gt;&lt;/Cite&gt;&lt;Cite&gt;&lt;Author&gt;OFFIS&lt;/Author&gt;&lt;Year&gt;2025&lt;/Year&gt;&lt;RecNum&gt;56&lt;/RecNum&gt;&lt;record&gt;&lt;rec-number&gt;56&lt;/rec-number&gt;&lt;foreign-keys&gt;&lt;key app="EN" db-id="mdae8500109496fea4aff9c086e16cc25895" timestamp="1793229176"&gt;56&lt;/key&gt;&lt;/foreign-keys&gt;&lt;ref-type name="Web Page"&gt;12&lt;/ref-type&gt;&lt;contributors&gt;&lt;authors&gt;&lt;author&gt;OFFIS&lt;/author&gt;&lt;/authors&gt;&lt;/contributors&gt;&lt;titles&gt;&lt;title&gt;mosaik documentation&lt;/title&gt;&lt;/titles&gt;&lt;dates&gt;&lt;year&gt;2025&lt;/year&gt;&lt;/dates&gt;&lt;label&gt;mosaik_docs&lt;/label&gt;&lt;urls&gt;&lt;related-urls&gt;&lt;url&gt;https://mosaik.readthedocs.io/en/3.5.0/&lt;/url&gt;&lt;/related-urls&gt;&lt;/urls&gt;&lt;access-date&gt;2026-10-28&lt;/access-date&gt;&lt;/record&gt;&lt;/Cite&gt;&lt;/EndNote&gt;</w:instrText>
       </w:r>
       <w:r>
         <w:fldChar w:fldCharType="separate"/>
@@ -2252,7 +2252,7 @@
 ZWNOdW0+ODU8L1JlY051bT48RGlzcGxheVRleHQ+KFdldHRlciAyMDExOyBVLlMuIERlcGFydG1l
 bnQgb2YgRW5lcmd5IDIwMTgpPC9EaXNwbGF5VGV4dD48cmVjb3JkPjxyZWMtbnVtYmVyPjg1PC9y
 ZWMtbnVtYmVyPjxmb3JlaWduLWtleXM+PGtleSBhcHA9IkVOIiBkYi1pZD0ibWRhZTg1MDAxMDk0
-OTZmZWE0YWZmOWMwODZlMTZjYzI1ODk1IiB0aW1lc3RhbXA9IjE3OTMyMjY2MjEiPjg1PC9rZXk+
+OTZmZWE0YWZmOWMwODZlMTZjYzI1ODk1IiB0aW1lc3RhbXA9IjE3OTMyMjkxNzYiPjg1PC9rZXk+
 PC9mb3JlaWduLWtleXM+PHJlZi10eXBlIG5hbWU9IkpvdXJuYWwgQXJ0aWNsZSI+MTc8L3JlZi10
 eXBlPjxjb250cmlidXRvcnM+PGF1dGhvcnM+PGF1dGhvcj5XZXR0ZXIsIE1pY2hhZWw8L2F1dGhv
 cj48L2F1dGhvcnM+PC9jb250cmlidXRvcnM+PHRpdGxlcz48dGl0bGU+Q28tc2ltdWxhdGlvbiBv
@@ -2270,7 +2270,7 @@
 ZT48QXV0aG9yPlUuUy4gRGVwYXJ0bWVudCBvZiBFbmVyZ3k8L0F1dGhvcj48WWVhcj4yMDE4PC9Z
 ZWFyPjxSZWNOdW0+MTg8L1JlY051bT48cmVjb3JkPjxyZWMtbnVtYmVyPjE4PC9yZWMtbnVtYmVy
 Pjxmb3JlaWduLWtleXM+PGtleSBhcHA9IkVOIiBkYi1pZD0ibWRhZTg1MDAxMDk0OTZmZWE0YWZm
-OWMwODZlMTZjYzI1ODk1IiB0aW1lc3RhbXA9IjE3OTMyMjY2MjEiPjE4PC9rZXk+PC9mb3JlaWdu
+OWMwODZlMTZjYzI1ODk1IiB0aW1lc3RhbXA9IjE3OTMyMjkxNzYiPjE4PC9rZXk+PC9mb3JlaWdu
 LWtleXM+PHJlZi10eXBlIG5hbWU9IldlYiBQYWdlIj4xMjwvcmVmLXR5cGU+PGNvbnRyaWJ1dG9y
 cz48YXV0aG9ycz48YXV0aG9yPlUuUy4gRGVwYXJ0bWVudCBvZiBFbmVyZ3k8L2F1dGhvcj48L2F1
 dGhvcnM+PC9jb250cmlidXRvcnM+PHRpdGxlcz48dGl0bGU+RW5lcmd5UGx1cyBFeHRlcm5hbCBJ
@@ -2291,7 +2291,7 @@
 ZWNOdW0+ODU8L1JlY051bT48RGlzcGxheVRleHQ+KFdldHRlciAyMDExOyBVLlMuIERlcGFydG1l
 bnQgb2YgRW5lcmd5IDIwMTgpPC9EaXNwbGF5VGV4dD48cmVjb3JkPjxyZWMtbnVtYmVyPjg1PC9y
 ZWMtbnVtYmVyPjxmb3JlaWduLWtleXM+PGtleSBhcHA9IkVOIiBkYi1pZD0ibWRhZTg1MDAxMDk0
-OTZmZWE0YWZmOWMwODZlMTZjYzI1ODk1IiB0aW1lc3RhbXA9IjE3OTMyMjY2MjEiPjg1PC9rZXk+
+OTZmZWE0YWZmOWMwODZlMTZjYzI1ODk1IiB0aW1lc3RhbXA9IjE3OTMyMjkxNzYiPjg1PC9rZXk+
 PC9mb3JlaWduLWtleXM+PHJlZi10eXBlIG5hbWU9IkpvdXJuYWwgQXJ0aWNsZSI+MTc8L3JlZi10
 eXBlPjxjb250cmlidXRvcnM+PGF1dGhvcnM+PGF1dGhvcj5XZXR0ZXIsIE1pY2hhZWw8L2F1dGhv
 cj48L2F1dGhvcnM+PC9jb250cmlidXRvcnM+PHRpdGxlcz48dGl0bGU+Q28tc2ltdWxhdGlvbiBv
@@ -2309,7 +2309,7 @@
 ZT48QXV0aG9yPlUuUy4gRGVwYXJ0bWVudCBvZiBFbmVyZ3k8L0F1dGhvcj48WWVhcj4yMDE4PC9Z
 ZWFyPjxSZWNOdW0+MTg8L1JlY051bT48cmVjb3JkPjxyZWMtbnVtYmVyPjE4PC9yZWMtbnVtYmVy
 Pjxmb3JlaWduLWtleXM+PGtleSBhcHA9IkVOIiBkYi1pZD0ibWRhZTg1MDAxMDk0OTZmZWE0YWZm
-OWMwODZlMTZjYzI1ODk1IiB0aW1lc3RhbXA9IjE3OTMyMjY2MjEiPjE4PC9rZXk+PC9mb3JlaWdu
+OWMwODZlMTZjYzI1ODk1IiB0aW1lc3RhbXA9IjE3OTMyMjkxNzYiPjE4PC9rZXk+PC9mb3JlaWdu
 LWtleXM+PHJlZi10eXBlIG5hbWU9IldlYiBQYWdlIj4xMjwvcmVmLXR5cGU+PGNvbnRyaWJ1dG9y
 cz48YXV0aG9ycz48YXV0aG9yPlUuUy4gRGVwYXJ0bWVudCBvZiBFbmVyZ3k8L2F1dGhvcj48L2F1
 dGhvcnM+PC9jb250cmlidXRvcnM+PHRpdGxlcz48dGl0bGU+RW5lcmd5UGx1cyBFeHRlcm5hbCBJ
@@ -2349,7 +2349,7 @@
 ZW5jZSBCZXJrZWxleSBOYXRpb25hbCBMYWJvcmF0b3J5IDIwMjEpPC9EaXNwbGF5VGV4dD48cmVj
 b3JkPjxyZWMtbnVtYmVyPjU5PC9yZWMtbnVtYmVyPjxmb3JlaWduLWtleXM+PGtleSBhcHA9IkVO
 IiBkYi1pZD0ibWRhZTg1MDAxMDk0OTZmZWE0YWZmOWMwODZlMTZjYzI1ODk1IiB0aW1lc3RhbXA9
-IjE3OTMyMjY2MjEiPjU5PC9rZXk+PC9mb3JlaWduLWtleXM+PHJlZi10eXBlIG5hbWU9IkpvdXJu
+IjE3OTMyMjkxNzYiPjU5PC9rZXk+PC9mb3JlaWduLWtleXM+PHJlZi10eXBlIG5hbWU9IkpvdXJu
 YWwgQXJ0aWNsZSI+MTc8L3JlZi10eXBlPjxjb250cmlidXRvcnM+PGF1dGhvcnM+PGF1dGhvcj5O
 b3VpZHVpLCBUaGllcnJ5PC9hdXRob3I+PGF1dGhvcj5XZXR0ZXIsIE1pY2hhZWw8L2F1dGhvcj48
 YXV0aG9yPlp1bywgV2FuZ2RhPC9hdXRob3I+PC9hdXRob3JzPjwvY29udHJpYnV0b3JzPjx0aXRs
@@ -2367,7 +2367,7 @@
 cj5MYXdyZW5jZSBCZXJrZWxleSBOYXRpb25hbCBMYWJvcmF0b3J5PC9BdXRob3I+PFllYXI+MjAy
 MTwvWWVhcj48UmVjTnVtPjQ4PC9SZWNOdW0+PHJlY29yZD48cmVjLW51bWJlcj40ODwvcmVjLW51
 bWJlcj48Zm9yZWlnbi1rZXlzPjxrZXkgYXBwPSJFTiIgZGItaWQ9Im1kYWU4NTAwMTA5NDk2ZmVh
-NGFmZjljMDg2ZTE2Y2MyNTg5NSIgdGltZXN0YW1wPSIxNzkzMjI2NjIxIj40ODwva2V5PjwvZm9y
+NGFmZjljMDg2ZTE2Y2MyNTg5NSIgdGltZXN0YW1wPSIxNzkzMjI5MTc2Ij40ODwva2V5PjwvZm9y
 ZWlnbi1rZXlzPjxyZWYtdHlwZSBuYW1lPSJXZWIgUGFnZSI+MTI8L3JlZi10eXBlPjxjb250cmli
 dXRvcnM+PGF1dGhvcnM+PGF1dGhvcj5MYXdyZW5jZSBCZXJrZWxleSBOYXRpb25hbCBMYWJvcmF0
 b3J5PC9hdXRob3I+PC9hdXRob3JzPjwvY29udHJpYnV0b3JzPjx0aXRsZXM+PHRpdGxlPkZNVSBF
@@ -2390,7 +2390,7 @@
 ZW5jZSBCZXJrZWxleSBOYXRpb25hbCBMYWJvcmF0b3J5IDIwMjEpPC9EaXNwbGF5VGV4dD48cmVj
 b3JkPjxyZWMtbnVtYmVyPjU5PC9yZWMtbnVtYmVyPjxmb3JlaWduLWtleXM+PGtleSBhcHA9IkVO
 IiBkYi1pZD0ibWRhZTg1MDAxMDk0OTZmZWE0YWZmOWMwODZlMTZjYzI1ODk1IiB0aW1lc3RhbXA9
-IjE3OTMyMjY2MjEiPjU5PC9rZXk+PC9mb3JlaWduLWtleXM+PHJlZi10eXBlIG5hbWU9IkpvdXJu
+IjE3OTMyMjkxNzYiPjU5PC9rZXk+PC9mb3JlaWduLWtleXM+PHJlZi10eXBlIG5hbWU9IkpvdXJu
 YWwgQXJ0aWNsZSI+MTc8L3JlZi10eXBlPjxjb250cmlidXRvcnM+PGF1dGhvcnM+PGF1dGhvcj5O
 b3VpZHVpLCBUaGllcnJ5PC9hdXRob3I+PGF1dGhvcj5XZXR0ZXIsIE1pY2hhZWw8L2F1dGhvcj48
 YXV0aG9yPlp1bywgV2FuZ2RhPC9hdXRob3I+PC9hdXRob3JzPjwvY29udHJpYnV0b3JzPjx0aXRs
@@ -2408,7 +2408,7 @@
 cj5MYXdyZW5jZSBCZXJrZWxleSBOYXRpb25hbCBMYWJvcmF0b3J5PC9BdXRob3I+PFllYXI+MjAy
 MTwvWWVhcj48UmVjTnVtPjQ4PC9SZWNOdW0+PHJlY29yZD48cmVjLW51bWJlcj40ODwvcmVjLW51
 bWJlcj48Zm9yZWlnbi1rZXlzPjxrZXkgYXBwPSJFTiIgZGItaWQ9Im1kYWU4NTAwMTA5NDk2ZmVh
-NGFmZjljMDg2ZTE2Y2MyNTg5NSIgdGltZXN0YW1wPSIxNzkzMjI2NjIxIj40ODwva2V5PjwvZm9y
+NGFmZjljMDg2ZTE2Y2MyNTg5NSIgdGltZXN0YW1wPSIxNzkzMjI5MTc2Ij40ODwva2V5PjwvZm9y
 ZWlnbi1rZXlzPjxyZWYtdHlwZSBuYW1lPSJXZWIgUGFnZSI+MTI8L3JlZi10eXBlPjxjb250cmli
 dXRvcnM+PGF1dGhvcnM+PGF1dGhvcj5MYXdyZW5jZSBCZXJrZWxleSBOYXRpb25hbCBMYWJvcmF0
 b3J5PC9hdXRob3I+PC9hdXRob3JzPjwvY29udHJpYnV0b3JzPjx0aXRsZXM+PHRpdGxlPkZNVSBF
@@ -2446,7 +2446,7 @@
         <w:fldChar w:fldCharType="begin"/>
       </w:r>
       <w:r>
-        <w:instrText xml:space="preserve"> ADDIN EN.CITE &lt;EndNote&gt;&lt;Cite&gt;&lt;Author&gt;Wetter&lt;/Author&gt;&lt;Year&gt;2020&lt;/Year&gt;&lt;RecNum&gt;86&lt;/RecNum&gt;&lt;DisplayText&gt;(Wetter et al. 2020)&lt;/DisplayText&gt;&lt;record&gt;&lt;rec-number&gt;86&lt;/rec-number&gt;&lt;foreign-keys&gt;&lt;key app="EN" db-id="mdae8500109496fea4aff9c086e16cc25895" timestamp="1793226621"&gt;86&lt;/key&gt;&lt;/foreign-keys&gt;&lt;ref-type name="Conference Paper"&gt;47&lt;/ref-type&gt;&lt;contributors&gt;&lt;authors&gt;&lt;author&gt;Wetter, Michael&lt;/author&gt;&lt;author&gt;Benne, Kyle&lt;/author&gt;&lt;author&gt;Gautier, Antoine&lt;/author&gt;&lt;author&gt;Nouidui, Thierry S.&lt;/author&gt;&lt;author&gt;Ramle, Agnes&lt;/author&gt;&lt;author&gt;Roth, Amir&lt;/author&gt;&lt;author&gt;Tummescheit, Hubertus&lt;/author&gt;&lt;author&gt;Mentzer, Stuart&lt;/author&gt;&lt;author&gt;Winther, Christian&lt;/author&gt;&lt;/authors&gt;&lt;/contributors&gt;&lt;titles&gt;&lt;title&gt;Lifting the Garage Door on Spawn, an Open-Source BEM-Controls Engine&lt;/title&gt;&lt;secondary-title&gt;Proceedings of SimBuild Conference 2020, ASHRAE/IBPSA-USA Building Simulation Conference&lt;/secondary-title&gt;&lt;/titles&gt;&lt;volume&gt;9&lt;/volume&gt;&lt;dates&gt;&lt;year&gt;2020&lt;/year&gt;&lt;/dates&gt;&lt;publisher&gt;IBPSA-USA&lt;/publisher&gt;&lt;label&gt;wetter2020&lt;/label&gt;&lt;urls&gt;&lt;/urls&gt;&lt;electronic-resource-num&gt;10.26868/25746308.2020.C063&lt;/electronic-resource-num&gt;&lt;/record&gt;&lt;/Cite&gt;&lt;/EndNote&gt;</w:instrText>
+        <w:instrText xml:space="preserve"> ADDIN EN.CITE &lt;EndNote&gt;&lt;Cite&gt;&lt;Author&gt;Wetter&lt;/Author&gt;&lt;Year&gt;2020&lt;/Year&gt;&lt;RecNum&gt;86&lt;/RecNum&gt;&lt;DisplayText&gt;(Wetter et al. 2020)&lt;/DisplayText&gt;&lt;record&gt;&lt;rec-number&gt;86&lt;/rec-number&gt;&lt;foreign-keys&gt;&lt;key app="EN" db-id="mdae8500109496fea4aff9c086e16cc25895" timestamp="1793229176"&gt;86&lt;/key&gt;&lt;/foreign-keys&gt;&lt;ref-type name="Conference Paper"&gt;47&lt;/ref-type&gt;&lt;contributors&gt;&lt;authors&gt;&lt;author&gt;Wetter, Michael&lt;/author&gt;&lt;author&gt;Benne, Kyle&lt;/author&gt;&lt;author&gt;Gautier, Antoine&lt;/author&gt;&lt;author&gt;Nouidui, Thierry S.&lt;/author&gt;&lt;author&gt;Ramle, Agnes&lt;/author&gt;&lt;author&gt;Roth, Amir&lt;/author&gt;&lt;author&gt;Tummescheit, Hubertus&lt;/author&gt;&lt;author&gt;Mentzer, Stuart&lt;/author&gt;&lt;author&gt;Winther, Christian&lt;/author&gt;&lt;/authors&gt;&lt;/contributors&gt;&lt;titles&gt;&lt;title&gt;Lifting the Garage Door on Spawn, an Open-Source BEM-Controls Engine&lt;/title&gt;&lt;secondary-title&gt;Proceedings of SimBuild Conference 2020, ASHRAE/IBPSA-USA Building Simulation Conference&lt;/secondary-title&gt;&lt;/titles&gt;&lt;volume&gt;9&lt;/volume&gt;&lt;dates&gt;&lt;year&gt;2020&lt;/year&gt;&lt;/dates&gt;&lt;publisher&gt;IBPSA-USA&lt;/publisher&gt;&lt;label&gt;wetter2020&lt;/label&gt;&lt;urls&gt;&lt;/urls&gt;&lt;electronic-resource-num&gt;10.26868/25746308.2020.C063&lt;/electronic-resource-num&gt;&lt;/record&gt;&lt;/Cite&gt;&lt;/EndNote&gt;</w:instrText>
       </w:r>
       <w:r>
         <w:fldChar w:fldCharType="separate"/>
@@ -2467,7 +2467,7 @@
         <w:fldChar w:fldCharType="begin"/>
       </w:r>
       <w:r>
-        <w:instrText xml:space="preserve"> ADDIN EN.CITE &lt;EndNote&gt;&lt;Cite&gt;&lt;Author&gt;U.S. Department of Energy&lt;/Author&gt;&lt;Year&gt;2022&lt;/Year&gt;&lt;RecNum&gt;19&lt;/RecNum&gt;&lt;DisplayText&gt;(U.S. Department of Energy 2022)&lt;/DisplayText&gt;&lt;record&gt;&lt;rec-number&gt;19&lt;/rec-number&gt;&lt;foreign-keys&gt;&lt;key app="EN" db-id="mdae8500109496fea4aff9c086e16cc25895" timestamp="1793226621"&gt;19&lt;/key&gt;&lt;/foreign-keys&gt;&lt;ref-type name="Web Page"&gt;12&lt;/ref-type&gt;&lt;contributors&gt;&lt;authors&gt;&lt;author&gt;U.S. Department of Energy&lt;/author&gt;&lt;/authors&gt;&lt;/contributors&gt;&lt;titles&gt;&lt;title&gt;EnergyPlus Input Output Reference: Group – Python Plugins / Python EMS&lt;/title&gt;&lt;/titles&gt;&lt;dates&gt;&lt;year&gt;2022&lt;/year&gt;&lt;/dates&gt;&lt;label&gt;doe2022&lt;/label&gt;&lt;urls&gt;&lt;related-urls&gt;&lt;url&gt;https://bigladdersoftware.com/epx/docs/22-2/input-output-reference/group-python-plugins.html&lt;/url&gt;&lt;/related-urls&gt;&lt;/urls&gt;&lt;access-date&gt;2026-10-28&lt;/access-date&gt;&lt;/record&gt;&lt;/Cite&gt;&lt;/EndNote&gt;</w:instrText>
+        <w:instrText xml:space="preserve"> ADDIN EN.CITE &lt;EndNote&gt;&lt;Cite&gt;&lt;Author&gt;U.S. Department of Energy&lt;/Author&gt;&lt;Year&gt;2022&lt;/Year&gt;&lt;RecNum&gt;19&lt;/RecNum&gt;&lt;DisplayText&gt;(U.S. Department of Energy 2022)&lt;/DisplayText&gt;&lt;record&gt;&lt;rec-number&gt;19&lt;/rec-number&gt;&lt;foreign-keys&gt;&lt;key app="EN" db-id="mdae8500109496fea4aff9c086e16cc25895" timestamp="1793229176"&gt;19&lt;/key&gt;&lt;/foreign-keys&gt;&lt;ref-type name="Web Page"&gt;12&lt;/ref-type&gt;&lt;contributors&gt;&lt;authors&gt;&lt;author&gt;U.S. Department of Energy&lt;/author&gt;&lt;/authors&gt;&lt;/contributors&gt;&lt;titles&gt;&lt;title&gt;EnergyPlus Input Output Reference: Group – Python Plugins / Python EMS&lt;/title&gt;&lt;/titles&gt;&lt;dates&gt;&lt;year&gt;2022&lt;/year&gt;&lt;/dates&gt;&lt;label&gt;doe2022&lt;/label&gt;&lt;urls&gt;&lt;related-urls&gt;&lt;url&gt;https://bigladdersoftware.com/epx/docs/22-2/input-output-reference/group-python-plugins.html&lt;/url&gt;&lt;/related-urls&gt;&lt;/urls&gt;&lt;access-date&gt;2026-10-28&lt;/access-date&gt;&lt;/record&gt;&lt;/Cite&gt;&lt;/EndNote&gt;</w:instrText>
       </w:r>
       <w:r>
         <w:fldChar w:fldCharType="separate"/>
@@ -2491,7 +2491,7 @@
 dCBhbC4gMjAyMTsgQ2FtcG95LU5pZXZlcyBldCBhbC4gMjAyNTsgWmhhbmcgYW5kIEFyZGFrYW5p
 YW4gMjAyMCk8L0Rpc3BsYXlUZXh0PjxyZWNvcmQ+PHJlYy1udW1iZXI+NDE8L3JlYy1udW1iZXI+
 PGZvcmVpZ24ta2V5cz48a2V5IGFwcD0iRU4iIGRiLWlkPSJtZGFlODUwMDEwOTQ5NmZlYTRhZmY5
-YzA4NmUxNmNjMjU4OTUiIHRpbWVzdGFtcD0iMTc5MzIyNjYyMSI+NDE8L2tleT48L2ZvcmVpZ24t
+YzA4NmUxNmNjMjU4OTUiIHRpbWVzdGFtcD0iMTc5MzIyOTE3NiI+NDE8L2tleT48L2ZvcmVpZ24t
 a2V5cz48cmVmLXR5cGUgbmFtZT0iQ29uZmVyZW5jZSBQYXBlciI+NDc8L3JlZi10eXBlPjxjb250
 cmlidXRvcnM+PGF1dGhvcnM+PGF1dGhvcj5KaW3DqW5lei1SYWJvc28sIEphdmllcjwvYXV0aG9y
 PjxhdXRob3I+Q2FtcG95LU5pZXZlcywgQWxlamFuZHJvPC9hdXRob3I+PGF1dGhvcj5NYW5qYXZh
@@ -2510,7 +2510,7 @@
 ZT48QXV0aG9yPkNhbXBveS1OaWV2ZXM8L0F1dGhvcj48WWVhcj4yMDI1PC9ZZWFyPjxSZWNOdW0+
 OTwvUmVjTnVtPjxyZWNvcmQ+PHJlYy1udW1iZXI+OTwvcmVjLW51bWJlcj48Zm9yZWlnbi1rZXlz
 PjxrZXkgYXBwPSJFTiIgZGItaWQ9Im1kYWU4NTAwMTA5NDk2ZmVhNGFmZjljMDg2ZTE2Y2MyNTg5
-NSIgdGltZXN0YW1wPSIxNzkzMjI2NjIxIj45PC9rZXk+PC9mb3JlaWduLWtleXM+PHJlZi10eXBl
+NSIgdGltZXN0YW1wPSIxNzkzMjI5MTc2Ij45PC9rZXk+PC9mb3JlaWduLWtleXM+PHJlZi10eXBl
 IG5hbWU9IkpvdXJuYWwgQXJ0aWNsZSI+MTc8L3JlZi10eXBlPjxjb250cmlidXRvcnM+PGF1dGhv
 cnM+PGF1dGhvcj5DYW1wb3ktTmlldmVzLCBBbGVqYW5kcm88L2F1dGhvcj48YXV0aG9yPk1hbmph
 dmFjYXMsIEFudG9uaW88L2F1dGhvcj48YXV0aG9yPkppbcOpbmV6LVJhYm9zbywgSmF2aWVyPC9h
@@ -2528,7 +2528,7 @@
 LXJlc291cmNlLW51bT48L3JlY29yZD48L0NpdGU+PENpdGU+PEF1dGhvcj5aaGFuZzwvQXV0aG9y
 PjxZZWFyPjIwMjA8L1llYXI+PFJlY051bT45MDwvUmVjTnVtPjxyZWNvcmQ+PHJlYy1udW1iZXI+
 OTA8L3JlYy1udW1iZXI+PGZvcmVpZ24ta2V5cz48a2V5IGFwcD0iRU4iIGRiLWlkPSJtZGFlODUw
-MDEwOTQ5NmZlYTRhZmY5YzA4NmUxNmNjMjU4OTUiIHRpbWVzdGFtcD0iMTc5MzIyNjYyMSI+OTA8
+MDEwOTQ5NmZlYTRhZmY5YzA4NmUxNmNjMjU4OTUiIHRpbWVzdGFtcD0iMTc5MzIyOTE3NiI+OTA8
 L2tleT48L2ZvcmVpZ24ta2V5cz48cmVmLXR5cGUgbmFtZT0iQ29uZmVyZW5jZSBQYXBlciI+NDc8
 L3JlZi10eXBlPjxjb250cmlidXRvcnM+PGF1dGhvcnM+PGF1dGhvcj5aaGFuZywgVGlhbnl1PC9h
 dXRob3I+PGF1dGhvcj5BcmRha2FuaWFuLCBPbWlkPC9hdXRob3I+PC9hdXRob3JzPjwvY29udHJp
@@ -2554,7 +2554,7 @@
 dCBhbC4gMjAyMTsgQ2FtcG95LU5pZXZlcyBldCBhbC4gMjAyNTsgWmhhbmcgYW5kIEFyZGFrYW5p
 YW4gMjAyMCk8L0Rpc3BsYXlUZXh0PjxyZWNvcmQ+PHJlYy1udW1iZXI+NDE8L3JlYy1udW1iZXI+
 PGZvcmVpZ24ta2V5cz48a2V5IGFwcD0iRU4iIGRiLWlkPSJtZGFlODUwMDEwOTQ5NmZlYTRhZmY5
-YzA4NmUxNmNjMjU4OTUiIHRpbWVzdGFtcD0iMTc5MzIyNjYyMSI+NDE8L2tleT48L2ZvcmVpZ24t
+YzA4NmUxNmNjMjU4OTUiIHRpbWVzdGFtcD0iMTc5MzIyOTE3NiI+NDE8L2tleT48L2ZvcmVpZ24t
 a2V5cz48cmVmLXR5cGUgbmFtZT0iQ29uZmVyZW5jZSBQYXBlciI+NDc8L3JlZi10eXBlPjxjb250
 cmlidXRvcnM+PGF1dGhvcnM+PGF1dGhvcj5KaW3DqW5lei1SYWJvc28sIEphdmllcjwvYXV0aG9y
 PjxhdXRob3I+Q2FtcG95LU5pZXZlcywgQWxlamFuZHJvPC9hdXRob3I+PGF1dGhvcj5NYW5qYXZh
@@ -2573,7 +2573,7 @@
 ZT48QXV0aG9yPkNhbXBveS1OaWV2ZXM8L0F1dGhvcj48WWVhcj4yMDI1PC9ZZWFyPjxSZWNOdW0+
 OTwvUmVjTnVtPjxyZWNvcmQ+PHJlYy1udW1iZXI+OTwvcmVjLW51bWJlcj48Zm9yZWlnbi1rZXlz
 PjxrZXkgYXBwPSJFTiIgZGItaWQ9Im1kYWU4NTAwMTA5NDk2ZmVhNGFmZjljMDg2ZTE2Y2MyNTg5
-NSIgdGltZXN0YW1wPSIxNzkzMjI2NjIxIj45PC9rZXk+PC9mb3JlaWduLWtleXM+PHJlZi10eXBl
+NSIgdGltZXN0YW1wPSIxNzkzMjI5MTc2Ij45PC9rZXk+PC9mb3JlaWduLWtleXM+PHJlZi10eXBl
 IG5hbWU9IkpvdXJuYWwgQXJ0aWNsZSI+MTc8L3JlZi10eXBlPjxjb250cmlidXRvcnM+PGF1dGhv
 cnM+PGF1dGhvcj5DYW1wb3ktTmlldmVzLCBBbGVqYW5kcm88L2F1dGhvcj48YXV0aG9yPk1hbmph
 dmFjYXMsIEFudG9uaW88L2F1dGhvcj48YXV0aG9yPkppbcOpbmV6LVJhYm9zbywgSmF2aWVyPC9h
@@ -2591,7 +2591,7 @@
 LXJlc291cmNlLW51bT48L3JlY29yZD48L0NpdGU+PENpdGU+PEF1dGhvcj5aaGFuZzwvQXV0aG9y
 PjxZZWFyPjIwMjA8L1llYXI+PFJlY051bT45MDwvUmVjTnVtPjxyZWNvcmQ+PHJlYy1udW1iZXI+
 OTA8L3JlYy1udW1iZXI+PGZvcmVpZ24ta2V5cz48a2V5IGFwcD0iRU4iIGRiLWlkPSJtZGFlODUw
-MDEwOTQ5NmZlYTRhZmY5YzA4NmUxNmNjMjU4OTUiIHRpbWVzdGFtcD0iMTc5MzIyNjYyMSI+OTA8
+MDEwOTQ5NmZlYTRhZmY5YzA4NmUxNmNjMjU4OTUiIHRpbWVzdGFtcD0iMTc5MzIyOTE3NiI+OTA8
 L2tleT48L2ZvcmVpZ24ta2V5cz48cmVmLXR5cGUgbmFtZT0iQ29uZmVyZW5jZSBQYXBlciI+NDc8
 L3JlZi10eXBlPjxjb250cmlidXRvcnM+PGF1dGhvcnM+PGF1dGhvcj5aaGFuZywgVGlhbnl1PC9h
 dXRob3I+PGF1dGhvcj5BcmRha2FuaWFuLCBPbWlkPC9hdXRob3I+PC9hdXRob3JzPjwvY29udHJp
@@ -2632,7 +2632,7 @@
         <w:fldChar w:fldCharType="begin"/>
       </w:r>
       <w:r>
-        <w:instrText xml:space="preserve"> ADDIN EN.CITE &lt;EndNote&gt;&lt;Cite&gt;&lt;Author&gt;Scharnhorst&lt;/Author&gt;&lt;Year&gt;2021&lt;/Year&gt;&lt;RecNum&gt;75&lt;/RecNum&gt;&lt;DisplayText&gt;(Scharnhorst et al. 2021)&lt;/DisplayText&gt;&lt;record&gt;&lt;rec-number&gt;75&lt;/rec-number&gt;&lt;foreign-keys&gt;&lt;key app="EN" db-id="mdae8500109496fea4aff9c086e16cc25895" timestamp="1793226621"&gt;75&lt;/key&gt;&lt;/foreign-keys&gt;&lt;ref-type name="Journal Article"&gt;17&lt;/ref-type&gt;&lt;contributors&gt;&lt;authors&gt;&lt;author&gt;Scharnhorst, Paul&lt;/author&gt;&lt;author&gt;Schubnel, Baptiste&lt;/author&gt;&lt;author&gt;Fernández Bandera, Carlos&lt;/author&gt;&lt;author&gt;Salom, Jaume&lt;/author&gt;&lt;author&gt;Taddeo, Paolo&lt;/author&gt;&lt;author&gt;Boegli, Max&lt;/author&gt;&lt;author&gt;Gorecki, Tomasz&lt;/author&gt;&lt;author&gt;Stauffer, Yves&lt;/author&gt;&lt;author&gt;Peppas, Antonis&lt;/author&gt;&lt;author&gt;Politi, Chrysa&lt;/author&gt;&lt;/authors&gt;&lt;/contributors&gt;&lt;titles&gt;&lt;title&gt;Energym: A Building Model Library for Controller Benchmarking&lt;/title&gt;&lt;secondary-title&gt;Applied Sciences&lt;/secondary-title&gt;&lt;alt-title&gt;Appl. Sci.&lt;/alt-title&gt;&lt;/titles&gt;&lt;periodical&gt;&lt;full-title&gt;Applied Sciences&lt;/full-title&gt;&lt;abbr-1&gt;Appl. Sci.&lt;/abbr-1&gt;&lt;/periodical&gt;&lt;pages&gt;3518&lt;/pages&gt;&lt;volume&gt;11&lt;/volume&gt;&lt;number&gt;8&lt;/number&gt;&lt;dates&gt;&lt;year&gt;2021&lt;/year&gt;&lt;/dates&gt;&lt;publisher&gt;MDPI&lt;/publisher&gt;&lt;label&gt;scharnhorst2021&lt;/label&gt;&lt;urls&gt;&lt;/urls&gt;&lt;electronic-resource-num&gt;10.3390/app11083518&lt;/electronic-resource-num&gt;&lt;/record&gt;&lt;/Cite&gt;&lt;/EndNote&gt;</w:instrText>
+        <w:instrText xml:space="preserve"> ADDIN EN.CITE &lt;EndNote&gt;&lt;Cite&gt;&lt;Author&gt;Scharnhorst&lt;/Author&gt;&lt;Year&gt;2021&lt;/Year&gt;&lt;RecNum&gt;75&lt;/RecNum&gt;&lt;DisplayText&gt;(Scharnhorst et al. 2021)&lt;/DisplayText&gt;&lt;record&gt;&lt;rec-number&gt;75&lt;/rec-number&gt;&lt;foreign-keys&gt;&lt;key app="EN" db-id="mdae8500109496fea4aff9c086e16cc25895" timestamp="1793229176"&gt;75&lt;/key&gt;&lt;/foreign-keys&gt;&lt;ref-type name="Journal Article"&gt;17&lt;/ref-type&gt;&lt;contributors&gt;&lt;authors&gt;&lt;author&gt;Scharnhorst, Paul&lt;/author&gt;&lt;author&gt;Schubnel, Baptiste&lt;/author&gt;&lt;author&gt;Fernández Bandera, Carlos&lt;/author&gt;&lt;author&gt;Salom, Jaume&lt;/author&gt;&lt;author&gt;Taddeo, Paolo&lt;/author&gt;&lt;author&gt;Boegli, Max&lt;/author&gt;&lt;author&gt;Gorecki, Tomasz&lt;/author&gt;&lt;author&gt;Stauffer, Yves&lt;/author&gt;&lt;author&gt;Peppas, Antonis&lt;/author&gt;&lt;author&gt;Politi, Chrysa&lt;/author&gt;&lt;/authors&gt;&lt;/contributors&gt;&lt;titles&gt;&lt;title&gt;Energym: A Building Model Library for Controller Benchmarking&lt;/title&gt;&lt;secondary-title&gt;Applied Sciences&lt;/secondary-title&gt;&lt;alt-title&gt;Appl. Sci.&lt;/alt-title&gt;&lt;/titles&gt;&lt;periodical&gt;&lt;full-title&gt;Applied Sciences&lt;/full-title&gt;&lt;abbr-1&gt;Appl. Sci.&lt;/abbr-1&gt;&lt;/periodical&gt;&lt;pages&gt;3518&lt;/pages&gt;&lt;volume&gt;11&lt;/volume&gt;&lt;number&gt;8&lt;/number&gt;&lt;dates&gt;&lt;year&gt;2021&lt;/year&gt;&lt;/dates&gt;&lt;publisher&gt;MDPI&lt;/publisher&gt;&lt;label&gt;scharnhorst2021&lt;/label&gt;&lt;urls&gt;&lt;/urls&gt;&lt;electronic-resource-num&gt;10.3390/app11083518&lt;/electronic-resource-num&gt;&lt;/record&gt;&lt;/Cite&gt;&lt;/EndNote&gt;</w:instrText>
       </w:r>
       <w:r>
         <w:fldChar w:fldCharType="separate"/>
@@ -2653,7 +2653,7 @@
         <w:fldChar w:fldCharType="begin"/>
       </w:r>
       <w:r>
-        <w:instrText xml:space="preserve"> ADDIN EN.CITE &lt;EndNote&gt;&lt;Cite&gt;&lt;Author&gt;Blum&lt;/Author&gt;&lt;Year&gt;2021&lt;/Year&gt;&lt;RecNum&gt;7&lt;/RecNum&gt;&lt;DisplayText&gt;(Blum et al. 2021)&lt;/DisplayText&gt;&lt;record&gt;&lt;rec-number&gt;7&lt;/rec-number&gt;&lt;foreign-keys&gt;&lt;key app="EN" db-id="mdae8500109496fea4aff9c086e16cc25895" timestamp="1793226621"&gt;7&lt;/key&gt;&lt;/foreign-keys&gt;&lt;ref-type name="Journal Article"&gt;17&lt;/ref-type&gt;&lt;contributors&gt;&lt;authors&gt;&lt;author&gt;Blum, David&lt;/author&gt;&lt;author&gt;Arroyo, Javier&lt;/author&gt;&lt;author&gt;Huang, Sen&lt;/author&gt;&lt;author&gt;Drgoňa, Ján&lt;/author&gt;&lt;author&gt;Jorissen, Filip&lt;/author&gt;&lt;author&gt;Walnum, Harald Taxt&lt;/author&gt;&lt;author&gt;Chen, Yan&lt;/author&gt;&lt;author&gt;Benne, Kyle&lt;/author&gt;&lt;author&gt;Vrabie, Draguna&lt;/author&gt;&lt;author&gt;Wetter, Michael&lt;/author&gt;&lt;author&gt;Helsen, Lieve&lt;/author&gt;&lt;/authors&gt;&lt;/contributors&gt;&lt;titles&gt;&lt;title&gt;Building optimization testing framework (BOPTEST) for simulation-based benchmarking of control strategies in buildings&lt;/title&gt;&lt;secondary-title&gt;Journal of Building Performance Simulation&lt;/secondary-title&gt;&lt;alt-title&gt;J. Build. Perform. Simul.&lt;/alt-title&gt;&lt;/titles&gt;&lt;periodical&gt;&lt;full-title&gt;Journal of Building Performance Simulation&lt;/full-title&gt;&lt;abbr-1&gt;J. Build. Perform. Simul.&lt;/abbr-1&gt;&lt;/periodical&gt;&lt;pages&gt;586-610&lt;/pages&gt;&lt;volume&gt;14&lt;/volume&gt;&lt;number&gt;5&lt;/number&gt;&lt;dates&gt;&lt;year&gt;2021&lt;/year&gt;&lt;/dates&gt;&lt;publisher&gt;Taylor &amp;amp; Francis&lt;/publisher&gt;&lt;label&gt;blum2021&lt;/label&gt;&lt;urls&gt;&lt;/urls&gt;&lt;electronic-resource-num&gt;10.1080/19401493.2021.1986574&lt;/electronic-resource-num&gt;&lt;/record&gt;&lt;/Cite&gt;&lt;/EndNote&gt;</w:instrText>
+        <w:instrText xml:space="preserve"> ADDIN EN.CITE &lt;EndNote&gt;&lt;Cite&gt;&lt;Author&gt;Blum&lt;/Author&gt;&lt;Year&gt;2021&lt;/Year&gt;&lt;RecNum&gt;7&lt;/RecNum&gt;&lt;DisplayText&gt;(Blum et al. 2021)&lt;/DisplayText&gt;&lt;record&gt;&lt;rec-number&gt;7&lt;/rec-number&gt;&lt;foreign-keys&gt;&lt;key app="EN" db-id="mdae8500109496fea4aff9c086e16cc25895" timestamp="1793229176"&gt;7&lt;/key&gt;&lt;/foreign-keys&gt;&lt;ref-type name="Journal Article"&gt;17&lt;/ref-type&gt;&lt;contributors&gt;&lt;authors&gt;&lt;author&gt;Blum, David&lt;/author&gt;&lt;author&gt;Arroyo, Javier&lt;/author&gt;&lt;author&gt;Huang, Sen&lt;/author&gt;&lt;author&gt;Drgoňa, Ján&lt;/author&gt;&lt;author&gt;Jorissen, Filip&lt;/author&gt;&lt;author&gt;Walnum, Harald Taxt&lt;/author&gt;&lt;author&gt;Chen, Yan&lt;/author&gt;&lt;author&gt;Benne, Kyle&lt;/author&gt;&lt;author&gt;Vrabie, Draguna&lt;/author&gt;&lt;author&gt;Wetter, Michael&lt;/author&gt;&lt;author&gt;Helsen, Lieve&lt;/author&gt;&lt;/authors&gt;&lt;/contributors&gt;&lt;titles&gt;&lt;title&gt;Building optimization testing framework (BOPTEST) for simulation-based benchmarking of control strategies in buildings&lt;/title&gt;&lt;secondary-title&gt;Journal of Building Performance Simulation&lt;/secondary-title&gt;&lt;alt-title&gt;J. Build. Perform. Simul.&lt;/alt-title&gt;&lt;/titles&gt;&lt;periodical&gt;&lt;full-title&gt;Journal of Building Performance Simulation&lt;/full-title&gt;&lt;abbr-1&gt;J. Build. Perform. Simul.&lt;/abbr-1&gt;&lt;/periodical&gt;&lt;pages&gt;586-610&lt;/pages&gt;&lt;volume&gt;14&lt;/volume&gt;&lt;number&gt;5&lt;/number&gt;&lt;dates&gt;&lt;year&gt;2021&lt;/year&gt;&lt;/dates&gt;&lt;publisher&gt;Taylor &amp;amp; Francis&lt;/publisher&gt;&lt;label&gt;blum2021&lt;/label&gt;&lt;urls&gt;&lt;/urls&gt;&lt;electronic-resource-num&gt;10.1080/19401493.2021.1986574&lt;/electronic-resource-num&gt;&lt;/record&gt;&lt;/Cite&gt;&lt;/EndNote&gt;</w:instrText>
       </w:r>
       <w:r>
         <w:fldChar w:fldCharType="separate"/>
@@ -2674,7 +2674,7 @@
         <w:fldChar w:fldCharType="begin"/>
       </w:r>
       <w:r>
-        <w:instrText xml:space="preserve"> ADDIN EN.CITE &lt;EndNote&gt;&lt;Cite&gt;&lt;Author&gt;Nweye&lt;/Author&gt;&lt;Year&gt;2025&lt;/Year&gt;&lt;RecNum&gt;60&lt;/RecNum&gt;&lt;DisplayText&gt;(Nweye et al. 2025)&lt;/DisplayText&gt;&lt;record&gt;&lt;rec-number&gt;60&lt;/rec-number&gt;&lt;foreign-keys&gt;&lt;key app="EN" db-id="mdae8500109496fea4aff9c086e16cc25895" timestamp="1793226621"&gt;60&lt;/key&gt;&lt;/foreign-keys&gt;&lt;ref-type name="Journal Article"&gt;17&lt;/ref-type&gt;&lt;contributors&gt;&lt;authors&gt;&lt;author&gt;Nweye, Kingsley&lt;/author&gt;&lt;author&gt;Kaspar, Kathryn&lt;/author&gt;&lt;author&gt;Buscemi, Giacomo&lt;/author&gt;&lt;author&gt;Fonseca, Tiago&lt;/author&gt;&lt;author&gt;Pinto, Giuseppe&lt;/author&gt;&lt;author&gt;Ghose, Dipanjan&lt;/author&gt;&lt;author&gt;Duddukuru, Satvik&lt;/author&gt;&lt;author&gt;Pratapa, Pavani&lt;/author&gt;&lt;author&gt;Li, Han&lt;/author&gt;&lt;author&gt;Mohammadi, Javad&lt;/author&gt;&lt;author&gt;Lino Ferreira, Luis&lt;/author&gt;&lt;author&gt;Hong, Tianzhen&lt;/author&gt;&lt;author&gt;Ouf, Mohamed&lt;/author&gt;&lt;author&gt;Capozzoli, Alfonso&lt;/author&gt;&lt;author&gt;Nagy, Zoltan&lt;/author&gt;&lt;/authors&gt;&lt;/contributors&gt;&lt;titles&gt;&lt;title&gt;CityLearn v2: energy-flexible, resilient, occupant-centric, and carbon-aware management of grid-interactive communities&lt;/title&gt;&lt;secondary-title&gt;Journal of Building Performance Simulation&lt;/secondary-title&gt;&lt;alt-title&gt;J. Build. Perform. Simul.&lt;/alt-title&gt;&lt;/titles&gt;&lt;periodical&gt;&lt;full-title&gt;Journal of Building Performance Simulation&lt;/full-title&gt;&lt;abbr-1&gt;J. Build. Perform. Simul.&lt;/abbr-1&gt;&lt;/periodical&gt;&lt;pages&gt;17-38&lt;/pages&gt;&lt;volume&gt;18&lt;/volume&gt;&lt;number&gt;1&lt;/number&gt;&lt;dates&gt;&lt;year&gt;2025&lt;/year&gt;&lt;/dates&gt;&lt;publisher&gt;Taylor &amp;amp; Francis&lt;/publisher&gt;&lt;label&gt;nweye2025&lt;/label&gt;&lt;urls&gt;&lt;/urls&gt;&lt;electronic-resource-num&gt;10.1080/19401493.2024.2418813&lt;/electronic-resource-num&gt;&lt;/record&gt;&lt;/Cite&gt;&lt;/EndNote&gt;</w:instrText>
+        <w:instrText xml:space="preserve"> ADDIN EN.CITE &lt;EndNote&gt;&lt;Cite&gt;&lt;Author&gt;Nweye&lt;/Author&gt;&lt;Year&gt;2025&lt;/Year&gt;&lt;RecNum&gt;60&lt;/RecNum&gt;&lt;DisplayText&gt;(Nweye et al. 2025)&lt;/DisplayText&gt;&lt;record&gt;&lt;rec-number&gt;60&lt;/rec-number&gt;&lt;foreign-keys&gt;&lt;key app="EN" db-id="mdae8500109496fea4aff9c086e16cc25895" timestamp="1793229176"&gt;60&lt;/key&gt;&lt;/foreign-keys&gt;&lt;ref-type name="Journal Article"&gt;17&lt;/ref-type&gt;&lt;contributors&gt;&lt;authors&gt;&lt;author&gt;Nweye, Kingsley&lt;/author&gt;&lt;author&gt;Kaspar, Kathryn&lt;/author&gt;&lt;author&gt;Buscemi, Giacomo&lt;/author&gt;&lt;author&gt;Fonseca, Tiago&lt;/author&gt;&lt;author&gt;Pinto, Giuseppe&lt;/author&gt;&lt;author&gt;Ghose, Dipanjan&lt;/author&gt;&lt;author&gt;Duddukuru, Satvik&lt;/author&gt;&lt;author&gt;Pratapa, Pavani&lt;/author&gt;&lt;author&gt;Li, Han&lt;/author&gt;&lt;author&gt;Mohammadi, Javad&lt;/author&gt;&lt;author&gt;Lino Ferreira, Luis&lt;/author&gt;&lt;author&gt;Hong, Tianzhen&lt;/author&gt;&lt;author&gt;Ouf, Mohamed&lt;/author&gt;&lt;author&gt;Capozzoli, Alfonso&lt;/author&gt;&lt;author&gt;Nagy, Zoltan&lt;/author&gt;&lt;/authors&gt;&lt;/contributors&gt;&lt;titles&gt;&lt;title&gt;CityLearn v2: energy-flexible, resilient, occupant-centric, and carbon-aware management of grid-interactive communities&lt;/title&gt;&lt;secondary-title&gt;Journal of Building Performance Simulation&lt;/secondary-title&gt;&lt;alt-title&gt;J. Build. Perform. Simul.&lt;/alt-title&gt;&lt;/titles&gt;&lt;periodical&gt;&lt;full-title&gt;Journal of Building Performance Simulation&lt;/full-title&gt;&lt;abbr-1&gt;J. Build. Perform. Simul.&lt;/abbr-1&gt;&lt;/periodical&gt;&lt;pages&gt;17-38&lt;/pages&gt;&lt;volume&gt;18&lt;/volume&gt;&lt;number&gt;1&lt;/number&gt;&lt;dates&gt;&lt;year&gt;2025&lt;/year&gt;&lt;/dates&gt;&lt;publisher&gt;Taylor &amp;amp; Francis&lt;/publisher&gt;&lt;label&gt;nweye2025&lt;/label&gt;&lt;urls&gt;&lt;/urls&gt;&lt;electronic-resource-num&gt;10.1080/19401493.2024.2418813&lt;/electronic-resource-num&gt;&lt;/record&gt;&lt;/Cite&gt;&lt;/EndNote&gt;</w:instrText>
       </w:r>
       <w:r>
         <w:fldChar w:fldCharType="separate"/>
@@ -2695,7 +2695,7 @@
         <w:fldChar w:fldCharType="begin"/>
       </w:r>
       <w:r>
-        <w:instrText xml:space="preserve"> ADDIN EN.CITE &lt;EndNote&gt;&lt;Cite&gt;&lt;Author&gt;Benne&lt;/Author&gt;&lt;Year&gt;2024&lt;/Year&gt;&lt;RecNum&gt;4&lt;/RecNum&gt;&lt;DisplayText&gt;(Benne et al. 2024)&lt;/DisplayText&gt;&lt;record&gt;&lt;rec-number&gt;4&lt;/rec-number&gt;&lt;foreign-keys&gt;&lt;key app="EN" db-id="mdae8500109496fea4aff9c086e16cc25895" timestamp="1793226621"&gt;4&lt;/key&gt;&lt;/foreign-keys&gt;&lt;ref-type name="Report"&gt;27&lt;/ref-type&gt;&lt;contributors&gt;&lt;authors&gt;&lt;author&gt;Benne, Kyle&lt;/author&gt;&lt;author&gt;Shapinsky, Tobias&lt;/author&gt;&lt;author&gt;Petersen, Anya&lt;/author&gt;&lt;/authors&gt;&lt;/contributors&gt;&lt;titles&gt;&lt;title&gt;Alfalfa Virtual Building Service: Software Engineering Best Practices Applied to Runtime Interaction with Building Energy Models&lt;/title&gt;&lt;secondary-title&gt;IBPSA-USA SimBuild 2024 Conference, Denver, Colorado, 21–23 May 2024&lt;/secondary-title&gt;&lt;/titles&gt;&lt;dates&gt;&lt;year&gt;2024&lt;/year&gt;&lt;/dates&gt;&lt;pub-location&gt;Golden, CO&lt;/pub-location&gt;&lt;publisher&gt;National Renewable Energy Laboratory&lt;/publisher&gt;&lt;isbn&gt;NREL/PR-5500-89738&lt;/isbn&gt;&lt;label&gt;benne2024&lt;/label&gt;&lt;work-type&gt;Presentation&lt;/work-type&gt;&lt;urls&gt;&lt;related-urls&gt;&lt;url&gt;https://www.osti.gov/biblio/2407013&lt;/url&gt;&lt;/related-urls&gt;&lt;/urls&gt;&lt;/record&gt;&lt;/Cite&gt;&lt;/EndNote&gt;</w:instrText>
+        <w:instrText xml:space="preserve"> ADDIN EN.CITE &lt;EndNote&gt;&lt;Cite&gt;&lt;Author&gt;Benne&lt;/Author&gt;&lt;Year&gt;2024&lt;/Year&gt;&lt;RecNum&gt;4&lt;/RecNum&gt;&lt;DisplayText&gt;(Benne et al. 2024)&lt;/DisplayText&gt;&lt;record&gt;&lt;rec-number&gt;4&lt;/rec-number&gt;&lt;foreign-keys&gt;&lt;key app="EN" db-id="mdae8500109496fea4aff9c086e16cc25895" timestamp="1793229176"&gt;4&lt;/key&gt;&lt;/foreign-keys&gt;&lt;ref-type name="Report"&gt;27&lt;/ref-type&gt;&lt;contributors&gt;&lt;authors&gt;&lt;author&gt;Benne, Kyle&lt;/author&gt;&lt;author&gt;Shapinsky, Tobias&lt;/author&gt;&lt;author&gt;Petersen, Anya&lt;/author&gt;&lt;/authors&gt;&lt;/contributors&gt;&lt;titles&gt;&lt;title&gt;Alfalfa Virtual Building Service: Software Engineering Best Practices Applied to Runtime Interaction with Building Energy Models&lt;/title&gt;&lt;secondary-title&gt;IBPSA-USA SimBuild 2024 Conference, Denver, Colorado, 21–23 May 2024&lt;/secondary-title&gt;&lt;/titles&gt;&lt;dates&gt;&lt;year&gt;2024&lt;/year&gt;&lt;/dates&gt;&lt;pub-location&gt;Golden, CO&lt;/pub-location&gt;&lt;publisher&gt;National Renewable Energy Laboratory&lt;/publisher&gt;&lt;isbn&gt;NREL/PR-5500-89738&lt;/isbn&gt;&lt;label&gt;benne2024&lt;/label&gt;&lt;work-type&gt;Presentation&lt;/work-type&gt;&lt;urls&gt;&lt;related-urls&gt;&lt;url&gt;https://www.osti.gov/biblio/2407013&lt;/url&gt;&lt;/related-urls&gt;&lt;/urls&gt;&lt;/record&gt;&lt;/Cite&gt;&lt;/EndNote&gt;</w:instrText>
       </w:r>
       <w:r>
         <w:fldChar w:fldCharType="separate"/>
@@ -2710,7 +2710,7 @@
         <w:fldChar w:fldCharType="end"/>
       </w:r>
       <w:r>
-        <w:t xml:space="preserve">. These tools step synchronously or follow the wall clock; we found no time-meaning metadata, no record/replay of components and no asynchronous handling of slow AI calls in them.</w:t>
+        <w:t xml:space="preserve">. These tools step synchronously or follow the wall clock; we found no time-meaning metadata, no record/replay of components and no asynchronous handling of slow calls in them.</w:t>
       </w:r>
     </w:p>
     <w:p>
@@ -2732,7 +2732,7 @@
         <w:fldChar w:fldCharType="begin"/>
       </w:r>
       <w:r>
-        <w:instrText xml:space="preserve"> ADDIN EN.CITE &lt;EndNote&gt;&lt;Cite&gt;&lt;Author&gt;Ahn&lt;/Author&gt;&lt;Year&gt;2023&lt;/Year&gt;&lt;RecNum&gt;1&lt;/RecNum&gt;&lt;DisplayText&gt;(Ahn et al. 2023)&lt;/DisplayText&gt;&lt;record&gt;&lt;rec-number&gt;1&lt;/rec-number&gt;&lt;foreign-keys&gt;&lt;key app="EN" db-id="mdae8500109496fea4aff9c086e16cc25895" timestamp="1793226621"&gt;1&lt;/key&gt;&lt;/foreign-keys&gt;&lt;ref-type name="Journal Article"&gt;17&lt;/ref-type&gt;&lt;contributors&gt;&lt;authors&gt;&lt;author&gt;Ahn, Ki Uhn&lt;/author&gt;&lt;author&gt;Kim, Deuk-Woo&lt;/author&gt;&lt;author&gt;Cho, Hyun Mi&lt;/author&gt;&lt;author&gt;Chae, Chang-U&lt;/author&gt;&lt;/authors&gt;&lt;/contributors&gt;&lt;titles&gt;&lt;title&gt;Alternative Approaches to HVAC Control of Chat Generative Pre-Trained Transformer (ChatGPT) for Autonomous Building System Operations&lt;/title&gt;&lt;secondary-title&gt;Buildings&lt;/secondary-title&gt;&lt;alt-title&gt;Buildings&lt;/alt-title&gt;&lt;/titles&gt;&lt;periodical&gt;&lt;full-title&gt;Buildings&lt;/full-title&gt;&lt;abbr-1&gt;Buildings&lt;/abbr-1&gt;&lt;/periodical&gt;&lt;pages&gt;2680&lt;/pages&gt;&lt;volume&gt;13&lt;/volume&gt;&lt;number&gt;11&lt;/number&gt;&lt;dates&gt;&lt;year&gt;2023&lt;/year&gt;&lt;/dates&gt;&lt;publisher&gt;MDPI&lt;/publisher&gt;&lt;label&gt;ahn2023&lt;/label&gt;&lt;urls&gt;&lt;/urls&gt;&lt;electronic-resource-num&gt;10.3390/buildings13112680&lt;/electronic-resource-num&gt;&lt;/record&gt;&lt;/Cite&gt;&lt;/EndNote&gt;</w:instrText>
+        <w:instrText xml:space="preserve"> ADDIN EN.CITE &lt;EndNote&gt;&lt;Cite&gt;&lt;Author&gt;Ahn&lt;/Author&gt;&lt;Year&gt;2023&lt;/Year&gt;&lt;RecNum&gt;1&lt;/RecNum&gt;&lt;DisplayText&gt;(Ahn et al. 2023)&lt;/DisplayText&gt;&lt;record&gt;&lt;rec-number&gt;1&lt;/rec-number&gt;&lt;foreign-keys&gt;&lt;key app="EN" db-id="mdae8500109496fea4aff9c086e16cc25895" timestamp="1793229176"&gt;1&lt;/key&gt;&lt;/foreign-keys&gt;&lt;ref-type name="Journal Article"&gt;17&lt;/ref-type&gt;&lt;contributors&gt;&lt;authors&gt;&lt;author&gt;Ahn, Ki Uhn&lt;/author&gt;&lt;author&gt;Kim, Deuk-Woo&lt;/author&gt;&lt;author&gt;Cho, Hyun Mi&lt;/author&gt;&lt;author&gt;Chae, Chang-U&lt;/author&gt;&lt;/authors&gt;&lt;/contributors&gt;&lt;titles&gt;&lt;title&gt;Alternative Approaches to HVAC Control of Chat Generative Pre-Trained Transformer (ChatGPT) for Autonomous Building System Operations&lt;/title&gt;&lt;secondary-title&gt;Buildings&lt;/secondary-title&gt;&lt;alt-title&gt;Buildings&lt;/alt-title&gt;&lt;/titles&gt;&lt;periodical&gt;&lt;full-title&gt;Buildings&lt;/full-title&gt;&lt;abbr-1&gt;Buildings&lt;/abbr-1&gt;&lt;/periodical&gt;&lt;pages&gt;2680&lt;/pages&gt;&lt;volume&gt;13&lt;/volume&gt;&lt;number&gt;11&lt;/number&gt;&lt;dates&gt;&lt;year&gt;2023&lt;/year&gt;&lt;/dates&gt;&lt;publisher&gt;MDPI&lt;/publisher&gt;&lt;label&gt;ahn2023&lt;/label&gt;&lt;urls&gt;&lt;/urls&gt;&lt;electronic-resource-num&gt;10.3390/buildings13112680&lt;/electronic-resource-num&gt;&lt;/record&gt;&lt;/Cite&gt;&lt;/EndNote&gt;</w:instrText>
       </w:r>
       <w:r>
         <w:fldChar w:fldCharType="separate"/>
@@ -2753,7 +2753,7 @@
         <w:fldChar w:fldCharType="begin"/>
       </w:r>
       <w:r>
-        <w:instrText xml:space="preserve"> ADDIN EN.CITE &lt;EndNote&gt;&lt;Cite&gt;&lt;Author&gt;Zhang&lt;/Author&gt;&lt;Year&gt;2024&lt;/Year&gt;&lt;RecNum&gt;94&lt;/RecNum&gt;&lt;DisplayText&gt;(Zhang and Chen 2024)&lt;/DisplayText&gt;&lt;record&gt;&lt;rec-number&gt;94&lt;/rec-number&gt;&lt;foreign-keys&gt;&lt;key app="EN" db-id="mdae8500109496fea4aff9c086e16cc25895" timestamp="1793226621"&gt;94&lt;/key&gt;&lt;/foreign-keys&gt;&lt;ref-type name="Journal Article"&gt;17&lt;/ref-type&gt;&lt;contributors&gt;&lt;authors&gt;&lt;author&gt;Zhang, Liang&lt;/author&gt;&lt;author&gt;Chen, Zhelun&lt;/author&gt;&lt;/authors&gt;&lt;/contributors&gt;&lt;titles&gt;&lt;title&gt;Large language model-based interpretable machine learning control in building energy systems&lt;/title&gt;&lt;secondary-title&gt;Energy and Buildings&lt;/secondary-title&gt;&lt;alt-title&gt;Energy Build.&lt;/alt-title&gt;&lt;/titles&gt;&lt;periodical&gt;&lt;full-title&gt;Energy and Buildings&lt;/full-title&gt;&lt;abbr-1&gt;Energy Build.&lt;/abbr-1&gt;&lt;/periodical&gt;&lt;pages&gt;114278&lt;/pages&gt;&lt;volume&gt;313&lt;/volume&gt;&lt;dates&gt;&lt;year&gt;2024&lt;/year&gt;&lt;/dates&gt;&lt;publisher&gt;Elsevier&lt;/publisher&gt;&lt;label&gt;zhangchen2024&lt;/label&gt;&lt;urls&gt;&lt;/urls&gt;&lt;electronic-resource-num&gt;10.1016/j.enbuild.2024.114278&lt;/electronic-resource-num&gt;&lt;/record&gt;&lt;/Cite&gt;&lt;/EndNote&gt;</w:instrText>
+        <w:instrText xml:space="preserve"> ADDIN EN.CITE &lt;EndNote&gt;&lt;Cite&gt;&lt;Author&gt;Zhang&lt;/Author&gt;&lt;Year&gt;2024&lt;/Year&gt;&lt;RecNum&gt;94&lt;/RecNum&gt;&lt;DisplayText&gt;(Zhang and Chen 2024)&lt;/DisplayText&gt;&lt;record&gt;&lt;rec-number&gt;94&lt;/rec-number&gt;&lt;foreign-keys&gt;&lt;key app="EN" db-id="mdae8500109496fea4aff9c086e16cc25895" timestamp="1793229176"&gt;94&lt;/key&gt;&lt;/foreign-keys&gt;&lt;ref-type name="Journal Article"&gt;17&lt;/ref-type&gt;&lt;contributors&gt;&lt;authors&gt;&lt;author&gt;Zhang, Liang&lt;/author&gt;&lt;author&gt;Chen, Zhelun&lt;/author&gt;&lt;/authors&gt;&lt;/contributors&gt;&lt;titles&gt;&lt;title&gt;Large language model-based interpretable machine learning control in building energy systems&lt;/title&gt;&lt;secondary-title&gt;Energy and Buildings&lt;/secondary-title&gt;&lt;alt-title&gt;Energy Build.&lt;/alt-title&gt;&lt;/titles&gt;&lt;periodical&gt;&lt;full-title&gt;Energy and Buildings&lt;/full-title&gt;&lt;abbr-1&gt;Energy Build.&lt;/abbr-1&gt;&lt;/periodical&gt;&lt;pages&gt;114278&lt;/pages&gt;&lt;volume&gt;313&lt;/volume&gt;&lt;dates&gt;&lt;year&gt;2024&lt;/year&gt;&lt;/dates&gt;&lt;publisher&gt;Elsevier&lt;/publisher&gt;&lt;label&gt;zhangchen2024&lt;/label&gt;&lt;urls&gt;&lt;/urls&gt;&lt;electronic-resource-num&gt;10.1016/j.enbuild.2024.114278&lt;/electronic-resource-num&gt;&lt;/record&gt;&lt;/Cite&gt;&lt;/EndNote&gt;</w:instrText>
       </w:r>
       <w:r>
         <w:fldChar w:fldCharType="separate"/>
@@ -2774,7 +2774,7 @@
         <w:fldChar w:fldCharType="begin"/>
       </w:r>
       <w:r>
-        <w:instrText xml:space="preserve"> ADDIN EN.CITE &lt;EndNote&gt;&lt;Cite&gt;&lt;Author&gt;Sawada&lt;/Author&gt;&lt;Year&gt;2025&lt;/Year&gt;&lt;RecNum&gt;74&lt;/RecNum&gt;&lt;DisplayText&gt;(Sawada et al. 2025)&lt;/DisplayText&gt;&lt;record&gt;&lt;rec-number&gt;74&lt;/rec-number&gt;&lt;foreign-keys&gt;&lt;key app="EN" db-id="mdae8500109496fea4aff9c086e16cc25895" timestamp="1793226621"&gt;74&lt;/key&gt;&lt;/foreign-keys&gt;&lt;ref-type name="Journal Article"&gt;17&lt;/ref-type&gt;&lt;contributors&gt;&lt;authors&gt;&lt;author&gt;Sawada, Tomoya&lt;/author&gt;&lt;author&gt;Mizuno, Masahiro&lt;/author&gt;&lt;author&gt;Hasegawa, Takaomi&lt;/author&gt;&lt;author&gt;Yokoyama, Keiichi&lt;/author&gt;&lt;author&gt;Kono, Mayuka&lt;/author&gt;&lt;/authors&gt;&lt;/contributors&gt;&lt;titles&gt;&lt;title&gt;Office-in-the-Loop: an investigation into Agentic AI for advanced building HVAC control systems&lt;/title&gt;&lt;secondary-title&gt;Data-Centric Engineering&lt;/secondary-title&gt;&lt;alt-title&gt;Data-Centric Eng.&lt;/alt-title&gt;&lt;/titles&gt;&lt;periodical&gt;&lt;full-title&gt;Data-Centric Engineering&lt;/full-title&gt;&lt;abbr-1&gt;Data-Centric Eng.&lt;/abbr-1&gt;&lt;/periodical&gt;&lt;pages&gt;e31&lt;/pages&gt;&lt;volume&gt;6&lt;/volume&gt;&lt;dates&gt;&lt;year&gt;2025&lt;/year&gt;&lt;/dates&gt;&lt;publisher&gt;Cambridge University Press&lt;/publisher&gt;&lt;label&gt;sawada2025&lt;/label&gt;&lt;urls&gt;&lt;/urls&gt;&lt;electronic-resource-num&gt;10.1017/dce.2025.10010&lt;/electronic-resource-num&gt;&lt;/record&gt;&lt;/Cite&gt;&lt;/EndNote&gt;</w:instrText>
+        <w:instrText xml:space="preserve"> ADDIN EN.CITE &lt;EndNote&gt;&lt;Cite&gt;&lt;Author&gt;Sawada&lt;/Author&gt;&lt;Year&gt;2025&lt;/Year&gt;&lt;RecNum&gt;74&lt;/RecNum&gt;&lt;DisplayText&gt;(Sawada et al. 2025)&lt;/DisplayText&gt;&lt;record&gt;&lt;rec-number&gt;74&lt;/rec-number&gt;&lt;foreign-keys&gt;&lt;key app="EN" db-id="mdae8500109496fea4aff9c086e16cc25895" timestamp="1793229176"&gt;74&lt;/key&gt;&lt;/foreign-keys&gt;&lt;ref-type name="Journal Article"&gt;17&lt;/ref-type&gt;&lt;contributors&gt;&lt;authors&gt;&lt;author&gt;Sawada, Tomoya&lt;/author&gt;&lt;author&gt;Mizuno, Masahiro&lt;/author&gt;&lt;author&gt;Hasegawa, Takaomi&lt;/author&gt;&lt;author&gt;Yokoyama, Keiichi&lt;/author&gt;&lt;author&gt;Kono, Mayuka&lt;/author&gt;&lt;/authors&gt;&lt;/contributors&gt;&lt;titles&gt;&lt;title&gt;Office-in-the-Loop: an investigation into Agentic AI for advanced building HVAC control systems&lt;/title&gt;&lt;secondary-title&gt;Data-Centric Engineering&lt;/secondary-title&gt;&lt;alt-title&gt;Data-Centric Eng.&lt;/alt-title&gt;&lt;/titles&gt;&lt;periodical&gt;&lt;full-title&gt;Data-Centric Engineering&lt;/full-title&gt;&lt;abbr-1&gt;Data-Centric Eng.&lt;/abbr-1&gt;&lt;/periodical&gt;&lt;pages&gt;e31&lt;/pages&gt;&lt;volume&gt;6&lt;/volume&gt;&lt;dates&gt;&lt;year&gt;2025&lt;/year&gt;&lt;/dates&gt;&lt;publisher&gt;Cambridge University Press&lt;/publisher&gt;&lt;label&gt;sawada2025&lt;/label&gt;&lt;urls&gt;&lt;/urls&gt;&lt;electronic-resource-num&gt;10.1017/dce.2025.10010&lt;/electronic-resource-num&gt;&lt;/record&gt;&lt;/Cite&gt;&lt;/EndNote&gt;</w:instrText>
       </w:r>
       <w:r>
         <w:fldChar w:fldCharType="separate"/>
@@ -2795,7 +2795,7 @@
         <w:fldChar w:fldCharType="begin"/>
       </w:r>
       <w:r>
-        <w:instrText xml:space="preserve"> ADDIN EN.CITE &lt;EndNote&gt;&lt;Cite&gt;&lt;Author&gt;Jiang&lt;/Author&gt;&lt;Year&gt;2024&lt;/Year&gt;&lt;RecNum&gt;40&lt;/RecNum&gt;&lt;DisplayText&gt;(Jiang et al. 2024)&lt;/DisplayText&gt;&lt;record&gt;&lt;rec-number&gt;40&lt;/rec-number&gt;&lt;foreign-keys&gt;&lt;key app="EN" db-id="mdae8500109496fea4aff9c086e16cc25895" timestamp="1793226621"&gt;40&lt;/key&gt;&lt;/foreign-keys&gt;&lt;ref-type name="Journal Article"&gt;17&lt;/ref-type&gt;&lt;contributors&gt;&lt;authors&gt;&lt;author&gt;Jiang, Gang&lt;/author&gt;&lt;author&gt;Ma, Zhihao&lt;/author&gt;&lt;author&gt;Zhang, Liang&lt;/author&gt;&lt;author&gt;Chen, Jianli&lt;/author&gt;&lt;/authors&gt;&lt;/contributors&gt;&lt;titles&gt;&lt;title&gt;EPlus-LLM: A large language model-based computing platform for automated building energy modeling&lt;/title&gt;&lt;secondary-title&gt;Applied Energy&lt;/secondary-title&gt;&lt;alt-title&gt;Appl. Energy&lt;/alt-title&gt;&lt;/titles&gt;&lt;periodical&gt;&lt;full-title&gt;Applied Energy&lt;/full-title&gt;&lt;abbr-1&gt;Appl. Energy&lt;/abbr-1&gt;&lt;/periodical&gt;&lt;pages&gt;123431&lt;/pages&gt;&lt;volume&gt;367&lt;/volume&gt;&lt;dates&gt;&lt;year&gt;2024&lt;/year&gt;&lt;/dates&gt;&lt;publisher&gt;Elsevier&lt;/publisher&gt;&lt;label&gt;jiang2024&lt;/label&gt;&lt;urls&gt;&lt;/urls&gt;&lt;electronic-resource-num&gt;10.1016/j.apenergy.2024.123431&lt;/electronic-resource-num&gt;&lt;/record&gt;&lt;/Cite&gt;&lt;/EndNote&gt;</w:instrText>
+        <w:instrText xml:space="preserve"> ADDIN EN.CITE &lt;EndNote&gt;&lt;Cite&gt;&lt;Author&gt;Jiang&lt;/Author&gt;&lt;Year&gt;2024&lt;/Year&gt;&lt;RecNum&gt;40&lt;/RecNum&gt;&lt;DisplayText&gt;(Jiang et al. 2024)&lt;/DisplayText&gt;&lt;record&gt;&lt;rec-number&gt;40&lt;/rec-number&gt;&lt;foreign-keys&gt;&lt;key app="EN" db-id="mdae8500109496fea4aff9c086e16cc25895" timestamp="1793229176"&gt;40&lt;/key&gt;&lt;/foreign-keys&gt;&lt;ref-type name="Journal Article"&gt;17&lt;/ref-type&gt;&lt;contributors&gt;&lt;authors&gt;&lt;author&gt;Jiang, Gang&lt;/author&gt;&lt;author&gt;Ma, Zhihao&lt;/author&gt;&lt;author&gt;Zhang, Liang&lt;/author&gt;&lt;author&gt;Chen, Jianli&lt;/author&gt;&lt;/authors&gt;&lt;/contributors&gt;&lt;titles&gt;&lt;title&gt;EPlus-LLM: A large language model-based computing platform for automated building energy modeling&lt;/title&gt;&lt;secondary-title&gt;Applied Energy&lt;/secondary-title&gt;&lt;alt-title&gt;Appl. Energy&lt;/alt-title&gt;&lt;/titles&gt;&lt;periodical&gt;&lt;full-title&gt;Applied Energy&lt;/full-title&gt;&lt;abbr-1&gt;Appl. Energy&lt;/abbr-1&gt;&lt;/periodical&gt;&lt;pages&gt;123431&lt;/pages&gt;&lt;volume&gt;367&lt;/volume&gt;&lt;dates&gt;&lt;year&gt;2024&lt;/year&gt;&lt;/dates&gt;&lt;publisher&gt;Elsevier&lt;/publisher&gt;&lt;label&gt;jiang2024&lt;/label&gt;&lt;urls&gt;&lt;/urls&gt;&lt;electronic-resource-num&gt;10.1016/j.apenergy.2024.123431&lt;/electronic-resource-num&gt;&lt;/record&gt;&lt;/Cite&gt;&lt;/EndNote&gt;</w:instrText>
       </w:r>
       <w:r>
         <w:fldChar w:fldCharType="separate"/>
@@ -2816,7 +2816,7 @@
         <w:fldChar w:fldCharType="begin"/>
       </w:r>
       <w:r>
-        <w:instrText xml:space="preserve"> ADDIN EN.CITE &lt;EndNote&gt;&lt;Cite&gt;&lt;Author&gt;Liu&lt;/Author&gt;&lt;Year&gt;2025&lt;/Year&gt;&lt;RecNum&gt;51&lt;/RecNum&gt;&lt;DisplayText&gt;(Liu et al. 2025)&lt;/DisplayText&gt;&lt;record&gt;&lt;rec-number&gt;51&lt;/rec-number&gt;&lt;foreign-keys&gt;&lt;key app="EN" db-id="mdae8500109496fea4aff9c086e16cc25895" timestamp="1793226621"&gt;51&lt;/key&gt;&lt;/foreign-keys&gt;&lt;ref-type name="Journal Article"&gt;17&lt;/ref-type&gt;&lt;contributors&gt;&lt;authors&gt;&lt;author&gt;Liu, Mingzhe&lt;/author&gt;&lt;author&gt;Zhang, Liang&lt;/author&gt;&lt;author&gt;Chen, Jianli&lt;/author&gt;&lt;author&gt;Chen, Wei-An&lt;/author&gt;&lt;author&gt;Yang, Zhiyao&lt;/author&gt;&lt;author&gt;Lo, L. James&lt;/author&gt;&lt;author&gt;Wen, Jin&lt;/author&gt;&lt;author&gt;O'Neill, Zheng&lt;/author&gt;&lt;/authors&gt;&lt;/contributors&gt;&lt;titles&gt;&lt;title&gt;Large language models for building energy applications: Opportunities and challenges&lt;/title&gt;&lt;secondary-title&gt;Building Simulation&lt;/secondary-title&gt;&lt;alt-title&gt;Build. Simul.&lt;/alt-title&gt;&lt;/titles&gt;&lt;periodical&gt;&lt;full-title&gt;Building Simulation&lt;/full-title&gt;&lt;abbr-1&gt;Build. Simul.&lt;/abbr-1&gt;&lt;/periodical&gt;&lt;pages&gt;225-234&lt;/pages&gt;&lt;volume&gt;18&lt;/volume&gt;&lt;number&gt;2&lt;/number&gt;&lt;dates&gt;&lt;year&gt;2025&lt;/year&gt;&lt;/dates&gt;&lt;publisher&gt;Springer&lt;/publisher&gt;&lt;label&gt;liu2025llm&lt;/label&gt;&lt;urls&gt;&lt;/urls&gt;&lt;electronic-resource-num&gt;10.1007/s12273-025-1235-9&lt;/electronic-resource-num&gt;&lt;/record&gt;&lt;/Cite&gt;&lt;/EndNote&gt;</w:instrText>
+        <w:instrText xml:space="preserve"> ADDIN EN.CITE &lt;EndNote&gt;&lt;Cite&gt;&lt;Author&gt;Liu&lt;/Author&gt;&lt;Year&gt;2025&lt;/Year&gt;&lt;RecNum&gt;51&lt;/RecNum&gt;&lt;DisplayText&gt;(Liu et al. 2025)&lt;/DisplayText&gt;&lt;record&gt;&lt;rec-number&gt;51&lt;/rec-number&gt;&lt;foreign-keys&gt;&lt;key app="EN" db-id="mdae8500109496fea4aff9c086e16cc25895" timestamp="1793229176"&gt;51&lt;/key&gt;&lt;/foreign-keys&gt;&lt;ref-type name="Journal Article"&gt;17&lt;/ref-type&gt;&lt;contributors&gt;&lt;authors&gt;&lt;author&gt;Liu, Mingzhe&lt;/author&gt;&lt;author&gt;Zhang, Liang&lt;/author&gt;&lt;author&gt;Chen, Jianli&lt;/author&gt;&lt;author&gt;Chen, Wei-An&lt;/author&gt;&lt;author&gt;Yang, Zhiyao&lt;/author&gt;&lt;author&gt;Lo, L. James&lt;/author&gt;&lt;author&gt;Wen, Jin&lt;/author&gt;&lt;author&gt;O'Neill, Zheng&lt;/author&gt;&lt;/authors&gt;&lt;/contributors&gt;&lt;titles&gt;&lt;title&gt;Large language models for building energy applications: Opportunities and challenges&lt;/title&gt;&lt;secondary-title&gt;Building Simulation&lt;/secondary-title&gt;&lt;alt-title&gt;Build. Simul.&lt;/alt-title&gt;&lt;/titles&gt;&lt;periodical&gt;&lt;full-title&gt;Building Simulation&lt;/full-title&gt;&lt;abbr-1&gt;Build. Simul.&lt;/abbr-1&gt;&lt;/periodical&gt;&lt;pages&gt;225-234&lt;/pages&gt;&lt;volume&gt;18&lt;/volume&gt;&lt;number&gt;2&lt;/number&gt;&lt;dates&gt;&lt;year&gt;2025&lt;/year&gt;&lt;/dates&gt;&lt;publisher&gt;Springer&lt;/publisher&gt;&lt;label&gt;liu2025llm&lt;/label&gt;&lt;urls&gt;&lt;/urls&gt;&lt;electronic-resource-num&gt;10.1007/s12273-025-1235-9&lt;/electronic-resource-num&gt;&lt;/record&gt;&lt;/Cite&gt;&lt;/EndNote&gt;</w:instrText>
       </w:r>
       <w:r>
         <w:fldChar w:fldCharType="separate"/>
@@ -2853,7 +2853,7 @@
         <w:fldChar w:fldCharType="begin"/>
       </w:r>
       <w:r>
-        <w:instrText xml:space="preserve"> ADDIN EN.CITE &lt;EndNote&gt;&lt;Cite&gt;&lt;Author&gt;Eaton&lt;/Author&gt;&lt;Year&gt;2023&lt;/Year&gt;&lt;RecNum&gt;10&lt;/RecNum&gt;&lt;DisplayText&gt;(Eaton et al. 2023)&lt;/DisplayText&gt;&lt;record&gt;&lt;rec-number&gt;10&lt;/rec-number&gt;&lt;foreign-keys&gt;&lt;key app="EN" db-id="mdae8500109496fea4aff9c086e16cc25895" timestamp="1793226621"&gt;10&lt;/key&gt;&lt;/foreign-keys&gt;&lt;ref-type name="Web Page"&gt;12&lt;/ref-type&gt;&lt;contributors&gt;&lt;authors&gt;&lt;author&gt;Eaton, Brian&lt;/author&gt;&lt;author&gt;Gregory, Jonathan&lt;/author&gt;&lt;author&gt;Drach, Bob&lt;/author&gt;&lt;author&gt;Taylor, Karl&lt;/author&gt;&lt;author&gt;Hankin, Steve&lt;/author&gt;&lt;author&gt;Blower, Jon&lt;/author&gt;&lt;author&gt;Caron, John&lt;/author&gt;&lt;author&gt;Signell, Rich&lt;/author&gt;&lt;author&gt;Bentley, Phil&lt;/author&gt;&lt;author&gt;Rappa, Greg&lt;/author&gt;&lt;author&gt;Höck, Heinke&lt;/author&gt;&lt;author&gt;Pamment, Alison&lt;/author&gt;&lt;author&gt;Juckes, Martin&lt;/author&gt;&lt;author&gt;Raspaud, Martin&lt;/author&gt;&lt;author&gt;Horne, Randy&lt;/author&gt;&lt;author&gt;Whiteaker, Timothy&lt;/author&gt;&lt;author&gt;Blodgett, David&lt;/author&gt;&lt;author&gt;Zender, Charlie&lt;/author&gt;&lt;author&gt;Lee, Daniel&lt;/author&gt;&lt;author&gt;Hassell, David&lt;/author&gt;&lt;author&gt;Snow, Alan D.&lt;/author&gt;&lt;author&gt;Kölling, Tobias&lt;/author&gt;&lt;author&gt;Allured, Dave&lt;/author&gt;&lt;author&gt;Jelenak, Aleksandar&lt;/author&gt;&lt;author&gt;Meier Soerensen, Anders&lt;/author&gt;&lt;author&gt;Gaultier, Lucile&lt;/author&gt;&lt;author&gt;Herlédan, Sylvain&lt;/author&gt;&lt;author&gt;Manzano, Fernando&lt;/author&gt;&lt;author&gt;Bärring, Lars&lt;/author&gt;&lt;author&gt;Barker, Christopher&lt;/author&gt;&lt;author&gt;Bartholomew, Sadie&lt;/author&gt;&lt;/authors&gt;&lt;/contributors&gt;&lt;titles&gt;&lt;title&gt;NetCDF Climate and Forecast (CF) Metadata Conventions&lt;/title&gt;&lt;/titles&gt;&lt;dates&gt;&lt;year&gt;2023&lt;/year&gt;&lt;/dates&gt;&lt;label&gt;cf2023&lt;/label&gt;&lt;urls&gt;&lt;related-urls&gt;&lt;url&gt;https://cfconventions.org/Data/cf-conventions/cf-conventions-1.11/cf-conventions.html&lt;/url&gt;&lt;/related-urls&gt;&lt;/urls&gt;&lt;access-date&gt;2026-10-28&lt;/access-date&gt;&lt;/record&gt;&lt;/Cite&gt;&lt;/EndNote&gt;</w:instrText>
+        <w:instrText xml:space="preserve"> ADDIN EN.CITE &lt;EndNote&gt;&lt;Cite&gt;&lt;Author&gt;Eaton&lt;/Author&gt;&lt;Year&gt;2023&lt;/Year&gt;&lt;RecNum&gt;10&lt;/RecNum&gt;&lt;DisplayText&gt;(Eaton et al. 2023)&lt;/DisplayText&gt;&lt;record&gt;&lt;rec-number&gt;10&lt;/rec-number&gt;&lt;foreign-keys&gt;&lt;key app="EN" db-id="mdae8500109496fea4aff9c086e16cc25895" timestamp="1793229176"&gt;10&lt;/key&gt;&lt;/foreign-keys&gt;&lt;ref-type name="Web Page"&gt;12&lt;/ref-type&gt;&lt;contributors&gt;&lt;authors&gt;&lt;author&gt;Eaton, Brian&lt;/author&gt;&lt;author&gt;Gregory, Jonathan&lt;/author&gt;&lt;author&gt;Drach, Bob&lt;/author&gt;&lt;author&gt;Taylor, Karl&lt;/author&gt;&lt;author&gt;Hankin, Steve&lt;/author&gt;&lt;author&gt;Blower, Jon&lt;/author&gt;&lt;author&gt;Caron, John&lt;/author&gt;&lt;author&gt;Signell, Rich&lt;/author&gt;&lt;author&gt;Bentley, Phil&lt;/author&gt;&lt;author&gt;Rappa, Greg&lt;/author&gt;&lt;author&gt;Höck, Heinke&lt;/author&gt;&lt;author&gt;Pamment, Alison&lt;/author&gt;&lt;author&gt;Juckes, Martin&lt;/author&gt;&lt;author&gt;Raspaud, Martin&lt;/author&gt;&lt;author&gt;Horne, Randy&lt;/author&gt;&lt;author&gt;Whiteaker, Timothy&lt;/author&gt;&lt;author&gt;Blodgett, David&lt;/author&gt;&lt;author&gt;Zender, Charlie&lt;/author&gt;&lt;author&gt;Lee, Daniel&lt;/author&gt;&lt;author&gt;Hassell, David&lt;/author&gt;&lt;author&gt;Snow, Alan D.&lt;/author&gt;&lt;author&gt;Kölling, Tobias&lt;/author&gt;&lt;author&gt;Allured, Dave&lt;/author&gt;&lt;author&gt;Jelenak, Aleksandar&lt;/author&gt;&lt;author&gt;Meier Soerensen, Anders&lt;/author&gt;&lt;author&gt;Gaultier, Lucile&lt;/author&gt;&lt;author&gt;Herlédan, Sylvain&lt;/author&gt;&lt;author&gt;Manzano, Fernando&lt;/author&gt;&lt;author&gt;Bärring, Lars&lt;/author&gt;&lt;author&gt;Barker, Christopher&lt;/author&gt;&lt;author&gt;Bartholomew, Sadie&lt;/author&gt;&lt;/authors&gt;&lt;/contributors&gt;&lt;titles&gt;&lt;title&gt;NetCDF Climate and Forecast (CF) Metadata Conventions&lt;/title&gt;&lt;/titles&gt;&lt;dates&gt;&lt;year&gt;2023&lt;/year&gt;&lt;/dates&gt;&lt;label&gt;cf2023&lt;/label&gt;&lt;urls&gt;&lt;related-urls&gt;&lt;url&gt;https://cfconventions.org/Data/cf-conventions/cf-conventions-1.11/cf-conventions.html&lt;/url&gt;&lt;/related-urls&gt;&lt;/urls&gt;&lt;access-date&gt;2026-10-28&lt;/access-date&gt;&lt;/record&gt;&lt;/Cite&gt;&lt;/EndNote&gt;</w:instrText>
       </w:r>
       <w:r>
         <w:fldChar w:fldCharType="separate"/>
@@ -2874,7 +2874,7 @@
         <w:fldChar w:fldCharType="begin"/>
       </w:r>
       <w:r>
-        <w:instrText xml:space="preserve"> ADDIN EN.CITE &lt;EndNote&gt;&lt;Cite&gt;&lt;Author&gt;Open Geospatial Consortium&lt;/Author&gt;&lt;Year&gt;2014&lt;/Year&gt;&lt;RecNum&gt;63&lt;/RecNum&gt;&lt;DisplayText&gt;(Open Geospatial Consortium 2014)&lt;/DisplayText&gt;&lt;record&gt;&lt;rec-number&gt;63&lt;/rec-number&gt;&lt;foreign-keys&gt;&lt;key app="EN" db-id="mdae8500109496fea4aff9c086e16cc25895" timestamp="1793226621"&gt;63&lt;/key&gt;&lt;/foreign-keys&gt;&lt;ref-type name="Standard"&gt;58&lt;/ref-type&gt;&lt;contributors&gt;&lt;authors&gt;&lt;author&gt;Open Geospatial Consortium&lt;/author&gt;&lt;/authors&gt;&lt;secondary-authors&gt;&lt;author&gt;Taylor, Peter&lt;/author&gt;&lt;/secondary-authors&gt;&lt;/contributors&gt;&lt;titles&gt;&lt;title&gt;OGC WaterML 2.0: Part 1 – Timeseries, Version 2.0.1&lt;/title&gt;&lt;secondary-title&gt;OGC 10-126r4&lt;/secondary-title&gt;&lt;/titles&gt;&lt;dates&gt;&lt;year&gt;2014&lt;/year&gt;&lt;/dates&gt;&lt;label&gt;ogc_waterml2014&lt;/label&gt;&lt;urls&gt;&lt;related-urls&gt;&lt;url&gt;https://docs.ogc.org/is/10-126r4/10-126r4.pdf&lt;/url&gt;&lt;/related-urls&gt;&lt;/urls&gt;&lt;/record&gt;&lt;/Cite&gt;&lt;/EndNote&gt;</w:instrText>
+        <w:instrText xml:space="preserve"> ADDIN EN.CITE &lt;EndNote&gt;&lt;Cite&gt;&lt;Author&gt;Open Geospatial Consortium&lt;/Author&gt;&lt;Year&gt;2014&lt;/Year&gt;&lt;RecNum&gt;63&lt;/RecNum&gt;&lt;DisplayText&gt;(Open Geospatial Consortium 2014)&lt;/DisplayText&gt;&lt;record&gt;&lt;rec-number&gt;63&lt;/rec-number&gt;&lt;foreign-keys&gt;&lt;key app="EN" db-id="mdae8500109496fea4aff9c086e16cc25895" timestamp="1793229176"&gt;63&lt;/key&gt;&lt;/foreign-keys&gt;&lt;ref-type name="Standard"&gt;58&lt;/ref-type&gt;&lt;contributors&gt;&lt;authors&gt;&lt;author&gt;Open Geospatial Consortium&lt;/author&gt;&lt;/authors&gt;&lt;secondary-authors&gt;&lt;author&gt;Taylor, Peter&lt;/author&gt;&lt;/secondary-authors&gt;&lt;/contributors&gt;&lt;titles&gt;&lt;title&gt;OGC WaterML 2.0: Part 1 – Timeseries, Version 2.0.1&lt;/title&gt;&lt;secondary-title&gt;OGC 10-126r4&lt;/secondary-title&gt;&lt;/titles&gt;&lt;dates&gt;&lt;year&gt;2014&lt;/year&gt;&lt;/dates&gt;&lt;label&gt;ogc_waterml2014&lt;/label&gt;&lt;urls&gt;&lt;related-urls&gt;&lt;url&gt;https://docs.ogc.org/is/10-126r4/10-126r4.pdf&lt;/url&gt;&lt;/related-urls&gt;&lt;/urls&gt;&lt;/record&gt;&lt;/Cite&gt;&lt;/EndNote&gt;</w:instrText>
       </w:r>
       <w:r>
         <w:fldChar w:fldCharType="separate"/>
@@ -2895,7 +2895,7 @@
         <w:fldChar w:fldCharType="begin"/>
       </w:r>
       <w:r>
-        <w:instrText xml:space="preserve"> ADDIN EN.CITE &lt;EndNote&gt;&lt;Cite&gt;&lt;Author&gt;U.S. Department of Energy&lt;/Author&gt;&lt;Year&gt;2024&lt;/Year&gt;&lt;RecNum&gt;20&lt;/RecNum&gt;&lt;DisplayText&gt;(U.S. Department of Energy 2024)&lt;/DisplayText&gt;&lt;record&gt;&lt;rec-number&gt;20&lt;/rec-number&gt;&lt;foreign-keys&gt;&lt;key app="EN" db-id="mdae8500109496fea4aff9c086e16cc25895" timestamp="1793226621"&gt;20&lt;/key&gt;&lt;/foreign-keys&gt;&lt;ref-type name="Web Page"&gt;12&lt;/ref-type&gt;&lt;contributors&gt;&lt;authors&gt;&lt;author&gt;U.S. Department of Energy&lt;/author&gt;&lt;/authors&gt;&lt;/contributors&gt;&lt;titles&gt;&lt;title&gt;EnergyPlus Output Details and Examples: eplusout.rdd&lt;/title&gt;&lt;/titles&gt;&lt;dates&gt;&lt;year&gt;2024&lt;/year&gt;&lt;/dates&gt;&lt;label&gt;doe2024rdd&lt;/label&gt;&lt;urls&gt;&lt;related-urls&gt;&lt;url&gt;https://bigladdersoftware.com/epx/docs/24-1/output-details-and-examples/eplusout-rdd.html&lt;/url&gt;&lt;/related-urls&gt;&lt;/urls&gt;&lt;access-date&gt;2026-10-28&lt;/access-date&gt;&lt;/record&gt;&lt;/Cite&gt;&lt;/EndNote&gt;</w:instrText>
+        <w:instrText xml:space="preserve"> ADDIN EN.CITE &lt;EndNote&gt;&lt;Cite&gt;&lt;Author&gt;U.S. Department of Energy&lt;/Author&gt;&lt;Year&gt;2024&lt;/Year&gt;&lt;RecNum&gt;20&lt;/RecNum&gt;&lt;DisplayText&gt;(U.S. Department of Energy 2024)&lt;/DisplayText&gt;&lt;record&gt;&lt;rec-number&gt;20&lt;/rec-number&gt;&lt;foreign-keys&gt;&lt;key app="EN" db-id="mdae8500109496fea4aff9c086e16cc25895" timestamp="1793229176"&gt;20&lt;/key&gt;&lt;/foreign-keys&gt;&lt;ref-type name="Web Page"&gt;12&lt;/ref-type&gt;&lt;contributors&gt;&lt;authors&gt;&lt;author&gt;U.S. Department of Energy&lt;/author&gt;&lt;/authors&gt;&lt;/contributors&gt;&lt;titles&gt;&lt;title&gt;EnergyPlus Output Details and Examples: eplusout.rdd&lt;/title&gt;&lt;/titles&gt;&lt;dates&gt;&lt;year&gt;2024&lt;/year&gt;&lt;/dates&gt;&lt;label&gt;doe2024rdd&lt;/label&gt;&lt;urls&gt;&lt;related-urls&gt;&lt;url&gt;https://bigladdersoftware.com/epx/docs/24-1/output-details-and-examples/eplusout-rdd.html&lt;/url&gt;&lt;/related-urls&gt;&lt;/urls&gt;&lt;access-date&gt;2026-10-28&lt;/access-date&gt;&lt;/record&gt;&lt;/Cite&gt;&lt;/EndNote&gt;</w:instrText>
       </w:r>
       <w:r>
         <w:fldChar w:fldCharType="separate"/>
@@ -2916,7 +2916,7 @@
         <w:fldChar w:fldCharType="begin"/>
       </w:r>
       <w:r>
-        <w:instrText xml:space="preserve"> ADDIN EN.CITE &lt;EndNote&gt;&lt;Cite&gt;&lt;Author&gt;OPC Foundation&lt;/Author&gt;&lt;Year&gt;2026&lt;/Year&gt;&lt;RecNum&gt;65&lt;/RecNum&gt;&lt;DisplayText&gt;(OPC Foundation 2026)&lt;/DisplayText&gt;&lt;record&gt;&lt;rec-number&gt;65&lt;/rec-number&gt;&lt;foreign-keys&gt;&lt;key app="EN" db-id="mdae8500109496fea4aff9c086e16cc25895" timestamp="1793226621"&gt;65&lt;/key&gt;&lt;/foreign-keys&gt;&lt;ref-type name="Standard"&gt;58&lt;/ref-type&gt;&lt;contributors&gt;&lt;authors&gt;&lt;author&gt;OPC Foundation&lt;/author&gt;&lt;/authors&gt;&lt;/contributors&gt;&lt;titles&gt;&lt;title&gt;OPC Unified Architecture – Part 8: Data Access&lt;/title&gt;&lt;secondary-title&gt;OPC 10000-8, Release 1.05.07&lt;/secondary-title&gt;&lt;/titles&gt;&lt;dates&gt;&lt;year&gt;2026&lt;/year&gt;&lt;/dates&gt;&lt;label&gt;opcua_part8&lt;/label&gt;&lt;urls&gt;&lt;related-urls&gt;&lt;url&gt;https://reference.opcfoundation.org/specs/OPC-10000-8&lt;/url&gt;&lt;/related-urls&gt;&lt;/urls&gt;&lt;/record&gt;&lt;/Cite&gt;&lt;/EndNote&gt;</w:instrText>
+        <w:instrText xml:space="preserve"> ADDIN EN.CITE &lt;EndNote&gt;&lt;Cite&gt;&lt;Author&gt;OPC Foundation&lt;/Author&gt;&lt;Year&gt;2026&lt;/Year&gt;&lt;RecNum&gt;65&lt;/RecNum&gt;&lt;DisplayText&gt;(OPC Foundation 2026)&lt;/DisplayText&gt;&lt;record&gt;&lt;rec-number&gt;65&lt;/rec-number&gt;&lt;foreign-keys&gt;&lt;key app="EN" db-id="mdae8500109496fea4aff9c086e16cc25895" timestamp="1793229176"&gt;65&lt;/key&gt;&lt;/foreign-keys&gt;&lt;ref-type name="Standard"&gt;58&lt;/ref-type&gt;&lt;contributors&gt;&lt;authors&gt;&lt;author&gt;OPC Foundation&lt;/author&gt;&lt;/authors&gt;&lt;/contributors&gt;&lt;titles&gt;&lt;title&gt;OPC Unified Architecture – Part 8: Data Access&lt;/title&gt;&lt;secondary-title&gt;OPC 10000-8, Release 1.05.07&lt;/secondary-title&gt;&lt;/titles&gt;&lt;dates&gt;&lt;year&gt;2026&lt;/year&gt;&lt;/dates&gt;&lt;label&gt;opcua_part8&lt;/label&gt;&lt;urls&gt;&lt;related-urls&gt;&lt;url&gt;https://reference.opcfoundation.org/specs/OPC-10000-8&lt;/url&gt;&lt;/related-urls&gt;&lt;/urls&gt;&lt;/record&gt;&lt;/Cite&gt;&lt;/EndNote&gt;</w:instrText>
       </w:r>
       <w:r>
         <w:fldChar w:fldCharType="separate"/>
@@ -2937,7 +2937,7 @@
         <w:fldChar w:fldCharType="begin"/>
       </w:r>
       <w:r>
-        <w:instrText xml:space="preserve"> ADDIN EN.CITE &lt;EndNote&gt;&lt;Cite&gt;&lt;Author&gt;Moreau&lt;/Author&gt;&lt;Year&gt;2013&lt;/Year&gt;&lt;RecNum&gt;55&lt;/RecNum&gt;&lt;DisplayText&gt;(Moreau and Missier 2013)&lt;/DisplayText&gt;&lt;record&gt;&lt;rec-number&gt;55&lt;/rec-number&gt;&lt;foreign-keys&gt;&lt;key app="EN" db-id="mdae8500109496fea4aff9c086e16cc25895" timestamp="1793226621"&gt;55&lt;/key&gt;&lt;/foreign-keys&gt;&lt;ref-type name="Standard"&gt;58&lt;/ref-type&gt;&lt;contributors&gt;&lt;authors&gt;&lt;author&gt;Moreau, Luc&lt;/author&gt;&lt;author&gt;Missier, Paolo&lt;/author&gt;&lt;/authors&gt;&lt;/contributors&gt;&lt;titles&gt;&lt;title&gt;PROV-DM: The PROV Data Model&lt;/title&gt;&lt;secondary-title&gt;W3C Recommendation&lt;/secondary-title&gt;&lt;/titles&gt;&lt;dates&gt;&lt;year&gt;2013&lt;/year&gt;&lt;/dates&gt;&lt;publisher&gt;World Wide Web Consortium (W3C)&lt;/publisher&gt;&lt;label&gt;moreau2013prov&lt;/label&gt;&lt;urls&gt;&lt;related-urls&gt;&lt;url&gt;https://www.w3.org/TR/2013/REC-prov-dm-20130430/&lt;/url&gt;&lt;/related-urls&gt;&lt;/urls&gt;&lt;/record&gt;&lt;/Cite&gt;&lt;/EndNote&gt;</w:instrText>
+        <w:instrText xml:space="preserve"> ADDIN EN.CITE &lt;EndNote&gt;&lt;Cite&gt;&lt;Author&gt;Moreau&lt;/Author&gt;&lt;Year&gt;2013&lt;/Year&gt;&lt;RecNum&gt;55&lt;/RecNum&gt;&lt;DisplayText&gt;(Moreau and Missier 2013)&lt;/DisplayText&gt;&lt;record&gt;&lt;rec-number&gt;55&lt;/rec-number&gt;&lt;foreign-keys&gt;&lt;key app="EN" db-id="mdae8500109496fea4aff9c086e16cc25895" timestamp="1793229176"&gt;55&lt;/key&gt;&lt;/foreign-keys&gt;&lt;ref-type name="Standard"&gt;58&lt;/ref-type&gt;&lt;contributors&gt;&lt;authors&gt;&lt;author&gt;Moreau, Luc&lt;/author&gt;&lt;author&gt;Missier, Paolo&lt;/author&gt;&lt;/authors&gt;&lt;/contributors&gt;&lt;titles&gt;&lt;title&gt;PROV-DM: The PROV Data Model&lt;/title&gt;&lt;secondary-title&gt;W3C Recommendation&lt;/secondary-title&gt;&lt;/titles&gt;&lt;dates&gt;&lt;year&gt;2013&lt;/year&gt;&lt;/dates&gt;&lt;publisher&gt;World Wide Web Consortium (W3C)&lt;/publisher&gt;&lt;label&gt;moreau2013prov&lt;/label&gt;&lt;urls&gt;&lt;related-urls&gt;&lt;url&gt;https://www.w3.org/TR/2013/REC-prov-dm-20130430/&lt;/url&gt;&lt;/related-urls&gt;&lt;/urls&gt;&lt;/record&gt;&lt;/Cite&gt;&lt;/EndNote&gt;</w:instrText>
       </w:r>
       <w:r>
         <w:fldChar w:fldCharType="separate"/>
@@ -2958,7 +2958,7 @@
         <w:fldChar w:fldCharType="begin"/>
       </w:r>
       <w:r>
-        <w:instrText xml:space="preserve"> ADDIN EN.CITE &lt;EndNote&gt;&lt;Cite&gt;&lt;Author&gt;Chen&lt;/Author&gt;&lt;Year&gt;2015&lt;/Year&gt;&lt;RecNum&gt;12&lt;/RecNum&gt;&lt;DisplayText&gt;(Chen et al. 2015)&lt;/DisplayText&gt;&lt;record&gt;&lt;rec-number&gt;12&lt;/rec-number&gt;&lt;foreign-keys&gt;&lt;key app="EN" db-id="mdae8500109496fea4aff9c086e16cc25895" timestamp="1793226621"&gt;12&lt;/key&gt;&lt;/foreign-keys&gt;&lt;ref-type name="Journal Article"&gt;17&lt;/ref-type&gt;&lt;contributors&gt;&lt;authors&gt;&lt;author&gt;Chen, Yunji&lt;/author&gt;&lt;author&gt;Zhang, Shijin&lt;/author&gt;&lt;author&gt;Guo, Qi&lt;/author&gt;&lt;author&gt;Li, Ling&lt;/author&gt;&lt;author&gt;Wu, Ruiyang&lt;/author&gt;&lt;author&gt;Chen, Tianshi&lt;/author&gt;&lt;/authors&gt;&lt;/contributors&gt;&lt;titles&gt;&lt;title&gt;Deterministic Replay: A Survey&lt;/title&gt;&lt;secondary-title&gt;ACM Computing Surveys&lt;/secondary-title&gt;&lt;alt-title&gt;ACM Comput. Surv.&lt;/alt-title&gt;&lt;/titles&gt;&lt;periodical&gt;&lt;full-title&gt;ACM Computing Surveys&lt;/full-title&gt;&lt;abbr-1&gt;ACM Comput. Surv.&lt;/abbr-1&gt;&lt;/periodical&gt;&lt;pages&gt;1-47&lt;/pages&gt;&lt;volume&gt;48&lt;/volume&gt;&lt;number&gt;2&lt;/number&gt;&lt;dates&gt;&lt;year&gt;2015&lt;/year&gt;&lt;/dates&gt;&lt;publisher&gt;ACM&lt;/publisher&gt;&lt;label&gt;chen2015replay&lt;/label&gt;&lt;urls&gt;&lt;/urls&gt;&lt;electronic-resource-num&gt;10.1145/2790077&lt;/electronic-resource-num&gt;&lt;/record&gt;&lt;/Cite&gt;&lt;/EndNote&gt;</w:instrText>
+        <w:instrText xml:space="preserve"> ADDIN EN.CITE &lt;EndNote&gt;&lt;Cite&gt;&lt;Author&gt;Chen&lt;/Author&gt;&lt;Year&gt;2015&lt;/Year&gt;&lt;RecNum&gt;12&lt;/RecNum&gt;&lt;DisplayText&gt;(Chen et al. 2015)&lt;/DisplayText&gt;&lt;record&gt;&lt;rec-number&gt;12&lt;/rec-number&gt;&lt;foreign-keys&gt;&lt;key app="EN" db-id="mdae8500109496fea4aff9c086e16cc25895" timestamp="1793229176"&gt;12&lt;/key&gt;&lt;/foreign-keys&gt;&lt;ref-type name="Journal Article"&gt;17&lt;/ref-type&gt;&lt;contributors&gt;&lt;authors&gt;&lt;author&gt;Chen, Yunji&lt;/author&gt;&lt;author&gt;Zhang, Shijin&lt;/author&gt;&lt;author&gt;Guo, Qi&lt;/author&gt;&lt;author&gt;Li, Ling&lt;/author&gt;&lt;author&gt;Wu, Ruiyang&lt;/author&gt;&lt;author&gt;Chen, Tianshi&lt;/author&gt;&lt;/authors&gt;&lt;/contributors&gt;&lt;titles&gt;&lt;title&gt;Deterministic Replay: A Survey&lt;/title&gt;&lt;secondary-title&gt;ACM Computing Surveys&lt;/secondary-title&gt;&lt;alt-title&gt;ACM Comput. Surv.&lt;/alt-title&gt;&lt;/titles&gt;&lt;periodical&gt;&lt;full-title&gt;ACM Computing Surveys&lt;/full-title&gt;&lt;abbr-1&gt;ACM Comput. Surv.&lt;/abbr-1&gt;&lt;/periodical&gt;&lt;pages&gt;1-47&lt;/pages&gt;&lt;volume&gt;48&lt;/volume&gt;&lt;number&gt;2&lt;/number&gt;&lt;dates&gt;&lt;year&gt;2015&lt;/year&gt;&lt;/dates&gt;&lt;publisher&gt;ACM&lt;/publisher&gt;&lt;label&gt;chen2015replay&lt;/label&gt;&lt;urls&gt;&lt;/urls&gt;&lt;electronic-resource-num&gt;10.1145/2790077&lt;/electronic-resource-num&gt;&lt;/record&gt;&lt;/Cite&gt;&lt;/EndNote&gt;</w:instrText>
       </w:r>
       <w:r>
         <w:fldChar w:fldCharType="separate"/>
@@ -2979,7 +2979,7 @@
         <w:fldChar w:fldCharType="begin"/>
       </w:r>
       <w:r>
-        <w:instrText xml:space="preserve"> ADDIN EN.CITE &lt;EndNote&gt;&lt;Cite&gt;&lt;Author&gt;Henzinger&lt;/Author&gt;&lt;Year&gt;2003&lt;/Year&gt;&lt;RecNum&gt;33&lt;/RecNum&gt;&lt;DisplayText&gt;(Henzinger et al. 2003)&lt;/DisplayText&gt;&lt;record&gt;&lt;rec-number&gt;33&lt;/rec-number&gt;&lt;foreign-keys&gt;&lt;key app="EN" db-id="mdae8500109496fea4aff9c086e16cc25895" timestamp="1793226621"&gt;33&lt;/key&gt;&lt;/foreign-keys&gt;&lt;ref-type name="Journal Article"&gt;17&lt;/ref-type&gt;&lt;contributors&gt;&lt;authors&gt;&lt;author&gt;Henzinger, T. A.&lt;/author&gt;&lt;author&gt;Horowitz, B.&lt;/author&gt;&lt;author&gt;Kirsch, C. M.&lt;/author&gt;&lt;/authors&gt;&lt;/contributors&gt;&lt;titles&gt;&lt;title&gt;Giotto: a time-triggered language for embedded programming&lt;/title&gt;&lt;secondary-title&gt;Proceedings of the IEEE&lt;/secondary-title&gt;&lt;alt-title&gt;Proc. IEEE&lt;/alt-title&gt;&lt;/titles&gt;&lt;periodical&gt;&lt;full-title&gt;Proceedings of the IEEE&lt;/full-title&gt;&lt;abbr-1&gt;Proc. IEEE&lt;/abbr-1&gt;&lt;/periodical&gt;&lt;pages&gt;84-99&lt;/pages&gt;&lt;volume&gt;91&lt;/volume&gt;&lt;number&gt;1&lt;/number&gt;&lt;dates&gt;&lt;year&gt;2003&lt;/year&gt;&lt;/dates&gt;&lt;publisher&gt;IEEE&lt;/publisher&gt;&lt;label&gt;henzinger2003&lt;/label&gt;&lt;urls&gt;&lt;/urls&gt;&lt;electronic-resource-num&gt;10.1109/JPROC.2002.805825&lt;/electronic-resource-num&gt;&lt;/record&gt;&lt;/Cite&gt;&lt;/EndNote&gt;</w:instrText>
+        <w:instrText xml:space="preserve"> ADDIN EN.CITE &lt;EndNote&gt;&lt;Cite&gt;&lt;Author&gt;Henzinger&lt;/Author&gt;&lt;Year&gt;2003&lt;/Year&gt;&lt;RecNum&gt;33&lt;/RecNum&gt;&lt;DisplayText&gt;(Henzinger et al. 2003)&lt;/DisplayText&gt;&lt;record&gt;&lt;rec-number&gt;33&lt;/rec-number&gt;&lt;foreign-keys&gt;&lt;key app="EN" db-id="mdae8500109496fea4aff9c086e16cc25895" timestamp="1793229176"&gt;33&lt;/key&gt;&lt;/foreign-keys&gt;&lt;ref-type name="Journal Article"&gt;17&lt;/ref-type&gt;&lt;contributors&gt;&lt;authors&gt;&lt;author&gt;Henzinger, T. A.&lt;/author&gt;&lt;author&gt;Horowitz, B.&lt;/author&gt;&lt;author&gt;Kirsch, C. M.&lt;/author&gt;&lt;/authors&gt;&lt;/contributors&gt;&lt;titles&gt;&lt;title&gt;Giotto: a time-triggered language for embedded programming&lt;/title&gt;&lt;secondary-title&gt;Proceedings of the IEEE&lt;/secondary-title&gt;&lt;alt-title&gt;Proc. IEEE&lt;/alt-title&gt;&lt;/titles&gt;&lt;periodical&gt;&lt;full-title&gt;Proceedings of the IEEE&lt;/full-title&gt;&lt;abbr-1&gt;Proc. IEEE&lt;/abbr-1&gt;&lt;/periodical&gt;&lt;pages&gt;84-99&lt;/pages&gt;&lt;volume&gt;91&lt;/volume&gt;&lt;number&gt;1&lt;/number&gt;&lt;dates&gt;&lt;year&gt;2003&lt;/year&gt;&lt;/dates&gt;&lt;publisher&gt;IEEE&lt;/publisher&gt;&lt;label&gt;henzinger2003&lt;/label&gt;&lt;urls&gt;&lt;/urls&gt;&lt;electronic-resource-num&gt;10.1109/JPROC.2002.805825&lt;/electronic-resource-num&gt;&lt;/record&gt;&lt;/Cite&gt;&lt;/EndNote&gt;</w:instrText>
       </w:r>
       <w:r>
         <w:fldChar w:fldCharType="separate"/>
@@ -3000,7 +3000,7 @@
         <w:fldChar w:fldCharType="begin"/>
       </w:r>
       <w:r>
-        <w:instrText xml:space="preserve"> ADDIN EN.CITE &lt;EndNote&gt;&lt;Cite&gt;&lt;Author&gt;Lohstroh&lt;/Author&gt;&lt;Year&gt;2021&lt;/Year&gt;&lt;RecNum&gt;53&lt;/RecNum&gt;&lt;DisplayText&gt;(Lohstroh et al. 2021)&lt;/DisplayText&gt;&lt;record&gt;&lt;rec-number&gt;53&lt;/rec-number&gt;&lt;foreign-keys&gt;&lt;key app="EN" db-id="mdae8500109496fea4aff9c086e16cc25895" timestamp="1793226621"&gt;53&lt;/key&gt;&lt;/foreign-keys&gt;&lt;ref-type name="Journal Article"&gt;17&lt;/ref-type&gt;&lt;contributors&gt;&lt;authors&gt;&lt;author&gt;Lohstroh, Marten&lt;/author&gt;&lt;author&gt;Menard, Christian&lt;/author&gt;&lt;author&gt;Bateni, Soroush&lt;/author&gt;&lt;author&gt;Lee, Edward A.&lt;/author&gt;&lt;/authors&gt;&lt;/contributors&gt;&lt;titles&gt;&lt;title&gt;Toward a Lingua Franca for Deterministic Concurrent Systems&lt;/title&gt;&lt;secondary-title&gt;ACM Transactions on Embedded Computing Systems&lt;/secondary-title&gt;&lt;alt-title&gt;ACM Trans. Embed. Comput. Syst.&lt;/alt-title&gt;&lt;/titles&gt;&lt;periodical&gt;&lt;full-title&gt;ACM Transactions on Embedded Computing Systems&lt;/full-title&gt;&lt;abbr-1&gt;ACM Trans. Embed. Comput. Syst.&lt;/abbr-1&gt;&lt;/periodical&gt;&lt;pages&gt;1-27&lt;/pages&gt;&lt;volume&gt;20&lt;/volume&gt;&lt;number&gt;4&lt;/number&gt;&lt;dates&gt;&lt;year&gt;2021&lt;/year&gt;&lt;/dates&gt;&lt;publisher&gt;ACM&lt;/publisher&gt;&lt;label&gt;lohstroh2021&lt;/label&gt;&lt;urls&gt;&lt;/urls&gt;&lt;electronic-resource-num&gt;10.1145/3448128&lt;/electronic-resource-num&gt;&lt;/record&gt;&lt;/Cite&gt;&lt;/EndNote&gt;</w:instrText>
+        <w:instrText xml:space="preserve"> ADDIN EN.CITE &lt;EndNote&gt;&lt;Cite&gt;&lt;Author&gt;Lohstroh&lt;/Author&gt;&lt;Year&gt;2021&lt;/Year&gt;&lt;RecNum&gt;53&lt;/RecNum&gt;&lt;DisplayText&gt;(Lohstroh et al. 2021)&lt;/DisplayText&gt;&lt;record&gt;&lt;rec-number&gt;53&lt;/rec-number&gt;&lt;foreign-keys&gt;&lt;key app="EN" db-id="mdae8500109496fea4aff9c086e16cc25895" timestamp="1793229176"&gt;53&lt;/key&gt;&lt;/foreign-keys&gt;&lt;ref-type name="Journal Article"&gt;17&lt;/ref-type&gt;&lt;contributors&gt;&lt;authors&gt;&lt;author&gt;Lohstroh, Marten&lt;/author&gt;&lt;author&gt;Menard, Christian&lt;/author&gt;&lt;author&gt;Bateni, Soroush&lt;/author&gt;&lt;author&gt;Lee, Edward A.&lt;/author&gt;&lt;/authors&gt;&lt;/contributors&gt;&lt;titles&gt;&lt;title&gt;Toward a Lingua Franca for Deterministic Concurrent Systems&lt;/title&gt;&lt;secondary-title&gt;ACM Transactions on Embedded Computing Systems&lt;/secondary-title&gt;&lt;alt-title&gt;ACM Trans. Embed. Comput. Syst.&lt;/alt-title&gt;&lt;/titles&gt;&lt;periodical&gt;&lt;full-title&gt;ACM Transactions on Embedded Computing Systems&lt;/full-title&gt;&lt;abbr-1&gt;ACM Trans. Embed. Comput. Syst.&lt;/abbr-1&gt;&lt;/periodical&gt;&lt;pages&gt;1-27&lt;/pages&gt;&lt;volume&gt;20&lt;/volume&gt;&lt;number&gt;4&lt;/number&gt;&lt;dates&gt;&lt;year&gt;2021&lt;/year&gt;&lt;/dates&gt;&lt;publisher&gt;ACM&lt;/publisher&gt;&lt;label&gt;lohstroh2021&lt;/label&gt;&lt;urls&gt;&lt;/urls&gt;&lt;electronic-resource-num&gt;10.1145/3448128&lt;/electronic-resource-num&gt;&lt;/record&gt;&lt;/Cite&gt;&lt;/EndNote&gt;</w:instrText>
       </w:r>
       <w:r>
         <w:fldChar w:fldCharType="separate"/>
@@ -6647,7 +6647,7 @@
 PFJlY051bT4yNTwvUmVjTnVtPjxEaXNwbGF5VGV4dD4oRnVqaW1vdG8gMjAwMDsgT2ZlbmxvY2gg
 ZXQgYWwuIDIwMjIpPC9EaXNwbGF5VGV4dD48cmVjb3JkPjxyZWMtbnVtYmVyPjI1PC9yZWMtbnVt
 YmVyPjxmb3JlaWduLWtleXM+PGtleSBhcHA9IkVOIiBkYi1pZD0ibWRhZTg1MDAxMDk0OTZmZWE0
-YWZmOWMwODZlMTZjYzI1ODk1IiB0aW1lc3RhbXA9IjE3OTMyMjY2MjEiPjI1PC9rZXk+PC9mb3Jl
+YWZmOWMwODZlMTZjYzI1ODk1IiB0aW1lc3RhbXA9IjE3OTMyMjkxNzYiPjI1PC9rZXk+PC9mb3Jl
 aWduLWtleXM+PHJlZi10eXBlIG5hbWU9IkJvb2siPjY8L3JlZi10eXBlPjxjb250cmlidXRvcnM+
 PGF1dGhvcnM+PGF1dGhvcj5GdWppbW90bywgUmljaGFyZCBNLjwvYXV0aG9yPjwvYXV0aG9ycz48
 L2NvbnRyaWJ1dG9ycz48dGl0bGVzPjx0aXRsZT5QYXJhbGxlbCBhbmQgRGlzdHJpYnV0ZWQgU2lt
@@ -6659,7 +6659,7 @@
 bD48dXJscz48L3VybHM+PC9yZWNvcmQ+PC9DaXRlPjxDaXRlPjxBdXRob3I+T2ZlbmxvY2g8L0F1
 dGhvcj48WWVhcj4yMDIyPC9ZZWFyPjxSZWNOdW0+NjI8L1JlY051bT48cmVjb3JkPjxyZWMtbnVt
 YmVyPjYyPC9yZWMtbnVtYmVyPjxmb3JlaWduLWtleXM+PGtleSBhcHA9IkVOIiBkYi1pZD0ibWRh
-ZTg1MDAxMDk0OTZmZWE0YWZmOWMwODZlMTZjYzI1ODk1IiB0aW1lc3RhbXA9IjE3OTMyMjY2MjEi
+ZTg1MDAxMDk0OTZmZWE0YWZmOWMwODZlMTZjYzI1ODk1IiB0aW1lc3RhbXA9IjE3OTMyMjkxNzYi
 PjYyPC9rZXk+PC9mb3JlaWduLWtleXM+PHJlZi10eXBlIG5hbWU9IkNvbmZlcmVuY2UgUGFwZXIi
 PjQ3PC9yZWYtdHlwZT48Y29udHJpYnV0b3JzPjxhdXRob3JzPjxhdXRob3I+T2ZlbmxvY2gsIEFu
 bmlrYTwvYXV0aG9yPjxhdXRob3I+U2Nod2FyeiwgSmFuIFPDtnJlbjwvYXV0aG9yPjxhdXRob3I+
@@ -6686,7 +6686,7 @@
 PFJlY051bT4yNTwvUmVjTnVtPjxEaXNwbGF5VGV4dD4oRnVqaW1vdG8gMjAwMDsgT2ZlbmxvY2gg
 ZXQgYWwuIDIwMjIpPC9EaXNwbGF5VGV4dD48cmVjb3JkPjxyZWMtbnVtYmVyPjI1PC9yZWMtbnVt
 YmVyPjxmb3JlaWduLWtleXM+PGtleSBhcHA9IkVOIiBkYi1pZD0ibWRhZTg1MDAxMDk0OTZmZWE0
-YWZmOWMwODZlMTZjYzI1ODk1IiB0aW1lc3RhbXA9IjE3OTMyMjY2MjEiPjI1PC9rZXk+PC9mb3Jl
+YWZmOWMwODZlMTZjYzI1ODk1IiB0aW1lc3RhbXA9IjE3OTMyMjkxNzYiPjI1PC9rZXk+PC9mb3Jl
 aWduLWtleXM+PHJlZi10eXBlIG5hbWU9IkJvb2siPjY8L3JlZi10eXBlPjxjb250cmlidXRvcnM+
 PGF1dGhvcnM+PGF1dGhvcj5GdWppbW90bywgUmljaGFyZCBNLjwvYXV0aG9yPjwvYXV0aG9ycz48
 L2NvbnRyaWJ1dG9ycz48dGl0bGVzPjx0aXRsZT5QYXJhbGxlbCBhbmQgRGlzdHJpYnV0ZWQgU2lt
@@ -6698,7 +6698,7 @@
 bD48dXJscz48L3VybHM+PC9yZWNvcmQ+PC9DaXRlPjxDaXRlPjxBdXRob3I+T2ZlbmxvY2g8L0F1
 dGhvcj48WWVhcj4yMDIyPC9ZZWFyPjxSZWNOdW0+NjI8L1JlY051bT48cmVjb3JkPjxyZWMtbnVt
 YmVyPjYyPC9yZWMtbnVtYmVyPjxmb3JlaWduLWtleXM+PGtleSBhcHA9IkVOIiBkYi1pZD0ibWRh
-ZTg1MDAxMDk0OTZmZWE0YWZmOWMwODZlMTZjYzI1ODk1IiB0aW1lc3RhbXA9IjE3OTMyMjY2MjEi
+ZTg1MDAxMDk0OTZmZWE0YWZmOWMwODZlMTZjYzI1ODk1IiB0aW1lc3RhbXA9IjE3OTMyMjkxNzYi
 PjYyPC9rZXk+PC9mb3JlaWduLWtleXM+PHJlZi10eXBlIG5hbWU9IkNvbmZlcmVuY2UgUGFwZXIi
 PjQ3PC9yZWYtdHlwZT48Y29udHJpYnV0b3JzPjxhdXRob3JzPjxhdXRob3I+T2ZlbmxvY2gsIEFu
 bmlrYTwvYXV0aG9yPjxhdXRob3I+U2Nod2FyeiwgSmFuIFPDtnJlbjwvYXV0aG9yPjxhdXRob3I+
@@ -6743,7 +6743,7 @@
         <w:pStyle w:val="Heading2"/>
       </w:pPr>
       <w:r>
-        <w:t xml:space="preserve">Message handling for AI components</w:t>
+        <w:t xml:space="preserve">Message handling for stochastic and slow components</w:t>
       </w:r>
     </w:p>
     <w:p>
@@ -6809,7 +6809,7 @@
         <w:fldChar w:fldCharType="begin"/>
       </w:r>
       <w:r>
-        <w:instrText xml:space="preserve"> ADDIN EN.CITE &lt;EndNote&gt;&lt;Cite&gt;&lt;Author&gt;OPC Foundation&lt;/Author&gt;&lt;Year&gt;2026&lt;/Year&gt;&lt;RecNum&gt;65&lt;/RecNum&gt;&lt;DisplayText&gt;(OPC Foundation 2026; International Electrotechnical Commission 2010)&lt;/DisplayText&gt;&lt;record&gt;&lt;rec-number&gt;65&lt;/rec-number&gt;&lt;foreign-keys&gt;&lt;key app="EN" db-id="mdae8500109496fea4aff9c086e16cc25895" timestamp="1793226621"&gt;65&lt;/key&gt;&lt;/foreign-keys&gt;&lt;ref-type name="Standard"&gt;58&lt;/ref-type&gt;&lt;contributors&gt;&lt;authors&gt;&lt;author&gt;OPC Foundation&lt;/author&gt;&lt;/authors&gt;&lt;/contributors&gt;&lt;titles&gt;&lt;title&gt;OPC Unified Architecture – Part 8: Data Access&lt;/title&gt;&lt;secondary-title&gt;OPC 10000-8, Release 1.05.07&lt;/secondary-title&gt;&lt;/titles&gt;&lt;dates&gt;&lt;year&gt;2026&lt;/year&gt;&lt;/dates&gt;&lt;label&gt;opcua_part8&lt;/label&gt;&lt;urls&gt;&lt;related-urls&gt;&lt;url&gt;https://reference.opcfoundation.org/specs/OPC-10000-8&lt;/url&gt;&lt;/related-urls&gt;&lt;/urls&gt;&lt;/record&gt;&lt;/Cite&gt;&lt;Cite&gt;&lt;Author&gt;International Electrotechnical Commission&lt;/Author&gt;&lt;Year&gt;2010&lt;/Year&gt;&lt;RecNum&gt;36&lt;/RecNum&gt;&lt;record&gt;&lt;rec-number&gt;36&lt;/rec-number&gt;&lt;foreign-keys&gt;&lt;key app="EN" db-id="mdae8500109496fea4aff9c086e16cc25895" timestamp="1793226621"&gt;36&lt;/key&gt;&lt;/foreign-keys&gt;&lt;ref-type name="Standard"&gt;58&lt;/ref-type&gt;&lt;contributors&gt;&lt;authors&gt;&lt;author&gt;International Electrotechnical Commission&lt;/author&gt;&lt;/authors&gt;&lt;/contributors&gt;&lt;titles&gt;&lt;title&gt;Communication networks and systems for power utility automation – Part 7-3: Basic communication structure – Common data classes&lt;/title&gt;&lt;secondary-title&gt;IEC 61850-7-3:2010, Edition 2.0&lt;/secondary-title&gt;&lt;/titles&gt;&lt;dates&gt;&lt;year&gt;2010&lt;/year&gt;&lt;/dates&gt;&lt;isbn&gt;978-2-88912-258-5&lt;/isbn&gt;&lt;label&gt;iec61850_7_3&lt;/label&gt;&lt;urls&gt;&lt;related-urls&gt;&lt;url&gt;https://webstore.iec.ch/en/publication/6016&lt;/url&gt;&lt;/related-urls&gt;&lt;/urls&gt;&lt;/record&gt;&lt;/Cite&gt;&lt;/EndNote&gt;</w:instrText>
+        <w:instrText xml:space="preserve"> ADDIN EN.CITE &lt;EndNote&gt;&lt;Cite&gt;&lt;Author&gt;OPC Foundation&lt;/Author&gt;&lt;Year&gt;2026&lt;/Year&gt;&lt;RecNum&gt;65&lt;/RecNum&gt;&lt;DisplayText&gt;(OPC Foundation 2026; International Electrotechnical Commission 2010)&lt;/DisplayText&gt;&lt;record&gt;&lt;rec-number&gt;65&lt;/rec-number&gt;&lt;foreign-keys&gt;&lt;key app="EN" db-id="mdae8500109496fea4aff9c086e16cc25895" timestamp="1793229176"&gt;65&lt;/key&gt;&lt;/foreign-keys&gt;&lt;ref-type name="Standard"&gt;58&lt;/ref-type&gt;&lt;contributors&gt;&lt;authors&gt;&lt;author&gt;OPC Foundation&lt;/author&gt;&lt;/authors&gt;&lt;/contributors&gt;&lt;titles&gt;&lt;title&gt;OPC Unified Architecture – Part 8: Data Access&lt;/title&gt;&lt;secondary-title&gt;OPC 10000-8, Release 1.05.07&lt;/secondary-title&gt;&lt;/titles&gt;&lt;dates&gt;&lt;year&gt;2026&lt;/year&gt;&lt;/dates&gt;&lt;label&gt;opcua_part8&lt;/label&gt;&lt;urls&gt;&lt;related-urls&gt;&lt;url&gt;https://reference.opcfoundation.org/specs/OPC-10000-8&lt;/url&gt;&lt;/related-urls&gt;&lt;/urls&gt;&lt;/record&gt;&lt;/Cite&gt;&lt;Cite&gt;&lt;Author&gt;International Electrotechnical Commission&lt;/Author&gt;&lt;Year&gt;2010&lt;/Year&gt;&lt;RecNum&gt;36&lt;/RecNum&gt;&lt;record&gt;&lt;rec-number&gt;36&lt;/rec-number&gt;&lt;foreign-keys&gt;&lt;key app="EN" db-id="mdae8500109496fea4aff9c086e16cc25895" timestamp="1793229176"&gt;36&lt;/key&gt;&lt;/foreign-keys&gt;&lt;ref-type name="Standard"&gt;58&lt;/ref-type&gt;&lt;contributors&gt;&lt;authors&gt;&lt;author&gt;International Electrotechnical Commission&lt;/author&gt;&lt;/authors&gt;&lt;/contributors&gt;&lt;titles&gt;&lt;title&gt;Communication networks and systems for power utility automation – Part 7-3: Basic communication structure – Common data classes&lt;/title&gt;&lt;secondary-title&gt;IEC 61850-7-3:2010, Edition 2.0&lt;/secondary-title&gt;&lt;/titles&gt;&lt;dates&gt;&lt;year&gt;2010&lt;/year&gt;&lt;/dates&gt;&lt;isbn&gt;978-2-88912-258-5&lt;/isbn&gt;&lt;label&gt;iec61850_7_3&lt;/label&gt;&lt;urls&gt;&lt;related-urls&gt;&lt;url&gt;https://webstore.iec.ch/en/publication/6016&lt;/url&gt;&lt;/related-urls&gt;&lt;/urls&gt;&lt;/record&gt;&lt;/Cite&gt;&lt;/EndNote&gt;</w:instrText>
       </w:r>
       <w:r>
         <w:fldChar w:fldCharType="separate"/>
@@ -6839,13 +6839,13 @@
         <w:t xml:space="preserve">Record and replay.</w:t>
       </w:r>
       <w:r>
-        <w:t xml:space="preserve"> Any component’s messages can be journaled with their values, validity intervals and originating steps. In a later run, the component can be replaced by a replay component that publishes exactly the recorded messages at the recorded steps and ignores its inputs. When all non-deterministic components are replayed, every other component receives the same messages, so the run is repeated bit for bit. Replaying recorded AI decisions into a modified system, for example a retrofitted building, gives a counterfactual in which the AI’s randomness is held fixed. Record/replay is an established technique, and HELICS offers a recorder and player </w:t>
+        <w:t xml:space="preserve"> Any component’s messages can be journaled with their values, validity intervals and originating steps. In a later run, the component can be replaced by a replay component that publishes exactly the recorded messages at the recorded steps and ignores its inputs. When all non-deterministic components are replayed, every other component receives the same messages, so the run is repeated bit for bit. Replaying the recorded decisions of a stochastic component, such as an AI supervisor, into a modified system, for example a retrofitted building, gives a counterfactual in which its randomness is held fixed. Record/replay is an established technique, and HELICS offers a recorder and player </w:t>
       </w:r>
       <w:r>
         <w:fldChar w:fldCharType="begin"/>
       </w:r>
       <w:r>
-        <w:instrText xml:space="preserve"> ADDIN EN.CITE &lt;EndNote&gt;&lt;Cite&gt;&lt;Author&gt;Chen&lt;/Author&gt;&lt;Year&gt;2015&lt;/Year&gt;&lt;RecNum&gt;12&lt;/RecNum&gt;&lt;DisplayText&gt;(Chen et al. 2015; HELICS developers 2026)&lt;/DisplayText&gt;&lt;record&gt;&lt;rec-number&gt;12&lt;/rec-number&gt;&lt;foreign-keys&gt;&lt;key app="EN" db-id="mdae8500109496fea4aff9c086e16cc25895" timestamp="1793226621"&gt;12&lt;/key&gt;&lt;/foreign-keys&gt;&lt;ref-type name="Journal Article"&gt;17&lt;/ref-type&gt;&lt;contributors&gt;&lt;authors&gt;&lt;author&gt;Chen, Yunji&lt;/author&gt;&lt;author&gt;Zhang, Shijin&lt;/author&gt;&lt;author&gt;Guo, Qi&lt;/author&gt;&lt;author&gt;Li, Ling&lt;/author&gt;&lt;author&gt;Wu, Ruiyang&lt;/author&gt;&lt;author&gt;Chen, Tianshi&lt;/author&gt;&lt;/authors&gt;&lt;/contributors&gt;&lt;titles&gt;&lt;title&gt;Deterministic Replay: A Survey&lt;/title&gt;&lt;secondary-title&gt;ACM Computing Surveys&lt;/secondary-title&gt;&lt;alt-title&gt;ACM Comput. Surv.&lt;/alt-title&gt;&lt;/titles&gt;&lt;periodical&gt;&lt;full-title&gt;ACM Computing Surveys&lt;/full-title&gt;&lt;abbr-1&gt;ACM Comput. Surv.&lt;/abbr-1&gt;&lt;/periodical&gt;&lt;pages&gt;1-47&lt;/pages&gt;&lt;volume&gt;48&lt;/volume&gt;&lt;number&gt;2&lt;/number&gt;&lt;dates&gt;&lt;year&gt;2015&lt;/year&gt;&lt;/dates&gt;&lt;publisher&gt;ACM&lt;/publisher&gt;&lt;label&gt;chen2015replay&lt;/label&gt;&lt;urls&gt;&lt;/urls&gt;&lt;electronic-resource-num&gt;10.1145/2790077&lt;/electronic-resource-num&gt;&lt;/record&gt;&lt;/Cite&gt;&lt;Cite&gt;&lt;Author&gt;HELICS developers&lt;/Author&gt;&lt;Year&gt;2026&lt;/Year&gt;&lt;RecNum&gt;31&lt;/RecNum&gt;&lt;record&gt;&lt;rec-number&gt;31&lt;/rec-number&gt;&lt;foreign-keys&gt;&lt;key app="EN" db-id="mdae8500109496fea4aff9c086e16cc25895" timestamp="1793226621"&gt;31&lt;/key&gt;&lt;/foreign-keys&gt;&lt;ref-type name="Web Page"&gt;12&lt;/ref-type&gt;&lt;contributors&gt;&lt;authors&gt;&lt;author&gt;HELICS developers&lt;/author&gt;&lt;/authors&gt;&lt;/contributors&gt;&lt;titles&gt;&lt;title&gt;HELICS documentation&lt;/title&gt;&lt;/titles&gt;&lt;dates&gt;&lt;year&gt;2026&lt;/year&gt;&lt;/dates&gt;&lt;label&gt;helics_docs&lt;/label&gt;&lt;urls&gt;&lt;related-urls&gt;&lt;url&gt;https://docs.helics.org/en/latest/&lt;/url&gt;&lt;/related-urls&gt;&lt;/urls&gt;&lt;access-date&gt;2026-10-28&lt;/access-date&gt;&lt;/record&gt;&lt;/Cite&gt;&lt;/EndNote&gt;</w:instrText>
+        <w:instrText xml:space="preserve"> ADDIN EN.CITE &lt;EndNote&gt;&lt;Cite&gt;&lt;Author&gt;Chen&lt;/Author&gt;&lt;Year&gt;2015&lt;/Year&gt;&lt;RecNum&gt;12&lt;/RecNum&gt;&lt;DisplayText&gt;(Chen et al. 2015; HELICS developers 2026)&lt;/DisplayText&gt;&lt;record&gt;&lt;rec-number&gt;12&lt;/rec-number&gt;&lt;foreign-keys&gt;&lt;key app="EN" db-id="mdae8500109496fea4aff9c086e16cc25895" timestamp="1793229176"&gt;12&lt;/key&gt;&lt;/foreign-keys&gt;&lt;ref-type name="Journal Article"&gt;17&lt;/ref-type&gt;&lt;contributors&gt;&lt;authors&gt;&lt;author&gt;Chen, Yunji&lt;/author&gt;&lt;author&gt;Zhang, Shijin&lt;/author&gt;&lt;author&gt;Guo, Qi&lt;/author&gt;&lt;author&gt;Li, Ling&lt;/author&gt;&lt;author&gt;Wu, Ruiyang&lt;/author&gt;&lt;author&gt;Chen, Tianshi&lt;/author&gt;&lt;/authors&gt;&lt;/contributors&gt;&lt;titles&gt;&lt;title&gt;Deterministic Replay: A Survey&lt;/title&gt;&lt;secondary-title&gt;ACM Computing Surveys&lt;/secondary-title&gt;&lt;alt-title&gt;ACM Comput. Surv.&lt;/alt-title&gt;&lt;/titles&gt;&lt;periodical&gt;&lt;full-title&gt;ACM Computing Surveys&lt;/full-title&gt;&lt;abbr-1&gt;ACM Comput. Surv.&lt;/abbr-1&gt;&lt;/periodical&gt;&lt;pages&gt;1-47&lt;/pages&gt;&lt;volume&gt;48&lt;/volume&gt;&lt;number&gt;2&lt;/number&gt;&lt;dates&gt;&lt;year&gt;2015&lt;/year&gt;&lt;/dates&gt;&lt;publisher&gt;ACM&lt;/publisher&gt;&lt;label&gt;chen2015replay&lt;/label&gt;&lt;urls&gt;&lt;/urls&gt;&lt;electronic-resource-num&gt;10.1145/2790077&lt;/electronic-resource-num&gt;&lt;/record&gt;&lt;/Cite&gt;&lt;Cite&gt;&lt;Author&gt;HELICS developers&lt;/Author&gt;&lt;Year&gt;2026&lt;/Year&gt;&lt;RecNum&gt;31&lt;/RecNum&gt;&lt;record&gt;&lt;rec-number&gt;31&lt;/rec-number&gt;&lt;foreign-keys&gt;&lt;key app="EN" db-id="mdae8500109496fea4aff9c086e16cc25895" timestamp="1793229176"&gt;31&lt;/key&gt;&lt;/foreign-keys&gt;&lt;ref-type name="Web Page"&gt;12&lt;/ref-type&gt;&lt;contributors&gt;&lt;authors&gt;&lt;author&gt;HELICS developers&lt;/author&gt;&lt;/authors&gt;&lt;/contributors&gt;&lt;titles&gt;&lt;title&gt;HELICS documentation&lt;/title&gt;&lt;/titles&gt;&lt;dates&gt;&lt;year&gt;2026&lt;/year&gt;&lt;/dates&gt;&lt;label&gt;helics_docs&lt;/label&gt;&lt;urls&gt;&lt;related-urls&gt;&lt;url&gt;https://docs.helics.org/en/latest/&lt;/url&gt;&lt;/related-urls&gt;&lt;/urls&gt;&lt;access-date&gt;2026-10-28&lt;/access-date&gt;&lt;/record&gt;&lt;/Cite&gt;&lt;/EndNote&gt;</w:instrText>
       </w:r>
       <w:r>
         <w:fldChar w:fldCharType="separate"/>
@@ -6860,7 +6860,7 @@
         <w:fldChar w:fldCharType="end"/>
       </w:r>
       <w:r>
-        <w:t xml:space="preserve">. Here it is automatic, per component, and aimed at AI components.</w:t>
+        <w:t xml:space="preserve">. Here it is automatic, per component, and aimed at non-deterministic components.</w:t>
       </w:r>
     </w:p>
     <w:p>
@@ -6881,7 +6881,7 @@
         <w:fldChar w:fldCharType="begin"/>
       </w:r>
       <w:r>
-        <w:instrText xml:space="preserve"> ADDIN EN.CITE &lt;EndNote&gt;&lt;Cite&gt;&lt;Author&gt;Moreau&lt;/Author&gt;&lt;Year&gt;2013&lt;/Year&gt;&lt;RecNum&gt;55&lt;/RecNum&gt;&lt;DisplayText&gt;(Moreau and Missier 2013)&lt;/DisplayText&gt;&lt;record&gt;&lt;rec-number&gt;55&lt;/rec-number&gt;&lt;foreign-keys&gt;&lt;key app="EN" db-id="mdae8500109496fea4aff9c086e16cc25895" timestamp="1793226621"&gt;55&lt;/key&gt;&lt;/foreign-keys&gt;&lt;ref-type name="Standard"&gt;58&lt;/ref-type&gt;&lt;contributors&gt;&lt;authors&gt;&lt;author&gt;Moreau, Luc&lt;/author&gt;&lt;author&gt;Missier, Paolo&lt;/author&gt;&lt;/authors&gt;&lt;/contributors&gt;&lt;titles&gt;&lt;title&gt;PROV-DM: The PROV Data Model&lt;/title&gt;&lt;secondary-title&gt;W3C Recommendation&lt;/secondary-title&gt;&lt;/titles&gt;&lt;dates&gt;&lt;year&gt;2013&lt;/year&gt;&lt;/dates&gt;&lt;publisher&gt;World Wide Web Consortium (W3C)&lt;/publisher&gt;&lt;label&gt;moreau2013prov&lt;/label&gt;&lt;urls&gt;&lt;related-urls&gt;&lt;url&gt;https://www.w3.org/TR/2013/REC-prov-dm-20130430/&lt;/url&gt;&lt;/related-urls&gt;&lt;/urls&gt;&lt;/record&gt;&lt;/Cite&gt;&lt;/EndNote&gt;</w:instrText>
+        <w:instrText xml:space="preserve"> ADDIN EN.CITE &lt;EndNote&gt;&lt;Cite&gt;&lt;Author&gt;Moreau&lt;/Author&gt;&lt;Year&gt;2013&lt;/Year&gt;&lt;RecNum&gt;55&lt;/RecNum&gt;&lt;DisplayText&gt;(Moreau and Missier 2013)&lt;/DisplayText&gt;&lt;record&gt;&lt;rec-number&gt;55&lt;/rec-number&gt;&lt;foreign-keys&gt;&lt;key app="EN" db-id="mdae8500109496fea4aff9c086e16cc25895" timestamp="1793229176"&gt;55&lt;/key&gt;&lt;/foreign-keys&gt;&lt;ref-type name="Standard"&gt;58&lt;/ref-type&gt;&lt;contributors&gt;&lt;authors&gt;&lt;author&gt;Moreau, Luc&lt;/author&gt;&lt;author&gt;Missier, Paolo&lt;/author&gt;&lt;/authors&gt;&lt;/contributors&gt;&lt;titles&gt;&lt;title&gt;PROV-DM: The PROV Data Model&lt;/title&gt;&lt;secondary-title&gt;W3C Recommendation&lt;/secondary-title&gt;&lt;/titles&gt;&lt;dates&gt;&lt;year&gt;2013&lt;/year&gt;&lt;/dates&gt;&lt;publisher&gt;World Wide Web Consortium (W3C)&lt;/publisher&gt;&lt;label&gt;moreau2013prov&lt;/label&gt;&lt;urls&gt;&lt;related-urls&gt;&lt;url&gt;https://www.w3.org/TR/2013/REC-prov-dm-20130430/&lt;/url&gt;&lt;/related-urls&gt;&lt;/urls&gt;&lt;/record&gt;&lt;/Cite&gt;&lt;/EndNote&gt;</w:instrText>
       </w:r>
       <w:r>
         <w:fldChar w:fldCharType="separate"/>
@@ -7025,7 +7025,7 @@
         <w:t xml:space="preserve">late</w:t>
       </w:r>
       <w:r>
-        <w:t xml:space="preserve"> (or the run stops, if so configured). The simulated decision delay is a model parameter, the counterpart of HLA lookahead, and results do not depend on the computer’s speed or the service’s latency as long as no deadline is missed. This applies the logical-execution-time principle of Giotto and Lingua Franca to AI components </w:t>
+        <w:t xml:space="preserve"> (or the run stops, if so configured). The simulated decision delay is a model parameter, the counterpart of HLA lookahead, and results do not depend on the computer’s speed or the service’s latency as long as no deadline is missed. This applies the logical-execution-time principle of Giotto and Lingua Franca to slow services </w:t>
       </w:r>
       <w:r>
         <w:fldChar w:fldCharType="begin">
@@ -7033,7 +7033,7 @@
 PjxSZWNOdW0+MzM8L1JlY051bT48RGlzcGxheVRleHQ+KEhlbnppbmdlciBldCBhbC4gMjAwMzsg
 TG9oc3Ryb2ggZXQgYWwuIDIwMjEpPC9EaXNwbGF5VGV4dD48cmVjb3JkPjxyZWMtbnVtYmVyPjMz
 PC9yZWMtbnVtYmVyPjxmb3JlaWduLWtleXM+PGtleSBhcHA9IkVOIiBkYi1pZD0ibWRhZTg1MDAx
-MDk0OTZmZWE0YWZmOWMwODZlMTZjYzI1ODk1IiB0aW1lc3RhbXA9IjE3OTMyMjY2MjEiPjMzPC9r
+MDk0OTZmZWE0YWZmOWMwODZlMTZjYzI1ODk1IiB0aW1lc3RhbXA9IjE3OTMyMjkxNzYiPjMzPC9r
 ZXk+PC9mb3JlaWduLWtleXM+PHJlZi10eXBlIG5hbWU9IkpvdXJuYWwgQXJ0aWNsZSI+MTc8L3Jl
 Zi10eXBlPjxjb250cmlidXRvcnM+PGF1dGhvcnM+PGF1dGhvcj5IZW56aW5nZXIsIFQuIEEuPC9h
 dXRob3I+PGF1dGhvcj5Ib3Jvd2l0eiwgQi48L2F1dGhvcj48YXV0aG9yPktpcnNjaCwgQy4gTS48
@@ -7050,7 +7050,7 @@
 QXV0aG9yPkxvaHN0cm9oPC9BdXRob3I+PFllYXI+MjAyMTwvWWVhcj48UmVjTnVtPjUzPC9SZWNO
 dW0+PHJlY29yZD48cmVjLW51bWJlcj41MzwvcmVjLW51bWJlcj48Zm9yZWlnbi1rZXlzPjxrZXkg
 YXBwPSJFTiIgZGItaWQ9Im1kYWU4NTAwMTA5NDk2ZmVhNGFmZjljMDg2ZTE2Y2MyNTg5NSIgdGlt
-ZXN0YW1wPSIxNzkzMjI2NjIxIj41Mzwva2V5PjwvZm9yZWlnbi1rZXlzPjxyZWYtdHlwZSBuYW1l
+ZXN0YW1wPSIxNzkzMjI5MTc2Ij41Mzwva2V5PjwvZm9yZWlnbi1rZXlzPjxyZWYtdHlwZSBuYW1l
 PSJKb3VybmFsIEFydGljbGUiPjE3PC9yZWYtdHlwZT48Y29udHJpYnV0b3JzPjxhdXRob3JzPjxh
 dXRob3I+TG9oc3Ryb2gsIE1hcnRlbjwvYXV0aG9yPjxhdXRob3I+TWVuYXJkLCBDaHJpc3RpYW48
 L2F1dGhvcj48YXV0aG9yPkJhdGVuaSwgU29yb3VzaDwvYXV0aG9yPjxhdXRob3I+TGVlLCBFZHdh
@@ -7077,7 +7077,7 @@
 PjxSZWNOdW0+MzM8L1JlY051bT48RGlzcGxheVRleHQ+KEhlbnppbmdlciBldCBhbC4gMjAwMzsg
 TG9oc3Ryb2ggZXQgYWwuIDIwMjEpPC9EaXNwbGF5VGV4dD48cmVjb3JkPjxyZWMtbnVtYmVyPjMz
 PC9yZWMtbnVtYmVyPjxmb3JlaWduLWtleXM+PGtleSBhcHA9IkVOIiBkYi1pZD0ibWRhZTg1MDAx
-MDk0OTZmZWE0YWZmOWMwODZlMTZjYzI1ODk1IiB0aW1lc3RhbXA9IjE3OTMyMjY2MjEiPjMzPC9r
+MDk0OTZmZWE0YWZmOWMwODZlMTZjYzI1ODk1IiB0aW1lc3RhbXA9IjE3OTMyMjkxNzYiPjMzPC9r
 ZXk+PC9mb3JlaWduLWtleXM+PHJlZi10eXBlIG5hbWU9IkpvdXJuYWwgQXJ0aWNsZSI+MTc8L3Jl
 Zi10eXBlPjxjb250cmlidXRvcnM+PGF1dGhvcnM+PGF1dGhvcj5IZW56aW5nZXIsIFQuIEEuPC9h
 dXRob3I+PGF1dGhvcj5Ib3Jvd2l0eiwgQi48L2F1dGhvcj48YXV0aG9yPktpcnNjaCwgQy4gTS48
@@ -7094,7 +7094,7 @@
 QXV0aG9yPkxvaHN0cm9oPC9BdXRob3I+PFllYXI+MjAyMTwvWWVhcj48UmVjTnVtPjUzPC9SZWNO
 dW0+PHJlY29yZD48cmVjLW51bWJlcj41MzwvcmVjLW51bWJlcj48Zm9yZWlnbi1rZXlzPjxrZXkg
 YXBwPSJFTiIgZGItaWQ9Im1kYWU4NTAwMTA5NDk2ZmVhNGFmZjljMDg2ZTE2Y2MyNTg5NSIgdGlt
-ZXN0YW1wPSIxNzkzMjI2NjIxIj41Mzwva2V5PjwvZm9yZWlnbi1rZXlzPjxyZWYtdHlwZSBuYW1l
+ZXN0YW1wPSIxNzkzMjI5MTc2Ij41Mzwva2V5PjwvZm9yZWlnbi1rZXlzPjxyZWYtdHlwZSBuYW1l
 PSJKb3VybmFsIEFydGljbGUiPjE3PC9yZWYtdHlwZT48Y29udHJpYnV0b3JzPjxhdXRob3JzPjxh
 dXRob3I+TG9oc3Ryb2gsIE1hcnRlbjwvYXV0aG9yPjxhdXRob3I+TWVuYXJkLCBDaHJpc3RpYW48
 L2F1dGhvcj48YXV0aG9yPkJhdGVuaSwgU29yb3VzaDwvYXV0aG9yPjxhdXRob3I+TGVlLCBFZHdh
@@ -7240,7 +7240,7 @@
         <w:fldChar w:fldCharType="begin"/>
       </w:r>
       <w:r>
-        <w:instrText xml:space="preserve"> ADDIN EN.CITE &lt;EndNote&gt;&lt;Cite&gt;&lt;Author&gt;U.S. Department of Energy&lt;/Author&gt;&lt;Year&gt;2024&lt;/Year&gt;&lt;RecNum&gt;20&lt;/RecNum&gt;&lt;DisplayText&gt;(U.S. Department of Energy 2024)&lt;/DisplayText&gt;&lt;record&gt;&lt;rec-number&gt;20&lt;/rec-number&gt;&lt;foreign-keys&gt;&lt;key app="EN" db-id="mdae8500109496fea4aff9c086e16cc25895" timestamp="1793226621"&gt;20&lt;/key&gt;&lt;/foreign-keys&gt;&lt;ref-type name="Web Page"&gt;12&lt;/ref-type&gt;&lt;contributors&gt;&lt;authors&gt;&lt;author&gt;U.S. Department of Energy&lt;/author&gt;&lt;/authors&gt;&lt;/contributors&gt;&lt;titles&gt;&lt;title&gt;EnergyPlus Output Details and Examples: eplusout.rdd&lt;/title&gt;&lt;/titles&gt;&lt;dates&gt;&lt;year&gt;2024&lt;/year&gt;&lt;/dates&gt;&lt;label&gt;doe2024rdd&lt;/label&gt;&lt;urls&gt;&lt;related-urls&gt;&lt;url&gt;https://bigladdersoftware.com/epx/docs/24-1/output-details-and-examples/eplusout-rdd.html&lt;/url&gt;&lt;/related-urls&gt;&lt;/urls&gt;&lt;access-date&gt;2026-10-28&lt;/access-date&gt;&lt;/record&gt;&lt;/Cite&gt;&lt;/EndNote&gt;</w:instrText>
+        <w:instrText xml:space="preserve"> ADDIN EN.CITE &lt;EndNote&gt;&lt;Cite&gt;&lt;Author&gt;U.S. Department of Energy&lt;/Author&gt;&lt;Year&gt;2024&lt;/Year&gt;&lt;RecNum&gt;20&lt;/RecNum&gt;&lt;DisplayText&gt;(U.S. Department of Energy 2024)&lt;/DisplayText&gt;&lt;record&gt;&lt;rec-number&gt;20&lt;/rec-number&gt;&lt;foreign-keys&gt;&lt;key app="EN" db-id="mdae8500109496fea4aff9c086e16cc25895" timestamp="1793229176"&gt;20&lt;/key&gt;&lt;/foreign-keys&gt;&lt;ref-type name="Web Page"&gt;12&lt;/ref-type&gt;&lt;contributors&gt;&lt;authors&gt;&lt;author&gt;U.S. Department of Energy&lt;/author&gt;&lt;/authors&gt;&lt;/contributors&gt;&lt;titles&gt;&lt;title&gt;EnergyPlus Output Details and Examples: eplusout.rdd&lt;/title&gt;&lt;/titles&gt;&lt;dates&gt;&lt;year&gt;2024&lt;/year&gt;&lt;/dates&gt;&lt;label&gt;doe2024rdd&lt;/label&gt;&lt;urls&gt;&lt;related-urls&gt;&lt;url&gt;https://bigladdersoftware.com/epx/docs/24-1/output-details-and-examples/eplusout-rdd.html&lt;/url&gt;&lt;/related-urls&gt;&lt;/urls&gt;&lt;access-date&gt;2026-10-28&lt;/access-date&gt;&lt;/record&gt;&lt;/Cite&gt;&lt;/EndNote&gt;</w:instrText>
       </w:r>
       <w:r>
         <w:fldChar w:fldCharType="separate"/>
@@ -7269,7 +7269,7 @@
         <w:fldChar w:fldCharType="begin"/>
       </w:r>
       <w:r>
-        <w:instrText xml:space="preserve"> ADDIN EN.CITE &lt;EndNote&gt;&lt;Cite&gt;&lt;Author&gt;U.S. Department of Energy&lt;/Author&gt;&lt;Year&gt;2018&lt;/Year&gt;&lt;RecNum&gt;18&lt;/RecNum&gt;&lt;DisplayText&gt;(U.S. Department of Energy 2018; Lawrence Berkeley National Laboratory 2021)&lt;/DisplayText&gt;&lt;record&gt;&lt;rec-number&gt;18&lt;/rec-number&gt;&lt;foreign-keys&gt;&lt;key app="EN" db-id="mdae8500109496fea4aff9c086e16cc25895" timestamp="1793226621"&gt;18&lt;/key&gt;&lt;/foreign-keys&gt;&lt;ref-type name="Web Page"&gt;12&lt;/ref-type&gt;&lt;contributors&gt;&lt;authors&gt;&lt;author&gt;U.S. Department of Energy&lt;/author&gt;&lt;/authors&gt;&lt;/contributors&gt;&lt;titles&gt;&lt;title&gt;EnergyPlus External Interface(s) Application Guide: BCVTB Examples&lt;/title&gt;&lt;/titles&gt;&lt;dates&gt;&lt;year&gt;2018&lt;/year&gt;&lt;/dates&gt;&lt;label&gt;doe_extif&lt;/label&gt;&lt;urls&gt;&lt;related-urls&gt;&lt;url&gt;https://bigladdersoftware.com/epx/docs/9-0/external-interfaces-application-guide/bcvtb-examples.html&lt;/url&gt;&lt;/related-urls&gt;&lt;/urls&gt;&lt;access-date&gt;2026-10-28&lt;/access-date&gt;&lt;/record&gt;&lt;/Cite&gt;&lt;Cite&gt;&lt;Author&gt;Lawrence Berkeley National Laboratory&lt;/Author&gt;&lt;Year&gt;2021&lt;/Year&gt;&lt;RecNum&gt;48&lt;/RecNum&gt;&lt;record&gt;&lt;rec-number&gt;48&lt;/rec-number&gt;&lt;foreign-keys&gt;&lt;key app="EN" db-id="mdae8500109496fea4aff9c086e16cc25895" timestamp="1793226621"&gt;48&lt;/key&gt;&lt;/foreign-keys&gt;&lt;ref-type name="Web Page"&gt;12&lt;/ref-type&gt;&lt;contributors&gt;&lt;authors&gt;&lt;author&gt;Lawrence Berkeley National Laboratory&lt;/author&gt;&lt;/authors&gt;&lt;/contributors&gt;&lt;titles&gt;&lt;title&gt;FMU Export of EnergyPlus User Guide, Section 5: Usage of EnergyPlus as an FMU&lt;/title&gt;&lt;/titles&gt;&lt;dates&gt;&lt;year&gt;2021&lt;/year&gt;&lt;/dates&gt;&lt;label&gt;lbnl_fmuexport&lt;/label&gt;&lt;urls&gt;&lt;related-urls&gt;&lt;url&gt;https://simulationresearch.lbl.gov/fmu/EnergyPlus/export/userGuide/usage.html&lt;/url&gt;&lt;/related-urls&gt;&lt;/urls&gt;&lt;access-date&gt;2026-10-28&lt;/access-date&gt;&lt;/record&gt;&lt;/Cite&gt;&lt;/EndNote&gt;</w:instrText>
+        <w:instrText xml:space="preserve"> ADDIN EN.CITE &lt;EndNote&gt;&lt;Cite&gt;&lt;Author&gt;U.S. Department of Energy&lt;/Author&gt;&lt;Year&gt;2018&lt;/Year&gt;&lt;RecNum&gt;18&lt;/RecNum&gt;&lt;DisplayText&gt;(U.S. Department of Energy 2018; Lawrence Berkeley National Laboratory 2021)&lt;/DisplayText&gt;&lt;record&gt;&lt;rec-number&gt;18&lt;/rec-number&gt;&lt;foreign-keys&gt;&lt;key app="EN" db-id="mdae8500109496fea4aff9c086e16cc25895" timestamp="1793229176"&gt;18&lt;/key&gt;&lt;/foreign-keys&gt;&lt;ref-type name="Web Page"&gt;12&lt;/ref-type&gt;&lt;contributors&gt;&lt;authors&gt;&lt;author&gt;U.S. Department of Energy&lt;/author&gt;&lt;/authors&gt;&lt;/contributors&gt;&lt;titles&gt;&lt;title&gt;EnergyPlus External Interface(s) Application Guide: BCVTB Examples&lt;/title&gt;&lt;/titles&gt;&lt;dates&gt;&lt;year&gt;2018&lt;/year&gt;&lt;/dates&gt;&lt;label&gt;doe_extif&lt;/label&gt;&lt;urls&gt;&lt;related-urls&gt;&lt;url&gt;https://bigladdersoftware.com/epx/docs/9-0/external-interfaces-application-guide/bcvtb-examples.html&lt;/url&gt;&lt;/related-urls&gt;&lt;/urls&gt;&lt;access-date&gt;2026-10-28&lt;/access-date&gt;&lt;/record&gt;&lt;/Cite&gt;&lt;Cite&gt;&lt;Author&gt;Lawrence Berkeley National Laboratory&lt;/Author&gt;&lt;Year&gt;2021&lt;/Year&gt;&lt;RecNum&gt;48&lt;/RecNum&gt;&lt;record&gt;&lt;rec-number&gt;48&lt;/rec-number&gt;&lt;foreign-keys&gt;&lt;key app="EN" db-id="mdae8500109496fea4aff9c086e16cc25895" timestamp="1793229176"&gt;48&lt;/key&gt;&lt;/foreign-keys&gt;&lt;ref-type name="Web Page"&gt;12&lt;/ref-type&gt;&lt;contributors&gt;&lt;authors&gt;&lt;author&gt;Lawrence Berkeley National Laboratory&lt;/author&gt;&lt;/authors&gt;&lt;/contributors&gt;&lt;titles&gt;&lt;title&gt;FMU Export of EnergyPlus User Guide, Section 5: Usage of EnergyPlus as an FMU&lt;/title&gt;&lt;/titles&gt;&lt;dates&gt;&lt;year&gt;2021&lt;/year&gt;&lt;/dates&gt;&lt;label&gt;lbnl_fmuexport&lt;/label&gt;&lt;urls&gt;&lt;related-urls&gt;&lt;url&gt;https://simulationresearch.lbl.gov/fmu/EnergyPlus/export/userGuide/usage.html&lt;/url&gt;&lt;/related-urls&gt;&lt;/urls&gt;&lt;access-date&gt;2026-10-28&lt;/access-date&gt;&lt;/record&gt;&lt;/Cite&gt;&lt;/EndNote&gt;</w:instrText>
       </w:r>
       <w:r>
         <w:fldChar w:fldCharType="separate"/>
@@ -7317,7 +7317,7 @@
         <w:fldChar w:fldCharType="begin"/>
       </w:r>
       <w:r>
-        <w:instrText xml:space="preserve"> ADDIN EN.CITE &lt;EndNote&gt;&lt;Cite&gt;&lt;Author&gt;Dobos&lt;/Author&gt;&lt;Year&gt;2014&lt;/Year&gt;&lt;RecNum&gt;17&lt;/RecNum&gt;&lt;DisplayText&gt;(Dobos 2014)&lt;/DisplayText&gt;&lt;record&gt;&lt;rec-number&gt;17&lt;/rec-number&gt;&lt;foreign-keys&gt;&lt;key app="EN" db-id="mdae8500109496fea4aff9c086e16cc25895" timestamp="1793226621"&gt;17&lt;/key&gt;&lt;/foreign-keys&gt;&lt;ref-type name="Report"&gt;27&lt;/ref-type&gt;&lt;contributors&gt;&lt;authors&gt;&lt;author&gt;Dobos, A. P.&lt;/author&gt;&lt;/authors&gt;&lt;/contributors&gt;&lt;titles&gt;&lt;title&gt;PVWatts Version 5 Manual&lt;/title&gt;&lt;/titles&gt;&lt;dates&gt;&lt;year&gt;2014&lt;/year&gt;&lt;/dates&gt;&lt;pub-location&gt;Golden, CO&lt;/pub-location&gt;&lt;publisher&gt;National Renewable Energy Laboratory&lt;/publisher&gt;&lt;isbn&gt;NREL/TP-6A20-62641&lt;/isbn&gt;&lt;label&gt;dobos2014&lt;/label&gt;&lt;work-type&gt;Technical Report&lt;/work-type&gt;&lt;urls&gt;&lt;/urls&gt;&lt;electronic-resource-num&gt;10.2172/1158421&lt;/electronic-resource-num&gt;&lt;/record&gt;&lt;/Cite&gt;&lt;/EndNote&gt;</w:instrText>
+        <w:instrText xml:space="preserve"> ADDIN EN.CITE &lt;EndNote&gt;&lt;Cite&gt;&lt;Author&gt;Dobos&lt;/Author&gt;&lt;Year&gt;2014&lt;/Year&gt;&lt;RecNum&gt;17&lt;/RecNum&gt;&lt;DisplayText&gt;(Dobos 2014)&lt;/DisplayText&gt;&lt;record&gt;&lt;rec-number&gt;17&lt;/rec-number&gt;&lt;foreign-keys&gt;&lt;key app="EN" db-id="mdae8500109496fea4aff9c086e16cc25895" timestamp="1793229176"&gt;17&lt;/key&gt;&lt;/foreign-keys&gt;&lt;ref-type name="Report"&gt;27&lt;/ref-type&gt;&lt;contributors&gt;&lt;authors&gt;&lt;author&gt;Dobos, A. P.&lt;/author&gt;&lt;/authors&gt;&lt;/contributors&gt;&lt;titles&gt;&lt;title&gt;PVWatts Version 5 Manual&lt;/title&gt;&lt;/titles&gt;&lt;dates&gt;&lt;year&gt;2014&lt;/year&gt;&lt;/dates&gt;&lt;pub-location&gt;Golden, CO&lt;/pub-location&gt;&lt;publisher&gt;National Renewable Energy Laboratory&lt;/publisher&gt;&lt;isbn&gt;NREL/TP-6A20-62641&lt;/isbn&gt;&lt;label&gt;dobos2014&lt;/label&gt;&lt;work-type&gt;Technical Report&lt;/work-type&gt;&lt;urls&gt;&lt;/urls&gt;&lt;electronic-resource-num&gt;10.2172/1158421&lt;/electronic-resource-num&gt;&lt;/record&gt;&lt;/Cite&gt;&lt;/EndNote&gt;</w:instrText>
       </w:r>
       <w:r>
         <w:fldChar w:fldCharType="separate"/>
@@ -7338,7 +7338,7 @@
         <w:fldChar w:fldCharType="begin"/>
       </w:r>
       <w:r>
-        <w:instrText xml:space="preserve"> ADDIN EN.CITE &lt;EndNote&gt;&lt;Cite&gt;&lt;Author&gt;Federal Highway Administration&lt;/Author&gt;&lt;Year&gt;2017&lt;/Year&gt;&lt;RecNum&gt;22&lt;/RecNum&gt;&lt;DisplayText&gt;(Federal Highway Administration 2017)&lt;/DisplayText&gt;&lt;record&gt;&lt;rec-number&gt;22&lt;/rec-number&gt;&lt;foreign-keys&gt;&lt;key app="EN" db-id="mdae8500109496fea4aff9c086e16cc25895" timestamp="1793226621"&gt;22&lt;/key&gt;&lt;/foreign-keys&gt;&lt;ref-type name="Web Page"&gt;12&lt;/ref-type&gt;&lt;contributors&gt;&lt;authors&gt;&lt;author&gt;Federal Highway Administration&lt;/author&gt;&lt;/authors&gt;&lt;/contributors&gt;&lt;titles&gt;&lt;title&gt;2017 National Household Travel Survey&lt;/title&gt;&lt;/titles&gt;&lt;dates&gt;&lt;year&gt;2017&lt;/year&gt;&lt;/dates&gt;&lt;publisher&gt;U.S. Department of Transportation&lt;/publisher&gt;&lt;label&gt;fhwa2017&lt;/label&gt;&lt;urls&gt;&lt;related-urls&gt;&lt;url&gt;https://nhts.ornl.gov&lt;/url&gt;&lt;/related-urls&gt;&lt;/urls&gt;&lt;access-date&gt;2026-10-28&lt;/access-date&gt;&lt;/record&gt;&lt;/Cite&gt;&lt;/EndNote&gt;</w:instrText>
+        <w:instrText xml:space="preserve"> ADDIN EN.CITE &lt;EndNote&gt;&lt;Cite&gt;&lt;Author&gt;Federal Highway Administration&lt;/Author&gt;&lt;Year&gt;2017&lt;/Year&gt;&lt;RecNum&gt;22&lt;/RecNum&gt;&lt;DisplayText&gt;(Federal Highway Administration 2017)&lt;/DisplayText&gt;&lt;record&gt;&lt;rec-number&gt;22&lt;/rec-number&gt;&lt;foreign-keys&gt;&lt;key app="EN" db-id="mdae8500109496fea4aff9c086e16cc25895" timestamp="1793229176"&gt;22&lt;/key&gt;&lt;/foreign-keys&gt;&lt;ref-type name="Web Page"&gt;12&lt;/ref-type&gt;&lt;contributors&gt;&lt;authors&gt;&lt;author&gt;Federal Highway Administration&lt;/author&gt;&lt;/authors&gt;&lt;/contributors&gt;&lt;titles&gt;&lt;title&gt;2017 National Household Travel Survey&lt;/title&gt;&lt;/titles&gt;&lt;dates&gt;&lt;year&gt;2017&lt;/year&gt;&lt;/dates&gt;&lt;publisher&gt;U.S. Department of Transportation&lt;/publisher&gt;&lt;label&gt;fhwa2017&lt;/label&gt;&lt;urls&gt;&lt;related-urls&gt;&lt;url&gt;https://nhts.ornl.gov&lt;/url&gt;&lt;/related-urls&gt;&lt;/urls&gt;&lt;access-date&gt;2026-10-28&lt;/access-date&gt;&lt;/record&gt;&lt;/Cite&gt;&lt;/EndNote&gt;</w:instrText>
       </w:r>
       <w:r>
         <w:fldChar w:fldCharType="separate"/>
@@ -7462,7 +7462,7 @@
         <w:fldChar w:fldCharType="begin"/>
       </w:r>
       <w:r>
-        <w:instrText xml:space="preserve"> ADDIN EN.CITE &lt;EndNote&gt;&lt;Cite&gt;&lt;Author&gt;Crawley&lt;/Author&gt;&lt;Year&gt;2001&lt;/Year&gt;&lt;RecNum&gt;13&lt;/RecNum&gt;&lt;DisplayText&gt;(Crawley et al. 2001)&lt;/DisplayText&gt;&lt;record&gt;&lt;rec-number&gt;13&lt;/rec-number&gt;&lt;foreign-keys&gt;&lt;key app="EN" db-id="mdae8500109496fea4aff9c086e16cc25895" timestamp="1793226621"&gt;13&lt;/key&gt;&lt;/foreign-keys&gt;&lt;ref-type name="Journal Article"&gt;17&lt;/ref-type&gt;&lt;contributors&gt;&lt;authors&gt;&lt;author&gt;Crawley, Drury B.&lt;/author&gt;&lt;author&gt;Lawrie, Linda K.&lt;/author&gt;&lt;author&gt;Winkelmann, Frederick C.&lt;/author&gt;&lt;author&gt;Buhl, W. F.&lt;/author&gt;&lt;author&gt;Huang, Y. Joe&lt;/author&gt;&lt;author&gt;Pedersen, Curtis O.&lt;/author&gt;&lt;author&gt;Strand, Richard K.&lt;/author&gt;&lt;author&gt;Liesen, Richard J.&lt;/author&gt;&lt;author&gt;Fisher, Daniel E.&lt;/author&gt;&lt;author&gt;Witte, Michael J.&lt;/author&gt;&lt;author&gt;Glazer, Jason&lt;/author&gt;&lt;/authors&gt;&lt;/contributors&gt;&lt;titles&gt;&lt;title&gt;EnergyPlus: creating a new-generation building energy simulation program&lt;/title&gt;&lt;secondary-title&gt;Energy and Buildings&lt;/secondary-title&gt;&lt;alt-title&gt;Energy Build.&lt;/alt-title&gt;&lt;/titles&gt;&lt;periodical&gt;&lt;full-title&gt;Energy and Buildings&lt;/full-title&gt;&lt;abbr-1&gt;Energy Build.&lt;/abbr-1&gt;&lt;/periodical&gt;&lt;pages&gt;319-331&lt;/pages&gt;&lt;volume&gt;33&lt;/volume&gt;&lt;number&gt;4&lt;/number&gt;&lt;dates&gt;&lt;year&gt;2001&lt;/year&gt;&lt;/dates&gt;&lt;publisher&gt;Elsevier&lt;/publisher&gt;&lt;label&gt;crawley2001&lt;/label&gt;&lt;urls&gt;&lt;/urls&gt;&lt;electronic-resource-num&gt;10.1016/S0378-7788(00)00114-6&lt;/electronic-resource-num&gt;&lt;/record&gt;&lt;/Cite&gt;&lt;/EndNote&gt;</w:instrText>
+        <w:instrText xml:space="preserve"> ADDIN EN.CITE &lt;EndNote&gt;&lt;Cite&gt;&lt;Author&gt;Crawley&lt;/Author&gt;&lt;Year&gt;2001&lt;/Year&gt;&lt;RecNum&gt;13&lt;/RecNum&gt;&lt;DisplayText&gt;(Crawley et al. 2001)&lt;/DisplayText&gt;&lt;record&gt;&lt;rec-number&gt;13&lt;/rec-number&gt;&lt;foreign-keys&gt;&lt;key app="EN" db-id="mdae8500109496fea4aff9c086e16cc25895" timestamp="1793229176"&gt;13&lt;/key&gt;&lt;/foreign-keys&gt;&lt;ref-type name="Journal Article"&gt;17&lt;/ref-type&gt;&lt;contributors&gt;&lt;authors&gt;&lt;author&gt;Crawley, Drury B.&lt;/author&gt;&lt;author&gt;Lawrie, Linda K.&lt;/author&gt;&lt;author&gt;Winkelmann, Frederick C.&lt;/author&gt;&lt;author&gt;Buhl, W. F.&lt;/author&gt;&lt;author&gt;Huang, Y. Joe&lt;/author&gt;&lt;author&gt;Pedersen, Curtis O.&lt;/author&gt;&lt;author&gt;Strand, Richard K.&lt;/author&gt;&lt;author&gt;Liesen, Richard J.&lt;/author&gt;&lt;author&gt;Fisher, Daniel E.&lt;/author&gt;&lt;author&gt;Witte, Michael J.&lt;/author&gt;&lt;author&gt;Glazer, Jason&lt;/author&gt;&lt;/authors&gt;&lt;/contributors&gt;&lt;titles&gt;&lt;title&gt;EnergyPlus: creating a new-generation building energy simulation program&lt;/title&gt;&lt;secondary-title&gt;Energy and Buildings&lt;/secondary-title&gt;&lt;alt-title&gt;Energy Build.&lt;/alt-title&gt;&lt;/titles&gt;&lt;periodical&gt;&lt;full-title&gt;Energy and Buildings&lt;/full-title&gt;&lt;abbr-1&gt;Energy Build.&lt;/abbr-1&gt;&lt;/periodical&gt;&lt;pages&gt;319-331&lt;/pages&gt;&lt;volume&gt;33&lt;/volume&gt;&lt;number&gt;4&lt;/number&gt;&lt;dates&gt;&lt;year&gt;2001&lt;/year&gt;&lt;/dates&gt;&lt;publisher&gt;Elsevier&lt;/publisher&gt;&lt;label&gt;crawley2001&lt;/label&gt;&lt;urls&gt;&lt;/urls&gt;&lt;electronic-resource-num&gt;10.1016/S0378-7788(00)00114-6&lt;/electronic-resource-num&gt;&lt;/record&gt;&lt;/Cite&gt;&lt;/EndNote&gt;</w:instrText>
       </w:r>
       <w:r>
         <w:fldChar w:fldCharType="separate"/>
@@ -7492,7 +7492,7 @@
         <w:fldChar w:fldCharType="begin"/>
       </w:r>
       <w:r>
-        <w:instrText xml:space="preserve"> ADDIN EN.CITE &lt;EndNote&gt;&lt;Cite&gt;&lt;Author&gt;Deru&lt;/Author&gt;&lt;Year&gt;2011&lt;/Year&gt;&lt;RecNum&gt;15&lt;/RecNum&gt;&lt;DisplayText&gt;(Deru et al. 2011)&lt;/DisplayText&gt;&lt;record&gt;&lt;rec-number&gt;15&lt;/rec-number&gt;&lt;foreign-keys&gt;&lt;key app="EN" db-id="mdae8500109496fea4aff9c086e16cc25895" timestamp="1793226621"&gt;15&lt;/key&gt;&lt;/foreign-keys&gt;&lt;ref-type name="Report"&gt;27&lt;/ref-type&gt;&lt;contributors&gt;&lt;authors&gt;&lt;author&gt;Deru, M.&lt;/author&gt;&lt;author&gt;Field, K.&lt;/author&gt;&lt;author&gt;Studer, D.&lt;/author&gt;&lt;author&gt;Benne, K.&lt;/author&gt;&lt;author&gt;Griffith, B.&lt;/author&gt;&lt;author&gt;Torcellini, P.&lt;/author&gt;&lt;author&gt;Liu, B.&lt;/author&gt;&lt;author&gt;Halverson, M.&lt;/author&gt;&lt;author&gt;Winiarski, D.&lt;/author&gt;&lt;author&gt;Rosenberg, M.&lt;/author&gt;&lt;author&gt;Yazdanian, M.&lt;/author&gt;&lt;author&gt;Huang, J.&lt;/author&gt;&lt;author&gt;Crawley, D.&lt;/author&gt;&lt;/authors&gt;&lt;/contributors&gt;&lt;titles&gt;&lt;title&gt;U.S. Department of Energy Commercial Reference Building Models of the National Building Stock&lt;/title&gt;&lt;/titles&gt;&lt;dates&gt;&lt;year&gt;2011&lt;/year&gt;&lt;/dates&gt;&lt;pub-location&gt;Golden, CO&lt;/pub-location&gt;&lt;publisher&gt;National Renewable Energy Laboratory&lt;/publisher&gt;&lt;isbn&gt;NREL/TP-5500-46861&lt;/isbn&gt;&lt;label&gt;deru2011&lt;/label&gt;&lt;work-type&gt;Technical Report&lt;/work-type&gt;&lt;urls&gt;&lt;/urls&gt;&lt;electronic-resource-num&gt;10.2172/1009264&lt;/electronic-resource-num&gt;&lt;/record&gt;&lt;/Cite&gt;&lt;/EndNote&gt;</w:instrText>
+        <w:instrText xml:space="preserve"> ADDIN EN.CITE &lt;EndNote&gt;&lt;Cite&gt;&lt;Author&gt;Deru&lt;/Author&gt;&lt;Year&gt;2011&lt;/Year&gt;&lt;RecNum&gt;15&lt;/RecNum&gt;&lt;DisplayText&gt;(Deru et al. 2011)&lt;/DisplayText&gt;&lt;record&gt;&lt;rec-number&gt;15&lt;/rec-number&gt;&lt;foreign-keys&gt;&lt;key app="EN" db-id="mdae8500109496fea4aff9c086e16cc25895" timestamp="1793229176"&gt;15&lt;/key&gt;&lt;/foreign-keys&gt;&lt;ref-type name="Report"&gt;27&lt;/ref-type&gt;&lt;contributors&gt;&lt;authors&gt;&lt;author&gt;Deru, M.&lt;/author&gt;&lt;author&gt;Field, K.&lt;/author&gt;&lt;author&gt;Studer, D.&lt;/author&gt;&lt;author&gt;Benne, K.&lt;/author&gt;&lt;author&gt;Griffith, B.&lt;/author&gt;&lt;author&gt;Torcellini, P.&lt;/author&gt;&lt;author&gt;Liu, B.&lt;/author&gt;&lt;author&gt;Halverson, M.&lt;/author&gt;&lt;author&gt;Winiarski, D.&lt;/author&gt;&lt;author&gt;Rosenberg, M.&lt;/author&gt;&lt;author&gt;Yazdanian, M.&lt;/author&gt;&lt;author&gt;Huang, J.&lt;/author&gt;&lt;author&gt;Crawley, D.&lt;/author&gt;&lt;/authors&gt;&lt;/contributors&gt;&lt;titles&gt;&lt;title&gt;U.S. Department of Energy Commercial Reference Building Models of the National Building Stock&lt;/title&gt;&lt;/titles&gt;&lt;dates&gt;&lt;year&gt;2011&lt;/year&gt;&lt;/dates&gt;&lt;pub-location&gt;Golden, CO&lt;/pub-location&gt;&lt;publisher&gt;National Renewable Energy Laboratory&lt;/publisher&gt;&lt;isbn&gt;NREL/TP-5500-46861&lt;/isbn&gt;&lt;label&gt;deru2011&lt;/label&gt;&lt;work-type&gt;Technical Report&lt;/work-type&gt;&lt;urls&gt;&lt;/urls&gt;&lt;electronic-resource-num&gt;10.2172/1009264&lt;/electronic-resource-num&gt;&lt;/record&gt;&lt;/Cite&gt;&lt;/EndNote&gt;</w:instrText>
       </w:r>
       <w:r>
         <w:fldChar w:fldCharType="separate"/>
@@ -7513,7 +7513,7 @@
         <w:fldChar w:fldCharType="begin"/>
       </w:r>
       <w:r>
-        <w:instrText xml:space="preserve"> ADDIN EN.CITE &lt;EndNote&gt;&lt;Cite&gt;&lt;Author&gt;Wilcox&lt;/Author&gt;&lt;Year&gt;2008&lt;/Year&gt;&lt;RecNum&gt;97&lt;/RecNum&gt;&lt;DisplayText&gt;(Wilcox and Marion 2008)&lt;/DisplayText&gt;&lt;record&gt;&lt;rec-number&gt;97&lt;/rec-number&gt;&lt;foreign-keys&gt;&lt;key app="EN" db-id="mdae8500109496fea4aff9c086e16cc25895" timestamp="1793226621"&gt;97&lt;/key&gt;&lt;/foreign-keys&gt;&lt;ref-type name="Report"&gt;27&lt;/ref-type&gt;&lt;contributors&gt;&lt;authors&gt;&lt;author&gt;Wilcox, S.&lt;/author&gt;&lt;author&gt;Marion, W.&lt;/author&gt;&lt;/authors&gt;&lt;/contributors&gt;&lt;titles&gt;&lt;title&gt;Users Manual for TMY3 Data Sets&lt;/title&gt;&lt;/titles&gt;&lt;dates&gt;&lt;year&gt;2008&lt;/year&gt;&lt;/dates&gt;&lt;pub-location&gt;Golden, CO&lt;/pub-location&gt;&lt;publisher&gt;National Renewable Energy Laboratory&lt;/publisher&gt;&lt;isbn&gt;NREL/TP-581-43156&lt;/isbn&gt;&lt;label&gt;wilcox2008&lt;/label&gt;&lt;work-type&gt;Technical Report&lt;/work-type&gt;&lt;urls&gt;&lt;related-urls&gt;&lt;url&gt;https://www.nrel.gov/docs/fy08osti/43156.pdf&lt;/url&gt;&lt;/related-urls&gt;&lt;/urls&gt;&lt;/record&gt;&lt;/Cite&gt;&lt;/EndNote&gt;</w:instrText>
+        <w:instrText xml:space="preserve"> ADDIN EN.CITE &lt;EndNote&gt;&lt;Cite&gt;&lt;Author&gt;Wilcox&lt;/Author&gt;&lt;Year&gt;2008&lt;/Year&gt;&lt;RecNum&gt;97&lt;/RecNum&gt;&lt;DisplayText&gt;(Wilcox and Marion 2008)&lt;/DisplayText&gt;&lt;record&gt;&lt;rec-number&gt;97&lt;/rec-number&gt;&lt;foreign-keys&gt;&lt;key app="EN" db-id="mdae8500109496fea4aff9c086e16cc25895" timestamp="1793229176"&gt;97&lt;/key&gt;&lt;/foreign-keys&gt;&lt;ref-type name="Report"&gt;27&lt;/ref-type&gt;&lt;contributors&gt;&lt;authors&gt;&lt;author&gt;Wilcox, S.&lt;/author&gt;&lt;author&gt;Marion, W.&lt;/author&gt;&lt;/authors&gt;&lt;/contributors&gt;&lt;titles&gt;&lt;title&gt;Users Manual for TMY3 Data Sets&lt;/title&gt;&lt;/titles&gt;&lt;dates&gt;&lt;year&gt;2008&lt;/year&gt;&lt;/dates&gt;&lt;pub-location&gt;Golden, CO&lt;/pub-location&gt;&lt;publisher&gt;National Renewable Energy Laboratory&lt;/publisher&gt;&lt;isbn&gt;NREL/TP-581-43156&lt;/isbn&gt;&lt;label&gt;wilcox2008&lt;/label&gt;&lt;work-type&gt;Technical Report&lt;/work-type&gt;&lt;urls&gt;&lt;related-urls&gt;&lt;url&gt;https://www.nrel.gov/docs/fy08osti/43156.pdf&lt;/url&gt;&lt;/related-urls&gt;&lt;/urls&gt;&lt;/record&gt;&lt;/Cite&gt;&lt;/EndNote&gt;</w:instrText>
       </w:r>
       <w:r>
         <w:fldChar w:fldCharType="separate"/>
@@ -7857,6 +7857,24 @@
     </w:p>
     <w:p>
       <w:pPr>
+        <w:pStyle w:val="Heading2"/>
+      </w:pPr>
+      <w:bookmarkStart w:id="17" w:name="_Ref_sec_e3"/>
+      <w:r>
+        <w:t xml:space="preserve">Reproducibility with a non-deterministic supervisor</w:t>
+      </w:r>
+      <w:bookmarkEnd w:id="17"/>
+    </w:p>
+    <w:p>
+      <w:pPr>
+        <w:pStyle w:val="BodyText"/>
+      </w:pPr>
+      <w:r>
+        <w:t xml:space="preserve">The office is now supervised by an LLM supervisor component that decides the cooling set-point every hour from the core-zone temperature, the outdoor temperature and the price. Its back end is a stochastic stand-in for a hosted LLM: it draws a random offset (standard deviation 1 K, rounded to 0.5 K) around a rule-based answer, with an unseeded random generator, so each run differs as a sampled LLM would. The stand-in is not a language model; it imitates the property that matters here.</w:t>
+      </w:r>
+    </w:p>
+    <w:p>
+      <w:pPr>
         <w:pStyle w:val="Figure"/>
       </w:pPr>
       <w:r>
@@ -7908,7 +7926,7 @@
         </w:rPr>
         <w:t xml:space="preserve">Fig. </w:t>
       </w:r>
-      <w:bookmarkStart w:id="17" w:name="_Ref_fig_e2b"/>
+      <w:bookmarkStart w:id="18" w:name="_Ref_fig_e2b"/>
       <w:r>
         <w:rPr>
           <w:b/>
@@ -7944,7 +7962,7 @@
         </w:rPr>
         <w:fldChar w:fldCharType="end"/>
       </w:r>
-      <w:bookmarkEnd w:id="17"/>
+      <w:bookmarkEnd w:id="18"/>
       <w:r>
         <w:rPr>
           <w:b/>
@@ -7961,87 +7979,69 @@
     </w:p>
     <w:p>
       <w:pPr>
+        <w:pStyle w:val="BodyText"/>
+      </w:pPr>
+      <w:r>
+        <w:t xml:space="preserve">Five live runs differ substantially (</w:t>
+      </w:r>
+      <w:r>
+        <w:t xml:space="preserve">Fig. </w:t>
+      </w:r>
+      <w:r>
+        <w:fldChar w:fldCharType="begin"/>
+      </w:r>
+      <w:r>
+        <w:instrText xml:space="preserve"> REF _Ref_fig_e3a \h </w:instrText>
+      </w:r>
+      <w:r>
+        <w:fldChar w:fldCharType="separate"/>
+      </w:r>
+      <w:r>
+        <w:t>5</w:t>
+      </w:r>
+      <w:r>
+        <w:fldChar w:fldCharType="end"/>
+      </w:r>
+      <w:r>
+        <w:t xml:space="preserve">). The hourly set-points of runs 1 and 2 differ by up to 4 K, the core-zone temperature by up to 4.0 K and the facility power by up to 6.2 kW at individual steps. The weekly energy varies between runs by 11.8 kWh (standard deviation 5.0 kWh, 0.3 %) and the cost by 1.87 $. Run 1 recorded the 672 messages of the supervisor. Replaying them into a new run, with the supervisor replaced by its recording, reproduced run 1 exactly: the maximum absolute difference over all physical outputs (zone temperatures, power, set-points, energy and cost) was zero.</w:t>
+      </w:r>
+    </w:p>
+    <w:p>
+      <w:pPr>
+        <w:pStyle w:val="BodyText"/>
+      </w:pPr>
+      <w:r>
+        <w:t xml:space="preserve">Replay also enables controlled comparisons. Suppose the question is how much a 30 % reduction of lighting power saves when the building is operated by the same stochastic supervisor. Comparing each live base run with a live run of the retrofitted building mixes the retrofit effect with fresh random decisions; the five estimates range from 8.0 % to 9.0 % (8.57 ± 0.38 %). Replaying each base run’s decisions into the retrofitted building holds the decisions fixed, as in the method of common random numbers. The five estimates then agree within 0.04 percentage points (8.56 ± 0.016 %), a 24-fold reduction of the spread (</w:t>
+      </w:r>
+      <w:r>
+        <w:t xml:space="preserve">Fig. </w:t>
+      </w:r>
+      <w:r>
+        <w:fldChar w:fldCharType="begin"/>
+      </w:r>
+      <w:r>
+        <w:instrText xml:space="preserve"> REF _Ref_fig_e3a \h </w:instrText>
+      </w:r>
+      <w:r>
+        <w:fldChar w:fldCharType="separate"/>
+      </w:r>
+      <w:r>
+        <w:t>5</w:t>
+      </w:r>
+      <w:r>
+        <w:fldChar w:fldCharType="end"/>
+      </w:r>
+      <w:r>
+        <w:t xml:space="preserve">(b)). The replayed comparison answers a narrower question, the effect of the retrofit under identical decisions rather than under decisions that react to the retrofitted building, and the two should be reported for what they are.</w:t>
+      </w:r>
+    </w:p>
+    <w:p>
+      <w:pPr>
         <w:pStyle w:val="Heading2"/>
       </w:pPr>
-      <w:bookmarkStart w:id="18" w:name="_Ref_sec_e3"/>
-      <w:r>
-        <w:t xml:space="preserve">Reproducibility with a non-deterministic AI supervisor</w:t>
-      </w:r>
-      <w:bookmarkEnd w:id="18"/>
-    </w:p>
-    <w:p>
-      <w:pPr>
-        <w:pStyle w:val="BodyText"/>
-      </w:pPr>
-      <w:r>
-        <w:t xml:space="preserve">The office is now supervised by an LLM supervisor component that decides the cooling set-point every hour from the core-zone temperature, the outdoor temperature and the price. Its back end is a stochastic stand-in for a hosted LLM: it draws a random offset (standard deviation 1 K, rounded to 0.5 K) around a rule-based answer, with an unseeded random generator, so each run differs as a sampled LLM would. The stand-in is not a language model; it imitates the property that matters here.</w:t>
-      </w:r>
-    </w:p>
-    <w:p>
-      <w:pPr>
-        <w:pStyle w:val="BodyText"/>
-      </w:pPr>
-      <w:r>
-        <w:t xml:space="preserve">Five live runs differ substantially (</w:t>
-      </w:r>
-      <w:r>
-        <w:t xml:space="preserve">Fig. </w:t>
-      </w:r>
-      <w:r>
-        <w:fldChar w:fldCharType="begin"/>
-      </w:r>
-      <w:r>
-        <w:instrText xml:space="preserve"> REF _Ref_fig_e3a \h </w:instrText>
-      </w:r>
-      <w:r>
-        <w:fldChar w:fldCharType="separate"/>
-      </w:r>
-      <w:r>
-        <w:t>5</w:t>
-      </w:r>
-      <w:r>
-        <w:fldChar w:fldCharType="end"/>
-      </w:r>
-      <w:r>
-        <w:t xml:space="preserve">). The hourly set-points of runs 1 and 2 differ by up to 4 K, the core-zone temperature by up to 4.0 K and the facility power by up to 6.2 kW at individual steps. The weekly energy varies between runs by 11.8 kWh (standard deviation 5.0 kWh, 0.3 %) and the cost by 1.87 $. Run 1 recorded the 672 messages of the supervisor. Replaying them into a new run, with the supervisor replaced by its recording, reproduced run 1 exactly: the maximum absolute difference over all physical outputs (zone temperatures, power, set-points, energy and cost) was zero.</w:t>
-      </w:r>
-    </w:p>
-    <w:p>
-      <w:pPr>
-        <w:pStyle w:val="BodyText"/>
-      </w:pPr>
-      <w:r>
-        <w:t xml:space="preserve">Replay also enables controlled comparisons. Suppose the question is how much a 30 % reduction of lighting power saves when the building is operated by the same AI supervisor. Comparing each live base run with a live run of the retrofitted building mixes the retrofit effect with fresh random decisions; the five estimates range from 8.0 % to 9.0 % (8.57 ± 0.38 %). Replaying each base run’s decisions into the retrofitted building holds the decisions fixed, as in the method of common random numbers. The five estimates then agree within 0.04 percentage points (8.56 ± 0.016 %), a 24-fold reduction of the spread (</w:t>
-      </w:r>
-      <w:r>
-        <w:t xml:space="preserve">Fig. </w:t>
-      </w:r>
-      <w:r>
-        <w:fldChar w:fldCharType="begin"/>
-      </w:r>
-      <w:r>
-        <w:instrText xml:space="preserve"> REF _Ref_fig_e3a \h </w:instrText>
-      </w:r>
-      <w:r>
-        <w:fldChar w:fldCharType="separate"/>
-      </w:r>
-      <w:r>
-        <w:t>5</w:t>
-      </w:r>
-      <w:r>
-        <w:fldChar w:fldCharType="end"/>
-      </w:r>
-      <w:r>
-        <w:t xml:space="preserve">(b)). The replayed comparison answers a narrower question, the effect of the retrofit under identical decisions rather than under decisions that react to the retrofitted building, and the two should be reported for what they are.</w:t>
-      </w:r>
-    </w:p>
-    <w:p>
-      <w:pPr>
-        <w:pStyle w:val="Heading2"/>
-      </w:pPr>
       <w:bookmarkStart w:id="19" w:name="_Ref_sec_e4"/>
       <w:r>
-        <w:t xml:space="preserve">Slow AI components</w:t>
+        <w:t xml:space="preserve">Slow components</w:t>
       </w:r>
       <w:bookmarkEnd w:id="19"/>
     </w:p>
@@ -8084,7 +8084,7 @@
           <wp:inline distT="0" distB="0" distL="0" distR="0">
             <wp:extent cx="5943600" cy="2743200"/>
             <wp:effectExtent l="0" t="0" r="0" b="0"/>
-            <wp:docPr id="5" name="Figure 5" descr="Record and replay with a stochastic AI supervisor: (a) cooling set-points chosen on 18 July in five live runs and in the replay of run 1, which coincides with run 1; (b) savings of a lighting retrofit"/>
+            <wp:docPr id="5" name="Figure 5" descr="Record and replay with a stochastic supervisor (stand-in for an LLM service): (a) cooling set-points chosen on 18 July in five live runs and in the replay of run 1, which coincides with run 1; (b) sav"/>
             <wp:cNvGraphicFramePr>
               <a:graphicFrameLocks noChangeAspect="1"/>
             </wp:cNvGraphicFramePr>
@@ -8176,7 +8176,7 @@
         <w:t xml:space="preserve"> </w:t>
       </w:r>
       <w:r>
-        <w:t xml:space="preserve">Record and replay with a stochastic AI supervisor: (a) cooling set-points chosen on 18 July in five live runs and in the replay of run 1, which coincides with run 1; (b) savings of a lighting retrofit estimated from pairs of live runs and from live runs paired with replays of their decisions in the retrofitted building.</w:t>
+        <w:t xml:space="preserve">Record and replay with a stochastic supervisor (stand-in for an LLM service): (a) cooling set-points chosen on 18 July in five live runs and in the replay of run 1, which coincides with run 1; (b) savings of a lighting retrofit estimated from pairs of live runs and from live runs paired with replays of their decisions in the retrofitted building.</w:t>
       </w:r>
     </w:p>
     <w:p>
@@ -8237,7 +8237,7 @@
           <wp:inline distT="0" distB="0" distL="0" distR="0">
             <wp:extent cx="3200406" cy="2377444"/>
             <wp:effectExtent l="0" t="0" r="0" b="0"/>
-            <wp:docPr id="6" name="Figure 6" descr="Wall-clock time of a two-day co-simulation of N EnergyPlus offices, each with an AI supervisor whose calls take 0.5 s (median), with blocking calls and with asynchronous delivery by TIDE (decision del"/>
+            <wp:docPr id="6" name="Figure 6" descr="Wall-clock time of a two-day co-simulation of N EnergyPlus offices, each with a slow supervisor whose calls take 0.5 s (median; stand-in for an LLM service), with blocking calls and with asynchronous "/>
             <wp:cNvGraphicFramePr>
               <a:graphicFrameLocks noChangeAspect="1"/>
             </wp:cNvGraphicFramePr>
@@ -8340,7 +8340,7 @@
         </m:r>
       </m:oMath>
       <w:r>
-        <w:t xml:space="preserve"> EnergyPlus offices, each with an AI supervisor whose calls take 0.5 s (median), with blocking calls and with asynchronous delivery by TIDE (decision delay 15 min).</w:t>
+        <w:t xml:space="preserve"> EnergyPlus offices, each with a slow supervisor whose calls take 0.5 s (median; stand-in for an LLM service), with blocking calls and with asynchronous delivery by TIDE (decision delay 15 min).</w:t>
       </w:r>
     </w:p>
     <w:p>
@@ -8382,7 +8382,7 @@
         <w:fldChar w:fldCharType="begin"/>
       </w:r>
       <w:r>
-        <w:instrText xml:space="preserve"> ADDIN EN.CITE &lt;EndNote&gt;&lt;Cite&gt;&lt;Author&gt;Hardy&lt;/Author&gt;&lt;Year&gt;2024&lt;/Year&gt;&lt;RecNum&gt;29&lt;/RecNum&gt;&lt;DisplayText&gt;(Hardy et al. 2024)&lt;/DisplayText&gt;&lt;record&gt;&lt;rec-number&gt;29&lt;/rec-number&gt;&lt;foreign-keys&gt;&lt;key app="EN" db-id="mdae8500109496fea4aff9c086e16cc25895" timestamp="1793226621"&gt;29&lt;/key&gt;&lt;/foreign-keys&gt;&lt;ref-type name="Journal Article"&gt;17&lt;/ref-type&gt;&lt;contributors&gt;&lt;authors&gt;&lt;author&gt;Hardy, Trevor D.&lt;/author&gt;&lt;author&gt;Palmintier, Bryan&lt;/author&gt;&lt;author&gt;Top, Philip L.&lt;/author&gt;&lt;author&gt;Krishnamurthy, Dheepak&lt;/author&gt;&lt;author&gt;Fuller, Jason C.&lt;/author&gt;&lt;/authors&gt;&lt;/contributors&gt;&lt;titles&gt;&lt;title&gt;HELICS: A Co-Simulation Framework for Scalable Multi-Domain Modeling and Analysis&lt;/title&gt;&lt;secondary-title&gt;IEEE Access&lt;/secondary-title&gt;&lt;alt-title&gt;IEEE Access&lt;/alt-title&gt;&lt;/titles&gt;&lt;periodical&gt;&lt;full-title&gt;IEEE Access&lt;/full-title&gt;&lt;abbr-1&gt;IEEE Access&lt;/abbr-1&gt;&lt;/periodical&gt;&lt;pages&gt;24325-24347&lt;/pages&gt;&lt;volume&gt;12&lt;/volume&gt;&lt;dates&gt;&lt;year&gt;2024&lt;/year&gt;&lt;/dates&gt;&lt;publisher&gt;IEEE&lt;/publisher&gt;&lt;label&gt;hardy2024&lt;/label&gt;&lt;urls&gt;&lt;/urls&gt;&lt;electronic-resource-num&gt;10.1109/ACCESS.2024.3363615&lt;/electronic-resource-num&gt;&lt;/record&gt;&lt;/Cite&gt;&lt;/EndNote&gt;</w:instrText>
+        <w:instrText xml:space="preserve"> ADDIN EN.CITE &lt;EndNote&gt;&lt;Cite&gt;&lt;Author&gt;Hardy&lt;/Author&gt;&lt;Year&gt;2024&lt;/Year&gt;&lt;RecNum&gt;29&lt;/RecNum&gt;&lt;DisplayText&gt;(Hardy et al. 2024)&lt;/DisplayText&gt;&lt;record&gt;&lt;rec-number&gt;29&lt;/rec-number&gt;&lt;foreign-keys&gt;&lt;key app="EN" db-id="mdae8500109496fea4aff9c086e16cc25895" timestamp="1793229176"&gt;29&lt;/key&gt;&lt;/foreign-keys&gt;&lt;ref-type name="Journal Article"&gt;17&lt;/ref-type&gt;&lt;contributors&gt;&lt;authors&gt;&lt;author&gt;Hardy, Trevor D.&lt;/author&gt;&lt;author&gt;Palmintier, Bryan&lt;/author&gt;&lt;author&gt;Top, Philip L.&lt;/author&gt;&lt;author&gt;Krishnamurthy, Dheepak&lt;/author&gt;&lt;author&gt;Fuller, Jason C.&lt;/author&gt;&lt;/authors&gt;&lt;/contributors&gt;&lt;titles&gt;&lt;title&gt;HELICS: A Co-Simulation Framework for Scalable Multi-Domain Modeling and Analysis&lt;/title&gt;&lt;secondary-title&gt;IEEE Access&lt;/secondary-title&gt;&lt;alt-title&gt;IEEE Access&lt;/alt-title&gt;&lt;/titles&gt;&lt;periodical&gt;&lt;full-title&gt;IEEE Access&lt;/full-title&gt;&lt;abbr-1&gt;IEEE Access&lt;/abbr-1&gt;&lt;/periodical&gt;&lt;pages&gt;24325-24347&lt;/pages&gt;&lt;volume&gt;12&lt;/volume&gt;&lt;dates&gt;&lt;year&gt;2024&lt;/year&gt;&lt;/dates&gt;&lt;publisher&gt;IEEE&lt;/publisher&gt;&lt;label&gt;hardy2024&lt;/label&gt;&lt;urls&gt;&lt;/urls&gt;&lt;electronic-resource-num&gt;10.1109/ACCESS.2024.3363615&lt;/electronic-resource-num&gt;&lt;/record&gt;&lt;/Cite&gt;&lt;/EndNote&gt;</w:instrText>
       </w:r>
       <w:r>
         <w:fldChar w:fldCharType="separate"/>
@@ -8543,7 +8543,7 @@
 UmVjTnVtPjQ3PC9SZWNOdW0+PERpc3BsYXlUZXh0PihLw7xibGVyIGFuZCBTY2hpZWhsZW4gMjAw
 MDsgR29tZXMgZXQgYWwuIDIwMTgpPC9EaXNwbGF5VGV4dD48cmVjb3JkPjxyZWMtbnVtYmVyPjQ3
 PC9yZWMtbnVtYmVyPjxmb3JlaWduLWtleXM+PGtleSBhcHA9IkVOIiBkYi1pZD0ibWRhZTg1MDAx
-MDk0OTZmZWE0YWZmOWMwODZlMTZjYzI1ODk1IiB0aW1lc3RhbXA9IjE3OTMyMjY2MjEiPjQ3PC9r
+MDk0OTZmZWE0YWZmOWMwODZlMTZjYzI1ODk1IiB0aW1lc3RhbXA9IjE3OTMyMjkxNzYiPjQ3PC9r
 ZXk+PC9mb3JlaWduLWtleXM+PHJlZi10eXBlIG5hbWU9IkpvdXJuYWwgQXJ0aWNsZSI+MTc8L3Jl
 Zi10eXBlPjxjb250cmlidXRvcnM+PGF1dGhvcnM+PGF1dGhvcj5Lw7xibGVyLCBSLjwvYXV0aG9y
 PjxhdXRob3I+U2NoaWVobGVuLCBXLjwvYXV0aG9yPjwvYXV0aG9ycz48L2NvbnRyaWJ1dG9ycz48
@@ -8561,7 +8561,7 @@
 b3JkPjwvQ2l0ZT48Q2l0ZT48QXV0aG9yPkdvbWVzPC9BdXRob3I+PFllYXI+MjAxODwvWWVhcj48
 UmVjTnVtPjI2PC9SZWNOdW0+PHJlY29yZD48cmVjLW51bWJlcj4yNjwvcmVjLW51bWJlcj48Zm9y
 ZWlnbi1rZXlzPjxrZXkgYXBwPSJFTiIgZGItaWQ9Im1kYWU4NTAwMTA5NDk2ZmVhNGFmZjljMDg2
-ZTE2Y2MyNTg5NSIgdGltZXN0YW1wPSIxNzkzMjI2NjIxIj4yNjwva2V5PjwvZm9yZWlnbi1rZXlz
+ZTE2Y2MyNTg5NSIgdGltZXN0YW1wPSIxNzkzMjI5MTc2Ij4yNjwva2V5PjwvZm9yZWlnbi1rZXlz
 PjxyZWYtdHlwZSBuYW1lPSJKb3VybmFsIEFydGljbGUiPjE3PC9yZWYtdHlwZT48Y29udHJpYnV0
 b3JzPjxhdXRob3JzPjxhdXRob3I+R29tZXMsIENsw6F1ZGlvPC9hdXRob3I+PGF1dGhvcj5UaHVs
 ZSwgQ2FzcGVyPC9hdXRob3I+PGF1dGhvcj5Ccm9tYW4sIERhdmlkPC9hdXRob3I+PGF1dGhvcj5M
@@ -8587,7 +8587,7 @@
 UmVjTnVtPjQ3PC9SZWNOdW0+PERpc3BsYXlUZXh0PihLw7xibGVyIGFuZCBTY2hpZWhsZW4gMjAw
 MDsgR29tZXMgZXQgYWwuIDIwMTgpPC9EaXNwbGF5VGV4dD48cmVjb3JkPjxyZWMtbnVtYmVyPjQ3
 PC9yZWMtbnVtYmVyPjxmb3JlaWduLWtleXM+PGtleSBhcHA9IkVOIiBkYi1pZD0ibWRhZTg1MDAx
-MDk0OTZmZWE0YWZmOWMwODZlMTZjYzI1ODk1IiB0aW1lc3RhbXA9IjE3OTMyMjY2MjEiPjQ3PC9r
+MDk0OTZmZWE0YWZmOWMwODZlMTZjYzI1ODk1IiB0aW1lc3RhbXA9IjE3OTMyMjkxNzYiPjQ3PC9r
 ZXk+PC9mb3JlaWduLWtleXM+PHJlZi10eXBlIG5hbWU9IkpvdXJuYWwgQXJ0aWNsZSI+MTc8L3Jl
 Zi10eXBlPjxjb250cmlidXRvcnM+PGF1dGhvcnM+PGF1dGhvcj5Lw7xibGVyLCBSLjwvYXV0aG9y
 PjxhdXRob3I+U2NoaWVobGVuLCBXLjwvYXV0aG9yPjwvYXV0aG9ycz48L2NvbnRyaWJ1dG9ycz48
@@ -8605,7 +8605,7 @@
 b3JkPjwvQ2l0ZT48Q2l0ZT48QXV0aG9yPkdvbWVzPC9BdXRob3I+PFllYXI+MjAxODwvWWVhcj48
 UmVjTnVtPjI2PC9SZWNOdW0+PHJlY29yZD48cmVjLW51bWJlcj4yNjwvcmVjLW51bWJlcj48Zm9y
 ZWlnbi1rZXlzPjxrZXkgYXBwPSJFTiIgZGItaWQ9Im1kYWU4NTAwMTA5NDk2ZmVhNGFmZjljMDg2
-ZTE2Y2MyNTg5NSIgdGltZXN0YW1wPSIxNzkzMjI2NjIxIj4yNjwva2V5PjwvZm9yZWlnbi1rZXlz
+ZTE2Y2MyNTg5NSIgdGltZXN0YW1wPSIxNzkzMjI5MTc2Ij4yNjwva2V5PjwvZm9yZWlnbi1rZXlz
 PjxyZWYtdHlwZSBuYW1lPSJKb3VybmFsIEFydGljbGUiPjE3PC9yZWYtdHlwZT48Y29udHJpYnV0
 b3JzPjxhdXRob3JzPjxhdXRob3I+R29tZXMsIENsw6F1ZGlvPC9hdXRob3I+PGF1dGhvcj5UaHVs
 ZSwgQ2FzcGVyPC9hdXRob3I+PGF1dGhvcj5Ccm9tYW4sIERhdmlkPC9hdXRob3I+PGF1dGhvcj5M
@@ -8647,7 +8647,7 @@
         <w:fldChar w:fldCharType="begin"/>
       </w:r>
       <w:r>
-        <w:instrText xml:space="preserve"> ADDIN EN.CITE &lt;EndNote&gt;&lt;Cite&gt;&lt;Author&gt;Eaton&lt;/Author&gt;&lt;Year&gt;2023&lt;/Year&gt;&lt;RecNum&gt;10&lt;/RecNum&gt;&lt;DisplayText&gt;(Eaton et al. 2023)&lt;/DisplayText&gt;&lt;record&gt;&lt;rec-number&gt;10&lt;/rec-number&gt;&lt;foreign-keys&gt;&lt;key app="EN" db-id="mdae8500109496fea4aff9c086e16cc25895" timestamp="1793226621"&gt;10&lt;/key&gt;&lt;/foreign-keys&gt;&lt;ref-type name="Web Page"&gt;12&lt;/ref-type&gt;&lt;contributors&gt;&lt;authors&gt;&lt;author&gt;Eaton, Brian&lt;/author&gt;&lt;author&gt;Gregory, Jonathan&lt;/author&gt;&lt;author&gt;Drach, Bob&lt;/author&gt;&lt;author&gt;Taylor, Karl&lt;/author&gt;&lt;author&gt;Hankin, Steve&lt;/author&gt;&lt;author&gt;Blower, Jon&lt;/author&gt;&lt;author&gt;Caron, John&lt;/author&gt;&lt;author&gt;Signell, Rich&lt;/author&gt;&lt;author&gt;Bentley, Phil&lt;/author&gt;&lt;author&gt;Rappa, Greg&lt;/author&gt;&lt;author&gt;Höck, Heinke&lt;/author&gt;&lt;author&gt;Pamment, Alison&lt;/author&gt;&lt;author&gt;Juckes, Martin&lt;/author&gt;&lt;author&gt;Raspaud, Martin&lt;/author&gt;&lt;author&gt;Horne, Randy&lt;/author&gt;&lt;author&gt;Whiteaker, Timothy&lt;/author&gt;&lt;author&gt;Blodgett, David&lt;/author&gt;&lt;author&gt;Zender, Charlie&lt;/author&gt;&lt;author&gt;Lee, Daniel&lt;/author&gt;&lt;author&gt;Hassell, David&lt;/author&gt;&lt;author&gt;Snow, Alan D.&lt;/author&gt;&lt;author&gt;Kölling, Tobias&lt;/author&gt;&lt;author&gt;Allured, Dave&lt;/author&gt;&lt;author&gt;Jelenak, Aleksandar&lt;/author&gt;&lt;author&gt;Meier Soerensen, Anders&lt;/author&gt;&lt;author&gt;Gaultier, Lucile&lt;/author&gt;&lt;author&gt;Herlédan, Sylvain&lt;/author&gt;&lt;author&gt;Manzano, Fernando&lt;/author&gt;&lt;author&gt;Bärring, Lars&lt;/author&gt;&lt;author&gt;Barker, Christopher&lt;/author&gt;&lt;author&gt;Bartholomew, Sadie&lt;/author&gt;&lt;/authors&gt;&lt;/contributors&gt;&lt;titles&gt;&lt;title&gt;NetCDF Climate and Forecast (CF) Metadata Conventions&lt;/title&gt;&lt;/titles&gt;&lt;dates&gt;&lt;year&gt;2023&lt;/year&gt;&lt;/dates&gt;&lt;label&gt;cf2023&lt;/label&gt;&lt;urls&gt;&lt;related-urls&gt;&lt;url&gt;https://cfconventions.org/Data/cf-conventions/cf-conventions-1.11/cf-conventions.html&lt;/url&gt;&lt;/related-urls&gt;&lt;/urls&gt;&lt;access-date&gt;2026-10-28&lt;/access-date&gt;&lt;/record&gt;&lt;/Cite&gt;&lt;/EndNote&gt;</w:instrText>
+        <w:instrText xml:space="preserve"> ADDIN EN.CITE &lt;EndNote&gt;&lt;Cite&gt;&lt;Author&gt;Eaton&lt;/Author&gt;&lt;Year&gt;2023&lt;/Year&gt;&lt;RecNum&gt;10&lt;/RecNum&gt;&lt;DisplayText&gt;(Eaton et al. 2023)&lt;/DisplayText&gt;&lt;record&gt;&lt;rec-number&gt;10&lt;/rec-number&gt;&lt;foreign-keys&gt;&lt;key app="EN" db-id="mdae8500109496fea4aff9c086e16cc25895" timestamp="1793229176"&gt;10&lt;/key&gt;&lt;/foreign-keys&gt;&lt;ref-type name="Web Page"&gt;12&lt;/ref-type&gt;&lt;contributors&gt;&lt;authors&gt;&lt;author&gt;Eaton, Brian&lt;/author&gt;&lt;author&gt;Gregory, Jonathan&lt;/author&gt;&lt;author&gt;Drach, Bob&lt;/author&gt;&lt;author&gt;Taylor, Karl&lt;/author&gt;&lt;author&gt;Hankin, Steve&lt;/author&gt;&lt;author&gt;Blower, Jon&lt;/author&gt;&lt;author&gt;Caron, John&lt;/author&gt;&lt;author&gt;Signell, Rich&lt;/author&gt;&lt;author&gt;Bentley, Phil&lt;/author&gt;&lt;author&gt;Rappa, Greg&lt;/author&gt;&lt;author&gt;Höck, Heinke&lt;/author&gt;&lt;author&gt;Pamment, Alison&lt;/author&gt;&lt;author&gt;Juckes, Martin&lt;/author&gt;&lt;author&gt;Raspaud, Martin&lt;/author&gt;&lt;author&gt;Horne, Randy&lt;/author&gt;&lt;author&gt;Whiteaker, Timothy&lt;/author&gt;&lt;author&gt;Blodgett, David&lt;/author&gt;&lt;author&gt;Zender, Charlie&lt;/author&gt;&lt;author&gt;Lee, Daniel&lt;/author&gt;&lt;author&gt;Hassell, David&lt;/author&gt;&lt;author&gt;Snow, Alan D.&lt;/author&gt;&lt;author&gt;Kölling, Tobias&lt;/author&gt;&lt;author&gt;Allured, Dave&lt;/author&gt;&lt;author&gt;Jelenak, Aleksandar&lt;/author&gt;&lt;author&gt;Meier Soerensen, Anders&lt;/author&gt;&lt;author&gt;Gaultier, Lucile&lt;/author&gt;&lt;author&gt;Herlédan, Sylvain&lt;/author&gt;&lt;author&gt;Manzano, Fernando&lt;/author&gt;&lt;author&gt;Bärring, Lars&lt;/author&gt;&lt;author&gt;Barker, Christopher&lt;/author&gt;&lt;author&gt;Bartholomew, Sadie&lt;/author&gt;&lt;/authors&gt;&lt;/contributors&gt;&lt;titles&gt;&lt;title&gt;NetCDF Climate and Forecast (CF) Metadata Conventions&lt;/title&gt;&lt;/titles&gt;&lt;dates&gt;&lt;year&gt;2023&lt;/year&gt;&lt;/dates&gt;&lt;label&gt;cf2023&lt;/label&gt;&lt;urls&gt;&lt;related-urls&gt;&lt;url&gt;https://cfconventions.org/Data/cf-conventions/cf-conventions-1.11/cf-conventions.html&lt;/url&gt;&lt;/related-urls&gt;&lt;/urls&gt;&lt;access-date&gt;2026-10-28&lt;/access-date&gt;&lt;/record&gt;&lt;/Cite&gt;&lt;/EndNote&gt;</w:instrText>
       </w:r>
       <w:r>
         <w:fldChar w:fldCharType="separate"/>
@@ -8669,6 +8669,128 @@
       </w:r>
       <w:r>
         <w:t xml:space="preserve">). Third, the conditions under which alignment is impossible, a consumer that needs a value no producer has published yet, become visible in the alignment report instead of silently producing a biased number.</w:t>
+      </w:r>
+    </w:p>
+    <w:p>
+      <w:pPr>
+        <w:pStyle w:val="BodyText"/>
+      </w:pPr>
+      <w:r>
+        <w:t xml:space="preserve">Alignment does not make an explicit co-simulation exact. TIDE aligns the data a component reads; it does not iterate between components or roll them back, so the physical coupling error of a feedback loop that is closed only every exchange step remains. Energy-residual methods such as the nearly energy-preserving coupling element and power bonds address that error and are complementary </w:t>
+      </w:r>
+      <w:r>
+        <w:fldChar w:fldCharType="begin">
+          <w:fldData xml:space="preserve">PEVuZE5vdGU+PENpdGU+PEF1dGhvcj5CZW5lZGlrdDwvQXV0aG9yPjxZZWFyPjIwMTM8L1llYXI+
+PFJlY051bT4zPC9SZWNOdW0+PERpc3BsYXlUZXh0PihCZW5lZGlrdCBldCBhbC4gMjAxMzsgU2Fk
+amluYSBldCBhbC4gMjAxNyk8L0Rpc3BsYXlUZXh0PjxyZWNvcmQ+PHJlYy1udW1iZXI+MzwvcmVj
+LW51bWJlcj48Zm9yZWlnbi1rZXlzPjxrZXkgYXBwPSJFTiIgZGItaWQ9Im1kYWU4NTAwMTA5NDk2
+ZmVhNGFmZjljMDg2ZTE2Y2MyNTg5NSIgdGltZXN0YW1wPSIxNzkzMjI5MTc2Ij4zPC9rZXk+PC9m
+b3JlaWduLWtleXM+PHJlZi10eXBlIG5hbWU9IkNvbmZlcmVuY2UgUGFwZXIiPjQ3PC9yZWYtdHlw
+ZT48Y29udHJpYnV0b3JzPjxhdXRob3JzPjxhdXRob3I+QmVuZWRpa3QsIE0uPC9hdXRob3I+PGF1
+dGhvcj5XYXR6ZW5pZywgRC48L2F1dGhvcj48YXV0aG9yPlplaGV0bmVyLCBKLjwvYXV0aG9yPjxh
+dXRob3I+SG9mZXIsIEEuPC9hdXRob3I+PC9hdXRob3JzPjwvY29udHJpYnV0b3JzPjx0aXRsZXM+
+PHRpdGxlPk5FUENFIOKAkyBhIG5lYXJseSBlbmVyZ3ktcHJlc2VydmluZyBjb3VwbGluZyBlbGVt
+ZW50IGZvciB3ZWFrLWNvdXBsZWQgcHJvYmxlbXMgYW5kIGNvLXNpbXVsYXRpb25zPC90aXRsZT48
+c2Vjb25kYXJ5LXRpdGxlPlYgSW50ZXJuYXRpb25hbCBDb25mZXJlbmNlIG9uIENvbXB1dGF0aW9u
+YWwgTWV0aG9kcyBmb3IgQ291cGxlZCBQcm9ibGVtcyBpbiBTY2llbmNlIGFuZCBFbmdpbmVlcmlu
+ZyAoQ09VUExFRCAyMDEzKTwvc2Vjb25kYXJ5LXRpdGxlPjwvdGl0bGVzPjxwYWdlcz4xMDIxLTEw
+MzI8L3BhZ2VzPjxkYXRlcz48eWVhcj4yMDEzPC95ZWFyPjwvZGF0ZXM+PHB1Yi1sb2NhdGlvbj5T
+YW50YSBFdWzDoGxpYSwgSWJpemEsIFNwYWluPC9wdWItbG9jYXRpb24+PHB1Ymxpc2hlcj5DSU1O
+RTwvcHVibGlzaGVyPjxpc2JuPjk3OC04NC05NDE0MDctNi0xPC9pc2JuPjxsYWJlbD5iZW5lZGlr
+dDIwMTNuZXBjZTwvbGFiZWw+PHVybHM+PHJlbGF0ZWQtdXJscz48dXJsPmh0dHBzOi8vaGRsLmhh
+bmRsZS5uZXQvMjExNy8xOTI2NzU8L3VybD48L3JlbGF0ZWQtdXJscz48L3VybHM+PC9yZWNvcmQ+
+PC9DaXRlPjxDaXRlPjxBdXRob3I+U2FkamluYTwvQXV0aG9yPjxZZWFyPjIwMTc8L1llYXI+PFJl
+Y051bT43MTwvUmVjTnVtPjxyZWNvcmQ+PHJlYy1udW1iZXI+NzE8L3JlYy1udW1iZXI+PGZvcmVp
+Z24ta2V5cz48a2V5IGFwcD0iRU4iIGRiLWlkPSJtZGFlODUwMDEwOTQ5NmZlYTRhZmY5YzA4NmUx
+NmNjMjU4OTUiIHRpbWVzdGFtcD0iMTc5MzIyOTE3NiI+NzE8L2tleT48L2ZvcmVpZ24ta2V5cz48
+cmVmLXR5cGUgbmFtZT0iSm91cm5hbCBBcnRpY2xlIj4xNzwvcmVmLXR5cGU+PGNvbnRyaWJ1dG9y
+cz48YXV0aG9ycz48YXV0aG9yPlNhZGppbmEsIFNldmVyaW48L2F1dGhvcj48YXV0aG9yPkt5bGxp
+bmdzdGFkLCBMYXJzIFQuPC9hdXRob3I+PGF1dGhvcj5Ta2pvbmcsIFN0aWFuPC9hdXRob3I+PGF1
+dGhvcj5QZWRlcnNlbiwgRWlsaWY8L2F1dGhvcj48L2F1dGhvcnM+PC9jb250cmlidXRvcnM+PHRp
+dGxlcz48dGl0bGU+RW5lcmd5IGNvbnNlcnZhdGlvbiBhbmQgcG93ZXIgYm9uZHMgaW4gY28tc2lt
+dWxhdGlvbnM6IG5vbi1pdGVyYXRpdmUgYWRhcHRpdmUgc3RlcCBzaXplIGNvbnRyb2wgYW5kIGVy
+cm9yIGVzdGltYXRpb248L3RpdGxlPjxzZWNvbmRhcnktdGl0bGU+RW5naW5lZXJpbmcgd2l0aCBD
+b21wdXRlcnM8L3NlY29uZGFyeS10aXRsZT48YWx0LXRpdGxlPkVuZy4gQ29tcHV0LjwvYWx0LXRp
+dGxlPjwvdGl0bGVzPjxwZXJpb2RpY2FsPjxmdWxsLXRpdGxlPkVuZ2luZWVyaW5nIHdpdGggQ29t
+cHV0ZXJzPC9mdWxsLXRpdGxlPjxhYmJyLTE+RW5nLiBDb21wdXQuPC9hYmJyLTE+PC9wZXJpb2Rp
+Y2FsPjxwYWdlcz42MDctNjIwPC9wYWdlcz48dm9sdW1lPjMzPC92b2x1bWU+PG51bWJlcj4zPC9u
+dW1iZXI+PGRhdGVzPjx5ZWFyPjIwMTc8L3llYXI+PC9kYXRlcz48cHVibGlzaGVyPlNwcmluZ2Vy
+PC9wdWJsaXNoZXI+PGxhYmVsPnNhZGppbmEyMDE3PC9sYWJlbD48dXJscz48L3VybHM+PGVsZWN0
+cm9uaWMtcmVzb3VyY2UtbnVtPjEwLjEwMDcvczAwMzY2LTAxNi0wNDkyLTg8L2VsZWN0cm9uaWMt
+cmVzb3VyY2UtbnVtPjwvcmVjb3JkPjwvQ2l0ZT48L0VuZE5vdGU+AA==</w:fldData>
+        </w:fldChar>
+      </w:r>
+      <w:r>
+        <w:instrText xml:space="preserve"> ADDIN EN.CITE </w:instrText>
+      </w:r>
+      <w:r>
+        <w:fldChar w:fldCharType="begin">
+          <w:fldData xml:space="preserve">PEVuZE5vdGU+PENpdGU+PEF1dGhvcj5CZW5lZGlrdDwvQXV0aG9yPjxZZWFyPjIwMTM8L1llYXI+
+PFJlY051bT4zPC9SZWNOdW0+PERpc3BsYXlUZXh0PihCZW5lZGlrdCBldCBhbC4gMjAxMzsgU2Fk
+amluYSBldCBhbC4gMjAxNyk8L0Rpc3BsYXlUZXh0PjxyZWNvcmQ+PHJlYy1udW1iZXI+MzwvcmVj
+LW51bWJlcj48Zm9yZWlnbi1rZXlzPjxrZXkgYXBwPSJFTiIgZGItaWQ9Im1kYWU4NTAwMTA5NDk2
+ZmVhNGFmZjljMDg2ZTE2Y2MyNTg5NSIgdGltZXN0YW1wPSIxNzkzMjI5MTc2Ij4zPC9rZXk+PC9m
+b3JlaWduLWtleXM+PHJlZi10eXBlIG5hbWU9IkNvbmZlcmVuY2UgUGFwZXIiPjQ3PC9yZWYtdHlw
+ZT48Y29udHJpYnV0b3JzPjxhdXRob3JzPjxhdXRob3I+QmVuZWRpa3QsIE0uPC9hdXRob3I+PGF1
+dGhvcj5XYXR6ZW5pZywgRC48L2F1dGhvcj48YXV0aG9yPlplaGV0bmVyLCBKLjwvYXV0aG9yPjxh
+dXRob3I+SG9mZXIsIEEuPC9hdXRob3I+PC9hdXRob3JzPjwvY29udHJpYnV0b3JzPjx0aXRsZXM+
+PHRpdGxlPk5FUENFIOKAkyBhIG5lYXJseSBlbmVyZ3ktcHJlc2VydmluZyBjb3VwbGluZyBlbGVt
+ZW50IGZvciB3ZWFrLWNvdXBsZWQgcHJvYmxlbXMgYW5kIGNvLXNpbXVsYXRpb25zPC90aXRsZT48
+c2Vjb25kYXJ5LXRpdGxlPlYgSW50ZXJuYXRpb25hbCBDb25mZXJlbmNlIG9uIENvbXB1dGF0aW9u
+YWwgTWV0aG9kcyBmb3IgQ291cGxlZCBQcm9ibGVtcyBpbiBTY2llbmNlIGFuZCBFbmdpbmVlcmlu
+ZyAoQ09VUExFRCAyMDEzKTwvc2Vjb25kYXJ5LXRpdGxlPjwvdGl0bGVzPjxwYWdlcz4xMDIxLTEw
+MzI8L3BhZ2VzPjxkYXRlcz48eWVhcj4yMDEzPC95ZWFyPjwvZGF0ZXM+PHB1Yi1sb2NhdGlvbj5T
+YW50YSBFdWzDoGxpYSwgSWJpemEsIFNwYWluPC9wdWItbG9jYXRpb24+PHB1Ymxpc2hlcj5DSU1O
+RTwvcHVibGlzaGVyPjxpc2JuPjk3OC04NC05NDE0MDctNi0xPC9pc2JuPjxsYWJlbD5iZW5lZGlr
+dDIwMTNuZXBjZTwvbGFiZWw+PHVybHM+PHJlbGF0ZWQtdXJscz48dXJsPmh0dHBzOi8vaGRsLmhh
+bmRsZS5uZXQvMjExNy8xOTI2NzU8L3VybD48L3JlbGF0ZWQtdXJscz48L3VybHM+PC9yZWNvcmQ+
+PC9DaXRlPjxDaXRlPjxBdXRob3I+U2FkamluYTwvQXV0aG9yPjxZZWFyPjIwMTc8L1llYXI+PFJl
+Y051bT43MTwvUmVjTnVtPjxyZWNvcmQ+PHJlYy1udW1iZXI+NzE8L3JlYy1udW1iZXI+PGZvcmVp
+Z24ta2V5cz48a2V5IGFwcD0iRU4iIGRiLWlkPSJtZGFlODUwMDEwOTQ5NmZlYTRhZmY5YzA4NmUx
+NmNjMjU4OTUiIHRpbWVzdGFtcD0iMTc5MzIyOTE3NiI+NzE8L2tleT48L2ZvcmVpZ24ta2V5cz48
+cmVmLXR5cGUgbmFtZT0iSm91cm5hbCBBcnRpY2xlIj4xNzwvcmVmLXR5cGU+PGNvbnRyaWJ1dG9y
+cz48YXV0aG9ycz48YXV0aG9yPlNhZGppbmEsIFNldmVyaW48L2F1dGhvcj48YXV0aG9yPkt5bGxp
+bmdzdGFkLCBMYXJzIFQuPC9hdXRob3I+PGF1dGhvcj5Ta2pvbmcsIFN0aWFuPC9hdXRob3I+PGF1
+dGhvcj5QZWRlcnNlbiwgRWlsaWY8L2F1dGhvcj48L2F1dGhvcnM+PC9jb250cmlidXRvcnM+PHRp
+dGxlcz48dGl0bGU+RW5lcmd5IGNvbnNlcnZhdGlvbiBhbmQgcG93ZXIgYm9uZHMgaW4gY28tc2lt
+dWxhdGlvbnM6IG5vbi1pdGVyYXRpdmUgYWRhcHRpdmUgc3RlcCBzaXplIGNvbnRyb2wgYW5kIGVy
+cm9yIGVzdGltYXRpb248L3RpdGxlPjxzZWNvbmRhcnktdGl0bGU+RW5naW5lZXJpbmcgd2l0aCBD
+b21wdXRlcnM8L3NlY29uZGFyeS10aXRsZT48YWx0LXRpdGxlPkVuZy4gQ29tcHV0LjwvYWx0LXRp
+dGxlPjwvdGl0bGVzPjxwZXJpb2RpY2FsPjxmdWxsLXRpdGxlPkVuZ2luZWVyaW5nIHdpdGggQ29t
+cHV0ZXJzPC9mdWxsLXRpdGxlPjxhYmJyLTE+RW5nLiBDb21wdXQuPC9hYmJyLTE+PC9wZXJpb2Rp
+Y2FsPjxwYWdlcz42MDctNjIwPC9wYWdlcz48dm9sdW1lPjMzPC92b2x1bWU+PG51bWJlcj4zPC9u
+dW1iZXI+PGRhdGVzPjx5ZWFyPjIwMTc8L3llYXI+PC9kYXRlcz48cHVibGlzaGVyPlNwcmluZ2Vy
+PC9wdWJsaXNoZXI+PGxhYmVsPnNhZGppbmEyMDE3PC9sYWJlbD48dXJscz48L3VybHM+PGVsZWN0
+cm9uaWMtcmVzb3VyY2UtbnVtPjEwLjEwMDcvczAwMzY2LTAxNi0wNDkyLTg8L2VsZWN0cm9uaWMt
+cmVzb3VyY2UtbnVtPjwvcmVjb3JkPjwvQ2l0ZT48L0VuZE5vdGU+AA==</w:fldData>
+        </w:fldChar>
+      </w:r>
+      <w:r>
+        <w:instrText xml:space="preserve"> ADDIN EN.CITE.DATA </w:instrText>
+      </w:r>
+      <w:r>
+        <w:fldChar w:fldCharType="end"/>
+      </w:r>
+      <w:r>
+        <w:fldChar w:fldCharType="separate"/>
+      </w:r>
+      <w:r>
+        <w:rPr>
+          <w:noProof/>
+        </w:rPr>
+        <w:t xml:space="preserve">(Benedikt et al. 2013; Sadjina et al. 2017)</w:t>
+      </w:r>
+      <w:r>
+        <w:fldChar w:fldCharType="end"/>
+      </w:r>
+      <w:r>
+        <w:t xml:space="preserve">. Within a consumer’s step, TIDE can only deliver aggregates: the product of a rapidly changing price and a rapidly changing load needs a consumer step at least as fine as the price changes (</w:t>
+      </w:r>
+      <w:r>
+        <w:t xml:space="preserve">Section 5.3</w:t>
+      </w:r>
+      <w:r>
+        <w:t xml:space="preserve">).</w:t>
       </w:r>
     </w:p>
     <w:p>
@@ -8777,121 +8899,49 @@
     </w:p>
     <w:p>
       <w:pPr>
+        <w:pStyle w:val="Heading2"/>
+      </w:pPr>
+      <w:r>
+        <w:t xml:space="preserve">A pitfall: the EnergyPlus time step changes the equipment</w:t>
+      </w:r>
+    </w:p>
+    <w:p>
+      <w:pPr>
         <w:pStyle w:val="BodyText"/>
       </w:pPr>
       <w:r>
-        <w:t xml:space="preserve">Alignment does not make an explicit co-simulation exact. TIDE aligns the data a component reads; it does not iterate between components or roll them back, so the physical coupling error of a feedback loop that is closed only every exchange step remains. Energy-residual methods such as the nearly energy-preserving coupling element and power bonds address that error and are complementary </w:t>
-      </w:r>
-      <w:r>
-        <w:fldChar w:fldCharType="begin">
-          <w:fldData xml:space="preserve">PEVuZE5vdGU+PENpdGU+PEF1dGhvcj5CZW5lZGlrdDwvQXV0aG9yPjxZZWFyPjIwMTM8L1llYXI+
-PFJlY051bT4zPC9SZWNOdW0+PERpc3BsYXlUZXh0PihCZW5lZGlrdCBldCBhbC4gMjAxMzsgU2Fk
-amluYSBldCBhbC4gMjAxNyk8L0Rpc3BsYXlUZXh0PjxyZWNvcmQ+PHJlYy1udW1iZXI+MzwvcmVj
-LW51bWJlcj48Zm9yZWlnbi1rZXlzPjxrZXkgYXBwPSJFTiIgZGItaWQ9Im1kYWU4NTAwMTA5NDk2
-ZmVhNGFmZjljMDg2ZTE2Y2MyNTg5NSIgdGltZXN0YW1wPSIxNzkzMjI2NjIxIj4zPC9rZXk+PC9m
-b3JlaWduLWtleXM+PHJlZi10eXBlIG5hbWU9IkNvbmZlcmVuY2UgUGFwZXIiPjQ3PC9yZWYtdHlw
-ZT48Y29udHJpYnV0b3JzPjxhdXRob3JzPjxhdXRob3I+QmVuZWRpa3QsIE0uPC9hdXRob3I+PGF1
-dGhvcj5XYXR6ZW5pZywgRC48L2F1dGhvcj48YXV0aG9yPlplaGV0bmVyLCBKLjwvYXV0aG9yPjxh
-dXRob3I+SG9mZXIsIEEuPC9hdXRob3I+PC9hdXRob3JzPjwvY29udHJpYnV0b3JzPjx0aXRsZXM+
-PHRpdGxlPk5FUENFIOKAkyBhIG5lYXJseSBlbmVyZ3ktcHJlc2VydmluZyBjb3VwbGluZyBlbGVt
-ZW50IGZvciB3ZWFrLWNvdXBsZWQgcHJvYmxlbXMgYW5kIGNvLXNpbXVsYXRpb25zPC90aXRsZT48
-c2Vjb25kYXJ5LXRpdGxlPlYgSW50ZXJuYXRpb25hbCBDb25mZXJlbmNlIG9uIENvbXB1dGF0aW9u
-YWwgTWV0aG9kcyBmb3IgQ291cGxlZCBQcm9ibGVtcyBpbiBTY2llbmNlIGFuZCBFbmdpbmVlcmlu
-ZyAoQ09VUExFRCAyMDEzKTwvc2Vjb25kYXJ5LXRpdGxlPjwvdGl0bGVzPjxwYWdlcz4xMDIxLTEw
-MzI8L3BhZ2VzPjxkYXRlcz48eWVhcj4yMDEzPC95ZWFyPjwvZGF0ZXM+PHB1Yi1sb2NhdGlvbj5T
-YW50YSBFdWzDoGxpYSwgSWJpemEsIFNwYWluPC9wdWItbG9jYXRpb24+PHB1Ymxpc2hlcj5DSU1O
-RTwvcHVibGlzaGVyPjxpc2JuPjk3OC04NC05NDE0MDctNi0xPC9pc2JuPjxsYWJlbD5iZW5lZGlr
-dDIwMTNuZXBjZTwvbGFiZWw+PHVybHM+PHJlbGF0ZWQtdXJscz48dXJsPmh0dHBzOi8vaGRsLmhh
-bmRsZS5uZXQvMjExNy8xOTI2NzU8L3VybD48L3JlbGF0ZWQtdXJscz48L3VybHM+PC9yZWNvcmQ+
-PC9DaXRlPjxDaXRlPjxBdXRob3I+U2FkamluYTwvQXV0aG9yPjxZZWFyPjIwMTc8L1llYXI+PFJl
-Y051bT43MTwvUmVjTnVtPjxyZWNvcmQ+PHJlYy1udW1iZXI+NzE8L3JlYy1udW1iZXI+PGZvcmVp
-Z24ta2V5cz48a2V5IGFwcD0iRU4iIGRiLWlkPSJtZGFlODUwMDEwOTQ5NmZlYTRhZmY5YzA4NmUx
-NmNjMjU4OTUiIHRpbWVzdGFtcD0iMTc5MzIyNjYyMSI+NzE8L2tleT48L2ZvcmVpZ24ta2V5cz48
-cmVmLXR5cGUgbmFtZT0iSm91cm5hbCBBcnRpY2xlIj4xNzwvcmVmLXR5cGU+PGNvbnRyaWJ1dG9y
-cz48YXV0aG9ycz48YXV0aG9yPlNhZGppbmEsIFNldmVyaW48L2F1dGhvcj48YXV0aG9yPkt5bGxp
-bmdzdGFkLCBMYXJzIFQuPC9hdXRob3I+PGF1dGhvcj5Ta2pvbmcsIFN0aWFuPC9hdXRob3I+PGF1
-dGhvcj5QZWRlcnNlbiwgRWlsaWY8L2F1dGhvcj48L2F1dGhvcnM+PC9jb250cmlidXRvcnM+PHRp
-dGxlcz48dGl0bGU+RW5lcmd5IGNvbnNlcnZhdGlvbiBhbmQgcG93ZXIgYm9uZHMgaW4gY28tc2lt
-dWxhdGlvbnM6IG5vbi1pdGVyYXRpdmUgYWRhcHRpdmUgc3RlcCBzaXplIGNvbnRyb2wgYW5kIGVy
-cm9yIGVzdGltYXRpb248L3RpdGxlPjxzZWNvbmRhcnktdGl0bGU+RW5naW5lZXJpbmcgd2l0aCBD
-b21wdXRlcnM8L3NlY29uZGFyeS10aXRsZT48YWx0LXRpdGxlPkVuZy4gQ29tcHV0LjwvYWx0LXRp
-dGxlPjwvdGl0bGVzPjxwZXJpb2RpY2FsPjxmdWxsLXRpdGxlPkVuZ2luZWVyaW5nIHdpdGggQ29t
-cHV0ZXJzPC9mdWxsLXRpdGxlPjxhYmJyLTE+RW5nLiBDb21wdXQuPC9hYmJyLTE+PC9wZXJpb2Rp
-Y2FsPjxwYWdlcz42MDctNjIwPC9wYWdlcz48dm9sdW1lPjMzPC92b2x1bWU+PG51bWJlcj4zPC9u
-dW1iZXI+PGRhdGVzPjx5ZWFyPjIwMTc8L3llYXI+PC9kYXRlcz48cHVibGlzaGVyPlNwcmluZ2Vy
-PC9wdWJsaXNoZXI+PGxhYmVsPnNhZGppbmEyMDE3PC9sYWJlbD48dXJscz48L3VybHM+PGVsZWN0
-cm9uaWMtcmVzb3VyY2UtbnVtPjEwLjEwMDcvczAwMzY2LTAxNi0wNDkyLTg8L2VsZWN0cm9uaWMt
-cmVzb3VyY2UtbnVtPjwvcmVjb3JkPjwvQ2l0ZT48L0VuZE5vdGU+AA==</w:fldData>
-        </w:fldChar>
-      </w:r>
-      <w:r>
-        <w:instrText xml:space="preserve"> ADDIN EN.CITE </w:instrText>
-      </w:r>
-      <w:r>
-        <w:fldChar w:fldCharType="begin">
-          <w:fldData xml:space="preserve">PEVuZE5vdGU+PENpdGU+PEF1dGhvcj5CZW5lZGlrdDwvQXV0aG9yPjxZZWFyPjIwMTM8L1llYXI+
-PFJlY051bT4zPC9SZWNOdW0+PERpc3BsYXlUZXh0PihCZW5lZGlrdCBldCBhbC4gMjAxMzsgU2Fk
-amluYSBldCBhbC4gMjAxNyk8L0Rpc3BsYXlUZXh0PjxyZWNvcmQ+PHJlYy1udW1iZXI+MzwvcmVj
-LW51bWJlcj48Zm9yZWlnbi1rZXlzPjxrZXkgYXBwPSJFTiIgZGItaWQ9Im1kYWU4NTAwMTA5NDk2
-ZmVhNGFmZjljMDg2ZTE2Y2MyNTg5NSIgdGltZXN0YW1wPSIxNzkzMjI2NjIxIj4zPC9rZXk+PC9m
-b3JlaWduLWtleXM+PHJlZi10eXBlIG5hbWU9IkNvbmZlcmVuY2UgUGFwZXIiPjQ3PC9yZWYtdHlw
-ZT48Y29udHJpYnV0b3JzPjxhdXRob3JzPjxhdXRob3I+QmVuZWRpa3QsIE0uPC9hdXRob3I+PGF1
-dGhvcj5XYXR6ZW5pZywgRC48L2F1dGhvcj48YXV0aG9yPlplaGV0bmVyLCBKLjwvYXV0aG9yPjxh
-dXRob3I+SG9mZXIsIEEuPC9hdXRob3I+PC9hdXRob3JzPjwvY29udHJpYnV0b3JzPjx0aXRsZXM+
-PHRpdGxlPk5FUENFIOKAkyBhIG5lYXJseSBlbmVyZ3ktcHJlc2VydmluZyBjb3VwbGluZyBlbGVt
-ZW50IGZvciB3ZWFrLWNvdXBsZWQgcHJvYmxlbXMgYW5kIGNvLXNpbXVsYXRpb25zPC90aXRsZT48
-c2Vjb25kYXJ5LXRpdGxlPlYgSW50ZXJuYXRpb25hbCBDb25mZXJlbmNlIG9uIENvbXB1dGF0aW9u
-YWwgTWV0aG9kcyBmb3IgQ291cGxlZCBQcm9ibGVtcyBpbiBTY2llbmNlIGFuZCBFbmdpbmVlcmlu
-ZyAoQ09VUExFRCAyMDEzKTwvc2Vjb25kYXJ5LXRpdGxlPjwvdGl0bGVzPjxwYWdlcz4xMDIxLTEw
-MzI8L3BhZ2VzPjxkYXRlcz48eWVhcj4yMDEzPC95ZWFyPjwvZGF0ZXM+PHB1Yi1sb2NhdGlvbj5T
-YW50YSBFdWzDoGxpYSwgSWJpemEsIFNwYWluPC9wdWItbG9jYXRpb24+PHB1Ymxpc2hlcj5DSU1O
-RTwvcHVibGlzaGVyPjxpc2JuPjk3OC04NC05NDE0MDctNi0xPC9pc2JuPjxsYWJlbD5iZW5lZGlr
-dDIwMTNuZXBjZTwvbGFiZWw+PHVybHM+PHJlbGF0ZWQtdXJscz48dXJsPmh0dHBzOi8vaGRsLmhh
-bmRsZS5uZXQvMjExNy8xOTI2NzU8L3VybD48L3JlbGF0ZWQtdXJscz48L3VybHM+PC9yZWNvcmQ+
-PC9DaXRlPjxDaXRlPjxBdXRob3I+U2FkamluYTwvQXV0aG9yPjxZZWFyPjIwMTc8L1llYXI+PFJl
-Y051bT43MTwvUmVjTnVtPjxyZWNvcmQ+PHJlYy1udW1iZXI+NzE8L3JlYy1udW1iZXI+PGZvcmVp
-Z24ta2V5cz48a2V5IGFwcD0iRU4iIGRiLWlkPSJtZGFlODUwMDEwOTQ5NmZlYTRhZmY5YzA4NmUx
-NmNjMjU4OTUiIHRpbWVzdGFtcD0iMTc5MzIyNjYyMSI+NzE8L2tleT48L2ZvcmVpZ24ta2V5cz48
-cmVmLXR5cGUgbmFtZT0iSm91cm5hbCBBcnRpY2xlIj4xNzwvcmVmLXR5cGU+PGNvbnRyaWJ1dG9y
-cz48YXV0aG9ycz48YXV0aG9yPlNhZGppbmEsIFNldmVyaW48L2F1dGhvcj48YXV0aG9yPkt5bGxp
-bmdzdGFkLCBMYXJzIFQuPC9hdXRob3I+PGF1dGhvcj5Ta2pvbmcsIFN0aWFuPC9hdXRob3I+PGF1
-dGhvcj5QZWRlcnNlbiwgRWlsaWY8L2F1dGhvcj48L2F1dGhvcnM+PC9jb250cmlidXRvcnM+PHRp
-dGxlcz48dGl0bGU+RW5lcmd5IGNvbnNlcnZhdGlvbiBhbmQgcG93ZXIgYm9uZHMgaW4gY28tc2lt
-dWxhdGlvbnM6IG5vbi1pdGVyYXRpdmUgYWRhcHRpdmUgc3RlcCBzaXplIGNvbnRyb2wgYW5kIGVy
-cm9yIGVzdGltYXRpb248L3RpdGxlPjxzZWNvbmRhcnktdGl0bGU+RW5naW5lZXJpbmcgd2l0aCBD
-b21wdXRlcnM8L3NlY29uZGFyeS10aXRsZT48YWx0LXRpdGxlPkVuZy4gQ29tcHV0LjwvYWx0LXRp
-dGxlPjwvdGl0bGVzPjxwZXJpb2RpY2FsPjxmdWxsLXRpdGxlPkVuZ2luZWVyaW5nIHdpdGggQ29t
-cHV0ZXJzPC9mdWxsLXRpdGxlPjxhYmJyLTE+RW5nLiBDb21wdXQuPC9hYmJyLTE+PC9wZXJpb2Rp
-Y2FsPjxwYWdlcz42MDctNjIwPC9wYWdlcz48dm9sdW1lPjMzPC92b2x1bWU+PG51bWJlcj4zPC9u
-dW1iZXI+PGRhdGVzPjx5ZWFyPjIwMTc8L3llYXI+PC9kYXRlcz48cHVibGlzaGVyPlNwcmluZ2Vy
-PC9wdWJsaXNoZXI+PGxhYmVsPnNhZGppbmEyMDE3PC9sYWJlbD48dXJscz48L3VybHM+PGVsZWN0
-cm9uaWMtcmVzb3VyY2UtbnVtPjEwLjEwMDcvczAwMzY2LTAxNi0wNDkyLTg8L2VsZWN0cm9uaWMt
-cmVzb3VyY2UtbnVtPjwvcmVjb3JkPjwvQ2l0ZT48L0VuZE5vdGU+AA==</w:fldData>
-        </w:fldChar>
-      </w:r>
-      <w:r>
-        <w:instrText xml:space="preserve"> ADDIN EN.CITE.DATA </w:instrText>
-      </w:r>
-      <w:r>
-        <w:fldChar w:fldCharType="end"/>
-      </w:r>
-      <w:r>
-        <w:fldChar w:fldCharType="separate"/>
-      </w:r>
-      <w:r>
-        <w:rPr>
-          <w:noProof/>
-        </w:rPr>
-        <w:t xml:space="preserve">(Benedikt et al. 2013; Sadjina et al. 2017)</w:t>
-      </w:r>
-      <w:r>
-        <w:fldChar w:fldCharType="end"/>
-      </w:r>
-      <w:r>
-        <w:t xml:space="preserve">. Within a consumer’s step, TIDE can only deliver aggregates: the product of a rapidly changing price and a rapidly changing load needs a consumer step at least as fine as the price changes (</w:t>
-      </w:r>
-      <w:r>
-        <w:t xml:space="preserve">Section 5.3</w:t>
+        <w:t xml:space="preserve">The standalone runs of </w:t>
+      </w:r>
+      <w:r>
+        <w:t xml:space="preserve">Section 5.4</w:t>
+      </w:r>
+      <w:r>
+        <w:t xml:space="preserve"> showed that the EnergyPlus time step changed the weekly electricity use of the small office by up to 14 %, almost entirely because the model’s autosizing window is counted in time steps. Any study that changes the EnergyPlus time step should therefore fix the sizing window or hard-size the equipment. The sub-step option of the EnergyPlus adapter avoids the question: EnergyPlus keeps the time step and sizing for which the model was prepared, while components exchange data at whatever step they need. It is a matter of accuracy and flexibility, not of speed.</w:t>
+      </w:r>
+    </w:p>
+    <w:p>
+      <w:pPr>
+        <w:pStyle w:val="Heading2"/>
+      </w:pPr>
+      <w:r>
+        <w:t xml:space="preserve">Compatibility with AI and generative AI applications</w:t>
+      </w:r>
+    </w:p>
+    <w:p>
+      <w:pPr>
+        <w:pStyle w:val="BodyText"/>
+      </w:pPr>
+      <w:r>
+        <w:t xml:space="preserve">Py-CoSim is not specific to AI, but its message model makes it compatible with AI and generative AI applications for four reasons. First, every input declares a window, so an ML predictor can read a history of aligned features instead of a single value. Second, quality flags with bounds and fallbacks, together with the JSON validation of the LLM supervisor, keep an invalid or refused answer from reaching a physics model unchecked, and every such case is counted. Third, record and replay makes a non-deterministic component repeatable at the cost of a JSON-lines file and separated a retrofit effect from a supervisor’s randomness (</w:t>
+      </w:r>
+      <w:r>
+        <w:t xml:space="preserve">Section 5.5</w:t>
+      </w:r>
+      <w:r>
+        <w:t xml:space="preserve">); a replay holds the decisions fixed, however, and does not tell what a supervisor would have decided in the modified system. Fourth, asynchronous execution makes the latency of a service a modeling decision (the decision delay) instead of an accident of the computer; overlapping the calls of several components reduced the wall-clock time by up to 2.9 times, and results stay independent of latency as long as no deadline is missed, with misses flagged. The LLM supervisor works with hosted or local models through interchangeable back ends, and a Gymnasium environment serves reinforcement learning (</w:t>
+      </w:r>
+      <w:r>
+        <w:t xml:space="preserve">Section 4</w:t>
       </w:r>
       <w:r>
         <w:t xml:space="preserve">).</w:t>
@@ -8902,7 +8952,7 @@
         <w:pStyle w:val="Heading2"/>
       </w:pPr>
       <w:r>
-        <w:t xml:space="preserve">A pitfall: the EnergyPlus time step changes the equipment</w:t>
+        <w:t xml:space="preserve">Limitations</w:t>
       </w:r>
     </w:p>
     <w:p>
@@ -8910,45 +8960,7 @@
         <w:pStyle w:val="BodyText"/>
       </w:pPr>
       <w:r>
-        <w:t xml:space="preserve">The standalone runs of </w:t>
-      </w:r>
-      <w:r>
-        <w:t xml:space="preserve">Section 5.4</w:t>
-      </w:r>
-      <w:r>
-        <w:t xml:space="preserve"> showed that the EnergyPlus time step changed the weekly electricity use of the small office by up to 14 %, almost entirely because the model’s autosizing window is counted in time steps. Any study that changes the EnergyPlus time step, for example to match the step of a controller or an FMU, should therefore fix the sizing window or hard-size the equipment. The sub-step option of the EnergyPlus adapter avoids the question: EnergyPlus keeps the time step and sizing for which the model was prepared, while components exchange data at whatever step they need. It is a matter of accuracy and flexibility, not of speed: with a 1-min internal step, the run time is dominated by EnergyPlus itself whatever the exchange step.</w:t>
-      </w:r>
-    </w:p>
-    <w:p>
-      <w:pPr>
-        <w:pStyle w:val="Heading2"/>
-      </w:pPr>
-      <w:r>
-        <w:t xml:space="preserve">AI components in co-simulation</w:t>
-      </w:r>
-    </w:p>
-    <w:p>
-      <w:pPr>
-        <w:pStyle w:val="BodyText"/>
-      </w:pPr>
-      <w:r>
-        <w:t xml:space="preserve">Record and replay turned a non-reproducible co-simulation into a reproducible one at the cost of a JSON-lines file, and it allowed a retrofit study with a stochastic supervisor to separate the retrofit effect from the supervisor’s randomness. Two cautions apply. A replay holds the decisions fixed; it does not tell what a supervisor would have decided in the modified system. Recorded prompts and answers may also contain information that needs the same care as any other research data. The asynchronous execution makes the latency of an AI service a modeling decision (the decision delay) instead of an accident of the computer, and overlapping the calls of several components reduced the wall-clock time by up to 2.9 times. Results remain independent of wall-clock latency only as long as no deadline is missed; deadline misses are flagged in the results so that they can be reported.</w:t>
-      </w:r>
-    </w:p>
-    <w:p>
-      <w:pPr>
-        <w:pStyle w:val="Heading2"/>
-      </w:pPr>
-      <w:r>
-        <w:t xml:space="preserve">Limitations</w:t>
-      </w:r>
-    </w:p>
-    <w:p>
-      <w:pPr>
-        <w:pStyle w:val="BodyText"/>
-      </w:pPr>
-      <w:r>
-        <w:t xml:space="preserve">The evaluation uses stand-ins for LLM services that imitate sampling and latency; the infrastructure claims do not depend on the quality of the answers, but a study with a hosted model is still needed to report realistic latency distributions and failure rates. All experiments run on one computer with EnergyPlus 22.2, and asynchronous components run in threads, which suits remote services better than compute-bound local models. TIDE runs in one Python process, with EnergyPlus instances in worker processes; distributing components over several machines, as HELICS and HLA do, and connecting components written in other languages are left for future work, as is exchanging units along with time meanings. The comparison with HELICS covers one scenario and measures what a typical user would write in each tool, not the best that each tool can do.</w:t>
+        <w:t xml:space="preserve">The evaluation uses stand-ins for LLM services that imitate sampling and latency; the infrastructure claims do not depend on the quality of the answers, but a study with real AI models is still needed to report realistic latency distributions and failure rates. All experiments run on one computer with EnergyPlus 22.2, and asynchronous components run in threads, which suits remote services better than compute-bound local models. TIDE runs in one Python process, with EnergyPlus instances in worker processes; distributing components over several machines, as HELICS and HLA do, and connecting components written in other languages are left for future work, as is exchanging units along with time meanings. The comparison with HELICS covers one scenario and measures what a typical user would write in each tool, not the best that each tool can do.</w:t>
       </w:r>
     </w:p>
     <w:p>
@@ -9026,7 +9038,7 @@
         </w:numPr>
       </w:pPr>
       <w:r>
-        <w:t xml:space="preserve">Recording the messages of a stochastic AI supervisor made its runs exactly repeatable and reduced the spread of a retrofit-savings estimate from 0.38 to 0.016 percentage points.</w:t>
+        <w:t xml:space="preserve">Recording the messages of a stochastic supervisor (a stand-in for an LLM service) made its runs exactly repeatable and reduced the spread of a retrofit-savings estimate from 0.38 to 0.016 percentage points.</w:t>
       </w:r>
     </w:p>
     <w:p>
@@ -9038,7 +9050,7 @@
         </w:numPr>
       </w:pPr>
       <w:r>
-        <w:t xml:space="preserve">Asynchronous delivery with a declared decision delay overlapped slow AI calls (2.9 times faster with eight supervisors) while keeping results independent of their latency.</w:t>
+        <w:t xml:space="preserve">Asynchronous delivery with a declared decision delay overlapped slow calls (2.9 times faster with eight supervisors) while keeping results independent of their latency.</w:t>
       </w:r>
     </w:p>
     <w:p>
@@ -9050,7 +9062,7 @@
         </w:numPr>
       </w:pPr>
       <w:r>
-        <w:t xml:space="preserve">Aligned reads cost about 15 % more master time than latest-value reads in a stress test without EnergyPlus, and recording every message about 80 %; next to EnergyPlus, whose co-simulation of a building-week took 9.4 s against 6.4 s standalone, these costs are small, and EnergyPlus instances run in parallel (3.4 times faster for eight buildings).</w:t>
+        <w:t xml:space="preserve">Alignment and recording add little next to EnergyPlus: a building-week took 9.4 s co-simulated against 6.4 s standalone, and EnergyPlus instances run in parallel (3.4 times faster for eight buildings).</w:t>
       </w:r>
     </w:p>
     <w:p>

</xml_diff>